<commit_message>
Added an example in the docx to send one complete cycle of data and music during each transmit time.
</commit_message>
<xml_diff>
--- a/RadioFox.docx
+++ b/RadioFox.docx
@@ -413,7 +413,15 @@
         <w:t xml:space="preserve">The actual runtime depends on the transmitting time and </w:t>
       </w:r>
       <w:r>
-        <w:t xml:space="preserve">quality of the batteries. There are many deceptively labelled 18650 batteries available. The best one </w:t>
+        <w:t xml:space="preserve">quality of the batteries. There are many deceptively labelled 18650 batteries available. The best </w:t>
+      </w:r>
+      <w:proofErr w:type="gramStart"/>
+      <w:r>
+        <w:t>one</w:t>
+      </w:r>
+      <w:proofErr w:type="gramEnd"/>
+      <w:r>
+        <w:t xml:space="preserve"> </w:t>
       </w:r>
       <w:proofErr w:type="gramStart"/>
       <w:r>
@@ -1974,16 +1982,7 @@
     </w:p>
     <w:p>
       <w:r>
-        <w:t>After booting or when not in the menu system the r</w:t>
-      </w:r>
-      <w:r>
-        <w:t>adio status</w:t>
-      </w:r>
-      <w:r>
-        <w:t xml:space="preserve"> is displayed. It</w:t>
-      </w:r>
-      <w:r>
-        <w:t xml:space="preserve"> shows the current operation, the count of transmit cycles, the ID text,</w:t>
+        <w:t>After booting or when not in the menu system the radio status is displayed. It shows the current operation, the count of transmit cycles, the ID text,</w:t>
       </w:r>
       <w:r>
         <w:t xml:space="preserve"> any selected audio file,</w:t>
@@ -2631,42 +2630,580 @@
         <w:t xml:space="preserve"> waits to stop until the entire cycle is finished.</w:t>
       </w:r>
     </w:p>
+    <w:p/>
+    <w:p>
+      <w:r>
+        <w:lastRenderedPageBreak/>
+        <w:t>A clever use of this command</w:t>
+      </w:r>
+      <w:r>
+        <w:t xml:space="preserve"> allows for only one cycle of beacon, ID, and music to be sent during each transmission time. Set the transmit</w:t>
+      </w:r>
+      <w:r>
+        <w:t xml:space="preserve"> time to something less than</w:t>
+      </w:r>
+      <w:r>
+        <w:t xml:space="preserve"> the time to perform a complete cycle and set this option to “Finish Cycle”. The transmit  cycle will begin, the timer will expire, but the current cycle will complete before stopping</w:t>
+      </w:r>
+      <w:r>
+        <w:t>.</w:t>
+      </w:r>
+    </w:p>
     <w:p>
       <w:pPr>
         <w:pStyle w:val="Heading3"/>
       </w:pPr>
       <w:r>
+        <w:t xml:space="preserve">Radio Pause: </w:t>
+      </w:r>
+      <w:proofErr w:type="spellStart"/>
+      <w:r>
+        <w:t>Sleep|Awake</w:t>
+      </w:r>
+      <w:proofErr w:type="spellEnd"/>
+    </w:p>
+    <w:p>
+      <w:r>
+        <w:t xml:space="preserve">During pause time the radio can be put into sleep mode. This lowers the power consumption and lets the battery last longer. </w:t>
+      </w:r>
+      <w:proofErr w:type="gramStart"/>
+      <w:r>
+        <w:t>However</w:t>
+      </w:r>
+      <w:proofErr w:type="gramEnd"/>
+      <w:r>
+        <w:t xml:space="preserve"> note that this also means that the DTMF commands are disabled since the radio is asleep!</w:t>
+      </w:r>
+    </w:p>
+    <w:p>
+      <w:pPr>
+        <w:pStyle w:val="Heading2"/>
+      </w:pPr>
+      <w:r>
+        <w:t>+</w:t>
+      </w:r>
+      <w:r>
+        <w:t>More Radio Settings</w:t>
+      </w:r>
+    </w:p>
+    <w:p>
+      <w:pPr>
+        <w:pStyle w:val="Heading3"/>
+      </w:pPr>
+      <w:r>
+        <w:t xml:space="preserve">RX Offset: -600|0|+600 </w:t>
+      </w:r>
+      <w:proofErr w:type="gramStart"/>
+      <w:r>
+        <w:t>kHz</w:t>
+      </w:r>
+      <w:proofErr w:type="gramEnd"/>
+    </w:p>
+    <w:p>
+      <w:r>
+        <w:t>This is the frequency offset from the transmit frequency that the radio uses to receive DTMF commands</w:t>
+      </w:r>
+      <w:r>
+        <w:t>. An offset is recommended. If 0 is used the radio will only listen when it isn’t sending. It has not been tested if it listens during sending when the offset is not 0.</w:t>
+      </w:r>
+    </w:p>
+    <w:p>
+      <w:pPr>
+        <w:pStyle w:val="Heading3"/>
+      </w:pPr>
+      <w:r>
+        <w:t>Bandwidth: 12.5|</w:t>
+      </w:r>
+      <w:r>
+        <w:t>25 kHz</w:t>
+      </w:r>
+    </w:p>
+    <w:p>
+      <w:r>
+        <w:t>This sets the radio bandwidth</w:t>
+      </w:r>
+      <w:r>
+        <w:t>. It has not been tested much to see what effect it has on performance yet.</w:t>
+      </w:r>
+    </w:p>
+    <w:p>
+      <w:pPr>
+        <w:pStyle w:val="Heading3"/>
+      </w:pPr>
+      <w:r>
+        <w:t>CTCSS/DCS: CTCSS|DCS</w:t>
+      </w:r>
+    </w:p>
+    <w:p>
+      <w:r>
+        <w:t xml:space="preserve">This sets the </w:t>
+      </w:r>
+      <w:r>
+        <w:t>un-squelch</w:t>
+      </w:r>
+      <w:r>
+        <w:t xml:space="preserve"> values</w:t>
+      </w:r>
+      <w:r>
+        <w:t xml:space="preserve"> for either the analog or digital versions.</w:t>
+      </w:r>
+    </w:p>
+    <w:p>
+      <w:pPr>
+        <w:pStyle w:val="Heading3"/>
+      </w:pPr>
+      <w:r>
+        <w:t>TX CTCSS:</w:t>
+      </w:r>
+      <w:r>
+        <w:t xml:space="preserve"> None</w:t>
+      </w:r>
+      <w:r>
+        <w:t>|</w:t>
+      </w:r>
+      <w:r>
+        <w:t>67-</w:t>
+      </w:r>
+      <w:r>
+        <w:t>250.3</w:t>
+      </w:r>
+    </w:p>
+    <w:p>
+      <w:r>
+        <w:t>Analog un-squelch frequencies sent out.</w:t>
+      </w:r>
+    </w:p>
+    <w:p>
+      <w:pPr>
+        <w:pStyle w:val="Heading3"/>
+      </w:pPr>
+      <w:r>
+        <w:t>RX CTCSS:</w:t>
+      </w:r>
+      <w:r>
+        <w:t xml:space="preserve"> None|67-250.3</w:t>
+      </w:r>
+    </w:p>
+    <w:p>
+      <w:r>
+        <w:t>Analog un-squelch frequency for receiving.</w:t>
+      </w:r>
+    </w:p>
+    <w:p>
+      <w:pPr>
+        <w:pStyle w:val="Heading3"/>
+      </w:pPr>
+      <w:r>
+        <w:t>TX DCS:</w:t>
+      </w:r>
+      <w:r>
+        <w:t xml:space="preserve"> None|023-754</w:t>
+      </w:r>
+    </w:p>
+    <w:p>
+      <w:r>
+        <w:t>Digital un-squelch value for sending.</w:t>
+      </w:r>
+    </w:p>
+    <w:p>
+      <w:pPr>
+        <w:pStyle w:val="Heading3"/>
+      </w:pPr>
+      <w:r>
+        <w:t>TX I/N: I|N</w:t>
+      </w:r>
+    </w:p>
+    <w:p>
+      <w:r>
+        <w:t>The digital I or N value for sending.</w:t>
+      </w:r>
+    </w:p>
+    <w:p>
+      <w:pPr>
+        <w:pStyle w:val="Heading3"/>
+      </w:pPr>
+      <w:r>
+        <w:t>RX DCS: None|023-754</w:t>
+      </w:r>
+    </w:p>
+    <w:p>
+      <w:r>
+        <w:t>Digital un-squelch value for receiving.</w:t>
+      </w:r>
+    </w:p>
+    <w:p>
+      <w:pPr>
+        <w:pStyle w:val="Heading3"/>
+      </w:pPr>
+      <w:r>
         <w:lastRenderedPageBreak/>
-        <w:t xml:space="preserve">Radio Pause: </w:t>
+        <w:t>RX I/N: I|N</w:t>
+      </w:r>
+    </w:p>
+    <w:p>
+      <w:r>
+        <w:t>The digital I or N value for receiving.</w:t>
+      </w:r>
+    </w:p>
+    <w:p>
+      <w:pPr>
+        <w:pStyle w:val="Heading3"/>
+      </w:pPr>
+      <w:r>
+        <w:t>RX Volume:</w:t>
+      </w:r>
+      <w:r>
+        <w:t xml:space="preserve"> 1-6</w:t>
+      </w:r>
+    </w:p>
+    <w:p>
+      <w:r>
+        <w:t>This is the receive volume setting. It affects how well DTMF tones are detected.</w:t>
+      </w:r>
+    </w:p>
+    <w:p>
+      <w:pPr>
+        <w:pStyle w:val="Heading3"/>
+      </w:pPr>
+      <w:r>
+        <w:t>RX Squelch:</w:t>
+      </w:r>
+      <w:r>
+        <w:t xml:space="preserve"> 0-8</w:t>
+      </w:r>
+    </w:p>
+    <w:p>
+      <w:r>
+        <w:t>This affects how much signal is required to receive the DTMF signals.</w:t>
+      </w:r>
+    </w:p>
+    <w:p>
+      <w:pPr>
+        <w:pStyle w:val="Heading2"/>
+      </w:pPr>
+      <w:r>
+        <w:t>Cancel Waits/TX Now</w:t>
+      </w:r>
+    </w:p>
+    <w:p>
+      <w:r>
+        <w:t>When the radio is in either send or pause mode this command will cancel the timer and the next mo</w:t>
+      </w:r>
+      <w:r>
+        <w:t xml:space="preserve">de will start. For </w:t>
+      </w:r>
+      <w:proofErr w:type="gramStart"/>
+      <w:r>
+        <w:t>example</w:t>
+      </w:r>
+      <w:proofErr w:type="gramEnd"/>
+      <w:r>
+        <w:t xml:space="preserve"> if you want to cancel</w:t>
+      </w:r>
+      <w:r>
+        <w:t xml:space="preserve"> the pause and go to transmit, use this option. It can also be done by </w:t>
+      </w:r>
+      <w:proofErr w:type="gramStart"/>
+      <w:r>
+        <w:t>long pressing B0</w:t>
+      </w:r>
+      <w:proofErr w:type="gramEnd"/>
+      <w:r>
+        <w:t>.</w:t>
+      </w:r>
+    </w:p>
+    <w:p>
+      <w:pPr>
+        <w:pStyle w:val="Heading2"/>
+      </w:pPr>
+      <w:r>
+        <w:t>+Saved Settings Files</w:t>
+      </w:r>
+    </w:p>
+    <w:p>
+      <w:r>
+        <w:t>Saved settings files are named files stored on the SD card. They are useful to</w:t>
+      </w:r>
+      <w:r>
+        <w:t xml:space="preserve"> quickly configure the radio for different uses. All values except the battery calibration are affected.</w:t>
+      </w:r>
+    </w:p>
+    <w:p>
+      <w:pPr>
+        <w:pStyle w:val="Heading3"/>
+      </w:pPr>
+      <w:r>
+        <w:t>Create File</w:t>
+      </w:r>
+    </w:p>
+    <w:p>
+      <w:r>
+        <w:t>This prompts the user for a name. The file is then created using the current system settings.</w:t>
+      </w:r>
+    </w:p>
+    <w:p>
+      <w:pPr>
+        <w:pStyle w:val="Heading3"/>
+      </w:pPr>
+      <w:r>
+        <w:t>Save/Update File</w:t>
+      </w:r>
+    </w:p>
+    <w:p>
+      <w:r>
+        <w:t xml:space="preserve">This command saves the current settings into the selected file. If it already </w:t>
+      </w:r>
+      <w:proofErr w:type="gramStart"/>
+      <w:r>
+        <w:t>exists</w:t>
+      </w:r>
+      <w:proofErr w:type="gramEnd"/>
+      <w:r>
+        <w:t xml:space="preserve"> the user will be asked to confirm overwriting the file.</w:t>
+      </w:r>
+    </w:p>
+    <w:p>
+      <w:pPr>
+        <w:pStyle w:val="Heading3"/>
+      </w:pPr>
+      <w:r>
+        <w:t>Load File</w:t>
+      </w:r>
+    </w:p>
+    <w:p>
+      <w:r>
+        <w:t xml:space="preserve">This command asks the user for the name and then sets </w:t>
+      </w:r>
+      <w:proofErr w:type="gramStart"/>
+      <w:r>
+        <w:t>all of</w:t>
+      </w:r>
+      <w:proofErr w:type="gramEnd"/>
+      <w:r>
+        <w:t xml:space="preserve"> the system settings except the battery calibration using the values in the file.</w:t>
+      </w:r>
+    </w:p>
+    <w:p>
+      <w:pPr>
+        <w:pStyle w:val="Heading3"/>
+      </w:pPr>
+      <w:r>
+        <w:t>Delete File</w:t>
+      </w:r>
+    </w:p>
+    <w:p>
+      <w:r>
+        <w:t>The user selects a file from the list and then it can be deleted.</w:t>
+      </w:r>
+    </w:p>
+    <w:p>
+      <w:pPr>
+        <w:pStyle w:val="Heading2"/>
+      </w:pPr>
+      <w:r>
+        <w:lastRenderedPageBreak/>
+        <w:t>+System Settings</w:t>
+      </w:r>
+    </w:p>
+    <w:p>
+      <w:pPr>
+        <w:pStyle w:val="Heading3"/>
+      </w:pPr>
+      <w:r>
+        <w:t>+Display</w:t>
+      </w:r>
+      <w:r>
+        <w:t xml:space="preserve"> Settings</w:t>
+      </w:r>
+    </w:p>
+    <w:p>
+      <w:pPr>
+        <w:pStyle w:val="Heading4"/>
+      </w:pPr>
+      <w:r>
+        <w:t xml:space="preserve">Dimming Mode: </w:t>
       </w:r>
       <w:proofErr w:type="spellStart"/>
       <w:r>
-        <w:t>Sleep|Awake</w:t>
+        <w:t>None</w:t>
+      </w:r>
+      <w:r>
+        <w:t>|Timer</w:t>
       </w:r>
       <w:proofErr w:type="spellEnd"/>
     </w:p>
     <w:p>
       <w:r>
-        <w:t xml:space="preserve">During pause time the radio can be put into sleep mode. This lowers the power consumption and lets the battery last longer. </w:t>
+        <w:t xml:space="preserve">The display can be set to dim automatically after a specified number of seconds. This is used to save battery power since the backlight </w:t>
+      </w:r>
+      <w:r>
+        <w:t>uses a significant amount.</w:t>
+      </w:r>
+    </w:p>
+    <w:p>
+      <w:pPr>
+        <w:pStyle w:val="Heading4"/>
+      </w:pPr>
+      <w:r>
+        <w:t>Bright Value: 1-100</w:t>
+      </w:r>
+      <w:r>
+        <w:t>%</w:t>
+      </w:r>
+    </w:p>
+    <w:p>
+      <w:r>
+        <w:t>Set the display brightness value.</w:t>
+      </w:r>
+    </w:p>
+    <w:p>
+      <w:pPr>
+        <w:pStyle w:val="Heading4"/>
+      </w:pPr>
+      <w:r>
+        <w:t xml:space="preserve">Dim Value: </w:t>
+      </w:r>
+      <w:r>
+        <w:t>0-100%</w:t>
+      </w:r>
+    </w:p>
+    <w:p>
+      <w:r>
+        <w:t xml:space="preserve">Set the display brightness after the </w:t>
+      </w:r>
+      <w:r>
+        <w:t>timer below expires.</w:t>
+      </w:r>
+    </w:p>
+    <w:p>
+      <w:pPr>
+        <w:pStyle w:val="Heading4"/>
+      </w:pPr>
+      <w:r>
+        <w:t>Display Dim Time:</w:t>
+      </w:r>
+      <w:r>
+        <w:t xml:space="preserve"> 0-120 S</w:t>
+      </w:r>
+    </w:p>
+    <w:p>
+      <w:r>
+        <w:t>Specify the time until the display changes to dim mode.</w:t>
+      </w:r>
+    </w:p>
+    <w:p>
+      <w:pPr>
+        <w:pStyle w:val="Heading4"/>
+      </w:pPr>
+      <w:r>
+        <w:t>+Sideways Scroll Settings</w:t>
+      </w:r>
+    </w:p>
+    <w:p>
+      <w:r>
+        <w:t xml:space="preserve">Lines of text that </w:t>
       </w:r>
       <w:proofErr w:type="gramStart"/>
       <w:r>
-        <w:t>However</w:t>
+        <w:t>too</w:t>
       </w:r>
       <w:proofErr w:type="gramEnd"/>
       <w:r>
-        <w:t xml:space="preserve"> note that this also means that the DTMF commands are disabled since the radio is asleep!</w:t>
-      </w:r>
-    </w:p>
-    <w:p>
-      <w:pPr>
-        <w:pStyle w:val="Heading2"/>
-      </w:pPr>
-      <w:r>
-        <w:t>+</w:t>
-      </w:r>
-      <w:r>
-        <w:t>More Radio Settings</w:t>
+        <w:t xml:space="preserve"> long for the display will scroll back and forth. The following settings control the speed.</w:t>
+      </w:r>
+    </w:p>
+    <w:p>
+      <w:pPr>
+        <w:pStyle w:val="Heading5"/>
+      </w:pPr>
+      <w:r>
+        <w:t xml:space="preserve">Speed: </w:t>
+      </w:r>
+      <w:r>
+        <w:t>1-1000 mS</w:t>
+      </w:r>
+    </w:p>
+    <w:p>
+      <w:r>
+        <w:t>Controls the speed of text moving to the left.</w:t>
+      </w:r>
+    </w:p>
+    <w:p>
+      <w:pPr>
+        <w:pStyle w:val="Heading5"/>
+      </w:pPr>
+      <w:r>
+        <w:t>Pause: 1-100</w:t>
+      </w:r>
+      <w:r>
+        <w:t xml:space="preserve"> mS</w:t>
+      </w:r>
+    </w:p>
+    <w:p>
+      <w:r>
+        <w:t>This controls the pause when the text is at the end (all the way to the left).</w:t>
+      </w:r>
+    </w:p>
+    <w:p>
+      <w:pPr>
+        <w:pStyle w:val="Heading5"/>
+      </w:pPr>
+      <w:r>
+        <w:t>Reverse Speed: 1-20x</w:t>
+      </w:r>
+    </w:p>
+    <w:p>
+      <w:r>
+        <w:t xml:space="preserve">This is how fast the text scrolls </w:t>
+      </w:r>
+      <w:r>
+        <w:t>back to the beginning (to the right). 2x means twice as fast as the text scroll</w:t>
+      </w:r>
+      <w:r>
+        <w:t>ed to the left</w:t>
+      </w:r>
+      <w:r>
+        <w:t>.</w:t>
+      </w:r>
+    </w:p>
+    <w:p>
+      <w:pPr>
+        <w:pStyle w:val="Heading4"/>
+      </w:pPr>
+      <w:r>
+        <w:t xml:space="preserve">Menu Selection: </w:t>
+      </w:r>
+      <w:r>
+        <w:t>Color|*</w:t>
+      </w:r>
+    </w:p>
+    <w:p>
+      <w:r>
+        <w:t>Menu selections</w:t>
+      </w:r>
+      <w:r>
+        <w:t xml:space="preserve"> and selections from a list can be either colored or marked with the ‘*’ character.</w:t>
+      </w:r>
+    </w:p>
+    <w:p>
+      <w:pPr>
+        <w:pStyle w:val="Heading4"/>
+      </w:pPr>
+      <w:r>
+        <w:t>Text/</w:t>
+      </w:r>
+      <w:proofErr w:type="spellStart"/>
+      <w:r>
+        <w:t>HiLite</w:t>
+      </w:r>
+      <w:proofErr w:type="spellEnd"/>
+      <w:r>
+        <w:t xml:space="preserve"> Colors</w:t>
+      </w:r>
+    </w:p>
+    <w:p>
+      <w:r>
+        <w:t>This selection allows for choosing the colors of the text and the highlight. The background screen is always black.</w:t>
       </w:r>
     </w:p>
     <w:p>
@@ -2674,535 +3211,7 @@
         <w:pStyle w:val="Heading3"/>
       </w:pPr>
       <w:r>
-        <w:t xml:space="preserve">RX Offset: -600|0|+600 </w:t>
-      </w:r>
-      <w:proofErr w:type="gramStart"/>
-      <w:r>
-        <w:t>kHz</w:t>
-      </w:r>
-      <w:proofErr w:type="gramEnd"/>
-    </w:p>
-    <w:p>
-      <w:r>
-        <w:t>This is the frequency offset from the transmit frequency that the radio uses to receive DTMF commands</w:t>
-      </w:r>
-      <w:r>
-        <w:t>. An offset is recommended. If 0 is used the radio will only listen when it isn’t sending. It has not been tested if it listens during sending when the offset is not 0.</w:t>
-      </w:r>
-    </w:p>
-    <w:p>
-      <w:pPr>
-        <w:pStyle w:val="Heading3"/>
-      </w:pPr>
-      <w:r>
-        <w:t>Bandwidth: 12.5|</w:t>
-      </w:r>
-      <w:r>
-        <w:t>25 kHz</w:t>
-      </w:r>
-    </w:p>
-    <w:p>
-      <w:r>
-        <w:t>This sets the radio bandwidth</w:t>
-      </w:r>
-      <w:r>
-        <w:t>. It has not been tested much to see what effect it has on performance yet.</w:t>
-      </w:r>
-    </w:p>
-    <w:p>
-      <w:pPr>
-        <w:pStyle w:val="Heading3"/>
-      </w:pPr>
-      <w:r>
-        <w:t>CTCSS/DCS: CTCSS|DCS</w:t>
-      </w:r>
-    </w:p>
-    <w:p>
-      <w:r>
-        <w:t xml:space="preserve">This sets the </w:t>
-      </w:r>
-      <w:r>
-        <w:t>un-squelch</w:t>
-      </w:r>
-      <w:r>
-        <w:t xml:space="preserve"> values</w:t>
-      </w:r>
-      <w:r>
-        <w:t xml:space="preserve"> for either the analog or digital versions.</w:t>
-      </w:r>
-    </w:p>
-    <w:p>
-      <w:pPr>
-        <w:pStyle w:val="Heading3"/>
-      </w:pPr>
-      <w:r>
-        <w:t>TX CTCSS:</w:t>
-      </w:r>
-      <w:r>
-        <w:t xml:space="preserve"> None</w:t>
-      </w:r>
-      <w:r>
-        <w:t>|</w:t>
-      </w:r>
-      <w:r>
-        <w:t>67-</w:t>
-      </w:r>
-      <w:r>
-        <w:t>250.3</w:t>
-      </w:r>
-    </w:p>
-    <w:p>
-      <w:r>
-        <w:t>Analog un-squelch frequencies sent out.</w:t>
-      </w:r>
-    </w:p>
-    <w:p>
-      <w:pPr>
-        <w:pStyle w:val="Heading3"/>
-      </w:pPr>
-      <w:r>
-        <w:t>RX CTCSS:</w:t>
-      </w:r>
-      <w:r>
-        <w:t xml:space="preserve"> None|67-250.3</w:t>
-      </w:r>
-    </w:p>
-    <w:p>
-      <w:r>
-        <w:t>Analog un-squelch frequency for receiving.</w:t>
-      </w:r>
-    </w:p>
-    <w:p>
-      <w:pPr>
-        <w:pStyle w:val="Heading3"/>
-      </w:pPr>
-      <w:r>
-        <w:t>TX DCS:</w:t>
-      </w:r>
-      <w:r>
-        <w:t xml:space="preserve"> None|023-754</w:t>
-      </w:r>
-    </w:p>
-    <w:p>
-      <w:r>
-        <w:t>Digital un-squelch value for sending.</w:t>
-      </w:r>
-    </w:p>
-    <w:p>
-      <w:pPr>
-        <w:pStyle w:val="Heading3"/>
-      </w:pPr>
-      <w:r>
-        <w:t>TX I/N: I|N</w:t>
-      </w:r>
-    </w:p>
-    <w:p>
-      <w:r>
-        <w:t>The digital I or N value for sending.</w:t>
-      </w:r>
-    </w:p>
-    <w:p>
-      <w:pPr>
-        <w:pStyle w:val="Heading3"/>
-      </w:pPr>
-      <w:r>
-        <w:t>RX DCS: None|023-754</w:t>
-      </w:r>
-    </w:p>
-    <w:p>
-      <w:r>
-        <w:t xml:space="preserve">Digital un-squelch value for </w:t>
-      </w:r>
-      <w:r>
-        <w:t>receiving</w:t>
-      </w:r>
-      <w:r>
-        <w:t>.</w:t>
-      </w:r>
-    </w:p>
-    <w:p>
-      <w:pPr>
-        <w:pStyle w:val="Heading3"/>
-      </w:pPr>
-      <w:r>
-        <w:t>RX I/N: I|N</w:t>
-      </w:r>
-    </w:p>
-    <w:p>
-      <w:r>
-        <w:t xml:space="preserve">The digital I or N value for </w:t>
-      </w:r>
-      <w:r>
-        <w:t>receiving.</w:t>
-      </w:r>
-    </w:p>
-    <w:p>
-      <w:pPr>
-        <w:pStyle w:val="Heading3"/>
-      </w:pPr>
-      <w:r>
         <w:lastRenderedPageBreak/>
-        <w:t>RX Volume:</w:t>
-      </w:r>
-      <w:r>
-        <w:t xml:space="preserve"> 1-6</w:t>
-      </w:r>
-    </w:p>
-    <w:p>
-      <w:r>
-        <w:t>This is the receive volume setting. It affects how well DTMF tones are detected.</w:t>
-      </w:r>
-    </w:p>
-    <w:p>
-      <w:pPr>
-        <w:pStyle w:val="Heading3"/>
-      </w:pPr>
-      <w:r>
-        <w:t>RX Squelch:</w:t>
-      </w:r>
-      <w:r>
-        <w:t xml:space="preserve"> 0-8</w:t>
-      </w:r>
-    </w:p>
-    <w:p>
-      <w:r>
-        <w:t>This affects how much signal is required to receive the DTMF signals.</w:t>
-      </w:r>
-    </w:p>
-    <w:p>
-      <w:pPr>
-        <w:pStyle w:val="Heading2"/>
-      </w:pPr>
-      <w:r>
-        <w:t>Cancel Waits/TX Now</w:t>
-      </w:r>
-    </w:p>
-    <w:p>
-      <w:r>
-        <w:t>When the radio is in either send or pause mode this command will cancel the timer and the next mo</w:t>
-      </w:r>
-      <w:r>
-        <w:t xml:space="preserve">de will start. For </w:t>
-      </w:r>
-      <w:proofErr w:type="gramStart"/>
-      <w:r>
-        <w:t>example</w:t>
-      </w:r>
-      <w:proofErr w:type="gramEnd"/>
-      <w:r>
-        <w:t xml:space="preserve"> if you want to cancel</w:t>
-      </w:r>
-      <w:r>
-        <w:t xml:space="preserve"> the pause and go to transmit, use this option. It can also be done by </w:t>
-      </w:r>
-      <w:proofErr w:type="gramStart"/>
-      <w:r>
-        <w:t>long pressing B0</w:t>
-      </w:r>
-      <w:proofErr w:type="gramEnd"/>
-      <w:r>
-        <w:t>.</w:t>
-      </w:r>
-    </w:p>
-    <w:p>
-      <w:pPr>
-        <w:pStyle w:val="Heading2"/>
-      </w:pPr>
-      <w:r>
-        <w:t>+Saved Settings Files</w:t>
-      </w:r>
-    </w:p>
-    <w:p>
-      <w:r>
-        <w:t>Saved settings files are named files stored on the SD card. They are useful to</w:t>
-      </w:r>
-      <w:r>
-        <w:t xml:space="preserve"> quickly configure the radio for different uses. All values except the battery calibration are affected.</w:t>
-      </w:r>
-    </w:p>
-    <w:p>
-      <w:pPr>
-        <w:pStyle w:val="Heading3"/>
-      </w:pPr>
-      <w:r>
-        <w:t>Create File</w:t>
-      </w:r>
-    </w:p>
-    <w:p>
-      <w:r>
-        <w:t>This prompts the user for a name. The file is then created using the current system settings.</w:t>
-      </w:r>
-    </w:p>
-    <w:p>
-      <w:pPr>
-        <w:pStyle w:val="Heading3"/>
-      </w:pPr>
-      <w:r>
-        <w:t>Save/Update File</w:t>
-      </w:r>
-    </w:p>
-    <w:p>
-      <w:r>
-        <w:t xml:space="preserve">This command saves the current settings into the selected file. If it already </w:t>
-      </w:r>
-      <w:proofErr w:type="gramStart"/>
-      <w:r>
-        <w:t>exists</w:t>
-      </w:r>
-      <w:proofErr w:type="gramEnd"/>
-      <w:r>
-        <w:t xml:space="preserve"> the user will be asked to confirm overwriting the file.</w:t>
-      </w:r>
-    </w:p>
-    <w:p>
-      <w:pPr>
-        <w:pStyle w:val="Heading3"/>
-      </w:pPr>
-      <w:r>
-        <w:t>Load File</w:t>
-      </w:r>
-    </w:p>
-    <w:p>
-      <w:r>
-        <w:t xml:space="preserve">This command asks the user for the name and then sets </w:t>
-      </w:r>
-      <w:proofErr w:type="gramStart"/>
-      <w:r>
-        <w:t>all of</w:t>
-      </w:r>
-      <w:proofErr w:type="gramEnd"/>
-      <w:r>
-        <w:t xml:space="preserve"> the system settings except the battery calibration using the values in the file.</w:t>
-      </w:r>
-    </w:p>
-    <w:p>
-      <w:pPr>
-        <w:pStyle w:val="Heading3"/>
-      </w:pPr>
-      <w:r>
-        <w:t>Delete File</w:t>
-      </w:r>
-    </w:p>
-    <w:p>
-      <w:r>
-        <w:t>The user selects a file from the list and then it can be deleted.</w:t>
-      </w:r>
-    </w:p>
-    <w:p>
-      <w:pPr>
-        <w:pStyle w:val="Heading2"/>
-      </w:pPr>
-      <w:r>
-        <w:t>+System Settings</w:t>
-      </w:r>
-    </w:p>
-    <w:p>
-      <w:pPr>
-        <w:pStyle w:val="Heading3"/>
-      </w:pPr>
-      <w:r>
-        <w:t>+Display</w:t>
-      </w:r>
-      <w:r>
-        <w:t xml:space="preserve"> Settings</w:t>
-      </w:r>
-    </w:p>
-    <w:p>
-      <w:pPr>
-        <w:pStyle w:val="Heading4"/>
-      </w:pPr>
-      <w:r>
-        <w:t xml:space="preserve">Dimming Mode: </w:t>
-      </w:r>
-      <w:proofErr w:type="spellStart"/>
-      <w:r>
-        <w:t>None</w:t>
-      </w:r>
-      <w:r>
-        <w:t>|Timer</w:t>
-      </w:r>
-      <w:proofErr w:type="spellEnd"/>
-    </w:p>
-    <w:p>
-      <w:r>
-        <w:t xml:space="preserve">The display can be set to dim automatically after a specified number of seconds. This is used to save battery power since the backlight </w:t>
-      </w:r>
-      <w:r>
-        <w:t>uses a significant amount.</w:t>
-      </w:r>
-    </w:p>
-    <w:p>
-      <w:pPr>
-        <w:pStyle w:val="Heading4"/>
-      </w:pPr>
-      <w:r>
-        <w:lastRenderedPageBreak/>
-        <w:t>Bright Value: 1-100</w:t>
-      </w:r>
-      <w:r>
-        <w:t>%</w:t>
-      </w:r>
-    </w:p>
-    <w:p>
-      <w:r>
-        <w:t>Set the display brightness value.</w:t>
-      </w:r>
-    </w:p>
-    <w:p>
-      <w:pPr>
-        <w:pStyle w:val="Heading4"/>
-      </w:pPr>
-      <w:r>
-        <w:t xml:space="preserve">Dim Value: </w:t>
-      </w:r>
-      <w:r>
-        <w:t>0-100%</w:t>
-      </w:r>
-    </w:p>
-    <w:p>
-      <w:r>
-        <w:t xml:space="preserve">Set the display brightness after the </w:t>
-      </w:r>
-      <w:r>
-        <w:t>timer below expires.</w:t>
-      </w:r>
-    </w:p>
-    <w:p>
-      <w:pPr>
-        <w:pStyle w:val="Heading4"/>
-      </w:pPr>
-      <w:r>
-        <w:t>Display Dim Time:</w:t>
-      </w:r>
-      <w:r>
-        <w:t xml:space="preserve"> 0-120 S</w:t>
-      </w:r>
-    </w:p>
-    <w:p>
-      <w:r>
-        <w:t>Specify the time until the display changes to dim mode.</w:t>
-      </w:r>
-    </w:p>
-    <w:p>
-      <w:pPr>
-        <w:pStyle w:val="Heading4"/>
-      </w:pPr>
-      <w:r>
-        <w:t>+Sideways Scroll Settings</w:t>
-      </w:r>
-    </w:p>
-    <w:p>
-      <w:r>
-        <w:t xml:space="preserve">Lines of text that </w:t>
-      </w:r>
-      <w:proofErr w:type="gramStart"/>
-      <w:r>
-        <w:t>too</w:t>
-      </w:r>
-      <w:proofErr w:type="gramEnd"/>
-      <w:r>
-        <w:t xml:space="preserve"> long for the display will scroll back and forth. The following settings control the speed.</w:t>
-      </w:r>
-    </w:p>
-    <w:p>
-      <w:pPr>
-        <w:pStyle w:val="Heading5"/>
-      </w:pPr>
-      <w:r>
-        <w:t xml:space="preserve">Speed: </w:t>
-      </w:r>
-      <w:r>
-        <w:t>1-1000 mS</w:t>
-      </w:r>
-    </w:p>
-    <w:p>
-      <w:r>
-        <w:t>Controls the speed of text moving to the left.</w:t>
-      </w:r>
-    </w:p>
-    <w:p>
-      <w:pPr>
-        <w:pStyle w:val="Heading5"/>
-      </w:pPr>
-      <w:r>
-        <w:t>Pause: 1-100</w:t>
-      </w:r>
-      <w:r>
-        <w:t xml:space="preserve"> mS</w:t>
-      </w:r>
-    </w:p>
-    <w:p>
-      <w:r>
-        <w:t>This controls the pause when the text is at the end (all the way to the left).</w:t>
-      </w:r>
-    </w:p>
-    <w:p>
-      <w:pPr>
-        <w:pStyle w:val="Heading5"/>
-      </w:pPr>
-      <w:r>
-        <w:t>Reverse Speed: 1-20x</w:t>
-      </w:r>
-    </w:p>
-    <w:p>
-      <w:r>
-        <w:t xml:space="preserve">This is how fast the text scrolls </w:t>
-      </w:r>
-      <w:r>
-        <w:t>back to the beginning (to the right). 2x means twice as fast as the text scroll</w:t>
-      </w:r>
-      <w:r>
-        <w:t>ed to the left</w:t>
-      </w:r>
-      <w:r>
-        <w:t>.</w:t>
-      </w:r>
-    </w:p>
-    <w:p>
-      <w:pPr>
-        <w:pStyle w:val="Heading4"/>
-      </w:pPr>
-      <w:r>
-        <w:t xml:space="preserve">Menu Selection: </w:t>
-      </w:r>
-      <w:r>
-        <w:t>Color|*</w:t>
-      </w:r>
-    </w:p>
-    <w:p>
-      <w:r>
-        <w:t>Menu selections</w:t>
-      </w:r>
-      <w:r>
-        <w:t xml:space="preserve"> and selections from a list can be either colored or marked with the ‘*’ character.</w:t>
-      </w:r>
-    </w:p>
-    <w:p>
-      <w:pPr>
-        <w:pStyle w:val="Heading4"/>
-      </w:pPr>
-      <w:r>
-        <w:t>Text/</w:t>
-      </w:r>
-      <w:proofErr w:type="spellStart"/>
-      <w:r>
-        <w:t>HiLite</w:t>
-      </w:r>
-      <w:proofErr w:type="spellEnd"/>
-      <w:r>
-        <w:t xml:space="preserve"> Colors</w:t>
-      </w:r>
-    </w:p>
-    <w:p>
-      <w:r>
-        <w:t>This selection allows for choosing the colors of the text and the highlight. The background screen is always black.</w:t>
-      </w:r>
-    </w:p>
-    <w:p>
-      <w:pPr>
-        <w:pStyle w:val="Heading3"/>
-      </w:pPr>
-      <w:r>
         <w:t>+Dial &amp; Button Settings</w:t>
       </w:r>
     </w:p>
@@ -3247,186 +3256,186 @@
         <w:pStyle w:val="Heading3"/>
       </w:pPr>
       <w:r>
+        <w:t>+Battery Settings</w:t>
+      </w:r>
+    </w:p>
+    <w:p>
+      <w:r>
+        <w:t xml:space="preserve">Since the PCB was designed with 10% resistors for measuring the battery voltage some calibration is needed. A future PCB will probably use better </w:t>
+      </w:r>
+      <w:proofErr w:type="gramStart"/>
+      <w:r>
+        <w:t>resistors</w:t>
+      </w:r>
+      <w:proofErr w:type="gramEnd"/>
+      <w:r>
+        <w:t xml:space="preserve"> so this won’t be needed.</w:t>
+      </w:r>
+    </w:p>
+    <w:p>
+      <w:pPr>
+        <w:pStyle w:val="Heading4"/>
+      </w:pPr>
+      <w:r>
+        <w:t xml:space="preserve">Show Battery: </w:t>
+      </w:r>
+      <w:proofErr w:type="spellStart"/>
+      <w:r>
+        <w:t>Yes|No</w:t>
+      </w:r>
+      <w:proofErr w:type="spellEnd"/>
+    </w:p>
+    <w:p>
+      <w:r>
+        <w:t xml:space="preserve">This option controls the </w:t>
+      </w:r>
+      <w:r>
+        <w:t>battery display on the bottom right of the display.</w:t>
+      </w:r>
+    </w:p>
+    <w:p>
+      <w:pPr>
+        <w:pStyle w:val="Heading4"/>
+      </w:pPr>
+      <w:r>
+        <w:t>Full Battery: 2000-4000</w:t>
+      </w:r>
+    </w:p>
+    <w:p>
+      <w:r>
+        <w:t>This is the value that indicates a full 4.2V battery.</w:t>
+      </w:r>
+    </w:p>
+    <w:p>
+      <w:pPr>
+        <w:pStyle w:val="Heading4"/>
+      </w:pPr>
+      <w:r>
+        <w:t>Set Full Battery</w:t>
+      </w:r>
+    </w:p>
+    <w:p>
+      <w:r>
+        <w:t>This selection reads the current battery values and stores it. It is best set by fully charging the battery and then disconnecting the charger. Wait a couple of minutes and then use it several times until it seems stable.</w:t>
+      </w:r>
+    </w:p>
+    <w:p>
+      <w:pPr>
+        <w:pStyle w:val="Heading4"/>
+      </w:pPr>
+      <w:r>
+        <w:t>Read Battery Raw Data</w:t>
+      </w:r>
+    </w:p>
+    <w:p>
+      <w:r>
+        <w:t>This continuously reads the battery value</w:t>
+      </w:r>
+      <w:r>
+        <w:t xml:space="preserve">. It was originally used for testing, but it seems like it might possibly be </w:t>
+      </w:r>
+      <w:proofErr w:type="gramStart"/>
+      <w:r>
+        <w:t>useful</w:t>
+      </w:r>
+      <w:proofErr w:type="gramEnd"/>
+      <w:r>
+        <w:t xml:space="preserve"> so it was left in the menu system.</w:t>
+      </w:r>
+    </w:p>
+    <w:p>
+      <w:pPr>
+        <w:pStyle w:val="Heading3"/>
+      </w:pPr>
+      <w:r>
+        <w:t>New Version BIN File</w:t>
+      </w:r>
+    </w:p>
+    <w:p>
+      <w:r>
+        <w:t xml:space="preserve">New firmware can be loaded by putting </w:t>
+      </w:r>
+      <w:r>
+        <w:t xml:space="preserve">the binary file on the SD card. It must be named </w:t>
+      </w:r>
+      <w:proofErr w:type="spellStart"/>
+      <w:r>
+        <w:t>RadioFox.BIN</w:t>
+      </w:r>
+      <w:proofErr w:type="spellEnd"/>
+      <w:r>
+        <w:t>.</w:t>
+      </w:r>
+      <w:r>
+        <w:t xml:space="preserve"> There are two prompts, one to confirm overwriting the firmware, and another to allow deletion of the </w:t>
+      </w:r>
+      <w:r>
+        <w:t>BIN file after installation.</w:t>
+      </w:r>
+    </w:p>
+    <w:p>
+      <w:pPr>
+        <w:pStyle w:val="Heading3"/>
+      </w:pPr>
+      <w:r>
+        <w:t>Factory Settings</w:t>
+      </w:r>
+    </w:p>
+    <w:p>
+      <w:r>
+        <w:t xml:space="preserve">This command resets </w:t>
+      </w:r>
+      <w:r>
+        <w:t xml:space="preserve">all </w:t>
+      </w:r>
+      <w:r>
+        <w:t>settings</w:t>
+      </w:r>
+      <w:r>
+        <w:t xml:space="preserve"> except the high battery value to the original factory values.</w:t>
+      </w:r>
+    </w:p>
+    <w:p>
+      <w:pPr>
+        <w:pStyle w:val="Heading3"/>
+      </w:pPr>
+      <w:r>
+        <w:t>Format EEPROM</w:t>
+      </w:r>
+    </w:p>
+    <w:p>
+      <w:r>
+        <w:t xml:space="preserve">This will clear </w:t>
+      </w:r>
+      <w:r>
+        <w:t xml:space="preserve">and reset </w:t>
+      </w:r>
+      <w:r>
+        <w:t xml:space="preserve">the </w:t>
+      </w:r>
+      <w:proofErr w:type="spellStart"/>
+      <w:r>
+        <w:t>eeprom</w:t>
+      </w:r>
+      <w:proofErr w:type="spellEnd"/>
+      <w:r>
+        <w:t xml:space="preserve"> where the settings are </w:t>
+      </w:r>
+      <w:proofErr w:type="gramStart"/>
+      <w:r>
+        <w:t>save</w:t>
+      </w:r>
+      <w:proofErr w:type="gramEnd"/>
+      <w:r>
+        <w:t xml:space="preserve"> in non-volatile memory. This is how settings are saved while the system is not powered.</w:t>
+      </w:r>
+    </w:p>
+    <w:p>
+      <w:pPr>
+        <w:pStyle w:val="Heading2"/>
+      </w:pPr>
+      <w:r>
         <w:lastRenderedPageBreak/>
-        <w:t>+Battery Settings</w:t>
-      </w:r>
-    </w:p>
-    <w:p>
-      <w:r>
-        <w:t xml:space="preserve">Since the PCB was designed with 10% resistors for measuring the battery voltage some calibration is needed. A future PCB will probably use better </w:t>
-      </w:r>
-      <w:proofErr w:type="gramStart"/>
-      <w:r>
-        <w:t>resistors</w:t>
-      </w:r>
-      <w:proofErr w:type="gramEnd"/>
-      <w:r>
-        <w:t xml:space="preserve"> so this won’t be needed.</w:t>
-      </w:r>
-    </w:p>
-    <w:p>
-      <w:pPr>
-        <w:pStyle w:val="Heading4"/>
-      </w:pPr>
-      <w:r>
-        <w:t xml:space="preserve">Show Battery: </w:t>
-      </w:r>
-      <w:proofErr w:type="spellStart"/>
-      <w:r>
-        <w:t>Yes|No</w:t>
-      </w:r>
-      <w:proofErr w:type="spellEnd"/>
-    </w:p>
-    <w:p>
-      <w:r>
-        <w:t xml:space="preserve">This option controls the </w:t>
-      </w:r>
-      <w:r>
-        <w:t>battery display on the bottom right of the display.</w:t>
-      </w:r>
-    </w:p>
-    <w:p>
-      <w:pPr>
-        <w:pStyle w:val="Heading4"/>
-      </w:pPr>
-      <w:r>
-        <w:t>Full Battery: 2000-4000</w:t>
-      </w:r>
-    </w:p>
-    <w:p>
-      <w:r>
-        <w:t>This is the value that indicates a full 4.2V battery.</w:t>
-      </w:r>
-    </w:p>
-    <w:p>
-      <w:pPr>
-        <w:pStyle w:val="Heading4"/>
-      </w:pPr>
-      <w:r>
-        <w:t>Set Full Battery</w:t>
-      </w:r>
-    </w:p>
-    <w:p>
-      <w:r>
-        <w:t>This selection reads the current battery values and stores it. It is best set by fully charging the battery and then disconnecting the charger. Wait a couple of minutes and then use it several times until it seems stable.</w:t>
-      </w:r>
-    </w:p>
-    <w:p>
-      <w:pPr>
-        <w:pStyle w:val="Heading4"/>
-      </w:pPr>
-      <w:r>
-        <w:t>Read Battery Raw Data</w:t>
-      </w:r>
-    </w:p>
-    <w:p>
-      <w:r>
-        <w:t>This continuously reads the battery value</w:t>
-      </w:r>
-      <w:r>
-        <w:t xml:space="preserve">. It was originally used for testing, but it seems like it might possibly be </w:t>
-      </w:r>
-      <w:proofErr w:type="gramStart"/>
-      <w:r>
-        <w:t>useful</w:t>
-      </w:r>
-      <w:proofErr w:type="gramEnd"/>
-      <w:r>
-        <w:t xml:space="preserve"> so it was left in the menu system.</w:t>
-      </w:r>
-    </w:p>
-    <w:p>
-      <w:pPr>
-        <w:pStyle w:val="Heading3"/>
-      </w:pPr>
-      <w:r>
-        <w:t>New Version BIN File</w:t>
-      </w:r>
-    </w:p>
-    <w:p>
-      <w:r>
-        <w:t xml:space="preserve">New firmware can be loaded by putting </w:t>
-      </w:r>
-      <w:r>
-        <w:t xml:space="preserve">the binary file on the SD card. It must be named </w:t>
-      </w:r>
-      <w:proofErr w:type="spellStart"/>
-      <w:r>
-        <w:t>RadioFox.BIN</w:t>
-      </w:r>
-      <w:proofErr w:type="spellEnd"/>
-      <w:r>
-        <w:t>.</w:t>
-      </w:r>
-      <w:r>
-        <w:t xml:space="preserve"> There are two prompts, one to confirm overwriting the firmware, and another to allow deletion of the </w:t>
-      </w:r>
-      <w:r>
-        <w:t>BIN file after installation.</w:t>
-      </w:r>
-    </w:p>
-    <w:p>
-      <w:pPr>
-        <w:pStyle w:val="Heading3"/>
-      </w:pPr>
-      <w:r>
-        <w:t>Factory Settings</w:t>
-      </w:r>
-    </w:p>
-    <w:p>
-      <w:r>
-        <w:t xml:space="preserve">This command resets </w:t>
-      </w:r>
-      <w:r>
-        <w:t xml:space="preserve">all </w:t>
-      </w:r>
-      <w:r>
-        <w:t>settings</w:t>
-      </w:r>
-      <w:r>
-        <w:t xml:space="preserve"> except the high battery value to the original factory values.</w:t>
-      </w:r>
-    </w:p>
-    <w:p>
-      <w:pPr>
-        <w:pStyle w:val="Heading3"/>
-      </w:pPr>
-      <w:r>
-        <w:t>Format EEPROM</w:t>
-      </w:r>
-    </w:p>
-    <w:p>
-      <w:r>
-        <w:t xml:space="preserve">This will clear </w:t>
-      </w:r>
-      <w:r>
-        <w:t xml:space="preserve">and reset </w:t>
-      </w:r>
-      <w:r>
-        <w:t xml:space="preserve">the </w:t>
-      </w:r>
-      <w:proofErr w:type="spellStart"/>
-      <w:r>
-        <w:t>eeprom</w:t>
-      </w:r>
-      <w:proofErr w:type="spellEnd"/>
-      <w:r>
-        <w:t xml:space="preserve"> where the settings are </w:t>
-      </w:r>
-      <w:proofErr w:type="gramStart"/>
-      <w:r>
-        <w:t>save</w:t>
-      </w:r>
-      <w:proofErr w:type="gramEnd"/>
-      <w:r>
-        <w:t xml:space="preserve"> in non-volatile memory. This is how settings are saved while the system is not powered.</w:t>
-      </w:r>
-    </w:p>
-    <w:p>
-      <w:pPr>
-        <w:pStyle w:val="Heading2"/>
-      </w:pPr>
-      <w:r>
         <w:t>Save Current Settings</w:t>
       </w:r>
     </w:p>
@@ -3505,6 +3514,7 @@
         <w:docPartUnique/>
       </w:docPartObj>
     </w:sdtPr>
+    <w:sdtEndPr/>
     <w:sdtContent>
       <w:sdt>
         <w:sdtPr>
@@ -3514,6 +3524,7 @@
             <w:docPartUnique/>
           </w:docPartObj>
         </w:sdtPr>
+        <w:sdtEndPr/>
         <w:sdtContent>
           <w:p>
             <w:pPr>

</xml_diff>

<commit_message>
Made TX red dot larger. Show DTMF characters in green on the bottom. (not tested yet)
</commit_message>
<xml_diff>
--- a/RadioFox.docx
+++ b/RadioFox.docx
@@ -53,15 +53,7 @@
         <w:t>amateur</w:t>
       </w:r>
       <w:r>
-        <w:t xml:space="preserve"> radio enthusiasts (AKA Hams) that is </w:t>
-      </w:r>
-      <w:proofErr w:type="gramStart"/>
-      <w:r>
-        <w:t>know</w:t>
-      </w:r>
-      <w:proofErr w:type="gramEnd"/>
-      <w:r>
-        <w:t xml:space="preserve"> as fox hunting or sometimes as bunny hunting. It is played by hiding a transmitter that transmits periodically and then silent until it is time to transmit again. This cycle repeats. Teams use radio receivers with directional antennas to find the transmitter.</w:t>
+        <w:t xml:space="preserve"> radio enthusiasts (AKA Hams) that is know as fox hunting or sometimes as bunny hunting. It is played by hiding a transmitter that transmits periodically and then silent until it is time to transmit again. This cycle repeats. Teams use radio receivers with directional antennas to find the transmitter.</w:t>
       </w:r>
       <w:r>
         <w:t xml:space="preserve"> The technique is called triangulation. The first team to find the transmitter wins.</w:t>
@@ -211,41 +203,59 @@
         <w:t xml:space="preserve"> actual versions will be listed here</w:t>
       </w:r>
       <w:r>
+        <w:t xml:space="preserve"> if and when the source code is released.</w:t>
+      </w:r>
+    </w:p>
+    <w:p>
+      <w:r>
+        <w:t xml:space="preserve">This is the software version </w:t>
+      </w:r>
+      <w:r>
+        <w:t xml:space="preserve">of the </w:t>
+      </w:r>
+      <w:r>
+        <w:t xml:space="preserve">custom </w:t>
+      </w:r>
+      <w:r>
+        <w:t>code</w:t>
+      </w:r>
+      <w:r>
+        <w:t>.</w:t>
+      </w:r>
+      <w:r>
         <w:t xml:space="preserve"> </w:t>
       </w:r>
-      <w:proofErr w:type="gramStart"/>
-      <w:r>
-        <w:t>if and when</w:t>
-      </w:r>
-      <w:proofErr w:type="gramEnd"/>
-      <w:r>
-        <w:t xml:space="preserve"> the source code is released.</w:t>
-      </w:r>
-    </w:p>
-    <w:p>
-      <w:r>
-        <w:t xml:space="preserve">This is the software version </w:t>
-      </w:r>
-      <w:r>
-        <w:t xml:space="preserve">of the </w:t>
-      </w:r>
-      <w:r>
-        <w:t xml:space="preserve">custom </w:t>
-      </w:r>
-      <w:r>
-        <w:t>code</w:t>
+      <w:r>
+        <w:t>C</w:t>
+      </w:r>
+      <w:r>
+        <w:t>hanges are described below.</w:t>
+      </w:r>
+    </w:p>
+    <w:p>
+      <w:r>
+        <w:t>Version 1.01</w:t>
+      </w:r>
+    </w:p>
+    <w:p>
+      <w:pPr>
+        <w:pStyle w:val="ListParagraph"/>
+        <w:numPr>
+          <w:ilvl w:val="0"/>
+          <w:numId w:val="91"/>
+        </w:numPr>
+      </w:pPr>
+      <w:r>
+        <w:t>Made TX red dot larger.</w:t>
+      </w:r>
+      <w:r>
+        <w:t xml:space="preserve"> </w:t>
+      </w:r>
+      <w:r>
+        <w:t>Show DTMF characters in green on the bottom. (not tested yet)</w:t>
       </w:r>
       <w:r>
         <w:t>.</w:t>
-      </w:r>
-      <w:r>
-        <w:t xml:space="preserve"> </w:t>
-      </w:r>
-      <w:r>
-        <w:t>C</w:t>
-      </w:r>
-      <w:r>
-        <w:t>hanges are described below.</w:t>
       </w:r>
     </w:p>
     <w:p>
@@ -265,13 +275,12 @@
         </w:numPr>
       </w:pPr>
       <w:r>
+        <w:lastRenderedPageBreak/>
         <w:t xml:space="preserve">This is </w:t>
       </w:r>
-      <w:proofErr w:type="gramStart"/>
       <w:r>
         <w:t>initial</w:t>
       </w:r>
-      <w:proofErr w:type="gramEnd"/>
       <w:r>
         <w:t xml:space="preserve"> version when this document was first created. The software is considered mostly complete.</w:t>
       </w:r>
@@ -289,181 +298,140 @@
       <w:bookmarkEnd w:id="4"/>
       <w:bookmarkEnd w:id="5"/>
       <w:r>
+        <w:t>The Hardware</w:t>
+      </w:r>
+    </w:p>
+    <w:p>
+      <w:pPr>
+        <w:pStyle w:val="Heading2"/>
+      </w:pPr>
+      <w:r>
+        <w:t>PCB</w:t>
+      </w:r>
+    </w:p>
+    <w:p>
+      <w:r>
+        <w:t>Th</w:t>
+      </w:r>
+      <w:r>
+        <w:t xml:space="preserve">e Fox is a single PCB that includes an 18650 battery holder that can have </w:t>
+      </w:r>
+      <w:r>
+        <w:t>1 or 2 batteries. There is a USB C connector on the left edge that is used for charging the batteries.</w:t>
+      </w:r>
+      <w:r>
+        <w:t xml:space="preserve"> Above that is a micro-SD slot. The SD card holds tone files</w:t>
+      </w:r>
+      <w:r>
+        <w:t>, and saved settings files. It can also be used to load new firmware onto the TTGO chip.</w:t>
+      </w:r>
+      <w:r>
+        <w:t xml:space="preserve"> There is also a USB C connector on the TTGO. It can be used for downloading</w:t>
+      </w:r>
+      <w:r>
+        <w:t xml:space="preserve"> firmware or debugging operations. It may also be used for serial communications in a future firmware release.</w:t>
+      </w:r>
+      <w:r>
+        <w:t xml:space="preserve"> It is not used for charging the batteries.</w:t>
+      </w:r>
+    </w:p>
+    <w:p/>
+    <w:p>
+      <w:pPr>
+        <w:pStyle w:val="Heading2"/>
+      </w:pPr>
+      <w:r>
+        <w:t>Radio</w:t>
+      </w:r>
+    </w:p>
+    <w:p>
+      <w:r>
+        <w:t>The radio functions are handled by the SA818-</w:t>
+      </w:r>
+      <w:r>
+        <w:t>V on the top right. There are vents in the case to allow cooling as this module can become quite hot when transmitting at high power for longer timer intervals. Transmitting longer than one minute is not recommended.</w:t>
+      </w:r>
+      <w:r>
+        <w:t xml:space="preserve"> High power is about 5W and low power</w:t>
+      </w:r>
+      <w:r>
+        <w:t xml:space="preserve"> is about 3W. Make sure a suitable antenna is connected to avoid damage to the radio circuit.</w:t>
+      </w:r>
+    </w:p>
+    <w:p/>
+    <w:p>
+      <w:pPr>
+        <w:pStyle w:val="Heading2"/>
+      </w:pPr>
+      <w:r>
+        <w:t>Batteries</w:t>
+      </w:r>
+    </w:p>
+    <w:p>
+      <w:r>
+        <w:t xml:space="preserve">The 18650 </w:t>
+      </w:r>
+      <w:r>
+        <w:t>batteries must button top style and protection is recommended</w:t>
+      </w:r>
+      <w:r>
+        <w:t xml:space="preserve">. The 18650 battery length is a very loose standard and some batteries may not fit. Too long and they can’t be used. Too short, it might be possible to bend the </w:t>
+      </w:r>
+      <w:r>
+        <w:t>contacts on the battery holder negative side. The battery holder is polarized to prevent insertion in the wrong direction.</w:t>
+      </w:r>
+      <w:r>
+        <w:t xml:space="preserve"> Do not defeat the feature or magic blue smoke may appear from the PCB!</w:t>
+      </w:r>
+    </w:p>
+    <w:p>
+      <w:pPr>
+        <w:pStyle w:val="Heading1"/>
+      </w:pPr>
+      <w:r>
+        <w:t>Run Time</w:t>
+      </w:r>
+    </w:p>
+    <w:p>
+      <w:r>
+        <w:t xml:space="preserve">The actual runtime depends on the transmitting time and </w:t>
+      </w:r>
+      <w:r>
+        <w:t>quality of the batteries. There are many deceptively labelled 18650 batteries available. The best one are made by Panasonic and Sanyo</w:t>
+      </w:r>
+      <w:r>
+        <w:t>. Using 1 minute transmit, 4 minutes pause, low power setting</w:t>
+      </w:r>
+      <w:r>
+        <w:t xml:space="preserve">, and display dimming the </w:t>
+      </w:r>
+      <w:r>
+        <w:t xml:space="preserve">Fox Radio </w:t>
+      </w:r>
+      <w:r>
+        <w:t>ran for 12 hours using Panasonic batteries.</w:t>
+      </w:r>
+    </w:p>
+    <w:p>
+      <w:pPr>
+        <w:pStyle w:val="Heading1"/>
+      </w:pPr>
+      <w:r>
         <w:lastRenderedPageBreak/>
-        <w:t>The Hardware</w:t>
-      </w:r>
-    </w:p>
-    <w:p>
-      <w:pPr>
-        <w:pStyle w:val="Heading2"/>
-      </w:pPr>
-      <w:r>
-        <w:t>PCB</w:t>
-      </w:r>
-    </w:p>
-    <w:p>
-      <w:r>
-        <w:t>Th</w:t>
-      </w:r>
-      <w:r>
-        <w:t xml:space="preserve">e Fox is a single PCB that includes an </w:t>
-      </w:r>
-      <w:proofErr w:type="gramStart"/>
-      <w:r>
-        <w:t>18650 battery</w:t>
-      </w:r>
-      <w:proofErr w:type="gramEnd"/>
-      <w:r>
-        <w:t xml:space="preserve"> holder that can have </w:t>
-      </w:r>
-      <w:r>
-        <w:t>1 or 2 batteries. There is a USB C connector on the left edge that is used for charging the batteries.</w:t>
-      </w:r>
-      <w:r>
-        <w:t xml:space="preserve"> Above that is a micro-SD slot. The SD card holds tone files</w:t>
-      </w:r>
-      <w:r>
-        <w:t>, and saved settings files. It can also be used to load new firmware onto the TTGO chip.</w:t>
-      </w:r>
-      <w:r>
-        <w:t xml:space="preserve"> There is also a USB C connector on the TTGO. It can be used for downloading</w:t>
-      </w:r>
-      <w:r>
-        <w:t xml:space="preserve"> firmware or debugging operations. It may also be used for serial communications in a future firmware release.</w:t>
-      </w:r>
-      <w:r>
-        <w:t xml:space="preserve"> It is not used for charging the batteries.</w:t>
+        <w:t>Tone Files</w:t>
+      </w:r>
+    </w:p>
+    <w:p>
+      <w:r>
+        <w:t xml:space="preserve">The </w:t>
+      </w:r>
+      <w:r>
+        <w:t>tone files are used to play “music” during transmissions. This can be used to identify the Fox, or just to annoy people!</w:t>
       </w:r>
     </w:p>
     <w:p/>
     <w:p>
-      <w:pPr>
-        <w:pStyle w:val="Heading2"/>
-      </w:pPr>
-      <w:r>
-        <w:t>Radio</w:t>
-      </w:r>
-    </w:p>
-    <w:p>
-      <w:r>
-        <w:t>The radio functions are handled by the SA818-</w:t>
-      </w:r>
-      <w:r>
-        <w:t>V on the top right. There are vents in the case to allow cooling as this module can become quite hot when transmitting at high power for longer timer intervals. Transmitting longer than one minute is not recommended.</w:t>
-      </w:r>
-      <w:r>
-        <w:t xml:space="preserve"> High power is about </w:t>
-      </w:r>
-      <w:proofErr w:type="gramStart"/>
-      <w:r>
-        <w:t>5W</w:t>
-      </w:r>
-      <w:proofErr w:type="gramEnd"/>
-      <w:r>
-        <w:t xml:space="preserve"> and low power</w:t>
-      </w:r>
-      <w:r>
-        <w:t xml:space="preserve"> is about 3W. Make sure a suitable antenna is connected to avoid damage to the radio circuit.</w:t>
-      </w:r>
-    </w:p>
-    <w:p/>
-    <w:p>
-      <w:pPr>
-        <w:pStyle w:val="Heading2"/>
-      </w:pPr>
-      <w:r>
-        <w:t>Batteries</w:t>
-      </w:r>
-    </w:p>
-    <w:p>
-      <w:r>
-        <w:t xml:space="preserve">The 18650 </w:t>
-      </w:r>
-      <w:r>
-        <w:t>batteries must button top style and protection is recommended</w:t>
-      </w:r>
-      <w:r>
-        <w:t xml:space="preserve">. The </w:t>
-      </w:r>
-      <w:proofErr w:type="gramStart"/>
-      <w:r>
-        <w:t>18650 battery</w:t>
-      </w:r>
-      <w:proofErr w:type="gramEnd"/>
-      <w:r>
-        <w:t xml:space="preserve"> length is a very loose standard and some batteries may not fit. Too long and they can’t be used. Too short, it might be possible to bend the </w:t>
-      </w:r>
-      <w:r>
-        <w:t>contacts on the battery holder negative side. The battery holder is polarized to prevent insertion in the wrong direction.</w:t>
-      </w:r>
-      <w:r>
-        <w:t xml:space="preserve"> Do not defeat the feature or magic blue smoke may appear from the PCB!</w:t>
-      </w:r>
-    </w:p>
-    <w:p>
-      <w:pPr>
-        <w:pStyle w:val="Heading1"/>
-      </w:pPr>
-      <w:r>
-        <w:t>Run Time</w:t>
-      </w:r>
-    </w:p>
-    <w:p>
-      <w:r>
-        <w:t xml:space="preserve">The actual runtime depends on the transmitting time and </w:t>
-      </w:r>
-      <w:r>
-        <w:t xml:space="preserve">quality of the batteries. There are many deceptively labelled 18650 batteries available. The best </w:t>
-      </w:r>
-      <w:proofErr w:type="gramStart"/>
-      <w:r>
-        <w:t>one</w:t>
-      </w:r>
-      <w:proofErr w:type="gramEnd"/>
-      <w:r>
-        <w:t xml:space="preserve"> </w:t>
-      </w:r>
-      <w:proofErr w:type="gramStart"/>
-      <w:r>
-        <w:t>are</w:t>
-      </w:r>
-      <w:proofErr w:type="gramEnd"/>
-      <w:r>
-        <w:t xml:space="preserve"> made by Panasonic and Sanyo</w:t>
-      </w:r>
-      <w:r>
-        <w:t>. Using 1 minute transmit, 4 minutes pause, low power setting</w:t>
-      </w:r>
-      <w:r>
-        <w:t xml:space="preserve">, and display dimming the </w:t>
-      </w:r>
-      <w:r>
-        <w:t xml:space="preserve">Fox Radio </w:t>
-      </w:r>
-      <w:r>
-        <w:t>ran for 12 hours using Panasonic batteries.</w:t>
-      </w:r>
-    </w:p>
-    <w:p>
-      <w:pPr>
-        <w:pStyle w:val="Heading1"/>
-      </w:pPr>
-      <w:r>
-        <w:t>Tone Files</w:t>
-      </w:r>
-    </w:p>
-    <w:p>
-      <w:r>
-        <w:t xml:space="preserve">The </w:t>
-      </w:r>
-      <w:r>
-        <w:t>tone files are used to play “music” during transmissions. This can be used to identify the Fox, or just to annoy people!</w:t>
-      </w:r>
-    </w:p>
-    <w:p/>
-    <w:p>
-      <w:r>
-        <w:lastRenderedPageBreak/>
+      <w:r>
         <w:t xml:space="preserve">The files are saved as .TXT and simply contain a list of tones to be played. The format </w:t>
       </w:r>
       <w:r>
@@ -553,17 +521,8 @@
           <w:b/>
           <w:bCs/>
         </w:rPr>
-        <w:t xml:space="preserve">This is the Tetris theme </w:t>
-      </w:r>
-      <w:proofErr w:type="gramStart"/>
-      <w:r>
-        <w:rPr>
-          <w:b/>
-          <w:bCs/>
-        </w:rPr>
-        <w:t>music</w:t>
-      </w:r>
-      <w:proofErr w:type="gramEnd"/>
+        <w:t>This is the Tetris theme music</w:t>
+      </w:r>
     </w:p>
     <w:p>
       <w:pPr>
@@ -607,17 +566,8 @@
           <w:b/>
           <w:bCs/>
         </w:rPr>
-        <w:t xml:space="preserve">and that the data starts with the tilde which must not be in these </w:t>
-      </w:r>
-      <w:proofErr w:type="gramStart"/>
-      <w:r>
-        <w:rPr>
-          <w:b/>
-          <w:bCs/>
-        </w:rPr>
-        <w:t>comments</w:t>
-      </w:r>
-      <w:proofErr w:type="gramEnd"/>
+        <w:t>and that the data starts with the tilde which must not be in these comments</w:t>
+      </w:r>
     </w:p>
     <w:p>
       <w:pPr>
@@ -647,41 +597,23 @@
           <w:b/>
           <w:bCs/>
         </w:rPr>
-        <w:t xml:space="preserve"> can be used to set the length of the note, it defaults to 90% and 10% quiet after the </w:t>
-      </w:r>
-      <w:proofErr w:type="gramStart"/>
-      <w:r>
+        <w:t xml:space="preserve"> can be used to set the length of the note, it defaults to 90% and 10% quiet after the note</w:t>
+      </w:r>
+    </w:p>
+    <w:p>
+      <w:pPr>
         <w:rPr>
           <w:b/>
           <w:bCs/>
         </w:rPr>
-        <w:t>note</w:t>
-      </w:r>
-      <w:proofErr w:type="gramEnd"/>
-    </w:p>
-    <w:p>
-      <w:pPr>
+      </w:pPr>
+      <w:r>
         <w:rPr>
           <w:b/>
           <w:bCs/>
         </w:rPr>
-      </w:pPr>
-      <w:r>
-        <w:rPr>
-          <w:b/>
-          <w:bCs/>
-        </w:rPr>
-        <w:t xml:space="preserve">This can be used for pizzicato notes, LENGTH, 25, for </w:t>
-      </w:r>
-      <w:proofErr w:type="gramStart"/>
-      <w:r>
-        <w:rPr>
-          <w:b/>
-          <w:bCs/>
-        </w:rPr>
-        <w:t>example</w:t>
-      </w:r>
-      <w:proofErr w:type="gramEnd"/>
+        <w:t>This can be used for pizzicato notes, LENGTH, 25, for example</w:t>
+      </w:r>
     </w:p>
     <w:p>
       <w:pPr>
@@ -740,23 +672,22 @@
           <w:b/>
           <w:bCs/>
         </w:rPr>
-        <w:t xml:space="preserve">NOTE_E5, </w:t>
-      </w:r>
-      <w:proofErr w:type="gramStart"/>
-      <w:r>
+        <w:t>NOTE_E5, 4,  NOTE_B4, 8,  NOTE_C5, 8,  NOTE_D5, 4,  NOTE_C5, 8,  NOTE_B4, 8,</w:t>
+      </w:r>
+    </w:p>
+    <w:p>
+      <w:pPr>
         <w:rPr>
           <w:b/>
           <w:bCs/>
         </w:rPr>
-        <w:t>4,  NOTE</w:t>
-      </w:r>
-      <w:proofErr w:type="gramEnd"/>
+      </w:pPr>
       <w:r>
         <w:rPr>
           <w:b/>
           <w:bCs/>
         </w:rPr>
-        <w:t>_B4, 8,  NOTE_C5, 8,  NOTE_D5, 4,  NOTE_C5, 8,  NOTE_B4, 8,</w:t>
+        <w:t>NOTE_A4, 4,  NOTE_A4, 8,  NOTE_C5, 8,  NOTE_E5, 4,  NOTE_D5, 8,  NOTE_C5, 8,</w:t>
       </w:r>
     </w:p>
     <w:p>
@@ -771,23 +702,22 @@
           <w:b/>
           <w:bCs/>
         </w:rPr>
-        <w:t xml:space="preserve">NOTE_A4, </w:t>
-      </w:r>
-      <w:proofErr w:type="gramStart"/>
-      <w:r>
+        <w:t>NOTE_B4, -4, NOTE_C5, 8,  NOTE_D5, 4,  NOTE_E5, 4,</w:t>
+      </w:r>
+    </w:p>
+    <w:p>
+      <w:pPr>
         <w:rPr>
           <w:b/>
           <w:bCs/>
         </w:rPr>
-        <w:t>4,  NOTE</w:t>
-      </w:r>
-      <w:proofErr w:type="gramEnd"/>
+      </w:pPr>
       <w:r>
         <w:rPr>
           <w:b/>
           <w:bCs/>
         </w:rPr>
-        <w:t>_A4, 8,  NOTE_C5, 8,  NOTE_E5, 4,  NOTE_D5, 8,  NOTE_C5, 8,</w:t>
+        <w:t>NOTE_C5, 4,  NOTE_A4, 4,  NOTE_A4, 8,  NOTE_A4, 4,  NOTE_B4, 8,  NOTE_C5, 8,</w:t>
       </w:r>
     </w:p>
     <w:p>
@@ -802,23 +732,22 @@
           <w:b/>
           <w:bCs/>
         </w:rPr>
-        <w:t xml:space="preserve">NOTE_B4, -4, NOTE_C5, </w:t>
-      </w:r>
-      <w:proofErr w:type="gramStart"/>
-      <w:r>
+        <w:t>NOTE_D5, -4, NOTE_F5, 8,  NOTE_A5, 4,  NOTE_G5, 8,  NOTE_F5, 8,</w:t>
+      </w:r>
+    </w:p>
+    <w:p>
+      <w:pPr>
         <w:rPr>
           <w:b/>
           <w:bCs/>
         </w:rPr>
-        <w:t>8,  NOTE</w:t>
-      </w:r>
-      <w:proofErr w:type="gramEnd"/>
+      </w:pPr>
       <w:r>
         <w:rPr>
           <w:b/>
           <w:bCs/>
         </w:rPr>
-        <w:t>_D5, 4,  NOTE_E5, 4,</w:t>
+        <w:t>NOTE_E5, -4, NOTE_C5, 8,  NOTE_E5, 4,  NOTE_D5, 8,  NOTE_C5, 8,</w:t>
       </w:r>
     </w:p>
     <w:p>
@@ -833,147 +762,22 @@
           <w:b/>
           <w:bCs/>
         </w:rPr>
-        <w:t xml:space="preserve">NOTE_C5, </w:t>
-      </w:r>
-      <w:proofErr w:type="gramStart"/>
-      <w:r>
+        <w:t>NOTE_B4, 4,  NOTE_B4, 8,  NOTE_C5, 8,  NOTE_D5, 4,  NOTE_E5, 4,</w:t>
+      </w:r>
+    </w:p>
+    <w:p>
+      <w:pPr>
         <w:rPr>
           <w:b/>
           <w:bCs/>
         </w:rPr>
-        <w:t>4,  NOTE</w:t>
-      </w:r>
-      <w:proofErr w:type="gramEnd"/>
+      </w:pPr>
       <w:r>
         <w:rPr>
           <w:b/>
           <w:bCs/>
         </w:rPr>
-        <w:t>_A4, 4,  NOTE_A4, 8,  NOTE_A4, 4,  NOTE_B4, 8,  NOTE_C5, 8,</w:t>
-      </w:r>
-    </w:p>
-    <w:p>
-      <w:pPr>
-        <w:rPr>
-          <w:b/>
-          <w:bCs/>
-        </w:rPr>
-      </w:pPr>
-      <w:r>
-        <w:rPr>
-          <w:b/>
-          <w:bCs/>
-        </w:rPr>
-        <w:t xml:space="preserve">NOTE_D5, -4, NOTE_F5, </w:t>
-      </w:r>
-      <w:proofErr w:type="gramStart"/>
-      <w:r>
-        <w:rPr>
-          <w:b/>
-          <w:bCs/>
-        </w:rPr>
-        <w:t>8,  NOTE</w:t>
-      </w:r>
-      <w:proofErr w:type="gramEnd"/>
-      <w:r>
-        <w:rPr>
-          <w:b/>
-          <w:bCs/>
-        </w:rPr>
-        <w:t>_A5, 4,  NOTE_G5, 8,  NOTE_F5, 8,</w:t>
-      </w:r>
-    </w:p>
-    <w:p>
-      <w:pPr>
-        <w:rPr>
-          <w:b/>
-          <w:bCs/>
-        </w:rPr>
-      </w:pPr>
-      <w:r>
-        <w:rPr>
-          <w:b/>
-          <w:bCs/>
-        </w:rPr>
-        <w:t xml:space="preserve">NOTE_E5, -4, NOTE_C5, </w:t>
-      </w:r>
-      <w:proofErr w:type="gramStart"/>
-      <w:r>
-        <w:rPr>
-          <w:b/>
-          <w:bCs/>
-        </w:rPr>
-        <w:t>8,  NOTE</w:t>
-      </w:r>
-      <w:proofErr w:type="gramEnd"/>
-      <w:r>
-        <w:rPr>
-          <w:b/>
-          <w:bCs/>
-        </w:rPr>
-        <w:t>_E5, 4,  NOTE_D5, 8,  NOTE_C5, 8,</w:t>
-      </w:r>
-    </w:p>
-    <w:p>
-      <w:pPr>
-        <w:rPr>
-          <w:b/>
-          <w:bCs/>
-        </w:rPr>
-      </w:pPr>
-      <w:r>
-        <w:rPr>
-          <w:b/>
-          <w:bCs/>
-        </w:rPr>
-        <w:t xml:space="preserve">NOTE_B4, </w:t>
-      </w:r>
-      <w:proofErr w:type="gramStart"/>
-      <w:r>
-        <w:rPr>
-          <w:b/>
-          <w:bCs/>
-        </w:rPr>
-        <w:t>4,  NOTE</w:t>
-      </w:r>
-      <w:proofErr w:type="gramEnd"/>
-      <w:r>
-        <w:rPr>
-          <w:b/>
-          <w:bCs/>
-        </w:rPr>
-        <w:t>_B4, 8,  NOTE_C5, 8,  NOTE_D5, 4,  NOTE_E5, 4,</w:t>
-      </w:r>
-    </w:p>
-    <w:p>
-      <w:pPr>
-        <w:rPr>
-          <w:b/>
-          <w:bCs/>
-        </w:rPr>
-      </w:pPr>
-      <w:r>
-        <w:rPr>
-          <w:b/>
-          <w:bCs/>
-        </w:rPr>
-        <w:t xml:space="preserve">NOTE_C5, </w:t>
-      </w:r>
-      <w:proofErr w:type="gramStart"/>
-      <w:r>
-        <w:rPr>
-          <w:b/>
-          <w:bCs/>
-        </w:rPr>
-        <w:t>4,  NOTE</w:t>
-      </w:r>
-      <w:proofErr w:type="gramEnd"/>
-      <w:r>
-        <w:rPr>
-          <w:b/>
-          <w:bCs/>
-        </w:rPr>
-        <w:t>_A4, 4,  NOTE_A4, 4, REST, 4,</w:t>
+        <w:t>NOTE_C5, 4,  NOTE_A4, 4,  NOTE_A4, 4, REST, 4,</w:t>
       </w:r>
     </w:p>
     <w:p>
@@ -1007,15 +811,7 @@
         <w:t xml:space="preserve"> that will attempt to load this file</w:t>
       </w:r>
       <w:r>
-        <w:t xml:space="preserve">. Confirmation will be required from the dial, </w:t>
-      </w:r>
-      <w:proofErr w:type="gramStart"/>
-      <w:r>
-        <w:t>After</w:t>
-      </w:r>
-      <w:proofErr w:type="gramEnd"/>
-      <w:r>
-        <w:t xml:space="preserve"> loading the BIN file can optionally be erased.</w:t>
+        <w:t>. Confirmation will be required from the dial, After loading the BIN file can optionally be erased.</w:t>
       </w:r>
     </w:p>
     <w:p>
@@ -1043,7 +839,11 @@
         <w:t>the menu system</w:t>
       </w:r>
       <w:r>
-        <w:t xml:space="preserve"> and is done by holding the button down for about a ½ second or longer. This long press time is also adjustable if a longer or shorter time is preferred. The system has two modes of operation. After booting the display shows the </w:t>
+        <w:t xml:space="preserve"> and is done by holding the button down for about a ½ second or longer. This long press time is also adjustable </w:t>
+      </w:r>
+      <w:r>
+        <w:lastRenderedPageBreak/>
+        <w:t xml:space="preserve">if a longer or shorter time is preferred. The system has two modes of operation. After booting the display shows the </w:t>
       </w:r>
       <w:r>
         <w:t xml:space="preserve">radio status and some important </w:t>
@@ -1097,11 +897,7 @@
         <w:t>radio</w:t>
       </w:r>
       <w:r>
-        <w:t xml:space="preserve"> mode. </w:t>
-      </w:r>
-      <w:r>
-        <w:lastRenderedPageBreak/>
-        <w:t xml:space="preserve">Each menu except the main menu has </w:t>
+        <w:t xml:space="preserve"> mode. Each menu except the main menu has </w:t>
       </w:r>
       <w:r>
         <w:t>two entries, the first and the last, which will</w:t>
@@ -1176,14 +972,12 @@
       <w:r>
         <w:t xml:space="preserve"> The top one is called </w:t>
       </w:r>
-      <w:proofErr w:type="gramStart"/>
       <w:r>
         <w:t>B</w:t>
       </w:r>
       <w:r>
         <w:t>0</w:t>
       </w:r>
-      <w:proofErr w:type="gramEnd"/>
       <w:r>
         <w:t xml:space="preserve"> and the bottom one is called </w:t>
       </w:r>
@@ -1581,21 +1375,7 @@
         <w:rPr>
           <w:lang w:val="en-US"/>
         </w:rPr>
-        <w:t xml:space="preserve">. After a dial </w:t>
-      </w:r>
-      <w:proofErr w:type="gramStart"/>
-      <w:r>
-        <w:rPr>
-          <w:lang w:val="en-US"/>
-        </w:rPr>
-        <w:t>click</w:t>
-      </w:r>
-      <w:proofErr w:type="gramEnd"/>
-      <w:r>
-        <w:rPr>
-          <w:lang w:val="en-US"/>
-        </w:rPr>
-        <w:t xml:space="preserve"> the increment will change to 10 and dial will add and subtract </w:t>
+        <w:t xml:space="preserve">. After a dial click the increment will change to 10 and dial will add and subtract </w:t>
       </w:r>
       <w:r>
         <w:rPr>
@@ -1728,7 +1508,11 @@
         <w:t xml:space="preserve"> values toggle with each click.</w:t>
       </w:r>
       <w:r>
-        <w:t xml:space="preserve"> Multiple selections cycle through all the available options.</w:t>
+        <w:t xml:space="preserve"> Multiple selections cycle through all the available </w:t>
+      </w:r>
+      <w:r>
+        <w:lastRenderedPageBreak/>
+        <w:t>options.</w:t>
       </w:r>
       <w:r>
         <w:t xml:space="preserve"> Integer values go to another screen that shows the minimum and maximum values. Rotating the dial right increases the value while rotating to the left decreases it by the increment amount. The increment amount can be changed by clicking the button which will cycle between different values. One of the values will be a reset to the original value, activated with a long press. A long press is also used to accept the new value and return to the menu. A * </w:t>
@@ -1737,22 +1521,13 @@
         <w:t xml:space="preserve">or highlight </w:t>
       </w:r>
       <w:r>
-        <w:lastRenderedPageBreak/>
         <w:t xml:space="preserve">indicates the active menu line. A + in front of the menu means another menu will be activated. </w:t>
       </w:r>
       <w:r>
-        <w:t>Any menu item starting with ‘</w:t>
-      </w:r>
-      <w:proofErr w:type="gramStart"/>
-      <w:r>
-        <w:t>-‘</w:t>
-      </w:r>
-      <w:r>
-        <w:t xml:space="preserve"> goes</w:t>
-      </w:r>
-      <w:proofErr w:type="gramEnd"/>
-      <w:r>
-        <w:t xml:space="preserve"> back to the previous menu when clicked. A</w:t>
+        <w:t>Any menu item starting with ‘-‘</w:t>
+      </w:r>
+      <w:r>
+        <w:t xml:space="preserve"> goes back to the previous menu when clicked. A</w:t>
       </w:r>
       <w:r>
         <w:t xml:space="preserve"> dial</w:t>
@@ -1800,15 +1575,7 @@
         <w:ind w:left="1440"/>
       </w:pPr>
       <w:r>
-        <w:t xml:space="preserve">Select </w:t>
-      </w:r>
-      <w:proofErr w:type="gramStart"/>
-      <w:r>
-        <w:t>menu</w:t>
-      </w:r>
-      <w:proofErr w:type="gramEnd"/>
-      <w:r>
-        <w:t xml:space="preserve"> </w:t>
+        <w:t xml:space="preserve">Select menu </w:t>
       </w:r>
     </w:p>
     <w:p>
@@ -1822,13 +1589,8 @@
         <w:t xml:space="preserve"> or list</w:t>
       </w:r>
       <w:r>
-        <w:t xml:space="preserve"> </w:t>
-      </w:r>
-      <w:proofErr w:type="gramStart"/>
-      <w:r>
-        <w:t>values</w:t>
-      </w:r>
-      <w:proofErr w:type="gramEnd"/>
+        <w:t xml:space="preserve"> values</w:t>
+      </w:r>
     </w:p>
     <w:p>
       <w:pPr>
@@ -1851,13 +1613,8 @@
         <w:ind w:left="1440"/>
       </w:pPr>
       <w:r>
-        <w:t xml:space="preserve">Open menu system, goes to the remembered menu </w:t>
-      </w:r>
-      <w:proofErr w:type="gramStart"/>
-      <w:r>
-        <w:t>point</w:t>
-      </w:r>
-      <w:proofErr w:type="gramEnd"/>
+        <w:t>Open menu system, goes to the remembered menu point</w:t>
+      </w:r>
     </w:p>
     <w:p>
       <w:pPr>
@@ -1870,39 +1627,24 @@
         <w:t>radio</w:t>
       </w:r>
       <w:r>
-        <w:t xml:space="preserve"> mode, the current menu point is </w:t>
-      </w:r>
-      <w:proofErr w:type="gramStart"/>
-      <w:r>
-        <w:t>remembered</w:t>
-      </w:r>
-      <w:proofErr w:type="gramEnd"/>
+        <w:t xml:space="preserve"> mode, the current menu point is remembered</w:t>
+      </w:r>
     </w:p>
     <w:p>
       <w:pPr>
         <w:ind w:left="1440"/>
       </w:pPr>
       <w:r>
-        <w:t xml:space="preserve">Accept </w:t>
-      </w:r>
-      <w:proofErr w:type="gramStart"/>
-      <w:r>
-        <w:t>integer</w:t>
-      </w:r>
-      <w:proofErr w:type="gramEnd"/>
+        <w:t>Accept integer</w:t>
+      </w:r>
     </w:p>
     <w:p>
       <w:pPr>
         <w:ind w:left="1440"/>
       </w:pPr>
       <w:r>
-        <w:t xml:space="preserve">Choose </w:t>
-      </w:r>
-      <w:proofErr w:type="gramStart"/>
-      <w:r>
-        <w:t>filenames</w:t>
-      </w:r>
-      <w:proofErr w:type="gramEnd"/>
+        <w:t>Choose filenames</w:t>
+      </w:r>
     </w:p>
     <w:p>
       <w:pPr>
@@ -1917,13 +1659,8 @@
         <w:ind w:left="1440"/>
       </w:pPr>
       <w:r>
-        <w:t xml:space="preserve">Select menu item, including return to previous </w:t>
-      </w:r>
-      <w:proofErr w:type="gramStart"/>
-      <w:r>
-        <w:t>menu</w:t>
-      </w:r>
-      <w:proofErr w:type="gramEnd"/>
+        <w:t>Select menu item, including return to previous menu</w:t>
+      </w:r>
     </w:p>
     <w:p>
       <w:pPr>
@@ -1933,12 +1670,10 @@
         <w:t xml:space="preserve">Toggle </w:t>
       </w:r>
       <w:proofErr w:type="spellStart"/>
-      <w:proofErr w:type="gramStart"/>
       <w:r>
         <w:t>booleans</w:t>
       </w:r>
       <w:proofErr w:type="spellEnd"/>
-      <w:proofErr w:type="gramEnd"/>
     </w:p>
     <w:p>
       <w:pPr>
@@ -1948,29 +1683,22 @@
         <w:t>Cycle</w:t>
       </w:r>
       <w:r>
-        <w:t xml:space="preserve"> through multiple </w:t>
-      </w:r>
-      <w:proofErr w:type="gramStart"/>
+        <w:t xml:space="preserve"> through multiple selections</w:t>
+      </w:r>
+    </w:p>
+    <w:p>
+      <w:pPr>
+        <w:ind w:left="1440"/>
+      </w:pPr>
+      <w:r>
+        <w:t xml:space="preserve">Cancel filename </w:t>
+      </w:r>
+      <w:r>
+        <w:t xml:space="preserve">or list </w:t>
+      </w:r>
       <w:r>
         <w:t>selections</w:t>
       </w:r>
-      <w:proofErr w:type="gramEnd"/>
-    </w:p>
-    <w:p>
-      <w:pPr>
-        <w:ind w:left="1440"/>
-      </w:pPr>
-      <w:r>
-        <w:t xml:space="preserve">Cancel filename </w:t>
-      </w:r>
-      <w:r>
-        <w:t xml:space="preserve">or list </w:t>
-      </w:r>
-      <w:proofErr w:type="gramStart"/>
-      <w:r>
-        <w:t>selections</w:t>
-      </w:r>
-      <w:proofErr w:type="gramEnd"/>
     </w:p>
     <w:p>
       <w:pPr>
@@ -2000,29 +1728,13 @@
         <w:t xml:space="preserve"> The bottom of the screen shows the</w:t>
       </w:r>
       <w:r>
-        <w:t xml:space="preserve"> battery status on the right if it has been enabled. This is related to the current battery voltage and will drop while transmitting. There are also 4 </w:t>
-      </w:r>
-      <w:proofErr w:type="gramStart"/>
-      <w:r>
-        <w:t>LED’s</w:t>
-      </w:r>
-      <w:proofErr w:type="gramEnd"/>
-      <w:r>
-        <w:t xml:space="preserve"> on the PCB that can be seen through</w:t>
+        <w:t xml:space="preserve"> battery status on the right if it has been enabled. This is related to the current battery voltage and will drop while transmitting. There are also 4 LED’s on the PCB that can be seen through</w:t>
       </w:r>
       <w:r>
         <w:t xml:space="preserve"> the slot on the top of the case</w:t>
       </w:r>
       <w:r>
-        <w:t xml:space="preserve">. These </w:t>
-      </w:r>
-      <w:proofErr w:type="gramStart"/>
-      <w:r>
-        <w:t>LED’s</w:t>
-      </w:r>
-      <w:proofErr w:type="gramEnd"/>
-      <w:r>
-        <w:t xml:space="preserve"> are controlled by the battery charger circuit and indicate the battery status during running and charging.</w:t>
+        <w:t>. These LED’s are controlled by the battery charger circuit and indicate the battery status during running and charging.</w:t>
       </w:r>
     </w:p>
     <w:p/>
@@ -2031,15 +1743,7 @@
         <w:t>During transmitting the bottom left shows an animated red dot. In a future firmware update the</w:t>
       </w:r>
       <w:r>
-        <w:t xml:space="preserve"> received DTMF characters will be </w:t>
-      </w:r>
-      <w:proofErr w:type="gramStart"/>
-      <w:r>
-        <w:t>display</w:t>
-      </w:r>
-      <w:proofErr w:type="gramEnd"/>
-      <w:r>
-        <w:t xml:space="preserve"> next to this.</w:t>
+        <w:t xml:space="preserve"> received DTMF characters will be display next to this.</w:t>
       </w:r>
     </w:p>
     <w:p>
@@ -2047,6 +1751,7 @@
         <w:pStyle w:val="Heading1"/>
       </w:pPr>
       <w:r>
+        <w:lastRenderedPageBreak/>
         <w:t>Menu Details</w:t>
       </w:r>
     </w:p>
@@ -2054,13 +1759,8 @@
       <w:r>
         <w:t xml:space="preserve">The following sections detail each entry in </w:t>
       </w:r>
-      <w:proofErr w:type="gramStart"/>
-      <w:r>
-        <w:t>all of</w:t>
-      </w:r>
-      <w:proofErr w:type="gramEnd"/>
-      <w:r>
-        <w:t xml:space="preserve"> the menus</w:t>
+      <w:r>
+        <w:t>all of the menus</w:t>
       </w:r>
       <w:r>
         <w:t xml:space="preserve"> starting with the main or top menu</w:t>
@@ -2087,15 +1787,7 @@
         <w:t>’</w:t>
       </w:r>
       <w:r>
-        <w:t xml:space="preserve"> or a ‘</w:t>
-      </w:r>
-      <w:proofErr w:type="gramStart"/>
-      <w:r>
-        <w:t>-‘ to</w:t>
-      </w:r>
-      <w:proofErr w:type="gramEnd"/>
-      <w:r>
-        <w:t xml:space="preserve"> indicate a range</w:t>
+        <w:t xml:space="preserve"> or a ‘-‘ to indicate a range</w:t>
       </w:r>
       <w:r>
         <w:t>.</w:t>
@@ -2117,22 +1809,10 @@
         <w:t>alphanumeric sequences. An example is the radio ID.</w:t>
       </w:r>
       <w:r>
-        <w:t xml:space="preserve"> </w:t>
-      </w:r>
-      <w:r>
-        <w:lastRenderedPageBreak/>
-        <w:t xml:space="preserve">Some menu entries may depend on other menu items </w:t>
-      </w:r>
-      <w:r>
-        <w:t xml:space="preserve">settings. For </w:t>
-      </w:r>
-      <w:proofErr w:type="gramStart"/>
-      <w:r>
-        <w:t>example</w:t>
-      </w:r>
-      <w:proofErr w:type="gramEnd"/>
-      <w:r>
-        <w:t xml:space="preserve"> the audio file name menu item is hidden unless </w:t>
+        <w:t xml:space="preserve"> Some menu entries may depend on other menu items </w:t>
+      </w:r>
+      <w:r>
+        <w:t xml:space="preserve">settings. For example the audio file name menu item is hidden unless </w:t>
       </w:r>
       <w:r>
         <w:t>“Play Audio File” is Yes.</w:t>
@@ -2167,34 +1847,10 @@
     </w:p>
     <w:p>
       <w:r>
-        <w:t xml:space="preserve">This must be set to </w:t>
-      </w:r>
-      <w:proofErr w:type="gramStart"/>
-      <w:r>
-        <w:t>On</w:t>
-      </w:r>
-      <w:proofErr w:type="gramEnd"/>
-      <w:r>
-        <w:t xml:space="preserve"> for the radio to begin </w:t>
-      </w:r>
-      <w:r>
-        <w:t xml:space="preserve">transmitting. If saved as </w:t>
-      </w:r>
-      <w:proofErr w:type="gramStart"/>
-      <w:r>
-        <w:t>On</w:t>
-      </w:r>
-      <w:proofErr w:type="gramEnd"/>
-      <w:r>
-        <w:t xml:space="preserve"> then the radio will start sending right after booting. If it is </w:t>
-      </w:r>
-      <w:proofErr w:type="gramStart"/>
-      <w:r>
-        <w:t>Off</w:t>
-      </w:r>
-      <w:proofErr w:type="gramEnd"/>
-      <w:r>
-        <w:t xml:space="preserve"> it will not automatically start sending. It can be toggle</w:t>
+        <w:t xml:space="preserve">This must be set to On for the radio to begin </w:t>
+      </w:r>
+      <w:r>
+        <w:t>transmitting. If saved as On then the radio will start sending right after booting. If it is Off it will not automatically start sending. It can be toggle</w:t>
       </w:r>
       <w:r>
         <w:t>d</w:t>
@@ -2203,13 +1859,8 @@
         <w:t xml:space="preserve"> with the B0 button while in run mode</w:t>
       </w:r>
       <w:r>
-        <w:t xml:space="preserve">. Using B0 does not </w:t>
-      </w:r>
-      <w:proofErr w:type="gramStart"/>
-      <w:r>
-        <w:t>changed</w:t>
-      </w:r>
-      <w:proofErr w:type="gramEnd"/>
+        <w:t>. Using B0 does not changed</w:t>
+      </w:r>
     </w:p>
     <w:p>
       <w:pPr>
@@ -2232,15 +1883,7 @@
     </w:p>
     <w:p>
       <w:r>
-        <w:t xml:space="preserve">High power is about </w:t>
-      </w:r>
-      <w:proofErr w:type="gramStart"/>
-      <w:r>
-        <w:t>5W</w:t>
-      </w:r>
-      <w:proofErr w:type="gramEnd"/>
-      <w:r>
-        <w:t xml:space="preserve"> and low power is 3W. These are the only</w:t>
+        <w:t>High power is about 5W and low power is 3W. These are the only</w:t>
       </w:r>
       <w:r>
         <w:t xml:space="preserve"> values allowed by the SA818 radio. If lower power is desired an attenuator can be attached to the </w:t>
@@ -2304,7 +1947,6 @@
       <w:r>
         <w:t xml:space="preserve">Call Sign: </w:t>
       </w:r>
-      <w:proofErr w:type="gramStart"/>
       <w:r>
         <w:rPr>
           <w:i/>
@@ -2312,7 +1954,6 @@
         </w:rPr>
         <w:t>text</w:t>
       </w:r>
-      <w:proofErr w:type="gramEnd"/>
     </w:p>
     <w:p>
       <w:r>
@@ -2357,6 +1998,7 @@
         <w:pStyle w:val="Heading3"/>
       </w:pPr>
       <w:r>
+        <w:lastRenderedPageBreak/>
         <w:t xml:space="preserve">Audio File: </w:t>
       </w:r>
       <w:r>
@@ -2369,29 +2011,13 @@
     </w:p>
     <w:p>
       <w:r>
-        <w:t xml:space="preserve">This menu item is only visible if the previous item is set to Yes. Clicking the dial will list </w:t>
-      </w:r>
-      <w:proofErr w:type="gramStart"/>
-      <w:r>
-        <w:t>all of</w:t>
-      </w:r>
-      <w:proofErr w:type="gramEnd"/>
-      <w:r>
-        <w:t xml:space="preserve"> the </w:t>
+        <w:t xml:space="preserve">This menu item is only visible if the previous item is set to Yes. Clicking the dial will list all of the </w:t>
       </w:r>
       <w:r>
         <w:t>*.txt files on the SD card. The dial is rotated to highlight a file and a long press will set it</w:t>
       </w:r>
       <w:r>
-        <w:t xml:space="preserve">. Note that a click of dial just exits the list of </w:t>
-      </w:r>
-      <w:proofErr w:type="gramStart"/>
-      <w:r>
-        <w:t>file</w:t>
-      </w:r>
-      <w:proofErr w:type="gramEnd"/>
-      <w:r>
-        <w:t xml:space="preserve"> with no selection being performed.</w:t>
+        <w:t>. Note that a click of dial just exits the list of file with no selection being performed.</w:t>
       </w:r>
     </w:p>
     <w:p>
@@ -2418,8 +2044,171 @@
         <w:pStyle w:val="Heading2"/>
       </w:pPr>
       <w:r>
+        <w:t>+Radio Timers</w:t>
+      </w:r>
+    </w:p>
+    <w:p>
+      <w:pPr>
+        <w:pStyle w:val="Heading3"/>
+      </w:pPr>
+      <w:r>
+        <w:t>Start Delay: 0-120 Min</w:t>
+      </w:r>
+    </w:p>
+    <w:p>
+      <w:r>
+        <w:t>When B0 or the menu starts the transmit mode</w:t>
+      </w:r>
+      <w:r>
+        <w:t xml:space="preserve"> the system will not actually begin sending until this time is expired. This allows the radio to be hidden</w:t>
+      </w:r>
+      <w:r>
+        <w:t xml:space="preserve"> and </w:t>
+      </w:r>
+      <w:r>
+        <w:t>gives the hiding person time to leave the area and return</w:t>
+      </w:r>
+      <w:r>
+        <w:t xml:space="preserve"> before transmission starts.</w:t>
+      </w:r>
+    </w:p>
+    <w:p>
+      <w:pPr>
+        <w:pStyle w:val="Heading3"/>
+      </w:pPr>
+      <w:r>
+        <w:t xml:space="preserve">Timer Mode: </w:t>
+      </w:r>
+      <w:proofErr w:type="spellStart"/>
+      <w:r>
+        <w:t>Fixed|Random</w:t>
+      </w:r>
+      <w:proofErr w:type="spellEnd"/>
+    </w:p>
+    <w:p>
+      <w:r>
+        <w:t>In Fixed</w:t>
+      </w:r>
+      <w:r>
+        <w:t xml:space="preserve"> mode the sending time and pause timer are controlled by the Send and Pause values</w:t>
+      </w:r>
+      <w:r>
+        <w:t xml:space="preserve"> and are always the same. In Random mode the transmit time and pause time are randomly chosen</w:t>
+      </w:r>
+      <w:r>
+        <w:t xml:space="preserve"> from the allowed values set in the Min and Max values for TX Send and Pause. This makes the timing less predictable and make the game a little bit harder.</w:t>
+      </w:r>
+      <w:r>
+        <w:t xml:space="preserve"> Keep your ears on!</w:t>
+      </w:r>
+    </w:p>
+    <w:p>
+      <w:pPr>
+        <w:pStyle w:val="Heading3"/>
+      </w:pPr>
+      <w:r>
+        <w:t xml:space="preserve">TX Send: </w:t>
+      </w:r>
+      <w:r>
+        <w:t>10-90 Sec</w:t>
+      </w:r>
+    </w:p>
+    <w:p>
+      <w:r>
+        <w:t>Fixed time for transmission. Shorter times are more challenging</w:t>
+      </w:r>
+      <w:r>
+        <w:t xml:space="preserve"> to locate</w:t>
+      </w:r>
+      <w:r>
+        <w:t xml:space="preserve"> but use less battery energy</w:t>
+      </w:r>
+      <w:r>
+        <w:t>. Longer times overheat the radio</w:t>
+      </w:r>
+      <w:r>
+        <w:t xml:space="preserve"> and use more battery </w:t>
+      </w:r>
+      <w:r>
+        <w:t>energy</w:t>
+      </w:r>
+      <w:r>
+        <w:t>.</w:t>
+      </w:r>
+    </w:p>
+    <w:p>
+      <w:pPr>
+        <w:pStyle w:val="Heading3"/>
+      </w:pPr>
+      <w:r>
+        <w:t>TX Pause:10-1200 Sec</w:t>
+      </w:r>
+    </w:p>
+    <w:p>
+      <w:r>
+        <w:t>This is the pause time between transmissions</w:t>
+      </w:r>
+      <w:r>
+        <w:t>. Longer times let the radio cool off and save the battery for longer run times.</w:t>
+      </w:r>
+    </w:p>
+    <w:p>
+      <w:pPr>
+        <w:pStyle w:val="Heading3"/>
+      </w:pPr>
+      <w:r>
+        <w:t>TX Send Min: 10-90 Sec</w:t>
+      </w:r>
+    </w:p>
+    <w:p>
+      <w:r>
+        <w:t>In random mode this is the minimum send time.</w:t>
+      </w:r>
+    </w:p>
+    <w:p>
+      <w:pPr>
+        <w:pStyle w:val="Heading3"/>
+      </w:pPr>
+      <w:r>
+        <w:t xml:space="preserve">TX Send Max: </w:t>
+      </w:r>
+      <w:r>
+        <w:t>10-90 Sec</w:t>
+      </w:r>
+    </w:p>
+    <w:p>
+      <w:r>
+        <w:t xml:space="preserve">In </w:t>
+      </w:r>
+      <w:r>
+        <w:t>random mode this is the maximum send time.</w:t>
+      </w:r>
+    </w:p>
+    <w:p>
+      <w:pPr>
+        <w:pStyle w:val="Heading3"/>
+      </w:pPr>
+      <w:r>
+        <w:t>TX Pause Min: 10-1200 Sec</w:t>
+      </w:r>
+    </w:p>
+    <w:p>
+      <w:r>
+        <w:t>In random mode this is the minimum pause time.</w:t>
+      </w:r>
+    </w:p>
+    <w:p>
+      <w:pPr>
+        <w:pStyle w:val="Heading3"/>
+      </w:pPr>
+      <w:r>
         <w:lastRenderedPageBreak/>
-        <w:t>+Radio Timers</w:t>
+        <w:t>TX Pause Max: 10-1200 Sec</w:t>
+      </w:r>
+    </w:p>
+    <w:p>
+      <w:r>
+        <w:t>In random mode this is the maximum pause time.</w:t>
       </w:r>
     </w:p>
     <w:p>
@@ -2427,24 +2216,38 @@
         <w:pStyle w:val="Heading3"/>
       </w:pPr>
       <w:r>
-        <w:t>Start Delay: 0-120 Min</w:t>
-      </w:r>
-    </w:p>
-    <w:p>
-      <w:r>
-        <w:t>When B0 or the menu starts the transmit mode</w:t>
-      </w:r>
-      <w:r>
-        <w:t xml:space="preserve"> the system will not actually begin sending until this time is expired. This allows the radio to be hidden</w:t>
-      </w:r>
-      <w:r>
-        <w:t xml:space="preserve"> and </w:t>
-      </w:r>
-      <w:r>
-        <w:t>gives the hiding person time to leave the area and return</w:t>
-      </w:r>
-      <w:r>
-        <w:t xml:space="preserve"> before transmission starts.</w:t>
+        <w:t xml:space="preserve">TX Stop: </w:t>
+      </w:r>
+      <w:proofErr w:type="spellStart"/>
+      <w:r>
+        <w:t>Immediate|Finish</w:t>
+      </w:r>
+      <w:proofErr w:type="spellEnd"/>
+      <w:r>
+        <w:t xml:space="preserve"> Cycle</w:t>
+      </w:r>
+    </w:p>
+    <w:p>
+      <w:r>
+        <w:t>During transmit time the Beacon, Call Sign, and Audio are continuously sent. At the end of the transmission time this option controls whether the transmission stops immediately of waits to stop until the entire cycle is finished.</w:t>
+      </w:r>
+    </w:p>
+    <w:p/>
+    <w:p>
+      <w:r>
+        <w:t>A clever use of this command</w:t>
+      </w:r>
+      <w:r>
+        <w:t xml:space="preserve"> allows for only one cycle of beacon, ID, and music to be sent during each transmission time. Set the transmit</w:t>
+      </w:r>
+      <w:r>
+        <w:t xml:space="preserve"> time to something less than</w:t>
+      </w:r>
+      <w:r>
+        <w:t xml:space="preserve"> the time to perform a complete cycle and set this option to “Finish Cycle”. The transmit  cycle will begin, the timer will expire, but the current cycle will complete before stopping</w:t>
+      </w:r>
+      <w:r>
+        <w:t>.</w:t>
       </w:r>
     </w:p>
     <w:p>
@@ -2452,37 +2255,28 @@
         <w:pStyle w:val="Heading3"/>
       </w:pPr>
       <w:r>
-        <w:t xml:space="preserve">Timer Mode: </w:t>
+        <w:t xml:space="preserve">Radio Pause: </w:t>
       </w:r>
       <w:proofErr w:type="spellStart"/>
       <w:r>
-        <w:t>Fixed|Random</w:t>
+        <w:t>Sleep|Awake</w:t>
       </w:r>
       <w:proofErr w:type="spellEnd"/>
     </w:p>
     <w:p>
       <w:r>
-        <w:t>In Fixed</w:t>
-      </w:r>
-      <w:r>
-        <w:t xml:space="preserve"> mode the sending time and pause timer are controlled by the Send and Pause values</w:t>
-      </w:r>
-      <w:r>
-        <w:t xml:space="preserve"> and are always the same. In Random mode the transmit time and pause time are randomly chosen</w:t>
-      </w:r>
-      <w:r>
-        <w:t xml:space="preserve"> from the allowed values set in the Min and Max values for TX Send and Pause. This makes the timing less predictable and </w:t>
-      </w:r>
-      <w:proofErr w:type="gramStart"/>
-      <w:r>
-        <w:t>make</w:t>
-      </w:r>
-      <w:proofErr w:type="gramEnd"/>
-      <w:r>
-        <w:t xml:space="preserve"> the game a little bit harder.</w:t>
-      </w:r>
-      <w:r>
-        <w:t xml:space="preserve"> Keep your ears on!</w:t>
+        <w:t>During pause time the radio can be put into sleep mode. This lowers the power consumption and lets the battery last longer. However note that this also means that the DTMF commands are disabled since the radio is asleep!</w:t>
+      </w:r>
+    </w:p>
+    <w:p>
+      <w:pPr>
+        <w:pStyle w:val="Heading2"/>
+      </w:pPr>
+      <w:r>
+        <w:t>+</w:t>
+      </w:r>
+      <w:r>
+        <w:t>More Radio Settings</w:t>
       </w:r>
     </w:p>
     <w:p>
@@ -2490,30 +2284,431 @@
         <w:pStyle w:val="Heading3"/>
       </w:pPr>
       <w:r>
-        <w:t xml:space="preserve">TX Send: </w:t>
-      </w:r>
-      <w:r>
-        <w:t>10-90 Sec</w:t>
-      </w:r>
-    </w:p>
-    <w:p>
-      <w:r>
-        <w:t>Fixed time for transmission. Shorter times are more challenging</w:t>
-      </w:r>
-      <w:r>
-        <w:t xml:space="preserve"> to locate</w:t>
-      </w:r>
-      <w:r>
-        <w:t xml:space="preserve"> but use less battery energy</w:t>
-      </w:r>
-      <w:r>
-        <w:t>. Longer times overheat the radio</w:t>
-      </w:r>
-      <w:r>
-        <w:t xml:space="preserve"> and use more battery </w:t>
-      </w:r>
-      <w:r>
-        <w:t>energy</w:t>
+        <w:t>RX Offset: -600|0|+600 kHz</w:t>
+      </w:r>
+    </w:p>
+    <w:p>
+      <w:r>
+        <w:t>This is the frequency offset from the transmit frequency that the radio uses to receive DTMF commands</w:t>
+      </w:r>
+      <w:r>
+        <w:t>. An offset is recommended. If 0 is used the radio will only listen when it isn’t sending. It has not been tested if it listens during sending when the offset is not 0.</w:t>
+      </w:r>
+    </w:p>
+    <w:p>
+      <w:pPr>
+        <w:pStyle w:val="Heading3"/>
+      </w:pPr>
+      <w:r>
+        <w:t>Bandwidth: 12.5|</w:t>
+      </w:r>
+      <w:r>
+        <w:t>25 kHz</w:t>
+      </w:r>
+    </w:p>
+    <w:p>
+      <w:r>
+        <w:t>This sets the radio bandwidth</w:t>
+      </w:r>
+      <w:r>
+        <w:t>. It has not been tested much to see what effect it has on performance yet.</w:t>
+      </w:r>
+    </w:p>
+    <w:p>
+      <w:pPr>
+        <w:pStyle w:val="Heading3"/>
+      </w:pPr>
+      <w:r>
+        <w:t>CTCSS/DCS: CTCSS|DCS</w:t>
+      </w:r>
+    </w:p>
+    <w:p>
+      <w:r>
+        <w:t xml:space="preserve">This sets the </w:t>
+      </w:r>
+      <w:r>
+        <w:t>un-squelch</w:t>
+      </w:r>
+      <w:r>
+        <w:t xml:space="preserve"> values</w:t>
+      </w:r>
+      <w:r>
+        <w:t xml:space="preserve"> for either the analog or digital versions.</w:t>
+      </w:r>
+    </w:p>
+    <w:p>
+      <w:pPr>
+        <w:pStyle w:val="Heading3"/>
+      </w:pPr>
+      <w:r>
+        <w:t>TX CTCSS:</w:t>
+      </w:r>
+      <w:r>
+        <w:t xml:space="preserve"> None</w:t>
+      </w:r>
+      <w:r>
+        <w:t>|</w:t>
+      </w:r>
+      <w:r>
+        <w:t>67-</w:t>
+      </w:r>
+      <w:r>
+        <w:t>250.3</w:t>
+      </w:r>
+    </w:p>
+    <w:p>
+      <w:r>
+        <w:t>Analog un-squelch frequencies sent out.</w:t>
+      </w:r>
+    </w:p>
+    <w:p>
+      <w:pPr>
+        <w:pStyle w:val="Heading3"/>
+      </w:pPr>
+      <w:r>
+        <w:t>RX CTCSS:</w:t>
+      </w:r>
+      <w:r>
+        <w:t xml:space="preserve"> None|67-250.3</w:t>
+      </w:r>
+    </w:p>
+    <w:p>
+      <w:r>
+        <w:t>Analog un-squelch frequency for receiving.</w:t>
+      </w:r>
+    </w:p>
+    <w:p>
+      <w:pPr>
+        <w:pStyle w:val="Heading3"/>
+      </w:pPr>
+      <w:r>
+        <w:lastRenderedPageBreak/>
+        <w:t>TX DCS:</w:t>
+      </w:r>
+      <w:r>
+        <w:t xml:space="preserve"> None|023-754</w:t>
+      </w:r>
+    </w:p>
+    <w:p>
+      <w:r>
+        <w:t>Digital un-squelch value for sending.</w:t>
+      </w:r>
+    </w:p>
+    <w:p>
+      <w:pPr>
+        <w:pStyle w:val="Heading3"/>
+      </w:pPr>
+      <w:r>
+        <w:t>TX I/N: I|N</w:t>
+      </w:r>
+    </w:p>
+    <w:p>
+      <w:r>
+        <w:t>The digital I or N value for sending.</w:t>
+      </w:r>
+    </w:p>
+    <w:p>
+      <w:pPr>
+        <w:pStyle w:val="Heading3"/>
+      </w:pPr>
+      <w:r>
+        <w:t>RX DCS: None|023-754</w:t>
+      </w:r>
+    </w:p>
+    <w:p>
+      <w:r>
+        <w:t>Digital un-squelch value for receiving.</w:t>
+      </w:r>
+    </w:p>
+    <w:p>
+      <w:pPr>
+        <w:pStyle w:val="Heading3"/>
+      </w:pPr>
+      <w:r>
+        <w:t>RX I/N: I|N</w:t>
+      </w:r>
+    </w:p>
+    <w:p>
+      <w:r>
+        <w:t>The digital I or N value for receiving.</w:t>
+      </w:r>
+    </w:p>
+    <w:p>
+      <w:pPr>
+        <w:pStyle w:val="Heading3"/>
+      </w:pPr>
+      <w:r>
+        <w:t>RX Volume:</w:t>
+      </w:r>
+      <w:r>
+        <w:t xml:space="preserve"> 1-6</w:t>
+      </w:r>
+    </w:p>
+    <w:p>
+      <w:r>
+        <w:t>This is the receive volume setting. It affects how well DTMF tones are detected.</w:t>
+      </w:r>
+    </w:p>
+    <w:p>
+      <w:pPr>
+        <w:pStyle w:val="Heading3"/>
+      </w:pPr>
+      <w:r>
+        <w:t>RX Squelch:</w:t>
+      </w:r>
+      <w:r>
+        <w:t xml:space="preserve"> 0-8</w:t>
+      </w:r>
+    </w:p>
+    <w:p>
+      <w:r>
+        <w:t>This affects how much signal is required to receive the DTMF signals.</w:t>
+      </w:r>
+    </w:p>
+    <w:p>
+      <w:pPr>
+        <w:pStyle w:val="Heading2"/>
+      </w:pPr>
+      <w:r>
+        <w:t>Cancel Waits/TX Now</w:t>
+      </w:r>
+    </w:p>
+    <w:p>
+      <w:r>
+        <w:t>When the radio is in either send or pause mode this command will cancel the timer and the next mo</w:t>
+      </w:r>
+      <w:r>
+        <w:t>de will start. For example if you want to cancel</w:t>
+      </w:r>
+      <w:r>
+        <w:t xml:space="preserve"> the pause and go to transmit, use this option. It can also be done by long pressing B0.</w:t>
+      </w:r>
+    </w:p>
+    <w:p>
+      <w:pPr>
+        <w:pStyle w:val="Heading2"/>
+      </w:pPr>
+      <w:r>
+        <w:t>+Saved Settings Files</w:t>
+      </w:r>
+    </w:p>
+    <w:p>
+      <w:r>
+        <w:t>Saved settings files are named files stored on the SD card. They are useful to</w:t>
+      </w:r>
+      <w:r>
+        <w:t xml:space="preserve"> quickly configure the radio for different uses. All values except the battery calibration are affected.</w:t>
+      </w:r>
+    </w:p>
+    <w:p>
+      <w:pPr>
+        <w:pStyle w:val="Heading3"/>
+      </w:pPr>
+      <w:r>
+        <w:t>Create File</w:t>
+      </w:r>
+    </w:p>
+    <w:p>
+      <w:r>
+        <w:t>This prompts the user for a name. The file is then created using the current system settings.</w:t>
+      </w:r>
+    </w:p>
+    <w:p>
+      <w:pPr>
+        <w:pStyle w:val="Heading3"/>
+      </w:pPr>
+      <w:r>
+        <w:t>Save/Update File</w:t>
+      </w:r>
+    </w:p>
+    <w:p>
+      <w:r>
+        <w:t>This command saves the current settings into the selected file. If it already exists the user will be asked to confirm overwriting the file.</w:t>
+      </w:r>
+    </w:p>
+    <w:p>
+      <w:pPr>
+        <w:pStyle w:val="Heading3"/>
+      </w:pPr>
+      <w:r>
+        <w:lastRenderedPageBreak/>
+        <w:t>Load File</w:t>
+      </w:r>
+    </w:p>
+    <w:p>
+      <w:r>
+        <w:t>This command asks the user for the name and then sets all of the system settings except the battery calibration using the values in the file.</w:t>
+      </w:r>
+    </w:p>
+    <w:p>
+      <w:pPr>
+        <w:pStyle w:val="Heading3"/>
+      </w:pPr>
+      <w:r>
+        <w:t>Delete File</w:t>
+      </w:r>
+    </w:p>
+    <w:p>
+      <w:r>
+        <w:t>The user selects a file from the list and then it can be deleted.</w:t>
+      </w:r>
+    </w:p>
+    <w:p>
+      <w:pPr>
+        <w:pStyle w:val="Heading2"/>
+      </w:pPr>
+      <w:r>
+        <w:t>+System Settings</w:t>
+      </w:r>
+    </w:p>
+    <w:p>
+      <w:pPr>
+        <w:pStyle w:val="Heading3"/>
+      </w:pPr>
+      <w:r>
+        <w:t>+Display</w:t>
+      </w:r>
+      <w:r>
+        <w:t xml:space="preserve"> Settings</w:t>
+      </w:r>
+    </w:p>
+    <w:p>
+      <w:pPr>
+        <w:pStyle w:val="Heading4"/>
+      </w:pPr>
+      <w:r>
+        <w:t xml:space="preserve">Dimming Mode: </w:t>
+      </w:r>
+      <w:proofErr w:type="spellStart"/>
+      <w:r>
+        <w:t>None</w:t>
+      </w:r>
+      <w:r>
+        <w:t>|Timer</w:t>
+      </w:r>
+      <w:proofErr w:type="spellEnd"/>
+    </w:p>
+    <w:p>
+      <w:r>
+        <w:t xml:space="preserve">The display can be set to dim automatically after a specified number of seconds. This is used to save battery power since the backlight </w:t>
+      </w:r>
+      <w:r>
+        <w:t>uses a significant amount.</w:t>
+      </w:r>
+    </w:p>
+    <w:p>
+      <w:pPr>
+        <w:pStyle w:val="Heading4"/>
+      </w:pPr>
+      <w:r>
+        <w:t>Bright Value: 1-100</w:t>
+      </w:r>
+      <w:r>
+        <w:t>%</w:t>
+      </w:r>
+    </w:p>
+    <w:p>
+      <w:r>
+        <w:t>Set the display brightness value.</w:t>
+      </w:r>
+    </w:p>
+    <w:p>
+      <w:pPr>
+        <w:pStyle w:val="Heading4"/>
+      </w:pPr>
+      <w:r>
+        <w:t xml:space="preserve">Dim Value: </w:t>
+      </w:r>
+      <w:r>
+        <w:t>0-100%</w:t>
+      </w:r>
+    </w:p>
+    <w:p>
+      <w:r>
+        <w:t xml:space="preserve">Set the display brightness after the </w:t>
+      </w:r>
+      <w:r>
+        <w:t>timer below expires.</w:t>
+      </w:r>
+    </w:p>
+    <w:p>
+      <w:pPr>
+        <w:pStyle w:val="Heading4"/>
+      </w:pPr>
+      <w:r>
+        <w:t>Display Dim Time:</w:t>
+      </w:r>
+      <w:r>
+        <w:t xml:space="preserve"> 0-120 S</w:t>
+      </w:r>
+    </w:p>
+    <w:p>
+      <w:r>
+        <w:t>Specify the time until the display changes to dim mode.</w:t>
+      </w:r>
+    </w:p>
+    <w:p>
+      <w:pPr>
+        <w:pStyle w:val="Heading4"/>
+      </w:pPr>
+      <w:r>
+        <w:t>+Sideways Scroll Settings</w:t>
+      </w:r>
+    </w:p>
+    <w:p>
+      <w:r>
+        <w:t>Lines of text that too long for the display will scroll back and forth. The following settings control the speed.</w:t>
+      </w:r>
+    </w:p>
+    <w:p>
+      <w:pPr>
+        <w:pStyle w:val="Heading5"/>
+      </w:pPr>
+      <w:r>
+        <w:t xml:space="preserve">Speed: </w:t>
+      </w:r>
+      <w:r>
+        <w:t>1-1000 mS</w:t>
+      </w:r>
+    </w:p>
+    <w:p>
+      <w:r>
+        <w:t>Controls the speed of text moving to the left.</w:t>
+      </w:r>
+    </w:p>
+    <w:p>
+      <w:pPr>
+        <w:pStyle w:val="Heading5"/>
+      </w:pPr>
+      <w:r>
+        <w:t>Pause: 1-100</w:t>
+      </w:r>
+      <w:r>
+        <w:t xml:space="preserve"> mS</w:t>
+      </w:r>
+    </w:p>
+    <w:p>
+      <w:r>
+        <w:t>This controls the pause when the text is at the end (all the way to the left).</w:t>
+      </w:r>
+    </w:p>
+    <w:p>
+      <w:pPr>
+        <w:pStyle w:val="Heading5"/>
+      </w:pPr>
+      <w:r>
+        <w:t>Reverse Speed: 1-20x</w:t>
+      </w:r>
+    </w:p>
+    <w:p>
+      <w:r>
+        <w:t xml:space="preserve">This is how fast the text scrolls </w:t>
+      </w:r>
+      <w:r>
+        <w:t>back to the beginning (to the right). 2x means twice as fast as the text scroll</w:t>
+      </w:r>
+      <w:r>
+        <w:t>ed to the left</w:t>
       </w:r>
       <w:r>
         <w:t>.</w:t>
@@ -2521,26 +2716,85 @@
     </w:p>
     <w:p>
       <w:pPr>
+        <w:pStyle w:val="Heading4"/>
+      </w:pPr>
+      <w:r>
+        <w:t xml:space="preserve">Menu Selection: </w:t>
+      </w:r>
+      <w:r>
+        <w:t>Color|*</w:t>
+      </w:r>
+    </w:p>
+    <w:p>
+      <w:r>
+        <w:t>Menu selections</w:t>
+      </w:r>
+      <w:r>
+        <w:t xml:space="preserve"> and selections from a list can be either colored or marked with the ‘*’ character.</w:t>
+      </w:r>
+    </w:p>
+    <w:p>
+      <w:pPr>
+        <w:pStyle w:val="Heading4"/>
+      </w:pPr>
+      <w:r>
+        <w:lastRenderedPageBreak/>
+        <w:t>Text/</w:t>
+      </w:r>
+      <w:proofErr w:type="spellStart"/>
+      <w:r>
+        <w:t>HiLite</w:t>
+      </w:r>
+      <w:proofErr w:type="spellEnd"/>
+      <w:r>
+        <w:t xml:space="preserve"> Colors</w:t>
+      </w:r>
+    </w:p>
+    <w:p>
+      <w:r>
+        <w:t>This selection allows for choosing the colors of the text and the highlight. The background screen is always black.</w:t>
+      </w:r>
+    </w:p>
+    <w:p>
+      <w:pPr>
         <w:pStyle w:val="Heading3"/>
       </w:pPr>
       <w:r>
-        <w:t>TX Pause:10-1200 Sec</w:t>
-      </w:r>
-    </w:p>
-    <w:p>
-      <w:r>
-        <w:t>This is the pause time between transmissions</w:t>
-      </w:r>
-      <w:r>
-        <w:t xml:space="preserve">. Longer times let the radio cool off and save the battery for longer </w:t>
-      </w:r>
-      <w:proofErr w:type="gramStart"/>
-      <w:r>
-        <w:t>run</w:t>
-      </w:r>
-      <w:proofErr w:type="gramEnd"/>
-      <w:r>
-        <w:t xml:space="preserve"> times.</w:t>
+        <w:t>+Dial &amp; Button Settings</w:t>
+      </w:r>
+    </w:p>
+    <w:p>
+      <w:pPr>
+        <w:pStyle w:val="Heading4"/>
+      </w:pPr>
+      <w:r>
+        <w:t xml:space="preserve">Direction: </w:t>
+      </w:r>
+      <w:proofErr w:type="spellStart"/>
+      <w:r>
+        <w:t>Normal:Reverse</w:t>
+      </w:r>
+      <w:proofErr w:type="spellEnd"/>
+    </w:p>
+    <w:p>
+      <w:r>
+        <w:t>If you really want the button to be the other way around this is the choice for you.</w:t>
+      </w:r>
+    </w:p>
+    <w:p>
+      <w:pPr>
+        <w:pStyle w:val="Heading4"/>
+      </w:pPr>
+      <w:r>
+        <w:t>Long Press Timer: 2-200</w:t>
+      </w:r>
+    </w:p>
+    <w:p>
+      <w:r>
+        <w:t>This value affects how long or short a long press is. The default value is normally OK</w:t>
+      </w:r>
+      <w:r>
+        <w:t>, but somebody might want to change it.</w:t>
       </w:r>
     </w:p>
     <w:p>
@@ -2548,12 +2802,75 @@
         <w:pStyle w:val="Heading3"/>
       </w:pPr>
       <w:r>
-        <w:t>TX Send Min: 10-90 Sec</w:t>
-      </w:r>
-    </w:p>
-    <w:p>
-      <w:r>
-        <w:t>In random mode this is the minimum send time.</w:t>
+        <w:t>+Battery Settings</w:t>
+      </w:r>
+    </w:p>
+    <w:p>
+      <w:r>
+        <w:t>Since the PCB was designed with 10% resistors for measuring the battery voltage some calibration is needed. A future PCB will probably use better resistors so this won’t be needed.</w:t>
+      </w:r>
+    </w:p>
+    <w:p>
+      <w:pPr>
+        <w:pStyle w:val="Heading4"/>
+      </w:pPr>
+      <w:r>
+        <w:t xml:space="preserve">Show Battery: </w:t>
+      </w:r>
+      <w:proofErr w:type="spellStart"/>
+      <w:r>
+        <w:t>Yes|No</w:t>
+      </w:r>
+      <w:proofErr w:type="spellEnd"/>
+    </w:p>
+    <w:p>
+      <w:r>
+        <w:t xml:space="preserve">This option controls the </w:t>
+      </w:r>
+      <w:r>
+        <w:t>battery display on the bottom right of the display.</w:t>
+      </w:r>
+    </w:p>
+    <w:p>
+      <w:pPr>
+        <w:pStyle w:val="Heading4"/>
+      </w:pPr>
+      <w:r>
+        <w:t>Full Battery: 2000-4000</w:t>
+      </w:r>
+    </w:p>
+    <w:p>
+      <w:r>
+        <w:t>This is the value that indicates a full 4.2V battery.</w:t>
+      </w:r>
+    </w:p>
+    <w:p>
+      <w:pPr>
+        <w:pStyle w:val="Heading4"/>
+      </w:pPr>
+      <w:r>
+        <w:t>Set Full Battery</w:t>
+      </w:r>
+    </w:p>
+    <w:p>
+      <w:r>
+        <w:t>This selection reads the current battery values and stores it. It is best set by fully charging the battery and then disconnecting the charger. Wait a couple of minutes and then use it several times until it seems stable.</w:t>
+      </w:r>
+    </w:p>
+    <w:p>
+      <w:pPr>
+        <w:pStyle w:val="Heading4"/>
+      </w:pPr>
+      <w:r>
+        <w:t>Read Battery Raw Data</w:t>
+      </w:r>
+    </w:p>
+    <w:p>
+      <w:r>
+        <w:t>This continuously reads the battery value</w:t>
+      </w:r>
+      <w:r>
+        <w:t>. It was originally used for testing, but it seems like it might possibly be useful so it was left in the menu system.</w:t>
       </w:r>
     </w:p>
     <w:p>
@@ -2561,18 +2878,29 @@
         <w:pStyle w:val="Heading3"/>
       </w:pPr>
       <w:r>
-        <w:t xml:space="preserve">TX Send Max: </w:t>
-      </w:r>
-      <w:r>
-        <w:t>10-90 Sec</w:t>
-      </w:r>
-    </w:p>
-    <w:p>
-      <w:r>
-        <w:t xml:space="preserve">In </w:t>
-      </w:r>
-      <w:r>
-        <w:t>random mode this is the maximum send time.</w:t>
+        <w:t>New Version BIN File</w:t>
+      </w:r>
+    </w:p>
+    <w:p>
+      <w:r>
+        <w:t xml:space="preserve">New firmware can be loaded by putting </w:t>
+      </w:r>
+      <w:r>
+        <w:t xml:space="preserve">the binary file on the SD card. It must be named </w:t>
+      </w:r>
+      <w:proofErr w:type="spellStart"/>
+      <w:r>
+        <w:t>RadioFox.BIN</w:t>
+      </w:r>
+      <w:proofErr w:type="spellEnd"/>
+      <w:r>
+        <w:t>.</w:t>
+      </w:r>
+      <w:r>
+        <w:t xml:space="preserve"> There are two prompts, one to confirm overwriting the firmware, and another to allow deletion of the </w:t>
+      </w:r>
+      <w:r>
+        <w:t>BIN file after installation.</w:t>
       </w:r>
     </w:p>
     <w:p>
@@ -2580,12 +2908,21 @@
         <w:pStyle w:val="Heading3"/>
       </w:pPr>
       <w:r>
-        <w:t>TX Pause Min: 10-1200 Sec</w:t>
-      </w:r>
-    </w:p>
-    <w:p>
-      <w:r>
-        <w:t>In random mode this is the minimum pause time.</w:t>
+        <w:t>Factory Settings</w:t>
+      </w:r>
+    </w:p>
+    <w:p>
+      <w:r>
+        <w:t xml:space="preserve">This command resets </w:t>
+      </w:r>
+      <w:r>
+        <w:t xml:space="preserve">all </w:t>
+      </w:r>
+      <w:r>
+        <w:t>settings</w:t>
+      </w:r>
+      <w:r>
+        <w:t xml:space="preserve"> except the high battery value to the original factory values.</w:t>
       </w:r>
     </w:p>
     <w:p>
@@ -2593,86 +2930,30 @@
         <w:pStyle w:val="Heading3"/>
       </w:pPr>
       <w:r>
-        <w:t>TX Pause Max: 10-1200 Sec</w:t>
-      </w:r>
-    </w:p>
-    <w:p>
-      <w:r>
-        <w:t>In random mode this is the maximum pause time.</w:t>
-      </w:r>
-    </w:p>
-    <w:p>
-      <w:pPr>
-        <w:pStyle w:val="Heading3"/>
-      </w:pPr>
-      <w:r>
-        <w:t xml:space="preserve">TX Stop: </w:t>
+        <w:lastRenderedPageBreak/>
+        <w:t>Format EEPROM</w:t>
+      </w:r>
+    </w:p>
+    <w:p>
+      <w:r>
+        <w:t xml:space="preserve">This will clear </w:t>
+      </w:r>
+      <w:r>
+        <w:t xml:space="preserve">and reset </w:t>
+      </w:r>
+      <w:r>
+        <w:t xml:space="preserve">the </w:t>
       </w:r>
       <w:proofErr w:type="spellStart"/>
       <w:r>
-        <w:t>Immediate|Finish</w:t>
+        <w:t>eeprom</w:t>
       </w:r>
       <w:proofErr w:type="spellEnd"/>
       <w:r>
-        <w:t xml:space="preserve"> Cycle</w:t>
-      </w:r>
-    </w:p>
-    <w:p>
-      <w:r>
-        <w:t xml:space="preserve">During transmit time the Beacon, Call Sign, and Audio are continuously sent. At the end of the transmission time this option controls whether the transmission stops immediately </w:t>
-      </w:r>
-      <w:proofErr w:type="gramStart"/>
-      <w:r>
-        <w:t>of</w:t>
-      </w:r>
-      <w:proofErr w:type="gramEnd"/>
-      <w:r>
-        <w:t xml:space="preserve"> waits to stop until the entire cycle is finished.</w:t>
-      </w:r>
-    </w:p>
-    <w:p/>
-    <w:p>
-      <w:r>
-        <w:lastRenderedPageBreak/>
-        <w:t>A clever use of this command</w:t>
-      </w:r>
-      <w:r>
-        <w:t xml:space="preserve"> allows for only one cycle of beacon, ID, and music to be sent during each transmission time. Set the transmit</w:t>
-      </w:r>
-      <w:r>
-        <w:t xml:space="preserve"> time to something less than</w:t>
-      </w:r>
-      <w:r>
-        <w:t xml:space="preserve"> the time to perform a complete cycle and set this option to “Finish Cycle”. The transmit  cycle will begin, the timer will expire, but the current cycle will complete before stopping</w:t>
-      </w:r>
-      <w:r>
-        <w:t>.</w:t>
-      </w:r>
-    </w:p>
-    <w:p>
-      <w:pPr>
-        <w:pStyle w:val="Heading3"/>
-      </w:pPr>
-      <w:r>
-        <w:t xml:space="preserve">Radio Pause: </w:t>
-      </w:r>
-      <w:proofErr w:type="spellStart"/>
-      <w:r>
-        <w:t>Sleep|Awake</w:t>
-      </w:r>
-      <w:proofErr w:type="spellEnd"/>
-    </w:p>
-    <w:p>
-      <w:r>
-        <w:t xml:space="preserve">During pause time the radio can be put into sleep mode. This lowers the power consumption and lets the battery last longer. </w:t>
-      </w:r>
-      <w:proofErr w:type="gramStart"/>
-      <w:r>
-        <w:t>However</w:t>
-      </w:r>
-      <w:proofErr w:type="gramEnd"/>
-      <w:r>
-        <w:t xml:space="preserve"> note that this also means that the DTMF commands are disabled since the radio is asleep!</w:t>
+        <w:t xml:space="preserve"> where the settings are save</w:t>
+      </w:r>
+      <w:r>
+        <w:t xml:space="preserve"> in non-volatile memory. This is how settings are saved while the system is not powered.</w:t>
       </w:r>
     </w:p>
     <w:p>
@@ -2680,776 +2961,12 @@
         <w:pStyle w:val="Heading2"/>
       </w:pPr>
       <w:r>
-        <w:t>+</w:t>
-      </w:r>
-      <w:r>
-        <w:t>More Radio Settings</w:t>
-      </w:r>
-    </w:p>
-    <w:p>
-      <w:pPr>
-        <w:pStyle w:val="Heading3"/>
-      </w:pPr>
-      <w:r>
-        <w:t xml:space="preserve">RX Offset: -600|0|+600 </w:t>
-      </w:r>
-      <w:proofErr w:type="gramStart"/>
-      <w:r>
-        <w:t>kHz</w:t>
-      </w:r>
-      <w:proofErr w:type="gramEnd"/>
-    </w:p>
-    <w:p>
-      <w:r>
-        <w:t>This is the frequency offset from the transmit frequency that the radio uses to receive DTMF commands</w:t>
-      </w:r>
-      <w:r>
-        <w:t>. An offset is recommended. If 0 is used the radio will only listen when it isn’t sending. It has not been tested if it listens during sending when the offset is not 0.</w:t>
-      </w:r>
-    </w:p>
-    <w:p>
-      <w:pPr>
-        <w:pStyle w:val="Heading3"/>
-      </w:pPr>
-      <w:r>
-        <w:t>Bandwidth: 12.5|</w:t>
-      </w:r>
-      <w:r>
-        <w:t>25 kHz</w:t>
-      </w:r>
-    </w:p>
-    <w:p>
-      <w:r>
-        <w:t>This sets the radio bandwidth</w:t>
-      </w:r>
-      <w:r>
-        <w:t>. It has not been tested much to see what effect it has on performance yet.</w:t>
-      </w:r>
-    </w:p>
-    <w:p>
-      <w:pPr>
-        <w:pStyle w:val="Heading3"/>
-      </w:pPr>
-      <w:r>
-        <w:t>CTCSS/DCS: CTCSS|DCS</w:t>
-      </w:r>
-    </w:p>
-    <w:p>
-      <w:r>
-        <w:t xml:space="preserve">This sets the </w:t>
-      </w:r>
-      <w:r>
-        <w:t>un-squelch</w:t>
-      </w:r>
-      <w:r>
-        <w:t xml:space="preserve"> values</w:t>
-      </w:r>
-      <w:r>
-        <w:t xml:space="preserve"> for either the analog or digital versions.</w:t>
-      </w:r>
-    </w:p>
-    <w:p>
-      <w:pPr>
-        <w:pStyle w:val="Heading3"/>
-      </w:pPr>
-      <w:r>
-        <w:t>TX CTCSS:</w:t>
-      </w:r>
-      <w:r>
-        <w:t xml:space="preserve"> None</w:t>
-      </w:r>
-      <w:r>
-        <w:t>|</w:t>
-      </w:r>
-      <w:r>
-        <w:t>67-</w:t>
-      </w:r>
-      <w:r>
-        <w:t>250.3</w:t>
-      </w:r>
-    </w:p>
-    <w:p>
-      <w:r>
-        <w:t>Analog un-squelch frequencies sent out.</w:t>
-      </w:r>
-    </w:p>
-    <w:p>
-      <w:pPr>
-        <w:pStyle w:val="Heading3"/>
-      </w:pPr>
-      <w:r>
-        <w:t>RX CTCSS:</w:t>
-      </w:r>
-      <w:r>
-        <w:t xml:space="preserve"> None|67-250.3</w:t>
-      </w:r>
-    </w:p>
-    <w:p>
-      <w:r>
-        <w:t>Analog un-squelch frequency for receiving.</w:t>
-      </w:r>
-    </w:p>
-    <w:p>
-      <w:pPr>
-        <w:pStyle w:val="Heading3"/>
-      </w:pPr>
-      <w:r>
-        <w:t>TX DCS:</w:t>
-      </w:r>
-      <w:r>
-        <w:t xml:space="preserve"> None|023-754</w:t>
-      </w:r>
-    </w:p>
-    <w:p>
-      <w:r>
-        <w:t>Digital un-squelch value for sending.</w:t>
-      </w:r>
-    </w:p>
-    <w:p>
-      <w:pPr>
-        <w:pStyle w:val="Heading3"/>
-      </w:pPr>
-      <w:r>
-        <w:t>TX I/N: I|N</w:t>
-      </w:r>
-    </w:p>
-    <w:p>
-      <w:r>
-        <w:t>The digital I or N value for sending.</w:t>
-      </w:r>
-    </w:p>
-    <w:p>
-      <w:pPr>
-        <w:pStyle w:val="Heading3"/>
-      </w:pPr>
-      <w:r>
-        <w:t>RX DCS: None|023-754</w:t>
-      </w:r>
-    </w:p>
-    <w:p>
-      <w:r>
-        <w:t>Digital un-squelch value for receiving.</w:t>
-      </w:r>
-    </w:p>
-    <w:p>
-      <w:pPr>
-        <w:pStyle w:val="Heading3"/>
-      </w:pPr>
-      <w:r>
-        <w:lastRenderedPageBreak/>
-        <w:t>RX I/N: I|N</w:t>
-      </w:r>
-    </w:p>
-    <w:p>
-      <w:r>
-        <w:t>The digital I or N value for receiving.</w:t>
-      </w:r>
-    </w:p>
-    <w:p>
-      <w:pPr>
-        <w:pStyle w:val="Heading3"/>
-      </w:pPr>
-      <w:r>
-        <w:t>RX Volume:</w:t>
-      </w:r>
-      <w:r>
-        <w:t xml:space="preserve"> 1-6</w:t>
-      </w:r>
-    </w:p>
-    <w:p>
-      <w:r>
-        <w:t>This is the receive volume setting. It affects how well DTMF tones are detected.</w:t>
-      </w:r>
-    </w:p>
-    <w:p>
-      <w:pPr>
-        <w:pStyle w:val="Heading3"/>
-      </w:pPr>
-      <w:r>
-        <w:t>RX Squelch:</w:t>
-      </w:r>
-      <w:r>
-        <w:t xml:space="preserve"> 0-8</w:t>
-      </w:r>
-    </w:p>
-    <w:p>
-      <w:r>
-        <w:t>This affects how much signal is required to receive the DTMF signals.</w:t>
-      </w:r>
-    </w:p>
-    <w:p>
-      <w:pPr>
-        <w:pStyle w:val="Heading2"/>
-      </w:pPr>
-      <w:r>
-        <w:t>Cancel Waits/TX Now</w:t>
-      </w:r>
-    </w:p>
-    <w:p>
-      <w:r>
-        <w:t>When the radio is in either send or pause mode this command will cancel the timer and the next mo</w:t>
-      </w:r>
-      <w:r>
-        <w:t xml:space="preserve">de will start. For </w:t>
-      </w:r>
-      <w:proofErr w:type="gramStart"/>
-      <w:r>
-        <w:t>example</w:t>
-      </w:r>
-      <w:proofErr w:type="gramEnd"/>
-      <w:r>
-        <w:t xml:space="preserve"> if you want to cancel</w:t>
-      </w:r>
-      <w:r>
-        <w:t xml:space="preserve"> the pause and go to transmit, use this option. It can also be done by </w:t>
-      </w:r>
-      <w:proofErr w:type="gramStart"/>
-      <w:r>
-        <w:t>long pressing B0</w:t>
-      </w:r>
-      <w:proofErr w:type="gramEnd"/>
-      <w:r>
-        <w:t>.</w:t>
-      </w:r>
-    </w:p>
-    <w:p>
-      <w:pPr>
-        <w:pStyle w:val="Heading2"/>
-      </w:pPr>
-      <w:r>
-        <w:t>+Saved Settings Files</w:t>
-      </w:r>
-    </w:p>
-    <w:p>
-      <w:r>
-        <w:t>Saved settings files are named files stored on the SD card. They are useful to</w:t>
-      </w:r>
-      <w:r>
-        <w:t xml:space="preserve"> quickly configure the radio for different uses. All values except the battery calibration are affected.</w:t>
-      </w:r>
-    </w:p>
-    <w:p>
-      <w:pPr>
-        <w:pStyle w:val="Heading3"/>
-      </w:pPr>
-      <w:r>
-        <w:t>Create File</w:t>
-      </w:r>
-    </w:p>
-    <w:p>
-      <w:r>
-        <w:t>This prompts the user for a name. The file is then created using the current system settings.</w:t>
-      </w:r>
-    </w:p>
-    <w:p>
-      <w:pPr>
-        <w:pStyle w:val="Heading3"/>
-      </w:pPr>
-      <w:r>
-        <w:t>Save/Update File</w:t>
-      </w:r>
-    </w:p>
-    <w:p>
-      <w:r>
-        <w:t xml:space="preserve">This command saves the current settings into the selected file. If it already </w:t>
-      </w:r>
-      <w:proofErr w:type="gramStart"/>
-      <w:r>
-        <w:t>exists</w:t>
-      </w:r>
-      <w:proofErr w:type="gramEnd"/>
-      <w:r>
-        <w:t xml:space="preserve"> the user will be asked to confirm overwriting the file.</w:t>
-      </w:r>
-    </w:p>
-    <w:p>
-      <w:pPr>
-        <w:pStyle w:val="Heading3"/>
-      </w:pPr>
-      <w:r>
-        <w:t>Load File</w:t>
-      </w:r>
-    </w:p>
-    <w:p>
-      <w:r>
-        <w:t xml:space="preserve">This command asks the user for the name and then sets </w:t>
-      </w:r>
-      <w:proofErr w:type="gramStart"/>
-      <w:r>
-        <w:t>all of</w:t>
-      </w:r>
-      <w:proofErr w:type="gramEnd"/>
-      <w:r>
-        <w:t xml:space="preserve"> the system settings except the battery calibration using the values in the file.</w:t>
-      </w:r>
-    </w:p>
-    <w:p>
-      <w:pPr>
-        <w:pStyle w:val="Heading3"/>
-      </w:pPr>
-      <w:r>
-        <w:t>Delete File</w:t>
-      </w:r>
-    </w:p>
-    <w:p>
-      <w:r>
-        <w:t>The user selects a file from the list and then it can be deleted.</w:t>
-      </w:r>
-    </w:p>
-    <w:p>
-      <w:pPr>
-        <w:pStyle w:val="Heading2"/>
-      </w:pPr>
-      <w:r>
-        <w:lastRenderedPageBreak/>
-        <w:t>+System Settings</w:t>
-      </w:r>
-    </w:p>
-    <w:p>
-      <w:pPr>
-        <w:pStyle w:val="Heading3"/>
-      </w:pPr>
-      <w:r>
-        <w:t>+Display</w:t>
-      </w:r>
-      <w:r>
-        <w:t xml:space="preserve"> Settings</w:t>
-      </w:r>
-    </w:p>
-    <w:p>
-      <w:pPr>
-        <w:pStyle w:val="Heading4"/>
-      </w:pPr>
-      <w:r>
-        <w:t xml:space="preserve">Dimming Mode: </w:t>
-      </w:r>
-      <w:proofErr w:type="spellStart"/>
-      <w:r>
-        <w:t>None</w:t>
-      </w:r>
-      <w:r>
-        <w:t>|Timer</w:t>
-      </w:r>
-      <w:proofErr w:type="spellEnd"/>
-    </w:p>
-    <w:p>
-      <w:r>
-        <w:t xml:space="preserve">The display can be set to dim automatically after a specified number of seconds. This is used to save battery power since the backlight </w:t>
-      </w:r>
-      <w:r>
-        <w:t>uses a significant amount.</w:t>
-      </w:r>
-    </w:p>
-    <w:p>
-      <w:pPr>
-        <w:pStyle w:val="Heading4"/>
-      </w:pPr>
-      <w:r>
-        <w:t>Bright Value: 1-100</w:t>
-      </w:r>
-      <w:r>
-        <w:t>%</w:t>
-      </w:r>
-    </w:p>
-    <w:p>
-      <w:r>
-        <w:t>Set the display brightness value.</w:t>
-      </w:r>
-    </w:p>
-    <w:p>
-      <w:pPr>
-        <w:pStyle w:val="Heading4"/>
-      </w:pPr>
-      <w:r>
-        <w:t xml:space="preserve">Dim Value: </w:t>
-      </w:r>
-      <w:r>
-        <w:t>0-100%</w:t>
-      </w:r>
-    </w:p>
-    <w:p>
-      <w:r>
-        <w:t xml:space="preserve">Set the display brightness after the </w:t>
-      </w:r>
-      <w:r>
-        <w:t>timer below expires.</w:t>
-      </w:r>
-    </w:p>
-    <w:p>
-      <w:pPr>
-        <w:pStyle w:val="Heading4"/>
-      </w:pPr>
-      <w:r>
-        <w:t>Display Dim Time:</w:t>
-      </w:r>
-      <w:r>
-        <w:t xml:space="preserve"> 0-120 S</w:t>
-      </w:r>
-    </w:p>
-    <w:p>
-      <w:r>
-        <w:t>Specify the time until the display changes to dim mode.</w:t>
-      </w:r>
-    </w:p>
-    <w:p>
-      <w:pPr>
-        <w:pStyle w:val="Heading4"/>
-      </w:pPr>
-      <w:r>
-        <w:t>+Sideways Scroll Settings</w:t>
-      </w:r>
-    </w:p>
-    <w:p>
-      <w:r>
-        <w:t xml:space="preserve">Lines of text that </w:t>
-      </w:r>
-      <w:proofErr w:type="gramStart"/>
-      <w:r>
-        <w:t>too</w:t>
-      </w:r>
-      <w:proofErr w:type="gramEnd"/>
-      <w:r>
-        <w:t xml:space="preserve"> long for the display will scroll back and forth. The following settings control the speed.</w:t>
-      </w:r>
-    </w:p>
-    <w:p>
-      <w:pPr>
-        <w:pStyle w:val="Heading5"/>
-      </w:pPr>
-      <w:r>
-        <w:t xml:space="preserve">Speed: </w:t>
-      </w:r>
-      <w:r>
-        <w:t>1-1000 mS</w:t>
-      </w:r>
-    </w:p>
-    <w:p>
-      <w:r>
-        <w:t>Controls the speed of text moving to the left.</w:t>
-      </w:r>
-    </w:p>
-    <w:p>
-      <w:pPr>
-        <w:pStyle w:val="Heading5"/>
-      </w:pPr>
-      <w:r>
-        <w:t>Pause: 1-100</w:t>
-      </w:r>
-      <w:r>
-        <w:t xml:space="preserve"> mS</w:t>
-      </w:r>
-    </w:p>
-    <w:p>
-      <w:r>
-        <w:t>This controls the pause when the text is at the end (all the way to the left).</w:t>
-      </w:r>
-    </w:p>
-    <w:p>
-      <w:pPr>
-        <w:pStyle w:val="Heading5"/>
-      </w:pPr>
-      <w:r>
-        <w:t>Reverse Speed: 1-20x</w:t>
-      </w:r>
-    </w:p>
-    <w:p>
-      <w:r>
-        <w:t xml:space="preserve">This is how fast the text scrolls </w:t>
-      </w:r>
-      <w:r>
-        <w:t>back to the beginning (to the right). 2x means twice as fast as the text scroll</w:t>
-      </w:r>
-      <w:r>
-        <w:t>ed to the left</w:t>
-      </w:r>
-      <w:r>
-        <w:t>.</w:t>
-      </w:r>
-    </w:p>
-    <w:p>
-      <w:pPr>
-        <w:pStyle w:val="Heading4"/>
-      </w:pPr>
-      <w:r>
-        <w:t xml:space="preserve">Menu Selection: </w:t>
-      </w:r>
-      <w:r>
-        <w:t>Color|*</w:t>
-      </w:r>
-    </w:p>
-    <w:p>
-      <w:r>
-        <w:t>Menu selections</w:t>
-      </w:r>
-      <w:r>
-        <w:t xml:space="preserve"> and selections from a list can be either colored or marked with the ‘*’ character.</w:t>
-      </w:r>
-    </w:p>
-    <w:p>
-      <w:pPr>
-        <w:pStyle w:val="Heading4"/>
-      </w:pPr>
-      <w:r>
-        <w:t>Text/</w:t>
-      </w:r>
-      <w:proofErr w:type="spellStart"/>
-      <w:r>
-        <w:t>HiLite</w:t>
-      </w:r>
-      <w:proofErr w:type="spellEnd"/>
-      <w:r>
-        <w:t xml:space="preserve"> Colors</w:t>
-      </w:r>
-    </w:p>
-    <w:p>
-      <w:r>
-        <w:t>This selection allows for choosing the colors of the text and the highlight. The background screen is always black.</w:t>
-      </w:r>
-    </w:p>
-    <w:p>
-      <w:pPr>
-        <w:pStyle w:val="Heading3"/>
-      </w:pPr>
-      <w:r>
-        <w:lastRenderedPageBreak/>
-        <w:t>+Dial &amp; Button Settings</w:t>
-      </w:r>
-    </w:p>
-    <w:p>
-      <w:pPr>
-        <w:pStyle w:val="Heading4"/>
-      </w:pPr>
-      <w:r>
-        <w:t xml:space="preserve">Direction: </w:t>
-      </w:r>
-      <w:proofErr w:type="spellStart"/>
-      <w:proofErr w:type="gramStart"/>
-      <w:r>
-        <w:t>Normal:Reverse</w:t>
-      </w:r>
-      <w:proofErr w:type="spellEnd"/>
-      <w:proofErr w:type="gramEnd"/>
-    </w:p>
-    <w:p>
-      <w:r>
-        <w:t>If you really want the button to be the other way around this is the choice for you.</w:t>
-      </w:r>
-    </w:p>
-    <w:p>
-      <w:pPr>
-        <w:pStyle w:val="Heading4"/>
-      </w:pPr>
-      <w:r>
-        <w:t>Long Press Timer: 2-200</w:t>
-      </w:r>
-    </w:p>
-    <w:p>
-      <w:r>
-        <w:t>This value affects how long or short a long press is. The default value is normally OK</w:t>
-      </w:r>
-      <w:r>
-        <w:t>, but somebody might want to change it.</w:t>
-      </w:r>
-    </w:p>
-    <w:p>
-      <w:pPr>
-        <w:pStyle w:val="Heading3"/>
-      </w:pPr>
-      <w:r>
-        <w:t>+Battery Settings</w:t>
-      </w:r>
-    </w:p>
-    <w:p>
-      <w:r>
-        <w:t xml:space="preserve">Since the PCB was designed with 10% resistors for measuring the battery voltage some calibration is needed. A future PCB will probably use better </w:t>
-      </w:r>
-      <w:proofErr w:type="gramStart"/>
-      <w:r>
-        <w:t>resistors</w:t>
-      </w:r>
-      <w:proofErr w:type="gramEnd"/>
-      <w:r>
-        <w:t xml:space="preserve"> so this won’t be needed.</w:t>
-      </w:r>
-    </w:p>
-    <w:p>
-      <w:pPr>
-        <w:pStyle w:val="Heading4"/>
-      </w:pPr>
-      <w:r>
-        <w:t xml:space="preserve">Show Battery: </w:t>
-      </w:r>
-      <w:proofErr w:type="spellStart"/>
-      <w:r>
-        <w:t>Yes|No</w:t>
-      </w:r>
-      <w:proofErr w:type="spellEnd"/>
-    </w:p>
-    <w:p>
-      <w:r>
-        <w:t xml:space="preserve">This option controls the </w:t>
-      </w:r>
-      <w:r>
-        <w:t>battery display on the bottom right of the display.</w:t>
-      </w:r>
-    </w:p>
-    <w:p>
-      <w:pPr>
-        <w:pStyle w:val="Heading4"/>
-      </w:pPr>
-      <w:r>
-        <w:t>Full Battery: 2000-4000</w:t>
-      </w:r>
-    </w:p>
-    <w:p>
-      <w:r>
-        <w:t>This is the value that indicates a full 4.2V battery.</w:t>
-      </w:r>
-    </w:p>
-    <w:p>
-      <w:pPr>
-        <w:pStyle w:val="Heading4"/>
-      </w:pPr>
-      <w:r>
-        <w:t>Set Full Battery</w:t>
-      </w:r>
-    </w:p>
-    <w:p>
-      <w:r>
-        <w:t>This selection reads the current battery values and stores it. It is best set by fully charging the battery and then disconnecting the charger. Wait a couple of minutes and then use it several times until it seems stable.</w:t>
-      </w:r>
-    </w:p>
-    <w:p>
-      <w:pPr>
-        <w:pStyle w:val="Heading4"/>
-      </w:pPr>
-      <w:r>
-        <w:t>Read Battery Raw Data</w:t>
-      </w:r>
-    </w:p>
-    <w:p>
-      <w:r>
-        <w:t>This continuously reads the battery value</w:t>
-      </w:r>
-      <w:r>
-        <w:t xml:space="preserve">. It was originally used for testing, but it seems like it might possibly be </w:t>
-      </w:r>
-      <w:proofErr w:type="gramStart"/>
-      <w:r>
-        <w:t>useful</w:t>
-      </w:r>
-      <w:proofErr w:type="gramEnd"/>
-      <w:r>
-        <w:t xml:space="preserve"> so it was left in the menu system.</w:t>
-      </w:r>
-    </w:p>
-    <w:p>
-      <w:pPr>
-        <w:pStyle w:val="Heading3"/>
-      </w:pPr>
-      <w:r>
-        <w:t>New Version BIN File</w:t>
-      </w:r>
-    </w:p>
-    <w:p>
-      <w:r>
-        <w:t xml:space="preserve">New firmware can be loaded by putting </w:t>
-      </w:r>
-      <w:r>
-        <w:t xml:space="preserve">the binary file on the SD card. It must be named </w:t>
-      </w:r>
-      <w:proofErr w:type="spellStart"/>
-      <w:r>
-        <w:t>RadioFox.BIN</w:t>
-      </w:r>
-      <w:proofErr w:type="spellEnd"/>
-      <w:r>
-        <w:t>.</w:t>
-      </w:r>
-      <w:r>
-        <w:t xml:space="preserve"> There are two prompts, one to confirm overwriting the firmware, and another to allow deletion of the </w:t>
-      </w:r>
-      <w:r>
-        <w:t>BIN file after installation.</w:t>
-      </w:r>
-    </w:p>
-    <w:p>
-      <w:pPr>
-        <w:pStyle w:val="Heading3"/>
-      </w:pPr>
-      <w:r>
-        <w:t>Factory Settings</w:t>
-      </w:r>
-    </w:p>
-    <w:p>
-      <w:r>
-        <w:t xml:space="preserve">This command resets </w:t>
-      </w:r>
-      <w:r>
-        <w:t xml:space="preserve">all </w:t>
-      </w:r>
-      <w:r>
-        <w:t>settings</w:t>
-      </w:r>
-      <w:r>
-        <w:t xml:space="preserve"> except the high battery value to the original factory values.</w:t>
-      </w:r>
-    </w:p>
-    <w:p>
-      <w:pPr>
-        <w:pStyle w:val="Heading3"/>
-      </w:pPr>
-      <w:r>
-        <w:t>Format EEPROM</w:t>
-      </w:r>
-    </w:p>
-    <w:p>
-      <w:r>
-        <w:t xml:space="preserve">This will clear </w:t>
-      </w:r>
-      <w:r>
-        <w:t xml:space="preserve">and reset </w:t>
-      </w:r>
-      <w:r>
-        <w:t xml:space="preserve">the </w:t>
-      </w:r>
-      <w:proofErr w:type="spellStart"/>
-      <w:r>
-        <w:t>eeprom</w:t>
-      </w:r>
-      <w:proofErr w:type="spellEnd"/>
-      <w:r>
-        <w:t xml:space="preserve"> where the settings are </w:t>
-      </w:r>
-      <w:proofErr w:type="gramStart"/>
-      <w:r>
-        <w:t>save</w:t>
-      </w:r>
-      <w:proofErr w:type="gramEnd"/>
-      <w:r>
-        <w:t xml:space="preserve"> in non-volatile memory. This is how settings are saved while the system is not powered.</w:t>
-      </w:r>
-    </w:p>
-    <w:p>
-      <w:pPr>
-        <w:pStyle w:val="Heading2"/>
-      </w:pPr>
-      <w:r>
-        <w:lastRenderedPageBreak/>
         <w:t>Save Current Settings</w:t>
       </w:r>
     </w:p>
     <w:p>
       <w:r>
-        <w:t xml:space="preserve">This stores </w:t>
-      </w:r>
-      <w:proofErr w:type="gramStart"/>
-      <w:r>
-        <w:t>all of</w:t>
-      </w:r>
-      <w:proofErr w:type="gramEnd"/>
-      <w:r>
-        <w:t xml:space="preserve"> the current settings in the non-volatile memory</w:t>
+        <w:t>This stores all of the current settings in the non-volatile memory</w:t>
       </w:r>
       <w:r>
         <w:t>. Note that this is not often used since settings are normally saved each time they are changed.</w:t>
@@ -3514,7 +3031,6 @@
         <w:docPartUnique/>
       </w:docPartObj>
     </w:sdtPr>
-    <w:sdtEndPr/>
     <w:sdtContent>
       <w:sdt>
         <w:sdtPr>
@@ -3524,7 +3040,6 @@
             <w:docPartUnique/>
           </w:docPartObj>
         </w:sdtPr>
-        <w:sdtEndPr/>
         <w:sdtContent>
           <w:p>
             <w:pPr>
@@ -13067,6 +12582,118 @@
     </w:lvl>
   </w:abstractNum>
   <w:abstractNum w:abstractNumId="84" w15:restartNumberingAfterBreak="0">
+    <w:nsid w:val="74D85371"/>
+    <w:multiLevelType w:val="hybridMultilevel"/>
+    <w:tmpl w:val="B20E36AC"/>
+    <w:lvl w:ilvl="0" w:tplc="9D16C8EC">
+      <w:numFmt w:val="bullet"/>
+      <w:lvlText w:val="-"/>
+      <w:lvlJc w:val="left"/>
+      <w:pPr>
+        <w:ind w:left="720" w:hanging="360"/>
+      </w:pPr>
+      <w:rPr>
+        <w:rFonts w:ascii="Arial" w:eastAsia="Arial" w:hAnsi="Arial" w:cs="Arial" w:hint="default"/>
+      </w:rPr>
+    </w:lvl>
+    <w:lvl w:ilvl="1" w:tplc="04090003" w:tentative="1">
+      <w:start w:val="1"/>
+      <w:numFmt w:val="bullet"/>
+      <w:lvlText w:val="o"/>
+      <w:lvlJc w:val="left"/>
+      <w:pPr>
+        <w:ind w:left="1440" w:hanging="360"/>
+      </w:pPr>
+      <w:rPr>
+        <w:rFonts w:ascii="Courier New" w:hAnsi="Courier New" w:cs="Courier New" w:hint="default"/>
+      </w:rPr>
+    </w:lvl>
+    <w:lvl w:ilvl="2" w:tplc="04090005" w:tentative="1">
+      <w:start w:val="1"/>
+      <w:numFmt w:val="bullet"/>
+      <w:lvlText w:val=""/>
+      <w:lvlJc w:val="left"/>
+      <w:pPr>
+        <w:ind w:left="2160" w:hanging="360"/>
+      </w:pPr>
+      <w:rPr>
+        <w:rFonts w:ascii="Wingdings" w:hAnsi="Wingdings" w:hint="default"/>
+      </w:rPr>
+    </w:lvl>
+    <w:lvl w:ilvl="3" w:tplc="04090001" w:tentative="1">
+      <w:start w:val="1"/>
+      <w:numFmt w:val="bullet"/>
+      <w:lvlText w:val=""/>
+      <w:lvlJc w:val="left"/>
+      <w:pPr>
+        <w:ind w:left="2880" w:hanging="360"/>
+      </w:pPr>
+      <w:rPr>
+        <w:rFonts w:ascii="Symbol" w:hAnsi="Symbol" w:hint="default"/>
+      </w:rPr>
+    </w:lvl>
+    <w:lvl w:ilvl="4" w:tplc="04090003" w:tentative="1">
+      <w:start w:val="1"/>
+      <w:numFmt w:val="bullet"/>
+      <w:lvlText w:val="o"/>
+      <w:lvlJc w:val="left"/>
+      <w:pPr>
+        <w:ind w:left="3600" w:hanging="360"/>
+      </w:pPr>
+      <w:rPr>
+        <w:rFonts w:ascii="Courier New" w:hAnsi="Courier New" w:cs="Courier New" w:hint="default"/>
+      </w:rPr>
+    </w:lvl>
+    <w:lvl w:ilvl="5" w:tplc="04090005" w:tentative="1">
+      <w:start w:val="1"/>
+      <w:numFmt w:val="bullet"/>
+      <w:lvlText w:val=""/>
+      <w:lvlJc w:val="left"/>
+      <w:pPr>
+        <w:ind w:left="4320" w:hanging="360"/>
+      </w:pPr>
+      <w:rPr>
+        <w:rFonts w:ascii="Wingdings" w:hAnsi="Wingdings" w:hint="default"/>
+      </w:rPr>
+    </w:lvl>
+    <w:lvl w:ilvl="6" w:tplc="04090001" w:tentative="1">
+      <w:start w:val="1"/>
+      <w:numFmt w:val="bullet"/>
+      <w:lvlText w:val=""/>
+      <w:lvlJc w:val="left"/>
+      <w:pPr>
+        <w:ind w:left="5040" w:hanging="360"/>
+      </w:pPr>
+      <w:rPr>
+        <w:rFonts w:ascii="Symbol" w:hAnsi="Symbol" w:hint="default"/>
+      </w:rPr>
+    </w:lvl>
+    <w:lvl w:ilvl="7" w:tplc="04090003" w:tentative="1">
+      <w:start w:val="1"/>
+      <w:numFmt w:val="bullet"/>
+      <w:lvlText w:val="o"/>
+      <w:lvlJc w:val="left"/>
+      <w:pPr>
+        <w:ind w:left="5760" w:hanging="360"/>
+      </w:pPr>
+      <w:rPr>
+        <w:rFonts w:ascii="Courier New" w:hAnsi="Courier New" w:cs="Courier New" w:hint="default"/>
+      </w:rPr>
+    </w:lvl>
+    <w:lvl w:ilvl="8" w:tplc="04090005" w:tentative="1">
+      <w:start w:val="1"/>
+      <w:numFmt w:val="bullet"/>
+      <w:lvlText w:val=""/>
+      <w:lvlJc w:val="left"/>
+      <w:pPr>
+        <w:ind w:left="6480" w:hanging="360"/>
+      </w:pPr>
+      <w:rPr>
+        <w:rFonts w:ascii="Wingdings" w:hAnsi="Wingdings" w:hint="default"/>
+      </w:rPr>
+    </w:lvl>
+  </w:abstractNum>
+  <w:abstractNum w:abstractNumId="85" w15:restartNumberingAfterBreak="0">
     <w:nsid w:val="75FA3747"/>
     <w:multiLevelType w:val="hybridMultilevel"/>
     <w:tmpl w:val="B9F43A9E"/>
@@ -13178,7 +12805,7 @@
       </w:rPr>
     </w:lvl>
   </w:abstractNum>
-  <w:abstractNum w:abstractNumId="85" w15:restartNumberingAfterBreak="0">
+  <w:abstractNum w:abstractNumId="86" w15:restartNumberingAfterBreak="0">
     <w:nsid w:val="7877407A"/>
     <w:multiLevelType w:val="hybridMultilevel"/>
     <w:tmpl w:val="C91E38FA"/>
@@ -13290,7 +12917,7 @@
       </w:rPr>
     </w:lvl>
   </w:abstractNum>
-  <w:abstractNum w:abstractNumId="86" w15:restartNumberingAfterBreak="0">
+  <w:abstractNum w:abstractNumId="87" w15:restartNumberingAfterBreak="0">
     <w:nsid w:val="78A40DC3"/>
     <w:multiLevelType w:val="hybridMultilevel"/>
     <w:tmpl w:val="F1E6B4B6"/>
@@ -13402,7 +13029,7 @@
       </w:rPr>
     </w:lvl>
   </w:abstractNum>
-  <w:abstractNum w:abstractNumId="87" w15:restartNumberingAfterBreak="0">
+  <w:abstractNum w:abstractNumId="88" w15:restartNumberingAfterBreak="0">
     <w:nsid w:val="79587B7C"/>
     <w:multiLevelType w:val="hybridMultilevel"/>
     <w:tmpl w:val="6A46933A"/>
@@ -13514,7 +13141,7 @@
       </w:rPr>
     </w:lvl>
   </w:abstractNum>
-  <w:abstractNum w:abstractNumId="88" w15:restartNumberingAfterBreak="0">
+  <w:abstractNum w:abstractNumId="89" w15:restartNumberingAfterBreak="0">
     <w:nsid w:val="7BB23699"/>
     <w:multiLevelType w:val="hybridMultilevel"/>
     <w:tmpl w:val="26C25814"/>
@@ -13626,7 +13253,7 @@
       </w:rPr>
     </w:lvl>
   </w:abstractNum>
-  <w:abstractNum w:abstractNumId="89" w15:restartNumberingAfterBreak="0">
+  <w:abstractNum w:abstractNumId="90" w15:restartNumberingAfterBreak="0">
     <w:nsid w:val="7F827ECF"/>
     <w:multiLevelType w:val="hybridMultilevel"/>
     <w:tmpl w:val="42DE9398"/>
@@ -13757,7 +13384,7 @@
     <w:abstractNumId w:val="75"/>
   </w:num>
   <w:num w:numId="7" w16cid:durableId="693576224">
-    <w:abstractNumId w:val="87"/>
+    <w:abstractNumId w:val="88"/>
   </w:num>
   <w:num w:numId="8" w16cid:durableId="1298343021">
     <w:abstractNumId w:val="83"/>
@@ -13784,7 +13411,7 @@
     <w:abstractNumId w:val="5"/>
   </w:num>
   <w:num w:numId="16" w16cid:durableId="1421751508">
-    <w:abstractNumId w:val="89"/>
+    <w:abstractNumId w:val="90"/>
   </w:num>
   <w:num w:numId="17" w16cid:durableId="1009716389">
     <w:abstractNumId w:val="60"/>
@@ -13853,7 +13480,7 @@
     <w:abstractNumId w:val="34"/>
   </w:num>
   <w:num w:numId="39" w16cid:durableId="798885554">
-    <w:abstractNumId w:val="88"/>
+    <w:abstractNumId w:val="89"/>
   </w:num>
   <w:num w:numId="40" w16cid:durableId="1610315013">
     <w:abstractNumId w:val="76"/>
@@ -13895,10 +13522,10 @@
     <w:abstractNumId w:val="55"/>
   </w:num>
   <w:num w:numId="53" w16cid:durableId="1740665818">
-    <w:abstractNumId w:val="84"/>
+    <w:abstractNumId w:val="85"/>
   </w:num>
   <w:num w:numId="54" w16cid:durableId="452988921">
-    <w:abstractNumId w:val="85"/>
+    <w:abstractNumId w:val="86"/>
   </w:num>
   <w:num w:numId="55" w16cid:durableId="207304158">
     <w:abstractNumId w:val="67"/>
@@ -13964,7 +13591,7 @@
     <w:abstractNumId w:val="42"/>
   </w:num>
   <w:num w:numId="76" w16cid:durableId="539049649">
-    <w:abstractNumId w:val="86"/>
+    <w:abstractNumId w:val="87"/>
   </w:num>
   <w:num w:numId="77" w16cid:durableId="1288513951">
     <w:abstractNumId w:val="61"/>
@@ -14007,6 +13634,9 @@
   </w:num>
   <w:num w:numId="90" w16cid:durableId="974530531">
     <w:abstractNumId w:val="62"/>
+  </w:num>
+  <w:num w:numId="91" w16cid:durableId="780148532">
+    <w:abstractNumId w:val="84"/>
   </w:num>
   <w:numIdMacAtCleanup w:val="84"/>
 </w:numbering>

</xml_diff>

<commit_message>
Added adjustable buzzer frequency.
</commit_message>
<xml_diff>
--- a/RadioFox.docx
+++ b/RadioFox.docx
@@ -53,7 +53,15 @@
         <w:t>amateur</w:t>
       </w:r>
       <w:r>
-        <w:t xml:space="preserve"> radio enthusiasts (AKA Hams) that is know as fox hunting or sometimes as bunny hunting. It is played by hiding a transmitter that transmits periodically and then silent until it is time to transmit again. This cycle repeats. Teams use radio receivers with directional antennas to find the transmitter.</w:t>
+        <w:t xml:space="preserve"> radio enthusiasts (AKA Hams) that is </w:t>
+      </w:r>
+      <w:proofErr w:type="gramStart"/>
+      <w:r>
+        <w:t>know</w:t>
+      </w:r>
+      <w:proofErr w:type="gramEnd"/>
+      <w:r>
+        <w:t xml:space="preserve"> as fox hunting or sometimes as bunny hunting. It is played by hiding a transmitter that transmits periodically and then silent until it is time to transmit again. This cycle repeats. Teams use radio receivers with directional antennas to find the transmitter.</w:t>
       </w:r>
       <w:r>
         <w:t xml:space="preserve"> The technique is called triangulation. The first team to find the transmitter wins.</w:t>
@@ -74,7 +82,15 @@
         <w:t xml:space="preserve">Many of these radios are homemade using handheld radios and timers. This device is a single PCB (printed circuit board) using an esp32 (Arduino) </w:t>
       </w:r>
       <w:r>
-        <w:t>computer with a display. There are two 18650 batteries with charging circuit and an SA818 shortwave transceiver module on the PCB. A rotary push button dial is used to set the various parameters for the fox</w:t>
+        <w:t xml:space="preserve">computer with a display. There are two 18650 batteries with charging </w:t>
+      </w:r>
+      <w:proofErr w:type="gramStart"/>
+      <w:r>
+        <w:t>circuit</w:t>
+      </w:r>
+      <w:proofErr w:type="gramEnd"/>
+      <w:r>
+        <w:t xml:space="preserve"> and an SA818 shortwave transceiver module on the PCB. A rotary push button dial is used to set the various parameters for the fox</w:t>
       </w:r>
       <w:r>
         <w:t>. These parameters include transmit time, pause time, frequency settings</w:t>
@@ -203,7 +219,15 @@
         <w:t xml:space="preserve"> actual versions will be listed here</w:t>
       </w:r>
       <w:r>
-        <w:t xml:space="preserve"> if and when the source code is released.</w:t>
+        <w:t xml:space="preserve"> </w:t>
+      </w:r>
+      <w:proofErr w:type="gramStart"/>
+      <w:r>
+        <w:t>if and when</w:t>
+      </w:r>
+      <w:proofErr w:type="gramEnd"/>
+      <w:r>
+        <w:t xml:space="preserve"> the source code is released.</w:t>
       </w:r>
     </w:p>
     <w:p>
@@ -225,11 +249,102 @@
       <w:r>
         <w:t xml:space="preserve"> </w:t>
       </w:r>
+      <w:proofErr w:type="gramStart"/>
       <w:r>
         <w:t>C</w:t>
       </w:r>
       <w:r>
-        <w:t>hanges are described below.</w:t>
+        <w:t>hanges</w:t>
+      </w:r>
+      <w:proofErr w:type="gramEnd"/>
+      <w:r>
+        <w:t xml:space="preserve"> are described below.</w:t>
+      </w:r>
+    </w:p>
+    <w:p>
+      <w:r>
+        <w:t>Version 1.05</w:t>
+      </w:r>
+    </w:p>
+    <w:p>
+      <w:pPr>
+        <w:pStyle w:val="ListParagraph"/>
+        <w:numPr>
+          <w:ilvl w:val="0"/>
+          <w:numId w:val="92"/>
+        </w:numPr>
+      </w:pPr>
+      <w:r>
+        <w:t>Added adjustable</w:t>
+      </w:r>
+      <w:r>
+        <w:t xml:space="preserve"> morse pitch, from 300 to 3000 Hz.</w:t>
+      </w:r>
+    </w:p>
+    <w:p>
+      <w:r>
+        <w:t>Version 1.04</w:t>
+      </w:r>
+    </w:p>
+    <w:p>
+      <w:pPr>
+        <w:pStyle w:val="ListParagraph"/>
+        <w:numPr>
+          <w:ilvl w:val="0"/>
+          <w:numId w:val="92"/>
+        </w:numPr>
+      </w:pPr>
+      <w:r>
+        <w:lastRenderedPageBreak/>
+        <w:t>Fixed crash when no SD card found.</w:t>
+      </w:r>
+    </w:p>
+    <w:p>
+      <w:r>
+        <w:t>Version 1.03</w:t>
+      </w:r>
+    </w:p>
+    <w:p>
+      <w:pPr>
+        <w:pStyle w:val="ListParagraph"/>
+        <w:numPr>
+          <w:ilvl w:val="0"/>
+          <w:numId w:val="92"/>
+        </w:numPr>
+      </w:pPr>
+      <w:r>
+        <w:t>Fixed hang problem #26</w:t>
+      </w:r>
+      <w:r>
+        <w:t xml:space="preserve">. Short </w:t>
+      </w:r>
+      <w:proofErr w:type="spellStart"/>
+      <w:r>
+        <w:t>tx</w:t>
+      </w:r>
+      <w:proofErr w:type="spellEnd"/>
+      <w:r>
+        <w:t xml:space="preserve"> time and B0 pressed</w:t>
+      </w:r>
+      <w:r>
+        <w:t xml:space="preserve"> caused display to stop updating.</w:t>
+      </w:r>
+    </w:p>
+    <w:p>
+      <w:r>
+        <w:t>Version 1.02</w:t>
+      </w:r>
+    </w:p>
+    <w:p>
+      <w:pPr>
+        <w:pStyle w:val="ListParagraph"/>
+        <w:numPr>
+          <w:ilvl w:val="0"/>
+          <w:numId w:val="92"/>
+        </w:numPr>
+      </w:pPr>
+      <w:r>
+        <w:t>Changed prompts from BTN0/1 to B0/1 to match the labels on the case.</w:t>
       </w:r>
     </w:p>
     <w:p>
@@ -246,16 +361,7 @@
         </w:numPr>
       </w:pPr>
       <w:r>
-        <w:t>Made TX red dot larger.</w:t>
-      </w:r>
-      <w:r>
-        <w:t xml:space="preserve"> </w:t>
-      </w:r>
-      <w:r>
-        <w:t>Show DTMF characters in green on the bottom. (not tested yet)</w:t>
-      </w:r>
-      <w:r>
-        <w:t>.</w:t>
+        <w:t>Made TX red dot larger. Show DTMF characters in green on the bottom. (not tested yet).</w:t>
       </w:r>
     </w:p>
     <w:p>
@@ -275,12 +381,13 @@
         </w:numPr>
       </w:pPr>
       <w:r>
-        <w:lastRenderedPageBreak/>
         <w:t xml:space="preserve">This is </w:t>
       </w:r>
+      <w:proofErr w:type="gramStart"/>
       <w:r>
         <w:t>initial</w:t>
       </w:r>
+      <w:proofErr w:type="gramEnd"/>
       <w:r>
         <w:t xml:space="preserve"> version when this document was first created. The software is considered mostly complete.</w:t>
       </w:r>
@@ -314,7 +421,15 @@
         <w:t>Th</w:t>
       </w:r>
       <w:r>
-        <w:t xml:space="preserve">e Fox is a single PCB that includes an 18650 battery holder that can have </w:t>
+        <w:t xml:space="preserve">e Fox is a single PCB that includes an </w:t>
+      </w:r>
+      <w:proofErr w:type="gramStart"/>
+      <w:r>
+        <w:t>18650 battery</w:t>
+      </w:r>
+      <w:proofErr w:type="gramEnd"/>
+      <w:r>
+        <w:t xml:space="preserve"> holder that can have </w:t>
       </w:r>
       <w:r>
         <w:t>1 or 2 batteries. There is a USB C connector on the left edge that is used for charging the batteries.</w:t>
@@ -352,7 +467,15 @@
         <w:t>V on the top right. There are vents in the case to allow cooling as this module can become quite hot when transmitting at high power for longer timer intervals. Transmitting longer than one minute is not recommended.</w:t>
       </w:r>
       <w:r>
-        <w:t xml:space="preserve"> High power is about 5W and low power</w:t>
+        <w:t xml:space="preserve"> High power is about </w:t>
+      </w:r>
+      <w:proofErr w:type="gramStart"/>
+      <w:r>
+        <w:t>5W</w:t>
+      </w:r>
+      <w:proofErr w:type="gramEnd"/>
+      <w:r>
+        <w:t xml:space="preserve"> and low power</w:t>
       </w:r>
       <w:r>
         <w:t xml:space="preserve"> is about 3W. Make sure a suitable antenna is connected to avoid damage to the radio circuit.</w:t>
@@ -375,7 +498,15 @@
         <w:t>batteries must button top style and protection is recommended</w:t>
       </w:r>
       <w:r>
-        <w:t xml:space="preserve">. The 18650 battery length is a very loose standard and some batteries may not fit. Too long and they can’t be used. Too short, it might be possible to bend the </w:t>
+        <w:t xml:space="preserve">. The </w:t>
+      </w:r>
+      <w:proofErr w:type="gramStart"/>
+      <w:r>
+        <w:t>18650 battery</w:t>
+      </w:r>
+      <w:proofErr w:type="gramEnd"/>
+      <w:r>
+        <w:t xml:space="preserve"> length is a very loose standard and some batteries may not fit. Too long and they can’t be used. Too short, it might be possible to bend the </w:t>
       </w:r>
       <w:r>
         <w:t>contacts on the battery holder negative side. The battery holder is polarized to prevent insertion in the wrong direction.</w:t>
@@ -389,6 +520,7 @@
         <w:pStyle w:val="Heading1"/>
       </w:pPr>
       <w:r>
+        <w:lastRenderedPageBreak/>
         <w:t>Run Time</w:t>
       </w:r>
     </w:p>
@@ -397,7 +529,23 @@
         <w:t xml:space="preserve">The actual runtime depends on the transmitting time and </w:t>
       </w:r>
       <w:r>
-        <w:t>quality of the batteries. There are many deceptively labelled 18650 batteries available. The best one are made by Panasonic and Sanyo</w:t>
+        <w:t xml:space="preserve">quality of the batteries. There are many deceptively labelled 18650 batteries available. The best </w:t>
+      </w:r>
+      <w:proofErr w:type="gramStart"/>
+      <w:r>
+        <w:t>one</w:t>
+      </w:r>
+      <w:proofErr w:type="gramEnd"/>
+      <w:r>
+        <w:t xml:space="preserve"> </w:t>
+      </w:r>
+      <w:proofErr w:type="gramStart"/>
+      <w:r>
+        <w:t>are</w:t>
+      </w:r>
+      <w:proofErr w:type="gramEnd"/>
+      <w:r>
+        <w:t xml:space="preserve"> made by Panasonic and Sanyo</w:t>
       </w:r>
       <w:r>
         <w:t>. Using 1 minute transmit, 4 minutes pause, low power setting</w:t>
@@ -417,7 +565,6 @@
         <w:pStyle w:val="Heading1"/>
       </w:pPr>
       <w:r>
-        <w:lastRenderedPageBreak/>
         <w:t>Tone Files</w:t>
       </w:r>
     </w:p>
@@ -521,8 +668,17 @@
           <w:b/>
           <w:bCs/>
         </w:rPr>
-        <w:t>This is the Tetris theme music</w:t>
-      </w:r>
+        <w:t xml:space="preserve">This is the Tetris theme </w:t>
+      </w:r>
+      <w:proofErr w:type="gramStart"/>
+      <w:r>
+        <w:rPr>
+          <w:b/>
+          <w:bCs/>
+        </w:rPr>
+        <w:t>music</w:t>
+      </w:r>
+      <w:proofErr w:type="gramEnd"/>
     </w:p>
     <w:p>
       <w:pPr>
@@ -566,8 +722,17 @@
           <w:b/>
           <w:bCs/>
         </w:rPr>
-        <w:t>and that the data starts with the tilde which must not be in these comments</w:t>
-      </w:r>
+        <w:t xml:space="preserve">and that the data starts with the tilde which must not be in these </w:t>
+      </w:r>
+      <w:proofErr w:type="gramStart"/>
+      <w:r>
+        <w:rPr>
+          <w:b/>
+          <w:bCs/>
+        </w:rPr>
+        <w:t>comments</w:t>
+      </w:r>
+      <w:proofErr w:type="gramEnd"/>
     </w:p>
     <w:p>
       <w:pPr>
@@ -597,23 +762,41 @@
           <w:b/>
           <w:bCs/>
         </w:rPr>
-        <w:t xml:space="preserve"> can be used to set the length of the note, it defaults to 90% and 10% quiet after the note</w:t>
-      </w:r>
-    </w:p>
-    <w:p>
-      <w:pPr>
+        <w:t xml:space="preserve"> can be used to set the length of the note, it defaults to 90% and 10% quiet after the </w:t>
+      </w:r>
+      <w:proofErr w:type="gramStart"/>
+      <w:r>
         <w:rPr>
           <w:b/>
           <w:bCs/>
         </w:rPr>
-      </w:pPr>
-      <w:r>
+        <w:t>note</w:t>
+      </w:r>
+      <w:proofErr w:type="gramEnd"/>
+    </w:p>
+    <w:p>
+      <w:pPr>
         <w:rPr>
           <w:b/>
           <w:bCs/>
         </w:rPr>
-        <w:t>This can be used for pizzicato notes, LENGTH, 25, for example</w:t>
-      </w:r>
+      </w:pPr>
+      <w:r>
+        <w:rPr>
+          <w:b/>
+          <w:bCs/>
+        </w:rPr>
+        <w:t xml:space="preserve">This can be used for pizzicato notes, LENGTH, 25, for </w:t>
+      </w:r>
+      <w:proofErr w:type="gramStart"/>
+      <w:r>
+        <w:rPr>
+          <w:b/>
+          <w:bCs/>
+        </w:rPr>
+        <w:t>example</w:t>
+      </w:r>
+      <w:proofErr w:type="gramEnd"/>
     </w:p>
     <w:p>
       <w:pPr>
@@ -672,22 +855,23 @@
           <w:b/>
           <w:bCs/>
         </w:rPr>
-        <w:t>NOTE_E5, 4,  NOTE_B4, 8,  NOTE_C5, 8,  NOTE_D5, 4,  NOTE_C5, 8,  NOTE_B4, 8,</w:t>
-      </w:r>
-    </w:p>
-    <w:p>
-      <w:pPr>
+        <w:t xml:space="preserve">NOTE_E5, </w:t>
+      </w:r>
+      <w:proofErr w:type="gramStart"/>
+      <w:r>
         <w:rPr>
           <w:b/>
           <w:bCs/>
         </w:rPr>
-      </w:pPr>
+        <w:t>4,  NOTE</w:t>
+      </w:r>
+      <w:proofErr w:type="gramEnd"/>
       <w:r>
         <w:rPr>
           <w:b/>
           <w:bCs/>
         </w:rPr>
-        <w:t>NOTE_A4, 4,  NOTE_A4, 8,  NOTE_C5, 8,  NOTE_E5, 4,  NOTE_D5, 8,  NOTE_C5, 8,</w:t>
+        <w:t>_B4, 8,  NOTE_C5, 8,  NOTE_D5, 4,  NOTE_C5, 8,  NOTE_B4, 8,</w:t>
       </w:r>
     </w:p>
     <w:p>
@@ -702,22 +886,23 @@
           <w:b/>
           <w:bCs/>
         </w:rPr>
-        <w:t>NOTE_B4, -4, NOTE_C5, 8,  NOTE_D5, 4,  NOTE_E5, 4,</w:t>
-      </w:r>
-    </w:p>
-    <w:p>
-      <w:pPr>
+        <w:t xml:space="preserve">NOTE_A4, </w:t>
+      </w:r>
+      <w:proofErr w:type="gramStart"/>
+      <w:r>
         <w:rPr>
           <w:b/>
           <w:bCs/>
         </w:rPr>
-      </w:pPr>
+        <w:t>4,  NOTE</w:t>
+      </w:r>
+      <w:proofErr w:type="gramEnd"/>
       <w:r>
         <w:rPr>
           <w:b/>
           <w:bCs/>
         </w:rPr>
-        <w:t>NOTE_C5, 4,  NOTE_A4, 4,  NOTE_A4, 8,  NOTE_A4, 4,  NOTE_B4, 8,  NOTE_C5, 8,</w:t>
+        <w:t>_A4, 8,  NOTE_C5, 8,  NOTE_E5, 4,  NOTE_D5, 8,  NOTE_C5, 8,</w:t>
       </w:r>
     </w:p>
     <w:p>
@@ -732,22 +917,23 @@
           <w:b/>
           <w:bCs/>
         </w:rPr>
-        <w:t>NOTE_D5, -4, NOTE_F5, 8,  NOTE_A5, 4,  NOTE_G5, 8,  NOTE_F5, 8,</w:t>
-      </w:r>
-    </w:p>
-    <w:p>
-      <w:pPr>
+        <w:t xml:space="preserve">NOTE_B4, -4, NOTE_C5, </w:t>
+      </w:r>
+      <w:proofErr w:type="gramStart"/>
+      <w:r>
         <w:rPr>
           <w:b/>
           <w:bCs/>
         </w:rPr>
-      </w:pPr>
+        <w:t>8,  NOTE</w:t>
+      </w:r>
+      <w:proofErr w:type="gramEnd"/>
       <w:r>
         <w:rPr>
           <w:b/>
           <w:bCs/>
         </w:rPr>
-        <w:t>NOTE_E5, -4, NOTE_C5, 8,  NOTE_E5, 4,  NOTE_D5, 8,  NOTE_C5, 8,</w:t>
+        <w:t>_D5, 4,  NOTE_E5, 4,</w:t>
       </w:r>
     </w:p>
     <w:p>
@@ -762,22 +948,147 @@
           <w:b/>
           <w:bCs/>
         </w:rPr>
-        <w:t>NOTE_B4, 4,  NOTE_B4, 8,  NOTE_C5, 8,  NOTE_D5, 4,  NOTE_E5, 4,</w:t>
-      </w:r>
-    </w:p>
-    <w:p>
-      <w:pPr>
+        <w:t xml:space="preserve">NOTE_C5, </w:t>
+      </w:r>
+      <w:proofErr w:type="gramStart"/>
+      <w:r>
         <w:rPr>
           <w:b/>
           <w:bCs/>
         </w:rPr>
-      </w:pPr>
+        <w:t>4,  NOTE</w:t>
+      </w:r>
+      <w:proofErr w:type="gramEnd"/>
       <w:r>
         <w:rPr>
           <w:b/>
           <w:bCs/>
         </w:rPr>
-        <w:t>NOTE_C5, 4,  NOTE_A4, 4,  NOTE_A4, 4, REST, 4,</w:t>
+        <w:t>_A4, 4,  NOTE_A4, 8,  NOTE_A4, 4,  NOTE_B4, 8,  NOTE_C5, 8,</w:t>
+      </w:r>
+    </w:p>
+    <w:p>
+      <w:pPr>
+        <w:rPr>
+          <w:b/>
+          <w:bCs/>
+        </w:rPr>
+      </w:pPr>
+      <w:r>
+        <w:rPr>
+          <w:b/>
+          <w:bCs/>
+        </w:rPr>
+        <w:t xml:space="preserve">NOTE_D5, -4, NOTE_F5, </w:t>
+      </w:r>
+      <w:proofErr w:type="gramStart"/>
+      <w:r>
+        <w:rPr>
+          <w:b/>
+          <w:bCs/>
+        </w:rPr>
+        <w:t>8,  NOTE</w:t>
+      </w:r>
+      <w:proofErr w:type="gramEnd"/>
+      <w:r>
+        <w:rPr>
+          <w:b/>
+          <w:bCs/>
+        </w:rPr>
+        <w:t>_A5, 4,  NOTE_G5, 8,  NOTE_F5, 8,</w:t>
+      </w:r>
+    </w:p>
+    <w:p>
+      <w:pPr>
+        <w:rPr>
+          <w:b/>
+          <w:bCs/>
+        </w:rPr>
+      </w:pPr>
+      <w:r>
+        <w:rPr>
+          <w:b/>
+          <w:bCs/>
+        </w:rPr>
+        <w:t xml:space="preserve">NOTE_E5, -4, NOTE_C5, </w:t>
+      </w:r>
+      <w:proofErr w:type="gramStart"/>
+      <w:r>
+        <w:rPr>
+          <w:b/>
+          <w:bCs/>
+        </w:rPr>
+        <w:t>8,  NOTE</w:t>
+      </w:r>
+      <w:proofErr w:type="gramEnd"/>
+      <w:r>
+        <w:rPr>
+          <w:b/>
+          <w:bCs/>
+        </w:rPr>
+        <w:t>_E5, 4,  NOTE_D5, 8,  NOTE_C5, 8,</w:t>
+      </w:r>
+    </w:p>
+    <w:p>
+      <w:pPr>
+        <w:rPr>
+          <w:b/>
+          <w:bCs/>
+        </w:rPr>
+      </w:pPr>
+      <w:r>
+        <w:rPr>
+          <w:b/>
+          <w:bCs/>
+        </w:rPr>
+        <w:t xml:space="preserve">NOTE_B4, </w:t>
+      </w:r>
+      <w:proofErr w:type="gramStart"/>
+      <w:r>
+        <w:rPr>
+          <w:b/>
+          <w:bCs/>
+        </w:rPr>
+        <w:t>4,  NOTE</w:t>
+      </w:r>
+      <w:proofErr w:type="gramEnd"/>
+      <w:r>
+        <w:rPr>
+          <w:b/>
+          <w:bCs/>
+        </w:rPr>
+        <w:t>_B4, 8,  NOTE_C5, 8,  NOTE_D5, 4,  NOTE_E5, 4,</w:t>
+      </w:r>
+    </w:p>
+    <w:p>
+      <w:pPr>
+        <w:rPr>
+          <w:b/>
+          <w:bCs/>
+        </w:rPr>
+      </w:pPr>
+      <w:r>
+        <w:rPr>
+          <w:b/>
+          <w:bCs/>
+        </w:rPr>
+        <w:t xml:space="preserve">NOTE_C5, </w:t>
+      </w:r>
+      <w:proofErr w:type="gramStart"/>
+      <w:r>
+        <w:rPr>
+          <w:b/>
+          <w:bCs/>
+        </w:rPr>
+        <w:t>4,  NOTE</w:t>
+      </w:r>
+      <w:proofErr w:type="gramEnd"/>
+      <w:r>
+        <w:rPr>
+          <w:b/>
+          <w:bCs/>
+        </w:rPr>
+        <w:t>_A4, 4,  NOTE_A4, 4, REST, 4,</w:t>
       </w:r>
     </w:p>
     <w:p>
@@ -785,6 +1096,7 @@
         <w:pStyle w:val="Heading1"/>
       </w:pPr>
       <w:r>
+        <w:lastRenderedPageBreak/>
         <w:t>Updating Firmware</w:t>
       </w:r>
     </w:p>
@@ -811,7 +1123,15 @@
         <w:t xml:space="preserve"> that will attempt to load this file</w:t>
       </w:r>
       <w:r>
-        <w:t>. Confirmation will be required from the dial, After loading the BIN file can optionally be erased.</w:t>
+        <w:t xml:space="preserve">. Confirmation will be required from the dial, </w:t>
+      </w:r>
+      <w:proofErr w:type="gramStart"/>
+      <w:r>
+        <w:t>After</w:t>
+      </w:r>
+      <w:proofErr w:type="gramEnd"/>
+      <w:r>
+        <w:t xml:space="preserve"> loading the BIN file can optionally be erased.</w:t>
       </w:r>
     </w:p>
     <w:p>
@@ -839,11 +1159,7 @@
         <w:t>the menu system</w:t>
       </w:r>
       <w:r>
-        <w:t xml:space="preserve"> and is done by holding the button down for about a ½ second or longer. This long press time is also adjustable </w:t>
-      </w:r>
-      <w:r>
-        <w:lastRenderedPageBreak/>
-        <w:t xml:space="preserve">if a longer or shorter time is preferred. The system has two modes of operation. After booting the display shows the </w:t>
+        <w:t xml:space="preserve"> and is done by holding the button down for about a ½ second or longer. This long press time is also adjustable if a longer or shorter time is preferred. The system has two modes of operation. After booting the display shows the </w:t>
       </w:r>
       <w:r>
         <w:t xml:space="preserve">radio status and some important </w:t>
@@ -972,12 +1288,14 @@
       <w:r>
         <w:t xml:space="preserve"> The top one is called </w:t>
       </w:r>
+      <w:proofErr w:type="gramStart"/>
       <w:r>
         <w:t>B</w:t>
       </w:r>
       <w:r>
         <w:t>0</w:t>
       </w:r>
+      <w:proofErr w:type="gramEnd"/>
       <w:r>
         <w:t xml:space="preserve"> and the bottom one is called </w:t>
       </w:r>
@@ -1314,6 +1632,7 @@
         <w:rPr>
           <w:lang w:val="en-US"/>
         </w:rPr>
+        <w:lastRenderedPageBreak/>
         <w:t>B</w:t>
       </w:r>
       <w:r>
@@ -1375,7 +1694,21 @@
         <w:rPr>
           <w:lang w:val="en-US"/>
         </w:rPr>
-        <w:t xml:space="preserve">. After a dial click the increment will change to 10 and dial will add and subtract </w:t>
+        <w:t xml:space="preserve">. After a dial </w:t>
+      </w:r>
+      <w:proofErr w:type="gramStart"/>
+      <w:r>
+        <w:rPr>
+          <w:lang w:val="en-US"/>
+        </w:rPr>
+        <w:t>click</w:t>
+      </w:r>
+      <w:proofErr w:type="gramEnd"/>
+      <w:r>
+        <w:rPr>
+          <w:lang w:val="en-US"/>
+        </w:rPr>
+        <w:t xml:space="preserve"> the increment will change to 10 and dial will add and subtract </w:t>
       </w:r>
       <w:r>
         <w:rPr>
@@ -1508,11 +1841,7 @@
         <w:t xml:space="preserve"> values toggle with each click.</w:t>
       </w:r>
       <w:r>
-        <w:t xml:space="preserve"> Multiple selections cycle through all the available </w:t>
-      </w:r>
-      <w:r>
-        <w:lastRenderedPageBreak/>
-        <w:t>options.</w:t>
+        <w:t xml:space="preserve"> Multiple selections cycle through all the available options.</w:t>
       </w:r>
       <w:r>
         <w:t xml:space="preserve"> Integer values go to another screen that shows the minimum and maximum values. Rotating the dial right increases the value while rotating to the left decreases it by the increment amount. The increment amount can be changed by clicking the button which will cycle between different values. One of the values will be a reset to the original value, activated with a long press. A long press is also used to accept the new value and return to the menu. A * </w:t>
@@ -1524,10 +1853,18 @@
         <w:t xml:space="preserve">indicates the active menu line. A + in front of the menu means another menu will be activated. </w:t>
       </w:r>
       <w:r>
-        <w:t>Any menu item starting with ‘-‘</w:t>
-      </w:r>
-      <w:r>
-        <w:t xml:space="preserve"> goes back to the previous menu when clicked. A</w:t>
+        <w:t>Any menu item starting with ‘</w:t>
+      </w:r>
+      <w:proofErr w:type="gramStart"/>
+      <w:r>
+        <w:t>-‘</w:t>
+      </w:r>
+      <w:r>
+        <w:t xml:space="preserve"> goes</w:t>
+      </w:r>
+      <w:proofErr w:type="gramEnd"/>
+      <w:r>
+        <w:t xml:space="preserve"> back to the previous menu when clicked. A</w:t>
       </w:r>
       <w:r>
         <w:t xml:space="preserve"> dial</w:t>
@@ -1575,7 +1912,15 @@
         <w:ind w:left="1440"/>
       </w:pPr>
       <w:r>
-        <w:t xml:space="preserve">Select menu </w:t>
+        <w:t xml:space="preserve">Select </w:t>
+      </w:r>
+      <w:proofErr w:type="gramStart"/>
+      <w:r>
+        <w:t>menu</w:t>
+      </w:r>
+      <w:proofErr w:type="gramEnd"/>
+      <w:r>
+        <w:t xml:space="preserve"> </w:t>
       </w:r>
     </w:p>
     <w:p>
@@ -1589,8 +1934,13 @@
         <w:t xml:space="preserve"> or list</w:t>
       </w:r>
       <w:r>
-        <w:t xml:space="preserve"> values</w:t>
-      </w:r>
+        <w:t xml:space="preserve"> </w:t>
+      </w:r>
+      <w:proofErr w:type="gramStart"/>
+      <w:r>
+        <w:t>values</w:t>
+      </w:r>
+      <w:proofErr w:type="gramEnd"/>
     </w:p>
     <w:p>
       <w:pPr>
@@ -1613,8 +1963,13 @@
         <w:ind w:left="1440"/>
       </w:pPr>
       <w:r>
-        <w:t>Open menu system, goes to the remembered menu point</w:t>
-      </w:r>
+        <w:t xml:space="preserve">Open menu system, goes to the remembered menu </w:t>
+      </w:r>
+      <w:proofErr w:type="gramStart"/>
+      <w:r>
+        <w:t>point</w:t>
+      </w:r>
+      <w:proofErr w:type="gramEnd"/>
     </w:p>
     <w:p>
       <w:pPr>
@@ -1627,24 +1982,39 @@
         <w:t>radio</w:t>
       </w:r>
       <w:r>
-        <w:t xml:space="preserve"> mode, the current menu point is remembered</w:t>
-      </w:r>
+        <w:t xml:space="preserve"> mode, the current menu point is </w:t>
+      </w:r>
+      <w:proofErr w:type="gramStart"/>
+      <w:r>
+        <w:t>remembered</w:t>
+      </w:r>
+      <w:proofErr w:type="gramEnd"/>
     </w:p>
     <w:p>
       <w:pPr>
         <w:ind w:left="1440"/>
       </w:pPr>
       <w:r>
-        <w:t>Accept integer</w:t>
-      </w:r>
+        <w:t xml:space="preserve">Accept </w:t>
+      </w:r>
+      <w:proofErr w:type="gramStart"/>
+      <w:r>
+        <w:t>integer</w:t>
+      </w:r>
+      <w:proofErr w:type="gramEnd"/>
     </w:p>
     <w:p>
       <w:pPr>
         <w:ind w:left="1440"/>
       </w:pPr>
       <w:r>
-        <w:t>Choose filenames</w:t>
-      </w:r>
+        <w:t xml:space="preserve">Choose </w:t>
+      </w:r>
+      <w:proofErr w:type="gramStart"/>
+      <w:r>
+        <w:t>filenames</w:t>
+      </w:r>
+      <w:proofErr w:type="gramEnd"/>
     </w:p>
     <w:p>
       <w:pPr>
@@ -1659,8 +2029,13 @@
         <w:ind w:left="1440"/>
       </w:pPr>
       <w:r>
-        <w:t>Select menu item, including return to previous menu</w:t>
-      </w:r>
+        <w:t xml:space="preserve">Select menu item, including return to previous </w:t>
+      </w:r>
+      <w:proofErr w:type="gramStart"/>
+      <w:r>
+        <w:t>menu</w:t>
+      </w:r>
+      <w:proofErr w:type="gramEnd"/>
     </w:p>
     <w:p>
       <w:pPr>
@@ -1670,10 +2045,12 @@
         <w:t xml:space="preserve">Toggle </w:t>
       </w:r>
       <w:proofErr w:type="spellStart"/>
+      <w:proofErr w:type="gramStart"/>
       <w:r>
         <w:t>booleans</w:t>
       </w:r>
       <w:proofErr w:type="spellEnd"/>
+      <w:proofErr w:type="gramEnd"/>
     </w:p>
     <w:p>
       <w:pPr>
@@ -1683,8 +2060,13 @@
         <w:t>Cycle</w:t>
       </w:r>
       <w:r>
-        <w:t xml:space="preserve"> through multiple selections</w:t>
-      </w:r>
+        <w:t xml:space="preserve"> through multiple </w:t>
+      </w:r>
+      <w:proofErr w:type="gramStart"/>
+      <w:r>
+        <w:t>selections</w:t>
+      </w:r>
+      <w:proofErr w:type="gramEnd"/>
     </w:p>
     <w:p>
       <w:pPr>
@@ -1696,15 +2078,18 @@
       <w:r>
         <w:t xml:space="preserve">or list </w:t>
       </w:r>
+      <w:proofErr w:type="gramStart"/>
       <w:r>
         <w:t>selections</w:t>
       </w:r>
+      <w:proofErr w:type="gramEnd"/>
     </w:p>
     <w:p>
       <w:pPr>
         <w:pStyle w:val="Heading1"/>
       </w:pPr>
       <w:r>
+        <w:lastRenderedPageBreak/>
         <w:t>Main Operating Screen</w:t>
       </w:r>
     </w:p>
@@ -1728,13 +2113,29 @@
         <w:t xml:space="preserve"> The bottom of the screen shows the</w:t>
       </w:r>
       <w:r>
-        <w:t xml:space="preserve"> battery status on the right if it has been enabled. This is related to the current battery voltage and will drop while transmitting. There are also 4 LED’s on the PCB that can be seen through</w:t>
+        <w:t xml:space="preserve"> battery status on the right if it has been enabled. This is related to the current battery voltage and will drop while transmitting. There are also 4 </w:t>
+      </w:r>
+      <w:proofErr w:type="gramStart"/>
+      <w:r>
+        <w:t>LED’s</w:t>
+      </w:r>
+      <w:proofErr w:type="gramEnd"/>
+      <w:r>
+        <w:t xml:space="preserve"> on the PCB that can be seen through</w:t>
       </w:r>
       <w:r>
         <w:t xml:space="preserve"> the slot on the top of the case</w:t>
       </w:r>
       <w:r>
-        <w:t>. These LED’s are controlled by the battery charger circuit and indicate the battery status during running and charging.</w:t>
+        <w:t xml:space="preserve">. These </w:t>
+      </w:r>
+      <w:proofErr w:type="gramStart"/>
+      <w:r>
+        <w:t>LED’s</w:t>
+      </w:r>
+      <w:proofErr w:type="gramEnd"/>
+      <w:r>
+        <w:t xml:space="preserve"> are controlled by the battery charger circuit and indicate the battery status during running and charging.</w:t>
       </w:r>
     </w:p>
     <w:p/>
@@ -1743,7 +2144,15 @@
         <w:t>During transmitting the bottom left shows an animated red dot. In a future firmware update the</w:t>
       </w:r>
       <w:r>
-        <w:t xml:space="preserve"> received DTMF characters will be display next to this.</w:t>
+        <w:t xml:space="preserve"> received DTMF characters will be </w:t>
+      </w:r>
+      <w:proofErr w:type="gramStart"/>
+      <w:r>
+        <w:t>display</w:t>
+      </w:r>
+      <w:proofErr w:type="gramEnd"/>
+      <w:r>
+        <w:t xml:space="preserve"> next to this.</w:t>
       </w:r>
     </w:p>
     <w:p>
@@ -1751,7 +2160,6 @@
         <w:pStyle w:val="Heading1"/>
       </w:pPr>
       <w:r>
-        <w:lastRenderedPageBreak/>
         <w:t>Menu Details</w:t>
       </w:r>
     </w:p>
@@ -1759,8 +2167,13 @@
       <w:r>
         <w:t xml:space="preserve">The following sections detail each entry in </w:t>
       </w:r>
-      <w:r>
-        <w:t>all of the menus</w:t>
+      <w:proofErr w:type="gramStart"/>
+      <w:r>
+        <w:t>all of</w:t>
+      </w:r>
+      <w:proofErr w:type="gramEnd"/>
+      <w:r>
+        <w:t xml:space="preserve"> the menus</w:t>
       </w:r>
       <w:r>
         <w:t xml:space="preserve"> starting with the main or top menu</w:t>
@@ -1787,7 +2200,15 @@
         <w:t>’</w:t>
       </w:r>
       <w:r>
-        <w:t xml:space="preserve"> or a ‘-‘ to indicate a range</w:t>
+        <w:t xml:space="preserve"> or a ‘</w:t>
+      </w:r>
+      <w:proofErr w:type="gramStart"/>
+      <w:r>
+        <w:t>-‘ to</w:t>
+      </w:r>
+      <w:proofErr w:type="gramEnd"/>
+      <w:r>
+        <w:t xml:space="preserve"> indicate a range</w:t>
       </w:r>
       <w:r>
         <w:t>.</w:t>
@@ -1812,7 +2233,15 @@
         <w:t xml:space="preserve"> Some menu entries may depend on other menu items </w:t>
       </w:r>
       <w:r>
-        <w:t xml:space="preserve">settings. For example the audio file name menu item is hidden unless </w:t>
+        <w:t xml:space="preserve">settings. For </w:t>
+      </w:r>
+      <w:proofErr w:type="gramStart"/>
+      <w:r>
+        <w:t>example</w:t>
+      </w:r>
+      <w:proofErr w:type="gramEnd"/>
+      <w:r>
+        <w:t xml:space="preserve"> the audio file name menu item is hidden unless </w:t>
       </w:r>
       <w:r>
         <w:t>“Play Audio File” is Yes.</w:t>
@@ -1847,10 +2276,34 @@
     </w:p>
     <w:p>
       <w:r>
-        <w:t xml:space="preserve">This must be set to On for the radio to begin </w:t>
-      </w:r>
-      <w:r>
-        <w:t>transmitting. If saved as On then the radio will start sending right after booting. If it is Off it will not automatically start sending. It can be toggle</w:t>
+        <w:t xml:space="preserve">This must be set to </w:t>
+      </w:r>
+      <w:proofErr w:type="gramStart"/>
+      <w:r>
+        <w:t>On</w:t>
+      </w:r>
+      <w:proofErr w:type="gramEnd"/>
+      <w:r>
+        <w:t xml:space="preserve"> for the radio to begin </w:t>
+      </w:r>
+      <w:r>
+        <w:t xml:space="preserve">transmitting. If saved as </w:t>
+      </w:r>
+      <w:proofErr w:type="gramStart"/>
+      <w:r>
+        <w:t>On</w:t>
+      </w:r>
+      <w:proofErr w:type="gramEnd"/>
+      <w:r>
+        <w:t xml:space="preserve"> then the radio will start sending right after booting. If it is </w:t>
+      </w:r>
+      <w:proofErr w:type="gramStart"/>
+      <w:r>
+        <w:t>Off</w:t>
+      </w:r>
+      <w:proofErr w:type="gramEnd"/>
+      <w:r>
+        <w:t xml:space="preserve"> it will not automatically start sending. It can be toggle</w:t>
       </w:r>
       <w:r>
         <w:t>d</w:t>
@@ -1859,8 +2312,13 @@
         <w:t xml:space="preserve"> with the B0 button while in run mode</w:t>
       </w:r>
       <w:r>
-        <w:t>. Using B0 does not changed</w:t>
-      </w:r>
+        <w:t xml:space="preserve">. Using B0 does not </w:t>
+      </w:r>
+      <w:proofErr w:type="gramStart"/>
+      <w:r>
+        <w:t>changed</w:t>
+      </w:r>
+      <w:proofErr w:type="gramEnd"/>
     </w:p>
     <w:p>
       <w:pPr>
@@ -1883,7 +2341,15 @@
     </w:p>
     <w:p>
       <w:r>
-        <w:t>High power is about 5W and low power is 3W. These are the only</w:t>
+        <w:t xml:space="preserve">High power is about </w:t>
+      </w:r>
+      <w:proofErr w:type="gramStart"/>
+      <w:r>
+        <w:t>5W</w:t>
+      </w:r>
+      <w:proofErr w:type="gramEnd"/>
+      <w:r>
+        <w:t xml:space="preserve"> and low power is 3W. These are the only</w:t>
       </w:r>
       <w:r>
         <w:t xml:space="preserve"> values allowed by the SA818 radio. If lower power is desired an attenuator can be attached to the </w:t>
@@ -1945,8 +2411,10 @@
         <w:pStyle w:val="Heading3"/>
       </w:pPr>
       <w:r>
+        <w:lastRenderedPageBreak/>
         <w:t xml:space="preserve">Call Sign: </w:t>
       </w:r>
+      <w:proofErr w:type="gramStart"/>
       <w:r>
         <w:rPr>
           <w:i/>
@@ -1954,6 +2422,7 @@
         </w:rPr>
         <w:t>text</w:t>
       </w:r>
+      <w:proofErr w:type="gramEnd"/>
     </w:p>
     <w:p>
       <w:r>
@@ -1998,7 +2467,6 @@
         <w:pStyle w:val="Heading3"/>
       </w:pPr>
       <w:r>
-        <w:lastRenderedPageBreak/>
         <w:t xml:space="preserve">Audio File: </w:t>
       </w:r>
       <w:r>
@@ -2011,13 +2479,29 @@
     </w:p>
     <w:p>
       <w:r>
-        <w:t xml:space="preserve">This menu item is only visible if the previous item is set to Yes. Clicking the dial will list all of the </w:t>
+        <w:t xml:space="preserve">This menu item is only visible if the previous item is set to Yes. Clicking the dial will list </w:t>
+      </w:r>
+      <w:proofErr w:type="gramStart"/>
+      <w:r>
+        <w:t>all of</w:t>
+      </w:r>
+      <w:proofErr w:type="gramEnd"/>
+      <w:r>
+        <w:t xml:space="preserve"> the </w:t>
       </w:r>
       <w:r>
         <w:t>*.txt files on the SD card. The dial is rotated to highlight a file and a long press will set it</w:t>
       </w:r>
       <w:r>
-        <w:t>. Note that a click of dial just exits the list of file with no selection being performed.</w:t>
+        <w:t xml:space="preserve">. Note that a click of dial just exits the list of </w:t>
+      </w:r>
+      <w:proofErr w:type="gramStart"/>
+      <w:r>
+        <w:t>file</w:t>
+      </w:r>
+      <w:proofErr w:type="gramEnd"/>
+      <w:r>
+        <w:t xml:space="preserve"> with no selection being performed.</w:t>
       </w:r>
     </w:p>
     <w:p>
@@ -2096,7 +2580,15 @@
         <w:t xml:space="preserve"> and are always the same. In Random mode the transmit time and pause time are randomly chosen</w:t>
       </w:r>
       <w:r>
-        <w:t xml:space="preserve"> from the allowed values set in the Min and Max values for TX Send and Pause. This makes the timing less predictable and make the game a little bit harder.</w:t>
+        <w:t xml:space="preserve"> from the allowed values set in the Min and Max values for TX Send and Pause. This makes the timing less predictable and </w:t>
+      </w:r>
+      <w:proofErr w:type="gramStart"/>
+      <w:r>
+        <w:t>make</w:t>
+      </w:r>
+      <w:proofErr w:type="gramEnd"/>
+      <w:r>
+        <w:t xml:space="preserve"> the game a little bit harder.</w:t>
       </w:r>
       <w:r>
         <w:t xml:space="preserve"> Keep your ears on!</w:t>
@@ -2149,7 +2641,15 @@
         <w:t>This is the pause time between transmissions</w:t>
       </w:r>
       <w:r>
-        <w:t>. Longer times let the radio cool off and save the battery for longer run times.</w:t>
+        <w:t xml:space="preserve">. Longer times let the radio cool off and save the battery for longer </w:t>
+      </w:r>
+      <w:proofErr w:type="gramStart"/>
+      <w:r>
+        <w:t>run</w:t>
+      </w:r>
+      <w:proofErr w:type="gramEnd"/>
+      <w:r>
+        <w:t xml:space="preserve"> times.</w:t>
       </w:r>
     </w:p>
     <w:p>
@@ -2157,6 +2657,7 @@
         <w:pStyle w:val="Heading3"/>
       </w:pPr>
       <w:r>
+        <w:lastRenderedPageBreak/>
         <w:t>TX Send Min: 10-90 Sec</w:t>
       </w:r>
     </w:p>
@@ -2202,13 +2703,167 @@
         <w:pStyle w:val="Heading3"/>
       </w:pPr>
       <w:r>
+        <w:t>TX Pause Max: 10-1200 Sec</w:t>
+      </w:r>
+    </w:p>
+    <w:p>
+      <w:r>
+        <w:t>In random mode this is the maximum pause time.</w:t>
+      </w:r>
+    </w:p>
+    <w:p>
+      <w:pPr>
+        <w:pStyle w:val="Heading3"/>
+      </w:pPr>
+      <w:r>
+        <w:t xml:space="preserve">TX Stop: </w:t>
+      </w:r>
+      <w:proofErr w:type="spellStart"/>
+      <w:r>
+        <w:t>Immediate|Finish</w:t>
+      </w:r>
+      <w:proofErr w:type="spellEnd"/>
+      <w:r>
+        <w:t xml:space="preserve"> Cycle</w:t>
+      </w:r>
+    </w:p>
+    <w:p>
+      <w:r>
+        <w:t xml:space="preserve">During transmit time the Beacon, Call Sign, and Audio are continuously sent. At the end of the transmission time this option controls whether the transmission stops immediately </w:t>
+      </w:r>
+      <w:proofErr w:type="gramStart"/>
+      <w:r>
+        <w:t>of</w:t>
+      </w:r>
+      <w:proofErr w:type="gramEnd"/>
+      <w:r>
+        <w:t xml:space="preserve"> waits to stop until the entire cycle is finished.</w:t>
+      </w:r>
+    </w:p>
+    <w:p/>
+    <w:p>
+      <w:r>
+        <w:t>A clever use of this command</w:t>
+      </w:r>
+      <w:r>
+        <w:t xml:space="preserve"> allows for only one cycle of beacon, ID, and music to be sent during each transmission time. Set the transmit</w:t>
+      </w:r>
+      <w:r>
+        <w:t xml:space="preserve"> time to something less than</w:t>
+      </w:r>
+      <w:r>
+        <w:t xml:space="preserve"> the time to perform a complete cycle and set this option to “Finish Cycle”. The </w:t>
+      </w:r>
+      <w:proofErr w:type="gramStart"/>
+      <w:r>
+        <w:t>transmit  cycle</w:t>
+      </w:r>
+      <w:proofErr w:type="gramEnd"/>
+      <w:r>
+        <w:t xml:space="preserve"> will begin, the timer will expire, but the current cycle will complete before stopping</w:t>
+      </w:r>
+      <w:r>
+        <w:t>.</w:t>
+      </w:r>
+    </w:p>
+    <w:p>
+      <w:pPr>
+        <w:pStyle w:val="Heading3"/>
+      </w:pPr>
+      <w:r>
+        <w:t xml:space="preserve">Radio Pause: </w:t>
+      </w:r>
+      <w:proofErr w:type="spellStart"/>
+      <w:r>
+        <w:t>Sleep|Awake</w:t>
+      </w:r>
+      <w:proofErr w:type="spellEnd"/>
+    </w:p>
+    <w:p>
+      <w:r>
+        <w:t xml:space="preserve">During pause time the radio can be put into sleep mode. This lowers the power consumption and lets the battery last longer. </w:t>
+      </w:r>
+      <w:proofErr w:type="gramStart"/>
+      <w:r>
+        <w:t>However</w:t>
+      </w:r>
+      <w:proofErr w:type="gramEnd"/>
+      <w:r>
+        <w:t xml:space="preserve"> note that this also means that the DTMF commands are disabled since the radio is asleep!</w:t>
+      </w:r>
+    </w:p>
+    <w:p>
+      <w:pPr>
+        <w:pStyle w:val="Heading2"/>
+      </w:pPr>
+      <w:r>
+        <w:t>+</w:t>
+      </w:r>
+      <w:r>
+        <w:t>More Radio Settings</w:t>
+      </w:r>
+    </w:p>
+    <w:p>
+      <w:pPr>
+        <w:pStyle w:val="Heading3"/>
+      </w:pPr>
+      <w:r>
+        <w:t xml:space="preserve">RX Offset: -600|0|+600 </w:t>
+      </w:r>
+      <w:proofErr w:type="gramStart"/>
+      <w:r>
+        <w:t>kHz</w:t>
+      </w:r>
+      <w:proofErr w:type="gramEnd"/>
+    </w:p>
+    <w:p>
+      <w:r>
+        <w:t>This is the frequency offset from the transmit frequency that the radio uses to receive DTMF commands</w:t>
+      </w:r>
+      <w:r>
+        <w:t>. An offset is recommended. If 0 is used the radio will only listen when it isn’t sending. It has not been tested if it listens during sending when the offset is not 0.</w:t>
+      </w:r>
+    </w:p>
+    <w:p>
+      <w:pPr>
+        <w:pStyle w:val="Heading3"/>
+      </w:pPr>
+      <w:r>
+        <w:t>Bandwidth: 12.5|</w:t>
+      </w:r>
+      <w:r>
+        <w:t>25 kHz</w:t>
+      </w:r>
+    </w:p>
+    <w:p>
+      <w:r>
+        <w:t>This sets the radio bandwidth</w:t>
+      </w:r>
+      <w:r>
+        <w:t>. It has not been tested much to see what effect it has on performance yet.</w:t>
+      </w:r>
+    </w:p>
+    <w:p>
+      <w:pPr>
+        <w:pStyle w:val="Heading3"/>
+      </w:pPr>
+      <w:r>
         <w:lastRenderedPageBreak/>
-        <w:t>TX Pause Max: 10-1200 Sec</w:t>
-      </w:r>
-    </w:p>
-    <w:p>
-      <w:r>
-        <w:t>In random mode this is the maximum pause time.</w:t>
+        <w:t>CTCSS/DCS: CTCSS|DCS</w:t>
+      </w:r>
+    </w:p>
+    <w:p>
+      <w:r>
+        <w:t xml:space="preserve">This sets the </w:t>
+      </w:r>
+      <w:r>
+        <w:t>un-squelch</w:t>
+      </w:r>
+      <w:r>
+        <w:t xml:space="preserve"> values</w:t>
+      </w:r>
+      <w:r>
+        <w:t xml:space="preserve"> for either the analog or digital versions.</w:t>
       </w:r>
     </w:p>
     <w:p>
@@ -2216,35 +2871,406 @@
         <w:pStyle w:val="Heading3"/>
       </w:pPr>
       <w:r>
-        <w:t xml:space="preserve">TX Stop: </w:t>
+        <w:t>TX CTCSS:</w:t>
+      </w:r>
+      <w:r>
+        <w:t xml:space="preserve"> None</w:t>
+      </w:r>
+      <w:r>
+        <w:t>|</w:t>
+      </w:r>
+      <w:r>
+        <w:t>67-</w:t>
+      </w:r>
+      <w:r>
+        <w:t>250.3</w:t>
+      </w:r>
+    </w:p>
+    <w:p>
+      <w:r>
+        <w:t>Analog un-squelch frequencies sent out.</w:t>
+      </w:r>
+    </w:p>
+    <w:p>
+      <w:pPr>
+        <w:pStyle w:val="Heading3"/>
+      </w:pPr>
+      <w:r>
+        <w:t>RX CTCSS:</w:t>
+      </w:r>
+      <w:r>
+        <w:t xml:space="preserve"> None|67-250.3</w:t>
+      </w:r>
+    </w:p>
+    <w:p>
+      <w:r>
+        <w:t>Analog un-squelch frequency for receiving.</w:t>
+      </w:r>
+    </w:p>
+    <w:p>
+      <w:pPr>
+        <w:pStyle w:val="Heading3"/>
+      </w:pPr>
+      <w:r>
+        <w:t>TX DCS:</w:t>
+      </w:r>
+      <w:r>
+        <w:t xml:space="preserve"> None|023-754</w:t>
+      </w:r>
+    </w:p>
+    <w:p>
+      <w:r>
+        <w:t>Digital un-squelch value for sending.</w:t>
+      </w:r>
+    </w:p>
+    <w:p>
+      <w:pPr>
+        <w:pStyle w:val="Heading3"/>
+      </w:pPr>
+      <w:r>
+        <w:t>TX I/N: I|N</w:t>
+      </w:r>
+    </w:p>
+    <w:p>
+      <w:r>
+        <w:t>The digital I or N value for sending.</w:t>
+      </w:r>
+    </w:p>
+    <w:p>
+      <w:pPr>
+        <w:pStyle w:val="Heading3"/>
+      </w:pPr>
+      <w:r>
+        <w:t>RX DCS: None|023-754</w:t>
+      </w:r>
+    </w:p>
+    <w:p>
+      <w:r>
+        <w:t>Digital un-squelch value for receiving.</w:t>
+      </w:r>
+    </w:p>
+    <w:p>
+      <w:pPr>
+        <w:pStyle w:val="Heading3"/>
+      </w:pPr>
+      <w:r>
+        <w:t>RX I/N: I|N</w:t>
+      </w:r>
+    </w:p>
+    <w:p>
+      <w:r>
+        <w:t>The digital I or N value for receiving.</w:t>
+      </w:r>
+    </w:p>
+    <w:p>
+      <w:pPr>
+        <w:pStyle w:val="Heading3"/>
+      </w:pPr>
+      <w:r>
+        <w:t>RX Volume:</w:t>
+      </w:r>
+      <w:r>
+        <w:t xml:space="preserve"> 1-6</w:t>
+      </w:r>
+    </w:p>
+    <w:p>
+      <w:r>
+        <w:t>This is the receive volume setting. It affects how well DTMF tones are detected.</w:t>
+      </w:r>
+    </w:p>
+    <w:p>
+      <w:pPr>
+        <w:pStyle w:val="Heading3"/>
+      </w:pPr>
+      <w:r>
+        <w:t>RX Squelch:</w:t>
+      </w:r>
+      <w:r>
+        <w:t xml:space="preserve"> 0-8</w:t>
+      </w:r>
+    </w:p>
+    <w:p>
+      <w:r>
+        <w:t>This affects how much signal is required to receive the DTMF signals.</w:t>
+      </w:r>
+    </w:p>
+    <w:p>
+      <w:pPr>
+        <w:pStyle w:val="Heading2"/>
+      </w:pPr>
+      <w:r>
+        <w:t>Cancel Waits/TX Now</w:t>
+      </w:r>
+    </w:p>
+    <w:p>
+      <w:r>
+        <w:t>When the radio is in either send or pause mode this command will cancel the timer and the next mo</w:t>
+      </w:r>
+      <w:r>
+        <w:t xml:space="preserve">de will start. For </w:t>
+      </w:r>
+      <w:proofErr w:type="gramStart"/>
+      <w:r>
+        <w:t>example</w:t>
+      </w:r>
+      <w:proofErr w:type="gramEnd"/>
+      <w:r>
+        <w:t xml:space="preserve"> if you want to cancel</w:t>
+      </w:r>
+      <w:r>
+        <w:t xml:space="preserve"> the pause and go to transmit, use this option. It can also be done by long pressing B0.</w:t>
+      </w:r>
+    </w:p>
+    <w:p>
+      <w:pPr>
+        <w:pStyle w:val="Heading2"/>
+      </w:pPr>
+      <w:r>
+        <w:t>+Saved Settings Files</w:t>
+      </w:r>
+    </w:p>
+    <w:p>
+      <w:r>
+        <w:t>Saved settings files are named files stored on the SD card. They are useful to</w:t>
+      </w:r>
+      <w:r>
+        <w:t xml:space="preserve"> quickly configure the radio for different uses. All values except the battery calibration are affected.</w:t>
+      </w:r>
+    </w:p>
+    <w:p>
+      <w:pPr>
+        <w:pStyle w:val="Heading3"/>
+      </w:pPr>
+      <w:r>
+        <w:lastRenderedPageBreak/>
+        <w:t>Create File</w:t>
+      </w:r>
+    </w:p>
+    <w:p>
+      <w:r>
+        <w:t>This prompts the user for a name. The file is then created using the current system settings.</w:t>
+      </w:r>
+    </w:p>
+    <w:p>
+      <w:pPr>
+        <w:pStyle w:val="Heading3"/>
+      </w:pPr>
+      <w:r>
+        <w:t>Save/Update File</w:t>
+      </w:r>
+    </w:p>
+    <w:p>
+      <w:r>
+        <w:t xml:space="preserve">This command saves the current settings into the selected file. If it already </w:t>
+      </w:r>
+      <w:proofErr w:type="gramStart"/>
+      <w:r>
+        <w:t>exists</w:t>
+      </w:r>
+      <w:proofErr w:type="gramEnd"/>
+      <w:r>
+        <w:t xml:space="preserve"> the user will be asked to confirm overwriting the file.</w:t>
+      </w:r>
+    </w:p>
+    <w:p>
+      <w:pPr>
+        <w:pStyle w:val="Heading3"/>
+      </w:pPr>
+      <w:r>
+        <w:t>Load File</w:t>
+      </w:r>
+    </w:p>
+    <w:p>
+      <w:r>
+        <w:t xml:space="preserve">This command asks the user for the name and then sets </w:t>
+      </w:r>
+      <w:proofErr w:type="gramStart"/>
+      <w:r>
+        <w:t>all of</w:t>
+      </w:r>
+      <w:proofErr w:type="gramEnd"/>
+      <w:r>
+        <w:t xml:space="preserve"> the system settings except the battery calibration using the values in the file.</w:t>
+      </w:r>
+    </w:p>
+    <w:p>
+      <w:pPr>
+        <w:pStyle w:val="Heading3"/>
+      </w:pPr>
+      <w:r>
+        <w:t>Delete File</w:t>
+      </w:r>
+    </w:p>
+    <w:p>
+      <w:r>
+        <w:t>The user selects a file from the list and then it can be deleted.</w:t>
+      </w:r>
+    </w:p>
+    <w:p>
+      <w:pPr>
+        <w:pStyle w:val="Heading2"/>
+      </w:pPr>
+      <w:r>
+        <w:t>+System Settings</w:t>
+      </w:r>
+    </w:p>
+    <w:p>
+      <w:pPr>
+        <w:pStyle w:val="Heading3"/>
+      </w:pPr>
+      <w:r>
+        <w:t>+Display</w:t>
+      </w:r>
+      <w:r>
+        <w:t xml:space="preserve"> Settings</w:t>
+      </w:r>
+    </w:p>
+    <w:p>
+      <w:pPr>
+        <w:pStyle w:val="Heading4"/>
+      </w:pPr>
+      <w:r>
+        <w:t xml:space="preserve">Dimming Mode: </w:t>
       </w:r>
       <w:proofErr w:type="spellStart"/>
       <w:r>
-        <w:t>Immediate|Finish</w:t>
+        <w:t>None</w:t>
+      </w:r>
+      <w:r>
+        <w:t>|Timer</w:t>
       </w:r>
       <w:proofErr w:type="spellEnd"/>
-      <w:r>
-        <w:t xml:space="preserve"> Cycle</w:t>
-      </w:r>
-    </w:p>
-    <w:p>
-      <w:r>
-        <w:t>During transmit time the Beacon, Call Sign, and Audio are continuously sent. At the end of the transmission time this option controls whether the transmission stops immediately of waits to stop until the entire cycle is finished.</w:t>
-      </w:r>
-    </w:p>
-    <w:p/>
-    <w:p>
-      <w:r>
-        <w:t>A clever use of this command</w:t>
-      </w:r>
-      <w:r>
-        <w:t xml:space="preserve"> allows for only one cycle of beacon, ID, and music to be sent during each transmission time. Set the transmit</w:t>
-      </w:r>
-      <w:r>
-        <w:t xml:space="preserve"> time to something less than</w:t>
-      </w:r>
-      <w:r>
-        <w:t xml:space="preserve"> the time to perform a complete cycle and set this option to “Finish Cycle”. The transmit  cycle will begin, the timer will expire, but the current cycle will complete before stopping</w:t>
+    </w:p>
+    <w:p>
+      <w:r>
+        <w:t xml:space="preserve">The display can be set to dim automatically after a specified number of seconds. This is used to save battery power since the backlight </w:t>
+      </w:r>
+      <w:r>
+        <w:t>uses a significant amount.</w:t>
+      </w:r>
+    </w:p>
+    <w:p>
+      <w:pPr>
+        <w:pStyle w:val="Heading4"/>
+      </w:pPr>
+      <w:r>
+        <w:t>Bright Value: 1-100</w:t>
+      </w:r>
+      <w:r>
+        <w:t>%</w:t>
+      </w:r>
+    </w:p>
+    <w:p>
+      <w:r>
+        <w:t>Set the display brightness value.</w:t>
+      </w:r>
+    </w:p>
+    <w:p>
+      <w:pPr>
+        <w:pStyle w:val="Heading4"/>
+      </w:pPr>
+      <w:r>
+        <w:t xml:space="preserve">Dim Value: </w:t>
+      </w:r>
+      <w:r>
+        <w:t>0-100%</w:t>
+      </w:r>
+    </w:p>
+    <w:p>
+      <w:r>
+        <w:t xml:space="preserve">Set the display brightness after the </w:t>
+      </w:r>
+      <w:r>
+        <w:t>timer below expires.</w:t>
+      </w:r>
+    </w:p>
+    <w:p>
+      <w:pPr>
+        <w:pStyle w:val="Heading4"/>
+      </w:pPr>
+      <w:r>
+        <w:t>Display Dim Time:</w:t>
+      </w:r>
+      <w:r>
+        <w:t xml:space="preserve"> 0-120 S</w:t>
+      </w:r>
+    </w:p>
+    <w:p>
+      <w:r>
+        <w:t>Specify the time until the display changes to dim mode.</w:t>
+      </w:r>
+    </w:p>
+    <w:p>
+      <w:pPr>
+        <w:pStyle w:val="Heading4"/>
+      </w:pPr>
+      <w:r>
+        <w:t>+Sideways Scroll Settings</w:t>
+      </w:r>
+    </w:p>
+    <w:p>
+      <w:r>
+        <w:t xml:space="preserve">Lines of text that </w:t>
+      </w:r>
+      <w:proofErr w:type="gramStart"/>
+      <w:r>
+        <w:t>too</w:t>
+      </w:r>
+      <w:proofErr w:type="gramEnd"/>
+      <w:r>
+        <w:t xml:space="preserve"> long for the display will scroll back and forth. The following settings control the speed.</w:t>
+      </w:r>
+    </w:p>
+    <w:p>
+      <w:pPr>
+        <w:pStyle w:val="Heading5"/>
+      </w:pPr>
+      <w:r>
+        <w:t xml:space="preserve">Speed: </w:t>
+      </w:r>
+      <w:r>
+        <w:t>1-1000 mS</w:t>
+      </w:r>
+    </w:p>
+    <w:p>
+      <w:r>
+        <w:t>Controls the speed of text moving to the left.</w:t>
+      </w:r>
+    </w:p>
+    <w:p>
+      <w:pPr>
+        <w:pStyle w:val="Heading5"/>
+      </w:pPr>
+      <w:r>
+        <w:lastRenderedPageBreak/>
+        <w:t>Pause: 1-100</w:t>
+      </w:r>
+      <w:r>
+        <w:t xml:space="preserve"> mS</w:t>
+      </w:r>
+    </w:p>
+    <w:p>
+      <w:r>
+        <w:t>This controls the pause when the text is at the end (all the way to the left).</w:t>
+      </w:r>
+    </w:p>
+    <w:p>
+      <w:pPr>
+        <w:pStyle w:val="Heading5"/>
+      </w:pPr>
+      <w:r>
+        <w:t>Reverse Speed: 1-20x</w:t>
+      </w:r>
+    </w:p>
+    <w:p>
+      <w:r>
+        <w:t xml:space="preserve">This is how fast the text scrolls </w:t>
+      </w:r>
+      <w:r>
+        <w:t>back to the beginning (to the right). 2x means twice as fast as the text scroll</w:t>
+      </w:r>
+      <w:r>
+        <w:t>ed to the left</w:t>
       </w:r>
       <w:r>
         <w:t>.</w:t>
@@ -2252,20 +3278,266 @@
     </w:p>
     <w:p>
       <w:pPr>
+        <w:pStyle w:val="Heading4"/>
+      </w:pPr>
+      <w:r>
+        <w:t xml:space="preserve">Menu Selection: </w:t>
+      </w:r>
+      <w:r>
+        <w:t>Color|*</w:t>
+      </w:r>
+    </w:p>
+    <w:p>
+      <w:r>
+        <w:t>Menu selections</w:t>
+      </w:r>
+      <w:r>
+        <w:t xml:space="preserve"> and selections from a list can be either colored or marked with the ‘*’ character.</w:t>
+      </w:r>
+    </w:p>
+    <w:p>
+      <w:pPr>
+        <w:pStyle w:val="Heading4"/>
+      </w:pPr>
+      <w:r>
+        <w:t>Text/</w:t>
+      </w:r>
+      <w:proofErr w:type="spellStart"/>
+      <w:r>
+        <w:t>HiLite</w:t>
+      </w:r>
+      <w:proofErr w:type="spellEnd"/>
+      <w:r>
+        <w:t xml:space="preserve"> Colors</w:t>
+      </w:r>
+    </w:p>
+    <w:p>
+      <w:r>
+        <w:t>This selection allows for choosing the colors of the text and the highlight. The background screen is always black.</w:t>
+      </w:r>
+    </w:p>
+    <w:p>
+      <w:pPr>
         <w:pStyle w:val="Heading3"/>
       </w:pPr>
       <w:r>
-        <w:t xml:space="preserve">Radio Pause: </w:t>
+        <w:t>+Dial &amp; Button Settings</w:t>
+      </w:r>
+    </w:p>
+    <w:p>
+      <w:pPr>
+        <w:pStyle w:val="Heading4"/>
+      </w:pPr>
+      <w:r>
+        <w:t xml:space="preserve">Direction: </w:t>
       </w:r>
       <w:proofErr w:type="spellStart"/>
-      <w:r>
-        <w:t>Sleep|Awake</w:t>
+      <w:proofErr w:type="gramStart"/>
+      <w:r>
+        <w:t>Normal:Reverse</w:t>
       </w:r>
       <w:proofErr w:type="spellEnd"/>
-    </w:p>
-    <w:p>
-      <w:r>
-        <w:t>During pause time the radio can be put into sleep mode. This lowers the power consumption and lets the battery last longer. However note that this also means that the DTMF commands are disabled since the radio is asleep!</w:t>
+      <w:proofErr w:type="gramEnd"/>
+    </w:p>
+    <w:p>
+      <w:r>
+        <w:t>If you really want the button to be the other way around this is the choice for you.</w:t>
+      </w:r>
+    </w:p>
+    <w:p>
+      <w:pPr>
+        <w:pStyle w:val="Heading4"/>
+      </w:pPr>
+      <w:r>
+        <w:t>Long Press Timer: 2-200</w:t>
+      </w:r>
+    </w:p>
+    <w:p>
+      <w:r>
+        <w:t>This value affects how long or short a long press is. The default value is normally OK</w:t>
+      </w:r>
+      <w:r>
+        <w:t>, but somebody might want to change it.</w:t>
+      </w:r>
+    </w:p>
+    <w:p>
+      <w:pPr>
+        <w:pStyle w:val="Heading3"/>
+      </w:pPr>
+      <w:r>
+        <w:t>+Battery Settings</w:t>
+      </w:r>
+    </w:p>
+    <w:p>
+      <w:r>
+        <w:t xml:space="preserve">Since the PCB was designed with 10% resistors for measuring the battery voltage some calibration is needed. A future PCB will probably use better </w:t>
+      </w:r>
+      <w:proofErr w:type="gramStart"/>
+      <w:r>
+        <w:t>resistors</w:t>
+      </w:r>
+      <w:proofErr w:type="gramEnd"/>
+      <w:r>
+        <w:t xml:space="preserve"> so this won’t be needed.</w:t>
+      </w:r>
+    </w:p>
+    <w:p>
+      <w:pPr>
+        <w:pStyle w:val="Heading4"/>
+      </w:pPr>
+      <w:r>
+        <w:t xml:space="preserve">Show Battery: </w:t>
+      </w:r>
+      <w:proofErr w:type="spellStart"/>
+      <w:r>
+        <w:t>Yes|No</w:t>
+      </w:r>
+      <w:proofErr w:type="spellEnd"/>
+    </w:p>
+    <w:p>
+      <w:r>
+        <w:t xml:space="preserve">This option controls the </w:t>
+      </w:r>
+      <w:r>
+        <w:t>battery display on the bottom right of the display.</w:t>
+      </w:r>
+    </w:p>
+    <w:p>
+      <w:pPr>
+        <w:pStyle w:val="Heading4"/>
+      </w:pPr>
+      <w:r>
+        <w:t>Full Battery: 2000-4000</w:t>
+      </w:r>
+    </w:p>
+    <w:p>
+      <w:r>
+        <w:t>This is the value that indicates a full 4.2V battery.</w:t>
+      </w:r>
+    </w:p>
+    <w:p>
+      <w:pPr>
+        <w:pStyle w:val="Heading4"/>
+      </w:pPr>
+      <w:r>
+        <w:t>Set Full Battery</w:t>
+      </w:r>
+    </w:p>
+    <w:p>
+      <w:r>
+        <w:t>This selection reads the current battery values and stores it. It is best set by fully charging the battery and then disconnecting the charger. Wait a couple of minutes and then use it several times until it seems stable.</w:t>
+      </w:r>
+    </w:p>
+    <w:p>
+      <w:pPr>
+        <w:pStyle w:val="Heading4"/>
+      </w:pPr>
+      <w:r>
+        <w:lastRenderedPageBreak/>
+        <w:t>Read Battery Raw Data</w:t>
+      </w:r>
+    </w:p>
+    <w:p>
+      <w:r>
+        <w:t>This continuously reads the battery value</w:t>
+      </w:r>
+      <w:r>
+        <w:t xml:space="preserve">. It was originally used for testing, but it seems like it might possibly be </w:t>
+      </w:r>
+      <w:proofErr w:type="gramStart"/>
+      <w:r>
+        <w:t>useful</w:t>
+      </w:r>
+      <w:proofErr w:type="gramEnd"/>
+      <w:r>
+        <w:t xml:space="preserve"> so it was left in the menu system.</w:t>
+      </w:r>
+    </w:p>
+    <w:p>
+      <w:pPr>
+        <w:pStyle w:val="Heading3"/>
+      </w:pPr>
+      <w:r>
+        <w:t>New Version BIN File</w:t>
+      </w:r>
+    </w:p>
+    <w:p>
+      <w:r>
+        <w:t xml:space="preserve">New firmware can be loaded by putting </w:t>
+      </w:r>
+      <w:r>
+        <w:t xml:space="preserve">the binary file on the SD card. It must be named </w:t>
+      </w:r>
+      <w:proofErr w:type="spellStart"/>
+      <w:r>
+        <w:t>RadioFox.BIN</w:t>
+      </w:r>
+      <w:proofErr w:type="spellEnd"/>
+      <w:r>
+        <w:t>.</w:t>
+      </w:r>
+      <w:r>
+        <w:t xml:space="preserve"> There are two prompts, one to confirm overwriting the firmware, and another to allow deletion of the </w:t>
+      </w:r>
+      <w:r>
+        <w:t>BIN file after installation.</w:t>
+      </w:r>
+    </w:p>
+    <w:p>
+      <w:pPr>
+        <w:pStyle w:val="Heading3"/>
+      </w:pPr>
+      <w:r>
+        <w:t>Factory Settings</w:t>
+      </w:r>
+    </w:p>
+    <w:p>
+      <w:r>
+        <w:t xml:space="preserve">This command resets </w:t>
+      </w:r>
+      <w:r>
+        <w:t xml:space="preserve">all </w:t>
+      </w:r>
+      <w:r>
+        <w:t>settings</w:t>
+      </w:r>
+      <w:r>
+        <w:t xml:space="preserve"> except the high battery value to the original factory values.</w:t>
+      </w:r>
+    </w:p>
+    <w:p>
+      <w:pPr>
+        <w:pStyle w:val="Heading3"/>
+      </w:pPr>
+      <w:r>
+        <w:t>Format EEPROM</w:t>
+      </w:r>
+    </w:p>
+    <w:p>
+      <w:r>
+        <w:t xml:space="preserve">This will clear </w:t>
+      </w:r>
+      <w:r>
+        <w:t xml:space="preserve">and reset </w:t>
+      </w:r>
+      <w:r>
+        <w:t xml:space="preserve">the </w:t>
+      </w:r>
+      <w:proofErr w:type="spellStart"/>
+      <w:r>
+        <w:t>eeprom</w:t>
+      </w:r>
+      <w:proofErr w:type="spellEnd"/>
+      <w:r>
+        <w:t xml:space="preserve"> where the settings are </w:t>
+      </w:r>
+      <w:proofErr w:type="gramStart"/>
+      <w:r>
+        <w:t>save</w:t>
+      </w:r>
+      <w:proofErr w:type="gramEnd"/>
+      <w:r>
+        <w:t xml:space="preserve"> in non-volatile memory. This is how settings are saved while the system is not powered.</w:t>
       </w:r>
     </w:p>
     <w:p>
@@ -2273,700 +3545,20 @@
         <w:pStyle w:val="Heading2"/>
       </w:pPr>
       <w:r>
-        <w:t>+</w:t>
-      </w:r>
-      <w:r>
-        <w:t>More Radio Settings</w:t>
-      </w:r>
-    </w:p>
-    <w:p>
-      <w:pPr>
-        <w:pStyle w:val="Heading3"/>
-      </w:pPr>
-      <w:r>
-        <w:t>RX Offset: -600|0|+600 kHz</w:t>
-      </w:r>
-    </w:p>
-    <w:p>
-      <w:r>
-        <w:t>This is the frequency offset from the transmit frequency that the radio uses to receive DTMF commands</w:t>
-      </w:r>
-      <w:r>
-        <w:t>. An offset is recommended. If 0 is used the radio will only listen when it isn’t sending. It has not been tested if it listens during sending when the offset is not 0.</w:t>
-      </w:r>
-    </w:p>
-    <w:p>
-      <w:pPr>
-        <w:pStyle w:val="Heading3"/>
-      </w:pPr>
-      <w:r>
-        <w:t>Bandwidth: 12.5|</w:t>
-      </w:r>
-      <w:r>
-        <w:t>25 kHz</w:t>
-      </w:r>
-    </w:p>
-    <w:p>
-      <w:r>
-        <w:t>This sets the radio bandwidth</w:t>
-      </w:r>
-      <w:r>
-        <w:t>. It has not been tested much to see what effect it has on performance yet.</w:t>
-      </w:r>
-    </w:p>
-    <w:p>
-      <w:pPr>
-        <w:pStyle w:val="Heading3"/>
-      </w:pPr>
-      <w:r>
-        <w:t>CTCSS/DCS: CTCSS|DCS</w:t>
-      </w:r>
-    </w:p>
-    <w:p>
-      <w:r>
-        <w:t xml:space="preserve">This sets the </w:t>
-      </w:r>
-      <w:r>
-        <w:t>un-squelch</w:t>
-      </w:r>
-      <w:r>
-        <w:t xml:space="preserve"> values</w:t>
-      </w:r>
-      <w:r>
-        <w:t xml:space="preserve"> for either the analog or digital versions.</w:t>
-      </w:r>
-    </w:p>
-    <w:p>
-      <w:pPr>
-        <w:pStyle w:val="Heading3"/>
-      </w:pPr>
-      <w:r>
-        <w:t>TX CTCSS:</w:t>
-      </w:r>
-      <w:r>
-        <w:t xml:space="preserve"> None</w:t>
-      </w:r>
-      <w:r>
-        <w:t>|</w:t>
-      </w:r>
-      <w:r>
-        <w:t>67-</w:t>
-      </w:r>
-      <w:r>
-        <w:t>250.3</w:t>
-      </w:r>
-    </w:p>
-    <w:p>
-      <w:r>
-        <w:t>Analog un-squelch frequencies sent out.</w:t>
-      </w:r>
-    </w:p>
-    <w:p>
-      <w:pPr>
-        <w:pStyle w:val="Heading3"/>
-      </w:pPr>
-      <w:r>
-        <w:t>RX CTCSS:</w:t>
-      </w:r>
-      <w:r>
-        <w:t xml:space="preserve"> None|67-250.3</w:t>
-      </w:r>
-    </w:p>
-    <w:p>
-      <w:r>
-        <w:t>Analog un-squelch frequency for receiving.</w:t>
-      </w:r>
-    </w:p>
-    <w:p>
-      <w:pPr>
-        <w:pStyle w:val="Heading3"/>
-      </w:pPr>
-      <w:r>
-        <w:lastRenderedPageBreak/>
-        <w:t>TX DCS:</w:t>
-      </w:r>
-      <w:r>
-        <w:t xml:space="preserve"> None|023-754</w:t>
-      </w:r>
-    </w:p>
-    <w:p>
-      <w:r>
-        <w:t>Digital un-squelch value for sending.</w:t>
-      </w:r>
-    </w:p>
-    <w:p>
-      <w:pPr>
-        <w:pStyle w:val="Heading3"/>
-      </w:pPr>
-      <w:r>
-        <w:t>TX I/N: I|N</w:t>
-      </w:r>
-    </w:p>
-    <w:p>
-      <w:r>
-        <w:t>The digital I or N value for sending.</w:t>
-      </w:r>
-    </w:p>
-    <w:p>
-      <w:pPr>
-        <w:pStyle w:val="Heading3"/>
-      </w:pPr>
-      <w:r>
-        <w:t>RX DCS: None|023-754</w:t>
-      </w:r>
-    </w:p>
-    <w:p>
-      <w:r>
-        <w:t>Digital un-squelch value for receiving.</w:t>
-      </w:r>
-    </w:p>
-    <w:p>
-      <w:pPr>
-        <w:pStyle w:val="Heading3"/>
-      </w:pPr>
-      <w:r>
-        <w:t>RX I/N: I|N</w:t>
-      </w:r>
-    </w:p>
-    <w:p>
-      <w:r>
-        <w:t>The digital I or N value for receiving.</w:t>
-      </w:r>
-    </w:p>
-    <w:p>
-      <w:pPr>
-        <w:pStyle w:val="Heading3"/>
-      </w:pPr>
-      <w:r>
-        <w:t>RX Volume:</w:t>
-      </w:r>
-      <w:r>
-        <w:t xml:space="preserve"> 1-6</w:t>
-      </w:r>
-    </w:p>
-    <w:p>
-      <w:r>
-        <w:t>This is the receive volume setting. It affects how well DTMF tones are detected.</w:t>
-      </w:r>
-    </w:p>
-    <w:p>
-      <w:pPr>
-        <w:pStyle w:val="Heading3"/>
-      </w:pPr>
-      <w:r>
-        <w:t>RX Squelch:</w:t>
-      </w:r>
-      <w:r>
-        <w:t xml:space="preserve"> 0-8</w:t>
-      </w:r>
-    </w:p>
-    <w:p>
-      <w:r>
-        <w:t>This affects how much signal is required to receive the DTMF signals.</w:t>
-      </w:r>
-    </w:p>
-    <w:p>
-      <w:pPr>
-        <w:pStyle w:val="Heading2"/>
-      </w:pPr>
-      <w:r>
-        <w:t>Cancel Waits/TX Now</w:t>
-      </w:r>
-    </w:p>
-    <w:p>
-      <w:r>
-        <w:t>When the radio is in either send or pause mode this command will cancel the timer and the next mo</w:t>
-      </w:r>
-      <w:r>
-        <w:t>de will start. For example if you want to cancel</w:t>
-      </w:r>
-      <w:r>
-        <w:t xml:space="preserve"> the pause and go to transmit, use this option. It can also be done by long pressing B0.</w:t>
-      </w:r>
-    </w:p>
-    <w:p>
-      <w:pPr>
-        <w:pStyle w:val="Heading2"/>
-      </w:pPr>
-      <w:r>
-        <w:t>+Saved Settings Files</w:t>
-      </w:r>
-    </w:p>
-    <w:p>
-      <w:r>
-        <w:t>Saved settings files are named files stored on the SD card. They are useful to</w:t>
-      </w:r>
-      <w:r>
-        <w:t xml:space="preserve"> quickly configure the radio for different uses. All values except the battery calibration are affected.</w:t>
-      </w:r>
-    </w:p>
-    <w:p>
-      <w:pPr>
-        <w:pStyle w:val="Heading3"/>
-      </w:pPr>
-      <w:r>
-        <w:t>Create File</w:t>
-      </w:r>
-    </w:p>
-    <w:p>
-      <w:r>
-        <w:t>This prompts the user for a name. The file is then created using the current system settings.</w:t>
-      </w:r>
-    </w:p>
-    <w:p>
-      <w:pPr>
-        <w:pStyle w:val="Heading3"/>
-      </w:pPr>
-      <w:r>
-        <w:t>Save/Update File</w:t>
-      </w:r>
-    </w:p>
-    <w:p>
-      <w:r>
-        <w:t>This command saves the current settings into the selected file. If it already exists the user will be asked to confirm overwriting the file.</w:t>
-      </w:r>
-    </w:p>
-    <w:p>
-      <w:pPr>
-        <w:pStyle w:val="Heading3"/>
-      </w:pPr>
-      <w:r>
-        <w:lastRenderedPageBreak/>
-        <w:t>Load File</w:t>
-      </w:r>
-    </w:p>
-    <w:p>
-      <w:r>
-        <w:t>This command asks the user for the name and then sets all of the system settings except the battery calibration using the values in the file.</w:t>
-      </w:r>
-    </w:p>
-    <w:p>
-      <w:pPr>
-        <w:pStyle w:val="Heading3"/>
-      </w:pPr>
-      <w:r>
-        <w:t>Delete File</w:t>
-      </w:r>
-    </w:p>
-    <w:p>
-      <w:r>
-        <w:t>The user selects a file from the list and then it can be deleted.</w:t>
-      </w:r>
-    </w:p>
-    <w:p>
-      <w:pPr>
-        <w:pStyle w:val="Heading2"/>
-      </w:pPr>
-      <w:r>
-        <w:t>+System Settings</w:t>
-      </w:r>
-    </w:p>
-    <w:p>
-      <w:pPr>
-        <w:pStyle w:val="Heading3"/>
-      </w:pPr>
-      <w:r>
-        <w:t>+Display</w:t>
-      </w:r>
-      <w:r>
-        <w:t xml:space="preserve"> Settings</w:t>
-      </w:r>
-    </w:p>
-    <w:p>
-      <w:pPr>
-        <w:pStyle w:val="Heading4"/>
-      </w:pPr>
-      <w:r>
-        <w:t xml:space="preserve">Dimming Mode: </w:t>
-      </w:r>
-      <w:proofErr w:type="spellStart"/>
-      <w:r>
-        <w:t>None</w:t>
-      </w:r>
-      <w:r>
-        <w:t>|Timer</w:t>
-      </w:r>
-      <w:proofErr w:type="spellEnd"/>
-    </w:p>
-    <w:p>
-      <w:r>
-        <w:t xml:space="preserve">The display can be set to dim automatically after a specified number of seconds. This is used to save battery power since the backlight </w:t>
-      </w:r>
-      <w:r>
-        <w:t>uses a significant amount.</w:t>
-      </w:r>
-    </w:p>
-    <w:p>
-      <w:pPr>
-        <w:pStyle w:val="Heading4"/>
-      </w:pPr>
-      <w:r>
-        <w:t>Bright Value: 1-100</w:t>
-      </w:r>
-      <w:r>
-        <w:t>%</w:t>
-      </w:r>
-    </w:p>
-    <w:p>
-      <w:r>
-        <w:t>Set the display brightness value.</w:t>
-      </w:r>
-    </w:p>
-    <w:p>
-      <w:pPr>
-        <w:pStyle w:val="Heading4"/>
-      </w:pPr>
-      <w:r>
-        <w:t xml:space="preserve">Dim Value: </w:t>
-      </w:r>
-      <w:r>
-        <w:t>0-100%</w:t>
-      </w:r>
-    </w:p>
-    <w:p>
-      <w:r>
-        <w:t xml:space="preserve">Set the display brightness after the </w:t>
-      </w:r>
-      <w:r>
-        <w:t>timer below expires.</w:t>
-      </w:r>
-    </w:p>
-    <w:p>
-      <w:pPr>
-        <w:pStyle w:val="Heading4"/>
-      </w:pPr>
-      <w:r>
-        <w:t>Display Dim Time:</w:t>
-      </w:r>
-      <w:r>
-        <w:t xml:space="preserve"> 0-120 S</w:t>
-      </w:r>
-    </w:p>
-    <w:p>
-      <w:r>
-        <w:t>Specify the time until the display changes to dim mode.</w:t>
-      </w:r>
-    </w:p>
-    <w:p>
-      <w:pPr>
-        <w:pStyle w:val="Heading4"/>
-      </w:pPr>
-      <w:r>
-        <w:t>+Sideways Scroll Settings</w:t>
-      </w:r>
-    </w:p>
-    <w:p>
-      <w:r>
-        <w:t>Lines of text that too long for the display will scroll back and forth. The following settings control the speed.</w:t>
-      </w:r>
-    </w:p>
-    <w:p>
-      <w:pPr>
-        <w:pStyle w:val="Heading5"/>
-      </w:pPr>
-      <w:r>
-        <w:t xml:space="preserve">Speed: </w:t>
-      </w:r>
-      <w:r>
-        <w:t>1-1000 mS</w:t>
-      </w:r>
-    </w:p>
-    <w:p>
-      <w:r>
-        <w:t>Controls the speed of text moving to the left.</w:t>
-      </w:r>
-    </w:p>
-    <w:p>
-      <w:pPr>
-        <w:pStyle w:val="Heading5"/>
-      </w:pPr>
-      <w:r>
-        <w:t>Pause: 1-100</w:t>
-      </w:r>
-      <w:r>
-        <w:t xml:space="preserve"> mS</w:t>
-      </w:r>
-    </w:p>
-    <w:p>
-      <w:r>
-        <w:t>This controls the pause when the text is at the end (all the way to the left).</w:t>
-      </w:r>
-    </w:p>
-    <w:p>
-      <w:pPr>
-        <w:pStyle w:val="Heading5"/>
-      </w:pPr>
-      <w:r>
-        <w:t>Reverse Speed: 1-20x</w:t>
-      </w:r>
-    </w:p>
-    <w:p>
-      <w:r>
-        <w:t xml:space="preserve">This is how fast the text scrolls </w:t>
-      </w:r>
-      <w:r>
-        <w:t>back to the beginning (to the right). 2x means twice as fast as the text scroll</w:t>
-      </w:r>
-      <w:r>
-        <w:t>ed to the left</w:t>
-      </w:r>
-      <w:r>
-        <w:t>.</w:t>
-      </w:r>
-    </w:p>
-    <w:p>
-      <w:pPr>
-        <w:pStyle w:val="Heading4"/>
-      </w:pPr>
-      <w:r>
-        <w:t xml:space="preserve">Menu Selection: </w:t>
-      </w:r>
-      <w:r>
-        <w:t>Color|*</w:t>
-      </w:r>
-    </w:p>
-    <w:p>
-      <w:r>
-        <w:t>Menu selections</w:t>
-      </w:r>
-      <w:r>
-        <w:t xml:space="preserve"> and selections from a list can be either colored or marked with the ‘*’ character.</w:t>
-      </w:r>
-    </w:p>
-    <w:p>
-      <w:pPr>
-        <w:pStyle w:val="Heading4"/>
-      </w:pPr>
-      <w:r>
-        <w:lastRenderedPageBreak/>
-        <w:t>Text/</w:t>
-      </w:r>
-      <w:proofErr w:type="spellStart"/>
-      <w:r>
-        <w:t>HiLite</w:t>
-      </w:r>
-      <w:proofErr w:type="spellEnd"/>
-      <w:r>
-        <w:t xml:space="preserve"> Colors</w:t>
-      </w:r>
-    </w:p>
-    <w:p>
-      <w:r>
-        <w:t>This selection allows for choosing the colors of the text and the highlight. The background screen is always black.</w:t>
-      </w:r>
-    </w:p>
-    <w:p>
-      <w:pPr>
-        <w:pStyle w:val="Heading3"/>
-      </w:pPr>
-      <w:r>
-        <w:t>+Dial &amp; Button Settings</w:t>
-      </w:r>
-    </w:p>
-    <w:p>
-      <w:pPr>
-        <w:pStyle w:val="Heading4"/>
-      </w:pPr>
-      <w:r>
-        <w:t xml:space="preserve">Direction: </w:t>
-      </w:r>
-      <w:proofErr w:type="spellStart"/>
-      <w:r>
-        <w:t>Normal:Reverse</w:t>
-      </w:r>
-      <w:proofErr w:type="spellEnd"/>
-    </w:p>
-    <w:p>
-      <w:r>
-        <w:t>If you really want the button to be the other way around this is the choice for you.</w:t>
-      </w:r>
-    </w:p>
-    <w:p>
-      <w:pPr>
-        <w:pStyle w:val="Heading4"/>
-      </w:pPr>
-      <w:r>
-        <w:t>Long Press Timer: 2-200</w:t>
-      </w:r>
-    </w:p>
-    <w:p>
-      <w:r>
-        <w:t>This value affects how long or short a long press is. The default value is normally OK</w:t>
-      </w:r>
-      <w:r>
-        <w:t>, but somebody might want to change it.</w:t>
-      </w:r>
-    </w:p>
-    <w:p>
-      <w:pPr>
-        <w:pStyle w:val="Heading3"/>
-      </w:pPr>
-      <w:r>
-        <w:t>+Battery Settings</w:t>
-      </w:r>
-    </w:p>
-    <w:p>
-      <w:r>
-        <w:t>Since the PCB was designed with 10% resistors for measuring the battery voltage some calibration is needed. A future PCB will probably use better resistors so this won’t be needed.</w:t>
-      </w:r>
-    </w:p>
-    <w:p>
-      <w:pPr>
-        <w:pStyle w:val="Heading4"/>
-      </w:pPr>
-      <w:r>
-        <w:t xml:space="preserve">Show Battery: </w:t>
-      </w:r>
-      <w:proofErr w:type="spellStart"/>
-      <w:r>
-        <w:t>Yes|No</w:t>
-      </w:r>
-      <w:proofErr w:type="spellEnd"/>
-    </w:p>
-    <w:p>
-      <w:r>
-        <w:t xml:space="preserve">This option controls the </w:t>
-      </w:r>
-      <w:r>
-        <w:t>battery display on the bottom right of the display.</w:t>
-      </w:r>
-    </w:p>
-    <w:p>
-      <w:pPr>
-        <w:pStyle w:val="Heading4"/>
-      </w:pPr>
-      <w:r>
-        <w:t>Full Battery: 2000-4000</w:t>
-      </w:r>
-    </w:p>
-    <w:p>
-      <w:r>
-        <w:t>This is the value that indicates a full 4.2V battery.</w:t>
-      </w:r>
-    </w:p>
-    <w:p>
-      <w:pPr>
-        <w:pStyle w:val="Heading4"/>
-      </w:pPr>
-      <w:r>
-        <w:t>Set Full Battery</w:t>
-      </w:r>
-    </w:p>
-    <w:p>
-      <w:r>
-        <w:t>This selection reads the current battery values and stores it. It is best set by fully charging the battery and then disconnecting the charger. Wait a couple of minutes and then use it several times until it seems stable.</w:t>
-      </w:r>
-    </w:p>
-    <w:p>
-      <w:pPr>
-        <w:pStyle w:val="Heading4"/>
-      </w:pPr>
-      <w:r>
-        <w:t>Read Battery Raw Data</w:t>
-      </w:r>
-    </w:p>
-    <w:p>
-      <w:r>
-        <w:t>This continuously reads the battery value</w:t>
-      </w:r>
-      <w:r>
-        <w:t>. It was originally used for testing, but it seems like it might possibly be useful so it was left in the menu system.</w:t>
-      </w:r>
-    </w:p>
-    <w:p>
-      <w:pPr>
-        <w:pStyle w:val="Heading3"/>
-      </w:pPr>
-      <w:r>
-        <w:t>New Version BIN File</w:t>
-      </w:r>
-    </w:p>
-    <w:p>
-      <w:r>
-        <w:t xml:space="preserve">New firmware can be loaded by putting </w:t>
-      </w:r>
-      <w:r>
-        <w:t xml:space="preserve">the binary file on the SD card. It must be named </w:t>
-      </w:r>
-      <w:proofErr w:type="spellStart"/>
-      <w:r>
-        <w:t>RadioFox.BIN</w:t>
-      </w:r>
-      <w:proofErr w:type="spellEnd"/>
-      <w:r>
-        <w:t>.</w:t>
-      </w:r>
-      <w:r>
-        <w:t xml:space="preserve"> There are two prompts, one to confirm overwriting the firmware, and another to allow deletion of the </w:t>
-      </w:r>
-      <w:r>
-        <w:t>BIN file after installation.</w:t>
-      </w:r>
-    </w:p>
-    <w:p>
-      <w:pPr>
-        <w:pStyle w:val="Heading3"/>
-      </w:pPr>
-      <w:r>
-        <w:t>Factory Settings</w:t>
-      </w:r>
-    </w:p>
-    <w:p>
-      <w:r>
-        <w:t xml:space="preserve">This command resets </w:t>
-      </w:r>
-      <w:r>
-        <w:t xml:space="preserve">all </w:t>
-      </w:r>
-      <w:r>
-        <w:t>settings</w:t>
-      </w:r>
-      <w:r>
-        <w:t xml:space="preserve"> except the high battery value to the original factory values.</w:t>
-      </w:r>
-    </w:p>
-    <w:p>
-      <w:pPr>
-        <w:pStyle w:val="Heading3"/>
-      </w:pPr>
-      <w:r>
-        <w:lastRenderedPageBreak/>
-        <w:t>Format EEPROM</w:t>
-      </w:r>
-    </w:p>
-    <w:p>
-      <w:r>
-        <w:t xml:space="preserve">This will clear </w:t>
-      </w:r>
-      <w:r>
-        <w:t xml:space="preserve">and reset </w:t>
-      </w:r>
-      <w:r>
-        <w:t xml:space="preserve">the </w:t>
-      </w:r>
-      <w:proofErr w:type="spellStart"/>
-      <w:r>
-        <w:t>eeprom</w:t>
-      </w:r>
-      <w:proofErr w:type="spellEnd"/>
-      <w:r>
-        <w:t xml:space="preserve"> where the settings are save</w:t>
-      </w:r>
-      <w:r>
-        <w:t xml:space="preserve"> in non-volatile memory. This is how settings are saved while the system is not powered.</w:t>
-      </w:r>
-    </w:p>
-    <w:p>
-      <w:pPr>
-        <w:pStyle w:val="Heading2"/>
-      </w:pPr>
-      <w:r>
         <w:t>Save Current Settings</w:t>
       </w:r>
     </w:p>
     <w:p>
       <w:r>
-        <w:t>This stores all of the current settings in the non-volatile memory</w:t>
+        <w:t xml:space="preserve">This stores </w:t>
+      </w:r>
+      <w:proofErr w:type="gramStart"/>
+      <w:r>
+        <w:t>all of</w:t>
+      </w:r>
+      <w:proofErr w:type="gramEnd"/>
+      <w:r>
+        <w:t xml:space="preserve"> the current settings in the non-volatile memory</w:t>
       </w:r>
       <w:r>
         <w:t>. Note that this is not often used since settings are normally saved each time they are changed.</w:t>
@@ -3031,6 +3623,7 @@
         <w:docPartUnique/>
       </w:docPartObj>
     </w:sdtPr>
+    <w:sdtEndPr/>
     <w:sdtContent>
       <w:sdt>
         <w:sdtPr>
@@ -3040,6 +3633,7 @@
             <w:docPartUnique/>
           </w:docPartObj>
         </w:sdtPr>
+        <w:sdtEndPr/>
         <w:sdtContent>
           <w:p>
             <w:pPr>
@@ -8111,6 +8705,118 @@
     </w:lvl>
   </w:abstractNum>
   <w:abstractNum w:abstractNumId="44" w15:restartNumberingAfterBreak="0">
+    <w:nsid w:val="377B1E27"/>
+    <w:multiLevelType w:val="hybridMultilevel"/>
+    <w:tmpl w:val="70E09EF8"/>
+    <w:lvl w:ilvl="0" w:tplc="74F2D27C">
+      <w:numFmt w:val="bullet"/>
+      <w:lvlText w:val="-"/>
+      <w:lvlJc w:val="left"/>
+      <w:pPr>
+        <w:ind w:left="720" w:hanging="360"/>
+      </w:pPr>
+      <w:rPr>
+        <w:rFonts w:ascii="Arial" w:eastAsia="Arial" w:hAnsi="Arial" w:cs="Arial" w:hint="default"/>
+      </w:rPr>
+    </w:lvl>
+    <w:lvl w:ilvl="1" w:tplc="04090003" w:tentative="1">
+      <w:start w:val="1"/>
+      <w:numFmt w:val="bullet"/>
+      <w:lvlText w:val="o"/>
+      <w:lvlJc w:val="left"/>
+      <w:pPr>
+        <w:ind w:left="1440" w:hanging="360"/>
+      </w:pPr>
+      <w:rPr>
+        <w:rFonts w:ascii="Courier New" w:hAnsi="Courier New" w:cs="Courier New" w:hint="default"/>
+      </w:rPr>
+    </w:lvl>
+    <w:lvl w:ilvl="2" w:tplc="04090005" w:tentative="1">
+      <w:start w:val="1"/>
+      <w:numFmt w:val="bullet"/>
+      <w:lvlText w:val=""/>
+      <w:lvlJc w:val="left"/>
+      <w:pPr>
+        <w:ind w:left="2160" w:hanging="360"/>
+      </w:pPr>
+      <w:rPr>
+        <w:rFonts w:ascii="Wingdings" w:hAnsi="Wingdings" w:hint="default"/>
+      </w:rPr>
+    </w:lvl>
+    <w:lvl w:ilvl="3" w:tplc="04090001" w:tentative="1">
+      <w:start w:val="1"/>
+      <w:numFmt w:val="bullet"/>
+      <w:lvlText w:val=""/>
+      <w:lvlJc w:val="left"/>
+      <w:pPr>
+        <w:ind w:left="2880" w:hanging="360"/>
+      </w:pPr>
+      <w:rPr>
+        <w:rFonts w:ascii="Symbol" w:hAnsi="Symbol" w:hint="default"/>
+      </w:rPr>
+    </w:lvl>
+    <w:lvl w:ilvl="4" w:tplc="04090003" w:tentative="1">
+      <w:start w:val="1"/>
+      <w:numFmt w:val="bullet"/>
+      <w:lvlText w:val="o"/>
+      <w:lvlJc w:val="left"/>
+      <w:pPr>
+        <w:ind w:left="3600" w:hanging="360"/>
+      </w:pPr>
+      <w:rPr>
+        <w:rFonts w:ascii="Courier New" w:hAnsi="Courier New" w:cs="Courier New" w:hint="default"/>
+      </w:rPr>
+    </w:lvl>
+    <w:lvl w:ilvl="5" w:tplc="04090005" w:tentative="1">
+      <w:start w:val="1"/>
+      <w:numFmt w:val="bullet"/>
+      <w:lvlText w:val=""/>
+      <w:lvlJc w:val="left"/>
+      <w:pPr>
+        <w:ind w:left="4320" w:hanging="360"/>
+      </w:pPr>
+      <w:rPr>
+        <w:rFonts w:ascii="Wingdings" w:hAnsi="Wingdings" w:hint="default"/>
+      </w:rPr>
+    </w:lvl>
+    <w:lvl w:ilvl="6" w:tplc="04090001" w:tentative="1">
+      <w:start w:val="1"/>
+      <w:numFmt w:val="bullet"/>
+      <w:lvlText w:val=""/>
+      <w:lvlJc w:val="left"/>
+      <w:pPr>
+        <w:ind w:left="5040" w:hanging="360"/>
+      </w:pPr>
+      <w:rPr>
+        <w:rFonts w:ascii="Symbol" w:hAnsi="Symbol" w:hint="default"/>
+      </w:rPr>
+    </w:lvl>
+    <w:lvl w:ilvl="7" w:tplc="04090003" w:tentative="1">
+      <w:start w:val="1"/>
+      <w:numFmt w:val="bullet"/>
+      <w:lvlText w:val="o"/>
+      <w:lvlJc w:val="left"/>
+      <w:pPr>
+        <w:ind w:left="5760" w:hanging="360"/>
+      </w:pPr>
+      <w:rPr>
+        <w:rFonts w:ascii="Courier New" w:hAnsi="Courier New" w:cs="Courier New" w:hint="default"/>
+      </w:rPr>
+    </w:lvl>
+    <w:lvl w:ilvl="8" w:tplc="04090005" w:tentative="1">
+      <w:start w:val="1"/>
+      <w:numFmt w:val="bullet"/>
+      <w:lvlText w:val=""/>
+      <w:lvlJc w:val="left"/>
+      <w:pPr>
+        <w:ind w:left="6480" w:hanging="360"/>
+      </w:pPr>
+      <w:rPr>
+        <w:rFonts w:ascii="Wingdings" w:hAnsi="Wingdings" w:hint="default"/>
+      </w:rPr>
+    </w:lvl>
+  </w:abstractNum>
+  <w:abstractNum w:abstractNumId="45" w15:restartNumberingAfterBreak="0">
     <w:nsid w:val="37ED2E74"/>
     <w:multiLevelType w:val="hybridMultilevel"/>
     <w:tmpl w:val="2D30E69C"/>
@@ -8222,7 +8928,7 @@
       </w:rPr>
     </w:lvl>
   </w:abstractNum>
-  <w:abstractNum w:abstractNumId="45" w15:restartNumberingAfterBreak="0">
+  <w:abstractNum w:abstractNumId="46" w15:restartNumberingAfterBreak="0">
     <w:nsid w:val="393A26B1"/>
     <w:multiLevelType w:val="hybridMultilevel"/>
     <w:tmpl w:val="59707C16"/>
@@ -8334,7 +9040,7 @@
       </w:rPr>
     </w:lvl>
   </w:abstractNum>
-  <w:abstractNum w:abstractNumId="46" w15:restartNumberingAfterBreak="0">
+  <w:abstractNum w:abstractNumId="47" w15:restartNumberingAfterBreak="0">
     <w:nsid w:val="395D6EAE"/>
     <w:multiLevelType w:val="hybridMultilevel"/>
     <w:tmpl w:val="A9FA500E"/>
@@ -8446,7 +9152,7 @@
       </w:rPr>
     </w:lvl>
   </w:abstractNum>
-  <w:abstractNum w:abstractNumId="47" w15:restartNumberingAfterBreak="0">
+  <w:abstractNum w:abstractNumId="48" w15:restartNumberingAfterBreak="0">
     <w:nsid w:val="39A93951"/>
     <w:multiLevelType w:val="hybridMultilevel"/>
     <w:tmpl w:val="E522E05C"/>
@@ -8558,7 +9264,7 @@
       </w:rPr>
     </w:lvl>
   </w:abstractNum>
-  <w:abstractNum w:abstractNumId="48" w15:restartNumberingAfterBreak="0">
+  <w:abstractNum w:abstractNumId="49" w15:restartNumberingAfterBreak="0">
     <w:nsid w:val="3B001DA3"/>
     <w:multiLevelType w:val="hybridMultilevel"/>
     <w:tmpl w:val="077EDE58"/>
@@ -8670,7 +9376,7 @@
       </w:rPr>
     </w:lvl>
   </w:abstractNum>
-  <w:abstractNum w:abstractNumId="49" w15:restartNumberingAfterBreak="0">
+  <w:abstractNum w:abstractNumId="50" w15:restartNumberingAfterBreak="0">
     <w:nsid w:val="3C141BB0"/>
     <w:multiLevelType w:val="hybridMultilevel"/>
     <w:tmpl w:val="E7900C40"/>
@@ -8782,7 +9488,7 @@
       </w:rPr>
     </w:lvl>
   </w:abstractNum>
-  <w:abstractNum w:abstractNumId="50" w15:restartNumberingAfterBreak="0">
+  <w:abstractNum w:abstractNumId="51" w15:restartNumberingAfterBreak="0">
     <w:nsid w:val="3D29141D"/>
     <w:multiLevelType w:val="hybridMultilevel"/>
     <w:tmpl w:val="907E98AC"/>
@@ -8894,7 +9600,7 @@
       </w:rPr>
     </w:lvl>
   </w:abstractNum>
-  <w:abstractNum w:abstractNumId="51" w15:restartNumberingAfterBreak="0">
+  <w:abstractNum w:abstractNumId="52" w15:restartNumberingAfterBreak="0">
     <w:nsid w:val="3E463A6C"/>
     <w:multiLevelType w:val="hybridMultilevel"/>
     <w:tmpl w:val="5A4C8A9E"/>
@@ -9006,7 +9712,7 @@
       </w:rPr>
     </w:lvl>
   </w:abstractNum>
-  <w:abstractNum w:abstractNumId="52" w15:restartNumberingAfterBreak="0">
+  <w:abstractNum w:abstractNumId="53" w15:restartNumberingAfterBreak="0">
     <w:nsid w:val="40163D94"/>
     <w:multiLevelType w:val="hybridMultilevel"/>
     <w:tmpl w:val="B8669994"/>
@@ -9118,7 +9824,7 @@
       </w:rPr>
     </w:lvl>
   </w:abstractNum>
-  <w:abstractNum w:abstractNumId="53" w15:restartNumberingAfterBreak="0">
+  <w:abstractNum w:abstractNumId="54" w15:restartNumberingAfterBreak="0">
     <w:nsid w:val="40570DDE"/>
     <w:multiLevelType w:val="hybridMultilevel"/>
     <w:tmpl w:val="374229F2"/>
@@ -9230,7 +9936,7 @@
       </w:rPr>
     </w:lvl>
   </w:abstractNum>
-  <w:abstractNum w:abstractNumId="54" w15:restartNumberingAfterBreak="0">
+  <w:abstractNum w:abstractNumId="55" w15:restartNumberingAfterBreak="0">
     <w:nsid w:val="42EE59E7"/>
     <w:multiLevelType w:val="multilevel"/>
     <w:tmpl w:val="6A52508A"/>
@@ -9343,7 +10049,7 @@
       </w:rPr>
     </w:lvl>
   </w:abstractNum>
-  <w:abstractNum w:abstractNumId="55" w15:restartNumberingAfterBreak="0">
+  <w:abstractNum w:abstractNumId="56" w15:restartNumberingAfterBreak="0">
     <w:nsid w:val="43E5715E"/>
     <w:multiLevelType w:val="hybridMultilevel"/>
     <w:tmpl w:val="DF4C239E"/>
@@ -9455,7 +10161,7 @@
       </w:rPr>
     </w:lvl>
   </w:abstractNum>
-  <w:abstractNum w:abstractNumId="56" w15:restartNumberingAfterBreak="0">
+  <w:abstractNum w:abstractNumId="57" w15:restartNumberingAfterBreak="0">
     <w:nsid w:val="447A353B"/>
     <w:multiLevelType w:val="hybridMultilevel"/>
     <w:tmpl w:val="C978BA68"/>
@@ -9567,7 +10273,7 @@
       </w:rPr>
     </w:lvl>
   </w:abstractNum>
-  <w:abstractNum w:abstractNumId="57" w15:restartNumberingAfterBreak="0">
+  <w:abstractNum w:abstractNumId="58" w15:restartNumberingAfterBreak="0">
     <w:nsid w:val="452C7493"/>
     <w:multiLevelType w:val="hybridMultilevel"/>
     <w:tmpl w:val="9910A868"/>
@@ -9679,7 +10385,7 @@
       </w:rPr>
     </w:lvl>
   </w:abstractNum>
-  <w:abstractNum w:abstractNumId="58" w15:restartNumberingAfterBreak="0">
+  <w:abstractNum w:abstractNumId="59" w15:restartNumberingAfterBreak="0">
     <w:nsid w:val="46BB3CB3"/>
     <w:multiLevelType w:val="hybridMultilevel"/>
     <w:tmpl w:val="8B62916A"/>
@@ -9791,7 +10497,7 @@
       </w:rPr>
     </w:lvl>
   </w:abstractNum>
-  <w:abstractNum w:abstractNumId="59" w15:restartNumberingAfterBreak="0">
+  <w:abstractNum w:abstractNumId="60" w15:restartNumberingAfterBreak="0">
     <w:nsid w:val="483D056B"/>
     <w:multiLevelType w:val="hybridMultilevel"/>
     <w:tmpl w:val="C4DCE034"/>
@@ -9903,7 +10609,7 @@
       </w:rPr>
     </w:lvl>
   </w:abstractNum>
-  <w:abstractNum w:abstractNumId="60" w15:restartNumberingAfterBreak="0">
+  <w:abstractNum w:abstractNumId="61" w15:restartNumberingAfterBreak="0">
     <w:nsid w:val="48813A05"/>
     <w:multiLevelType w:val="hybridMultilevel"/>
     <w:tmpl w:val="42CAA4CE"/>
@@ -10016,7 +10722,7 @@
       </w:rPr>
     </w:lvl>
   </w:abstractNum>
-  <w:abstractNum w:abstractNumId="61" w15:restartNumberingAfterBreak="0">
+  <w:abstractNum w:abstractNumId="62" w15:restartNumberingAfterBreak="0">
     <w:nsid w:val="4A3C29DC"/>
     <w:multiLevelType w:val="hybridMultilevel"/>
     <w:tmpl w:val="29F4D392"/>
@@ -10128,7 +10834,7 @@
       </w:rPr>
     </w:lvl>
   </w:abstractNum>
-  <w:abstractNum w:abstractNumId="62" w15:restartNumberingAfterBreak="0">
+  <w:abstractNum w:abstractNumId="63" w15:restartNumberingAfterBreak="0">
     <w:nsid w:val="4A9B6FB7"/>
     <w:multiLevelType w:val="hybridMultilevel"/>
     <w:tmpl w:val="C47ECA54"/>
@@ -10240,7 +10946,7 @@
       </w:rPr>
     </w:lvl>
   </w:abstractNum>
-  <w:abstractNum w:abstractNumId="63" w15:restartNumberingAfterBreak="0">
+  <w:abstractNum w:abstractNumId="64" w15:restartNumberingAfterBreak="0">
     <w:nsid w:val="4C2207ED"/>
     <w:multiLevelType w:val="hybridMultilevel"/>
     <w:tmpl w:val="E95272B2"/>
@@ -10352,7 +11058,7 @@
       </w:rPr>
     </w:lvl>
   </w:abstractNum>
-  <w:abstractNum w:abstractNumId="64" w15:restartNumberingAfterBreak="0">
+  <w:abstractNum w:abstractNumId="65" w15:restartNumberingAfterBreak="0">
     <w:nsid w:val="4C687CB3"/>
     <w:multiLevelType w:val="hybridMultilevel"/>
     <w:tmpl w:val="0D781E22"/>
@@ -10464,7 +11170,7 @@
       </w:rPr>
     </w:lvl>
   </w:abstractNum>
-  <w:abstractNum w:abstractNumId="65" w15:restartNumberingAfterBreak="0">
+  <w:abstractNum w:abstractNumId="66" w15:restartNumberingAfterBreak="0">
     <w:nsid w:val="4FCE4725"/>
     <w:multiLevelType w:val="hybridMultilevel"/>
     <w:tmpl w:val="914EE3B4"/>
@@ -10576,7 +11282,7 @@
       </w:rPr>
     </w:lvl>
   </w:abstractNum>
-  <w:abstractNum w:abstractNumId="66" w15:restartNumberingAfterBreak="0">
+  <w:abstractNum w:abstractNumId="67" w15:restartNumberingAfterBreak="0">
     <w:nsid w:val="51CE085C"/>
     <w:multiLevelType w:val="hybridMultilevel"/>
     <w:tmpl w:val="84788A08"/>
@@ -10688,7 +11394,7 @@
       </w:rPr>
     </w:lvl>
   </w:abstractNum>
-  <w:abstractNum w:abstractNumId="67" w15:restartNumberingAfterBreak="0">
+  <w:abstractNum w:abstractNumId="68" w15:restartNumberingAfterBreak="0">
     <w:nsid w:val="52944BD2"/>
     <w:multiLevelType w:val="hybridMultilevel"/>
     <w:tmpl w:val="BC3489E0"/>
@@ -10800,7 +11506,7 @@
       </w:rPr>
     </w:lvl>
   </w:abstractNum>
-  <w:abstractNum w:abstractNumId="68" w15:restartNumberingAfterBreak="0">
+  <w:abstractNum w:abstractNumId="69" w15:restartNumberingAfterBreak="0">
     <w:nsid w:val="565E12F2"/>
     <w:multiLevelType w:val="hybridMultilevel"/>
     <w:tmpl w:val="9E96747C"/>
@@ -10912,7 +11618,7 @@
       </w:rPr>
     </w:lvl>
   </w:abstractNum>
-  <w:abstractNum w:abstractNumId="69" w15:restartNumberingAfterBreak="0">
+  <w:abstractNum w:abstractNumId="70" w15:restartNumberingAfterBreak="0">
     <w:nsid w:val="57466407"/>
     <w:multiLevelType w:val="hybridMultilevel"/>
     <w:tmpl w:val="0F9ADCF4"/>
@@ -11024,7 +11730,7 @@
       </w:rPr>
     </w:lvl>
   </w:abstractNum>
-  <w:abstractNum w:abstractNumId="70" w15:restartNumberingAfterBreak="0">
+  <w:abstractNum w:abstractNumId="71" w15:restartNumberingAfterBreak="0">
     <w:nsid w:val="5ABE68FB"/>
     <w:multiLevelType w:val="hybridMultilevel"/>
     <w:tmpl w:val="B422F472"/>
@@ -11136,7 +11842,7 @@
       </w:rPr>
     </w:lvl>
   </w:abstractNum>
-  <w:abstractNum w:abstractNumId="71" w15:restartNumberingAfterBreak="0">
+  <w:abstractNum w:abstractNumId="72" w15:restartNumberingAfterBreak="0">
     <w:nsid w:val="5BA928F1"/>
     <w:multiLevelType w:val="hybridMultilevel"/>
     <w:tmpl w:val="4D4E1798"/>
@@ -11248,7 +11954,7 @@
       </w:rPr>
     </w:lvl>
   </w:abstractNum>
-  <w:abstractNum w:abstractNumId="72" w15:restartNumberingAfterBreak="0">
+  <w:abstractNum w:abstractNumId="73" w15:restartNumberingAfterBreak="0">
     <w:nsid w:val="5C834FA4"/>
     <w:multiLevelType w:val="hybridMultilevel"/>
     <w:tmpl w:val="1FC415FC"/>
@@ -11360,7 +12066,7 @@
       </w:rPr>
     </w:lvl>
   </w:abstractNum>
-  <w:abstractNum w:abstractNumId="73" w15:restartNumberingAfterBreak="0">
+  <w:abstractNum w:abstractNumId="74" w15:restartNumberingAfterBreak="0">
     <w:nsid w:val="5F3C3936"/>
     <w:multiLevelType w:val="hybridMultilevel"/>
     <w:tmpl w:val="917CC46E"/>
@@ -11472,7 +12178,7 @@
       </w:rPr>
     </w:lvl>
   </w:abstractNum>
-  <w:abstractNum w:abstractNumId="74" w15:restartNumberingAfterBreak="0">
+  <w:abstractNum w:abstractNumId="75" w15:restartNumberingAfterBreak="0">
     <w:nsid w:val="60544E94"/>
     <w:multiLevelType w:val="hybridMultilevel"/>
     <w:tmpl w:val="CBCAC042"/>
@@ -11584,7 +12290,7 @@
       </w:rPr>
     </w:lvl>
   </w:abstractNum>
-  <w:abstractNum w:abstractNumId="75" w15:restartNumberingAfterBreak="0">
+  <w:abstractNum w:abstractNumId="76" w15:restartNumberingAfterBreak="0">
     <w:nsid w:val="62D1418B"/>
     <w:multiLevelType w:val="multilevel"/>
     <w:tmpl w:val="3E58308A"/>
@@ -11683,7 +12389,7 @@
       </w:pPr>
     </w:lvl>
   </w:abstractNum>
-  <w:abstractNum w:abstractNumId="76" w15:restartNumberingAfterBreak="0">
+  <w:abstractNum w:abstractNumId="77" w15:restartNumberingAfterBreak="0">
     <w:nsid w:val="62E52923"/>
     <w:multiLevelType w:val="hybridMultilevel"/>
     <w:tmpl w:val="7668165A"/>
@@ -11795,7 +12501,7 @@
       </w:rPr>
     </w:lvl>
   </w:abstractNum>
-  <w:abstractNum w:abstractNumId="77" w15:restartNumberingAfterBreak="0">
+  <w:abstractNum w:abstractNumId="78" w15:restartNumberingAfterBreak="0">
     <w:nsid w:val="63935A88"/>
     <w:multiLevelType w:val="hybridMultilevel"/>
     <w:tmpl w:val="0F5805EA"/>
@@ -11907,7 +12613,7 @@
       </w:rPr>
     </w:lvl>
   </w:abstractNum>
-  <w:abstractNum w:abstractNumId="78" w15:restartNumberingAfterBreak="0">
+  <w:abstractNum w:abstractNumId="79" w15:restartNumberingAfterBreak="0">
     <w:nsid w:val="69496F08"/>
     <w:multiLevelType w:val="hybridMultilevel"/>
     <w:tmpl w:val="6EE839E4"/>
@@ -12019,7 +12725,7 @@
       </w:rPr>
     </w:lvl>
   </w:abstractNum>
-  <w:abstractNum w:abstractNumId="79" w15:restartNumberingAfterBreak="0">
+  <w:abstractNum w:abstractNumId="80" w15:restartNumberingAfterBreak="0">
     <w:nsid w:val="6ACC6C5E"/>
     <w:multiLevelType w:val="multilevel"/>
     <w:tmpl w:val="4AB8E1DA"/>
@@ -12132,7 +12838,7 @@
       </w:rPr>
     </w:lvl>
   </w:abstractNum>
-  <w:abstractNum w:abstractNumId="80" w15:restartNumberingAfterBreak="0">
+  <w:abstractNum w:abstractNumId="81" w15:restartNumberingAfterBreak="0">
     <w:nsid w:val="6D7319F8"/>
     <w:multiLevelType w:val="hybridMultilevel"/>
     <w:tmpl w:val="A7EEE4A4"/>
@@ -12244,7 +12950,7 @@
       </w:rPr>
     </w:lvl>
   </w:abstractNum>
-  <w:abstractNum w:abstractNumId="81" w15:restartNumberingAfterBreak="0">
+  <w:abstractNum w:abstractNumId="82" w15:restartNumberingAfterBreak="0">
     <w:nsid w:val="6D94244E"/>
     <w:multiLevelType w:val="hybridMultilevel"/>
     <w:tmpl w:val="D38C1A3A"/>
@@ -12356,7 +13062,7 @@
       </w:rPr>
     </w:lvl>
   </w:abstractNum>
-  <w:abstractNum w:abstractNumId="82" w15:restartNumberingAfterBreak="0">
+  <w:abstractNum w:abstractNumId="83" w15:restartNumberingAfterBreak="0">
     <w:nsid w:val="6DEA09BD"/>
     <w:multiLevelType w:val="hybridMultilevel"/>
     <w:tmpl w:val="029A123E"/>
@@ -12468,7 +13174,7 @@
       </w:rPr>
     </w:lvl>
   </w:abstractNum>
-  <w:abstractNum w:abstractNumId="83" w15:restartNumberingAfterBreak="0">
+  <w:abstractNum w:abstractNumId="84" w15:restartNumberingAfterBreak="0">
     <w:nsid w:val="6E310D77"/>
     <w:multiLevelType w:val="hybridMultilevel"/>
     <w:tmpl w:val="9C74834E"/>
@@ -12581,7 +13287,7 @@
       </w:rPr>
     </w:lvl>
   </w:abstractNum>
-  <w:abstractNum w:abstractNumId="84" w15:restartNumberingAfterBreak="0">
+  <w:abstractNum w:abstractNumId="85" w15:restartNumberingAfterBreak="0">
     <w:nsid w:val="74D85371"/>
     <w:multiLevelType w:val="hybridMultilevel"/>
     <w:tmpl w:val="B20E36AC"/>
@@ -12693,7 +13399,7 @@
       </w:rPr>
     </w:lvl>
   </w:abstractNum>
-  <w:abstractNum w:abstractNumId="85" w15:restartNumberingAfterBreak="0">
+  <w:abstractNum w:abstractNumId="86" w15:restartNumberingAfterBreak="0">
     <w:nsid w:val="75FA3747"/>
     <w:multiLevelType w:val="hybridMultilevel"/>
     <w:tmpl w:val="B9F43A9E"/>
@@ -12805,7 +13511,7 @@
       </w:rPr>
     </w:lvl>
   </w:abstractNum>
-  <w:abstractNum w:abstractNumId="86" w15:restartNumberingAfterBreak="0">
+  <w:abstractNum w:abstractNumId="87" w15:restartNumberingAfterBreak="0">
     <w:nsid w:val="7877407A"/>
     <w:multiLevelType w:val="hybridMultilevel"/>
     <w:tmpl w:val="C91E38FA"/>
@@ -12917,7 +13623,7 @@
       </w:rPr>
     </w:lvl>
   </w:abstractNum>
-  <w:abstractNum w:abstractNumId="87" w15:restartNumberingAfterBreak="0">
+  <w:abstractNum w:abstractNumId="88" w15:restartNumberingAfterBreak="0">
     <w:nsid w:val="78A40DC3"/>
     <w:multiLevelType w:val="hybridMultilevel"/>
     <w:tmpl w:val="F1E6B4B6"/>
@@ -13029,7 +13735,7 @@
       </w:rPr>
     </w:lvl>
   </w:abstractNum>
-  <w:abstractNum w:abstractNumId="88" w15:restartNumberingAfterBreak="0">
+  <w:abstractNum w:abstractNumId="89" w15:restartNumberingAfterBreak="0">
     <w:nsid w:val="79587B7C"/>
     <w:multiLevelType w:val="hybridMultilevel"/>
     <w:tmpl w:val="6A46933A"/>
@@ -13141,7 +13847,7 @@
       </w:rPr>
     </w:lvl>
   </w:abstractNum>
-  <w:abstractNum w:abstractNumId="89" w15:restartNumberingAfterBreak="0">
+  <w:abstractNum w:abstractNumId="90" w15:restartNumberingAfterBreak="0">
     <w:nsid w:val="7BB23699"/>
     <w:multiLevelType w:val="hybridMultilevel"/>
     <w:tmpl w:val="26C25814"/>
@@ -13253,7 +13959,7 @@
       </w:rPr>
     </w:lvl>
   </w:abstractNum>
-  <w:abstractNum w:abstractNumId="90" w15:restartNumberingAfterBreak="0">
+  <w:abstractNum w:abstractNumId="91" w15:restartNumberingAfterBreak="0">
     <w:nsid w:val="7F827ECF"/>
     <w:multiLevelType w:val="hybridMultilevel"/>
     <w:tmpl w:val="42DE9398"/>
@@ -13366,13 +14072,13 @@
     </w:lvl>
   </w:abstractNum>
   <w:num w:numId="1" w16cid:durableId="553472407">
-    <w:abstractNumId w:val="79"/>
+    <w:abstractNumId w:val="80"/>
   </w:num>
   <w:num w:numId="2" w16cid:durableId="1531718695">
     <w:abstractNumId w:val="16"/>
   </w:num>
   <w:num w:numId="3" w16cid:durableId="667371155">
-    <w:abstractNumId w:val="54"/>
+    <w:abstractNumId w:val="55"/>
   </w:num>
   <w:num w:numId="4" w16cid:durableId="751775167">
     <w:abstractNumId w:val="12"/>
@@ -13381,16 +14087,16 @@
     <w:abstractNumId w:val="29"/>
   </w:num>
   <w:num w:numId="6" w16cid:durableId="915629572">
-    <w:abstractNumId w:val="75"/>
+    <w:abstractNumId w:val="76"/>
   </w:num>
   <w:num w:numId="7" w16cid:durableId="693576224">
-    <w:abstractNumId w:val="88"/>
+    <w:abstractNumId w:val="89"/>
   </w:num>
   <w:num w:numId="8" w16cid:durableId="1298343021">
-    <w:abstractNumId w:val="83"/>
+    <w:abstractNumId w:val="84"/>
   </w:num>
   <w:num w:numId="9" w16cid:durableId="367219526">
-    <w:abstractNumId w:val="81"/>
+    <w:abstractNumId w:val="82"/>
   </w:num>
   <w:num w:numId="10" w16cid:durableId="1497187389">
     <w:abstractNumId w:val="18"/>
@@ -13399,7 +14105,7 @@
     <w:abstractNumId w:val="11"/>
   </w:num>
   <w:num w:numId="12" w16cid:durableId="567883504">
-    <w:abstractNumId w:val="50"/>
+    <w:abstractNumId w:val="51"/>
   </w:num>
   <w:num w:numId="13" w16cid:durableId="1572815186">
     <w:abstractNumId w:val="43"/>
@@ -13411,16 +14117,16 @@
     <w:abstractNumId w:val="5"/>
   </w:num>
   <w:num w:numId="16" w16cid:durableId="1421751508">
-    <w:abstractNumId w:val="90"/>
+    <w:abstractNumId w:val="91"/>
   </w:num>
   <w:num w:numId="17" w16cid:durableId="1009716389">
-    <w:abstractNumId w:val="60"/>
+    <w:abstractNumId w:val="61"/>
   </w:num>
   <w:num w:numId="18" w16cid:durableId="300229387">
-    <w:abstractNumId w:val="66"/>
+    <w:abstractNumId w:val="67"/>
   </w:num>
   <w:num w:numId="19" w16cid:durableId="1025836216">
-    <w:abstractNumId w:val="48"/>
+    <w:abstractNumId w:val="49"/>
   </w:num>
   <w:num w:numId="20" w16cid:durableId="976106770">
     <w:abstractNumId w:val="14"/>
@@ -13429,13 +14135,13 @@
     <w:abstractNumId w:val="38"/>
   </w:num>
   <w:num w:numId="22" w16cid:durableId="177355694">
-    <w:abstractNumId w:val="73"/>
+    <w:abstractNumId w:val="74"/>
   </w:num>
   <w:num w:numId="23" w16cid:durableId="6762404">
-    <w:abstractNumId w:val="57"/>
+    <w:abstractNumId w:val="58"/>
   </w:num>
   <w:num w:numId="24" w16cid:durableId="1492133217">
-    <w:abstractNumId w:val="63"/>
+    <w:abstractNumId w:val="64"/>
   </w:num>
   <w:num w:numId="25" w16cid:durableId="695159279">
     <w:abstractNumId w:val="27"/>
@@ -13447,25 +14153,25 @@
     <w:abstractNumId w:val="41"/>
   </w:num>
   <w:num w:numId="28" w16cid:durableId="1082484344">
-    <w:abstractNumId w:val="59"/>
+    <w:abstractNumId w:val="60"/>
   </w:num>
   <w:num w:numId="29" w16cid:durableId="467865549">
-    <w:abstractNumId w:val="64"/>
+    <w:abstractNumId w:val="65"/>
   </w:num>
   <w:num w:numId="30" w16cid:durableId="1656108771">
     <w:abstractNumId w:val="17"/>
   </w:num>
   <w:num w:numId="31" w16cid:durableId="1611818230">
-    <w:abstractNumId w:val="82"/>
+    <w:abstractNumId w:val="83"/>
   </w:num>
   <w:num w:numId="32" w16cid:durableId="1666009498">
     <w:abstractNumId w:val="10"/>
   </w:num>
   <w:num w:numId="33" w16cid:durableId="1041394156">
-    <w:abstractNumId w:val="45"/>
+    <w:abstractNumId w:val="46"/>
   </w:num>
   <w:num w:numId="34" w16cid:durableId="1270353408">
-    <w:abstractNumId w:val="53"/>
+    <w:abstractNumId w:val="54"/>
   </w:num>
   <w:num w:numId="35" w16cid:durableId="1540698615">
     <w:abstractNumId w:val="9"/>
@@ -13480,37 +14186,37 @@
     <w:abstractNumId w:val="34"/>
   </w:num>
   <w:num w:numId="39" w16cid:durableId="798885554">
-    <w:abstractNumId w:val="89"/>
+    <w:abstractNumId w:val="90"/>
   </w:num>
   <w:num w:numId="40" w16cid:durableId="1610315013">
-    <w:abstractNumId w:val="76"/>
+    <w:abstractNumId w:val="77"/>
   </w:num>
   <w:num w:numId="41" w16cid:durableId="213975163">
     <w:abstractNumId w:val="4"/>
   </w:num>
   <w:num w:numId="42" w16cid:durableId="511454106">
-    <w:abstractNumId w:val="72"/>
+    <w:abstractNumId w:val="73"/>
   </w:num>
   <w:num w:numId="43" w16cid:durableId="1721711403">
     <w:abstractNumId w:val="21"/>
   </w:num>
   <w:num w:numId="44" w16cid:durableId="652369700">
-    <w:abstractNumId w:val="80"/>
+    <w:abstractNumId w:val="81"/>
   </w:num>
   <w:num w:numId="45" w16cid:durableId="227304564">
-    <w:abstractNumId w:val="65"/>
+    <w:abstractNumId w:val="66"/>
   </w:num>
   <w:num w:numId="46" w16cid:durableId="1561091169">
     <w:abstractNumId w:val="31"/>
   </w:num>
   <w:num w:numId="47" w16cid:durableId="734011883">
-    <w:abstractNumId w:val="77"/>
+    <w:abstractNumId w:val="78"/>
   </w:num>
   <w:num w:numId="48" w16cid:durableId="2125267477">
-    <w:abstractNumId w:val="69"/>
+    <w:abstractNumId w:val="70"/>
   </w:num>
   <w:num w:numId="49" w16cid:durableId="1612585929">
-    <w:abstractNumId w:val="68"/>
+    <w:abstractNumId w:val="69"/>
   </w:num>
   <w:num w:numId="50" w16cid:durableId="1628664370">
     <w:abstractNumId w:val="3"/>
@@ -13519,16 +14225,16 @@
     <w:abstractNumId w:val="23"/>
   </w:num>
   <w:num w:numId="52" w16cid:durableId="754671244">
-    <w:abstractNumId w:val="55"/>
+    <w:abstractNumId w:val="56"/>
   </w:num>
   <w:num w:numId="53" w16cid:durableId="1740665818">
-    <w:abstractNumId w:val="85"/>
+    <w:abstractNumId w:val="86"/>
   </w:num>
   <w:num w:numId="54" w16cid:durableId="452988921">
-    <w:abstractNumId w:val="86"/>
+    <w:abstractNumId w:val="87"/>
   </w:num>
   <w:num w:numId="55" w16cid:durableId="207304158">
-    <w:abstractNumId w:val="67"/>
+    <w:abstractNumId w:val="68"/>
   </w:num>
   <w:num w:numId="56" w16cid:durableId="2016880598">
     <w:abstractNumId w:val="19"/>
@@ -13537,19 +14243,19 @@
     <w:abstractNumId w:val="1"/>
   </w:num>
   <w:num w:numId="58" w16cid:durableId="1794397765">
-    <w:abstractNumId w:val="49"/>
+    <w:abstractNumId w:val="50"/>
   </w:num>
   <w:num w:numId="59" w16cid:durableId="1690447450">
-    <w:abstractNumId w:val="47"/>
+    <w:abstractNumId w:val="48"/>
   </w:num>
   <w:num w:numId="60" w16cid:durableId="2130009061">
-    <w:abstractNumId w:val="70"/>
+    <w:abstractNumId w:val="71"/>
   </w:num>
   <w:num w:numId="61" w16cid:durableId="1293515410">
     <w:abstractNumId w:val="2"/>
   </w:num>
   <w:num w:numId="62" w16cid:durableId="650257227">
-    <w:abstractNumId w:val="44"/>
+    <w:abstractNumId w:val="45"/>
   </w:num>
   <w:num w:numId="63" w16cid:durableId="571551157">
     <w:abstractNumId w:val="24"/>
@@ -13582,7 +14288,7 @@
     <w:abstractNumId w:val="39"/>
   </w:num>
   <w:num w:numId="73" w16cid:durableId="368451605">
-    <w:abstractNumId w:val="58"/>
+    <w:abstractNumId w:val="59"/>
   </w:num>
   <w:num w:numId="74" w16cid:durableId="65686607">
     <w:abstractNumId w:val="6"/>
@@ -13591,16 +14297,16 @@
     <w:abstractNumId w:val="42"/>
   </w:num>
   <w:num w:numId="76" w16cid:durableId="539049649">
-    <w:abstractNumId w:val="87"/>
+    <w:abstractNumId w:val="88"/>
   </w:num>
   <w:num w:numId="77" w16cid:durableId="1288513951">
-    <w:abstractNumId w:val="61"/>
+    <w:abstractNumId w:val="62"/>
   </w:num>
   <w:num w:numId="78" w16cid:durableId="1532762005">
-    <w:abstractNumId w:val="51"/>
+    <w:abstractNumId w:val="52"/>
   </w:num>
   <w:num w:numId="79" w16cid:durableId="1374647797">
-    <w:abstractNumId w:val="74"/>
+    <w:abstractNumId w:val="75"/>
   </w:num>
   <w:num w:numId="80" w16cid:durableId="1210456390">
     <w:abstractNumId w:val="8"/>
@@ -13609,34 +14315,37 @@
     <w:abstractNumId w:val="35"/>
   </w:num>
   <w:num w:numId="82" w16cid:durableId="500893856">
-    <w:abstractNumId w:val="78"/>
+    <w:abstractNumId w:val="79"/>
   </w:num>
   <w:num w:numId="83" w16cid:durableId="1950622049">
-    <w:abstractNumId w:val="56"/>
+    <w:abstractNumId w:val="57"/>
   </w:num>
   <w:num w:numId="84" w16cid:durableId="2060282905">
     <w:abstractNumId w:val="0"/>
   </w:num>
   <w:num w:numId="85" w16cid:durableId="490635123">
-    <w:abstractNumId w:val="52"/>
+    <w:abstractNumId w:val="53"/>
   </w:num>
   <w:num w:numId="86" w16cid:durableId="2038313657">
     <w:abstractNumId w:val="20"/>
   </w:num>
   <w:num w:numId="87" w16cid:durableId="1744451624">
-    <w:abstractNumId w:val="46"/>
+    <w:abstractNumId w:val="47"/>
   </w:num>
   <w:num w:numId="88" w16cid:durableId="2105687898">
-    <w:abstractNumId w:val="71"/>
+    <w:abstractNumId w:val="72"/>
   </w:num>
   <w:num w:numId="89" w16cid:durableId="363360886">
     <w:abstractNumId w:val="22"/>
   </w:num>
   <w:num w:numId="90" w16cid:durableId="974530531">
-    <w:abstractNumId w:val="62"/>
+    <w:abstractNumId w:val="63"/>
   </w:num>
   <w:num w:numId="91" w16cid:durableId="780148532">
-    <w:abstractNumId w:val="84"/>
+    <w:abstractNumId w:val="85"/>
+  </w:num>
+  <w:num w:numId="92" w16cid:durableId="304706915">
+    <w:abstractNumId w:val="44"/>
   </w:num>
   <w:numIdMacAtCleanup w:val="84"/>
 </w:numbering>

</xml_diff>

<commit_message>
Beacon mode changes. #29
</commit_message>
<xml_diff>
--- a/RadioFox.docx
+++ b/RadioFox.docx
@@ -61,13 +61,37 @@
       </w:r>
       <w:proofErr w:type="gramEnd"/>
       <w:r>
-        <w:t xml:space="preserve"> as fox hunting or sometimes as bunny hunting. It is played by hiding a transmitter that transmits periodically and then silent until it is time to transmit again. This cycle repeats. Teams use radio receivers with directional antennas to find the transmitter.</w:t>
-      </w:r>
-      <w:r>
-        <w:t xml:space="preserve"> The technique is called triangulation. The first team to find the transmitter wins.</w:t>
-      </w:r>
-      <w:r>
-        <w:t xml:space="preserve"> Sometimes the transmitter is moved periodically to make the game more challenging, </w:t>
+        <w:t xml:space="preserve"> as fox hunting or sometimes as bunny hunting. It </w:t>
+      </w:r>
+      <w:proofErr w:type="gramStart"/>
+      <w:r>
+        <w:t>is played</w:t>
+      </w:r>
+      <w:proofErr w:type="gramEnd"/>
+      <w:r>
+        <w:t xml:space="preserve"> by hiding a transmitter that transmits periodically and then silent until it is time to transmit again. This cycle repeats. Teams use radio receivers with directional antennas to find the transmitter.</w:t>
+      </w:r>
+      <w:r>
+        <w:t xml:space="preserve"> The technique </w:t>
+      </w:r>
+      <w:proofErr w:type="gramStart"/>
+      <w:r>
+        <w:t>is called</w:t>
+      </w:r>
+      <w:proofErr w:type="gramEnd"/>
+      <w:r>
+        <w:t xml:space="preserve"> triangulation. The first team to find the transmitter wins.</w:t>
+      </w:r>
+      <w:r>
+        <w:t xml:space="preserve"> Sometimes the transmitter </w:t>
+      </w:r>
+      <w:proofErr w:type="gramStart"/>
+      <w:r>
+        <w:t>is moved</w:t>
+      </w:r>
+      <w:proofErr w:type="gramEnd"/>
+      <w:r>
+        <w:t xml:space="preserve"> periodically to make the game more challenging, </w:t>
       </w:r>
       <w:r>
         <w:t xml:space="preserve">this is </w:t>
@@ -78,8 +102,13 @@
     </w:p>
     <w:p/>
     <w:p>
-      <w:r>
-        <w:t xml:space="preserve">Many of these radios are homemade using handheld radios and timers. This device is a single PCB (printed circuit board) using an esp32 (Arduino) </w:t>
+      <w:proofErr w:type="gramStart"/>
+      <w:r>
+        <w:t>Many</w:t>
+      </w:r>
+      <w:proofErr w:type="gramEnd"/>
+      <w:r>
+        <w:t xml:space="preserve"> of these radios are homemade using handheld radios and timers. This device is a single PCB (printed circuit board) using an esp32 (Arduino) </w:t>
       </w:r>
       <w:r>
         <w:t xml:space="preserve">computer with a display. There are two 18650 batteries with charging </w:t>
@@ -90,7 +119,15 @@
       </w:r>
       <w:proofErr w:type="gramEnd"/>
       <w:r>
-        <w:t xml:space="preserve"> and an SA818 shortwave transceiver module on the PCB. A rotary push button dial is used to set the various parameters for the fox</w:t>
+        <w:t xml:space="preserve"> and an SA818 shortwave transceiver module on the PCB. A rotary push button dial </w:t>
+      </w:r>
+      <w:proofErr w:type="gramStart"/>
+      <w:r>
+        <w:t>is used</w:t>
+      </w:r>
+      <w:proofErr w:type="gramEnd"/>
+      <w:r>
+        <w:t xml:space="preserve"> to set the various parameters for the fox</w:t>
       </w:r>
       <w:r>
         <w:t>. These parameters include transmit time, pause time, frequency settings</w:t>
@@ -111,7 +148,23 @@
         <w:t xml:space="preserve">company </w:t>
       </w:r>
       <w:r>
-        <w:t>manufactures several types of Fox radios. I had never heard of them until I had this project working, so I can’t claim to be inspired by any of their designs.</w:t>
+        <w:t xml:space="preserve">manufactures </w:t>
+      </w:r>
+      <w:proofErr w:type="gramStart"/>
+      <w:r>
+        <w:t>several</w:t>
+      </w:r>
+      <w:proofErr w:type="gramEnd"/>
+      <w:r>
+        <w:t xml:space="preserve"> types of Fox radios. I had never heard of them until I had this project working, so I </w:t>
+      </w:r>
+      <w:proofErr w:type="gramStart"/>
+      <w:r>
+        <w:t>can’t</w:t>
+      </w:r>
+      <w:proofErr w:type="gramEnd"/>
+      <w:r>
+        <w:t xml:space="preserve"> claim to be inspired by any of their designs.</w:t>
       </w:r>
       <w:r>
         <w:t xml:space="preserve"> </w:t>
@@ -157,7 +210,15 @@
         <w:t>system that would be easy to adapt to this project.</w:t>
       </w:r>
       <w:r>
-        <w:t xml:space="preserve"> It also featured code to handle a </w:t>
+        <w:t xml:space="preserve"> It also featured code to </w:t>
+      </w:r>
+      <w:proofErr w:type="gramStart"/>
+      <w:r>
+        <w:t>handle</w:t>
+      </w:r>
+      <w:proofErr w:type="gramEnd"/>
+      <w:r>
+        <w:t xml:space="preserve"> a </w:t>
       </w:r>
       <w:r>
         <w:t>micro-SD</w:t>
@@ -174,27 +235,78 @@
         <w:pStyle w:val="Heading2"/>
       </w:pPr>
       <w:r>
+        <w:t>Beacon</w:t>
+      </w:r>
+    </w:p>
+    <w:p>
+      <w:r>
+        <w:t>Version 1.0</w:t>
+      </w:r>
+      <w:r>
+        <w:t>6 adds a beacon mode that limits the allowe</w:t>
+      </w:r>
+      <w:r>
+        <w:t>d frequencies.</w:t>
+      </w:r>
+      <w:r>
+        <w:t xml:space="preserve"> The system must </w:t>
+      </w:r>
+      <w:proofErr w:type="gramStart"/>
+      <w:r>
+        <w:t>be powered</w:t>
+      </w:r>
+      <w:proofErr w:type="gramEnd"/>
+      <w:r>
+        <w:t xml:space="preserve"> by an external power supply connected to the USB C charging port.</w:t>
+      </w:r>
+    </w:p>
+    <w:p>
+      <w:pPr>
+        <w:pStyle w:val="Heading2"/>
+        <w:numPr>
+          <w:ilvl w:val="0"/>
+          <w:numId w:val="0"/>
+        </w:numPr>
+      </w:pPr>
+      <w:r>
         <w:t>Source Code</w:t>
       </w:r>
     </w:p>
     <w:p>
       <w:r>
-        <w:t xml:space="preserve">The firmware is written </w:t>
-      </w:r>
-      <w:r>
-        <w:t>entirely</w:t>
-      </w:r>
-      <w:r>
-        <w:t xml:space="preserve"> in C/C++. </w:t>
-      </w:r>
-      <w:r>
-        <w:t xml:space="preserve">The source code will likely be released, but that has not been totally </w:t>
-      </w:r>
-      <w:r>
-        <w:t>decided</w:t>
-      </w:r>
-      <w:r>
-        <w:t xml:space="preserve"> at this time.</w:t>
+        <w:t>The firmware</w:t>
+      </w:r>
+      <w:r>
+        <w:t xml:space="preserve"> source</w:t>
+      </w:r>
+      <w:r>
+        <w:t xml:space="preserve"> code consists of</w:t>
+      </w:r>
+      <w:r>
+        <w:t xml:space="preserve"> C</w:t>
+      </w:r>
+      <w:r>
+        <w:t xml:space="preserve"> and </w:t>
+      </w:r>
+      <w:r>
+        <w:t xml:space="preserve">C++. </w:t>
+      </w:r>
+      <w:r>
+        <w:t xml:space="preserve">The source code will </w:t>
+      </w:r>
+      <w:proofErr w:type="gramStart"/>
+      <w:r>
+        <w:t>be</w:t>
+      </w:r>
+      <w:r>
+        <w:t xml:space="preserve"> released</w:t>
+      </w:r>
+      <w:proofErr w:type="gramEnd"/>
+      <w:r>
+        <w:t xml:space="preserve"> at a future date</w:t>
+      </w:r>
+      <w:r>
+        <w:t>, it is still being changed frequently.</w:t>
       </w:r>
     </w:p>
     <w:p>
@@ -202,6 +314,7 @@
         <w:pStyle w:val="Heading3"/>
       </w:pPr>
       <w:r>
+        <w:lastRenderedPageBreak/>
         <w:t xml:space="preserve">Arduino </w:t>
       </w:r>
       <w:r>
@@ -210,55 +323,94 @@
     </w:p>
     <w:p>
       <w:r>
-        <w:t>Typically, the latest version of libraries is used</w:t>
-      </w:r>
+        <w:t xml:space="preserve">Typically, the latest version of libraries </w:t>
+      </w:r>
+      <w:proofErr w:type="gramStart"/>
+      <w:r>
+        <w:t>is used</w:t>
+      </w:r>
+      <w:proofErr w:type="gramEnd"/>
       <w:r>
         <w:t>. The</w:t>
       </w:r>
       <w:r>
-        <w:t xml:space="preserve"> actual versions will be listed here</w:t>
+        <w:t xml:space="preserve"> actual versions will </w:t>
+      </w:r>
+      <w:proofErr w:type="gramStart"/>
+      <w:r>
+        <w:t>be listed</w:t>
+      </w:r>
+      <w:proofErr w:type="gramEnd"/>
+      <w:r>
+        <w:t xml:space="preserve"> here</w:t>
+      </w:r>
+      <w:r>
+        <w:t xml:space="preserve"> when the source code is released.</w:t>
+      </w:r>
+    </w:p>
+    <w:p>
+      <w:r>
+        <w:t xml:space="preserve">This is the software version </w:t>
+      </w:r>
+      <w:r>
+        <w:t xml:space="preserve">of the </w:t>
+      </w:r>
+      <w:r>
+        <w:t xml:space="preserve">custom </w:t>
+      </w:r>
+      <w:r>
+        <w:t>code</w:t>
+      </w:r>
+      <w:r>
+        <w:t>.</w:t>
       </w:r>
       <w:r>
         <w:t xml:space="preserve"> </w:t>
       </w:r>
+      <w:r>
+        <w:t>The changes</w:t>
+      </w:r>
+      <w:r>
+        <w:t xml:space="preserve"> </w:t>
+      </w:r>
       <w:proofErr w:type="gramStart"/>
       <w:r>
-        <w:t>if and when</w:t>
+        <w:t>are described</w:t>
       </w:r>
       <w:proofErr w:type="gramEnd"/>
       <w:r>
-        <w:t xml:space="preserve"> the source code is released.</w:t>
-      </w:r>
-    </w:p>
-    <w:p>
-      <w:r>
-        <w:t xml:space="preserve">This is the software version </w:t>
-      </w:r>
-      <w:r>
-        <w:t xml:space="preserve">of the </w:t>
-      </w:r>
-      <w:r>
-        <w:t xml:space="preserve">custom </w:t>
-      </w:r>
-      <w:r>
-        <w:t>code</w:t>
-      </w:r>
-      <w:r>
-        <w:t>.</w:t>
-      </w:r>
-      <w:r>
-        <w:t xml:space="preserve"> </w:t>
+        <w:t xml:space="preserve"> below.</w:t>
+      </w:r>
+    </w:p>
+    <w:p>
+      <w:r>
+        <w:t>Version 1.06</w:t>
+      </w:r>
+    </w:p>
+    <w:p>
+      <w:pPr>
+        <w:pStyle w:val="ListParagraph"/>
+        <w:numPr>
+          <w:ilvl w:val="0"/>
+          <w:numId w:val="93"/>
+        </w:numPr>
+      </w:pPr>
+      <w:r>
+        <w:t>Added a switch to limit the frequency range to that allowed for</w:t>
+      </w:r>
+      <w:r>
+        <w:t xml:space="preserve"> beacon use in ITU region </w:t>
       </w:r>
       <w:proofErr w:type="gramStart"/>
       <w:r>
-        <w:t>C</w:t>
-      </w:r>
-      <w:r>
-        <w:t>hanges</w:t>
+        <w:t>2</w:t>
       </w:r>
       <w:proofErr w:type="gramEnd"/>
       <w:r>
-        <w:t xml:space="preserve"> are described below.</w:t>
+        <w:t>. The range is 144.276-</w:t>
+      </w:r>
+      <w:r>
+        <w:t>144.300 MHz.</w:t>
       </w:r>
     </w:p>
     <w:p>
@@ -295,7 +447,6 @@
         </w:numPr>
       </w:pPr>
       <w:r>
-        <w:lastRenderedPageBreak/>
         <w:t>Fixed crash when no SD card found.</w:t>
       </w:r>
     </w:p>
@@ -318,16 +469,20 @@
       <w:r>
         <w:t xml:space="preserve">. Short </w:t>
       </w:r>
-      <w:proofErr w:type="spellStart"/>
-      <w:r>
-        <w:t>tx</w:t>
-      </w:r>
-      <w:proofErr w:type="spellEnd"/>
+      <w:r>
+        <w:t>TX</w:t>
+      </w:r>
       <w:r>
         <w:t xml:space="preserve"> time and B0 pressed</w:t>
       </w:r>
       <w:r>
-        <w:t xml:space="preserve"> caused display to stop updating.</w:t>
+        <w:t xml:space="preserve"> caused </w:t>
+      </w:r>
+      <w:r>
+        <w:t>the display</w:t>
+      </w:r>
+      <w:r>
+        <w:t xml:space="preserve"> to stop updating.</w:t>
       </w:r>
     </w:p>
     <w:p>
@@ -361,7 +516,15 @@
         </w:numPr>
       </w:pPr>
       <w:r>
-        <w:t>Made TX red dot larger. Show DTMF characters in green on the bottom. (not tested yet).</w:t>
+        <w:t xml:space="preserve">Made TX red dot larger. Show DTMF characters in green on the bottom. (not </w:t>
+      </w:r>
+      <w:proofErr w:type="gramStart"/>
+      <w:r>
+        <w:t>tested</w:t>
+      </w:r>
+      <w:proofErr w:type="gramEnd"/>
+      <w:r>
+        <w:t xml:space="preserve"> yet).</w:t>
       </w:r>
     </w:p>
     <w:p>
@@ -389,7 +552,23 @@
       </w:r>
       <w:proofErr w:type="gramEnd"/>
       <w:r>
-        <w:t xml:space="preserve"> version when this document was first created. The software is considered mostly complete.</w:t>
+        <w:t xml:space="preserve"> version when this document </w:t>
+      </w:r>
+      <w:proofErr w:type="gramStart"/>
+      <w:r>
+        <w:t>was first created</w:t>
+      </w:r>
+      <w:proofErr w:type="gramEnd"/>
+      <w:r>
+        <w:t xml:space="preserve">. The software </w:t>
+      </w:r>
+      <w:proofErr w:type="gramStart"/>
+      <w:r>
+        <w:t>is considered</w:t>
+      </w:r>
+      <w:proofErr w:type="gramEnd"/>
+      <w:r>
+        <w:t xml:space="preserve"> mostly complete.</w:t>
       </w:r>
     </w:p>
     <w:p>
@@ -425,161 +604,290 @@
       </w:r>
       <w:proofErr w:type="gramStart"/>
       <w:r>
-        <w:t>18650 battery</w:t>
+        <w:t>18650</w:t>
+      </w:r>
+      <w:r>
+        <w:t xml:space="preserve"> </w:t>
+      </w:r>
+      <w:r>
+        <w:t>battery</w:t>
       </w:r>
       <w:proofErr w:type="gramEnd"/>
       <w:r>
         <w:t xml:space="preserve"> holder that can have </w:t>
       </w:r>
       <w:r>
-        <w:t>1 or 2 batteries. There is a USB C connector on the left edge that is used for charging the batteries.</w:t>
-      </w:r>
-      <w:r>
-        <w:t xml:space="preserve"> Above that is a micro-SD slot. The SD card holds tone files</w:t>
-      </w:r>
-      <w:r>
-        <w:t>, and saved settings files. It can also be used to load new firmware onto the TTGO chip.</w:t>
-      </w:r>
-      <w:r>
-        <w:t xml:space="preserve"> There is also a USB C connector on the TTGO. It can be used for downloading</w:t>
-      </w:r>
-      <w:r>
-        <w:t xml:space="preserve"> firmware or debugging operations. It may also be used for serial communications in a future firmware release.</w:t>
-      </w:r>
-      <w:r>
-        <w:t xml:space="preserve"> It is not used for charging the batteries.</w:t>
+        <w:t>1 or 2 batteries. There is a USB C connector on the left edge used for charging the batteries.</w:t>
+      </w:r>
+      <w:r>
+        <w:t xml:space="preserve"> Above that is a micro-SD slot. The SD card holds tone </w:t>
+      </w:r>
+      <w:r>
+        <w:t>files and</w:t>
+      </w:r>
+      <w:r>
+        <w:t xml:space="preserve"> saved settings files. It can also </w:t>
+      </w:r>
+      <w:proofErr w:type="gramStart"/>
+      <w:r>
+        <w:t>be used</w:t>
+      </w:r>
+      <w:proofErr w:type="gramEnd"/>
+      <w:r>
+        <w:t xml:space="preserve"> to load new firmware onto the TTGO chip.</w:t>
+      </w:r>
+      <w:r>
+        <w:t xml:space="preserve"> There is also a USB C connector on the TTGO. It </w:t>
+      </w:r>
+      <w:proofErr w:type="gramStart"/>
+      <w:r>
+        <w:t>is</w:t>
+      </w:r>
+      <w:r>
+        <w:t xml:space="preserve"> used</w:t>
+      </w:r>
+      <w:proofErr w:type="gramEnd"/>
+      <w:r>
+        <w:t xml:space="preserve"> for downloading</w:t>
+      </w:r>
+      <w:r>
+        <w:t xml:space="preserve"> firmware or debugging operations. It </w:t>
+      </w:r>
+      <w:r>
+        <w:t>might</w:t>
+      </w:r>
+      <w:r>
+        <w:t xml:space="preserve"> also </w:t>
+      </w:r>
+      <w:proofErr w:type="gramStart"/>
+      <w:r>
+        <w:t>be used</w:t>
+      </w:r>
+      <w:proofErr w:type="gramEnd"/>
+      <w:r>
+        <w:t xml:space="preserve"> for serial communications in a future firmware release.</w:t>
+      </w:r>
+      <w:r>
+        <w:t xml:space="preserve"> It </w:t>
+      </w:r>
+      <w:proofErr w:type="gramStart"/>
+      <w:r>
+        <w:t>is not used</w:t>
+      </w:r>
+      <w:proofErr w:type="gramEnd"/>
+      <w:r>
+        <w:t xml:space="preserve"> for charging the batteries.</w:t>
+      </w:r>
+    </w:p>
+    <w:p>
+      <w:pPr>
+        <w:pStyle w:val="Heading2"/>
+      </w:pPr>
+      <w:r>
+        <w:t>Radio</w:t>
+      </w:r>
+    </w:p>
+    <w:p>
+      <w:r>
+        <w:t xml:space="preserve">The radio functions are </w:t>
+      </w:r>
+      <w:proofErr w:type="gramStart"/>
+      <w:r>
+        <w:t>handled</w:t>
+      </w:r>
+      <w:proofErr w:type="gramEnd"/>
+      <w:r>
+        <w:t xml:space="preserve"> by the SA818-</w:t>
+      </w:r>
+      <w:r>
+        <w:t xml:space="preserve">V on the top right. There are vents in the case to allow cooling as this module can become quite hot when transmitting at high power for longer timer intervals. Transmitting longer than one minute </w:t>
+      </w:r>
+      <w:proofErr w:type="gramStart"/>
+      <w:r>
+        <w:t>is not recommended</w:t>
+      </w:r>
+      <w:proofErr w:type="gramEnd"/>
+      <w:r>
+        <w:t>.</w:t>
+      </w:r>
+      <w:r>
+        <w:t xml:space="preserve"> High power is about </w:t>
+      </w:r>
+      <w:proofErr w:type="gramStart"/>
+      <w:r>
+        <w:t>5W</w:t>
+      </w:r>
+      <w:proofErr w:type="gramEnd"/>
+      <w:r>
+        <w:t xml:space="preserve"> and low power</w:t>
+      </w:r>
+      <w:r>
+        <w:t xml:space="preserve"> is about 3W. Make sure a suitable antenna is connected to avoid damage to the radio circuit.</w:t>
+      </w:r>
+    </w:p>
+    <w:p>
+      <w:pPr>
+        <w:pStyle w:val="Heading2"/>
+      </w:pPr>
+      <w:r>
+        <w:lastRenderedPageBreak/>
+        <w:t>Batteries</w:t>
+      </w:r>
+    </w:p>
+    <w:p>
+      <w:r>
+        <w:t xml:space="preserve">The 18650 </w:t>
+      </w:r>
+      <w:r>
+        <w:t xml:space="preserve">batteries must button top style and protection </w:t>
+      </w:r>
+      <w:proofErr w:type="gramStart"/>
+      <w:r>
+        <w:t>is recommended</w:t>
+      </w:r>
+      <w:proofErr w:type="gramEnd"/>
+      <w:r>
+        <w:t xml:space="preserve">. The </w:t>
+      </w:r>
+      <w:proofErr w:type="gramStart"/>
+      <w:r>
+        <w:t>18650</w:t>
+      </w:r>
+      <w:r>
+        <w:t xml:space="preserve"> </w:t>
+      </w:r>
+      <w:r>
+        <w:t>battery</w:t>
+      </w:r>
+      <w:proofErr w:type="gramEnd"/>
+      <w:r>
+        <w:t xml:space="preserve"> length is a very loose standard and some batteries may not fit. Too long and they </w:t>
+      </w:r>
+      <w:r>
+        <w:t>cannot</w:t>
+      </w:r>
+      <w:r>
+        <w:t xml:space="preserve"> </w:t>
+      </w:r>
+      <w:proofErr w:type="gramStart"/>
+      <w:r>
+        <w:t>be used</w:t>
+      </w:r>
+      <w:proofErr w:type="gramEnd"/>
+      <w:r>
+        <w:t xml:space="preserve">. Too short, it might be possible to bend the </w:t>
+      </w:r>
+      <w:r>
+        <w:t xml:space="preserve">contacts on the battery holder negative side. The battery holder </w:t>
+      </w:r>
+      <w:proofErr w:type="gramStart"/>
+      <w:r>
+        <w:t>is polarized</w:t>
+      </w:r>
+      <w:proofErr w:type="gramEnd"/>
+      <w:r>
+        <w:t xml:space="preserve"> to prevent insertion in the wrong direction.</w:t>
+      </w:r>
+      <w:r>
+        <w:t xml:space="preserve"> Do not defeat the feature or magic blue smoke may appear from the PCB!</w:t>
+      </w:r>
+    </w:p>
+    <w:p>
+      <w:pPr>
+        <w:pStyle w:val="Heading1"/>
+      </w:pPr>
+      <w:r>
+        <w:t>Run Time</w:t>
+      </w:r>
+    </w:p>
+    <w:p>
+      <w:r>
+        <w:t xml:space="preserve">The actual runtime depends on the transmitting time and </w:t>
+      </w:r>
+      <w:r>
+        <w:t xml:space="preserve">quality of the batteries. There are </w:t>
+      </w:r>
+      <w:proofErr w:type="gramStart"/>
+      <w:r>
+        <w:t>many</w:t>
+      </w:r>
+      <w:proofErr w:type="gramEnd"/>
+      <w:r>
+        <w:t xml:space="preserve"> deceptively labelled 18650 batteries available. The best </w:t>
+      </w:r>
+      <w:proofErr w:type="gramStart"/>
+      <w:r>
+        <w:t>one</w:t>
+      </w:r>
+      <w:proofErr w:type="gramEnd"/>
+      <w:r>
+        <w:t xml:space="preserve"> </w:t>
+      </w:r>
+      <w:proofErr w:type="gramStart"/>
+      <w:r>
+        <w:t>are</w:t>
+      </w:r>
+      <w:proofErr w:type="gramEnd"/>
+      <w:r>
+        <w:t xml:space="preserve"> made by Panasonic and Sanyo</w:t>
+      </w:r>
+      <w:r>
+        <w:t>. Using 1 minute transmit, 4 minutes pause, low power setting</w:t>
+      </w:r>
+      <w:r>
+        <w:t xml:space="preserve">, and display dimming the </w:t>
+      </w:r>
+      <w:r>
+        <w:t xml:space="preserve">Fox Radio </w:t>
+      </w:r>
+      <w:r>
+        <w:t>ran for 12 hours using Panasonic batteries.</w:t>
+      </w:r>
+    </w:p>
+    <w:p>
+      <w:pPr>
+        <w:pStyle w:val="Heading1"/>
+      </w:pPr>
+      <w:r>
+        <w:t>Tone Files</w:t>
+      </w:r>
+    </w:p>
+    <w:p>
+      <w:r>
+        <w:t xml:space="preserve">The </w:t>
+      </w:r>
+      <w:r>
+        <w:t xml:space="preserve">tone files </w:t>
+      </w:r>
+      <w:proofErr w:type="gramStart"/>
+      <w:r>
+        <w:t>are used</w:t>
+      </w:r>
+      <w:proofErr w:type="gramEnd"/>
+      <w:r>
+        <w:t xml:space="preserve"> to play “music” during transmissions. This can </w:t>
+      </w:r>
+      <w:proofErr w:type="gramStart"/>
+      <w:r>
+        <w:t>be used</w:t>
+      </w:r>
+      <w:proofErr w:type="gramEnd"/>
+      <w:r>
+        <w:t xml:space="preserve"> to identify the Fox, or just to annoy people!</w:t>
       </w:r>
     </w:p>
     <w:p/>
     <w:p>
-      <w:pPr>
-        <w:pStyle w:val="Heading2"/>
-      </w:pPr>
-      <w:r>
-        <w:t>Radio</w:t>
-      </w:r>
-    </w:p>
-    <w:p>
-      <w:r>
-        <w:t>The radio functions are handled by the SA818-</w:t>
-      </w:r>
-      <w:r>
-        <w:t>V on the top right. There are vents in the case to allow cooling as this module can become quite hot when transmitting at high power for longer timer intervals. Transmitting longer than one minute is not recommended.</w:t>
-      </w:r>
-      <w:r>
-        <w:t xml:space="preserve"> High power is about </w:t>
+      <w:r>
+        <w:t xml:space="preserve">The files </w:t>
       </w:r>
       <w:proofErr w:type="gramStart"/>
       <w:r>
-        <w:t>5W</w:t>
+        <w:t>are saved</w:t>
       </w:r>
       <w:proofErr w:type="gramEnd"/>
       <w:r>
-        <w:t xml:space="preserve"> and low power</w:t>
-      </w:r>
-      <w:r>
-        <w:t xml:space="preserve"> is about 3W. Make sure a suitable antenna is connected to avoid damage to the radio circuit.</w:t>
-      </w:r>
-    </w:p>
-    <w:p/>
-    <w:p>
-      <w:pPr>
-        <w:pStyle w:val="Heading2"/>
-      </w:pPr>
-      <w:r>
-        <w:t>Batteries</w:t>
-      </w:r>
-    </w:p>
-    <w:p>
-      <w:r>
-        <w:t xml:space="preserve">The 18650 </w:t>
-      </w:r>
-      <w:r>
-        <w:t>batteries must button top style and protection is recommended</w:t>
-      </w:r>
-      <w:r>
-        <w:t xml:space="preserve">. The </w:t>
-      </w:r>
-      <w:proofErr w:type="gramStart"/>
-      <w:r>
-        <w:t>18650 battery</w:t>
-      </w:r>
-      <w:proofErr w:type="gramEnd"/>
-      <w:r>
-        <w:t xml:space="preserve"> length is a very loose standard and some batteries may not fit. Too long and they can’t be used. Too short, it might be possible to bend the </w:t>
-      </w:r>
-      <w:r>
-        <w:t>contacts on the battery holder negative side. The battery holder is polarized to prevent insertion in the wrong direction.</w:t>
-      </w:r>
-      <w:r>
-        <w:t xml:space="preserve"> Do not defeat the feature or magic blue smoke may appear from the PCB!</w:t>
-      </w:r>
-    </w:p>
-    <w:p>
-      <w:pPr>
-        <w:pStyle w:val="Heading1"/>
-      </w:pPr>
-      <w:r>
-        <w:lastRenderedPageBreak/>
-        <w:t>Run Time</w:t>
-      </w:r>
-    </w:p>
-    <w:p>
-      <w:r>
-        <w:t xml:space="preserve">The actual runtime depends on the transmitting time and </w:t>
-      </w:r>
-      <w:r>
-        <w:t xml:space="preserve">quality of the batteries. There are many deceptively labelled 18650 batteries available. The best </w:t>
-      </w:r>
-      <w:proofErr w:type="gramStart"/>
-      <w:r>
-        <w:t>one</w:t>
-      </w:r>
-      <w:proofErr w:type="gramEnd"/>
-      <w:r>
-        <w:t xml:space="preserve"> </w:t>
-      </w:r>
-      <w:proofErr w:type="gramStart"/>
-      <w:r>
-        <w:t>are</w:t>
-      </w:r>
-      <w:proofErr w:type="gramEnd"/>
-      <w:r>
-        <w:t xml:space="preserve"> made by Panasonic and Sanyo</w:t>
-      </w:r>
-      <w:r>
-        <w:t>. Using 1 minute transmit, 4 minutes pause, low power setting</w:t>
-      </w:r>
-      <w:r>
-        <w:t xml:space="preserve">, and display dimming the </w:t>
-      </w:r>
-      <w:r>
-        <w:t xml:space="preserve">Fox Radio </w:t>
-      </w:r>
-      <w:r>
-        <w:t>ran for 12 hours using Panasonic batteries.</w:t>
-      </w:r>
-    </w:p>
-    <w:p>
-      <w:pPr>
-        <w:pStyle w:val="Heading1"/>
-      </w:pPr>
-      <w:r>
-        <w:t>Tone Files</w:t>
-      </w:r>
-    </w:p>
-    <w:p>
-      <w:r>
-        <w:t xml:space="preserve">The </w:t>
-      </w:r>
-      <w:r>
-        <w:t>tone files are used to play “music” during transmissions. This can be used to identify the Fox, or just to annoy people!</w:t>
-      </w:r>
-    </w:p>
-    <w:p/>
-    <w:p>
-      <w:r>
-        <w:t xml:space="preserve">The files are saved as .TXT and simply contain a list of tones to be played. The format </w:t>
+        <w:t xml:space="preserve"> as .TXT and simply contain a list of tones to be played. The format </w:t>
       </w:r>
       <w:r>
         <w:t xml:space="preserve">is similar the hard coded files from here: </w:t>
@@ -630,13 +938,29 @@
         <w:t xml:space="preserve"> GitHub</w:t>
       </w:r>
       <w:r>
-        <w:t xml:space="preserve"> site has many other example tone files</w:t>
+        <w:t xml:space="preserve"> site has </w:t>
+      </w:r>
+      <w:proofErr w:type="gramStart"/>
+      <w:r>
+        <w:t>many</w:t>
+      </w:r>
+      <w:proofErr w:type="gramEnd"/>
+      <w:r>
+        <w:t xml:space="preserve"> other example tone files</w:t>
       </w:r>
       <w:r>
         <w:t>. They are arrays in code but</w:t>
       </w:r>
       <w:r>
-        <w:t xml:space="preserve"> are easily converted to the required text format.</w:t>
+        <w:t xml:space="preserve"> </w:t>
+      </w:r>
+      <w:proofErr w:type="gramStart"/>
+      <w:r>
+        <w:t>are easily converted</w:t>
+      </w:r>
+      <w:proofErr w:type="gramEnd"/>
+      <w:r>
+        <w:t xml:space="preserve"> to the required text format.</w:t>
       </w:r>
       <w:r>
         <w:t xml:space="preserve"> Give the file a name and save it on the SD card.</w:t>
@@ -1010,6 +1334,7 @@
           <w:b/>
           <w:bCs/>
         </w:rPr>
+        <w:lastRenderedPageBreak/>
         <w:t xml:space="preserve">NOTE_E5, -4, NOTE_C5, </w:t>
       </w:r>
       <w:proofErr w:type="gramStart"/>
@@ -1096,13 +1421,20 @@
         <w:pStyle w:val="Heading1"/>
       </w:pPr>
       <w:r>
-        <w:lastRenderedPageBreak/>
         <w:t>Updating Firmware</w:t>
       </w:r>
     </w:p>
     <w:p>
       <w:r>
-        <w:t xml:space="preserve">The new file must be put on the SD card and named </w:t>
+        <w:t xml:space="preserve">The new file must </w:t>
+      </w:r>
+      <w:proofErr w:type="gramStart"/>
+      <w:r>
+        <w:t>be put</w:t>
+      </w:r>
+      <w:proofErr w:type="gramEnd"/>
+      <w:r>
+        <w:t xml:space="preserve"> on the SD card and named </w:t>
       </w:r>
       <w:proofErr w:type="spellStart"/>
       <w:r>
@@ -1144,7 +1476,15 @@
     </w:p>
     <w:p>
       <w:r>
-        <w:t xml:space="preserve">All operations can be controlled by the rotary push button on the </w:t>
+        <w:t xml:space="preserve">All operations can </w:t>
+      </w:r>
+      <w:proofErr w:type="gramStart"/>
+      <w:r>
+        <w:t>be controlled</w:t>
+      </w:r>
+      <w:proofErr w:type="gramEnd"/>
+      <w:r>
+        <w:t xml:space="preserve"> by the rotary push button on the </w:t>
       </w:r>
       <w:r>
         <w:t>box and the two extra buttons to the left labelled B0 and B1</w:t>
@@ -1153,16 +1493,40 @@
         <w:t>.</w:t>
       </w:r>
       <w:r>
-        <w:t xml:space="preserve"> A long press is used to access </w:t>
+        <w:t xml:space="preserve"> A long press </w:t>
+      </w:r>
+      <w:proofErr w:type="gramStart"/>
+      <w:r>
+        <w:t>is used</w:t>
+      </w:r>
+      <w:proofErr w:type="gramEnd"/>
+      <w:r>
+        <w:t xml:space="preserve"> to access </w:t>
       </w:r>
       <w:r>
         <w:t>the menu system</w:t>
       </w:r>
       <w:r>
-        <w:t xml:space="preserve"> and is done by holding the button down for about a ½ second or longer. This long press time is also adjustable if a longer or shorter time is preferred. The system has two modes of operation. After booting the display shows the </w:t>
-      </w:r>
-      <w:r>
-        <w:t xml:space="preserve">radio status and some important </w:t>
+        <w:t xml:space="preserve"> and is done by holding the button down for about a ½ second or longer. This long press time is also adjustable if a longer or shorter time </w:t>
+      </w:r>
+      <w:proofErr w:type="gramStart"/>
+      <w:r>
+        <w:t>is preferred</w:t>
+      </w:r>
+      <w:proofErr w:type="gramEnd"/>
+      <w:r>
+        <w:t xml:space="preserve">. The system has two modes of operation. After booting the display shows the </w:t>
+      </w:r>
+      <w:r>
+        <w:t xml:space="preserve">radio status and </w:t>
+      </w:r>
+      <w:proofErr w:type="gramStart"/>
+      <w:r>
+        <w:t>some</w:t>
+      </w:r>
+      <w:proofErr w:type="gramEnd"/>
+      <w:r>
+        <w:t xml:space="preserve"> important </w:t>
       </w:r>
       <w:r>
         <w:t xml:space="preserve">radio </w:t>
@@ -1198,8 +1562,13 @@
         <w:t xml:space="preserve">. </w:t>
       </w:r>
       <w:r>
-        <w:t>The system opens the last menu that was used</w:t>
-      </w:r>
+        <w:t xml:space="preserve">The system opens the last menu that </w:t>
+      </w:r>
+      <w:proofErr w:type="gramStart"/>
+      <w:r>
+        <w:t>was used</w:t>
+      </w:r>
+      <w:proofErr w:type="gramEnd"/>
       <w:r>
         <w:t>. A long press</w:t>
       </w:r>
@@ -1224,9 +1593,11 @@
     </w:p>
     <w:p/>
     <w:p>
+      <w:proofErr w:type="gramStart"/>
       <w:r>
         <w:t>Many</w:t>
       </w:r>
+      <w:proofErr w:type="gramEnd"/>
       <w:r>
         <w:t xml:space="preserve"> data entry screens will show help on the bottom few lines to explain </w:t>
       </w:r>
@@ -1386,21 +1757,7 @@
         <w:rPr>
           <w:lang w:val="da-DK"/>
         </w:rPr>
-        <w:t xml:space="preserve"> </w:t>
-      </w:r>
-      <w:proofErr w:type="spellStart"/>
-      <w:r>
-        <w:rPr>
-          <w:lang w:val="da-DK"/>
-        </w:rPr>
-        <w:t>During</w:t>
-      </w:r>
-      <w:proofErr w:type="spellEnd"/>
-      <w:r>
-        <w:rPr>
-          <w:lang w:val="da-DK"/>
-        </w:rPr>
-        <w:t xml:space="preserve"> Run Mode</w:t>
+        <w:t xml:space="preserve"> During Run Mode</w:t>
       </w:r>
     </w:p>
     <w:p>
@@ -1475,21 +1832,7 @@
         <w:rPr>
           <w:lang w:val="da-DK"/>
         </w:rPr>
-        <w:t xml:space="preserve">1 </w:t>
-      </w:r>
-      <w:proofErr w:type="spellStart"/>
-      <w:r>
-        <w:rPr>
-          <w:lang w:val="da-DK"/>
-        </w:rPr>
-        <w:t>During</w:t>
-      </w:r>
-      <w:proofErr w:type="spellEnd"/>
-      <w:r>
-        <w:rPr>
-          <w:lang w:val="da-DK"/>
-        </w:rPr>
-        <w:t xml:space="preserve"> Menu Mod</w:t>
+        <w:t>1 During Menu Mod</w:t>
       </w:r>
       <w:r>
         <w:rPr>
@@ -1556,7 +1899,21 @@
         <w:rPr>
           <w:lang w:val="en-US"/>
         </w:rPr>
-        <w:t>displays some help (if available) about the current menu item</w:t>
+        <w:t xml:space="preserve">displays </w:t>
+      </w:r>
+      <w:proofErr w:type="gramStart"/>
+      <w:r>
+        <w:rPr>
+          <w:lang w:val="en-US"/>
+        </w:rPr>
+        <w:t>some</w:t>
+      </w:r>
+      <w:proofErr w:type="gramEnd"/>
+      <w:r>
+        <w:rPr>
+          <w:lang w:val="en-US"/>
+        </w:rPr>
+        <w:t xml:space="preserve"> help (if available) about the current menu item</w:t>
       </w:r>
       <w:r>
         <w:rPr>
@@ -1568,7 +1925,35 @@
         <w:rPr>
           <w:lang w:val="en-US"/>
         </w:rPr>
-        <w:t xml:space="preserve"> Note that currently only a few menu items have help. More will be added in the future.</w:t>
+        <w:t xml:space="preserve"> Note that currently only </w:t>
+      </w:r>
+      <w:proofErr w:type="gramStart"/>
+      <w:r>
+        <w:rPr>
+          <w:lang w:val="en-US"/>
+        </w:rPr>
+        <w:t>a few</w:t>
+      </w:r>
+      <w:proofErr w:type="gramEnd"/>
+      <w:r>
+        <w:rPr>
+          <w:lang w:val="en-US"/>
+        </w:rPr>
+        <w:t xml:space="preserve"> menu items have help. More will </w:t>
+      </w:r>
+      <w:proofErr w:type="gramStart"/>
+      <w:r>
+        <w:rPr>
+          <w:lang w:val="en-US"/>
+        </w:rPr>
+        <w:t>be added</w:t>
+      </w:r>
+      <w:proofErr w:type="gramEnd"/>
+      <w:r>
+        <w:rPr>
+          <w:lang w:val="en-US"/>
+        </w:rPr>
+        <w:t xml:space="preserve"> in the future.</w:t>
       </w:r>
     </w:p>
     <w:p>
@@ -1632,7 +2017,6 @@
         <w:rPr>
           <w:lang w:val="en-US"/>
         </w:rPr>
-        <w:lastRenderedPageBreak/>
         <w:t>B</w:t>
       </w:r>
       <w:r>
@@ -1688,8 +2072,16 @@
         <w:rPr>
           <w:lang w:val="en-US"/>
         </w:rPr>
-        <w:t>0, the increment from the dial will be 1</w:t>
-      </w:r>
+        <w:t xml:space="preserve">0, the increment from the dial will be </w:t>
+      </w:r>
+      <w:proofErr w:type="gramStart"/>
+      <w:r>
+        <w:rPr>
+          <w:lang w:val="en-US"/>
+        </w:rPr>
+        <w:t>1</w:t>
+      </w:r>
+      <w:proofErr w:type="gramEnd"/>
       <w:r>
         <w:rPr>
           <w:lang w:val="en-US"/>
@@ -1714,7 +2106,21 @@
         <w:rPr>
           <w:lang w:val="en-US"/>
         </w:rPr>
-        <w:t>values by 10. Another click will change the increment to 100.</w:t>
+        <w:t xml:space="preserve">values by 10. Another click will change the increment to </w:t>
+      </w:r>
+      <w:proofErr w:type="gramStart"/>
+      <w:r>
+        <w:rPr>
+          <w:lang w:val="en-US"/>
+        </w:rPr>
+        <w:t>100</w:t>
+      </w:r>
+      <w:proofErr w:type="gramEnd"/>
+      <w:r>
+        <w:rPr>
+          <w:lang w:val="en-US"/>
+        </w:rPr>
+        <w:t>.</w:t>
       </w:r>
       <w:r>
         <w:rPr>
@@ -1797,7 +2203,15 @@
     </w:p>
     <w:p>
       <w:r>
-        <w:t xml:space="preserve">Dial rotation is only useful in the menu system, it doesn’t have any function while the radio </w:t>
+        <w:t xml:space="preserve">Dial rotation is only useful in the menu system, it </w:t>
+      </w:r>
+      <w:proofErr w:type="gramStart"/>
+      <w:r>
+        <w:t>doesn’t</w:t>
+      </w:r>
+      <w:proofErr w:type="gramEnd"/>
+      <w:r>
+        <w:t xml:space="preserve"> have any function while the radio </w:t>
       </w:r>
       <w:r>
         <w:t>status is displayed.</w:t>
@@ -1844,13 +2258,37 @@
         <w:t xml:space="preserve"> Multiple selections cycle through all the available options.</w:t>
       </w:r>
       <w:r>
-        <w:t xml:space="preserve"> Integer values go to another screen that shows the minimum and maximum values. Rotating the dial right increases the value while rotating to the left decreases it by the increment amount. The increment amount can be changed by clicking the button which will cycle between different values. One of the values will be a reset to the original value, activated with a long press. A long press is also used to accept the new value and return to the menu. A * </w:t>
+        <w:t xml:space="preserve"> Integer values go to another screen that shows the minimum and maximum values. Rotating the dial right increases the value while rotating to the left decreases it by the increment amount. The increment amount can </w:t>
+      </w:r>
+      <w:proofErr w:type="gramStart"/>
+      <w:r>
+        <w:t>be changed</w:t>
+      </w:r>
+      <w:proofErr w:type="gramEnd"/>
+      <w:r>
+        <w:t xml:space="preserve"> by clicking the button which will cycle between different values. One of the values will be a reset to the original value, activated with a long press. A long press </w:t>
+      </w:r>
+      <w:proofErr w:type="gramStart"/>
+      <w:r>
+        <w:t>is also used</w:t>
+      </w:r>
+      <w:proofErr w:type="gramEnd"/>
+      <w:r>
+        <w:t xml:space="preserve"> to accept the new value and return to the menu. A * </w:t>
       </w:r>
       <w:r>
         <w:t xml:space="preserve">or highlight </w:t>
       </w:r>
       <w:r>
-        <w:t xml:space="preserve">indicates the active menu line. A + in front of the menu means another menu will be activated. </w:t>
+        <w:t xml:space="preserve">indicates the active menu line. A + in front of the menu means another menu will </w:t>
+      </w:r>
+      <w:proofErr w:type="gramStart"/>
+      <w:r>
+        <w:t>be activated</w:t>
+      </w:r>
+      <w:proofErr w:type="gramEnd"/>
+      <w:r>
+        <w:t xml:space="preserve">. </w:t>
       </w:r>
       <w:r>
         <w:t>Any menu item starting with ‘</w:t>
@@ -1876,7 +2314,15 @@
         <w:t>radio status</w:t>
       </w:r>
       <w:r>
-        <w:t xml:space="preserve"> mode. The current menu entry is remembered so that it will return to the same place when the long press is done from the </w:t>
+        <w:t xml:space="preserve"> mode. The current menu entry </w:t>
+      </w:r>
+      <w:proofErr w:type="gramStart"/>
+      <w:r>
+        <w:t>is remembered</w:t>
+      </w:r>
+      <w:proofErr w:type="gramEnd"/>
+      <w:r>
+        <w:t xml:space="preserve"> so that it will return to the same place when the long press is done from the </w:t>
       </w:r>
       <w:r>
         <w:t>radio status mode</w:t>
@@ -2095,7 +2541,15 @@
     </w:p>
     <w:p>
       <w:r>
-        <w:t>After booting or when not in the menu system the radio status is displayed. It shows the current operation, the count of transmit cycles, the ID text,</w:t>
+        <w:t xml:space="preserve">After booting or when not in the menu system the radio status </w:t>
+      </w:r>
+      <w:proofErr w:type="gramStart"/>
+      <w:r>
+        <w:t>is displayed</w:t>
+      </w:r>
+      <w:proofErr w:type="gramEnd"/>
+      <w:r>
+        <w:t>. It shows the current operation, the count of transmit cycles, the ID text,</w:t>
       </w:r>
       <w:r>
         <w:t xml:space="preserve"> any selected audio file,</w:t>
@@ -2230,7 +2684,15 @@
         <w:t>alphanumeric sequences. An example is the radio ID.</w:t>
       </w:r>
       <w:r>
-        <w:t xml:space="preserve"> Some menu entries may depend on other menu items </w:t>
+        <w:t xml:space="preserve"> </w:t>
+      </w:r>
+      <w:proofErr w:type="gramStart"/>
+      <w:r>
+        <w:t>Some</w:t>
+      </w:r>
+      <w:proofErr w:type="gramEnd"/>
+      <w:r>
+        <w:t xml:space="preserve"> menu entries may depend on other menu items </w:t>
       </w:r>
       <w:r>
         <w:t xml:space="preserve">settings. For </w:t>
@@ -2295,20 +2757,17 @@
       </w:r>
       <w:proofErr w:type="gramEnd"/>
       <w:r>
-        <w:t xml:space="preserve"> then the radio will start sending right after booting. If it is </w:t>
+        <w:t xml:space="preserve"> then the radio will start sending right after booting. If it is Off it will not automatically start sending. It can </w:t>
       </w:r>
       <w:proofErr w:type="gramStart"/>
       <w:r>
-        <w:t>Off</w:t>
+        <w:t>be toggle</w:t>
+      </w:r>
+      <w:r>
+        <w:t>d</w:t>
       </w:r>
       <w:proofErr w:type="gramEnd"/>
       <w:r>
-        <w:t xml:space="preserve"> it will not automatically start sending. It can be toggle</w:t>
-      </w:r>
-      <w:r>
-        <w:t>d</w:t>
-      </w:r>
-      <w:r>
         <w:t xml:space="preserve"> with the B0 button while in run mode</w:t>
       </w:r>
       <w:r>
@@ -2335,6 +2794,10 @@
         <w:t>|</w:t>
       </w:r>
       <w:r>
+        <w:rPr>
+          <w:b/>
+          <w:bCs/>
+        </w:rPr>
         <w:t>Low</w:t>
       </w:r>
       <w:proofErr w:type="spellEnd"/>
@@ -2352,7 +2815,15 @@
         <w:t xml:space="preserve"> and low power is 3W. These are the only</w:t>
       </w:r>
       <w:r>
-        <w:t xml:space="preserve"> values allowed by the SA818 radio. If lower power is desired an attenuator can be attached to the </w:t>
+        <w:t xml:space="preserve"> values allowed by the SA818 radio. If lower power </w:t>
+      </w:r>
+      <w:proofErr w:type="gramStart"/>
+      <w:r>
+        <w:t>is desired</w:t>
+      </w:r>
+      <w:proofErr w:type="gramEnd"/>
+      <w:r>
+        <w:t xml:space="preserve"> an attenuator can be attached to the </w:t>
       </w:r>
       <w:r>
         <w:t>radio antenna.</w:t>
@@ -2363,18 +2834,58 @@
         <w:pStyle w:val="Heading3"/>
       </w:pPr>
       <w:r>
+        <w:t>Beacon Frequency Mode</w:t>
+      </w:r>
+      <w:r>
+        <w:t>:</w:t>
+      </w:r>
+      <w:r>
+        <w:t xml:space="preserve"> </w:t>
+      </w:r>
+      <w:proofErr w:type="spellStart"/>
+      <w:r>
+        <w:t>Yes|</w:t>
+      </w:r>
+      <w:r>
+        <w:rPr>
+          <w:b/>
+          <w:bCs/>
+        </w:rPr>
+        <w:t>No</w:t>
+      </w:r>
+      <w:proofErr w:type="spellEnd"/>
+    </w:p>
+    <w:p>
+      <w:pPr>
+        <w:pStyle w:val="Heading3"/>
+      </w:pPr>
+      <w:r>
         <w:t xml:space="preserve">TX: </w:t>
       </w:r>
       <w:r>
         <w:t>134-174 MHz</w:t>
       </w:r>
+      <w:r>
+        <w:t xml:space="preserve"> or 144.275-144.300</w:t>
+      </w:r>
+      <w:r>
+        <w:t xml:space="preserve"> (beacon mode)</w:t>
+      </w:r>
     </w:p>
     <w:p>
       <w:r>
         <w:t>This is the transmit VHF frequency. A future versi</w:t>
       </w:r>
       <w:r>
-        <w:t>on might be created using the UHF radio module. VHF is more common for Fox Hunting.</w:t>
+        <w:t xml:space="preserve">on might </w:t>
+      </w:r>
+      <w:proofErr w:type="gramStart"/>
+      <w:r>
+        <w:t>be created</w:t>
+      </w:r>
+      <w:proofErr w:type="gramEnd"/>
+      <w:r>
+        <w:t xml:space="preserve"> using the UHF radio module. VHF is more common for Fox Hunting.</w:t>
       </w:r>
     </w:p>
     <w:p>
@@ -2382,7 +2893,11 @@
         <w:pStyle w:val="Heading3"/>
       </w:pPr>
       <w:r>
+        <w:lastRenderedPageBreak/>
         <w:t>Beacon</w:t>
+      </w:r>
+      <w:r>
+        <w:t xml:space="preserve"> ID</w:t>
       </w:r>
       <w:r>
         <w:t xml:space="preserve">: </w:t>
@@ -2397,7 +2912,15 @@
     </w:p>
     <w:p>
       <w:r>
-        <w:t xml:space="preserve">This is an alphanumeric string sent out during the transmitting cycle as morse code. It is always sent right before the </w:t>
+        <w:t xml:space="preserve">This is an alphanumeric string sent out during the transmitting cycle as morse code. It </w:t>
+      </w:r>
+      <w:proofErr w:type="gramStart"/>
+      <w:r>
+        <w:t>is always sent</w:t>
+      </w:r>
+      <w:proofErr w:type="gramEnd"/>
+      <w:r>
+        <w:t xml:space="preserve"> right before the </w:t>
       </w:r>
       <w:r>
         <w:t>Call Sign (ID).</w:t>
@@ -2411,7 +2934,6 @@
         <w:pStyle w:val="Heading3"/>
       </w:pPr>
       <w:r>
-        <w:lastRenderedPageBreak/>
         <w:t xml:space="preserve">Call Sign: </w:t>
       </w:r>
       <w:proofErr w:type="gramStart"/>
@@ -2426,13 +2948,37 @@
     </w:p>
     <w:p>
       <w:r>
-        <w:t>This alphanumeric string is sent out</w:t>
-      </w:r>
-      <w:r>
-        <w:t xml:space="preserve"> after the beacon text. It is sent as morse code.</w:t>
-      </w:r>
-      <w:r>
-        <w:t xml:space="preserve"> It is legally required to send this ID string periodically so it m</w:t>
+        <w:t xml:space="preserve">This alphanumeric string </w:t>
+      </w:r>
+      <w:proofErr w:type="gramStart"/>
+      <w:r>
+        <w:t>is sent</w:t>
+      </w:r>
+      <w:proofErr w:type="gramEnd"/>
+      <w:r>
+        <w:t xml:space="preserve"> out</w:t>
+      </w:r>
+      <w:r>
+        <w:t xml:space="preserve"> after the beacon text. It </w:t>
+      </w:r>
+      <w:proofErr w:type="gramStart"/>
+      <w:r>
+        <w:t>is sent</w:t>
+      </w:r>
+      <w:proofErr w:type="gramEnd"/>
+      <w:r>
+        <w:t xml:space="preserve"> as morse code.</w:t>
+      </w:r>
+      <w:r>
+        <w:t xml:space="preserve"> It </w:t>
+      </w:r>
+      <w:proofErr w:type="gramStart"/>
+      <w:r>
+        <w:t>is legally required</w:t>
+      </w:r>
+      <w:proofErr w:type="gramEnd"/>
+      <w:r>
+        <w:t xml:space="preserve"> to send this ID string periodically so it m</w:t>
       </w:r>
       <w:r>
         <w:t xml:space="preserve">ust not be empty and should be a valid FCC amateur radio ID. It is usually set to </w:t>
@@ -2459,7 +3005,15 @@
     </w:p>
     <w:p>
       <w:r>
-        <w:t>This allows the selected tone file to be played after the beacon and call sign are sent.</w:t>
+        <w:t xml:space="preserve">This allows the selected tone file to </w:t>
+      </w:r>
+      <w:proofErr w:type="gramStart"/>
+      <w:r>
+        <w:t>be played</w:t>
+      </w:r>
+      <w:proofErr w:type="gramEnd"/>
+      <w:r>
+        <w:t xml:space="preserve"> after the beacon and call sign are sent.</w:t>
       </w:r>
     </w:p>
     <w:p>
@@ -2490,7 +3044,15 @@
         <w:t xml:space="preserve"> the </w:t>
       </w:r>
       <w:r>
-        <w:t>*.txt files on the SD card. The dial is rotated to highlight a file and a long press will set it</w:t>
+        <w:t xml:space="preserve">*.txt files on the SD card. The dial </w:t>
+      </w:r>
+      <w:proofErr w:type="gramStart"/>
+      <w:r>
+        <w:t>is rotated</w:t>
+      </w:r>
+      <w:proofErr w:type="gramEnd"/>
+      <w:r>
+        <w:t xml:space="preserve"> to highlight a file and a long press will set it</w:t>
       </w:r>
       <w:r>
         <w:t xml:space="preserve">. Note that a click of dial just exits the list of </w:t>
@@ -2544,8 +3106,21 @@
         <w:t>When B0 or the menu starts the transmit mode</w:t>
       </w:r>
       <w:r>
-        <w:t xml:space="preserve"> the system will not actually begin sending until this time is expired. This allows the radio to be hidden</w:t>
-      </w:r>
+        <w:t xml:space="preserve"> the system will not actually begin sending until this time </w:t>
+      </w:r>
+      <w:proofErr w:type="gramStart"/>
+      <w:r>
+        <w:t>is expired</w:t>
+      </w:r>
+      <w:proofErr w:type="gramEnd"/>
+      <w:r>
+        <w:t xml:space="preserve">. This allows the radio to </w:t>
+      </w:r>
+      <w:proofErr w:type="gramStart"/>
+      <w:r>
+        <w:t>be hidden</w:t>
+      </w:r>
+      <w:proofErr w:type="gramEnd"/>
       <w:r>
         <w:t xml:space="preserve"> and </w:t>
       </w:r>
@@ -2574,11 +3149,24 @@
         <w:t>In Fixed</w:t>
       </w:r>
       <w:r>
-        <w:t xml:space="preserve"> mode the sending time and pause timer are controlled by the Send and Pause values</w:t>
-      </w:r>
-      <w:r>
-        <w:t xml:space="preserve"> and are always the same. In Random mode the transmit time and pause time are randomly chosen</w:t>
-      </w:r>
+        <w:t xml:space="preserve"> mode the sending time and pause timer </w:t>
+      </w:r>
+      <w:proofErr w:type="gramStart"/>
+      <w:r>
+        <w:t>are controlled</w:t>
+      </w:r>
+      <w:proofErr w:type="gramEnd"/>
+      <w:r>
+        <w:t xml:space="preserve"> by the Send and Pause values</w:t>
+      </w:r>
+      <w:r>
+        <w:t xml:space="preserve"> and are always the same. In Random mode the transmit time and pause time </w:t>
+      </w:r>
+      <w:proofErr w:type="gramStart"/>
+      <w:r>
+        <w:t>are randomly chosen</w:t>
+      </w:r>
+      <w:proofErr w:type="gramEnd"/>
       <w:r>
         <w:t xml:space="preserve"> from the allowed values set in the Min and Max values for TX Send and Pause. This makes the timing less predictable and </w:t>
       </w:r>
@@ -2633,6 +3221,7 @@
         <w:pStyle w:val="Heading3"/>
       </w:pPr>
       <w:r>
+        <w:lastRenderedPageBreak/>
         <w:t>TX Pause:10-1200 Sec</w:t>
       </w:r>
     </w:p>
@@ -2657,13 +3246,262 @@
         <w:pStyle w:val="Heading3"/>
       </w:pPr>
       <w:r>
+        <w:t>TX Send Min: 10-90 Sec</w:t>
+      </w:r>
+    </w:p>
+    <w:p>
+      <w:r>
+        <w:t>In random mode this is the minimum send time.</w:t>
+      </w:r>
+    </w:p>
+    <w:p>
+      <w:pPr>
+        <w:pStyle w:val="Heading3"/>
+      </w:pPr>
+      <w:r>
+        <w:t xml:space="preserve">TX Send Max: </w:t>
+      </w:r>
+      <w:r>
+        <w:t>10-90 Sec</w:t>
+      </w:r>
+    </w:p>
+    <w:p>
+      <w:r>
+        <w:t xml:space="preserve">In </w:t>
+      </w:r>
+      <w:r>
+        <w:t>random mode this is the maximum send time.</w:t>
+      </w:r>
+    </w:p>
+    <w:p>
+      <w:pPr>
+        <w:pStyle w:val="Heading3"/>
+      </w:pPr>
+      <w:r>
+        <w:t>TX Pause Min: 10-1200 Sec</w:t>
+      </w:r>
+    </w:p>
+    <w:p>
+      <w:r>
+        <w:t>In random mode this is the minimum pause time.</w:t>
+      </w:r>
+    </w:p>
+    <w:p>
+      <w:pPr>
+        <w:pStyle w:val="Heading3"/>
+      </w:pPr>
+      <w:r>
+        <w:t>TX Pause Max: 10-1200 Sec</w:t>
+      </w:r>
+    </w:p>
+    <w:p>
+      <w:r>
+        <w:t>In random mode this is the maximum pause time.</w:t>
+      </w:r>
+    </w:p>
+    <w:p>
+      <w:pPr>
+        <w:pStyle w:val="Heading3"/>
+      </w:pPr>
+      <w:r>
+        <w:t xml:space="preserve">TX Stop: </w:t>
+      </w:r>
+      <w:proofErr w:type="spellStart"/>
+      <w:r>
+        <w:t>Immediate|Finish</w:t>
+      </w:r>
+      <w:proofErr w:type="spellEnd"/>
+      <w:r>
+        <w:t xml:space="preserve"> Cycle</w:t>
+      </w:r>
+    </w:p>
+    <w:p>
+      <w:r>
+        <w:t xml:space="preserve">During transmit time the Beacon, Call Sign, and Audio </w:t>
+      </w:r>
+      <w:proofErr w:type="gramStart"/>
+      <w:r>
+        <w:t>are continuously sent</w:t>
+      </w:r>
+      <w:proofErr w:type="gramEnd"/>
+      <w:r>
+        <w:t xml:space="preserve">. At the end of the transmission time this option controls whether the transmission stops immediately </w:t>
+      </w:r>
+      <w:proofErr w:type="gramStart"/>
+      <w:r>
+        <w:t>of</w:t>
+      </w:r>
+      <w:proofErr w:type="gramEnd"/>
+      <w:r>
+        <w:t xml:space="preserve"> waits to stop until the entire cycle </w:t>
+      </w:r>
+      <w:proofErr w:type="gramStart"/>
+      <w:r>
+        <w:t>is finished</w:t>
+      </w:r>
+      <w:proofErr w:type="gramEnd"/>
+      <w:r>
+        <w:t>.</w:t>
+      </w:r>
+    </w:p>
+    <w:p/>
+    <w:p>
+      <w:r>
+        <w:t>A clever use of this command</w:t>
+      </w:r>
+      <w:r>
+        <w:t xml:space="preserve"> allows for only one cycle of beacon, ID, and music to </w:t>
+      </w:r>
+      <w:proofErr w:type="gramStart"/>
+      <w:r>
+        <w:t>be sent</w:t>
+      </w:r>
+      <w:proofErr w:type="gramEnd"/>
+      <w:r>
+        <w:t xml:space="preserve"> during each transmission time. Set the transmit</w:t>
+      </w:r>
+      <w:r>
+        <w:t xml:space="preserve"> time to something less than</w:t>
+      </w:r>
+      <w:r>
+        <w:t xml:space="preserve"> the time to perform a complete cycle and set this option to “Finish Cycle</w:t>
+      </w:r>
+      <w:proofErr w:type="gramStart"/>
+      <w:r>
+        <w:t>”.</w:t>
+      </w:r>
+      <w:proofErr w:type="gramEnd"/>
+      <w:r>
+        <w:t xml:space="preserve"> The </w:t>
+      </w:r>
+      <w:proofErr w:type="gramStart"/>
+      <w:r>
+        <w:t>transmit  cycle</w:t>
+      </w:r>
+      <w:proofErr w:type="gramEnd"/>
+      <w:r>
+        <w:t xml:space="preserve"> will begin, the timer will expire, but the current cycle will complete before stopping</w:t>
+      </w:r>
+      <w:r>
+        <w:t>.</w:t>
+      </w:r>
+    </w:p>
+    <w:p>
+      <w:pPr>
+        <w:pStyle w:val="Heading3"/>
+      </w:pPr>
+      <w:r>
+        <w:t xml:space="preserve">Radio Pause: </w:t>
+      </w:r>
+      <w:proofErr w:type="spellStart"/>
+      <w:r>
+        <w:t>Sleep|Awake</w:t>
+      </w:r>
+      <w:proofErr w:type="spellEnd"/>
+    </w:p>
+    <w:p>
+      <w:r>
+        <w:t xml:space="preserve">During pause time the radio can </w:t>
+      </w:r>
+      <w:proofErr w:type="gramStart"/>
+      <w:r>
+        <w:t>be put</w:t>
+      </w:r>
+      <w:proofErr w:type="gramEnd"/>
+      <w:r>
+        <w:t xml:space="preserve"> into sleep mode. This lowers the power consumption and lets the battery last longer. </w:t>
+      </w:r>
+      <w:proofErr w:type="gramStart"/>
+      <w:r>
+        <w:t>However</w:t>
+      </w:r>
+      <w:proofErr w:type="gramEnd"/>
+      <w:r>
+        <w:t xml:space="preserve"> note that this also means that the DTMF commands are disabled since the radio is asleep!</w:t>
+      </w:r>
+    </w:p>
+    <w:p>
+      <w:pPr>
+        <w:pStyle w:val="Heading2"/>
+      </w:pPr>
+      <w:r>
+        <w:t>+</w:t>
+      </w:r>
+      <w:r>
+        <w:t>More Radio Settings</w:t>
+      </w:r>
+    </w:p>
+    <w:p>
+      <w:pPr>
+        <w:pStyle w:val="Heading3"/>
+      </w:pPr>
+      <w:r>
+        <w:t xml:space="preserve">RX Offset: -600|0|+600 </w:t>
+      </w:r>
+      <w:proofErr w:type="gramStart"/>
+      <w:r>
+        <w:t>kHz</w:t>
+      </w:r>
+      <w:proofErr w:type="gramEnd"/>
+    </w:p>
+    <w:p>
+      <w:r>
+        <w:t>This is the frequency offset from the transmit frequency that the radio uses to receive DTMF commands</w:t>
+      </w:r>
+      <w:r>
+        <w:t xml:space="preserve">. An offset </w:t>
+      </w:r>
+      <w:proofErr w:type="gramStart"/>
+      <w:r>
+        <w:t>is recommended</w:t>
+      </w:r>
+      <w:proofErr w:type="gramEnd"/>
+      <w:r>
+        <w:t xml:space="preserve">. If </w:t>
+      </w:r>
+      <w:proofErr w:type="gramStart"/>
+      <w:r>
+        <w:t>0</w:t>
+      </w:r>
+      <w:proofErr w:type="gramEnd"/>
+      <w:r>
+        <w:t xml:space="preserve"> is used the radio will only listen when it isn’t sending. It has not been </w:t>
+      </w:r>
+      <w:proofErr w:type="gramStart"/>
+      <w:r>
+        <w:t>tested</w:t>
+      </w:r>
+      <w:proofErr w:type="gramEnd"/>
+      <w:r>
+        <w:t xml:space="preserve"> if it listens during sending when the offset is not 0.</w:t>
+      </w:r>
+    </w:p>
+    <w:p>
+      <w:pPr>
+        <w:pStyle w:val="Heading3"/>
+      </w:pPr>
+      <w:r>
         <w:lastRenderedPageBreak/>
-        <w:t>TX Send Min: 10-90 Sec</w:t>
-      </w:r>
-    </w:p>
-    <w:p>
-      <w:r>
-        <w:t>In random mode this is the minimum send time.</w:t>
+        <w:t>Bandwidth: 12.5|</w:t>
+      </w:r>
+      <w:r>
+        <w:t>25 kHz</w:t>
+      </w:r>
+    </w:p>
+    <w:p>
+      <w:r>
+        <w:t>This sets the radio bandwidth</w:t>
+      </w:r>
+      <w:r>
+        <w:t xml:space="preserve">. It has not been </w:t>
+      </w:r>
+      <w:proofErr w:type="gramStart"/>
+      <w:r>
+        <w:t>tested</w:t>
+      </w:r>
+      <w:proofErr w:type="gramEnd"/>
+      <w:r>
+        <w:t xml:space="preserve"> much to see what effect it has on performance yet.</w:t>
       </w:r>
     </w:p>
     <w:p>
@@ -2671,18 +3509,21 @@
         <w:pStyle w:val="Heading3"/>
       </w:pPr>
       <w:r>
-        <w:t xml:space="preserve">TX Send Max: </w:t>
-      </w:r>
-      <w:r>
-        <w:t>10-90 Sec</w:t>
-      </w:r>
-    </w:p>
-    <w:p>
-      <w:r>
-        <w:t xml:space="preserve">In </w:t>
-      </w:r>
-      <w:r>
-        <w:t>random mode this is the maximum send time.</w:t>
+        <w:t>CTCSS/DCS: CTCSS|DCS</w:t>
+      </w:r>
+    </w:p>
+    <w:p>
+      <w:r>
+        <w:t xml:space="preserve">This sets the </w:t>
+      </w:r>
+      <w:r>
+        <w:t>un-squelch</w:t>
+      </w:r>
+      <w:r>
+        <w:t xml:space="preserve"> values</w:t>
+      </w:r>
+      <w:r>
+        <w:t xml:space="preserve"> for either the analog or digital versions.</w:t>
       </w:r>
     </w:p>
     <w:p>
@@ -2690,12 +3531,24 @@
         <w:pStyle w:val="Heading3"/>
       </w:pPr>
       <w:r>
-        <w:t>TX Pause Min: 10-1200 Sec</w:t>
-      </w:r>
-    </w:p>
-    <w:p>
-      <w:r>
-        <w:t>In random mode this is the minimum pause time.</w:t>
+        <w:t>TX CTCSS:</w:t>
+      </w:r>
+      <w:r>
+        <w:t xml:space="preserve"> None</w:t>
+      </w:r>
+      <w:r>
+        <w:t>|</w:t>
+      </w:r>
+      <w:r>
+        <w:t>67-</w:t>
+      </w:r>
+      <w:r>
+        <w:t>250.3</w:t>
+      </w:r>
+    </w:p>
+    <w:p>
+      <w:r>
+        <w:t>Analog un-squelch frequencies sent out.</w:t>
       </w:r>
     </w:p>
     <w:p>
@@ -2703,12 +3556,15 @@
         <w:pStyle w:val="Heading3"/>
       </w:pPr>
       <w:r>
-        <w:t>TX Pause Max: 10-1200 Sec</w:t>
-      </w:r>
-    </w:p>
-    <w:p>
-      <w:r>
-        <w:t>In random mode this is the maximum pause time.</w:t>
+        <w:t>RX CTCSS:</w:t>
+      </w:r>
+      <w:r>
+        <w:t xml:space="preserve"> None|67-250.3</w:t>
+      </w:r>
+    </w:p>
+    <w:p>
+      <w:r>
+        <w:t>Analog un-squelch frequency for receiving.</w:t>
       </w:r>
     </w:p>
     <w:p>
@@ -2716,558 +3572,442 @@
         <w:pStyle w:val="Heading3"/>
       </w:pPr>
       <w:r>
-        <w:t xml:space="preserve">TX Stop: </w:t>
+        <w:t>TX DCS:</w:t>
+      </w:r>
+      <w:r>
+        <w:t xml:space="preserve"> None|023-754</w:t>
+      </w:r>
+    </w:p>
+    <w:p>
+      <w:r>
+        <w:t>Digital un-squelch value for sending.</w:t>
+      </w:r>
+    </w:p>
+    <w:p>
+      <w:pPr>
+        <w:pStyle w:val="Heading3"/>
+      </w:pPr>
+      <w:r>
+        <w:t>TX I/N: I|N</w:t>
+      </w:r>
+    </w:p>
+    <w:p>
+      <w:r>
+        <w:t>The digital I or N value for sending.</w:t>
+      </w:r>
+    </w:p>
+    <w:p>
+      <w:pPr>
+        <w:pStyle w:val="Heading3"/>
+      </w:pPr>
+      <w:r>
+        <w:t>RX DCS: None|023-754</w:t>
+      </w:r>
+    </w:p>
+    <w:p>
+      <w:r>
+        <w:t>Digital un-squelch value for receiving.</w:t>
+      </w:r>
+    </w:p>
+    <w:p>
+      <w:pPr>
+        <w:pStyle w:val="Heading3"/>
+      </w:pPr>
+      <w:r>
+        <w:t>RX I/N: I|N</w:t>
+      </w:r>
+    </w:p>
+    <w:p>
+      <w:r>
+        <w:t>The digital I or N value for receiving.</w:t>
+      </w:r>
+    </w:p>
+    <w:p>
+      <w:pPr>
+        <w:pStyle w:val="Heading3"/>
+      </w:pPr>
+      <w:r>
+        <w:t>RX Volume:</w:t>
+      </w:r>
+      <w:r>
+        <w:t xml:space="preserve"> 1-6</w:t>
+      </w:r>
+    </w:p>
+    <w:p>
+      <w:r>
+        <w:t xml:space="preserve">This is the receive volume setting. It affects how well DTMF tones </w:t>
+      </w:r>
+      <w:proofErr w:type="gramStart"/>
+      <w:r>
+        <w:t>are detected</w:t>
+      </w:r>
+      <w:proofErr w:type="gramEnd"/>
+      <w:r>
+        <w:t>.</w:t>
+      </w:r>
+    </w:p>
+    <w:p>
+      <w:pPr>
+        <w:pStyle w:val="Heading3"/>
+      </w:pPr>
+      <w:r>
+        <w:t>RX Squelch:</w:t>
+      </w:r>
+      <w:r>
+        <w:t xml:space="preserve"> 0-8</w:t>
+      </w:r>
+    </w:p>
+    <w:p>
+      <w:r>
+        <w:t xml:space="preserve">This affects how </w:t>
+      </w:r>
+      <w:proofErr w:type="gramStart"/>
+      <w:r>
+        <w:t>much</w:t>
+      </w:r>
+      <w:proofErr w:type="gramEnd"/>
+      <w:r>
+        <w:t xml:space="preserve"> signal is required to receive the DTMF signals.</w:t>
+      </w:r>
+    </w:p>
+    <w:p>
+      <w:pPr>
+        <w:pStyle w:val="Heading2"/>
+      </w:pPr>
+      <w:r>
+        <w:t>Cancel Waits/TX Now</w:t>
+      </w:r>
+    </w:p>
+    <w:p>
+      <w:r>
+        <w:t>When the radio is in either send or pause mode this command will cancel the timer and the next mo</w:t>
+      </w:r>
+      <w:r>
+        <w:t xml:space="preserve">de will start. For </w:t>
+      </w:r>
+      <w:proofErr w:type="gramStart"/>
+      <w:r>
+        <w:t>example</w:t>
+      </w:r>
+      <w:proofErr w:type="gramEnd"/>
+      <w:r>
+        <w:t xml:space="preserve"> if you want to cancel</w:t>
+      </w:r>
+      <w:r>
+        <w:t xml:space="preserve"> the pause and go to transmit, use this option. It can also </w:t>
+      </w:r>
+      <w:proofErr w:type="gramStart"/>
+      <w:r>
+        <w:t>be done</w:t>
+      </w:r>
+      <w:proofErr w:type="gramEnd"/>
+      <w:r>
+        <w:t xml:space="preserve"> by </w:t>
+      </w:r>
+      <w:proofErr w:type="gramStart"/>
+      <w:r>
+        <w:t>long pressing B0</w:t>
+      </w:r>
+      <w:proofErr w:type="gramEnd"/>
+      <w:r>
+        <w:t>.</w:t>
+      </w:r>
+    </w:p>
+    <w:p>
+      <w:pPr>
+        <w:pStyle w:val="Heading2"/>
+      </w:pPr>
+      <w:r>
+        <w:lastRenderedPageBreak/>
+        <w:t>+Saved Settings Files</w:t>
+      </w:r>
+    </w:p>
+    <w:p>
+      <w:r>
+        <w:t xml:space="preserve">Saved settings files </w:t>
+      </w:r>
+      <w:proofErr w:type="gramStart"/>
+      <w:r>
+        <w:t>are named</w:t>
+      </w:r>
+      <w:proofErr w:type="gramEnd"/>
+      <w:r>
+        <w:t xml:space="preserve"> files stored on the SD card. They are useful to</w:t>
+      </w:r>
+      <w:r>
+        <w:t xml:space="preserve"> quickly configure the radio for different uses. All values except the battery calibration </w:t>
+      </w:r>
+      <w:proofErr w:type="gramStart"/>
+      <w:r>
+        <w:t>are affected</w:t>
+      </w:r>
+      <w:proofErr w:type="gramEnd"/>
+      <w:r>
+        <w:t>.</w:t>
+      </w:r>
+    </w:p>
+    <w:p>
+      <w:pPr>
+        <w:pStyle w:val="Heading3"/>
+      </w:pPr>
+      <w:r>
+        <w:t>Create File</w:t>
+      </w:r>
+    </w:p>
+    <w:p>
+      <w:r>
+        <w:t xml:space="preserve">This prompts the user for a name. The file </w:t>
+      </w:r>
+      <w:proofErr w:type="gramStart"/>
+      <w:r>
+        <w:t>is then created</w:t>
+      </w:r>
+      <w:proofErr w:type="gramEnd"/>
+      <w:r>
+        <w:t xml:space="preserve"> using the current system settings.</w:t>
+      </w:r>
+    </w:p>
+    <w:p>
+      <w:pPr>
+        <w:pStyle w:val="Heading3"/>
+      </w:pPr>
+      <w:r>
+        <w:t>Save/Update File</w:t>
+      </w:r>
+    </w:p>
+    <w:p>
+      <w:r>
+        <w:t xml:space="preserve">This command saves the current settings into the selected file. If it already </w:t>
+      </w:r>
+      <w:proofErr w:type="gramStart"/>
+      <w:r>
+        <w:t>exists</w:t>
+      </w:r>
+      <w:proofErr w:type="gramEnd"/>
+      <w:r>
+        <w:t xml:space="preserve"> the user will be asked to confirm overwriting the file.</w:t>
+      </w:r>
+    </w:p>
+    <w:p>
+      <w:pPr>
+        <w:pStyle w:val="Heading3"/>
+      </w:pPr>
+      <w:r>
+        <w:t>Load File</w:t>
+      </w:r>
+    </w:p>
+    <w:p>
+      <w:r>
+        <w:t xml:space="preserve">This command asks the user for the name and then sets </w:t>
+      </w:r>
+      <w:proofErr w:type="gramStart"/>
+      <w:r>
+        <w:t>all of</w:t>
+      </w:r>
+      <w:proofErr w:type="gramEnd"/>
+      <w:r>
+        <w:t xml:space="preserve"> the system settings except the battery calibration using the values in the file.</w:t>
+      </w:r>
+    </w:p>
+    <w:p>
+      <w:pPr>
+        <w:pStyle w:val="Heading3"/>
+      </w:pPr>
+      <w:r>
+        <w:t>Delete File</w:t>
+      </w:r>
+    </w:p>
+    <w:p>
+      <w:r>
+        <w:t xml:space="preserve">The user selects a file from the list and then it can </w:t>
+      </w:r>
+      <w:proofErr w:type="gramStart"/>
+      <w:r>
+        <w:t>be deleted</w:t>
+      </w:r>
+      <w:proofErr w:type="gramEnd"/>
+      <w:r>
+        <w:t>.</w:t>
+      </w:r>
+    </w:p>
+    <w:p>
+      <w:pPr>
+        <w:pStyle w:val="Heading2"/>
+      </w:pPr>
+      <w:r>
+        <w:t>+System Settings</w:t>
+      </w:r>
+    </w:p>
+    <w:p>
+      <w:pPr>
+        <w:pStyle w:val="Heading3"/>
+      </w:pPr>
+      <w:r>
+        <w:t>+Display</w:t>
+      </w:r>
+      <w:r>
+        <w:t xml:space="preserve"> Settings</w:t>
+      </w:r>
+    </w:p>
+    <w:p>
+      <w:pPr>
+        <w:pStyle w:val="Heading4"/>
+      </w:pPr>
+      <w:r>
+        <w:t xml:space="preserve">Dimming Mode: </w:t>
       </w:r>
       <w:proofErr w:type="spellStart"/>
       <w:r>
-        <w:t>Immediate|Finish</w:t>
+        <w:t>None</w:t>
+      </w:r>
+      <w:r>
+        <w:t>|Timer</w:t>
       </w:r>
       <w:proofErr w:type="spellEnd"/>
-      <w:r>
-        <w:t xml:space="preserve"> Cycle</w:t>
-      </w:r>
-    </w:p>
-    <w:p>
-      <w:r>
-        <w:t xml:space="preserve">During transmit time the Beacon, Call Sign, and Audio are continuously sent. At the end of the transmission time this option controls whether the transmission stops immediately </w:t>
+    </w:p>
+    <w:p>
+      <w:r>
+        <w:t xml:space="preserve">The display can be set to dim automatically after a specified number of seconds. This </w:t>
       </w:r>
       <w:proofErr w:type="gramStart"/>
       <w:r>
-        <w:t>of</w:t>
+        <w:t>is used</w:t>
       </w:r>
       <w:proofErr w:type="gramEnd"/>
       <w:r>
-        <w:t xml:space="preserve"> waits to stop until the entire cycle is finished.</w:t>
-      </w:r>
-    </w:p>
-    <w:p/>
-    <w:p>
-      <w:r>
-        <w:t>A clever use of this command</w:t>
-      </w:r>
-      <w:r>
-        <w:t xml:space="preserve"> allows for only one cycle of beacon, ID, and music to be sent during each transmission time. Set the transmit</w:t>
-      </w:r>
-      <w:r>
-        <w:t xml:space="preserve"> time to something less than</w:t>
-      </w:r>
-      <w:r>
-        <w:t xml:space="preserve"> the time to perform a complete cycle and set this option to “Finish Cycle”. The </w:t>
+        <w:t xml:space="preserve"> to save battery power since the backlight </w:t>
+      </w:r>
+      <w:r>
+        <w:t>uses a significant amount.</w:t>
+      </w:r>
+    </w:p>
+    <w:p>
+      <w:pPr>
+        <w:pStyle w:val="Heading4"/>
+      </w:pPr>
+      <w:r>
+        <w:t>Bright Value: 1-100</w:t>
+      </w:r>
+      <w:r>
+        <w:t>%</w:t>
+      </w:r>
+    </w:p>
+    <w:p>
+      <w:r>
+        <w:t>Set the display brightness value.</w:t>
+      </w:r>
+    </w:p>
+    <w:p>
+      <w:pPr>
+        <w:pStyle w:val="Heading4"/>
+      </w:pPr>
+      <w:r>
+        <w:t xml:space="preserve">Dim Value: </w:t>
+      </w:r>
+      <w:r>
+        <w:t>0-100%</w:t>
+      </w:r>
+    </w:p>
+    <w:p>
+      <w:r>
+        <w:t xml:space="preserve">Set the display brightness after the </w:t>
+      </w:r>
+      <w:r>
+        <w:t>timer below expires.</w:t>
+      </w:r>
+    </w:p>
+    <w:p>
+      <w:pPr>
+        <w:pStyle w:val="Heading4"/>
+      </w:pPr>
+      <w:r>
+        <w:t>Display Dim Time:</w:t>
+      </w:r>
+      <w:r>
+        <w:t xml:space="preserve"> 0-120 S</w:t>
+      </w:r>
+    </w:p>
+    <w:p>
+      <w:r>
+        <w:t>Specify the time until the display changes to dim mode.</w:t>
+      </w:r>
+    </w:p>
+    <w:p>
+      <w:pPr>
+        <w:pStyle w:val="Heading4"/>
+      </w:pPr>
+      <w:r>
+        <w:t>+Sideways Scroll Settings</w:t>
+      </w:r>
+    </w:p>
+    <w:p>
+      <w:r>
+        <w:t xml:space="preserve">Lines of text that </w:t>
       </w:r>
       <w:proofErr w:type="gramStart"/>
       <w:r>
-        <w:t>transmit  cycle</w:t>
+        <w:t>too</w:t>
       </w:r>
       <w:proofErr w:type="gramEnd"/>
       <w:r>
-        <w:t xml:space="preserve"> will begin, the timer will expire, but the current cycle will complete before stopping</w:t>
-      </w:r>
-      <w:r>
-        <w:t>.</w:t>
-      </w:r>
-    </w:p>
-    <w:p>
-      <w:pPr>
-        <w:pStyle w:val="Heading3"/>
-      </w:pPr>
-      <w:r>
-        <w:t xml:space="preserve">Radio Pause: </w:t>
-      </w:r>
-      <w:proofErr w:type="spellStart"/>
-      <w:r>
-        <w:t>Sleep|Awake</w:t>
-      </w:r>
-      <w:proofErr w:type="spellEnd"/>
-    </w:p>
-    <w:p>
-      <w:r>
-        <w:t xml:space="preserve">During pause time the radio can be put into sleep mode. This lowers the power consumption and lets the battery last longer. </w:t>
+        <w:t xml:space="preserve"> long for the display will scroll back and forth. The following settings control the speed.</w:t>
+      </w:r>
+    </w:p>
+    <w:p>
+      <w:pPr>
+        <w:pStyle w:val="Heading5"/>
+      </w:pPr>
+      <w:r>
+        <w:lastRenderedPageBreak/>
+        <w:t xml:space="preserve">Speed: </w:t>
+      </w:r>
+      <w:r>
+        <w:t>1-1000 mS</w:t>
+      </w:r>
+    </w:p>
+    <w:p>
+      <w:r>
+        <w:t>Controls the speed of text moving to the left.</w:t>
+      </w:r>
+    </w:p>
+    <w:p>
+      <w:pPr>
+        <w:pStyle w:val="Heading5"/>
+      </w:pPr>
+      <w:r>
+        <w:t>Pause: 1-100</w:t>
+      </w:r>
+      <w:r>
+        <w:t xml:space="preserve"> mS</w:t>
+      </w:r>
+    </w:p>
+    <w:p>
+      <w:r>
+        <w:t>This controls the pause when the text is at the end (all the way to the left).</w:t>
+      </w:r>
+    </w:p>
+    <w:p>
+      <w:pPr>
+        <w:pStyle w:val="Heading5"/>
+      </w:pPr>
+      <w:r>
+        <w:t>Reverse Speed: 1-20x</w:t>
+      </w:r>
+    </w:p>
+    <w:p>
+      <w:r>
+        <w:t xml:space="preserve">This is how fast the text scrolls </w:t>
+      </w:r>
+      <w:r>
+        <w:t xml:space="preserve">back to the beginning (to the right). </w:t>
       </w:r>
       <w:proofErr w:type="gramStart"/>
       <w:r>
-        <w:t>However</w:t>
+        <w:t>2x</w:t>
       </w:r>
       <w:proofErr w:type="gramEnd"/>
       <w:r>
-        <w:t xml:space="preserve"> note that this also means that the DTMF commands are disabled since the radio is asleep!</w:t>
-      </w:r>
-    </w:p>
-    <w:p>
-      <w:pPr>
-        <w:pStyle w:val="Heading2"/>
-      </w:pPr>
-      <w:r>
-        <w:t>+</w:t>
-      </w:r>
-      <w:r>
-        <w:t>More Radio Settings</w:t>
-      </w:r>
-    </w:p>
-    <w:p>
-      <w:pPr>
-        <w:pStyle w:val="Heading3"/>
-      </w:pPr>
-      <w:r>
-        <w:t xml:space="preserve">RX Offset: -600|0|+600 </w:t>
-      </w:r>
-      <w:proofErr w:type="gramStart"/>
-      <w:r>
-        <w:t>kHz</w:t>
-      </w:r>
-      <w:proofErr w:type="gramEnd"/>
-    </w:p>
-    <w:p>
-      <w:r>
-        <w:t>This is the frequency offset from the transmit frequency that the radio uses to receive DTMF commands</w:t>
-      </w:r>
-      <w:r>
-        <w:t>. An offset is recommended. If 0 is used the radio will only listen when it isn’t sending. It has not been tested if it listens during sending when the offset is not 0.</w:t>
-      </w:r>
-    </w:p>
-    <w:p>
-      <w:pPr>
-        <w:pStyle w:val="Heading3"/>
-      </w:pPr>
-      <w:r>
-        <w:t>Bandwidth: 12.5|</w:t>
-      </w:r>
-      <w:r>
-        <w:t>25 kHz</w:t>
-      </w:r>
-    </w:p>
-    <w:p>
-      <w:r>
-        <w:t>This sets the radio bandwidth</w:t>
-      </w:r>
-      <w:r>
-        <w:t>. It has not been tested much to see what effect it has on performance yet.</w:t>
-      </w:r>
-    </w:p>
-    <w:p>
-      <w:pPr>
-        <w:pStyle w:val="Heading3"/>
-      </w:pPr>
-      <w:r>
-        <w:lastRenderedPageBreak/>
-        <w:t>CTCSS/DCS: CTCSS|DCS</w:t>
-      </w:r>
-    </w:p>
-    <w:p>
-      <w:r>
-        <w:t xml:space="preserve">This sets the </w:t>
-      </w:r>
-      <w:r>
-        <w:t>un-squelch</w:t>
-      </w:r>
-      <w:r>
-        <w:t xml:space="preserve"> values</w:t>
-      </w:r>
-      <w:r>
-        <w:t xml:space="preserve"> for either the analog or digital versions.</w:t>
-      </w:r>
-    </w:p>
-    <w:p>
-      <w:pPr>
-        <w:pStyle w:val="Heading3"/>
-      </w:pPr>
-      <w:r>
-        <w:t>TX CTCSS:</w:t>
-      </w:r>
-      <w:r>
-        <w:t xml:space="preserve"> None</w:t>
-      </w:r>
-      <w:r>
-        <w:t>|</w:t>
-      </w:r>
-      <w:r>
-        <w:t>67-</w:t>
-      </w:r>
-      <w:r>
-        <w:t>250.3</w:t>
-      </w:r>
-    </w:p>
-    <w:p>
-      <w:r>
-        <w:t>Analog un-squelch frequencies sent out.</w:t>
-      </w:r>
-    </w:p>
-    <w:p>
-      <w:pPr>
-        <w:pStyle w:val="Heading3"/>
-      </w:pPr>
-      <w:r>
-        <w:t>RX CTCSS:</w:t>
-      </w:r>
-      <w:r>
-        <w:t xml:space="preserve"> None|67-250.3</w:t>
-      </w:r>
-    </w:p>
-    <w:p>
-      <w:r>
-        <w:t>Analog un-squelch frequency for receiving.</w:t>
-      </w:r>
-    </w:p>
-    <w:p>
-      <w:pPr>
-        <w:pStyle w:val="Heading3"/>
-      </w:pPr>
-      <w:r>
-        <w:t>TX DCS:</w:t>
-      </w:r>
-      <w:r>
-        <w:t xml:space="preserve"> None|023-754</w:t>
-      </w:r>
-    </w:p>
-    <w:p>
-      <w:r>
-        <w:t>Digital un-squelch value for sending.</w:t>
-      </w:r>
-    </w:p>
-    <w:p>
-      <w:pPr>
-        <w:pStyle w:val="Heading3"/>
-      </w:pPr>
-      <w:r>
-        <w:t>TX I/N: I|N</w:t>
-      </w:r>
-    </w:p>
-    <w:p>
-      <w:r>
-        <w:t>The digital I or N value for sending.</w:t>
-      </w:r>
-    </w:p>
-    <w:p>
-      <w:pPr>
-        <w:pStyle w:val="Heading3"/>
-      </w:pPr>
-      <w:r>
-        <w:t>RX DCS: None|023-754</w:t>
-      </w:r>
-    </w:p>
-    <w:p>
-      <w:r>
-        <w:t>Digital un-squelch value for receiving.</w:t>
-      </w:r>
-    </w:p>
-    <w:p>
-      <w:pPr>
-        <w:pStyle w:val="Heading3"/>
-      </w:pPr>
-      <w:r>
-        <w:t>RX I/N: I|N</w:t>
-      </w:r>
-    </w:p>
-    <w:p>
-      <w:r>
-        <w:t>The digital I or N value for receiving.</w:t>
-      </w:r>
-    </w:p>
-    <w:p>
-      <w:pPr>
-        <w:pStyle w:val="Heading3"/>
-      </w:pPr>
-      <w:r>
-        <w:t>RX Volume:</w:t>
-      </w:r>
-      <w:r>
-        <w:t xml:space="preserve"> 1-6</w:t>
-      </w:r>
-    </w:p>
-    <w:p>
-      <w:r>
-        <w:t>This is the receive volume setting. It affects how well DTMF tones are detected.</w:t>
-      </w:r>
-    </w:p>
-    <w:p>
-      <w:pPr>
-        <w:pStyle w:val="Heading3"/>
-      </w:pPr>
-      <w:r>
-        <w:t>RX Squelch:</w:t>
-      </w:r>
-      <w:r>
-        <w:t xml:space="preserve"> 0-8</w:t>
-      </w:r>
-    </w:p>
-    <w:p>
-      <w:r>
-        <w:t>This affects how much signal is required to receive the DTMF signals.</w:t>
-      </w:r>
-    </w:p>
-    <w:p>
-      <w:pPr>
-        <w:pStyle w:val="Heading2"/>
-      </w:pPr>
-      <w:r>
-        <w:t>Cancel Waits/TX Now</w:t>
-      </w:r>
-    </w:p>
-    <w:p>
-      <w:r>
-        <w:t>When the radio is in either send or pause mode this command will cancel the timer and the next mo</w:t>
-      </w:r>
-      <w:r>
-        <w:t xml:space="preserve">de will start. For </w:t>
-      </w:r>
-      <w:proofErr w:type="gramStart"/>
-      <w:r>
-        <w:t>example</w:t>
-      </w:r>
-      <w:proofErr w:type="gramEnd"/>
-      <w:r>
-        <w:t xml:space="preserve"> if you want to cancel</w:t>
-      </w:r>
-      <w:r>
-        <w:t xml:space="preserve"> the pause and go to transmit, use this option. It can also be done by long pressing B0.</w:t>
-      </w:r>
-    </w:p>
-    <w:p>
-      <w:pPr>
-        <w:pStyle w:val="Heading2"/>
-      </w:pPr>
-      <w:r>
-        <w:t>+Saved Settings Files</w:t>
-      </w:r>
-    </w:p>
-    <w:p>
-      <w:r>
-        <w:t>Saved settings files are named files stored on the SD card. They are useful to</w:t>
-      </w:r>
-      <w:r>
-        <w:t xml:space="preserve"> quickly configure the radio for different uses. All values except the battery calibration are affected.</w:t>
-      </w:r>
-    </w:p>
-    <w:p>
-      <w:pPr>
-        <w:pStyle w:val="Heading3"/>
-      </w:pPr>
-      <w:r>
-        <w:lastRenderedPageBreak/>
-        <w:t>Create File</w:t>
-      </w:r>
-    </w:p>
-    <w:p>
-      <w:r>
-        <w:t>This prompts the user for a name. The file is then created using the current system settings.</w:t>
-      </w:r>
-    </w:p>
-    <w:p>
-      <w:pPr>
-        <w:pStyle w:val="Heading3"/>
-      </w:pPr>
-      <w:r>
-        <w:t>Save/Update File</w:t>
-      </w:r>
-    </w:p>
-    <w:p>
-      <w:r>
-        <w:t xml:space="preserve">This command saves the current settings into the selected file. If it already </w:t>
-      </w:r>
-      <w:proofErr w:type="gramStart"/>
-      <w:r>
-        <w:t>exists</w:t>
-      </w:r>
-      <w:proofErr w:type="gramEnd"/>
-      <w:r>
-        <w:t xml:space="preserve"> the user will be asked to confirm overwriting the file.</w:t>
-      </w:r>
-    </w:p>
-    <w:p>
-      <w:pPr>
-        <w:pStyle w:val="Heading3"/>
-      </w:pPr>
-      <w:r>
-        <w:t>Load File</w:t>
-      </w:r>
-    </w:p>
-    <w:p>
-      <w:r>
-        <w:t xml:space="preserve">This command asks the user for the name and then sets </w:t>
-      </w:r>
-      <w:proofErr w:type="gramStart"/>
-      <w:r>
-        <w:t>all of</w:t>
-      </w:r>
-      <w:proofErr w:type="gramEnd"/>
-      <w:r>
-        <w:t xml:space="preserve"> the system settings except the battery calibration using the values in the file.</w:t>
-      </w:r>
-    </w:p>
-    <w:p>
-      <w:pPr>
-        <w:pStyle w:val="Heading3"/>
-      </w:pPr>
-      <w:r>
-        <w:t>Delete File</w:t>
-      </w:r>
-    </w:p>
-    <w:p>
-      <w:r>
-        <w:t>The user selects a file from the list and then it can be deleted.</w:t>
-      </w:r>
-    </w:p>
-    <w:p>
-      <w:pPr>
-        <w:pStyle w:val="Heading2"/>
-      </w:pPr>
-      <w:r>
-        <w:t>+System Settings</w:t>
-      </w:r>
-    </w:p>
-    <w:p>
-      <w:pPr>
-        <w:pStyle w:val="Heading3"/>
-      </w:pPr>
-      <w:r>
-        <w:t>+Display</w:t>
-      </w:r>
-      <w:r>
-        <w:t xml:space="preserve"> Settings</w:t>
-      </w:r>
-    </w:p>
-    <w:p>
-      <w:pPr>
-        <w:pStyle w:val="Heading4"/>
-      </w:pPr>
-      <w:r>
-        <w:t xml:space="preserve">Dimming Mode: </w:t>
-      </w:r>
-      <w:proofErr w:type="spellStart"/>
-      <w:r>
-        <w:t>None</w:t>
-      </w:r>
-      <w:r>
-        <w:t>|Timer</w:t>
-      </w:r>
-      <w:proofErr w:type="spellEnd"/>
-    </w:p>
-    <w:p>
-      <w:r>
-        <w:t xml:space="preserve">The display can be set to dim automatically after a specified number of seconds. This is used to save battery power since the backlight </w:t>
-      </w:r>
-      <w:r>
-        <w:t>uses a significant amount.</w:t>
-      </w:r>
-    </w:p>
-    <w:p>
-      <w:pPr>
-        <w:pStyle w:val="Heading4"/>
-      </w:pPr>
-      <w:r>
-        <w:t>Bright Value: 1-100</w:t>
-      </w:r>
-      <w:r>
-        <w:t>%</w:t>
-      </w:r>
-    </w:p>
-    <w:p>
-      <w:r>
-        <w:t>Set the display brightness value.</w:t>
-      </w:r>
-    </w:p>
-    <w:p>
-      <w:pPr>
-        <w:pStyle w:val="Heading4"/>
-      </w:pPr>
-      <w:r>
-        <w:t xml:space="preserve">Dim Value: </w:t>
-      </w:r>
-      <w:r>
-        <w:t>0-100%</w:t>
-      </w:r>
-    </w:p>
-    <w:p>
-      <w:r>
-        <w:t xml:space="preserve">Set the display brightness after the </w:t>
-      </w:r>
-      <w:r>
-        <w:t>timer below expires.</w:t>
-      </w:r>
-    </w:p>
-    <w:p>
-      <w:pPr>
-        <w:pStyle w:val="Heading4"/>
-      </w:pPr>
-      <w:r>
-        <w:t>Display Dim Time:</w:t>
-      </w:r>
-      <w:r>
-        <w:t xml:space="preserve"> 0-120 S</w:t>
-      </w:r>
-    </w:p>
-    <w:p>
-      <w:r>
-        <w:t>Specify the time until the display changes to dim mode.</w:t>
-      </w:r>
-    </w:p>
-    <w:p>
-      <w:pPr>
-        <w:pStyle w:val="Heading4"/>
-      </w:pPr>
-      <w:r>
-        <w:t>+Sideways Scroll Settings</w:t>
-      </w:r>
-    </w:p>
-    <w:p>
-      <w:r>
-        <w:t xml:space="preserve">Lines of text that </w:t>
-      </w:r>
-      <w:proofErr w:type="gramStart"/>
-      <w:r>
-        <w:t>too</w:t>
-      </w:r>
-      <w:proofErr w:type="gramEnd"/>
-      <w:r>
-        <w:t xml:space="preserve"> long for the display will scroll back and forth. The following settings control the speed.</w:t>
-      </w:r>
-    </w:p>
-    <w:p>
-      <w:pPr>
-        <w:pStyle w:val="Heading5"/>
-      </w:pPr>
-      <w:r>
-        <w:t xml:space="preserve">Speed: </w:t>
-      </w:r>
-      <w:r>
-        <w:t>1-1000 mS</w:t>
-      </w:r>
-    </w:p>
-    <w:p>
-      <w:r>
-        <w:t>Controls the speed of text moving to the left.</w:t>
-      </w:r>
-    </w:p>
-    <w:p>
-      <w:pPr>
-        <w:pStyle w:val="Heading5"/>
-      </w:pPr>
-      <w:r>
-        <w:lastRenderedPageBreak/>
-        <w:t>Pause: 1-100</w:t>
-      </w:r>
-      <w:r>
-        <w:t xml:space="preserve"> mS</w:t>
-      </w:r>
-    </w:p>
-    <w:p>
-      <w:r>
-        <w:t>This controls the pause when the text is at the end (all the way to the left).</w:t>
-      </w:r>
-    </w:p>
-    <w:p>
-      <w:pPr>
-        <w:pStyle w:val="Heading5"/>
-      </w:pPr>
-      <w:r>
-        <w:t>Reverse Speed: 1-20x</w:t>
-      </w:r>
-    </w:p>
-    <w:p>
-      <w:r>
-        <w:t xml:space="preserve">This is how fast the text scrolls </w:t>
-      </w:r>
-      <w:r>
-        <w:t>back to the beginning (to the right). 2x means twice as fast as the text scroll</w:t>
+        <w:t xml:space="preserve"> means twice as fast as the text scroll</w:t>
       </w:r>
       <w:r>
         <w:t>ed to the left</w:t>
@@ -3370,10 +4110,18 @@
     </w:p>
     <w:p>
       <w:r>
-        <w:t xml:space="preserve">Since the PCB was designed with 10% resistors for measuring the battery voltage some calibration is needed. A future PCB will probably use better </w:t>
+        <w:t xml:space="preserve">Since the PCB </w:t>
       </w:r>
       <w:proofErr w:type="gramStart"/>
       <w:r>
+        <w:t>was designed</w:t>
+      </w:r>
+      <w:proofErr w:type="gramEnd"/>
+      <w:r>
+        <w:t xml:space="preserve"> with 10% resistors for measuring the battery voltage some calibration is needed. A future PCB will probably use better </w:t>
+      </w:r>
+      <w:proofErr w:type="gramStart"/>
+      <w:r>
         <w:t>resistors</w:t>
       </w:r>
       <w:proofErr w:type="gramEnd"/>
@@ -3425,7 +4173,15 @@
     </w:p>
     <w:p>
       <w:r>
-        <w:t>This selection reads the current battery values and stores it. It is best set by fully charging the battery and then disconnecting the charger. Wait a couple of minutes and then use it several times until it seems stable.</w:t>
+        <w:t xml:space="preserve">This selection reads the current battery values and stores it. It is best set by fully charging the battery and then disconnecting the charger. Wait a couple of minutes and then use it </w:t>
+      </w:r>
+      <w:proofErr w:type="gramStart"/>
+      <w:r>
+        <w:t>several</w:t>
+      </w:r>
+      <w:proofErr w:type="gramEnd"/>
+      <w:r>
+        <w:t xml:space="preserve"> times until it seems stable.</w:t>
       </w:r>
     </w:p>
     <w:p>
@@ -3463,10 +4219,26 @@
     </w:p>
     <w:p>
       <w:r>
-        <w:t xml:space="preserve">New firmware can be loaded by putting </w:t>
-      </w:r>
-      <w:r>
-        <w:t xml:space="preserve">the binary file on the SD card. It must be named </w:t>
+        <w:t xml:space="preserve">New firmware can </w:t>
+      </w:r>
+      <w:proofErr w:type="gramStart"/>
+      <w:r>
+        <w:t>be loaded</w:t>
+      </w:r>
+      <w:proofErr w:type="gramEnd"/>
+      <w:r>
+        <w:t xml:space="preserve"> by putting </w:t>
+      </w:r>
+      <w:r>
+        <w:t xml:space="preserve">the binary file on the SD card. It must </w:t>
+      </w:r>
+      <w:proofErr w:type="gramStart"/>
+      <w:r>
+        <w:t>be named</w:t>
+      </w:r>
+      <w:proofErr w:type="gramEnd"/>
+      <w:r>
+        <w:t xml:space="preserve"> </w:t>
       </w:r>
       <w:proofErr w:type="spellStart"/>
       <w:r>
@@ -3504,6 +4276,17 @@
       <w:r>
         <w:t xml:space="preserve"> except the high battery value to the original factory values.</w:t>
       </w:r>
+      <w:r>
+        <w:t xml:space="preserve"> The factory reset can also </w:t>
+      </w:r>
+      <w:proofErr w:type="gramStart"/>
+      <w:r>
+        <w:t>be done</w:t>
+      </w:r>
+      <w:proofErr w:type="gramEnd"/>
+      <w:r>
+        <w:t xml:space="preserve"> by holding the dial button down while turning the power on.</w:t>
+      </w:r>
     </w:p>
     <w:p>
       <w:pPr>
@@ -3537,7 +4320,15 @@
       </w:r>
       <w:proofErr w:type="gramEnd"/>
       <w:r>
-        <w:t xml:space="preserve"> in non-volatile memory. This is how settings are saved while the system is not powered.</w:t>
+        <w:t xml:space="preserve"> in non-volatile memory. This is how settings </w:t>
+      </w:r>
+      <w:proofErr w:type="gramStart"/>
+      <w:r>
+        <w:t>are saved</w:t>
+      </w:r>
+      <w:proofErr w:type="gramEnd"/>
+      <w:r>
+        <w:t xml:space="preserve"> while the system is not powered.</w:t>
       </w:r>
     </w:p>
     <w:p>
@@ -3561,7 +4352,15 @@
         <w:t xml:space="preserve"> the current settings in the non-volatile memory</w:t>
       </w:r>
       <w:r>
-        <w:t>. Note that this is not often used since settings are normally saved each time they are changed.</w:t>
+        <w:t xml:space="preserve">. Note that this </w:t>
+      </w:r>
+      <w:proofErr w:type="gramStart"/>
+      <w:r>
+        <w:t>is not often used</w:t>
+      </w:r>
+      <w:proofErr w:type="gramEnd"/>
+      <w:r>
+        <w:t xml:space="preserve"> since settings are normally saved each time they are changed.</w:t>
       </w:r>
     </w:p>
     <w:p>
@@ -3574,7 +4373,23 @@
     </w:p>
     <w:p>
       <w:r>
-        <w:t>This causes the system to reboot. It will wait 2 seconds first. If you press the dial during the reboot factory settings will be restored. Note that the battery full settings will not be reset.</w:t>
+        <w:t xml:space="preserve">This causes the system to reboot. It will wait 2 seconds first. If you press the dial during the reboot factory settings will </w:t>
+      </w:r>
+      <w:proofErr w:type="gramStart"/>
+      <w:r>
+        <w:t>be restored</w:t>
+      </w:r>
+      <w:proofErr w:type="gramEnd"/>
+      <w:r>
+        <w:t xml:space="preserve">. Note that the battery full settings will not </w:t>
+      </w:r>
+      <w:proofErr w:type="gramStart"/>
+      <w:r>
+        <w:t>be reset</w:t>
+      </w:r>
+      <w:proofErr w:type="gramEnd"/>
+      <w:r>
+        <w:t>.</w:t>
       </w:r>
     </w:p>
     <w:sectPr>
@@ -3623,7 +4438,6 @@
         <w:docPartUnique/>
       </w:docPartObj>
     </w:sdtPr>
-    <w:sdtEndPr/>
     <w:sdtContent>
       <w:sdt>
         <w:sdtPr>
@@ -3633,7 +4447,6 @@
             <w:docPartUnique/>
           </w:docPartObj>
         </w:sdtPr>
-        <w:sdtEndPr/>
         <w:sdtContent>
           <w:p>
             <w:pPr>
@@ -10498,6 +11311,118 @@
     </w:lvl>
   </w:abstractNum>
   <w:abstractNum w:abstractNumId="60" w15:restartNumberingAfterBreak="0">
+    <w:nsid w:val="47746E93"/>
+    <w:multiLevelType w:val="hybridMultilevel"/>
+    <w:tmpl w:val="2B721A4A"/>
+    <w:lvl w:ilvl="0" w:tplc="6ADAC7C4">
+      <w:numFmt w:val="bullet"/>
+      <w:lvlText w:val="-"/>
+      <w:lvlJc w:val="left"/>
+      <w:pPr>
+        <w:ind w:left="720" w:hanging="360"/>
+      </w:pPr>
+      <w:rPr>
+        <w:rFonts w:ascii="Arial" w:eastAsia="Arial" w:hAnsi="Arial" w:cs="Arial" w:hint="default"/>
+      </w:rPr>
+    </w:lvl>
+    <w:lvl w:ilvl="1" w:tplc="04090003" w:tentative="1">
+      <w:start w:val="1"/>
+      <w:numFmt w:val="bullet"/>
+      <w:lvlText w:val="o"/>
+      <w:lvlJc w:val="left"/>
+      <w:pPr>
+        <w:ind w:left="1440" w:hanging="360"/>
+      </w:pPr>
+      <w:rPr>
+        <w:rFonts w:ascii="Courier New" w:hAnsi="Courier New" w:cs="Courier New" w:hint="default"/>
+      </w:rPr>
+    </w:lvl>
+    <w:lvl w:ilvl="2" w:tplc="04090005" w:tentative="1">
+      <w:start w:val="1"/>
+      <w:numFmt w:val="bullet"/>
+      <w:lvlText w:val=""/>
+      <w:lvlJc w:val="left"/>
+      <w:pPr>
+        <w:ind w:left="2160" w:hanging="360"/>
+      </w:pPr>
+      <w:rPr>
+        <w:rFonts w:ascii="Wingdings" w:hAnsi="Wingdings" w:hint="default"/>
+      </w:rPr>
+    </w:lvl>
+    <w:lvl w:ilvl="3" w:tplc="04090001" w:tentative="1">
+      <w:start w:val="1"/>
+      <w:numFmt w:val="bullet"/>
+      <w:lvlText w:val=""/>
+      <w:lvlJc w:val="left"/>
+      <w:pPr>
+        <w:ind w:left="2880" w:hanging="360"/>
+      </w:pPr>
+      <w:rPr>
+        <w:rFonts w:ascii="Symbol" w:hAnsi="Symbol" w:hint="default"/>
+      </w:rPr>
+    </w:lvl>
+    <w:lvl w:ilvl="4" w:tplc="04090003" w:tentative="1">
+      <w:start w:val="1"/>
+      <w:numFmt w:val="bullet"/>
+      <w:lvlText w:val="o"/>
+      <w:lvlJc w:val="left"/>
+      <w:pPr>
+        <w:ind w:left="3600" w:hanging="360"/>
+      </w:pPr>
+      <w:rPr>
+        <w:rFonts w:ascii="Courier New" w:hAnsi="Courier New" w:cs="Courier New" w:hint="default"/>
+      </w:rPr>
+    </w:lvl>
+    <w:lvl w:ilvl="5" w:tplc="04090005" w:tentative="1">
+      <w:start w:val="1"/>
+      <w:numFmt w:val="bullet"/>
+      <w:lvlText w:val=""/>
+      <w:lvlJc w:val="left"/>
+      <w:pPr>
+        <w:ind w:left="4320" w:hanging="360"/>
+      </w:pPr>
+      <w:rPr>
+        <w:rFonts w:ascii="Wingdings" w:hAnsi="Wingdings" w:hint="default"/>
+      </w:rPr>
+    </w:lvl>
+    <w:lvl w:ilvl="6" w:tplc="04090001" w:tentative="1">
+      <w:start w:val="1"/>
+      <w:numFmt w:val="bullet"/>
+      <w:lvlText w:val=""/>
+      <w:lvlJc w:val="left"/>
+      <w:pPr>
+        <w:ind w:left="5040" w:hanging="360"/>
+      </w:pPr>
+      <w:rPr>
+        <w:rFonts w:ascii="Symbol" w:hAnsi="Symbol" w:hint="default"/>
+      </w:rPr>
+    </w:lvl>
+    <w:lvl w:ilvl="7" w:tplc="04090003" w:tentative="1">
+      <w:start w:val="1"/>
+      <w:numFmt w:val="bullet"/>
+      <w:lvlText w:val="o"/>
+      <w:lvlJc w:val="left"/>
+      <w:pPr>
+        <w:ind w:left="5760" w:hanging="360"/>
+      </w:pPr>
+      <w:rPr>
+        <w:rFonts w:ascii="Courier New" w:hAnsi="Courier New" w:cs="Courier New" w:hint="default"/>
+      </w:rPr>
+    </w:lvl>
+    <w:lvl w:ilvl="8" w:tplc="04090005" w:tentative="1">
+      <w:start w:val="1"/>
+      <w:numFmt w:val="bullet"/>
+      <w:lvlText w:val=""/>
+      <w:lvlJc w:val="left"/>
+      <w:pPr>
+        <w:ind w:left="6480" w:hanging="360"/>
+      </w:pPr>
+      <w:rPr>
+        <w:rFonts w:ascii="Wingdings" w:hAnsi="Wingdings" w:hint="default"/>
+      </w:rPr>
+    </w:lvl>
+  </w:abstractNum>
+  <w:abstractNum w:abstractNumId="61" w15:restartNumberingAfterBreak="0">
     <w:nsid w:val="483D056B"/>
     <w:multiLevelType w:val="hybridMultilevel"/>
     <w:tmpl w:val="C4DCE034"/>
@@ -10609,7 +11534,7 @@
       </w:rPr>
     </w:lvl>
   </w:abstractNum>
-  <w:abstractNum w:abstractNumId="61" w15:restartNumberingAfterBreak="0">
+  <w:abstractNum w:abstractNumId="62" w15:restartNumberingAfterBreak="0">
     <w:nsid w:val="48813A05"/>
     <w:multiLevelType w:val="hybridMultilevel"/>
     <w:tmpl w:val="42CAA4CE"/>
@@ -10722,7 +11647,7 @@
       </w:rPr>
     </w:lvl>
   </w:abstractNum>
-  <w:abstractNum w:abstractNumId="62" w15:restartNumberingAfterBreak="0">
+  <w:abstractNum w:abstractNumId="63" w15:restartNumberingAfterBreak="0">
     <w:nsid w:val="4A3C29DC"/>
     <w:multiLevelType w:val="hybridMultilevel"/>
     <w:tmpl w:val="29F4D392"/>
@@ -10834,7 +11759,7 @@
       </w:rPr>
     </w:lvl>
   </w:abstractNum>
-  <w:abstractNum w:abstractNumId="63" w15:restartNumberingAfterBreak="0">
+  <w:abstractNum w:abstractNumId="64" w15:restartNumberingAfterBreak="0">
     <w:nsid w:val="4A9B6FB7"/>
     <w:multiLevelType w:val="hybridMultilevel"/>
     <w:tmpl w:val="C47ECA54"/>
@@ -10946,7 +11871,7 @@
       </w:rPr>
     </w:lvl>
   </w:abstractNum>
-  <w:abstractNum w:abstractNumId="64" w15:restartNumberingAfterBreak="0">
+  <w:abstractNum w:abstractNumId="65" w15:restartNumberingAfterBreak="0">
     <w:nsid w:val="4C2207ED"/>
     <w:multiLevelType w:val="hybridMultilevel"/>
     <w:tmpl w:val="E95272B2"/>
@@ -11058,7 +11983,7 @@
       </w:rPr>
     </w:lvl>
   </w:abstractNum>
-  <w:abstractNum w:abstractNumId="65" w15:restartNumberingAfterBreak="0">
+  <w:abstractNum w:abstractNumId="66" w15:restartNumberingAfterBreak="0">
     <w:nsid w:val="4C687CB3"/>
     <w:multiLevelType w:val="hybridMultilevel"/>
     <w:tmpl w:val="0D781E22"/>
@@ -11170,7 +12095,7 @@
       </w:rPr>
     </w:lvl>
   </w:abstractNum>
-  <w:abstractNum w:abstractNumId="66" w15:restartNumberingAfterBreak="0">
+  <w:abstractNum w:abstractNumId="67" w15:restartNumberingAfterBreak="0">
     <w:nsid w:val="4FCE4725"/>
     <w:multiLevelType w:val="hybridMultilevel"/>
     <w:tmpl w:val="914EE3B4"/>
@@ -11282,7 +12207,7 @@
       </w:rPr>
     </w:lvl>
   </w:abstractNum>
-  <w:abstractNum w:abstractNumId="67" w15:restartNumberingAfterBreak="0">
+  <w:abstractNum w:abstractNumId="68" w15:restartNumberingAfterBreak="0">
     <w:nsid w:val="51CE085C"/>
     <w:multiLevelType w:val="hybridMultilevel"/>
     <w:tmpl w:val="84788A08"/>
@@ -11394,7 +12319,7 @@
       </w:rPr>
     </w:lvl>
   </w:abstractNum>
-  <w:abstractNum w:abstractNumId="68" w15:restartNumberingAfterBreak="0">
+  <w:abstractNum w:abstractNumId="69" w15:restartNumberingAfterBreak="0">
     <w:nsid w:val="52944BD2"/>
     <w:multiLevelType w:val="hybridMultilevel"/>
     <w:tmpl w:val="BC3489E0"/>
@@ -11506,7 +12431,7 @@
       </w:rPr>
     </w:lvl>
   </w:abstractNum>
-  <w:abstractNum w:abstractNumId="69" w15:restartNumberingAfterBreak="0">
+  <w:abstractNum w:abstractNumId="70" w15:restartNumberingAfterBreak="0">
     <w:nsid w:val="565E12F2"/>
     <w:multiLevelType w:val="hybridMultilevel"/>
     <w:tmpl w:val="9E96747C"/>
@@ -11618,7 +12543,7 @@
       </w:rPr>
     </w:lvl>
   </w:abstractNum>
-  <w:abstractNum w:abstractNumId="70" w15:restartNumberingAfterBreak="0">
+  <w:abstractNum w:abstractNumId="71" w15:restartNumberingAfterBreak="0">
     <w:nsid w:val="57466407"/>
     <w:multiLevelType w:val="hybridMultilevel"/>
     <w:tmpl w:val="0F9ADCF4"/>
@@ -11730,7 +12655,7 @@
       </w:rPr>
     </w:lvl>
   </w:abstractNum>
-  <w:abstractNum w:abstractNumId="71" w15:restartNumberingAfterBreak="0">
+  <w:abstractNum w:abstractNumId="72" w15:restartNumberingAfterBreak="0">
     <w:nsid w:val="5ABE68FB"/>
     <w:multiLevelType w:val="hybridMultilevel"/>
     <w:tmpl w:val="B422F472"/>
@@ -11842,7 +12767,7 @@
       </w:rPr>
     </w:lvl>
   </w:abstractNum>
-  <w:abstractNum w:abstractNumId="72" w15:restartNumberingAfterBreak="0">
+  <w:abstractNum w:abstractNumId="73" w15:restartNumberingAfterBreak="0">
     <w:nsid w:val="5BA928F1"/>
     <w:multiLevelType w:val="hybridMultilevel"/>
     <w:tmpl w:val="4D4E1798"/>
@@ -11954,7 +12879,7 @@
       </w:rPr>
     </w:lvl>
   </w:abstractNum>
-  <w:abstractNum w:abstractNumId="73" w15:restartNumberingAfterBreak="0">
+  <w:abstractNum w:abstractNumId="74" w15:restartNumberingAfterBreak="0">
     <w:nsid w:val="5C834FA4"/>
     <w:multiLevelType w:val="hybridMultilevel"/>
     <w:tmpl w:val="1FC415FC"/>
@@ -12066,7 +12991,7 @@
       </w:rPr>
     </w:lvl>
   </w:abstractNum>
-  <w:abstractNum w:abstractNumId="74" w15:restartNumberingAfterBreak="0">
+  <w:abstractNum w:abstractNumId="75" w15:restartNumberingAfterBreak="0">
     <w:nsid w:val="5F3C3936"/>
     <w:multiLevelType w:val="hybridMultilevel"/>
     <w:tmpl w:val="917CC46E"/>
@@ -12178,7 +13103,7 @@
       </w:rPr>
     </w:lvl>
   </w:abstractNum>
-  <w:abstractNum w:abstractNumId="75" w15:restartNumberingAfterBreak="0">
+  <w:abstractNum w:abstractNumId="76" w15:restartNumberingAfterBreak="0">
     <w:nsid w:val="60544E94"/>
     <w:multiLevelType w:val="hybridMultilevel"/>
     <w:tmpl w:val="CBCAC042"/>
@@ -12290,7 +13215,7 @@
       </w:rPr>
     </w:lvl>
   </w:abstractNum>
-  <w:abstractNum w:abstractNumId="76" w15:restartNumberingAfterBreak="0">
+  <w:abstractNum w:abstractNumId="77" w15:restartNumberingAfterBreak="0">
     <w:nsid w:val="62D1418B"/>
     <w:multiLevelType w:val="multilevel"/>
     <w:tmpl w:val="3E58308A"/>
@@ -12389,7 +13314,7 @@
       </w:pPr>
     </w:lvl>
   </w:abstractNum>
-  <w:abstractNum w:abstractNumId="77" w15:restartNumberingAfterBreak="0">
+  <w:abstractNum w:abstractNumId="78" w15:restartNumberingAfterBreak="0">
     <w:nsid w:val="62E52923"/>
     <w:multiLevelType w:val="hybridMultilevel"/>
     <w:tmpl w:val="7668165A"/>
@@ -12501,7 +13426,7 @@
       </w:rPr>
     </w:lvl>
   </w:abstractNum>
-  <w:abstractNum w:abstractNumId="78" w15:restartNumberingAfterBreak="0">
+  <w:abstractNum w:abstractNumId="79" w15:restartNumberingAfterBreak="0">
     <w:nsid w:val="63935A88"/>
     <w:multiLevelType w:val="hybridMultilevel"/>
     <w:tmpl w:val="0F5805EA"/>
@@ -12613,7 +13538,7 @@
       </w:rPr>
     </w:lvl>
   </w:abstractNum>
-  <w:abstractNum w:abstractNumId="79" w15:restartNumberingAfterBreak="0">
+  <w:abstractNum w:abstractNumId="80" w15:restartNumberingAfterBreak="0">
     <w:nsid w:val="69496F08"/>
     <w:multiLevelType w:val="hybridMultilevel"/>
     <w:tmpl w:val="6EE839E4"/>
@@ -12725,7 +13650,7 @@
       </w:rPr>
     </w:lvl>
   </w:abstractNum>
-  <w:abstractNum w:abstractNumId="80" w15:restartNumberingAfterBreak="0">
+  <w:abstractNum w:abstractNumId="81" w15:restartNumberingAfterBreak="0">
     <w:nsid w:val="6ACC6C5E"/>
     <w:multiLevelType w:val="multilevel"/>
     <w:tmpl w:val="4AB8E1DA"/>
@@ -12838,7 +13763,7 @@
       </w:rPr>
     </w:lvl>
   </w:abstractNum>
-  <w:abstractNum w:abstractNumId="81" w15:restartNumberingAfterBreak="0">
+  <w:abstractNum w:abstractNumId="82" w15:restartNumberingAfterBreak="0">
     <w:nsid w:val="6D7319F8"/>
     <w:multiLevelType w:val="hybridMultilevel"/>
     <w:tmpl w:val="A7EEE4A4"/>
@@ -12950,7 +13875,7 @@
       </w:rPr>
     </w:lvl>
   </w:abstractNum>
-  <w:abstractNum w:abstractNumId="82" w15:restartNumberingAfterBreak="0">
+  <w:abstractNum w:abstractNumId="83" w15:restartNumberingAfterBreak="0">
     <w:nsid w:val="6D94244E"/>
     <w:multiLevelType w:val="hybridMultilevel"/>
     <w:tmpl w:val="D38C1A3A"/>
@@ -13062,7 +13987,7 @@
       </w:rPr>
     </w:lvl>
   </w:abstractNum>
-  <w:abstractNum w:abstractNumId="83" w15:restartNumberingAfterBreak="0">
+  <w:abstractNum w:abstractNumId="84" w15:restartNumberingAfterBreak="0">
     <w:nsid w:val="6DEA09BD"/>
     <w:multiLevelType w:val="hybridMultilevel"/>
     <w:tmpl w:val="029A123E"/>
@@ -13174,7 +14099,7 @@
       </w:rPr>
     </w:lvl>
   </w:abstractNum>
-  <w:abstractNum w:abstractNumId="84" w15:restartNumberingAfterBreak="0">
+  <w:abstractNum w:abstractNumId="85" w15:restartNumberingAfterBreak="0">
     <w:nsid w:val="6E310D77"/>
     <w:multiLevelType w:val="hybridMultilevel"/>
     <w:tmpl w:val="9C74834E"/>
@@ -13287,7 +14212,7 @@
       </w:rPr>
     </w:lvl>
   </w:abstractNum>
-  <w:abstractNum w:abstractNumId="85" w15:restartNumberingAfterBreak="0">
+  <w:abstractNum w:abstractNumId="86" w15:restartNumberingAfterBreak="0">
     <w:nsid w:val="74D85371"/>
     <w:multiLevelType w:val="hybridMultilevel"/>
     <w:tmpl w:val="B20E36AC"/>
@@ -13399,7 +14324,7 @@
       </w:rPr>
     </w:lvl>
   </w:abstractNum>
-  <w:abstractNum w:abstractNumId="86" w15:restartNumberingAfterBreak="0">
+  <w:abstractNum w:abstractNumId="87" w15:restartNumberingAfterBreak="0">
     <w:nsid w:val="75FA3747"/>
     <w:multiLevelType w:val="hybridMultilevel"/>
     <w:tmpl w:val="B9F43A9E"/>
@@ -13511,7 +14436,7 @@
       </w:rPr>
     </w:lvl>
   </w:abstractNum>
-  <w:abstractNum w:abstractNumId="87" w15:restartNumberingAfterBreak="0">
+  <w:abstractNum w:abstractNumId="88" w15:restartNumberingAfterBreak="0">
     <w:nsid w:val="7877407A"/>
     <w:multiLevelType w:val="hybridMultilevel"/>
     <w:tmpl w:val="C91E38FA"/>
@@ -13623,7 +14548,7 @@
       </w:rPr>
     </w:lvl>
   </w:abstractNum>
-  <w:abstractNum w:abstractNumId="88" w15:restartNumberingAfterBreak="0">
+  <w:abstractNum w:abstractNumId="89" w15:restartNumberingAfterBreak="0">
     <w:nsid w:val="78A40DC3"/>
     <w:multiLevelType w:val="hybridMultilevel"/>
     <w:tmpl w:val="F1E6B4B6"/>
@@ -13735,7 +14660,7 @@
       </w:rPr>
     </w:lvl>
   </w:abstractNum>
-  <w:abstractNum w:abstractNumId="89" w15:restartNumberingAfterBreak="0">
+  <w:abstractNum w:abstractNumId="90" w15:restartNumberingAfterBreak="0">
     <w:nsid w:val="79587B7C"/>
     <w:multiLevelType w:val="hybridMultilevel"/>
     <w:tmpl w:val="6A46933A"/>
@@ -13847,7 +14772,7 @@
       </w:rPr>
     </w:lvl>
   </w:abstractNum>
-  <w:abstractNum w:abstractNumId="90" w15:restartNumberingAfterBreak="0">
+  <w:abstractNum w:abstractNumId="91" w15:restartNumberingAfterBreak="0">
     <w:nsid w:val="7BB23699"/>
     <w:multiLevelType w:val="hybridMultilevel"/>
     <w:tmpl w:val="26C25814"/>
@@ -13959,7 +14884,7 @@
       </w:rPr>
     </w:lvl>
   </w:abstractNum>
-  <w:abstractNum w:abstractNumId="91" w15:restartNumberingAfterBreak="0">
+  <w:abstractNum w:abstractNumId="92" w15:restartNumberingAfterBreak="0">
     <w:nsid w:val="7F827ECF"/>
     <w:multiLevelType w:val="hybridMultilevel"/>
     <w:tmpl w:val="42DE9398"/>
@@ -14072,7 +14997,7 @@
     </w:lvl>
   </w:abstractNum>
   <w:num w:numId="1" w16cid:durableId="553472407">
-    <w:abstractNumId w:val="80"/>
+    <w:abstractNumId w:val="81"/>
   </w:num>
   <w:num w:numId="2" w16cid:durableId="1531718695">
     <w:abstractNumId w:val="16"/>
@@ -14087,16 +15012,16 @@
     <w:abstractNumId w:val="29"/>
   </w:num>
   <w:num w:numId="6" w16cid:durableId="915629572">
-    <w:abstractNumId w:val="76"/>
+    <w:abstractNumId w:val="77"/>
   </w:num>
   <w:num w:numId="7" w16cid:durableId="693576224">
-    <w:abstractNumId w:val="89"/>
+    <w:abstractNumId w:val="90"/>
   </w:num>
   <w:num w:numId="8" w16cid:durableId="1298343021">
-    <w:abstractNumId w:val="84"/>
+    <w:abstractNumId w:val="85"/>
   </w:num>
   <w:num w:numId="9" w16cid:durableId="367219526">
-    <w:abstractNumId w:val="82"/>
+    <w:abstractNumId w:val="83"/>
   </w:num>
   <w:num w:numId="10" w16cid:durableId="1497187389">
     <w:abstractNumId w:val="18"/>
@@ -14117,13 +15042,13 @@
     <w:abstractNumId w:val="5"/>
   </w:num>
   <w:num w:numId="16" w16cid:durableId="1421751508">
-    <w:abstractNumId w:val="91"/>
+    <w:abstractNumId w:val="92"/>
   </w:num>
   <w:num w:numId="17" w16cid:durableId="1009716389">
-    <w:abstractNumId w:val="61"/>
+    <w:abstractNumId w:val="62"/>
   </w:num>
   <w:num w:numId="18" w16cid:durableId="300229387">
-    <w:abstractNumId w:val="67"/>
+    <w:abstractNumId w:val="68"/>
   </w:num>
   <w:num w:numId="19" w16cid:durableId="1025836216">
     <w:abstractNumId w:val="49"/>
@@ -14135,13 +15060,13 @@
     <w:abstractNumId w:val="38"/>
   </w:num>
   <w:num w:numId="22" w16cid:durableId="177355694">
-    <w:abstractNumId w:val="74"/>
+    <w:abstractNumId w:val="75"/>
   </w:num>
   <w:num w:numId="23" w16cid:durableId="6762404">
     <w:abstractNumId w:val="58"/>
   </w:num>
   <w:num w:numId="24" w16cid:durableId="1492133217">
-    <w:abstractNumId w:val="64"/>
+    <w:abstractNumId w:val="65"/>
   </w:num>
   <w:num w:numId="25" w16cid:durableId="695159279">
     <w:abstractNumId w:val="27"/>
@@ -14153,16 +15078,16 @@
     <w:abstractNumId w:val="41"/>
   </w:num>
   <w:num w:numId="28" w16cid:durableId="1082484344">
-    <w:abstractNumId w:val="60"/>
+    <w:abstractNumId w:val="61"/>
   </w:num>
   <w:num w:numId="29" w16cid:durableId="467865549">
-    <w:abstractNumId w:val="65"/>
+    <w:abstractNumId w:val="66"/>
   </w:num>
   <w:num w:numId="30" w16cid:durableId="1656108771">
     <w:abstractNumId w:val="17"/>
   </w:num>
   <w:num w:numId="31" w16cid:durableId="1611818230">
-    <w:abstractNumId w:val="83"/>
+    <w:abstractNumId w:val="84"/>
   </w:num>
   <w:num w:numId="32" w16cid:durableId="1666009498">
     <w:abstractNumId w:val="10"/>
@@ -14186,37 +15111,37 @@
     <w:abstractNumId w:val="34"/>
   </w:num>
   <w:num w:numId="39" w16cid:durableId="798885554">
-    <w:abstractNumId w:val="90"/>
+    <w:abstractNumId w:val="91"/>
   </w:num>
   <w:num w:numId="40" w16cid:durableId="1610315013">
-    <w:abstractNumId w:val="77"/>
+    <w:abstractNumId w:val="78"/>
   </w:num>
   <w:num w:numId="41" w16cid:durableId="213975163">
     <w:abstractNumId w:val="4"/>
   </w:num>
   <w:num w:numId="42" w16cid:durableId="511454106">
-    <w:abstractNumId w:val="73"/>
+    <w:abstractNumId w:val="74"/>
   </w:num>
   <w:num w:numId="43" w16cid:durableId="1721711403">
     <w:abstractNumId w:val="21"/>
   </w:num>
   <w:num w:numId="44" w16cid:durableId="652369700">
-    <w:abstractNumId w:val="81"/>
+    <w:abstractNumId w:val="82"/>
   </w:num>
   <w:num w:numId="45" w16cid:durableId="227304564">
-    <w:abstractNumId w:val="66"/>
+    <w:abstractNumId w:val="67"/>
   </w:num>
   <w:num w:numId="46" w16cid:durableId="1561091169">
     <w:abstractNumId w:val="31"/>
   </w:num>
   <w:num w:numId="47" w16cid:durableId="734011883">
-    <w:abstractNumId w:val="78"/>
+    <w:abstractNumId w:val="79"/>
   </w:num>
   <w:num w:numId="48" w16cid:durableId="2125267477">
-    <w:abstractNumId w:val="70"/>
+    <w:abstractNumId w:val="71"/>
   </w:num>
   <w:num w:numId="49" w16cid:durableId="1612585929">
-    <w:abstractNumId w:val="69"/>
+    <w:abstractNumId w:val="70"/>
   </w:num>
   <w:num w:numId="50" w16cid:durableId="1628664370">
     <w:abstractNumId w:val="3"/>
@@ -14228,13 +15153,13 @@
     <w:abstractNumId w:val="56"/>
   </w:num>
   <w:num w:numId="53" w16cid:durableId="1740665818">
-    <w:abstractNumId w:val="86"/>
+    <w:abstractNumId w:val="87"/>
   </w:num>
   <w:num w:numId="54" w16cid:durableId="452988921">
-    <w:abstractNumId w:val="87"/>
+    <w:abstractNumId w:val="88"/>
   </w:num>
   <w:num w:numId="55" w16cid:durableId="207304158">
-    <w:abstractNumId w:val="68"/>
+    <w:abstractNumId w:val="69"/>
   </w:num>
   <w:num w:numId="56" w16cid:durableId="2016880598">
     <w:abstractNumId w:val="19"/>
@@ -14249,7 +15174,7 @@
     <w:abstractNumId w:val="48"/>
   </w:num>
   <w:num w:numId="60" w16cid:durableId="2130009061">
-    <w:abstractNumId w:val="71"/>
+    <w:abstractNumId w:val="72"/>
   </w:num>
   <w:num w:numId="61" w16cid:durableId="1293515410">
     <w:abstractNumId w:val="2"/>
@@ -14297,16 +15222,16 @@
     <w:abstractNumId w:val="42"/>
   </w:num>
   <w:num w:numId="76" w16cid:durableId="539049649">
-    <w:abstractNumId w:val="88"/>
+    <w:abstractNumId w:val="89"/>
   </w:num>
   <w:num w:numId="77" w16cid:durableId="1288513951">
-    <w:abstractNumId w:val="62"/>
+    <w:abstractNumId w:val="63"/>
   </w:num>
   <w:num w:numId="78" w16cid:durableId="1532762005">
     <w:abstractNumId w:val="52"/>
   </w:num>
   <w:num w:numId="79" w16cid:durableId="1374647797">
-    <w:abstractNumId w:val="75"/>
+    <w:abstractNumId w:val="76"/>
   </w:num>
   <w:num w:numId="80" w16cid:durableId="1210456390">
     <w:abstractNumId w:val="8"/>
@@ -14315,7 +15240,7 @@
     <w:abstractNumId w:val="35"/>
   </w:num>
   <w:num w:numId="82" w16cid:durableId="500893856">
-    <w:abstractNumId w:val="79"/>
+    <w:abstractNumId w:val="80"/>
   </w:num>
   <w:num w:numId="83" w16cid:durableId="1950622049">
     <w:abstractNumId w:val="57"/>
@@ -14333,19 +15258,22 @@
     <w:abstractNumId w:val="47"/>
   </w:num>
   <w:num w:numId="88" w16cid:durableId="2105687898">
-    <w:abstractNumId w:val="72"/>
+    <w:abstractNumId w:val="73"/>
   </w:num>
   <w:num w:numId="89" w16cid:durableId="363360886">
     <w:abstractNumId w:val="22"/>
   </w:num>
   <w:num w:numId="90" w16cid:durableId="974530531">
-    <w:abstractNumId w:val="63"/>
+    <w:abstractNumId w:val="64"/>
   </w:num>
   <w:num w:numId="91" w16cid:durableId="780148532">
-    <w:abstractNumId w:val="85"/>
+    <w:abstractNumId w:val="86"/>
   </w:num>
   <w:num w:numId="92" w16cid:durableId="304706915">
     <w:abstractNumId w:val="44"/>
+  </w:num>
+  <w:num w:numId="93" w16cid:durableId="1232305665">
+    <w:abstractNumId w:val="60"/>
   </w:num>
   <w:numIdMacAtCleanup w:val="84"/>
 </w:numbering>
@@ -15234,6 +16162,16 @@
     <w:uiPriority w:val="99"/>
     <w:rsid w:val="005A0C24"/>
   </w:style>
+  <w:style w:type="paragraph" w:styleId="Revision">
+    <w:name w:val="Revision"/>
+    <w:hidden/>
+    <w:uiPriority w:val="99"/>
+    <w:semiHidden/>
+    <w:rsid w:val="00774A46"/>
+    <w:pPr>
+      <w:spacing w:line="240" w:lineRule="auto"/>
+    </w:pPr>
+  </w:style>
 </w:styles>
 </file>
 

</xml_diff>

<commit_message>
Added beacon mode to restrict frequency range. #29
</commit_message>
<xml_diff>
--- a/RadioFox.docx
+++ b/RadioFox.docx
@@ -53,15 +53,7 @@
         <w:t>amateur</w:t>
       </w:r>
       <w:r>
-        <w:t xml:space="preserve"> radio enthusiasts (AKA Hams) that is </w:t>
-      </w:r>
-      <w:proofErr w:type="gramStart"/>
-      <w:r>
-        <w:t>know</w:t>
-      </w:r>
-      <w:proofErr w:type="gramEnd"/>
-      <w:r>
-        <w:t xml:space="preserve"> as fox hunting or sometimes as bunny hunting. It is played by hiding a transmitter that transmits periodically and then silent until it is time to transmit again. This cycle repeats. Teams use radio receivers with directional antennas to find the transmitter.</w:t>
+        <w:t xml:space="preserve"> radio enthusiasts (AKA Hams) that is know as fox hunting or sometimes as bunny hunting. It is played by hiding a transmitter that transmits periodically and then silent until it is time to transmit again. This cycle repeats. Teams use radio receivers with directional antennas to find the transmitter.</w:t>
       </w:r>
       <w:r>
         <w:t xml:space="preserve"> The technique is called triangulation. The first team to find the transmitter wins.</w:t>
@@ -82,15 +74,7 @@
         <w:t xml:space="preserve">Many of these radios are homemade using handheld radios and timers. This device is a single PCB (printed circuit board) using an esp32 (Arduino) </w:t>
       </w:r>
       <w:r>
-        <w:t xml:space="preserve">computer with a display. There are two 18650 batteries with charging </w:t>
-      </w:r>
-      <w:proofErr w:type="gramStart"/>
-      <w:r>
-        <w:t>circuit</w:t>
-      </w:r>
-      <w:proofErr w:type="gramEnd"/>
-      <w:r>
-        <w:t xml:space="preserve"> and an SA818 shortwave transceiver module on the PCB. A rotary push button dial is used to set the various parameters for the fox</w:t>
+        <w:t>computer with a display. There are two 18650 batteries with charging circuit and an SA818 shortwave transceiver module on the PCB. A rotary push button dial is used to set the various parameters for the fox</w:t>
       </w:r>
       <w:r>
         <w:t>. These parameters include transmit time, pause time, frequency settings</w:t>
@@ -174,27 +158,68 @@
         <w:pStyle w:val="Heading2"/>
       </w:pPr>
       <w:r>
+        <w:t>Beacon</w:t>
+      </w:r>
+    </w:p>
+    <w:p>
+      <w:r>
+        <w:t>Version 1.0</w:t>
+      </w:r>
+      <w:r>
+        <w:t>6 adds a beacon mode that limits the allowe</w:t>
+      </w:r>
+      <w:r>
+        <w:t>d frequencies.</w:t>
+      </w:r>
+      <w:r>
+        <w:t xml:space="preserve"> The system must be powered by an external power supply connected to the USB C charging port.</w:t>
+      </w:r>
+    </w:p>
+    <w:p>
+      <w:pPr>
+        <w:pStyle w:val="Heading2"/>
+        <w:numPr>
+          <w:ilvl w:val="0"/>
+          <w:numId w:val="0"/>
+        </w:numPr>
+      </w:pPr>
+      <w:r>
         <w:t>Source Code</w:t>
       </w:r>
     </w:p>
     <w:p>
       <w:r>
-        <w:t xml:space="preserve">The firmware is written </w:t>
-      </w:r>
-      <w:r>
-        <w:t>entirely</w:t>
-      </w:r>
-      <w:r>
-        <w:t xml:space="preserve"> in C/C++. </w:t>
-      </w:r>
-      <w:r>
-        <w:t xml:space="preserve">The source code will likely be released, but that has not been totally </w:t>
-      </w:r>
-      <w:r>
-        <w:t>decided</w:t>
-      </w:r>
-      <w:r>
-        <w:t xml:space="preserve"> at this time.</w:t>
+        <w:t>The firmware</w:t>
+      </w:r>
+      <w:r>
+        <w:t xml:space="preserve"> source</w:t>
+      </w:r>
+      <w:r>
+        <w:t xml:space="preserve"> code consists of</w:t>
+      </w:r>
+      <w:r>
+        <w:t xml:space="preserve"> C</w:t>
+      </w:r>
+      <w:r>
+        <w:t xml:space="preserve"> and </w:t>
+      </w:r>
+      <w:r>
+        <w:t xml:space="preserve">C++. </w:t>
+      </w:r>
+      <w:r>
+        <w:t xml:space="preserve">The source code will </w:t>
+      </w:r>
+      <w:r>
+        <w:t>be</w:t>
+      </w:r>
+      <w:r>
+        <w:t xml:space="preserve"> released</w:t>
+      </w:r>
+      <w:r>
+        <w:t xml:space="preserve"> at a future date</w:t>
+      </w:r>
+      <w:r>
+        <w:t>, it is still being changed frequently.</w:t>
       </w:r>
     </w:p>
     <w:p>
@@ -202,6 +227,7 @@
         <w:pStyle w:val="Heading3"/>
       </w:pPr>
       <w:r>
+        <w:lastRenderedPageBreak/>
         <w:t xml:space="preserve">Arduino </w:t>
       </w:r>
       <w:r>
@@ -219,46 +245,56 @@
         <w:t xml:space="preserve"> actual versions will be listed here</w:t>
       </w:r>
       <w:r>
+        <w:t xml:space="preserve"> when the source code is released.</w:t>
+      </w:r>
+    </w:p>
+    <w:p>
+      <w:r>
+        <w:t xml:space="preserve">This is the software version </w:t>
+      </w:r>
+      <w:r>
+        <w:t xml:space="preserve">of the </w:t>
+      </w:r>
+      <w:r>
+        <w:t xml:space="preserve">custom </w:t>
+      </w:r>
+      <w:r>
+        <w:t>code</w:t>
+      </w:r>
+      <w:r>
+        <w:t>.</w:t>
+      </w:r>
+      <w:r>
         <w:t xml:space="preserve"> </w:t>
       </w:r>
-      <w:proofErr w:type="gramStart"/>
-      <w:r>
-        <w:t>if and when</w:t>
-      </w:r>
-      <w:proofErr w:type="gramEnd"/>
-      <w:r>
-        <w:t xml:space="preserve"> the source code is released.</w:t>
-      </w:r>
-    </w:p>
-    <w:p>
-      <w:r>
-        <w:t xml:space="preserve">This is the software version </w:t>
-      </w:r>
-      <w:r>
-        <w:t xml:space="preserve">of the </w:t>
-      </w:r>
-      <w:r>
-        <w:t xml:space="preserve">custom </w:t>
-      </w:r>
-      <w:r>
-        <w:t>code</w:t>
-      </w:r>
-      <w:r>
-        <w:t>.</w:t>
-      </w:r>
-      <w:r>
-        <w:t xml:space="preserve"> </w:t>
-      </w:r>
-      <w:proofErr w:type="gramStart"/>
-      <w:r>
-        <w:t>C</w:t>
-      </w:r>
-      <w:r>
-        <w:t>hanges</w:t>
-      </w:r>
-      <w:proofErr w:type="gramEnd"/>
+      <w:r>
+        <w:t>The changes</w:t>
+      </w:r>
       <w:r>
         <w:t xml:space="preserve"> are described below.</w:t>
+      </w:r>
+    </w:p>
+    <w:p>
+      <w:r>
+        <w:t>Version 1.06</w:t>
+      </w:r>
+    </w:p>
+    <w:p>
+      <w:pPr>
+        <w:pStyle w:val="ListParagraph"/>
+        <w:numPr>
+          <w:ilvl w:val="0"/>
+          <w:numId w:val="93"/>
+        </w:numPr>
+      </w:pPr>
+      <w:r>
+        <w:t>Added a switch to limit the frequency range to that allowed for</w:t>
+      </w:r>
+      <w:r>
+        <w:t xml:space="preserve"> beacon use in ITU region 2. The range is 144.276-</w:t>
+      </w:r>
+      <w:r>
+        <w:t>144.300 MHz.</w:t>
       </w:r>
     </w:p>
     <w:p>
@@ -295,7 +331,6 @@
         </w:numPr>
       </w:pPr>
       <w:r>
-        <w:lastRenderedPageBreak/>
         <w:t>Fixed crash when no SD card found.</w:t>
       </w:r>
     </w:p>
@@ -318,16 +353,20 @@
       <w:r>
         <w:t xml:space="preserve">. Short </w:t>
       </w:r>
-      <w:proofErr w:type="spellStart"/>
-      <w:r>
-        <w:t>tx</w:t>
-      </w:r>
-      <w:proofErr w:type="spellEnd"/>
+      <w:r>
+        <w:t>TX</w:t>
+      </w:r>
       <w:r>
         <w:t xml:space="preserve"> time and B0 pressed</w:t>
       </w:r>
       <w:r>
-        <w:t xml:space="preserve"> caused display to stop updating.</w:t>
+        <w:t xml:space="preserve"> caused </w:t>
+      </w:r>
+      <w:r>
+        <w:t>the display</w:t>
+      </w:r>
+      <w:r>
+        <w:t xml:space="preserve"> to stop updating.</w:t>
       </w:r>
     </w:p>
     <w:p>
@@ -383,11 +422,9 @@
       <w:r>
         <w:t xml:space="preserve">This is </w:t>
       </w:r>
-      <w:proofErr w:type="gramStart"/>
       <w:r>
         <w:t>initial</w:t>
       </w:r>
-      <w:proofErr w:type="gramEnd"/>
       <w:r>
         <w:t xml:space="preserve"> version when this document was first created. The software is considered mostly complete.</w:t>
       </w:r>
@@ -423,161 +460,164 @@
       <w:r>
         <w:t xml:space="preserve">e Fox is a single PCB that includes an </w:t>
       </w:r>
-      <w:proofErr w:type="gramStart"/>
-      <w:r>
-        <w:t>18650 battery</w:t>
-      </w:r>
-      <w:proofErr w:type="gramEnd"/>
+      <w:r>
+        <w:t>18650</w:t>
+      </w:r>
+      <w:r>
+        <w:t xml:space="preserve"> </w:t>
+      </w:r>
+      <w:r>
+        <w:t>battery</w:t>
+      </w:r>
       <w:r>
         <w:t xml:space="preserve"> holder that can have </w:t>
       </w:r>
       <w:r>
-        <w:t>1 or 2 batteries. There is a USB C connector on the left edge that is used for charging the batteries.</w:t>
-      </w:r>
-      <w:r>
-        <w:t xml:space="preserve"> Above that is a micro-SD slot. The SD card holds tone files</w:t>
-      </w:r>
-      <w:r>
-        <w:t>, and saved settings files. It can also be used to load new firmware onto the TTGO chip.</w:t>
-      </w:r>
-      <w:r>
-        <w:t xml:space="preserve"> There is also a USB C connector on the TTGO. It can be used for downloading</w:t>
-      </w:r>
-      <w:r>
-        <w:t xml:space="preserve"> firmware or debugging operations. It may also be used for serial communications in a future firmware release.</w:t>
+        <w:t>1 or 2 batteries. There is a USB C connector on the left edge used for charging the batteries.</w:t>
+      </w:r>
+      <w:r>
+        <w:t xml:space="preserve"> Above that is a micro-SD slot. The SD card holds tone </w:t>
+      </w:r>
+      <w:r>
+        <w:t>files and</w:t>
+      </w:r>
+      <w:r>
+        <w:t xml:space="preserve"> saved settings files. It can also be used to load new firmware onto the TTGO chip.</w:t>
+      </w:r>
+      <w:r>
+        <w:t xml:space="preserve"> There is also a USB C connector on the TTGO. It </w:t>
+      </w:r>
+      <w:r>
+        <w:t>is</w:t>
+      </w:r>
+      <w:r>
+        <w:t xml:space="preserve"> used for downloading</w:t>
+      </w:r>
+      <w:r>
+        <w:t xml:space="preserve"> firmware or debugging operations. It </w:t>
+      </w:r>
+      <w:r>
+        <w:t>might</w:t>
+      </w:r>
+      <w:r>
+        <w:t xml:space="preserve"> also be used for serial communications in a future firmware release.</w:t>
       </w:r>
       <w:r>
         <w:t xml:space="preserve"> It is not used for charging the batteries.</w:t>
       </w:r>
     </w:p>
+    <w:p>
+      <w:pPr>
+        <w:pStyle w:val="Heading2"/>
+      </w:pPr>
+      <w:r>
+        <w:t>Radio</w:t>
+      </w:r>
+    </w:p>
+    <w:p>
+      <w:r>
+        <w:t>The radio functions are handled by the SA818-</w:t>
+      </w:r>
+      <w:r>
+        <w:t>V on the top right. There are vents in the case to allow cooling as this module can become quite hot when transmitting at high power for longer timer intervals. Transmitting longer than one minute is not recommended.</w:t>
+      </w:r>
+      <w:r>
+        <w:t xml:space="preserve"> High power is about 5W and low power</w:t>
+      </w:r>
+      <w:r>
+        <w:t xml:space="preserve"> is about 3W. Make sure a suitable antenna is connected to avoid damage to the radio circuit.</w:t>
+      </w:r>
+    </w:p>
+    <w:p>
+      <w:pPr>
+        <w:pStyle w:val="Heading2"/>
+      </w:pPr>
+      <w:r>
+        <w:lastRenderedPageBreak/>
+        <w:t>Batteries</w:t>
+      </w:r>
+    </w:p>
+    <w:p>
+      <w:r>
+        <w:t xml:space="preserve">The 18650 </w:t>
+      </w:r>
+      <w:r>
+        <w:t>batteries must button top style and protection is recommended</w:t>
+      </w:r>
+      <w:r>
+        <w:t xml:space="preserve">. The </w:t>
+      </w:r>
+      <w:r>
+        <w:t>18650</w:t>
+      </w:r>
+      <w:r>
+        <w:t xml:space="preserve"> </w:t>
+      </w:r>
+      <w:r>
+        <w:t>battery</w:t>
+      </w:r>
+      <w:r>
+        <w:t xml:space="preserve"> length is a very loose standard and some batteries may not fit. Too long and they </w:t>
+      </w:r>
+      <w:r>
+        <w:t>cannot</w:t>
+      </w:r>
+      <w:r>
+        <w:t xml:space="preserve"> be used. Too short, it might be possible to bend the </w:t>
+      </w:r>
+      <w:r>
+        <w:t>contacts on the battery holder negative side. The battery holder is polarized to prevent insertion in the wrong direction.</w:t>
+      </w:r>
+      <w:r>
+        <w:t xml:space="preserve"> Do not defeat the feature or magic blue smoke may appear from the PCB!</w:t>
+      </w:r>
+    </w:p>
+    <w:p>
+      <w:pPr>
+        <w:pStyle w:val="Heading1"/>
+      </w:pPr>
+      <w:r>
+        <w:t>Run Time</w:t>
+      </w:r>
+    </w:p>
+    <w:p>
+      <w:r>
+        <w:t xml:space="preserve">The actual runtime depends on the transmitting time and </w:t>
+      </w:r>
+      <w:r>
+        <w:t>quality of the batteries. There are many deceptively labelled 18650 batteries available. The best one are made by Panasonic and Sanyo</w:t>
+      </w:r>
+      <w:r>
+        <w:t>. Using 1 minute transmit, 4 minutes pause, low power setting</w:t>
+      </w:r>
+      <w:r>
+        <w:t xml:space="preserve">, and display dimming the </w:t>
+      </w:r>
+      <w:r>
+        <w:t xml:space="preserve">Fox Radio </w:t>
+      </w:r>
+      <w:r>
+        <w:t>ran for 12 hours using Panasonic batteries.</w:t>
+      </w:r>
+    </w:p>
+    <w:p>
+      <w:pPr>
+        <w:pStyle w:val="Heading1"/>
+      </w:pPr>
+      <w:r>
+        <w:t>Tone Files</w:t>
+      </w:r>
+    </w:p>
+    <w:p>
+      <w:r>
+        <w:t xml:space="preserve">The </w:t>
+      </w:r>
+      <w:r>
+        <w:t>tone files are used to play “music” during transmissions. This can be used to identify the Fox, or just to annoy people!</w:t>
+      </w:r>
+    </w:p>
     <w:p/>
     <w:p>
-      <w:pPr>
-        <w:pStyle w:val="Heading2"/>
-      </w:pPr>
-      <w:r>
-        <w:t>Radio</w:t>
-      </w:r>
-    </w:p>
-    <w:p>
-      <w:r>
-        <w:t>The radio functions are handled by the SA818-</w:t>
-      </w:r>
-      <w:r>
-        <w:t>V on the top right. There are vents in the case to allow cooling as this module can become quite hot when transmitting at high power for longer timer intervals. Transmitting longer than one minute is not recommended.</w:t>
-      </w:r>
-      <w:r>
-        <w:t xml:space="preserve"> High power is about </w:t>
-      </w:r>
-      <w:proofErr w:type="gramStart"/>
-      <w:r>
-        <w:t>5W</w:t>
-      </w:r>
-      <w:proofErr w:type="gramEnd"/>
-      <w:r>
-        <w:t xml:space="preserve"> and low power</w:t>
-      </w:r>
-      <w:r>
-        <w:t xml:space="preserve"> is about 3W. Make sure a suitable antenna is connected to avoid damage to the radio circuit.</w:t>
-      </w:r>
-    </w:p>
-    <w:p/>
-    <w:p>
-      <w:pPr>
-        <w:pStyle w:val="Heading2"/>
-      </w:pPr>
-      <w:r>
-        <w:t>Batteries</w:t>
-      </w:r>
-    </w:p>
-    <w:p>
-      <w:r>
-        <w:t xml:space="preserve">The 18650 </w:t>
-      </w:r>
-      <w:r>
-        <w:t>batteries must button top style and protection is recommended</w:t>
-      </w:r>
-      <w:r>
-        <w:t xml:space="preserve">. The </w:t>
-      </w:r>
-      <w:proofErr w:type="gramStart"/>
-      <w:r>
-        <w:t>18650 battery</w:t>
-      </w:r>
-      <w:proofErr w:type="gramEnd"/>
-      <w:r>
-        <w:t xml:space="preserve"> length is a very loose standard and some batteries may not fit. Too long and they can’t be used. Too short, it might be possible to bend the </w:t>
-      </w:r>
-      <w:r>
-        <w:t>contacts on the battery holder negative side. The battery holder is polarized to prevent insertion in the wrong direction.</w:t>
-      </w:r>
-      <w:r>
-        <w:t xml:space="preserve"> Do not defeat the feature or magic blue smoke may appear from the PCB!</w:t>
-      </w:r>
-    </w:p>
-    <w:p>
-      <w:pPr>
-        <w:pStyle w:val="Heading1"/>
-      </w:pPr>
-      <w:r>
-        <w:lastRenderedPageBreak/>
-        <w:t>Run Time</w:t>
-      </w:r>
-    </w:p>
-    <w:p>
-      <w:r>
-        <w:t xml:space="preserve">The actual runtime depends on the transmitting time and </w:t>
-      </w:r>
-      <w:r>
-        <w:t xml:space="preserve">quality of the batteries. There are many deceptively labelled 18650 batteries available. The best </w:t>
-      </w:r>
-      <w:proofErr w:type="gramStart"/>
-      <w:r>
-        <w:t>one</w:t>
-      </w:r>
-      <w:proofErr w:type="gramEnd"/>
-      <w:r>
-        <w:t xml:space="preserve"> </w:t>
-      </w:r>
-      <w:proofErr w:type="gramStart"/>
-      <w:r>
-        <w:t>are</w:t>
-      </w:r>
-      <w:proofErr w:type="gramEnd"/>
-      <w:r>
-        <w:t xml:space="preserve"> made by Panasonic and Sanyo</w:t>
-      </w:r>
-      <w:r>
-        <w:t>. Using 1 minute transmit, 4 minutes pause, low power setting</w:t>
-      </w:r>
-      <w:r>
-        <w:t xml:space="preserve">, and display dimming the </w:t>
-      </w:r>
-      <w:r>
-        <w:t xml:space="preserve">Fox Radio </w:t>
-      </w:r>
-      <w:r>
-        <w:t>ran for 12 hours using Panasonic batteries.</w:t>
-      </w:r>
-    </w:p>
-    <w:p>
-      <w:pPr>
-        <w:pStyle w:val="Heading1"/>
-      </w:pPr>
-      <w:r>
-        <w:t>Tone Files</w:t>
-      </w:r>
-    </w:p>
-    <w:p>
-      <w:r>
-        <w:t xml:space="preserve">The </w:t>
-      </w:r>
-      <w:r>
-        <w:t>tone files are used to play “music” during transmissions. This can be used to identify the Fox, or just to annoy people!</w:t>
-      </w:r>
-    </w:p>
-    <w:p/>
-    <w:p>
       <w:r>
         <w:t xml:space="preserve">The files are saved as .TXT and simply contain a list of tones to be played. The format </w:t>
       </w:r>
@@ -585,33 +625,11 @@
         <w:t xml:space="preserve">is similar the hard coded files from here: </w:t>
       </w:r>
       <w:hyperlink r:id="rId8" w:history="1">
-        <w:proofErr w:type="spellStart"/>
         <w:r>
           <w:rPr>
             <w:rStyle w:val="Hyperlink"/>
           </w:rPr>
-          <w:t>robsoncouto</w:t>
-        </w:r>
-        <w:proofErr w:type="spellEnd"/>
-        <w:r>
-          <w:rPr>
-            <w:rStyle w:val="Hyperlink"/>
-          </w:rPr>
-          <w:t>/</w:t>
-        </w:r>
-        <w:proofErr w:type="spellStart"/>
-        <w:r>
-          <w:rPr>
-            <w:rStyle w:val="Hyperlink"/>
-          </w:rPr>
-          <w:t>arduino</w:t>
-        </w:r>
-        <w:proofErr w:type="spellEnd"/>
-        <w:r>
-          <w:rPr>
-            <w:rStyle w:val="Hyperlink"/>
-          </w:rPr>
-          <w:t>-songs (github.com)</w:t>
+          <w:t>robsoncouto/arduino-songs (github.com)</w:t>
         </w:r>
       </w:hyperlink>
     </w:p>
@@ -668,17 +686,8 @@
           <w:b/>
           <w:bCs/>
         </w:rPr>
-        <w:t xml:space="preserve">This is the Tetris theme </w:t>
-      </w:r>
-      <w:proofErr w:type="gramStart"/>
-      <w:r>
-        <w:rPr>
-          <w:b/>
-          <w:bCs/>
-        </w:rPr>
-        <w:t>music</w:t>
-      </w:r>
-      <w:proofErr w:type="gramEnd"/>
+        <w:t>This is the Tetris theme music</w:t>
+      </w:r>
     </w:p>
     <w:p>
       <w:pPr>
@@ -722,81 +731,38 @@
           <w:b/>
           <w:bCs/>
         </w:rPr>
-        <w:t xml:space="preserve">and that the data starts with the tilde which must not be in these </w:t>
-      </w:r>
-      <w:proofErr w:type="gramStart"/>
-      <w:r>
+        <w:t>and that the data starts with the tilde which must not be in these comments</w:t>
+      </w:r>
+    </w:p>
+    <w:p>
+      <w:pPr>
         <w:rPr>
           <w:b/>
           <w:bCs/>
         </w:rPr>
-        <w:t>comments</w:t>
-      </w:r>
-      <w:proofErr w:type="gramEnd"/>
-    </w:p>
-    <w:p>
-      <w:pPr>
+      </w:pPr>
+      <w:r>
         <w:rPr>
           <w:b/>
           <w:bCs/>
         </w:rPr>
-      </w:pPr>
-      <w:r>
+        <w:t>LENGTH, %val can be used to set the length of the note, it defaults to 90% and 10% quiet after the note</w:t>
+      </w:r>
+    </w:p>
+    <w:p>
+      <w:pPr>
         <w:rPr>
           <w:b/>
           <w:bCs/>
         </w:rPr>
-        <w:t>LENGTH, %</w:t>
-      </w:r>
-      <w:proofErr w:type="spellStart"/>
+      </w:pPr>
       <w:r>
         <w:rPr>
           <w:b/>
           <w:bCs/>
         </w:rPr>
-        <w:t>val</w:t>
-      </w:r>
-      <w:proofErr w:type="spellEnd"/>
-      <w:r>
-        <w:rPr>
-          <w:b/>
-          <w:bCs/>
-        </w:rPr>
-        <w:t xml:space="preserve"> can be used to set the length of the note, it defaults to 90% and 10% quiet after the </w:t>
-      </w:r>
-      <w:proofErr w:type="gramStart"/>
-      <w:r>
-        <w:rPr>
-          <w:b/>
-          <w:bCs/>
-        </w:rPr>
-        <w:t>note</w:t>
-      </w:r>
-      <w:proofErr w:type="gramEnd"/>
-    </w:p>
-    <w:p>
-      <w:pPr>
-        <w:rPr>
-          <w:b/>
-          <w:bCs/>
-        </w:rPr>
-      </w:pPr>
-      <w:r>
-        <w:rPr>
-          <w:b/>
-          <w:bCs/>
-        </w:rPr>
-        <w:t xml:space="preserve">This can be used for pizzicato notes, LENGTH, 25, for </w:t>
-      </w:r>
-      <w:proofErr w:type="gramStart"/>
-      <w:r>
-        <w:rPr>
-          <w:b/>
-          <w:bCs/>
-        </w:rPr>
-        <w:t>example</w:t>
-      </w:r>
-      <w:proofErr w:type="gramEnd"/>
+        <w:t>This can be used for pizzicato notes, LENGTH, 25, for example</w:t>
+      </w:r>
     </w:p>
     <w:p>
       <w:pPr>
@@ -855,23 +821,22 @@
           <w:b/>
           <w:bCs/>
         </w:rPr>
-        <w:t xml:space="preserve">NOTE_E5, </w:t>
-      </w:r>
-      <w:proofErr w:type="gramStart"/>
-      <w:r>
+        <w:t>NOTE_E5, 4,  NOTE_B4, 8,  NOTE_C5, 8,  NOTE_D5, 4,  NOTE_C5, 8,  NOTE_B4, 8,</w:t>
+      </w:r>
+    </w:p>
+    <w:p>
+      <w:pPr>
         <w:rPr>
           <w:b/>
           <w:bCs/>
         </w:rPr>
-        <w:t>4,  NOTE</w:t>
-      </w:r>
-      <w:proofErr w:type="gramEnd"/>
+      </w:pPr>
       <w:r>
         <w:rPr>
           <w:b/>
           <w:bCs/>
         </w:rPr>
-        <w:t>_B4, 8,  NOTE_C5, 8,  NOTE_D5, 4,  NOTE_C5, 8,  NOTE_B4, 8,</w:t>
+        <w:t>NOTE_A4, 4,  NOTE_A4, 8,  NOTE_C5, 8,  NOTE_E5, 4,  NOTE_D5, 8,  NOTE_C5, 8,</w:t>
       </w:r>
     </w:p>
     <w:p>
@@ -886,23 +851,22 @@
           <w:b/>
           <w:bCs/>
         </w:rPr>
-        <w:t xml:space="preserve">NOTE_A4, </w:t>
-      </w:r>
-      <w:proofErr w:type="gramStart"/>
-      <w:r>
+        <w:t>NOTE_B4, -4, NOTE_C5, 8,  NOTE_D5, 4,  NOTE_E5, 4,</w:t>
+      </w:r>
+    </w:p>
+    <w:p>
+      <w:pPr>
         <w:rPr>
           <w:b/>
           <w:bCs/>
         </w:rPr>
-        <w:t>4,  NOTE</w:t>
-      </w:r>
-      <w:proofErr w:type="gramEnd"/>
+      </w:pPr>
       <w:r>
         <w:rPr>
           <w:b/>
           <w:bCs/>
         </w:rPr>
-        <w:t>_A4, 8,  NOTE_C5, 8,  NOTE_E5, 4,  NOTE_D5, 8,  NOTE_C5, 8,</w:t>
+        <w:t>NOTE_C5, 4,  NOTE_A4, 4,  NOTE_A4, 8,  NOTE_A4, 4,  NOTE_B4, 8,  NOTE_C5, 8,</w:t>
       </w:r>
     </w:p>
     <w:p>
@@ -917,23 +881,23 @@
           <w:b/>
           <w:bCs/>
         </w:rPr>
-        <w:t xml:space="preserve">NOTE_B4, -4, NOTE_C5, </w:t>
-      </w:r>
-      <w:proofErr w:type="gramStart"/>
-      <w:r>
+        <w:t>NOTE_D5, -4, NOTE_F5, 8,  NOTE_A5, 4,  NOTE_G5, 8,  NOTE_F5, 8,</w:t>
+      </w:r>
+    </w:p>
+    <w:p>
+      <w:pPr>
         <w:rPr>
           <w:b/>
           <w:bCs/>
         </w:rPr>
-        <w:t>8,  NOTE</w:t>
-      </w:r>
-      <w:proofErr w:type="gramEnd"/>
+      </w:pPr>
       <w:r>
         <w:rPr>
           <w:b/>
           <w:bCs/>
         </w:rPr>
-        <w:t>_D5, 4,  NOTE_E5, 4,</w:t>
+        <w:lastRenderedPageBreak/>
+        <w:t>NOTE_E5, -4, NOTE_C5, 8,  NOTE_E5, 4,  NOTE_D5, 8,  NOTE_C5, 8,</w:t>
       </w:r>
     </w:p>
     <w:p>
@@ -948,147 +912,22 @@
           <w:b/>
           <w:bCs/>
         </w:rPr>
-        <w:t xml:space="preserve">NOTE_C5, </w:t>
-      </w:r>
-      <w:proofErr w:type="gramStart"/>
-      <w:r>
+        <w:t>NOTE_B4, 4,  NOTE_B4, 8,  NOTE_C5, 8,  NOTE_D5, 4,  NOTE_E5, 4,</w:t>
+      </w:r>
+    </w:p>
+    <w:p>
+      <w:pPr>
         <w:rPr>
           <w:b/>
           <w:bCs/>
         </w:rPr>
-        <w:t>4,  NOTE</w:t>
-      </w:r>
-      <w:proofErr w:type="gramEnd"/>
+      </w:pPr>
       <w:r>
         <w:rPr>
           <w:b/>
           <w:bCs/>
         </w:rPr>
-        <w:t>_A4, 4,  NOTE_A4, 8,  NOTE_A4, 4,  NOTE_B4, 8,  NOTE_C5, 8,</w:t>
-      </w:r>
-    </w:p>
-    <w:p>
-      <w:pPr>
-        <w:rPr>
-          <w:b/>
-          <w:bCs/>
-        </w:rPr>
-      </w:pPr>
-      <w:r>
-        <w:rPr>
-          <w:b/>
-          <w:bCs/>
-        </w:rPr>
-        <w:t xml:space="preserve">NOTE_D5, -4, NOTE_F5, </w:t>
-      </w:r>
-      <w:proofErr w:type="gramStart"/>
-      <w:r>
-        <w:rPr>
-          <w:b/>
-          <w:bCs/>
-        </w:rPr>
-        <w:t>8,  NOTE</w:t>
-      </w:r>
-      <w:proofErr w:type="gramEnd"/>
-      <w:r>
-        <w:rPr>
-          <w:b/>
-          <w:bCs/>
-        </w:rPr>
-        <w:t>_A5, 4,  NOTE_G5, 8,  NOTE_F5, 8,</w:t>
-      </w:r>
-    </w:p>
-    <w:p>
-      <w:pPr>
-        <w:rPr>
-          <w:b/>
-          <w:bCs/>
-        </w:rPr>
-      </w:pPr>
-      <w:r>
-        <w:rPr>
-          <w:b/>
-          <w:bCs/>
-        </w:rPr>
-        <w:t xml:space="preserve">NOTE_E5, -4, NOTE_C5, </w:t>
-      </w:r>
-      <w:proofErr w:type="gramStart"/>
-      <w:r>
-        <w:rPr>
-          <w:b/>
-          <w:bCs/>
-        </w:rPr>
-        <w:t>8,  NOTE</w:t>
-      </w:r>
-      <w:proofErr w:type="gramEnd"/>
-      <w:r>
-        <w:rPr>
-          <w:b/>
-          <w:bCs/>
-        </w:rPr>
-        <w:t>_E5, 4,  NOTE_D5, 8,  NOTE_C5, 8,</w:t>
-      </w:r>
-    </w:p>
-    <w:p>
-      <w:pPr>
-        <w:rPr>
-          <w:b/>
-          <w:bCs/>
-        </w:rPr>
-      </w:pPr>
-      <w:r>
-        <w:rPr>
-          <w:b/>
-          <w:bCs/>
-        </w:rPr>
-        <w:t xml:space="preserve">NOTE_B4, </w:t>
-      </w:r>
-      <w:proofErr w:type="gramStart"/>
-      <w:r>
-        <w:rPr>
-          <w:b/>
-          <w:bCs/>
-        </w:rPr>
-        <w:t>4,  NOTE</w:t>
-      </w:r>
-      <w:proofErr w:type="gramEnd"/>
-      <w:r>
-        <w:rPr>
-          <w:b/>
-          <w:bCs/>
-        </w:rPr>
-        <w:t>_B4, 8,  NOTE_C5, 8,  NOTE_D5, 4,  NOTE_E5, 4,</w:t>
-      </w:r>
-    </w:p>
-    <w:p>
-      <w:pPr>
-        <w:rPr>
-          <w:b/>
-          <w:bCs/>
-        </w:rPr>
-      </w:pPr>
-      <w:r>
-        <w:rPr>
-          <w:b/>
-          <w:bCs/>
-        </w:rPr>
-        <w:t xml:space="preserve">NOTE_C5, </w:t>
-      </w:r>
-      <w:proofErr w:type="gramStart"/>
-      <w:r>
-        <w:rPr>
-          <w:b/>
-          <w:bCs/>
-        </w:rPr>
-        <w:t>4,  NOTE</w:t>
-      </w:r>
-      <w:proofErr w:type="gramEnd"/>
-      <w:r>
-        <w:rPr>
-          <w:b/>
-          <w:bCs/>
-        </w:rPr>
-        <w:t>_A4, 4,  NOTE_A4, 4, REST, 4,</w:t>
+        <w:t>NOTE_C5, 4,  NOTE_A4, 4,  NOTE_A4, 4, REST, 4,</w:t>
       </w:r>
     </w:p>
     <w:p>
@@ -1096,7 +935,6 @@
         <w:pStyle w:val="Heading1"/>
       </w:pPr>
       <w:r>
-        <w:lastRenderedPageBreak/>
         <w:t>Updating Firmware</w:t>
       </w:r>
     </w:p>
@@ -1104,13 +942,8 @@
       <w:r>
         <w:t xml:space="preserve">The new file must be put on the SD card and named </w:t>
       </w:r>
-      <w:proofErr w:type="spellStart"/>
-      <w:r>
-        <w:t>RadioFox.bin</w:t>
-      </w:r>
-      <w:proofErr w:type="spellEnd"/>
-      <w:r>
-        <w:t xml:space="preserve">. The system menu has an entry </w:t>
+      <w:r>
+        <w:t xml:space="preserve">RadioFox.bin. The system menu has an entry </w:t>
       </w:r>
       <w:r>
         <w:rPr>
@@ -1123,15 +956,7 @@
         <w:t xml:space="preserve"> that will attempt to load this file</w:t>
       </w:r>
       <w:r>
-        <w:t xml:space="preserve">. Confirmation will be required from the dial, </w:t>
-      </w:r>
-      <w:proofErr w:type="gramStart"/>
-      <w:r>
-        <w:t>After</w:t>
-      </w:r>
-      <w:proofErr w:type="gramEnd"/>
-      <w:r>
-        <w:t xml:space="preserve"> loading the BIN file can optionally be erased.</w:t>
+        <w:t>. Confirmation will be required from the dial, After loading the BIN file can optionally be erased.</w:t>
       </w:r>
     </w:p>
     <w:p>
@@ -1288,14 +1113,12 @@
       <w:r>
         <w:t xml:space="preserve"> The top one is called </w:t>
       </w:r>
-      <w:proofErr w:type="gramStart"/>
       <w:r>
         <w:t>B</w:t>
       </w:r>
       <w:r>
         <w:t>0</w:t>
       </w:r>
-      <w:proofErr w:type="gramEnd"/>
       <w:r>
         <w:t xml:space="preserve"> and the bottom one is called </w:t>
       </w:r>
@@ -1386,21 +1209,7 @@
         <w:rPr>
           <w:lang w:val="da-DK"/>
         </w:rPr>
-        <w:t xml:space="preserve"> </w:t>
-      </w:r>
-      <w:proofErr w:type="spellStart"/>
-      <w:r>
-        <w:rPr>
-          <w:lang w:val="da-DK"/>
-        </w:rPr>
-        <w:t>During</w:t>
-      </w:r>
-      <w:proofErr w:type="spellEnd"/>
-      <w:r>
-        <w:rPr>
-          <w:lang w:val="da-DK"/>
-        </w:rPr>
-        <w:t xml:space="preserve"> Run Mode</w:t>
+        <w:t xml:space="preserve"> During Run Mode</w:t>
       </w:r>
     </w:p>
     <w:p>
@@ -1475,21 +1284,7 @@
         <w:rPr>
           <w:lang w:val="da-DK"/>
         </w:rPr>
-        <w:t xml:space="preserve">1 </w:t>
-      </w:r>
-      <w:proofErr w:type="spellStart"/>
-      <w:r>
-        <w:rPr>
-          <w:lang w:val="da-DK"/>
-        </w:rPr>
-        <w:t>During</w:t>
-      </w:r>
-      <w:proofErr w:type="spellEnd"/>
-      <w:r>
-        <w:rPr>
-          <w:lang w:val="da-DK"/>
-        </w:rPr>
-        <w:t xml:space="preserve"> Menu Mod</w:t>
+        <w:t>1 During Menu Mod</w:t>
       </w:r>
       <w:r>
         <w:rPr>
@@ -1632,7 +1427,6 @@
         <w:rPr>
           <w:lang w:val="en-US"/>
         </w:rPr>
-        <w:lastRenderedPageBreak/>
         <w:t>B</w:t>
       </w:r>
       <w:r>
@@ -1694,21 +1488,7 @@
         <w:rPr>
           <w:lang w:val="en-US"/>
         </w:rPr>
-        <w:t xml:space="preserve">. After a dial </w:t>
-      </w:r>
-      <w:proofErr w:type="gramStart"/>
-      <w:r>
-        <w:rPr>
-          <w:lang w:val="en-US"/>
-        </w:rPr>
-        <w:t>click</w:t>
-      </w:r>
-      <w:proofErr w:type="gramEnd"/>
-      <w:r>
-        <w:rPr>
-          <w:lang w:val="en-US"/>
-        </w:rPr>
-        <w:t xml:space="preserve"> the increment will change to 10 and dial will add and subtract </w:t>
+        <w:t xml:space="preserve">. After a dial click the increment will change to 10 and dial will add and subtract </w:t>
       </w:r>
       <w:r>
         <w:rPr>
@@ -1830,15 +1610,7 @@
         <w:t>,</w:t>
       </w:r>
       <w:r>
-        <w:t xml:space="preserve"> </w:t>
-      </w:r>
-      <w:proofErr w:type="spellStart"/>
-      <w:r>
-        <w:t>boolean</w:t>
-      </w:r>
-      <w:proofErr w:type="spellEnd"/>
-      <w:r>
-        <w:t xml:space="preserve"> values toggle with each click.</w:t>
+        <w:t xml:space="preserve"> boolean values toggle with each click.</w:t>
       </w:r>
       <w:r>
         <w:t xml:space="preserve"> Multiple selections cycle through all the available options.</w:t>
@@ -1853,18 +1625,10 @@
         <w:t xml:space="preserve">indicates the active menu line. A + in front of the menu means another menu will be activated. </w:t>
       </w:r>
       <w:r>
-        <w:t>Any menu item starting with ‘</w:t>
-      </w:r>
-      <w:proofErr w:type="gramStart"/>
-      <w:r>
-        <w:t>-‘</w:t>
-      </w:r>
-      <w:r>
-        <w:t xml:space="preserve"> goes</w:t>
-      </w:r>
-      <w:proofErr w:type="gramEnd"/>
-      <w:r>
-        <w:t xml:space="preserve"> back to the previous menu when clicked. A</w:t>
+        <w:t>Any menu item starting with ‘-‘</w:t>
+      </w:r>
+      <w:r>
+        <w:t xml:space="preserve"> goes back to the previous menu when clicked. A</w:t>
       </w:r>
       <w:r>
         <w:t xml:space="preserve"> dial</w:t>
@@ -1912,15 +1676,7 @@
         <w:ind w:left="1440"/>
       </w:pPr>
       <w:r>
-        <w:t xml:space="preserve">Select </w:t>
-      </w:r>
-      <w:proofErr w:type="gramStart"/>
-      <w:r>
-        <w:t>menu</w:t>
-      </w:r>
-      <w:proofErr w:type="gramEnd"/>
-      <w:r>
-        <w:t xml:space="preserve"> </w:t>
+        <w:t xml:space="preserve">Select menu </w:t>
       </w:r>
     </w:p>
     <w:p>
@@ -1934,13 +1690,8 @@
         <w:t xml:space="preserve"> or list</w:t>
       </w:r>
       <w:r>
-        <w:t xml:space="preserve"> </w:t>
-      </w:r>
-      <w:proofErr w:type="gramStart"/>
-      <w:r>
-        <w:t>values</w:t>
-      </w:r>
-      <w:proofErr w:type="gramEnd"/>
+        <w:t xml:space="preserve"> values</w:t>
+      </w:r>
     </w:p>
     <w:p>
       <w:pPr>
@@ -1963,13 +1714,8 @@
         <w:ind w:left="1440"/>
       </w:pPr>
       <w:r>
-        <w:t xml:space="preserve">Open menu system, goes to the remembered menu </w:t>
-      </w:r>
-      <w:proofErr w:type="gramStart"/>
-      <w:r>
-        <w:t>point</w:t>
-      </w:r>
-      <w:proofErr w:type="gramEnd"/>
+        <w:t>Open menu system, goes to the remembered menu point</w:t>
+      </w:r>
     </w:p>
     <w:p>
       <w:pPr>
@@ -1982,39 +1728,24 @@
         <w:t>radio</w:t>
       </w:r>
       <w:r>
-        <w:t xml:space="preserve"> mode, the current menu point is </w:t>
-      </w:r>
-      <w:proofErr w:type="gramStart"/>
-      <w:r>
-        <w:t>remembered</w:t>
-      </w:r>
-      <w:proofErr w:type="gramEnd"/>
+        <w:t xml:space="preserve"> mode, the current menu point is remembered</w:t>
+      </w:r>
     </w:p>
     <w:p>
       <w:pPr>
         <w:ind w:left="1440"/>
       </w:pPr>
       <w:r>
-        <w:t xml:space="preserve">Accept </w:t>
-      </w:r>
-      <w:proofErr w:type="gramStart"/>
-      <w:r>
-        <w:t>integer</w:t>
-      </w:r>
-      <w:proofErr w:type="gramEnd"/>
+        <w:t>Accept integer</w:t>
+      </w:r>
     </w:p>
     <w:p>
       <w:pPr>
         <w:ind w:left="1440"/>
       </w:pPr>
       <w:r>
-        <w:t xml:space="preserve">Choose </w:t>
-      </w:r>
-      <w:proofErr w:type="gramStart"/>
-      <w:r>
-        <w:t>filenames</w:t>
-      </w:r>
-      <w:proofErr w:type="gramEnd"/>
+        <w:t>Choose filenames</w:t>
+      </w:r>
     </w:p>
     <w:p>
       <w:pPr>
@@ -2029,28 +1760,16 @@
         <w:ind w:left="1440"/>
       </w:pPr>
       <w:r>
-        <w:t xml:space="preserve">Select menu item, including return to previous </w:t>
-      </w:r>
-      <w:proofErr w:type="gramStart"/>
-      <w:r>
-        <w:t>menu</w:t>
-      </w:r>
-      <w:proofErr w:type="gramEnd"/>
+        <w:t>Select menu item, including return to previous menu</w:t>
+      </w:r>
     </w:p>
     <w:p>
       <w:pPr>
         <w:ind w:left="1440"/>
       </w:pPr>
       <w:r>
-        <w:t xml:space="preserve">Toggle </w:t>
-      </w:r>
-      <w:proofErr w:type="spellStart"/>
-      <w:proofErr w:type="gramStart"/>
-      <w:r>
-        <w:t>booleans</w:t>
-      </w:r>
-      <w:proofErr w:type="spellEnd"/>
-      <w:proofErr w:type="gramEnd"/>
+        <w:t>Toggle booleans</w:t>
+      </w:r>
     </w:p>
     <w:p>
       <w:pPr>
@@ -2060,29 +1779,22 @@
         <w:t>Cycle</w:t>
       </w:r>
       <w:r>
-        <w:t xml:space="preserve"> through multiple </w:t>
-      </w:r>
-      <w:proofErr w:type="gramStart"/>
+        <w:t xml:space="preserve"> through multiple selections</w:t>
+      </w:r>
+    </w:p>
+    <w:p>
+      <w:pPr>
+        <w:ind w:left="1440"/>
+      </w:pPr>
+      <w:r>
+        <w:t xml:space="preserve">Cancel filename </w:t>
+      </w:r>
+      <w:r>
+        <w:t xml:space="preserve">or list </w:t>
+      </w:r>
       <w:r>
         <w:t>selections</w:t>
       </w:r>
-      <w:proofErr w:type="gramEnd"/>
-    </w:p>
-    <w:p>
-      <w:pPr>
-        <w:ind w:left="1440"/>
-      </w:pPr>
-      <w:r>
-        <w:t xml:space="preserve">Cancel filename </w:t>
-      </w:r>
-      <w:r>
-        <w:t xml:space="preserve">or list </w:t>
-      </w:r>
-      <w:proofErr w:type="gramStart"/>
-      <w:r>
-        <w:t>selections</w:t>
-      </w:r>
-      <w:proofErr w:type="gramEnd"/>
     </w:p>
     <w:p>
       <w:pPr>
@@ -2113,29 +1825,13 @@
         <w:t xml:space="preserve"> The bottom of the screen shows the</w:t>
       </w:r>
       <w:r>
-        <w:t xml:space="preserve"> battery status on the right if it has been enabled. This is related to the current battery voltage and will drop while transmitting. There are also 4 </w:t>
-      </w:r>
-      <w:proofErr w:type="gramStart"/>
-      <w:r>
-        <w:t>LED’s</w:t>
-      </w:r>
-      <w:proofErr w:type="gramEnd"/>
-      <w:r>
-        <w:t xml:space="preserve"> on the PCB that can be seen through</w:t>
+        <w:t xml:space="preserve"> battery status on the right if it has been enabled. This is related to the current battery voltage and will drop while transmitting. There are also 4 LED’s on the PCB that can be seen through</w:t>
       </w:r>
       <w:r>
         <w:t xml:space="preserve"> the slot on the top of the case</w:t>
       </w:r>
       <w:r>
-        <w:t xml:space="preserve">. These </w:t>
-      </w:r>
-      <w:proofErr w:type="gramStart"/>
-      <w:r>
-        <w:t>LED’s</w:t>
-      </w:r>
-      <w:proofErr w:type="gramEnd"/>
-      <w:r>
-        <w:t xml:space="preserve"> are controlled by the battery charger circuit and indicate the battery status during running and charging.</w:t>
+        <w:t>. These LED’s are controlled by the battery charger circuit and indicate the battery status during running and charging.</w:t>
       </w:r>
     </w:p>
     <w:p/>
@@ -2144,15 +1840,7 @@
         <w:t>During transmitting the bottom left shows an animated red dot. In a future firmware update the</w:t>
       </w:r>
       <w:r>
-        <w:t xml:space="preserve"> received DTMF characters will be </w:t>
-      </w:r>
-      <w:proofErr w:type="gramStart"/>
-      <w:r>
-        <w:t>display</w:t>
-      </w:r>
-      <w:proofErr w:type="gramEnd"/>
-      <w:r>
-        <w:t xml:space="preserve"> next to this.</w:t>
+        <w:t xml:space="preserve"> received DTMF characters will be display next to this.</w:t>
       </w:r>
     </w:p>
     <w:p>
@@ -2167,13 +1855,8 @@
       <w:r>
         <w:t xml:space="preserve">The following sections detail each entry in </w:t>
       </w:r>
-      <w:proofErr w:type="gramStart"/>
-      <w:r>
-        <w:t>all of</w:t>
-      </w:r>
-      <w:proofErr w:type="gramEnd"/>
-      <w:r>
-        <w:t xml:space="preserve"> the menus</w:t>
+      <w:r>
+        <w:t>all of the menus</w:t>
       </w:r>
       <w:r>
         <w:t xml:space="preserve"> starting with the main or top menu</w:t>
@@ -2200,15 +1883,7 @@
         <w:t>’</w:t>
       </w:r>
       <w:r>
-        <w:t xml:space="preserve"> or a ‘</w:t>
-      </w:r>
-      <w:proofErr w:type="gramStart"/>
-      <w:r>
-        <w:t>-‘ to</w:t>
-      </w:r>
-      <w:proofErr w:type="gramEnd"/>
-      <w:r>
-        <w:t xml:space="preserve"> indicate a range</w:t>
+        <w:t xml:space="preserve"> or a ‘-‘ to indicate a range</w:t>
       </w:r>
       <w:r>
         <w:t>.</w:t>
@@ -2233,15 +1908,7 @@
         <w:t xml:space="preserve"> Some menu entries may depend on other menu items </w:t>
       </w:r>
       <w:r>
-        <w:t xml:space="preserve">settings. For </w:t>
-      </w:r>
-      <w:proofErr w:type="gramStart"/>
-      <w:r>
-        <w:t>example</w:t>
-      </w:r>
-      <w:proofErr w:type="gramEnd"/>
-      <w:r>
-        <w:t xml:space="preserve"> the audio file name menu item is hidden unless </w:t>
+        <w:t xml:space="preserve">settings. For example the audio file name menu item is hidden unless </w:t>
       </w:r>
       <w:r>
         <w:t>“Play Audio File” is Yes.</w:t>
@@ -2260,11 +1927,7 @@
         <w:pStyle w:val="Heading3"/>
       </w:pPr>
       <w:r>
-        <w:t xml:space="preserve">XMIT: </w:t>
-      </w:r>
-      <w:proofErr w:type="spellStart"/>
-      <w:r>
-        <w:t>On</w:t>
+        <w:t>XMIT: On</w:t>
       </w:r>
       <w:r>
         <w:t>|</w:t>
@@ -2272,38 +1935,13 @@
       <w:r>
         <w:t>Off</w:t>
       </w:r>
-      <w:proofErr w:type="spellEnd"/>
-    </w:p>
-    <w:p>
-      <w:r>
-        <w:t xml:space="preserve">This must be set to </w:t>
-      </w:r>
-      <w:proofErr w:type="gramStart"/>
-      <w:r>
-        <w:t>On</w:t>
-      </w:r>
-      <w:proofErr w:type="gramEnd"/>
-      <w:r>
-        <w:t xml:space="preserve"> for the radio to begin </w:t>
-      </w:r>
-      <w:r>
-        <w:t xml:space="preserve">transmitting. If saved as </w:t>
-      </w:r>
-      <w:proofErr w:type="gramStart"/>
-      <w:r>
-        <w:t>On</w:t>
-      </w:r>
-      <w:proofErr w:type="gramEnd"/>
-      <w:r>
-        <w:t xml:space="preserve"> then the radio will start sending right after booting. If it is </w:t>
-      </w:r>
-      <w:proofErr w:type="gramStart"/>
-      <w:r>
-        <w:t>Off</w:t>
-      </w:r>
-      <w:proofErr w:type="gramEnd"/>
-      <w:r>
-        <w:t xml:space="preserve"> it will not automatically start sending. It can be toggle</w:t>
+    </w:p>
+    <w:p>
+      <w:r>
+        <w:t xml:space="preserve">This must be set to On for the radio to begin </w:t>
+      </w:r>
+      <w:r>
+        <w:t>transmitting. If saved as On then the radio will start sending right after booting. If it is Off it will not automatically start sending. It can be toggle</w:t>
       </w:r>
       <w:r>
         <w:t>d</w:t>
@@ -2312,44 +1950,30 @@
         <w:t xml:space="preserve"> with the B0 button while in run mode</w:t>
       </w:r>
       <w:r>
-        <w:t xml:space="preserve">. Using B0 does not </w:t>
-      </w:r>
-      <w:proofErr w:type="gramStart"/>
-      <w:r>
-        <w:t>changed</w:t>
-      </w:r>
-      <w:proofErr w:type="gramEnd"/>
+        <w:t>. Using B0 does not changed</w:t>
+      </w:r>
     </w:p>
     <w:p>
       <w:pPr>
         <w:pStyle w:val="Heading3"/>
       </w:pPr>
       <w:r>
-        <w:t xml:space="preserve">TX Power: </w:t>
-      </w:r>
-      <w:proofErr w:type="spellStart"/>
-      <w:r>
-        <w:t>High</w:t>
+        <w:t>TX Power: High</w:t>
       </w:r>
       <w:r>
         <w:t>|</w:t>
       </w:r>
       <w:r>
+        <w:rPr>
+          <w:b/>
+          <w:bCs/>
+        </w:rPr>
         <w:t>Low</w:t>
       </w:r>
-      <w:proofErr w:type="spellEnd"/>
-    </w:p>
-    <w:p>
-      <w:r>
-        <w:t xml:space="preserve">High power is about </w:t>
-      </w:r>
-      <w:proofErr w:type="gramStart"/>
-      <w:r>
-        <w:t>5W</w:t>
-      </w:r>
-      <w:proofErr w:type="gramEnd"/>
-      <w:r>
-        <w:t xml:space="preserve"> and low power is 3W. These are the only</w:t>
+    </w:p>
+    <w:p>
+      <w:r>
+        <w:t>High power is about 5W and low power is 3W. These are the only</w:t>
       </w:r>
       <w:r>
         <w:t xml:space="preserve"> values allowed by the SA818 radio. If lower power is desired an attenuator can be attached to the </w:t>
@@ -2361,6 +1985,42 @@
     <w:p>
       <w:pPr>
         <w:pStyle w:val="Heading3"/>
+        <w:rPr>
+          <w:b/>
+          <w:bCs/>
+        </w:rPr>
+      </w:pPr>
+      <w:r>
+        <w:t>Beacon Frequenc</w:t>
+      </w:r>
+      <w:r>
+        <w:t>y</w:t>
+      </w:r>
+      <w:r>
+        <w:t>:</w:t>
+      </w:r>
+      <w:r>
+        <w:t xml:space="preserve"> Yes|</w:t>
+      </w:r>
+      <w:r>
+        <w:rPr>
+          <w:b/>
+          <w:bCs/>
+        </w:rPr>
+        <w:t>No</w:t>
+      </w:r>
+    </w:p>
+    <w:p>
+      <w:r>
+        <w:t>This restricts the frequency range to the allowed values</w:t>
+      </w:r>
+      <w:r>
+        <w:t xml:space="preserve"> for ITU region 2.</w:t>
+      </w:r>
+    </w:p>
+    <w:p>
+      <w:pPr>
+        <w:pStyle w:val="Heading3"/>
       </w:pPr>
       <w:r>
         <w:t xml:space="preserve">TX: </w:t>
@@ -2368,6 +2028,12 @@
       <w:r>
         <w:t>134-174 MHz</w:t>
       </w:r>
+      <w:r>
+        <w:t xml:space="preserve"> or 144.275-144.300</w:t>
+      </w:r>
+      <w:r>
+        <w:t xml:space="preserve"> (beacon mode)</w:t>
+      </w:r>
     </w:p>
     <w:p>
       <w:r>
@@ -2382,7 +2048,11 @@
         <w:pStyle w:val="Heading3"/>
       </w:pPr>
       <w:r>
+        <w:lastRenderedPageBreak/>
         <w:t>Beacon</w:t>
+      </w:r>
+      <w:r>
+        <w:t xml:space="preserve"> ID</w:t>
       </w:r>
       <w:r>
         <w:t xml:space="preserve">: </w:t>
@@ -2411,10 +2081,8 @@
         <w:pStyle w:val="Heading3"/>
       </w:pPr>
       <w:r>
-        <w:lastRenderedPageBreak/>
         <w:t xml:space="preserve">Call Sign: </w:t>
       </w:r>
-      <w:proofErr w:type="gramStart"/>
       <w:r>
         <w:rPr>
           <w:i/>
@@ -2422,7 +2090,6 @@
         </w:rPr>
         <w:t>text</w:t>
       </w:r>
-      <w:proofErr w:type="gramEnd"/>
     </w:p>
     <w:p>
       <w:r>
@@ -2449,13 +2116,8 @@
         <w:t>Play Audio File</w:t>
       </w:r>
       <w:r>
-        <w:t xml:space="preserve">: </w:t>
-      </w:r>
-      <w:proofErr w:type="spellStart"/>
-      <w:r>
-        <w:t>Yes|No</w:t>
-      </w:r>
-      <w:proofErr w:type="spellEnd"/>
+        <w:t>: Yes|No</w:t>
+      </w:r>
     </w:p>
     <w:p>
       <w:r>
@@ -2479,29 +2141,13 @@
     </w:p>
     <w:p>
       <w:r>
-        <w:t xml:space="preserve">This menu item is only visible if the previous item is set to Yes. Clicking the dial will list </w:t>
-      </w:r>
-      <w:proofErr w:type="gramStart"/>
-      <w:r>
-        <w:t>all of</w:t>
-      </w:r>
-      <w:proofErr w:type="gramEnd"/>
-      <w:r>
-        <w:t xml:space="preserve"> the </w:t>
+        <w:t xml:space="preserve">This menu item is only visible if the previous item is set to Yes. Clicking the dial will list all of the </w:t>
       </w:r>
       <w:r>
         <w:t>*.txt files on the SD card. The dial is rotated to highlight a file and a long press will set it</w:t>
       </w:r>
       <w:r>
-        <w:t xml:space="preserve">. Note that a click of dial just exits the list of </w:t>
-      </w:r>
-      <w:proofErr w:type="gramStart"/>
-      <w:r>
-        <w:t>file</w:t>
-      </w:r>
-      <w:proofErr w:type="gramEnd"/>
-      <w:r>
-        <w:t xml:space="preserve"> with no selection being performed.</w:t>
+        <w:t>. Note that a click of dial just exits the list of file with no selection being performed.</w:t>
       </w:r>
     </w:p>
     <w:p>
@@ -2561,13 +2207,8 @@
         <w:pStyle w:val="Heading3"/>
       </w:pPr>
       <w:r>
-        <w:t xml:space="preserve">Timer Mode: </w:t>
-      </w:r>
-      <w:proofErr w:type="spellStart"/>
-      <w:r>
-        <w:t>Fixed|Random</w:t>
-      </w:r>
-      <w:proofErr w:type="spellEnd"/>
+        <w:t>Timer Mode: Fixed|Random</w:t>
+      </w:r>
     </w:p>
     <w:p>
       <w:r>
@@ -2580,15 +2221,7 @@
         <w:t xml:space="preserve"> and are always the same. In Random mode the transmit time and pause time are randomly chosen</w:t>
       </w:r>
       <w:r>
-        <w:t xml:space="preserve"> from the allowed values set in the Min and Max values for TX Send and Pause. This makes the timing less predictable and </w:t>
-      </w:r>
-      <w:proofErr w:type="gramStart"/>
-      <w:r>
-        <w:t>make</w:t>
-      </w:r>
-      <w:proofErr w:type="gramEnd"/>
-      <w:r>
-        <w:t xml:space="preserve"> the game a little bit harder.</w:t>
+        <w:t xml:space="preserve"> from the allowed values set in the Min and Max values for TX Send and Pause. This makes the timing less predictable and make the game a little bit harder.</w:t>
       </w:r>
       <w:r>
         <w:t xml:space="preserve"> Keep your ears on!</w:t>
@@ -2633,6 +2266,7 @@
         <w:pStyle w:val="Heading3"/>
       </w:pPr>
       <w:r>
+        <w:lastRenderedPageBreak/>
         <w:t>TX Pause:10-1200 Sec</w:t>
       </w:r>
     </w:p>
@@ -2641,15 +2275,7 @@
         <w:t>This is the pause time between transmissions</w:t>
       </w:r>
       <w:r>
-        <w:t xml:space="preserve">. Longer times let the radio cool off and save the battery for longer </w:t>
-      </w:r>
-      <w:proofErr w:type="gramStart"/>
-      <w:r>
-        <w:t>run</w:t>
-      </w:r>
-      <w:proofErr w:type="gramEnd"/>
-      <w:r>
-        <w:t xml:space="preserve"> times.</w:t>
+        <w:t>. Longer times let the radio cool off and save the battery for longer run times.</w:t>
       </w:r>
     </w:p>
     <w:p>
@@ -2657,13 +2283,148 @@
         <w:pStyle w:val="Heading3"/>
       </w:pPr>
       <w:r>
+        <w:t>TX Send Min: 10-90 Sec</w:t>
+      </w:r>
+    </w:p>
+    <w:p>
+      <w:r>
+        <w:t>In random mode this is the minimum send time.</w:t>
+      </w:r>
+    </w:p>
+    <w:p>
+      <w:pPr>
+        <w:pStyle w:val="Heading3"/>
+      </w:pPr>
+      <w:r>
+        <w:t xml:space="preserve">TX Send Max: </w:t>
+      </w:r>
+      <w:r>
+        <w:t>10-90 Sec</w:t>
+      </w:r>
+    </w:p>
+    <w:p>
+      <w:r>
+        <w:t xml:space="preserve">In </w:t>
+      </w:r>
+      <w:r>
+        <w:t>random mode this is the maximum send time.</w:t>
+      </w:r>
+    </w:p>
+    <w:p>
+      <w:pPr>
+        <w:pStyle w:val="Heading3"/>
+      </w:pPr>
+      <w:r>
+        <w:t>TX Pause Min: 10-1200 Sec</w:t>
+      </w:r>
+    </w:p>
+    <w:p>
+      <w:r>
+        <w:t>In random mode this is the minimum pause time.</w:t>
+      </w:r>
+    </w:p>
+    <w:p>
+      <w:pPr>
+        <w:pStyle w:val="Heading3"/>
+      </w:pPr>
+      <w:r>
+        <w:t>TX Pause Max: 10-1200 Sec</w:t>
+      </w:r>
+    </w:p>
+    <w:p>
+      <w:r>
+        <w:t>In random mode this is the maximum pause time.</w:t>
+      </w:r>
+    </w:p>
+    <w:p>
+      <w:pPr>
+        <w:pStyle w:val="Heading3"/>
+      </w:pPr>
+      <w:r>
+        <w:t>TX Stop: Immediate|Finish Cycle</w:t>
+      </w:r>
+    </w:p>
+    <w:p>
+      <w:r>
+        <w:t>During transmit time the Beacon, Call Sign, and Audio are continuously sent. At the end of the transmission time this option controls whether the transmission stops immediately of waits to stop until the entire cycle is finished.</w:t>
+      </w:r>
+    </w:p>
+    <w:p/>
+    <w:p>
+      <w:r>
+        <w:t>A clever use of this command</w:t>
+      </w:r>
+      <w:r>
+        <w:t xml:space="preserve"> allows for only one cycle of beacon, ID, and music to be sent during each transmission time. Set the transmit</w:t>
+      </w:r>
+      <w:r>
+        <w:t xml:space="preserve"> time to something less than</w:t>
+      </w:r>
+      <w:r>
+        <w:t xml:space="preserve"> the time to perform a complete cycle and set this option to “Finish Cycle”. The transmit  cycle will begin, the timer will expire, but the current cycle will complete before stopping</w:t>
+      </w:r>
+      <w:r>
+        <w:t>.</w:t>
+      </w:r>
+    </w:p>
+    <w:p>
+      <w:pPr>
+        <w:pStyle w:val="Heading3"/>
+      </w:pPr>
+      <w:r>
+        <w:t>Radio Pause: Sleep|Awake</w:t>
+      </w:r>
+    </w:p>
+    <w:p>
+      <w:r>
+        <w:t>During pause time the radio can be put into sleep mode. This lowers the power consumption and lets the battery last longer. However note that this also means that the DTMF commands are disabled since the radio is asleep!</w:t>
+      </w:r>
+    </w:p>
+    <w:p>
+      <w:pPr>
+        <w:pStyle w:val="Heading2"/>
+      </w:pPr>
+      <w:r>
+        <w:t>+</w:t>
+      </w:r>
+      <w:r>
+        <w:t>More Radio Settings</w:t>
+      </w:r>
+    </w:p>
+    <w:p>
+      <w:pPr>
+        <w:pStyle w:val="Heading3"/>
+      </w:pPr>
+      <w:r>
+        <w:t>RX Offset: -600|0|+600 kHz</w:t>
+      </w:r>
+    </w:p>
+    <w:p>
+      <w:r>
+        <w:t>This is the frequency offset from the transmit frequency that the radio uses to receive DTMF commands</w:t>
+      </w:r>
+      <w:r>
+        <w:t>. An offset is recommended. If 0 is used the radio will only listen when it isn’t sending. It has not been tested if it listens during sending when the offset is not 0.</w:t>
+      </w:r>
+    </w:p>
+    <w:p>
+      <w:pPr>
+        <w:pStyle w:val="Heading3"/>
+      </w:pPr>
+      <w:r>
         <w:lastRenderedPageBreak/>
-        <w:t>TX Send Min: 10-90 Sec</w:t>
-      </w:r>
-    </w:p>
-    <w:p>
-      <w:r>
-        <w:t>In random mode this is the minimum send time.</w:t>
+        <w:t>Bandwidth: 12.5|</w:t>
+      </w:r>
+      <w:r>
+        <w:t>25 kHz</w:t>
+      </w:r>
+    </w:p>
+    <w:p>
+      <w:r>
+        <w:t>This sets the radio bandwidth</w:t>
+      </w:r>
+      <w:r>
+        <w:t>. It has not been tested much to see what effect it has on performance yet.</w:t>
       </w:r>
     </w:p>
     <w:p>
@@ -2671,18 +2432,21 @@
         <w:pStyle w:val="Heading3"/>
       </w:pPr>
       <w:r>
-        <w:t xml:space="preserve">TX Send Max: </w:t>
-      </w:r>
-      <w:r>
-        <w:t>10-90 Sec</w:t>
-      </w:r>
-    </w:p>
-    <w:p>
-      <w:r>
-        <w:t xml:space="preserve">In </w:t>
-      </w:r>
-      <w:r>
-        <w:t>random mode this is the maximum send time.</w:t>
+        <w:t>CTCSS/DCS: CTCSS|DCS</w:t>
+      </w:r>
+    </w:p>
+    <w:p>
+      <w:r>
+        <w:t xml:space="preserve">This sets the </w:t>
+      </w:r>
+      <w:r>
+        <w:t>un-squelch</w:t>
+      </w:r>
+      <w:r>
+        <w:t xml:space="preserve"> values</w:t>
+      </w:r>
+      <w:r>
+        <w:t xml:space="preserve"> for either the analog or digital versions.</w:t>
       </w:r>
     </w:p>
     <w:p>
@@ -2690,12 +2454,24 @@
         <w:pStyle w:val="Heading3"/>
       </w:pPr>
       <w:r>
-        <w:t>TX Pause Min: 10-1200 Sec</w:t>
-      </w:r>
-    </w:p>
-    <w:p>
-      <w:r>
-        <w:t>In random mode this is the minimum pause time.</w:t>
+        <w:t>TX CTCSS:</w:t>
+      </w:r>
+      <w:r>
+        <w:t xml:space="preserve"> None</w:t>
+      </w:r>
+      <w:r>
+        <w:t>|</w:t>
+      </w:r>
+      <w:r>
+        <w:t>67-</w:t>
+      </w:r>
+      <w:r>
+        <w:t>250.3</w:t>
+      </w:r>
+    </w:p>
+    <w:p>
+      <w:r>
+        <w:t>Analog un-squelch frequencies sent out.</w:t>
       </w:r>
     </w:p>
     <w:p>
@@ -2703,12 +2479,15 @@
         <w:pStyle w:val="Heading3"/>
       </w:pPr>
       <w:r>
-        <w:t>TX Pause Max: 10-1200 Sec</w:t>
-      </w:r>
-    </w:p>
-    <w:p>
-      <w:r>
-        <w:t>In random mode this is the maximum pause time.</w:t>
+        <w:t>RX CTCSS:</w:t>
+      </w:r>
+      <w:r>
+        <w:t xml:space="preserve"> None|67-250.3</w:t>
+      </w:r>
+    </w:p>
+    <w:p>
+      <w:r>
+        <w:t>Analog un-squelch frequency for receiving.</w:t>
       </w:r>
     </w:p>
     <w:p>
@@ -2716,51 +2495,328 @@
         <w:pStyle w:val="Heading3"/>
       </w:pPr>
       <w:r>
-        <w:t xml:space="preserve">TX Stop: </w:t>
-      </w:r>
-      <w:proofErr w:type="spellStart"/>
-      <w:r>
-        <w:t>Immediate|Finish</w:t>
-      </w:r>
-      <w:proofErr w:type="spellEnd"/>
-      <w:r>
-        <w:t xml:space="preserve"> Cycle</w:t>
-      </w:r>
-    </w:p>
-    <w:p>
-      <w:r>
-        <w:t xml:space="preserve">During transmit time the Beacon, Call Sign, and Audio are continuously sent. At the end of the transmission time this option controls whether the transmission stops immediately </w:t>
-      </w:r>
-      <w:proofErr w:type="gramStart"/>
-      <w:r>
-        <w:t>of</w:t>
-      </w:r>
-      <w:proofErr w:type="gramEnd"/>
-      <w:r>
-        <w:t xml:space="preserve"> waits to stop until the entire cycle is finished.</w:t>
-      </w:r>
-    </w:p>
-    <w:p/>
-    <w:p>
-      <w:r>
-        <w:t>A clever use of this command</w:t>
-      </w:r>
-      <w:r>
-        <w:t xml:space="preserve"> allows for only one cycle of beacon, ID, and music to be sent during each transmission time. Set the transmit</w:t>
-      </w:r>
-      <w:r>
-        <w:t xml:space="preserve"> time to something less than</w:t>
-      </w:r>
-      <w:r>
-        <w:t xml:space="preserve"> the time to perform a complete cycle and set this option to “Finish Cycle”. The </w:t>
-      </w:r>
-      <w:proofErr w:type="gramStart"/>
-      <w:r>
-        <w:t>transmit  cycle</w:t>
-      </w:r>
-      <w:proofErr w:type="gramEnd"/>
-      <w:r>
-        <w:t xml:space="preserve"> will begin, the timer will expire, but the current cycle will complete before stopping</w:t>
+        <w:t>TX DCS:</w:t>
+      </w:r>
+      <w:r>
+        <w:t xml:space="preserve"> None|023-754</w:t>
+      </w:r>
+    </w:p>
+    <w:p>
+      <w:r>
+        <w:t>Digital un-squelch value for sending.</w:t>
+      </w:r>
+    </w:p>
+    <w:p>
+      <w:pPr>
+        <w:pStyle w:val="Heading3"/>
+      </w:pPr>
+      <w:r>
+        <w:t>TX I/N: I|N</w:t>
+      </w:r>
+    </w:p>
+    <w:p>
+      <w:r>
+        <w:t>The digital I or N value for sending.</w:t>
+      </w:r>
+    </w:p>
+    <w:p>
+      <w:pPr>
+        <w:pStyle w:val="Heading3"/>
+      </w:pPr>
+      <w:r>
+        <w:t>RX DCS: None|023-754</w:t>
+      </w:r>
+    </w:p>
+    <w:p>
+      <w:r>
+        <w:t>Digital un-squelch value for receiving.</w:t>
+      </w:r>
+    </w:p>
+    <w:p>
+      <w:pPr>
+        <w:pStyle w:val="Heading3"/>
+      </w:pPr>
+      <w:r>
+        <w:t>RX I/N: I|N</w:t>
+      </w:r>
+    </w:p>
+    <w:p>
+      <w:r>
+        <w:t>The digital I or N value for receiving.</w:t>
+      </w:r>
+    </w:p>
+    <w:p>
+      <w:pPr>
+        <w:pStyle w:val="Heading3"/>
+      </w:pPr>
+      <w:r>
+        <w:t>RX Volume:</w:t>
+      </w:r>
+      <w:r>
+        <w:t xml:space="preserve"> 1-6</w:t>
+      </w:r>
+    </w:p>
+    <w:p>
+      <w:r>
+        <w:t>This is the receive volume setting. It affects how well DTMF tones are detected.</w:t>
+      </w:r>
+    </w:p>
+    <w:p>
+      <w:pPr>
+        <w:pStyle w:val="Heading3"/>
+      </w:pPr>
+      <w:r>
+        <w:t>RX Squelch:</w:t>
+      </w:r>
+      <w:r>
+        <w:t xml:space="preserve"> 0-8</w:t>
+      </w:r>
+    </w:p>
+    <w:p>
+      <w:r>
+        <w:t>This affects how much signal is required to receive the DTMF signals.</w:t>
+      </w:r>
+    </w:p>
+    <w:p>
+      <w:pPr>
+        <w:pStyle w:val="Heading2"/>
+      </w:pPr>
+      <w:r>
+        <w:t>Cancel Waits/TX Now</w:t>
+      </w:r>
+    </w:p>
+    <w:p>
+      <w:r>
+        <w:t>When the radio is in either send or pause mode this command will cancel the timer and the next mo</w:t>
+      </w:r>
+      <w:r>
+        <w:t>de will start. For example if you want to cancel</w:t>
+      </w:r>
+      <w:r>
+        <w:t xml:space="preserve"> the pause and go to transmit, use this option. It can also be done by long pressing B0.</w:t>
+      </w:r>
+    </w:p>
+    <w:p>
+      <w:pPr>
+        <w:pStyle w:val="Heading2"/>
+      </w:pPr>
+      <w:r>
+        <w:lastRenderedPageBreak/>
+        <w:t>+Saved Settings Files</w:t>
+      </w:r>
+    </w:p>
+    <w:p>
+      <w:r>
+        <w:t>Saved settings files are named files stored on the SD card. They are useful to</w:t>
+      </w:r>
+      <w:r>
+        <w:t xml:space="preserve"> quickly configure the radio for different uses. All values except the battery calibration are affected.</w:t>
+      </w:r>
+    </w:p>
+    <w:p>
+      <w:pPr>
+        <w:pStyle w:val="Heading3"/>
+      </w:pPr>
+      <w:r>
+        <w:t>Create File</w:t>
+      </w:r>
+    </w:p>
+    <w:p>
+      <w:r>
+        <w:t>This prompts the user for a name. The file is then created using the current system settings.</w:t>
+      </w:r>
+    </w:p>
+    <w:p>
+      <w:pPr>
+        <w:pStyle w:val="Heading3"/>
+      </w:pPr>
+      <w:r>
+        <w:t>Save/Update File</w:t>
+      </w:r>
+    </w:p>
+    <w:p>
+      <w:r>
+        <w:t>This command saves the current settings into the selected file. If it already exists the user will be asked to confirm overwriting the file.</w:t>
+      </w:r>
+    </w:p>
+    <w:p>
+      <w:pPr>
+        <w:pStyle w:val="Heading3"/>
+      </w:pPr>
+      <w:r>
+        <w:t>Load File</w:t>
+      </w:r>
+    </w:p>
+    <w:p>
+      <w:r>
+        <w:t>This command asks the user for the name and then sets all of the system settings except the battery calibration using the values in the file.</w:t>
+      </w:r>
+    </w:p>
+    <w:p>
+      <w:pPr>
+        <w:pStyle w:val="Heading3"/>
+      </w:pPr>
+      <w:r>
+        <w:t>Delete File</w:t>
+      </w:r>
+    </w:p>
+    <w:p>
+      <w:r>
+        <w:t>The user selects a file from the list and then it can be deleted.</w:t>
+      </w:r>
+    </w:p>
+    <w:p>
+      <w:pPr>
+        <w:pStyle w:val="Heading2"/>
+      </w:pPr>
+      <w:r>
+        <w:t>+System Settings</w:t>
+      </w:r>
+    </w:p>
+    <w:p>
+      <w:pPr>
+        <w:pStyle w:val="Heading3"/>
+      </w:pPr>
+      <w:r>
+        <w:t>+Display</w:t>
+      </w:r>
+      <w:r>
+        <w:t xml:space="preserve"> Settings</w:t>
+      </w:r>
+    </w:p>
+    <w:p>
+      <w:pPr>
+        <w:pStyle w:val="Heading4"/>
+      </w:pPr>
+      <w:r>
+        <w:t>Dimming Mode: None</w:t>
+      </w:r>
+      <w:r>
+        <w:t>|Timer</w:t>
+      </w:r>
+    </w:p>
+    <w:p>
+      <w:r>
+        <w:t xml:space="preserve">The display can be set to dim automatically after a specified number of seconds. This is used to save battery power since the backlight </w:t>
+      </w:r>
+      <w:r>
+        <w:t>uses a significant amount.</w:t>
+      </w:r>
+    </w:p>
+    <w:p>
+      <w:pPr>
+        <w:pStyle w:val="Heading4"/>
+      </w:pPr>
+      <w:r>
+        <w:t>Bright Value: 1-100</w:t>
+      </w:r>
+      <w:r>
+        <w:t>%</w:t>
+      </w:r>
+    </w:p>
+    <w:p>
+      <w:r>
+        <w:t>Set the display brightness value.</w:t>
+      </w:r>
+    </w:p>
+    <w:p>
+      <w:pPr>
+        <w:pStyle w:val="Heading4"/>
+      </w:pPr>
+      <w:r>
+        <w:t xml:space="preserve">Dim Value: </w:t>
+      </w:r>
+      <w:r>
+        <w:t>0-100%</w:t>
+      </w:r>
+    </w:p>
+    <w:p>
+      <w:r>
+        <w:t xml:space="preserve">Set the display brightness after the </w:t>
+      </w:r>
+      <w:r>
+        <w:t>timer below expires.</w:t>
+      </w:r>
+    </w:p>
+    <w:p>
+      <w:pPr>
+        <w:pStyle w:val="Heading4"/>
+      </w:pPr>
+      <w:r>
+        <w:t>Display Dim Time:</w:t>
+      </w:r>
+      <w:r>
+        <w:t xml:space="preserve"> 0-120 S</w:t>
+      </w:r>
+    </w:p>
+    <w:p>
+      <w:r>
+        <w:t>Specify the time until the display changes to dim mode.</w:t>
+      </w:r>
+    </w:p>
+    <w:p>
+      <w:pPr>
+        <w:pStyle w:val="Heading4"/>
+      </w:pPr>
+      <w:r>
+        <w:t>+Sideways Scroll Settings</w:t>
+      </w:r>
+    </w:p>
+    <w:p>
+      <w:r>
+        <w:t>Lines of text that too long for the display will scroll back and forth. The following settings control the speed.</w:t>
+      </w:r>
+    </w:p>
+    <w:p>
+      <w:pPr>
+        <w:pStyle w:val="Heading5"/>
+      </w:pPr>
+      <w:r>
+        <w:lastRenderedPageBreak/>
+        <w:t xml:space="preserve">Speed: </w:t>
+      </w:r>
+      <w:r>
+        <w:t>1-1000 mS</w:t>
+      </w:r>
+    </w:p>
+    <w:p>
+      <w:r>
+        <w:t>Controls the speed of text moving to the left.</w:t>
+      </w:r>
+    </w:p>
+    <w:p>
+      <w:pPr>
+        <w:pStyle w:val="Heading5"/>
+      </w:pPr>
+      <w:r>
+        <w:t>Pause: 1-100</w:t>
+      </w:r>
+      <w:r>
+        <w:t xml:space="preserve"> mS</w:t>
+      </w:r>
+    </w:p>
+    <w:p>
+      <w:r>
+        <w:t>This controls the pause when the text is at the end (all the way to the left).</w:t>
+      </w:r>
+    </w:p>
+    <w:p>
+      <w:pPr>
+        <w:pStyle w:val="Heading5"/>
+      </w:pPr>
+      <w:r>
+        <w:t>Reverse Speed: 1-20x</w:t>
+      </w:r>
+    </w:p>
+    <w:p>
+      <w:r>
+        <w:t xml:space="preserve">This is how fast the text scrolls </w:t>
+      </w:r>
+      <w:r>
+        <w:t>back to the beginning (to the right). 2x means twice as fast as the text scroll</w:t>
+      </w:r>
+      <w:r>
+        <w:t>ed to the left</w:t>
       </w:r>
       <w:r>
         <w:t>.</w:t>
@@ -2768,39 +2824,71 @@
     </w:p>
     <w:p>
       <w:pPr>
+        <w:pStyle w:val="Heading4"/>
+      </w:pPr>
+      <w:r>
+        <w:t xml:space="preserve">Menu Selection: </w:t>
+      </w:r>
+      <w:r>
+        <w:t>Color|*</w:t>
+      </w:r>
+    </w:p>
+    <w:p>
+      <w:r>
+        <w:t>Menu selections</w:t>
+      </w:r>
+      <w:r>
+        <w:t xml:space="preserve"> and selections from a list can be either colored or marked with the ‘*’ character.</w:t>
+      </w:r>
+    </w:p>
+    <w:p>
+      <w:pPr>
+        <w:pStyle w:val="Heading4"/>
+      </w:pPr>
+      <w:r>
+        <w:t>Text/HiLite Colors</w:t>
+      </w:r>
+    </w:p>
+    <w:p>
+      <w:r>
+        <w:t>This selection allows for choosing the colors of the text and the highlight. The background screen is always black.</w:t>
+      </w:r>
+    </w:p>
+    <w:p>
+      <w:pPr>
         <w:pStyle w:val="Heading3"/>
       </w:pPr>
       <w:r>
-        <w:t xml:space="preserve">Radio Pause: </w:t>
-      </w:r>
-      <w:proofErr w:type="spellStart"/>
-      <w:r>
-        <w:t>Sleep|Awake</w:t>
-      </w:r>
-      <w:proofErr w:type="spellEnd"/>
-    </w:p>
-    <w:p>
-      <w:r>
-        <w:t xml:space="preserve">During pause time the radio can be put into sleep mode. This lowers the power consumption and lets the battery last longer. </w:t>
-      </w:r>
-      <w:proofErr w:type="gramStart"/>
-      <w:r>
-        <w:t>However</w:t>
-      </w:r>
-      <w:proofErr w:type="gramEnd"/>
-      <w:r>
-        <w:t xml:space="preserve"> note that this also means that the DTMF commands are disabled since the radio is asleep!</w:t>
-      </w:r>
-    </w:p>
-    <w:p>
-      <w:pPr>
-        <w:pStyle w:val="Heading2"/>
-      </w:pPr>
-      <w:r>
-        <w:t>+</w:t>
-      </w:r>
-      <w:r>
-        <w:t>More Radio Settings</w:t>
+        <w:t>+Dial &amp; Button Settings</w:t>
+      </w:r>
+    </w:p>
+    <w:p>
+      <w:pPr>
+        <w:pStyle w:val="Heading4"/>
+      </w:pPr>
+      <w:r>
+        <w:t>Direction: Normal:Reverse</w:t>
+      </w:r>
+    </w:p>
+    <w:p>
+      <w:r>
+        <w:t>If you really want the button to be the other way around this is the choice for you.</w:t>
+      </w:r>
+    </w:p>
+    <w:p>
+      <w:pPr>
+        <w:pStyle w:val="Heading4"/>
+      </w:pPr>
+      <w:r>
+        <w:t>Long Press Timer: 2-200</w:t>
+      </w:r>
+    </w:p>
+    <w:p>
+      <w:r>
+        <w:t>This value affects how long or short a long press is. The default value is normally OK</w:t>
+      </w:r>
+      <w:r>
+        <w:t>, but somebody might want to change it.</w:t>
       </w:r>
     </w:p>
     <w:p>
@@ -2808,321 +2896,12 @@
         <w:pStyle w:val="Heading3"/>
       </w:pPr>
       <w:r>
-        <w:t xml:space="preserve">RX Offset: -600|0|+600 </w:t>
-      </w:r>
-      <w:proofErr w:type="gramStart"/>
-      <w:r>
-        <w:t>kHz</w:t>
-      </w:r>
-      <w:proofErr w:type="gramEnd"/>
-    </w:p>
-    <w:p>
-      <w:r>
-        <w:t>This is the frequency offset from the transmit frequency that the radio uses to receive DTMF commands</w:t>
-      </w:r>
-      <w:r>
-        <w:t>. An offset is recommended. If 0 is used the radio will only listen when it isn’t sending. It has not been tested if it listens during sending when the offset is not 0.</w:t>
-      </w:r>
-    </w:p>
-    <w:p>
-      <w:pPr>
-        <w:pStyle w:val="Heading3"/>
-      </w:pPr>
-      <w:r>
-        <w:t>Bandwidth: 12.5|</w:t>
-      </w:r>
-      <w:r>
-        <w:t>25 kHz</w:t>
-      </w:r>
-    </w:p>
-    <w:p>
-      <w:r>
-        <w:t>This sets the radio bandwidth</w:t>
-      </w:r>
-      <w:r>
-        <w:t>. It has not been tested much to see what effect it has on performance yet.</w:t>
-      </w:r>
-    </w:p>
-    <w:p>
-      <w:pPr>
-        <w:pStyle w:val="Heading3"/>
-      </w:pPr>
-      <w:r>
-        <w:lastRenderedPageBreak/>
-        <w:t>CTCSS/DCS: CTCSS|DCS</w:t>
-      </w:r>
-    </w:p>
-    <w:p>
-      <w:r>
-        <w:t xml:space="preserve">This sets the </w:t>
-      </w:r>
-      <w:r>
-        <w:t>un-squelch</w:t>
-      </w:r>
-      <w:r>
-        <w:t xml:space="preserve"> values</w:t>
-      </w:r>
-      <w:r>
-        <w:t xml:space="preserve"> for either the analog or digital versions.</w:t>
-      </w:r>
-    </w:p>
-    <w:p>
-      <w:pPr>
-        <w:pStyle w:val="Heading3"/>
-      </w:pPr>
-      <w:r>
-        <w:t>TX CTCSS:</w:t>
-      </w:r>
-      <w:r>
-        <w:t xml:space="preserve"> None</w:t>
-      </w:r>
-      <w:r>
-        <w:t>|</w:t>
-      </w:r>
-      <w:r>
-        <w:t>67-</w:t>
-      </w:r>
-      <w:r>
-        <w:t>250.3</w:t>
-      </w:r>
-    </w:p>
-    <w:p>
-      <w:r>
-        <w:t>Analog un-squelch frequencies sent out.</w:t>
-      </w:r>
-    </w:p>
-    <w:p>
-      <w:pPr>
-        <w:pStyle w:val="Heading3"/>
-      </w:pPr>
-      <w:r>
-        <w:t>RX CTCSS:</w:t>
-      </w:r>
-      <w:r>
-        <w:t xml:space="preserve"> None|67-250.3</w:t>
-      </w:r>
-    </w:p>
-    <w:p>
-      <w:r>
-        <w:t>Analog un-squelch frequency for receiving.</w:t>
-      </w:r>
-    </w:p>
-    <w:p>
-      <w:pPr>
-        <w:pStyle w:val="Heading3"/>
-      </w:pPr>
-      <w:r>
-        <w:t>TX DCS:</w:t>
-      </w:r>
-      <w:r>
-        <w:t xml:space="preserve"> None|023-754</w:t>
-      </w:r>
-    </w:p>
-    <w:p>
-      <w:r>
-        <w:t>Digital un-squelch value for sending.</w:t>
-      </w:r>
-    </w:p>
-    <w:p>
-      <w:pPr>
-        <w:pStyle w:val="Heading3"/>
-      </w:pPr>
-      <w:r>
-        <w:t>TX I/N: I|N</w:t>
-      </w:r>
-    </w:p>
-    <w:p>
-      <w:r>
-        <w:t>The digital I or N value for sending.</w:t>
-      </w:r>
-    </w:p>
-    <w:p>
-      <w:pPr>
-        <w:pStyle w:val="Heading3"/>
-      </w:pPr>
-      <w:r>
-        <w:t>RX DCS: None|023-754</w:t>
-      </w:r>
-    </w:p>
-    <w:p>
-      <w:r>
-        <w:t>Digital un-squelch value for receiving.</w:t>
-      </w:r>
-    </w:p>
-    <w:p>
-      <w:pPr>
-        <w:pStyle w:val="Heading3"/>
-      </w:pPr>
-      <w:r>
-        <w:t>RX I/N: I|N</w:t>
-      </w:r>
-    </w:p>
-    <w:p>
-      <w:r>
-        <w:t>The digital I or N value for receiving.</w:t>
-      </w:r>
-    </w:p>
-    <w:p>
-      <w:pPr>
-        <w:pStyle w:val="Heading3"/>
-      </w:pPr>
-      <w:r>
-        <w:t>RX Volume:</w:t>
-      </w:r>
-      <w:r>
-        <w:t xml:space="preserve"> 1-6</w:t>
-      </w:r>
-    </w:p>
-    <w:p>
-      <w:r>
-        <w:t>This is the receive volume setting. It affects how well DTMF tones are detected.</w:t>
-      </w:r>
-    </w:p>
-    <w:p>
-      <w:pPr>
-        <w:pStyle w:val="Heading3"/>
-      </w:pPr>
-      <w:r>
-        <w:t>RX Squelch:</w:t>
-      </w:r>
-      <w:r>
-        <w:t xml:space="preserve"> 0-8</w:t>
-      </w:r>
-    </w:p>
-    <w:p>
-      <w:r>
-        <w:t>This affects how much signal is required to receive the DTMF signals.</w:t>
-      </w:r>
-    </w:p>
-    <w:p>
-      <w:pPr>
-        <w:pStyle w:val="Heading2"/>
-      </w:pPr>
-      <w:r>
-        <w:t>Cancel Waits/TX Now</w:t>
-      </w:r>
-    </w:p>
-    <w:p>
-      <w:r>
-        <w:t>When the radio is in either send or pause mode this command will cancel the timer and the next mo</w:t>
-      </w:r>
-      <w:r>
-        <w:t xml:space="preserve">de will start. For </w:t>
-      </w:r>
-      <w:proofErr w:type="gramStart"/>
-      <w:r>
-        <w:t>example</w:t>
-      </w:r>
-      <w:proofErr w:type="gramEnd"/>
-      <w:r>
-        <w:t xml:space="preserve"> if you want to cancel</w:t>
-      </w:r>
-      <w:r>
-        <w:t xml:space="preserve"> the pause and go to transmit, use this option. It can also be done by long pressing B0.</w:t>
-      </w:r>
-    </w:p>
-    <w:p>
-      <w:pPr>
-        <w:pStyle w:val="Heading2"/>
-      </w:pPr>
-      <w:r>
-        <w:t>+Saved Settings Files</w:t>
-      </w:r>
-    </w:p>
-    <w:p>
-      <w:r>
-        <w:t>Saved settings files are named files stored on the SD card. They are useful to</w:t>
-      </w:r>
-      <w:r>
-        <w:t xml:space="preserve"> quickly configure the radio for different uses. All values except the battery calibration are affected.</w:t>
-      </w:r>
-    </w:p>
-    <w:p>
-      <w:pPr>
-        <w:pStyle w:val="Heading3"/>
-      </w:pPr>
-      <w:r>
-        <w:lastRenderedPageBreak/>
-        <w:t>Create File</w:t>
-      </w:r>
-    </w:p>
-    <w:p>
-      <w:r>
-        <w:t>This prompts the user for a name. The file is then created using the current system settings.</w:t>
-      </w:r>
-    </w:p>
-    <w:p>
-      <w:pPr>
-        <w:pStyle w:val="Heading3"/>
-      </w:pPr>
-      <w:r>
-        <w:t>Save/Update File</w:t>
-      </w:r>
-    </w:p>
-    <w:p>
-      <w:r>
-        <w:t xml:space="preserve">This command saves the current settings into the selected file. If it already </w:t>
-      </w:r>
-      <w:proofErr w:type="gramStart"/>
-      <w:r>
-        <w:t>exists</w:t>
-      </w:r>
-      <w:proofErr w:type="gramEnd"/>
-      <w:r>
-        <w:t xml:space="preserve"> the user will be asked to confirm overwriting the file.</w:t>
-      </w:r>
-    </w:p>
-    <w:p>
-      <w:pPr>
-        <w:pStyle w:val="Heading3"/>
-      </w:pPr>
-      <w:r>
-        <w:t>Load File</w:t>
-      </w:r>
-    </w:p>
-    <w:p>
-      <w:r>
-        <w:t xml:space="preserve">This command asks the user for the name and then sets </w:t>
-      </w:r>
-      <w:proofErr w:type="gramStart"/>
-      <w:r>
-        <w:t>all of</w:t>
-      </w:r>
-      <w:proofErr w:type="gramEnd"/>
-      <w:r>
-        <w:t xml:space="preserve"> the system settings except the battery calibration using the values in the file.</w:t>
-      </w:r>
-    </w:p>
-    <w:p>
-      <w:pPr>
-        <w:pStyle w:val="Heading3"/>
-      </w:pPr>
-      <w:r>
-        <w:t>Delete File</w:t>
-      </w:r>
-    </w:p>
-    <w:p>
-      <w:r>
-        <w:t>The user selects a file from the list and then it can be deleted.</w:t>
-      </w:r>
-    </w:p>
-    <w:p>
-      <w:pPr>
-        <w:pStyle w:val="Heading2"/>
-      </w:pPr>
-      <w:r>
-        <w:t>+System Settings</w:t>
-      </w:r>
-    </w:p>
-    <w:p>
-      <w:pPr>
-        <w:pStyle w:val="Heading3"/>
-      </w:pPr>
-      <w:r>
-        <w:t>+Display</w:t>
-      </w:r>
-      <w:r>
-        <w:t xml:space="preserve"> Settings</w:t>
+        <w:t>+Battery Settings</w:t>
+      </w:r>
+    </w:p>
+    <w:p>
+      <w:r>
+        <w:t>Since the PCB was designed with 10% resistors for measuring the battery voltage some calibration is needed. A future PCB will probably use better resistors so this won’t be needed.</w:t>
       </w:r>
     </w:p>
     <w:p>
@@ -3130,269 +2909,8 @@
         <w:pStyle w:val="Heading4"/>
       </w:pPr>
       <w:r>
-        <w:t xml:space="preserve">Dimming Mode: </w:t>
-      </w:r>
-      <w:proofErr w:type="spellStart"/>
-      <w:r>
-        <w:t>None</w:t>
-      </w:r>
-      <w:r>
-        <w:t>|Timer</w:t>
-      </w:r>
-      <w:proofErr w:type="spellEnd"/>
-    </w:p>
-    <w:p>
-      <w:r>
-        <w:t xml:space="preserve">The display can be set to dim automatically after a specified number of seconds. This is used to save battery power since the backlight </w:t>
-      </w:r>
-      <w:r>
-        <w:t>uses a significant amount.</w:t>
-      </w:r>
-    </w:p>
-    <w:p>
-      <w:pPr>
-        <w:pStyle w:val="Heading4"/>
-      </w:pPr>
-      <w:r>
-        <w:t>Bright Value: 1-100</w:t>
-      </w:r>
-      <w:r>
-        <w:t>%</w:t>
-      </w:r>
-    </w:p>
-    <w:p>
-      <w:r>
-        <w:t>Set the display brightness value.</w:t>
-      </w:r>
-    </w:p>
-    <w:p>
-      <w:pPr>
-        <w:pStyle w:val="Heading4"/>
-      </w:pPr>
-      <w:r>
-        <w:t xml:space="preserve">Dim Value: </w:t>
-      </w:r>
-      <w:r>
-        <w:t>0-100%</w:t>
-      </w:r>
-    </w:p>
-    <w:p>
-      <w:r>
-        <w:t xml:space="preserve">Set the display brightness after the </w:t>
-      </w:r>
-      <w:r>
-        <w:t>timer below expires.</w:t>
-      </w:r>
-    </w:p>
-    <w:p>
-      <w:pPr>
-        <w:pStyle w:val="Heading4"/>
-      </w:pPr>
-      <w:r>
-        <w:t>Display Dim Time:</w:t>
-      </w:r>
-      <w:r>
-        <w:t xml:space="preserve"> 0-120 S</w:t>
-      </w:r>
-    </w:p>
-    <w:p>
-      <w:r>
-        <w:t>Specify the time until the display changes to dim mode.</w:t>
-      </w:r>
-    </w:p>
-    <w:p>
-      <w:pPr>
-        <w:pStyle w:val="Heading4"/>
-      </w:pPr>
-      <w:r>
-        <w:t>+Sideways Scroll Settings</w:t>
-      </w:r>
-    </w:p>
-    <w:p>
-      <w:r>
-        <w:t xml:space="preserve">Lines of text that </w:t>
-      </w:r>
-      <w:proofErr w:type="gramStart"/>
-      <w:r>
-        <w:t>too</w:t>
-      </w:r>
-      <w:proofErr w:type="gramEnd"/>
-      <w:r>
-        <w:t xml:space="preserve"> long for the display will scroll back and forth. The following settings control the speed.</w:t>
-      </w:r>
-    </w:p>
-    <w:p>
-      <w:pPr>
-        <w:pStyle w:val="Heading5"/>
-      </w:pPr>
-      <w:r>
-        <w:t xml:space="preserve">Speed: </w:t>
-      </w:r>
-      <w:r>
-        <w:t>1-1000 mS</w:t>
-      </w:r>
-    </w:p>
-    <w:p>
-      <w:r>
-        <w:t>Controls the speed of text moving to the left.</w:t>
-      </w:r>
-    </w:p>
-    <w:p>
-      <w:pPr>
-        <w:pStyle w:val="Heading5"/>
-      </w:pPr>
-      <w:r>
-        <w:lastRenderedPageBreak/>
-        <w:t>Pause: 1-100</w:t>
-      </w:r>
-      <w:r>
-        <w:t xml:space="preserve"> mS</w:t>
-      </w:r>
-    </w:p>
-    <w:p>
-      <w:r>
-        <w:t>This controls the pause when the text is at the end (all the way to the left).</w:t>
-      </w:r>
-    </w:p>
-    <w:p>
-      <w:pPr>
-        <w:pStyle w:val="Heading5"/>
-      </w:pPr>
-      <w:r>
-        <w:t>Reverse Speed: 1-20x</w:t>
-      </w:r>
-    </w:p>
-    <w:p>
-      <w:r>
-        <w:t xml:space="preserve">This is how fast the text scrolls </w:t>
-      </w:r>
-      <w:r>
-        <w:t>back to the beginning (to the right). 2x means twice as fast as the text scroll</w:t>
-      </w:r>
-      <w:r>
-        <w:t>ed to the left</w:t>
-      </w:r>
-      <w:r>
-        <w:t>.</w:t>
-      </w:r>
-    </w:p>
-    <w:p>
-      <w:pPr>
-        <w:pStyle w:val="Heading4"/>
-      </w:pPr>
-      <w:r>
-        <w:t xml:space="preserve">Menu Selection: </w:t>
-      </w:r>
-      <w:r>
-        <w:t>Color|*</w:t>
-      </w:r>
-    </w:p>
-    <w:p>
-      <w:r>
-        <w:t>Menu selections</w:t>
-      </w:r>
-      <w:r>
-        <w:t xml:space="preserve"> and selections from a list can be either colored or marked with the ‘*’ character.</w:t>
-      </w:r>
-    </w:p>
-    <w:p>
-      <w:pPr>
-        <w:pStyle w:val="Heading4"/>
-      </w:pPr>
-      <w:r>
-        <w:t>Text/</w:t>
-      </w:r>
-      <w:proofErr w:type="spellStart"/>
-      <w:r>
-        <w:t>HiLite</w:t>
-      </w:r>
-      <w:proofErr w:type="spellEnd"/>
-      <w:r>
-        <w:t xml:space="preserve"> Colors</w:t>
-      </w:r>
-    </w:p>
-    <w:p>
-      <w:r>
-        <w:t>This selection allows for choosing the colors of the text and the highlight. The background screen is always black.</w:t>
-      </w:r>
-    </w:p>
-    <w:p>
-      <w:pPr>
-        <w:pStyle w:val="Heading3"/>
-      </w:pPr>
-      <w:r>
-        <w:t>+Dial &amp; Button Settings</w:t>
-      </w:r>
-    </w:p>
-    <w:p>
-      <w:pPr>
-        <w:pStyle w:val="Heading4"/>
-      </w:pPr>
-      <w:r>
-        <w:t xml:space="preserve">Direction: </w:t>
-      </w:r>
-      <w:proofErr w:type="spellStart"/>
-      <w:proofErr w:type="gramStart"/>
-      <w:r>
-        <w:t>Normal:Reverse</w:t>
-      </w:r>
-      <w:proofErr w:type="spellEnd"/>
-      <w:proofErr w:type="gramEnd"/>
-    </w:p>
-    <w:p>
-      <w:r>
-        <w:t>If you really want the button to be the other way around this is the choice for you.</w:t>
-      </w:r>
-    </w:p>
-    <w:p>
-      <w:pPr>
-        <w:pStyle w:val="Heading4"/>
-      </w:pPr>
-      <w:r>
-        <w:t>Long Press Timer: 2-200</w:t>
-      </w:r>
-    </w:p>
-    <w:p>
-      <w:r>
-        <w:t>This value affects how long or short a long press is. The default value is normally OK</w:t>
-      </w:r>
-      <w:r>
-        <w:t>, but somebody might want to change it.</w:t>
-      </w:r>
-    </w:p>
-    <w:p>
-      <w:pPr>
-        <w:pStyle w:val="Heading3"/>
-      </w:pPr>
-      <w:r>
-        <w:t>+Battery Settings</w:t>
-      </w:r>
-    </w:p>
-    <w:p>
-      <w:r>
-        <w:t xml:space="preserve">Since the PCB was designed with 10% resistors for measuring the battery voltage some calibration is needed. A future PCB will probably use better </w:t>
-      </w:r>
-      <w:proofErr w:type="gramStart"/>
-      <w:r>
-        <w:t>resistors</w:t>
-      </w:r>
-      <w:proofErr w:type="gramEnd"/>
-      <w:r>
-        <w:t xml:space="preserve"> so this won’t be needed.</w:t>
-      </w:r>
-    </w:p>
-    <w:p>
-      <w:pPr>
-        <w:pStyle w:val="Heading4"/>
-      </w:pPr>
-      <w:r>
-        <w:t xml:space="preserve">Show Battery: </w:t>
-      </w:r>
-      <w:proofErr w:type="spellStart"/>
-      <w:r>
-        <w:t>Yes|No</w:t>
-      </w:r>
-      <w:proofErr w:type="spellEnd"/>
+        <w:t>Show Battery: Yes|No</w:t>
+      </w:r>
     </w:p>
     <w:p>
       <w:r>
@@ -3442,15 +2960,7 @@
         <w:t>This continuously reads the battery value</w:t>
       </w:r>
       <w:r>
-        <w:t xml:space="preserve">. It was originally used for testing, but it seems like it might possibly be </w:t>
-      </w:r>
-      <w:proofErr w:type="gramStart"/>
-      <w:r>
-        <w:t>useful</w:t>
-      </w:r>
-      <w:proofErr w:type="gramEnd"/>
-      <w:r>
-        <w:t xml:space="preserve"> so it was left in the menu system.</w:t>
+        <w:t>. It was originally used for testing, but it seems like it might possibly be useful so it was left in the menu system.</w:t>
       </w:r>
     </w:p>
     <w:p>
@@ -3466,15 +2976,7 @@
         <w:t xml:space="preserve">New firmware can be loaded by putting </w:t>
       </w:r>
       <w:r>
-        <w:t xml:space="preserve">the binary file on the SD card. It must be named </w:t>
-      </w:r>
-      <w:proofErr w:type="spellStart"/>
-      <w:r>
-        <w:t>RadioFox.BIN</w:t>
-      </w:r>
-      <w:proofErr w:type="spellEnd"/>
-      <w:r>
-        <w:t>.</w:t>
+        <w:t>the binary file on the SD card. It must be named RadioFox.BIN.</w:t>
       </w:r>
       <w:r>
         <w:t xml:space="preserve"> There are two prompts, one to confirm overwriting the firmware, and another to allow deletion of the </w:t>
@@ -3504,6 +3006,9 @@
       <w:r>
         <w:t xml:space="preserve"> except the high battery value to the original factory values.</w:t>
       </w:r>
+      <w:r>
+        <w:t xml:space="preserve"> The factory reset can also be done by holding the dial button down while turning the power on.</w:t>
+      </w:r>
     </w:p>
     <w:p>
       <w:pPr>
@@ -3521,21 +3026,8 @@
         <w:t xml:space="preserve">and reset </w:t>
       </w:r>
       <w:r>
-        <w:t xml:space="preserve">the </w:t>
-      </w:r>
-      <w:proofErr w:type="spellStart"/>
-      <w:r>
-        <w:t>eeprom</w:t>
-      </w:r>
-      <w:proofErr w:type="spellEnd"/>
-      <w:r>
-        <w:t xml:space="preserve"> where the settings are </w:t>
-      </w:r>
-      <w:proofErr w:type="gramStart"/>
-      <w:r>
-        <w:t>save</w:t>
-      </w:r>
-      <w:proofErr w:type="gramEnd"/>
+        <w:t>the eeprom where the settings are save</w:t>
+      </w:r>
       <w:r>
         <w:t xml:space="preserve"> in non-volatile memory. This is how settings are saved while the system is not powered.</w:t>
       </w:r>
@@ -3550,15 +3042,7 @@
     </w:p>
     <w:p>
       <w:r>
-        <w:t xml:space="preserve">This stores </w:t>
-      </w:r>
-      <w:proofErr w:type="gramStart"/>
-      <w:r>
-        <w:t>all of</w:t>
-      </w:r>
-      <w:proofErr w:type="gramEnd"/>
-      <w:r>
-        <w:t xml:space="preserve"> the current settings in the non-volatile memory</w:t>
+        <w:t>This stores all of the current settings in the non-volatile memory</w:t>
       </w:r>
       <w:r>
         <w:t>. Note that this is not often used since settings are normally saved each time they are changed.</w:t>
@@ -10498,6 +9982,118 @@
     </w:lvl>
   </w:abstractNum>
   <w:abstractNum w:abstractNumId="60" w15:restartNumberingAfterBreak="0">
+    <w:nsid w:val="47746E93"/>
+    <w:multiLevelType w:val="hybridMultilevel"/>
+    <w:tmpl w:val="2B721A4A"/>
+    <w:lvl w:ilvl="0" w:tplc="6ADAC7C4">
+      <w:numFmt w:val="bullet"/>
+      <w:lvlText w:val="-"/>
+      <w:lvlJc w:val="left"/>
+      <w:pPr>
+        <w:ind w:left="720" w:hanging="360"/>
+      </w:pPr>
+      <w:rPr>
+        <w:rFonts w:ascii="Arial" w:eastAsia="Arial" w:hAnsi="Arial" w:cs="Arial" w:hint="default"/>
+      </w:rPr>
+    </w:lvl>
+    <w:lvl w:ilvl="1" w:tplc="04090003" w:tentative="1">
+      <w:start w:val="1"/>
+      <w:numFmt w:val="bullet"/>
+      <w:lvlText w:val="o"/>
+      <w:lvlJc w:val="left"/>
+      <w:pPr>
+        <w:ind w:left="1440" w:hanging="360"/>
+      </w:pPr>
+      <w:rPr>
+        <w:rFonts w:ascii="Courier New" w:hAnsi="Courier New" w:cs="Courier New" w:hint="default"/>
+      </w:rPr>
+    </w:lvl>
+    <w:lvl w:ilvl="2" w:tplc="04090005" w:tentative="1">
+      <w:start w:val="1"/>
+      <w:numFmt w:val="bullet"/>
+      <w:lvlText w:val=""/>
+      <w:lvlJc w:val="left"/>
+      <w:pPr>
+        <w:ind w:left="2160" w:hanging="360"/>
+      </w:pPr>
+      <w:rPr>
+        <w:rFonts w:ascii="Wingdings" w:hAnsi="Wingdings" w:hint="default"/>
+      </w:rPr>
+    </w:lvl>
+    <w:lvl w:ilvl="3" w:tplc="04090001" w:tentative="1">
+      <w:start w:val="1"/>
+      <w:numFmt w:val="bullet"/>
+      <w:lvlText w:val=""/>
+      <w:lvlJc w:val="left"/>
+      <w:pPr>
+        <w:ind w:left="2880" w:hanging="360"/>
+      </w:pPr>
+      <w:rPr>
+        <w:rFonts w:ascii="Symbol" w:hAnsi="Symbol" w:hint="default"/>
+      </w:rPr>
+    </w:lvl>
+    <w:lvl w:ilvl="4" w:tplc="04090003" w:tentative="1">
+      <w:start w:val="1"/>
+      <w:numFmt w:val="bullet"/>
+      <w:lvlText w:val="o"/>
+      <w:lvlJc w:val="left"/>
+      <w:pPr>
+        <w:ind w:left="3600" w:hanging="360"/>
+      </w:pPr>
+      <w:rPr>
+        <w:rFonts w:ascii="Courier New" w:hAnsi="Courier New" w:cs="Courier New" w:hint="default"/>
+      </w:rPr>
+    </w:lvl>
+    <w:lvl w:ilvl="5" w:tplc="04090005" w:tentative="1">
+      <w:start w:val="1"/>
+      <w:numFmt w:val="bullet"/>
+      <w:lvlText w:val=""/>
+      <w:lvlJc w:val="left"/>
+      <w:pPr>
+        <w:ind w:left="4320" w:hanging="360"/>
+      </w:pPr>
+      <w:rPr>
+        <w:rFonts w:ascii="Wingdings" w:hAnsi="Wingdings" w:hint="default"/>
+      </w:rPr>
+    </w:lvl>
+    <w:lvl w:ilvl="6" w:tplc="04090001" w:tentative="1">
+      <w:start w:val="1"/>
+      <w:numFmt w:val="bullet"/>
+      <w:lvlText w:val=""/>
+      <w:lvlJc w:val="left"/>
+      <w:pPr>
+        <w:ind w:left="5040" w:hanging="360"/>
+      </w:pPr>
+      <w:rPr>
+        <w:rFonts w:ascii="Symbol" w:hAnsi="Symbol" w:hint="default"/>
+      </w:rPr>
+    </w:lvl>
+    <w:lvl w:ilvl="7" w:tplc="04090003" w:tentative="1">
+      <w:start w:val="1"/>
+      <w:numFmt w:val="bullet"/>
+      <w:lvlText w:val="o"/>
+      <w:lvlJc w:val="left"/>
+      <w:pPr>
+        <w:ind w:left="5760" w:hanging="360"/>
+      </w:pPr>
+      <w:rPr>
+        <w:rFonts w:ascii="Courier New" w:hAnsi="Courier New" w:cs="Courier New" w:hint="default"/>
+      </w:rPr>
+    </w:lvl>
+    <w:lvl w:ilvl="8" w:tplc="04090005" w:tentative="1">
+      <w:start w:val="1"/>
+      <w:numFmt w:val="bullet"/>
+      <w:lvlText w:val=""/>
+      <w:lvlJc w:val="left"/>
+      <w:pPr>
+        <w:ind w:left="6480" w:hanging="360"/>
+      </w:pPr>
+      <w:rPr>
+        <w:rFonts w:ascii="Wingdings" w:hAnsi="Wingdings" w:hint="default"/>
+      </w:rPr>
+    </w:lvl>
+  </w:abstractNum>
+  <w:abstractNum w:abstractNumId="61" w15:restartNumberingAfterBreak="0">
     <w:nsid w:val="483D056B"/>
     <w:multiLevelType w:val="hybridMultilevel"/>
     <w:tmpl w:val="C4DCE034"/>
@@ -10609,7 +10205,7 @@
       </w:rPr>
     </w:lvl>
   </w:abstractNum>
-  <w:abstractNum w:abstractNumId="61" w15:restartNumberingAfterBreak="0">
+  <w:abstractNum w:abstractNumId="62" w15:restartNumberingAfterBreak="0">
     <w:nsid w:val="48813A05"/>
     <w:multiLevelType w:val="hybridMultilevel"/>
     <w:tmpl w:val="42CAA4CE"/>
@@ -10722,7 +10318,7 @@
       </w:rPr>
     </w:lvl>
   </w:abstractNum>
-  <w:abstractNum w:abstractNumId="62" w15:restartNumberingAfterBreak="0">
+  <w:abstractNum w:abstractNumId="63" w15:restartNumberingAfterBreak="0">
     <w:nsid w:val="4A3C29DC"/>
     <w:multiLevelType w:val="hybridMultilevel"/>
     <w:tmpl w:val="29F4D392"/>
@@ -10834,7 +10430,7 @@
       </w:rPr>
     </w:lvl>
   </w:abstractNum>
-  <w:abstractNum w:abstractNumId="63" w15:restartNumberingAfterBreak="0">
+  <w:abstractNum w:abstractNumId="64" w15:restartNumberingAfterBreak="0">
     <w:nsid w:val="4A9B6FB7"/>
     <w:multiLevelType w:val="hybridMultilevel"/>
     <w:tmpl w:val="C47ECA54"/>
@@ -10946,7 +10542,7 @@
       </w:rPr>
     </w:lvl>
   </w:abstractNum>
-  <w:abstractNum w:abstractNumId="64" w15:restartNumberingAfterBreak="0">
+  <w:abstractNum w:abstractNumId="65" w15:restartNumberingAfterBreak="0">
     <w:nsid w:val="4C2207ED"/>
     <w:multiLevelType w:val="hybridMultilevel"/>
     <w:tmpl w:val="E95272B2"/>
@@ -11058,7 +10654,7 @@
       </w:rPr>
     </w:lvl>
   </w:abstractNum>
-  <w:abstractNum w:abstractNumId="65" w15:restartNumberingAfterBreak="0">
+  <w:abstractNum w:abstractNumId="66" w15:restartNumberingAfterBreak="0">
     <w:nsid w:val="4C687CB3"/>
     <w:multiLevelType w:val="hybridMultilevel"/>
     <w:tmpl w:val="0D781E22"/>
@@ -11170,7 +10766,7 @@
       </w:rPr>
     </w:lvl>
   </w:abstractNum>
-  <w:abstractNum w:abstractNumId="66" w15:restartNumberingAfterBreak="0">
+  <w:abstractNum w:abstractNumId="67" w15:restartNumberingAfterBreak="0">
     <w:nsid w:val="4FCE4725"/>
     <w:multiLevelType w:val="hybridMultilevel"/>
     <w:tmpl w:val="914EE3B4"/>
@@ -11282,7 +10878,7 @@
       </w:rPr>
     </w:lvl>
   </w:abstractNum>
-  <w:abstractNum w:abstractNumId="67" w15:restartNumberingAfterBreak="0">
+  <w:abstractNum w:abstractNumId="68" w15:restartNumberingAfterBreak="0">
     <w:nsid w:val="51CE085C"/>
     <w:multiLevelType w:val="hybridMultilevel"/>
     <w:tmpl w:val="84788A08"/>
@@ -11394,7 +10990,7 @@
       </w:rPr>
     </w:lvl>
   </w:abstractNum>
-  <w:abstractNum w:abstractNumId="68" w15:restartNumberingAfterBreak="0">
+  <w:abstractNum w:abstractNumId="69" w15:restartNumberingAfterBreak="0">
     <w:nsid w:val="52944BD2"/>
     <w:multiLevelType w:val="hybridMultilevel"/>
     <w:tmpl w:val="BC3489E0"/>
@@ -11506,7 +11102,7 @@
       </w:rPr>
     </w:lvl>
   </w:abstractNum>
-  <w:abstractNum w:abstractNumId="69" w15:restartNumberingAfterBreak="0">
+  <w:abstractNum w:abstractNumId="70" w15:restartNumberingAfterBreak="0">
     <w:nsid w:val="565E12F2"/>
     <w:multiLevelType w:val="hybridMultilevel"/>
     <w:tmpl w:val="9E96747C"/>
@@ -11618,7 +11214,7 @@
       </w:rPr>
     </w:lvl>
   </w:abstractNum>
-  <w:abstractNum w:abstractNumId="70" w15:restartNumberingAfterBreak="0">
+  <w:abstractNum w:abstractNumId="71" w15:restartNumberingAfterBreak="0">
     <w:nsid w:val="57466407"/>
     <w:multiLevelType w:val="hybridMultilevel"/>
     <w:tmpl w:val="0F9ADCF4"/>
@@ -11730,7 +11326,7 @@
       </w:rPr>
     </w:lvl>
   </w:abstractNum>
-  <w:abstractNum w:abstractNumId="71" w15:restartNumberingAfterBreak="0">
+  <w:abstractNum w:abstractNumId="72" w15:restartNumberingAfterBreak="0">
     <w:nsid w:val="5ABE68FB"/>
     <w:multiLevelType w:val="hybridMultilevel"/>
     <w:tmpl w:val="B422F472"/>
@@ -11842,7 +11438,7 @@
       </w:rPr>
     </w:lvl>
   </w:abstractNum>
-  <w:abstractNum w:abstractNumId="72" w15:restartNumberingAfterBreak="0">
+  <w:abstractNum w:abstractNumId="73" w15:restartNumberingAfterBreak="0">
     <w:nsid w:val="5BA928F1"/>
     <w:multiLevelType w:val="hybridMultilevel"/>
     <w:tmpl w:val="4D4E1798"/>
@@ -11954,7 +11550,7 @@
       </w:rPr>
     </w:lvl>
   </w:abstractNum>
-  <w:abstractNum w:abstractNumId="73" w15:restartNumberingAfterBreak="0">
+  <w:abstractNum w:abstractNumId="74" w15:restartNumberingAfterBreak="0">
     <w:nsid w:val="5C834FA4"/>
     <w:multiLevelType w:val="hybridMultilevel"/>
     <w:tmpl w:val="1FC415FC"/>
@@ -12066,7 +11662,7 @@
       </w:rPr>
     </w:lvl>
   </w:abstractNum>
-  <w:abstractNum w:abstractNumId="74" w15:restartNumberingAfterBreak="0">
+  <w:abstractNum w:abstractNumId="75" w15:restartNumberingAfterBreak="0">
     <w:nsid w:val="5F3C3936"/>
     <w:multiLevelType w:val="hybridMultilevel"/>
     <w:tmpl w:val="917CC46E"/>
@@ -12178,7 +11774,7 @@
       </w:rPr>
     </w:lvl>
   </w:abstractNum>
-  <w:abstractNum w:abstractNumId="75" w15:restartNumberingAfterBreak="0">
+  <w:abstractNum w:abstractNumId="76" w15:restartNumberingAfterBreak="0">
     <w:nsid w:val="60544E94"/>
     <w:multiLevelType w:val="hybridMultilevel"/>
     <w:tmpl w:val="CBCAC042"/>
@@ -12290,7 +11886,7 @@
       </w:rPr>
     </w:lvl>
   </w:abstractNum>
-  <w:abstractNum w:abstractNumId="76" w15:restartNumberingAfterBreak="0">
+  <w:abstractNum w:abstractNumId="77" w15:restartNumberingAfterBreak="0">
     <w:nsid w:val="62D1418B"/>
     <w:multiLevelType w:val="multilevel"/>
     <w:tmpl w:val="3E58308A"/>
@@ -12389,7 +11985,7 @@
       </w:pPr>
     </w:lvl>
   </w:abstractNum>
-  <w:abstractNum w:abstractNumId="77" w15:restartNumberingAfterBreak="0">
+  <w:abstractNum w:abstractNumId="78" w15:restartNumberingAfterBreak="0">
     <w:nsid w:val="62E52923"/>
     <w:multiLevelType w:val="hybridMultilevel"/>
     <w:tmpl w:val="7668165A"/>
@@ -12501,7 +12097,7 @@
       </w:rPr>
     </w:lvl>
   </w:abstractNum>
-  <w:abstractNum w:abstractNumId="78" w15:restartNumberingAfterBreak="0">
+  <w:abstractNum w:abstractNumId="79" w15:restartNumberingAfterBreak="0">
     <w:nsid w:val="63935A88"/>
     <w:multiLevelType w:val="hybridMultilevel"/>
     <w:tmpl w:val="0F5805EA"/>
@@ -12613,7 +12209,7 @@
       </w:rPr>
     </w:lvl>
   </w:abstractNum>
-  <w:abstractNum w:abstractNumId="79" w15:restartNumberingAfterBreak="0">
+  <w:abstractNum w:abstractNumId="80" w15:restartNumberingAfterBreak="0">
     <w:nsid w:val="69496F08"/>
     <w:multiLevelType w:val="hybridMultilevel"/>
     <w:tmpl w:val="6EE839E4"/>
@@ -12725,7 +12321,7 @@
       </w:rPr>
     </w:lvl>
   </w:abstractNum>
-  <w:abstractNum w:abstractNumId="80" w15:restartNumberingAfterBreak="0">
+  <w:abstractNum w:abstractNumId="81" w15:restartNumberingAfterBreak="0">
     <w:nsid w:val="6ACC6C5E"/>
     <w:multiLevelType w:val="multilevel"/>
     <w:tmpl w:val="4AB8E1DA"/>
@@ -12838,7 +12434,7 @@
       </w:rPr>
     </w:lvl>
   </w:abstractNum>
-  <w:abstractNum w:abstractNumId="81" w15:restartNumberingAfterBreak="0">
+  <w:abstractNum w:abstractNumId="82" w15:restartNumberingAfterBreak="0">
     <w:nsid w:val="6D7319F8"/>
     <w:multiLevelType w:val="hybridMultilevel"/>
     <w:tmpl w:val="A7EEE4A4"/>
@@ -12950,7 +12546,7 @@
       </w:rPr>
     </w:lvl>
   </w:abstractNum>
-  <w:abstractNum w:abstractNumId="82" w15:restartNumberingAfterBreak="0">
+  <w:abstractNum w:abstractNumId="83" w15:restartNumberingAfterBreak="0">
     <w:nsid w:val="6D94244E"/>
     <w:multiLevelType w:val="hybridMultilevel"/>
     <w:tmpl w:val="D38C1A3A"/>
@@ -13062,7 +12658,7 @@
       </w:rPr>
     </w:lvl>
   </w:abstractNum>
-  <w:abstractNum w:abstractNumId="83" w15:restartNumberingAfterBreak="0">
+  <w:abstractNum w:abstractNumId="84" w15:restartNumberingAfterBreak="0">
     <w:nsid w:val="6DEA09BD"/>
     <w:multiLevelType w:val="hybridMultilevel"/>
     <w:tmpl w:val="029A123E"/>
@@ -13174,7 +12770,7 @@
       </w:rPr>
     </w:lvl>
   </w:abstractNum>
-  <w:abstractNum w:abstractNumId="84" w15:restartNumberingAfterBreak="0">
+  <w:abstractNum w:abstractNumId="85" w15:restartNumberingAfterBreak="0">
     <w:nsid w:val="6E310D77"/>
     <w:multiLevelType w:val="hybridMultilevel"/>
     <w:tmpl w:val="9C74834E"/>
@@ -13287,7 +12883,7 @@
       </w:rPr>
     </w:lvl>
   </w:abstractNum>
-  <w:abstractNum w:abstractNumId="85" w15:restartNumberingAfterBreak="0">
+  <w:abstractNum w:abstractNumId="86" w15:restartNumberingAfterBreak="0">
     <w:nsid w:val="74D85371"/>
     <w:multiLevelType w:val="hybridMultilevel"/>
     <w:tmpl w:val="B20E36AC"/>
@@ -13399,7 +12995,7 @@
       </w:rPr>
     </w:lvl>
   </w:abstractNum>
-  <w:abstractNum w:abstractNumId="86" w15:restartNumberingAfterBreak="0">
+  <w:abstractNum w:abstractNumId="87" w15:restartNumberingAfterBreak="0">
     <w:nsid w:val="75FA3747"/>
     <w:multiLevelType w:val="hybridMultilevel"/>
     <w:tmpl w:val="B9F43A9E"/>
@@ -13511,7 +13107,7 @@
       </w:rPr>
     </w:lvl>
   </w:abstractNum>
-  <w:abstractNum w:abstractNumId="87" w15:restartNumberingAfterBreak="0">
+  <w:abstractNum w:abstractNumId="88" w15:restartNumberingAfterBreak="0">
     <w:nsid w:val="7877407A"/>
     <w:multiLevelType w:val="hybridMultilevel"/>
     <w:tmpl w:val="C91E38FA"/>
@@ -13623,7 +13219,7 @@
       </w:rPr>
     </w:lvl>
   </w:abstractNum>
-  <w:abstractNum w:abstractNumId="88" w15:restartNumberingAfterBreak="0">
+  <w:abstractNum w:abstractNumId="89" w15:restartNumberingAfterBreak="0">
     <w:nsid w:val="78A40DC3"/>
     <w:multiLevelType w:val="hybridMultilevel"/>
     <w:tmpl w:val="F1E6B4B6"/>
@@ -13735,7 +13331,7 @@
       </w:rPr>
     </w:lvl>
   </w:abstractNum>
-  <w:abstractNum w:abstractNumId="89" w15:restartNumberingAfterBreak="0">
+  <w:abstractNum w:abstractNumId="90" w15:restartNumberingAfterBreak="0">
     <w:nsid w:val="79587B7C"/>
     <w:multiLevelType w:val="hybridMultilevel"/>
     <w:tmpl w:val="6A46933A"/>
@@ -13847,7 +13443,7 @@
       </w:rPr>
     </w:lvl>
   </w:abstractNum>
-  <w:abstractNum w:abstractNumId="90" w15:restartNumberingAfterBreak="0">
+  <w:abstractNum w:abstractNumId="91" w15:restartNumberingAfterBreak="0">
     <w:nsid w:val="7BB23699"/>
     <w:multiLevelType w:val="hybridMultilevel"/>
     <w:tmpl w:val="26C25814"/>
@@ -13959,7 +13555,7 @@
       </w:rPr>
     </w:lvl>
   </w:abstractNum>
-  <w:abstractNum w:abstractNumId="91" w15:restartNumberingAfterBreak="0">
+  <w:abstractNum w:abstractNumId="92" w15:restartNumberingAfterBreak="0">
     <w:nsid w:val="7F827ECF"/>
     <w:multiLevelType w:val="hybridMultilevel"/>
     <w:tmpl w:val="42DE9398"/>
@@ -14072,7 +13668,7 @@
     </w:lvl>
   </w:abstractNum>
   <w:num w:numId="1" w16cid:durableId="553472407">
-    <w:abstractNumId w:val="80"/>
+    <w:abstractNumId w:val="81"/>
   </w:num>
   <w:num w:numId="2" w16cid:durableId="1531718695">
     <w:abstractNumId w:val="16"/>
@@ -14087,16 +13683,16 @@
     <w:abstractNumId w:val="29"/>
   </w:num>
   <w:num w:numId="6" w16cid:durableId="915629572">
-    <w:abstractNumId w:val="76"/>
+    <w:abstractNumId w:val="77"/>
   </w:num>
   <w:num w:numId="7" w16cid:durableId="693576224">
-    <w:abstractNumId w:val="89"/>
+    <w:abstractNumId w:val="90"/>
   </w:num>
   <w:num w:numId="8" w16cid:durableId="1298343021">
-    <w:abstractNumId w:val="84"/>
+    <w:abstractNumId w:val="85"/>
   </w:num>
   <w:num w:numId="9" w16cid:durableId="367219526">
-    <w:abstractNumId w:val="82"/>
+    <w:abstractNumId w:val="83"/>
   </w:num>
   <w:num w:numId="10" w16cid:durableId="1497187389">
     <w:abstractNumId w:val="18"/>
@@ -14117,13 +13713,13 @@
     <w:abstractNumId w:val="5"/>
   </w:num>
   <w:num w:numId="16" w16cid:durableId="1421751508">
-    <w:abstractNumId w:val="91"/>
+    <w:abstractNumId w:val="92"/>
   </w:num>
   <w:num w:numId="17" w16cid:durableId="1009716389">
-    <w:abstractNumId w:val="61"/>
+    <w:abstractNumId w:val="62"/>
   </w:num>
   <w:num w:numId="18" w16cid:durableId="300229387">
-    <w:abstractNumId w:val="67"/>
+    <w:abstractNumId w:val="68"/>
   </w:num>
   <w:num w:numId="19" w16cid:durableId="1025836216">
     <w:abstractNumId w:val="49"/>
@@ -14135,13 +13731,13 @@
     <w:abstractNumId w:val="38"/>
   </w:num>
   <w:num w:numId="22" w16cid:durableId="177355694">
-    <w:abstractNumId w:val="74"/>
+    <w:abstractNumId w:val="75"/>
   </w:num>
   <w:num w:numId="23" w16cid:durableId="6762404">
     <w:abstractNumId w:val="58"/>
   </w:num>
   <w:num w:numId="24" w16cid:durableId="1492133217">
-    <w:abstractNumId w:val="64"/>
+    <w:abstractNumId w:val="65"/>
   </w:num>
   <w:num w:numId="25" w16cid:durableId="695159279">
     <w:abstractNumId w:val="27"/>
@@ -14153,16 +13749,16 @@
     <w:abstractNumId w:val="41"/>
   </w:num>
   <w:num w:numId="28" w16cid:durableId="1082484344">
-    <w:abstractNumId w:val="60"/>
+    <w:abstractNumId w:val="61"/>
   </w:num>
   <w:num w:numId="29" w16cid:durableId="467865549">
-    <w:abstractNumId w:val="65"/>
+    <w:abstractNumId w:val="66"/>
   </w:num>
   <w:num w:numId="30" w16cid:durableId="1656108771">
     <w:abstractNumId w:val="17"/>
   </w:num>
   <w:num w:numId="31" w16cid:durableId="1611818230">
-    <w:abstractNumId w:val="83"/>
+    <w:abstractNumId w:val="84"/>
   </w:num>
   <w:num w:numId="32" w16cid:durableId="1666009498">
     <w:abstractNumId w:val="10"/>
@@ -14186,37 +13782,37 @@
     <w:abstractNumId w:val="34"/>
   </w:num>
   <w:num w:numId="39" w16cid:durableId="798885554">
-    <w:abstractNumId w:val="90"/>
+    <w:abstractNumId w:val="91"/>
   </w:num>
   <w:num w:numId="40" w16cid:durableId="1610315013">
-    <w:abstractNumId w:val="77"/>
+    <w:abstractNumId w:val="78"/>
   </w:num>
   <w:num w:numId="41" w16cid:durableId="213975163">
     <w:abstractNumId w:val="4"/>
   </w:num>
   <w:num w:numId="42" w16cid:durableId="511454106">
-    <w:abstractNumId w:val="73"/>
+    <w:abstractNumId w:val="74"/>
   </w:num>
   <w:num w:numId="43" w16cid:durableId="1721711403">
     <w:abstractNumId w:val="21"/>
   </w:num>
   <w:num w:numId="44" w16cid:durableId="652369700">
-    <w:abstractNumId w:val="81"/>
+    <w:abstractNumId w:val="82"/>
   </w:num>
   <w:num w:numId="45" w16cid:durableId="227304564">
-    <w:abstractNumId w:val="66"/>
+    <w:abstractNumId w:val="67"/>
   </w:num>
   <w:num w:numId="46" w16cid:durableId="1561091169">
     <w:abstractNumId w:val="31"/>
   </w:num>
   <w:num w:numId="47" w16cid:durableId="734011883">
-    <w:abstractNumId w:val="78"/>
+    <w:abstractNumId w:val="79"/>
   </w:num>
   <w:num w:numId="48" w16cid:durableId="2125267477">
-    <w:abstractNumId w:val="70"/>
+    <w:abstractNumId w:val="71"/>
   </w:num>
   <w:num w:numId="49" w16cid:durableId="1612585929">
-    <w:abstractNumId w:val="69"/>
+    <w:abstractNumId w:val="70"/>
   </w:num>
   <w:num w:numId="50" w16cid:durableId="1628664370">
     <w:abstractNumId w:val="3"/>
@@ -14228,13 +13824,13 @@
     <w:abstractNumId w:val="56"/>
   </w:num>
   <w:num w:numId="53" w16cid:durableId="1740665818">
-    <w:abstractNumId w:val="86"/>
+    <w:abstractNumId w:val="87"/>
   </w:num>
   <w:num w:numId="54" w16cid:durableId="452988921">
-    <w:abstractNumId w:val="87"/>
+    <w:abstractNumId w:val="88"/>
   </w:num>
   <w:num w:numId="55" w16cid:durableId="207304158">
-    <w:abstractNumId w:val="68"/>
+    <w:abstractNumId w:val="69"/>
   </w:num>
   <w:num w:numId="56" w16cid:durableId="2016880598">
     <w:abstractNumId w:val="19"/>
@@ -14249,7 +13845,7 @@
     <w:abstractNumId w:val="48"/>
   </w:num>
   <w:num w:numId="60" w16cid:durableId="2130009061">
-    <w:abstractNumId w:val="71"/>
+    <w:abstractNumId w:val="72"/>
   </w:num>
   <w:num w:numId="61" w16cid:durableId="1293515410">
     <w:abstractNumId w:val="2"/>
@@ -14297,16 +13893,16 @@
     <w:abstractNumId w:val="42"/>
   </w:num>
   <w:num w:numId="76" w16cid:durableId="539049649">
-    <w:abstractNumId w:val="88"/>
+    <w:abstractNumId w:val="89"/>
   </w:num>
   <w:num w:numId="77" w16cid:durableId="1288513951">
-    <w:abstractNumId w:val="62"/>
+    <w:abstractNumId w:val="63"/>
   </w:num>
   <w:num w:numId="78" w16cid:durableId="1532762005">
     <w:abstractNumId w:val="52"/>
   </w:num>
   <w:num w:numId="79" w16cid:durableId="1374647797">
-    <w:abstractNumId w:val="75"/>
+    <w:abstractNumId w:val="76"/>
   </w:num>
   <w:num w:numId="80" w16cid:durableId="1210456390">
     <w:abstractNumId w:val="8"/>
@@ -14315,7 +13911,7 @@
     <w:abstractNumId w:val="35"/>
   </w:num>
   <w:num w:numId="82" w16cid:durableId="500893856">
-    <w:abstractNumId w:val="79"/>
+    <w:abstractNumId w:val="80"/>
   </w:num>
   <w:num w:numId="83" w16cid:durableId="1950622049">
     <w:abstractNumId w:val="57"/>
@@ -14333,19 +13929,22 @@
     <w:abstractNumId w:val="47"/>
   </w:num>
   <w:num w:numId="88" w16cid:durableId="2105687898">
-    <w:abstractNumId w:val="72"/>
+    <w:abstractNumId w:val="73"/>
   </w:num>
   <w:num w:numId="89" w16cid:durableId="363360886">
     <w:abstractNumId w:val="22"/>
   </w:num>
   <w:num w:numId="90" w16cid:durableId="974530531">
-    <w:abstractNumId w:val="63"/>
+    <w:abstractNumId w:val="64"/>
   </w:num>
   <w:num w:numId="91" w16cid:durableId="780148532">
-    <w:abstractNumId w:val="85"/>
+    <w:abstractNumId w:val="86"/>
   </w:num>
   <w:num w:numId="92" w16cid:durableId="304706915">
     <w:abstractNumId w:val="44"/>
+  </w:num>
+  <w:num w:numId="93" w16cid:durableId="1232305665">
+    <w:abstractNumId w:val="60"/>
   </w:num>
   <w:numIdMacAtCleanup w:val="84"/>
 </w:numbering>
@@ -15234,6 +14833,16 @@
     <w:uiPriority w:val="99"/>
     <w:rsid w:val="005A0C24"/>
   </w:style>
+  <w:style w:type="paragraph" w:styleId="Revision">
+    <w:name w:val="Revision"/>
+    <w:hidden/>
+    <w:uiPriority w:val="99"/>
+    <w:semiHidden/>
+    <w:rsid w:val="00774A46"/>
+    <w:pPr>
+      <w:spacing w:line="240" w:lineRule="auto"/>
+    </w:pPr>
+  </w:style>
 </w:styles>
 </file>
 

</xml_diff>

<commit_message>
Change "Beacon Frequency Mode" in menus to "Beacon Frequency". Added DTMF documentation to docx file.
</commit_message>
<xml_diff>
--- a/RadioFox.docx
+++ b/RadioFox.docx
@@ -53,7 +53,17 @@
         <w:t>amateur</w:t>
       </w:r>
       <w:r>
-        <w:t xml:space="preserve"> radio enthusiasts (AKA Hams) that is know as fox hunting or sometimes as bunny hunting. It is played by hiding a transmitter that transmits periodically and then silent until it is time to transmit again. This cycle repeats. Teams use radio receivers with directional antennas to find the transmitter.</w:t>
+        <w:t xml:space="preserve"> radio enthusiasts (AKA Hams) that is </w:t>
+      </w:r>
+      <w:proofErr w:type="spellStart"/>
+      <w:proofErr w:type="gramStart"/>
+      <w:r>
+        <w:t>know</w:t>
+      </w:r>
+      <w:proofErr w:type="spellEnd"/>
+      <w:proofErr w:type="gramEnd"/>
+      <w:r>
+        <w:t xml:space="preserve"> as fox hunting or sometimes as bunny hunting. It is played by hiding a transmitter that transmits periodically and then silent until it is time to transmit again. This cycle repeats. Teams use radio receivers with directional antennas to find the transmitter.</w:t>
       </w:r>
       <w:r>
         <w:t xml:space="preserve"> The technique is called triangulation. The first team to find the transmitter wins.</w:t>
@@ -74,7 +84,15 @@
         <w:t xml:space="preserve">Many of these radios are homemade using handheld radios and timers. This device is a single PCB (printed circuit board) using an esp32 (Arduino) </w:t>
       </w:r>
       <w:r>
-        <w:t>computer with a display. There are two 18650 batteries with charging circuit and an SA818 shortwave transceiver module on the PCB. A rotary push button dial is used to set the various parameters for the fox</w:t>
+        <w:t xml:space="preserve">computer with a display. There are two 18650 batteries with charging </w:t>
+      </w:r>
+      <w:proofErr w:type="gramStart"/>
+      <w:r>
+        <w:t>circuit</w:t>
+      </w:r>
+      <w:proofErr w:type="gramEnd"/>
+      <w:r>
+        <w:t xml:space="preserve"> and an SA818 shortwave transceiver module on the PCB. A rotary push button dial is used to set the various parameters for the fox</w:t>
       </w:r>
       <w:r>
         <w:t>. These parameters include transmit time, pause time, frequency settings</w:t>
@@ -276,6 +294,23 @@
     </w:p>
     <w:p>
       <w:r>
+        <w:t>Version 1.07</w:t>
+      </w:r>
+    </w:p>
+    <w:p>
+      <w:pPr>
+        <w:pStyle w:val="ListParagraph"/>
+        <w:numPr>
+          <w:ilvl w:val="0"/>
+          <w:numId w:val="94"/>
+        </w:numPr>
+      </w:pPr>
+      <w:r>
+        <w:t>Change "Beacon Frequency Mode" in menus to "Beacon Frequency".</w:t>
+      </w:r>
+    </w:p>
+    <w:p>
+      <w:r>
         <w:t>Version 1.06</w:t>
       </w:r>
     </w:p>
@@ -294,8 +329,13 @@
         <w:t xml:space="preserve"> beacon use in ITU region 2. The range is 144.276-</w:t>
       </w:r>
       <w:r>
-        <w:t>144.300 MHz.</w:t>
-      </w:r>
+        <w:t xml:space="preserve">144.300 </w:t>
+      </w:r>
+      <w:proofErr w:type="spellStart"/>
+      <w:r>
+        <w:t>MHz.</w:t>
+      </w:r>
+      <w:proofErr w:type="spellEnd"/>
     </w:p>
     <w:p>
       <w:r>
@@ -422,9 +462,11 @@
       <w:r>
         <w:t xml:space="preserve">This is </w:t>
       </w:r>
+      <w:proofErr w:type="gramStart"/>
       <w:r>
         <w:t>initial</w:t>
       </w:r>
+      <w:proofErr w:type="gramEnd"/>
       <w:r>
         <w:t xml:space="preserve"> version when this document was first created. The software is considered mostly complete.</w:t>
       </w:r>
@@ -460,6 +502,7 @@
       <w:r>
         <w:t xml:space="preserve">e Fox is a single PCB that includes an </w:t>
       </w:r>
+      <w:proofErr w:type="gramStart"/>
       <w:r>
         <w:t>18650</w:t>
       </w:r>
@@ -469,6 +512,7 @@
       <w:r>
         <w:t>battery</w:t>
       </w:r>
+      <w:proofErr w:type="gramEnd"/>
       <w:r>
         <w:t xml:space="preserve"> holder that can have </w:t>
       </w:r>
@@ -522,7 +566,15 @@
         <w:t>V on the top right. There are vents in the case to allow cooling as this module can become quite hot when transmitting at high power for longer timer intervals. Transmitting longer than one minute is not recommended.</w:t>
       </w:r>
       <w:r>
-        <w:t xml:space="preserve"> High power is about 5W and low power</w:t>
+        <w:t xml:space="preserve"> High power is about </w:t>
+      </w:r>
+      <w:proofErr w:type="gramStart"/>
+      <w:r>
+        <w:t>5W</w:t>
+      </w:r>
+      <w:proofErr w:type="gramEnd"/>
+      <w:r>
+        <w:t xml:space="preserve"> and low power</w:t>
       </w:r>
       <w:r>
         <w:t xml:space="preserve"> is about 3W. Make sure a suitable antenna is connected to avoid damage to the radio circuit.</w:t>
@@ -547,6 +599,7 @@
       <w:r>
         <w:t xml:space="preserve">. The </w:t>
       </w:r>
+      <w:proofErr w:type="gramStart"/>
       <w:r>
         <w:t>18650</w:t>
       </w:r>
@@ -556,6 +609,7 @@
       <w:r>
         <w:t>battery</w:t>
       </w:r>
+      <w:proofErr w:type="gramEnd"/>
       <w:r>
         <w:t xml:space="preserve"> length is a very loose standard and some batteries may not fit. Too long and they </w:t>
       </w:r>
@@ -585,7 +639,23 @@
         <w:t xml:space="preserve">The actual runtime depends on the transmitting time and </w:t>
       </w:r>
       <w:r>
-        <w:t>quality of the batteries. There are many deceptively labelled 18650 batteries available. The best one are made by Panasonic and Sanyo</w:t>
+        <w:t xml:space="preserve">quality of the batteries. There are many deceptively labelled 18650 batteries available. The best </w:t>
+      </w:r>
+      <w:proofErr w:type="gramStart"/>
+      <w:r>
+        <w:t>one</w:t>
+      </w:r>
+      <w:proofErr w:type="gramEnd"/>
+      <w:r>
+        <w:t xml:space="preserve"> </w:t>
+      </w:r>
+      <w:proofErr w:type="gramStart"/>
+      <w:r>
+        <w:t>are</w:t>
+      </w:r>
+      <w:proofErr w:type="gramEnd"/>
+      <w:r>
+        <w:t xml:space="preserve"> made by Panasonic and Sanyo</w:t>
       </w:r>
       <w:r>
         <w:t>. Using 1 minute transmit, 4 minutes pause, low power setting</w:t>
@@ -625,11 +695,33 @@
         <w:t xml:space="preserve">is similar the hard coded files from here: </w:t>
       </w:r>
       <w:hyperlink r:id="rId8" w:history="1">
+        <w:proofErr w:type="spellStart"/>
         <w:r>
           <w:rPr>
             <w:rStyle w:val="Hyperlink"/>
           </w:rPr>
-          <w:t>robsoncouto/arduino-songs (github.com)</w:t>
+          <w:t>robsoncouto</w:t>
+        </w:r>
+        <w:proofErr w:type="spellEnd"/>
+        <w:r>
+          <w:rPr>
+            <w:rStyle w:val="Hyperlink"/>
+          </w:rPr>
+          <w:t>/</w:t>
+        </w:r>
+        <w:proofErr w:type="spellStart"/>
+        <w:r>
+          <w:rPr>
+            <w:rStyle w:val="Hyperlink"/>
+          </w:rPr>
+          <w:t>arduino</w:t>
+        </w:r>
+        <w:proofErr w:type="spellEnd"/>
+        <w:r>
+          <w:rPr>
+            <w:rStyle w:val="Hyperlink"/>
+          </w:rPr>
+          <w:t>-songs (github.com)</w:t>
         </w:r>
       </w:hyperlink>
     </w:p>
@@ -746,7 +838,23 @@
           <w:b/>
           <w:bCs/>
         </w:rPr>
-        <w:t>LENGTH, %val can be used to set the length of the note, it defaults to 90% and 10% quiet after the note</w:t>
+        <w:t>LENGTH, %</w:t>
+      </w:r>
+      <w:proofErr w:type="spellStart"/>
+      <w:r>
+        <w:rPr>
+          <w:b/>
+          <w:bCs/>
+        </w:rPr>
+        <w:t>val</w:t>
+      </w:r>
+      <w:proofErr w:type="spellEnd"/>
+      <w:r>
+        <w:rPr>
+          <w:b/>
+          <w:bCs/>
+        </w:rPr>
+        <w:t xml:space="preserve"> can be used to set the length of the note, it defaults to 90% and 10% quiet after the note</w:t>
       </w:r>
     </w:p>
     <w:p>
@@ -821,22 +929,23 @@
           <w:b/>
           <w:bCs/>
         </w:rPr>
-        <w:t>NOTE_E5, 4,  NOTE_B4, 8,  NOTE_C5, 8,  NOTE_D5, 4,  NOTE_C5, 8,  NOTE_B4, 8,</w:t>
-      </w:r>
-    </w:p>
-    <w:p>
-      <w:pPr>
+        <w:t xml:space="preserve">NOTE_E5, </w:t>
+      </w:r>
+      <w:proofErr w:type="gramStart"/>
+      <w:r>
         <w:rPr>
           <w:b/>
           <w:bCs/>
         </w:rPr>
-      </w:pPr>
+        <w:t>4,  NOTE</w:t>
+      </w:r>
+      <w:proofErr w:type="gramEnd"/>
       <w:r>
         <w:rPr>
           <w:b/>
           <w:bCs/>
         </w:rPr>
-        <w:t>NOTE_A4, 4,  NOTE_A4, 8,  NOTE_C5, 8,  NOTE_E5, 4,  NOTE_D5, 8,  NOTE_C5, 8,</w:t>
+        <w:t>_B4, 8,  NOTE_C5, 8,  NOTE_D5, 4,  NOTE_C5, 8,  NOTE_B4, 8,</w:t>
       </w:r>
     </w:p>
     <w:p>
@@ -851,22 +960,23 @@
           <w:b/>
           <w:bCs/>
         </w:rPr>
-        <w:t>NOTE_B4, -4, NOTE_C5, 8,  NOTE_D5, 4,  NOTE_E5, 4,</w:t>
-      </w:r>
-    </w:p>
-    <w:p>
-      <w:pPr>
+        <w:t xml:space="preserve">NOTE_A4, </w:t>
+      </w:r>
+      <w:proofErr w:type="gramStart"/>
+      <w:r>
         <w:rPr>
           <w:b/>
           <w:bCs/>
         </w:rPr>
-      </w:pPr>
+        <w:t>4,  NOTE</w:t>
+      </w:r>
+      <w:proofErr w:type="gramEnd"/>
       <w:r>
         <w:rPr>
           <w:b/>
           <w:bCs/>
         </w:rPr>
-        <w:t>NOTE_C5, 4,  NOTE_A4, 4,  NOTE_A4, 8,  NOTE_A4, 4,  NOTE_B4, 8,  NOTE_C5, 8,</w:t>
+        <w:t>_A4, 8,  NOTE_C5, 8,  NOTE_E5, 4,  NOTE_D5, 8,  NOTE_C5, 8,</w:t>
       </w:r>
     </w:p>
     <w:p>
@@ -881,7 +991,85 @@
           <w:b/>
           <w:bCs/>
         </w:rPr>
-        <w:t>NOTE_D5, -4, NOTE_F5, 8,  NOTE_A5, 4,  NOTE_G5, 8,  NOTE_F5, 8,</w:t>
+        <w:t xml:space="preserve">NOTE_B4, -4, NOTE_C5, </w:t>
+      </w:r>
+      <w:proofErr w:type="gramStart"/>
+      <w:r>
+        <w:rPr>
+          <w:b/>
+          <w:bCs/>
+        </w:rPr>
+        <w:t>8,  NOTE</w:t>
+      </w:r>
+      <w:proofErr w:type="gramEnd"/>
+      <w:r>
+        <w:rPr>
+          <w:b/>
+          <w:bCs/>
+        </w:rPr>
+        <w:t>_D5, 4,  NOTE_E5, 4,</w:t>
+      </w:r>
+    </w:p>
+    <w:p>
+      <w:pPr>
+        <w:rPr>
+          <w:b/>
+          <w:bCs/>
+        </w:rPr>
+      </w:pPr>
+      <w:r>
+        <w:rPr>
+          <w:b/>
+          <w:bCs/>
+        </w:rPr>
+        <w:t xml:space="preserve">NOTE_C5, </w:t>
+      </w:r>
+      <w:proofErr w:type="gramStart"/>
+      <w:r>
+        <w:rPr>
+          <w:b/>
+          <w:bCs/>
+        </w:rPr>
+        <w:t>4,  NOTE</w:t>
+      </w:r>
+      <w:proofErr w:type="gramEnd"/>
+      <w:r>
+        <w:rPr>
+          <w:b/>
+          <w:bCs/>
+        </w:rPr>
+        <w:t>_A4, 4,  NOTE_A4, 8,  NOTE_A4, 4,  NOTE_B4, 8,  NOTE_C5, 8,</w:t>
+      </w:r>
+    </w:p>
+    <w:p>
+      <w:pPr>
+        <w:rPr>
+          <w:b/>
+          <w:bCs/>
+        </w:rPr>
+      </w:pPr>
+      <w:r>
+        <w:rPr>
+          <w:b/>
+          <w:bCs/>
+        </w:rPr>
+        <w:t xml:space="preserve">NOTE_D5, -4, NOTE_F5, </w:t>
+      </w:r>
+      <w:proofErr w:type="gramStart"/>
+      <w:r>
+        <w:rPr>
+          <w:b/>
+          <w:bCs/>
+        </w:rPr>
+        <w:t>8,  NOTE</w:t>
+      </w:r>
+      <w:proofErr w:type="gramEnd"/>
+      <w:r>
+        <w:rPr>
+          <w:b/>
+          <w:bCs/>
+        </w:rPr>
+        <w:t>_A5, 4,  NOTE_G5, 8,  NOTE_F5, 8,</w:t>
       </w:r>
     </w:p>
     <w:p>
@@ -897,22 +1085,23 @@
           <w:bCs/>
         </w:rPr>
         <w:lastRenderedPageBreak/>
-        <w:t>NOTE_E5, -4, NOTE_C5, 8,  NOTE_E5, 4,  NOTE_D5, 8,  NOTE_C5, 8,</w:t>
-      </w:r>
-    </w:p>
-    <w:p>
-      <w:pPr>
+        <w:t xml:space="preserve">NOTE_E5, -4, NOTE_C5, </w:t>
+      </w:r>
+      <w:proofErr w:type="gramStart"/>
+      <w:r>
         <w:rPr>
           <w:b/>
           <w:bCs/>
         </w:rPr>
-      </w:pPr>
+        <w:t>8,  NOTE</w:t>
+      </w:r>
+      <w:proofErr w:type="gramEnd"/>
       <w:r>
         <w:rPr>
           <w:b/>
           <w:bCs/>
         </w:rPr>
-        <w:t>NOTE_B4, 4,  NOTE_B4, 8,  NOTE_C5, 8,  NOTE_D5, 4,  NOTE_E5, 4,</w:t>
+        <w:t>_E5, 4,  NOTE_D5, 8,  NOTE_C5, 8,</w:t>
       </w:r>
     </w:p>
     <w:p>
@@ -927,7 +1116,54 @@
           <w:b/>
           <w:bCs/>
         </w:rPr>
-        <w:t>NOTE_C5, 4,  NOTE_A4, 4,  NOTE_A4, 4, REST, 4,</w:t>
+        <w:t xml:space="preserve">NOTE_B4, </w:t>
+      </w:r>
+      <w:proofErr w:type="gramStart"/>
+      <w:r>
+        <w:rPr>
+          <w:b/>
+          <w:bCs/>
+        </w:rPr>
+        <w:t>4,  NOTE</w:t>
+      </w:r>
+      <w:proofErr w:type="gramEnd"/>
+      <w:r>
+        <w:rPr>
+          <w:b/>
+          <w:bCs/>
+        </w:rPr>
+        <w:t>_B4, 8,  NOTE_C5, 8,  NOTE_D5, 4,  NOTE_E5, 4,</w:t>
+      </w:r>
+    </w:p>
+    <w:p>
+      <w:pPr>
+        <w:rPr>
+          <w:b/>
+          <w:bCs/>
+        </w:rPr>
+      </w:pPr>
+      <w:r>
+        <w:rPr>
+          <w:b/>
+          <w:bCs/>
+        </w:rPr>
+        <w:t xml:space="preserve">NOTE_C5, </w:t>
+      </w:r>
+      <w:proofErr w:type="gramStart"/>
+      <w:r>
+        <w:rPr>
+          <w:b/>
+          <w:bCs/>
+        </w:rPr>
+        <w:t>4,  NOTE</w:t>
+      </w:r>
+      <w:proofErr w:type="gramEnd"/>
+      <w:r>
+        <w:rPr>
+          <w:b/>
+          <w:bCs/>
+        </w:rPr>
+        <w:t>_A4, 4,  NOTE_A4, 4, REST, 4,</w:t>
       </w:r>
     </w:p>
     <w:p>
@@ -942,8 +1178,13 @@
       <w:r>
         <w:t xml:space="preserve">The new file must be put on the SD card and named </w:t>
       </w:r>
-      <w:r>
-        <w:t xml:space="preserve">RadioFox.bin. The system menu has an entry </w:t>
+      <w:proofErr w:type="spellStart"/>
+      <w:r>
+        <w:t>RadioFox.bin</w:t>
+      </w:r>
+      <w:proofErr w:type="spellEnd"/>
+      <w:r>
+        <w:t xml:space="preserve">. The system menu has an entry </w:t>
       </w:r>
       <w:r>
         <w:rPr>
@@ -956,7 +1197,15 @@
         <w:t xml:space="preserve"> that will attempt to load this file</w:t>
       </w:r>
       <w:r>
-        <w:t>. Confirmation will be required from the dial, After loading the BIN file can optionally be erased.</w:t>
+        <w:t xml:space="preserve">. Confirmation will be required from the dial, </w:t>
+      </w:r>
+      <w:proofErr w:type="gramStart"/>
+      <w:r>
+        <w:t>After</w:t>
+      </w:r>
+      <w:proofErr w:type="gramEnd"/>
+      <w:r>
+        <w:t xml:space="preserve"> loading the BIN file can optionally be erased.</w:t>
       </w:r>
     </w:p>
     <w:p>
@@ -964,6 +1213,127 @@
         <w:pStyle w:val="Heading1"/>
       </w:pPr>
       <w:r>
+        <w:t>DTMF Operations</w:t>
+      </w:r>
+    </w:p>
+    <w:p>
+      <w:r>
+        <w:t>DTMF (aka touch-tones) can be sent from the transmitter to control certain operations of the radio.</w:t>
+      </w:r>
+      <w:r>
+        <w:t xml:space="preserve"> It works best when the tones are sent for at least a second.</w:t>
+      </w:r>
+      <w:r>
+        <w:t xml:space="preserve"> It is usually also necessary to wait 2 seconds after pressing the transmit button on the radio.</w:t>
+      </w:r>
+      <w:r>
+        <w:t xml:space="preserve"> All commands consist of a ‘*’ followed by a digit.</w:t>
+      </w:r>
+      <w:r>
+        <w:t xml:space="preserve"> The following commands are available.</w:t>
+      </w:r>
+    </w:p>
+    <w:p/>
+    <w:p>
+      <w:r>
+        <w:t>Please feel free to request additional commands. I’m sure there are other usual things that can be done</w:t>
+      </w:r>
+      <w:r>
+        <w:t xml:space="preserve"> remotely using DTMF signals.</w:t>
+      </w:r>
+      <w:r>
+        <w:t xml:space="preserve"> Also note that these functions have not yet been tested extensively so there may be some bugs in the code.</w:t>
+      </w:r>
+      <w:r>
+        <w:t xml:space="preserve"> I will fix as soon as I can after I find out what they are.</w:t>
+      </w:r>
+    </w:p>
+    <w:p>
+      <w:pPr>
+        <w:pStyle w:val="Heading2"/>
+      </w:pPr>
+      <w:r>
+        <w:t>DTMF *1</w:t>
+      </w:r>
+    </w:p>
+    <w:p>
+      <w:r>
+        <w:t>Start transmitt</w:t>
+      </w:r>
+      <w:r>
+        <w:t>ing timer.</w:t>
+      </w:r>
+    </w:p>
+    <w:p>
+      <w:pPr>
+        <w:pStyle w:val="Heading2"/>
+      </w:pPr>
+      <w:r>
+        <w:t>DTMF *</w:t>
+      </w:r>
+      <w:r>
+        <w:t>2</w:t>
+      </w:r>
+    </w:p>
+    <w:p>
+      <w:r>
+        <w:t>Stop transmitting timer.</w:t>
+      </w:r>
+    </w:p>
+    <w:p>
+      <w:pPr>
+        <w:pStyle w:val="Heading2"/>
+      </w:pPr>
+      <w:r>
+        <w:t>DTMF *</w:t>
+      </w:r>
+      <w:r>
+        <w:t>4</w:t>
+      </w:r>
+    </w:p>
+    <w:p>
+      <w:r>
+        <w:t>Set low power mode.</w:t>
+      </w:r>
+    </w:p>
+    <w:p>
+      <w:pPr>
+        <w:pStyle w:val="Heading2"/>
+      </w:pPr>
+      <w:r>
+        <w:t>DTMF *</w:t>
+      </w:r>
+      <w:r>
+        <w:t>5</w:t>
+      </w:r>
+    </w:p>
+    <w:p>
+      <w:r>
+        <w:t>Set high power mode.</w:t>
+      </w:r>
+    </w:p>
+    <w:p>
+      <w:pPr>
+        <w:pStyle w:val="Heading2"/>
+      </w:pPr>
+      <w:r>
+        <w:t>DTMF *</w:t>
+      </w:r>
+      <w:r>
+        <w:t>6</w:t>
+      </w:r>
+    </w:p>
+    <w:p>
+      <w:r>
+        <w:t>Cancel existing delay and pause and begin transmitting immediately.</w:t>
+      </w:r>
+    </w:p>
+    <w:p>
+      <w:pPr>
+        <w:pStyle w:val="Heading1"/>
+      </w:pPr>
+      <w:r>
+        <w:lastRenderedPageBreak/>
         <w:t>Button Operations</w:t>
       </w:r>
     </w:p>
@@ -1113,12 +1483,14 @@
       <w:r>
         <w:t xml:space="preserve"> The top one is called </w:t>
       </w:r>
+      <w:proofErr w:type="gramStart"/>
       <w:r>
         <w:t>B</w:t>
       </w:r>
       <w:r>
         <w:t>0</w:t>
       </w:r>
+      <w:proofErr w:type="gramEnd"/>
       <w:r>
         <w:t xml:space="preserve"> and the bottom one is called </w:t>
       </w:r>
@@ -1209,7 +1581,21 @@
         <w:rPr>
           <w:lang w:val="da-DK"/>
         </w:rPr>
-        <w:t xml:space="preserve"> During Run Mode</w:t>
+        <w:t xml:space="preserve"> </w:t>
+      </w:r>
+      <w:proofErr w:type="spellStart"/>
+      <w:r>
+        <w:rPr>
+          <w:lang w:val="da-DK"/>
+        </w:rPr>
+        <w:t>During</w:t>
+      </w:r>
+      <w:proofErr w:type="spellEnd"/>
+      <w:r>
+        <w:rPr>
+          <w:lang w:val="da-DK"/>
+        </w:rPr>
+        <w:t xml:space="preserve"> Run Mode</w:t>
       </w:r>
     </w:p>
     <w:p>
@@ -1284,7 +1670,21 @@
         <w:rPr>
           <w:lang w:val="da-DK"/>
         </w:rPr>
-        <w:t>1 During Menu Mod</w:t>
+        <w:t xml:space="preserve">1 </w:t>
+      </w:r>
+      <w:proofErr w:type="spellStart"/>
+      <w:r>
+        <w:rPr>
+          <w:lang w:val="da-DK"/>
+        </w:rPr>
+        <w:t>During</w:t>
+      </w:r>
+      <w:proofErr w:type="spellEnd"/>
+      <w:r>
+        <w:rPr>
+          <w:lang w:val="da-DK"/>
+        </w:rPr>
+        <w:t xml:space="preserve"> Menu Mod</w:t>
       </w:r>
       <w:r>
         <w:rPr>
@@ -1488,7 +1888,21 @@
         <w:rPr>
           <w:lang w:val="en-US"/>
         </w:rPr>
-        <w:t xml:space="preserve">. After a dial click the increment will change to 10 and dial will add and subtract </w:t>
+        <w:t xml:space="preserve">. After a dial </w:t>
+      </w:r>
+      <w:proofErr w:type="gramStart"/>
+      <w:r>
+        <w:rPr>
+          <w:lang w:val="en-US"/>
+        </w:rPr>
+        <w:t>click</w:t>
+      </w:r>
+      <w:proofErr w:type="gramEnd"/>
+      <w:r>
+        <w:rPr>
+          <w:lang w:val="en-US"/>
+        </w:rPr>
+        <w:t xml:space="preserve"> the increment will change to 10 and dial will add and subtract </w:t>
       </w:r>
       <w:r>
         <w:rPr>
@@ -1566,6 +1980,7 @@
       <w:bookmarkEnd w:id="6"/>
       <w:bookmarkEnd w:id="7"/>
       <w:r>
+        <w:lastRenderedPageBreak/>
         <w:t xml:space="preserve">Rotating </w:t>
       </w:r>
       <w:r>
@@ -1610,7 +2025,15 @@
         <w:t>,</w:t>
       </w:r>
       <w:r>
-        <w:t xml:space="preserve"> boolean values toggle with each click.</w:t>
+        <w:t xml:space="preserve"> </w:t>
+      </w:r>
+      <w:proofErr w:type="spellStart"/>
+      <w:r>
+        <w:t>boolean</w:t>
+      </w:r>
+      <w:proofErr w:type="spellEnd"/>
+      <w:r>
+        <w:t xml:space="preserve"> values toggle with each click.</w:t>
       </w:r>
       <w:r>
         <w:t xml:space="preserve"> Multiple selections cycle through all the available options.</w:t>
@@ -1625,10 +2048,18 @@
         <w:t xml:space="preserve">indicates the active menu line. A + in front of the menu means another menu will be activated. </w:t>
       </w:r>
       <w:r>
-        <w:t>Any menu item starting with ‘-‘</w:t>
-      </w:r>
-      <w:r>
-        <w:t xml:space="preserve"> goes back to the previous menu when clicked. A</w:t>
+        <w:t>Any menu item starting with ‘</w:t>
+      </w:r>
+      <w:proofErr w:type="gramStart"/>
+      <w:r>
+        <w:t>-‘</w:t>
+      </w:r>
+      <w:r>
+        <w:t xml:space="preserve"> goes</w:t>
+      </w:r>
+      <w:proofErr w:type="gramEnd"/>
+      <w:r>
+        <w:t xml:space="preserve"> back to the previous menu when clicked. A</w:t>
       </w:r>
       <w:r>
         <w:t xml:space="preserve"> dial</w:t>
@@ -1768,8 +2199,13 @@
         <w:ind w:left="1440"/>
       </w:pPr>
       <w:r>
-        <w:t>Toggle booleans</w:t>
-      </w:r>
+        <w:t xml:space="preserve">Toggle </w:t>
+      </w:r>
+      <w:proofErr w:type="spellStart"/>
+      <w:r>
+        <w:t>booleans</w:t>
+      </w:r>
+      <w:proofErr w:type="spellEnd"/>
     </w:p>
     <w:p>
       <w:pPr>
@@ -1801,42 +2237,58 @@
         <w:pStyle w:val="Heading1"/>
       </w:pPr>
       <w:r>
+        <w:t>Main Operating Screen</w:t>
+      </w:r>
+    </w:p>
+    <w:p>
+      <w:r>
+        <w:t>After booting or when not in the menu system the radio status is displayed. It shows the current operation, the count of transmit cycles, the ID text,</w:t>
+      </w:r>
+      <w:r>
+        <w:t xml:space="preserve"> any selected audio file,</w:t>
+      </w:r>
+      <w:r>
+        <w:t xml:space="preserve"> the</w:t>
+      </w:r>
+      <w:r>
+        <w:t xml:space="preserve"> transmit</w:t>
+      </w:r>
+      <w:r>
+        <w:t xml:space="preserve"> frequency and the receive frequency offset.</w:t>
+      </w:r>
+      <w:r>
+        <w:t xml:space="preserve"> The bottom of the screen shows the</w:t>
+      </w:r>
+      <w:r>
+        <w:t xml:space="preserve"> battery status on the right if it has been enabled. This is related to the current battery voltage and will drop while transmitting. There are also 4 </w:t>
+      </w:r>
+      <w:proofErr w:type="gramStart"/>
+      <w:r>
+        <w:t>LED’s</w:t>
+      </w:r>
+      <w:proofErr w:type="gramEnd"/>
+      <w:r>
+        <w:t xml:space="preserve"> on the PCB that can be seen through</w:t>
+      </w:r>
+      <w:r>
+        <w:t xml:space="preserve"> the slot on the top of the case</w:t>
+      </w:r>
+      <w:r>
+        <w:t xml:space="preserve">. These </w:t>
+      </w:r>
+      <w:proofErr w:type="gramStart"/>
+      <w:r>
+        <w:t>LED’s</w:t>
+      </w:r>
+      <w:proofErr w:type="gramEnd"/>
+      <w:r>
+        <w:t xml:space="preserve"> are controlled by the battery charger circuit and indicate the battery status during running and charging.</w:t>
+      </w:r>
+    </w:p>
+    <w:p/>
+    <w:p>
+      <w:r>
         <w:lastRenderedPageBreak/>
-        <w:t>Main Operating Screen</w:t>
-      </w:r>
-    </w:p>
-    <w:p>
-      <w:r>
-        <w:t>After booting or when not in the menu system the radio status is displayed. It shows the current operation, the count of transmit cycles, the ID text,</w:t>
-      </w:r>
-      <w:r>
-        <w:t xml:space="preserve"> any selected audio file,</w:t>
-      </w:r>
-      <w:r>
-        <w:t xml:space="preserve"> the</w:t>
-      </w:r>
-      <w:r>
-        <w:t xml:space="preserve"> transmit</w:t>
-      </w:r>
-      <w:r>
-        <w:t xml:space="preserve"> frequency and the receive frequency offset.</w:t>
-      </w:r>
-      <w:r>
-        <w:t xml:space="preserve"> The bottom of the screen shows the</w:t>
-      </w:r>
-      <w:r>
-        <w:t xml:space="preserve"> battery status on the right if it has been enabled. This is related to the current battery voltage and will drop while transmitting. There are also 4 LED’s on the PCB that can be seen through</w:t>
-      </w:r>
-      <w:r>
-        <w:t xml:space="preserve"> the slot on the top of the case</w:t>
-      </w:r>
-      <w:r>
-        <w:t>. These LED’s are controlled by the battery charger circuit and indicate the battery status during running and charging.</w:t>
-      </w:r>
-    </w:p>
-    <w:p/>
-    <w:p>
-      <w:r>
         <w:t>During transmitting the bottom left shows an animated red dot. In a future firmware update the</w:t>
       </w:r>
       <w:r>
@@ -1855,8 +2307,13 @@
       <w:r>
         <w:t xml:space="preserve">The following sections detail each entry in </w:t>
       </w:r>
-      <w:r>
-        <w:t>all of the menus</w:t>
+      <w:proofErr w:type="gramStart"/>
+      <w:r>
+        <w:t>all of</w:t>
+      </w:r>
+      <w:proofErr w:type="gramEnd"/>
+      <w:r>
+        <w:t xml:space="preserve"> the menus</w:t>
       </w:r>
       <w:r>
         <w:t xml:space="preserve"> starting with the main or top menu</w:t>
@@ -1883,7 +2340,15 @@
         <w:t>’</w:t>
       </w:r>
       <w:r>
-        <w:t xml:space="preserve"> or a ‘-‘ to indicate a range</w:t>
+        <w:t xml:space="preserve"> or a ‘</w:t>
+      </w:r>
+      <w:proofErr w:type="gramStart"/>
+      <w:r>
+        <w:t>-‘ to</w:t>
+      </w:r>
+      <w:proofErr w:type="gramEnd"/>
+      <w:r>
+        <w:t xml:space="preserve"> indicate a range</w:t>
       </w:r>
       <w:r>
         <w:t>.</w:t>
@@ -1908,7 +2373,15 @@
         <w:t xml:space="preserve"> Some menu entries may depend on other menu items </w:t>
       </w:r>
       <w:r>
-        <w:t xml:space="preserve">settings. For example the audio file name menu item is hidden unless </w:t>
+        <w:t xml:space="preserve">settings. For </w:t>
+      </w:r>
+      <w:proofErr w:type="gramStart"/>
+      <w:r>
+        <w:t>example</w:t>
+      </w:r>
+      <w:proofErr w:type="gramEnd"/>
+      <w:r>
+        <w:t xml:space="preserve"> the audio file name menu item is hidden unless </w:t>
       </w:r>
       <w:r>
         <w:t>“Play Audio File” is Yes.</w:t>
@@ -1927,7 +2400,11 @@
         <w:pStyle w:val="Heading3"/>
       </w:pPr>
       <w:r>
-        <w:t>XMIT: On</w:t>
+        <w:t xml:space="preserve">XMIT: </w:t>
+      </w:r>
+      <w:proofErr w:type="spellStart"/>
+      <w:r>
+        <w:t>On</w:t>
       </w:r>
       <w:r>
         <w:t>|</w:t>
@@ -1935,13 +2412,38 @@
       <w:r>
         <w:t>Off</w:t>
       </w:r>
-    </w:p>
-    <w:p>
-      <w:r>
-        <w:t xml:space="preserve">This must be set to On for the radio to begin </w:t>
-      </w:r>
-      <w:r>
-        <w:t>transmitting. If saved as On then the radio will start sending right after booting. If it is Off it will not automatically start sending. It can be toggle</w:t>
+      <w:proofErr w:type="spellEnd"/>
+    </w:p>
+    <w:p>
+      <w:r>
+        <w:t xml:space="preserve">This must be set to </w:t>
+      </w:r>
+      <w:proofErr w:type="gramStart"/>
+      <w:r>
+        <w:t>On</w:t>
+      </w:r>
+      <w:proofErr w:type="gramEnd"/>
+      <w:r>
+        <w:t xml:space="preserve"> for the radio to begin </w:t>
+      </w:r>
+      <w:r>
+        <w:t xml:space="preserve">transmitting. If saved as </w:t>
+      </w:r>
+      <w:proofErr w:type="gramStart"/>
+      <w:r>
+        <w:t>On</w:t>
+      </w:r>
+      <w:proofErr w:type="gramEnd"/>
+      <w:r>
+        <w:t xml:space="preserve"> then the radio will start sending right after booting. If it is </w:t>
+      </w:r>
+      <w:proofErr w:type="gramStart"/>
+      <w:r>
+        <w:t>Off</w:t>
+      </w:r>
+      <w:proofErr w:type="gramEnd"/>
+      <w:r>
+        <w:t xml:space="preserve"> it will not automatically start sending. It can be toggle</w:t>
       </w:r>
       <w:r>
         <w:t>d</w:t>
@@ -1958,7 +2460,11 @@
         <w:pStyle w:val="Heading3"/>
       </w:pPr>
       <w:r>
-        <w:t>TX Power: High</w:t>
+        <w:t xml:space="preserve">TX Power: </w:t>
+      </w:r>
+      <w:proofErr w:type="spellStart"/>
+      <w:r>
+        <w:t>High</w:t>
       </w:r>
       <w:r>
         <w:t>|</w:t>
@@ -1970,10 +2476,19 @@
         </w:rPr>
         <w:t>Low</w:t>
       </w:r>
-    </w:p>
-    <w:p>
-      <w:r>
-        <w:t>High power is about 5W and low power is 3W. These are the only</w:t>
+      <w:proofErr w:type="spellEnd"/>
+    </w:p>
+    <w:p>
+      <w:r>
+        <w:t xml:space="preserve">High power is about </w:t>
+      </w:r>
+      <w:proofErr w:type="gramStart"/>
+      <w:r>
+        <w:t>5W</w:t>
+      </w:r>
+      <w:proofErr w:type="gramEnd"/>
+      <w:r>
+        <w:t xml:space="preserve"> and low power is 3W. These are the only</w:t>
       </w:r>
       <w:r>
         <w:t xml:space="preserve"> values allowed by the SA818 radio. If lower power is desired an attenuator can be attached to the </w:t>
@@ -2000,7 +2515,11 @@
         <w:t>:</w:t>
       </w:r>
       <w:r>
-        <w:t xml:space="preserve"> Yes|</w:t>
+        <w:t xml:space="preserve"> </w:t>
+      </w:r>
+      <w:proofErr w:type="spellStart"/>
+      <w:r>
+        <w:t>Yes|</w:t>
       </w:r>
       <w:r>
         <w:rPr>
@@ -2009,6 +2528,7 @@
         </w:rPr>
         <w:t>No</w:t>
       </w:r>
+      <w:proofErr w:type="spellEnd"/>
     </w:p>
     <w:p>
       <w:r>
@@ -2048,7 +2568,6 @@
         <w:pStyle w:val="Heading3"/>
       </w:pPr>
       <w:r>
-        <w:lastRenderedPageBreak/>
         <w:t>Beacon</w:t>
       </w:r>
       <w:r>
@@ -2113,11 +2632,17 @@
         <w:pStyle w:val="Heading3"/>
       </w:pPr>
       <w:r>
+        <w:lastRenderedPageBreak/>
         <w:t>Play Audio File</w:t>
       </w:r>
       <w:r>
-        <w:t>: Yes|No</w:t>
-      </w:r>
+        <w:t xml:space="preserve">: </w:t>
+      </w:r>
+      <w:proofErr w:type="spellStart"/>
+      <w:r>
+        <w:t>Yes|No</w:t>
+      </w:r>
+      <w:proofErr w:type="spellEnd"/>
     </w:p>
     <w:p>
       <w:r>
@@ -2141,13 +2666,37 @@
     </w:p>
     <w:p>
       <w:r>
-        <w:t xml:space="preserve">This menu item is only visible if the previous item is set to Yes. Clicking the dial will list all of the </w:t>
-      </w:r>
-      <w:r>
-        <w:t>*.txt files on the SD card. The dial is rotated to highlight a file and a long press will set it</w:t>
-      </w:r>
-      <w:r>
-        <w:t>. Note that a click of dial just exits the list of file with no selection being performed.</w:t>
+        <w:t xml:space="preserve">This menu item is only visible if the previous item is set to Yes. Clicking the dial will list </w:t>
+      </w:r>
+      <w:proofErr w:type="gramStart"/>
+      <w:r>
+        <w:t>all of</w:t>
+      </w:r>
+      <w:proofErr w:type="gramEnd"/>
+      <w:r>
+        <w:t xml:space="preserve"> the </w:t>
+      </w:r>
+      <w:r>
+        <w:t xml:space="preserve">*.txt files on the SD card. The dial is rotated to highlight a </w:t>
+      </w:r>
+      <w:proofErr w:type="gramStart"/>
+      <w:r>
+        <w:t>file</w:t>
+      </w:r>
+      <w:proofErr w:type="gramEnd"/>
+      <w:r>
+        <w:t xml:space="preserve"> and a long press will set it</w:t>
+      </w:r>
+      <w:r>
+        <w:t xml:space="preserve">. Note that a click of dial just exits the list of </w:t>
+      </w:r>
+      <w:proofErr w:type="gramStart"/>
+      <w:r>
+        <w:t>file</w:t>
+      </w:r>
+      <w:proofErr w:type="gramEnd"/>
+      <w:r>
+        <w:t xml:space="preserve"> with no selection being performed.</w:t>
       </w:r>
     </w:p>
     <w:p>
@@ -2207,8 +2756,13 @@
         <w:pStyle w:val="Heading3"/>
       </w:pPr>
       <w:r>
-        <w:t>Timer Mode: Fixed|Random</w:t>
-      </w:r>
+        <w:t xml:space="preserve">Timer Mode: </w:t>
+      </w:r>
+      <w:proofErr w:type="spellStart"/>
+      <w:r>
+        <w:t>Fixed|Random</w:t>
+      </w:r>
+      <w:proofErr w:type="spellEnd"/>
     </w:p>
     <w:p>
       <w:r>
@@ -2221,7 +2775,15 @@
         <w:t xml:space="preserve"> and are always the same. In Random mode the transmit time and pause time are randomly chosen</w:t>
       </w:r>
       <w:r>
-        <w:t xml:space="preserve"> from the allowed values set in the Min and Max values for TX Send and Pause. This makes the timing less predictable and make the game a little bit harder.</w:t>
+        <w:t xml:space="preserve"> from the allowed values set in the Min and Max values for TX Send and Pause. This makes the timing less predictable and </w:t>
+      </w:r>
+      <w:proofErr w:type="gramStart"/>
+      <w:r>
+        <w:t>make</w:t>
+      </w:r>
+      <w:proofErr w:type="gramEnd"/>
+      <w:r>
+        <w:t xml:space="preserve"> the game a little bit harder.</w:t>
       </w:r>
       <w:r>
         <w:t xml:space="preserve"> Keep your ears on!</w:t>
@@ -2266,16 +2828,69 @@
         <w:pStyle w:val="Heading3"/>
       </w:pPr>
       <w:r>
+        <w:t>TX Pause:10-1200 Sec</w:t>
+      </w:r>
+    </w:p>
+    <w:p>
+      <w:r>
+        <w:t>This is the pause time between transmissions</w:t>
+      </w:r>
+      <w:r>
+        <w:t xml:space="preserve">. Longer times let the radio cool off and save the battery for longer </w:t>
+      </w:r>
+      <w:proofErr w:type="gramStart"/>
+      <w:r>
+        <w:t>run</w:t>
+      </w:r>
+      <w:proofErr w:type="gramEnd"/>
+      <w:r>
+        <w:t xml:space="preserve"> times.</w:t>
+      </w:r>
+    </w:p>
+    <w:p>
+      <w:pPr>
+        <w:pStyle w:val="Heading3"/>
+      </w:pPr>
+      <w:r>
+        <w:t>TX Send Min: 10-90 Sec</w:t>
+      </w:r>
+    </w:p>
+    <w:p>
+      <w:r>
+        <w:t>In random mode this is the minimum send time.</w:t>
+      </w:r>
+    </w:p>
+    <w:p>
+      <w:pPr>
+        <w:pStyle w:val="Heading3"/>
+      </w:pPr>
+      <w:r>
+        <w:t xml:space="preserve">TX Send Max: </w:t>
+      </w:r>
+      <w:r>
+        <w:t>10-90 Sec</w:t>
+      </w:r>
+    </w:p>
+    <w:p>
+      <w:r>
+        <w:t xml:space="preserve">In </w:t>
+      </w:r>
+      <w:r>
+        <w:t>random mode this is the maximum send time.</w:t>
+      </w:r>
+    </w:p>
+    <w:p>
+      <w:pPr>
+        <w:pStyle w:val="Heading3"/>
+      </w:pPr>
+      <w:r>
         <w:lastRenderedPageBreak/>
-        <w:t>TX Pause:10-1200 Sec</w:t>
-      </w:r>
-    </w:p>
-    <w:p>
-      <w:r>
-        <w:t>This is the pause time between transmissions</w:t>
-      </w:r>
-      <w:r>
-        <w:t>. Longer times let the radio cool off and save the battery for longer run times.</w:t>
+        <w:t>TX Pause Min: 10-1200 Sec</w:t>
+      </w:r>
+    </w:p>
+    <w:p>
+      <w:r>
+        <w:t>In random mode this is the minimum pause time.</w:t>
       </w:r>
     </w:p>
     <w:p>
@@ -2283,12 +2898,12 @@
         <w:pStyle w:val="Heading3"/>
       </w:pPr>
       <w:r>
-        <w:t>TX Send Min: 10-90 Sec</w:t>
-      </w:r>
-    </w:p>
-    <w:p>
-      <w:r>
-        <w:t>In random mode this is the minimum send time.</w:t>
+        <w:t>TX Pause Max: 10-1200 Sec</w:t>
+      </w:r>
+    </w:p>
+    <w:p>
+      <w:r>
+        <w:t>In random mode this is the maximum pause time.</w:t>
       </w:r>
     </w:p>
     <w:p>
@@ -2296,18 +2911,54 @@
         <w:pStyle w:val="Heading3"/>
       </w:pPr>
       <w:r>
-        <w:t xml:space="preserve">TX Send Max: </w:t>
-      </w:r>
-      <w:r>
-        <w:t>10-90 Sec</w:t>
-      </w:r>
-    </w:p>
-    <w:p>
-      <w:r>
-        <w:t xml:space="preserve">In </w:t>
-      </w:r>
-      <w:r>
-        <w:t>random mode this is the maximum send time.</w:t>
+        <w:t xml:space="preserve">TX Stop: </w:t>
+      </w:r>
+      <w:proofErr w:type="spellStart"/>
+      <w:r>
+        <w:t>Immediate|Finish</w:t>
+      </w:r>
+      <w:proofErr w:type="spellEnd"/>
+      <w:r>
+        <w:t xml:space="preserve"> Cycle</w:t>
+      </w:r>
+    </w:p>
+    <w:p>
+      <w:r>
+        <w:t xml:space="preserve">During transmit time the Beacon, Call Sign, and Audio are continuously sent. At the end of the transmission time this option controls whether the transmission stops immediately </w:t>
+      </w:r>
+      <w:proofErr w:type="gramStart"/>
+      <w:r>
+        <w:t>of</w:t>
+      </w:r>
+      <w:proofErr w:type="gramEnd"/>
+      <w:r>
+        <w:t xml:space="preserve"> waits to stop until the entire cycle is finished.</w:t>
+      </w:r>
+    </w:p>
+    <w:p/>
+    <w:p>
+      <w:r>
+        <w:t>A clever use of this command</w:t>
+      </w:r>
+      <w:r>
+        <w:t xml:space="preserve"> allows for only one cycle of beacon, ID, and music to be sent during each transmission time. Set the transmit</w:t>
+      </w:r>
+      <w:r>
+        <w:t xml:space="preserve"> time to something less than</w:t>
+      </w:r>
+      <w:r>
+        <w:t xml:space="preserve"> the time to perform a complete cycle and set this option to “Finish Cycle”. The </w:t>
+      </w:r>
+      <w:proofErr w:type="gramStart"/>
+      <w:r>
+        <w:t>transmit  cycle</w:t>
+      </w:r>
+      <w:proofErr w:type="gramEnd"/>
+      <w:r>
+        <w:t xml:space="preserve"> will begin, the timer will expire, but the current cycle will complete before stopping</w:t>
+      </w:r>
+      <w:r>
+        <w:t>.</w:t>
       </w:r>
     </w:p>
     <w:p>
@@ -2315,12 +2966,36 @@
         <w:pStyle w:val="Heading3"/>
       </w:pPr>
       <w:r>
-        <w:t>TX Pause Min: 10-1200 Sec</w:t>
-      </w:r>
-    </w:p>
-    <w:p>
-      <w:r>
-        <w:t>In random mode this is the minimum pause time.</w:t>
+        <w:t xml:space="preserve">Radio Pause: </w:t>
+      </w:r>
+      <w:proofErr w:type="spellStart"/>
+      <w:r>
+        <w:t>Sleep|Awake</w:t>
+      </w:r>
+      <w:proofErr w:type="spellEnd"/>
+    </w:p>
+    <w:p>
+      <w:r>
+        <w:t xml:space="preserve">During pause time the radio can be put into sleep mode. This lowers the power consumption and lets the battery last longer. </w:t>
+      </w:r>
+      <w:proofErr w:type="gramStart"/>
+      <w:r>
+        <w:t>However</w:t>
+      </w:r>
+      <w:proofErr w:type="gramEnd"/>
+      <w:r>
+        <w:t xml:space="preserve"> note that this also means that the DTMF commands are disabled since the radio is asleep!</w:t>
+      </w:r>
+    </w:p>
+    <w:p>
+      <w:pPr>
+        <w:pStyle w:val="Heading2"/>
+      </w:pPr>
+      <w:r>
+        <w:t>+</w:t>
+      </w:r>
+      <w:r>
+        <w:t>More Radio Settings</w:t>
       </w:r>
     </w:p>
     <w:p>
@@ -2328,12 +3003,15 @@
         <w:pStyle w:val="Heading3"/>
       </w:pPr>
       <w:r>
-        <w:t>TX Pause Max: 10-1200 Sec</w:t>
-      </w:r>
-    </w:p>
-    <w:p>
-      <w:r>
-        <w:t>In random mode this is the maximum pause time.</w:t>
+        <w:t>RX Offset: -600|0|+600 kHz</w:t>
+      </w:r>
+    </w:p>
+    <w:p>
+      <w:r>
+        <w:t>This is the frequency offset from the transmit frequency that the radio uses to receive DTMF commands</w:t>
+      </w:r>
+      <w:r>
+        <w:t>. An offset is recommended. If 0 is used the radio will only listen when it isn’t sending. It has not been tested if it listens during sending when the offset is not 0.</w:t>
       </w:r>
     </w:p>
     <w:p>
@@ -2341,27 +3019,455 @@
         <w:pStyle w:val="Heading3"/>
       </w:pPr>
       <w:r>
-        <w:t>TX Stop: Immediate|Finish Cycle</w:t>
-      </w:r>
-    </w:p>
-    <w:p>
-      <w:r>
-        <w:t>During transmit time the Beacon, Call Sign, and Audio are continuously sent. At the end of the transmission time this option controls whether the transmission stops immediately of waits to stop until the entire cycle is finished.</w:t>
-      </w:r>
-    </w:p>
-    <w:p/>
-    <w:p>
-      <w:r>
-        <w:t>A clever use of this command</w:t>
-      </w:r>
-      <w:r>
-        <w:t xml:space="preserve"> allows for only one cycle of beacon, ID, and music to be sent during each transmission time. Set the transmit</w:t>
-      </w:r>
-      <w:r>
-        <w:t xml:space="preserve"> time to something less than</w:t>
-      </w:r>
-      <w:r>
-        <w:t xml:space="preserve"> the time to perform a complete cycle and set this option to “Finish Cycle”. The transmit  cycle will begin, the timer will expire, but the current cycle will complete before stopping</w:t>
+        <w:t>Bandwidth: 12.5|</w:t>
+      </w:r>
+      <w:r>
+        <w:t>25 kHz</w:t>
+      </w:r>
+    </w:p>
+    <w:p>
+      <w:r>
+        <w:t>This sets the radio bandwidth</w:t>
+      </w:r>
+      <w:r>
+        <w:t>. It has not been tested much to see what effect it has on performance yet.</w:t>
+      </w:r>
+    </w:p>
+    <w:p>
+      <w:pPr>
+        <w:pStyle w:val="Heading3"/>
+      </w:pPr>
+      <w:r>
+        <w:t>CTCSS/DCS: CTCSS|DCS</w:t>
+      </w:r>
+    </w:p>
+    <w:p>
+      <w:r>
+        <w:t xml:space="preserve">This sets the </w:t>
+      </w:r>
+      <w:r>
+        <w:t>un-squelch</w:t>
+      </w:r>
+      <w:r>
+        <w:t xml:space="preserve"> values</w:t>
+      </w:r>
+      <w:r>
+        <w:t xml:space="preserve"> for either the analog or digital versions.</w:t>
+      </w:r>
+    </w:p>
+    <w:p>
+      <w:pPr>
+        <w:pStyle w:val="Heading3"/>
+      </w:pPr>
+      <w:r>
+        <w:t>TX CTCSS:</w:t>
+      </w:r>
+      <w:r>
+        <w:t xml:space="preserve"> None</w:t>
+      </w:r>
+      <w:r>
+        <w:t>|</w:t>
+      </w:r>
+      <w:r>
+        <w:t>67-</w:t>
+      </w:r>
+      <w:r>
+        <w:t>250.3</w:t>
+      </w:r>
+    </w:p>
+    <w:p>
+      <w:r>
+        <w:t>Analog un-squelch frequencies sent out.</w:t>
+      </w:r>
+    </w:p>
+    <w:p>
+      <w:pPr>
+        <w:pStyle w:val="Heading3"/>
+      </w:pPr>
+      <w:r>
+        <w:lastRenderedPageBreak/>
+        <w:t>RX CTCSS:</w:t>
+      </w:r>
+      <w:r>
+        <w:t xml:space="preserve"> None|67-250.3</w:t>
+      </w:r>
+    </w:p>
+    <w:p>
+      <w:r>
+        <w:t>Analog un-squelch frequency for receiving.</w:t>
+      </w:r>
+    </w:p>
+    <w:p>
+      <w:pPr>
+        <w:pStyle w:val="Heading3"/>
+      </w:pPr>
+      <w:r>
+        <w:t>TX DCS:</w:t>
+      </w:r>
+      <w:r>
+        <w:t xml:space="preserve"> None|023-754</w:t>
+      </w:r>
+    </w:p>
+    <w:p>
+      <w:r>
+        <w:t>Digital un-squelch value for sending.</w:t>
+      </w:r>
+    </w:p>
+    <w:p>
+      <w:pPr>
+        <w:pStyle w:val="Heading3"/>
+      </w:pPr>
+      <w:r>
+        <w:t>TX I/N: I|N</w:t>
+      </w:r>
+    </w:p>
+    <w:p>
+      <w:r>
+        <w:t>The digital I or N value for sending.</w:t>
+      </w:r>
+    </w:p>
+    <w:p>
+      <w:pPr>
+        <w:pStyle w:val="Heading3"/>
+      </w:pPr>
+      <w:r>
+        <w:t>RX DCS: None|023-754</w:t>
+      </w:r>
+    </w:p>
+    <w:p>
+      <w:r>
+        <w:t>Digital un-squelch value for receiving.</w:t>
+      </w:r>
+    </w:p>
+    <w:p>
+      <w:pPr>
+        <w:pStyle w:val="Heading3"/>
+      </w:pPr>
+      <w:r>
+        <w:t>RX I/N: I|N</w:t>
+      </w:r>
+    </w:p>
+    <w:p>
+      <w:r>
+        <w:t>The digital I or N value for receiving.</w:t>
+      </w:r>
+    </w:p>
+    <w:p>
+      <w:pPr>
+        <w:pStyle w:val="Heading3"/>
+      </w:pPr>
+      <w:r>
+        <w:t>RX Volume:</w:t>
+      </w:r>
+      <w:r>
+        <w:t xml:space="preserve"> 1-6</w:t>
+      </w:r>
+    </w:p>
+    <w:p>
+      <w:r>
+        <w:t>This is the receive volume setting. It affects how well DTMF tones are detected.</w:t>
+      </w:r>
+    </w:p>
+    <w:p>
+      <w:pPr>
+        <w:pStyle w:val="Heading3"/>
+      </w:pPr>
+      <w:r>
+        <w:t>RX Squelch:</w:t>
+      </w:r>
+      <w:r>
+        <w:t xml:space="preserve"> 0-8</w:t>
+      </w:r>
+    </w:p>
+    <w:p>
+      <w:r>
+        <w:t>This affects how much signal is required to receive the DTMF signals.</w:t>
+      </w:r>
+    </w:p>
+    <w:p>
+      <w:pPr>
+        <w:pStyle w:val="Heading2"/>
+      </w:pPr>
+      <w:r>
+        <w:t>Cancel Waits/TX Now</w:t>
+      </w:r>
+    </w:p>
+    <w:p>
+      <w:r>
+        <w:t xml:space="preserve">When the radio is in either send or pause mode this command will cancel the </w:t>
+      </w:r>
+      <w:proofErr w:type="gramStart"/>
+      <w:r>
+        <w:t>timer</w:t>
+      </w:r>
+      <w:proofErr w:type="gramEnd"/>
+      <w:r>
+        <w:t xml:space="preserve"> and the next mo</w:t>
+      </w:r>
+      <w:r>
+        <w:t xml:space="preserve">de will start. For </w:t>
+      </w:r>
+      <w:proofErr w:type="gramStart"/>
+      <w:r>
+        <w:t>example</w:t>
+      </w:r>
+      <w:proofErr w:type="gramEnd"/>
+      <w:r>
+        <w:t xml:space="preserve"> if you want to cancel</w:t>
+      </w:r>
+      <w:r>
+        <w:t xml:space="preserve"> the pause and go to transmit, use this option. It can also be done by long pressing B0.</w:t>
+      </w:r>
+    </w:p>
+    <w:p>
+      <w:pPr>
+        <w:pStyle w:val="Heading2"/>
+      </w:pPr>
+      <w:r>
+        <w:t>+Saved Settings Files</w:t>
+      </w:r>
+    </w:p>
+    <w:p>
+      <w:r>
+        <w:t>Saved settings files are named files stored on the SD card. They are useful to</w:t>
+      </w:r>
+      <w:r>
+        <w:t xml:space="preserve"> quickly configure the radio for different uses. All values except the battery calibration are affected.</w:t>
+      </w:r>
+    </w:p>
+    <w:p>
+      <w:pPr>
+        <w:pStyle w:val="Heading3"/>
+      </w:pPr>
+      <w:r>
+        <w:t>Create File</w:t>
+      </w:r>
+    </w:p>
+    <w:p>
+      <w:r>
+        <w:t>This prompts the user for a name. The file is then created using the current system settings.</w:t>
+      </w:r>
+    </w:p>
+    <w:p>
+      <w:pPr>
+        <w:pStyle w:val="Heading3"/>
+      </w:pPr>
+      <w:r>
+        <w:t>Save/Update File</w:t>
+      </w:r>
+    </w:p>
+    <w:p>
+      <w:r>
+        <w:t xml:space="preserve">This command saves the current settings into the selected file. If it already </w:t>
+      </w:r>
+      <w:proofErr w:type="gramStart"/>
+      <w:r>
+        <w:t>exists</w:t>
+      </w:r>
+      <w:proofErr w:type="gramEnd"/>
+      <w:r>
+        <w:t xml:space="preserve"> the user will be asked to confirm overwriting the file.</w:t>
+      </w:r>
+    </w:p>
+    <w:p>
+      <w:pPr>
+        <w:pStyle w:val="Heading3"/>
+      </w:pPr>
+      <w:r>
+        <w:lastRenderedPageBreak/>
+        <w:t>Load File</w:t>
+      </w:r>
+    </w:p>
+    <w:p>
+      <w:r>
+        <w:t xml:space="preserve">This command asks the user for the name and then sets </w:t>
+      </w:r>
+      <w:proofErr w:type="gramStart"/>
+      <w:r>
+        <w:t>all of</w:t>
+      </w:r>
+      <w:proofErr w:type="gramEnd"/>
+      <w:r>
+        <w:t xml:space="preserve"> the system settings except the battery calibration using the values in the file.</w:t>
+      </w:r>
+    </w:p>
+    <w:p>
+      <w:pPr>
+        <w:pStyle w:val="Heading3"/>
+      </w:pPr>
+      <w:r>
+        <w:t>Delete File</w:t>
+      </w:r>
+    </w:p>
+    <w:p>
+      <w:r>
+        <w:t>The user selects a file from the list and then it can be deleted.</w:t>
+      </w:r>
+    </w:p>
+    <w:p>
+      <w:pPr>
+        <w:pStyle w:val="Heading2"/>
+      </w:pPr>
+      <w:r>
+        <w:t>+System Settings</w:t>
+      </w:r>
+    </w:p>
+    <w:p>
+      <w:pPr>
+        <w:pStyle w:val="Heading3"/>
+      </w:pPr>
+      <w:r>
+        <w:t>+Display</w:t>
+      </w:r>
+      <w:r>
+        <w:t xml:space="preserve"> Settings</w:t>
+      </w:r>
+    </w:p>
+    <w:p>
+      <w:pPr>
+        <w:pStyle w:val="Heading4"/>
+      </w:pPr>
+      <w:r>
+        <w:t xml:space="preserve">Dimming Mode: </w:t>
+      </w:r>
+      <w:proofErr w:type="spellStart"/>
+      <w:r>
+        <w:t>None</w:t>
+      </w:r>
+      <w:r>
+        <w:t>|Timer</w:t>
+      </w:r>
+      <w:proofErr w:type="spellEnd"/>
+    </w:p>
+    <w:p>
+      <w:r>
+        <w:t xml:space="preserve">The display can be set to dim automatically after a specified number of seconds. This is used to save battery power since the backlight </w:t>
+      </w:r>
+      <w:r>
+        <w:t>uses a significant amount.</w:t>
+      </w:r>
+    </w:p>
+    <w:p>
+      <w:pPr>
+        <w:pStyle w:val="Heading4"/>
+      </w:pPr>
+      <w:r>
+        <w:t>Bright Value: 1-100</w:t>
+      </w:r>
+      <w:r>
+        <w:t>%</w:t>
+      </w:r>
+    </w:p>
+    <w:p>
+      <w:r>
+        <w:t>Set the display brightness value.</w:t>
+      </w:r>
+    </w:p>
+    <w:p>
+      <w:pPr>
+        <w:pStyle w:val="Heading4"/>
+      </w:pPr>
+      <w:r>
+        <w:t xml:space="preserve">Dim Value: </w:t>
+      </w:r>
+      <w:r>
+        <w:t>0-100%</w:t>
+      </w:r>
+    </w:p>
+    <w:p>
+      <w:r>
+        <w:t xml:space="preserve">Set the display brightness after the </w:t>
+      </w:r>
+      <w:r>
+        <w:t>timer below expires.</w:t>
+      </w:r>
+    </w:p>
+    <w:p>
+      <w:pPr>
+        <w:pStyle w:val="Heading4"/>
+      </w:pPr>
+      <w:r>
+        <w:t>Display Dim Time:</w:t>
+      </w:r>
+      <w:r>
+        <w:t xml:space="preserve"> 0-120 S</w:t>
+      </w:r>
+    </w:p>
+    <w:p>
+      <w:r>
+        <w:t>Specify the time until the display changes to dim mode.</w:t>
+      </w:r>
+    </w:p>
+    <w:p>
+      <w:pPr>
+        <w:pStyle w:val="Heading4"/>
+      </w:pPr>
+      <w:r>
+        <w:t>+Sideways Scroll Settings</w:t>
+      </w:r>
+    </w:p>
+    <w:p>
+      <w:r>
+        <w:t xml:space="preserve">Lines of text that </w:t>
+      </w:r>
+      <w:proofErr w:type="gramStart"/>
+      <w:r>
+        <w:t>too</w:t>
+      </w:r>
+      <w:proofErr w:type="gramEnd"/>
+      <w:r>
+        <w:t xml:space="preserve"> long for the display will scroll back and forth. The following settings control the speed.</w:t>
+      </w:r>
+    </w:p>
+    <w:p>
+      <w:pPr>
+        <w:pStyle w:val="Heading5"/>
+      </w:pPr>
+      <w:r>
+        <w:t xml:space="preserve">Speed: </w:t>
+      </w:r>
+      <w:r>
+        <w:t>1-1000 mS</w:t>
+      </w:r>
+    </w:p>
+    <w:p>
+      <w:r>
+        <w:t>Controls the speed of text moving to the left.</w:t>
+      </w:r>
+    </w:p>
+    <w:p>
+      <w:pPr>
+        <w:pStyle w:val="Heading5"/>
+      </w:pPr>
+      <w:r>
+        <w:t>Pause: 1-100</w:t>
+      </w:r>
+      <w:r>
+        <w:t xml:space="preserve"> mS</w:t>
+      </w:r>
+    </w:p>
+    <w:p>
+      <w:r>
+        <w:t>This controls the pause when the text is at the end (all the way to the left).</w:t>
+      </w:r>
+    </w:p>
+    <w:p>
+      <w:pPr>
+        <w:pStyle w:val="Heading5"/>
+      </w:pPr>
+      <w:r>
+        <w:t>Reverse Speed: 1-20x</w:t>
+      </w:r>
+    </w:p>
+    <w:p>
+      <w:r>
+        <w:t xml:space="preserve">This is how fast the text scrolls </w:t>
+      </w:r>
+      <w:r>
+        <w:t>back to the beginning (to the right). 2x means twice as fast as the text scroll</w:t>
+      </w:r>
+      <w:r>
+        <w:t>ed to the left</w:t>
       </w:r>
       <w:r>
         <w:t>.</w:t>
@@ -2369,15 +3475,270 @@
     </w:p>
     <w:p>
       <w:pPr>
+        <w:pStyle w:val="Heading4"/>
+      </w:pPr>
+      <w:r>
+        <w:t xml:space="preserve">Menu Selection: </w:t>
+      </w:r>
+      <w:r>
+        <w:t>Color|*</w:t>
+      </w:r>
+    </w:p>
+    <w:p>
+      <w:r>
+        <w:t>Menu selections</w:t>
+      </w:r>
+      <w:r>
+        <w:t xml:space="preserve"> and selections from a list can be either colored or marked with the ‘*’ character.</w:t>
+      </w:r>
+    </w:p>
+    <w:p>
+      <w:pPr>
+        <w:pStyle w:val="Heading4"/>
+      </w:pPr>
+      <w:r>
+        <w:lastRenderedPageBreak/>
+        <w:t>Text/</w:t>
+      </w:r>
+      <w:proofErr w:type="spellStart"/>
+      <w:r>
+        <w:t>HiLite</w:t>
+      </w:r>
+      <w:proofErr w:type="spellEnd"/>
+      <w:r>
+        <w:t xml:space="preserve"> Colors</w:t>
+      </w:r>
+    </w:p>
+    <w:p>
+      <w:r>
+        <w:t>This selection allows for choosing the colors of the text and the highlight. The background screen is always black.</w:t>
+      </w:r>
+    </w:p>
+    <w:p>
+      <w:pPr>
         <w:pStyle w:val="Heading3"/>
       </w:pPr>
       <w:r>
-        <w:t>Radio Pause: Sleep|Awake</w:t>
-      </w:r>
-    </w:p>
-    <w:p>
-      <w:r>
-        <w:t>During pause time the radio can be put into sleep mode. This lowers the power consumption and lets the battery last longer. However note that this also means that the DTMF commands are disabled since the radio is asleep!</w:t>
+        <w:t>+Dial &amp; Button Settings</w:t>
+      </w:r>
+    </w:p>
+    <w:p>
+      <w:pPr>
+        <w:pStyle w:val="Heading4"/>
+      </w:pPr>
+      <w:r>
+        <w:t xml:space="preserve">Direction: </w:t>
+      </w:r>
+      <w:proofErr w:type="spellStart"/>
+      <w:proofErr w:type="gramStart"/>
+      <w:r>
+        <w:t>Normal:Reverse</w:t>
+      </w:r>
+      <w:proofErr w:type="spellEnd"/>
+      <w:proofErr w:type="gramEnd"/>
+    </w:p>
+    <w:p>
+      <w:r>
+        <w:t>If you really want the button to be the other way around this is the choice for you.</w:t>
+      </w:r>
+    </w:p>
+    <w:p>
+      <w:pPr>
+        <w:pStyle w:val="Heading4"/>
+      </w:pPr>
+      <w:r>
+        <w:t>Long Press Timer: 2-200</w:t>
+      </w:r>
+    </w:p>
+    <w:p>
+      <w:r>
+        <w:t>This value affects how long or short a long press is. The default value is normally OK</w:t>
+      </w:r>
+      <w:r>
+        <w:t>, but somebody might want to change it.</w:t>
+      </w:r>
+    </w:p>
+    <w:p>
+      <w:pPr>
+        <w:pStyle w:val="Heading3"/>
+      </w:pPr>
+      <w:r>
+        <w:t>+Battery Settings</w:t>
+      </w:r>
+    </w:p>
+    <w:p>
+      <w:r>
+        <w:t xml:space="preserve">Since the PCB was designed with 10% resistors for measuring the battery voltage some calibration is needed. A future PCB will probably use better </w:t>
+      </w:r>
+      <w:proofErr w:type="gramStart"/>
+      <w:r>
+        <w:t>resistors</w:t>
+      </w:r>
+      <w:proofErr w:type="gramEnd"/>
+      <w:r>
+        <w:t xml:space="preserve"> so this won’t be needed.</w:t>
+      </w:r>
+    </w:p>
+    <w:p>
+      <w:pPr>
+        <w:pStyle w:val="Heading4"/>
+      </w:pPr>
+      <w:r>
+        <w:t xml:space="preserve">Show Battery: </w:t>
+      </w:r>
+      <w:proofErr w:type="spellStart"/>
+      <w:r>
+        <w:t>Yes|No</w:t>
+      </w:r>
+      <w:proofErr w:type="spellEnd"/>
+    </w:p>
+    <w:p>
+      <w:r>
+        <w:t xml:space="preserve">This option controls the </w:t>
+      </w:r>
+      <w:r>
+        <w:t>battery display on the bottom right of the display.</w:t>
+      </w:r>
+    </w:p>
+    <w:p>
+      <w:pPr>
+        <w:pStyle w:val="Heading4"/>
+      </w:pPr>
+      <w:r>
+        <w:t>Full Battery: 2000-4000</w:t>
+      </w:r>
+    </w:p>
+    <w:p>
+      <w:r>
+        <w:t>This is the value that indicates a full 4.2V battery.</w:t>
+      </w:r>
+    </w:p>
+    <w:p>
+      <w:pPr>
+        <w:pStyle w:val="Heading4"/>
+      </w:pPr>
+      <w:r>
+        <w:t>Set Full Battery</w:t>
+      </w:r>
+    </w:p>
+    <w:p>
+      <w:r>
+        <w:t>This selection reads the current battery values and stores it. It is best set by fully charging the battery and then disconnecting the charger. Wait a couple of minutes and then use it several times until it seems stable.</w:t>
+      </w:r>
+    </w:p>
+    <w:p>
+      <w:pPr>
+        <w:pStyle w:val="Heading4"/>
+      </w:pPr>
+      <w:r>
+        <w:t>Read Battery Raw Data</w:t>
+      </w:r>
+    </w:p>
+    <w:p>
+      <w:r>
+        <w:t>This continuously reads the battery value</w:t>
+      </w:r>
+      <w:r>
+        <w:t xml:space="preserve">. It was originally used for testing, but it seems like it might possibly be </w:t>
+      </w:r>
+      <w:proofErr w:type="gramStart"/>
+      <w:r>
+        <w:t>useful</w:t>
+      </w:r>
+      <w:proofErr w:type="gramEnd"/>
+      <w:r>
+        <w:t xml:space="preserve"> so it was left in the menu system.</w:t>
+      </w:r>
+    </w:p>
+    <w:p>
+      <w:pPr>
+        <w:pStyle w:val="Heading3"/>
+      </w:pPr>
+      <w:r>
+        <w:t>New Version BIN File</w:t>
+      </w:r>
+    </w:p>
+    <w:p>
+      <w:r>
+        <w:t xml:space="preserve">New firmware can be loaded by putting </w:t>
+      </w:r>
+      <w:r>
+        <w:t xml:space="preserve">the binary file on the SD card. It must be named </w:t>
+      </w:r>
+      <w:proofErr w:type="spellStart"/>
+      <w:r>
+        <w:t>RadioFox.BIN</w:t>
+      </w:r>
+      <w:proofErr w:type="spellEnd"/>
+      <w:r>
+        <w:t>.</w:t>
+      </w:r>
+      <w:r>
+        <w:t xml:space="preserve"> There are two prompts, one to confirm overwriting the firmware, and another to allow deletion of the </w:t>
+      </w:r>
+      <w:r>
+        <w:t>BIN file after installation.</w:t>
+      </w:r>
+    </w:p>
+    <w:p>
+      <w:pPr>
+        <w:pStyle w:val="Heading3"/>
+      </w:pPr>
+      <w:r>
+        <w:t>Factory Settings</w:t>
+      </w:r>
+    </w:p>
+    <w:p>
+      <w:r>
+        <w:t xml:space="preserve">This command resets </w:t>
+      </w:r>
+      <w:r>
+        <w:t xml:space="preserve">all </w:t>
+      </w:r>
+      <w:r>
+        <w:t>settings</w:t>
+      </w:r>
+      <w:r>
+        <w:t xml:space="preserve"> except the high battery value to the original factory values.</w:t>
+      </w:r>
+      <w:r>
+        <w:t xml:space="preserve"> The factory reset can also be done by holding the dial button down while turning the power on.</w:t>
+      </w:r>
+    </w:p>
+    <w:p>
+      <w:pPr>
+        <w:pStyle w:val="Heading3"/>
+      </w:pPr>
+      <w:r>
+        <w:lastRenderedPageBreak/>
+        <w:t>Format EEPROM</w:t>
+      </w:r>
+    </w:p>
+    <w:p>
+      <w:r>
+        <w:t xml:space="preserve">This will clear </w:t>
+      </w:r>
+      <w:r>
+        <w:t xml:space="preserve">and reset </w:t>
+      </w:r>
+      <w:r>
+        <w:t xml:space="preserve">the </w:t>
+      </w:r>
+      <w:proofErr w:type="spellStart"/>
+      <w:r>
+        <w:t>eeprom</w:t>
+      </w:r>
+      <w:proofErr w:type="spellEnd"/>
+      <w:r>
+        <w:t xml:space="preserve"> where the settings are </w:t>
+      </w:r>
+      <w:proofErr w:type="gramStart"/>
+      <w:r>
+        <w:t>save</w:t>
+      </w:r>
+      <w:proofErr w:type="gramEnd"/>
+      <w:r>
+        <w:t xml:space="preserve"> in non-volatile memory. This is how settings are saved while the system is not powered.</w:t>
       </w:r>
     </w:p>
     <w:p>
@@ -2385,664 +3746,20 @@
         <w:pStyle w:val="Heading2"/>
       </w:pPr>
       <w:r>
-        <w:t>+</w:t>
-      </w:r>
-      <w:r>
-        <w:t>More Radio Settings</w:t>
-      </w:r>
-    </w:p>
-    <w:p>
-      <w:pPr>
-        <w:pStyle w:val="Heading3"/>
-      </w:pPr>
-      <w:r>
-        <w:t>RX Offset: -600|0|+600 kHz</w:t>
-      </w:r>
-    </w:p>
-    <w:p>
-      <w:r>
-        <w:t>This is the frequency offset from the transmit frequency that the radio uses to receive DTMF commands</w:t>
-      </w:r>
-      <w:r>
-        <w:t>. An offset is recommended. If 0 is used the radio will only listen when it isn’t sending. It has not been tested if it listens during sending when the offset is not 0.</w:t>
-      </w:r>
-    </w:p>
-    <w:p>
-      <w:pPr>
-        <w:pStyle w:val="Heading3"/>
-      </w:pPr>
-      <w:r>
-        <w:lastRenderedPageBreak/>
-        <w:t>Bandwidth: 12.5|</w:t>
-      </w:r>
-      <w:r>
-        <w:t>25 kHz</w:t>
-      </w:r>
-    </w:p>
-    <w:p>
-      <w:r>
-        <w:t>This sets the radio bandwidth</w:t>
-      </w:r>
-      <w:r>
-        <w:t>. It has not been tested much to see what effect it has on performance yet.</w:t>
-      </w:r>
-    </w:p>
-    <w:p>
-      <w:pPr>
-        <w:pStyle w:val="Heading3"/>
-      </w:pPr>
-      <w:r>
-        <w:t>CTCSS/DCS: CTCSS|DCS</w:t>
-      </w:r>
-    </w:p>
-    <w:p>
-      <w:r>
-        <w:t xml:space="preserve">This sets the </w:t>
-      </w:r>
-      <w:r>
-        <w:t>un-squelch</w:t>
-      </w:r>
-      <w:r>
-        <w:t xml:space="preserve"> values</w:t>
-      </w:r>
-      <w:r>
-        <w:t xml:space="preserve"> for either the analog or digital versions.</w:t>
-      </w:r>
-    </w:p>
-    <w:p>
-      <w:pPr>
-        <w:pStyle w:val="Heading3"/>
-      </w:pPr>
-      <w:r>
-        <w:t>TX CTCSS:</w:t>
-      </w:r>
-      <w:r>
-        <w:t xml:space="preserve"> None</w:t>
-      </w:r>
-      <w:r>
-        <w:t>|</w:t>
-      </w:r>
-      <w:r>
-        <w:t>67-</w:t>
-      </w:r>
-      <w:r>
-        <w:t>250.3</w:t>
-      </w:r>
-    </w:p>
-    <w:p>
-      <w:r>
-        <w:t>Analog un-squelch frequencies sent out.</w:t>
-      </w:r>
-    </w:p>
-    <w:p>
-      <w:pPr>
-        <w:pStyle w:val="Heading3"/>
-      </w:pPr>
-      <w:r>
-        <w:t>RX CTCSS:</w:t>
-      </w:r>
-      <w:r>
-        <w:t xml:space="preserve"> None|67-250.3</w:t>
-      </w:r>
-    </w:p>
-    <w:p>
-      <w:r>
-        <w:t>Analog un-squelch frequency for receiving.</w:t>
-      </w:r>
-    </w:p>
-    <w:p>
-      <w:pPr>
-        <w:pStyle w:val="Heading3"/>
-      </w:pPr>
-      <w:r>
-        <w:t>TX DCS:</w:t>
-      </w:r>
-      <w:r>
-        <w:t xml:space="preserve"> None|023-754</w:t>
-      </w:r>
-    </w:p>
-    <w:p>
-      <w:r>
-        <w:t>Digital un-squelch value for sending.</w:t>
-      </w:r>
-    </w:p>
-    <w:p>
-      <w:pPr>
-        <w:pStyle w:val="Heading3"/>
-      </w:pPr>
-      <w:r>
-        <w:t>TX I/N: I|N</w:t>
-      </w:r>
-    </w:p>
-    <w:p>
-      <w:r>
-        <w:t>The digital I or N value for sending.</w:t>
-      </w:r>
-    </w:p>
-    <w:p>
-      <w:pPr>
-        <w:pStyle w:val="Heading3"/>
-      </w:pPr>
-      <w:r>
-        <w:t>RX DCS: None|023-754</w:t>
-      </w:r>
-    </w:p>
-    <w:p>
-      <w:r>
-        <w:t>Digital un-squelch value for receiving.</w:t>
-      </w:r>
-    </w:p>
-    <w:p>
-      <w:pPr>
-        <w:pStyle w:val="Heading3"/>
-      </w:pPr>
-      <w:r>
-        <w:t>RX I/N: I|N</w:t>
-      </w:r>
-    </w:p>
-    <w:p>
-      <w:r>
-        <w:t>The digital I or N value for receiving.</w:t>
-      </w:r>
-    </w:p>
-    <w:p>
-      <w:pPr>
-        <w:pStyle w:val="Heading3"/>
-      </w:pPr>
-      <w:r>
-        <w:t>RX Volume:</w:t>
-      </w:r>
-      <w:r>
-        <w:t xml:space="preserve"> 1-6</w:t>
-      </w:r>
-    </w:p>
-    <w:p>
-      <w:r>
-        <w:t>This is the receive volume setting. It affects how well DTMF tones are detected.</w:t>
-      </w:r>
-    </w:p>
-    <w:p>
-      <w:pPr>
-        <w:pStyle w:val="Heading3"/>
-      </w:pPr>
-      <w:r>
-        <w:t>RX Squelch:</w:t>
-      </w:r>
-      <w:r>
-        <w:t xml:space="preserve"> 0-8</w:t>
-      </w:r>
-    </w:p>
-    <w:p>
-      <w:r>
-        <w:t>This affects how much signal is required to receive the DTMF signals.</w:t>
-      </w:r>
-    </w:p>
-    <w:p>
-      <w:pPr>
-        <w:pStyle w:val="Heading2"/>
-      </w:pPr>
-      <w:r>
-        <w:t>Cancel Waits/TX Now</w:t>
-      </w:r>
-    </w:p>
-    <w:p>
-      <w:r>
-        <w:t>When the radio is in either send or pause mode this command will cancel the timer and the next mo</w:t>
-      </w:r>
-      <w:r>
-        <w:t>de will start. For example if you want to cancel</w:t>
-      </w:r>
-      <w:r>
-        <w:t xml:space="preserve"> the pause and go to transmit, use this option. It can also be done by long pressing B0.</w:t>
-      </w:r>
-    </w:p>
-    <w:p>
-      <w:pPr>
-        <w:pStyle w:val="Heading2"/>
-      </w:pPr>
-      <w:r>
-        <w:lastRenderedPageBreak/>
-        <w:t>+Saved Settings Files</w:t>
-      </w:r>
-    </w:p>
-    <w:p>
-      <w:r>
-        <w:t>Saved settings files are named files stored on the SD card. They are useful to</w:t>
-      </w:r>
-      <w:r>
-        <w:t xml:space="preserve"> quickly configure the radio for different uses. All values except the battery calibration are affected.</w:t>
-      </w:r>
-    </w:p>
-    <w:p>
-      <w:pPr>
-        <w:pStyle w:val="Heading3"/>
-      </w:pPr>
-      <w:r>
-        <w:t>Create File</w:t>
-      </w:r>
-    </w:p>
-    <w:p>
-      <w:r>
-        <w:t>This prompts the user for a name. The file is then created using the current system settings.</w:t>
-      </w:r>
-    </w:p>
-    <w:p>
-      <w:pPr>
-        <w:pStyle w:val="Heading3"/>
-      </w:pPr>
-      <w:r>
-        <w:t>Save/Update File</w:t>
-      </w:r>
-    </w:p>
-    <w:p>
-      <w:r>
-        <w:t>This command saves the current settings into the selected file. If it already exists the user will be asked to confirm overwriting the file.</w:t>
-      </w:r>
-    </w:p>
-    <w:p>
-      <w:pPr>
-        <w:pStyle w:val="Heading3"/>
-      </w:pPr>
-      <w:r>
-        <w:t>Load File</w:t>
-      </w:r>
-    </w:p>
-    <w:p>
-      <w:r>
-        <w:t>This command asks the user for the name and then sets all of the system settings except the battery calibration using the values in the file.</w:t>
-      </w:r>
-    </w:p>
-    <w:p>
-      <w:pPr>
-        <w:pStyle w:val="Heading3"/>
-      </w:pPr>
-      <w:r>
-        <w:t>Delete File</w:t>
-      </w:r>
-    </w:p>
-    <w:p>
-      <w:r>
-        <w:t>The user selects a file from the list and then it can be deleted.</w:t>
-      </w:r>
-    </w:p>
-    <w:p>
-      <w:pPr>
-        <w:pStyle w:val="Heading2"/>
-      </w:pPr>
-      <w:r>
-        <w:t>+System Settings</w:t>
-      </w:r>
-    </w:p>
-    <w:p>
-      <w:pPr>
-        <w:pStyle w:val="Heading3"/>
-      </w:pPr>
-      <w:r>
-        <w:t>+Display</w:t>
-      </w:r>
-      <w:r>
-        <w:t xml:space="preserve"> Settings</w:t>
-      </w:r>
-    </w:p>
-    <w:p>
-      <w:pPr>
-        <w:pStyle w:val="Heading4"/>
-      </w:pPr>
-      <w:r>
-        <w:t>Dimming Mode: None</w:t>
-      </w:r>
-      <w:r>
-        <w:t>|Timer</w:t>
-      </w:r>
-    </w:p>
-    <w:p>
-      <w:r>
-        <w:t xml:space="preserve">The display can be set to dim automatically after a specified number of seconds. This is used to save battery power since the backlight </w:t>
-      </w:r>
-      <w:r>
-        <w:t>uses a significant amount.</w:t>
-      </w:r>
-    </w:p>
-    <w:p>
-      <w:pPr>
-        <w:pStyle w:val="Heading4"/>
-      </w:pPr>
-      <w:r>
-        <w:t>Bright Value: 1-100</w:t>
-      </w:r>
-      <w:r>
-        <w:t>%</w:t>
-      </w:r>
-    </w:p>
-    <w:p>
-      <w:r>
-        <w:t>Set the display brightness value.</w:t>
-      </w:r>
-    </w:p>
-    <w:p>
-      <w:pPr>
-        <w:pStyle w:val="Heading4"/>
-      </w:pPr>
-      <w:r>
-        <w:t xml:space="preserve">Dim Value: </w:t>
-      </w:r>
-      <w:r>
-        <w:t>0-100%</w:t>
-      </w:r>
-    </w:p>
-    <w:p>
-      <w:r>
-        <w:t xml:space="preserve">Set the display brightness after the </w:t>
-      </w:r>
-      <w:r>
-        <w:t>timer below expires.</w:t>
-      </w:r>
-    </w:p>
-    <w:p>
-      <w:pPr>
-        <w:pStyle w:val="Heading4"/>
-      </w:pPr>
-      <w:r>
-        <w:t>Display Dim Time:</w:t>
-      </w:r>
-      <w:r>
-        <w:t xml:space="preserve"> 0-120 S</w:t>
-      </w:r>
-    </w:p>
-    <w:p>
-      <w:r>
-        <w:t>Specify the time until the display changes to dim mode.</w:t>
-      </w:r>
-    </w:p>
-    <w:p>
-      <w:pPr>
-        <w:pStyle w:val="Heading4"/>
-      </w:pPr>
-      <w:r>
-        <w:t>+Sideways Scroll Settings</w:t>
-      </w:r>
-    </w:p>
-    <w:p>
-      <w:r>
-        <w:t>Lines of text that too long for the display will scroll back and forth. The following settings control the speed.</w:t>
-      </w:r>
-    </w:p>
-    <w:p>
-      <w:pPr>
-        <w:pStyle w:val="Heading5"/>
-      </w:pPr>
-      <w:r>
-        <w:lastRenderedPageBreak/>
-        <w:t xml:space="preserve">Speed: </w:t>
-      </w:r>
-      <w:r>
-        <w:t>1-1000 mS</w:t>
-      </w:r>
-    </w:p>
-    <w:p>
-      <w:r>
-        <w:t>Controls the speed of text moving to the left.</w:t>
-      </w:r>
-    </w:p>
-    <w:p>
-      <w:pPr>
-        <w:pStyle w:val="Heading5"/>
-      </w:pPr>
-      <w:r>
-        <w:t>Pause: 1-100</w:t>
-      </w:r>
-      <w:r>
-        <w:t xml:space="preserve"> mS</w:t>
-      </w:r>
-    </w:p>
-    <w:p>
-      <w:r>
-        <w:t>This controls the pause when the text is at the end (all the way to the left).</w:t>
-      </w:r>
-    </w:p>
-    <w:p>
-      <w:pPr>
-        <w:pStyle w:val="Heading5"/>
-      </w:pPr>
-      <w:r>
-        <w:t>Reverse Speed: 1-20x</w:t>
-      </w:r>
-    </w:p>
-    <w:p>
-      <w:r>
-        <w:t xml:space="preserve">This is how fast the text scrolls </w:t>
-      </w:r>
-      <w:r>
-        <w:t>back to the beginning (to the right). 2x means twice as fast as the text scroll</w:t>
-      </w:r>
-      <w:r>
-        <w:t>ed to the left</w:t>
-      </w:r>
-      <w:r>
-        <w:t>.</w:t>
-      </w:r>
-    </w:p>
-    <w:p>
-      <w:pPr>
-        <w:pStyle w:val="Heading4"/>
-      </w:pPr>
-      <w:r>
-        <w:t xml:space="preserve">Menu Selection: </w:t>
-      </w:r>
-      <w:r>
-        <w:t>Color|*</w:t>
-      </w:r>
-    </w:p>
-    <w:p>
-      <w:r>
-        <w:t>Menu selections</w:t>
-      </w:r>
-      <w:r>
-        <w:t xml:space="preserve"> and selections from a list can be either colored or marked with the ‘*’ character.</w:t>
-      </w:r>
-    </w:p>
-    <w:p>
-      <w:pPr>
-        <w:pStyle w:val="Heading4"/>
-      </w:pPr>
-      <w:r>
-        <w:t>Text/HiLite Colors</w:t>
-      </w:r>
-    </w:p>
-    <w:p>
-      <w:r>
-        <w:t>This selection allows for choosing the colors of the text and the highlight. The background screen is always black.</w:t>
-      </w:r>
-    </w:p>
-    <w:p>
-      <w:pPr>
-        <w:pStyle w:val="Heading3"/>
-      </w:pPr>
-      <w:r>
-        <w:t>+Dial &amp; Button Settings</w:t>
-      </w:r>
-    </w:p>
-    <w:p>
-      <w:pPr>
-        <w:pStyle w:val="Heading4"/>
-      </w:pPr>
-      <w:r>
-        <w:t>Direction: Normal:Reverse</w:t>
-      </w:r>
-    </w:p>
-    <w:p>
-      <w:r>
-        <w:t>If you really want the button to be the other way around this is the choice for you.</w:t>
-      </w:r>
-    </w:p>
-    <w:p>
-      <w:pPr>
-        <w:pStyle w:val="Heading4"/>
-      </w:pPr>
-      <w:r>
-        <w:t>Long Press Timer: 2-200</w:t>
-      </w:r>
-    </w:p>
-    <w:p>
-      <w:r>
-        <w:t>This value affects how long or short a long press is. The default value is normally OK</w:t>
-      </w:r>
-      <w:r>
-        <w:t>, but somebody might want to change it.</w:t>
-      </w:r>
-    </w:p>
-    <w:p>
-      <w:pPr>
-        <w:pStyle w:val="Heading3"/>
-      </w:pPr>
-      <w:r>
-        <w:t>+Battery Settings</w:t>
-      </w:r>
-    </w:p>
-    <w:p>
-      <w:r>
-        <w:t>Since the PCB was designed with 10% resistors for measuring the battery voltage some calibration is needed. A future PCB will probably use better resistors so this won’t be needed.</w:t>
-      </w:r>
-    </w:p>
-    <w:p>
-      <w:pPr>
-        <w:pStyle w:val="Heading4"/>
-      </w:pPr>
-      <w:r>
-        <w:t>Show Battery: Yes|No</w:t>
-      </w:r>
-    </w:p>
-    <w:p>
-      <w:r>
-        <w:t xml:space="preserve">This option controls the </w:t>
-      </w:r>
-      <w:r>
-        <w:t>battery display on the bottom right of the display.</w:t>
-      </w:r>
-    </w:p>
-    <w:p>
-      <w:pPr>
-        <w:pStyle w:val="Heading4"/>
-      </w:pPr>
-      <w:r>
-        <w:t>Full Battery: 2000-4000</w:t>
-      </w:r>
-    </w:p>
-    <w:p>
-      <w:r>
-        <w:t>This is the value that indicates a full 4.2V battery.</w:t>
-      </w:r>
-    </w:p>
-    <w:p>
-      <w:pPr>
-        <w:pStyle w:val="Heading4"/>
-      </w:pPr>
-      <w:r>
-        <w:t>Set Full Battery</w:t>
-      </w:r>
-    </w:p>
-    <w:p>
-      <w:r>
-        <w:t>This selection reads the current battery values and stores it. It is best set by fully charging the battery and then disconnecting the charger. Wait a couple of minutes and then use it several times until it seems stable.</w:t>
-      </w:r>
-    </w:p>
-    <w:p>
-      <w:pPr>
-        <w:pStyle w:val="Heading4"/>
-      </w:pPr>
-      <w:r>
-        <w:lastRenderedPageBreak/>
-        <w:t>Read Battery Raw Data</w:t>
-      </w:r>
-    </w:p>
-    <w:p>
-      <w:r>
-        <w:t>This continuously reads the battery value</w:t>
-      </w:r>
-      <w:r>
-        <w:t>. It was originally used for testing, but it seems like it might possibly be useful so it was left in the menu system.</w:t>
-      </w:r>
-    </w:p>
-    <w:p>
-      <w:pPr>
-        <w:pStyle w:val="Heading3"/>
-      </w:pPr>
-      <w:r>
-        <w:t>New Version BIN File</w:t>
-      </w:r>
-    </w:p>
-    <w:p>
-      <w:r>
-        <w:t xml:space="preserve">New firmware can be loaded by putting </w:t>
-      </w:r>
-      <w:r>
-        <w:t>the binary file on the SD card. It must be named RadioFox.BIN.</w:t>
-      </w:r>
-      <w:r>
-        <w:t xml:space="preserve"> There are two prompts, one to confirm overwriting the firmware, and another to allow deletion of the </w:t>
-      </w:r>
-      <w:r>
-        <w:t>BIN file after installation.</w:t>
-      </w:r>
-    </w:p>
-    <w:p>
-      <w:pPr>
-        <w:pStyle w:val="Heading3"/>
-      </w:pPr>
-      <w:r>
-        <w:t>Factory Settings</w:t>
-      </w:r>
-    </w:p>
-    <w:p>
-      <w:r>
-        <w:t xml:space="preserve">This command resets </w:t>
-      </w:r>
-      <w:r>
-        <w:t xml:space="preserve">all </w:t>
-      </w:r>
-      <w:r>
-        <w:t>settings</w:t>
-      </w:r>
-      <w:r>
-        <w:t xml:space="preserve"> except the high battery value to the original factory values.</w:t>
-      </w:r>
-      <w:r>
-        <w:t xml:space="preserve"> The factory reset can also be done by holding the dial button down while turning the power on.</w:t>
-      </w:r>
-    </w:p>
-    <w:p>
-      <w:pPr>
-        <w:pStyle w:val="Heading3"/>
-      </w:pPr>
-      <w:r>
-        <w:t>Format EEPROM</w:t>
-      </w:r>
-    </w:p>
-    <w:p>
-      <w:r>
-        <w:t xml:space="preserve">This will clear </w:t>
-      </w:r>
-      <w:r>
-        <w:t xml:space="preserve">and reset </w:t>
-      </w:r>
-      <w:r>
-        <w:t>the eeprom where the settings are save</w:t>
-      </w:r>
-      <w:r>
-        <w:t xml:space="preserve"> in non-volatile memory. This is how settings are saved while the system is not powered.</w:t>
-      </w:r>
-    </w:p>
-    <w:p>
-      <w:pPr>
-        <w:pStyle w:val="Heading2"/>
-      </w:pPr>
-      <w:r>
         <w:t>Save Current Settings</w:t>
       </w:r>
     </w:p>
     <w:p>
       <w:r>
-        <w:t>This stores all of the current settings in the non-volatile memory</w:t>
+        <w:t xml:space="preserve">This stores </w:t>
+      </w:r>
+      <w:proofErr w:type="gramStart"/>
+      <w:r>
+        <w:t>all of</w:t>
+      </w:r>
+      <w:proofErr w:type="gramEnd"/>
+      <w:r>
+        <w:t xml:space="preserve"> the current settings in the non-volatile memory</w:t>
       </w:r>
       <w:r>
         <w:t>. Note that this is not often used since settings are normally saved each time they are changed.</w:t>
@@ -7741,6 +8458,118 @@
     </w:lvl>
   </w:abstractNum>
   <w:abstractNum w:abstractNumId="40" w15:restartNumberingAfterBreak="0">
+    <w:nsid w:val="33DD7186"/>
+    <w:multiLevelType w:val="hybridMultilevel"/>
+    <w:tmpl w:val="0158FAEA"/>
+    <w:lvl w:ilvl="0" w:tplc="C6BEFDC4">
+      <w:numFmt w:val="bullet"/>
+      <w:lvlText w:val="-"/>
+      <w:lvlJc w:val="left"/>
+      <w:pPr>
+        <w:ind w:left="720" w:hanging="360"/>
+      </w:pPr>
+      <w:rPr>
+        <w:rFonts w:ascii="Arial" w:eastAsia="Arial" w:hAnsi="Arial" w:cs="Arial" w:hint="default"/>
+      </w:rPr>
+    </w:lvl>
+    <w:lvl w:ilvl="1" w:tplc="04090003" w:tentative="1">
+      <w:start w:val="1"/>
+      <w:numFmt w:val="bullet"/>
+      <w:lvlText w:val="o"/>
+      <w:lvlJc w:val="left"/>
+      <w:pPr>
+        <w:ind w:left="1440" w:hanging="360"/>
+      </w:pPr>
+      <w:rPr>
+        <w:rFonts w:ascii="Courier New" w:hAnsi="Courier New" w:cs="Courier New" w:hint="default"/>
+      </w:rPr>
+    </w:lvl>
+    <w:lvl w:ilvl="2" w:tplc="04090005" w:tentative="1">
+      <w:start w:val="1"/>
+      <w:numFmt w:val="bullet"/>
+      <w:lvlText w:val=""/>
+      <w:lvlJc w:val="left"/>
+      <w:pPr>
+        <w:ind w:left="2160" w:hanging="360"/>
+      </w:pPr>
+      <w:rPr>
+        <w:rFonts w:ascii="Wingdings" w:hAnsi="Wingdings" w:hint="default"/>
+      </w:rPr>
+    </w:lvl>
+    <w:lvl w:ilvl="3" w:tplc="04090001" w:tentative="1">
+      <w:start w:val="1"/>
+      <w:numFmt w:val="bullet"/>
+      <w:lvlText w:val=""/>
+      <w:lvlJc w:val="left"/>
+      <w:pPr>
+        <w:ind w:left="2880" w:hanging="360"/>
+      </w:pPr>
+      <w:rPr>
+        <w:rFonts w:ascii="Symbol" w:hAnsi="Symbol" w:hint="default"/>
+      </w:rPr>
+    </w:lvl>
+    <w:lvl w:ilvl="4" w:tplc="04090003" w:tentative="1">
+      <w:start w:val="1"/>
+      <w:numFmt w:val="bullet"/>
+      <w:lvlText w:val="o"/>
+      <w:lvlJc w:val="left"/>
+      <w:pPr>
+        <w:ind w:left="3600" w:hanging="360"/>
+      </w:pPr>
+      <w:rPr>
+        <w:rFonts w:ascii="Courier New" w:hAnsi="Courier New" w:cs="Courier New" w:hint="default"/>
+      </w:rPr>
+    </w:lvl>
+    <w:lvl w:ilvl="5" w:tplc="04090005" w:tentative="1">
+      <w:start w:val="1"/>
+      <w:numFmt w:val="bullet"/>
+      <w:lvlText w:val=""/>
+      <w:lvlJc w:val="left"/>
+      <w:pPr>
+        <w:ind w:left="4320" w:hanging="360"/>
+      </w:pPr>
+      <w:rPr>
+        <w:rFonts w:ascii="Wingdings" w:hAnsi="Wingdings" w:hint="default"/>
+      </w:rPr>
+    </w:lvl>
+    <w:lvl w:ilvl="6" w:tplc="04090001" w:tentative="1">
+      <w:start w:val="1"/>
+      <w:numFmt w:val="bullet"/>
+      <w:lvlText w:val=""/>
+      <w:lvlJc w:val="left"/>
+      <w:pPr>
+        <w:ind w:left="5040" w:hanging="360"/>
+      </w:pPr>
+      <w:rPr>
+        <w:rFonts w:ascii="Symbol" w:hAnsi="Symbol" w:hint="default"/>
+      </w:rPr>
+    </w:lvl>
+    <w:lvl w:ilvl="7" w:tplc="04090003" w:tentative="1">
+      <w:start w:val="1"/>
+      <w:numFmt w:val="bullet"/>
+      <w:lvlText w:val="o"/>
+      <w:lvlJc w:val="left"/>
+      <w:pPr>
+        <w:ind w:left="5760" w:hanging="360"/>
+      </w:pPr>
+      <w:rPr>
+        <w:rFonts w:ascii="Courier New" w:hAnsi="Courier New" w:cs="Courier New" w:hint="default"/>
+      </w:rPr>
+    </w:lvl>
+    <w:lvl w:ilvl="8" w:tplc="04090005" w:tentative="1">
+      <w:start w:val="1"/>
+      <w:numFmt w:val="bullet"/>
+      <w:lvlText w:val=""/>
+      <w:lvlJc w:val="left"/>
+      <w:pPr>
+        <w:ind w:left="6480" w:hanging="360"/>
+      </w:pPr>
+      <w:rPr>
+        <w:rFonts w:ascii="Wingdings" w:hAnsi="Wingdings" w:hint="default"/>
+      </w:rPr>
+    </w:lvl>
+  </w:abstractNum>
+  <w:abstractNum w:abstractNumId="41" w15:restartNumberingAfterBreak="0">
     <w:nsid w:val="342D66E6"/>
     <w:multiLevelType w:val="hybridMultilevel"/>
     <w:tmpl w:val="E254554A"/>
@@ -7852,7 +8681,7 @@
       </w:rPr>
     </w:lvl>
   </w:abstractNum>
-  <w:abstractNum w:abstractNumId="41" w15:restartNumberingAfterBreak="0">
+  <w:abstractNum w:abstractNumId="42" w15:restartNumberingAfterBreak="0">
     <w:nsid w:val="343C0E61"/>
     <w:multiLevelType w:val="hybridMultilevel"/>
     <w:tmpl w:val="B88A1536"/>
@@ -7964,7 +8793,7 @@
       </w:rPr>
     </w:lvl>
   </w:abstractNum>
-  <w:abstractNum w:abstractNumId="42" w15:restartNumberingAfterBreak="0">
+  <w:abstractNum w:abstractNumId="43" w15:restartNumberingAfterBreak="0">
     <w:nsid w:val="34A14553"/>
     <w:multiLevelType w:val="hybridMultilevel"/>
     <w:tmpl w:val="170EF526"/>
@@ -8076,7 +8905,7 @@
       </w:rPr>
     </w:lvl>
   </w:abstractNum>
-  <w:abstractNum w:abstractNumId="43" w15:restartNumberingAfterBreak="0">
+  <w:abstractNum w:abstractNumId="44" w15:restartNumberingAfterBreak="0">
     <w:nsid w:val="376B3B86"/>
     <w:multiLevelType w:val="hybridMultilevel"/>
     <w:tmpl w:val="A616020E"/>
@@ -8188,7 +9017,7 @@
       </w:rPr>
     </w:lvl>
   </w:abstractNum>
-  <w:abstractNum w:abstractNumId="44" w15:restartNumberingAfterBreak="0">
+  <w:abstractNum w:abstractNumId="45" w15:restartNumberingAfterBreak="0">
     <w:nsid w:val="377B1E27"/>
     <w:multiLevelType w:val="hybridMultilevel"/>
     <w:tmpl w:val="70E09EF8"/>
@@ -8300,7 +9129,7 @@
       </w:rPr>
     </w:lvl>
   </w:abstractNum>
-  <w:abstractNum w:abstractNumId="45" w15:restartNumberingAfterBreak="0">
+  <w:abstractNum w:abstractNumId="46" w15:restartNumberingAfterBreak="0">
     <w:nsid w:val="37ED2E74"/>
     <w:multiLevelType w:val="hybridMultilevel"/>
     <w:tmpl w:val="2D30E69C"/>
@@ -8412,7 +9241,7 @@
       </w:rPr>
     </w:lvl>
   </w:abstractNum>
-  <w:abstractNum w:abstractNumId="46" w15:restartNumberingAfterBreak="0">
+  <w:abstractNum w:abstractNumId="47" w15:restartNumberingAfterBreak="0">
     <w:nsid w:val="393A26B1"/>
     <w:multiLevelType w:val="hybridMultilevel"/>
     <w:tmpl w:val="59707C16"/>
@@ -8524,7 +9353,7 @@
       </w:rPr>
     </w:lvl>
   </w:abstractNum>
-  <w:abstractNum w:abstractNumId="47" w15:restartNumberingAfterBreak="0">
+  <w:abstractNum w:abstractNumId="48" w15:restartNumberingAfterBreak="0">
     <w:nsid w:val="395D6EAE"/>
     <w:multiLevelType w:val="hybridMultilevel"/>
     <w:tmpl w:val="A9FA500E"/>
@@ -8636,7 +9465,7 @@
       </w:rPr>
     </w:lvl>
   </w:abstractNum>
-  <w:abstractNum w:abstractNumId="48" w15:restartNumberingAfterBreak="0">
+  <w:abstractNum w:abstractNumId="49" w15:restartNumberingAfterBreak="0">
     <w:nsid w:val="39A93951"/>
     <w:multiLevelType w:val="hybridMultilevel"/>
     <w:tmpl w:val="E522E05C"/>
@@ -8748,7 +9577,7 @@
       </w:rPr>
     </w:lvl>
   </w:abstractNum>
-  <w:abstractNum w:abstractNumId="49" w15:restartNumberingAfterBreak="0">
+  <w:abstractNum w:abstractNumId="50" w15:restartNumberingAfterBreak="0">
     <w:nsid w:val="3B001DA3"/>
     <w:multiLevelType w:val="hybridMultilevel"/>
     <w:tmpl w:val="077EDE58"/>
@@ -8860,7 +9689,7 @@
       </w:rPr>
     </w:lvl>
   </w:abstractNum>
-  <w:abstractNum w:abstractNumId="50" w15:restartNumberingAfterBreak="0">
+  <w:abstractNum w:abstractNumId="51" w15:restartNumberingAfterBreak="0">
     <w:nsid w:val="3C141BB0"/>
     <w:multiLevelType w:val="hybridMultilevel"/>
     <w:tmpl w:val="E7900C40"/>
@@ -8972,7 +9801,7 @@
       </w:rPr>
     </w:lvl>
   </w:abstractNum>
-  <w:abstractNum w:abstractNumId="51" w15:restartNumberingAfterBreak="0">
+  <w:abstractNum w:abstractNumId="52" w15:restartNumberingAfterBreak="0">
     <w:nsid w:val="3D29141D"/>
     <w:multiLevelType w:val="hybridMultilevel"/>
     <w:tmpl w:val="907E98AC"/>
@@ -9084,7 +9913,7 @@
       </w:rPr>
     </w:lvl>
   </w:abstractNum>
-  <w:abstractNum w:abstractNumId="52" w15:restartNumberingAfterBreak="0">
+  <w:abstractNum w:abstractNumId="53" w15:restartNumberingAfterBreak="0">
     <w:nsid w:val="3E463A6C"/>
     <w:multiLevelType w:val="hybridMultilevel"/>
     <w:tmpl w:val="5A4C8A9E"/>
@@ -9196,7 +10025,7 @@
       </w:rPr>
     </w:lvl>
   </w:abstractNum>
-  <w:abstractNum w:abstractNumId="53" w15:restartNumberingAfterBreak="0">
+  <w:abstractNum w:abstractNumId="54" w15:restartNumberingAfterBreak="0">
     <w:nsid w:val="40163D94"/>
     <w:multiLevelType w:val="hybridMultilevel"/>
     <w:tmpl w:val="B8669994"/>
@@ -9308,7 +10137,7 @@
       </w:rPr>
     </w:lvl>
   </w:abstractNum>
-  <w:abstractNum w:abstractNumId="54" w15:restartNumberingAfterBreak="0">
+  <w:abstractNum w:abstractNumId="55" w15:restartNumberingAfterBreak="0">
     <w:nsid w:val="40570DDE"/>
     <w:multiLevelType w:val="hybridMultilevel"/>
     <w:tmpl w:val="374229F2"/>
@@ -9420,7 +10249,7 @@
       </w:rPr>
     </w:lvl>
   </w:abstractNum>
-  <w:abstractNum w:abstractNumId="55" w15:restartNumberingAfterBreak="0">
+  <w:abstractNum w:abstractNumId="56" w15:restartNumberingAfterBreak="0">
     <w:nsid w:val="42EE59E7"/>
     <w:multiLevelType w:val="multilevel"/>
     <w:tmpl w:val="6A52508A"/>
@@ -9533,7 +10362,7 @@
       </w:rPr>
     </w:lvl>
   </w:abstractNum>
-  <w:abstractNum w:abstractNumId="56" w15:restartNumberingAfterBreak="0">
+  <w:abstractNum w:abstractNumId="57" w15:restartNumberingAfterBreak="0">
     <w:nsid w:val="43E5715E"/>
     <w:multiLevelType w:val="hybridMultilevel"/>
     <w:tmpl w:val="DF4C239E"/>
@@ -9645,7 +10474,7 @@
       </w:rPr>
     </w:lvl>
   </w:abstractNum>
-  <w:abstractNum w:abstractNumId="57" w15:restartNumberingAfterBreak="0">
+  <w:abstractNum w:abstractNumId="58" w15:restartNumberingAfterBreak="0">
     <w:nsid w:val="447A353B"/>
     <w:multiLevelType w:val="hybridMultilevel"/>
     <w:tmpl w:val="C978BA68"/>
@@ -9757,7 +10586,7 @@
       </w:rPr>
     </w:lvl>
   </w:abstractNum>
-  <w:abstractNum w:abstractNumId="58" w15:restartNumberingAfterBreak="0">
+  <w:abstractNum w:abstractNumId="59" w15:restartNumberingAfterBreak="0">
     <w:nsid w:val="452C7493"/>
     <w:multiLevelType w:val="hybridMultilevel"/>
     <w:tmpl w:val="9910A868"/>
@@ -9869,7 +10698,7 @@
       </w:rPr>
     </w:lvl>
   </w:abstractNum>
-  <w:abstractNum w:abstractNumId="59" w15:restartNumberingAfterBreak="0">
+  <w:abstractNum w:abstractNumId="60" w15:restartNumberingAfterBreak="0">
     <w:nsid w:val="46BB3CB3"/>
     <w:multiLevelType w:val="hybridMultilevel"/>
     <w:tmpl w:val="8B62916A"/>
@@ -9981,7 +10810,7 @@
       </w:rPr>
     </w:lvl>
   </w:abstractNum>
-  <w:abstractNum w:abstractNumId="60" w15:restartNumberingAfterBreak="0">
+  <w:abstractNum w:abstractNumId="61" w15:restartNumberingAfterBreak="0">
     <w:nsid w:val="47746E93"/>
     <w:multiLevelType w:val="hybridMultilevel"/>
     <w:tmpl w:val="2B721A4A"/>
@@ -10093,7 +10922,7 @@
       </w:rPr>
     </w:lvl>
   </w:abstractNum>
-  <w:abstractNum w:abstractNumId="61" w15:restartNumberingAfterBreak="0">
+  <w:abstractNum w:abstractNumId="62" w15:restartNumberingAfterBreak="0">
     <w:nsid w:val="483D056B"/>
     <w:multiLevelType w:val="hybridMultilevel"/>
     <w:tmpl w:val="C4DCE034"/>
@@ -10205,7 +11034,7 @@
       </w:rPr>
     </w:lvl>
   </w:abstractNum>
-  <w:abstractNum w:abstractNumId="62" w15:restartNumberingAfterBreak="0">
+  <w:abstractNum w:abstractNumId="63" w15:restartNumberingAfterBreak="0">
     <w:nsid w:val="48813A05"/>
     <w:multiLevelType w:val="hybridMultilevel"/>
     <w:tmpl w:val="42CAA4CE"/>
@@ -10318,7 +11147,7 @@
       </w:rPr>
     </w:lvl>
   </w:abstractNum>
-  <w:abstractNum w:abstractNumId="63" w15:restartNumberingAfterBreak="0">
+  <w:abstractNum w:abstractNumId="64" w15:restartNumberingAfterBreak="0">
     <w:nsid w:val="4A3C29DC"/>
     <w:multiLevelType w:val="hybridMultilevel"/>
     <w:tmpl w:val="29F4D392"/>
@@ -10430,7 +11259,7 @@
       </w:rPr>
     </w:lvl>
   </w:abstractNum>
-  <w:abstractNum w:abstractNumId="64" w15:restartNumberingAfterBreak="0">
+  <w:abstractNum w:abstractNumId="65" w15:restartNumberingAfterBreak="0">
     <w:nsid w:val="4A9B6FB7"/>
     <w:multiLevelType w:val="hybridMultilevel"/>
     <w:tmpl w:val="C47ECA54"/>
@@ -10542,7 +11371,7 @@
       </w:rPr>
     </w:lvl>
   </w:abstractNum>
-  <w:abstractNum w:abstractNumId="65" w15:restartNumberingAfterBreak="0">
+  <w:abstractNum w:abstractNumId="66" w15:restartNumberingAfterBreak="0">
     <w:nsid w:val="4C2207ED"/>
     <w:multiLevelType w:val="hybridMultilevel"/>
     <w:tmpl w:val="E95272B2"/>
@@ -10654,7 +11483,7 @@
       </w:rPr>
     </w:lvl>
   </w:abstractNum>
-  <w:abstractNum w:abstractNumId="66" w15:restartNumberingAfterBreak="0">
+  <w:abstractNum w:abstractNumId="67" w15:restartNumberingAfterBreak="0">
     <w:nsid w:val="4C687CB3"/>
     <w:multiLevelType w:val="hybridMultilevel"/>
     <w:tmpl w:val="0D781E22"/>
@@ -10766,7 +11595,7 @@
       </w:rPr>
     </w:lvl>
   </w:abstractNum>
-  <w:abstractNum w:abstractNumId="67" w15:restartNumberingAfterBreak="0">
+  <w:abstractNum w:abstractNumId="68" w15:restartNumberingAfterBreak="0">
     <w:nsid w:val="4FCE4725"/>
     <w:multiLevelType w:val="hybridMultilevel"/>
     <w:tmpl w:val="914EE3B4"/>
@@ -10878,7 +11707,7 @@
       </w:rPr>
     </w:lvl>
   </w:abstractNum>
-  <w:abstractNum w:abstractNumId="68" w15:restartNumberingAfterBreak="0">
+  <w:abstractNum w:abstractNumId="69" w15:restartNumberingAfterBreak="0">
     <w:nsid w:val="51CE085C"/>
     <w:multiLevelType w:val="hybridMultilevel"/>
     <w:tmpl w:val="84788A08"/>
@@ -10990,7 +11819,7 @@
       </w:rPr>
     </w:lvl>
   </w:abstractNum>
-  <w:abstractNum w:abstractNumId="69" w15:restartNumberingAfterBreak="0">
+  <w:abstractNum w:abstractNumId="70" w15:restartNumberingAfterBreak="0">
     <w:nsid w:val="52944BD2"/>
     <w:multiLevelType w:val="hybridMultilevel"/>
     <w:tmpl w:val="BC3489E0"/>
@@ -11102,7 +11931,7 @@
       </w:rPr>
     </w:lvl>
   </w:abstractNum>
-  <w:abstractNum w:abstractNumId="70" w15:restartNumberingAfterBreak="0">
+  <w:abstractNum w:abstractNumId="71" w15:restartNumberingAfterBreak="0">
     <w:nsid w:val="565E12F2"/>
     <w:multiLevelType w:val="hybridMultilevel"/>
     <w:tmpl w:val="9E96747C"/>
@@ -11214,7 +12043,7 @@
       </w:rPr>
     </w:lvl>
   </w:abstractNum>
-  <w:abstractNum w:abstractNumId="71" w15:restartNumberingAfterBreak="0">
+  <w:abstractNum w:abstractNumId="72" w15:restartNumberingAfterBreak="0">
     <w:nsid w:val="57466407"/>
     <w:multiLevelType w:val="hybridMultilevel"/>
     <w:tmpl w:val="0F9ADCF4"/>
@@ -11326,7 +12155,7 @@
       </w:rPr>
     </w:lvl>
   </w:abstractNum>
-  <w:abstractNum w:abstractNumId="72" w15:restartNumberingAfterBreak="0">
+  <w:abstractNum w:abstractNumId="73" w15:restartNumberingAfterBreak="0">
     <w:nsid w:val="5ABE68FB"/>
     <w:multiLevelType w:val="hybridMultilevel"/>
     <w:tmpl w:val="B422F472"/>
@@ -11438,7 +12267,7 @@
       </w:rPr>
     </w:lvl>
   </w:abstractNum>
-  <w:abstractNum w:abstractNumId="73" w15:restartNumberingAfterBreak="0">
+  <w:abstractNum w:abstractNumId="74" w15:restartNumberingAfterBreak="0">
     <w:nsid w:val="5BA928F1"/>
     <w:multiLevelType w:val="hybridMultilevel"/>
     <w:tmpl w:val="4D4E1798"/>
@@ -11550,7 +12379,7 @@
       </w:rPr>
     </w:lvl>
   </w:abstractNum>
-  <w:abstractNum w:abstractNumId="74" w15:restartNumberingAfterBreak="0">
+  <w:abstractNum w:abstractNumId="75" w15:restartNumberingAfterBreak="0">
     <w:nsid w:val="5C834FA4"/>
     <w:multiLevelType w:val="hybridMultilevel"/>
     <w:tmpl w:val="1FC415FC"/>
@@ -11662,7 +12491,7 @@
       </w:rPr>
     </w:lvl>
   </w:abstractNum>
-  <w:abstractNum w:abstractNumId="75" w15:restartNumberingAfterBreak="0">
+  <w:abstractNum w:abstractNumId="76" w15:restartNumberingAfterBreak="0">
     <w:nsid w:val="5F3C3936"/>
     <w:multiLevelType w:val="hybridMultilevel"/>
     <w:tmpl w:val="917CC46E"/>
@@ -11774,7 +12603,7 @@
       </w:rPr>
     </w:lvl>
   </w:abstractNum>
-  <w:abstractNum w:abstractNumId="76" w15:restartNumberingAfterBreak="0">
+  <w:abstractNum w:abstractNumId="77" w15:restartNumberingAfterBreak="0">
     <w:nsid w:val="60544E94"/>
     <w:multiLevelType w:val="hybridMultilevel"/>
     <w:tmpl w:val="CBCAC042"/>
@@ -11886,7 +12715,7 @@
       </w:rPr>
     </w:lvl>
   </w:abstractNum>
-  <w:abstractNum w:abstractNumId="77" w15:restartNumberingAfterBreak="0">
+  <w:abstractNum w:abstractNumId="78" w15:restartNumberingAfterBreak="0">
     <w:nsid w:val="62D1418B"/>
     <w:multiLevelType w:val="multilevel"/>
     <w:tmpl w:val="3E58308A"/>
@@ -11985,7 +12814,7 @@
       </w:pPr>
     </w:lvl>
   </w:abstractNum>
-  <w:abstractNum w:abstractNumId="78" w15:restartNumberingAfterBreak="0">
+  <w:abstractNum w:abstractNumId="79" w15:restartNumberingAfterBreak="0">
     <w:nsid w:val="62E52923"/>
     <w:multiLevelType w:val="hybridMultilevel"/>
     <w:tmpl w:val="7668165A"/>
@@ -12097,7 +12926,7 @@
       </w:rPr>
     </w:lvl>
   </w:abstractNum>
-  <w:abstractNum w:abstractNumId="79" w15:restartNumberingAfterBreak="0">
+  <w:abstractNum w:abstractNumId="80" w15:restartNumberingAfterBreak="0">
     <w:nsid w:val="63935A88"/>
     <w:multiLevelType w:val="hybridMultilevel"/>
     <w:tmpl w:val="0F5805EA"/>
@@ -12209,7 +13038,7 @@
       </w:rPr>
     </w:lvl>
   </w:abstractNum>
-  <w:abstractNum w:abstractNumId="80" w15:restartNumberingAfterBreak="0">
+  <w:abstractNum w:abstractNumId="81" w15:restartNumberingAfterBreak="0">
     <w:nsid w:val="69496F08"/>
     <w:multiLevelType w:val="hybridMultilevel"/>
     <w:tmpl w:val="6EE839E4"/>
@@ -12321,7 +13150,7 @@
       </w:rPr>
     </w:lvl>
   </w:abstractNum>
-  <w:abstractNum w:abstractNumId="81" w15:restartNumberingAfterBreak="0">
+  <w:abstractNum w:abstractNumId="82" w15:restartNumberingAfterBreak="0">
     <w:nsid w:val="6ACC6C5E"/>
     <w:multiLevelType w:val="multilevel"/>
     <w:tmpl w:val="4AB8E1DA"/>
@@ -12434,7 +13263,7 @@
       </w:rPr>
     </w:lvl>
   </w:abstractNum>
-  <w:abstractNum w:abstractNumId="82" w15:restartNumberingAfterBreak="0">
+  <w:abstractNum w:abstractNumId="83" w15:restartNumberingAfterBreak="0">
     <w:nsid w:val="6D7319F8"/>
     <w:multiLevelType w:val="hybridMultilevel"/>
     <w:tmpl w:val="A7EEE4A4"/>
@@ -12546,7 +13375,7 @@
       </w:rPr>
     </w:lvl>
   </w:abstractNum>
-  <w:abstractNum w:abstractNumId="83" w15:restartNumberingAfterBreak="0">
+  <w:abstractNum w:abstractNumId="84" w15:restartNumberingAfterBreak="0">
     <w:nsid w:val="6D94244E"/>
     <w:multiLevelType w:val="hybridMultilevel"/>
     <w:tmpl w:val="D38C1A3A"/>
@@ -12658,7 +13487,7 @@
       </w:rPr>
     </w:lvl>
   </w:abstractNum>
-  <w:abstractNum w:abstractNumId="84" w15:restartNumberingAfterBreak="0">
+  <w:abstractNum w:abstractNumId="85" w15:restartNumberingAfterBreak="0">
     <w:nsid w:val="6DEA09BD"/>
     <w:multiLevelType w:val="hybridMultilevel"/>
     <w:tmpl w:val="029A123E"/>
@@ -12770,7 +13599,7 @@
       </w:rPr>
     </w:lvl>
   </w:abstractNum>
-  <w:abstractNum w:abstractNumId="85" w15:restartNumberingAfterBreak="0">
+  <w:abstractNum w:abstractNumId="86" w15:restartNumberingAfterBreak="0">
     <w:nsid w:val="6E310D77"/>
     <w:multiLevelType w:val="hybridMultilevel"/>
     <w:tmpl w:val="9C74834E"/>
@@ -12883,7 +13712,7 @@
       </w:rPr>
     </w:lvl>
   </w:abstractNum>
-  <w:abstractNum w:abstractNumId="86" w15:restartNumberingAfterBreak="0">
+  <w:abstractNum w:abstractNumId="87" w15:restartNumberingAfterBreak="0">
     <w:nsid w:val="74D85371"/>
     <w:multiLevelType w:val="hybridMultilevel"/>
     <w:tmpl w:val="B20E36AC"/>
@@ -12995,7 +13824,7 @@
       </w:rPr>
     </w:lvl>
   </w:abstractNum>
-  <w:abstractNum w:abstractNumId="87" w15:restartNumberingAfterBreak="0">
+  <w:abstractNum w:abstractNumId="88" w15:restartNumberingAfterBreak="0">
     <w:nsid w:val="75FA3747"/>
     <w:multiLevelType w:val="hybridMultilevel"/>
     <w:tmpl w:val="B9F43A9E"/>
@@ -13107,7 +13936,7 @@
       </w:rPr>
     </w:lvl>
   </w:abstractNum>
-  <w:abstractNum w:abstractNumId="88" w15:restartNumberingAfterBreak="0">
+  <w:abstractNum w:abstractNumId="89" w15:restartNumberingAfterBreak="0">
     <w:nsid w:val="7877407A"/>
     <w:multiLevelType w:val="hybridMultilevel"/>
     <w:tmpl w:val="C91E38FA"/>
@@ -13219,7 +14048,7 @@
       </w:rPr>
     </w:lvl>
   </w:abstractNum>
-  <w:abstractNum w:abstractNumId="89" w15:restartNumberingAfterBreak="0">
+  <w:abstractNum w:abstractNumId="90" w15:restartNumberingAfterBreak="0">
     <w:nsid w:val="78A40DC3"/>
     <w:multiLevelType w:val="hybridMultilevel"/>
     <w:tmpl w:val="F1E6B4B6"/>
@@ -13331,7 +14160,7 @@
       </w:rPr>
     </w:lvl>
   </w:abstractNum>
-  <w:abstractNum w:abstractNumId="90" w15:restartNumberingAfterBreak="0">
+  <w:abstractNum w:abstractNumId="91" w15:restartNumberingAfterBreak="0">
     <w:nsid w:val="79587B7C"/>
     <w:multiLevelType w:val="hybridMultilevel"/>
     <w:tmpl w:val="6A46933A"/>
@@ -13443,7 +14272,7 @@
       </w:rPr>
     </w:lvl>
   </w:abstractNum>
-  <w:abstractNum w:abstractNumId="91" w15:restartNumberingAfterBreak="0">
+  <w:abstractNum w:abstractNumId="92" w15:restartNumberingAfterBreak="0">
     <w:nsid w:val="7BB23699"/>
     <w:multiLevelType w:val="hybridMultilevel"/>
     <w:tmpl w:val="26C25814"/>
@@ -13555,7 +14384,7 @@
       </w:rPr>
     </w:lvl>
   </w:abstractNum>
-  <w:abstractNum w:abstractNumId="92" w15:restartNumberingAfterBreak="0">
+  <w:abstractNum w:abstractNumId="93" w15:restartNumberingAfterBreak="0">
     <w:nsid w:val="7F827ECF"/>
     <w:multiLevelType w:val="hybridMultilevel"/>
     <w:tmpl w:val="42DE9398"/>
@@ -13668,13 +14497,13 @@
     </w:lvl>
   </w:abstractNum>
   <w:num w:numId="1" w16cid:durableId="553472407">
-    <w:abstractNumId w:val="81"/>
+    <w:abstractNumId w:val="82"/>
   </w:num>
   <w:num w:numId="2" w16cid:durableId="1531718695">
     <w:abstractNumId w:val="16"/>
   </w:num>
   <w:num w:numId="3" w16cid:durableId="667371155">
-    <w:abstractNumId w:val="55"/>
+    <w:abstractNumId w:val="56"/>
   </w:num>
   <w:num w:numId="4" w16cid:durableId="751775167">
     <w:abstractNumId w:val="12"/>
@@ -13683,16 +14512,16 @@
     <w:abstractNumId w:val="29"/>
   </w:num>
   <w:num w:numId="6" w16cid:durableId="915629572">
-    <w:abstractNumId w:val="77"/>
+    <w:abstractNumId w:val="78"/>
   </w:num>
   <w:num w:numId="7" w16cid:durableId="693576224">
-    <w:abstractNumId w:val="90"/>
+    <w:abstractNumId w:val="91"/>
   </w:num>
   <w:num w:numId="8" w16cid:durableId="1298343021">
-    <w:abstractNumId w:val="85"/>
+    <w:abstractNumId w:val="86"/>
   </w:num>
   <w:num w:numId="9" w16cid:durableId="367219526">
-    <w:abstractNumId w:val="83"/>
+    <w:abstractNumId w:val="84"/>
   </w:num>
   <w:num w:numId="10" w16cid:durableId="1497187389">
     <w:abstractNumId w:val="18"/>
@@ -13701,10 +14530,10 @@
     <w:abstractNumId w:val="11"/>
   </w:num>
   <w:num w:numId="12" w16cid:durableId="567883504">
-    <w:abstractNumId w:val="51"/>
+    <w:abstractNumId w:val="52"/>
   </w:num>
   <w:num w:numId="13" w16cid:durableId="1572815186">
-    <w:abstractNumId w:val="43"/>
+    <w:abstractNumId w:val="44"/>
   </w:num>
   <w:num w:numId="14" w16cid:durableId="1914309961">
     <w:abstractNumId w:val="36"/>
@@ -13713,16 +14542,16 @@
     <w:abstractNumId w:val="5"/>
   </w:num>
   <w:num w:numId="16" w16cid:durableId="1421751508">
-    <w:abstractNumId w:val="92"/>
+    <w:abstractNumId w:val="93"/>
   </w:num>
   <w:num w:numId="17" w16cid:durableId="1009716389">
-    <w:abstractNumId w:val="62"/>
+    <w:abstractNumId w:val="63"/>
   </w:num>
   <w:num w:numId="18" w16cid:durableId="300229387">
-    <w:abstractNumId w:val="68"/>
+    <w:abstractNumId w:val="69"/>
   </w:num>
   <w:num w:numId="19" w16cid:durableId="1025836216">
-    <w:abstractNumId w:val="49"/>
+    <w:abstractNumId w:val="50"/>
   </w:num>
   <w:num w:numId="20" w16cid:durableId="976106770">
     <w:abstractNumId w:val="14"/>
@@ -13731,13 +14560,13 @@
     <w:abstractNumId w:val="38"/>
   </w:num>
   <w:num w:numId="22" w16cid:durableId="177355694">
-    <w:abstractNumId w:val="75"/>
+    <w:abstractNumId w:val="76"/>
   </w:num>
   <w:num w:numId="23" w16cid:durableId="6762404">
-    <w:abstractNumId w:val="58"/>
+    <w:abstractNumId w:val="59"/>
   </w:num>
   <w:num w:numId="24" w16cid:durableId="1492133217">
-    <w:abstractNumId w:val="65"/>
+    <w:abstractNumId w:val="66"/>
   </w:num>
   <w:num w:numId="25" w16cid:durableId="695159279">
     <w:abstractNumId w:val="27"/>
@@ -13746,34 +14575,34 @@
     <w:abstractNumId w:val="33"/>
   </w:num>
   <w:num w:numId="27" w16cid:durableId="1101994251">
-    <w:abstractNumId w:val="41"/>
+    <w:abstractNumId w:val="42"/>
   </w:num>
   <w:num w:numId="28" w16cid:durableId="1082484344">
-    <w:abstractNumId w:val="61"/>
+    <w:abstractNumId w:val="62"/>
   </w:num>
   <w:num w:numId="29" w16cid:durableId="467865549">
-    <w:abstractNumId w:val="66"/>
+    <w:abstractNumId w:val="67"/>
   </w:num>
   <w:num w:numId="30" w16cid:durableId="1656108771">
     <w:abstractNumId w:val="17"/>
   </w:num>
   <w:num w:numId="31" w16cid:durableId="1611818230">
-    <w:abstractNumId w:val="84"/>
+    <w:abstractNumId w:val="85"/>
   </w:num>
   <w:num w:numId="32" w16cid:durableId="1666009498">
     <w:abstractNumId w:val="10"/>
   </w:num>
   <w:num w:numId="33" w16cid:durableId="1041394156">
-    <w:abstractNumId w:val="46"/>
+    <w:abstractNumId w:val="47"/>
   </w:num>
   <w:num w:numId="34" w16cid:durableId="1270353408">
-    <w:abstractNumId w:val="54"/>
+    <w:abstractNumId w:val="55"/>
   </w:num>
   <w:num w:numId="35" w16cid:durableId="1540698615">
     <w:abstractNumId w:val="9"/>
   </w:num>
   <w:num w:numId="36" w16cid:durableId="1684479704">
-    <w:abstractNumId w:val="40"/>
+    <w:abstractNumId w:val="41"/>
   </w:num>
   <w:num w:numId="37" w16cid:durableId="2125145959">
     <w:abstractNumId w:val="15"/>
@@ -13782,37 +14611,37 @@
     <w:abstractNumId w:val="34"/>
   </w:num>
   <w:num w:numId="39" w16cid:durableId="798885554">
-    <w:abstractNumId w:val="91"/>
+    <w:abstractNumId w:val="92"/>
   </w:num>
   <w:num w:numId="40" w16cid:durableId="1610315013">
-    <w:abstractNumId w:val="78"/>
+    <w:abstractNumId w:val="79"/>
   </w:num>
   <w:num w:numId="41" w16cid:durableId="213975163">
     <w:abstractNumId w:val="4"/>
   </w:num>
   <w:num w:numId="42" w16cid:durableId="511454106">
-    <w:abstractNumId w:val="74"/>
+    <w:abstractNumId w:val="75"/>
   </w:num>
   <w:num w:numId="43" w16cid:durableId="1721711403">
     <w:abstractNumId w:val="21"/>
   </w:num>
   <w:num w:numId="44" w16cid:durableId="652369700">
-    <w:abstractNumId w:val="82"/>
+    <w:abstractNumId w:val="83"/>
   </w:num>
   <w:num w:numId="45" w16cid:durableId="227304564">
-    <w:abstractNumId w:val="67"/>
+    <w:abstractNumId w:val="68"/>
   </w:num>
   <w:num w:numId="46" w16cid:durableId="1561091169">
     <w:abstractNumId w:val="31"/>
   </w:num>
   <w:num w:numId="47" w16cid:durableId="734011883">
-    <w:abstractNumId w:val="79"/>
+    <w:abstractNumId w:val="80"/>
   </w:num>
   <w:num w:numId="48" w16cid:durableId="2125267477">
-    <w:abstractNumId w:val="71"/>
+    <w:abstractNumId w:val="72"/>
   </w:num>
   <w:num w:numId="49" w16cid:durableId="1612585929">
-    <w:abstractNumId w:val="70"/>
+    <w:abstractNumId w:val="71"/>
   </w:num>
   <w:num w:numId="50" w16cid:durableId="1628664370">
     <w:abstractNumId w:val="3"/>
@@ -13821,16 +14650,16 @@
     <w:abstractNumId w:val="23"/>
   </w:num>
   <w:num w:numId="52" w16cid:durableId="754671244">
-    <w:abstractNumId w:val="56"/>
+    <w:abstractNumId w:val="57"/>
   </w:num>
   <w:num w:numId="53" w16cid:durableId="1740665818">
-    <w:abstractNumId w:val="87"/>
+    <w:abstractNumId w:val="88"/>
   </w:num>
   <w:num w:numId="54" w16cid:durableId="452988921">
-    <w:abstractNumId w:val="88"/>
+    <w:abstractNumId w:val="89"/>
   </w:num>
   <w:num w:numId="55" w16cid:durableId="207304158">
-    <w:abstractNumId w:val="69"/>
+    <w:abstractNumId w:val="70"/>
   </w:num>
   <w:num w:numId="56" w16cid:durableId="2016880598">
     <w:abstractNumId w:val="19"/>
@@ -13839,19 +14668,19 @@
     <w:abstractNumId w:val="1"/>
   </w:num>
   <w:num w:numId="58" w16cid:durableId="1794397765">
-    <w:abstractNumId w:val="50"/>
+    <w:abstractNumId w:val="51"/>
   </w:num>
   <w:num w:numId="59" w16cid:durableId="1690447450">
-    <w:abstractNumId w:val="48"/>
+    <w:abstractNumId w:val="49"/>
   </w:num>
   <w:num w:numId="60" w16cid:durableId="2130009061">
-    <w:abstractNumId w:val="72"/>
+    <w:abstractNumId w:val="73"/>
   </w:num>
   <w:num w:numId="61" w16cid:durableId="1293515410">
     <w:abstractNumId w:val="2"/>
   </w:num>
   <w:num w:numId="62" w16cid:durableId="650257227">
-    <w:abstractNumId w:val="45"/>
+    <w:abstractNumId w:val="46"/>
   </w:num>
   <w:num w:numId="63" w16cid:durableId="571551157">
     <w:abstractNumId w:val="24"/>
@@ -13884,25 +14713,25 @@
     <w:abstractNumId w:val="39"/>
   </w:num>
   <w:num w:numId="73" w16cid:durableId="368451605">
-    <w:abstractNumId w:val="59"/>
+    <w:abstractNumId w:val="60"/>
   </w:num>
   <w:num w:numId="74" w16cid:durableId="65686607">
     <w:abstractNumId w:val="6"/>
   </w:num>
   <w:num w:numId="75" w16cid:durableId="1840541023">
-    <w:abstractNumId w:val="42"/>
+    <w:abstractNumId w:val="43"/>
   </w:num>
   <w:num w:numId="76" w16cid:durableId="539049649">
-    <w:abstractNumId w:val="89"/>
+    <w:abstractNumId w:val="90"/>
   </w:num>
   <w:num w:numId="77" w16cid:durableId="1288513951">
-    <w:abstractNumId w:val="63"/>
+    <w:abstractNumId w:val="64"/>
   </w:num>
   <w:num w:numId="78" w16cid:durableId="1532762005">
-    <w:abstractNumId w:val="52"/>
+    <w:abstractNumId w:val="53"/>
   </w:num>
   <w:num w:numId="79" w16cid:durableId="1374647797">
-    <w:abstractNumId w:val="76"/>
+    <w:abstractNumId w:val="77"/>
   </w:num>
   <w:num w:numId="80" w16cid:durableId="1210456390">
     <w:abstractNumId w:val="8"/>
@@ -13911,40 +14740,43 @@
     <w:abstractNumId w:val="35"/>
   </w:num>
   <w:num w:numId="82" w16cid:durableId="500893856">
-    <w:abstractNumId w:val="80"/>
+    <w:abstractNumId w:val="81"/>
   </w:num>
   <w:num w:numId="83" w16cid:durableId="1950622049">
-    <w:abstractNumId w:val="57"/>
+    <w:abstractNumId w:val="58"/>
   </w:num>
   <w:num w:numId="84" w16cid:durableId="2060282905">
     <w:abstractNumId w:val="0"/>
   </w:num>
   <w:num w:numId="85" w16cid:durableId="490635123">
-    <w:abstractNumId w:val="53"/>
+    <w:abstractNumId w:val="54"/>
   </w:num>
   <w:num w:numId="86" w16cid:durableId="2038313657">
     <w:abstractNumId w:val="20"/>
   </w:num>
   <w:num w:numId="87" w16cid:durableId="1744451624">
-    <w:abstractNumId w:val="47"/>
+    <w:abstractNumId w:val="48"/>
   </w:num>
   <w:num w:numId="88" w16cid:durableId="2105687898">
-    <w:abstractNumId w:val="73"/>
+    <w:abstractNumId w:val="74"/>
   </w:num>
   <w:num w:numId="89" w16cid:durableId="363360886">
     <w:abstractNumId w:val="22"/>
   </w:num>
   <w:num w:numId="90" w16cid:durableId="974530531">
-    <w:abstractNumId w:val="64"/>
+    <w:abstractNumId w:val="65"/>
   </w:num>
   <w:num w:numId="91" w16cid:durableId="780148532">
-    <w:abstractNumId w:val="86"/>
+    <w:abstractNumId w:val="87"/>
   </w:num>
   <w:num w:numId="92" w16cid:durableId="304706915">
-    <w:abstractNumId w:val="44"/>
+    <w:abstractNumId w:val="45"/>
   </w:num>
   <w:num w:numId="93" w16cid:durableId="1232305665">
-    <w:abstractNumId w:val="60"/>
+    <w:abstractNumId w:val="61"/>
+  </w:num>
+  <w:num w:numId="94" w16cid:durableId="2055348731">
+    <w:abstractNumId w:val="40"/>
   </w:num>
   <w:numIdMacAtCleanup w:val="84"/>
 </w:numbering>
@@ -14374,6 +15206,7 @@
     <w:name w:val="heading 2"/>
     <w:basedOn w:val="Normal"/>
     <w:next w:val="Normal"/>
+    <w:link w:val="Heading2Char"/>
     <w:uiPriority w:val="9"/>
     <w:unhideWhenUsed/>
     <w:qFormat/>
@@ -14843,6 +15676,17 @@
       <w:spacing w:line="240" w:lineRule="auto"/>
     </w:pPr>
   </w:style>
+  <w:style w:type="character" w:customStyle="1" w:styleId="Heading2Char">
+    <w:name w:val="Heading 2 Char"/>
+    <w:basedOn w:val="DefaultParagraphFont"/>
+    <w:link w:val="Heading2"/>
+    <w:uiPriority w:val="9"/>
+    <w:rsid w:val="007A1C62"/>
+    <w:rPr>
+      <w:sz w:val="32"/>
+      <w:szCs w:val="32"/>
+    </w:rPr>
+  </w:style>
 </w:styles>
 </file>
 

</xml_diff>

<commit_message>
Show total on time on main screen.
</commit_message>
<xml_diff>
--- a/RadioFox.docx
+++ b/RadioFox.docx
@@ -290,6 +290,26 @@
       </w:r>
       <w:r>
         <w:t xml:space="preserve"> are described below.</w:t>
+      </w:r>
+    </w:p>
+    <w:p>
+      <w:r>
+        <w:t>Version 1.08</w:t>
+      </w:r>
+    </w:p>
+    <w:p>
+      <w:pPr>
+        <w:pStyle w:val="ListParagraph"/>
+        <w:numPr>
+          <w:ilvl w:val="0"/>
+          <w:numId w:val="95"/>
+        </w:numPr>
+      </w:pPr>
+      <w:r>
+        <w:t>Show the active run time on the main display in hours, minutes, and seconds. This time is reset</w:t>
+      </w:r>
+      <w:r>
+        <w:t xml:space="preserve"> on boot, and just keeps track of the time used for sending and pausing.</w:t>
       </w:r>
     </w:p>
     <w:p>
@@ -563,7 +583,11 @@
         <w:t>The radio functions are handled by the SA818-</w:t>
       </w:r>
       <w:r>
-        <w:t>V on the top right. There are vents in the case to allow cooling as this module can become quite hot when transmitting at high power for longer timer intervals. Transmitting longer than one minute is not recommended.</w:t>
+        <w:t xml:space="preserve">V on the top right. There are vents in the case to allow cooling as this module can become quite hot when transmitting at high power for longer </w:t>
+      </w:r>
+      <w:r>
+        <w:lastRenderedPageBreak/>
+        <w:t>timer intervals. Transmitting longer than one minute is not recommended.</w:t>
       </w:r>
       <w:r>
         <w:t xml:space="preserve"> High power is about </w:t>
@@ -585,7 +609,6 @@
         <w:pStyle w:val="Heading2"/>
       </w:pPr>
       <w:r>
-        <w:lastRenderedPageBreak/>
         <w:t>Batteries</w:t>
       </w:r>
     </w:p>
@@ -960,6 +983,7 @@
           <w:b/>
           <w:bCs/>
         </w:rPr>
+        <w:lastRenderedPageBreak/>
         <w:t xml:space="preserve">NOTE_A4, </w:t>
       </w:r>
       <w:proofErr w:type="gramStart"/>
@@ -1084,7 +1108,6 @@
           <w:b/>
           <w:bCs/>
         </w:rPr>
-        <w:lastRenderedPageBreak/>
         <w:t xml:space="preserve">NOTE_E5, -4, NOTE_C5, </w:t>
       </w:r>
       <w:proofErr w:type="gramStart"/>
@@ -1317,6 +1340,7 @@
         <w:pStyle w:val="Heading2"/>
       </w:pPr>
       <w:r>
+        <w:lastRenderedPageBreak/>
         <w:t>DTMF *</w:t>
       </w:r>
       <w:r>
@@ -1333,7 +1357,6 @@
         <w:pStyle w:val="Heading1"/>
       </w:pPr>
       <w:r>
-        <w:lastRenderedPageBreak/>
         <w:t>Button Operations</w:t>
       </w:r>
     </w:p>
@@ -1581,21 +1604,7 @@
         <w:rPr>
           <w:lang w:val="da-DK"/>
         </w:rPr>
-        <w:t xml:space="preserve"> </w:t>
-      </w:r>
-      <w:proofErr w:type="spellStart"/>
-      <w:r>
-        <w:rPr>
-          <w:lang w:val="da-DK"/>
-        </w:rPr>
-        <w:t>During</w:t>
-      </w:r>
-      <w:proofErr w:type="spellEnd"/>
-      <w:r>
-        <w:rPr>
-          <w:lang w:val="da-DK"/>
-        </w:rPr>
-        <w:t xml:space="preserve"> Run Mode</w:t>
+        <w:t xml:space="preserve"> During Run Mode</w:t>
       </w:r>
     </w:p>
     <w:p>
@@ -1670,21 +1679,7 @@
         <w:rPr>
           <w:lang w:val="da-DK"/>
         </w:rPr>
-        <w:t xml:space="preserve">1 </w:t>
-      </w:r>
-      <w:proofErr w:type="spellStart"/>
-      <w:r>
-        <w:rPr>
-          <w:lang w:val="da-DK"/>
-        </w:rPr>
-        <w:t>During</w:t>
-      </w:r>
-      <w:proofErr w:type="spellEnd"/>
-      <w:r>
-        <w:rPr>
-          <w:lang w:val="da-DK"/>
-        </w:rPr>
-        <w:t xml:space="preserve"> Menu Mod</w:t>
+        <w:t>1 During Menu Mod</w:t>
       </w:r>
       <w:r>
         <w:rPr>
@@ -1902,7 +1897,14 @@
         <w:rPr>
           <w:lang w:val="en-US"/>
         </w:rPr>
-        <w:t xml:space="preserve"> the increment will change to 10 and dial will add and subtract </w:t>
+        <w:t xml:space="preserve"> the increment will change to 10 and dial will </w:t>
+      </w:r>
+      <w:r>
+        <w:rPr>
+          <w:lang w:val="en-US"/>
+        </w:rPr>
+        <w:lastRenderedPageBreak/>
+        <w:t xml:space="preserve">add and subtract </w:t>
       </w:r>
       <w:r>
         <w:rPr>
@@ -1980,7 +1982,6 @@
       <w:bookmarkEnd w:id="6"/>
       <w:bookmarkEnd w:id="7"/>
       <w:r>
-        <w:lastRenderedPageBreak/>
         <w:t xml:space="preserve">Rotating </w:t>
       </w:r>
       <w:r>
@@ -2271,7 +2272,11 @@
         <w:t xml:space="preserve"> on the PCB that can be seen through</w:t>
       </w:r>
       <w:r>
-        <w:t xml:space="preserve"> the slot on the top of the case</w:t>
+        <w:t xml:space="preserve"> the slot on the </w:t>
+      </w:r>
+      <w:r>
+        <w:lastRenderedPageBreak/>
+        <w:t>top of the case</w:t>
       </w:r>
       <w:r>
         <w:t xml:space="preserve">. These </w:t>
@@ -2288,7 +2293,6 @@
     <w:p/>
     <w:p>
       <w:r>
-        <w:lastRenderedPageBreak/>
         <w:t>During transmitting the bottom left shows an animated red dot. In a future firmware update the</w:t>
       </w:r>
       <w:r>
@@ -2600,6 +2604,7 @@
         <w:pStyle w:val="Heading3"/>
       </w:pPr>
       <w:r>
+        <w:lastRenderedPageBreak/>
         <w:t xml:space="preserve">Call Sign: </w:t>
       </w:r>
       <w:r>
@@ -2632,7 +2637,6 @@
         <w:pStyle w:val="Heading3"/>
       </w:pPr>
       <w:r>
-        <w:lastRenderedPageBreak/>
         <w:t>Play Audio File</w:t>
       </w:r>
       <w:r>
@@ -2852,6 +2856,7 @@
         <w:pStyle w:val="Heading3"/>
       </w:pPr>
       <w:r>
+        <w:lastRenderedPageBreak/>
         <w:t>TX Send Min: 10-90 Sec</w:t>
       </w:r>
     </w:p>
@@ -2884,13 +2889,175 @@
         <w:pStyle w:val="Heading3"/>
       </w:pPr>
       <w:r>
+        <w:t>TX Pause Min: 10-1200 Sec</w:t>
+      </w:r>
+    </w:p>
+    <w:p>
+      <w:r>
+        <w:t>In random mode this is the minimum pause time.</w:t>
+      </w:r>
+    </w:p>
+    <w:p>
+      <w:pPr>
+        <w:pStyle w:val="Heading3"/>
+      </w:pPr>
+      <w:r>
+        <w:t>TX Pause Max: 10-1200 Sec</w:t>
+      </w:r>
+    </w:p>
+    <w:p>
+      <w:r>
+        <w:t>In random mode this is the maximum pause time.</w:t>
+      </w:r>
+    </w:p>
+    <w:p>
+      <w:pPr>
+        <w:pStyle w:val="Heading3"/>
+      </w:pPr>
+      <w:r>
+        <w:t xml:space="preserve">TX Stop: </w:t>
+      </w:r>
+      <w:proofErr w:type="spellStart"/>
+      <w:r>
+        <w:t>Immediate|Finish</w:t>
+      </w:r>
+      <w:proofErr w:type="spellEnd"/>
+      <w:r>
+        <w:t xml:space="preserve"> Cycle</w:t>
+      </w:r>
+    </w:p>
+    <w:p>
+      <w:r>
+        <w:t xml:space="preserve">During transmit time the Beacon, Call Sign, and Audio are continuously sent. At the end of the transmission time this option controls whether the transmission stops immediately </w:t>
+      </w:r>
+      <w:proofErr w:type="gramStart"/>
+      <w:r>
+        <w:t>of</w:t>
+      </w:r>
+      <w:proofErr w:type="gramEnd"/>
+      <w:r>
+        <w:t xml:space="preserve"> waits to stop until the entire cycle is finished.</w:t>
+      </w:r>
+    </w:p>
+    <w:p/>
+    <w:p>
+      <w:r>
+        <w:t>A clever use of this command</w:t>
+      </w:r>
+      <w:r>
+        <w:t xml:space="preserve"> allows for only one cycle of beacon, ID, and music to be sent during each transmission time. Set the transmit</w:t>
+      </w:r>
+      <w:r>
+        <w:t xml:space="preserve"> time to something less than</w:t>
+      </w:r>
+      <w:r>
+        <w:t xml:space="preserve"> the time to perform a complete cycle and set this option to “Finish Cycle”. The </w:t>
+      </w:r>
+      <w:proofErr w:type="gramStart"/>
+      <w:r>
+        <w:t>transmit  cycle</w:t>
+      </w:r>
+      <w:proofErr w:type="gramEnd"/>
+      <w:r>
+        <w:t xml:space="preserve"> will begin, the timer will expire, but the current cycle will complete before stopping</w:t>
+      </w:r>
+      <w:r>
+        <w:t>.</w:t>
+      </w:r>
+    </w:p>
+    <w:p>
+      <w:pPr>
+        <w:pStyle w:val="Heading3"/>
+      </w:pPr>
+      <w:r>
+        <w:t xml:space="preserve">Radio Pause: </w:t>
+      </w:r>
+      <w:proofErr w:type="spellStart"/>
+      <w:r>
+        <w:t>Sleep|Awake</w:t>
+      </w:r>
+      <w:proofErr w:type="spellEnd"/>
+    </w:p>
+    <w:p>
+      <w:r>
+        <w:t xml:space="preserve">During pause time the radio can be put into sleep mode. This lowers the power consumption and lets the battery last longer. </w:t>
+      </w:r>
+      <w:proofErr w:type="gramStart"/>
+      <w:r>
+        <w:t>However</w:t>
+      </w:r>
+      <w:proofErr w:type="gramEnd"/>
+      <w:r>
+        <w:t xml:space="preserve"> note that this also means that the DTMF commands are disabled since the radio is asleep!</w:t>
+      </w:r>
+    </w:p>
+    <w:p>
+      <w:pPr>
+        <w:pStyle w:val="Heading2"/>
+      </w:pPr>
+      <w:r>
+        <w:t>+</w:t>
+      </w:r>
+      <w:r>
+        <w:t>More Radio Settings</w:t>
+      </w:r>
+    </w:p>
+    <w:p>
+      <w:pPr>
+        <w:pStyle w:val="Heading3"/>
+      </w:pPr>
+      <w:r>
+        <w:t>RX Offset: -600|0|+600 kHz</w:t>
+      </w:r>
+    </w:p>
+    <w:p>
+      <w:r>
+        <w:t>This is the frequency offset from the transmit frequency that the radio uses to receive DTMF commands</w:t>
+      </w:r>
+      <w:r>
+        <w:t>. An offset is recommended. If 0 is used the radio will only listen when it isn’t sending. It has not been tested if it listens during sending when the offset is not 0.</w:t>
+      </w:r>
+    </w:p>
+    <w:p>
+      <w:pPr>
+        <w:pStyle w:val="Heading3"/>
+      </w:pPr>
+      <w:r>
+        <w:t>Bandwidth: 12.5|</w:t>
+      </w:r>
+      <w:r>
+        <w:t>25 kHz</w:t>
+      </w:r>
+    </w:p>
+    <w:p>
+      <w:r>
+        <w:t>This sets the radio bandwidth</w:t>
+      </w:r>
+      <w:r>
+        <w:t>. It has not been tested much to see what effect it has on performance yet.</w:t>
+      </w:r>
+    </w:p>
+    <w:p>
+      <w:pPr>
+        <w:pStyle w:val="Heading3"/>
+      </w:pPr>
+      <w:r>
         <w:lastRenderedPageBreak/>
-        <w:t>TX Pause Min: 10-1200 Sec</w:t>
-      </w:r>
-    </w:p>
-    <w:p>
-      <w:r>
-        <w:t>In random mode this is the minimum pause time.</w:t>
+        <w:t>CTCSS/DCS: CTCSS|DCS</w:t>
+      </w:r>
+    </w:p>
+    <w:p>
+      <w:r>
+        <w:t xml:space="preserve">This sets the </w:t>
+      </w:r>
+      <w:r>
+        <w:t>un-squelch</w:t>
+      </w:r>
+      <w:r>
+        <w:t xml:space="preserve"> values</w:t>
+      </w:r>
+      <w:r>
+        <w:t xml:space="preserve"> for either the analog or digital versions.</w:t>
       </w:r>
     </w:p>
     <w:p>
@@ -2898,12 +3065,24 @@
         <w:pStyle w:val="Heading3"/>
       </w:pPr>
       <w:r>
-        <w:t>TX Pause Max: 10-1200 Sec</w:t>
-      </w:r>
-    </w:p>
-    <w:p>
-      <w:r>
-        <w:t>In random mode this is the maximum pause time.</w:t>
+        <w:t>TX CTCSS:</w:t>
+      </w:r>
+      <w:r>
+        <w:t xml:space="preserve"> None</w:t>
+      </w:r>
+      <w:r>
+        <w:t>|</w:t>
+      </w:r>
+      <w:r>
+        <w:t>67-</w:t>
+      </w:r>
+      <w:r>
+        <w:t>250.3</w:t>
+      </w:r>
+    </w:p>
+    <w:p>
+      <w:r>
+        <w:t>Analog un-squelch frequencies sent out.</w:t>
       </w:r>
     </w:p>
     <w:p>
@@ -2911,51 +3090,389 @@
         <w:pStyle w:val="Heading3"/>
       </w:pPr>
       <w:r>
-        <w:t xml:space="preserve">TX Stop: </w:t>
+        <w:t>RX CTCSS:</w:t>
+      </w:r>
+      <w:r>
+        <w:t xml:space="preserve"> None|67-250.3</w:t>
+      </w:r>
+    </w:p>
+    <w:p>
+      <w:r>
+        <w:t>Analog un-squelch frequency for receiving.</w:t>
+      </w:r>
+    </w:p>
+    <w:p>
+      <w:pPr>
+        <w:pStyle w:val="Heading3"/>
+      </w:pPr>
+      <w:r>
+        <w:t>TX DCS:</w:t>
+      </w:r>
+      <w:r>
+        <w:t xml:space="preserve"> None|023-754</w:t>
+      </w:r>
+    </w:p>
+    <w:p>
+      <w:r>
+        <w:t>Digital un-squelch value for sending.</w:t>
+      </w:r>
+    </w:p>
+    <w:p>
+      <w:pPr>
+        <w:pStyle w:val="Heading3"/>
+      </w:pPr>
+      <w:r>
+        <w:t>TX I/N: I|N</w:t>
+      </w:r>
+    </w:p>
+    <w:p>
+      <w:r>
+        <w:t>The digital I or N value for sending.</w:t>
+      </w:r>
+    </w:p>
+    <w:p>
+      <w:pPr>
+        <w:pStyle w:val="Heading3"/>
+      </w:pPr>
+      <w:r>
+        <w:t>RX DCS: None|023-754</w:t>
+      </w:r>
+    </w:p>
+    <w:p>
+      <w:r>
+        <w:t>Digital un-squelch value for receiving.</w:t>
+      </w:r>
+    </w:p>
+    <w:p>
+      <w:pPr>
+        <w:pStyle w:val="Heading3"/>
+      </w:pPr>
+      <w:r>
+        <w:t>RX I/N: I|N</w:t>
+      </w:r>
+    </w:p>
+    <w:p>
+      <w:r>
+        <w:t>The digital I or N value for receiving.</w:t>
+      </w:r>
+    </w:p>
+    <w:p>
+      <w:pPr>
+        <w:pStyle w:val="Heading3"/>
+      </w:pPr>
+      <w:r>
+        <w:t>RX Volume:</w:t>
+      </w:r>
+      <w:r>
+        <w:t xml:space="preserve"> 1-6</w:t>
+      </w:r>
+    </w:p>
+    <w:p>
+      <w:r>
+        <w:t>This is the receive volume setting. It affects how well DTMF tones are detected.</w:t>
+      </w:r>
+    </w:p>
+    <w:p>
+      <w:pPr>
+        <w:pStyle w:val="Heading3"/>
+      </w:pPr>
+      <w:r>
+        <w:t>RX Squelch:</w:t>
+      </w:r>
+      <w:r>
+        <w:t xml:space="preserve"> 0-8</w:t>
+      </w:r>
+    </w:p>
+    <w:p>
+      <w:r>
+        <w:t>This affects how much signal is required to receive the DTMF signals.</w:t>
+      </w:r>
+    </w:p>
+    <w:p>
+      <w:pPr>
+        <w:pStyle w:val="Heading2"/>
+      </w:pPr>
+      <w:r>
+        <w:t>Cancel Waits/TX Now</w:t>
+      </w:r>
+    </w:p>
+    <w:p>
+      <w:r>
+        <w:t xml:space="preserve">When the radio is in either send or pause mode this command will cancel the </w:t>
+      </w:r>
+      <w:proofErr w:type="gramStart"/>
+      <w:r>
+        <w:t>timer</w:t>
+      </w:r>
+      <w:proofErr w:type="gramEnd"/>
+      <w:r>
+        <w:t xml:space="preserve"> and the next mo</w:t>
+      </w:r>
+      <w:r>
+        <w:t xml:space="preserve">de will start. For </w:t>
+      </w:r>
+      <w:proofErr w:type="gramStart"/>
+      <w:r>
+        <w:t>example</w:t>
+      </w:r>
+      <w:proofErr w:type="gramEnd"/>
+      <w:r>
+        <w:t xml:space="preserve"> if you want to cancel</w:t>
+      </w:r>
+      <w:r>
+        <w:t xml:space="preserve"> the pause and go to transmit, use this option. It can also be done by long pressing B0.</w:t>
+      </w:r>
+    </w:p>
+    <w:p>
+      <w:pPr>
+        <w:pStyle w:val="Heading2"/>
+      </w:pPr>
+      <w:r>
+        <w:t>+Saved Settings Files</w:t>
+      </w:r>
+    </w:p>
+    <w:p>
+      <w:r>
+        <w:t>Saved settings files are named files stored on the SD card. They are useful to</w:t>
+      </w:r>
+      <w:r>
+        <w:t xml:space="preserve"> quickly configure the radio for different uses. All values except the battery calibration are affected.</w:t>
+      </w:r>
+    </w:p>
+    <w:p>
+      <w:pPr>
+        <w:pStyle w:val="Heading3"/>
+      </w:pPr>
+      <w:r>
+        <w:lastRenderedPageBreak/>
+        <w:t>Create File</w:t>
+      </w:r>
+    </w:p>
+    <w:p>
+      <w:r>
+        <w:t>This prompts the user for a name. The file is then created using the current system settings.</w:t>
+      </w:r>
+    </w:p>
+    <w:p>
+      <w:pPr>
+        <w:pStyle w:val="Heading3"/>
+      </w:pPr>
+      <w:r>
+        <w:t>Save/Update File</w:t>
+      </w:r>
+    </w:p>
+    <w:p>
+      <w:r>
+        <w:t xml:space="preserve">This command saves the current settings into the selected file. If it already </w:t>
+      </w:r>
+      <w:proofErr w:type="gramStart"/>
+      <w:r>
+        <w:t>exists</w:t>
+      </w:r>
+      <w:proofErr w:type="gramEnd"/>
+      <w:r>
+        <w:t xml:space="preserve"> the user will be asked to confirm overwriting the file.</w:t>
+      </w:r>
+    </w:p>
+    <w:p>
+      <w:pPr>
+        <w:pStyle w:val="Heading3"/>
+      </w:pPr>
+      <w:r>
+        <w:t>Load File</w:t>
+      </w:r>
+    </w:p>
+    <w:p>
+      <w:r>
+        <w:t xml:space="preserve">This command asks the user for the name and then sets </w:t>
+      </w:r>
+      <w:proofErr w:type="gramStart"/>
+      <w:r>
+        <w:t>all of</w:t>
+      </w:r>
+      <w:proofErr w:type="gramEnd"/>
+      <w:r>
+        <w:t xml:space="preserve"> the system settings except the battery calibration using the values in the file.</w:t>
+      </w:r>
+    </w:p>
+    <w:p>
+      <w:pPr>
+        <w:pStyle w:val="Heading3"/>
+      </w:pPr>
+      <w:r>
+        <w:t>Delete File</w:t>
+      </w:r>
+    </w:p>
+    <w:p>
+      <w:r>
+        <w:t>The user selects a file from the list and then it can be deleted.</w:t>
+      </w:r>
+    </w:p>
+    <w:p>
+      <w:pPr>
+        <w:pStyle w:val="Heading2"/>
+      </w:pPr>
+      <w:r>
+        <w:t>+System Settings</w:t>
+      </w:r>
+    </w:p>
+    <w:p>
+      <w:pPr>
+        <w:pStyle w:val="Heading3"/>
+      </w:pPr>
+      <w:r>
+        <w:t>+Display</w:t>
+      </w:r>
+      <w:r>
+        <w:t xml:space="preserve"> Settings</w:t>
+      </w:r>
+    </w:p>
+    <w:p>
+      <w:pPr>
+        <w:pStyle w:val="Heading4"/>
+      </w:pPr>
+      <w:r>
+        <w:t xml:space="preserve">Dimming Mode: </w:t>
       </w:r>
       <w:proofErr w:type="spellStart"/>
       <w:r>
-        <w:t>Immediate|Finish</w:t>
+        <w:t>None</w:t>
+      </w:r>
+      <w:r>
+        <w:t>|Timer</w:t>
       </w:r>
       <w:proofErr w:type="spellEnd"/>
-      <w:r>
-        <w:t xml:space="preserve"> Cycle</w:t>
-      </w:r>
-    </w:p>
-    <w:p>
-      <w:r>
-        <w:t xml:space="preserve">During transmit time the Beacon, Call Sign, and Audio are continuously sent. At the end of the transmission time this option controls whether the transmission stops immediately </w:t>
+    </w:p>
+    <w:p>
+      <w:r>
+        <w:t xml:space="preserve">The display can be set to dim automatically after a specified number of seconds. This is used to save battery power since the backlight </w:t>
+      </w:r>
+      <w:r>
+        <w:t>uses a significant amount.</w:t>
+      </w:r>
+    </w:p>
+    <w:p>
+      <w:pPr>
+        <w:pStyle w:val="Heading4"/>
+      </w:pPr>
+      <w:r>
+        <w:t>Bright Value: 1-100</w:t>
+      </w:r>
+      <w:r>
+        <w:t>%</w:t>
+      </w:r>
+    </w:p>
+    <w:p>
+      <w:r>
+        <w:t>Set the display brightness value.</w:t>
+      </w:r>
+    </w:p>
+    <w:p>
+      <w:pPr>
+        <w:pStyle w:val="Heading4"/>
+      </w:pPr>
+      <w:r>
+        <w:t xml:space="preserve">Dim Value: </w:t>
+      </w:r>
+      <w:r>
+        <w:t>0-100%</w:t>
+      </w:r>
+    </w:p>
+    <w:p>
+      <w:r>
+        <w:t xml:space="preserve">Set the display brightness after the </w:t>
+      </w:r>
+      <w:r>
+        <w:t>timer below expires.</w:t>
+      </w:r>
+    </w:p>
+    <w:p>
+      <w:pPr>
+        <w:pStyle w:val="Heading4"/>
+      </w:pPr>
+      <w:r>
+        <w:t>Display Dim Time:</w:t>
+      </w:r>
+      <w:r>
+        <w:t xml:space="preserve"> 0-120 S</w:t>
+      </w:r>
+    </w:p>
+    <w:p>
+      <w:r>
+        <w:t>Specify the time until the display changes to dim mode.</w:t>
+      </w:r>
+    </w:p>
+    <w:p>
+      <w:pPr>
+        <w:pStyle w:val="Heading4"/>
+      </w:pPr>
+      <w:r>
+        <w:t>+Sideways Scroll Settings</w:t>
+      </w:r>
+    </w:p>
+    <w:p>
+      <w:r>
+        <w:t xml:space="preserve">Lines of text that </w:t>
       </w:r>
       <w:proofErr w:type="gramStart"/>
       <w:r>
-        <w:t>of</w:t>
+        <w:t>too</w:t>
       </w:r>
       <w:proofErr w:type="gramEnd"/>
       <w:r>
-        <w:t xml:space="preserve"> waits to stop until the entire cycle is finished.</w:t>
-      </w:r>
-    </w:p>
-    <w:p/>
-    <w:p>
-      <w:r>
-        <w:t>A clever use of this command</w:t>
-      </w:r>
-      <w:r>
-        <w:t xml:space="preserve"> allows for only one cycle of beacon, ID, and music to be sent during each transmission time. Set the transmit</w:t>
-      </w:r>
-      <w:r>
-        <w:t xml:space="preserve"> time to something less than</w:t>
-      </w:r>
-      <w:r>
-        <w:t xml:space="preserve"> the time to perform a complete cycle and set this option to “Finish Cycle”. The </w:t>
-      </w:r>
-      <w:proofErr w:type="gramStart"/>
-      <w:r>
-        <w:t>transmit  cycle</w:t>
-      </w:r>
-      <w:proofErr w:type="gramEnd"/>
-      <w:r>
-        <w:t xml:space="preserve"> will begin, the timer will expire, but the current cycle will complete before stopping</w:t>
+        <w:t xml:space="preserve"> long for the display will scroll back and forth. The following settings control the speed.</w:t>
+      </w:r>
+    </w:p>
+    <w:p>
+      <w:pPr>
+        <w:pStyle w:val="Heading5"/>
+      </w:pPr>
+      <w:r>
+        <w:t xml:space="preserve">Speed: </w:t>
+      </w:r>
+      <w:r>
+        <w:t>1-1000 mS</w:t>
+      </w:r>
+    </w:p>
+    <w:p>
+      <w:r>
+        <w:t>Controls the speed of text moving to the left.</w:t>
+      </w:r>
+    </w:p>
+    <w:p>
+      <w:pPr>
+        <w:pStyle w:val="Heading5"/>
+      </w:pPr>
+      <w:r>
+        <w:lastRenderedPageBreak/>
+        <w:t>Pause: 1-100</w:t>
+      </w:r>
+      <w:r>
+        <w:t xml:space="preserve"> mS</w:t>
+      </w:r>
+    </w:p>
+    <w:p>
+      <w:r>
+        <w:t>This controls the pause when the text is at the end (all the way to the left).</w:t>
+      </w:r>
+    </w:p>
+    <w:p>
+      <w:pPr>
+        <w:pStyle w:val="Heading5"/>
+      </w:pPr>
+      <w:r>
+        <w:t>Reverse Speed: 1-20x</w:t>
+      </w:r>
+    </w:p>
+    <w:p>
+      <w:r>
+        <w:t xml:space="preserve">This is how fast the text scrolls </w:t>
+      </w:r>
+      <w:r>
+        <w:t>back to the beginning (to the right). 2x means twice as fast as the text scroll</w:t>
+      </w:r>
+      <w:r>
+        <w:t>ed to the left</w:t>
       </w:r>
       <w:r>
         <w:t>.</w:t>
@@ -2963,388 +3480,21 @@
     </w:p>
     <w:p>
       <w:pPr>
-        <w:pStyle w:val="Heading3"/>
-      </w:pPr>
-      <w:r>
-        <w:t xml:space="preserve">Radio Pause: </w:t>
-      </w:r>
-      <w:proofErr w:type="spellStart"/>
-      <w:r>
-        <w:t>Sleep|Awake</w:t>
-      </w:r>
-      <w:proofErr w:type="spellEnd"/>
-    </w:p>
-    <w:p>
-      <w:r>
-        <w:t xml:space="preserve">During pause time the radio can be put into sleep mode. This lowers the power consumption and lets the battery last longer. </w:t>
-      </w:r>
-      <w:proofErr w:type="gramStart"/>
-      <w:r>
-        <w:t>However</w:t>
-      </w:r>
-      <w:proofErr w:type="gramEnd"/>
-      <w:r>
-        <w:t xml:space="preserve"> note that this also means that the DTMF commands are disabled since the radio is asleep!</w:t>
-      </w:r>
-    </w:p>
-    <w:p>
-      <w:pPr>
-        <w:pStyle w:val="Heading2"/>
-      </w:pPr>
-      <w:r>
-        <w:t>+</w:t>
-      </w:r>
-      <w:r>
-        <w:t>More Radio Settings</w:t>
-      </w:r>
-    </w:p>
-    <w:p>
-      <w:pPr>
-        <w:pStyle w:val="Heading3"/>
-      </w:pPr>
-      <w:r>
-        <w:t>RX Offset: -600|0|+600 kHz</w:t>
-      </w:r>
-    </w:p>
-    <w:p>
-      <w:r>
-        <w:t>This is the frequency offset from the transmit frequency that the radio uses to receive DTMF commands</w:t>
-      </w:r>
-      <w:r>
-        <w:t>. An offset is recommended. If 0 is used the radio will only listen when it isn’t sending. It has not been tested if it listens during sending when the offset is not 0.</w:t>
-      </w:r>
-    </w:p>
-    <w:p>
-      <w:pPr>
-        <w:pStyle w:val="Heading3"/>
-      </w:pPr>
-      <w:r>
-        <w:t>Bandwidth: 12.5|</w:t>
-      </w:r>
-      <w:r>
-        <w:t>25 kHz</w:t>
-      </w:r>
-    </w:p>
-    <w:p>
-      <w:r>
-        <w:t>This sets the radio bandwidth</w:t>
-      </w:r>
-      <w:r>
-        <w:t>. It has not been tested much to see what effect it has on performance yet.</w:t>
-      </w:r>
-    </w:p>
-    <w:p>
-      <w:pPr>
-        <w:pStyle w:val="Heading3"/>
-      </w:pPr>
-      <w:r>
-        <w:t>CTCSS/DCS: CTCSS|DCS</w:t>
-      </w:r>
-    </w:p>
-    <w:p>
-      <w:r>
-        <w:t xml:space="preserve">This sets the </w:t>
-      </w:r>
-      <w:r>
-        <w:t>un-squelch</w:t>
-      </w:r>
-      <w:r>
-        <w:t xml:space="preserve"> values</w:t>
-      </w:r>
-      <w:r>
-        <w:t xml:space="preserve"> for either the analog or digital versions.</w:t>
-      </w:r>
-    </w:p>
-    <w:p>
-      <w:pPr>
-        <w:pStyle w:val="Heading3"/>
-      </w:pPr>
-      <w:r>
-        <w:t>TX CTCSS:</w:t>
-      </w:r>
-      <w:r>
-        <w:t xml:space="preserve"> None</w:t>
-      </w:r>
-      <w:r>
-        <w:t>|</w:t>
-      </w:r>
-      <w:r>
-        <w:t>67-</w:t>
-      </w:r>
-      <w:r>
-        <w:t>250.3</w:t>
-      </w:r>
-    </w:p>
-    <w:p>
-      <w:r>
-        <w:t>Analog un-squelch frequencies sent out.</w:t>
-      </w:r>
-    </w:p>
-    <w:p>
-      <w:pPr>
-        <w:pStyle w:val="Heading3"/>
-      </w:pPr>
-      <w:r>
-        <w:lastRenderedPageBreak/>
-        <w:t>RX CTCSS:</w:t>
-      </w:r>
-      <w:r>
-        <w:t xml:space="preserve"> None|67-250.3</w:t>
-      </w:r>
-    </w:p>
-    <w:p>
-      <w:r>
-        <w:t>Analog un-squelch frequency for receiving.</w:t>
-      </w:r>
-    </w:p>
-    <w:p>
-      <w:pPr>
-        <w:pStyle w:val="Heading3"/>
-      </w:pPr>
-      <w:r>
-        <w:t>TX DCS:</w:t>
-      </w:r>
-      <w:r>
-        <w:t xml:space="preserve"> None|023-754</w:t>
-      </w:r>
-    </w:p>
-    <w:p>
-      <w:r>
-        <w:t>Digital un-squelch value for sending.</w:t>
-      </w:r>
-    </w:p>
-    <w:p>
-      <w:pPr>
-        <w:pStyle w:val="Heading3"/>
-      </w:pPr>
-      <w:r>
-        <w:t>TX I/N: I|N</w:t>
-      </w:r>
-    </w:p>
-    <w:p>
-      <w:r>
-        <w:t>The digital I or N value for sending.</w:t>
-      </w:r>
-    </w:p>
-    <w:p>
-      <w:pPr>
-        <w:pStyle w:val="Heading3"/>
-      </w:pPr>
-      <w:r>
-        <w:t>RX DCS: None|023-754</w:t>
-      </w:r>
-    </w:p>
-    <w:p>
-      <w:r>
-        <w:t>Digital un-squelch value for receiving.</w:t>
-      </w:r>
-    </w:p>
-    <w:p>
-      <w:pPr>
-        <w:pStyle w:val="Heading3"/>
-      </w:pPr>
-      <w:r>
-        <w:t>RX I/N: I|N</w:t>
-      </w:r>
-    </w:p>
-    <w:p>
-      <w:r>
-        <w:t>The digital I or N value for receiving.</w:t>
-      </w:r>
-    </w:p>
-    <w:p>
-      <w:pPr>
-        <w:pStyle w:val="Heading3"/>
-      </w:pPr>
-      <w:r>
-        <w:t>RX Volume:</w:t>
-      </w:r>
-      <w:r>
-        <w:t xml:space="preserve"> 1-6</w:t>
-      </w:r>
-    </w:p>
-    <w:p>
-      <w:r>
-        <w:t>This is the receive volume setting. It affects how well DTMF tones are detected.</w:t>
-      </w:r>
-    </w:p>
-    <w:p>
-      <w:pPr>
-        <w:pStyle w:val="Heading3"/>
-      </w:pPr>
-      <w:r>
-        <w:t>RX Squelch:</w:t>
-      </w:r>
-      <w:r>
-        <w:t xml:space="preserve"> 0-8</w:t>
-      </w:r>
-    </w:p>
-    <w:p>
-      <w:r>
-        <w:t>This affects how much signal is required to receive the DTMF signals.</w:t>
-      </w:r>
-    </w:p>
-    <w:p>
-      <w:pPr>
-        <w:pStyle w:val="Heading2"/>
-      </w:pPr>
-      <w:r>
-        <w:t>Cancel Waits/TX Now</w:t>
-      </w:r>
-    </w:p>
-    <w:p>
-      <w:r>
-        <w:t xml:space="preserve">When the radio is in either send or pause mode this command will cancel the </w:t>
-      </w:r>
-      <w:proofErr w:type="gramStart"/>
-      <w:r>
-        <w:t>timer</w:t>
-      </w:r>
-      <w:proofErr w:type="gramEnd"/>
-      <w:r>
-        <w:t xml:space="preserve"> and the next mo</w:t>
-      </w:r>
-      <w:r>
-        <w:t xml:space="preserve">de will start. For </w:t>
-      </w:r>
-      <w:proofErr w:type="gramStart"/>
-      <w:r>
-        <w:t>example</w:t>
-      </w:r>
-      <w:proofErr w:type="gramEnd"/>
-      <w:r>
-        <w:t xml:space="preserve"> if you want to cancel</w:t>
-      </w:r>
-      <w:r>
-        <w:t xml:space="preserve"> the pause and go to transmit, use this option. It can also be done by long pressing B0.</w:t>
-      </w:r>
-    </w:p>
-    <w:p>
-      <w:pPr>
-        <w:pStyle w:val="Heading2"/>
-      </w:pPr>
-      <w:r>
-        <w:t>+Saved Settings Files</w:t>
-      </w:r>
-    </w:p>
-    <w:p>
-      <w:r>
-        <w:t>Saved settings files are named files stored on the SD card. They are useful to</w:t>
-      </w:r>
-      <w:r>
-        <w:t xml:space="preserve"> quickly configure the radio for different uses. All values except the battery calibration are affected.</w:t>
-      </w:r>
-    </w:p>
-    <w:p>
-      <w:pPr>
-        <w:pStyle w:val="Heading3"/>
-      </w:pPr>
-      <w:r>
-        <w:t>Create File</w:t>
-      </w:r>
-    </w:p>
-    <w:p>
-      <w:r>
-        <w:t>This prompts the user for a name. The file is then created using the current system settings.</w:t>
-      </w:r>
-    </w:p>
-    <w:p>
-      <w:pPr>
-        <w:pStyle w:val="Heading3"/>
-      </w:pPr>
-      <w:r>
-        <w:t>Save/Update File</w:t>
-      </w:r>
-    </w:p>
-    <w:p>
-      <w:r>
-        <w:t xml:space="preserve">This command saves the current settings into the selected file. If it already </w:t>
-      </w:r>
-      <w:proofErr w:type="gramStart"/>
-      <w:r>
-        <w:t>exists</w:t>
-      </w:r>
-      <w:proofErr w:type="gramEnd"/>
-      <w:r>
-        <w:t xml:space="preserve"> the user will be asked to confirm overwriting the file.</w:t>
-      </w:r>
-    </w:p>
-    <w:p>
-      <w:pPr>
-        <w:pStyle w:val="Heading3"/>
-      </w:pPr>
-      <w:r>
-        <w:lastRenderedPageBreak/>
-        <w:t>Load File</w:t>
-      </w:r>
-    </w:p>
-    <w:p>
-      <w:r>
-        <w:t xml:space="preserve">This command asks the user for the name and then sets </w:t>
-      </w:r>
-      <w:proofErr w:type="gramStart"/>
-      <w:r>
-        <w:t>all of</w:t>
-      </w:r>
-      <w:proofErr w:type="gramEnd"/>
-      <w:r>
-        <w:t xml:space="preserve"> the system settings except the battery calibration using the values in the file.</w:t>
-      </w:r>
-    </w:p>
-    <w:p>
-      <w:pPr>
-        <w:pStyle w:val="Heading3"/>
-      </w:pPr>
-      <w:r>
-        <w:t>Delete File</w:t>
-      </w:r>
-    </w:p>
-    <w:p>
-      <w:r>
-        <w:t>The user selects a file from the list and then it can be deleted.</w:t>
-      </w:r>
-    </w:p>
-    <w:p>
-      <w:pPr>
-        <w:pStyle w:val="Heading2"/>
-      </w:pPr>
-      <w:r>
-        <w:t>+System Settings</w:t>
-      </w:r>
-    </w:p>
-    <w:p>
-      <w:pPr>
-        <w:pStyle w:val="Heading3"/>
-      </w:pPr>
-      <w:r>
-        <w:t>+Display</w:t>
-      </w:r>
-      <w:r>
-        <w:t xml:space="preserve"> Settings</w:t>
-      </w:r>
-    </w:p>
-    <w:p>
-      <w:pPr>
         <w:pStyle w:val="Heading4"/>
       </w:pPr>
       <w:r>
-        <w:t xml:space="preserve">Dimming Mode: </w:t>
-      </w:r>
-      <w:proofErr w:type="spellStart"/>
-      <w:r>
-        <w:t>None</w:t>
-      </w:r>
-      <w:r>
-        <w:t>|Timer</w:t>
-      </w:r>
-      <w:proofErr w:type="spellEnd"/>
-    </w:p>
-    <w:p>
-      <w:r>
-        <w:t xml:space="preserve">The display can be set to dim automatically after a specified number of seconds. This is used to save battery power since the backlight </w:t>
-      </w:r>
-      <w:r>
-        <w:t>uses a significant amount.</w:t>
+        <w:t xml:space="preserve">Menu Selection: </w:t>
+      </w:r>
+      <w:r>
+        <w:t>Color|*</w:t>
+      </w:r>
+    </w:p>
+    <w:p>
+      <w:r>
+        <w:t>Menu selections</w:t>
+      </w:r>
+      <w:r>
+        <w:t xml:space="preserve"> and selections from a list can be either colored or marked with the ‘*’ character.</w:t>
       </w:r>
     </w:p>
     <w:p>
@@ -3352,152 +3502,6 @@
         <w:pStyle w:val="Heading4"/>
       </w:pPr>
       <w:r>
-        <w:t>Bright Value: 1-100</w:t>
-      </w:r>
-      <w:r>
-        <w:t>%</w:t>
-      </w:r>
-    </w:p>
-    <w:p>
-      <w:r>
-        <w:t>Set the display brightness value.</w:t>
-      </w:r>
-    </w:p>
-    <w:p>
-      <w:pPr>
-        <w:pStyle w:val="Heading4"/>
-      </w:pPr>
-      <w:r>
-        <w:t xml:space="preserve">Dim Value: </w:t>
-      </w:r>
-      <w:r>
-        <w:t>0-100%</w:t>
-      </w:r>
-    </w:p>
-    <w:p>
-      <w:r>
-        <w:t xml:space="preserve">Set the display brightness after the </w:t>
-      </w:r>
-      <w:r>
-        <w:t>timer below expires.</w:t>
-      </w:r>
-    </w:p>
-    <w:p>
-      <w:pPr>
-        <w:pStyle w:val="Heading4"/>
-      </w:pPr>
-      <w:r>
-        <w:t>Display Dim Time:</w:t>
-      </w:r>
-      <w:r>
-        <w:t xml:space="preserve"> 0-120 S</w:t>
-      </w:r>
-    </w:p>
-    <w:p>
-      <w:r>
-        <w:t>Specify the time until the display changes to dim mode.</w:t>
-      </w:r>
-    </w:p>
-    <w:p>
-      <w:pPr>
-        <w:pStyle w:val="Heading4"/>
-      </w:pPr>
-      <w:r>
-        <w:t>+Sideways Scroll Settings</w:t>
-      </w:r>
-    </w:p>
-    <w:p>
-      <w:r>
-        <w:t xml:space="preserve">Lines of text that </w:t>
-      </w:r>
-      <w:proofErr w:type="gramStart"/>
-      <w:r>
-        <w:t>too</w:t>
-      </w:r>
-      <w:proofErr w:type="gramEnd"/>
-      <w:r>
-        <w:t xml:space="preserve"> long for the display will scroll back and forth. The following settings control the speed.</w:t>
-      </w:r>
-    </w:p>
-    <w:p>
-      <w:pPr>
-        <w:pStyle w:val="Heading5"/>
-      </w:pPr>
-      <w:r>
-        <w:t xml:space="preserve">Speed: </w:t>
-      </w:r>
-      <w:r>
-        <w:t>1-1000 mS</w:t>
-      </w:r>
-    </w:p>
-    <w:p>
-      <w:r>
-        <w:t>Controls the speed of text moving to the left.</w:t>
-      </w:r>
-    </w:p>
-    <w:p>
-      <w:pPr>
-        <w:pStyle w:val="Heading5"/>
-      </w:pPr>
-      <w:r>
-        <w:t>Pause: 1-100</w:t>
-      </w:r>
-      <w:r>
-        <w:t xml:space="preserve"> mS</w:t>
-      </w:r>
-    </w:p>
-    <w:p>
-      <w:r>
-        <w:t>This controls the pause when the text is at the end (all the way to the left).</w:t>
-      </w:r>
-    </w:p>
-    <w:p>
-      <w:pPr>
-        <w:pStyle w:val="Heading5"/>
-      </w:pPr>
-      <w:r>
-        <w:t>Reverse Speed: 1-20x</w:t>
-      </w:r>
-    </w:p>
-    <w:p>
-      <w:r>
-        <w:t xml:space="preserve">This is how fast the text scrolls </w:t>
-      </w:r>
-      <w:r>
-        <w:t>back to the beginning (to the right). 2x means twice as fast as the text scroll</w:t>
-      </w:r>
-      <w:r>
-        <w:t>ed to the left</w:t>
-      </w:r>
-      <w:r>
-        <w:t>.</w:t>
-      </w:r>
-    </w:p>
-    <w:p>
-      <w:pPr>
-        <w:pStyle w:val="Heading4"/>
-      </w:pPr>
-      <w:r>
-        <w:t xml:space="preserve">Menu Selection: </w:t>
-      </w:r>
-      <w:r>
-        <w:t>Color|*</w:t>
-      </w:r>
-    </w:p>
-    <w:p>
-      <w:r>
-        <w:t>Menu selections</w:t>
-      </w:r>
-      <w:r>
-        <w:t xml:space="preserve"> and selections from a list can be either colored or marked with the ‘*’ character.</w:t>
-      </w:r>
-    </w:p>
-    <w:p>
-      <w:pPr>
-        <w:pStyle w:val="Heading4"/>
-      </w:pPr>
-      <w:r>
-        <w:lastRenderedPageBreak/>
         <w:t>Text/</w:t>
       </w:r>
       <w:proofErr w:type="spellStart"/>
@@ -3631,6 +3635,7 @@
         <w:pStyle w:val="Heading4"/>
       </w:pPr>
       <w:r>
+        <w:lastRenderedPageBreak/>
         <w:t>Read Battery Raw Data</w:t>
       </w:r>
     </w:p>
@@ -3710,7 +3715,6 @@
         <w:pStyle w:val="Heading3"/>
       </w:pPr>
       <w:r>
-        <w:lastRenderedPageBreak/>
         <w:t>Format EEPROM</w:t>
       </w:r>
     </w:p>
@@ -8122,6 +8126,118 @@
     </w:lvl>
   </w:abstractNum>
   <w:abstractNum w:abstractNumId="37" w15:restartNumberingAfterBreak="0">
+    <w:nsid w:val="2FFE628C"/>
+    <w:multiLevelType w:val="hybridMultilevel"/>
+    <w:tmpl w:val="2BA48666"/>
+    <w:lvl w:ilvl="0" w:tplc="A54E0A3E">
+      <w:numFmt w:val="bullet"/>
+      <w:lvlText w:val="-"/>
+      <w:lvlJc w:val="left"/>
+      <w:pPr>
+        <w:ind w:left="720" w:hanging="360"/>
+      </w:pPr>
+      <w:rPr>
+        <w:rFonts w:ascii="Arial" w:eastAsia="Arial" w:hAnsi="Arial" w:cs="Arial" w:hint="default"/>
+      </w:rPr>
+    </w:lvl>
+    <w:lvl w:ilvl="1" w:tplc="04090003" w:tentative="1">
+      <w:start w:val="1"/>
+      <w:numFmt w:val="bullet"/>
+      <w:lvlText w:val="o"/>
+      <w:lvlJc w:val="left"/>
+      <w:pPr>
+        <w:ind w:left="1440" w:hanging="360"/>
+      </w:pPr>
+      <w:rPr>
+        <w:rFonts w:ascii="Courier New" w:hAnsi="Courier New" w:cs="Courier New" w:hint="default"/>
+      </w:rPr>
+    </w:lvl>
+    <w:lvl w:ilvl="2" w:tplc="04090005" w:tentative="1">
+      <w:start w:val="1"/>
+      <w:numFmt w:val="bullet"/>
+      <w:lvlText w:val=""/>
+      <w:lvlJc w:val="left"/>
+      <w:pPr>
+        <w:ind w:left="2160" w:hanging="360"/>
+      </w:pPr>
+      <w:rPr>
+        <w:rFonts w:ascii="Wingdings" w:hAnsi="Wingdings" w:hint="default"/>
+      </w:rPr>
+    </w:lvl>
+    <w:lvl w:ilvl="3" w:tplc="04090001" w:tentative="1">
+      <w:start w:val="1"/>
+      <w:numFmt w:val="bullet"/>
+      <w:lvlText w:val=""/>
+      <w:lvlJc w:val="left"/>
+      <w:pPr>
+        <w:ind w:left="2880" w:hanging="360"/>
+      </w:pPr>
+      <w:rPr>
+        <w:rFonts w:ascii="Symbol" w:hAnsi="Symbol" w:hint="default"/>
+      </w:rPr>
+    </w:lvl>
+    <w:lvl w:ilvl="4" w:tplc="04090003" w:tentative="1">
+      <w:start w:val="1"/>
+      <w:numFmt w:val="bullet"/>
+      <w:lvlText w:val="o"/>
+      <w:lvlJc w:val="left"/>
+      <w:pPr>
+        <w:ind w:left="3600" w:hanging="360"/>
+      </w:pPr>
+      <w:rPr>
+        <w:rFonts w:ascii="Courier New" w:hAnsi="Courier New" w:cs="Courier New" w:hint="default"/>
+      </w:rPr>
+    </w:lvl>
+    <w:lvl w:ilvl="5" w:tplc="04090005" w:tentative="1">
+      <w:start w:val="1"/>
+      <w:numFmt w:val="bullet"/>
+      <w:lvlText w:val=""/>
+      <w:lvlJc w:val="left"/>
+      <w:pPr>
+        <w:ind w:left="4320" w:hanging="360"/>
+      </w:pPr>
+      <w:rPr>
+        <w:rFonts w:ascii="Wingdings" w:hAnsi="Wingdings" w:hint="default"/>
+      </w:rPr>
+    </w:lvl>
+    <w:lvl w:ilvl="6" w:tplc="04090001" w:tentative="1">
+      <w:start w:val="1"/>
+      <w:numFmt w:val="bullet"/>
+      <w:lvlText w:val=""/>
+      <w:lvlJc w:val="left"/>
+      <w:pPr>
+        <w:ind w:left="5040" w:hanging="360"/>
+      </w:pPr>
+      <w:rPr>
+        <w:rFonts w:ascii="Symbol" w:hAnsi="Symbol" w:hint="default"/>
+      </w:rPr>
+    </w:lvl>
+    <w:lvl w:ilvl="7" w:tplc="04090003" w:tentative="1">
+      <w:start w:val="1"/>
+      <w:numFmt w:val="bullet"/>
+      <w:lvlText w:val="o"/>
+      <w:lvlJc w:val="left"/>
+      <w:pPr>
+        <w:ind w:left="5760" w:hanging="360"/>
+      </w:pPr>
+      <w:rPr>
+        <w:rFonts w:ascii="Courier New" w:hAnsi="Courier New" w:cs="Courier New" w:hint="default"/>
+      </w:rPr>
+    </w:lvl>
+    <w:lvl w:ilvl="8" w:tplc="04090005" w:tentative="1">
+      <w:start w:val="1"/>
+      <w:numFmt w:val="bullet"/>
+      <w:lvlText w:val=""/>
+      <w:lvlJc w:val="left"/>
+      <w:pPr>
+        <w:ind w:left="6480" w:hanging="360"/>
+      </w:pPr>
+      <w:rPr>
+        <w:rFonts w:ascii="Wingdings" w:hAnsi="Wingdings" w:hint="default"/>
+      </w:rPr>
+    </w:lvl>
+  </w:abstractNum>
+  <w:abstractNum w:abstractNumId="38" w15:restartNumberingAfterBreak="0">
     <w:nsid w:val="301A1E6F"/>
     <w:multiLevelType w:val="hybridMultilevel"/>
     <w:tmpl w:val="D316A260"/>
@@ -8233,7 +8349,7 @@
       </w:rPr>
     </w:lvl>
   </w:abstractNum>
-  <w:abstractNum w:abstractNumId="38" w15:restartNumberingAfterBreak="0">
+  <w:abstractNum w:abstractNumId="39" w15:restartNumberingAfterBreak="0">
     <w:nsid w:val="31C8769F"/>
     <w:multiLevelType w:val="hybridMultilevel"/>
     <w:tmpl w:val="C1DA7B78"/>
@@ -8345,7 +8461,7 @@
       </w:rPr>
     </w:lvl>
   </w:abstractNum>
-  <w:abstractNum w:abstractNumId="39" w15:restartNumberingAfterBreak="0">
+  <w:abstractNum w:abstractNumId="40" w15:restartNumberingAfterBreak="0">
     <w:nsid w:val="32B03C03"/>
     <w:multiLevelType w:val="hybridMultilevel"/>
     <w:tmpl w:val="44640EF4"/>
@@ -8457,7 +8573,7 @@
       </w:rPr>
     </w:lvl>
   </w:abstractNum>
-  <w:abstractNum w:abstractNumId="40" w15:restartNumberingAfterBreak="0">
+  <w:abstractNum w:abstractNumId="41" w15:restartNumberingAfterBreak="0">
     <w:nsid w:val="33DD7186"/>
     <w:multiLevelType w:val="hybridMultilevel"/>
     <w:tmpl w:val="0158FAEA"/>
@@ -8569,7 +8685,7 @@
       </w:rPr>
     </w:lvl>
   </w:abstractNum>
-  <w:abstractNum w:abstractNumId="41" w15:restartNumberingAfterBreak="0">
+  <w:abstractNum w:abstractNumId="42" w15:restartNumberingAfterBreak="0">
     <w:nsid w:val="342D66E6"/>
     <w:multiLevelType w:val="hybridMultilevel"/>
     <w:tmpl w:val="E254554A"/>
@@ -8681,7 +8797,7 @@
       </w:rPr>
     </w:lvl>
   </w:abstractNum>
-  <w:abstractNum w:abstractNumId="42" w15:restartNumberingAfterBreak="0">
+  <w:abstractNum w:abstractNumId="43" w15:restartNumberingAfterBreak="0">
     <w:nsid w:val="343C0E61"/>
     <w:multiLevelType w:val="hybridMultilevel"/>
     <w:tmpl w:val="B88A1536"/>
@@ -8793,7 +8909,7 @@
       </w:rPr>
     </w:lvl>
   </w:abstractNum>
-  <w:abstractNum w:abstractNumId="43" w15:restartNumberingAfterBreak="0">
+  <w:abstractNum w:abstractNumId="44" w15:restartNumberingAfterBreak="0">
     <w:nsid w:val="34A14553"/>
     <w:multiLevelType w:val="hybridMultilevel"/>
     <w:tmpl w:val="170EF526"/>
@@ -8905,7 +9021,7 @@
       </w:rPr>
     </w:lvl>
   </w:abstractNum>
-  <w:abstractNum w:abstractNumId="44" w15:restartNumberingAfterBreak="0">
+  <w:abstractNum w:abstractNumId="45" w15:restartNumberingAfterBreak="0">
     <w:nsid w:val="376B3B86"/>
     <w:multiLevelType w:val="hybridMultilevel"/>
     <w:tmpl w:val="A616020E"/>
@@ -9017,7 +9133,7 @@
       </w:rPr>
     </w:lvl>
   </w:abstractNum>
-  <w:abstractNum w:abstractNumId="45" w15:restartNumberingAfterBreak="0">
+  <w:abstractNum w:abstractNumId="46" w15:restartNumberingAfterBreak="0">
     <w:nsid w:val="377B1E27"/>
     <w:multiLevelType w:val="hybridMultilevel"/>
     <w:tmpl w:val="70E09EF8"/>
@@ -9129,7 +9245,7 @@
       </w:rPr>
     </w:lvl>
   </w:abstractNum>
-  <w:abstractNum w:abstractNumId="46" w15:restartNumberingAfterBreak="0">
+  <w:abstractNum w:abstractNumId="47" w15:restartNumberingAfterBreak="0">
     <w:nsid w:val="37ED2E74"/>
     <w:multiLevelType w:val="hybridMultilevel"/>
     <w:tmpl w:val="2D30E69C"/>
@@ -9241,7 +9357,7 @@
       </w:rPr>
     </w:lvl>
   </w:abstractNum>
-  <w:abstractNum w:abstractNumId="47" w15:restartNumberingAfterBreak="0">
+  <w:abstractNum w:abstractNumId="48" w15:restartNumberingAfterBreak="0">
     <w:nsid w:val="393A26B1"/>
     <w:multiLevelType w:val="hybridMultilevel"/>
     <w:tmpl w:val="59707C16"/>
@@ -9353,7 +9469,7 @@
       </w:rPr>
     </w:lvl>
   </w:abstractNum>
-  <w:abstractNum w:abstractNumId="48" w15:restartNumberingAfterBreak="0">
+  <w:abstractNum w:abstractNumId="49" w15:restartNumberingAfterBreak="0">
     <w:nsid w:val="395D6EAE"/>
     <w:multiLevelType w:val="hybridMultilevel"/>
     <w:tmpl w:val="A9FA500E"/>
@@ -9465,7 +9581,7 @@
       </w:rPr>
     </w:lvl>
   </w:abstractNum>
-  <w:abstractNum w:abstractNumId="49" w15:restartNumberingAfterBreak="0">
+  <w:abstractNum w:abstractNumId="50" w15:restartNumberingAfterBreak="0">
     <w:nsid w:val="39A93951"/>
     <w:multiLevelType w:val="hybridMultilevel"/>
     <w:tmpl w:val="E522E05C"/>
@@ -9577,7 +9693,7 @@
       </w:rPr>
     </w:lvl>
   </w:abstractNum>
-  <w:abstractNum w:abstractNumId="50" w15:restartNumberingAfterBreak="0">
+  <w:abstractNum w:abstractNumId="51" w15:restartNumberingAfterBreak="0">
     <w:nsid w:val="3B001DA3"/>
     <w:multiLevelType w:val="hybridMultilevel"/>
     <w:tmpl w:val="077EDE58"/>
@@ -9689,7 +9805,7 @@
       </w:rPr>
     </w:lvl>
   </w:abstractNum>
-  <w:abstractNum w:abstractNumId="51" w15:restartNumberingAfterBreak="0">
+  <w:abstractNum w:abstractNumId="52" w15:restartNumberingAfterBreak="0">
     <w:nsid w:val="3C141BB0"/>
     <w:multiLevelType w:val="hybridMultilevel"/>
     <w:tmpl w:val="E7900C40"/>
@@ -9801,7 +9917,7 @@
       </w:rPr>
     </w:lvl>
   </w:abstractNum>
-  <w:abstractNum w:abstractNumId="52" w15:restartNumberingAfterBreak="0">
+  <w:abstractNum w:abstractNumId="53" w15:restartNumberingAfterBreak="0">
     <w:nsid w:val="3D29141D"/>
     <w:multiLevelType w:val="hybridMultilevel"/>
     <w:tmpl w:val="907E98AC"/>
@@ -9913,7 +10029,7 @@
       </w:rPr>
     </w:lvl>
   </w:abstractNum>
-  <w:abstractNum w:abstractNumId="53" w15:restartNumberingAfterBreak="0">
+  <w:abstractNum w:abstractNumId="54" w15:restartNumberingAfterBreak="0">
     <w:nsid w:val="3E463A6C"/>
     <w:multiLevelType w:val="hybridMultilevel"/>
     <w:tmpl w:val="5A4C8A9E"/>
@@ -10025,7 +10141,7 @@
       </w:rPr>
     </w:lvl>
   </w:abstractNum>
-  <w:abstractNum w:abstractNumId="54" w15:restartNumberingAfterBreak="0">
+  <w:abstractNum w:abstractNumId="55" w15:restartNumberingAfterBreak="0">
     <w:nsid w:val="40163D94"/>
     <w:multiLevelType w:val="hybridMultilevel"/>
     <w:tmpl w:val="B8669994"/>
@@ -10137,7 +10253,7 @@
       </w:rPr>
     </w:lvl>
   </w:abstractNum>
-  <w:abstractNum w:abstractNumId="55" w15:restartNumberingAfterBreak="0">
+  <w:abstractNum w:abstractNumId="56" w15:restartNumberingAfterBreak="0">
     <w:nsid w:val="40570DDE"/>
     <w:multiLevelType w:val="hybridMultilevel"/>
     <w:tmpl w:val="374229F2"/>
@@ -10249,7 +10365,7 @@
       </w:rPr>
     </w:lvl>
   </w:abstractNum>
-  <w:abstractNum w:abstractNumId="56" w15:restartNumberingAfterBreak="0">
+  <w:abstractNum w:abstractNumId="57" w15:restartNumberingAfterBreak="0">
     <w:nsid w:val="42EE59E7"/>
     <w:multiLevelType w:val="multilevel"/>
     <w:tmpl w:val="6A52508A"/>
@@ -10362,7 +10478,7 @@
       </w:rPr>
     </w:lvl>
   </w:abstractNum>
-  <w:abstractNum w:abstractNumId="57" w15:restartNumberingAfterBreak="0">
+  <w:abstractNum w:abstractNumId="58" w15:restartNumberingAfterBreak="0">
     <w:nsid w:val="43E5715E"/>
     <w:multiLevelType w:val="hybridMultilevel"/>
     <w:tmpl w:val="DF4C239E"/>
@@ -10474,7 +10590,7 @@
       </w:rPr>
     </w:lvl>
   </w:abstractNum>
-  <w:abstractNum w:abstractNumId="58" w15:restartNumberingAfterBreak="0">
+  <w:abstractNum w:abstractNumId="59" w15:restartNumberingAfterBreak="0">
     <w:nsid w:val="447A353B"/>
     <w:multiLevelType w:val="hybridMultilevel"/>
     <w:tmpl w:val="C978BA68"/>
@@ -10586,7 +10702,7 @@
       </w:rPr>
     </w:lvl>
   </w:abstractNum>
-  <w:abstractNum w:abstractNumId="59" w15:restartNumberingAfterBreak="0">
+  <w:abstractNum w:abstractNumId="60" w15:restartNumberingAfterBreak="0">
     <w:nsid w:val="452C7493"/>
     <w:multiLevelType w:val="hybridMultilevel"/>
     <w:tmpl w:val="9910A868"/>
@@ -10698,7 +10814,7 @@
       </w:rPr>
     </w:lvl>
   </w:abstractNum>
-  <w:abstractNum w:abstractNumId="60" w15:restartNumberingAfterBreak="0">
+  <w:abstractNum w:abstractNumId="61" w15:restartNumberingAfterBreak="0">
     <w:nsid w:val="46BB3CB3"/>
     <w:multiLevelType w:val="hybridMultilevel"/>
     <w:tmpl w:val="8B62916A"/>
@@ -10810,7 +10926,7 @@
       </w:rPr>
     </w:lvl>
   </w:abstractNum>
-  <w:abstractNum w:abstractNumId="61" w15:restartNumberingAfterBreak="0">
+  <w:abstractNum w:abstractNumId="62" w15:restartNumberingAfterBreak="0">
     <w:nsid w:val="47746E93"/>
     <w:multiLevelType w:val="hybridMultilevel"/>
     <w:tmpl w:val="2B721A4A"/>
@@ -10922,7 +11038,7 @@
       </w:rPr>
     </w:lvl>
   </w:abstractNum>
-  <w:abstractNum w:abstractNumId="62" w15:restartNumberingAfterBreak="0">
+  <w:abstractNum w:abstractNumId="63" w15:restartNumberingAfterBreak="0">
     <w:nsid w:val="483D056B"/>
     <w:multiLevelType w:val="hybridMultilevel"/>
     <w:tmpl w:val="C4DCE034"/>
@@ -11034,7 +11150,7 @@
       </w:rPr>
     </w:lvl>
   </w:abstractNum>
-  <w:abstractNum w:abstractNumId="63" w15:restartNumberingAfterBreak="0">
+  <w:abstractNum w:abstractNumId="64" w15:restartNumberingAfterBreak="0">
     <w:nsid w:val="48813A05"/>
     <w:multiLevelType w:val="hybridMultilevel"/>
     <w:tmpl w:val="42CAA4CE"/>
@@ -11147,7 +11263,7 @@
       </w:rPr>
     </w:lvl>
   </w:abstractNum>
-  <w:abstractNum w:abstractNumId="64" w15:restartNumberingAfterBreak="0">
+  <w:abstractNum w:abstractNumId="65" w15:restartNumberingAfterBreak="0">
     <w:nsid w:val="4A3C29DC"/>
     <w:multiLevelType w:val="hybridMultilevel"/>
     <w:tmpl w:val="29F4D392"/>
@@ -11259,7 +11375,7 @@
       </w:rPr>
     </w:lvl>
   </w:abstractNum>
-  <w:abstractNum w:abstractNumId="65" w15:restartNumberingAfterBreak="0">
+  <w:abstractNum w:abstractNumId="66" w15:restartNumberingAfterBreak="0">
     <w:nsid w:val="4A9B6FB7"/>
     <w:multiLevelType w:val="hybridMultilevel"/>
     <w:tmpl w:val="C47ECA54"/>
@@ -11371,7 +11487,7 @@
       </w:rPr>
     </w:lvl>
   </w:abstractNum>
-  <w:abstractNum w:abstractNumId="66" w15:restartNumberingAfterBreak="0">
+  <w:abstractNum w:abstractNumId="67" w15:restartNumberingAfterBreak="0">
     <w:nsid w:val="4C2207ED"/>
     <w:multiLevelType w:val="hybridMultilevel"/>
     <w:tmpl w:val="E95272B2"/>
@@ -11483,7 +11599,7 @@
       </w:rPr>
     </w:lvl>
   </w:abstractNum>
-  <w:abstractNum w:abstractNumId="67" w15:restartNumberingAfterBreak="0">
+  <w:abstractNum w:abstractNumId="68" w15:restartNumberingAfterBreak="0">
     <w:nsid w:val="4C687CB3"/>
     <w:multiLevelType w:val="hybridMultilevel"/>
     <w:tmpl w:val="0D781E22"/>
@@ -11595,7 +11711,7 @@
       </w:rPr>
     </w:lvl>
   </w:abstractNum>
-  <w:abstractNum w:abstractNumId="68" w15:restartNumberingAfterBreak="0">
+  <w:abstractNum w:abstractNumId="69" w15:restartNumberingAfterBreak="0">
     <w:nsid w:val="4FCE4725"/>
     <w:multiLevelType w:val="hybridMultilevel"/>
     <w:tmpl w:val="914EE3B4"/>
@@ -11707,7 +11823,7 @@
       </w:rPr>
     </w:lvl>
   </w:abstractNum>
-  <w:abstractNum w:abstractNumId="69" w15:restartNumberingAfterBreak="0">
+  <w:abstractNum w:abstractNumId="70" w15:restartNumberingAfterBreak="0">
     <w:nsid w:val="51CE085C"/>
     <w:multiLevelType w:val="hybridMultilevel"/>
     <w:tmpl w:val="84788A08"/>
@@ -11819,7 +11935,7 @@
       </w:rPr>
     </w:lvl>
   </w:abstractNum>
-  <w:abstractNum w:abstractNumId="70" w15:restartNumberingAfterBreak="0">
+  <w:abstractNum w:abstractNumId="71" w15:restartNumberingAfterBreak="0">
     <w:nsid w:val="52944BD2"/>
     <w:multiLevelType w:val="hybridMultilevel"/>
     <w:tmpl w:val="BC3489E0"/>
@@ -11931,7 +12047,7 @@
       </w:rPr>
     </w:lvl>
   </w:abstractNum>
-  <w:abstractNum w:abstractNumId="71" w15:restartNumberingAfterBreak="0">
+  <w:abstractNum w:abstractNumId="72" w15:restartNumberingAfterBreak="0">
     <w:nsid w:val="565E12F2"/>
     <w:multiLevelType w:val="hybridMultilevel"/>
     <w:tmpl w:val="9E96747C"/>
@@ -12043,7 +12159,7 @@
       </w:rPr>
     </w:lvl>
   </w:abstractNum>
-  <w:abstractNum w:abstractNumId="72" w15:restartNumberingAfterBreak="0">
+  <w:abstractNum w:abstractNumId="73" w15:restartNumberingAfterBreak="0">
     <w:nsid w:val="57466407"/>
     <w:multiLevelType w:val="hybridMultilevel"/>
     <w:tmpl w:val="0F9ADCF4"/>
@@ -12155,7 +12271,7 @@
       </w:rPr>
     </w:lvl>
   </w:abstractNum>
-  <w:abstractNum w:abstractNumId="73" w15:restartNumberingAfterBreak="0">
+  <w:abstractNum w:abstractNumId="74" w15:restartNumberingAfterBreak="0">
     <w:nsid w:val="5ABE68FB"/>
     <w:multiLevelType w:val="hybridMultilevel"/>
     <w:tmpl w:val="B422F472"/>
@@ -12267,7 +12383,7 @@
       </w:rPr>
     </w:lvl>
   </w:abstractNum>
-  <w:abstractNum w:abstractNumId="74" w15:restartNumberingAfterBreak="0">
+  <w:abstractNum w:abstractNumId="75" w15:restartNumberingAfterBreak="0">
     <w:nsid w:val="5BA928F1"/>
     <w:multiLevelType w:val="hybridMultilevel"/>
     <w:tmpl w:val="4D4E1798"/>
@@ -12379,7 +12495,7 @@
       </w:rPr>
     </w:lvl>
   </w:abstractNum>
-  <w:abstractNum w:abstractNumId="75" w15:restartNumberingAfterBreak="0">
+  <w:abstractNum w:abstractNumId="76" w15:restartNumberingAfterBreak="0">
     <w:nsid w:val="5C834FA4"/>
     <w:multiLevelType w:val="hybridMultilevel"/>
     <w:tmpl w:val="1FC415FC"/>
@@ -12491,7 +12607,7 @@
       </w:rPr>
     </w:lvl>
   </w:abstractNum>
-  <w:abstractNum w:abstractNumId="76" w15:restartNumberingAfterBreak="0">
+  <w:abstractNum w:abstractNumId="77" w15:restartNumberingAfterBreak="0">
     <w:nsid w:val="5F3C3936"/>
     <w:multiLevelType w:val="hybridMultilevel"/>
     <w:tmpl w:val="917CC46E"/>
@@ -12603,7 +12719,7 @@
       </w:rPr>
     </w:lvl>
   </w:abstractNum>
-  <w:abstractNum w:abstractNumId="77" w15:restartNumberingAfterBreak="0">
+  <w:abstractNum w:abstractNumId="78" w15:restartNumberingAfterBreak="0">
     <w:nsid w:val="60544E94"/>
     <w:multiLevelType w:val="hybridMultilevel"/>
     <w:tmpl w:val="CBCAC042"/>
@@ -12715,7 +12831,7 @@
       </w:rPr>
     </w:lvl>
   </w:abstractNum>
-  <w:abstractNum w:abstractNumId="78" w15:restartNumberingAfterBreak="0">
+  <w:abstractNum w:abstractNumId="79" w15:restartNumberingAfterBreak="0">
     <w:nsid w:val="62D1418B"/>
     <w:multiLevelType w:val="multilevel"/>
     <w:tmpl w:val="3E58308A"/>
@@ -12814,7 +12930,7 @@
       </w:pPr>
     </w:lvl>
   </w:abstractNum>
-  <w:abstractNum w:abstractNumId="79" w15:restartNumberingAfterBreak="0">
+  <w:abstractNum w:abstractNumId="80" w15:restartNumberingAfterBreak="0">
     <w:nsid w:val="62E52923"/>
     <w:multiLevelType w:val="hybridMultilevel"/>
     <w:tmpl w:val="7668165A"/>
@@ -12926,7 +13042,7 @@
       </w:rPr>
     </w:lvl>
   </w:abstractNum>
-  <w:abstractNum w:abstractNumId="80" w15:restartNumberingAfterBreak="0">
+  <w:abstractNum w:abstractNumId="81" w15:restartNumberingAfterBreak="0">
     <w:nsid w:val="63935A88"/>
     <w:multiLevelType w:val="hybridMultilevel"/>
     <w:tmpl w:val="0F5805EA"/>
@@ -13038,7 +13154,7 @@
       </w:rPr>
     </w:lvl>
   </w:abstractNum>
-  <w:abstractNum w:abstractNumId="81" w15:restartNumberingAfterBreak="0">
+  <w:abstractNum w:abstractNumId="82" w15:restartNumberingAfterBreak="0">
     <w:nsid w:val="69496F08"/>
     <w:multiLevelType w:val="hybridMultilevel"/>
     <w:tmpl w:val="6EE839E4"/>
@@ -13150,7 +13266,7 @@
       </w:rPr>
     </w:lvl>
   </w:abstractNum>
-  <w:abstractNum w:abstractNumId="82" w15:restartNumberingAfterBreak="0">
+  <w:abstractNum w:abstractNumId="83" w15:restartNumberingAfterBreak="0">
     <w:nsid w:val="6ACC6C5E"/>
     <w:multiLevelType w:val="multilevel"/>
     <w:tmpl w:val="4AB8E1DA"/>
@@ -13263,7 +13379,7 @@
       </w:rPr>
     </w:lvl>
   </w:abstractNum>
-  <w:abstractNum w:abstractNumId="83" w15:restartNumberingAfterBreak="0">
+  <w:abstractNum w:abstractNumId="84" w15:restartNumberingAfterBreak="0">
     <w:nsid w:val="6D7319F8"/>
     <w:multiLevelType w:val="hybridMultilevel"/>
     <w:tmpl w:val="A7EEE4A4"/>
@@ -13375,7 +13491,7 @@
       </w:rPr>
     </w:lvl>
   </w:abstractNum>
-  <w:abstractNum w:abstractNumId="84" w15:restartNumberingAfterBreak="0">
+  <w:abstractNum w:abstractNumId="85" w15:restartNumberingAfterBreak="0">
     <w:nsid w:val="6D94244E"/>
     <w:multiLevelType w:val="hybridMultilevel"/>
     <w:tmpl w:val="D38C1A3A"/>
@@ -13487,7 +13603,7 @@
       </w:rPr>
     </w:lvl>
   </w:abstractNum>
-  <w:abstractNum w:abstractNumId="85" w15:restartNumberingAfterBreak="0">
+  <w:abstractNum w:abstractNumId="86" w15:restartNumberingAfterBreak="0">
     <w:nsid w:val="6DEA09BD"/>
     <w:multiLevelType w:val="hybridMultilevel"/>
     <w:tmpl w:val="029A123E"/>
@@ -13599,7 +13715,7 @@
       </w:rPr>
     </w:lvl>
   </w:abstractNum>
-  <w:abstractNum w:abstractNumId="86" w15:restartNumberingAfterBreak="0">
+  <w:abstractNum w:abstractNumId="87" w15:restartNumberingAfterBreak="0">
     <w:nsid w:val="6E310D77"/>
     <w:multiLevelType w:val="hybridMultilevel"/>
     <w:tmpl w:val="9C74834E"/>
@@ -13712,7 +13828,7 @@
       </w:rPr>
     </w:lvl>
   </w:abstractNum>
-  <w:abstractNum w:abstractNumId="87" w15:restartNumberingAfterBreak="0">
+  <w:abstractNum w:abstractNumId="88" w15:restartNumberingAfterBreak="0">
     <w:nsid w:val="74D85371"/>
     <w:multiLevelType w:val="hybridMultilevel"/>
     <w:tmpl w:val="B20E36AC"/>
@@ -13824,7 +13940,7 @@
       </w:rPr>
     </w:lvl>
   </w:abstractNum>
-  <w:abstractNum w:abstractNumId="88" w15:restartNumberingAfterBreak="0">
+  <w:abstractNum w:abstractNumId="89" w15:restartNumberingAfterBreak="0">
     <w:nsid w:val="75FA3747"/>
     <w:multiLevelType w:val="hybridMultilevel"/>
     <w:tmpl w:val="B9F43A9E"/>
@@ -13936,7 +14052,7 @@
       </w:rPr>
     </w:lvl>
   </w:abstractNum>
-  <w:abstractNum w:abstractNumId="89" w15:restartNumberingAfterBreak="0">
+  <w:abstractNum w:abstractNumId="90" w15:restartNumberingAfterBreak="0">
     <w:nsid w:val="7877407A"/>
     <w:multiLevelType w:val="hybridMultilevel"/>
     <w:tmpl w:val="C91E38FA"/>
@@ -14048,7 +14164,7 @@
       </w:rPr>
     </w:lvl>
   </w:abstractNum>
-  <w:abstractNum w:abstractNumId="90" w15:restartNumberingAfterBreak="0">
+  <w:abstractNum w:abstractNumId="91" w15:restartNumberingAfterBreak="0">
     <w:nsid w:val="78A40DC3"/>
     <w:multiLevelType w:val="hybridMultilevel"/>
     <w:tmpl w:val="F1E6B4B6"/>
@@ -14160,7 +14276,7 @@
       </w:rPr>
     </w:lvl>
   </w:abstractNum>
-  <w:abstractNum w:abstractNumId="91" w15:restartNumberingAfterBreak="0">
+  <w:abstractNum w:abstractNumId="92" w15:restartNumberingAfterBreak="0">
     <w:nsid w:val="79587B7C"/>
     <w:multiLevelType w:val="hybridMultilevel"/>
     <w:tmpl w:val="6A46933A"/>
@@ -14272,7 +14388,7 @@
       </w:rPr>
     </w:lvl>
   </w:abstractNum>
-  <w:abstractNum w:abstractNumId="92" w15:restartNumberingAfterBreak="0">
+  <w:abstractNum w:abstractNumId="93" w15:restartNumberingAfterBreak="0">
     <w:nsid w:val="7BB23699"/>
     <w:multiLevelType w:val="hybridMultilevel"/>
     <w:tmpl w:val="26C25814"/>
@@ -14384,7 +14500,7 @@
       </w:rPr>
     </w:lvl>
   </w:abstractNum>
-  <w:abstractNum w:abstractNumId="93" w15:restartNumberingAfterBreak="0">
+  <w:abstractNum w:abstractNumId="94" w15:restartNumberingAfterBreak="0">
     <w:nsid w:val="7F827ECF"/>
     <w:multiLevelType w:val="hybridMultilevel"/>
     <w:tmpl w:val="42DE9398"/>
@@ -14497,13 +14613,13 @@
     </w:lvl>
   </w:abstractNum>
   <w:num w:numId="1" w16cid:durableId="553472407">
-    <w:abstractNumId w:val="82"/>
+    <w:abstractNumId w:val="83"/>
   </w:num>
   <w:num w:numId="2" w16cid:durableId="1531718695">
     <w:abstractNumId w:val="16"/>
   </w:num>
   <w:num w:numId="3" w16cid:durableId="667371155">
-    <w:abstractNumId w:val="56"/>
+    <w:abstractNumId w:val="57"/>
   </w:num>
   <w:num w:numId="4" w16cid:durableId="751775167">
     <w:abstractNumId w:val="12"/>
@@ -14512,16 +14628,16 @@
     <w:abstractNumId w:val="29"/>
   </w:num>
   <w:num w:numId="6" w16cid:durableId="915629572">
-    <w:abstractNumId w:val="78"/>
+    <w:abstractNumId w:val="79"/>
   </w:num>
   <w:num w:numId="7" w16cid:durableId="693576224">
-    <w:abstractNumId w:val="91"/>
+    <w:abstractNumId w:val="92"/>
   </w:num>
   <w:num w:numId="8" w16cid:durableId="1298343021">
-    <w:abstractNumId w:val="86"/>
+    <w:abstractNumId w:val="87"/>
   </w:num>
   <w:num w:numId="9" w16cid:durableId="367219526">
-    <w:abstractNumId w:val="84"/>
+    <w:abstractNumId w:val="85"/>
   </w:num>
   <w:num w:numId="10" w16cid:durableId="1497187389">
     <w:abstractNumId w:val="18"/>
@@ -14530,10 +14646,10 @@
     <w:abstractNumId w:val="11"/>
   </w:num>
   <w:num w:numId="12" w16cid:durableId="567883504">
-    <w:abstractNumId w:val="52"/>
+    <w:abstractNumId w:val="53"/>
   </w:num>
   <w:num w:numId="13" w16cid:durableId="1572815186">
-    <w:abstractNumId w:val="44"/>
+    <w:abstractNumId w:val="45"/>
   </w:num>
   <w:num w:numId="14" w16cid:durableId="1914309961">
     <w:abstractNumId w:val="36"/>
@@ -14542,31 +14658,31 @@
     <w:abstractNumId w:val="5"/>
   </w:num>
   <w:num w:numId="16" w16cid:durableId="1421751508">
-    <w:abstractNumId w:val="93"/>
+    <w:abstractNumId w:val="94"/>
   </w:num>
   <w:num w:numId="17" w16cid:durableId="1009716389">
-    <w:abstractNumId w:val="63"/>
+    <w:abstractNumId w:val="64"/>
   </w:num>
   <w:num w:numId="18" w16cid:durableId="300229387">
-    <w:abstractNumId w:val="69"/>
+    <w:abstractNumId w:val="70"/>
   </w:num>
   <w:num w:numId="19" w16cid:durableId="1025836216">
-    <w:abstractNumId w:val="50"/>
+    <w:abstractNumId w:val="51"/>
   </w:num>
   <w:num w:numId="20" w16cid:durableId="976106770">
     <w:abstractNumId w:val="14"/>
   </w:num>
   <w:num w:numId="21" w16cid:durableId="427965314">
-    <w:abstractNumId w:val="38"/>
+    <w:abstractNumId w:val="39"/>
   </w:num>
   <w:num w:numId="22" w16cid:durableId="177355694">
-    <w:abstractNumId w:val="76"/>
+    <w:abstractNumId w:val="77"/>
   </w:num>
   <w:num w:numId="23" w16cid:durableId="6762404">
-    <w:abstractNumId w:val="59"/>
+    <w:abstractNumId w:val="60"/>
   </w:num>
   <w:num w:numId="24" w16cid:durableId="1492133217">
-    <w:abstractNumId w:val="66"/>
+    <w:abstractNumId w:val="67"/>
   </w:num>
   <w:num w:numId="25" w16cid:durableId="695159279">
     <w:abstractNumId w:val="27"/>
@@ -14575,34 +14691,34 @@
     <w:abstractNumId w:val="33"/>
   </w:num>
   <w:num w:numId="27" w16cid:durableId="1101994251">
-    <w:abstractNumId w:val="42"/>
+    <w:abstractNumId w:val="43"/>
   </w:num>
   <w:num w:numId="28" w16cid:durableId="1082484344">
-    <w:abstractNumId w:val="62"/>
+    <w:abstractNumId w:val="63"/>
   </w:num>
   <w:num w:numId="29" w16cid:durableId="467865549">
-    <w:abstractNumId w:val="67"/>
+    <w:abstractNumId w:val="68"/>
   </w:num>
   <w:num w:numId="30" w16cid:durableId="1656108771">
     <w:abstractNumId w:val="17"/>
   </w:num>
   <w:num w:numId="31" w16cid:durableId="1611818230">
-    <w:abstractNumId w:val="85"/>
+    <w:abstractNumId w:val="86"/>
   </w:num>
   <w:num w:numId="32" w16cid:durableId="1666009498">
     <w:abstractNumId w:val="10"/>
   </w:num>
   <w:num w:numId="33" w16cid:durableId="1041394156">
-    <w:abstractNumId w:val="47"/>
+    <w:abstractNumId w:val="48"/>
   </w:num>
   <w:num w:numId="34" w16cid:durableId="1270353408">
-    <w:abstractNumId w:val="55"/>
+    <w:abstractNumId w:val="56"/>
   </w:num>
   <w:num w:numId="35" w16cid:durableId="1540698615">
     <w:abstractNumId w:val="9"/>
   </w:num>
   <w:num w:numId="36" w16cid:durableId="1684479704">
-    <w:abstractNumId w:val="41"/>
+    <w:abstractNumId w:val="42"/>
   </w:num>
   <w:num w:numId="37" w16cid:durableId="2125145959">
     <w:abstractNumId w:val="15"/>
@@ -14611,37 +14727,37 @@
     <w:abstractNumId w:val="34"/>
   </w:num>
   <w:num w:numId="39" w16cid:durableId="798885554">
-    <w:abstractNumId w:val="92"/>
+    <w:abstractNumId w:val="93"/>
   </w:num>
   <w:num w:numId="40" w16cid:durableId="1610315013">
-    <w:abstractNumId w:val="79"/>
+    <w:abstractNumId w:val="80"/>
   </w:num>
   <w:num w:numId="41" w16cid:durableId="213975163">
     <w:abstractNumId w:val="4"/>
   </w:num>
   <w:num w:numId="42" w16cid:durableId="511454106">
-    <w:abstractNumId w:val="75"/>
+    <w:abstractNumId w:val="76"/>
   </w:num>
   <w:num w:numId="43" w16cid:durableId="1721711403">
     <w:abstractNumId w:val="21"/>
   </w:num>
   <w:num w:numId="44" w16cid:durableId="652369700">
-    <w:abstractNumId w:val="83"/>
+    <w:abstractNumId w:val="84"/>
   </w:num>
   <w:num w:numId="45" w16cid:durableId="227304564">
-    <w:abstractNumId w:val="68"/>
+    <w:abstractNumId w:val="69"/>
   </w:num>
   <w:num w:numId="46" w16cid:durableId="1561091169">
     <w:abstractNumId w:val="31"/>
   </w:num>
   <w:num w:numId="47" w16cid:durableId="734011883">
-    <w:abstractNumId w:val="80"/>
+    <w:abstractNumId w:val="81"/>
   </w:num>
   <w:num w:numId="48" w16cid:durableId="2125267477">
-    <w:abstractNumId w:val="72"/>
+    <w:abstractNumId w:val="73"/>
   </w:num>
   <w:num w:numId="49" w16cid:durableId="1612585929">
-    <w:abstractNumId w:val="71"/>
+    <w:abstractNumId w:val="72"/>
   </w:num>
   <w:num w:numId="50" w16cid:durableId="1628664370">
     <w:abstractNumId w:val="3"/>
@@ -14650,16 +14766,16 @@
     <w:abstractNumId w:val="23"/>
   </w:num>
   <w:num w:numId="52" w16cid:durableId="754671244">
-    <w:abstractNumId w:val="57"/>
+    <w:abstractNumId w:val="58"/>
   </w:num>
   <w:num w:numId="53" w16cid:durableId="1740665818">
-    <w:abstractNumId w:val="88"/>
+    <w:abstractNumId w:val="89"/>
   </w:num>
   <w:num w:numId="54" w16cid:durableId="452988921">
-    <w:abstractNumId w:val="89"/>
+    <w:abstractNumId w:val="90"/>
   </w:num>
   <w:num w:numId="55" w16cid:durableId="207304158">
-    <w:abstractNumId w:val="70"/>
+    <w:abstractNumId w:val="71"/>
   </w:num>
   <w:num w:numId="56" w16cid:durableId="2016880598">
     <w:abstractNumId w:val="19"/>
@@ -14668,19 +14784,19 @@
     <w:abstractNumId w:val="1"/>
   </w:num>
   <w:num w:numId="58" w16cid:durableId="1794397765">
-    <w:abstractNumId w:val="51"/>
+    <w:abstractNumId w:val="52"/>
   </w:num>
   <w:num w:numId="59" w16cid:durableId="1690447450">
-    <w:abstractNumId w:val="49"/>
+    <w:abstractNumId w:val="50"/>
   </w:num>
   <w:num w:numId="60" w16cid:durableId="2130009061">
-    <w:abstractNumId w:val="73"/>
+    <w:abstractNumId w:val="74"/>
   </w:num>
   <w:num w:numId="61" w16cid:durableId="1293515410">
     <w:abstractNumId w:val="2"/>
   </w:num>
   <w:num w:numId="62" w16cid:durableId="650257227">
-    <w:abstractNumId w:val="46"/>
+    <w:abstractNumId w:val="47"/>
   </w:num>
   <w:num w:numId="63" w16cid:durableId="571551157">
     <w:abstractNumId w:val="24"/>
@@ -14704,34 +14820,34 @@
     <w:abstractNumId w:val="7"/>
   </w:num>
   <w:num w:numId="70" w16cid:durableId="131336986">
-    <w:abstractNumId w:val="37"/>
+    <w:abstractNumId w:val="38"/>
   </w:num>
   <w:num w:numId="71" w16cid:durableId="894970823">
     <w:abstractNumId w:val="30"/>
   </w:num>
   <w:num w:numId="72" w16cid:durableId="1865287051">
-    <w:abstractNumId w:val="39"/>
+    <w:abstractNumId w:val="40"/>
   </w:num>
   <w:num w:numId="73" w16cid:durableId="368451605">
-    <w:abstractNumId w:val="60"/>
+    <w:abstractNumId w:val="61"/>
   </w:num>
   <w:num w:numId="74" w16cid:durableId="65686607">
     <w:abstractNumId w:val="6"/>
   </w:num>
   <w:num w:numId="75" w16cid:durableId="1840541023">
-    <w:abstractNumId w:val="43"/>
+    <w:abstractNumId w:val="44"/>
   </w:num>
   <w:num w:numId="76" w16cid:durableId="539049649">
-    <w:abstractNumId w:val="90"/>
+    <w:abstractNumId w:val="91"/>
   </w:num>
   <w:num w:numId="77" w16cid:durableId="1288513951">
-    <w:abstractNumId w:val="64"/>
+    <w:abstractNumId w:val="65"/>
   </w:num>
   <w:num w:numId="78" w16cid:durableId="1532762005">
-    <w:abstractNumId w:val="53"/>
+    <w:abstractNumId w:val="54"/>
   </w:num>
   <w:num w:numId="79" w16cid:durableId="1374647797">
-    <w:abstractNumId w:val="77"/>
+    <w:abstractNumId w:val="78"/>
   </w:num>
   <w:num w:numId="80" w16cid:durableId="1210456390">
     <w:abstractNumId w:val="8"/>
@@ -14740,43 +14856,46 @@
     <w:abstractNumId w:val="35"/>
   </w:num>
   <w:num w:numId="82" w16cid:durableId="500893856">
-    <w:abstractNumId w:val="81"/>
+    <w:abstractNumId w:val="82"/>
   </w:num>
   <w:num w:numId="83" w16cid:durableId="1950622049">
-    <w:abstractNumId w:val="58"/>
+    <w:abstractNumId w:val="59"/>
   </w:num>
   <w:num w:numId="84" w16cid:durableId="2060282905">
     <w:abstractNumId w:val="0"/>
   </w:num>
   <w:num w:numId="85" w16cid:durableId="490635123">
-    <w:abstractNumId w:val="54"/>
+    <w:abstractNumId w:val="55"/>
   </w:num>
   <w:num w:numId="86" w16cid:durableId="2038313657">
     <w:abstractNumId w:val="20"/>
   </w:num>
   <w:num w:numId="87" w16cid:durableId="1744451624">
-    <w:abstractNumId w:val="48"/>
+    <w:abstractNumId w:val="49"/>
   </w:num>
   <w:num w:numId="88" w16cid:durableId="2105687898">
-    <w:abstractNumId w:val="74"/>
+    <w:abstractNumId w:val="75"/>
   </w:num>
   <w:num w:numId="89" w16cid:durableId="363360886">
     <w:abstractNumId w:val="22"/>
   </w:num>
   <w:num w:numId="90" w16cid:durableId="974530531">
-    <w:abstractNumId w:val="65"/>
+    <w:abstractNumId w:val="66"/>
   </w:num>
   <w:num w:numId="91" w16cid:durableId="780148532">
-    <w:abstractNumId w:val="87"/>
+    <w:abstractNumId w:val="88"/>
   </w:num>
   <w:num w:numId="92" w16cid:durableId="304706915">
-    <w:abstractNumId w:val="45"/>
+    <w:abstractNumId w:val="46"/>
   </w:num>
   <w:num w:numId="93" w16cid:durableId="1232305665">
-    <w:abstractNumId w:val="61"/>
+    <w:abstractNumId w:val="62"/>
   </w:num>
   <w:num w:numId="94" w16cid:durableId="2055348731">
-    <w:abstractNumId w:val="40"/>
+    <w:abstractNumId w:val="41"/>
+  </w:num>
+  <w:num w:numId="95" w16cid:durableId="513424609">
+    <w:abstractNumId w:val="37"/>
   </w:num>
   <w:numIdMacAtCleanup w:val="84"/>
 </w:numbering>

</xml_diff>

<commit_message>
Fixed display of run time, it was on the last line when audio file was on. Moved the time to the end of the second line. #32
</commit_message>
<xml_diff>
--- a/RadioFox.docx
+++ b/RadioFox.docx
@@ -290,6 +290,26 @@
       </w:r>
       <w:r>
         <w:t xml:space="preserve"> are described below.</w:t>
+      </w:r>
+    </w:p>
+    <w:p>
+      <w:r>
+        <w:t>Version 1.09</w:t>
+      </w:r>
+    </w:p>
+    <w:p>
+      <w:pPr>
+        <w:pStyle w:val="ListParagraph"/>
+        <w:numPr>
+          <w:ilvl w:val="0"/>
+          <w:numId w:val="96"/>
+        </w:numPr>
+      </w:pPr>
+      <w:r>
+        <w:t>Moved the active time display to the end of the second line on the main display.</w:t>
+      </w:r>
+      <w:r>
+        <w:t xml:space="preserve"> Bug 32, when the audio file was selected, the last line overwrote the bottom of the display.</w:t>
       </w:r>
     </w:p>
     <w:p>
@@ -575,6 +595,7 @@
         <w:pStyle w:val="Heading2"/>
       </w:pPr>
       <w:r>
+        <w:lastRenderedPageBreak/>
         <w:t>Radio</w:t>
       </w:r>
     </w:p>
@@ -583,11 +604,7 @@
         <w:t>The radio functions are handled by the SA818-</w:t>
       </w:r>
       <w:r>
-        <w:t xml:space="preserve">V on the top right. There are vents in the case to allow cooling as this module can become quite hot when transmitting at high power for longer </w:t>
-      </w:r>
-      <w:r>
-        <w:lastRenderedPageBreak/>
-        <w:t>timer intervals. Transmitting longer than one minute is not recommended.</w:t>
+        <w:t>V on the top right. There are vents in the case to allow cooling as this module can become quite hot when transmitting at high power for longer timer intervals. Transmitting longer than one minute is not recommended.</w:t>
       </w:r>
       <w:r>
         <w:t xml:space="preserve"> High power is about </w:t>
@@ -907,6 +924,7 @@
           <w:b/>
           <w:bCs/>
         </w:rPr>
+        <w:lastRenderedPageBreak/>
         <w:t>~</w:t>
       </w:r>
     </w:p>
@@ -983,7 +1001,6 @@
           <w:b/>
           <w:bCs/>
         </w:rPr>
-        <w:lastRenderedPageBreak/>
         <w:t xml:space="preserve">NOTE_A4, </w:t>
       </w:r>
       <w:proofErr w:type="gramStart"/>
@@ -1324,6 +1341,7 @@
         <w:pStyle w:val="Heading2"/>
       </w:pPr>
       <w:r>
+        <w:lastRenderedPageBreak/>
         <w:t>DTMF *</w:t>
       </w:r>
       <w:r>
@@ -1340,7 +1358,6 @@
         <w:pStyle w:val="Heading2"/>
       </w:pPr>
       <w:r>
-        <w:lastRenderedPageBreak/>
         <w:t>DTMF *</w:t>
       </w:r>
       <w:r>
@@ -1822,6 +1839,7 @@
         <w:rPr>
           <w:lang w:val="en-US"/>
         </w:rPr>
+        <w:lastRenderedPageBreak/>
         <w:t>B</w:t>
       </w:r>
       <w:r>
@@ -1897,14 +1915,7 @@
         <w:rPr>
           <w:lang w:val="en-US"/>
         </w:rPr>
-        <w:t xml:space="preserve"> the increment will change to 10 and dial will </w:t>
-      </w:r>
-      <w:r>
-        <w:rPr>
-          <w:lang w:val="en-US"/>
-        </w:rPr>
-        <w:lastRenderedPageBreak/>
-        <w:t xml:space="preserve">add and subtract </w:t>
+        <w:t xml:space="preserve"> the increment will change to 10 and dial will add and subtract </w:t>
       </w:r>
       <w:r>
         <w:rPr>
@@ -2238,6 +2249,7 @@
         <w:pStyle w:val="Heading1"/>
       </w:pPr>
       <w:r>
+        <w:lastRenderedPageBreak/>
         <w:t>Main Operating Screen</w:t>
       </w:r>
     </w:p>
@@ -2272,11 +2284,7 @@
         <w:t xml:space="preserve"> on the PCB that can be seen through</w:t>
       </w:r>
       <w:r>
-        <w:t xml:space="preserve"> the slot on the </w:t>
-      </w:r>
-      <w:r>
-        <w:lastRenderedPageBreak/>
-        <w:t>top of the case</w:t>
+        <w:t xml:space="preserve"> the slot on the top of the case</w:t>
       </w:r>
       <w:r>
         <w:t xml:space="preserve">. These </w:t>
@@ -2572,6 +2580,7 @@
         <w:pStyle w:val="Heading3"/>
       </w:pPr>
       <w:r>
+        <w:lastRenderedPageBreak/>
         <w:t>Beacon</w:t>
       </w:r>
       <w:r>
@@ -2604,7 +2613,6 @@
         <w:pStyle w:val="Heading3"/>
       </w:pPr>
       <w:r>
-        <w:lastRenderedPageBreak/>
         <w:t xml:space="preserve">Call Sign: </w:t>
       </w:r>
       <w:r>
@@ -2832,6 +2840,7 @@
         <w:pStyle w:val="Heading3"/>
       </w:pPr>
       <w:r>
+        <w:lastRenderedPageBreak/>
         <w:t>TX Pause:10-1200 Sec</w:t>
       </w:r>
     </w:p>
@@ -2856,13 +2865,185 @@
         <w:pStyle w:val="Heading3"/>
       </w:pPr>
       <w:r>
+        <w:t>TX Send Min: 10-90 Sec</w:t>
+      </w:r>
+    </w:p>
+    <w:p>
+      <w:r>
+        <w:t>In random mode this is the minimum send time.</w:t>
+      </w:r>
+    </w:p>
+    <w:p>
+      <w:pPr>
+        <w:pStyle w:val="Heading3"/>
+      </w:pPr>
+      <w:r>
+        <w:t xml:space="preserve">TX Send Max: </w:t>
+      </w:r>
+      <w:r>
+        <w:t>10-90 Sec</w:t>
+      </w:r>
+    </w:p>
+    <w:p>
+      <w:r>
+        <w:t xml:space="preserve">In </w:t>
+      </w:r>
+      <w:r>
+        <w:t>random mode this is the maximum send time.</w:t>
+      </w:r>
+    </w:p>
+    <w:p>
+      <w:pPr>
+        <w:pStyle w:val="Heading3"/>
+      </w:pPr>
+      <w:r>
+        <w:t>TX Pause Min: 10-1200 Sec</w:t>
+      </w:r>
+    </w:p>
+    <w:p>
+      <w:r>
+        <w:t>In random mode this is the minimum pause time.</w:t>
+      </w:r>
+    </w:p>
+    <w:p>
+      <w:pPr>
+        <w:pStyle w:val="Heading3"/>
+      </w:pPr>
+      <w:r>
+        <w:t>TX Pause Max: 10-1200 Sec</w:t>
+      </w:r>
+    </w:p>
+    <w:p>
+      <w:r>
+        <w:t>In random mode this is the maximum pause time.</w:t>
+      </w:r>
+    </w:p>
+    <w:p>
+      <w:pPr>
+        <w:pStyle w:val="Heading3"/>
+      </w:pPr>
+      <w:r>
+        <w:t xml:space="preserve">TX Stop: </w:t>
+      </w:r>
+      <w:proofErr w:type="spellStart"/>
+      <w:r>
+        <w:t>Immediate|Finish</w:t>
+      </w:r>
+      <w:proofErr w:type="spellEnd"/>
+      <w:r>
+        <w:t xml:space="preserve"> Cycle</w:t>
+      </w:r>
+    </w:p>
+    <w:p>
+      <w:r>
+        <w:t xml:space="preserve">During transmit time the Beacon, Call Sign, and Audio are continuously sent. At the end of the transmission time this option controls whether the transmission stops immediately </w:t>
+      </w:r>
+      <w:proofErr w:type="gramStart"/>
+      <w:r>
+        <w:t>of</w:t>
+      </w:r>
+      <w:proofErr w:type="gramEnd"/>
+      <w:r>
+        <w:t xml:space="preserve"> waits to stop until the entire cycle is finished.</w:t>
+      </w:r>
+    </w:p>
+    <w:p/>
+    <w:p>
+      <w:r>
+        <w:t>A clever use of this command</w:t>
+      </w:r>
+      <w:r>
+        <w:t xml:space="preserve"> allows for only one cycle of beacon, ID, and music to be sent during each transmission time. Set the transmit</w:t>
+      </w:r>
+      <w:r>
+        <w:t xml:space="preserve"> time to something less than</w:t>
+      </w:r>
+      <w:r>
+        <w:t xml:space="preserve"> the time to perform a complete cycle and set this option to “Finish Cycle”. The </w:t>
+      </w:r>
+      <w:proofErr w:type="gramStart"/>
+      <w:r>
+        <w:t>transmit  cycle</w:t>
+      </w:r>
+      <w:proofErr w:type="gramEnd"/>
+      <w:r>
+        <w:t xml:space="preserve"> will begin, the timer will expire, but the current cycle will complete before stopping</w:t>
+      </w:r>
+      <w:r>
+        <w:t>.</w:t>
+      </w:r>
+    </w:p>
+    <w:p>
+      <w:pPr>
+        <w:pStyle w:val="Heading3"/>
+      </w:pPr>
+      <w:r>
+        <w:t xml:space="preserve">Radio Pause: </w:t>
+      </w:r>
+      <w:proofErr w:type="spellStart"/>
+      <w:r>
+        <w:t>Sleep|Awake</w:t>
+      </w:r>
+      <w:proofErr w:type="spellEnd"/>
+    </w:p>
+    <w:p>
+      <w:r>
+        <w:t xml:space="preserve">During pause time the radio can be put into sleep mode. This lowers the power consumption and lets the battery last longer. </w:t>
+      </w:r>
+      <w:proofErr w:type="gramStart"/>
+      <w:r>
+        <w:t>However</w:t>
+      </w:r>
+      <w:proofErr w:type="gramEnd"/>
+      <w:r>
+        <w:t xml:space="preserve"> note that this also means that the DTMF commands are disabled since the radio is asleep!</w:t>
+      </w:r>
+    </w:p>
+    <w:p>
+      <w:pPr>
+        <w:pStyle w:val="Heading2"/>
+      </w:pPr>
+      <w:r>
+        <w:t>+</w:t>
+      </w:r>
+      <w:r>
+        <w:t>More Radio Settings</w:t>
+      </w:r>
+    </w:p>
+    <w:p>
+      <w:pPr>
+        <w:pStyle w:val="Heading3"/>
+      </w:pPr>
+      <w:r>
+        <w:t>RX Offset: -600|0|+600 kHz</w:t>
+      </w:r>
+    </w:p>
+    <w:p>
+      <w:r>
+        <w:t>This is the frequency offset from the transmit frequency that the radio uses to receive DTMF commands</w:t>
+      </w:r>
+      <w:r>
+        <w:t>. An offset is recommended. If 0 is used the radio will only listen when it isn’t sending. It has not been tested if it listens during sending when the offset is not 0.</w:t>
+      </w:r>
+    </w:p>
+    <w:p>
+      <w:pPr>
+        <w:pStyle w:val="Heading3"/>
+      </w:pPr>
+      <w:r>
         <w:lastRenderedPageBreak/>
-        <w:t>TX Send Min: 10-90 Sec</w:t>
-      </w:r>
-    </w:p>
-    <w:p>
-      <w:r>
-        <w:t>In random mode this is the minimum send time.</w:t>
+        <w:t>Bandwidth: 12.5|</w:t>
+      </w:r>
+      <w:r>
+        <w:t>25 kHz</w:t>
+      </w:r>
+    </w:p>
+    <w:p>
+      <w:r>
+        <w:t>This sets the radio bandwidth</w:t>
+      </w:r>
+      <w:r>
+        <w:t>. It has not been tested much to see what effect it has on performance yet.</w:t>
       </w:r>
     </w:p>
     <w:p>
@@ -2870,18 +3051,21 @@
         <w:pStyle w:val="Heading3"/>
       </w:pPr>
       <w:r>
-        <w:t xml:space="preserve">TX Send Max: </w:t>
-      </w:r>
-      <w:r>
-        <w:t>10-90 Sec</w:t>
-      </w:r>
-    </w:p>
-    <w:p>
-      <w:r>
-        <w:t xml:space="preserve">In </w:t>
-      </w:r>
-      <w:r>
-        <w:t>random mode this is the maximum send time.</w:t>
+        <w:t>CTCSS/DCS: CTCSS|DCS</w:t>
+      </w:r>
+    </w:p>
+    <w:p>
+      <w:r>
+        <w:t xml:space="preserve">This sets the </w:t>
+      </w:r>
+      <w:r>
+        <w:t>un-squelch</w:t>
+      </w:r>
+      <w:r>
+        <w:t xml:space="preserve"> values</w:t>
+      </w:r>
+      <w:r>
+        <w:t xml:space="preserve"> for either the analog or digital versions.</w:t>
       </w:r>
     </w:p>
     <w:p>
@@ -2889,12 +3073,24 @@
         <w:pStyle w:val="Heading3"/>
       </w:pPr>
       <w:r>
-        <w:t>TX Pause Min: 10-1200 Sec</w:t>
-      </w:r>
-    </w:p>
-    <w:p>
-      <w:r>
-        <w:t>In random mode this is the minimum pause time.</w:t>
+        <w:t>TX CTCSS:</w:t>
+      </w:r>
+      <w:r>
+        <w:t xml:space="preserve"> None</w:t>
+      </w:r>
+      <w:r>
+        <w:t>|</w:t>
+      </w:r>
+      <w:r>
+        <w:t>67-</w:t>
+      </w:r>
+      <w:r>
+        <w:t>250.3</w:t>
+      </w:r>
+    </w:p>
+    <w:p>
+      <w:r>
+        <w:t>Analog un-squelch frequencies sent out.</w:t>
       </w:r>
     </w:p>
     <w:p>
@@ -2902,12 +3098,15 @@
         <w:pStyle w:val="Heading3"/>
       </w:pPr>
       <w:r>
-        <w:t>TX Pause Max: 10-1200 Sec</w:t>
-      </w:r>
-    </w:p>
-    <w:p>
-      <w:r>
-        <w:t>In random mode this is the maximum pause time.</w:t>
+        <w:t>RX CTCSS:</w:t>
+      </w:r>
+      <w:r>
+        <w:t xml:space="preserve"> None|67-250.3</w:t>
+      </w:r>
+    </w:p>
+    <w:p>
+      <w:r>
+        <w:t>Analog un-squelch frequency for receiving.</w:t>
       </w:r>
     </w:p>
     <w:p>
@@ -2915,512 +3114,338 @@
         <w:pStyle w:val="Heading3"/>
       </w:pPr>
       <w:r>
-        <w:t xml:space="preserve">TX Stop: </w:t>
+        <w:t>TX DCS:</w:t>
+      </w:r>
+      <w:r>
+        <w:t xml:space="preserve"> None|023-754</w:t>
+      </w:r>
+    </w:p>
+    <w:p>
+      <w:r>
+        <w:t>Digital un-squelch value for sending.</w:t>
+      </w:r>
+    </w:p>
+    <w:p>
+      <w:pPr>
+        <w:pStyle w:val="Heading3"/>
+      </w:pPr>
+      <w:r>
+        <w:t>TX I/N: I|N</w:t>
+      </w:r>
+    </w:p>
+    <w:p>
+      <w:r>
+        <w:t>The digital I or N value for sending.</w:t>
+      </w:r>
+    </w:p>
+    <w:p>
+      <w:pPr>
+        <w:pStyle w:val="Heading3"/>
+      </w:pPr>
+      <w:r>
+        <w:t>RX DCS: None|023-754</w:t>
+      </w:r>
+    </w:p>
+    <w:p>
+      <w:r>
+        <w:t>Digital un-squelch value for receiving.</w:t>
+      </w:r>
+    </w:p>
+    <w:p>
+      <w:pPr>
+        <w:pStyle w:val="Heading3"/>
+      </w:pPr>
+      <w:r>
+        <w:t>RX I/N: I|N</w:t>
+      </w:r>
+    </w:p>
+    <w:p>
+      <w:r>
+        <w:t>The digital I or N value for receiving.</w:t>
+      </w:r>
+    </w:p>
+    <w:p>
+      <w:pPr>
+        <w:pStyle w:val="Heading3"/>
+      </w:pPr>
+      <w:r>
+        <w:t>RX Volume:</w:t>
+      </w:r>
+      <w:r>
+        <w:t xml:space="preserve"> 1-6</w:t>
+      </w:r>
+    </w:p>
+    <w:p>
+      <w:r>
+        <w:t>This is the receive volume setting. It affects how well DTMF tones are detected.</w:t>
+      </w:r>
+    </w:p>
+    <w:p>
+      <w:pPr>
+        <w:pStyle w:val="Heading3"/>
+      </w:pPr>
+      <w:r>
+        <w:t>RX Squelch:</w:t>
+      </w:r>
+      <w:r>
+        <w:t xml:space="preserve"> 0-8</w:t>
+      </w:r>
+    </w:p>
+    <w:p>
+      <w:r>
+        <w:t>This affects how much signal is required to receive the DTMF signals.</w:t>
+      </w:r>
+    </w:p>
+    <w:p>
+      <w:pPr>
+        <w:pStyle w:val="Heading2"/>
+      </w:pPr>
+      <w:r>
+        <w:t>Cancel Waits/TX Now</w:t>
+      </w:r>
+    </w:p>
+    <w:p>
+      <w:r>
+        <w:t xml:space="preserve">When the radio is in either send or pause mode this command will cancel the </w:t>
+      </w:r>
+      <w:proofErr w:type="gramStart"/>
+      <w:r>
+        <w:t>timer</w:t>
+      </w:r>
+      <w:proofErr w:type="gramEnd"/>
+      <w:r>
+        <w:t xml:space="preserve"> and the next mo</w:t>
+      </w:r>
+      <w:r>
+        <w:t xml:space="preserve">de will start. For </w:t>
+      </w:r>
+      <w:proofErr w:type="gramStart"/>
+      <w:r>
+        <w:t>example</w:t>
+      </w:r>
+      <w:proofErr w:type="gramEnd"/>
+      <w:r>
+        <w:t xml:space="preserve"> if you want to cancel</w:t>
+      </w:r>
+      <w:r>
+        <w:t xml:space="preserve"> the pause and go to transmit, use this option. It can also be done by long pressing B0.</w:t>
+      </w:r>
+    </w:p>
+    <w:p>
+      <w:pPr>
+        <w:pStyle w:val="Heading2"/>
+      </w:pPr>
+      <w:r>
+        <w:lastRenderedPageBreak/>
+        <w:t>+Saved Settings Files</w:t>
+      </w:r>
+    </w:p>
+    <w:p>
+      <w:r>
+        <w:t>Saved settings files are named files stored on the SD card. They are useful to</w:t>
+      </w:r>
+      <w:r>
+        <w:t xml:space="preserve"> quickly configure the radio for different uses. All values except the battery calibration are affected.</w:t>
+      </w:r>
+    </w:p>
+    <w:p>
+      <w:pPr>
+        <w:pStyle w:val="Heading3"/>
+      </w:pPr>
+      <w:r>
+        <w:t>Create File</w:t>
+      </w:r>
+    </w:p>
+    <w:p>
+      <w:r>
+        <w:t>This prompts the user for a name. The file is then created using the current system settings.</w:t>
+      </w:r>
+    </w:p>
+    <w:p>
+      <w:pPr>
+        <w:pStyle w:val="Heading3"/>
+      </w:pPr>
+      <w:r>
+        <w:t>Save/Update File</w:t>
+      </w:r>
+    </w:p>
+    <w:p>
+      <w:r>
+        <w:t xml:space="preserve">This command saves the current settings into the selected file. If it already </w:t>
+      </w:r>
+      <w:proofErr w:type="gramStart"/>
+      <w:r>
+        <w:t>exists</w:t>
+      </w:r>
+      <w:proofErr w:type="gramEnd"/>
+      <w:r>
+        <w:t xml:space="preserve"> the user will be asked to confirm overwriting the file.</w:t>
+      </w:r>
+    </w:p>
+    <w:p>
+      <w:pPr>
+        <w:pStyle w:val="Heading3"/>
+      </w:pPr>
+      <w:r>
+        <w:t>Load File</w:t>
+      </w:r>
+    </w:p>
+    <w:p>
+      <w:r>
+        <w:t xml:space="preserve">This command asks the user for the name and then sets </w:t>
+      </w:r>
+      <w:proofErr w:type="gramStart"/>
+      <w:r>
+        <w:t>all of</w:t>
+      </w:r>
+      <w:proofErr w:type="gramEnd"/>
+      <w:r>
+        <w:t xml:space="preserve"> the system settings except the battery calibration using the values in the file.</w:t>
+      </w:r>
+    </w:p>
+    <w:p>
+      <w:pPr>
+        <w:pStyle w:val="Heading3"/>
+      </w:pPr>
+      <w:r>
+        <w:t>Delete File</w:t>
+      </w:r>
+    </w:p>
+    <w:p>
+      <w:r>
+        <w:t>The user selects a file from the list and then it can be deleted.</w:t>
+      </w:r>
+    </w:p>
+    <w:p>
+      <w:pPr>
+        <w:pStyle w:val="Heading2"/>
+      </w:pPr>
+      <w:r>
+        <w:t>+System Settings</w:t>
+      </w:r>
+    </w:p>
+    <w:p>
+      <w:pPr>
+        <w:pStyle w:val="Heading3"/>
+      </w:pPr>
+      <w:r>
+        <w:t>+Display</w:t>
+      </w:r>
+      <w:r>
+        <w:t xml:space="preserve"> Settings</w:t>
+      </w:r>
+    </w:p>
+    <w:p>
+      <w:pPr>
+        <w:pStyle w:val="Heading4"/>
+      </w:pPr>
+      <w:r>
+        <w:t xml:space="preserve">Dimming Mode: </w:t>
       </w:r>
       <w:proofErr w:type="spellStart"/>
       <w:r>
-        <w:t>Immediate|Finish</w:t>
+        <w:t>None</w:t>
+      </w:r>
+      <w:r>
+        <w:t>|Timer</w:t>
       </w:r>
       <w:proofErr w:type="spellEnd"/>
-      <w:r>
-        <w:t xml:space="preserve"> Cycle</w:t>
-      </w:r>
-    </w:p>
-    <w:p>
-      <w:r>
-        <w:t xml:space="preserve">During transmit time the Beacon, Call Sign, and Audio are continuously sent. At the end of the transmission time this option controls whether the transmission stops immediately </w:t>
+    </w:p>
+    <w:p>
+      <w:r>
+        <w:t xml:space="preserve">The display can be set to dim automatically after a specified number of seconds. This is used to save battery power since the backlight </w:t>
+      </w:r>
+      <w:r>
+        <w:t>uses a significant amount.</w:t>
+      </w:r>
+    </w:p>
+    <w:p>
+      <w:pPr>
+        <w:pStyle w:val="Heading4"/>
+      </w:pPr>
+      <w:r>
+        <w:t>Bright Value: 1-100</w:t>
+      </w:r>
+      <w:r>
+        <w:t>%</w:t>
+      </w:r>
+    </w:p>
+    <w:p>
+      <w:r>
+        <w:t>Set the display brightness value.</w:t>
+      </w:r>
+    </w:p>
+    <w:p>
+      <w:pPr>
+        <w:pStyle w:val="Heading4"/>
+      </w:pPr>
+      <w:r>
+        <w:t xml:space="preserve">Dim Value: </w:t>
+      </w:r>
+      <w:r>
+        <w:t>0-100%</w:t>
+      </w:r>
+    </w:p>
+    <w:p>
+      <w:r>
+        <w:t xml:space="preserve">Set the display brightness after the </w:t>
+      </w:r>
+      <w:r>
+        <w:t>timer below expires.</w:t>
+      </w:r>
+    </w:p>
+    <w:p>
+      <w:pPr>
+        <w:pStyle w:val="Heading4"/>
+      </w:pPr>
+      <w:r>
+        <w:t>Display Dim Time:</w:t>
+      </w:r>
+      <w:r>
+        <w:t xml:space="preserve"> 0-120 S</w:t>
+      </w:r>
+    </w:p>
+    <w:p>
+      <w:r>
+        <w:t>Specify the time until the display changes to dim mode.</w:t>
+      </w:r>
+    </w:p>
+    <w:p>
+      <w:pPr>
+        <w:pStyle w:val="Heading4"/>
+      </w:pPr>
+      <w:r>
+        <w:t>+Sideways Scroll Settings</w:t>
+      </w:r>
+    </w:p>
+    <w:p>
+      <w:r>
+        <w:t xml:space="preserve">Lines of text that </w:t>
       </w:r>
       <w:proofErr w:type="gramStart"/>
       <w:r>
-        <w:t>of</w:t>
+        <w:t>too</w:t>
       </w:r>
       <w:proofErr w:type="gramEnd"/>
       <w:r>
-        <w:t xml:space="preserve"> waits to stop until the entire cycle is finished.</w:t>
-      </w:r>
-    </w:p>
-    <w:p/>
-    <w:p>
-      <w:r>
-        <w:t>A clever use of this command</w:t>
-      </w:r>
-      <w:r>
-        <w:t xml:space="preserve"> allows for only one cycle of beacon, ID, and music to be sent during each transmission time. Set the transmit</w:t>
-      </w:r>
-      <w:r>
-        <w:t xml:space="preserve"> time to something less than</w:t>
-      </w:r>
-      <w:r>
-        <w:t xml:space="preserve"> the time to perform a complete cycle and set this option to “Finish Cycle”. The </w:t>
-      </w:r>
-      <w:proofErr w:type="gramStart"/>
-      <w:r>
-        <w:t>transmit  cycle</w:t>
-      </w:r>
-      <w:proofErr w:type="gramEnd"/>
-      <w:r>
-        <w:t xml:space="preserve"> will begin, the timer will expire, but the current cycle will complete before stopping</w:t>
-      </w:r>
-      <w:r>
-        <w:t>.</w:t>
-      </w:r>
-    </w:p>
-    <w:p>
-      <w:pPr>
-        <w:pStyle w:val="Heading3"/>
-      </w:pPr>
-      <w:r>
-        <w:t xml:space="preserve">Radio Pause: </w:t>
-      </w:r>
-      <w:proofErr w:type="spellStart"/>
-      <w:r>
-        <w:t>Sleep|Awake</w:t>
-      </w:r>
-      <w:proofErr w:type="spellEnd"/>
-    </w:p>
-    <w:p>
-      <w:r>
-        <w:t xml:space="preserve">During pause time the radio can be put into sleep mode. This lowers the power consumption and lets the battery last longer. </w:t>
-      </w:r>
-      <w:proofErr w:type="gramStart"/>
-      <w:r>
-        <w:t>However</w:t>
-      </w:r>
-      <w:proofErr w:type="gramEnd"/>
-      <w:r>
-        <w:t xml:space="preserve"> note that this also means that the DTMF commands are disabled since the radio is asleep!</w:t>
-      </w:r>
-    </w:p>
-    <w:p>
-      <w:pPr>
-        <w:pStyle w:val="Heading2"/>
-      </w:pPr>
-      <w:r>
-        <w:t>+</w:t>
-      </w:r>
-      <w:r>
-        <w:t>More Radio Settings</w:t>
-      </w:r>
-    </w:p>
-    <w:p>
-      <w:pPr>
-        <w:pStyle w:val="Heading3"/>
-      </w:pPr>
-      <w:r>
-        <w:t>RX Offset: -600|0|+600 kHz</w:t>
-      </w:r>
-    </w:p>
-    <w:p>
-      <w:r>
-        <w:t>This is the frequency offset from the transmit frequency that the radio uses to receive DTMF commands</w:t>
-      </w:r>
-      <w:r>
-        <w:t>. An offset is recommended. If 0 is used the radio will only listen when it isn’t sending. It has not been tested if it listens during sending when the offset is not 0.</w:t>
-      </w:r>
-    </w:p>
-    <w:p>
-      <w:pPr>
-        <w:pStyle w:val="Heading3"/>
-      </w:pPr>
-      <w:r>
-        <w:t>Bandwidth: 12.5|</w:t>
-      </w:r>
-      <w:r>
-        <w:t>25 kHz</w:t>
-      </w:r>
-    </w:p>
-    <w:p>
-      <w:r>
-        <w:t>This sets the radio bandwidth</w:t>
-      </w:r>
-      <w:r>
-        <w:t>. It has not been tested much to see what effect it has on performance yet.</w:t>
-      </w:r>
-    </w:p>
-    <w:p>
-      <w:pPr>
-        <w:pStyle w:val="Heading3"/>
+        <w:t xml:space="preserve"> long for the display will scroll back and forth. The following settings control the speed.</w:t>
+      </w:r>
+    </w:p>
+    <w:p>
+      <w:pPr>
+        <w:pStyle w:val="Heading5"/>
       </w:pPr>
       <w:r>
         <w:lastRenderedPageBreak/>
-        <w:t>CTCSS/DCS: CTCSS|DCS</w:t>
-      </w:r>
-    </w:p>
-    <w:p>
-      <w:r>
-        <w:t xml:space="preserve">This sets the </w:t>
-      </w:r>
-      <w:r>
-        <w:t>un-squelch</w:t>
-      </w:r>
-      <w:r>
-        <w:t xml:space="preserve"> values</w:t>
-      </w:r>
-      <w:r>
-        <w:t xml:space="preserve"> for either the analog or digital versions.</w:t>
-      </w:r>
-    </w:p>
-    <w:p>
-      <w:pPr>
-        <w:pStyle w:val="Heading3"/>
-      </w:pPr>
-      <w:r>
-        <w:t>TX CTCSS:</w:t>
-      </w:r>
-      <w:r>
-        <w:t xml:space="preserve"> None</w:t>
-      </w:r>
-      <w:r>
-        <w:t>|</w:t>
-      </w:r>
-      <w:r>
-        <w:t>67-</w:t>
-      </w:r>
-      <w:r>
-        <w:t>250.3</w:t>
-      </w:r>
-    </w:p>
-    <w:p>
-      <w:r>
-        <w:t>Analog un-squelch frequencies sent out.</w:t>
-      </w:r>
-    </w:p>
-    <w:p>
-      <w:pPr>
-        <w:pStyle w:val="Heading3"/>
-      </w:pPr>
-      <w:r>
-        <w:t>RX CTCSS:</w:t>
-      </w:r>
-      <w:r>
-        <w:t xml:space="preserve"> None|67-250.3</w:t>
-      </w:r>
-    </w:p>
-    <w:p>
-      <w:r>
-        <w:t>Analog un-squelch frequency for receiving.</w:t>
-      </w:r>
-    </w:p>
-    <w:p>
-      <w:pPr>
-        <w:pStyle w:val="Heading3"/>
-      </w:pPr>
-      <w:r>
-        <w:t>TX DCS:</w:t>
-      </w:r>
-      <w:r>
-        <w:t xml:space="preserve"> None|023-754</w:t>
-      </w:r>
-    </w:p>
-    <w:p>
-      <w:r>
-        <w:t>Digital un-squelch value for sending.</w:t>
-      </w:r>
-    </w:p>
-    <w:p>
-      <w:pPr>
-        <w:pStyle w:val="Heading3"/>
-      </w:pPr>
-      <w:r>
-        <w:t>TX I/N: I|N</w:t>
-      </w:r>
-    </w:p>
-    <w:p>
-      <w:r>
-        <w:t>The digital I or N value for sending.</w:t>
-      </w:r>
-    </w:p>
-    <w:p>
-      <w:pPr>
-        <w:pStyle w:val="Heading3"/>
-      </w:pPr>
-      <w:r>
-        <w:t>RX DCS: None|023-754</w:t>
-      </w:r>
-    </w:p>
-    <w:p>
-      <w:r>
-        <w:t>Digital un-squelch value for receiving.</w:t>
-      </w:r>
-    </w:p>
-    <w:p>
-      <w:pPr>
-        <w:pStyle w:val="Heading3"/>
-      </w:pPr>
-      <w:r>
-        <w:t>RX I/N: I|N</w:t>
-      </w:r>
-    </w:p>
-    <w:p>
-      <w:r>
-        <w:t>The digital I or N value for receiving.</w:t>
-      </w:r>
-    </w:p>
-    <w:p>
-      <w:pPr>
-        <w:pStyle w:val="Heading3"/>
-      </w:pPr>
-      <w:r>
-        <w:t>RX Volume:</w:t>
-      </w:r>
-      <w:r>
-        <w:t xml:space="preserve"> 1-6</w:t>
-      </w:r>
-    </w:p>
-    <w:p>
-      <w:r>
-        <w:t>This is the receive volume setting. It affects how well DTMF tones are detected.</w:t>
-      </w:r>
-    </w:p>
-    <w:p>
-      <w:pPr>
-        <w:pStyle w:val="Heading3"/>
-      </w:pPr>
-      <w:r>
-        <w:t>RX Squelch:</w:t>
-      </w:r>
-      <w:r>
-        <w:t xml:space="preserve"> 0-8</w:t>
-      </w:r>
-    </w:p>
-    <w:p>
-      <w:r>
-        <w:t>This affects how much signal is required to receive the DTMF signals.</w:t>
-      </w:r>
-    </w:p>
-    <w:p>
-      <w:pPr>
-        <w:pStyle w:val="Heading2"/>
-      </w:pPr>
-      <w:r>
-        <w:t>Cancel Waits/TX Now</w:t>
-      </w:r>
-    </w:p>
-    <w:p>
-      <w:r>
-        <w:t xml:space="preserve">When the radio is in either send or pause mode this command will cancel the </w:t>
-      </w:r>
-      <w:proofErr w:type="gramStart"/>
-      <w:r>
-        <w:t>timer</w:t>
-      </w:r>
-      <w:proofErr w:type="gramEnd"/>
-      <w:r>
-        <w:t xml:space="preserve"> and the next mo</w:t>
-      </w:r>
-      <w:r>
-        <w:t xml:space="preserve">de will start. For </w:t>
-      </w:r>
-      <w:proofErr w:type="gramStart"/>
-      <w:r>
-        <w:t>example</w:t>
-      </w:r>
-      <w:proofErr w:type="gramEnd"/>
-      <w:r>
-        <w:t xml:space="preserve"> if you want to cancel</w:t>
-      </w:r>
-      <w:r>
-        <w:t xml:space="preserve"> the pause and go to transmit, use this option. It can also be done by long pressing B0.</w:t>
-      </w:r>
-    </w:p>
-    <w:p>
-      <w:pPr>
-        <w:pStyle w:val="Heading2"/>
-      </w:pPr>
-      <w:r>
-        <w:t>+Saved Settings Files</w:t>
-      </w:r>
-    </w:p>
-    <w:p>
-      <w:r>
-        <w:t>Saved settings files are named files stored on the SD card. They are useful to</w:t>
-      </w:r>
-      <w:r>
-        <w:t xml:space="preserve"> quickly configure the radio for different uses. All values except the battery calibration are affected.</w:t>
-      </w:r>
-    </w:p>
-    <w:p>
-      <w:pPr>
-        <w:pStyle w:val="Heading3"/>
-      </w:pPr>
-      <w:r>
-        <w:lastRenderedPageBreak/>
-        <w:t>Create File</w:t>
-      </w:r>
-    </w:p>
-    <w:p>
-      <w:r>
-        <w:t>This prompts the user for a name. The file is then created using the current system settings.</w:t>
-      </w:r>
-    </w:p>
-    <w:p>
-      <w:pPr>
-        <w:pStyle w:val="Heading3"/>
-      </w:pPr>
-      <w:r>
-        <w:t>Save/Update File</w:t>
-      </w:r>
-    </w:p>
-    <w:p>
-      <w:r>
-        <w:t xml:space="preserve">This command saves the current settings into the selected file. If it already </w:t>
-      </w:r>
-      <w:proofErr w:type="gramStart"/>
-      <w:r>
-        <w:t>exists</w:t>
-      </w:r>
-      <w:proofErr w:type="gramEnd"/>
-      <w:r>
-        <w:t xml:space="preserve"> the user will be asked to confirm overwriting the file.</w:t>
-      </w:r>
-    </w:p>
-    <w:p>
-      <w:pPr>
-        <w:pStyle w:val="Heading3"/>
-      </w:pPr>
-      <w:r>
-        <w:t>Load File</w:t>
-      </w:r>
-    </w:p>
-    <w:p>
-      <w:r>
-        <w:t xml:space="preserve">This command asks the user for the name and then sets </w:t>
-      </w:r>
-      <w:proofErr w:type="gramStart"/>
-      <w:r>
-        <w:t>all of</w:t>
-      </w:r>
-      <w:proofErr w:type="gramEnd"/>
-      <w:r>
-        <w:t xml:space="preserve"> the system settings except the battery calibration using the values in the file.</w:t>
-      </w:r>
-    </w:p>
-    <w:p>
-      <w:pPr>
-        <w:pStyle w:val="Heading3"/>
-      </w:pPr>
-      <w:r>
-        <w:t>Delete File</w:t>
-      </w:r>
-    </w:p>
-    <w:p>
-      <w:r>
-        <w:t>The user selects a file from the list and then it can be deleted.</w:t>
-      </w:r>
-    </w:p>
-    <w:p>
-      <w:pPr>
-        <w:pStyle w:val="Heading2"/>
-      </w:pPr>
-      <w:r>
-        <w:t>+System Settings</w:t>
-      </w:r>
-    </w:p>
-    <w:p>
-      <w:pPr>
-        <w:pStyle w:val="Heading3"/>
-      </w:pPr>
-      <w:r>
-        <w:t>+Display</w:t>
-      </w:r>
-      <w:r>
-        <w:t xml:space="preserve"> Settings</w:t>
-      </w:r>
-    </w:p>
-    <w:p>
-      <w:pPr>
-        <w:pStyle w:val="Heading4"/>
-      </w:pPr>
-      <w:r>
-        <w:t xml:space="preserve">Dimming Mode: </w:t>
-      </w:r>
-      <w:proofErr w:type="spellStart"/>
-      <w:r>
-        <w:t>None</w:t>
-      </w:r>
-      <w:r>
-        <w:t>|Timer</w:t>
-      </w:r>
-      <w:proofErr w:type="spellEnd"/>
-    </w:p>
-    <w:p>
-      <w:r>
-        <w:t xml:space="preserve">The display can be set to dim automatically after a specified number of seconds. This is used to save battery power since the backlight </w:t>
-      </w:r>
-      <w:r>
-        <w:t>uses a significant amount.</w:t>
-      </w:r>
-    </w:p>
-    <w:p>
-      <w:pPr>
-        <w:pStyle w:val="Heading4"/>
-      </w:pPr>
-      <w:r>
-        <w:t>Bright Value: 1-100</w:t>
-      </w:r>
-      <w:r>
-        <w:t>%</w:t>
-      </w:r>
-    </w:p>
-    <w:p>
-      <w:r>
-        <w:t>Set the display brightness value.</w:t>
-      </w:r>
-    </w:p>
-    <w:p>
-      <w:pPr>
-        <w:pStyle w:val="Heading4"/>
-      </w:pPr>
-      <w:r>
-        <w:t xml:space="preserve">Dim Value: </w:t>
-      </w:r>
-      <w:r>
-        <w:t>0-100%</w:t>
-      </w:r>
-    </w:p>
-    <w:p>
-      <w:r>
-        <w:t xml:space="preserve">Set the display brightness after the </w:t>
-      </w:r>
-      <w:r>
-        <w:t>timer below expires.</w:t>
-      </w:r>
-    </w:p>
-    <w:p>
-      <w:pPr>
-        <w:pStyle w:val="Heading4"/>
-      </w:pPr>
-      <w:r>
-        <w:t>Display Dim Time:</w:t>
-      </w:r>
-      <w:r>
-        <w:t xml:space="preserve"> 0-120 S</w:t>
-      </w:r>
-    </w:p>
-    <w:p>
-      <w:r>
-        <w:t>Specify the time until the display changes to dim mode.</w:t>
-      </w:r>
-    </w:p>
-    <w:p>
-      <w:pPr>
-        <w:pStyle w:val="Heading4"/>
-      </w:pPr>
-      <w:r>
-        <w:t>+Sideways Scroll Settings</w:t>
-      </w:r>
-    </w:p>
-    <w:p>
-      <w:r>
-        <w:t xml:space="preserve">Lines of text that </w:t>
-      </w:r>
-      <w:proofErr w:type="gramStart"/>
-      <w:r>
-        <w:t>too</w:t>
-      </w:r>
-      <w:proofErr w:type="gramEnd"/>
-      <w:r>
-        <w:t xml:space="preserve"> long for the display will scroll back and forth. The following settings control the speed.</w:t>
+        <w:t xml:space="preserve">Speed: </w:t>
+      </w:r>
+      <w:r>
+        <w:t>1-1000 mS</w:t>
+      </w:r>
+    </w:p>
+    <w:p>
+      <w:r>
+        <w:t>Controls the speed of text moving to the left.</w:t>
       </w:r>
     </w:p>
     <w:p>
@@ -3428,23 +3453,6 @@
         <w:pStyle w:val="Heading5"/>
       </w:pPr>
       <w:r>
-        <w:t xml:space="preserve">Speed: </w:t>
-      </w:r>
-      <w:r>
-        <w:t>1-1000 mS</w:t>
-      </w:r>
-    </w:p>
-    <w:p>
-      <w:r>
-        <w:t>Controls the speed of text moving to the left.</w:t>
-      </w:r>
-    </w:p>
-    <w:p>
-      <w:pPr>
-        <w:pStyle w:val="Heading5"/>
-      </w:pPr>
-      <w:r>
-        <w:lastRenderedPageBreak/>
         <w:t>Pause: 1-100</w:t>
       </w:r>
       <w:r>
@@ -4987,6 +4995,118 @@
     </w:lvl>
   </w:abstractNum>
   <w:abstractNum w:abstractNumId="9" w15:restartNumberingAfterBreak="0">
+    <w:nsid w:val="09D1555E"/>
+    <w:multiLevelType w:val="hybridMultilevel"/>
+    <w:tmpl w:val="F3D6DB74"/>
+    <w:lvl w:ilvl="0" w:tplc="3134FDCA">
+      <w:numFmt w:val="bullet"/>
+      <w:lvlText w:val="-"/>
+      <w:lvlJc w:val="left"/>
+      <w:pPr>
+        <w:ind w:left="720" w:hanging="360"/>
+      </w:pPr>
+      <w:rPr>
+        <w:rFonts w:ascii="Arial" w:eastAsia="Arial" w:hAnsi="Arial" w:cs="Arial" w:hint="default"/>
+      </w:rPr>
+    </w:lvl>
+    <w:lvl w:ilvl="1" w:tplc="04090003" w:tentative="1">
+      <w:start w:val="1"/>
+      <w:numFmt w:val="bullet"/>
+      <w:lvlText w:val="o"/>
+      <w:lvlJc w:val="left"/>
+      <w:pPr>
+        <w:ind w:left="1440" w:hanging="360"/>
+      </w:pPr>
+      <w:rPr>
+        <w:rFonts w:ascii="Courier New" w:hAnsi="Courier New" w:cs="Courier New" w:hint="default"/>
+      </w:rPr>
+    </w:lvl>
+    <w:lvl w:ilvl="2" w:tplc="04090005" w:tentative="1">
+      <w:start w:val="1"/>
+      <w:numFmt w:val="bullet"/>
+      <w:lvlText w:val=""/>
+      <w:lvlJc w:val="left"/>
+      <w:pPr>
+        <w:ind w:left="2160" w:hanging="360"/>
+      </w:pPr>
+      <w:rPr>
+        <w:rFonts w:ascii="Wingdings" w:hAnsi="Wingdings" w:hint="default"/>
+      </w:rPr>
+    </w:lvl>
+    <w:lvl w:ilvl="3" w:tplc="04090001" w:tentative="1">
+      <w:start w:val="1"/>
+      <w:numFmt w:val="bullet"/>
+      <w:lvlText w:val=""/>
+      <w:lvlJc w:val="left"/>
+      <w:pPr>
+        <w:ind w:left="2880" w:hanging="360"/>
+      </w:pPr>
+      <w:rPr>
+        <w:rFonts w:ascii="Symbol" w:hAnsi="Symbol" w:hint="default"/>
+      </w:rPr>
+    </w:lvl>
+    <w:lvl w:ilvl="4" w:tplc="04090003" w:tentative="1">
+      <w:start w:val="1"/>
+      <w:numFmt w:val="bullet"/>
+      <w:lvlText w:val="o"/>
+      <w:lvlJc w:val="left"/>
+      <w:pPr>
+        <w:ind w:left="3600" w:hanging="360"/>
+      </w:pPr>
+      <w:rPr>
+        <w:rFonts w:ascii="Courier New" w:hAnsi="Courier New" w:cs="Courier New" w:hint="default"/>
+      </w:rPr>
+    </w:lvl>
+    <w:lvl w:ilvl="5" w:tplc="04090005" w:tentative="1">
+      <w:start w:val="1"/>
+      <w:numFmt w:val="bullet"/>
+      <w:lvlText w:val=""/>
+      <w:lvlJc w:val="left"/>
+      <w:pPr>
+        <w:ind w:left="4320" w:hanging="360"/>
+      </w:pPr>
+      <w:rPr>
+        <w:rFonts w:ascii="Wingdings" w:hAnsi="Wingdings" w:hint="default"/>
+      </w:rPr>
+    </w:lvl>
+    <w:lvl w:ilvl="6" w:tplc="04090001" w:tentative="1">
+      <w:start w:val="1"/>
+      <w:numFmt w:val="bullet"/>
+      <w:lvlText w:val=""/>
+      <w:lvlJc w:val="left"/>
+      <w:pPr>
+        <w:ind w:left="5040" w:hanging="360"/>
+      </w:pPr>
+      <w:rPr>
+        <w:rFonts w:ascii="Symbol" w:hAnsi="Symbol" w:hint="default"/>
+      </w:rPr>
+    </w:lvl>
+    <w:lvl w:ilvl="7" w:tplc="04090003" w:tentative="1">
+      <w:start w:val="1"/>
+      <w:numFmt w:val="bullet"/>
+      <w:lvlText w:val="o"/>
+      <w:lvlJc w:val="left"/>
+      <w:pPr>
+        <w:ind w:left="5760" w:hanging="360"/>
+      </w:pPr>
+      <w:rPr>
+        <w:rFonts w:ascii="Courier New" w:hAnsi="Courier New" w:cs="Courier New" w:hint="default"/>
+      </w:rPr>
+    </w:lvl>
+    <w:lvl w:ilvl="8" w:tplc="04090005" w:tentative="1">
+      <w:start w:val="1"/>
+      <w:numFmt w:val="bullet"/>
+      <w:lvlText w:val=""/>
+      <w:lvlJc w:val="left"/>
+      <w:pPr>
+        <w:ind w:left="6480" w:hanging="360"/>
+      </w:pPr>
+      <w:rPr>
+        <w:rFonts w:ascii="Wingdings" w:hAnsi="Wingdings" w:hint="default"/>
+      </w:rPr>
+    </w:lvl>
+  </w:abstractNum>
+  <w:abstractNum w:abstractNumId="10" w15:restartNumberingAfterBreak="0">
     <w:nsid w:val="0A1A3E32"/>
     <w:multiLevelType w:val="hybridMultilevel"/>
     <w:tmpl w:val="0CBCE04C"/>
@@ -5098,7 +5218,7 @@
       </w:rPr>
     </w:lvl>
   </w:abstractNum>
-  <w:abstractNum w:abstractNumId="10" w15:restartNumberingAfterBreak="0">
+  <w:abstractNum w:abstractNumId="11" w15:restartNumberingAfterBreak="0">
     <w:nsid w:val="0DE374E2"/>
     <w:multiLevelType w:val="hybridMultilevel"/>
     <w:tmpl w:val="48EE269C"/>
@@ -5210,7 +5330,7 @@
       </w:rPr>
     </w:lvl>
   </w:abstractNum>
-  <w:abstractNum w:abstractNumId="11" w15:restartNumberingAfterBreak="0">
+  <w:abstractNum w:abstractNumId="12" w15:restartNumberingAfterBreak="0">
     <w:nsid w:val="0E807CF8"/>
     <w:multiLevelType w:val="hybridMultilevel"/>
     <w:tmpl w:val="983EF9CA"/>
@@ -5322,7 +5442,7 @@
       </w:rPr>
     </w:lvl>
   </w:abstractNum>
-  <w:abstractNum w:abstractNumId="12" w15:restartNumberingAfterBreak="0">
+  <w:abstractNum w:abstractNumId="13" w15:restartNumberingAfterBreak="0">
     <w:nsid w:val="0F8101D2"/>
     <w:multiLevelType w:val="multilevel"/>
     <w:tmpl w:val="1BFAB1EC"/>
@@ -5435,7 +5555,7 @@
       </w:rPr>
     </w:lvl>
   </w:abstractNum>
-  <w:abstractNum w:abstractNumId="13" w15:restartNumberingAfterBreak="0">
+  <w:abstractNum w:abstractNumId="14" w15:restartNumberingAfterBreak="0">
     <w:nsid w:val="10DC0D9F"/>
     <w:multiLevelType w:val="hybridMultilevel"/>
     <w:tmpl w:val="F0987B8C"/>
@@ -5547,7 +5667,7 @@
       </w:rPr>
     </w:lvl>
   </w:abstractNum>
-  <w:abstractNum w:abstractNumId="14" w15:restartNumberingAfterBreak="0">
+  <w:abstractNum w:abstractNumId="15" w15:restartNumberingAfterBreak="0">
     <w:nsid w:val="11DD04A8"/>
     <w:multiLevelType w:val="hybridMultilevel"/>
     <w:tmpl w:val="DD22F0A0"/>
@@ -5659,7 +5779,7 @@
       </w:rPr>
     </w:lvl>
   </w:abstractNum>
-  <w:abstractNum w:abstractNumId="15" w15:restartNumberingAfterBreak="0">
+  <w:abstractNum w:abstractNumId="16" w15:restartNumberingAfterBreak="0">
     <w:nsid w:val="124F1E1F"/>
     <w:multiLevelType w:val="hybridMultilevel"/>
     <w:tmpl w:val="7B28089C"/>
@@ -5771,7 +5891,7 @@
       </w:rPr>
     </w:lvl>
   </w:abstractNum>
-  <w:abstractNum w:abstractNumId="16" w15:restartNumberingAfterBreak="0">
+  <w:abstractNum w:abstractNumId="17" w15:restartNumberingAfterBreak="0">
     <w:nsid w:val="14F956A8"/>
     <w:multiLevelType w:val="multilevel"/>
     <w:tmpl w:val="5FFEEA20"/>
@@ -5884,7 +6004,7 @@
       </w:rPr>
     </w:lvl>
   </w:abstractNum>
-  <w:abstractNum w:abstractNumId="17" w15:restartNumberingAfterBreak="0">
+  <w:abstractNum w:abstractNumId="18" w15:restartNumberingAfterBreak="0">
     <w:nsid w:val="151B6300"/>
     <w:multiLevelType w:val="hybridMultilevel"/>
     <w:tmpl w:val="4678C3DC"/>
@@ -5996,7 +6116,7 @@
       </w:rPr>
     </w:lvl>
   </w:abstractNum>
-  <w:abstractNum w:abstractNumId="18" w15:restartNumberingAfterBreak="0">
+  <w:abstractNum w:abstractNumId="19" w15:restartNumberingAfterBreak="0">
     <w:nsid w:val="155F1692"/>
     <w:multiLevelType w:val="hybridMultilevel"/>
     <w:tmpl w:val="6E90EEE6"/>
@@ -6108,7 +6228,7 @@
       </w:rPr>
     </w:lvl>
   </w:abstractNum>
-  <w:abstractNum w:abstractNumId="19" w15:restartNumberingAfterBreak="0">
+  <w:abstractNum w:abstractNumId="20" w15:restartNumberingAfterBreak="0">
     <w:nsid w:val="16474E7D"/>
     <w:multiLevelType w:val="hybridMultilevel"/>
     <w:tmpl w:val="CD52420E"/>
@@ -6220,7 +6340,7 @@
       </w:rPr>
     </w:lvl>
   </w:abstractNum>
-  <w:abstractNum w:abstractNumId="20" w15:restartNumberingAfterBreak="0">
+  <w:abstractNum w:abstractNumId="21" w15:restartNumberingAfterBreak="0">
     <w:nsid w:val="16752B7E"/>
     <w:multiLevelType w:val="hybridMultilevel"/>
     <w:tmpl w:val="2F74FB54"/>
@@ -6332,7 +6452,7 @@
       </w:rPr>
     </w:lvl>
   </w:abstractNum>
-  <w:abstractNum w:abstractNumId="21" w15:restartNumberingAfterBreak="0">
+  <w:abstractNum w:abstractNumId="22" w15:restartNumberingAfterBreak="0">
     <w:nsid w:val="16EF7843"/>
     <w:multiLevelType w:val="hybridMultilevel"/>
     <w:tmpl w:val="2F808D12"/>
@@ -6444,7 +6564,7 @@
       </w:rPr>
     </w:lvl>
   </w:abstractNum>
-  <w:abstractNum w:abstractNumId="22" w15:restartNumberingAfterBreak="0">
+  <w:abstractNum w:abstractNumId="23" w15:restartNumberingAfterBreak="0">
     <w:nsid w:val="19743067"/>
     <w:multiLevelType w:val="hybridMultilevel"/>
     <w:tmpl w:val="E2FC694C"/>
@@ -6556,7 +6676,7 @@
       </w:rPr>
     </w:lvl>
   </w:abstractNum>
-  <w:abstractNum w:abstractNumId="23" w15:restartNumberingAfterBreak="0">
+  <w:abstractNum w:abstractNumId="24" w15:restartNumberingAfterBreak="0">
     <w:nsid w:val="19D5464F"/>
     <w:multiLevelType w:val="hybridMultilevel"/>
     <w:tmpl w:val="068EEEBC"/>
@@ -6668,7 +6788,7 @@
       </w:rPr>
     </w:lvl>
   </w:abstractNum>
-  <w:abstractNum w:abstractNumId="24" w15:restartNumberingAfterBreak="0">
+  <w:abstractNum w:abstractNumId="25" w15:restartNumberingAfterBreak="0">
     <w:nsid w:val="1B343D1F"/>
     <w:multiLevelType w:val="hybridMultilevel"/>
     <w:tmpl w:val="F530BB0A"/>
@@ -6780,7 +6900,7 @@
       </w:rPr>
     </w:lvl>
   </w:abstractNum>
-  <w:abstractNum w:abstractNumId="25" w15:restartNumberingAfterBreak="0">
+  <w:abstractNum w:abstractNumId="26" w15:restartNumberingAfterBreak="0">
     <w:nsid w:val="1B386294"/>
     <w:multiLevelType w:val="hybridMultilevel"/>
     <w:tmpl w:val="2CA87954"/>
@@ -6892,7 +7012,7 @@
       </w:rPr>
     </w:lvl>
   </w:abstractNum>
-  <w:abstractNum w:abstractNumId="26" w15:restartNumberingAfterBreak="0">
+  <w:abstractNum w:abstractNumId="27" w15:restartNumberingAfterBreak="0">
     <w:nsid w:val="1CDF49F3"/>
     <w:multiLevelType w:val="hybridMultilevel"/>
     <w:tmpl w:val="B2420764"/>
@@ -7004,7 +7124,7 @@
       </w:rPr>
     </w:lvl>
   </w:abstractNum>
-  <w:abstractNum w:abstractNumId="27" w15:restartNumberingAfterBreak="0">
+  <w:abstractNum w:abstractNumId="28" w15:restartNumberingAfterBreak="0">
     <w:nsid w:val="1E136BF4"/>
     <w:multiLevelType w:val="hybridMultilevel"/>
     <w:tmpl w:val="AD680D46"/>
@@ -7116,7 +7236,7 @@
       </w:rPr>
     </w:lvl>
   </w:abstractNum>
-  <w:abstractNum w:abstractNumId="28" w15:restartNumberingAfterBreak="0">
+  <w:abstractNum w:abstractNumId="29" w15:restartNumberingAfterBreak="0">
     <w:nsid w:val="1F2326A2"/>
     <w:multiLevelType w:val="hybridMultilevel"/>
     <w:tmpl w:val="EBAA749E"/>
@@ -7228,7 +7348,7 @@
       </w:rPr>
     </w:lvl>
   </w:abstractNum>
-  <w:abstractNum w:abstractNumId="29" w15:restartNumberingAfterBreak="0">
+  <w:abstractNum w:abstractNumId="30" w15:restartNumberingAfterBreak="0">
     <w:nsid w:val="1F29207C"/>
     <w:multiLevelType w:val="multilevel"/>
     <w:tmpl w:val="C862CF76"/>
@@ -7341,7 +7461,7 @@
       </w:rPr>
     </w:lvl>
   </w:abstractNum>
-  <w:abstractNum w:abstractNumId="30" w15:restartNumberingAfterBreak="0">
+  <w:abstractNum w:abstractNumId="31" w15:restartNumberingAfterBreak="0">
     <w:nsid w:val="22DC79D5"/>
     <w:multiLevelType w:val="hybridMultilevel"/>
     <w:tmpl w:val="17CA0744"/>
@@ -7453,7 +7573,7 @@
       </w:rPr>
     </w:lvl>
   </w:abstractNum>
-  <w:abstractNum w:abstractNumId="31" w15:restartNumberingAfterBreak="0">
+  <w:abstractNum w:abstractNumId="32" w15:restartNumberingAfterBreak="0">
     <w:nsid w:val="25FC5DAE"/>
     <w:multiLevelType w:val="hybridMultilevel"/>
     <w:tmpl w:val="6DACDCC6"/>
@@ -7565,7 +7685,7 @@
       </w:rPr>
     </w:lvl>
   </w:abstractNum>
-  <w:abstractNum w:abstractNumId="32" w15:restartNumberingAfterBreak="0">
+  <w:abstractNum w:abstractNumId="33" w15:restartNumberingAfterBreak="0">
     <w:nsid w:val="28631233"/>
     <w:multiLevelType w:val="hybridMultilevel"/>
     <w:tmpl w:val="49F46462"/>
@@ -7677,7 +7797,7 @@
       </w:rPr>
     </w:lvl>
   </w:abstractNum>
-  <w:abstractNum w:abstractNumId="33" w15:restartNumberingAfterBreak="0">
+  <w:abstractNum w:abstractNumId="34" w15:restartNumberingAfterBreak="0">
     <w:nsid w:val="28C00D1F"/>
     <w:multiLevelType w:val="hybridMultilevel"/>
     <w:tmpl w:val="A4B44116"/>
@@ -7789,7 +7909,7 @@
       </w:rPr>
     </w:lvl>
   </w:abstractNum>
-  <w:abstractNum w:abstractNumId="34" w15:restartNumberingAfterBreak="0">
+  <w:abstractNum w:abstractNumId="35" w15:restartNumberingAfterBreak="0">
     <w:nsid w:val="2D426920"/>
     <w:multiLevelType w:val="hybridMultilevel"/>
     <w:tmpl w:val="81A06AF0"/>
@@ -7901,7 +8021,7 @@
       </w:rPr>
     </w:lvl>
   </w:abstractNum>
-  <w:abstractNum w:abstractNumId="35" w15:restartNumberingAfterBreak="0">
+  <w:abstractNum w:abstractNumId="36" w15:restartNumberingAfterBreak="0">
     <w:nsid w:val="2F31353D"/>
     <w:multiLevelType w:val="hybridMultilevel"/>
     <w:tmpl w:val="6C600DC6"/>
@@ -8013,7 +8133,7 @@
       </w:rPr>
     </w:lvl>
   </w:abstractNum>
-  <w:abstractNum w:abstractNumId="36" w15:restartNumberingAfterBreak="0">
+  <w:abstractNum w:abstractNumId="37" w15:restartNumberingAfterBreak="0">
     <w:nsid w:val="2FAF0D3B"/>
     <w:multiLevelType w:val="hybridMultilevel"/>
     <w:tmpl w:val="12D82FE2"/>
@@ -8125,7 +8245,7 @@
       </w:rPr>
     </w:lvl>
   </w:abstractNum>
-  <w:abstractNum w:abstractNumId="37" w15:restartNumberingAfterBreak="0">
+  <w:abstractNum w:abstractNumId="38" w15:restartNumberingAfterBreak="0">
     <w:nsid w:val="2FFE628C"/>
     <w:multiLevelType w:val="hybridMultilevel"/>
     <w:tmpl w:val="2BA48666"/>
@@ -8237,7 +8357,7 @@
       </w:rPr>
     </w:lvl>
   </w:abstractNum>
-  <w:abstractNum w:abstractNumId="38" w15:restartNumberingAfterBreak="0">
+  <w:abstractNum w:abstractNumId="39" w15:restartNumberingAfterBreak="0">
     <w:nsid w:val="301A1E6F"/>
     <w:multiLevelType w:val="hybridMultilevel"/>
     <w:tmpl w:val="D316A260"/>
@@ -8349,7 +8469,7 @@
       </w:rPr>
     </w:lvl>
   </w:abstractNum>
-  <w:abstractNum w:abstractNumId="39" w15:restartNumberingAfterBreak="0">
+  <w:abstractNum w:abstractNumId="40" w15:restartNumberingAfterBreak="0">
     <w:nsid w:val="31C8769F"/>
     <w:multiLevelType w:val="hybridMultilevel"/>
     <w:tmpl w:val="C1DA7B78"/>
@@ -8461,7 +8581,7 @@
       </w:rPr>
     </w:lvl>
   </w:abstractNum>
-  <w:abstractNum w:abstractNumId="40" w15:restartNumberingAfterBreak="0">
+  <w:abstractNum w:abstractNumId="41" w15:restartNumberingAfterBreak="0">
     <w:nsid w:val="32B03C03"/>
     <w:multiLevelType w:val="hybridMultilevel"/>
     <w:tmpl w:val="44640EF4"/>
@@ -8573,7 +8693,7 @@
       </w:rPr>
     </w:lvl>
   </w:abstractNum>
-  <w:abstractNum w:abstractNumId="41" w15:restartNumberingAfterBreak="0">
+  <w:abstractNum w:abstractNumId="42" w15:restartNumberingAfterBreak="0">
     <w:nsid w:val="33DD7186"/>
     <w:multiLevelType w:val="hybridMultilevel"/>
     <w:tmpl w:val="0158FAEA"/>
@@ -8685,7 +8805,7 @@
       </w:rPr>
     </w:lvl>
   </w:abstractNum>
-  <w:abstractNum w:abstractNumId="42" w15:restartNumberingAfterBreak="0">
+  <w:abstractNum w:abstractNumId="43" w15:restartNumberingAfterBreak="0">
     <w:nsid w:val="342D66E6"/>
     <w:multiLevelType w:val="hybridMultilevel"/>
     <w:tmpl w:val="E254554A"/>
@@ -8797,7 +8917,7 @@
       </w:rPr>
     </w:lvl>
   </w:abstractNum>
-  <w:abstractNum w:abstractNumId="43" w15:restartNumberingAfterBreak="0">
+  <w:abstractNum w:abstractNumId="44" w15:restartNumberingAfterBreak="0">
     <w:nsid w:val="343C0E61"/>
     <w:multiLevelType w:val="hybridMultilevel"/>
     <w:tmpl w:val="B88A1536"/>
@@ -8909,7 +9029,7 @@
       </w:rPr>
     </w:lvl>
   </w:abstractNum>
-  <w:abstractNum w:abstractNumId="44" w15:restartNumberingAfterBreak="0">
+  <w:abstractNum w:abstractNumId="45" w15:restartNumberingAfterBreak="0">
     <w:nsid w:val="34A14553"/>
     <w:multiLevelType w:val="hybridMultilevel"/>
     <w:tmpl w:val="170EF526"/>
@@ -9021,7 +9141,7 @@
       </w:rPr>
     </w:lvl>
   </w:abstractNum>
-  <w:abstractNum w:abstractNumId="45" w15:restartNumberingAfterBreak="0">
+  <w:abstractNum w:abstractNumId="46" w15:restartNumberingAfterBreak="0">
     <w:nsid w:val="376B3B86"/>
     <w:multiLevelType w:val="hybridMultilevel"/>
     <w:tmpl w:val="A616020E"/>
@@ -9133,7 +9253,7 @@
       </w:rPr>
     </w:lvl>
   </w:abstractNum>
-  <w:abstractNum w:abstractNumId="46" w15:restartNumberingAfterBreak="0">
+  <w:abstractNum w:abstractNumId="47" w15:restartNumberingAfterBreak="0">
     <w:nsid w:val="377B1E27"/>
     <w:multiLevelType w:val="hybridMultilevel"/>
     <w:tmpl w:val="70E09EF8"/>
@@ -9245,7 +9365,7 @@
       </w:rPr>
     </w:lvl>
   </w:abstractNum>
-  <w:abstractNum w:abstractNumId="47" w15:restartNumberingAfterBreak="0">
+  <w:abstractNum w:abstractNumId="48" w15:restartNumberingAfterBreak="0">
     <w:nsid w:val="37ED2E74"/>
     <w:multiLevelType w:val="hybridMultilevel"/>
     <w:tmpl w:val="2D30E69C"/>
@@ -9357,7 +9477,7 @@
       </w:rPr>
     </w:lvl>
   </w:abstractNum>
-  <w:abstractNum w:abstractNumId="48" w15:restartNumberingAfterBreak="0">
+  <w:abstractNum w:abstractNumId="49" w15:restartNumberingAfterBreak="0">
     <w:nsid w:val="393A26B1"/>
     <w:multiLevelType w:val="hybridMultilevel"/>
     <w:tmpl w:val="59707C16"/>
@@ -9469,7 +9589,7 @@
       </w:rPr>
     </w:lvl>
   </w:abstractNum>
-  <w:abstractNum w:abstractNumId="49" w15:restartNumberingAfterBreak="0">
+  <w:abstractNum w:abstractNumId="50" w15:restartNumberingAfterBreak="0">
     <w:nsid w:val="395D6EAE"/>
     <w:multiLevelType w:val="hybridMultilevel"/>
     <w:tmpl w:val="A9FA500E"/>
@@ -9581,7 +9701,7 @@
       </w:rPr>
     </w:lvl>
   </w:abstractNum>
-  <w:abstractNum w:abstractNumId="50" w15:restartNumberingAfterBreak="0">
+  <w:abstractNum w:abstractNumId="51" w15:restartNumberingAfterBreak="0">
     <w:nsid w:val="39A93951"/>
     <w:multiLevelType w:val="hybridMultilevel"/>
     <w:tmpl w:val="E522E05C"/>
@@ -9693,7 +9813,7 @@
       </w:rPr>
     </w:lvl>
   </w:abstractNum>
-  <w:abstractNum w:abstractNumId="51" w15:restartNumberingAfterBreak="0">
+  <w:abstractNum w:abstractNumId="52" w15:restartNumberingAfterBreak="0">
     <w:nsid w:val="3B001DA3"/>
     <w:multiLevelType w:val="hybridMultilevel"/>
     <w:tmpl w:val="077EDE58"/>
@@ -9805,7 +9925,7 @@
       </w:rPr>
     </w:lvl>
   </w:abstractNum>
-  <w:abstractNum w:abstractNumId="52" w15:restartNumberingAfterBreak="0">
+  <w:abstractNum w:abstractNumId="53" w15:restartNumberingAfterBreak="0">
     <w:nsid w:val="3C141BB0"/>
     <w:multiLevelType w:val="hybridMultilevel"/>
     <w:tmpl w:val="E7900C40"/>
@@ -9917,7 +10037,7 @@
       </w:rPr>
     </w:lvl>
   </w:abstractNum>
-  <w:abstractNum w:abstractNumId="53" w15:restartNumberingAfterBreak="0">
+  <w:abstractNum w:abstractNumId="54" w15:restartNumberingAfterBreak="0">
     <w:nsid w:val="3D29141D"/>
     <w:multiLevelType w:val="hybridMultilevel"/>
     <w:tmpl w:val="907E98AC"/>
@@ -10029,7 +10149,7 @@
       </w:rPr>
     </w:lvl>
   </w:abstractNum>
-  <w:abstractNum w:abstractNumId="54" w15:restartNumberingAfterBreak="0">
+  <w:abstractNum w:abstractNumId="55" w15:restartNumberingAfterBreak="0">
     <w:nsid w:val="3E463A6C"/>
     <w:multiLevelType w:val="hybridMultilevel"/>
     <w:tmpl w:val="5A4C8A9E"/>
@@ -10141,7 +10261,7 @@
       </w:rPr>
     </w:lvl>
   </w:abstractNum>
-  <w:abstractNum w:abstractNumId="55" w15:restartNumberingAfterBreak="0">
+  <w:abstractNum w:abstractNumId="56" w15:restartNumberingAfterBreak="0">
     <w:nsid w:val="40163D94"/>
     <w:multiLevelType w:val="hybridMultilevel"/>
     <w:tmpl w:val="B8669994"/>
@@ -10253,7 +10373,7 @@
       </w:rPr>
     </w:lvl>
   </w:abstractNum>
-  <w:abstractNum w:abstractNumId="56" w15:restartNumberingAfterBreak="0">
+  <w:abstractNum w:abstractNumId="57" w15:restartNumberingAfterBreak="0">
     <w:nsid w:val="40570DDE"/>
     <w:multiLevelType w:val="hybridMultilevel"/>
     <w:tmpl w:val="374229F2"/>
@@ -10365,7 +10485,7 @@
       </w:rPr>
     </w:lvl>
   </w:abstractNum>
-  <w:abstractNum w:abstractNumId="57" w15:restartNumberingAfterBreak="0">
+  <w:abstractNum w:abstractNumId="58" w15:restartNumberingAfterBreak="0">
     <w:nsid w:val="42EE59E7"/>
     <w:multiLevelType w:val="multilevel"/>
     <w:tmpl w:val="6A52508A"/>
@@ -10478,7 +10598,7 @@
       </w:rPr>
     </w:lvl>
   </w:abstractNum>
-  <w:abstractNum w:abstractNumId="58" w15:restartNumberingAfterBreak="0">
+  <w:abstractNum w:abstractNumId="59" w15:restartNumberingAfterBreak="0">
     <w:nsid w:val="43E5715E"/>
     <w:multiLevelType w:val="hybridMultilevel"/>
     <w:tmpl w:val="DF4C239E"/>
@@ -10590,7 +10710,7 @@
       </w:rPr>
     </w:lvl>
   </w:abstractNum>
-  <w:abstractNum w:abstractNumId="59" w15:restartNumberingAfterBreak="0">
+  <w:abstractNum w:abstractNumId="60" w15:restartNumberingAfterBreak="0">
     <w:nsid w:val="447A353B"/>
     <w:multiLevelType w:val="hybridMultilevel"/>
     <w:tmpl w:val="C978BA68"/>
@@ -10702,7 +10822,7 @@
       </w:rPr>
     </w:lvl>
   </w:abstractNum>
-  <w:abstractNum w:abstractNumId="60" w15:restartNumberingAfterBreak="0">
+  <w:abstractNum w:abstractNumId="61" w15:restartNumberingAfterBreak="0">
     <w:nsid w:val="452C7493"/>
     <w:multiLevelType w:val="hybridMultilevel"/>
     <w:tmpl w:val="9910A868"/>
@@ -10814,7 +10934,7 @@
       </w:rPr>
     </w:lvl>
   </w:abstractNum>
-  <w:abstractNum w:abstractNumId="61" w15:restartNumberingAfterBreak="0">
+  <w:abstractNum w:abstractNumId="62" w15:restartNumberingAfterBreak="0">
     <w:nsid w:val="46BB3CB3"/>
     <w:multiLevelType w:val="hybridMultilevel"/>
     <w:tmpl w:val="8B62916A"/>
@@ -10926,7 +11046,7 @@
       </w:rPr>
     </w:lvl>
   </w:abstractNum>
-  <w:abstractNum w:abstractNumId="62" w15:restartNumberingAfterBreak="0">
+  <w:abstractNum w:abstractNumId="63" w15:restartNumberingAfterBreak="0">
     <w:nsid w:val="47746E93"/>
     <w:multiLevelType w:val="hybridMultilevel"/>
     <w:tmpl w:val="2B721A4A"/>
@@ -11038,7 +11158,7 @@
       </w:rPr>
     </w:lvl>
   </w:abstractNum>
-  <w:abstractNum w:abstractNumId="63" w15:restartNumberingAfterBreak="0">
+  <w:abstractNum w:abstractNumId="64" w15:restartNumberingAfterBreak="0">
     <w:nsid w:val="483D056B"/>
     <w:multiLevelType w:val="hybridMultilevel"/>
     <w:tmpl w:val="C4DCE034"/>
@@ -11150,7 +11270,7 @@
       </w:rPr>
     </w:lvl>
   </w:abstractNum>
-  <w:abstractNum w:abstractNumId="64" w15:restartNumberingAfterBreak="0">
+  <w:abstractNum w:abstractNumId="65" w15:restartNumberingAfterBreak="0">
     <w:nsid w:val="48813A05"/>
     <w:multiLevelType w:val="hybridMultilevel"/>
     <w:tmpl w:val="42CAA4CE"/>
@@ -11263,7 +11383,7 @@
       </w:rPr>
     </w:lvl>
   </w:abstractNum>
-  <w:abstractNum w:abstractNumId="65" w15:restartNumberingAfterBreak="0">
+  <w:abstractNum w:abstractNumId="66" w15:restartNumberingAfterBreak="0">
     <w:nsid w:val="4A3C29DC"/>
     <w:multiLevelType w:val="hybridMultilevel"/>
     <w:tmpl w:val="29F4D392"/>
@@ -11375,7 +11495,7 @@
       </w:rPr>
     </w:lvl>
   </w:abstractNum>
-  <w:abstractNum w:abstractNumId="66" w15:restartNumberingAfterBreak="0">
+  <w:abstractNum w:abstractNumId="67" w15:restartNumberingAfterBreak="0">
     <w:nsid w:val="4A9B6FB7"/>
     <w:multiLevelType w:val="hybridMultilevel"/>
     <w:tmpl w:val="C47ECA54"/>
@@ -11487,7 +11607,7 @@
       </w:rPr>
     </w:lvl>
   </w:abstractNum>
-  <w:abstractNum w:abstractNumId="67" w15:restartNumberingAfterBreak="0">
+  <w:abstractNum w:abstractNumId="68" w15:restartNumberingAfterBreak="0">
     <w:nsid w:val="4C2207ED"/>
     <w:multiLevelType w:val="hybridMultilevel"/>
     <w:tmpl w:val="E95272B2"/>
@@ -11599,7 +11719,7 @@
       </w:rPr>
     </w:lvl>
   </w:abstractNum>
-  <w:abstractNum w:abstractNumId="68" w15:restartNumberingAfterBreak="0">
+  <w:abstractNum w:abstractNumId="69" w15:restartNumberingAfterBreak="0">
     <w:nsid w:val="4C687CB3"/>
     <w:multiLevelType w:val="hybridMultilevel"/>
     <w:tmpl w:val="0D781E22"/>
@@ -11711,7 +11831,7 @@
       </w:rPr>
     </w:lvl>
   </w:abstractNum>
-  <w:abstractNum w:abstractNumId="69" w15:restartNumberingAfterBreak="0">
+  <w:abstractNum w:abstractNumId="70" w15:restartNumberingAfterBreak="0">
     <w:nsid w:val="4FCE4725"/>
     <w:multiLevelType w:val="hybridMultilevel"/>
     <w:tmpl w:val="914EE3B4"/>
@@ -11823,7 +11943,7 @@
       </w:rPr>
     </w:lvl>
   </w:abstractNum>
-  <w:abstractNum w:abstractNumId="70" w15:restartNumberingAfterBreak="0">
+  <w:abstractNum w:abstractNumId="71" w15:restartNumberingAfterBreak="0">
     <w:nsid w:val="51CE085C"/>
     <w:multiLevelType w:val="hybridMultilevel"/>
     <w:tmpl w:val="84788A08"/>
@@ -11935,7 +12055,7 @@
       </w:rPr>
     </w:lvl>
   </w:abstractNum>
-  <w:abstractNum w:abstractNumId="71" w15:restartNumberingAfterBreak="0">
+  <w:abstractNum w:abstractNumId="72" w15:restartNumberingAfterBreak="0">
     <w:nsid w:val="52944BD2"/>
     <w:multiLevelType w:val="hybridMultilevel"/>
     <w:tmpl w:val="BC3489E0"/>
@@ -12047,7 +12167,7 @@
       </w:rPr>
     </w:lvl>
   </w:abstractNum>
-  <w:abstractNum w:abstractNumId="72" w15:restartNumberingAfterBreak="0">
+  <w:abstractNum w:abstractNumId="73" w15:restartNumberingAfterBreak="0">
     <w:nsid w:val="565E12F2"/>
     <w:multiLevelType w:val="hybridMultilevel"/>
     <w:tmpl w:val="9E96747C"/>
@@ -12159,7 +12279,7 @@
       </w:rPr>
     </w:lvl>
   </w:abstractNum>
-  <w:abstractNum w:abstractNumId="73" w15:restartNumberingAfterBreak="0">
+  <w:abstractNum w:abstractNumId="74" w15:restartNumberingAfterBreak="0">
     <w:nsid w:val="57466407"/>
     <w:multiLevelType w:val="hybridMultilevel"/>
     <w:tmpl w:val="0F9ADCF4"/>
@@ -12271,7 +12391,7 @@
       </w:rPr>
     </w:lvl>
   </w:abstractNum>
-  <w:abstractNum w:abstractNumId="74" w15:restartNumberingAfterBreak="0">
+  <w:abstractNum w:abstractNumId="75" w15:restartNumberingAfterBreak="0">
     <w:nsid w:val="5ABE68FB"/>
     <w:multiLevelType w:val="hybridMultilevel"/>
     <w:tmpl w:val="B422F472"/>
@@ -12383,7 +12503,7 @@
       </w:rPr>
     </w:lvl>
   </w:abstractNum>
-  <w:abstractNum w:abstractNumId="75" w15:restartNumberingAfterBreak="0">
+  <w:abstractNum w:abstractNumId="76" w15:restartNumberingAfterBreak="0">
     <w:nsid w:val="5BA928F1"/>
     <w:multiLevelType w:val="hybridMultilevel"/>
     <w:tmpl w:val="4D4E1798"/>
@@ -12495,7 +12615,7 @@
       </w:rPr>
     </w:lvl>
   </w:abstractNum>
-  <w:abstractNum w:abstractNumId="76" w15:restartNumberingAfterBreak="0">
+  <w:abstractNum w:abstractNumId="77" w15:restartNumberingAfterBreak="0">
     <w:nsid w:val="5C834FA4"/>
     <w:multiLevelType w:val="hybridMultilevel"/>
     <w:tmpl w:val="1FC415FC"/>
@@ -12607,7 +12727,7 @@
       </w:rPr>
     </w:lvl>
   </w:abstractNum>
-  <w:abstractNum w:abstractNumId="77" w15:restartNumberingAfterBreak="0">
+  <w:abstractNum w:abstractNumId="78" w15:restartNumberingAfterBreak="0">
     <w:nsid w:val="5F3C3936"/>
     <w:multiLevelType w:val="hybridMultilevel"/>
     <w:tmpl w:val="917CC46E"/>
@@ -12719,7 +12839,7 @@
       </w:rPr>
     </w:lvl>
   </w:abstractNum>
-  <w:abstractNum w:abstractNumId="78" w15:restartNumberingAfterBreak="0">
+  <w:abstractNum w:abstractNumId="79" w15:restartNumberingAfterBreak="0">
     <w:nsid w:val="60544E94"/>
     <w:multiLevelType w:val="hybridMultilevel"/>
     <w:tmpl w:val="CBCAC042"/>
@@ -12831,7 +12951,7 @@
       </w:rPr>
     </w:lvl>
   </w:abstractNum>
-  <w:abstractNum w:abstractNumId="79" w15:restartNumberingAfterBreak="0">
+  <w:abstractNum w:abstractNumId="80" w15:restartNumberingAfterBreak="0">
     <w:nsid w:val="62D1418B"/>
     <w:multiLevelType w:val="multilevel"/>
     <w:tmpl w:val="3E58308A"/>
@@ -12930,7 +13050,7 @@
       </w:pPr>
     </w:lvl>
   </w:abstractNum>
-  <w:abstractNum w:abstractNumId="80" w15:restartNumberingAfterBreak="0">
+  <w:abstractNum w:abstractNumId="81" w15:restartNumberingAfterBreak="0">
     <w:nsid w:val="62E52923"/>
     <w:multiLevelType w:val="hybridMultilevel"/>
     <w:tmpl w:val="7668165A"/>
@@ -13042,7 +13162,7 @@
       </w:rPr>
     </w:lvl>
   </w:abstractNum>
-  <w:abstractNum w:abstractNumId="81" w15:restartNumberingAfterBreak="0">
+  <w:abstractNum w:abstractNumId="82" w15:restartNumberingAfterBreak="0">
     <w:nsid w:val="63935A88"/>
     <w:multiLevelType w:val="hybridMultilevel"/>
     <w:tmpl w:val="0F5805EA"/>
@@ -13154,7 +13274,7 @@
       </w:rPr>
     </w:lvl>
   </w:abstractNum>
-  <w:abstractNum w:abstractNumId="82" w15:restartNumberingAfterBreak="0">
+  <w:abstractNum w:abstractNumId="83" w15:restartNumberingAfterBreak="0">
     <w:nsid w:val="69496F08"/>
     <w:multiLevelType w:val="hybridMultilevel"/>
     <w:tmpl w:val="6EE839E4"/>
@@ -13266,7 +13386,7 @@
       </w:rPr>
     </w:lvl>
   </w:abstractNum>
-  <w:abstractNum w:abstractNumId="83" w15:restartNumberingAfterBreak="0">
+  <w:abstractNum w:abstractNumId="84" w15:restartNumberingAfterBreak="0">
     <w:nsid w:val="6ACC6C5E"/>
     <w:multiLevelType w:val="multilevel"/>
     <w:tmpl w:val="4AB8E1DA"/>
@@ -13379,7 +13499,7 @@
       </w:rPr>
     </w:lvl>
   </w:abstractNum>
-  <w:abstractNum w:abstractNumId="84" w15:restartNumberingAfterBreak="0">
+  <w:abstractNum w:abstractNumId="85" w15:restartNumberingAfterBreak="0">
     <w:nsid w:val="6D7319F8"/>
     <w:multiLevelType w:val="hybridMultilevel"/>
     <w:tmpl w:val="A7EEE4A4"/>
@@ -13491,7 +13611,7 @@
       </w:rPr>
     </w:lvl>
   </w:abstractNum>
-  <w:abstractNum w:abstractNumId="85" w15:restartNumberingAfterBreak="0">
+  <w:abstractNum w:abstractNumId="86" w15:restartNumberingAfterBreak="0">
     <w:nsid w:val="6D94244E"/>
     <w:multiLevelType w:val="hybridMultilevel"/>
     <w:tmpl w:val="D38C1A3A"/>
@@ -13603,7 +13723,7 @@
       </w:rPr>
     </w:lvl>
   </w:abstractNum>
-  <w:abstractNum w:abstractNumId="86" w15:restartNumberingAfterBreak="0">
+  <w:abstractNum w:abstractNumId="87" w15:restartNumberingAfterBreak="0">
     <w:nsid w:val="6DEA09BD"/>
     <w:multiLevelType w:val="hybridMultilevel"/>
     <w:tmpl w:val="029A123E"/>
@@ -13715,7 +13835,7 @@
       </w:rPr>
     </w:lvl>
   </w:abstractNum>
-  <w:abstractNum w:abstractNumId="87" w15:restartNumberingAfterBreak="0">
+  <w:abstractNum w:abstractNumId="88" w15:restartNumberingAfterBreak="0">
     <w:nsid w:val="6E310D77"/>
     <w:multiLevelType w:val="hybridMultilevel"/>
     <w:tmpl w:val="9C74834E"/>
@@ -13828,7 +13948,7 @@
       </w:rPr>
     </w:lvl>
   </w:abstractNum>
-  <w:abstractNum w:abstractNumId="88" w15:restartNumberingAfterBreak="0">
+  <w:abstractNum w:abstractNumId="89" w15:restartNumberingAfterBreak="0">
     <w:nsid w:val="74D85371"/>
     <w:multiLevelType w:val="hybridMultilevel"/>
     <w:tmpl w:val="B20E36AC"/>
@@ -13940,7 +14060,7 @@
       </w:rPr>
     </w:lvl>
   </w:abstractNum>
-  <w:abstractNum w:abstractNumId="89" w15:restartNumberingAfterBreak="0">
+  <w:abstractNum w:abstractNumId="90" w15:restartNumberingAfterBreak="0">
     <w:nsid w:val="75FA3747"/>
     <w:multiLevelType w:val="hybridMultilevel"/>
     <w:tmpl w:val="B9F43A9E"/>
@@ -14052,7 +14172,7 @@
       </w:rPr>
     </w:lvl>
   </w:abstractNum>
-  <w:abstractNum w:abstractNumId="90" w15:restartNumberingAfterBreak="0">
+  <w:abstractNum w:abstractNumId="91" w15:restartNumberingAfterBreak="0">
     <w:nsid w:val="7877407A"/>
     <w:multiLevelType w:val="hybridMultilevel"/>
     <w:tmpl w:val="C91E38FA"/>
@@ -14164,7 +14284,7 @@
       </w:rPr>
     </w:lvl>
   </w:abstractNum>
-  <w:abstractNum w:abstractNumId="91" w15:restartNumberingAfterBreak="0">
+  <w:abstractNum w:abstractNumId="92" w15:restartNumberingAfterBreak="0">
     <w:nsid w:val="78A40DC3"/>
     <w:multiLevelType w:val="hybridMultilevel"/>
     <w:tmpl w:val="F1E6B4B6"/>
@@ -14276,7 +14396,7 @@
       </w:rPr>
     </w:lvl>
   </w:abstractNum>
-  <w:abstractNum w:abstractNumId="92" w15:restartNumberingAfterBreak="0">
+  <w:abstractNum w:abstractNumId="93" w15:restartNumberingAfterBreak="0">
     <w:nsid w:val="79587B7C"/>
     <w:multiLevelType w:val="hybridMultilevel"/>
     <w:tmpl w:val="6A46933A"/>
@@ -14388,7 +14508,7 @@
       </w:rPr>
     </w:lvl>
   </w:abstractNum>
-  <w:abstractNum w:abstractNumId="93" w15:restartNumberingAfterBreak="0">
+  <w:abstractNum w:abstractNumId="94" w15:restartNumberingAfterBreak="0">
     <w:nsid w:val="7BB23699"/>
     <w:multiLevelType w:val="hybridMultilevel"/>
     <w:tmpl w:val="26C25814"/>
@@ -14500,7 +14620,7 @@
       </w:rPr>
     </w:lvl>
   </w:abstractNum>
-  <w:abstractNum w:abstractNumId="94" w15:restartNumberingAfterBreak="0">
+  <w:abstractNum w:abstractNumId="95" w15:restartNumberingAfterBreak="0">
     <w:nsid w:val="7F827ECF"/>
     <w:multiLevelType w:val="hybridMultilevel"/>
     <w:tmpl w:val="42DE9398"/>
@@ -14613,289 +14733,292 @@
     </w:lvl>
   </w:abstractNum>
   <w:num w:numId="1" w16cid:durableId="553472407">
-    <w:abstractNumId w:val="83"/>
+    <w:abstractNumId w:val="84"/>
   </w:num>
   <w:num w:numId="2" w16cid:durableId="1531718695">
-    <w:abstractNumId w:val="16"/>
+    <w:abstractNumId w:val="17"/>
   </w:num>
   <w:num w:numId="3" w16cid:durableId="667371155">
-    <w:abstractNumId w:val="57"/>
+    <w:abstractNumId w:val="58"/>
   </w:num>
   <w:num w:numId="4" w16cid:durableId="751775167">
+    <w:abstractNumId w:val="13"/>
+  </w:num>
+  <w:num w:numId="5" w16cid:durableId="1754624907">
+    <w:abstractNumId w:val="30"/>
+  </w:num>
+  <w:num w:numId="6" w16cid:durableId="915629572">
+    <w:abstractNumId w:val="80"/>
+  </w:num>
+  <w:num w:numId="7" w16cid:durableId="693576224">
+    <w:abstractNumId w:val="93"/>
+  </w:num>
+  <w:num w:numId="8" w16cid:durableId="1298343021">
+    <w:abstractNumId w:val="88"/>
+  </w:num>
+  <w:num w:numId="9" w16cid:durableId="367219526">
+    <w:abstractNumId w:val="86"/>
+  </w:num>
+  <w:num w:numId="10" w16cid:durableId="1497187389">
+    <w:abstractNumId w:val="19"/>
+  </w:num>
+  <w:num w:numId="11" w16cid:durableId="1935239735">
     <w:abstractNumId w:val="12"/>
   </w:num>
-  <w:num w:numId="5" w16cid:durableId="1754624907">
-    <w:abstractNumId w:val="29"/>
-  </w:num>
-  <w:num w:numId="6" w16cid:durableId="915629572">
-    <w:abstractNumId w:val="79"/>
-  </w:num>
-  <w:num w:numId="7" w16cid:durableId="693576224">
-    <w:abstractNumId w:val="92"/>
-  </w:num>
-  <w:num w:numId="8" w16cid:durableId="1298343021">
-    <w:abstractNumId w:val="87"/>
-  </w:num>
-  <w:num w:numId="9" w16cid:durableId="367219526">
-    <w:abstractNumId w:val="85"/>
-  </w:num>
-  <w:num w:numId="10" w16cid:durableId="1497187389">
-    <w:abstractNumId w:val="18"/>
-  </w:num>
-  <w:num w:numId="11" w16cid:durableId="1935239735">
-    <w:abstractNumId w:val="11"/>
-  </w:num>
   <w:num w:numId="12" w16cid:durableId="567883504">
-    <w:abstractNumId w:val="53"/>
+    <w:abstractNumId w:val="54"/>
   </w:num>
   <w:num w:numId="13" w16cid:durableId="1572815186">
-    <w:abstractNumId w:val="45"/>
+    <w:abstractNumId w:val="46"/>
   </w:num>
   <w:num w:numId="14" w16cid:durableId="1914309961">
-    <w:abstractNumId w:val="36"/>
+    <w:abstractNumId w:val="37"/>
   </w:num>
   <w:num w:numId="15" w16cid:durableId="538855433">
     <w:abstractNumId w:val="5"/>
   </w:num>
   <w:num w:numId="16" w16cid:durableId="1421751508">
+    <w:abstractNumId w:val="95"/>
+  </w:num>
+  <w:num w:numId="17" w16cid:durableId="1009716389">
+    <w:abstractNumId w:val="65"/>
+  </w:num>
+  <w:num w:numId="18" w16cid:durableId="300229387">
+    <w:abstractNumId w:val="71"/>
+  </w:num>
+  <w:num w:numId="19" w16cid:durableId="1025836216">
+    <w:abstractNumId w:val="52"/>
+  </w:num>
+  <w:num w:numId="20" w16cid:durableId="976106770">
+    <w:abstractNumId w:val="15"/>
+  </w:num>
+  <w:num w:numId="21" w16cid:durableId="427965314">
+    <w:abstractNumId w:val="40"/>
+  </w:num>
+  <w:num w:numId="22" w16cid:durableId="177355694">
+    <w:abstractNumId w:val="78"/>
+  </w:num>
+  <w:num w:numId="23" w16cid:durableId="6762404">
+    <w:abstractNumId w:val="61"/>
+  </w:num>
+  <w:num w:numId="24" w16cid:durableId="1492133217">
+    <w:abstractNumId w:val="68"/>
+  </w:num>
+  <w:num w:numId="25" w16cid:durableId="695159279">
+    <w:abstractNumId w:val="28"/>
+  </w:num>
+  <w:num w:numId="26" w16cid:durableId="1012492464">
+    <w:abstractNumId w:val="34"/>
+  </w:num>
+  <w:num w:numId="27" w16cid:durableId="1101994251">
+    <w:abstractNumId w:val="44"/>
+  </w:num>
+  <w:num w:numId="28" w16cid:durableId="1082484344">
+    <w:abstractNumId w:val="64"/>
+  </w:num>
+  <w:num w:numId="29" w16cid:durableId="467865549">
+    <w:abstractNumId w:val="69"/>
+  </w:num>
+  <w:num w:numId="30" w16cid:durableId="1656108771">
+    <w:abstractNumId w:val="18"/>
+  </w:num>
+  <w:num w:numId="31" w16cid:durableId="1611818230">
+    <w:abstractNumId w:val="87"/>
+  </w:num>
+  <w:num w:numId="32" w16cid:durableId="1666009498">
+    <w:abstractNumId w:val="11"/>
+  </w:num>
+  <w:num w:numId="33" w16cid:durableId="1041394156">
+    <w:abstractNumId w:val="49"/>
+  </w:num>
+  <w:num w:numId="34" w16cid:durableId="1270353408">
+    <w:abstractNumId w:val="57"/>
+  </w:num>
+  <w:num w:numId="35" w16cid:durableId="1540698615">
+    <w:abstractNumId w:val="10"/>
+  </w:num>
+  <w:num w:numId="36" w16cid:durableId="1684479704">
+    <w:abstractNumId w:val="43"/>
+  </w:num>
+  <w:num w:numId="37" w16cid:durableId="2125145959">
+    <w:abstractNumId w:val="16"/>
+  </w:num>
+  <w:num w:numId="38" w16cid:durableId="1120106064">
+    <w:abstractNumId w:val="35"/>
+  </w:num>
+  <w:num w:numId="39" w16cid:durableId="798885554">
     <w:abstractNumId w:val="94"/>
   </w:num>
-  <w:num w:numId="17" w16cid:durableId="1009716389">
-    <w:abstractNumId w:val="64"/>
-  </w:num>
-  <w:num w:numId="18" w16cid:durableId="300229387">
-    <w:abstractNumId w:val="70"/>
-  </w:num>
-  <w:num w:numId="19" w16cid:durableId="1025836216">
-    <w:abstractNumId w:val="51"/>
-  </w:num>
-  <w:num w:numId="20" w16cid:durableId="976106770">
-    <w:abstractNumId w:val="14"/>
-  </w:num>
-  <w:num w:numId="21" w16cid:durableId="427965314">
-    <w:abstractNumId w:val="39"/>
-  </w:num>
-  <w:num w:numId="22" w16cid:durableId="177355694">
-    <w:abstractNumId w:val="77"/>
-  </w:num>
-  <w:num w:numId="23" w16cid:durableId="6762404">
-    <w:abstractNumId w:val="60"/>
-  </w:num>
-  <w:num w:numId="24" w16cid:durableId="1492133217">
-    <w:abstractNumId w:val="67"/>
-  </w:num>
-  <w:num w:numId="25" w16cid:durableId="695159279">
-    <w:abstractNumId w:val="27"/>
-  </w:num>
-  <w:num w:numId="26" w16cid:durableId="1012492464">
-    <w:abstractNumId w:val="33"/>
-  </w:num>
-  <w:num w:numId="27" w16cid:durableId="1101994251">
-    <w:abstractNumId w:val="43"/>
-  </w:num>
-  <w:num w:numId="28" w16cid:durableId="1082484344">
-    <w:abstractNumId w:val="63"/>
-  </w:num>
-  <w:num w:numId="29" w16cid:durableId="467865549">
-    <w:abstractNumId w:val="68"/>
-  </w:num>
-  <w:num w:numId="30" w16cid:durableId="1656108771">
-    <w:abstractNumId w:val="17"/>
-  </w:num>
-  <w:num w:numId="31" w16cid:durableId="1611818230">
-    <w:abstractNumId w:val="86"/>
-  </w:num>
-  <w:num w:numId="32" w16cid:durableId="1666009498">
-    <w:abstractNumId w:val="10"/>
-  </w:num>
-  <w:num w:numId="33" w16cid:durableId="1041394156">
-    <w:abstractNumId w:val="48"/>
-  </w:num>
-  <w:num w:numId="34" w16cid:durableId="1270353408">
-    <w:abstractNumId w:val="56"/>
-  </w:num>
-  <w:num w:numId="35" w16cid:durableId="1540698615">
-    <w:abstractNumId w:val="9"/>
-  </w:num>
-  <w:num w:numId="36" w16cid:durableId="1684479704">
-    <w:abstractNumId w:val="42"/>
-  </w:num>
-  <w:num w:numId="37" w16cid:durableId="2125145959">
-    <w:abstractNumId w:val="15"/>
-  </w:num>
-  <w:num w:numId="38" w16cid:durableId="1120106064">
-    <w:abstractNumId w:val="34"/>
-  </w:num>
-  <w:num w:numId="39" w16cid:durableId="798885554">
-    <w:abstractNumId w:val="93"/>
-  </w:num>
   <w:num w:numId="40" w16cid:durableId="1610315013">
-    <w:abstractNumId w:val="80"/>
+    <w:abstractNumId w:val="81"/>
   </w:num>
   <w:num w:numId="41" w16cid:durableId="213975163">
     <w:abstractNumId w:val="4"/>
   </w:num>
   <w:num w:numId="42" w16cid:durableId="511454106">
-    <w:abstractNumId w:val="76"/>
+    <w:abstractNumId w:val="77"/>
   </w:num>
   <w:num w:numId="43" w16cid:durableId="1721711403">
-    <w:abstractNumId w:val="21"/>
+    <w:abstractNumId w:val="22"/>
   </w:num>
   <w:num w:numId="44" w16cid:durableId="652369700">
-    <w:abstractNumId w:val="84"/>
+    <w:abstractNumId w:val="85"/>
   </w:num>
   <w:num w:numId="45" w16cid:durableId="227304564">
-    <w:abstractNumId w:val="69"/>
+    <w:abstractNumId w:val="70"/>
   </w:num>
   <w:num w:numId="46" w16cid:durableId="1561091169">
-    <w:abstractNumId w:val="31"/>
+    <w:abstractNumId w:val="32"/>
   </w:num>
   <w:num w:numId="47" w16cid:durableId="734011883">
-    <w:abstractNumId w:val="81"/>
+    <w:abstractNumId w:val="82"/>
   </w:num>
   <w:num w:numId="48" w16cid:durableId="2125267477">
-    <w:abstractNumId w:val="73"/>
+    <w:abstractNumId w:val="74"/>
   </w:num>
   <w:num w:numId="49" w16cid:durableId="1612585929">
-    <w:abstractNumId w:val="72"/>
+    <w:abstractNumId w:val="73"/>
   </w:num>
   <w:num w:numId="50" w16cid:durableId="1628664370">
     <w:abstractNumId w:val="3"/>
   </w:num>
   <w:num w:numId="51" w16cid:durableId="512651056">
-    <w:abstractNumId w:val="23"/>
+    <w:abstractNumId w:val="24"/>
   </w:num>
   <w:num w:numId="52" w16cid:durableId="754671244">
-    <w:abstractNumId w:val="58"/>
+    <w:abstractNumId w:val="59"/>
   </w:num>
   <w:num w:numId="53" w16cid:durableId="1740665818">
-    <w:abstractNumId w:val="89"/>
+    <w:abstractNumId w:val="90"/>
   </w:num>
   <w:num w:numId="54" w16cid:durableId="452988921">
-    <w:abstractNumId w:val="90"/>
+    <w:abstractNumId w:val="91"/>
   </w:num>
   <w:num w:numId="55" w16cid:durableId="207304158">
-    <w:abstractNumId w:val="71"/>
+    <w:abstractNumId w:val="72"/>
   </w:num>
   <w:num w:numId="56" w16cid:durableId="2016880598">
-    <w:abstractNumId w:val="19"/>
+    <w:abstractNumId w:val="20"/>
   </w:num>
   <w:num w:numId="57" w16cid:durableId="2106536066">
     <w:abstractNumId w:val="1"/>
   </w:num>
   <w:num w:numId="58" w16cid:durableId="1794397765">
-    <w:abstractNumId w:val="52"/>
+    <w:abstractNumId w:val="53"/>
   </w:num>
   <w:num w:numId="59" w16cid:durableId="1690447450">
-    <w:abstractNumId w:val="50"/>
+    <w:abstractNumId w:val="51"/>
   </w:num>
   <w:num w:numId="60" w16cid:durableId="2130009061">
-    <w:abstractNumId w:val="74"/>
+    <w:abstractNumId w:val="75"/>
   </w:num>
   <w:num w:numId="61" w16cid:durableId="1293515410">
     <w:abstractNumId w:val="2"/>
   </w:num>
   <w:num w:numId="62" w16cid:durableId="650257227">
-    <w:abstractNumId w:val="47"/>
+    <w:abstractNumId w:val="48"/>
   </w:num>
   <w:num w:numId="63" w16cid:durableId="571551157">
-    <w:abstractNumId w:val="24"/>
+    <w:abstractNumId w:val="25"/>
   </w:num>
   <w:num w:numId="64" w16cid:durableId="1582831216">
-    <w:abstractNumId w:val="13"/>
+    <w:abstractNumId w:val="14"/>
   </w:num>
   <w:num w:numId="65" w16cid:durableId="1185439327">
+    <w:abstractNumId w:val="27"/>
+  </w:num>
+  <w:num w:numId="66" w16cid:durableId="643194621">
     <w:abstractNumId w:val="26"/>
   </w:num>
-  <w:num w:numId="66" w16cid:durableId="643194621">
-    <w:abstractNumId w:val="25"/>
-  </w:num>
   <w:num w:numId="67" w16cid:durableId="186255340">
-    <w:abstractNumId w:val="28"/>
+    <w:abstractNumId w:val="29"/>
   </w:num>
   <w:num w:numId="68" w16cid:durableId="139276496">
-    <w:abstractNumId w:val="32"/>
+    <w:abstractNumId w:val="33"/>
   </w:num>
   <w:num w:numId="69" w16cid:durableId="1090197415">
     <w:abstractNumId w:val="7"/>
   </w:num>
   <w:num w:numId="70" w16cid:durableId="131336986">
-    <w:abstractNumId w:val="38"/>
+    <w:abstractNumId w:val="39"/>
   </w:num>
   <w:num w:numId="71" w16cid:durableId="894970823">
-    <w:abstractNumId w:val="30"/>
+    <w:abstractNumId w:val="31"/>
   </w:num>
   <w:num w:numId="72" w16cid:durableId="1865287051">
-    <w:abstractNumId w:val="40"/>
+    <w:abstractNumId w:val="41"/>
   </w:num>
   <w:num w:numId="73" w16cid:durableId="368451605">
-    <w:abstractNumId w:val="61"/>
+    <w:abstractNumId w:val="62"/>
   </w:num>
   <w:num w:numId="74" w16cid:durableId="65686607">
     <w:abstractNumId w:val="6"/>
   </w:num>
   <w:num w:numId="75" w16cid:durableId="1840541023">
-    <w:abstractNumId w:val="44"/>
+    <w:abstractNumId w:val="45"/>
   </w:num>
   <w:num w:numId="76" w16cid:durableId="539049649">
-    <w:abstractNumId w:val="91"/>
+    <w:abstractNumId w:val="92"/>
   </w:num>
   <w:num w:numId="77" w16cid:durableId="1288513951">
-    <w:abstractNumId w:val="65"/>
+    <w:abstractNumId w:val="66"/>
   </w:num>
   <w:num w:numId="78" w16cid:durableId="1532762005">
-    <w:abstractNumId w:val="54"/>
+    <w:abstractNumId w:val="55"/>
   </w:num>
   <w:num w:numId="79" w16cid:durableId="1374647797">
-    <w:abstractNumId w:val="78"/>
+    <w:abstractNumId w:val="79"/>
   </w:num>
   <w:num w:numId="80" w16cid:durableId="1210456390">
     <w:abstractNumId w:val="8"/>
   </w:num>
   <w:num w:numId="81" w16cid:durableId="171071792">
-    <w:abstractNumId w:val="35"/>
+    <w:abstractNumId w:val="36"/>
   </w:num>
   <w:num w:numId="82" w16cid:durableId="500893856">
-    <w:abstractNumId w:val="82"/>
+    <w:abstractNumId w:val="83"/>
   </w:num>
   <w:num w:numId="83" w16cid:durableId="1950622049">
-    <w:abstractNumId w:val="59"/>
+    <w:abstractNumId w:val="60"/>
   </w:num>
   <w:num w:numId="84" w16cid:durableId="2060282905">
     <w:abstractNumId w:val="0"/>
   </w:num>
   <w:num w:numId="85" w16cid:durableId="490635123">
-    <w:abstractNumId w:val="55"/>
+    <w:abstractNumId w:val="56"/>
   </w:num>
   <w:num w:numId="86" w16cid:durableId="2038313657">
-    <w:abstractNumId w:val="20"/>
+    <w:abstractNumId w:val="21"/>
   </w:num>
   <w:num w:numId="87" w16cid:durableId="1744451624">
-    <w:abstractNumId w:val="49"/>
+    <w:abstractNumId w:val="50"/>
   </w:num>
   <w:num w:numId="88" w16cid:durableId="2105687898">
-    <w:abstractNumId w:val="75"/>
+    <w:abstractNumId w:val="76"/>
   </w:num>
   <w:num w:numId="89" w16cid:durableId="363360886">
-    <w:abstractNumId w:val="22"/>
+    <w:abstractNumId w:val="23"/>
   </w:num>
   <w:num w:numId="90" w16cid:durableId="974530531">
-    <w:abstractNumId w:val="66"/>
+    <w:abstractNumId w:val="67"/>
   </w:num>
   <w:num w:numId="91" w16cid:durableId="780148532">
-    <w:abstractNumId w:val="88"/>
+    <w:abstractNumId w:val="89"/>
   </w:num>
   <w:num w:numId="92" w16cid:durableId="304706915">
-    <w:abstractNumId w:val="46"/>
+    <w:abstractNumId w:val="47"/>
   </w:num>
   <w:num w:numId="93" w16cid:durableId="1232305665">
-    <w:abstractNumId w:val="62"/>
+    <w:abstractNumId w:val="63"/>
   </w:num>
   <w:num w:numId="94" w16cid:durableId="2055348731">
-    <w:abstractNumId w:val="41"/>
+    <w:abstractNumId w:val="42"/>
   </w:num>
   <w:num w:numId="95" w16cid:durableId="513424609">
-    <w:abstractNumId w:val="37"/>
+    <w:abstractNumId w:val="38"/>
+  </w:num>
+  <w:num w:numId="96" w16cid:durableId="1417553145">
+    <w:abstractNumId w:val="9"/>
   </w:num>
   <w:numIdMacAtCleanup w:val="84"/>
 </w:numbering>

</xml_diff>

<commit_message>
Updated DOCX file with the USB-C cable issue.
</commit_message>
<xml_diff>
--- a/RadioFox.docx
+++ b/RadioFox.docx
@@ -176,6 +176,28 @@
         <w:pStyle w:val="Heading2"/>
       </w:pPr>
       <w:r>
+        <w:t>Charging Issues</w:t>
+      </w:r>
+    </w:p>
+    <w:p>
+      <w:r>
+        <w:t xml:space="preserve">The </w:t>
+      </w:r>
+      <w:r>
+        <w:t>device is charged using the USB-C connector. There is a flaw on the PCB that requires</w:t>
+      </w:r>
+      <w:r>
+        <w:t xml:space="preserve"> a USB-A to USB-C cable. This will be fixed in a future revision of the PCB</w:t>
+      </w:r>
+      <w:r>
+        <w:t xml:space="preserve"> so that USB-C to USB-C cables will also work.</w:t>
+      </w:r>
+    </w:p>
+    <w:p>
+      <w:pPr>
+        <w:pStyle w:val="Heading2"/>
+      </w:pPr>
+      <w:r>
         <w:t>Beacon</w:t>
       </w:r>
     </w:p>
@@ -196,12 +218,9 @@
     <w:p>
       <w:pPr>
         <w:pStyle w:val="Heading2"/>
-        <w:numPr>
-          <w:ilvl w:val="0"/>
-          <w:numId w:val="0"/>
-        </w:numPr>
-      </w:pPr>
-      <w:r>
+      </w:pPr>
+      <w:r>
+        <w:lastRenderedPageBreak/>
         <w:t>Source Code</w:t>
       </w:r>
     </w:p>
@@ -245,7 +264,6 @@
         <w:pStyle w:val="Heading3"/>
       </w:pPr>
       <w:r>
-        <w:lastRenderedPageBreak/>
         <w:t xml:space="preserve">Arduino </w:t>
       </w:r>
       <w:r>
@@ -566,7 +584,11 @@
         <w:t>files and</w:t>
       </w:r>
       <w:r>
-        <w:t xml:space="preserve"> saved settings files. It can also be used to load new firmware onto the TTGO chip.</w:t>
+        <w:t xml:space="preserve"> saved settings files. It can also be used to load </w:t>
+      </w:r>
+      <w:r>
+        <w:lastRenderedPageBreak/>
+        <w:t>new firmware onto the TTGO chip.</w:t>
       </w:r>
       <w:r>
         <w:t xml:space="preserve"> There is also a USB C connector on the TTGO. It </w:t>
@@ -595,7 +617,6 @@
         <w:pStyle w:val="Heading2"/>
       </w:pPr>
       <w:r>
-        <w:lastRenderedPageBreak/>
         <w:t>Radio</w:t>
       </w:r>
     </w:p>
@@ -863,6 +884,7 @@
           <w:b/>
           <w:bCs/>
         </w:rPr>
+        <w:lastRenderedPageBreak/>
         <w:t>and that the data starts with the tilde which must not be in these comments</w:t>
       </w:r>
     </w:p>
@@ -924,7 +946,6 @@
           <w:b/>
           <w:bCs/>
         </w:rPr>
-        <w:lastRenderedPageBreak/>
         <w:t>~</w:t>
       </w:r>
     </w:p>
@@ -1325,6 +1346,7 @@
         <w:pStyle w:val="Heading2"/>
       </w:pPr>
       <w:r>
+        <w:lastRenderedPageBreak/>
         <w:t>DTMF *</w:t>
       </w:r>
       <w:r>
@@ -1341,7 +1363,6 @@
         <w:pStyle w:val="Heading2"/>
       </w:pPr>
       <w:r>
-        <w:lastRenderedPageBreak/>
         <w:t>DTMF *</w:t>
       </w:r>
       <w:r>
@@ -1678,6 +1699,7 @@
         <w:rPr>
           <w:lang w:val="da-DK"/>
         </w:rPr>
+        <w:lastRenderedPageBreak/>
         <w:t>B</w:t>
       </w:r>
       <w:r>
@@ -1839,7 +1861,6 @@
         <w:rPr>
           <w:lang w:val="en-US"/>
         </w:rPr>
-        <w:lastRenderedPageBreak/>
         <w:t>B</w:t>
       </w:r>
       <w:r>
@@ -2211,6 +2232,7 @@
         <w:ind w:left="1440"/>
       </w:pPr>
       <w:r>
+        <w:lastRenderedPageBreak/>
         <w:t xml:space="preserve">Toggle </w:t>
       </w:r>
       <w:proofErr w:type="spellStart"/>
@@ -2249,7 +2271,6 @@
         <w:pStyle w:val="Heading1"/>
       </w:pPr>
       <w:r>
-        <w:lastRenderedPageBreak/>
         <w:t>Main Operating Screen</w:t>
       </w:r>
     </w:p>
@@ -2555,6 +2576,7 @@
         <w:pStyle w:val="Heading3"/>
       </w:pPr>
       <w:r>
+        <w:lastRenderedPageBreak/>
         <w:t xml:space="preserve">TX: </w:t>
       </w:r>
       <w:r>
@@ -2580,7 +2602,6 @@
         <w:pStyle w:val="Heading3"/>
       </w:pPr>
       <w:r>
-        <w:lastRenderedPageBreak/>
         <w:t>Beacon</w:t>
       </w:r>
       <w:r>
@@ -2806,6 +2827,7 @@
         <w:pStyle w:val="Heading3"/>
       </w:pPr>
       <w:r>
+        <w:lastRenderedPageBreak/>
         <w:t xml:space="preserve">TX Send: </w:t>
       </w:r>
       <w:r>
@@ -2840,24 +2862,411 @@
         <w:pStyle w:val="Heading3"/>
       </w:pPr>
       <w:r>
+        <w:t>TX Pause:10-1200 Sec</w:t>
+      </w:r>
+    </w:p>
+    <w:p>
+      <w:r>
+        <w:t>This is the pause time between transmissions</w:t>
+      </w:r>
+      <w:r>
+        <w:t xml:space="preserve">. Longer times let the radio cool off and save the battery for longer </w:t>
+      </w:r>
+      <w:proofErr w:type="gramStart"/>
+      <w:r>
+        <w:t>run</w:t>
+      </w:r>
+      <w:proofErr w:type="gramEnd"/>
+      <w:r>
+        <w:t xml:space="preserve"> times.</w:t>
+      </w:r>
+    </w:p>
+    <w:p>
+      <w:pPr>
+        <w:pStyle w:val="Heading3"/>
+      </w:pPr>
+      <w:r>
+        <w:t>TX Send Min: 10-90 Sec</w:t>
+      </w:r>
+    </w:p>
+    <w:p>
+      <w:r>
+        <w:t>In random mode this is the minimum send time.</w:t>
+      </w:r>
+    </w:p>
+    <w:p>
+      <w:pPr>
+        <w:pStyle w:val="Heading3"/>
+      </w:pPr>
+      <w:r>
+        <w:t xml:space="preserve">TX Send Max: </w:t>
+      </w:r>
+      <w:r>
+        <w:t>10-90 Sec</w:t>
+      </w:r>
+    </w:p>
+    <w:p>
+      <w:r>
+        <w:t xml:space="preserve">In </w:t>
+      </w:r>
+      <w:r>
+        <w:t>random mode this is the maximum send time.</w:t>
+      </w:r>
+    </w:p>
+    <w:p>
+      <w:pPr>
+        <w:pStyle w:val="Heading3"/>
+      </w:pPr>
+      <w:r>
+        <w:t>TX Pause Min: 10-1200 Sec</w:t>
+      </w:r>
+    </w:p>
+    <w:p>
+      <w:r>
+        <w:t>In random mode this is the minimum pause time.</w:t>
+      </w:r>
+    </w:p>
+    <w:p>
+      <w:pPr>
+        <w:pStyle w:val="Heading3"/>
+      </w:pPr>
+      <w:r>
+        <w:t>TX Pause Max: 10-1200 Sec</w:t>
+      </w:r>
+    </w:p>
+    <w:p>
+      <w:r>
+        <w:t>In random mode this is the maximum pause time.</w:t>
+      </w:r>
+    </w:p>
+    <w:p>
+      <w:pPr>
+        <w:pStyle w:val="Heading3"/>
+      </w:pPr>
+      <w:r>
+        <w:t xml:space="preserve">TX Stop: </w:t>
+      </w:r>
+      <w:proofErr w:type="spellStart"/>
+      <w:r>
+        <w:t>Immediate|Finish</w:t>
+      </w:r>
+      <w:proofErr w:type="spellEnd"/>
+      <w:r>
+        <w:t xml:space="preserve"> Cycle</w:t>
+      </w:r>
+    </w:p>
+    <w:p>
+      <w:r>
+        <w:t xml:space="preserve">During transmit time the Beacon, Call Sign, and Audio are continuously sent. At the end of the transmission time this option controls whether the transmission stops immediately </w:t>
+      </w:r>
+      <w:proofErr w:type="gramStart"/>
+      <w:r>
+        <w:t>of</w:t>
+      </w:r>
+      <w:proofErr w:type="gramEnd"/>
+      <w:r>
+        <w:t xml:space="preserve"> waits to stop until the entire cycle is finished.</w:t>
+      </w:r>
+    </w:p>
+    <w:p/>
+    <w:p>
+      <w:r>
+        <w:t>A clever use of this command</w:t>
+      </w:r>
+      <w:r>
+        <w:t xml:space="preserve"> allows for only one cycle of beacon, ID, and music to be sent during each transmission time. Set the transmit</w:t>
+      </w:r>
+      <w:r>
+        <w:t xml:space="preserve"> time to something less than</w:t>
+      </w:r>
+      <w:r>
+        <w:t xml:space="preserve"> the time to perform a complete cycle and set this option to “Finish Cycle”. The </w:t>
+      </w:r>
+      <w:proofErr w:type="gramStart"/>
+      <w:r>
+        <w:t>transmit  cycle</w:t>
+      </w:r>
+      <w:proofErr w:type="gramEnd"/>
+      <w:r>
+        <w:t xml:space="preserve"> will begin, the timer will expire, but the current cycle will complete before stopping</w:t>
+      </w:r>
+      <w:r>
+        <w:t>.</w:t>
+      </w:r>
+    </w:p>
+    <w:p>
+      <w:pPr>
+        <w:pStyle w:val="Heading3"/>
+      </w:pPr>
+      <w:r>
+        <w:t xml:space="preserve">Radio Pause: </w:t>
+      </w:r>
+      <w:proofErr w:type="spellStart"/>
+      <w:r>
+        <w:t>Sleep|Awake</w:t>
+      </w:r>
+      <w:proofErr w:type="spellEnd"/>
+    </w:p>
+    <w:p>
+      <w:r>
+        <w:t xml:space="preserve">During pause time the radio can be put into sleep mode. This lowers the power consumption and lets the battery last longer. </w:t>
+      </w:r>
+      <w:proofErr w:type="gramStart"/>
+      <w:r>
+        <w:t>However</w:t>
+      </w:r>
+      <w:proofErr w:type="gramEnd"/>
+      <w:r>
+        <w:t xml:space="preserve"> note that this also means that the DTMF commands are disabled since the radio is asleep!</w:t>
+      </w:r>
+    </w:p>
+    <w:p>
+      <w:pPr>
+        <w:pStyle w:val="Heading2"/>
+      </w:pPr>
+      <w:r>
         <w:lastRenderedPageBreak/>
-        <w:t>TX Pause:10-1200 Sec</w:t>
-      </w:r>
-    </w:p>
-    <w:p>
-      <w:r>
-        <w:t>This is the pause time between transmissions</w:t>
-      </w:r>
-      <w:r>
-        <w:t xml:space="preserve">. Longer times let the radio cool off and save the battery for longer </w:t>
+        <w:t>+</w:t>
+      </w:r>
+      <w:r>
+        <w:t>More Radio Settings</w:t>
+      </w:r>
+    </w:p>
+    <w:p>
+      <w:pPr>
+        <w:pStyle w:val="Heading3"/>
+      </w:pPr>
+      <w:r>
+        <w:t>RX Offset: -600|0|+600 kHz</w:t>
+      </w:r>
+    </w:p>
+    <w:p>
+      <w:r>
+        <w:t>This is the frequency offset from the transmit frequency that the radio uses to receive DTMF commands</w:t>
+      </w:r>
+      <w:r>
+        <w:t>. An offset is recommended. If 0 is used the radio will only listen when it isn’t sending. It has not been tested if it listens during sending when the offset is not 0.</w:t>
+      </w:r>
+    </w:p>
+    <w:p>
+      <w:pPr>
+        <w:pStyle w:val="Heading3"/>
+      </w:pPr>
+      <w:r>
+        <w:t>Bandwidth: 12.5|</w:t>
+      </w:r>
+      <w:r>
+        <w:t>25 kHz</w:t>
+      </w:r>
+    </w:p>
+    <w:p>
+      <w:r>
+        <w:t>This sets the radio bandwidth</w:t>
+      </w:r>
+      <w:r>
+        <w:t>. It has not been tested much to see what effect it has on performance yet.</w:t>
+      </w:r>
+    </w:p>
+    <w:p>
+      <w:pPr>
+        <w:pStyle w:val="Heading3"/>
+      </w:pPr>
+      <w:r>
+        <w:t>CTCSS/DCS: CTCSS|DCS</w:t>
+      </w:r>
+    </w:p>
+    <w:p>
+      <w:r>
+        <w:t xml:space="preserve">This sets the </w:t>
+      </w:r>
+      <w:r>
+        <w:t>un-squelch</w:t>
+      </w:r>
+      <w:r>
+        <w:t xml:space="preserve"> values</w:t>
+      </w:r>
+      <w:r>
+        <w:t xml:space="preserve"> for either the analog or digital versions.</w:t>
+      </w:r>
+    </w:p>
+    <w:p>
+      <w:pPr>
+        <w:pStyle w:val="Heading3"/>
+      </w:pPr>
+      <w:r>
+        <w:t>TX CTCSS:</w:t>
+      </w:r>
+      <w:r>
+        <w:t xml:space="preserve"> None</w:t>
+      </w:r>
+      <w:r>
+        <w:t>|</w:t>
+      </w:r>
+      <w:r>
+        <w:t>67-</w:t>
+      </w:r>
+      <w:r>
+        <w:t>250.3</w:t>
+      </w:r>
+    </w:p>
+    <w:p>
+      <w:r>
+        <w:t>Analog un-squelch frequencies sent out.</w:t>
+      </w:r>
+    </w:p>
+    <w:p>
+      <w:pPr>
+        <w:pStyle w:val="Heading3"/>
+      </w:pPr>
+      <w:r>
+        <w:t>RX CTCSS:</w:t>
+      </w:r>
+      <w:r>
+        <w:t xml:space="preserve"> None|67-250.3</w:t>
+      </w:r>
+    </w:p>
+    <w:p>
+      <w:r>
+        <w:t>Analog un-squelch frequency for receiving.</w:t>
+      </w:r>
+    </w:p>
+    <w:p>
+      <w:pPr>
+        <w:pStyle w:val="Heading3"/>
+      </w:pPr>
+      <w:r>
+        <w:t>TX DCS:</w:t>
+      </w:r>
+      <w:r>
+        <w:t xml:space="preserve"> None|023-754</w:t>
+      </w:r>
+    </w:p>
+    <w:p>
+      <w:r>
+        <w:t>Digital un-squelch value for sending.</w:t>
+      </w:r>
+    </w:p>
+    <w:p>
+      <w:pPr>
+        <w:pStyle w:val="Heading3"/>
+      </w:pPr>
+      <w:r>
+        <w:t>TX I/N: I|N</w:t>
+      </w:r>
+    </w:p>
+    <w:p>
+      <w:r>
+        <w:t>The digital I or N value for sending.</w:t>
+      </w:r>
+    </w:p>
+    <w:p>
+      <w:pPr>
+        <w:pStyle w:val="Heading3"/>
+      </w:pPr>
+      <w:r>
+        <w:t>RX DCS: None|023-754</w:t>
+      </w:r>
+    </w:p>
+    <w:p>
+      <w:r>
+        <w:t>Digital un-squelch value for receiving.</w:t>
+      </w:r>
+    </w:p>
+    <w:p>
+      <w:pPr>
+        <w:pStyle w:val="Heading3"/>
+      </w:pPr>
+      <w:r>
+        <w:t>RX I/N: I|N</w:t>
+      </w:r>
+    </w:p>
+    <w:p>
+      <w:r>
+        <w:t>The digital I or N value for receiving.</w:t>
+      </w:r>
+    </w:p>
+    <w:p>
+      <w:pPr>
+        <w:pStyle w:val="Heading3"/>
+      </w:pPr>
+      <w:r>
+        <w:t>RX Volume:</w:t>
+      </w:r>
+      <w:r>
+        <w:t xml:space="preserve"> 1-6</w:t>
+      </w:r>
+    </w:p>
+    <w:p>
+      <w:r>
+        <w:t>This is the receive volume setting. It affects how well DTMF tones are detected.</w:t>
+      </w:r>
+    </w:p>
+    <w:p>
+      <w:pPr>
+        <w:pStyle w:val="Heading3"/>
+      </w:pPr>
+      <w:r>
+        <w:t>RX Squelch:</w:t>
+      </w:r>
+      <w:r>
+        <w:t xml:space="preserve"> 0-8</w:t>
+      </w:r>
+    </w:p>
+    <w:p>
+      <w:r>
+        <w:t>This affects how much signal is required to receive the DTMF signals.</w:t>
+      </w:r>
+    </w:p>
+    <w:p>
+      <w:pPr>
+        <w:pStyle w:val="Heading2"/>
+      </w:pPr>
+      <w:r>
+        <w:lastRenderedPageBreak/>
+        <w:t>Cancel Waits/TX Now</w:t>
+      </w:r>
+    </w:p>
+    <w:p>
+      <w:r>
+        <w:t xml:space="preserve">When the radio is in either send or pause mode this command will cancel the </w:t>
       </w:r>
       <w:proofErr w:type="gramStart"/>
       <w:r>
-        <w:t>run</w:t>
+        <w:t>timer</w:t>
       </w:r>
       <w:proofErr w:type="gramEnd"/>
       <w:r>
-        <w:t xml:space="preserve"> times.</w:t>
+        <w:t xml:space="preserve"> and the next mo</w:t>
+      </w:r>
+      <w:r>
+        <w:t xml:space="preserve">de will start. For </w:t>
+      </w:r>
+      <w:proofErr w:type="gramStart"/>
+      <w:r>
+        <w:t>example</w:t>
+      </w:r>
+      <w:proofErr w:type="gramEnd"/>
+      <w:r>
+        <w:t xml:space="preserve"> if you want to cancel</w:t>
+      </w:r>
+      <w:r>
+        <w:t xml:space="preserve"> the pause and go to transmit, use this option. It can also be done by long pressing B0.</w:t>
+      </w:r>
+    </w:p>
+    <w:p>
+      <w:pPr>
+        <w:pStyle w:val="Heading2"/>
+      </w:pPr>
+      <w:r>
+        <w:t>+Saved Settings Files</w:t>
+      </w:r>
+    </w:p>
+    <w:p>
+      <w:r>
+        <w:t>Saved settings files are named files stored on the SD card. They are useful to</w:t>
+      </w:r>
+      <w:r>
+        <w:t xml:space="preserve"> quickly configure the radio for different uses. All values except the battery calibration are affected.</w:t>
       </w:r>
     </w:p>
     <w:p>
@@ -2865,12 +3274,12 @@
         <w:pStyle w:val="Heading3"/>
       </w:pPr>
       <w:r>
-        <w:t>TX Send Min: 10-90 Sec</w:t>
-      </w:r>
-    </w:p>
-    <w:p>
-      <w:r>
-        <w:t>In random mode this is the minimum send time.</w:t>
+        <w:t>Create File</w:t>
+      </w:r>
+    </w:p>
+    <w:p>
+      <w:r>
+        <w:t>This prompts the user for a name. The file is then created using the current system settings.</w:t>
       </w:r>
     </w:p>
     <w:p>
@@ -2878,18 +3287,20 @@
         <w:pStyle w:val="Heading3"/>
       </w:pPr>
       <w:r>
-        <w:t xml:space="preserve">TX Send Max: </w:t>
-      </w:r>
-      <w:r>
-        <w:t>10-90 Sec</w:t>
-      </w:r>
-    </w:p>
-    <w:p>
-      <w:r>
-        <w:t xml:space="preserve">In </w:t>
-      </w:r>
-      <w:r>
-        <w:t>random mode this is the maximum send time.</w:t>
+        <w:t>Save/Update File</w:t>
+      </w:r>
+    </w:p>
+    <w:p>
+      <w:r>
+        <w:t xml:space="preserve">This command saves the current settings into the selected file. If it already </w:t>
+      </w:r>
+      <w:proofErr w:type="gramStart"/>
+      <w:r>
+        <w:t>exists</w:t>
+      </w:r>
+      <w:proofErr w:type="gramEnd"/>
+      <w:r>
+        <w:t xml:space="preserve"> the user will be asked to confirm overwriting the file.</w:t>
       </w:r>
     </w:p>
     <w:p>
@@ -2897,12 +3308,20 @@
         <w:pStyle w:val="Heading3"/>
       </w:pPr>
       <w:r>
-        <w:t>TX Pause Min: 10-1200 Sec</w:t>
-      </w:r>
-    </w:p>
-    <w:p>
-      <w:r>
-        <w:t>In random mode this is the minimum pause time.</w:t>
+        <w:t>Load File</w:t>
+      </w:r>
+    </w:p>
+    <w:p>
+      <w:r>
+        <w:t xml:space="preserve">This command asks the user for the name and then sets </w:t>
+      </w:r>
+      <w:proofErr w:type="gramStart"/>
+      <w:r>
+        <w:t>all of</w:t>
+      </w:r>
+      <w:proofErr w:type="gramEnd"/>
+      <w:r>
+        <w:t xml:space="preserve"> the system settings except the battery calibration using the values in the file.</w:t>
       </w:r>
     </w:p>
     <w:p>
@@ -2910,12 +3329,20 @@
         <w:pStyle w:val="Heading3"/>
       </w:pPr>
       <w:r>
-        <w:t>TX Pause Max: 10-1200 Sec</w:t>
-      </w:r>
-    </w:p>
-    <w:p>
-      <w:r>
-        <w:t>In random mode this is the maximum pause time.</w:t>
+        <w:t>Delete File</w:t>
+      </w:r>
+    </w:p>
+    <w:p>
+      <w:r>
+        <w:t>The user selects a file from the list and then it can be deleted.</w:t>
+      </w:r>
+    </w:p>
+    <w:p>
+      <w:pPr>
+        <w:pStyle w:val="Heading2"/>
+      </w:pPr>
+      <w:r>
+        <w:t>+System Settings</w:t>
       </w:r>
     </w:p>
     <w:p>
@@ -2923,511 +3350,106 @@
         <w:pStyle w:val="Heading3"/>
       </w:pPr>
       <w:r>
-        <w:t xml:space="preserve">TX Stop: </w:t>
+        <w:t>+Display</w:t>
+      </w:r>
+      <w:r>
+        <w:t xml:space="preserve"> Settings</w:t>
+      </w:r>
+    </w:p>
+    <w:p>
+      <w:pPr>
+        <w:pStyle w:val="Heading4"/>
+      </w:pPr>
+      <w:r>
+        <w:t xml:space="preserve">Dimming Mode: </w:t>
       </w:r>
       <w:proofErr w:type="spellStart"/>
       <w:r>
-        <w:t>Immediate|Finish</w:t>
+        <w:t>None</w:t>
+      </w:r>
+      <w:r>
+        <w:t>|Timer</w:t>
       </w:r>
       <w:proofErr w:type="spellEnd"/>
-      <w:r>
-        <w:t xml:space="preserve"> Cycle</w:t>
-      </w:r>
-    </w:p>
-    <w:p>
-      <w:r>
-        <w:t xml:space="preserve">During transmit time the Beacon, Call Sign, and Audio are continuously sent. At the end of the transmission time this option controls whether the transmission stops immediately </w:t>
+    </w:p>
+    <w:p>
+      <w:r>
+        <w:t xml:space="preserve">The display can be set to dim automatically after a specified number of seconds. This is used to save battery power since the backlight </w:t>
+      </w:r>
+      <w:r>
+        <w:t>uses a significant amount.</w:t>
+      </w:r>
+    </w:p>
+    <w:p>
+      <w:pPr>
+        <w:pStyle w:val="Heading4"/>
+      </w:pPr>
+      <w:r>
+        <w:t>Bright Value: 1-100</w:t>
+      </w:r>
+      <w:r>
+        <w:t>%</w:t>
+      </w:r>
+    </w:p>
+    <w:p>
+      <w:r>
+        <w:t>Set the display brightness value.</w:t>
+      </w:r>
+    </w:p>
+    <w:p>
+      <w:pPr>
+        <w:pStyle w:val="Heading4"/>
+      </w:pPr>
+      <w:r>
+        <w:t xml:space="preserve">Dim Value: </w:t>
+      </w:r>
+      <w:r>
+        <w:t>0-100%</w:t>
+      </w:r>
+    </w:p>
+    <w:p>
+      <w:r>
+        <w:t xml:space="preserve">Set the display brightness after the </w:t>
+      </w:r>
+      <w:r>
+        <w:t>timer below expires.</w:t>
+      </w:r>
+    </w:p>
+    <w:p>
+      <w:pPr>
+        <w:pStyle w:val="Heading4"/>
+      </w:pPr>
+      <w:r>
+        <w:lastRenderedPageBreak/>
+        <w:t>Display Dim Time:</w:t>
+      </w:r>
+      <w:r>
+        <w:t xml:space="preserve"> 0-120 S</w:t>
+      </w:r>
+    </w:p>
+    <w:p>
+      <w:r>
+        <w:t>Specify the time until the display changes to dim mode.</w:t>
+      </w:r>
+    </w:p>
+    <w:p>
+      <w:pPr>
+        <w:pStyle w:val="Heading4"/>
+      </w:pPr>
+      <w:r>
+        <w:t>+Sideways Scroll Settings</w:t>
+      </w:r>
+    </w:p>
+    <w:p>
+      <w:r>
+        <w:t xml:space="preserve">Lines of text that </w:t>
       </w:r>
       <w:proofErr w:type="gramStart"/>
       <w:r>
-        <w:t>of</w:t>
+        <w:t>too</w:t>
       </w:r>
       <w:proofErr w:type="gramEnd"/>
       <w:r>
-        <w:t xml:space="preserve"> waits to stop until the entire cycle is finished.</w:t>
-      </w:r>
-    </w:p>
-    <w:p/>
-    <w:p>
-      <w:r>
-        <w:t>A clever use of this command</w:t>
-      </w:r>
-      <w:r>
-        <w:t xml:space="preserve"> allows for only one cycle of beacon, ID, and music to be sent during each transmission time. Set the transmit</w:t>
-      </w:r>
-      <w:r>
-        <w:t xml:space="preserve"> time to something less than</w:t>
-      </w:r>
-      <w:r>
-        <w:t xml:space="preserve"> the time to perform a complete cycle and set this option to “Finish Cycle”. The </w:t>
-      </w:r>
-      <w:proofErr w:type="gramStart"/>
-      <w:r>
-        <w:t>transmit  cycle</w:t>
-      </w:r>
-      <w:proofErr w:type="gramEnd"/>
-      <w:r>
-        <w:t xml:space="preserve"> will begin, the timer will expire, but the current cycle will complete before stopping</w:t>
-      </w:r>
-      <w:r>
-        <w:t>.</w:t>
-      </w:r>
-    </w:p>
-    <w:p>
-      <w:pPr>
-        <w:pStyle w:val="Heading3"/>
-      </w:pPr>
-      <w:r>
-        <w:t xml:space="preserve">Radio Pause: </w:t>
-      </w:r>
-      <w:proofErr w:type="spellStart"/>
-      <w:r>
-        <w:t>Sleep|Awake</w:t>
-      </w:r>
-      <w:proofErr w:type="spellEnd"/>
-    </w:p>
-    <w:p>
-      <w:r>
-        <w:t xml:space="preserve">During pause time the radio can be put into sleep mode. This lowers the power consumption and lets the battery last longer. </w:t>
-      </w:r>
-      <w:proofErr w:type="gramStart"/>
-      <w:r>
-        <w:t>However</w:t>
-      </w:r>
-      <w:proofErr w:type="gramEnd"/>
-      <w:r>
-        <w:t xml:space="preserve"> note that this also means that the DTMF commands are disabled since the radio is asleep!</w:t>
-      </w:r>
-    </w:p>
-    <w:p>
-      <w:pPr>
-        <w:pStyle w:val="Heading2"/>
-      </w:pPr>
-      <w:r>
-        <w:t>+</w:t>
-      </w:r>
-      <w:r>
-        <w:t>More Radio Settings</w:t>
-      </w:r>
-    </w:p>
-    <w:p>
-      <w:pPr>
-        <w:pStyle w:val="Heading3"/>
-      </w:pPr>
-      <w:r>
-        <w:t>RX Offset: -600|0|+600 kHz</w:t>
-      </w:r>
-    </w:p>
-    <w:p>
-      <w:r>
-        <w:t>This is the frequency offset from the transmit frequency that the radio uses to receive DTMF commands</w:t>
-      </w:r>
-      <w:r>
-        <w:t>. An offset is recommended. If 0 is used the radio will only listen when it isn’t sending. It has not been tested if it listens during sending when the offset is not 0.</w:t>
-      </w:r>
-    </w:p>
-    <w:p>
-      <w:pPr>
-        <w:pStyle w:val="Heading3"/>
-      </w:pPr>
-      <w:r>
-        <w:lastRenderedPageBreak/>
-        <w:t>Bandwidth: 12.5|</w:t>
-      </w:r>
-      <w:r>
-        <w:t>25 kHz</w:t>
-      </w:r>
-    </w:p>
-    <w:p>
-      <w:r>
-        <w:t>This sets the radio bandwidth</w:t>
-      </w:r>
-      <w:r>
-        <w:t>. It has not been tested much to see what effect it has on performance yet.</w:t>
-      </w:r>
-    </w:p>
-    <w:p>
-      <w:pPr>
-        <w:pStyle w:val="Heading3"/>
-      </w:pPr>
-      <w:r>
-        <w:t>CTCSS/DCS: CTCSS|DCS</w:t>
-      </w:r>
-    </w:p>
-    <w:p>
-      <w:r>
-        <w:t xml:space="preserve">This sets the </w:t>
-      </w:r>
-      <w:r>
-        <w:t>un-squelch</w:t>
-      </w:r>
-      <w:r>
-        <w:t xml:space="preserve"> values</w:t>
-      </w:r>
-      <w:r>
-        <w:t xml:space="preserve"> for either the analog or digital versions.</w:t>
-      </w:r>
-    </w:p>
-    <w:p>
-      <w:pPr>
-        <w:pStyle w:val="Heading3"/>
-      </w:pPr>
-      <w:r>
-        <w:t>TX CTCSS:</w:t>
-      </w:r>
-      <w:r>
-        <w:t xml:space="preserve"> None</w:t>
-      </w:r>
-      <w:r>
-        <w:t>|</w:t>
-      </w:r>
-      <w:r>
-        <w:t>67-</w:t>
-      </w:r>
-      <w:r>
-        <w:t>250.3</w:t>
-      </w:r>
-    </w:p>
-    <w:p>
-      <w:r>
-        <w:t>Analog un-squelch frequencies sent out.</w:t>
-      </w:r>
-    </w:p>
-    <w:p>
-      <w:pPr>
-        <w:pStyle w:val="Heading3"/>
-      </w:pPr>
-      <w:r>
-        <w:t>RX CTCSS:</w:t>
-      </w:r>
-      <w:r>
-        <w:t xml:space="preserve"> None|67-250.3</w:t>
-      </w:r>
-    </w:p>
-    <w:p>
-      <w:r>
-        <w:t>Analog un-squelch frequency for receiving.</w:t>
-      </w:r>
-    </w:p>
-    <w:p>
-      <w:pPr>
-        <w:pStyle w:val="Heading3"/>
-      </w:pPr>
-      <w:r>
-        <w:t>TX DCS:</w:t>
-      </w:r>
-      <w:r>
-        <w:t xml:space="preserve"> None|023-754</w:t>
-      </w:r>
-    </w:p>
-    <w:p>
-      <w:r>
-        <w:t>Digital un-squelch value for sending.</w:t>
-      </w:r>
-    </w:p>
-    <w:p>
-      <w:pPr>
-        <w:pStyle w:val="Heading3"/>
-      </w:pPr>
-      <w:r>
-        <w:t>TX I/N: I|N</w:t>
-      </w:r>
-    </w:p>
-    <w:p>
-      <w:r>
-        <w:t>The digital I or N value for sending.</w:t>
-      </w:r>
-    </w:p>
-    <w:p>
-      <w:pPr>
-        <w:pStyle w:val="Heading3"/>
-      </w:pPr>
-      <w:r>
-        <w:t>RX DCS: None|023-754</w:t>
-      </w:r>
-    </w:p>
-    <w:p>
-      <w:r>
-        <w:t>Digital un-squelch value for receiving.</w:t>
-      </w:r>
-    </w:p>
-    <w:p>
-      <w:pPr>
-        <w:pStyle w:val="Heading3"/>
-      </w:pPr>
-      <w:r>
-        <w:t>RX I/N: I|N</w:t>
-      </w:r>
-    </w:p>
-    <w:p>
-      <w:r>
-        <w:t>The digital I or N value for receiving.</w:t>
-      </w:r>
-    </w:p>
-    <w:p>
-      <w:pPr>
-        <w:pStyle w:val="Heading3"/>
-      </w:pPr>
-      <w:r>
-        <w:t>RX Volume:</w:t>
-      </w:r>
-      <w:r>
-        <w:t xml:space="preserve"> 1-6</w:t>
-      </w:r>
-    </w:p>
-    <w:p>
-      <w:r>
-        <w:t>This is the receive volume setting. It affects how well DTMF tones are detected.</w:t>
-      </w:r>
-    </w:p>
-    <w:p>
-      <w:pPr>
-        <w:pStyle w:val="Heading3"/>
-      </w:pPr>
-      <w:r>
-        <w:t>RX Squelch:</w:t>
-      </w:r>
-      <w:r>
-        <w:t xml:space="preserve"> 0-8</w:t>
-      </w:r>
-    </w:p>
-    <w:p>
-      <w:r>
-        <w:t>This affects how much signal is required to receive the DTMF signals.</w:t>
-      </w:r>
-    </w:p>
-    <w:p>
-      <w:pPr>
-        <w:pStyle w:val="Heading2"/>
-      </w:pPr>
-      <w:r>
-        <w:t>Cancel Waits/TX Now</w:t>
-      </w:r>
-    </w:p>
-    <w:p>
-      <w:r>
-        <w:t xml:space="preserve">When the radio is in either send or pause mode this command will cancel the </w:t>
-      </w:r>
-      <w:proofErr w:type="gramStart"/>
-      <w:r>
-        <w:t>timer</w:t>
-      </w:r>
-      <w:proofErr w:type="gramEnd"/>
-      <w:r>
-        <w:t xml:space="preserve"> and the next mo</w:t>
-      </w:r>
-      <w:r>
-        <w:t xml:space="preserve">de will start. For </w:t>
-      </w:r>
-      <w:proofErr w:type="gramStart"/>
-      <w:r>
-        <w:t>example</w:t>
-      </w:r>
-      <w:proofErr w:type="gramEnd"/>
-      <w:r>
-        <w:t xml:space="preserve"> if you want to cancel</w:t>
-      </w:r>
-      <w:r>
-        <w:t xml:space="preserve"> the pause and go to transmit, use this option. It can also be done by long pressing B0.</w:t>
-      </w:r>
-    </w:p>
-    <w:p>
-      <w:pPr>
-        <w:pStyle w:val="Heading2"/>
-      </w:pPr>
-      <w:r>
-        <w:lastRenderedPageBreak/>
-        <w:t>+Saved Settings Files</w:t>
-      </w:r>
-    </w:p>
-    <w:p>
-      <w:r>
-        <w:t>Saved settings files are named files stored on the SD card. They are useful to</w:t>
-      </w:r>
-      <w:r>
-        <w:t xml:space="preserve"> quickly configure the radio for different uses. All values except the battery calibration are affected.</w:t>
-      </w:r>
-    </w:p>
-    <w:p>
-      <w:pPr>
-        <w:pStyle w:val="Heading3"/>
-      </w:pPr>
-      <w:r>
-        <w:t>Create File</w:t>
-      </w:r>
-    </w:p>
-    <w:p>
-      <w:r>
-        <w:t>This prompts the user for a name. The file is then created using the current system settings.</w:t>
-      </w:r>
-    </w:p>
-    <w:p>
-      <w:pPr>
-        <w:pStyle w:val="Heading3"/>
-      </w:pPr>
-      <w:r>
-        <w:t>Save/Update File</w:t>
-      </w:r>
-    </w:p>
-    <w:p>
-      <w:r>
-        <w:t xml:space="preserve">This command saves the current settings into the selected file. If it already </w:t>
-      </w:r>
-      <w:proofErr w:type="gramStart"/>
-      <w:r>
-        <w:t>exists</w:t>
-      </w:r>
-      <w:proofErr w:type="gramEnd"/>
-      <w:r>
-        <w:t xml:space="preserve"> the user will be asked to confirm overwriting the file.</w:t>
-      </w:r>
-    </w:p>
-    <w:p>
-      <w:pPr>
-        <w:pStyle w:val="Heading3"/>
-      </w:pPr>
-      <w:r>
-        <w:t>Load File</w:t>
-      </w:r>
-    </w:p>
-    <w:p>
-      <w:r>
-        <w:t xml:space="preserve">This command asks the user for the name and then sets </w:t>
-      </w:r>
-      <w:proofErr w:type="gramStart"/>
-      <w:r>
-        <w:t>all of</w:t>
-      </w:r>
-      <w:proofErr w:type="gramEnd"/>
-      <w:r>
-        <w:t xml:space="preserve"> the system settings except the battery calibration using the values in the file.</w:t>
-      </w:r>
-    </w:p>
-    <w:p>
-      <w:pPr>
-        <w:pStyle w:val="Heading3"/>
-      </w:pPr>
-      <w:r>
-        <w:t>Delete File</w:t>
-      </w:r>
-    </w:p>
-    <w:p>
-      <w:r>
-        <w:t>The user selects a file from the list and then it can be deleted.</w:t>
-      </w:r>
-    </w:p>
-    <w:p>
-      <w:pPr>
-        <w:pStyle w:val="Heading2"/>
-      </w:pPr>
-      <w:r>
-        <w:t>+System Settings</w:t>
-      </w:r>
-    </w:p>
-    <w:p>
-      <w:pPr>
-        <w:pStyle w:val="Heading3"/>
-      </w:pPr>
-      <w:r>
-        <w:t>+Display</w:t>
-      </w:r>
-      <w:r>
-        <w:t xml:space="preserve"> Settings</w:t>
-      </w:r>
-    </w:p>
-    <w:p>
-      <w:pPr>
-        <w:pStyle w:val="Heading4"/>
-      </w:pPr>
-      <w:r>
-        <w:t xml:space="preserve">Dimming Mode: </w:t>
-      </w:r>
-      <w:proofErr w:type="spellStart"/>
-      <w:r>
-        <w:t>None</w:t>
-      </w:r>
-      <w:r>
-        <w:t>|Timer</w:t>
-      </w:r>
-      <w:proofErr w:type="spellEnd"/>
-    </w:p>
-    <w:p>
-      <w:r>
-        <w:t xml:space="preserve">The display can be set to dim automatically after a specified number of seconds. This is used to save battery power since the backlight </w:t>
-      </w:r>
-      <w:r>
-        <w:t>uses a significant amount.</w:t>
-      </w:r>
-    </w:p>
-    <w:p>
-      <w:pPr>
-        <w:pStyle w:val="Heading4"/>
-      </w:pPr>
-      <w:r>
-        <w:t>Bright Value: 1-100</w:t>
-      </w:r>
-      <w:r>
-        <w:t>%</w:t>
-      </w:r>
-    </w:p>
-    <w:p>
-      <w:r>
-        <w:t>Set the display brightness value.</w:t>
-      </w:r>
-    </w:p>
-    <w:p>
-      <w:pPr>
-        <w:pStyle w:val="Heading4"/>
-      </w:pPr>
-      <w:r>
-        <w:t xml:space="preserve">Dim Value: </w:t>
-      </w:r>
-      <w:r>
-        <w:t>0-100%</w:t>
-      </w:r>
-    </w:p>
-    <w:p>
-      <w:r>
-        <w:t xml:space="preserve">Set the display brightness after the </w:t>
-      </w:r>
-      <w:r>
-        <w:t>timer below expires.</w:t>
-      </w:r>
-    </w:p>
-    <w:p>
-      <w:pPr>
-        <w:pStyle w:val="Heading4"/>
-      </w:pPr>
-      <w:r>
-        <w:t>Display Dim Time:</w:t>
-      </w:r>
-      <w:r>
-        <w:t xml:space="preserve"> 0-120 S</w:t>
-      </w:r>
-    </w:p>
-    <w:p>
-      <w:r>
-        <w:t>Specify the time until the display changes to dim mode.</w:t>
-      </w:r>
-    </w:p>
-    <w:p>
-      <w:pPr>
-        <w:pStyle w:val="Heading4"/>
-      </w:pPr>
-      <w:r>
-        <w:t>+Sideways Scroll Settings</w:t>
-      </w:r>
-    </w:p>
-    <w:p>
-      <w:r>
-        <w:t xml:space="preserve">Lines of text that </w:t>
-      </w:r>
-      <w:proofErr w:type="gramStart"/>
-      <w:r>
-        <w:t>too</w:t>
-      </w:r>
-      <w:proofErr w:type="gramEnd"/>
-      <w:r>
         <w:t xml:space="preserve"> long for the display will scroll back and forth. The following settings control the speed.</w:t>
       </w:r>
     </w:p>
@@ -3436,7 +3458,6 @@
         <w:pStyle w:val="Heading5"/>
       </w:pPr>
       <w:r>
-        <w:lastRenderedPageBreak/>
         <w:t xml:space="preserve">Speed: </w:t>
       </w:r>
       <w:r>
@@ -3617,6 +3638,7 @@
         <w:pStyle w:val="Heading4"/>
       </w:pPr>
       <w:r>
+        <w:lastRenderedPageBreak/>
         <w:t>Full Battery: 2000-4000</w:t>
       </w:r>
     </w:p>
@@ -3643,7 +3665,6 @@
         <w:pStyle w:val="Heading4"/>
       </w:pPr>
       <w:r>
-        <w:lastRenderedPageBreak/>
         <w:t>Read Battery Raw Data</w:t>
       </w:r>
     </w:p>

</xml_diff>

<commit_message>
Added mainmenu entries to return to main run screen. It used to be a long press only could do that.
</commit_message>
<xml_diff>
--- a/RadioFox.docx
+++ b/RadioFox.docx
@@ -308,6 +308,23 @@
       </w:r>
       <w:r>
         <w:t xml:space="preserve"> are described below.</w:t>
+      </w:r>
+    </w:p>
+    <w:p>
+      <w:r>
+        <w:t>Version 2.10</w:t>
+      </w:r>
+    </w:p>
+    <w:p>
+      <w:pPr>
+        <w:pStyle w:val="ListParagraph"/>
+        <w:numPr>
+          <w:ilvl w:val="0"/>
+          <w:numId w:val="97"/>
+        </w:numPr>
+      </w:pPr>
+      <w:r>
+        <w:t>Added main menu entries to return to the main run screen. The long press still works.</w:t>
       </w:r>
     </w:p>
     <w:p>
@@ -542,6 +559,7 @@
       <w:bookmarkEnd w:id="4"/>
       <w:bookmarkEnd w:id="5"/>
       <w:r>
+        <w:lastRenderedPageBreak/>
         <w:t>The Hardware</w:t>
       </w:r>
     </w:p>
@@ -584,11 +602,7 @@
         <w:t>files and</w:t>
       </w:r>
       <w:r>
-        <w:t xml:space="preserve"> saved settings files. It can also be used to load </w:t>
-      </w:r>
-      <w:r>
-        <w:lastRenderedPageBreak/>
-        <w:t>new firmware onto the TTGO chip.</w:t>
+        <w:t xml:space="preserve"> saved settings files. It can also be used to load new firmware onto the TTGO chip.</w:t>
       </w:r>
       <w:r>
         <w:t xml:space="preserve"> There is also a USB C connector on the TTGO. It </w:t>
@@ -789,6 +803,7 @@
     <w:p/>
     <w:p>
       <w:r>
+        <w:lastRenderedPageBreak/>
         <w:t xml:space="preserve">The </w:t>
       </w:r>
       <w:r>
@@ -884,7 +899,6 @@
           <w:b/>
           <w:bCs/>
         </w:rPr>
-        <w:lastRenderedPageBreak/>
         <w:t>and that the data starts with the tilde which must not be in these comments</w:t>
       </w:r>
     </w:p>
@@ -1314,6 +1328,7 @@
         <w:pStyle w:val="Heading2"/>
       </w:pPr>
       <w:r>
+        <w:lastRenderedPageBreak/>
         <w:t>DTMF *1</w:t>
       </w:r>
     </w:p>
@@ -1346,7 +1361,6 @@
         <w:pStyle w:val="Heading2"/>
       </w:pPr>
       <w:r>
-        <w:lastRenderedPageBreak/>
         <w:t>DTMF *</w:t>
       </w:r>
       <w:r>
@@ -1636,6 +1650,7 @@
         <w:rPr>
           <w:lang w:val="da-DK"/>
         </w:rPr>
+        <w:lastRenderedPageBreak/>
         <w:t>B0/B1</w:t>
       </w:r>
       <w:r>
@@ -1699,7 +1714,6 @@
         <w:rPr>
           <w:lang w:val="da-DK"/>
         </w:rPr>
-        <w:lastRenderedPageBreak/>
         <w:t>B</w:t>
       </w:r>
       <w:r>
@@ -2200,6 +2214,7 @@
         <w:ind w:left="1440"/>
       </w:pPr>
       <w:r>
+        <w:lastRenderedPageBreak/>
         <w:t>Accept integer</w:t>
       </w:r>
     </w:p>
@@ -2232,7 +2247,6 @@
         <w:ind w:left="1440"/>
       </w:pPr>
       <w:r>
-        <w:lastRenderedPageBreak/>
         <w:t xml:space="preserve">Toggle </w:t>
       </w:r>
       <w:proofErr w:type="spellStart"/>
@@ -2539,6 +2553,7 @@
         </w:rPr>
       </w:pPr>
       <w:r>
+        <w:lastRenderedPageBreak/>
         <w:t>Beacon Frequenc</w:t>
       </w:r>
       <w:r>
@@ -2576,7 +2591,6 @@
         <w:pStyle w:val="Heading3"/>
       </w:pPr>
       <w:r>
-        <w:lastRenderedPageBreak/>
         <w:t xml:space="preserve">TX: </w:t>
       </w:r>
       <w:r>
@@ -2805,7 +2819,11 @@
         <w:t xml:space="preserve"> mode the sending time and pause timer are controlled by the Send and Pause values</w:t>
       </w:r>
       <w:r>
-        <w:t xml:space="preserve"> and are always the same. In Random mode the transmit time and pause time are randomly chosen</w:t>
+        <w:t xml:space="preserve"> and are always the same. In Random mode the transmit time and pause time are randomly </w:t>
+      </w:r>
+      <w:r>
+        <w:lastRenderedPageBreak/>
+        <w:t>chosen</w:t>
       </w:r>
       <w:r>
         <w:t xml:space="preserve"> from the allowed values set in the Min and Max values for TX Send and Pause. This makes the timing less predictable and </w:t>
@@ -2827,7 +2845,6 @@
         <w:pStyle w:val="Heading3"/>
       </w:pPr>
       <w:r>
-        <w:lastRenderedPageBreak/>
         <w:t xml:space="preserve">TX Send: </w:t>
       </w:r>
       <w:r>
@@ -3442,15 +3459,7 @@
     </w:p>
     <w:p>
       <w:r>
-        <w:t xml:space="preserve">Lines of text that </w:t>
-      </w:r>
-      <w:proofErr w:type="gramStart"/>
-      <w:r>
-        <w:t>too</w:t>
-      </w:r>
-      <w:proofErr w:type="gramEnd"/>
-      <w:r>
-        <w:t xml:space="preserve"> long for the display will scroll back and forth. The following settings control the speed.</w:t>
+        <w:t>Lines of text that too long for the display will scroll back and forth. The following settings control the speed.</w:t>
       </w:r>
     </w:p>
     <w:p>
@@ -12973,6 +12982,118 @@
     </w:lvl>
   </w:abstractNum>
   <w:abstractNum w:abstractNumId="80" w15:restartNumberingAfterBreak="0">
+    <w:nsid w:val="622F692B"/>
+    <w:multiLevelType w:val="hybridMultilevel"/>
+    <w:tmpl w:val="63B20C1E"/>
+    <w:lvl w:ilvl="0" w:tplc="93849BFA">
+      <w:numFmt w:val="bullet"/>
+      <w:lvlText w:val="-"/>
+      <w:lvlJc w:val="left"/>
+      <w:pPr>
+        <w:ind w:left="720" w:hanging="360"/>
+      </w:pPr>
+      <w:rPr>
+        <w:rFonts w:ascii="Arial" w:eastAsia="Arial" w:hAnsi="Arial" w:cs="Arial" w:hint="default"/>
+      </w:rPr>
+    </w:lvl>
+    <w:lvl w:ilvl="1" w:tplc="04090003" w:tentative="1">
+      <w:start w:val="1"/>
+      <w:numFmt w:val="bullet"/>
+      <w:lvlText w:val="o"/>
+      <w:lvlJc w:val="left"/>
+      <w:pPr>
+        <w:ind w:left="1440" w:hanging="360"/>
+      </w:pPr>
+      <w:rPr>
+        <w:rFonts w:ascii="Courier New" w:hAnsi="Courier New" w:cs="Courier New" w:hint="default"/>
+      </w:rPr>
+    </w:lvl>
+    <w:lvl w:ilvl="2" w:tplc="04090005" w:tentative="1">
+      <w:start w:val="1"/>
+      <w:numFmt w:val="bullet"/>
+      <w:lvlText w:val=""/>
+      <w:lvlJc w:val="left"/>
+      <w:pPr>
+        <w:ind w:left="2160" w:hanging="360"/>
+      </w:pPr>
+      <w:rPr>
+        <w:rFonts w:ascii="Wingdings" w:hAnsi="Wingdings" w:hint="default"/>
+      </w:rPr>
+    </w:lvl>
+    <w:lvl w:ilvl="3" w:tplc="04090001" w:tentative="1">
+      <w:start w:val="1"/>
+      <w:numFmt w:val="bullet"/>
+      <w:lvlText w:val=""/>
+      <w:lvlJc w:val="left"/>
+      <w:pPr>
+        <w:ind w:left="2880" w:hanging="360"/>
+      </w:pPr>
+      <w:rPr>
+        <w:rFonts w:ascii="Symbol" w:hAnsi="Symbol" w:hint="default"/>
+      </w:rPr>
+    </w:lvl>
+    <w:lvl w:ilvl="4" w:tplc="04090003" w:tentative="1">
+      <w:start w:val="1"/>
+      <w:numFmt w:val="bullet"/>
+      <w:lvlText w:val="o"/>
+      <w:lvlJc w:val="left"/>
+      <w:pPr>
+        <w:ind w:left="3600" w:hanging="360"/>
+      </w:pPr>
+      <w:rPr>
+        <w:rFonts w:ascii="Courier New" w:hAnsi="Courier New" w:cs="Courier New" w:hint="default"/>
+      </w:rPr>
+    </w:lvl>
+    <w:lvl w:ilvl="5" w:tplc="04090005" w:tentative="1">
+      <w:start w:val="1"/>
+      <w:numFmt w:val="bullet"/>
+      <w:lvlText w:val=""/>
+      <w:lvlJc w:val="left"/>
+      <w:pPr>
+        <w:ind w:left="4320" w:hanging="360"/>
+      </w:pPr>
+      <w:rPr>
+        <w:rFonts w:ascii="Wingdings" w:hAnsi="Wingdings" w:hint="default"/>
+      </w:rPr>
+    </w:lvl>
+    <w:lvl w:ilvl="6" w:tplc="04090001" w:tentative="1">
+      <w:start w:val="1"/>
+      <w:numFmt w:val="bullet"/>
+      <w:lvlText w:val=""/>
+      <w:lvlJc w:val="left"/>
+      <w:pPr>
+        <w:ind w:left="5040" w:hanging="360"/>
+      </w:pPr>
+      <w:rPr>
+        <w:rFonts w:ascii="Symbol" w:hAnsi="Symbol" w:hint="default"/>
+      </w:rPr>
+    </w:lvl>
+    <w:lvl w:ilvl="7" w:tplc="04090003" w:tentative="1">
+      <w:start w:val="1"/>
+      <w:numFmt w:val="bullet"/>
+      <w:lvlText w:val="o"/>
+      <w:lvlJc w:val="left"/>
+      <w:pPr>
+        <w:ind w:left="5760" w:hanging="360"/>
+      </w:pPr>
+      <w:rPr>
+        <w:rFonts w:ascii="Courier New" w:hAnsi="Courier New" w:cs="Courier New" w:hint="default"/>
+      </w:rPr>
+    </w:lvl>
+    <w:lvl w:ilvl="8" w:tplc="04090005" w:tentative="1">
+      <w:start w:val="1"/>
+      <w:numFmt w:val="bullet"/>
+      <w:lvlText w:val=""/>
+      <w:lvlJc w:val="left"/>
+      <w:pPr>
+        <w:ind w:left="6480" w:hanging="360"/>
+      </w:pPr>
+      <w:rPr>
+        <w:rFonts w:ascii="Wingdings" w:hAnsi="Wingdings" w:hint="default"/>
+      </w:rPr>
+    </w:lvl>
+  </w:abstractNum>
+  <w:abstractNum w:abstractNumId="81" w15:restartNumberingAfterBreak="0">
     <w:nsid w:val="62D1418B"/>
     <w:multiLevelType w:val="multilevel"/>
     <w:tmpl w:val="3E58308A"/>
@@ -13071,7 +13192,7 @@
       </w:pPr>
     </w:lvl>
   </w:abstractNum>
-  <w:abstractNum w:abstractNumId="81" w15:restartNumberingAfterBreak="0">
+  <w:abstractNum w:abstractNumId="82" w15:restartNumberingAfterBreak="0">
     <w:nsid w:val="62E52923"/>
     <w:multiLevelType w:val="hybridMultilevel"/>
     <w:tmpl w:val="7668165A"/>
@@ -13183,7 +13304,7 @@
       </w:rPr>
     </w:lvl>
   </w:abstractNum>
-  <w:abstractNum w:abstractNumId="82" w15:restartNumberingAfterBreak="0">
+  <w:abstractNum w:abstractNumId="83" w15:restartNumberingAfterBreak="0">
     <w:nsid w:val="63935A88"/>
     <w:multiLevelType w:val="hybridMultilevel"/>
     <w:tmpl w:val="0F5805EA"/>
@@ -13295,7 +13416,7 @@
       </w:rPr>
     </w:lvl>
   </w:abstractNum>
-  <w:abstractNum w:abstractNumId="83" w15:restartNumberingAfterBreak="0">
+  <w:abstractNum w:abstractNumId="84" w15:restartNumberingAfterBreak="0">
     <w:nsid w:val="69496F08"/>
     <w:multiLevelType w:val="hybridMultilevel"/>
     <w:tmpl w:val="6EE839E4"/>
@@ -13407,7 +13528,7 @@
       </w:rPr>
     </w:lvl>
   </w:abstractNum>
-  <w:abstractNum w:abstractNumId="84" w15:restartNumberingAfterBreak="0">
+  <w:abstractNum w:abstractNumId="85" w15:restartNumberingAfterBreak="0">
     <w:nsid w:val="6ACC6C5E"/>
     <w:multiLevelType w:val="multilevel"/>
     <w:tmpl w:val="4AB8E1DA"/>
@@ -13520,7 +13641,7 @@
       </w:rPr>
     </w:lvl>
   </w:abstractNum>
-  <w:abstractNum w:abstractNumId="85" w15:restartNumberingAfterBreak="0">
+  <w:abstractNum w:abstractNumId="86" w15:restartNumberingAfterBreak="0">
     <w:nsid w:val="6D7319F8"/>
     <w:multiLevelType w:val="hybridMultilevel"/>
     <w:tmpl w:val="A7EEE4A4"/>
@@ -13632,7 +13753,7 @@
       </w:rPr>
     </w:lvl>
   </w:abstractNum>
-  <w:abstractNum w:abstractNumId="86" w15:restartNumberingAfterBreak="0">
+  <w:abstractNum w:abstractNumId="87" w15:restartNumberingAfterBreak="0">
     <w:nsid w:val="6D94244E"/>
     <w:multiLevelType w:val="hybridMultilevel"/>
     <w:tmpl w:val="D38C1A3A"/>
@@ -13744,7 +13865,7 @@
       </w:rPr>
     </w:lvl>
   </w:abstractNum>
-  <w:abstractNum w:abstractNumId="87" w15:restartNumberingAfterBreak="0">
+  <w:abstractNum w:abstractNumId="88" w15:restartNumberingAfterBreak="0">
     <w:nsid w:val="6DEA09BD"/>
     <w:multiLevelType w:val="hybridMultilevel"/>
     <w:tmpl w:val="029A123E"/>
@@ -13856,7 +13977,7 @@
       </w:rPr>
     </w:lvl>
   </w:abstractNum>
-  <w:abstractNum w:abstractNumId="88" w15:restartNumberingAfterBreak="0">
+  <w:abstractNum w:abstractNumId="89" w15:restartNumberingAfterBreak="0">
     <w:nsid w:val="6E310D77"/>
     <w:multiLevelType w:val="hybridMultilevel"/>
     <w:tmpl w:val="9C74834E"/>
@@ -13969,7 +14090,7 @@
       </w:rPr>
     </w:lvl>
   </w:abstractNum>
-  <w:abstractNum w:abstractNumId="89" w15:restartNumberingAfterBreak="0">
+  <w:abstractNum w:abstractNumId="90" w15:restartNumberingAfterBreak="0">
     <w:nsid w:val="74D85371"/>
     <w:multiLevelType w:val="hybridMultilevel"/>
     <w:tmpl w:val="B20E36AC"/>
@@ -14081,7 +14202,7 @@
       </w:rPr>
     </w:lvl>
   </w:abstractNum>
-  <w:abstractNum w:abstractNumId="90" w15:restartNumberingAfterBreak="0">
+  <w:abstractNum w:abstractNumId="91" w15:restartNumberingAfterBreak="0">
     <w:nsid w:val="75FA3747"/>
     <w:multiLevelType w:val="hybridMultilevel"/>
     <w:tmpl w:val="B9F43A9E"/>
@@ -14193,7 +14314,7 @@
       </w:rPr>
     </w:lvl>
   </w:abstractNum>
-  <w:abstractNum w:abstractNumId="91" w15:restartNumberingAfterBreak="0">
+  <w:abstractNum w:abstractNumId="92" w15:restartNumberingAfterBreak="0">
     <w:nsid w:val="7877407A"/>
     <w:multiLevelType w:val="hybridMultilevel"/>
     <w:tmpl w:val="C91E38FA"/>
@@ -14305,7 +14426,7 @@
       </w:rPr>
     </w:lvl>
   </w:abstractNum>
-  <w:abstractNum w:abstractNumId="92" w15:restartNumberingAfterBreak="0">
+  <w:abstractNum w:abstractNumId="93" w15:restartNumberingAfterBreak="0">
     <w:nsid w:val="78A40DC3"/>
     <w:multiLevelType w:val="hybridMultilevel"/>
     <w:tmpl w:val="F1E6B4B6"/>
@@ -14417,7 +14538,7 @@
       </w:rPr>
     </w:lvl>
   </w:abstractNum>
-  <w:abstractNum w:abstractNumId="93" w15:restartNumberingAfterBreak="0">
+  <w:abstractNum w:abstractNumId="94" w15:restartNumberingAfterBreak="0">
     <w:nsid w:val="79587B7C"/>
     <w:multiLevelType w:val="hybridMultilevel"/>
     <w:tmpl w:val="6A46933A"/>
@@ -14529,7 +14650,7 @@
       </w:rPr>
     </w:lvl>
   </w:abstractNum>
-  <w:abstractNum w:abstractNumId="94" w15:restartNumberingAfterBreak="0">
+  <w:abstractNum w:abstractNumId="95" w15:restartNumberingAfterBreak="0">
     <w:nsid w:val="7BB23699"/>
     <w:multiLevelType w:val="hybridMultilevel"/>
     <w:tmpl w:val="26C25814"/>
@@ -14641,7 +14762,7 @@
       </w:rPr>
     </w:lvl>
   </w:abstractNum>
-  <w:abstractNum w:abstractNumId="95" w15:restartNumberingAfterBreak="0">
+  <w:abstractNum w:abstractNumId="96" w15:restartNumberingAfterBreak="0">
     <w:nsid w:val="7F827ECF"/>
     <w:multiLevelType w:val="hybridMultilevel"/>
     <w:tmpl w:val="42DE9398"/>
@@ -14754,7 +14875,7 @@
     </w:lvl>
   </w:abstractNum>
   <w:num w:numId="1" w16cid:durableId="553472407">
-    <w:abstractNumId w:val="84"/>
+    <w:abstractNumId w:val="85"/>
   </w:num>
   <w:num w:numId="2" w16cid:durableId="1531718695">
     <w:abstractNumId w:val="17"/>
@@ -14769,16 +14890,16 @@
     <w:abstractNumId w:val="30"/>
   </w:num>
   <w:num w:numId="6" w16cid:durableId="915629572">
-    <w:abstractNumId w:val="80"/>
+    <w:abstractNumId w:val="81"/>
   </w:num>
   <w:num w:numId="7" w16cid:durableId="693576224">
-    <w:abstractNumId w:val="93"/>
+    <w:abstractNumId w:val="94"/>
   </w:num>
   <w:num w:numId="8" w16cid:durableId="1298343021">
-    <w:abstractNumId w:val="88"/>
+    <w:abstractNumId w:val="89"/>
   </w:num>
   <w:num w:numId="9" w16cid:durableId="367219526">
-    <w:abstractNumId w:val="86"/>
+    <w:abstractNumId w:val="87"/>
   </w:num>
   <w:num w:numId="10" w16cid:durableId="1497187389">
     <w:abstractNumId w:val="19"/>
@@ -14799,7 +14920,7 @@
     <w:abstractNumId w:val="5"/>
   </w:num>
   <w:num w:numId="16" w16cid:durableId="1421751508">
-    <w:abstractNumId w:val="95"/>
+    <w:abstractNumId w:val="96"/>
   </w:num>
   <w:num w:numId="17" w16cid:durableId="1009716389">
     <w:abstractNumId w:val="65"/>
@@ -14844,7 +14965,7 @@
     <w:abstractNumId w:val="18"/>
   </w:num>
   <w:num w:numId="31" w16cid:durableId="1611818230">
-    <w:abstractNumId w:val="87"/>
+    <w:abstractNumId w:val="88"/>
   </w:num>
   <w:num w:numId="32" w16cid:durableId="1666009498">
     <w:abstractNumId w:val="11"/>
@@ -14868,10 +14989,10 @@
     <w:abstractNumId w:val="35"/>
   </w:num>
   <w:num w:numId="39" w16cid:durableId="798885554">
-    <w:abstractNumId w:val="94"/>
+    <w:abstractNumId w:val="95"/>
   </w:num>
   <w:num w:numId="40" w16cid:durableId="1610315013">
-    <w:abstractNumId w:val="81"/>
+    <w:abstractNumId w:val="82"/>
   </w:num>
   <w:num w:numId="41" w16cid:durableId="213975163">
     <w:abstractNumId w:val="4"/>
@@ -14883,7 +15004,7 @@
     <w:abstractNumId w:val="22"/>
   </w:num>
   <w:num w:numId="44" w16cid:durableId="652369700">
-    <w:abstractNumId w:val="85"/>
+    <w:abstractNumId w:val="86"/>
   </w:num>
   <w:num w:numId="45" w16cid:durableId="227304564">
     <w:abstractNumId w:val="70"/>
@@ -14892,7 +15013,7 @@
     <w:abstractNumId w:val="32"/>
   </w:num>
   <w:num w:numId="47" w16cid:durableId="734011883">
-    <w:abstractNumId w:val="82"/>
+    <w:abstractNumId w:val="83"/>
   </w:num>
   <w:num w:numId="48" w16cid:durableId="2125267477">
     <w:abstractNumId w:val="74"/>
@@ -14910,10 +15031,10 @@
     <w:abstractNumId w:val="59"/>
   </w:num>
   <w:num w:numId="53" w16cid:durableId="1740665818">
-    <w:abstractNumId w:val="90"/>
+    <w:abstractNumId w:val="91"/>
   </w:num>
   <w:num w:numId="54" w16cid:durableId="452988921">
-    <w:abstractNumId w:val="91"/>
+    <w:abstractNumId w:val="92"/>
   </w:num>
   <w:num w:numId="55" w16cid:durableId="207304158">
     <w:abstractNumId w:val="72"/>
@@ -14979,7 +15100,7 @@
     <w:abstractNumId w:val="45"/>
   </w:num>
   <w:num w:numId="76" w16cid:durableId="539049649">
-    <w:abstractNumId w:val="92"/>
+    <w:abstractNumId w:val="93"/>
   </w:num>
   <w:num w:numId="77" w16cid:durableId="1288513951">
     <w:abstractNumId w:val="66"/>
@@ -14997,7 +15118,7 @@
     <w:abstractNumId w:val="36"/>
   </w:num>
   <w:num w:numId="82" w16cid:durableId="500893856">
-    <w:abstractNumId w:val="83"/>
+    <w:abstractNumId w:val="84"/>
   </w:num>
   <w:num w:numId="83" w16cid:durableId="1950622049">
     <w:abstractNumId w:val="60"/>
@@ -15024,7 +15145,7 @@
     <w:abstractNumId w:val="67"/>
   </w:num>
   <w:num w:numId="91" w16cid:durableId="780148532">
-    <w:abstractNumId w:val="89"/>
+    <w:abstractNumId w:val="90"/>
   </w:num>
   <w:num w:numId="92" w16cid:durableId="304706915">
     <w:abstractNumId w:val="47"/>
@@ -15040,6 +15161,9 @@
   </w:num>
   <w:num w:numId="96" w16cid:durableId="1417553145">
     <w:abstractNumId w:val="9"/>
+  </w:num>
+  <w:num w:numId="97" w16cid:durableId="2112820987">
+    <w:abstractNumId w:val="80"/>
   </w:num>
   <w:numIdMacAtCleanup w:val="84"/>
 </w:numbering>

</xml_diff>

<commit_message>
Added floats to menu system. Used for latitude and longitude settings.
</commit_message>
<xml_diff>
--- a/RadioFox.docx
+++ b/RadioFox.docx
@@ -88,6 +88,11 @@
     </w:p>
     <w:p/>
     <w:p>
+      <w:pPr>
+        <w:rPr>
+          <w:lang w:val="en-US"/>
+        </w:rPr>
+      </w:pPr>
       <w:r>
         <w:rPr>
           <w:lang w:val="en-US"/>
@@ -111,6 +116,36 @@
     </w:p>
     <w:p>
       <w:pPr>
+        <w:rPr>
+          <w:lang w:val="en-US"/>
+        </w:rPr>
+      </w:pPr>
+    </w:p>
+    <w:p>
+      <w:pPr>
+        <w:rPr>
+          <w:lang w:val="en-US"/>
+        </w:rPr>
+      </w:pPr>
+      <w:r>
+        <w:rPr>
+          <w:lang w:val="en-US"/>
+        </w:rPr>
+        <w:t xml:space="preserve">A link to this file can be found here: </w:t>
+      </w:r>
+      <w:hyperlink r:id="rId8" w:history="1">
+        <w:r>
+          <w:rPr>
+            <w:rStyle w:val="Hyperlink"/>
+            <w:lang w:val="en-US"/>
+          </w:rPr>
+          <w:t>https://www.youtube.com/watch?v=oTXZL2KgMQE</w:t>
+        </w:r>
+      </w:hyperlink>
+    </w:p>
+    <w:p/>
+    <w:p>
+      <w:pPr>
         <w:pStyle w:val="Heading2"/>
       </w:pPr>
       <w:r>
@@ -167,6 +202,7 @@
         <w:pStyle w:val="Heading2"/>
       </w:pPr>
       <w:r>
+        <w:lastRenderedPageBreak/>
         <w:t>Initial Setup</w:t>
       </w:r>
     </w:p>
@@ -178,11 +214,7 @@
         <w:t>your call sign out periodically. The radio cycles between Call Sign and Beacon (whatever text you want) and the music if a music file has been selected.</w:t>
       </w:r>
       <w:r>
-        <w:t xml:space="preserve"> The Beacon and Call </w:t>
-      </w:r>
-      <w:r>
-        <w:lastRenderedPageBreak/>
-        <w:t xml:space="preserve">Sign are sent out as morse code. A future revision of the PCB is </w:t>
+        <w:t xml:space="preserve"> The Beacon and Call Sign are sent out as morse code. A future revision of the PCB is </w:t>
       </w:r>
       <w:r>
         <w:t xml:space="preserve">being </w:t>
@@ -412,6 +444,7 @@
         </w:numPr>
       </w:pPr>
       <w:r>
+        <w:lastRenderedPageBreak/>
         <w:t>Change "Beacon Frequency Mode" in menus to "Beacon Frequency".</w:t>
       </w:r>
     </w:p>
@@ -460,7 +493,6 @@
         </w:numPr>
       </w:pPr>
       <w:r>
-        <w:lastRenderedPageBreak/>
         <w:t>Added adjustable</w:t>
       </w:r>
       <w:r>
@@ -573,21 +605,7 @@
         <w:rPr>
           <w:lang w:val="en-US"/>
         </w:rPr>
-        <w:t xml:space="preserve">This is </w:t>
-      </w:r>
-      <w:proofErr w:type="gramStart"/>
-      <w:r>
-        <w:rPr>
-          <w:lang w:val="en-US"/>
-        </w:rPr>
-        <w:t>initial</w:t>
-      </w:r>
-      <w:proofErr w:type="gramEnd"/>
-      <w:r>
-        <w:rPr>
-          <w:lang w:val="en-US"/>
-        </w:rPr>
-        <w:t xml:space="preserve"> version when this document was first created. The software is considered mostly complete.</w:t>
+        <w:t>This is initial version when this document was first created. The software is considered mostly complete.</w:t>
       </w:r>
     </w:p>
     <w:p>
@@ -619,112 +637,62 @@
         <w:rPr>
           <w:lang w:val="en-US"/>
         </w:rPr>
-        <w:t xml:space="preserve">The Fox is a single PCB that includes an </w:t>
-      </w:r>
-      <w:proofErr w:type="gramStart"/>
+        <w:t>The Fox is a single PCB that includes an 18650 battery holder that can have 1 or 2 batteries. There is a USB C connector on the left edge used for charging the batteries. Above that is a micro-SD slot. The SD card holds tone files and saved settings files. It can also be used to load new firmware onto the TTGO chip. There is also a USB C connector on the TTGO. It is used for downloading firmware or debugging operations. It might also be used for serial communications in a future firmware release. It is not used for charging the batteries.</w:t>
+      </w:r>
+    </w:p>
+    <w:p>
+      <w:pPr>
+        <w:pStyle w:val="Heading2"/>
+      </w:pPr>
+      <w:r>
+        <w:t>Radio</w:t>
+      </w:r>
+    </w:p>
+    <w:p>
       <w:r>
         <w:rPr>
           <w:lang w:val="en-US"/>
         </w:rPr>
-        <w:t>18650 battery</w:t>
-      </w:r>
-      <w:proofErr w:type="gramEnd"/>
+        <w:t>The radio functions are handled by the SA818-V on the top right. There are vents in the case to allow cooling as this module can become quite hot when transmitting at high power for longer timer intervals. Transmitting longer than one minute is not recommended. High power is about 5W and low power is about 3W. Make sure a suitable antenna is connected to avoid damage to the radio circuit.</w:t>
+      </w:r>
+    </w:p>
+    <w:p>
+      <w:pPr>
+        <w:pStyle w:val="Heading2"/>
+      </w:pPr>
+      <w:r>
+        <w:t>Batteries</w:t>
+      </w:r>
+    </w:p>
+    <w:p>
       <w:r>
         <w:rPr>
           <w:lang w:val="en-US"/>
         </w:rPr>
-        <w:t xml:space="preserve"> holder that can have 1 or 2 batteries. There is a USB C connector on the left edge used for charging the batteries. Above that is a micro-SD slot. The SD card holds tone files and saved settings files. It can also be used to load new firmware onto the TTGO chip. There is also a USB C connector on the TTGO. It is used for downloading firmware or debugging operations. It might also be used for serial communications in a future firmware release. It is not used for charging the batteries.</w:t>
-      </w:r>
-    </w:p>
-    <w:p>
-      <w:pPr>
-        <w:pStyle w:val="Heading2"/>
-      </w:pPr>
-      <w:r>
-        <w:t>Radio</w:t>
-      </w:r>
-    </w:p>
-    <w:p>
+        <w:t xml:space="preserve">The 18650 batteries must button top style and protection is recommended. The 18650 battery length is a very loose standard and some batteries may not fit. Too long and they cannot be used. Too short, it might be possible to bend the contacts on the battery holder negative side. </w:t>
+      </w:r>
       <w:r>
         <w:rPr>
           <w:lang w:val="en-US"/>
         </w:rPr>
-        <w:t xml:space="preserve">The radio functions are handled by the SA818-V on the top right. There are vents in the case to allow cooling as this module can become quite hot when transmitting at high power for longer timer intervals. Transmitting longer than one minute is not recommended. High power is about </w:t>
-      </w:r>
-      <w:proofErr w:type="gramStart"/>
+        <w:lastRenderedPageBreak/>
+        <w:t>The battery holder is polarized to prevent insertion in the wrong direction. Do not defeat the feature or magic blue smoke may appear from the PCB!</w:t>
+      </w:r>
+    </w:p>
+    <w:p>
+      <w:pPr>
+        <w:pStyle w:val="Heading1"/>
+      </w:pPr>
+      <w:r>
+        <w:t>Run Time</w:t>
+      </w:r>
+    </w:p>
+    <w:p>
       <w:r>
         <w:rPr>
           <w:lang w:val="en-US"/>
         </w:rPr>
-        <w:t>5W</w:t>
-      </w:r>
-      <w:proofErr w:type="gramEnd"/>
-      <w:r>
-        <w:rPr>
-          <w:lang w:val="en-US"/>
-        </w:rPr>
-        <w:t xml:space="preserve"> and low power is about 3W. Make sure a suitable antenna is connected to avoid damage to the radio circuit.</w:t>
-      </w:r>
-    </w:p>
-    <w:p>
-      <w:pPr>
-        <w:pStyle w:val="Heading2"/>
-      </w:pPr>
-      <w:r>
-        <w:t>Batteries</w:t>
-      </w:r>
-    </w:p>
-    <w:p>
-      <w:r>
-        <w:rPr>
-          <w:lang w:val="en-US"/>
-        </w:rPr>
-        <w:t xml:space="preserve">The 18650 batteries must button top style and protection is recommended. The </w:t>
-      </w:r>
-      <w:proofErr w:type="gramStart"/>
-      <w:r>
-        <w:rPr>
-          <w:lang w:val="en-US"/>
-        </w:rPr>
-        <w:t>18650 battery</w:t>
-      </w:r>
-      <w:proofErr w:type="gramEnd"/>
-      <w:r>
-        <w:rPr>
-          <w:lang w:val="en-US"/>
-        </w:rPr>
-        <w:t xml:space="preserve"> length is a very loose standard and some batteries may not fit. Too long and they cannot be used. Too short, it might be possible to bend the contacts on the battery holder negative side. The battery holder is polarized to prevent insertion in the wrong direction. Do not defeat the feature or magic blue smoke may appear from the PCB!</w:t>
-      </w:r>
-    </w:p>
-    <w:p>
-      <w:pPr>
-        <w:pStyle w:val="Heading1"/>
-      </w:pPr>
-      <w:r>
-        <w:lastRenderedPageBreak/>
-        <w:t>Run Time</w:t>
-      </w:r>
-    </w:p>
-    <w:p>
-      <w:r>
-        <w:rPr>
-          <w:lang w:val="en-US"/>
-        </w:rPr>
-        <w:t xml:space="preserve">The actual runtime depends on the transmitting time and quality of the batteries. There are many deceptively labelled 18650 batteries available. The best one </w:t>
-      </w:r>
-      <w:proofErr w:type="gramStart"/>
-      <w:r>
-        <w:rPr>
-          <w:lang w:val="en-US"/>
-        </w:rPr>
-        <w:t>are</w:t>
-      </w:r>
-      <w:proofErr w:type="gramEnd"/>
-      <w:r>
-        <w:rPr>
-          <w:lang w:val="en-US"/>
-        </w:rPr>
-        <w:t xml:space="preserve"> made by Panasonic and Sanyo. Using 1 minute transmit, 4 minutes pause, low power setting, and display dimming the Fox Radio ran for 12 hours using Panasonic batteries.</w:t>
+        <w:t>The actual runtime depends on the transmitting time and quality of the batteries. There are many deceptively labelled 18650 batteries available. The best one are made by Panasonic and Sanyo. Using 1 minute transmit, 4 minutes pause, low power setting, and display dimming the Fox Radio ran for 12 hours using Panasonic batteries.</w:t>
       </w:r>
     </w:p>
     <w:p>
@@ -751,7 +719,7 @@
         </w:rPr>
         <w:t xml:space="preserve">The files are saved as .TXT and simply contain a list of tones to be played. The format is similar the hard coded files from here: </w:t>
       </w:r>
-      <w:hyperlink r:id="rId8">
+      <w:hyperlink r:id="rId9">
         <w:proofErr w:type="spellStart"/>
         <w:r>
           <w:rPr>
@@ -996,25 +964,24 @@
           <w:bCs/>
           <w:lang w:val="en-US"/>
         </w:rPr>
-        <w:t xml:space="preserve">NOTE_E5, </w:t>
-      </w:r>
-      <w:proofErr w:type="gramStart"/>
-      <w:r>
+        <w:t>NOTE_E5, 4,  NOTE_B4, 8,  NOTE_C5, 8,  NOTE_D5, 4,  NOTE_C5, 8,  NOTE_B4, 8,</w:t>
+      </w:r>
+    </w:p>
+    <w:p>
+      <w:pPr>
         <w:rPr>
           <w:b/>
           <w:bCs/>
           <w:lang w:val="en-US"/>
         </w:rPr>
-        <w:t>4,  NOTE</w:t>
-      </w:r>
-      <w:proofErr w:type="gramEnd"/>
+      </w:pPr>
       <w:r>
         <w:rPr>
           <w:b/>
           <w:bCs/>
           <w:lang w:val="en-US"/>
         </w:rPr>
-        <w:t>_B4, 8,  NOTE_C5, 8,  NOTE_D5, 4,  NOTE_C5, 8,  NOTE_B4, 8,</w:t>
+        <w:t>NOTE_A4, 4,  NOTE_A4, 8,  NOTE_C5, 8,  NOTE_E5, 4,  NOTE_D5, 8,  NOTE_C5, 8,</w:t>
       </w:r>
     </w:p>
     <w:p>
@@ -1031,25 +998,24 @@
           <w:bCs/>
           <w:lang w:val="en-US"/>
         </w:rPr>
-        <w:t xml:space="preserve">NOTE_A4, </w:t>
-      </w:r>
-      <w:proofErr w:type="gramStart"/>
-      <w:r>
+        <w:t>NOTE_B4, -4, NOTE_C5, 8,  NOTE_D5, 4,  NOTE_E5, 4,</w:t>
+      </w:r>
+    </w:p>
+    <w:p>
+      <w:pPr>
         <w:rPr>
           <w:b/>
           <w:bCs/>
           <w:lang w:val="en-US"/>
         </w:rPr>
-        <w:t>4,  NOTE</w:t>
-      </w:r>
-      <w:proofErr w:type="gramEnd"/>
+      </w:pPr>
       <w:r>
         <w:rPr>
           <w:b/>
           <w:bCs/>
           <w:lang w:val="en-US"/>
         </w:rPr>
-        <w:t>_A4, 8,  NOTE_C5, 8,  NOTE_E5, 4,  NOTE_D5, 8,  NOTE_C5, 8,</w:t>
+        <w:t>NOTE_C5, 4,  NOTE_A4, 4,  NOTE_A4, 8,  NOTE_A4, 4,  NOTE_B4, 8,  NOTE_C5, 8,</w:t>
       </w:r>
     </w:p>
     <w:p>
@@ -1066,25 +1032,24 @@
           <w:bCs/>
           <w:lang w:val="en-US"/>
         </w:rPr>
-        <w:t xml:space="preserve">NOTE_B4, -4, NOTE_C5, </w:t>
-      </w:r>
-      <w:proofErr w:type="gramStart"/>
-      <w:r>
+        <w:t>NOTE_D5, -4, NOTE_F5, 8,  NOTE_A5, 4,  NOTE_G5, 8,  NOTE_F5, 8,</w:t>
+      </w:r>
+    </w:p>
+    <w:p>
+      <w:pPr>
         <w:rPr>
           <w:b/>
           <w:bCs/>
           <w:lang w:val="en-US"/>
         </w:rPr>
-        <w:t>8,  NOTE</w:t>
-      </w:r>
-      <w:proofErr w:type="gramEnd"/>
+      </w:pPr>
       <w:r>
         <w:rPr>
           <w:b/>
           <w:bCs/>
           <w:lang w:val="en-US"/>
         </w:rPr>
-        <w:t>_D5, 4,  NOTE_E5, 4,</w:t>
+        <w:t>NOTE_E5, -4, NOTE_C5, 8,  NOTE_E5, 4,  NOTE_D5, 8,  NOTE_C5, 8,</w:t>
       </w:r>
     </w:p>
     <w:p>
@@ -1101,165 +1066,24 @@
           <w:bCs/>
           <w:lang w:val="en-US"/>
         </w:rPr>
-        <w:t xml:space="preserve">NOTE_C5, </w:t>
-      </w:r>
-      <w:proofErr w:type="gramStart"/>
-      <w:r>
+        <w:t>NOTE_B4, 4,  NOTE_B4, 8,  NOTE_C5, 8,  NOTE_D5, 4,  NOTE_E5, 4,</w:t>
+      </w:r>
+    </w:p>
+    <w:p>
+      <w:pPr>
         <w:rPr>
           <w:b/>
           <w:bCs/>
           <w:lang w:val="en-US"/>
         </w:rPr>
-        <w:t>4,  NOTE</w:t>
-      </w:r>
-      <w:proofErr w:type="gramEnd"/>
+      </w:pPr>
       <w:r>
         <w:rPr>
           <w:b/>
           <w:bCs/>
           <w:lang w:val="en-US"/>
         </w:rPr>
-        <w:t>_A4, 4,  NOTE_A4, 8,  NOTE_A4, 4,  NOTE_B4, 8,  NOTE_C5, 8,</w:t>
-      </w:r>
-    </w:p>
-    <w:p>
-      <w:pPr>
-        <w:rPr>
-          <w:b/>
-          <w:bCs/>
-          <w:lang w:val="en-US"/>
-        </w:rPr>
-      </w:pPr>
-      <w:r>
-        <w:rPr>
-          <w:b/>
-          <w:bCs/>
-          <w:lang w:val="en-US"/>
-        </w:rPr>
-        <w:t xml:space="preserve">NOTE_D5, -4, NOTE_F5, </w:t>
-      </w:r>
-      <w:proofErr w:type="gramStart"/>
-      <w:r>
-        <w:rPr>
-          <w:b/>
-          <w:bCs/>
-          <w:lang w:val="en-US"/>
-        </w:rPr>
-        <w:t>8,  NOTE</w:t>
-      </w:r>
-      <w:proofErr w:type="gramEnd"/>
-      <w:r>
-        <w:rPr>
-          <w:b/>
-          <w:bCs/>
-          <w:lang w:val="en-US"/>
-        </w:rPr>
-        <w:t>_A5, 4,  NOTE_G5, 8,  NOTE_F5, 8,</w:t>
-      </w:r>
-    </w:p>
-    <w:p>
-      <w:pPr>
-        <w:rPr>
-          <w:b/>
-          <w:bCs/>
-          <w:lang w:val="en-US"/>
-        </w:rPr>
-      </w:pPr>
-      <w:r>
-        <w:rPr>
-          <w:b/>
-          <w:bCs/>
-          <w:lang w:val="en-US"/>
-        </w:rPr>
-        <w:t xml:space="preserve">NOTE_E5, -4, NOTE_C5, </w:t>
-      </w:r>
-      <w:proofErr w:type="gramStart"/>
-      <w:r>
-        <w:rPr>
-          <w:b/>
-          <w:bCs/>
-          <w:lang w:val="en-US"/>
-        </w:rPr>
-        <w:t>8,  NOTE</w:t>
-      </w:r>
-      <w:proofErr w:type="gramEnd"/>
-      <w:r>
-        <w:rPr>
-          <w:b/>
-          <w:bCs/>
-          <w:lang w:val="en-US"/>
-        </w:rPr>
-        <w:t>_E5, 4,  NOTE_D5, 8,  NOTE_C5, 8,</w:t>
-      </w:r>
-    </w:p>
-    <w:p>
-      <w:pPr>
-        <w:rPr>
-          <w:b/>
-          <w:bCs/>
-          <w:lang w:val="en-US"/>
-        </w:rPr>
-      </w:pPr>
-      <w:r>
-        <w:rPr>
-          <w:b/>
-          <w:bCs/>
-          <w:lang w:val="en-US"/>
-        </w:rPr>
-        <w:t xml:space="preserve">NOTE_B4, </w:t>
-      </w:r>
-      <w:proofErr w:type="gramStart"/>
-      <w:r>
-        <w:rPr>
-          <w:b/>
-          <w:bCs/>
-          <w:lang w:val="en-US"/>
-        </w:rPr>
-        <w:t>4,  NOTE</w:t>
-      </w:r>
-      <w:proofErr w:type="gramEnd"/>
-      <w:r>
-        <w:rPr>
-          <w:b/>
-          <w:bCs/>
-          <w:lang w:val="en-US"/>
-        </w:rPr>
-        <w:t>_B4, 8,  NOTE_C5, 8,  NOTE_D5, 4,  NOTE_E5, 4,</w:t>
-      </w:r>
-    </w:p>
-    <w:p>
-      <w:pPr>
-        <w:rPr>
-          <w:b/>
-          <w:bCs/>
-          <w:lang w:val="en-US"/>
-        </w:rPr>
-      </w:pPr>
-      <w:r>
-        <w:rPr>
-          <w:b/>
-          <w:bCs/>
-          <w:lang w:val="en-US"/>
-        </w:rPr>
-        <w:t xml:space="preserve">NOTE_C5, </w:t>
-      </w:r>
-      <w:proofErr w:type="gramStart"/>
-      <w:r>
-        <w:rPr>
-          <w:b/>
-          <w:bCs/>
-          <w:lang w:val="en-US"/>
-        </w:rPr>
-        <w:t>4,  NOTE</w:t>
-      </w:r>
-      <w:proofErr w:type="gramEnd"/>
-      <w:r>
-        <w:rPr>
-          <w:b/>
-          <w:bCs/>
-          <w:lang w:val="en-US"/>
-        </w:rPr>
-        <w:t>_A4, 4,  NOTE_A4, 4, REST, 4,</w:t>
+        <w:t>NOTE_C5, 4,  NOTE_A4, 4,  NOTE_A4, 4, REST, 4,</w:t>
       </w:r>
     </w:p>
     <w:p>
@@ -1304,21 +1128,7 @@
         <w:rPr>
           <w:lang w:val="en-US"/>
         </w:rPr>
-        <w:t xml:space="preserve"> that will attempt to load this file. Confirmation will be required from the dial, </w:t>
-      </w:r>
-      <w:proofErr w:type="gramStart"/>
-      <w:r>
-        <w:rPr>
-          <w:lang w:val="en-US"/>
-        </w:rPr>
-        <w:t>After</w:t>
-      </w:r>
-      <w:proofErr w:type="gramEnd"/>
-      <w:r>
-        <w:rPr>
-          <w:lang w:val="en-US"/>
-        </w:rPr>
-        <w:t xml:space="preserve"> loading the BIN file can optionally be erased.</w:t>
+        <w:t xml:space="preserve"> that will attempt to load this file. Confirmation will be required from the dial, After loading the BIN file can optionally be erased.</w:t>
       </w:r>
     </w:p>
     <w:p>
@@ -1548,14 +1358,12 @@
       <w:r>
         <w:t xml:space="preserve"> The top one is called </w:t>
       </w:r>
-      <w:proofErr w:type="gramStart"/>
       <w:r>
         <w:t>B</w:t>
       </w:r>
       <w:r>
         <w:t>0</w:t>
       </w:r>
-      <w:proofErr w:type="gramEnd"/>
       <w:r>
         <w:t xml:space="preserve"> and the bottom one is called </w:t>
       </w:r>
@@ -1925,21 +1733,7 @@
         <w:rPr>
           <w:lang w:val="en-US"/>
         </w:rPr>
-        <w:t xml:space="preserve">. After a dial </w:t>
-      </w:r>
-      <w:proofErr w:type="gramStart"/>
-      <w:r>
-        <w:rPr>
-          <w:lang w:val="en-US"/>
-        </w:rPr>
-        <w:t>click</w:t>
-      </w:r>
-      <w:proofErr w:type="gramEnd"/>
-      <w:r>
-        <w:rPr>
-          <w:lang w:val="en-US"/>
-        </w:rPr>
-        <w:t xml:space="preserve"> the increment will change to 10 and dial will add and subtract </w:t>
+        <w:t xml:space="preserve">. After a dial click the increment will change to 10 and dial will add and subtract </w:t>
       </w:r>
       <w:r>
         <w:rPr>
@@ -2088,18 +1882,10 @@
         <w:t xml:space="preserve">indicates the active menu line. A + in front of the menu means another menu will be activated. </w:t>
       </w:r>
       <w:r>
-        <w:t>Any menu item starting with ‘</w:t>
-      </w:r>
-      <w:proofErr w:type="gramStart"/>
-      <w:r>
-        <w:t>-‘</w:t>
-      </w:r>
-      <w:r>
-        <w:t xml:space="preserve"> goes</w:t>
-      </w:r>
-      <w:proofErr w:type="gramEnd"/>
-      <w:r>
-        <w:t xml:space="preserve"> back to the previous menu when clicked. A</w:t>
+        <w:t>Any menu item starting with ‘-‘</w:t>
+      </w:r>
+      <w:r>
+        <w:t xml:space="preserve"> goes back to the previous menu when clicked. A</w:t>
       </w:r>
       <w:r>
         <w:t xml:space="preserve"> dial</w:t>
@@ -2300,15 +2086,7 @@
         <w:t xml:space="preserve"> The bottom of the screen shows the</w:t>
       </w:r>
       <w:r>
-        <w:t xml:space="preserve"> battery status on the right if it has been enabled. This is related to the current battery voltage and will drop while transmitting. There are also 4 </w:t>
-      </w:r>
-      <w:proofErr w:type="gramStart"/>
-      <w:r>
-        <w:t>LED’s</w:t>
-      </w:r>
-      <w:proofErr w:type="gramEnd"/>
-      <w:r>
-        <w:t xml:space="preserve"> on the PCB that can be seen through</w:t>
+        <w:t xml:space="preserve"> battery status on the right if it has been enabled. This is related to the current battery voltage and will drop while transmitting. There are also 4 LED’s on the PCB that can be seen through</w:t>
       </w:r>
       <w:r>
         <w:t xml:space="preserve"> the slot on the </w:t>
@@ -2320,15 +2098,7 @@
         <w:t xml:space="preserve"> of the case</w:t>
       </w:r>
       <w:r>
-        <w:t xml:space="preserve">. These </w:t>
-      </w:r>
-      <w:proofErr w:type="gramStart"/>
-      <w:r>
-        <w:t>LED’s</w:t>
-      </w:r>
-      <w:proofErr w:type="gramEnd"/>
-      <w:r>
-        <w:t xml:space="preserve"> are controlled by the battery charger circuit and indicate the battery status during running and charging.</w:t>
+        <w:t>. These LED’s are controlled by the battery charger circuit and indicate the battery status during running and charging.</w:t>
       </w:r>
     </w:p>
     <w:p/>
@@ -2337,15 +2107,7 @@
         <w:t>During transmitting the bottom left shows an animated red dot. In a future firmware update the</w:t>
       </w:r>
       <w:r>
-        <w:t xml:space="preserve"> received DTMF characters will be </w:t>
-      </w:r>
-      <w:proofErr w:type="gramStart"/>
-      <w:r>
-        <w:t>display</w:t>
-      </w:r>
-      <w:proofErr w:type="gramEnd"/>
-      <w:r>
-        <w:t xml:space="preserve"> next to this.</w:t>
+        <w:t xml:space="preserve"> received DTMF characters will be display next to this.</w:t>
       </w:r>
     </w:p>
     <w:p>
@@ -2361,13 +2123,8 @@
       <w:r>
         <w:t xml:space="preserve">The following sections detail each entry in </w:t>
       </w:r>
-      <w:proofErr w:type="gramStart"/>
-      <w:r>
-        <w:t>all of</w:t>
-      </w:r>
-      <w:proofErr w:type="gramEnd"/>
-      <w:r>
-        <w:t xml:space="preserve"> the menus</w:t>
+      <w:r>
+        <w:t>all of the menus</w:t>
       </w:r>
       <w:r>
         <w:t xml:space="preserve"> starting with the main or top menu</w:t>
@@ -2394,15 +2151,7 @@
         <w:t>’</w:t>
       </w:r>
       <w:r>
-        <w:t xml:space="preserve"> or a ‘</w:t>
-      </w:r>
-      <w:proofErr w:type="gramStart"/>
-      <w:r>
-        <w:t>-‘ to</w:t>
-      </w:r>
-      <w:proofErr w:type="gramEnd"/>
-      <w:r>
-        <w:t xml:space="preserve"> indicate a range</w:t>
+        <w:t xml:space="preserve"> or a ‘-‘ to indicate a range</w:t>
       </w:r>
       <w:r>
         <w:t>.</w:t>
@@ -2427,15 +2176,7 @@
         <w:t xml:space="preserve"> Some menu entries may depend on other menu items </w:t>
       </w:r>
       <w:r>
-        <w:t xml:space="preserve">settings. For </w:t>
-      </w:r>
-      <w:proofErr w:type="gramStart"/>
-      <w:r>
-        <w:t>example</w:t>
-      </w:r>
-      <w:proofErr w:type="gramEnd"/>
-      <w:r>
-        <w:t xml:space="preserve"> the audio file name menu item is hidden unless </w:t>
+        <w:t xml:space="preserve">settings. For example the audio file name menu item is hidden unless </w:t>
       </w:r>
       <w:r>
         <w:t>“Play Audio File” is Yes.</w:t>
@@ -2470,34 +2211,10 @@
     </w:p>
     <w:p>
       <w:r>
-        <w:t xml:space="preserve">This must be set to </w:t>
-      </w:r>
-      <w:proofErr w:type="gramStart"/>
-      <w:r>
-        <w:t>On</w:t>
-      </w:r>
-      <w:proofErr w:type="gramEnd"/>
-      <w:r>
-        <w:t xml:space="preserve"> for the radio to begin </w:t>
-      </w:r>
-      <w:r>
-        <w:t xml:space="preserve">transmitting. If saved as </w:t>
-      </w:r>
-      <w:proofErr w:type="gramStart"/>
-      <w:r>
-        <w:t>On</w:t>
-      </w:r>
-      <w:proofErr w:type="gramEnd"/>
-      <w:r>
-        <w:t xml:space="preserve"> then the radio will start sending right after booting. If it is </w:t>
-      </w:r>
-      <w:proofErr w:type="gramStart"/>
-      <w:r>
-        <w:t>Off</w:t>
-      </w:r>
-      <w:proofErr w:type="gramEnd"/>
-      <w:r>
-        <w:t xml:space="preserve"> it will not automatically start sending. It can be toggle</w:t>
+        <w:t xml:space="preserve">This must be set to On for the radio to begin </w:t>
+      </w:r>
+      <w:r>
+        <w:t>transmitting. If saved as On then the radio will start sending right after booting. If it is Off it will not automatically start sending. It can be toggle</w:t>
       </w:r>
       <w:r>
         <w:t>d</w:t>
@@ -2534,15 +2251,7 @@
     </w:p>
     <w:p>
       <w:r>
-        <w:t xml:space="preserve">High power is about </w:t>
-      </w:r>
-      <w:proofErr w:type="gramStart"/>
-      <w:r>
-        <w:t>5W</w:t>
-      </w:r>
-      <w:proofErr w:type="gramEnd"/>
-      <w:r>
-        <w:t xml:space="preserve"> and low power is 3W. These are the only</w:t>
+        <w:t>High power is about 5W and low power is 3W. These are the only</w:t>
       </w:r>
       <w:r>
         <w:t xml:space="preserve"> values allowed by the SA818 radio. If lower power is desired an attenuator can be attached to the </w:t>
@@ -2720,37 +2429,13 @@
     </w:p>
     <w:p>
       <w:r>
-        <w:t xml:space="preserve">This menu item is only visible if the previous item is set to Yes. Clicking the dial will list </w:t>
-      </w:r>
-      <w:proofErr w:type="gramStart"/>
-      <w:r>
-        <w:t>all of</w:t>
-      </w:r>
-      <w:proofErr w:type="gramEnd"/>
-      <w:r>
-        <w:t xml:space="preserve"> the </w:t>
-      </w:r>
-      <w:r>
-        <w:t xml:space="preserve">*.txt files on the SD card. The dial is rotated to highlight a </w:t>
-      </w:r>
-      <w:proofErr w:type="gramStart"/>
-      <w:r>
-        <w:t>file</w:t>
-      </w:r>
-      <w:proofErr w:type="gramEnd"/>
-      <w:r>
-        <w:t xml:space="preserve"> and a long press will set it</w:t>
-      </w:r>
-      <w:r>
-        <w:t xml:space="preserve">. Note that a click of dial just exits the list of </w:t>
-      </w:r>
-      <w:proofErr w:type="gramStart"/>
-      <w:r>
-        <w:t>file</w:t>
-      </w:r>
-      <w:proofErr w:type="gramEnd"/>
-      <w:r>
-        <w:t xml:space="preserve"> with no selection being performed.</w:t>
+        <w:t xml:space="preserve">This menu item is only visible if the previous item is set to Yes. Clicking the dial will list all of the </w:t>
+      </w:r>
+      <w:r>
+        <w:t>*.txt files on the SD card. The dial is rotated to highlight a file and a long press will set it</w:t>
+      </w:r>
+      <w:r>
+        <w:t>. Note that a click of dial just exits the list of file with no selection being performed.</w:t>
       </w:r>
     </w:p>
     <w:p>
@@ -2829,15 +2514,7 @@
         <w:t xml:space="preserve"> and are always the same. In Random mode the transmit time and pause time are randomly chosen</w:t>
       </w:r>
       <w:r>
-        <w:t xml:space="preserve"> from the allowed values set in the Min and Max values for TX Send and Pause. This makes the timing less predictable and </w:t>
-      </w:r>
-      <w:proofErr w:type="gramStart"/>
-      <w:r>
-        <w:t>make</w:t>
-      </w:r>
-      <w:proofErr w:type="gramEnd"/>
-      <w:r>
-        <w:t xml:space="preserve"> the game a little bit harder.</w:t>
+        <w:t xml:space="preserve"> from the allowed values set in the Min and Max values for TX Send and Pause. This makes the timing less predictable and make the game a little bit harder.</w:t>
       </w:r>
       <w:r>
         <w:t xml:space="preserve"> Keep your ears on!</w:t>
@@ -2890,15 +2567,7 @@
         <w:t>This is the pause time between transmissions</w:t>
       </w:r>
       <w:r>
-        <w:t xml:space="preserve">. Longer times let the radio cool off and save the battery for longer </w:t>
-      </w:r>
-      <w:proofErr w:type="gramStart"/>
-      <w:r>
-        <w:t>run</w:t>
-      </w:r>
-      <w:proofErr w:type="gramEnd"/>
-      <w:r>
-        <w:t xml:space="preserve"> times.</w:t>
+        <w:t>. Longer times let the radio cool off and save the battery for longer run times.</w:t>
       </w:r>
     </w:p>
     <w:p>
@@ -2978,15 +2647,7 @@
     </w:p>
     <w:p>
       <w:r>
-        <w:t xml:space="preserve">During transmit time the Beacon, Call Sign, and Audio are continuously sent. At the end of the transmission time this option controls whether the transmission stops immediately </w:t>
-      </w:r>
-      <w:proofErr w:type="gramStart"/>
-      <w:r>
-        <w:t>of</w:t>
-      </w:r>
-      <w:proofErr w:type="gramEnd"/>
-      <w:r>
-        <w:t xml:space="preserve"> waits to stop until the entire cycle is finished.</w:t>
+        <w:t>During transmit time the Beacon, Call Sign, and Audio are continuously sent. At the end of the transmission time this option controls whether the transmission stops immediately of waits to stop until the entire cycle is finished.</w:t>
       </w:r>
     </w:p>
     <w:p/>
@@ -3001,15 +2662,7 @@
         <w:t xml:space="preserve"> time to something less than</w:t>
       </w:r>
       <w:r>
-        <w:t xml:space="preserve"> the time to perform a complete cycle and set this option to “Finish Cycle”. The </w:t>
-      </w:r>
-      <w:proofErr w:type="gramStart"/>
-      <w:r>
-        <w:t>transmit  cycle</w:t>
-      </w:r>
-      <w:proofErr w:type="gramEnd"/>
-      <w:r>
-        <w:t xml:space="preserve"> will begin, the timer will expire, but the current cycle will complete before stopping</w:t>
+        <w:t xml:space="preserve"> the time to perform a complete cycle and set this option to “Finish Cycle”. The transmit  cycle will begin, the timer will expire, but the current cycle will complete before stopping</w:t>
       </w:r>
       <w:r>
         <w:t>.</w:t>
@@ -3030,15 +2683,7 @@
     </w:p>
     <w:p>
       <w:r>
-        <w:t xml:space="preserve">During pause time the radio can be put into sleep mode. This lowers the power consumption and lets the battery last longer. </w:t>
-      </w:r>
-      <w:proofErr w:type="gramStart"/>
-      <w:r>
-        <w:t>However</w:t>
-      </w:r>
-      <w:proofErr w:type="gramEnd"/>
-      <w:r>
-        <w:t xml:space="preserve"> note that this also means that the DTMF commands are disabled since the radio is asleep!</w:t>
+        <w:t>During pause time the radio can be put into sleep mode. This lowers the power consumption and lets the battery last longer. However note that this also means that the DTMF commands are disabled since the radio is asleep!</w:t>
       </w:r>
     </w:p>
     <w:p>
@@ -3248,26 +2893,10 @@
     </w:p>
     <w:p>
       <w:r>
-        <w:t xml:space="preserve">When the radio is in either send or pause mode this command will cancel the </w:t>
-      </w:r>
-      <w:proofErr w:type="gramStart"/>
-      <w:r>
-        <w:t>timer</w:t>
-      </w:r>
-      <w:proofErr w:type="gramEnd"/>
-      <w:r>
-        <w:t xml:space="preserve"> and the next mo</w:t>
-      </w:r>
-      <w:r>
-        <w:t xml:space="preserve">de will start. For </w:t>
-      </w:r>
-      <w:proofErr w:type="gramStart"/>
-      <w:r>
-        <w:t>example</w:t>
-      </w:r>
-      <w:proofErr w:type="gramEnd"/>
-      <w:r>
-        <w:t xml:space="preserve"> if you want to cancel</w:t>
+        <w:t>When the radio is in either send or pause mode this command will cancel the timer and the next mo</w:t>
+      </w:r>
+      <w:r>
+        <w:t>de will start. For example if you want to cancel</w:t>
       </w:r>
       <w:r>
         <w:t xml:space="preserve"> the pause and go to transmit, use this option. It can also be done by long pressing B0.</w:t>
@@ -3312,15 +2941,7 @@
     </w:p>
     <w:p>
       <w:r>
-        <w:t xml:space="preserve">This command saves the current settings into the selected file. If it already </w:t>
-      </w:r>
-      <w:proofErr w:type="gramStart"/>
-      <w:r>
-        <w:t>exists</w:t>
-      </w:r>
-      <w:proofErr w:type="gramEnd"/>
-      <w:r>
-        <w:t xml:space="preserve"> the user will be asked to confirm overwriting the file.</w:t>
+        <w:t>This command saves the current settings into the selected file. If it already exists the user will be asked to confirm overwriting the file.</w:t>
       </w:r>
     </w:p>
     <w:p>
@@ -3334,15 +2955,7 @@
     </w:p>
     <w:p>
       <w:r>
-        <w:t xml:space="preserve">This command asks the user for the name and then sets </w:t>
-      </w:r>
-      <w:proofErr w:type="gramStart"/>
-      <w:r>
-        <w:t>all of</w:t>
-      </w:r>
-      <w:proofErr w:type="gramEnd"/>
-      <w:r>
-        <w:t xml:space="preserve"> the system settings except the battery calibration using the values in the file.</w:t>
+        <w:t>This command asks the user for the name and then sets all of the system settings except the battery calibration using the values in the file.</w:t>
       </w:r>
     </w:p>
     <w:p>
@@ -3462,15 +3075,7 @@
     </w:p>
     <w:p>
       <w:r>
-        <w:t xml:space="preserve">Lines of text that </w:t>
-      </w:r>
-      <w:proofErr w:type="gramStart"/>
-      <w:r>
-        <w:t>too</w:t>
-      </w:r>
-      <w:proofErr w:type="gramEnd"/>
-      <w:r>
-        <w:t xml:space="preserve"> long for the display will scroll back and forth. The following settings control the speed.</w:t>
+        <w:t>Lines of text that too long for the display will scroll back and forth. The following settings control the speed.</w:t>
       </w:r>
     </w:p>
     <w:p>
@@ -3584,12 +3189,10 @@
         <w:t xml:space="preserve">Direction: </w:t>
       </w:r>
       <w:proofErr w:type="spellStart"/>
-      <w:proofErr w:type="gramStart"/>
       <w:r>
         <w:t>Normal:Reverse</w:t>
       </w:r>
       <w:proofErr w:type="spellEnd"/>
-      <w:proofErr w:type="gramEnd"/>
     </w:p>
     <w:p>
       <w:r>
@@ -3622,15 +3225,7 @@
     </w:p>
     <w:p>
       <w:r>
-        <w:t xml:space="preserve">Since the PCB was designed with 10% resistors for measuring the battery voltage some calibration is needed. A future PCB will probably use better </w:t>
-      </w:r>
-      <w:proofErr w:type="gramStart"/>
-      <w:r>
-        <w:t>resistors</w:t>
-      </w:r>
-      <w:proofErr w:type="gramEnd"/>
-      <w:r>
-        <w:t xml:space="preserve"> so this won’t be needed.</w:t>
+        <w:t>Since the PCB was designed with 10% resistors for measuring the battery voltage some calibration is needed. A future PCB will probably use better resistors so this won’t be needed.</w:t>
       </w:r>
     </w:p>
     <w:p>
@@ -3693,15 +3288,7 @@
         <w:t>This continuously reads the battery value</w:t>
       </w:r>
       <w:r>
-        <w:t xml:space="preserve">. It was originally used for testing, but it seems like it might possibly be </w:t>
-      </w:r>
-      <w:proofErr w:type="gramStart"/>
-      <w:r>
-        <w:t>useful</w:t>
-      </w:r>
-      <w:proofErr w:type="gramEnd"/>
-      <w:r>
-        <w:t xml:space="preserve"> so it was left in the menu system.</w:t>
+        <w:t>. It was originally used for testing, but it seems like it might possibly be useful so it was left in the menu system.</w:t>
       </w:r>
     </w:p>
     <w:p>
@@ -3784,13 +3371,8 @@
       </w:r>
       <w:proofErr w:type="spellEnd"/>
       <w:r>
-        <w:t xml:space="preserve"> where the settings are </w:t>
-      </w:r>
-      <w:proofErr w:type="gramStart"/>
-      <w:r>
-        <w:t>save</w:t>
-      </w:r>
-      <w:proofErr w:type="gramEnd"/>
+        <w:t xml:space="preserve"> where the settings are save</w:t>
+      </w:r>
       <w:r>
         <w:t xml:space="preserve"> in non-volatile memory. This is how settings are saved while the system is not powered.</w:t>
       </w:r>
@@ -3805,15 +3387,7 @@
     </w:p>
     <w:p>
       <w:r>
-        <w:t xml:space="preserve">This stores </w:t>
-      </w:r>
-      <w:proofErr w:type="gramStart"/>
-      <w:r>
-        <w:t>all of</w:t>
-      </w:r>
-      <w:proofErr w:type="gramEnd"/>
-      <w:r>
-        <w:t xml:space="preserve"> the current settings in the non-volatile memory</w:t>
+        <w:t>This stores all of the current settings in the non-volatile memory</w:t>
       </w:r>
       <w:r>
         <w:t>. Note that this is not often used since settings are normally saved each time they are changed.</w:t>
@@ -3833,7 +3407,7 @@
       </w:r>
     </w:p>
     <w:sectPr>
-      <w:footerReference w:type="default" r:id="rId9"/>
+      <w:footerReference w:type="default" r:id="rId10"/>
       <w:pgSz w:w="12240" w:h="15840"/>
       <w:pgMar w:top="1440" w:right="1440" w:bottom="1440" w:left="1440" w:header="720" w:footer="720" w:gutter="0"/>
       <w:pgNumType w:start="1"/>

</xml_diff>

<commit_message>
Moved send GPS values to right befow send GPS menu item. Moved TX frequency to right below the TX power item.
</commit_message>
<xml_diff>
--- a/RadioFox.docx
+++ b/RadioFox.docx
@@ -1,6 +1,6 @@
 
 <file path=word/document.xml><?xml version="1.0" encoding="utf-8"?>
-<w:document xmlns:wpc="http://schemas.microsoft.com/office/word/2010/wordprocessingCanvas" xmlns:cx="http://schemas.microsoft.com/office/drawing/2014/chartex" xmlns:cx1="http://schemas.microsoft.com/office/drawing/2015/9/8/chartex" xmlns:cx2="http://schemas.microsoft.com/office/drawing/2015/10/21/chartex" xmlns:cx3="http://schemas.microsoft.com/office/drawing/2016/5/9/chartex" xmlns:cx4="http://schemas.microsoft.com/office/drawing/2016/5/10/chartex" xmlns:cx5="http://schemas.microsoft.com/office/drawing/2016/5/11/chartex" xmlns:cx6="http://schemas.microsoft.com/office/drawing/2016/5/12/chartex" xmlns:cx7="http://schemas.microsoft.com/office/drawing/2016/5/13/chartex" xmlns:cx8="http://schemas.microsoft.com/office/drawing/2016/5/14/chartex" xmlns:mc="http://schemas.openxmlformats.org/markup-compatibility/2006" xmlns:aink="http://schemas.microsoft.com/office/drawing/2016/ink" xmlns:am3d="http://schemas.microsoft.com/office/drawing/2017/model3d" xmlns:o="urn:schemas-microsoft-com:office:office" xmlns:oel="http://schemas.microsoft.com/office/2019/extlst" xmlns:r="http://schemas.openxmlformats.org/officeDocument/2006/relationships" xmlns:m="http://schemas.openxmlformats.org/officeDocument/2006/math" xmlns:v="urn:schemas-microsoft-com:vml" xmlns:wp14="http://schemas.microsoft.com/office/word/2010/wordprocessingDrawing" xmlns:wp="http://schemas.openxmlformats.org/drawingml/2006/wordprocessingDrawing" xmlns:w10="urn:schemas-microsoft-com:office:word" xmlns:w="http://schemas.openxmlformats.org/wordprocessingml/2006/main" xmlns:w14="http://schemas.microsoft.com/office/word/2010/wordml" xmlns:w15="http://schemas.microsoft.com/office/word/2012/wordml" xmlns:w16cex="http://schemas.microsoft.com/office/word/2018/wordml/cex" xmlns:w16cid="http://schemas.microsoft.com/office/word/2016/wordml/cid" xmlns:w16="http://schemas.microsoft.com/office/word/2018/wordml" xmlns:w16du="http://schemas.microsoft.com/office/word/2023/wordml/word16du" xmlns:w16sdtdh="http://schemas.microsoft.com/office/word/2020/wordml/sdtdatahash" xmlns:w16se="http://schemas.microsoft.com/office/word/2015/wordml/symex" xmlns:wpg="http://schemas.microsoft.com/office/word/2010/wordprocessingGroup" xmlns:wpi="http://schemas.microsoft.com/office/word/2010/wordprocessingInk" xmlns:wne="http://schemas.microsoft.com/office/word/2006/wordml" xmlns:wps="http://schemas.microsoft.com/office/word/2010/wordprocessingShape" mc:Ignorable="w14 w15 w16se w16cid w16 w16cex w16sdtdh w16du wp14">
+<w:document xmlns:wpc="http://schemas.microsoft.com/office/word/2010/wordprocessingCanvas" xmlns:cx="http://schemas.microsoft.com/office/drawing/2014/chartex" xmlns:cx1="http://schemas.microsoft.com/office/drawing/2015/9/8/chartex" xmlns:cx2="http://schemas.microsoft.com/office/drawing/2015/10/21/chartex" xmlns:cx3="http://schemas.microsoft.com/office/drawing/2016/5/9/chartex" xmlns:cx4="http://schemas.microsoft.com/office/drawing/2016/5/10/chartex" xmlns:cx5="http://schemas.microsoft.com/office/drawing/2016/5/11/chartex" xmlns:cx6="http://schemas.microsoft.com/office/drawing/2016/5/12/chartex" xmlns:cx7="http://schemas.microsoft.com/office/drawing/2016/5/13/chartex" xmlns:cx8="http://schemas.microsoft.com/office/drawing/2016/5/14/chartex" xmlns:mc="http://schemas.openxmlformats.org/markup-compatibility/2006" xmlns:aink="http://schemas.microsoft.com/office/drawing/2016/ink" xmlns:am3d="http://schemas.microsoft.com/office/drawing/2017/model3d" xmlns:o="urn:schemas-microsoft-com:office:office" xmlns:oel="http://schemas.microsoft.com/office/2019/extlst" xmlns:r="http://schemas.openxmlformats.org/officeDocument/2006/relationships" xmlns:m="http://schemas.openxmlformats.org/officeDocument/2006/math" xmlns:v="urn:schemas-microsoft-com:vml" xmlns:wp14="http://schemas.microsoft.com/office/word/2010/wordprocessingDrawing" xmlns:wp="http://schemas.openxmlformats.org/drawingml/2006/wordprocessingDrawing" xmlns:w10="urn:schemas-microsoft-com:office:word" xmlns:w="http://schemas.openxmlformats.org/wordprocessingml/2006/main" xmlns:w14="http://schemas.microsoft.com/office/word/2010/wordml" xmlns:w15="http://schemas.microsoft.com/office/word/2012/wordml" xmlns:w16cex="http://schemas.microsoft.com/office/word/2018/wordml/cex" xmlns:w16cid="http://schemas.microsoft.com/office/word/2016/wordml/cid" xmlns:w16="http://schemas.microsoft.com/office/word/2018/wordml" xmlns:w16du="http://schemas.microsoft.com/office/word/2023/wordml/word16du" xmlns:w16sdtdh="http://schemas.microsoft.com/office/word/2020/wordml/sdtdatahash" xmlns:w16sdtfl="http://schemas.microsoft.com/office/word/2024/wordml/sdtformatlock" xmlns:w16se="http://schemas.microsoft.com/office/word/2015/wordml/symex" xmlns:wpg="http://schemas.microsoft.com/office/word/2010/wordprocessingGroup" xmlns:wpi="http://schemas.microsoft.com/office/word/2010/wordprocessingInk" xmlns:wne="http://schemas.microsoft.com/office/word/2006/wordml" xmlns:wps="http://schemas.microsoft.com/office/word/2010/wordprocessingShape" mc:Ignorable="w14 w15 w16se w16cid w16 w16cex w16sdtdh w16sdtfl w16du wp14">
   <w:body>
     <w:p>
       <w:pPr>
@@ -375,7 +375,71 @@
     </w:p>
     <w:p>
       <w:r>
-        <w:t>Version 2.10</w:t>
+        <w:t>Version 1.12</w:t>
+      </w:r>
+    </w:p>
+    <w:p>
+      <w:pPr>
+        <w:pStyle w:val="ListParagraph"/>
+        <w:numPr>
+          <w:ilvl w:val="0"/>
+          <w:numId w:val="99"/>
+        </w:numPr>
+      </w:pPr>
+      <w:r>
+        <w:t>Moved latitude and long</w:t>
+      </w:r>
+      <w:r>
+        <w:t>itude menu</w:t>
+      </w:r>
+      <w:r>
+        <w:t xml:space="preserve"> items</w:t>
+      </w:r>
+      <w:r>
+        <w:t xml:space="preserve"> to be right below the </w:t>
+      </w:r>
+      <w:r>
+        <w:t>“Send GPS:” menu item.</w:t>
+      </w:r>
+      <w:r>
+        <w:t xml:space="preserve"> They were below the “TX:” menu which was confusing.</w:t>
+      </w:r>
+      <w:r>
+        <w:t xml:space="preserve"> The TX frequency item was moved right below the </w:t>
+      </w:r>
+      <w:r>
+        <w:t>TX Power and before the beacon mode item.</w:t>
+      </w:r>
+    </w:p>
+    <w:p>
+      <w:r>
+        <w:t>Version 1.11</w:t>
+      </w:r>
+    </w:p>
+    <w:p>
+      <w:pPr>
+        <w:pStyle w:val="ListParagraph"/>
+        <w:numPr>
+          <w:ilvl w:val="0"/>
+          <w:numId w:val="98"/>
+        </w:numPr>
+      </w:pPr>
+      <w:r>
+        <w:t xml:space="preserve">Added ability to send manually entered GPS coordinates when in </w:t>
+      </w:r>
+      <w:r>
+        <w:t>beacon mode.</w:t>
+      </w:r>
+    </w:p>
+    <w:p>
+      <w:r>
+        <w:t xml:space="preserve">Version </w:t>
+      </w:r>
+      <w:r>
+        <w:t>1</w:t>
+      </w:r>
+      <w:r>
+        <w:t>.10</w:t>
       </w:r>
     </w:p>
     <w:p>
@@ -404,6 +468,7 @@
         </w:numPr>
       </w:pPr>
       <w:r>
+        <w:lastRenderedPageBreak/>
         <w:t>Moved the active time display to the end of the second line on the main display.</w:t>
       </w:r>
       <w:r>
@@ -444,7 +509,6 @@
         </w:numPr>
       </w:pPr>
       <w:r>
-        <w:lastRenderedPageBreak/>
         <w:t>Change "Beacon Frequency Mode" in menus to "Beacon Frequency".</w:t>
       </w:r>
     </w:p>
@@ -605,7 +669,21 @@
         <w:rPr>
           <w:lang w:val="en-US"/>
         </w:rPr>
-        <w:t>This is initial version when this document was first created. The software is considered mostly complete.</w:t>
+        <w:t xml:space="preserve">This is </w:t>
+      </w:r>
+      <w:proofErr w:type="gramStart"/>
+      <w:r>
+        <w:rPr>
+          <w:lang w:val="en-US"/>
+        </w:rPr>
+        <w:t>initial</w:t>
+      </w:r>
+      <w:proofErr w:type="gramEnd"/>
+      <w:r>
+        <w:rPr>
+          <w:lang w:val="en-US"/>
+        </w:rPr>
+        <w:t xml:space="preserve"> version when this document was first created. The software is considered mostly complete.</w:t>
       </w:r>
     </w:p>
     <w:p>
@@ -637,7 +715,21 @@
         <w:rPr>
           <w:lang w:val="en-US"/>
         </w:rPr>
-        <w:t>The Fox is a single PCB that includes an 18650 battery holder that can have 1 or 2 batteries. There is a USB C connector on the left edge used for charging the batteries. Above that is a micro-SD slot. The SD card holds tone files and saved settings files. It can also be used to load new firmware onto the TTGO chip. There is also a USB C connector on the TTGO. It is used for downloading firmware or debugging operations. It might also be used for serial communications in a future firmware release. It is not used for charging the batteries.</w:t>
+        <w:t xml:space="preserve">The Fox is a single PCB that includes an </w:t>
+      </w:r>
+      <w:proofErr w:type="gramStart"/>
+      <w:r>
+        <w:rPr>
+          <w:lang w:val="en-US"/>
+        </w:rPr>
+        <w:t>18650 battery</w:t>
+      </w:r>
+      <w:proofErr w:type="gramEnd"/>
+      <w:r>
+        <w:rPr>
+          <w:lang w:val="en-US"/>
+        </w:rPr>
+        <w:t xml:space="preserve"> holder that can have 1 or 2 batteries. There is a USB C connector on the left edge used for charging the batteries. Above that is a micro-SD slot. The SD card holds tone files and saved settings files. It can also be used to load new firmware onto the TTGO chip. There is also a USB C connector on the TTGO. It is used for downloading firmware or debugging operations. It might also be used for serial communications in a future firmware release. It is not used for charging the batteries.</w:t>
       </w:r>
     </w:p>
     <w:p>
@@ -653,7 +745,21 @@
         <w:rPr>
           <w:lang w:val="en-US"/>
         </w:rPr>
-        <w:t>The radio functions are handled by the SA818-V on the top right. There are vents in the case to allow cooling as this module can become quite hot when transmitting at high power for longer timer intervals. Transmitting longer than one minute is not recommended. High power is about 5W and low power is about 3W. Make sure a suitable antenna is connected to avoid damage to the radio circuit.</w:t>
+        <w:t xml:space="preserve">The radio functions are handled by the SA818-V on the top right. There are vents in the case to allow cooling as this module can become quite hot when transmitting at high power for longer timer intervals. Transmitting longer than one minute is not recommended. High power is about </w:t>
+      </w:r>
+      <w:proofErr w:type="gramStart"/>
+      <w:r>
+        <w:rPr>
+          <w:lang w:val="en-US"/>
+        </w:rPr>
+        <w:t>5W</w:t>
+      </w:r>
+      <w:proofErr w:type="gramEnd"/>
+      <w:r>
+        <w:rPr>
+          <w:lang w:val="en-US"/>
+        </w:rPr>
+        <w:t xml:space="preserve"> and low power is about 3W. Make sure a suitable antenna is connected to avoid damage to the radio circuit.</w:t>
       </w:r>
     </w:p>
     <w:p>
@@ -661,6 +767,7 @@
         <w:pStyle w:val="Heading2"/>
       </w:pPr>
       <w:r>
+        <w:lastRenderedPageBreak/>
         <w:t>Batteries</w:t>
       </w:r>
     </w:p>
@@ -669,14 +776,21 @@
         <w:rPr>
           <w:lang w:val="en-US"/>
         </w:rPr>
-        <w:t xml:space="preserve">The 18650 batteries must button top style and protection is recommended. The 18650 battery length is a very loose standard and some batteries may not fit. Too long and they cannot be used. Too short, it might be possible to bend the contacts on the battery holder negative side. </w:t>
-      </w:r>
+        <w:t xml:space="preserve">The 18650 batteries must button top style and protection is recommended. The </w:t>
+      </w:r>
+      <w:proofErr w:type="gramStart"/>
       <w:r>
         <w:rPr>
           <w:lang w:val="en-US"/>
         </w:rPr>
-        <w:lastRenderedPageBreak/>
-        <w:t>The battery holder is polarized to prevent insertion in the wrong direction. Do not defeat the feature or magic blue smoke may appear from the PCB!</w:t>
+        <w:t>18650 battery</w:t>
+      </w:r>
+      <w:proofErr w:type="gramEnd"/>
+      <w:r>
+        <w:rPr>
+          <w:lang w:val="en-US"/>
+        </w:rPr>
+        <w:t xml:space="preserve"> length is a very loose standard and some batteries may not fit. Too long and they cannot be used. Too short, it might be possible to bend the contacts on the battery holder negative side. The battery holder is polarized to prevent insertion in the wrong direction. Do not defeat the feature or magic blue smoke may appear from the PCB!</w:t>
       </w:r>
     </w:p>
     <w:p>
@@ -692,7 +806,35 @@
         <w:rPr>
           <w:lang w:val="en-US"/>
         </w:rPr>
-        <w:t>The actual runtime depends on the transmitting time and quality of the batteries. There are many deceptively labelled 18650 batteries available. The best one are made by Panasonic and Sanyo. Using 1 minute transmit, 4 minutes pause, low power setting, and display dimming the Fox Radio ran for 12 hours using Panasonic batteries.</w:t>
+        <w:t xml:space="preserve">The actual runtime depends on the transmitting time and quality of the batteries. There are many deceptively labelled 18650 batteries available. The best </w:t>
+      </w:r>
+      <w:proofErr w:type="gramStart"/>
+      <w:r>
+        <w:rPr>
+          <w:lang w:val="en-US"/>
+        </w:rPr>
+        <w:t>one</w:t>
+      </w:r>
+      <w:proofErr w:type="gramEnd"/>
+      <w:r>
+        <w:rPr>
+          <w:lang w:val="en-US"/>
+        </w:rPr>
+        <w:t xml:space="preserve"> </w:t>
+      </w:r>
+      <w:proofErr w:type="gramStart"/>
+      <w:r>
+        <w:rPr>
+          <w:lang w:val="en-US"/>
+        </w:rPr>
+        <w:t>are</w:t>
+      </w:r>
+      <w:proofErr w:type="gramEnd"/>
+      <w:r>
+        <w:rPr>
+          <w:lang w:val="en-US"/>
+        </w:rPr>
+        <w:t xml:space="preserve"> made by Panasonic and Sanyo. Using 1 minute transmit, 4 minutes pause, low power setting, and display dimming the Fox Radio ran for 12 hours using Panasonic batteries.</w:t>
       </w:r>
     </w:p>
     <w:p>
@@ -964,24 +1106,25 @@
           <w:bCs/>
           <w:lang w:val="en-US"/>
         </w:rPr>
-        <w:t>NOTE_E5, 4,  NOTE_B4, 8,  NOTE_C5, 8,  NOTE_D5, 4,  NOTE_C5, 8,  NOTE_B4, 8,</w:t>
-      </w:r>
-    </w:p>
-    <w:p>
-      <w:pPr>
+        <w:t xml:space="preserve">NOTE_E5, </w:t>
+      </w:r>
+      <w:proofErr w:type="gramStart"/>
+      <w:r>
         <w:rPr>
           <w:b/>
           <w:bCs/>
           <w:lang w:val="en-US"/>
         </w:rPr>
-      </w:pPr>
+        <w:t>4,  NOTE</w:t>
+      </w:r>
+      <w:proofErr w:type="gramEnd"/>
       <w:r>
         <w:rPr>
           <w:b/>
           <w:bCs/>
           <w:lang w:val="en-US"/>
         </w:rPr>
-        <w:t>NOTE_A4, 4,  NOTE_A4, 8,  NOTE_C5, 8,  NOTE_E5, 4,  NOTE_D5, 8,  NOTE_C5, 8,</w:t>
+        <w:t>_B4, 8,  NOTE_C5, 8,  NOTE_D5, 4,  NOTE_C5, 8,  NOTE_B4, 8,</w:t>
       </w:r>
     </w:p>
     <w:p>
@@ -998,24 +1141,25 @@
           <w:bCs/>
           <w:lang w:val="en-US"/>
         </w:rPr>
-        <w:t>NOTE_B4, -4, NOTE_C5, 8,  NOTE_D5, 4,  NOTE_E5, 4,</w:t>
-      </w:r>
-    </w:p>
-    <w:p>
-      <w:pPr>
+        <w:t xml:space="preserve">NOTE_A4, </w:t>
+      </w:r>
+      <w:proofErr w:type="gramStart"/>
+      <w:r>
         <w:rPr>
           <w:b/>
           <w:bCs/>
           <w:lang w:val="en-US"/>
         </w:rPr>
-      </w:pPr>
+        <w:t>4,  NOTE</w:t>
+      </w:r>
+      <w:proofErr w:type="gramEnd"/>
       <w:r>
         <w:rPr>
           <w:b/>
           <w:bCs/>
           <w:lang w:val="en-US"/>
         </w:rPr>
-        <w:t>NOTE_C5, 4,  NOTE_A4, 4,  NOTE_A4, 8,  NOTE_A4, 4,  NOTE_B4, 8,  NOTE_C5, 8,</w:t>
+        <w:t>_A4, 8,  NOTE_C5, 8,  NOTE_E5, 4,  NOTE_D5, 8,  NOTE_C5, 8,</w:t>
       </w:r>
     </w:p>
     <w:p>
@@ -1032,24 +1176,25 @@
           <w:bCs/>
           <w:lang w:val="en-US"/>
         </w:rPr>
-        <w:t>NOTE_D5, -4, NOTE_F5, 8,  NOTE_A5, 4,  NOTE_G5, 8,  NOTE_F5, 8,</w:t>
-      </w:r>
-    </w:p>
-    <w:p>
-      <w:pPr>
+        <w:t xml:space="preserve">NOTE_B4, -4, NOTE_C5, </w:t>
+      </w:r>
+      <w:proofErr w:type="gramStart"/>
+      <w:r>
         <w:rPr>
           <w:b/>
           <w:bCs/>
           <w:lang w:val="en-US"/>
         </w:rPr>
-      </w:pPr>
+        <w:t>8,  NOTE</w:t>
+      </w:r>
+      <w:proofErr w:type="gramEnd"/>
       <w:r>
         <w:rPr>
           <w:b/>
           <w:bCs/>
           <w:lang w:val="en-US"/>
         </w:rPr>
-        <w:t>NOTE_E5, -4, NOTE_C5, 8,  NOTE_E5, 4,  NOTE_D5, 8,  NOTE_C5, 8,</w:t>
+        <w:t>_D5, 4,  NOTE_E5, 4,</w:t>
       </w:r>
     </w:p>
     <w:p>
@@ -1066,69 +1211,224 @@
           <w:bCs/>
           <w:lang w:val="en-US"/>
         </w:rPr>
-        <w:t>NOTE_B4, 4,  NOTE_B4, 8,  NOTE_C5, 8,  NOTE_D5, 4,  NOTE_E5, 4,</w:t>
-      </w:r>
-    </w:p>
-    <w:p>
-      <w:pPr>
+        <w:t xml:space="preserve">NOTE_C5, </w:t>
+      </w:r>
+      <w:proofErr w:type="gramStart"/>
+      <w:r>
         <w:rPr>
           <w:b/>
           <w:bCs/>
           <w:lang w:val="en-US"/>
         </w:rPr>
-      </w:pPr>
+        <w:t>4,  NOTE</w:t>
+      </w:r>
+      <w:proofErr w:type="gramEnd"/>
       <w:r>
         <w:rPr>
           <w:b/>
           <w:bCs/>
           <w:lang w:val="en-US"/>
         </w:rPr>
-        <w:t>NOTE_C5, 4,  NOTE_A4, 4,  NOTE_A4, 4, REST, 4,</w:t>
-      </w:r>
-    </w:p>
-    <w:p>
-      <w:pPr>
-        <w:pStyle w:val="Heading1"/>
-      </w:pPr>
-      <w:r>
-        <w:lastRenderedPageBreak/>
-        <w:t>Updating Firmware</w:t>
-      </w:r>
-    </w:p>
-    <w:p>
-      <w:r>
-        <w:rPr>
-          <w:lang w:val="en-US"/>
-        </w:rPr>
-        <w:t xml:space="preserve">The new file must be put on the SD card and named </w:t>
-      </w:r>
-      <w:proofErr w:type="spellStart"/>
-      <w:r>
-        <w:rPr>
-          <w:lang w:val="en-US"/>
-        </w:rPr>
-        <w:t>RadioFox.bin</w:t>
-      </w:r>
-      <w:proofErr w:type="spellEnd"/>
-      <w:r>
-        <w:rPr>
-          <w:lang w:val="en-US"/>
-        </w:rPr>
-        <w:t xml:space="preserve">. The system menu has an entry </w:t>
-      </w:r>
-      <w:r>
+        <w:t>_A4, 4,  NOTE_A4, 8,  NOTE_A4, 4,  NOTE_B4, 8,  NOTE_C5, 8,</w:t>
+      </w:r>
+    </w:p>
+    <w:p>
+      <w:pPr>
         <w:rPr>
           <w:b/>
           <w:bCs/>
           <w:lang w:val="en-US"/>
         </w:rPr>
+      </w:pPr>
+      <w:r>
+        <w:rPr>
+          <w:b/>
+          <w:bCs/>
+          <w:lang w:val="en-US"/>
+        </w:rPr>
+        <w:t xml:space="preserve">NOTE_D5, -4, NOTE_F5, </w:t>
+      </w:r>
+      <w:proofErr w:type="gramStart"/>
+      <w:r>
+        <w:rPr>
+          <w:b/>
+          <w:bCs/>
+          <w:lang w:val="en-US"/>
+        </w:rPr>
+        <w:t>8,  NOTE</w:t>
+      </w:r>
+      <w:proofErr w:type="gramEnd"/>
+      <w:r>
+        <w:rPr>
+          <w:b/>
+          <w:bCs/>
+          <w:lang w:val="en-US"/>
+        </w:rPr>
+        <w:t>_A5, 4,  NOTE_G5, 8,  NOTE_F5, 8,</w:t>
+      </w:r>
+    </w:p>
+    <w:p>
+      <w:pPr>
+        <w:rPr>
+          <w:b/>
+          <w:bCs/>
+          <w:lang w:val="en-US"/>
+        </w:rPr>
+      </w:pPr>
+      <w:r>
+        <w:rPr>
+          <w:b/>
+          <w:bCs/>
+          <w:lang w:val="en-US"/>
+        </w:rPr>
+        <w:lastRenderedPageBreak/>
+        <w:t xml:space="preserve">NOTE_E5, -4, NOTE_C5, </w:t>
+      </w:r>
+      <w:proofErr w:type="gramStart"/>
+      <w:r>
+        <w:rPr>
+          <w:b/>
+          <w:bCs/>
+          <w:lang w:val="en-US"/>
+        </w:rPr>
+        <w:t>8,  NOTE</w:t>
+      </w:r>
+      <w:proofErr w:type="gramEnd"/>
+      <w:r>
+        <w:rPr>
+          <w:b/>
+          <w:bCs/>
+          <w:lang w:val="en-US"/>
+        </w:rPr>
+        <w:t>_E5, 4,  NOTE_D5, 8,  NOTE_C5, 8,</w:t>
+      </w:r>
+    </w:p>
+    <w:p>
+      <w:pPr>
+        <w:rPr>
+          <w:b/>
+          <w:bCs/>
+          <w:lang w:val="en-US"/>
+        </w:rPr>
+      </w:pPr>
+      <w:r>
+        <w:rPr>
+          <w:b/>
+          <w:bCs/>
+          <w:lang w:val="en-US"/>
+        </w:rPr>
+        <w:t xml:space="preserve">NOTE_B4, </w:t>
+      </w:r>
+      <w:proofErr w:type="gramStart"/>
+      <w:r>
+        <w:rPr>
+          <w:b/>
+          <w:bCs/>
+          <w:lang w:val="en-US"/>
+        </w:rPr>
+        <w:t>4,  NOTE</w:t>
+      </w:r>
+      <w:proofErr w:type="gramEnd"/>
+      <w:r>
+        <w:rPr>
+          <w:b/>
+          <w:bCs/>
+          <w:lang w:val="en-US"/>
+        </w:rPr>
+        <w:t>_B4, 8,  NOTE_C5, 8,  NOTE_D5, 4,  NOTE_E5, 4,</w:t>
+      </w:r>
+    </w:p>
+    <w:p>
+      <w:pPr>
+        <w:rPr>
+          <w:b/>
+          <w:bCs/>
+          <w:lang w:val="en-US"/>
+        </w:rPr>
+      </w:pPr>
+      <w:r>
+        <w:rPr>
+          <w:b/>
+          <w:bCs/>
+          <w:lang w:val="en-US"/>
+        </w:rPr>
+        <w:t xml:space="preserve">NOTE_C5, </w:t>
+      </w:r>
+      <w:proofErr w:type="gramStart"/>
+      <w:r>
+        <w:rPr>
+          <w:b/>
+          <w:bCs/>
+          <w:lang w:val="en-US"/>
+        </w:rPr>
+        <w:t>4,  NOTE</w:t>
+      </w:r>
+      <w:proofErr w:type="gramEnd"/>
+      <w:r>
+        <w:rPr>
+          <w:b/>
+          <w:bCs/>
+          <w:lang w:val="en-US"/>
+        </w:rPr>
+        <w:t>_A4, 4,  NOTE_A4, 4, REST, 4,</w:t>
+      </w:r>
+    </w:p>
+    <w:p>
+      <w:pPr>
+        <w:pStyle w:val="Heading1"/>
+      </w:pPr>
+      <w:r>
+        <w:t>Updating Firmware</w:t>
+      </w:r>
+    </w:p>
+    <w:p>
+      <w:r>
+        <w:rPr>
+          <w:lang w:val="en-US"/>
+        </w:rPr>
+        <w:t xml:space="preserve">The new file must be put on the SD card and named </w:t>
+      </w:r>
+      <w:proofErr w:type="spellStart"/>
+      <w:r>
+        <w:rPr>
+          <w:lang w:val="en-US"/>
+        </w:rPr>
+        <w:t>RadioFox.bin</w:t>
+      </w:r>
+      <w:proofErr w:type="spellEnd"/>
+      <w:r>
+        <w:rPr>
+          <w:lang w:val="en-US"/>
+        </w:rPr>
+        <w:t xml:space="preserve">. The system menu has an entry </w:t>
+      </w:r>
+      <w:r>
+        <w:rPr>
+          <w:b/>
+          <w:bCs/>
+          <w:lang w:val="en-US"/>
+        </w:rPr>
         <w:t>New Version BIN file</w:t>
       </w:r>
       <w:r>
         <w:rPr>
           <w:lang w:val="en-US"/>
         </w:rPr>
-        <w:t xml:space="preserve"> that will attempt to load this file. Confirmation will be required from the dial, After loading the BIN file can optionally be erased.</w:t>
+        <w:t xml:space="preserve"> that will attempt to load this file. Confirmation will be required from the dial, </w:t>
+      </w:r>
+      <w:proofErr w:type="gramStart"/>
+      <w:r>
+        <w:rPr>
+          <w:lang w:val="en-US"/>
+        </w:rPr>
+        <w:t>After</w:t>
+      </w:r>
+      <w:proofErr w:type="gramEnd"/>
+      <w:r>
+        <w:rPr>
+          <w:lang w:val="en-US"/>
+        </w:rPr>
+        <w:t xml:space="preserve"> loading the BIN file can optionally be erased.</w:t>
       </w:r>
     </w:p>
     <w:p>
@@ -1153,7 +1453,21 @@
         <w:rPr>
           <w:lang w:val="en-US"/>
         </w:rPr>
-        <w:t>Please feel free to request additional commands. I’m sure there are other usual things that can be done remotely using DTMF signals. Also note that these functions have not yet been tested extensively so there may be some bugs in the code. I will fix as soon as I can after I find out what they are.</w:t>
+        <w:t xml:space="preserve">Please feel free to request additional commands. I’m sure there are other usual things that can be done remotely using DTMF signals. Also note that these functions have not yet been tested extensively so there may be some bugs in the code. I will </w:t>
+      </w:r>
+      <w:proofErr w:type="gramStart"/>
+      <w:r>
+        <w:rPr>
+          <w:lang w:val="en-US"/>
+        </w:rPr>
+        <w:t>fix</w:t>
+      </w:r>
+      <w:proofErr w:type="gramEnd"/>
+      <w:r>
+        <w:rPr>
+          <w:lang w:val="en-US"/>
+        </w:rPr>
+        <w:t xml:space="preserve"> as soon as I can after I find out what they are.</w:t>
       </w:r>
     </w:p>
     <w:p>
@@ -1244,6 +1558,7 @@
         <w:pStyle w:val="Heading1"/>
       </w:pPr>
       <w:r>
+        <w:lastRenderedPageBreak/>
         <w:t>Button Operations</w:t>
       </w:r>
     </w:p>
@@ -1264,11 +1579,7 @@
         <w:t>the menu system</w:t>
       </w:r>
       <w:r>
-        <w:t xml:space="preserve"> and is done by </w:t>
-      </w:r>
-      <w:r>
-        <w:lastRenderedPageBreak/>
-        <w:t xml:space="preserve">holding the button down for about a ½ second or longer. This long press time is also adjustable if a longer or shorter time is preferred. The system has two modes of operation. After booting the display shows the </w:t>
+        <w:t xml:space="preserve"> and is done by holding the button down for about a ½ second or longer. This long press time is also adjustable if a longer or shorter time is preferred. The system has two modes of operation. After booting the display shows the </w:t>
       </w:r>
       <w:r>
         <w:t xml:space="preserve">radio status and some important </w:t>
@@ -1358,12 +1669,14 @@
       <w:r>
         <w:t xml:space="preserve"> The top one is called </w:t>
       </w:r>
+      <w:proofErr w:type="gramStart"/>
       <w:r>
         <w:t>B</w:t>
       </w:r>
       <w:r>
         <w:t>0</w:t>
       </w:r>
+      <w:proofErr w:type="gramEnd"/>
       <w:r>
         <w:t xml:space="preserve"> and the bottom one is called </w:t>
       </w:r>
@@ -1733,7 +2046,21 @@
         <w:rPr>
           <w:lang w:val="en-US"/>
         </w:rPr>
-        <w:t xml:space="preserve">. After a dial click the increment will change to 10 and dial will add and subtract </w:t>
+        <w:t xml:space="preserve">. After a dial </w:t>
+      </w:r>
+      <w:proofErr w:type="gramStart"/>
+      <w:r>
+        <w:rPr>
+          <w:lang w:val="en-US"/>
+        </w:rPr>
+        <w:t>click</w:t>
+      </w:r>
+      <w:proofErr w:type="gramEnd"/>
+      <w:r>
+        <w:rPr>
+          <w:lang w:val="en-US"/>
+        </w:rPr>
+        <w:t xml:space="preserve"> the increment will change to 10 and dial will add and subtract </w:t>
       </w:r>
       <w:r>
         <w:rPr>
@@ -1811,6 +2138,7 @@
       <w:bookmarkEnd w:id="6"/>
       <w:bookmarkEnd w:id="7"/>
       <w:r>
+        <w:lastRenderedPageBreak/>
         <w:t xml:space="preserve">Rotating </w:t>
       </w:r>
       <w:r>
@@ -1849,11 +2177,7 @@
         <w:t>s</w:t>
       </w:r>
       <w:r>
-        <w:t xml:space="preserve"> settings. In the </w:t>
-      </w:r>
-      <w:r>
-        <w:lastRenderedPageBreak/>
-        <w:t>menus</w:t>
+        <w:t xml:space="preserve"> settings. In the menus</w:t>
       </w:r>
       <w:r>
         <w:t>,</w:t>
@@ -1882,10 +2206,18 @@
         <w:t xml:space="preserve">indicates the active menu line. A + in front of the menu means another menu will be activated. </w:t>
       </w:r>
       <w:r>
-        <w:t>Any menu item starting with ‘-‘</w:t>
-      </w:r>
-      <w:r>
-        <w:t xml:space="preserve"> goes back to the previous menu when clicked. A</w:t>
+        <w:t>Any menu item starting with ‘</w:t>
+      </w:r>
+      <w:proofErr w:type="gramStart"/>
+      <w:r>
+        <w:t>-‘</w:t>
+      </w:r>
+      <w:r>
+        <w:t xml:space="preserve"> goes</w:t>
+      </w:r>
+      <w:proofErr w:type="gramEnd"/>
+      <w:r>
+        <w:t xml:space="preserve"> back to the previous menu when clicked. A</w:t>
       </w:r>
       <w:r>
         <w:t xml:space="preserve"> dial</w:t>
@@ -2086,7 +2418,15 @@
         <w:t xml:space="preserve"> The bottom of the screen shows the</w:t>
       </w:r>
       <w:r>
-        <w:t xml:space="preserve"> battery status on the right if it has been enabled. This is related to the current battery voltage and will drop while transmitting. There are also 4 LED’s on the PCB that can be seen through</w:t>
+        <w:t xml:space="preserve"> battery status on the right if it has been enabled. This is related to the current battery voltage and will drop while transmitting. There are also 4 </w:t>
+      </w:r>
+      <w:proofErr w:type="gramStart"/>
+      <w:r>
+        <w:t>LED’s</w:t>
+      </w:r>
+      <w:proofErr w:type="gramEnd"/>
+      <w:r>
+        <w:t xml:space="preserve"> on the PCB that can be seen through</w:t>
       </w:r>
       <w:r>
         <w:t xml:space="preserve"> the slot on the </w:t>
@@ -2098,16 +2438,33 @@
         <w:t xml:space="preserve"> of the case</w:t>
       </w:r>
       <w:r>
-        <w:t>. These LED’s are controlled by the battery charger circuit and indicate the battery status during running and charging.</w:t>
+        <w:t xml:space="preserve">. These </w:t>
+      </w:r>
+      <w:proofErr w:type="gramStart"/>
+      <w:r>
+        <w:t>LED’s</w:t>
+      </w:r>
+      <w:proofErr w:type="gramEnd"/>
+      <w:r>
+        <w:t xml:space="preserve"> are controlled by the battery charger circuit and indicate the battery status during running and charging.</w:t>
       </w:r>
     </w:p>
     <w:p/>
     <w:p>
       <w:r>
+        <w:lastRenderedPageBreak/>
         <w:t>During transmitting the bottom left shows an animated red dot. In a future firmware update the</w:t>
       </w:r>
       <w:r>
-        <w:t xml:space="preserve"> received DTMF characters will be display next to this.</w:t>
+        <w:t xml:space="preserve"> received DTMF characters will be </w:t>
+      </w:r>
+      <w:proofErr w:type="gramStart"/>
+      <w:r>
+        <w:t>display</w:t>
+      </w:r>
+      <w:proofErr w:type="gramEnd"/>
+      <w:r>
+        <w:t xml:space="preserve"> next to this.</w:t>
       </w:r>
     </w:p>
     <w:p>
@@ -2115,7 +2472,6 @@
         <w:pStyle w:val="Heading1"/>
       </w:pPr>
       <w:r>
-        <w:lastRenderedPageBreak/>
         <w:t>Menu Details</w:t>
       </w:r>
     </w:p>
@@ -2123,8 +2479,13 @@
       <w:r>
         <w:t xml:space="preserve">The following sections detail each entry in </w:t>
       </w:r>
-      <w:r>
-        <w:t>all of the menus</w:t>
+      <w:proofErr w:type="gramStart"/>
+      <w:r>
+        <w:t>all of</w:t>
+      </w:r>
+      <w:proofErr w:type="gramEnd"/>
+      <w:r>
+        <w:t xml:space="preserve"> the menus</w:t>
       </w:r>
       <w:r>
         <w:t xml:space="preserve"> starting with the main or top menu</w:t>
@@ -2151,7 +2512,15 @@
         <w:t>’</w:t>
       </w:r>
       <w:r>
-        <w:t xml:space="preserve"> or a ‘-‘ to indicate a range</w:t>
+        <w:t xml:space="preserve"> or a ‘</w:t>
+      </w:r>
+      <w:proofErr w:type="gramStart"/>
+      <w:r>
+        <w:t>-‘ to</w:t>
+      </w:r>
+      <w:proofErr w:type="gramEnd"/>
+      <w:r>
+        <w:t xml:space="preserve"> indicate a range</w:t>
       </w:r>
       <w:r>
         <w:t>.</w:t>
@@ -2176,7 +2545,15 @@
         <w:t xml:space="preserve"> Some menu entries may depend on other menu items </w:t>
       </w:r>
       <w:r>
-        <w:t xml:space="preserve">settings. For example the audio file name menu item is hidden unless </w:t>
+        <w:t xml:space="preserve">settings. For </w:t>
+      </w:r>
+      <w:proofErr w:type="gramStart"/>
+      <w:r>
+        <w:t>example</w:t>
+      </w:r>
+      <w:proofErr w:type="gramEnd"/>
+      <w:r>
+        <w:t xml:space="preserve"> the audio file name menu item is hidden unless </w:t>
       </w:r>
       <w:r>
         <w:t>“Play Audio File” is Yes.</w:t>
@@ -2211,10 +2588,34 @@
     </w:p>
     <w:p>
       <w:r>
-        <w:t xml:space="preserve">This must be set to On for the radio to begin </w:t>
-      </w:r>
-      <w:r>
-        <w:t>transmitting. If saved as On then the radio will start sending right after booting. If it is Off it will not automatically start sending. It can be toggle</w:t>
+        <w:t xml:space="preserve">This must be set to </w:t>
+      </w:r>
+      <w:proofErr w:type="gramStart"/>
+      <w:r>
+        <w:t>On</w:t>
+      </w:r>
+      <w:proofErr w:type="gramEnd"/>
+      <w:r>
+        <w:t xml:space="preserve"> for the radio to begin </w:t>
+      </w:r>
+      <w:r>
+        <w:t xml:space="preserve">transmitting. If saved as </w:t>
+      </w:r>
+      <w:proofErr w:type="gramStart"/>
+      <w:r>
+        <w:t>On</w:t>
+      </w:r>
+      <w:proofErr w:type="gramEnd"/>
+      <w:r>
+        <w:t xml:space="preserve"> then the radio will start sending right after booting. If it is </w:t>
+      </w:r>
+      <w:proofErr w:type="gramStart"/>
+      <w:r>
+        <w:t>Off</w:t>
+      </w:r>
+      <w:proofErr w:type="gramEnd"/>
+      <w:r>
+        <w:t xml:space="preserve"> it will not automatically start sending. It can be toggle</w:t>
       </w:r>
       <w:r>
         <w:t>d</w:t>
@@ -2251,13 +2652,34 @@
     </w:p>
     <w:p>
       <w:r>
-        <w:t>High power is about 5W and low power is 3W. These are the only</w:t>
+        <w:t xml:space="preserve">High power is about </w:t>
+      </w:r>
+      <w:proofErr w:type="gramStart"/>
+      <w:r>
+        <w:t>5W</w:t>
+      </w:r>
+      <w:proofErr w:type="gramEnd"/>
+      <w:r>
+        <w:t xml:space="preserve"> and low power is 3W. These are the only</w:t>
       </w:r>
       <w:r>
         <w:t xml:space="preserve"> values allowed by the SA818 radio. If lower power is desired an attenuator can be attached to the </w:t>
       </w:r>
       <w:r>
         <w:t>radio antenna.</w:t>
+      </w:r>
+    </w:p>
+    <w:p>
+      <w:pPr>
+        <w:pStyle w:val="Heading3"/>
+      </w:pPr>
+      <w:r>
+        <w:t>TX: 134-174 MHz or 144.275-144.300 (beacon mode only)</w:t>
+      </w:r>
+    </w:p>
+    <w:p>
+      <w:r>
+        <w:t>This is the transmit VHF frequency. A future version might be created using the UHF radio module. VHF is more common for Fox Hunting.</w:t>
       </w:r>
     </w:p>
     <w:p>
@@ -2269,10 +2691,10 @@
         </w:rPr>
       </w:pPr>
       <w:r>
-        <w:t>Beacon Frequenc</w:t>
-      </w:r>
-      <w:r>
-        <w:t>y</w:t>
+        <w:t xml:space="preserve">Beacon </w:t>
+      </w:r>
+      <w:r>
+        <w:t>Mode</w:t>
       </w:r>
       <w:r>
         <w:t>:</w:t>
@@ -2306,26 +2728,149 @@
         <w:pStyle w:val="Heading3"/>
       </w:pPr>
       <w:r>
-        <w:t xml:space="preserve">TX: </w:t>
-      </w:r>
-      <w:r>
-        <w:t>134-174 MHz</w:t>
-      </w:r>
-      <w:r>
-        <w:t xml:space="preserve"> or 144.275-144.300</w:t>
-      </w:r>
-      <w:r>
-        <w:t xml:space="preserve"> (beacon mode)</w:t>
-      </w:r>
-    </w:p>
-    <w:p>
-      <w:r>
-        <w:t>This is the transmit VHF frequency. A future versi</w:t>
-      </w:r>
-      <w:r>
-        <w:t>on might be created using the UHF radio module. VHF is more common for Fox Hunting.</w:t>
-      </w:r>
-    </w:p>
+        <w:t xml:space="preserve">Send GPS: </w:t>
+      </w:r>
+      <w:proofErr w:type="spellStart"/>
+      <w:r>
+        <w:t>Yes|</w:t>
+      </w:r>
+      <w:r>
+        <w:rPr>
+          <w:b/>
+          <w:bCs/>
+        </w:rPr>
+        <w:t>NO</w:t>
+      </w:r>
+      <w:proofErr w:type="spellEnd"/>
+      <w:r>
+        <w:t xml:space="preserve"> (beacon mode only)</w:t>
+      </w:r>
+    </w:p>
+    <w:p>
+      <w:r>
+        <w:t>This enables sending the GPS latit</w:t>
+      </w:r>
+      <w:r>
+        <w:t xml:space="preserve">ude and longitude values. The values must be entered manually from a phone </w:t>
+      </w:r>
+      <w:r>
+        <w:t xml:space="preserve">or GPS device. A future version of the hardware may have a built-in GPS </w:t>
+      </w:r>
+      <w:proofErr w:type="gramStart"/>
+      <w:r>
+        <w:t>module</w:t>
+      </w:r>
+      <w:proofErr w:type="gramEnd"/>
+      <w:r>
+        <w:t xml:space="preserve"> or it may be able to connect to a serial GPS device using the USB connection.</w:t>
+      </w:r>
+    </w:p>
+    <w:p>
+      <w:pPr>
+        <w:pStyle w:val="Heading3"/>
+      </w:pPr>
+      <w:r>
+        <w:t xml:space="preserve">Latitude: </w:t>
+      </w:r>
+      <w:r>
+        <w:t>+/-</w:t>
+      </w:r>
+      <w:proofErr w:type="spellStart"/>
+      <w:proofErr w:type="gramStart"/>
+      <w:r>
+        <w:t>n.nnnnnn</w:t>
+      </w:r>
+      <w:proofErr w:type="spellEnd"/>
+      <w:proofErr w:type="gramEnd"/>
+      <w:r>
+        <w:t xml:space="preserve"> (</w:t>
+      </w:r>
+      <w:r>
+        <w:t xml:space="preserve">Send </w:t>
+      </w:r>
+      <w:r>
+        <w:rPr>
+          <w:b/>
+          <w:bCs/>
+        </w:rPr>
+        <w:t xml:space="preserve">GPS </w:t>
+      </w:r>
+      <w:r>
+        <w:rPr>
+          <w:b/>
+          <w:bCs/>
+        </w:rPr>
+        <w:t>Yes</w:t>
+      </w:r>
+      <w:r>
+        <w:t xml:space="preserve"> only)</w:t>
+      </w:r>
+    </w:p>
+    <w:p>
+      <w:r>
+        <w:t xml:space="preserve">Enter the current latitude by reading </w:t>
+      </w:r>
+      <w:r>
+        <w:t xml:space="preserve">it </w:t>
+      </w:r>
+      <w:r>
+        <w:t>from a phone o</w:t>
+      </w:r>
+      <w:r>
+        <w:t>r</w:t>
+      </w:r>
+      <w:r>
+        <w:t xml:space="preserve"> GPS unit.</w:t>
+      </w:r>
+    </w:p>
+    <w:p>
+      <w:pPr>
+        <w:pStyle w:val="Heading3"/>
+      </w:pPr>
+      <w:r>
+        <w:lastRenderedPageBreak/>
+        <w:t>Longitude: +/-</w:t>
+      </w:r>
+      <w:proofErr w:type="spellStart"/>
+      <w:proofErr w:type="gramStart"/>
+      <w:r>
+        <w:t>n.nnnnnn</w:t>
+      </w:r>
+      <w:proofErr w:type="spellEnd"/>
+      <w:proofErr w:type="gramEnd"/>
+      <w:r>
+        <w:t xml:space="preserve"> (Send </w:t>
+      </w:r>
+      <w:r>
+        <w:rPr>
+          <w:b/>
+          <w:bCs/>
+        </w:rPr>
+        <w:t xml:space="preserve">GPS </w:t>
+      </w:r>
+      <w:r>
+        <w:rPr>
+          <w:b/>
+          <w:bCs/>
+        </w:rPr>
+        <w:t>Yes</w:t>
+      </w:r>
+      <w:r>
+        <w:t xml:space="preserve"> only)</w:t>
+      </w:r>
+    </w:p>
+    <w:p>
+      <w:r>
+        <w:t xml:space="preserve">Enter the current longitude by reading </w:t>
+      </w:r>
+      <w:r>
+        <w:t xml:space="preserve">it </w:t>
+      </w:r>
+      <w:r>
+        <w:t>from a phone or GPS unit.</w:t>
+      </w:r>
+    </w:p>
+    <w:p/>
     <w:p>
       <w:pPr>
         <w:pStyle w:val="Heading3"/>
@@ -2416,7 +2961,6 @@
         <w:pStyle w:val="Heading3"/>
       </w:pPr>
       <w:r>
-        <w:lastRenderedPageBreak/>
         <w:t xml:space="preserve">Audio File: </w:t>
       </w:r>
       <w:r>
@@ -2429,13 +2973,37 @@
     </w:p>
     <w:p>
       <w:r>
-        <w:t xml:space="preserve">This menu item is only visible if the previous item is set to Yes. Clicking the dial will list all of the </w:t>
-      </w:r>
-      <w:r>
-        <w:t>*.txt files on the SD card. The dial is rotated to highlight a file and a long press will set it</w:t>
-      </w:r>
-      <w:r>
-        <w:t>. Note that a click of dial just exits the list of file with no selection being performed.</w:t>
+        <w:t xml:space="preserve">This menu item is only visible if the previous item is set to Yes. Clicking the dial will list </w:t>
+      </w:r>
+      <w:proofErr w:type="gramStart"/>
+      <w:r>
+        <w:t>all of</w:t>
+      </w:r>
+      <w:proofErr w:type="gramEnd"/>
+      <w:r>
+        <w:t xml:space="preserve"> the </w:t>
+      </w:r>
+      <w:r>
+        <w:t xml:space="preserve">*.txt files on the SD card. The dial is rotated to highlight a </w:t>
+      </w:r>
+      <w:proofErr w:type="gramStart"/>
+      <w:r>
+        <w:t>file</w:t>
+      </w:r>
+      <w:proofErr w:type="gramEnd"/>
+      <w:r>
+        <w:t xml:space="preserve"> and a long press will set it</w:t>
+      </w:r>
+      <w:r>
+        <w:t xml:space="preserve">. Note that a click of dial just exits the list of </w:t>
+      </w:r>
+      <w:proofErr w:type="gramStart"/>
+      <w:r>
+        <w:t>file</w:t>
+      </w:r>
+      <w:proofErr w:type="gramEnd"/>
+      <w:r>
+        <w:t xml:space="preserve"> with no selection being performed.</w:t>
       </w:r>
     </w:p>
     <w:p>
@@ -2514,7 +3082,15 @@
         <w:t xml:space="preserve"> and are always the same. In Random mode the transmit time and pause time are randomly chosen</w:t>
       </w:r>
       <w:r>
-        <w:t xml:space="preserve"> from the allowed values set in the Min and Max values for TX Send and Pause. This makes the timing less predictable and make the game a little bit harder.</w:t>
+        <w:t xml:space="preserve"> from the allowed values set in the Min and Max values for TX Send and Pause. This makes the timing less predictable and </w:t>
+      </w:r>
+      <w:proofErr w:type="gramStart"/>
+      <w:r>
+        <w:t>make</w:t>
+      </w:r>
+      <w:proofErr w:type="gramEnd"/>
+      <w:r>
+        <w:t xml:space="preserve"> the game a little bit harder.</w:t>
       </w:r>
       <w:r>
         <w:t xml:space="preserve"> Keep your ears on!</w:t>
@@ -2525,6 +3101,7 @@
         <w:pStyle w:val="Heading3"/>
       </w:pPr>
       <w:r>
+        <w:lastRenderedPageBreak/>
         <w:t xml:space="preserve">TX Send: </w:t>
       </w:r>
       <w:r>
@@ -2567,7 +3144,15 @@
         <w:t>This is the pause time between transmissions</w:t>
       </w:r>
       <w:r>
-        <w:t>. Longer times let the radio cool off and save the battery for longer run times.</w:t>
+        <w:t xml:space="preserve">. Longer times let the radio cool off and save the battery for longer </w:t>
+      </w:r>
+      <w:proofErr w:type="gramStart"/>
+      <w:r>
+        <w:t>run</w:t>
+      </w:r>
+      <w:proofErr w:type="gramEnd"/>
+      <w:r>
+        <w:t xml:space="preserve"> times.</w:t>
       </w:r>
     </w:p>
     <w:p>
@@ -2620,13 +3205,105 @@
         <w:pStyle w:val="Heading3"/>
       </w:pPr>
       <w:r>
+        <w:t>TX Pause Max: 10-1200 Sec</w:t>
+      </w:r>
+    </w:p>
+    <w:p>
+      <w:r>
+        <w:t>In random mode this is the maximum pause time.</w:t>
+      </w:r>
+    </w:p>
+    <w:p>
+      <w:pPr>
+        <w:pStyle w:val="Heading3"/>
+      </w:pPr>
+      <w:r>
+        <w:t xml:space="preserve">TX Stop: </w:t>
+      </w:r>
+      <w:proofErr w:type="spellStart"/>
+      <w:r>
+        <w:t>Immediate|Finish</w:t>
+      </w:r>
+      <w:proofErr w:type="spellEnd"/>
+      <w:r>
+        <w:t xml:space="preserve"> Cycle</w:t>
+      </w:r>
+    </w:p>
+    <w:p>
+      <w:r>
+        <w:t xml:space="preserve">During transmit time the Beacon, Call Sign, and Audio are continuously sent. At the end of the transmission time this option controls whether the transmission stops immediately </w:t>
+      </w:r>
+      <w:proofErr w:type="gramStart"/>
+      <w:r>
+        <w:t>of</w:t>
+      </w:r>
+      <w:proofErr w:type="gramEnd"/>
+      <w:r>
+        <w:t xml:space="preserve"> waits to stop until the entire cycle is finished.</w:t>
+      </w:r>
+    </w:p>
+    <w:p/>
+    <w:p>
+      <w:r>
+        <w:t>A clever use of this command</w:t>
+      </w:r>
+      <w:r>
+        <w:t xml:space="preserve"> allows for only one cycle of beacon, ID, and music to be sent during each transmission time. Set the transmit</w:t>
+      </w:r>
+      <w:r>
+        <w:t xml:space="preserve"> time to something less than</w:t>
+      </w:r>
+      <w:r>
+        <w:t xml:space="preserve"> the time to perform a complete cycle and set this option to “Finish Cycle”. The </w:t>
+      </w:r>
+      <w:proofErr w:type="gramStart"/>
+      <w:r>
+        <w:t>transmit  cycle</w:t>
+      </w:r>
+      <w:proofErr w:type="gramEnd"/>
+      <w:r>
+        <w:t xml:space="preserve"> will begin, the timer will expire, but the current cycle will complete before stopping</w:t>
+      </w:r>
+      <w:r>
+        <w:t>.</w:t>
+      </w:r>
+    </w:p>
+    <w:p>
+      <w:pPr>
+        <w:pStyle w:val="Heading3"/>
+      </w:pPr>
+      <w:r>
+        <w:t xml:space="preserve">Radio Pause: </w:t>
+      </w:r>
+      <w:proofErr w:type="spellStart"/>
+      <w:r>
+        <w:t>Sleep|Awake</w:t>
+      </w:r>
+      <w:proofErr w:type="spellEnd"/>
+    </w:p>
+    <w:p>
+      <w:r>
+        <w:t xml:space="preserve">During pause time the radio can be put into sleep mode. This lowers the power consumption and lets the battery last longer. </w:t>
+      </w:r>
+      <w:proofErr w:type="gramStart"/>
+      <w:r>
+        <w:t>However</w:t>
+      </w:r>
+      <w:proofErr w:type="gramEnd"/>
+      <w:r>
+        <w:t xml:space="preserve"> note that this also means that the DTMF commands are disabled since the radio is asleep!</w:t>
+      </w:r>
+    </w:p>
+    <w:p>
+      <w:pPr>
+        <w:pStyle w:val="Heading2"/>
+      </w:pPr>
+      <w:r>
         <w:lastRenderedPageBreak/>
-        <w:t>TX Pause Max: 10-1200 Sec</w:t>
-      </w:r>
-    </w:p>
-    <w:p>
-      <w:r>
-        <w:t>In random mode this is the maximum pause time.</w:t>
+        <w:t>+</w:t>
+      </w:r>
+      <w:r>
+        <w:t>More Radio Settings</w:t>
       </w:r>
     </w:p>
     <w:p>
@@ -2634,56 +3311,736 @@
         <w:pStyle w:val="Heading3"/>
       </w:pPr>
       <w:r>
-        <w:t xml:space="preserve">TX Stop: </w:t>
+        <w:t>RX Offset: -600|0|+600 kHz</w:t>
+      </w:r>
+    </w:p>
+    <w:p>
+      <w:r>
+        <w:t>This is the frequency offset from the transmit frequency that the radio uses to receive DTMF commands</w:t>
+      </w:r>
+      <w:r>
+        <w:t>. An offset is recommended. If 0 is used the radio will only listen when it isn’t sending. It has not been tested if it listens during sending when the offset is not 0.</w:t>
+      </w:r>
+    </w:p>
+    <w:p>
+      <w:pPr>
+        <w:pStyle w:val="Heading3"/>
+      </w:pPr>
+      <w:r>
+        <w:t>Bandwidth: 12.5|</w:t>
+      </w:r>
+      <w:r>
+        <w:t>25 kHz</w:t>
+      </w:r>
+    </w:p>
+    <w:p>
+      <w:r>
+        <w:t>This sets the radio bandwidth</w:t>
+      </w:r>
+      <w:r>
+        <w:t>. It has not been tested much to see what effect it has on performance yet.</w:t>
+      </w:r>
+    </w:p>
+    <w:p>
+      <w:pPr>
+        <w:pStyle w:val="Heading3"/>
+      </w:pPr>
+      <w:r>
+        <w:t>CTCSS/DCS: CTCSS|DCS</w:t>
+      </w:r>
+    </w:p>
+    <w:p>
+      <w:r>
+        <w:t xml:space="preserve">This sets the </w:t>
+      </w:r>
+      <w:r>
+        <w:t>un-squelch</w:t>
+      </w:r>
+      <w:r>
+        <w:t xml:space="preserve"> values</w:t>
+      </w:r>
+      <w:r>
+        <w:t xml:space="preserve"> for either the analog or digital versions.</w:t>
+      </w:r>
+    </w:p>
+    <w:p>
+      <w:pPr>
+        <w:pStyle w:val="Heading3"/>
+      </w:pPr>
+      <w:r>
+        <w:t>TX CTCSS:</w:t>
+      </w:r>
+      <w:r>
+        <w:t xml:space="preserve"> None</w:t>
+      </w:r>
+      <w:r>
+        <w:t>|</w:t>
+      </w:r>
+      <w:r>
+        <w:t>67-</w:t>
+      </w:r>
+      <w:r>
+        <w:t>250.3</w:t>
+      </w:r>
+    </w:p>
+    <w:p>
+      <w:r>
+        <w:t>Analog un-squelch frequencies sent out.</w:t>
+      </w:r>
+    </w:p>
+    <w:p>
+      <w:pPr>
+        <w:pStyle w:val="Heading3"/>
+      </w:pPr>
+      <w:r>
+        <w:t>RX CTCSS:</w:t>
+      </w:r>
+      <w:r>
+        <w:t xml:space="preserve"> None|67-250.3</w:t>
+      </w:r>
+    </w:p>
+    <w:p>
+      <w:r>
+        <w:t>Analog un-squelch frequency for receiving.</w:t>
+      </w:r>
+    </w:p>
+    <w:p>
+      <w:pPr>
+        <w:pStyle w:val="Heading3"/>
+      </w:pPr>
+      <w:r>
+        <w:t>TX DCS:</w:t>
+      </w:r>
+      <w:r>
+        <w:t xml:space="preserve"> None|023-754</w:t>
+      </w:r>
+    </w:p>
+    <w:p>
+      <w:r>
+        <w:t>Digital un-squelch value for sending.</w:t>
+      </w:r>
+    </w:p>
+    <w:p>
+      <w:pPr>
+        <w:pStyle w:val="Heading3"/>
+      </w:pPr>
+      <w:r>
+        <w:t>TX I/N: I|N</w:t>
+      </w:r>
+    </w:p>
+    <w:p>
+      <w:r>
+        <w:t>The digital I or N value for sending.</w:t>
+      </w:r>
+    </w:p>
+    <w:p>
+      <w:pPr>
+        <w:pStyle w:val="Heading3"/>
+      </w:pPr>
+      <w:r>
+        <w:t>RX DCS: None|023-754</w:t>
+      </w:r>
+    </w:p>
+    <w:p>
+      <w:r>
+        <w:t>Digital un-squelch value for receiving.</w:t>
+      </w:r>
+    </w:p>
+    <w:p>
+      <w:pPr>
+        <w:pStyle w:val="Heading3"/>
+      </w:pPr>
+      <w:r>
+        <w:t>RX I/N: I|N</w:t>
+      </w:r>
+    </w:p>
+    <w:p>
+      <w:r>
+        <w:t>The digital I or N value for receiving.</w:t>
+      </w:r>
+    </w:p>
+    <w:p>
+      <w:pPr>
+        <w:pStyle w:val="Heading3"/>
+      </w:pPr>
+      <w:r>
+        <w:t>RX Volume:</w:t>
+      </w:r>
+      <w:r>
+        <w:t xml:space="preserve"> 1-6</w:t>
+      </w:r>
+    </w:p>
+    <w:p>
+      <w:r>
+        <w:t>This is the receive volume setting. It affects how well DTMF tones are detected.</w:t>
+      </w:r>
+    </w:p>
+    <w:p>
+      <w:pPr>
+        <w:pStyle w:val="Heading3"/>
+      </w:pPr>
+      <w:r>
+        <w:t>RX Squelch:</w:t>
+      </w:r>
+      <w:r>
+        <w:t xml:space="preserve"> 0-8</w:t>
+      </w:r>
+    </w:p>
+    <w:p>
+      <w:r>
+        <w:t>This affects how much signal is required to receive the DTMF signals.</w:t>
+      </w:r>
+    </w:p>
+    <w:p>
+      <w:pPr>
+        <w:pStyle w:val="Heading2"/>
+      </w:pPr>
+      <w:r>
+        <w:lastRenderedPageBreak/>
+        <w:t>Cancel Waits/TX Now</w:t>
+      </w:r>
+    </w:p>
+    <w:p>
+      <w:r>
+        <w:t xml:space="preserve">When the radio is in either send or pause mode this command will cancel the </w:t>
+      </w:r>
+      <w:proofErr w:type="gramStart"/>
+      <w:r>
+        <w:t>timer</w:t>
+      </w:r>
+      <w:proofErr w:type="gramEnd"/>
+      <w:r>
+        <w:t xml:space="preserve"> and the next mo</w:t>
+      </w:r>
+      <w:r>
+        <w:t xml:space="preserve">de will start. For </w:t>
+      </w:r>
+      <w:proofErr w:type="gramStart"/>
+      <w:r>
+        <w:t>example</w:t>
+      </w:r>
+      <w:proofErr w:type="gramEnd"/>
+      <w:r>
+        <w:t xml:space="preserve"> if you want to cancel</w:t>
+      </w:r>
+      <w:r>
+        <w:t xml:space="preserve"> the pause and go to transmit, use this option. It can also be done by long pressing B0.</w:t>
+      </w:r>
+    </w:p>
+    <w:p>
+      <w:pPr>
+        <w:pStyle w:val="Heading2"/>
+      </w:pPr>
+      <w:r>
+        <w:t>+Saved Settings Files</w:t>
+      </w:r>
+    </w:p>
+    <w:p>
+      <w:r>
+        <w:t>Saved settings files are named files stored on the SD card. They are useful to</w:t>
+      </w:r>
+      <w:r>
+        <w:t xml:space="preserve"> quickly configure the radio for different uses. All values except the battery calibration are affected.</w:t>
+      </w:r>
+    </w:p>
+    <w:p>
+      <w:pPr>
+        <w:pStyle w:val="Heading3"/>
+      </w:pPr>
+      <w:r>
+        <w:t>Create File</w:t>
+      </w:r>
+    </w:p>
+    <w:p>
+      <w:r>
+        <w:t>This prompts the user for a name. The file is then created using the current system settings.</w:t>
+      </w:r>
+    </w:p>
+    <w:p>
+      <w:pPr>
+        <w:pStyle w:val="Heading3"/>
+      </w:pPr>
+      <w:r>
+        <w:t>Save/Update File</w:t>
+      </w:r>
+    </w:p>
+    <w:p>
+      <w:r>
+        <w:t xml:space="preserve">This command saves the current settings into the selected file. If it already </w:t>
+      </w:r>
+      <w:proofErr w:type="gramStart"/>
+      <w:r>
+        <w:t>exists</w:t>
+      </w:r>
+      <w:proofErr w:type="gramEnd"/>
+      <w:r>
+        <w:t xml:space="preserve"> the user will be asked to confirm overwriting the file.</w:t>
+      </w:r>
+    </w:p>
+    <w:p>
+      <w:pPr>
+        <w:pStyle w:val="Heading3"/>
+      </w:pPr>
+      <w:r>
+        <w:t>Load File</w:t>
+      </w:r>
+    </w:p>
+    <w:p>
+      <w:r>
+        <w:t xml:space="preserve">This command asks the user for the name and then sets </w:t>
+      </w:r>
+      <w:proofErr w:type="gramStart"/>
+      <w:r>
+        <w:t>all of</w:t>
+      </w:r>
+      <w:proofErr w:type="gramEnd"/>
+      <w:r>
+        <w:t xml:space="preserve"> the system settings except the battery calibration using the values in the file.</w:t>
+      </w:r>
+    </w:p>
+    <w:p>
+      <w:pPr>
+        <w:pStyle w:val="Heading3"/>
+      </w:pPr>
+      <w:r>
+        <w:t>Delete File</w:t>
+      </w:r>
+    </w:p>
+    <w:p>
+      <w:r>
+        <w:t>The user selects a file from the list and then it can be deleted.</w:t>
+      </w:r>
+    </w:p>
+    <w:p>
+      <w:pPr>
+        <w:pStyle w:val="Heading2"/>
+      </w:pPr>
+      <w:r>
+        <w:t>+System Settings</w:t>
+      </w:r>
+    </w:p>
+    <w:p>
+      <w:pPr>
+        <w:pStyle w:val="Heading3"/>
+      </w:pPr>
+      <w:r>
+        <w:t>+Display</w:t>
+      </w:r>
+      <w:r>
+        <w:t xml:space="preserve"> Settings</w:t>
+      </w:r>
+    </w:p>
+    <w:p>
+      <w:pPr>
+        <w:pStyle w:val="Heading4"/>
+      </w:pPr>
+      <w:r>
+        <w:t>Dimming Mode: None</w:t>
+      </w:r>
+      <w:r>
+        <w:t>|Timer</w:t>
+      </w:r>
+    </w:p>
+    <w:p>
+      <w:r>
+        <w:t xml:space="preserve">The display can be set to dim automatically after a specified number of seconds. This is used to save battery power since the backlight </w:t>
+      </w:r>
+      <w:r>
+        <w:t>uses a significant amount.</w:t>
+      </w:r>
+    </w:p>
+    <w:p>
+      <w:pPr>
+        <w:pStyle w:val="Heading4"/>
+      </w:pPr>
+      <w:r>
+        <w:t>Bright Value: 1-100</w:t>
+      </w:r>
+      <w:r>
+        <w:t>%</w:t>
+      </w:r>
+    </w:p>
+    <w:p>
+      <w:r>
+        <w:t>Set the display brightness value.</w:t>
+      </w:r>
+    </w:p>
+    <w:p>
+      <w:pPr>
+        <w:pStyle w:val="Heading4"/>
+      </w:pPr>
+      <w:r>
+        <w:t xml:space="preserve">Dim Value: </w:t>
+      </w:r>
+      <w:r>
+        <w:t>0-100%</w:t>
+      </w:r>
+    </w:p>
+    <w:p>
+      <w:r>
+        <w:t xml:space="preserve">Set the display brightness after the </w:t>
+      </w:r>
+      <w:r>
+        <w:t>timer below expires.</w:t>
+      </w:r>
+    </w:p>
+    <w:p>
+      <w:pPr>
+        <w:pStyle w:val="Heading4"/>
+      </w:pPr>
+      <w:r>
+        <w:lastRenderedPageBreak/>
+        <w:t>Display Dim Time:</w:t>
+      </w:r>
+      <w:r>
+        <w:t xml:space="preserve"> 0-120 S</w:t>
+      </w:r>
+    </w:p>
+    <w:p>
+      <w:r>
+        <w:t>Specify the time until the display changes to dim mode.</w:t>
+      </w:r>
+    </w:p>
+    <w:p>
+      <w:pPr>
+        <w:pStyle w:val="Heading4"/>
+      </w:pPr>
+      <w:r>
+        <w:t>+Sideways Scroll Settings</w:t>
+      </w:r>
+    </w:p>
+    <w:p>
+      <w:r>
+        <w:t xml:space="preserve">Lines of text that </w:t>
+      </w:r>
+      <w:proofErr w:type="gramStart"/>
+      <w:r>
+        <w:t>too</w:t>
+      </w:r>
+      <w:proofErr w:type="gramEnd"/>
+      <w:r>
+        <w:t xml:space="preserve"> long for the display will scroll back and forth. The following settings control the speed.</w:t>
+      </w:r>
+    </w:p>
+    <w:p>
+      <w:pPr>
+        <w:pStyle w:val="Heading5"/>
+      </w:pPr>
+      <w:r>
+        <w:t xml:space="preserve">Speed: </w:t>
+      </w:r>
+      <w:r>
+        <w:t>1-1000 mS</w:t>
+      </w:r>
+    </w:p>
+    <w:p>
+      <w:r>
+        <w:t>Controls the speed of text moving to the left.</w:t>
+      </w:r>
+    </w:p>
+    <w:p>
+      <w:pPr>
+        <w:pStyle w:val="Heading5"/>
+      </w:pPr>
+      <w:r>
+        <w:t>Pause: 1-100</w:t>
+      </w:r>
+      <w:r>
+        <w:t xml:space="preserve"> mS</w:t>
+      </w:r>
+    </w:p>
+    <w:p>
+      <w:r>
+        <w:t>This controls the pause when the text is at the end (all the way to the left).</w:t>
+      </w:r>
+    </w:p>
+    <w:p>
+      <w:pPr>
+        <w:pStyle w:val="Heading5"/>
+      </w:pPr>
+      <w:r>
+        <w:t>Reverse Speed: 1-20x</w:t>
+      </w:r>
+    </w:p>
+    <w:p>
+      <w:r>
+        <w:t xml:space="preserve">This is how fast the text scrolls </w:t>
+      </w:r>
+      <w:r>
+        <w:t>back to the beginning (to the right). 2x means twice as fast as the text scroll</w:t>
+      </w:r>
+      <w:r>
+        <w:t>ed to the left</w:t>
+      </w:r>
+      <w:r>
+        <w:t>.</w:t>
+      </w:r>
+    </w:p>
+    <w:p>
+      <w:pPr>
+        <w:pStyle w:val="Heading4"/>
+      </w:pPr>
+      <w:r>
+        <w:t xml:space="preserve">Menu Selection: </w:t>
+      </w:r>
+      <w:r>
+        <w:t>Color|*</w:t>
+      </w:r>
+    </w:p>
+    <w:p>
+      <w:r>
+        <w:t>Menu selections</w:t>
+      </w:r>
+      <w:r>
+        <w:t xml:space="preserve"> and selections from a list can be either colored or marked with the ‘*’ character.</w:t>
+      </w:r>
+    </w:p>
+    <w:p>
+      <w:pPr>
+        <w:pStyle w:val="Heading4"/>
+      </w:pPr>
+      <w:r>
+        <w:t>Text/</w:t>
       </w:r>
       <w:proofErr w:type="spellStart"/>
       <w:r>
-        <w:t>Immediate|Finish</w:t>
+        <w:t>HiLite</w:t>
       </w:r>
       <w:proofErr w:type="spellEnd"/>
       <w:r>
-        <w:t xml:space="preserve"> Cycle</w:t>
-      </w:r>
-    </w:p>
-    <w:p>
-      <w:r>
-        <w:t>During transmit time the Beacon, Call Sign, and Audio are continuously sent. At the end of the transmission time this option controls whether the transmission stops immediately of waits to stop until the entire cycle is finished.</w:t>
-      </w:r>
-    </w:p>
-    <w:p/>
-    <w:p>
-      <w:r>
-        <w:t>A clever use of this command</w:t>
-      </w:r>
-      <w:r>
-        <w:t xml:space="preserve"> allows for only one cycle of beacon, ID, and music to be sent during each transmission time. Set the transmit</w:t>
-      </w:r>
-      <w:r>
-        <w:t xml:space="preserve"> time to something less than</w:t>
-      </w:r>
-      <w:r>
-        <w:t xml:space="preserve"> the time to perform a complete cycle and set this option to “Finish Cycle”. The transmit  cycle will begin, the timer will expire, but the current cycle will complete before stopping</w:t>
-      </w:r>
+        <w:t xml:space="preserve"> Colors</w:t>
+      </w:r>
+    </w:p>
+    <w:p>
+      <w:r>
+        <w:t>This selection allows for choosing the colors of the text and the highlight. The background screen is always black.</w:t>
+      </w:r>
+    </w:p>
+    <w:p>
+      <w:pPr>
+        <w:pStyle w:val="Heading3"/>
+      </w:pPr>
+      <w:r>
+        <w:t>+Dial &amp; Button Settings</w:t>
+      </w:r>
+    </w:p>
+    <w:p>
+      <w:pPr>
+        <w:pStyle w:val="Heading4"/>
+      </w:pPr>
+      <w:r>
+        <w:t xml:space="preserve">Direction: </w:t>
+      </w:r>
+      <w:proofErr w:type="spellStart"/>
+      <w:proofErr w:type="gramStart"/>
+      <w:r>
+        <w:t>Normal:Reverse</w:t>
+      </w:r>
+      <w:proofErr w:type="spellEnd"/>
+      <w:proofErr w:type="gramEnd"/>
+    </w:p>
+    <w:p>
+      <w:r>
+        <w:t>If you really want the button to be the other way around this is the choice for you.</w:t>
+      </w:r>
+    </w:p>
+    <w:p>
+      <w:pPr>
+        <w:pStyle w:val="Heading4"/>
+      </w:pPr>
+      <w:r>
+        <w:t>Long Press Timer: 2-200</w:t>
+      </w:r>
+    </w:p>
+    <w:p>
+      <w:r>
+        <w:t>This value affects how long or short a long press is. The default value is normally OK</w:t>
+      </w:r>
+      <w:r>
+        <w:t>, but somebody might want to change it.</w:t>
+      </w:r>
+    </w:p>
+    <w:p>
+      <w:pPr>
+        <w:pStyle w:val="Heading3"/>
+      </w:pPr>
+      <w:r>
+        <w:t>+Battery Settings</w:t>
+      </w:r>
+    </w:p>
+    <w:p>
+      <w:r>
+        <w:t xml:space="preserve">Since the PCB was designed with 10% resistors for measuring the battery voltage some calibration is needed. A future PCB will probably use better </w:t>
+      </w:r>
+      <w:proofErr w:type="gramStart"/>
+      <w:r>
+        <w:t>resistors</w:t>
+      </w:r>
+      <w:proofErr w:type="gramEnd"/>
+      <w:r>
+        <w:t xml:space="preserve"> so this won’t be needed.</w:t>
+      </w:r>
+    </w:p>
+    <w:p>
+      <w:pPr>
+        <w:pStyle w:val="Heading4"/>
+      </w:pPr>
+      <w:r>
+        <w:t xml:space="preserve">Show Battery: </w:t>
+      </w:r>
+      <w:proofErr w:type="spellStart"/>
+      <w:r>
+        <w:t>Yes|No</w:t>
+      </w:r>
+      <w:proofErr w:type="spellEnd"/>
+    </w:p>
+    <w:p>
+      <w:r>
+        <w:t xml:space="preserve">This option controls the </w:t>
+      </w:r>
+      <w:r>
+        <w:t>battery display on the bottom right of the display.</w:t>
+      </w:r>
+    </w:p>
+    <w:p>
+      <w:pPr>
+        <w:pStyle w:val="Heading4"/>
+      </w:pPr>
+      <w:r>
+        <w:lastRenderedPageBreak/>
+        <w:t>Full Battery: 2000-4000</w:t>
+      </w:r>
+    </w:p>
+    <w:p>
+      <w:r>
+        <w:t>This is the value that indicates a full 4.2V battery.</w:t>
+      </w:r>
+    </w:p>
+    <w:p>
+      <w:pPr>
+        <w:pStyle w:val="Heading4"/>
+      </w:pPr>
+      <w:r>
+        <w:t>Set Full Battery</w:t>
+      </w:r>
+    </w:p>
+    <w:p>
+      <w:r>
+        <w:t>This selection reads the current battery values and stores it. It is best set by fully charging the battery and then disconnecting the charger. Wait a couple of minutes and then use it several times until it seems stable.</w:t>
+      </w:r>
+    </w:p>
+    <w:p>
+      <w:pPr>
+        <w:pStyle w:val="Heading4"/>
+      </w:pPr>
+      <w:r>
+        <w:t>Read Battery Raw Data</w:t>
+      </w:r>
+    </w:p>
+    <w:p>
+      <w:r>
+        <w:t>This continuously reads the battery value</w:t>
+      </w:r>
+      <w:r>
+        <w:t xml:space="preserve">. It was originally used for testing, but it seems like it might possibly be </w:t>
+      </w:r>
+      <w:proofErr w:type="gramStart"/>
+      <w:r>
+        <w:t>useful</w:t>
+      </w:r>
+      <w:proofErr w:type="gramEnd"/>
+      <w:r>
+        <w:t xml:space="preserve"> so it was left in the menu system.</w:t>
+      </w:r>
+    </w:p>
+    <w:p>
+      <w:pPr>
+        <w:pStyle w:val="Heading3"/>
+      </w:pPr>
+      <w:r>
+        <w:t>New Version BIN File</w:t>
+      </w:r>
+    </w:p>
+    <w:p>
+      <w:r>
+        <w:t xml:space="preserve">New firmware can be loaded by putting </w:t>
+      </w:r>
+      <w:r>
+        <w:t xml:space="preserve">the binary file on the SD card. It must be named </w:t>
+      </w:r>
+      <w:proofErr w:type="spellStart"/>
+      <w:r>
+        <w:t>RadioFox.BIN</w:t>
+      </w:r>
+      <w:proofErr w:type="spellEnd"/>
       <w:r>
         <w:t>.</w:t>
       </w:r>
+      <w:r>
+        <w:t xml:space="preserve"> There are two prompts, one to confirm overwriting the firmware, and another to allow deletion of the </w:t>
+      </w:r>
+      <w:r>
+        <w:t>BIN file after installation.</w:t>
+      </w:r>
     </w:p>
     <w:p>
       <w:pPr>
         <w:pStyle w:val="Heading3"/>
       </w:pPr>
       <w:r>
-        <w:t xml:space="preserve">Radio Pause: </w:t>
+        <w:t>Factory Settings</w:t>
+      </w:r>
+    </w:p>
+    <w:p>
+      <w:r>
+        <w:t xml:space="preserve">This command resets </w:t>
+      </w:r>
+      <w:r>
+        <w:t xml:space="preserve">all </w:t>
+      </w:r>
+      <w:r>
+        <w:t>settings</w:t>
+      </w:r>
+      <w:r>
+        <w:t xml:space="preserve"> except the high battery value to the original factory values.</w:t>
+      </w:r>
+      <w:r>
+        <w:t xml:space="preserve"> The factory reset can also be done by holding the dial button down while turning the power on.</w:t>
+      </w:r>
+    </w:p>
+    <w:p>
+      <w:pPr>
+        <w:pStyle w:val="Heading3"/>
+      </w:pPr>
+      <w:r>
+        <w:t>Format EEPROM</w:t>
+      </w:r>
+    </w:p>
+    <w:p>
+      <w:r>
+        <w:t xml:space="preserve">This will clear </w:t>
+      </w:r>
+      <w:r>
+        <w:t xml:space="preserve">and reset </w:t>
+      </w:r>
+      <w:r>
+        <w:t xml:space="preserve">the </w:t>
       </w:r>
       <w:proofErr w:type="spellStart"/>
       <w:r>
-        <w:t>Sleep|Awake</w:t>
+        <w:t>eeprom</w:t>
       </w:r>
       <w:proofErr w:type="spellEnd"/>
-    </w:p>
-    <w:p>
-      <w:r>
-        <w:t>During pause time the radio can be put into sleep mode. This lowers the power consumption and lets the battery last longer. However note that this also means that the DTMF commands are disabled since the radio is asleep!</w:t>
+      <w:r>
+        <w:t xml:space="preserve"> where the settings are </w:t>
+      </w:r>
+      <w:proofErr w:type="gramStart"/>
+      <w:r>
+        <w:t>save</w:t>
+      </w:r>
+      <w:proofErr w:type="gramEnd"/>
+      <w:r>
+        <w:t xml:space="preserve"> in non-volatile memory. This is how settings are saved while the system is not powered.</w:t>
       </w:r>
     </w:p>
     <w:p>
@@ -2691,703 +4048,20 @@
         <w:pStyle w:val="Heading2"/>
       </w:pPr>
       <w:r>
-        <w:t>+</w:t>
-      </w:r>
-      <w:r>
-        <w:t>More Radio Settings</w:t>
-      </w:r>
-    </w:p>
-    <w:p>
-      <w:pPr>
-        <w:pStyle w:val="Heading3"/>
-      </w:pPr>
-      <w:r>
-        <w:t>RX Offset: -600|0|+600 kHz</w:t>
-      </w:r>
-    </w:p>
-    <w:p>
-      <w:r>
-        <w:t>This is the frequency offset from the transmit frequency that the radio uses to receive DTMF commands</w:t>
-      </w:r>
-      <w:r>
-        <w:t>. An offset is recommended. If 0 is used the radio will only listen when it isn’t sending. It has not been tested if it listens during sending when the offset is not 0.</w:t>
-      </w:r>
-    </w:p>
-    <w:p>
-      <w:pPr>
-        <w:pStyle w:val="Heading3"/>
-      </w:pPr>
-      <w:r>
-        <w:t>Bandwidth: 12.5|</w:t>
-      </w:r>
-      <w:r>
-        <w:t>25 kHz</w:t>
-      </w:r>
-    </w:p>
-    <w:p>
-      <w:r>
-        <w:t>This sets the radio bandwidth</w:t>
-      </w:r>
-      <w:r>
-        <w:t>. It has not been tested much to see what effect it has on performance yet.</w:t>
-      </w:r>
-    </w:p>
-    <w:p>
-      <w:pPr>
-        <w:pStyle w:val="Heading3"/>
-      </w:pPr>
-      <w:r>
-        <w:t>CTCSS/DCS: CTCSS|DCS</w:t>
-      </w:r>
-    </w:p>
-    <w:p>
-      <w:r>
-        <w:t xml:space="preserve">This sets the </w:t>
-      </w:r>
-      <w:r>
-        <w:t>un-squelch</w:t>
-      </w:r>
-      <w:r>
-        <w:t xml:space="preserve"> values</w:t>
-      </w:r>
-      <w:r>
-        <w:t xml:space="preserve"> for either the analog or digital versions.</w:t>
-      </w:r>
-    </w:p>
-    <w:p>
-      <w:pPr>
-        <w:pStyle w:val="Heading3"/>
-      </w:pPr>
-      <w:r>
-        <w:t>TX CTCSS:</w:t>
-      </w:r>
-      <w:r>
-        <w:t xml:space="preserve"> None</w:t>
-      </w:r>
-      <w:r>
-        <w:t>|</w:t>
-      </w:r>
-      <w:r>
-        <w:t>67-</w:t>
-      </w:r>
-      <w:r>
-        <w:t>250.3</w:t>
-      </w:r>
-    </w:p>
-    <w:p>
-      <w:r>
-        <w:t>Analog un-squelch frequencies sent out.</w:t>
-      </w:r>
-    </w:p>
-    <w:p>
-      <w:pPr>
-        <w:pStyle w:val="Heading3"/>
-      </w:pPr>
-      <w:r>
-        <w:t>RX CTCSS:</w:t>
-      </w:r>
-      <w:r>
-        <w:t xml:space="preserve"> None|67-250.3</w:t>
-      </w:r>
-    </w:p>
-    <w:p>
-      <w:r>
-        <w:t>Analog un-squelch frequency for receiving.</w:t>
-      </w:r>
-    </w:p>
-    <w:p>
-      <w:pPr>
-        <w:pStyle w:val="Heading3"/>
-      </w:pPr>
-      <w:r>
-        <w:lastRenderedPageBreak/>
-        <w:t>TX DCS:</w:t>
-      </w:r>
-      <w:r>
-        <w:t xml:space="preserve"> None|023-754</w:t>
-      </w:r>
-    </w:p>
-    <w:p>
-      <w:r>
-        <w:t>Digital un-squelch value for sending.</w:t>
-      </w:r>
-    </w:p>
-    <w:p>
-      <w:pPr>
-        <w:pStyle w:val="Heading3"/>
-      </w:pPr>
-      <w:r>
-        <w:t>TX I/N: I|N</w:t>
-      </w:r>
-    </w:p>
-    <w:p>
-      <w:r>
-        <w:t>The digital I or N value for sending.</w:t>
-      </w:r>
-    </w:p>
-    <w:p>
-      <w:pPr>
-        <w:pStyle w:val="Heading3"/>
-      </w:pPr>
-      <w:r>
-        <w:t>RX DCS: None|023-754</w:t>
-      </w:r>
-    </w:p>
-    <w:p>
-      <w:r>
-        <w:t>Digital un-squelch value for receiving.</w:t>
-      </w:r>
-    </w:p>
-    <w:p>
-      <w:pPr>
-        <w:pStyle w:val="Heading3"/>
-      </w:pPr>
-      <w:r>
-        <w:t>RX I/N: I|N</w:t>
-      </w:r>
-    </w:p>
-    <w:p>
-      <w:r>
-        <w:t>The digital I or N value for receiving.</w:t>
-      </w:r>
-    </w:p>
-    <w:p>
-      <w:pPr>
-        <w:pStyle w:val="Heading3"/>
-      </w:pPr>
-      <w:r>
-        <w:t>RX Volume:</w:t>
-      </w:r>
-      <w:r>
-        <w:t xml:space="preserve"> 1-6</w:t>
-      </w:r>
-    </w:p>
-    <w:p>
-      <w:r>
-        <w:t>This is the receive volume setting. It affects how well DTMF tones are detected.</w:t>
-      </w:r>
-    </w:p>
-    <w:p>
-      <w:pPr>
-        <w:pStyle w:val="Heading3"/>
-      </w:pPr>
-      <w:r>
-        <w:t>RX Squelch:</w:t>
-      </w:r>
-      <w:r>
-        <w:t xml:space="preserve"> 0-8</w:t>
-      </w:r>
-    </w:p>
-    <w:p>
-      <w:r>
-        <w:t>This affects how much signal is required to receive the DTMF signals.</w:t>
-      </w:r>
-    </w:p>
-    <w:p>
-      <w:pPr>
-        <w:pStyle w:val="Heading2"/>
-      </w:pPr>
-      <w:r>
-        <w:t>Cancel Waits/TX Now</w:t>
-      </w:r>
-    </w:p>
-    <w:p>
-      <w:r>
-        <w:t>When the radio is in either send or pause mode this command will cancel the timer and the next mo</w:t>
-      </w:r>
-      <w:r>
-        <w:t>de will start. For example if you want to cancel</w:t>
-      </w:r>
-      <w:r>
-        <w:t xml:space="preserve"> the pause and go to transmit, use this option. It can also be done by long pressing B0.</w:t>
-      </w:r>
-    </w:p>
-    <w:p>
-      <w:pPr>
-        <w:pStyle w:val="Heading2"/>
-      </w:pPr>
-      <w:r>
-        <w:t>+Saved Settings Files</w:t>
-      </w:r>
-    </w:p>
-    <w:p>
-      <w:r>
-        <w:t>Saved settings files are named files stored on the SD card. They are useful to</w:t>
-      </w:r>
-      <w:r>
-        <w:t xml:space="preserve"> quickly configure the radio for different uses. All values except the battery calibration are affected.</w:t>
-      </w:r>
-    </w:p>
-    <w:p>
-      <w:pPr>
-        <w:pStyle w:val="Heading3"/>
-      </w:pPr>
-      <w:r>
-        <w:t>Create File</w:t>
-      </w:r>
-    </w:p>
-    <w:p>
-      <w:r>
-        <w:t>This prompts the user for a name. The file is then created using the current system settings.</w:t>
-      </w:r>
-    </w:p>
-    <w:p>
-      <w:pPr>
-        <w:pStyle w:val="Heading3"/>
-      </w:pPr>
-      <w:r>
-        <w:t>Save/Update File</w:t>
-      </w:r>
-    </w:p>
-    <w:p>
-      <w:r>
-        <w:t>This command saves the current settings into the selected file. If it already exists the user will be asked to confirm overwriting the file.</w:t>
-      </w:r>
-    </w:p>
-    <w:p>
-      <w:pPr>
-        <w:pStyle w:val="Heading3"/>
-      </w:pPr>
-      <w:r>
-        <w:lastRenderedPageBreak/>
-        <w:t>Load File</w:t>
-      </w:r>
-    </w:p>
-    <w:p>
-      <w:r>
-        <w:t>This command asks the user for the name and then sets all of the system settings except the battery calibration using the values in the file.</w:t>
-      </w:r>
-    </w:p>
-    <w:p>
-      <w:pPr>
-        <w:pStyle w:val="Heading3"/>
-      </w:pPr>
-      <w:r>
-        <w:t>Delete File</w:t>
-      </w:r>
-    </w:p>
-    <w:p>
-      <w:r>
-        <w:t>The user selects a file from the list and then it can be deleted.</w:t>
-      </w:r>
-    </w:p>
-    <w:p>
-      <w:pPr>
-        <w:pStyle w:val="Heading2"/>
-      </w:pPr>
-      <w:r>
-        <w:t>+System Settings</w:t>
-      </w:r>
-    </w:p>
-    <w:p>
-      <w:pPr>
-        <w:pStyle w:val="Heading3"/>
-      </w:pPr>
-      <w:r>
-        <w:t>+Display</w:t>
-      </w:r>
-      <w:r>
-        <w:t xml:space="preserve"> Settings</w:t>
-      </w:r>
-    </w:p>
-    <w:p>
-      <w:pPr>
-        <w:pStyle w:val="Heading4"/>
-      </w:pPr>
-      <w:r>
-        <w:t xml:space="preserve">Dimming Mode: </w:t>
-      </w:r>
-      <w:proofErr w:type="spellStart"/>
-      <w:r>
-        <w:t>None</w:t>
-      </w:r>
-      <w:r>
-        <w:t>|Timer</w:t>
-      </w:r>
-      <w:proofErr w:type="spellEnd"/>
-    </w:p>
-    <w:p>
-      <w:r>
-        <w:t xml:space="preserve">The display can be set to dim automatically after a specified number of seconds. This is used to save battery power since the backlight </w:t>
-      </w:r>
-      <w:r>
-        <w:t>uses a significant amount.</w:t>
-      </w:r>
-    </w:p>
-    <w:p>
-      <w:pPr>
-        <w:pStyle w:val="Heading4"/>
-      </w:pPr>
-      <w:r>
-        <w:t>Bright Value: 1-100</w:t>
-      </w:r>
-      <w:r>
-        <w:t>%</w:t>
-      </w:r>
-    </w:p>
-    <w:p>
-      <w:r>
-        <w:t>Set the display brightness value.</w:t>
-      </w:r>
-    </w:p>
-    <w:p>
-      <w:pPr>
-        <w:pStyle w:val="Heading4"/>
-      </w:pPr>
-      <w:r>
-        <w:t xml:space="preserve">Dim Value: </w:t>
-      </w:r>
-      <w:r>
-        <w:t>0-100%</w:t>
-      </w:r>
-    </w:p>
-    <w:p>
-      <w:r>
-        <w:t xml:space="preserve">Set the display brightness after the </w:t>
-      </w:r>
-      <w:r>
-        <w:t>timer below expires.</w:t>
-      </w:r>
-    </w:p>
-    <w:p>
-      <w:pPr>
-        <w:pStyle w:val="Heading4"/>
-      </w:pPr>
-      <w:r>
-        <w:t>Display Dim Time:</w:t>
-      </w:r>
-      <w:r>
-        <w:t xml:space="preserve"> 0-120 S</w:t>
-      </w:r>
-    </w:p>
-    <w:p>
-      <w:r>
-        <w:t>Specify the time until the display changes to dim mode.</w:t>
-      </w:r>
-    </w:p>
-    <w:p>
-      <w:pPr>
-        <w:pStyle w:val="Heading4"/>
-      </w:pPr>
-      <w:r>
-        <w:t>+Sideways Scroll Settings</w:t>
-      </w:r>
-    </w:p>
-    <w:p>
-      <w:r>
-        <w:t>Lines of text that too long for the display will scroll back and forth. The following settings control the speed.</w:t>
-      </w:r>
-    </w:p>
-    <w:p>
-      <w:pPr>
-        <w:pStyle w:val="Heading5"/>
-      </w:pPr>
-      <w:r>
-        <w:t xml:space="preserve">Speed: </w:t>
-      </w:r>
-      <w:r>
-        <w:t>1-1000 mS</w:t>
-      </w:r>
-    </w:p>
-    <w:p>
-      <w:r>
-        <w:t>Controls the speed of text moving to the left.</w:t>
-      </w:r>
-    </w:p>
-    <w:p>
-      <w:pPr>
-        <w:pStyle w:val="Heading5"/>
-      </w:pPr>
-      <w:r>
-        <w:t>Pause: 1-100</w:t>
-      </w:r>
-      <w:r>
-        <w:t xml:space="preserve"> mS</w:t>
-      </w:r>
-    </w:p>
-    <w:p>
-      <w:r>
-        <w:t>This controls the pause when the text is at the end (all the way to the left).</w:t>
-      </w:r>
-    </w:p>
-    <w:p>
-      <w:pPr>
-        <w:pStyle w:val="Heading5"/>
-      </w:pPr>
-      <w:r>
-        <w:t>Reverse Speed: 1-20x</w:t>
-      </w:r>
-    </w:p>
-    <w:p>
-      <w:r>
-        <w:t xml:space="preserve">This is how fast the text scrolls </w:t>
-      </w:r>
-      <w:r>
-        <w:t>back to the beginning (to the right). 2x means twice as fast as the text scroll</w:t>
-      </w:r>
-      <w:r>
-        <w:t>ed to the left</w:t>
-      </w:r>
-      <w:r>
-        <w:t>.</w:t>
-      </w:r>
-    </w:p>
-    <w:p>
-      <w:pPr>
-        <w:pStyle w:val="Heading4"/>
-      </w:pPr>
-      <w:r>
-        <w:t xml:space="preserve">Menu Selection: </w:t>
-      </w:r>
-      <w:r>
-        <w:t>Color|*</w:t>
-      </w:r>
-    </w:p>
-    <w:p>
-      <w:r>
-        <w:t>Menu selections</w:t>
-      </w:r>
-      <w:r>
-        <w:t xml:space="preserve"> and selections from a list can be either colored or marked with the ‘*’ character.</w:t>
-      </w:r>
-    </w:p>
-    <w:p>
-      <w:pPr>
-        <w:pStyle w:val="Heading4"/>
-      </w:pPr>
-      <w:r>
-        <w:lastRenderedPageBreak/>
-        <w:t>Text/</w:t>
-      </w:r>
-      <w:proofErr w:type="spellStart"/>
-      <w:r>
-        <w:t>HiLite</w:t>
-      </w:r>
-      <w:proofErr w:type="spellEnd"/>
-      <w:r>
-        <w:t xml:space="preserve"> Colors</w:t>
-      </w:r>
-    </w:p>
-    <w:p>
-      <w:r>
-        <w:t>This selection allows for choosing the colors of the text and the highlight. The background screen is always black.</w:t>
-      </w:r>
-    </w:p>
-    <w:p>
-      <w:pPr>
-        <w:pStyle w:val="Heading3"/>
-      </w:pPr>
-      <w:r>
-        <w:t>+Dial &amp; Button Settings</w:t>
-      </w:r>
-    </w:p>
-    <w:p>
-      <w:pPr>
-        <w:pStyle w:val="Heading4"/>
-      </w:pPr>
-      <w:r>
-        <w:t xml:space="preserve">Direction: </w:t>
-      </w:r>
-      <w:proofErr w:type="spellStart"/>
-      <w:r>
-        <w:t>Normal:Reverse</w:t>
-      </w:r>
-      <w:proofErr w:type="spellEnd"/>
-    </w:p>
-    <w:p>
-      <w:r>
-        <w:t>If you really want the button to be the other way around this is the choice for you.</w:t>
-      </w:r>
-    </w:p>
-    <w:p>
-      <w:pPr>
-        <w:pStyle w:val="Heading4"/>
-      </w:pPr>
-      <w:r>
-        <w:t>Long Press Timer: 2-200</w:t>
-      </w:r>
-    </w:p>
-    <w:p>
-      <w:r>
-        <w:t>This value affects how long or short a long press is. The default value is normally OK</w:t>
-      </w:r>
-      <w:r>
-        <w:t>, but somebody might want to change it.</w:t>
-      </w:r>
-    </w:p>
-    <w:p>
-      <w:pPr>
-        <w:pStyle w:val="Heading3"/>
-      </w:pPr>
-      <w:r>
-        <w:t>+Battery Settings</w:t>
-      </w:r>
-    </w:p>
-    <w:p>
-      <w:r>
-        <w:t>Since the PCB was designed with 10% resistors for measuring the battery voltage some calibration is needed. A future PCB will probably use better resistors so this won’t be needed.</w:t>
-      </w:r>
-    </w:p>
-    <w:p>
-      <w:pPr>
-        <w:pStyle w:val="Heading4"/>
-      </w:pPr>
-      <w:r>
-        <w:t xml:space="preserve">Show Battery: </w:t>
-      </w:r>
-      <w:proofErr w:type="spellStart"/>
-      <w:r>
-        <w:t>Yes|No</w:t>
-      </w:r>
-      <w:proofErr w:type="spellEnd"/>
-    </w:p>
-    <w:p>
-      <w:r>
-        <w:t xml:space="preserve">This option controls the </w:t>
-      </w:r>
-      <w:r>
-        <w:t>battery display on the bottom right of the display.</w:t>
-      </w:r>
-    </w:p>
-    <w:p>
-      <w:pPr>
-        <w:pStyle w:val="Heading4"/>
-      </w:pPr>
-      <w:r>
-        <w:t>Full Battery: 2000-4000</w:t>
-      </w:r>
-    </w:p>
-    <w:p>
-      <w:r>
-        <w:t>This is the value that indicates a full 4.2V battery.</w:t>
-      </w:r>
-    </w:p>
-    <w:p>
-      <w:pPr>
-        <w:pStyle w:val="Heading4"/>
-      </w:pPr>
-      <w:r>
-        <w:t>Set Full Battery</w:t>
-      </w:r>
-    </w:p>
-    <w:p>
-      <w:r>
-        <w:t>This selection reads the current battery values and stores it. It is best set by fully charging the battery and then disconnecting the charger. Wait a couple of minutes and then use it several times until it seems stable.</w:t>
-      </w:r>
-    </w:p>
-    <w:p>
-      <w:pPr>
-        <w:pStyle w:val="Heading4"/>
-      </w:pPr>
-      <w:r>
-        <w:t>Read Battery Raw Data</w:t>
-      </w:r>
-    </w:p>
-    <w:p>
-      <w:r>
-        <w:t>This continuously reads the battery value</w:t>
-      </w:r>
-      <w:r>
-        <w:t>. It was originally used for testing, but it seems like it might possibly be useful so it was left in the menu system.</w:t>
-      </w:r>
-    </w:p>
-    <w:p>
-      <w:pPr>
-        <w:pStyle w:val="Heading3"/>
-      </w:pPr>
-      <w:r>
-        <w:t>New Version BIN File</w:t>
-      </w:r>
-    </w:p>
-    <w:p>
-      <w:r>
-        <w:t xml:space="preserve">New firmware can be loaded by putting </w:t>
-      </w:r>
-      <w:r>
-        <w:t xml:space="preserve">the binary file on the SD card. It must be named </w:t>
-      </w:r>
-      <w:proofErr w:type="spellStart"/>
-      <w:r>
-        <w:t>RadioFox.BIN</w:t>
-      </w:r>
-      <w:proofErr w:type="spellEnd"/>
-      <w:r>
-        <w:t>.</w:t>
-      </w:r>
-      <w:r>
-        <w:t xml:space="preserve"> There are two prompts, one to confirm overwriting the firmware, and another to allow deletion of the </w:t>
-      </w:r>
-      <w:r>
-        <w:t>BIN file after installation.</w:t>
-      </w:r>
-    </w:p>
-    <w:p>
-      <w:pPr>
-        <w:pStyle w:val="Heading3"/>
-      </w:pPr>
-      <w:r>
-        <w:t>Factory Settings</w:t>
-      </w:r>
-    </w:p>
-    <w:p>
-      <w:r>
-        <w:t xml:space="preserve">This command resets </w:t>
-      </w:r>
-      <w:r>
-        <w:t xml:space="preserve">all </w:t>
-      </w:r>
-      <w:r>
-        <w:t>settings</w:t>
-      </w:r>
-      <w:r>
-        <w:t xml:space="preserve"> except the high battery value to the original factory values.</w:t>
-      </w:r>
-      <w:r>
-        <w:t xml:space="preserve"> The factory reset can also be done by holding the dial button down while turning the power on.</w:t>
-      </w:r>
-    </w:p>
-    <w:p>
-      <w:pPr>
-        <w:pStyle w:val="Heading3"/>
-      </w:pPr>
-      <w:r>
-        <w:lastRenderedPageBreak/>
-        <w:t>Format EEPROM</w:t>
-      </w:r>
-    </w:p>
-    <w:p>
-      <w:r>
-        <w:t xml:space="preserve">This will clear </w:t>
-      </w:r>
-      <w:r>
-        <w:t xml:space="preserve">and reset </w:t>
-      </w:r>
-      <w:r>
-        <w:t xml:space="preserve">the </w:t>
-      </w:r>
-      <w:proofErr w:type="spellStart"/>
-      <w:r>
-        <w:t>eeprom</w:t>
-      </w:r>
-      <w:proofErr w:type="spellEnd"/>
-      <w:r>
-        <w:t xml:space="preserve"> where the settings are save</w:t>
-      </w:r>
-      <w:r>
-        <w:t xml:space="preserve"> in non-volatile memory. This is how settings are saved while the system is not powered.</w:t>
-      </w:r>
-    </w:p>
-    <w:p>
-      <w:pPr>
-        <w:pStyle w:val="Heading2"/>
-      </w:pPr>
-      <w:r>
         <w:t>Save Current Settings</w:t>
       </w:r>
     </w:p>
     <w:p>
       <w:r>
-        <w:t>This stores all of the current settings in the non-volatile memory</w:t>
+        <w:t xml:space="preserve">This stores </w:t>
+      </w:r>
+      <w:proofErr w:type="gramStart"/>
+      <w:r>
+        <w:t>all of</w:t>
+      </w:r>
+      <w:proofErr w:type="gramEnd"/>
+      <w:r>
+        <w:t xml:space="preserve"> the current settings in the non-volatile memory</w:t>
       </w:r>
       <w:r>
         <w:t>. Note that this is not often used since settings are normally saved each time they are changed.</w:t>
@@ -3418,7 +4092,7 @@
 </file>
 
 <file path=word/endnotes.xml><?xml version="1.0" encoding="utf-8"?>
-<w:endnotes xmlns:wpc="http://schemas.microsoft.com/office/word/2010/wordprocessingCanvas" xmlns:cx="http://schemas.microsoft.com/office/drawing/2014/chartex" xmlns:cx1="http://schemas.microsoft.com/office/drawing/2015/9/8/chartex" xmlns:cx2="http://schemas.microsoft.com/office/drawing/2015/10/21/chartex" xmlns:cx3="http://schemas.microsoft.com/office/drawing/2016/5/9/chartex" xmlns:cx4="http://schemas.microsoft.com/office/drawing/2016/5/10/chartex" xmlns:cx5="http://schemas.microsoft.com/office/drawing/2016/5/11/chartex" xmlns:cx6="http://schemas.microsoft.com/office/drawing/2016/5/12/chartex" xmlns:cx7="http://schemas.microsoft.com/office/drawing/2016/5/13/chartex" xmlns:cx8="http://schemas.microsoft.com/office/drawing/2016/5/14/chartex" xmlns:mc="http://schemas.openxmlformats.org/markup-compatibility/2006" xmlns:aink="http://schemas.microsoft.com/office/drawing/2016/ink" xmlns:am3d="http://schemas.microsoft.com/office/drawing/2017/model3d" xmlns:o="urn:schemas-microsoft-com:office:office" xmlns:oel="http://schemas.microsoft.com/office/2019/extlst" xmlns:r="http://schemas.openxmlformats.org/officeDocument/2006/relationships" xmlns:m="http://schemas.openxmlformats.org/officeDocument/2006/math" xmlns:v="urn:schemas-microsoft-com:vml" xmlns:wp14="http://schemas.microsoft.com/office/word/2010/wordprocessingDrawing" xmlns:wp="http://schemas.openxmlformats.org/drawingml/2006/wordprocessingDrawing" xmlns:w10="urn:schemas-microsoft-com:office:word" xmlns:w="http://schemas.openxmlformats.org/wordprocessingml/2006/main" xmlns:w14="http://schemas.microsoft.com/office/word/2010/wordml" xmlns:w15="http://schemas.microsoft.com/office/word/2012/wordml" xmlns:w16cex="http://schemas.microsoft.com/office/word/2018/wordml/cex" xmlns:w16cid="http://schemas.microsoft.com/office/word/2016/wordml/cid" xmlns:w16="http://schemas.microsoft.com/office/word/2018/wordml" xmlns:w16du="http://schemas.microsoft.com/office/word/2023/wordml/word16du" xmlns:w16sdtdh="http://schemas.microsoft.com/office/word/2020/wordml/sdtdatahash" xmlns:w16se="http://schemas.microsoft.com/office/word/2015/wordml/symex" xmlns:wpg="http://schemas.microsoft.com/office/word/2010/wordprocessingGroup" xmlns:wpi="http://schemas.microsoft.com/office/word/2010/wordprocessingInk" xmlns:wne="http://schemas.microsoft.com/office/word/2006/wordml" xmlns:wps="http://schemas.microsoft.com/office/word/2010/wordprocessingShape" mc:Ignorable="w14 w15 w16se w16cid w16 w16cex w16sdtdh w16du wp14">
+<w:endnotes xmlns:wpc="http://schemas.microsoft.com/office/word/2010/wordprocessingCanvas" xmlns:cx="http://schemas.microsoft.com/office/drawing/2014/chartex" xmlns:cx1="http://schemas.microsoft.com/office/drawing/2015/9/8/chartex" xmlns:cx2="http://schemas.microsoft.com/office/drawing/2015/10/21/chartex" xmlns:cx3="http://schemas.microsoft.com/office/drawing/2016/5/9/chartex" xmlns:cx4="http://schemas.microsoft.com/office/drawing/2016/5/10/chartex" xmlns:cx5="http://schemas.microsoft.com/office/drawing/2016/5/11/chartex" xmlns:cx6="http://schemas.microsoft.com/office/drawing/2016/5/12/chartex" xmlns:cx7="http://schemas.microsoft.com/office/drawing/2016/5/13/chartex" xmlns:cx8="http://schemas.microsoft.com/office/drawing/2016/5/14/chartex" xmlns:mc="http://schemas.openxmlformats.org/markup-compatibility/2006" xmlns:aink="http://schemas.microsoft.com/office/drawing/2016/ink" xmlns:am3d="http://schemas.microsoft.com/office/drawing/2017/model3d" xmlns:o="urn:schemas-microsoft-com:office:office" xmlns:oel="http://schemas.microsoft.com/office/2019/extlst" xmlns:r="http://schemas.openxmlformats.org/officeDocument/2006/relationships" xmlns:m="http://schemas.openxmlformats.org/officeDocument/2006/math" xmlns:v="urn:schemas-microsoft-com:vml" xmlns:wp14="http://schemas.microsoft.com/office/word/2010/wordprocessingDrawing" xmlns:wp="http://schemas.openxmlformats.org/drawingml/2006/wordprocessingDrawing" xmlns:w10="urn:schemas-microsoft-com:office:word" xmlns:w="http://schemas.openxmlformats.org/wordprocessingml/2006/main" xmlns:w14="http://schemas.microsoft.com/office/word/2010/wordml" xmlns:w15="http://schemas.microsoft.com/office/word/2012/wordml" xmlns:w16cex="http://schemas.microsoft.com/office/word/2018/wordml/cex" xmlns:w16cid="http://schemas.microsoft.com/office/word/2016/wordml/cid" xmlns:w16="http://schemas.microsoft.com/office/word/2018/wordml" xmlns:w16du="http://schemas.microsoft.com/office/word/2023/wordml/word16du" xmlns:w16sdtdh="http://schemas.microsoft.com/office/word/2020/wordml/sdtdatahash" xmlns:w16sdtfl="http://schemas.microsoft.com/office/word/2024/wordml/sdtformatlock" xmlns:w16se="http://schemas.microsoft.com/office/word/2015/wordml/symex" xmlns:wpg="http://schemas.microsoft.com/office/word/2010/wordprocessingGroup" xmlns:wpi="http://schemas.microsoft.com/office/word/2010/wordprocessingInk" xmlns:wne="http://schemas.microsoft.com/office/word/2006/wordml" xmlns:wps="http://schemas.microsoft.com/office/word/2010/wordprocessingShape" mc:Ignorable="w14 w15 w16se w16cid w16 w16cex w16sdtdh w16sdtfl w16du wp14">
   <w:endnote w:type="separator" w:id="-1">
     <w:p>
       <w:pPr>
@@ -3443,7 +4117,7 @@
 </file>
 
 <file path=word/footer1.xml><?xml version="1.0" encoding="utf-8"?>
-<w:ftr xmlns:wpc="http://schemas.microsoft.com/office/word/2010/wordprocessingCanvas" xmlns:cx="http://schemas.microsoft.com/office/drawing/2014/chartex" xmlns:cx1="http://schemas.microsoft.com/office/drawing/2015/9/8/chartex" xmlns:cx2="http://schemas.microsoft.com/office/drawing/2015/10/21/chartex" xmlns:cx3="http://schemas.microsoft.com/office/drawing/2016/5/9/chartex" xmlns:cx4="http://schemas.microsoft.com/office/drawing/2016/5/10/chartex" xmlns:cx5="http://schemas.microsoft.com/office/drawing/2016/5/11/chartex" xmlns:cx6="http://schemas.microsoft.com/office/drawing/2016/5/12/chartex" xmlns:cx7="http://schemas.microsoft.com/office/drawing/2016/5/13/chartex" xmlns:cx8="http://schemas.microsoft.com/office/drawing/2016/5/14/chartex" xmlns:mc="http://schemas.openxmlformats.org/markup-compatibility/2006" xmlns:aink="http://schemas.microsoft.com/office/drawing/2016/ink" xmlns:am3d="http://schemas.microsoft.com/office/drawing/2017/model3d" xmlns:o="urn:schemas-microsoft-com:office:office" xmlns:oel="http://schemas.microsoft.com/office/2019/extlst" xmlns:r="http://schemas.openxmlformats.org/officeDocument/2006/relationships" xmlns:m="http://schemas.openxmlformats.org/officeDocument/2006/math" xmlns:v="urn:schemas-microsoft-com:vml" xmlns:wp14="http://schemas.microsoft.com/office/word/2010/wordprocessingDrawing" xmlns:wp="http://schemas.openxmlformats.org/drawingml/2006/wordprocessingDrawing" xmlns:w10="urn:schemas-microsoft-com:office:word" xmlns:w="http://schemas.openxmlformats.org/wordprocessingml/2006/main" xmlns:w14="http://schemas.microsoft.com/office/word/2010/wordml" xmlns:w15="http://schemas.microsoft.com/office/word/2012/wordml" xmlns:w16cex="http://schemas.microsoft.com/office/word/2018/wordml/cex" xmlns:w16cid="http://schemas.microsoft.com/office/word/2016/wordml/cid" xmlns:w16="http://schemas.microsoft.com/office/word/2018/wordml" xmlns:w16du="http://schemas.microsoft.com/office/word/2023/wordml/word16du" xmlns:w16sdtdh="http://schemas.microsoft.com/office/word/2020/wordml/sdtdatahash" xmlns:w16se="http://schemas.microsoft.com/office/word/2015/wordml/symex" xmlns:wpg="http://schemas.microsoft.com/office/word/2010/wordprocessingGroup" xmlns:wpi="http://schemas.microsoft.com/office/word/2010/wordprocessingInk" xmlns:wne="http://schemas.microsoft.com/office/word/2006/wordml" xmlns:wps="http://schemas.microsoft.com/office/word/2010/wordprocessingShape" mc:Ignorable="w14 w15 w16se w16cid w16 w16cex w16sdtdh w16du wp14">
+<w:ftr xmlns:wpc="http://schemas.microsoft.com/office/word/2010/wordprocessingCanvas" xmlns:cx="http://schemas.microsoft.com/office/drawing/2014/chartex" xmlns:cx1="http://schemas.microsoft.com/office/drawing/2015/9/8/chartex" xmlns:cx2="http://schemas.microsoft.com/office/drawing/2015/10/21/chartex" xmlns:cx3="http://schemas.microsoft.com/office/drawing/2016/5/9/chartex" xmlns:cx4="http://schemas.microsoft.com/office/drawing/2016/5/10/chartex" xmlns:cx5="http://schemas.microsoft.com/office/drawing/2016/5/11/chartex" xmlns:cx6="http://schemas.microsoft.com/office/drawing/2016/5/12/chartex" xmlns:cx7="http://schemas.microsoft.com/office/drawing/2016/5/13/chartex" xmlns:cx8="http://schemas.microsoft.com/office/drawing/2016/5/14/chartex" xmlns:mc="http://schemas.openxmlformats.org/markup-compatibility/2006" xmlns:aink="http://schemas.microsoft.com/office/drawing/2016/ink" xmlns:am3d="http://schemas.microsoft.com/office/drawing/2017/model3d" xmlns:o="urn:schemas-microsoft-com:office:office" xmlns:oel="http://schemas.microsoft.com/office/2019/extlst" xmlns:r="http://schemas.openxmlformats.org/officeDocument/2006/relationships" xmlns:m="http://schemas.openxmlformats.org/officeDocument/2006/math" xmlns:v="urn:schemas-microsoft-com:vml" xmlns:wp14="http://schemas.microsoft.com/office/word/2010/wordprocessingDrawing" xmlns:wp="http://schemas.openxmlformats.org/drawingml/2006/wordprocessingDrawing" xmlns:w10="urn:schemas-microsoft-com:office:word" xmlns:w="http://schemas.openxmlformats.org/wordprocessingml/2006/main" xmlns:w14="http://schemas.microsoft.com/office/word/2010/wordml" xmlns:w15="http://schemas.microsoft.com/office/word/2012/wordml" xmlns:w16cex="http://schemas.microsoft.com/office/word/2018/wordml/cex" xmlns:w16cid="http://schemas.microsoft.com/office/word/2016/wordml/cid" xmlns:w16="http://schemas.microsoft.com/office/word/2018/wordml" xmlns:w16du="http://schemas.microsoft.com/office/word/2023/wordml/word16du" xmlns:w16sdtdh="http://schemas.microsoft.com/office/word/2020/wordml/sdtdatahash" xmlns:w16sdtfl="http://schemas.microsoft.com/office/word/2024/wordml/sdtformatlock" xmlns:w16se="http://schemas.microsoft.com/office/word/2015/wordml/symex" xmlns:wpg="http://schemas.microsoft.com/office/word/2010/wordprocessingGroup" xmlns:wpi="http://schemas.microsoft.com/office/word/2010/wordprocessingInk" xmlns:wne="http://schemas.microsoft.com/office/word/2006/wordml" xmlns:wps="http://schemas.microsoft.com/office/word/2010/wordprocessingShape" mc:Ignorable="w14 w15 w16se w16cid w16 w16cex w16sdtdh w16sdtfl w16du wp14">
   <w:sdt>
     <w:sdtPr>
       <w:id w:val="-1635484502"/>
@@ -3574,7 +4248,7 @@
 </file>
 
 <file path=word/footnotes.xml><?xml version="1.0" encoding="utf-8"?>
-<w:footnotes xmlns:wpc="http://schemas.microsoft.com/office/word/2010/wordprocessingCanvas" xmlns:cx="http://schemas.microsoft.com/office/drawing/2014/chartex" xmlns:cx1="http://schemas.microsoft.com/office/drawing/2015/9/8/chartex" xmlns:cx2="http://schemas.microsoft.com/office/drawing/2015/10/21/chartex" xmlns:cx3="http://schemas.microsoft.com/office/drawing/2016/5/9/chartex" xmlns:cx4="http://schemas.microsoft.com/office/drawing/2016/5/10/chartex" xmlns:cx5="http://schemas.microsoft.com/office/drawing/2016/5/11/chartex" xmlns:cx6="http://schemas.microsoft.com/office/drawing/2016/5/12/chartex" xmlns:cx7="http://schemas.microsoft.com/office/drawing/2016/5/13/chartex" xmlns:cx8="http://schemas.microsoft.com/office/drawing/2016/5/14/chartex" xmlns:mc="http://schemas.openxmlformats.org/markup-compatibility/2006" xmlns:aink="http://schemas.microsoft.com/office/drawing/2016/ink" xmlns:am3d="http://schemas.microsoft.com/office/drawing/2017/model3d" xmlns:o="urn:schemas-microsoft-com:office:office" xmlns:oel="http://schemas.microsoft.com/office/2019/extlst" xmlns:r="http://schemas.openxmlformats.org/officeDocument/2006/relationships" xmlns:m="http://schemas.openxmlformats.org/officeDocument/2006/math" xmlns:v="urn:schemas-microsoft-com:vml" xmlns:wp14="http://schemas.microsoft.com/office/word/2010/wordprocessingDrawing" xmlns:wp="http://schemas.openxmlformats.org/drawingml/2006/wordprocessingDrawing" xmlns:w10="urn:schemas-microsoft-com:office:word" xmlns:w="http://schemas.openxmlformats.org/wordprocessingml/2006/main" xmlns:w14="http://schemas.microsoft.com/office/word/2010/wordml" xmlns:w15="http://schemas.microsoft.com/office/word/2012/wordml" xmlns:w16cex="http://schemas.microsoft.com/office/word/2018/wordml/cex" xmlns:w16cid="http://schemas.microsoft.com/office/word/2016/wordml/cid" xmlns:w16="http://schemas.microsoft.com/office/word/2018/wordml" xmlns:w16du="http://schemas.microsoft.com/office/word/2023/wordml/word16du" xmlns:w16sdtdh="http://schemas.microsoft.com/office/word/2020/wordml/sdtdatahash" xmlns:w16se="http://schemas.microsoft.com/office/word/2015/wordml/symex" xmlns:wpg="http://schemas.microsoft.com/office/word/2010/wordprocessingGroup" xmlns:wpi="http://schemas.microsoft.com/office/word/2010/wordprocessingInk" xmlns:wne="http://schemas.microsoft.com/office/word/2006/wordml" xmlns:wps="http://schemas.microsoft.com/office/word/2010/wordprocessingShape" mc:Ignorable="w14 w15 w16se w16cid w16 w16cex w16sdtdh w16du wp14">
+<w:footnotes xmlns:wpc="http://schemas.microsoft.com/office/word/2010/wordprocessingCanvas" xmlns:cx="http://schemas.microsoft.com/office/drawing/2014/chartex" xmlns:cx1="http://schemas.microsoft.com/office/drawing/2015/9/8/chartex" xmlns:cx2="http://schemas.microsoft.com/office/drawing/2015/10/21/chartex" xmlns:cx3="http://schemas.microsoft.com/office/drawing/2016/5/9/chartex" xmlns:cx4="http://schemas.microsoft.com/office/drawing/2016/5/10/chartex" xmlns:cx5="http://schemas.microsoft.com/office/drawing/2016/5/11/chartex" xmlns:cx6="http://schemas.microsoft.com/office/drawing/2016/5/12/chartex" xmlns:cx7="http://schemas.microsoft.com/office/drawing/2016/5/13/chartex" xmlns:cx8="http://schemas.microsoft.com/office/drawing/2016/5/14/chartex" xmlns:mc="http://schemas.openxmlformats.org/markup-compatibility/2006" xmlns:aink="http://schemas.microsoft.com/office/drawing/2016/ink" xmlns:am3d="http://schemas.microsoft.com/office/drawing/2017/model3d" xmlns:o="urn:schemas-microsoft-com:office:office" xmlns:oel="http://schemas.microsoft.com/office/2019/extlst" xmlns:r="http://schemas.openxmlformats.org/officeDocument/2006/relationships" xmlns:m="http://schemas.openxmlformats.org/officeDocument/2006/math" xmlns:v="urn:schemas-microsoft-com:vml" xmlns:wp14="http://schemas.microsoft.com/office/word/2010/wordprocessingDrawing" xmlns:wp="http://schemas.openxmlformats.org/drawingml/2006/wordprocessingDrawing" xmlns:w10="urn:schemas-microsoft-com:office:word" xmlns:w="http://schemas.openxmlformats.org/wordprocessingml/2006/main" xmlns:w14="http://schemas.microsoft.com/office/word/2010/wordml" xmlns:w15="http://schemas.microsoft.com/office/word/2012/wordml" xmlns:w16cex="http://schemas.microsoft.com/office/word/2018/wordml/cex" xmlns:w16cid="http://schemas.microsoft.com/office/word/2016/wordml/cid" xmlns:w16="http://schemas.microsoft.com/office/word/2018/wordml" xmlns:w16du="http://schemas.microsoft.com/office/word/2023/wordml/word16du" xmlns:w16sdtdh="http://schemas.microsoft.com/office/word/2020/wordml/sdtdatahash" xmlns:w16sdtfl="http://schemas.microsoft.com/office/word/2024/wordml/sdtformatlock" xmlns:w16se="http://schemas.microsoft.com/office/word/2015/wordml/symex" xmlns:wpg="http://schemas.microsoft.com/office/word/2010/wordprocessingGroup" xmlns:wpi="http://schemas.microsoft.com/office/word/2010/wordprocessingInk" xmlns:wne="http://schemas.microsoft.com/office/word/2006/wordml" xmlns:wps="http://schemas.microsoft.com/office/word/2010/wordprocessingShape" mc:Ignorable="w14 w15 w16se w16cid w16 w16cex w16sdtdh w16sdtfl w16du wp14">
   <w:footnote w:type="separator" w:id="-1">
     <w:p>
       <w:pPr>
@@ -3599,7 +4273,7 @@
 </file>
 
 <file path=word/numbering.xml><?xml version="1.0" encoding="utf-8"?>
-<w:numbering xmlns:wpc="http://schemas.microsoft.com/office/word/2010/wordprocessingCanvas" xmlns:cx="http://schemas.microsoft.com/office/drawing/2014/chartex" xmlns:cx1="http://schemas.microsoft.com/office/drawing/2015/9/8/chartex" xmlns:cx2="http://schemas.microsoft.com/office/drawing/2015/10/21/chartex" xmlns:cx3="http://schemas.microsoft.com/office/drawing/2016/5/9/chartex" xmlns:cx4="http://schemas.microsoft.com/office/drawing/2016/5/10/chartex" xmlns:cx5="http://schemas.microsoft.com/office/drawing/2016/5/11/chartex" xmlns:cx6="http://schemas.microsoft.com/office/drawing/2016/5/12/chartex" xmlns:cx7="http://schemas.microsoft.com/office/drawing/2016/5/13/chartex" xmlns:cx8="http://schemas.microsoft.com/office/drawing/2016/5/14/chartex" xmlns:mc="http://schemas.openxmlformats.org/markup-compatibility/2006" xmlns:aink="http://schemas.microsoft.com/office/drawing/2016/ink" xmlns:am3d="http://schemas.microsoft.com/office/drawing/2017/model3d" xmlns:o="urn:schemas-microsoft-com:office:office" xmlns:oel="http://schemas.microsoft.com/office/2019/extlst" xmlns:r="http://schemas.openxmlformats.org/officeDocument/2006/relationships" xmlns:m="http://schemas.openxmlformats.org/officeDocument/2006/math" xmlns:v="urn:schemas-microsoft-com:vml" xmlns:wp14="http://schemas.microsoft.com/office/word/2010/wordprocessingDrawing" xmlns:wp="http://schemas.openxmlformats.org/drawingml/2006/wordprocessingDrawing" xmlns:w10="urn:schemas-microsoft-com:office:word" xmlns:w="http://schemas.openxmlformats.org/wordprocessingml/2006/main" xmlns:w14="http://schemas.microsoft.com/office/word/2010/wordml" xmlns:w15="http://schemas.microsoft.com/office/word/2012/wordml" xmlns:w16cex="http://schemas.microsoft.com/office/word/2018/wordml/cex" xmlns:w16cid="http://schemas.microsoft.com/office/word/2016/wordml/cid" xmlns:w16="http://schemas.microsoft.com/office/word/2018/wordml" xmlns:w16du="http://schemas.microsoft.com/office/word/2023/wordml/word16du" xmlns:w16sdtdh="http://schemas.microsoft.com/office/word/2020/wordml/sdtdatahash" xmlns:w16se="http://schemas.microsoft.com/office/word/2015/wordml/symex" xmlns:wpg="http://schemas.microsoft.com/office/word/2010/wordprocessingGroup" xmlns:wpi="http://schemas.microsoft.com/office/word/2010/wordprocessingInk" xmlns:wne="http://schemas.microsoft.com/office/word/2006/wordml" xmlns:wps="http://schemas.microsoft.com/office/word/2010/wordprocessingShape" mc:Ignorable="w14 w15 w16se w16cid w16 w16cex w16sdtdh w16du wp14">
+<w:numbering xmlns:wpc="http://schemas.microsoft.com/office/word/2010/wordprocessingCanvas" xmlns:cx="http://schemas.microsoft.com/office/drawing/2014/chartex" xmlns:cx1="http://schemas.microsoft.com/office/drawing/2015/9/8/chartex" xmlns:cx2="http://schemas.microsoft.com/office/drawing/2015/10/21/chartex" xmlns:cx3="http://schemas.microsoft.com/office/drawing/2016/5/9/chartex" xmlns:cx4="http://schemas.microsoft.com/office/drawing/2016/5/10/chartex" xmlns:cx5="http://schemas.microsoft.com/office/drawing/2016/5/11/chartex" xmlns:cx6="http://schemas.microsoft.com/office/drawing/2016/5/12/chartex" xmlns:cx7="http://schemas.microsoft.com/office/drawing/2016/5/13/chartex" xmlns:cx8="http://schemas.microsoft.com/office/drawing/2016/5/14/chartex" xmlns:mc="http://schemas.openxmlformats.org/markup-compatibility/2006" xmlns:aink="http://schemas.microsoft.com/office/drawing/2016/ink" xmlns:am3d="http://schemas.microsoft.com/office/drawing/2017/model3d" xmlns:o="urn:schemas-microsoft-com:office:office" xmlns:oel="http://schemas.microsoft.com/office/2019/extlst" xmlns:r="http://schemas.openxmlformats.org/officeDocument/2006/relationships" xmlns:m="http://schemas.openxmlformats.org/officeDocument/2006/math" xmlns:v="urn:schemas-microsoft-com:vml" xmlns:wp14="http://schemas.microsoft.com/office/word/2010/wordprocessingDrawing" xmlns:wp="http://schemas.openxmlformats.org/drawingml/2006/wordprocessingDrawing" xmlns:w10="urn:schemas-microsoft-com:office:word" xmlns:w="http://schemas.openxmlformats.org/wordprocessingml/2006/main" xmlns:w14="http://schemas.microsoft.com/office/word/2010/wordml" xmlns:w15="http://schemas.microsoft.com/office/word/2012/wordml" xmlns:w16cex="http://schemas.microsoft.com/office/word/2018/wordml/cex" xmlns:w16cid="http://schemas.microsoft.com/office/word/2016/wordml/cid" xmlns:w16="http://schemas.microsoft.com/office/word/2018/wordml" xmlns:w16du="http://schemas.microsoft.com/office/word/2023/wordml/word16du" xmlns:w16sdtdh="http://schemas.microsoft.com/office/word/2020/wordml/sdtdatahash" xmlns:w16sdtfl="http://schemas.microsoft.com/office/word/2024/wordml/sdtformatlock" xmlns:w16se="http://schemas.microsoft.com/office/word/2015/wordml/symex" xmlns:wpg="http://schemas.microsoft.com/office/word/2010/wordprocessingGroup" xmlns:wpi="http://schemas.microsoft.com/office/word/2010/wordprocessingInk" xmlns:wne="http://schemas.microsoft.com/office/word/2006/wordml" xmlns:wps="http://schemas.microsoft.com/office/word/2010/wordprocessingShape" mc:Ignorable="w14 w15 w16se w16cid w16 w16cex w16sdtdh w16sdtfl w16du wp14">
   <w:abstractNum w:abstractNumId="0" w15:restartNumberingAfterBreak="0">
     <w:nsid w:val="006D7728"/>
     <w:multiLevelType w:val="hybridMultilevel"/>
@@ -7076,6 +7750,118 @@
     </w:lvl>
   </w:abstractNum>
   <w:abstractNum w:abstractNumId="31" w15:restartNumberingAfterBreak="0">
+    <w:nsid w:val="1FFA7451"/>
+    <w:multiLevelType w:val="hybridMultilevel"/>
+    <w:tmpl w:val="D65C3E54"/>
+    <w:lvl w:ilvl="0" w:tplc="F0F6CE1E">
+      <w:numFmt w:val="bullet"/>
+      <w:lvlText w:val="-"/>
+      <w:lvlJc w:val="left"/>
+      <w:pPr>
+        <w:ind w:left="720" w:hanging="360"/>
+      </w:pPr>
+      <w:rPr>
+        <w:rFonts w:ascii="Arial" w:eastAsia="Arial" w:hAnsi="Arial" w:cs="Arial" w:hint="default"/>
+      </w:rPr>
+    </w:lvl>
+    <w:lvl w:ilvl="1" w:tplc="04090003" w:tentative="1">
+      <w:start w:val="1"/>
+      <w:numFmt w:val="bullet"/>
+      <w:lvlText w:val="o"/>
+      <w:lvlJc w:val="left"/>
+      <w:pPr>
+        <w:ind w:left="1440" w:hanging="360"/>
+      </w:pPr>
+      <w:rPr>
+        <w:rFonts w:ascii="Courier New" w:hAnsi="Courier New" w:cs="Courier New" w:hint="default"/>
+      </w:rPr>
+    </w:lvl>
+    <w:lvl w:ilvl="2" w:tplc="04090005" w:tentative="1">
+      <w:start w:val="1"/>
+      <w:numFmt w:val="bullet"/>
+      <w:lvlText w:val=""/>
+      <w:lvlJc w:val="left"/>
+      <w:pPr>
+        <w:ind w:left="2160" w:hanging="360"/>
+      </w:pPr>
+      <w:rPr>
+        <w:rFonts w:ascii="Wingdings" w:hAnsi="Wingdings" w:hint="default"/>
+      </w:rPr>
+    </w:lvl>
+    <w:lvl w:ilvl="3" w:tplc="04090001" w:tentative="1">
+      <w:start w:val="1"/>
+      <w:numFmt w:val="bullet"/>
+      <w:lvlText w:val=""/>
+      <w:lvlJc w:val="left"/>
+      <w:pPr>
+        <w:ind w:left="2880" w:hanging="360"/>
+      </w:pPr>
+      <w:rPr>
+        <w:rFonts w:ascii="Symbol" w:hAnsi="Symbol" w:hint="default"/>
+      </w:rPr>
+    </w:lvl>
+    <w:lvl w:ilvl="4" w:tplc="04090003" w:tentative="1">
+      <w:start w:val="1"/>
+      <w:numFmt w:val="bullet"/>
+      <w:lvlText w:val="o"/>
+      <w:lvlJc w:val="left"/>
+      <w:pPr>
+        <w:ind w:left="3600" w:hanging="360"/>
+      </w:pPr>
+      <w:rPr>
+        <w:rFonts w:ascii="Courier New" w:hAnsi="Courier New" w:cs="Courier New" w:hint="default"/>
+      </w:rPr>
+    </w:lvl>
+    <w:lvl w:ilvl="5" w:tplc="04090005" w:tentative="1">
+      <w:start w:val="1"/>
+      <w:numFmt w:val="bullet"/>
+      <w:lvlText w:val=""/>
+      <w:lvlJc w:val="left"/>
+      <w:pPr>
+        <w:ind w:left="4320" w:hanging="360"/>
+      </w:pPr>
+      <w:rPr>
+        <w:rFonts w:ascii="Wingdings" w:hAnsi="Wingdings" w:hint="default"/>
+      </w:rPr>
+    </w:lvl>
+    <w:lvl w:ilvl="6" w:tplc="04090001" w:tentative="1">
+      <w:start w:val="1"/>
+      <w:numFmt w:val="bullet"/>
+      <w:lvlText w:val=""/>
+      <w:lvlJc w:val="left"/>
+      <w:pPr>
+        <w:ind w:left="5040" w:hanging="360"/>
+      </w:pPr>
+      <w:rPr>
+        <w:rFonts w:ascii="Symbol" w:hAnsi="Symbol" w:hint="default"/>
+      </w:rPr>
+    </w:lvl>
+    <w:lvl w:ilvl="7" w:tplc="04090003" w:tentative="1">
+      <w:start w:val="1"/>
+      <w:numFmt w:val="bullet"/>
+      <w:lvlText w:val="o"/>
+      <w:lvlJc w:val="left"/>
+      <w:pPr>
+        <w:ind w:left="5760" w:hanging="360"/>
+      </w:pPr>
+      <w:rPr>
+        <w:rFonts w:ascii="Courier New" w:hAnsi="Courier New" w:cs="Courier New" w:hint="default"/>
+      </w:rPr>
+    </w:lvl>
+    <w:lvl w:ilvl="8" w:tplc="04090005" w:tentative="1">
+      <w:start w:val="1"/>
+      <w:numFmt w:val="bullet"/>
+      <w:lvlText w:val=""/>
+      <w:lvlJc w:val="left"/>
+      <w:pPr>
+        <w:ind w:left="6480" w:hanging="360"/>
+      </w:pPr>
+      <w:rPr>
+        <w:rFonts w:ascii="Wingdings" w:hAnsi="Wingdings" w:hint="default"/>
+      </w:rPr>
+    </w:lvl>
+  </w:abstractNum>
+  <w:abstractNum w:abstractNumId="32" w15:restartNumberingAfterBreak="0">
     <w:nsid w:val="22DC79D5"/>
     <w:multiLevelType w:val="hybridMultilevel"/>
     <w:tmpl w:val="17CA0744"/>
@@ -7187,7 +7973,7 @@
       </w:rPr>
     </w:lvl>
   </w:abstractNum>
-  <w:abstractNum w:abstractNumId="32" w15:restartNumberingAfterBreak="0">
+  <w:abstractNum w:abstractNumId="33" w15:restartNumberingAfterBreak="0">
     <w:nsid w:val="25FC5DAE"/>
     <w:multiLevelType w:val="hybridMultilevel"/>
     <w:tmpl w:val="6DACDCC6"/>
@@ -7299,7 +8085,7 @@
       </w:rPr>
     </w:lvl>
   </w:abstractNum>
-  <w:abstractNum w:abstractNumId="33" w15:restartNumberingAfterBreak="0">
+  <w:abstractNum w:abstractNumId="34" w15:restartNumberingAfterBreak="0">
     <w:nsid w:val="28631233"/>
     <w:multiLevelType w:val="hybridMultilevel"/>
     <w:tmpl w:val="49F46462"/>
@@ -7411,7 +8197,119 @@
       </w:rPr>
     </w:lvl>
   </w:abstractNum>
-  <w:abstractNum w:abstractNumId="34" w15:restartNumberingAfterBreak="0">
+  <w:abstractNum w:abstractNumId="35" w15:restartNumberingAfterBreak="0">
+    <w:nsid w:val="28A4447E"/>
+    <w:multiLevelType w:val="hybridMultilevel"/>
+    <w:tmpl w:val="6A361D52"/>
+    <w:lvl w:ilvl="0" w:tplc="61B0F172">
+      <w:numFmt w:val="bullet"/>
+      <w:lvlText w:val="-"/>
+      <w:lvlJc w:val="left"/>
+      <w:pPr>
+        <w:ind w:left="720" w:hanging="360"/>
+      </w:pPr>
+      <w:rPr>
+        <w:rFonts w:ascii="Arial" w:eastAsia="Arial" w:hAnsi="Arial" w:cs="Arial" w:hint="default"/>
+      </w:rPr>
+    </w:lvl>
+    <w:lvl w:ilvl="1" w:tplc="04090003" w:tentative="1">
+      <w:start w:val="1"/>
+      <w:numFmt w:val="bullet"/>
+      <w:lvlText w:val="o"/>
+      <w:lvlJc w:val="left"/>
+      <w:pPr>
+        <w:ind w:left="1440" w:hanging="360"/>
+      </w:pPr>
+      <w:rPr>
+        <w:rFonts w:ascii="Courier New" w:hAnsi="Courier New" w:cs="Courier New" w:hint="default"/>
+      </w:rPr>
+    </w:lvl>
+    <w:lvl w:ilvl="2" w:tplc="04090005" w:tentative="1">
+      <w:start w:val="1"/>
+      <w:numFmt w:val="bullet"/>
+      <w:lvlText w:val=""/>
+      <w:lvlJc w:val="left"/>
+      <w:pPr>
+        <w:ind w:left="2160" w:hanging="360"/>
+      </w:pPr>
+      <w:rPr>
+        <w:rFonts w:ascii="Wingdings" w:hAnsi="Wingdings" w:hint="default"/>
+      </w:rPr>
+    </w:lvl>
+    <w:lvl w:ilvl="3" w:tplc="04090001" w:tentative="1">
+      <w:start w:val="1"/>
+      <w:numFmt w:val="bullet"/>
+      <w:lvlText w:val=""/>
+      <w:lvlJc w:val="left"/>
+      <w:pPr>
+        <w:ind w:left="2880" w:hanging="360"/>
+      </w:pPr>
+      <w:rPr>
+        <w:rFonts w:ascii="Symbol" w:hAnsi="Symbol" w:hint="default"/>
+      </w:rPr>
+    </w:lvl>
+    <w:lvl w:ilvl="4" w:tplc="04090003" w:tentative="1">
+      <w:start w:val="1"/>
+      <w:numFmt w:val="bullet"/>
+      <w:lvlText w:val="o"/>
+      <w:lvlJc w:val="left"/>
+      <w:pPr>
+        <w:ind w:left="3600" w:hanging="360"/>
+      </w:pPr>
+      <w:rPr>
+        <w:rFonts w:ascii="Courier New" w:hAnsi="Courier New" w:cs="Courier New" w:hint="default"/>
+      </w:rPr>
+    </w:lvl>
+    <w:lvl w:ilvl="5" w:tplc="04090005" w:tentative="1">
+      <w:start w:val="1"/>
+      <w:numFmt w:val="bullet"/>
+      <w:lvlText w:val=""/>
+      <w:lvlJc w:val="left"/>
+      <w:pPr>
+        <w:ind w:left="4320" w:hanging="360"/>
+      </w:pPr>
+      <w:rPr>
+        <w:rFonts w:ascii="Wingdings" w:hAnsi="Wingdings" w:hint="default"/>
+      </w:rPr>
+    </w:lvl>
+    <w:lvl w:ilvl="6" w:tplc="04090001" w:tentative="1">
+      <w:start w:val="1"/>
+      <w:numFmt w:val="bullet"/>
+      <w:lvlText w:val=""/>
+      <w:lvlJc w:val="left"/>
+      <w:pPr>
+        <w:ind w:left="5040" w:hanging="360"/>
+      </w:pPr>
+      <w:rPr>
+        <w:rFonts w:ascii="Symbol" w:hAnsi="Symbol" w:hint="default"/>
+      </w:rPr>
+    </w:lvl>
+    <w:lvl w:ilvl="7" w:tplc="04090003" w:tentative="1">
+      <w:start w:val="1"/>
+      <w:numFmt w:val="bullet"/>
+      <w:lvlText w:val="o"/>
+      <w:lvlJc w:val="left"/>
+      <w:pPr>
+        <w:ind w:left="5760" w:hanging="360"/>
+      </w:pPr>
+      <w:rPr>
+        <w:rFonts w:ascii="Courier New" w:hAnsi="Courier New" w:cs="Courier New" w:hint="default"/>
+      </w:rPr>
+    </w:lvl>
+    <w:lvl w:ilvl="8" w:tplc="04090005" w:tentative="1">
+      <w:start w:val="1"/>
+      <w:numFmt w:val="bullet"/>
+      <w:lvlText w:val=""/>
+      <w:lvlJc w:val="left"/>
+      <w:pPr>
+        <w:ind w:left="6480" w:hanging="360"/>
+      </w:pPr>
+      <w:rPr>
+        <w:rFonts w:ascii="Wingdings" w:hAnsi="Wingdings" w:hint="default"/>
+      </w:rPr>
+    </w:lvl>
+  </w:abstractNum>
+  <w:abstractNum w:abstractNumId="36" w15:restartNumberingAfterBreak="0">
     <w:nsid w:val="28C00D1F"/>
     <w:multiLevelType w:val="hybridMultilevel"/>
     <w:tmpl w:val="A4B44116"/>
@@ -7523,7 +8421,7 @@
       </w:rPr>
     </w:lvl>
   </w:abstractNum>
-  <w:abstractNum w:abstractNumId="35" w15:restartNumberingAfterBreak="0">
+  <w:abstractNum w:abstractNumId="37" w15:restartNumberingAfterBreak="0">
     <w:nsid w:val="2D426920"/>
     <w:multiLevelType w:val="hybridMultilevel"/>
     <w:tmpl w:val="81A06AF0"/>
@@ -7635,7 +8533,7 @@
       </w:rPr>
     </w:lvl>
   </w:abstractNum>
-  <w:abstractNum w:abstractNumId="36" w15:restartNumberingAfterBreak="0">
+  <w:abstractNum w:abstractNumId="38" w15:restartNumberingAfterBreak="0">
     <w:nsid w:val="2F31353D"/>
     <w:multiLevelType w:val="hybridMultilevel"/>
     <w:tmpl w:val="6C600DC6"/>
@@ -7747,7 +8645,7 @@
       </w:rPr>
     </w:lvl>
   </w:abstractNum>
-  <w:abstractNum w:abstractNumId="37" w15:restartNumberingAfterBreak="0">
+  <w:abstractNum w:abstractNumId="39" w15:restartNumberingAfterBreak="0">
     <w:nsid w:val="2FAF0D3B"/>
     <w:multiLevelType w:val="hybridMultilevel"/>
     <w:tmpl w:val="12D82FE2"/>
@@ -7859,7 +8757,7 @@
       </w:rPr>
     </w:lvl>
   </w:abstractNum>
-  <w:abstractNum w:abstractNumId="38" w15:restartNumberingAfterBreak="0">
+  <w:abstractNum w:abstractNumId="40" w15:restartNumberingAfterBreak="0">
     <w:nsid w:val="2FFE628C"/>
     <w:multiLevelType w:val="hybridMultilevel"/>
     <w:tmpl w:val="2BA48666"/>
@@ -7971,7 +8869,7 @@
       </w:rPr>
     </w:lvl>
   </w:abstractNum>
-  <w:abstractNum w:abstractNumId="39" w15:restartNumberingAfterBreak="0">
+  <w:abstractNum w:abstractNumId="41" w15:restartNumberingAfterBreak="0">
     <w:nsid w:val="301A1E6F"/>
     <w:multiLevelType w:val="hybridMultilevel"/>
     <w:tmpl w:val="D316A260"/>
@@ -8083,7 +8981,7 @@
       </w:rPr>
     </w:lvl>
   </w:abstractNum>
-  <w:abstractNum w:abstractNumId="40" w15:restartNumberingAfterBreak="0">
+  <w:abstractNum w:abstractNumId="42" w15:restartNumberingAfterBreak="0">
     <w:nsid w:val="31C8769F"/>
     <w:multiLevelType w:val="hybridMultilevel"/>
     <w:tmpl w:val="C1DA7B78"/>
@@ -8195,7 +9093,7 @@
       </w:rPr>
     </w:lvl>
   </w:abstractNum>
-  <w:abstractNum w:abstractNumId="41" w15:restartNumberingAfterBreak="0">
+  <w:abstractNum w:abstractNumId="43" w15:restartNumberingAfterBreak="0">
     <w:nsid w:val="32B03C03"/>
     <w:multiLevelType w:val="hybridMultilevel"/>
     <w:tmpl w:val="44640EF4"/>
@@ -8307,7 +9205,7 @@
       </w:rPr>
     </w:lvl>
   </w:abstractNum>
-  <w:abstractNum w:abstractNumId="42" w15:restartNumberingAfterBreak="0">
+  <w:abstractNum w:abstractNumId="44" w15:restartNumberingAfterBreak="0">
     <w:nsid w:val="33DD7186"/>
     <w:multiLevelType w:val="hybridMultilevel"/>
     <w:tmpl w:val="0158FAEA"/>
@@ -8419,7 +9317,7 @@
       </w:rPr>
     </w:lvl>
   </w:abstractNum>
-  <w:abstractNum w:abstractNumId="43" w15:restartNumberingAfterBreak="0">
+  <w:abstractNum w:abstractNumId="45" w15:restartNumberingAfterBreak="0">
     <w:nsid w:val="342D66E6"/>
     <w:multiLevelType w:val="hybridMultilevel"/>
     <w:tmpl w:val="E254554A"/>
@@ -8531,7 +9429,7 @@
       </w:rPr>
     </w:lvl>
   </w:abstractNum>
-  <w:abstractNum w:abstractNumId="44" w15:restartNumberingAfterBreak="0">
+  <w:abstractNum w:abstractNumId="46" w15:restartNumberingAfterBreak="0">
     <w:nsid w:val="343C0E61"/>
     <w:multiLevelType w:val="hybridMultilevel"/>
     <w:tmpl w:val="B88A1536"/>
@@ -8643,7 +9541,7 @@
       </w:rPr>
     </w:lvl>
   </w:abstractNum>
-  <w:abstractNum w:abstractNumId="45" w15:restartNumberingAfterBreak="0">
+  <w:abstractNum w:abstractNumId="47" w15:restartNumberingAfterBreak="0">
     <w:nsid w:val="34A14553"/>
     <w:multiLevelType w:val="hybridMultilevel"/>
     <w:tmpl w:val="170EF526"/>
@@ -8755,7 +9653,7 @@
       </w:rPr>
     </w:lvl>
   </w:abstractNum>
-  <w:abstractNum w:abstractNumId="46" w15:restartNumberingAfterBreak="0">
+  <w:abstractNum w:abstractNumId="48" w15:restartNumberingAfterBreak="0">
     <w:nsid w:val="376B3B86"/>
     <w:multiLevelType w:val="hybridMultilevel"/>
     <w:tmpl w:val="A616020E"/>
@@ -8867,7 +9765,7 @@
       </w:rPr>
     </w:lvl>
   </w:abstractNum>
-  <w:abstractNum w:abstractNumId="47" w15:restartNumberingAfterBreak="0">
+  <w:abstractNum w:abstractNumId="49" w15:restartNumberingAfterBreak="0">
     <w:nsid w:val="377B1E27"/>
     <w:multiLevelType w:val="hybridMultilevel"/>
     <w:tmpl w:val="70E09EF8"/>
@@ -8979,7 +9877,7 @@
       </w:rPr>
     </w:lvl>
   </w:abstractNum>
-  <w:abstractNum w:abstractNumId="48" w15:restartNumberingAfterBreak="0">
+  <w:abstractNum w:abstractNumId="50" w15:restartNumberingAfterBreak="0">
     <w:nsid w:val="37ED2E74"/>
     <w:multiLevelType w:val="hybridMultilevel"/>
     <w:tmpl w:val="2D30E69C"/>
@@ -9091,7 +9989,7 @@
       </w:rPr>
     </w:lvl>
   </w:abstractNum>
-  <w:abstractNum w:abstractNumId="49" w15:restartNumberingAfterBreak="0">
+  <w:abstractNum w:abstractNumId="51" w15:restartNumberingAfterBreak="0">
     <w:nsid w:val="393A26B1"/>
     <w:multiLevelType w:val="hybridMultilevel"/>
     <w:tmpl w:val="59707C16"/>
@@ -9203,7 +10101,7 @@
       </w:rPr>
     </w:lvl>
   </w:abstractNum>
-  <w:abstractNum w:abstractNumId="50" w15:restartNumberingAfterBreak="0">
+  <w:abstractNum w:abstractNumId="52" w15:restartNumberingAfterBreak="0">
     <w:nsid w:val="395D6EAE"/>
     <w:multiLevelType w:val="hybridMultilevel"/>
     <w:tmpl w:val="A9FA500E"/>
@@ -9315,7 +10213,7 @@
       </w:rPr>
     </w:lvl>
   </w:abstractNum>
-  <w:abstractNum w:abstractNumId="51" w15:restartNumberingAfterBreak="0">
+  <w:abstractNum w:abstractNumId="53" w15:restartNumberingAfterBreak="0">
     <w:nsid w:val="39A93951"/>
     <w:multiLevelType w:val="hybridMultilevel"/>
     <w:tmpl w:val="E522E05C"/>
@@ -9427,7 +10325,7 @@
       </w:rPr>
     </w:lvl>
   </w:abstractNum>
-  <w:abstractNum w:abstractNumId="52" w15:restartNumberingAfterBreak="0">
+  <w:abstractNum w:abstractNumId="54" w15:restartNumberingAfterBreak="0">
     <w:nsid w:val="3B001DA3"/>
     <w:multiLevelType w:val="hybridMultilevel"/>
     <w:tmpl w:val="077EDE58"/>
@@ -9539,7 +10437,7 @@
       </w:rPr>
     </w:lvl>
   </w:abstractNum>
-  <w:abstractNum w:abstractNumId="53" w15:restartNumberingAfterBreak="0">
+  <w:abstractNum w:abstractNumId="55" w15:restartNumberingAfterBreak="0">
     <w:nsid w:val="3C141BB0"/>
     <w:multiLevelType w:val="hybridMultilevel"/>
     <w:tmpl w:val="E7900C40"/>
@@ -9651,7 +10549,7 @@
       </w:rPr>
     </w:lvl>
   </w:abstractNum>
-  <w:abstractNum w:abstractNumId="54" w15:restartNumberingAfterBreak="0">
+  <w:abstractNum w:abstractNumId="56" w15:restartNumberingAfterBreak="0">
     <w:nsid w:val="3D29141D"/>
     <w:multiLevelType w:val="hybridMultilevel"/>
     <w:tmpl w:val="907E98AC"/>
@@ -9763,7 +10661,7 @@
       </w:rPr>
     </w:lvl>
   </w:abstractNum>
-  <w:abstractNum w:abstractNumId="55" w15:restartNumberingAfterBreak="0">
+  <w:abstractNum w:abstractNumId="57" w15:restartNumberingAfterBreak="0">
     <w:nsid w:val="3E463A6C"/>
     <w:multiLevelType w:val="hybridMultilevel"/>
     <w:tmpl w:val="5A4C8A9E"/>
@@ -9875,7 +10773,7 @@
       </w:rPr>
     </w:lvl>
   </w:abstractNum>
-  <w:abstractNum w:abstractNumId="56" w15:restartNumberingAfterBreak="0">
+  <w:abstractNum w:abstractNumId="58" w15:restartNumberingAfterBreak="0">
     <w:nsid w:val="40163D94"/>
     <w:multiLevelType w:val="hybridMultilevel"/>
     <w:tmpl w:val="B8669994"/>
@@ -9987,7 +10885,7 @@
       </w:rPr>
     </w:lvl>
   </w:abstractNum>
-  <w:abstractNum w:abstractNumId="57" w15:restartNumberingAfterBreak="0">
+  <w:abstractNum w:abstractNumId="59" w15:restartNumberingAfterBreak="0">
     <w:nsid w:val="40570DDE"/>
     <w:multiLevelType w:val="hybridMultilevel"/>
     <w:tmpl w:val="374229F2"/>
@@ -10099,7 +10997,7 @@
       </w:rPr>
     </w:lvl>
   </w:abstractNum>
-  <w:abstractNum w:abstractNumId="58" w15:restartNumberingAfterBreak="0">
+  <w:abstractNum w:abstractNumId="60" w15:restartNumberingAfterBreak="0">
     <w:nsid w:val="42EE59E7"/>
     <w:multiLevelType w:val="multilevel"/>
     <w:tmpl w:val="6A52508A"/>
@@ -10212,7 +11110,7 @@
       </w:rPr>
     </w:lvl>
   </w:abstractNum>
-  <w:abstractNum w:abstractNumId="59" w15:restartNumberingAfterBreak="0">
+  <w:abstractNum w:abstractNumId="61" w15:restartNumberingAfterBreak="0">
     <w:nsid w:val="43E5715E"/>
     <w:multiLevelType w:val="hybridMultilevel"/>
     <w:tmpl w:val="DF4C239E"/>
@@ -10324,7 +11222,7 @@
       </w:rPr>
     </w:lvl>
   </w:abstractNum>
-  <w:abstractNum w:abstractNumId="60" w15:restartNumberingAfterBreak="0">
+  <w:abstractNum w:abstractNumId="62" w15:restartNumberingAfterBreak="0">
     <w:nsid w:val="447A353B"/>
     <w:multiLevelType w:val="hybridMultilevel"/>
     <w:tmpl w:val="C978BA68"/>
@@ -10436,7 +11334,7 @@
       </w:rPr>
     </w:lvl>
   </w:abstractNum>
-  <w:abstractNum w:abstractNumId="61" w15:restartNumberingAfterBreak="0">
+  <w:abstractNum w:abstractNumId="63" w15:restartNumberingAfterBreak="0">
     <w:nsid w:val="452C7493"/>
     <w:multiLevelType w:val="hybridMultilevel"/>
     <w:tmpl w:val="9910A868"/>
@@ -10548,7 +11446,7 @@
       </w:rPr>
     </w:lvl>
   </w:abstractNum>
-  <w:abstractNum w:abstractNumId="62" w15:restartNumberingAfterBreak="0">
+  <w:abstractNum w:abstractNumId="64" w15:restartNumberingAfterBreak="0">
     <w:nsid w:val="46BB3CB3"/>
     <w:multiLevelType w:val="hybridMultilevel"/>
     <w:tmpl w:val="8B62916A"/>
@@ -10660,7 +11558,7 @@
       </w:rPr>
     </w:lvl>
   </w:abstractNum>
-  <w:abstractNum w:abstractNumId="63" w15:restartNumberingAfterBreak="0">
+  <w:abstractNum w:abstractNumId="65" w15:restartNumberingAfterBreak="0">
     <w:nsid w:val="47746E93"/>
     <w:multiLevelType w:val="hybridMultilevel"/>
     <w:tmpl w:val="2B721A4A"/>
@@ -10772,7 +11670,7 @@
       </w:rPr>
     </w:lvl>
   </w:abstractNum>
-  <w:abstractNum w:abstractNumId="64" w15:restartNumberingAfterBreak="0">
+  <w:abstractNum w:abstractNumId="66" w15:restartNumberingAfterBreak="0">
     <w:nsid w:val="483D056B"/>
     <w:multiLevelType w:val="hybridMultilevel"/>
     <w:tmpl w:val="C4DCE034"/>
@@ -10884,7 +11782,7 @@
       </w:rPr>
     </w:lvl>
   </w:abstractNum>
-  <w:abstractNum w:abstractNumId="65" w15:restartNumberingAfterBreak="0">
+  <w:abstractNum w:abstractNumId="67" w15:restartNumberingAfterBreak="0">
     <w:nsid w:val="48813A05"/>
     <w:multiLevelType w:val="hybridMultilevel"/>
     <w:tmpl w:val="42CAA4CE"/>
@@ -10997,7 +11895,7 @@
       </w:rPr>
     </w:lvl>
   </w:abstractNum>
-  <w:abstractNum w:abstractNumId="66" w15:restartNumberingAfterBreak="0">
+  <w:abstractNum w:abstractNumId="68" w15:restartNumberingAfterBreak="0">
     <w:nsid w:val="4A3C29DC"/>
     <w:multiLevelType w:val="hybridMultilevel"/>
     <w:tmpl w:val="29F4D392"/>
@@ -11109,7 +12007,7 @@
       </w:rPr>
     </w:lvl>
   </w:abstractNum>
-  <w:abstractNum w:abstractNumId="67" w15:restartNumberingAfterBreak="0">
+  <w:abstractNum w:abstractNumId="69" w15:restartNumberingAfterBreak="0">
     <w:nsid w:val="4A9B6FB7"/>
     <w:multiLevelType w:val="hybridMultilevel"/>
     <w:tmpl w:val="C47ECA54"/>
@@ -11221,7 +12119,7 @@
       </w:rPr>
     </w:lvl>
   </w:abstractNum>
-  <w:abstractNum w:abstractNumId="68" w15:restartNumberingAfterBreak="0">
+  <w:abstractNum w:abstractNumId="70" w15:restartNumberingAfterBreak="0">
     <w:nsid w:val="4C2207ED"/>
     <w:multiLevelType w:val="hybridMultilevel"/>
     <w:tmpl w:val="E95272B2"/>
@@ -11333,7 +12231,7 @@
       </w:rPr>
     </w:lvl>
   </w:abstractNum>
-  <w:abstractNum w:abstractNumId="69" w15:restartNumberingAfterBreak="0">
+  <w:abstractNum w:abstractNumId="71" w15:restartNumberingAfterBreak="0">
     <w:nsid w:val="4C687CB3"/>
     <w:multiLevelType w:val="hybridMultilevel"/>
     <w:tmpl w:val="0D781E22"/>
@@ -11445,7 +12343,7 @@
       </w:rPr>
     </w:lvl>
   </w:abstractNum>
-  <w:abstractNum w:abstractNumId="70" w15:restartNumberingAfterBreak="0">
+  <w:abstractNum w:abstractNumId="72" w15:restartNumberingAfterBreak="0">
     <w:nsid w:val="4FCE4725"/>
     <w:multiLevelType w:val="hybridMultilevel"/>
     <w:tmpl w:val="914EE3B4"/>
@@ -11557,7 +12455,7 @@
       </w:rPr>
     </w:lvl>
   </w:abstractNum>
-  <w:abstractNum w:abstractNumId="71" w15:restartNumberingAfterBreak="0">
+  <w:abstractNum w:abstractNumId="73" w15:restartNumberingAfterBreak="0">
     <w:nsid w:val="51CE085C"/>
     <w:multiLevelType w:val="hybridMultilevel"/>
     <w:tmpl w:val="84788A08"/>
@@ -11669,7 +12567,7 @@
       </w:rPr>
     </w:lvl>
   </w:abstractNum>
-  <w:abstractNum w:abstractNumId="72" w15:restartNumberingAfterBreak="0">
+  <w:abstractNum w:abstractNumId="74" w15:restartNumberingAfterBreak="0">
     <w:nsid w:val="52944BD2"/>
     <w:multiLevelType w:val="hybridMultilevel"/>
     <w:tmpl w:val="BC3489E0"/>
@@ -11781,7 +12679,7 @@
       </w:rPr>
     </w:lvl>
   </w:abstractNum>
-  <w:abstractNum w:abstractNumId="73" w15:restartNumberingAfterBreak="0">
+  <w:abstractNum w:abstractNumId="75" w15:restartNumberingAfterBreak="0">
     <w:nsid w:val="565E12F2"/>
     <w:multiLevelType w:val="hybridMultilevel"/>
     <w:tmpl w:val="9E96747C"/>
@@ -11893,7 +12791,7 @@
       </w:rPr>
     </w:lvl>
   </w:abstractNum>
-  <w:abstractNum w:abstractNumId="74" w15:restartNumberingAfterBreak="0">
+  <w:abstractNum w:abstractNumId="76" w15:restartNumberingAfterBreak="0">
     <w:nsid w:val="57466407"/>
     <w:multiLevelType w:val="hybridMultilevel"/>
     <w:tmpl w:val="0F9ADCF4"/>
@@ -12005,7 +12903,7 @@
       </w:rPr>
     </w:lvl>
   </w:abstractNum>
-  <w:abstractNum w:abstractNumId="75" w15:restartNumberingAfterBreak="0">
+  <w:abstractNum w:abstractNumId="77" w15:restartNumberingAfterBreak="0">
     <w:nsid w:val="5ABE68FB"/>
     <w:multiLevelType w:val="hybridMultilevel"/>
     <w:tmpl w:val="B422F472"/>
@@ -12117,7 +13015,7 @@
       </w:rPr>
     </w:lvl>
   </w:abstractNum>
-  <w:abstractNum w:abstractNumId="76" w15:restartNumberingAfterBreak="0">
+  <w:abstractNum w:abstractNumId="78" w15:restartNumberingAfterBreak="0">
     <w:nsid w:val="5BA928F1"/>
     <w:multiLevelType w:val="hybridMultilevel"/>
     <w:tmpl w:val="4D4E1798"/>
@@ -12229,7 +13127,7 @@
       </w:rPr>
     </w:lvl>
   </w:abstractNum>
-  <w:abstractNum w:abstractNumId="77" w15:restartNumberingAfterBreak="0">
+  <w:abstractNum w:abstractNumId="79" w15:restartNumberingAfterBreak="0">
     <w:nsid w:val="5C834FA4"/>
     <w:multiLevelType w:val="hybridMultilevel"/>
     <w:tmpl w:val="1FC415FC"/>
@@ -12341,7 +13239,7 @@
       </w:rPr>
     </w:lvl>
   </w:abstractNum>
-  <w:abstractNum w:abstractNumId="78" w15:restartNumberingAfterBreak="0">
+  <w:abstractNum w:abstractNumId="80" w15:restartNumberingAfterBreak="0">
     <w:nsid w:val="5F3C3936"/>
     <w:multiLevelType w:val="hybridMultilevel"/>
     <w:tmpl w:val="917CC46E"/>
@@ -12453,7 +13351,7 @@
       </w:rPr>
     </w:lvl>
   </w:abstractNum>
-  <w:abstractNum w:abstractNumId="79" w15:restartNumberingAfterBreak="0">
+  <w:abstractNum w:abstractNumId="81" w15:restartNumberingAfterBreak="0">
     <w:nsid w:val="60544E94"/>
     <w:multiLevelType w:val="hybridMultilevel"/>
     <w:tmpl w:val="CBCAC042"/>
@@ -12565,7 +13463,7 @@
       </w:rPr>
     </w:lvl>
   </w:abstractNum>
-  <w:abstractNum w:abstractNumId="80" w15:restartNumberingAfterBreak="0">
+  <w:abstractNum w:abstractNumId="82" w15:restartNumberingAfterBreak="0">
     <w:nsid w:val="622F692B"/>
     <w:multiLevelType w:val="hybridMultilevel"/>
     <w:tmpl w:val="63B20C1E"/>
@@ -12677,7 +13575,7 @@
       </w:rPr>
     </w:lvl>
   </w:abstractNum>
-  <w:abstractNum w:abstractNumId="81" w15:restartNumberingAfterBreak="0">
+  <w:abstractNum w:abstractNumId="83" w15:restartNumberingAfterBreak="0">
     <w:nsid w:val="62D1418B"/>
     <w:multiLevelType w:val="multilevel"/>
     <w:tmpl w:val="3E58308A"/>
@@ -12776,7 +13674,7 @@
       </w:pPr>
     </w:lvl>
   </w:abstractNum>
-  <w:abstractNum w:abstractNumId="82" w15:restartNumberingAfterBreak="0">
+  <w:abstractNum w:abstractNumId="84" w15:restartNumberingAfterBreak="0">
     <w:nsid w:val="62E52923"/>
     <w:multiLevelType w:val="hybridMultilevel"/>
     <w:tmpl w:val="7668165A"/>
@@ -12888,7 +13786,7 @@
       </w:rPr>
     </w:lvl>
   </w:abstractNum>
-  <w:abstractNum w:abstractNumId="83" w15:restartNumberingAfterBreak="0">
+  <w:abstractNum w:abstractNumId="85" w15:restartNumberingAfterBreak="0">
     <w:nsid w:val="63935A88"/>
     <w:multiLevelType w:val="hybridMultilevel"/>
     <w:tmpl w:val="0F5805EA"/>
@@ -13000,7 +13898,7 @@
       </w:rPr>
     </w:lvl>
   </w:abstractNum>
-  <w:abstractNum w:abstractNumId="84" w15:restartNumberingAfterBreak="0">
+  <w:abstractNum w:abstractNumId="86" w15:restartNumberingAfterBreak="0">
     <w:nsid w:val="69496F08"/>
     <w:multiLevelType w:val="hybridMultilevel"/>
     <w:tmpl w:val="6EE839E4"/>
@@ -13112,7 +14010,7 @@
       </w:rPr>
     </w:lvl>
   </w:abstractNum>
-  <w:abstractNum w:abstractNumId="85" w15:restartNumberingAfterBreak="0">
+  <w:abstractNum w:abstractNumId="87" w15:restartNumberingAfterBreak="0">
     <w:nsid w:val="6ACC6C5E"/>
     <w:multiLevelType w:val="multilevel"/>
     <w:tmpl w:val="4AB8E1DA"/>
@@ -13225,7 +14123,7 @@
       </w:rPr>
     </w:lvl>
   </w:abstractNum>
-  <w:abstractNum w:abstractNumId="86" w15:restartNumberingAfterBreak="0">
+  <w:abstractNum w:abstractNumId="88" w15:restartNumberingAfterBreak="0">
     <w:nsid w:val="6D7319F8"/>
     <w:multiLevelType w:val="hybridMultilevel"/>
     <w:tmpl w:val="A7EEE4A4"/>
@@ -13337,7 +14235,7 @@
       </w:rPr>
     </w:lvl>
   </w:abstractNum>
-  <w:abstractNum w:abstractNumId="87" w15:restartNumberingAfterBreak="0">
+  <w:abstractNum w:abstractNumId="89" w15:restartNumberingAfterBreak="0">
     <w:nsid w:val="6D94244E"/>
     <w:multiLevelType w:val="hybridMultilevel"/>
     <w:tmpl w:val="D38C1A3A"/>
@@ -13449,7 +14347,7 @@
       </w:rPr>
     </w:lvl>
   </w:abstractNum>
-  <w:abstractNum w:abstractNumId="88" w15:restartNumberingAfterBreak="0">
+  <w:abstractNum w:abstractNumId="90" w15:restartNumberingAfterBreak="0">
     <w:nsid w:val="6DEA09BD"/>
     <w:multiLevelType w:val="hybridMultilevel"/>
     <w:tmpl w:val="029A123E"/>
@@ -13561,7 +14459,7 @@
       </w:rPr>
     </w:lvl>
   </w:abstractNum>
-  <w:abstractNum w:abstractNumId="89" w15:restartNumberingAfterBreak="0">
+  <w:abstractNum w:abstractNumId="91" w15:restartNumberingAfterBreak="0">
     <w:nsid w:val="6E310D77"/>
     <w:multiLevelType w:val="hybridMultilevel"/>
     <w:tmpl w:val="9C74834E"/>
@@ -13674,7 +14572,7 @@
       </w:rPr>
     </w:lvl>
   </w:abstractNum>
-  <w:abstractNum w:abstractNumId="90" w15:restartNumberingAfterBreak="0">
+  <w:abstractNum w:abstractNumId="92" w15:restartNumberingAfterBreak="0">
     <w:nsid w:val="74D85371"/>
     <w:multiLevelType w:val="hybridMultilevel"/>
     <w:tmpl w:val="B20E36AC"/>
@@ -13786,7 +14684,7 @@
       </w:rPr>
     </w:lvl>
   </w:abstractNum>
-  <w:abstractNum w:abstractNumId="91" w15:restartNumberingAfterBreak="0">
+  <w:abstractNum w:abstractNumId="93" w15:restartNumberingAfterBreak="0">
     <w:nsid w:val="75FA3747"/>
     <w:multiLevelType w:val="hybridMultilevel"/>
     <w:tmpl w:val="B9F43A9E"/>
@@ -13898,7 +14796,7 @@
       </w:rPr>
     </w:lvl>
   </w:abstractNum>
-  <w:abstractNum w:abstractNumId="92" w15:restartNumberingAfterBreak="0">
+  <w:abstractNum w:abstractNumId="94" w15:restartNumberingAfterBreak="0">
     <w:nsid w:val="7877407A"/>
     <w:multiLevelType w:val="hybridMultilevel"/>
     <w:tmpl w:val="C91E38FA"/>
@@ -14010,7 +14908,7 @@
       </w:rPr>
     </w:lvl>
   </w:abstractNum>
-  <w:abstractNum w:abstractNumId="93" w15:restartNumberingAfterBreak="0">
+  <w:abstractNum w:abstractNumId="95" w15:restartNumberingAfterBreak="0">
     <w:nsid w:val="78A40DC3"/>
     <w:multiLevelType w:val="hybridMultilevel"/>
     <w:tmpl w:val="F1E6B4B6"/>
@@ -14122,7 +15020,7 @@
       </w:rPr>
     </w:lvl>
   </w:abstractNum>
-  <w:abstractNum w:abstractNumId="94" w15:restartNumberingAfterBreak="0">
+  <w:abstractNum w:abstractNumId="96" w15:restartNumberingAfterBreak="0">
     <w:nsid w:val="79587B7C"/>
     <w:multiLevelType w:val="hybridMultilevel"/>
     <w:tmpl w:val="6A46933A"/>
@@ -14234,7 +15132,7 @@
       </w:rPr>
     </w:lvl>
   </w:abstractNum>
-  <w:abstractNum w:abstractNumId="95" w15:restartNumberingAfterBreak="0">
+  <w:abstractNum w:abstractNumId="97" w15:restartNumberingAfterBreak="0">
     <w:nsid w:val="7BB23699"/>
     <w:multiLevelType w:val="hybridMultilevel"/>
     <w:tmpl w:val="26C25814"/>
@@ -14346,7 +15244,7 @@
       </w:rPr>
     </w:lvl>
   </w:abstractNum>
-  <w:abstractNum w:abstractNumId="96" w15:restartNumberingAfterBreak="0">
+  <w:abstractNum w:abstractNumId="98" w15:restartNumberingAfterBreak="0">
     <w:nsid w:val="7F827ECF"/>
     <w:multiLevelType w:val="hybridMultilevel"/>
     <w:tmpl w:val="42DE9398"/>
@@ -14459,13 +15357,13 @@
     </w:lvl>
   </w:abstractNum>
   <w:num w:numId="1" w16cid:durableId="553472407">
-    <w:abstractNumId w:val="85"/>
+    <w:abstractNumId w:val="87"/>
   </w:num>
   <w:num w:numId="2" w16cid:durableId="1531718695">
     <w:abstractNumId w:val="17"/>
   </w:num>
   <w:num w:numId="3" w16cid:durableId="667371155">
-    <w:abstractNumId w:val="58"/>
+    <w:abstractNumId w:val="60"/>
   </w:num>
   <w:num w:numId="4" w16cid:durableId="751775167">
     <w:abstractNumId w:val="13"/>
@@ -14474,16 +15372,16 @@
     <w:abstractNumId w:val="30"/>
   </w:num>
   <w:num w:numId="6" w16cid:durableId="915629572">
-    <w:abstractNumId w:val="81"/>
+    <w:abstractNumId w:val="83"/>
   </w:num>
   <w:num w:numId="7" w16cid:durableId="693576224">
-    <w:abstractNumId w:val="94"/>
+    <w:abstractNumId w:val="96"/>
   </w:num>
   <w:num w:numId="8" w16cid:durableId="1298343021">
-    <w:abstractNumId w:val="89"/>
+    <w:abstractNumId w:val="91"/>
   </w:num>
   <w:num w:numId="9" w16cid:durableId="367219526">
-    <w:abstractNumId w:val="87"/>
+    <w:abstractNumId w:val="89"/>
   </w:num>
   <w:num w:numId="10" w16cid:durableId="1497187389">
     <w:abstractNumId w:val="19"/>
@@ -14492,118 +15390,118 @@
     <w:abstractNumId w:val="12"/>
   </w:num>
   <w:num w:numId="12" w16cid:durableId="567883504">
-    <w:abstractNumId w:val="54"/>
+    <w:abstractNumId w:val="56"/>
   </w:num>
   <w:num w:numId="13" w16cid:durableId="1572815186">
-    <w:abstractNumId w:val="46"/>
+    <w:abstractNumId w:val="48"/>
   </w:num>
   <w:num w:numId="14" w16cid:durableId="1914309961">
-    <w:abstractNumId w:val="37"/>
+    <w:abstractNumId w:val="39"/>
   </w:num>
   <w:num w:numId="15" w16cid:durableId="538855433">
     <w:abstractNumId w:val="5"/>
   </w:num>
   <w:num w:numId="16" w16cid:durableId="1421751508">
-    <w:abstractNumId w:val="96"/>
+    <w:abstractNumId w:val="98"/>
   </w:num>
   <w:num w:numId="17" w16cid:durableId="1009716389">
-    <w:abstractNumId w:val="65"/>
+    <w:abstractNumId w:val="67"/>
   </w:num>
   <w:num w:numId="18" w16cid:durableId="300229387">
-    <w:abstractNumId w:val="71"/>
+    <w:abstractNumId w:val="73"/>
   </w:num>
   <w:num w:numId="19" w16cid:durableId="1025836216">
-    <w:abstractNumId w:val="52"/>
+    <w:abstractNumId w:val="54"/>
   </w:num>
   <w:num w:numId="20" w16cid:durableId="976106770">
     <w:abstractNumId w:val="15"/>
   </w:num>
   <w:num w:numId="21" w16cid:durableId="427965314">
-    <w:abstractNumId w:val="40"/>
+    <w:abstractNumId w:val="42"/>
   </w:num>
   <w:num w:numId="22" w16cid:durableId="177355694">
-    <w:abstractNumId w:val="78"/>
+    <w:abstractNumId w:val="80"/>
   </w:num>
   <w:num w:numId="23" w16cid:durableId="6762404">
-    <w:abstractNumId w:val="61"/>
+    <w:abstractNumId w:val="63"/>
   </w:num>
   <w:num w:numId="24" w16cid:durableId="1492133217">
-    <w:abstractNumId w:val="68"/>
+    <w:abstractNumId w:val="70"/>
   </w:num>
   <w:num w:numId="25" w16cid:durableId="695159279">
     <w:abstractNumId w:val="28"/>
   </w:num>
   <w:num w:numId="26" w16cid:durableId="1012492464">
-    <w:abstractNumId w:val="34"/>
+    <w:abstractNumId w:val="36"/>
   </w:num>
   <w:num w:numId="27" w16cid:durableId="1101994251">
-    <w:abstractNumId w:val="44"/>
+    <w:abstractNumId w:val="46"/>
   </w:num>
   <w:num w:numId="28" w16cid:durableId="1082484344">
-    <w:abstractNumId w:val="64"/>
+    <w:abstractNumId w:val="66"/>
   </w:num>
   <w:num w:numId="29" w16cid:durableId="467865549">
-    <w:abstractNumId w:val="69"/>
+    <w:abstractNumId w:val="71"/>
   </w:num>
   <w:num w:numId="30" w16cid:durableId="1656108771">
     <w:abstractNumId w:val="18"/>
   </w:num>
   <w:num w:numId="31" w16cid:durableId="1611818230">
-    <w:abstractNumId w:val="88"/>
+    <w:abstractNumId w:val="90"/>
   </w:num>
   <w:num w:numId="32" w16cid:durableId="1666009498">
     <w:abstractNumId w:val="11"/>
   </w:num>
   <w:num w:numId="33" w16cid:durableId="1041394156">
-    <w:abstractNumId w:val="49"/>
+    <w:abstractNumId w:val="51"/>
   </w:num>
   <w:num w:numId="34" w16cid:durableId="1270353408">
-    <w:abstractNumId w:val="57"/>
+    <w:abstractNumId w:val="59"/>
   </w:num>
   <w:num w:numId="35" w16cid:durableId="1540698615">
     <w:abstractNumId w:val="10"/>
   </w:num>
   <w:num w:numId="36" w16cid:durableId="1684479704">
-    <w:abstractNumId w:val="43"/>
+    <w:abstractNumId w:val="45"/>
   </w:num>
   <w:num w:numId="37" w16cid:durableId="2125145959">
     <w:abstractNumId w:val="16"/>
   </w:num>
   <w:num w:numId="38" w16cid:durableId="1120106064">
-    <w:abstractNumId w:val="35"/>
+    <w:abstractNumId w:val="37"/>
   </w:num>
   <w:num w:numId="39" w16cid:durableId="798885554">
-    <w:abstractNumId w:val="95"/>
+    <w:abstractNumId w:val="97"/>
   </w:num>
   <w:num w:numId="40" w16cid:durableId="1610315013">
-    <w:abstractNumId w:val="82"/>
+    <w:abstractNumId w:val="84"/>
   </w:num>
   <w:num w:numId="41" w16cid:durableId="213975163">
     <w:abstractNumId w:val="4"/>
   </w:num>
   <w:num w:numId="42" w16cid:durableId="511454106">
-    <w:abstractNumId w:val="77"/>
+    <w:abstractNumId w:val="79"/>
   </w:num>
   <w:num w:numId="43" w16cid:durableId="1721711403">
     <w:abstractNumId w:val="22"/>
   </w:num>
   <w:num w:numId="44" w16cid:durableId="652369700">
-    <w:abstractNumId w:val="86"/>
+    <w:abstractNumId w:val="88"/>
   </w:num>
   <w:num w:numId="45" w16cid:durableId="227304564">
-    <w:abstractNumId w:val="70"/>
+    <w:abstractNumId w:val="72"/>
   </w:num>
   <w:num w:numId="46" w16cid:durableId="1561091169">
-    <w:abstractNumId w:val="32"/>
+    <w:abstractNumId w:val="33"/>
   </w:num>
   <w:num w:numId="47" w16cid:durableId="734011883">
-    <w:abstractNumId w:val="83"/>
+    <w:abstractNumId w:val="85"/>
   </w:num>
   <w:num w:numId="48" w16cid:durableId="2125267477">
-    <w:abstractNumId w:val="74"/>
+    <w:abstractNumId w:val="76"/>
   </w:num>
   <w:num w:numId="49" w16cid:durableId="1612585929">
-    <w:abstractNumId w:val="73"/>
+    <w:abstractNumId w:val="75"/>
   </w:num>
   <w:num w:numId="50" w16cid:durableId="1628664370">
     <w:abstractNumId w:val="3"/>
@@ -14612,16 +15510,16 @@
     <w:abstractNumId w:val="24"/>
   </w:num>
   <w:num w:numId="52" w16cid:durableId="754671244">
-    <w:abstractNumId w:val="59"/>
+    <w:abstractNumId w:val="61"/>
   </w:num>
   <w:num w:numId="53" w16cid:durableId="1740665818">
-    <w:abstractNumId w:val="91"/>
+    <w:abstractNumId w:val="93"/>
   </w:num>
   <w:num w:numId="54" w16cid:durableId="452988921">
-    <w:abstractNumId w:val="92"/>
+    <w:abstractNumId w:val="94"/>
   </w:num>
   <w:num w:numId="55" w16cid:durableId="207304158">
-    <w:abstractNumId w:val="72"/>
+    <w:abstractNumId w:val="74"/>
   </w:num>
   <w:num w:numId="56" w16cid:durableId="2016880598">
     <w:abstractNumId w:val="20"/>
@@ -14630,19 +15528,19 @@
     <w:abstractNumId w:val="1"/>
   </w:num>
   <w:num w:numId="58" w16cid:durableId="1794397765">
+    <w:abstractNumId w:val="55"/>
+  </w:num>
+  <w:num w:numId="59" w16cid:durableId="1690447450">
     <w:abstractNumId w:val="53"/>
   </w:num>
-  <w:num w:numId="59" w16cid:durableId="1690447450">
-    <w:abstractNumId w:val="51"/>
-  </w:num>
   <w:num w:numId="60" w16cid:durableId="2130009061">
-    <w:abstractNumId w:val="75"/>
+    <w:abstractNumId w:val="77"/>
   </w:num>
   <w:num w:numId="61" w16cid:durableId="1293515410">
     <w:abstractNumId w:val="2"/>
   </w:num>
   <w:num w:numId="62" w16cid:durableId="650257227">
-    <w:abstractNumId w:val="48"/>
+    <w:abstractNumId w:val="50"/>
   </w:num>
   <w:num w:numId="63" w16cid:durableId="571551157">
     <w:abstractNumId w:val="25"/>
@@ -14660,101 +15558,107 @@
     <w:abstractNumId w:val="29"/>
   </w:num>
   <w:num w:numId="68" w16cid:durableId="139276496">
-    <w:abstractNumId w:val="33"/>
+    <w:abstractNumId w:val="34"/>
   </w:num>
   <w:num w:numId="69" w16cid:durableId="1090197415">
     <w:abstractNumId w:val="7"/>
   </w:num>
   <w:num w:numId="70" w16cid:durableId="131336986">
-    <w:abstractNumId w:val="39"/>
+    <w:abstractNumId w:val="41"/>
   </w:num>
   <w:num w:numId="71" w16cid:durableId="894970823">
-    <w:abstractNumId w:val="31"/>
+    <w:abstractNumId w:val="32"/>
   </w:num>
   <w:num w:numId="72" w16cid:durableId="1865287051">
-    <w:abstractNumId w:val="41"/>
+    <w:abstractNumId w:val="43"/>
   </w:num>
   <w:num w:numId="73" w16cid:durableId="368451605">
-    <w:abstractNumId w:val="62"/>
+    <w:abstractNumId w:val="64"/>
   </w:num>
   <w:num w:numId="74" w16cid:durableId="65686607">
     <w:abstractNumId w:val="6"/>
   </w:num>
   <w:num w:numId="75" w16cid:durableId="1840541023">
-    <w:abstractNumId w:val="45"/>
+    <w:abstractNumId w:val="47"/>
   </w:num>
   <w:num w:numId="76" w16cid:durableId="539049649">
-    <w:abstractNumId w:val="93"/>
+    <w:abstractNumId w:val="95"/>
   </w:num>
   <w:num w:numId="77" w16cid:durableId="1288513951">
-    <w:abstractNumId w:val="66"/>
+    <w:abstractNumId w:val="68"/>
   </w:num>
   <w:num w:numId="78" w16cid:durableId="1532762005">
-    <w:abstractNumId w:val="55"/>
+    <w:abstractNumId w:val="57"/>
   </w:num>
   <w:num w:numId="79" w16cid:durableId="1374647797">
-    <w:abstractNumId w:val="79"/>
+    <w:abstractNumId w:val="81"/>
   </w:num>
   <w:num w:numId="80" w16cid:durableId="1210456390">
     <w:abstractNumId w:val="8"/>
   </w:num>
   <w:num w:numId="81" w16cid:durableId="171071792">
-    <w:abstractNumId w:val="36"/>
+    <w:abstractNumId w:val="38"/>
   </w:num>
   <w:num w:numId="82" w16cid:durableId="500893856">
-    <w:abstractNumId w:val="84"/>
+    <w:abstractNumId w:val="86"/>
   </w:num>
   <w:num w:numId="83" w16cid:durableId="1950622049">
-    <w:abstractNumId w:val="60"/>
+    <w:abstractNumId w:val="62"/>
   </w:num>
   <w:num w:numId="84" w16cid:durableId="2060282905">
     <w:abstractNumId w:val="0"/>
   </w:num>
   <w:num w:numId="85" w16cid:durableId="490635123">
-    <w:abstractNumId w:val="56"/>
+    <w:abstractNumId w:val="58"/>
   </w:num>
   <w:num w:numId="86" w16cid:durableId="2038313657">
     <w:abstractNumId w:val="21"/>
   </w:num>
   <w:num w:numId="87" w16cid:durableId="1744451624">
-    <w:abstractNumId w:val="50"/>
+    <w:abstractNumId w:val="52"/>
   </w:num>
   <w:num w:numId="88" w16cid:durableId="2105687898">
-    <w:abstractNumId w:val="76"/>
+    <w:abstractNumId w:val="78"/>
   </w:num>
   <w:num w:numId="89" w16cid:durableId="363360886">
     <w:abstractNumId w:val="23"/>
   </w:num>
   <w:num w:numId="90" w16cid:durableId="974530531">
-    <w:abstractNumId w:val="67"/>
+    <w:abstractNumId w:val="69"/>
   </w:num>
   <w:num w:numId="91" w16cid:durableId="780148532">
-    <w:abstractNumId w:val="90"/>
+    <w:abstractNumId w:val="92"/>
   </w:num>
   <w:num w:numId="92" w16cid:durableId="304706915">
-    <w:abstractNumId w:val="47"/>
+    <w:abstractNumId w:val="49"/>
   </w:num>
   <w:num w:numId="93" w16cid:durableId="1232305665">
-    <w:abstractNumId w:val="63"/>
+    <w:abstractNumId w:val="65"/>
   </w:num>
   <w:num w:numId="94" w16cid:durableId="2055348731">
-    <w:abstractNumId w:val="42"/>
+    <w:abstractNumId w:val="44"/>
   </w:num>
   <w:num w:numId="95" w16cid:durableId="513424609">
-    <w:abstractNumId w:val="38"/>
+    <w:abstractNumId w:val="40"/>
   </w:num>
   <w:num w:numId="96" w16cid:durableId="1417553145">
     <w:abstractNumId w:val="9"/>
   </w:num>
   <w:num w:numId="97" w16cid:durableId="2112820987">
-    <w:abstractNumId w:val="80"/>
+    <w:abstractNumId w:val="82"/>
+  </w:num>
+  <w:num w:numId="98" w16cid:durableId="764885690">
+    <w:abstractNumId w:val="35"/>
+  </w:num>
+  <w:num w:numId="99" w16cid:durableId="1459834170">
+    <w:abstractNumId w:val="31"/>
   </w:num>
   <w:numIdMacAtCleanup w:val="84"/>
 </w:numbering>
 </file>
 
 <file path=word/styles.xml><?xml version="1.0" encoding="utf-8"?>
-<w:styles xmlns:mc="http://schemas.openxmlformats.org/markup-compatibility/2006" xmlns:r="http://schemas.openxmlformats.org/officeDocument/2006/relationships" xmlns:w="http://schemas.openxmlformats.org/wordprocessingml/2006/main" xmlns:w14="http://schemas.microsoft.com/office/word/2010/wordml" xmlns:w15="http://schemas.microsoft.com/office/word/2012/wordml" xmlns:w16cex="http://schemas.microsoft.com/office/word/2018/wordml/cex" xmlns:w16cid="http://schemas.microsoft.com/office/word/2016/wordml/cid" xmlns:w16="http://schemas.microsoft.com/office/word/2018/wordml" xmlns:w16du="http://schemas.microsoft.com/office/word/2023/wordml/word16du" xmlns:w16sdtdh="http://schemas.microsoft.com/office/word/2020/wordml/sdtdatahash" xmlns:w16se="http://schemas.microsoft.com/office/word/2015/wordml/symex" mc:Ignorable="w14 w15 w16se w16cid w16 w16cex w16sdtdh w16du">
+<w:styles xmlns:mc="http://schemas.openxmlformats.org/markup-compatibility/2006" xmlns:r="http://schemas.openxmlformats.org/officeDocument/2006/relationships" xmlns:w="http://schemas.openxmlformats.org/wordprocessingml/2006/main" xmlns:w14="http://schemas.microsoft.com/office/word/2010/wordml" xmlns:w15="http://schemas.microsoft.com/office/word/2012/wordml" xmlns:w16cex="http://schemas.microsoft.com/office/word/2018/wordml/cex" xmlns:w16cid="http://schemas.microsoft.com/office/word/2016/wordml/cid" xmlns:w16="http://schemas.microsoft.com/office/word/2018/wordml" xmlns:w16du="http://schemas.microsoft.com/office/word/2023/wordml/word16du" xmlns:w16sdtdh="http://schemas.microsoft.com/office/word/2020/wordml/sdtdatahash" xmlns:w16sdtfl="http://schemas.microsoft.com/office/word/2024/wordml/sdtformatlock" xmlns:w16se="http://schemas.microsoft.com/office/word/2015/wordml/symex" mc:Ignorable="w14 w15 w16se w16cid w16 w16cex w16sdtdh w16sdtfl w16du">
   <w:docDefaults>
     <w:rPrDefault>
       <w:rPr>

</xml_diff>

<commit_message>
Some beginning Kicad files and update docx file.
</commit_message>
<xml_diff>
--- a/RadioFox.docx
+++ b/RadioFox.docx
@@ -1,6 +1,6 @@
 
 <file path=word/document.xml><?xml version="1.0" encoding="utf-8"?>
-<w:document xmlns:wpc="http://schemas.microsoft.com/office/word/2010/wordprocessingCanvas" xmlns:cx="http://schemas.microsoft.com/office/drawing/2014/chartex" xmlns:cx1="http://schemas.microsoft.com/office/drawing/2015/9/8/chartex" xmlns:cx2="http://schemas.microsoft.com/office/drawing/2015/10/21/chartex" xmlns:cx3="http://schemas.microsoft.com/office/drawing/2016/5/9/chartex" xmlns:cx4="http://schemas.microsoft.com/office/drawing/2016/5/10/chartex" xmlns:cx5="http://schemas.microsoft.com/office/drawing/2016/5/11/chartex" xmlns:cx6="http://schemas.microsoft.com/office/drawing/2016/5/12/chartex" xmlns:cx7="http://schemas.microsoft.com/office/drawing/2016/5/13/chartex" xmlns:cx8="http://schemas.microsoft.com/office/drawing/2016/5/14/chartex" xmlns:mc="http://schemas.openxmlformats.org/markup-compatibility/2006" xmlns:aink="http://schemas.microsoft.com/office/drawing/2016/ink" xmlns:am3d="http://schemas.microsoft.com/office/drawing/2017/model3d" xmlns:o="urn:schemas-microsoft-com:office:office" xmlns:oel="http://schemas.microsoft.com/office/2019/extlst" xmlns:r="http://schemas.openxmlformats.org/officeDocument/2006/relationships" xmlns:m="http://schemas.openxmlformats.org/officeDocument/2006/math" xmlns:v="urn:schemas-microsoft-com:vml" xmlns:wp14="http://schemas.microsoft.com/office/word/2010/wordprocessingDrawing" xmlns:wp="http://schemas.openxmlformats.org/drawingml/2006/wordprocessingDrawing" xmlns:w10="urn:schemas-microsoft-com:office:word" xmlns:w="http://schemas.openxmlformats.org/wordprocessingml/2006/main" xmlns:w14="http://schemas.microsoft.com/office/word/2010/wordml" xmlns:w15="http://schemas.microsoft.com/office/word/2012/wordml" xmlns:w16cex="http://schemas.microsoft.com/office/word/2018/wordml/cex" xmlns:w16cid="http://schemas.microsoft.com/office/word/2016/wordml/cid" xmlns:w16="http://schemas.microsoft.com/office/word/2018/wordml" xmlns:w16du="http://schemas.microsoft.com/office/word/2023/wordml/word16du" xmlns:w16sdtdh="http://schemas.microsoft.com/office/word/2020/wordml/sdtdatahash" xmlns:w16sdtfl="http://schemas.microsoft.com/office/word/2024/wordml/sdtformatlock" xmlns:w16se="http://schemas.microsoft.com/office/word/2015/wordml/symex" xmlns:wpg="http://schemas.microsoft.com/office/word/2010/wordprocessingGroup" xmlns:wpi="http://schemas.microsoft.com/office/word/2010/wordprocessingInk" xmlns:wne="http://schemas.microsoft.com/office/word/2006/wordml" xmlns:wps="http://schemas.microsoft.com/office/word/2010/wordprocessingShape" mc:Ignorable="w14 w15 w16se w16cid w16 w16cex w16sdtdh w16sdtfl w16du wp14">
+<w:document xmlns:wpc="http://schemas.microsoft.com/office/word/2010/wordprocessingCanvas" xmlns:cx="http://schemas.microsoft.com/office/drawing/2014/chartex" xmlns:cx1="http://schemas.microsoft.com/office/drawing/2015/9/8/chartex" xmlns:cx2="http://schemas.microsoft.com/office/drawing/2015/10/21/chartex" xmlns:cx3="http://schemas.microsoft.com/office/drawing/2016/5/9/chartex" xmlns:cx4="http://schemas.microsoft.com/office/drawing/2016/5/10/chartex" xmlns:cx5="http://schemas.microsoft.com/office/drawing/2016/5/11/chartex" xmlns:cx6="http://schemas.microsoft.com/office/drawing/2016/5/12/chartex" xmlns:cx7="http://schemas.microsoft.com/office/drawing/2016/5/13/chartex" xmlns:cx8="http://schemas.microsoft.com/office/drawing/2016/5/14/chartex" xmlns:mc="http://schemas.openxmlformats.org/markup-compatibility/2006" xmlns:aink="http://schemas.microsoft.com/office/drawing/2016/ink" xmlns:am3d="http://schemas.microsoft.com/office/drawing/2017/model3d" xmlns:o="urn:schemas-microsoft-com:office:office" xmlns:oel="http://schemas.microsoft.com/office/2019/extlst" xmlns:r="http://schemas.openxmlformats.org/officeDocument/2006/relationships" xmlns:m="http://schemas.openxmlformats.org/officeDocument/2006/math" xmlns:v="urn:schemas-microsoft-com:vml" xmlns:wp14="http://schemas.microsoft.com/office/word/2010/wordprocessingDrawing" xmlns:wp="http://schemas.openxmlformats.org/drawingml/2006/wordprocessingDrawing" xmlns:w10="urn:schemas-microsoft-com:office:word" xmlns:w="http://schemas.openxmlformats.org/wordprocessingml/2006/main" xmlns:w14="http://schemas.microsoft.com/office/word/2010/wordml" xmlns:w15="http://schemas.microsoft.com/office/word/2012/wordml" xmlns:w16cex="http://schemas.microsoft.com/office/word/2018/wordml/cex" xmlns:w16cid="http://schemas.microsoft.com/office/word/2016/wordml/cid" xmlns:w16="http://schemas.microsoft.com/office/word/2018/wordml" xmlns:w16du="http://schemas.microsoft.com/office/word/2023/wordml/word16du" xmlns:w16sdtdh="http://schemas.microsoft.com/office/word/2020/wordml/sdtdatahash" xmlns:w16se="http://schemas.microsoft.com/office/word/2015/wordml/symex" xmlns:wpg="http://schemas.microsoft.com/office/word/2010/wordprocessingGroup" xmlns:wpi="http://schemas.microsoft.com/office/word/2010/wordprocessingInk" xmlns:wne="http://schemas.microsoft.com/office/word/2006/wordml" xmlns:wps="http://schemas.microsoft.com/office/word/2010/wordprocessingShape" mc:Ignorable="w14 w15 w16se w16cid w16 w16cex w16sdtdh w16du wp14">
   <w:body>
     <w:p>
       <w:pPr>
@@ -412,6 +412,18 @@
       </w:r>
     </w:p>
     <w:p>
+      <w:pPr>
+        <w:pStyle w:val="ListParagraph"/>
+        <w:numPr>
+          <w:ilvl w:val="0"/>
+          <w:numId w:val="99"/>
+        </w:numPr>
+      </w:pPr>
+      <w:r>
+        <w:t>I also corrected the documentation that the power output is 1 or 0.5 Watts for high and low power settings.</w:t>
+      </w:r>
+    </w:p>
+    <w:p>
       <w:r>
         <w:t>Version 1.11</w:t>
       </w:r>
@@ -451,6 +463,7 @@
         </w:numPr>
       </w:pPr>
       <w:r>
+        <w:lastRenderedPageBreak/>
         <w:t>Added main menu entries to return to the main run screen. The long press still works.</w:t>
       </w:r>
     </w:p>
@@ -468,7 +481,6 @@
         </w:numPr>
       </w:pPr>
       <w:r>
-        <w:lastRenderedPageBreak/>
         <w:t>Moved the active time display to the end of the second line on the main display.</w:t>
       </w:r>
       <w:r>
@@ -532,16 +544,8 @@
         <w:rPr>
           <w:lang w:val="en-US"/>
         </w:rPr>
-        <w:t xml:space="preserve">Added a switch to limit the frequency range to that allowed for beacon use in ITU region 2. The range is 144.276-144.300 </w:t>
-      </w:r>
-      <w:proofErr w:type="spellStart"/>
-      <w:r>
-        <w:rPr>
-          <w:lang w:val="en-US"/>
-        </w:rPr>
-        <w:t>MHz.</w:t>
-      </w:r>
-      <w:proofErr w:type="spellEnd"/>
+        <w:t>Added a switch to limit the frequency range to that allowed for beacon use in ITU region 2. The range is 144.276-144.300 MHz.</w:t>
+      </w:r>
     </w:p>
     <w:p>
       <w:r>
@@ -669,21 +673,7 @@
         <w:rPr>
           <w:lang w:val="en-US"/>
         </w:rPr>
-        <w:t xml:space="preserve">This is </w:t>
-      </w:r>
-      <w:proofErr w:type="gramStart"/>
-      <w:r>
-        <w:rPr>
-          <w:lang w:val="en-US"/>
-        </w:rPr>
-        <w:t>initial</w:t>
-      </w:r>
-      <w:proofErr w:type="gramEnd"/>
-      <w:r>
-        <w:rPr>
-          <w:lang w:val="en-US"/>
-        </w:rPr>
-        <w:t xml:space="preserve"> version when this document was first created. The software is considered mostly complete.</w:t>
+        <w:t>This is initial version when this document was first created. The software is considered mostly complete.</w:t>
       </w:r>
     </w:p>
     <w:p>
@@ -715,21 +705,7 @@
         <w:rPr>
           <w:lang w:val="en-US"/>
         </w:rPr>
-        <w:t xml:space="preserve">The Fox is a single PCB that includes an </w:t>
-      </w:r>
-      <w:proofErr w:type="gramStart"/>
-      <w:r>
-        <w:rPr>
-          <w:lang w:val="en-US"/>
-        </w:rPr>
-        <w:t>18650 battery</w:t>
-      </w:r>
-      <w:proofErr w:type="gramEnd"/>
-      <w:r>
-        <w:rPr>
-          <w:lang w:val="en-US"/>
-        </w:rPr>
-        <w:t xml:space="preserve"> holder that can have 1 or 2 batteries. There is a USB C connector on the left edge used for charging the batteries. Above that is a micro-SD slot. The SD card holds tone files and saved settings files. It can also be used to load new firmware onto the TTGO chip. There is also a USB C connector on the TTGO. It is used for downloading firmware or debugging operations. It might also be used for serial communications in a future firmware release. It is not used for charging the batteries.</w:t>
+        <w:t>The Fox is a single PCB that includes an 18650 battery holder that can have 1 or 2 batteries. There is a USB C connector on the left edge used for charging the batteries. Above that is a micro-SD slot. The SD card holds tone files and saved settings files. It can also be used to load new firmware onto the TTGO chip. There is also a USB C connector on the TTGO. It is used for downloading firmware or debugging operations. It might also be used for serial communications in a future firmware release. It is not used for charging the batteries.</w:t>
       </w:r>
     </w:p>
     <w:p>
@@ -747,94 +723,86 @@
         </w:rPr>
         <w:t xml:space="preserve">The radio functions are handled by the SA818-V on the top right. There are vents in the case to allow cooling as this module can become quite hot when transmitting at high power for longer timer intervals. Transmitting longer than one minute is not recommended. High power is about </w:t>
       </w:r>
-      <w:proofErr w:type="gramStart"/>
       <w:r>
         <w:rPr>
           <w:lang w:val="en-US"/>
         </w:rPr>
-        <w:t>5W</w:t>
-      </w:r>
-      <w:proofErr w:type="gramEnd"/>
+        <w:lastRenderedPageBreak/>
+        <w:t>1</w:t>
+      </w:r>
       <w:r>
         <w:rPr>
           <w:lang w:val="en-US"/>
         </w:rPr>
-        <w:t xml:space="preserve"> and low power is about 3W. Make sure a suitable antenna is connected to avoid damage to the radio circuit.</w:t>
-      </w:r>
-    </w:p>
-    <w:p>
-      <w:pPr>
-        <w:pStyle w:val="Heading2"/>
-      </w:pPr>
-      <w:r>
-        <w:lastRenderedPageBreak/>
-        <w:t>Batteries</w:t>
-      </w:r>
-    </w:p>
-    <w:p>
+        <w:t xml:space="preserve">W and low power is about </w:t>
+      </w:r>
       <w:r>
         <w:rPr>
           <w:lang w:val="en-US"/>
         </w:rPr>
-        <w:t xml:space="preserve">The 18650 batteries must button top style and protection is recommended. The </w:t>
-      </w:r>
-      <w:proofErr w:type="gramStart"/>
+        <w:t>0.5</w:t>
+      </w:r>
       <w:r>
         <w:rPr>
           <w:lang w:val="en-US"/>
         </w:rPr>
-        <w:t>18650 battery</w:t>
-      </w:r>
-      <w:proofErr w:type="gramEnd"/>
+        <w:t>W.</w:t>
+      </w:r>
       <w:r>
         <w:rPr>
           <w:lang w:val="en-US"/>
         </w:rPr>
-        <w:t xml:space="preserve"> length is a very loose standard and some batteries may not fit. Too long and they cannot be used. Too short, it might be possible to bend the contacts on the battery holder negative side. The battery holder is polarized to prevent insertion in the wrong direction. Do not defeat the feature or magic blue smoke may appear from the PCB!</w:t>
-      </w:r>
-    </w:p>
-    <w:p>
-      <w:pPr>
-        <w:pStyle w:val="Heading1"/>
-      </w:pPr>
-      <w:r>
-        <w:t>Run Time</w:t>
-      </w:r>
-    </w:p>
-    <w:p>
+        <w:t xml:space="preserve"> These powers are according to the data sheet and may not be entirely accurate. I have not measured them with a power meter.</w:t>
+      </w:r>
       <w:r>
         <w:rPr>
           <w:lang w:val="en-US"/>
         </w:rPr>
-        <w:t xml:space="preserve">The actual runtime depends on the transmitting time and quality of the batteries. There are many deceptively labelled 18650 batteries available. The best </w:t>
-      </w:r>
-      <w:proofErr w:type="gramStart"/>
+        <w:t xml:space="preserve"> Make sure a suitable antenna is connected to avoid damage to the radio circuit.</w:t>
+      </w:r>
+    </w:p>
+    <w:p>
+      <w:pPr>
+        <w:pStyle w:val="Heading2"/>
+      </w:pPr>
+      <w:r>
+        <w:t>Batteries</w:t>
+      </w:r>
+    </w:p>
+    <w:p>
       <w:r>
         <w:rPr>
           <w:lang w:val="en-US"/>
         </w:rPr>
-        <w:t>one</w:t>
-      </w:r>
-      <w:proofErr w:type="gramEnd"/>
+        <w:t xml:space="preserve">The 18650 batteries must </w:t>
+      </w:r>
       <w:r>
         <w:rPr>
           <w:lang w:val="en-US"/>
         </w:rPr>
-        <w:t xml:space="preserve"> </w:t>
-      </w:r>
-      <w:proofErr w:type="gramStart"/>
+        <w:t xml:space="preserve">be </w:t>
+      </w:r>
       <w:r>
         <w:rPr>
           <w:lang w:val="en-US"/>
         </w:rPr>
-        <w:t>are</w:t>
-      </w:r>
-      <w:proofErr w:type="gramEnd"/>
+        <w:t>button top style and protection is recommended. The 18650 battery length is a very loose standard and some batteries may not fit. Too long and they cannot be used. Too short, it might be possible to bend the contacts on the battery holder negative side. The battery holder is polarized to prevent insertion in the wrong direction. Do not defeat the feature or magic blue smoke may appear from the PCB!</w:t>
+      </w:r>
+    </w:p>
+    <w:p>
+      <w:pPr>
+        <w:pStyle w:val="Heading1"/>
+      </w:pPr>
+      <w:r>
+        <w:t>Run Time</w:t>
+      </w:r>
+    </w:p>
+    <w:p>
       <w:r>
         <w:rPr>
           <w:lang w:val="en-US"/>
         </w:rPr>
-        <w:t xml:space="preserve"> made by Panasonic and Sanyo. Using 1 minute transmit, 4 minutes pause, low power setting, and display dimming the Fox Radio ran for 12 hours using Panasonic batteries.</w:t>
+        <w:t>The actual runtime depends on the transmitting time and quality of the batteries. There are many deceptively labelled 18650 batteries available. The best one are made by Panasonic and Sanyo. Using 1 minute transmit, 4 minutes pause, low power setting, and display dimming the Fox Radio ran for 12 hours using Panasonic batteries.</w:t>
       </w:r>
     </w:p>
     <w:p>
@@ -862,37 +830,12 @@
         <w:t xml:space="preserve">The files are saved as .TXT and simply contain a list of tones to be played. The format is similar the hard coded files from here: </w:t>
       </w:r>
       <w:hyperlink r:id="rId9">
-        <w:proofErr w:type="spellStart"/>
         <w:r>
           <w:rPr>
             <w:rStyle w:val="Hyperlink"/>
             <w:lang w:val="en-US"/>
           </w:rPr>
-          <w:t>robsoncouto</w:t>
-        </w:r>
-        <w:proofErr w:type="spellEnd"/>
-        <w:r>
-          <w:rPr>
-            <w:rStyle w:val="Hyperlink"/>
-            <w:lang w:val="en-US"/>
-          </w:rPr>
-          <w:t>/</w:t>
-        </w:r>
-        <w:proofErr w:type="spellStart"/>
-        <w:r>
-          <w:rPr>
-            <w:rStyle w:val="Hyperlink"/>
-            <w:lang w:val="en-US"/>
-          </w:rPr>
-          <w:t>arduino</w:t>
-        </w:r>
-        <w:proofErr w:type="spellEnd"/>
-        <w:r>
-          <w:rPr>
-            <w:rStyle w:val="Hyperlink"/>
-            <w:lang w:val="en-US"/>
-          </w:rPr>
-          <w:t>-songs (github.com)</w:t>
+          <w:t>robsoncouto/arduino-songs (github.com)</w:t>
         </w:r>
       </w:hyperlink>
     </w:p>
@@ -1011,260 +954,84 @@
           <w:bCs/>
           <w:lang w:val="en-US"/>
         </w:rPr>
-        <w:t>LENGTH, %</w:t>
-      </w:r>
-      <w:proofErr w:type="spellStart"/>
-      <w:r>
+        <w:t>LENGTH, %val can be used to set the length of the note, it defaults to 90% and 10% quiet after the note</w:t>
+      </w:r>
+    </w:p>
+    <w:p>
+      <w:pPr>
+        <w:rPr>
+          <w:b/>
+          <w:bCs/>
+        </w:rPr>
+      </w:pPr>
+      <w:r>
+        <w:rPr>
+          <w:b/>
+          <w:bCs/>
+        </w:rPr>
+        <w:t>This can be used for pizzicato notes, LENGTH, 25, for example</w:t>
+      </w:r>
+    </w:p>
+    <w:p>
+      <w:pPr>
+        <w:rPr>
+          <w:b/>
+          <w:bCs/>
+        </w:rPr>
+      </w:pPr>
+      <w:r>
+        <w:rPr>
+          <w:b/>
+          <w:bCs/>
+        </w:rPr>
+        <w:t>~</w:t>
+      </w:r>
+    </w:p>
+    <w:p>
+      <w:pPr>
+        <w:rPr>
+          <w:b/>
+          <w:bCs/>
+        </w:rPr>
+      </w:pPr>
+      <w:r>
+        <w:rPr>
+          <w:b/>
+          <w:bCs/>
+        </w:rPr>
+        <w:t>TEMPO, 145,</w:t>
+      </w:r>
+    </w:p>
+    <w:p>
+      <w:pPr>
+        <w:rPr>
+          <w:b/>
+          <w:bCs/>
+        </w:rPr>
+      </w:pPr>
+      <w:r>
+        <w:rPr>
+          <w:b/>
+          <w:bCs/>
+        </w:rPr>
+        <w:t>LENGTH, 90,</w:t>
+      </w:r>
+    </w:p>
+    <w:p>
+      <w:pPr>
         <w:rPr>
           <w:b/>
           <w:bCs/>
           <w:lang w:val="en-US"/>
         </w:rPr>
-        <w:t>val</w:t>
-      </w:r>
-      <w:proofErr w:type="spellEnd"/>
+      </w:pPr>
       <w:r>
         <w:rPr>
           <w:b/>
           <w:bCs/>
           <w:lang w:val="en-US"/>
         </w:rPr>
-        <w:t xml:space="preserve"> can be used to set the length of the note, it defaults to 90% and 10% quiet after the note</w:t>
-      </w:r>
-    </w:p>
-    <w:p>
-      <w:pPr>
-        <w:rPr>
-          <w:b/>
-          <w:bCs/>
-        </w:rPr>
-      </w:pPr>
-      <w:r>
-        <w:rPr>
-          <w:b/>
-          <w:bCs/>
-        </w:rPr>
-        <w:t>This can be used for pizzicato notes, LENGTH, 25, for example</w:t>
-      </w:r>
-    </w:p>
-    <w:p>
-      <w:pPr>
-        <w:rPr>
-          <w:b/>
-          <w:bCs/>
-        </w:rPr>
-      </w:pPr>
-      <w:r>
-        <w:rPr>
-          <w:b/>
-          <w:bCs/>
-        </w:rPr>
-        <w:t>~</w:t>
-      </w:r>
-    </w:p>
-    <w:p>
-      <w:pPr>
-        <w:rPr>
-          <w:b/>
-          <w:bCs/>
-        </w:rPr>
-      </w:pPr>
-      <w:r>
-        <w:rPr>
-          <w:b/>
-          <w:bCs/>
-        </w:rPr>
-        <w:t>TEMPO, 145,</w:t>
-      </w:r>
-    </w:p>
-    <w:p>
-      <w:pPr>
-        <w:rPr>
-          <w:b/>
-          <w:bCs/>
-        </w:rPr>
-      </w:pPr>
-      <w:r>
-        <w:rPr>
-          <w:b/>
-          <w:bCs/>
-        </w:rPr>
-        <w:t>LENGTH, 90,</w:t>
-      </w:r>
-    </w:p>
-    <w:p>
-      <w:pPr>
-        <w:rPr>
-          <w:b/>
-          <w:bCs/>
-          <w:lang w:val="en-US"/>
-        </w:rPr>
-      </w:pPr>
-      <w:r>
-        <w:rPr>
-          <w:b/>
-          <w:bCs/>
-          <w:lang w:val="en-US"/>
-        </w:rPr>
-        <w:t xml:space="preserve">NOTE_E5, </w:t>
-      </w:r>
-      <w:proofErr w:type="gramStart"/>
-      <w:r>
-        <w:rPr>
-          <w:b/>
-          <w:bCs/>
-          <w:lang w:val="en-US"/>
-        </w:rPr>
-        <w:t>4,  NOTE</w:t>
-      </w:r>
-      <w:proofErr w:type="gramEnd"/>
-      <w:r>
-        <w:rPr>
-          <w:b/>
-          <w:bCs/>
-          <w:lang w:val="en-US"/>
-        </w:rPr>
-        <w:t>_B4, 8,  NOTE_C5, 8,  NOTE_D5, 4,  NOTE_C5, 8,  NOTE_B4, 8,</w:t>
-      </w:r>
-    </w:p>
-    <w:p>
-      <w:pPr>
-        <w:rPr>
-          <w:b/>
-          <w:bCs/>
-          <w:lang w:val="en-US"/>
-        </w:rPr>
-      </w:pPr>
-      <w:r>
-        <w:rPr>
-          <w:b/>
-          <w:bCs/>
-          <w:lang w:val="en-US"/>
-        </w:rPr>
-        <w:t xml:space="preserve">NOTE_A4, </w:t>
-      </w:r>
-      <w:proofErr w:type="gramStart"/>
-      <w:r>
-        <w:rPr>
-          <w:b/>
-          <w:bCs/>
-          <w:lang w:val="en-US"/>
-        </w:rPr>
-        <w:t>4,  NOTE</w:t>
-      </w:r>
-      <w:proofErr w:type="gramEnd"/>
-      <w:r>
-        <w:rPr>
-          <w:b/>
-          <w:bCs/>
-          <w:lang w:val="en-US"/>
-        </w:rPr>
-        <w:t>_A4, 8,  NOTE_C5, 8,  NOTE_E5, 4,  NOTE_D5, 8,  NOTE_C5, 8,</w:t>
-      </w:r>
-    </w:p>
-    <w:p>
-      <w:pPr>
-        <w:rPr>
-          <w:b/>
-          <w:bCs/>
-          <w:lang w:val="en-US"/>
-        </w:rPr>
-      </w:pPr>
-      <w:r>
-        <w:rPr>
-          <w:b/>
-          <w:bCs/>
-          <w:lang w:val="en-US"/>
-        </w:rPr>
-        <w:t xml:space="preserve">NOTE_B4, -4, NOTE_C5, </w:t>
-      </w:r>
-      <w:proofErr w:type="gramStart"/>
-      <w:r>
-        <w:rPr>
-          <w:b/>
-          <w:bCs/>
-          <w:lang w:val="en-US"/>
-        </w:rPr>
-        <w:t>8,  NOTE</w:t>
-      </w:r>
-      <w:proofErr w:type="gramEnd"/>
-      <w:r>
-        <w:rPr>
-          <w:b/>
-          <w:bCs/>
-          <w:lang w:val="en-US"/>
-        </w:rPr>
-        <w:t>_D5, 4,  NOTE_E5, 4,</w:t>
-      </w:r>
-    </w:p>
-    <w:p>
-      <w:pPr>
-        <w:rPr>
-          <w:b/>
-          <w:bCs/>
-          <w:lang w:val="en-US"/>
-        </w:rPr>
-      </w:pPr>
-      <w:r>
-        <w:rPr>
-          <w:b/>
-          <w:bCs/>
-          <w:lang w:val="en-US"/>
-        </w:rPr>
-        <w:t xml:space="preserve">NOTE_C5, </w:t>
-      </w:r>
-      <w:proofErr w:type="gramStart"/>
-      <w:r>
-        <w:rPr>
-          <w:b/>
-          <w:bCs/>
-          <w:lang w:val="en-US"/>
-        </w:rPr>
-        <w:t>4,  NOTE</w:t>
-      </w:r>
-      <w:proofErr w:type="gramEnd"/>
-      <w:r>
-        <w:rPr>
-          <w:b/>
-          <w:bCs/>
-          <w:lang w:val="en-US"/>
-        </w:rPr>
-        <w:t>_A4, 4,  NOTE_A4, 8,  NOTE_A4, 4,  NOTE_B4, 8,  NOTE_C5, 8,</w:t>
-      </w:r>
-    </w:p>
-    <w:p>
-      <w:pPr>
-        <w:rPr>
-          <w:b/>
-          <w:bCs/>
-          <w:lang w:val="en-US"/>
-        </w:rPr>
-      </w:pPr>
-      <w:r>
-        <w:rPr>
-          <w:b/>
-          <w:bCs/>
-          <w:lang w:val="en-US"/>
-        </w:rPr>
-        <w:t xml:space="preserve">NOTE_D5, -4, NOTE_F5, </w:t>
-      </w:r>
-      <w:proofErr w:type="gramStart"/>
-      <w:r>
-        <w:rPr>
-          <w:b/>
-          <w:bCs/>
-          <w:lang w:val="en-US"/>
-        </w:rPr>
-        <w:t>8,  NOTE</w:t>
-      </w:r>
-      <w:proofErr w:type="gramEnd"/>
-      <w:r>
-        <w:rPr>
-          <w:b/>
-          <w:bCs/>
-          <w:lang w:val="en-US"/>
-        </w:rPr>
-        <w:t>_A5, 4,  NOTE_G5, 8,  NOTE_F5, 8,</w:t>
+        <w:t>NOTE_E5, 4,  NOTE_B4, 8,  NOTE_C5, 8,  NOTE_D5, 4,  NOTE_C5, 8,  NOTE_B4, 8,</w:t>
       </w:r>
     </w:p>
     <w:p>
@@ -1282,25 +1049,24 @@
           <w:lang w:val="en-US"/>
         </w:rPr>
         <w:lastRenderedPageBreak/>
-        <w:t xml:space="preserve">NOTE_E5, -4, NOTE_C5, </w:t>
-      </w:r>
-      <w:proofErr w:type="gramStart"/>
-      <w:r>
+        <w:t>NOTE_A4, 4,  NOTE_A4, 8,  NOTE_C5, 8,  NOTE_E5, 4,  NOTE_D5, 8,  NOTE_C5, 8,</w:t>
+      </w:r>
+    </w:p>
+    <w:p>
+      <w:pPr>
         <w:rPr>
           <w:b/>
           <w:bCs/>
           <w:lang w:val="en-US"/>
         </w:rPr>
-        <w:t>8,  NOTE</w:t>
-      </w:r>
-      <w:proofErr w:type="gramEnd"/>
+      </w:pPr>
       <w:r>
         <w:rPr>
           <w:b/>
           <w:bCs/>
           <w:lang w:val="en-US"/>
         </w:rPr>
-        <w:t>_E5, 4,  NOTE_D5, 8,  NOTE_C5, 8,</w:t>
+        <w:t>NOTE_B4, -4, NOTE_C5, 8,  NOTE_D5, 4,  NOTE_E5, 4,</w:t>
       </w:r>
     </w:p>
     <w:p>
@@ -1317,25 +1083,24 @@
           <w:bCs/>
           <w:lang w:val="en-US"/>
         </w:rPr>
-        <w:t xml:space="preserve">NOTE_B4, </w:t>
-      </w:r>
-      <w:proofErr w:type="gramStart"/>
-      <w:r>
+        <w:t>NOTE_C5, 4,  NOTE_A4, 4,  NOTE_A4, 8,  NOTE_A4, 4,  NOTE_B4, 8,  NOTE_C5, 8,</w:t>
+      </w:r>
+    </w:p>
+    <w:p>
+      <w:pPr>
         <w:rPr>
           <w:b/>
           <w:bCs/>
           <w:lang w:val="en-US"/>
         </w:rPr>
-        <w:t>4,  NOTE</w:t>
-      </w:r>
-      <w:proofErr w:type="gramEnd"/>
+      </w:pPr>
       <w:r>
         <w:rPr>
           <w:b/>
           <w:bCs/>
           <w:lang w:val="en-US"/>
         </w:rPr>
-        <w:t>_B4, 8,  NOTE_C5, 8,  NOTE_D5, 4,  NOTE_E5, 4,</w:t>
+        <w:t>NOTE_D5, -4, NOTE_F5, 8,  NOTE_A5, 4,  NOTE_G5, 8,  NOTE_F5, 8,</w:t>
       </w:r>
     </w:p>
     <w:p>
@@ -1352,25 +1117,41 @@
           <w:bCs/>
           <w:lang w:val="en-US"/>
         </w:rPr>
-        <w:t xml:space="preserve">NOTE_C5, </w:t>
-      </w:r>
-      <w:proofErr w:type="gramStart"/>
-      <w:r>
+        <w:t>NOTE_E5, -4, NOTE_C5, 8,  NOTE_E5, 4,  NOTE_D5, 8,  NOTE_C5, 8,</w:t>
+      </w:r>
+    </w:p>
+    <w:p>
+      <w:pPr>
         <w:rPr>
           <w:b/>
           <w:bCs/>
           <w:lang w:val="en-US"/>
         </w:rPr>
-        <w:t>4,  NOTE</w:t>
-      </w:r>
-      <w:proofErr w:type="gramEnd"/>
+      </w:pPr>
       <w:r>
         <w:rPr>
           <w:b/>
           <w:bCs/>
           <w:lang w:val="en-US"/>
         </w:rPr>
-        <w:t>_A4, 4,  NOTE_A4, 4, REST, 4,</w:t>
+        <w:t>NOTE_B4, 4,  NOTE_B4, 8,  NOTE_C5, 8,  NOTE_D5, 4,  NOTE_E5, 4,</w:t>
+      </w:r>
+    </w:p>
+    <w:p>
+      <w:pPr>
+        <w:rPr>
+          <w:b/>
+          <w:bCs/>
+          <w:lang w:val="en-US"/>
+        </w:rPr>
+      </w:pPr>
+      <w:r>
+        <w:rPr>
+          <w:b/>
+          <w:bCs/>
+          <w:lang w:val="en-US"/>
+        </w:rPr>
+        <w:t>NOTE_C5, 4,  NOTE_A4, 4,  NOTE_A4, 4, REST, 4,</w:t>
       </w:r>
     </w:p>
     <w:p>
@@ -1386,21 +1167,7 @@
         <w:rPr>
           <w:lang w:val="en-US"/>
         </w:rPr>
-        <w:t xml:space="preserve">The new file must be put on the SD card and named </w:t>
-      </w:r>
-      <w:proofErr w:type="spellStart"/>
-      <w:r>
-        <w:rPr>
-          <w:lang w:val="en-US"/>
-        </w:rPr>
-        <w:t>RadioFox.bin</w:t>
-      </w:r>
-      <w:proofErr w:type="spellEnd"/>
-      <w:r>
-        <w:rPr>
-          <w:lang w:val="en-US"/>
-        </w:rPr>
-        <w:t xml:space="preserve">. The system menu has an entry </w:t>
+        <w:t xml:space="preserve">The new file must be put on the SD card and named RadioFox.bin. The system menu has an entry </w:t>
       </w:r>
       <w:r>
         <w:rPr>
@@ -1414,21 +1181,7 @@
         <w:rPr>
           <w:lang w:val="en-US"/>
         </w:rPr>
-        <w:t xml:space="preserve"> that will attempt to load this file. Confirmation will be required from the dial, </w:t>
-      </w:r>
-      <w:proofErr w:type="gramStart"/>
-      <w:r>
-        <w:rPr>
-          <w:lang w:val="en-US"/>
-        </w:rPr>
-        <w:t>After</w:t>
-      </w:r>
-      <w:proofErr w:type="gramEnd"/>
-      <w:r>
-        <w:rPr>
-          <w:lang w:val="en-US"/>
-        </w:rPr>
-        <w:t xml:space="preserve"> loading the BIN file can optionally be erased.</w:t>
+        <w:t xml:space="preserve"> that will attempt to load this file. Confirmation will be required from the dial, After loading the BIN file can optionally be erased.</w:t>
       </w:r>
     </w:p>
     <w:p>
@@ -1453,21 +1206,7 @@
         <w:rPr>
           <w:lang w:val="en-US"/>
         </w:rPr>
-        <w:t xml:space="preserve">Please feel free to request additional commands. I’m sure there are other usual things that can be done remotely using DTMF signals. Also note that these functions have not yet been tested extensively so there may be some bugs in the code. I will </w:t>
-      </w:r>
-      <w:proofErr w:type="gramStart"/>
-      <w:r>
-        <w:rPr>
-          <w:lang w:val="en-US"/>
-        </w:rPr>
-        <w:t>fix</w:t>
-      </w:r>
-      <w:proofErr w:type="gramEnd"/>
-      <w:r>
-        <w:rPr>
-          <w:lang w:val="en-US"/>
-        </w:rPr>
-        <w:t xml:space="preserve"> as soon as I can after I find out what they are.</w:t>
+        <w:t>Please feel free to request additional commands. I’m sure there are other usual things that can be done remotely using DTMF signals. Also note that these functions have not yet been tested extensively so there may be some bugs in the code. I will fix as soon as I can after I find out what they are.</w:t>
       </w:r>
     </w:p>
     <w:p>
@@ -1539,6 +1278,7 @@
         <w:pStyle w:val="Heading2"/>
       </w:pPr>
       <w:r>
+        <w:lastRenderedPageBreak/>
         <w:t>DTMF *</w:t>
       </w:r>
       <w:r>
@@ -1558,7 +1298,6 @@
         <w:pStyle w:val="Heading1"/>
       </w:pPr>
       <w:r>
-        <w:lastRenderedPageBreak/>
         <w:t>Button Operations</w:t>
       </w:r>
     </w:p>
@@ -1669,14 +1408,12 @@
       <w:r>
         <w:t xml:space="preserve"> The top one is called </w:t>
       </w:r>
-      <w:proofErr w:type="gramStart"/>
       <w:r>
         <w:t>B</w:t>
       </w:r>
       <w:r>
         <w:t>0</w:t>
       </w:r>
-      <w:proofErr w:type="gramEnd"/>
       <w:r>
         <w:t xml:space="preserve"> and the bottom one is called </w:t>
       </w:r>
@@ -2046,21 +1783,14 @@
         <w:rPr>
           <w:lang w:val="en-US"/>
         </w:rPr>
-        <w:t xml:space="preserve">. After a dial </w:t>
-      </w:r>
-      <w:proofErr w:type="gramStart"/>
+        <w:t xml:space="preserve">. After a dial click the increment will change to 10 and dial will </w:t>
+      </w:r>
       <w:r>
         <w:rPr>
           <w:lang w:val="en-US"/>
         </w:rPr>
-        <w:t>click</w:t>
-      </w:r>
-      <w:proofErr w:type="gramEnd"/>
-      <w:r>
-        <w:rPr>
-          <w:lang w:val="en-US"/>
-        </w:rPr>
-        <w:t xml:space="preserve"> the increment will change to 10 and dial will add and subtract </w:t>
+        <w:lastRenderedPageBreak/>
+        <w:t xml:space="preserve">add and subtract </w:t>
       </w:r>
       <w:r>
         <w:rPr>
@@ -2138,7 +1868,6 @@
       <w:bookmarkEnd w:id="6"/>
       <w:bookmarkEnd w:id="7"/>
       <w:r>
-        <w:lastRenderedPageBreak/>
         <w:t xml:space="preserve">Rotating </w:t>
       </w:r>
       <w:r>
@@ -2183,15 +1912,7 @@
         <w:t>,</w:t>
       </w:r>
       <w:r>
-        <w:t xml:space="preserve"> </w:t>
-      </w:r>
-      <w:proofErr w:type="spellStart"/>
-      <w:r>
-        <w:t>boolean</w:t>
-      </w:r>
-      <w:proofErr w:type="spellEnd"/>
-      <w:r>
-        <w:t xml:space="preserve"> values toggle with each click.</w:t>
+        <w:t xml:space="preserve"> boolean values toggle with each click.</w:t>
       </w:r>
       <w:r>
         <w:t xml:space="preserve"> Multiple selections cycle through all the available options.</w:t>
@@ -2206,18 +1927,10 @@
         <w:t xml:space="preserve">indicates the active menu line. A + in front of the menu means another menu will be activated. </w:t>
       </w:r>
       <w:r>
-        <w:t>Any menu item starting with ‘</w:t>
-      </w:r>
-      <w:proofErr w:type="gramStart"/>
-      <w:r>
-        <w:t>-‘</w:t>
-      </w:r>
-      <w:r>
-        <w:t xml:space="preserve"> goes</w:t>
-      </w:r>
-      <w:proofErr w:type="gramEnd"/>
-      <w:r>
-        <w:t xml:space="preserve"> back to the previous menu when clicked. A</w:t>
+        <w:t>Any menu item starting with ‘-‘</w:t>
+      </w:r>
+      <w:r>
+        <w:t xml:space="preserve"> goes back to the previous menu when clicked. A</w:t>
       </w:r>
       <w:r>
         <w:t xml:space="preserve"> dial</w:t>
@@ -2357,13 +2070,8 @@
         <w:ind w:left="1440"/>
       </w:pPr>
       <w:r>
-        <w:t xml:space="preserve">Toggle </w:t>
-      </w:r>
-      <w:proofErr w:type="spellStart"/>
-      <w:r>
-        <w:t>booleans</w:t>
-      </w:r>
-      <w:proofErr w:type="spellEnd"/>
+        <w:t>Toggle booleans</w:t>
+      </w:r>
     </w:p>
     <w:p>
       <w:pPr>
@@ -2418,53 +2126,29 @@
         <w:t xml:space="preserve"> The bottom of the screen shows the</w:t>
       </w:r>
       <w:r>
-        <w:t xml:space="preserve"> battery status on the right if it has been enabled. This is related to the current battery voltage and will drop while transmitting. There are also 4 </w:t>
-      </w:r>
-      <w:proofErr w:type="gramStart"/>
-      <w:r>
-        <w:t>LED’s</w:t>
-      </w:r>
-      <w:proofErr w:type="gramEnd"/>
-      <w:r>
-        <w:t xml:space="preserve"> on the PCB that can be seen through</w:t>
+        <w:t xml:space="preserve"> battery status on the right if it has been enabled. This is related to the current battery voltage and will drop while transmitting. There are also 4 LED’s on the PCB that can be seen through</w:t>
       </w:r>
       <w:r>
         <w:t xml:space="preserve"> the slot on the </w:t>
       </w:r>
       <w:r>
+        <w:lastRenderedPageBreak/>
         <w:t>side</w:t>
       </w:r>
       <w:r>
         <w:t xml:space="preserve"> of the case</w:t>
       </w:r>
       <w:r>
-        <w:t xml:space="preserve">. These </w:t>
-      </w:r>
-      <w:proofErr w:type="gramStart"/>
-      <w:r>
-        <w:t>LED’s</w:t>
-      </w:r>
-      <w:proofErr w:type="gramEnd"/>
-      <w:r>
-        <w:t xml:space="preserve"> are controlled by the battery charger circuit and indicate the battery status during running and charging.</w:t>
+        <w:t>. These LED’s are controlled by the battery charger circuit and indicate the battery status during running and charging.</w:t>
       </w:r>
     </w:p>
     <w:p/>
     <w:p>
       <w:r>
-        <w:lastRenderedPageBreak/>
         <w:t>During transmitting the bottom left shows an animated red dot. In a future firmware update the</w:t>
       </w:r>
       <w:r>
-        <w:t xml:space="preserve"> received DTMF characters will be </w:t>
-      </w:r>
-      <w:proofErr w:type="gramStart"/>
-      <w:r>
-        <w:t>display</w:t>
-      </w:r>
-      <w:proofErr w:type="gramEnd"/>
-      <w:r>
-        <w:t xml:space="preserve"> next to this.</w:t>
+        <w:t xml:space="preserve"> received DTMF characters will be display next to this.</w:t>
       </w:r>
     </w:p>
     <w:p>
@@ -2479,13 +2163,8 @@
       <w:r>
         <w:t xml:space="preserve">The following sections detail each entry in </w:t>
       </w:r>
-      <w:proofErr w:type="gramStart"/>
-      <w:r>
-        <w:t>all of</w:t>
-      </w:r>
-      <w:proofErr w:type="gramEnd"/>
-      <w:r>
-        <w:t xml:space="preserve"> the menus</w:t>
+      <w:r>
+        <w:t>all of the menus</w:t>
       </w:r>
       <w:r>
         <w:t xml:space="preserve"> starting with the main or top menu</w:t>
@@ -2512,15 +2191,7 @@
         <w:t>’</w:t>
       </w:r>
       <w:r>
-        <w:t xml:space="preserve"> or a ‘</w:t>
-      </w:r>
-      <w:proofErr w:type="gramStart"/>
-      <w:r>
-        <w:t>-‘ to</w:t>
-      </w:r>
-      <w:proofErr w:type="gramEnd"/>
-      <w:r>
-        <w:t xml:space="preserve"> indicate a range</w:t>
+        <w:t xml:space="preserve"> or a ‘-‘ to indicate a range</w:t>
       </w:r>
       <w:r>
         <w:t>.</w:t>
@@ -2545,15 +2216,7 @@
         <w:t xml:space="preserve"> Some menu entries may depend on other menu items </w:t>
       </w:r>
       <w:r>
-        <w:t xml:space="preserve">settings. For </w:t>
-      </w:r>
-      <w:proofErr w:type="gramStart"/>
-      <w:r>
-        <w:t>example</w:t>
-      </w:r>
-      <w:proofErr w:type="gramEnd"/>
-      <w:r>
-        <w:t xml:space="preserve"> the audio file name menu item is hidden unless </w:t>
+        <w:t xml:space="preserve">settings. For example the audio file name menu item is hidden unless </w:t>
       </w:r>
       <w:r>
         <w:t>“Play Audio File” is Yes.</w:t>
@@ -2572,11 +2235,7 @@
         <w:pStyle w:val="Heading3"/>
       </w:pPr>
       <w:r>
-        <w:t xml:space="preserve">XMIT: </w:t>
-      </w:r>
-      <w:proofErr w:type="spellStart"/>
-      <w:r>
-        <w:t>On</w:t>
+        <w:t>XMIT: On</w:t>
       </w:r>
       <w:r>
         <w:t>|</w:t>
@@ -2584,38 +2243,13 @@
       <w:r>
         <w:t>Off</w:t>
       </w:r>
-      <w:proofErr w:type="spellEnd"/>
-    </w:p>
-    <w:p>
-      <w:r>
-        <w:t xml:space="preserve">This must be set to </w:t>
-      </w:r>
-      <w:proofErr w:type="gramStart"/>
-      <w:r>
-        <w:t>On</w:t>
-      </w:r>
-      <w:proofErr w:type="gramEnd"/>
-      <w:r>
-        <w:t xml:space="preserve"> for the radio to begin </w:t>
-      </w:r>
-      <w:r>
-        <w:t xml:space="preserve">transmitting. If saved as </w:t>
-      </w:r>
-      <w:proofErr w:type="gramStart"/>
-      <w:r>
-        <w:t>On</w:t>
-      </w:r>
-      <w:proofErr w:type="gramEnd"/>
-      <w:r>
-        <w:t xml:space="preserve"> then the radio will start sending right after booting. If it is </w:t>
-      </w:r>
-      <w:proofErr w:type="gramStart"/>
-      <w:r>
-        <w:t>Off</w:t>
-      </w:r>
-      <w:proofErr w:type="gramEnd"/>
-      <w:r>
-        <w:t xml:space="preserve"> it will not automatically start sending. It can be toggle</w:t>
+    </w:p>
+    <w:p>
+      <w:r>
+        <w:t xml:space="preserve">This must be set to On for the radio to begin </w:t>
+      </w:r>
+      <w:r>
+        <w:t>transmitting. If saved as On then the radio will start sending right after booting. If it is Off it will not automatically start sending. It can be toggle</w:t>
       </w:r>
       <w:r>
         <w:t>d</w:t>
@@ -2632,11 +2266,7 @@
         <w:pStyle w:val="Heading3"/>
       </w:pPr>
       <w:r>
-        <w:t xml:space="preserve">TX Power: </w:t>
-      </w:r>
-      <w:proofErr w:type="spellStart"/>
-      <w:r>
-        <w:t>High</w:t>
+        <w:t>TX Power: High</w:t>
       </w:r>
       <w:r>
         <w:t>|</w:t>
@@ -2648,19 +2278,22 @@
         </w:rPr>
         <w:t>Low</w:t>
       </w:r>
-      <w:proofErr w:type="spellEnd"/>
     </w:p>
     <w:p>
       <w:r>
         <w:t xml:space="preserve">High power is about </w:t>
       </w:r>
-      <w:proofErr w:type="gramStart"/>
-      <w:r>
-        <w:t>5W</w:t>
-      </w:r>
-      <w:proofErr w:type="gramEnd"/>
-      <w:r>
-        <w:t xml:space="preserve"> and low power is 3W. These are the only</w:t>
+      <w:r>
+        <w:t>1</w:t>
+      </w:r>
+      <w:r>
+        <w:t xml:space="preserve">W and low power is </w:t>
+      </w:r>
+      <w:r>
+        <w:t>0.5</w:t>
+      </w:r>
+      <w:r>
+        <w:t>W. These are the only</w:t>
       </w:r>
       <w:r>
         <w:t xml:space="preserve"> values allowed by the SA818 radio. If lower power is desired an attenuator can be attached to the </w:t>
@@ -2700,11 +2333,7 @@
         <w:t>:</w:t>
       </w:r>
       <w:r>
-        <w:t xml:space="preserve"> </w:t>
-      </w:r>
-      <w:proofErr w:type="spellStart"/>
-      <w:r>
-        <w:t>Yes|</w:t>
+        <w:t xml:space="preserve"> Yes|</w:t>
       </w:r>
       <w:r>
         <w:rPr>
@@ -2713,7 +2342,6 @@
         </w:rPr>
         <w:t>No</w:t>
       </w:r>
-      <w:proofErr w:type="spellEnd"/>
     </w:p>
     <w:p>
       <w:r>
@@ -2728,11 +2356,7 @@
         <w:pStyle w:val="Heading3"/>
       </w:pPr>
       <w:r>
-        <w:t xml:space="preserve">Send GPS: </w:t>
-      </w:r>
-      <w:proofErr w:type="spellStart"/>
-      <w:r>
-        <w:t>Yes|</w:t>
+        <w:t>Send GPS: Yes|</w:t>
       </w:r>
       <w:r>
         <w:rPr>
@@ -2741,7 +2365,6 @@
         </w:rPr>
         <w:t>NO</w:t>
       </w:r>
-      <w:proofErr w:type="spellEnd"/>
       <w:r>
         <w:t xml:space="preserve"> (beacon mode only)</w:t>
       </w:r>
@@ -2754,13 +2377,8 @@
         <w:t xml:space="preserve">ude and longitude values. The values must be entered manually from a phone </w:t>
       </w:r>
       <w:r>
-        <w:t xml:space="preserve">or GPS device. A future version of the hardware may have a built-in GPS </w:t>
-      </w:r>
-      <w:proofErr w:type="gramStart"/>
-      <w:r>
-        <w:t>module</w:t>
-      </w:r>
-      <w:proofErr w:type="gramEnd"/>
+        <w:t>or GPS device. A future version of the hardware may have a built-in GPS module</w:t>
+      </w:r>
       <w:r>
         <w:t xml:space="preserve"> or it may be able to connect to a serial GPS device using the USB connection.</w:t>
       </w:r>
@@ -2770,18 +2388,15 @@
         <w:pStyle w:val="Heading3"/>
       </w:pPr>
       <w:r>
+        <w:lastRenderedPageBreak/>
         <w:t xml:space="preserve">Latitude: </w:t>
       </w:r>
       <w:r>
         <w:t>+/-</w:t>
       </w:r>
-      <w:proofErr w:type="spellStart"/>
-      <w:proofErr w:type="gramStart"/>
       <w:r>
         <w:t>n.nnnnnn</w:t>
       </w:r>
-      <w:proofErr w:type="spellEnd"/>
-      <w:proofErr w:type="gramEnd"/>
       <w:r>
         <w:t xml:space="preserve"> (</w:t>
       </w:r>
@@ -2828,18 +2443,7 @@
         <w:pStyle w:val="Heading3"/>
       </w:pPr>
       <w:r>
-        <w:lastRenderedPageBreak/>
-        <w:t>Longitude: +/-</w:t>
-      </w:r>
-      <w:proofErr w:type="spellStart"/>
-      <w:proofErr w:type="gramStart"/>
-      <w:r>
-        <w:t>n.nnnnnn</w:t>
-      </w:r>
-      <w:proofErr w:type="spellEnd"/>
-      <w:proofErr w:type="gramEnd"/>
-      <w:r>
-        <w:t xml:space="preserve"> (Send </w:t>
+        <w:t xml:space="preserve">Longitude: +/-n.nnnnnn (Send </w:t>
       </w:r>
       <w:r>
         <w:rPr>
@@ -2943,13 +2547,8 @@
         <w:t>Play Audio File</w:t>
       </w:r>
       <w:r>
-        <w:t xml:space="preserve">: </w:t>
-      </w:r>
-      <w:proofErr w:type="spellStart"/>
-      <w:r>
-        <w:t>Yes|No</w:t>
-      </w:r>
-      <w:proofErr w:type="spellEnd"/>
+        <w:t>: Yes|No</w:t>
+      </w:r>
     </w:p>
     <w:p>
       <w:r>
@@ -2973,37 +2572,13 @@
     </w:p>
     <w:p>
       <w:r>
-        <w:t xml:space="preserve">This menu item is only visible if the previous item is set to Yes. Clicking the dial will list </w:t>
-      </w:r>
-      <w:proofErr w:type="gramStart"/>
-      <w:r>
-        <w:t>all of</w:t>
-      </w:r>
-      <w:proofErr w:type="gramEnd"/>
-      <w:r>
-        <w:t xml:space="preserve"> the </w:t>
-      </w:r>
-      <w:r>
-        <w:t xml:space="preserve">*.txt files on the SD card. The dial is rotated to highlight a </w:t>
-      </w:r>
-      <w:proofErr w:type="gramStart"/>
-      <w:r>
-        <w:t>file</w:t>
-      </w:r>
-      <w:proofErr w:type="gramEnd"/>
-      <w:r>
-        <w:t xml:space="preserve"> and a long press will set it</w:t>
-      </w:r>
-      <w:r>
-        <w:t xml:space="preserve">. Note that a click of dial just exits the list of </w:t>
-      </w:r>
-      <w:proofErr w:type="gramStart"/>
-      <w:r>
-        <w:t>file</w:t>
-      </w:r>
-      <w:proofErr w:type="gramEnd"/>
-      <w:r>
-        <w:t xml:space="preserve"> with no selection being performed.</w:t>
+        <w:t xml:space="preserve">This menu item is only visible if the previous item is set to Yes. Clicking the dial will list all of the </w:t>
+      </w:r>
+      <w:r>
+        <w:t>*.txt files on the SD card. The dial is rotated to highlight a file and a long press will set it</w:t>
+      </w:r>
+      <w:r>
+        <w:t>. Note that a click of dial just exits the list of file with no selection being performed.</w:t>
       </w:r>
     </w:p>
     <w:p>
@@ -3063,13 +2638,8 @@
         <w:pStyle w:val="Heading3"/>
       </w:pPr>
       <w:r>
-        <w:t xml:space="preserve">Timer Mode: </w:t>
-      </w:r>
-      <w:proofErr w:type="spellStart"/>
-      <w:r>
-        <w:t>Fixed|Random</w:t>
-      </w:r>
-      <w:proofErr w:type="spellEnd"/>
+        <w:t>Timer Mode: Fixed|Random</w:t>
+      </w:r>
     </w:p>
     <w:p>
       <w:r>
@@ -3079,18 +2649,14 @@
         <w:t xml:space="preserve"> mode the sending time and pause timer are controlled by the Send and Pause values</w:t>
       </w:r>
       <w:r>
-        <w:t xml:space="preserve"> and are always the same. In Random mode the transmit time and pause time are randomly chosen</w:t>
-      </w:r>
-      <w:r>
-        <w:t xml:space="preserve"> from the allowed values set in the Min and Max values for TX Send and Pause. This makes the timing less predictable and </w:t>
-      </w:r>
-      <w:proofErr w:type="gramStart"/>
-      <w:r>
-        <w:t>make</w:t>
-      </w:r>
-      <w:proofErr w:type="gramEnd"/>
-      <w:r>
-        <w:t xml:space="preserve"> the game a little bit harder.</w:t>
+        <w:t xml:space="preserve"> and are always the same. In Random mode the transmit time and pause time are randomly </w:t>
+      </w:r>
+      <w:r>
+        <w:lastRenderedPageBreak/>
+        <w:t>chosen</w:t>
+      </w:r>
+      <w:r>
+        <w:t xml:space="preserve"> from the allowed values set in the Min and Max values for TX Send and Pause. This makes the timing less predictable and make the game a little bit harder.</w:t>
       </w:r>
       <w:r>
         <w:t xml:space="preserve"> Keep your ears on!</w:t>
@@ -3101,7 +2667,6 @@
         <w:pStyle w:val="Heading3"/>
       </w:pPr>
       <w:r>
-        <w:lastRenderedPageBreak/>
         <w:t xml:space="preserve">TX Send: </w:t>
       </w:r>
       <w:r>
@@ -3144,15 +2709,7 @@
         <w:t>This is the pause time between transmissions</w:t>
       </w:r>
       <w:r>
-        <w:t xml:space="preserve">. Longer times let the radio cool off and save the battery for longer </w:t>
-      </w:r>
-      <w:proofErr w:type="gramStart"/>
-      <w:r>
-        <w:t>run</w:t>
-      </w:r>
-      <w:proofErr w:type="gramEnd"/>
-      <w:r>
-        <w:t xml:space="preserve"> times.</w:t>
+        <w:t>. Longer times let the radio cool off and save the battery for longer run times.</w:t>
       </w:r>
     </w:p>
     <w:p>
@@ -3218,28 +2775,12 @@
         <w:pStyle w:val="Heading3"/>
       </w:pPr>
       <w:r>
-        <w:t xml:space="preserve">TX Stop: </w:t>
-      </w:r>
-      <w:proofErr w:type="spellStart"/>
-      <w:r>
-        <w:t>Immediate|Finish</w:t>
-      </w:r>
-      <w:proofErr w:type="spellEnd"/>
-      <w:r>
-        <w:t xml:space="preserve"> Cycle</w:t>
-      </w:r>
-    </w:p>
-    <w:p>
-      <w:r>
-        <w:t xml:space="preserve">During transmit time the Beacon, Call Sign, and Audio are continuously sent. At the end of the transmission time this option controls whether the transmission stops immediately </w:t>
-      </w:r>
-      <w:proofErr w:type="gramStart"/>
-      <w:r>
-        <w:t>of</w:t>
-      </w:r>
-      <w:proofErr w:type="gramEnd"/>
-      <w:r>
-        <w:t xml:space="preserve"> waits to stop until the entire cycle is finished.</w:t>
+        <w:t>TX Stop: Immediate|Finish Cycle</w:t>
+      </w:r>
+    </w:p>
+    <w:p>
+      <w:r>
+        <w:t>During transmit time the Beacon, Call Sign, and Audio are continuously sent. At the end of the transmission time this option controls whether the transmission stops immediately of waits to stop until the entire cycle is finished.</w:t>
       </w:r>
     </w:p>
     <w:p/>
@@ -3254,15 +2795,7 @@
         <w:t xml:space="preserve"> time to something less than</w:t>
       </w:r>
       <w:r>
-        <w:t xml:space="preserve"> the time to perform a complete cycle and set this option to “Finish Cycle”. The </w:t>
-      </w:r>
-      <w:proofErr w:type="gramStart"/>
-      <w:r>
-        <w:t>transmit  cycle</w:t>
-      </w:r>
-      <w:proofErr w:type="gramEnd"/>
-      <w:r>
-        <w:t xml:space="preserve"> will begin, the timer will expire, but the current cycle will complete before stopping</w:t>
+        <w:t xml:space="preserve"> the time to perform a complete cycle and set this option to “Finish Cycle”. The transmit  cycle will begin, the timer will expire, but the current cycle will complete before stopping</w:t>
       </w:r>
       <w:r>
         <w:t>.</w:t>
@@ -3273,25 +2806,12 @@
         <w:pStyle w:val="Heading3"/>
       </w:pPr>
       <w:r>
-        <w:t xml:space="preserve">Radio Pause: </w:t>
-      </w:r>
-      <w:proofErr w:type="spellStart"/>
-      <w:r>
-        <w:t>Sleep|Awake</w:t>
-      </w:r>
-      <w:proofErr w:type="spellEnd"/>
-    </w:p>
-    <w:p>
-      <w:r>
-        <w:t xml:space="preserve">During pause time the radio can be put into sleep mode. This lowers the power consumption and lets the battery last longer. </w:t>
-      </w:r>
-      <w:proofErr w:type="gramStart"/>
-      <w:r>
-        <w:t>However</w:t>
-      </w:r>
-      <w:proofErr w:type="gramEnd"/>
-      <w:r>
-        <w:t xml:space="preserve"> note that this also means that the DTMF commands are disabled since the radio is asleep!</w:t>
+        <w:t>Radio Pause: Sleep|Awake</w:t>
+      </w:r>
+    </w:p>
+    <w:p>
+      <w:r>
+        <w:t>During pause time the radio can be put into sleep mode. This lowers the power consumption and lets the battery last longer. However note that this also means that the DTMF commands are disabled since the radio is asleep!</w:t>
       </w:r>
     </w:p>
     <w:p>
@@ -3502,26 +3022,10 @@
     </w:p>
     <w:p>
       <w:r>
-        <w:t xml:space="preserve">When the radio is in either send or pause mode this command will cancel the </w:t>
-      </w:r>
-      <w:proofErr w:type="gramStart"/>
-      <w:r>
-        <w:t>timer</w:t>
-      </w:r>
-      <w:proofErr w:type="gramEnd"/>
-      <w:r>
-        <w:t xml:space="preserve"> and the next mo</w:t>
-      </w:r>
-      <w:r>
-        <w:t xml:space="preserve">de will start. For </w:t>
-      </w:r>
-      <w:proofErr w:type="gramStart"/>
-      <w:r>
-        <w:t>example</w:t>
-      </w:r>
-      <w:proofErr w:type="gramEnd"/>
-      <w:r>
-        <w:t xml:space="preserve"> if you want to cancel</w:t>
+        <w:t>When the radio is in either send or pause mode this command will cancel the timer and the next mo</w:t>
+      </w:r>
+      <w:r>
+        <w:t>de will start. For example if you want to cancel</w:t>
       </w:r>
       <w:r>
         <w:t xml:space="preserve"> the pause and go to transmit, use this option. It can also be done by long pressing B0.</w:t>
@@ -3566,15 +3070,7 @@
     </w:p>
     <w:p>
       <w:r>
-        <w:t xml:space="preserve">This command saves the current settings into the selected file. If it already </w:t>
-      </w:r>
-      <w:proofErr w:type="gramStart"/>
-      <w:r>
-        <w:t>exists</w:t>
-      </w:r>
-      <w:proofErr w:type="gramEnd"/>
-      <w:r>
-        <w:t xml:space="preserve"> the user will be asked to confirm overwriting the file.</w:t>
+        <w:t>This command saves the current settings into the selected file. If it already exists the user will be asked to confirm overwriting the file.</w:t>
       </w:r>
     </w:p>
     <w:p>
@@ -3587,15 +3083,7 @@
     </w:p>
     <w:p>
       <w:r>
-        <w:t xml:space="preserve">This command asks the user for the name and then sets </w:t>
-      </w:r>
-      <w:proofErr w:type="gramStart"/>
-      <w:r>
-        <w:t>all of</w:t>
-      </w:r>
-      <w:proofErr w:type="gramEnd"/>
-      <w:r>
-        <w:t xml:space="preserve"> the system settings except the battery calibration using the values in the file.</w:t>
+        <w:t>This command asks the user for the name and then sets all of the system settings except the battery calibration using the values in the file.</w:t>
       </w:r>
     </w:p>
     <w:p>
@@ -3711,15 +3199,7 @@
     </w:p>
     <w:p>
       <w:r>
-        <w:t xml:space="preserve">Lines of text that </w:t>
-      </w:r>
-      <w:proofErr w:type="gramStart"/>
-      <w:r>
-        <w:t>too</w:t>
-      </w:r>
-      <w:proofErr w:type="gramEnd"/>
-      <w:r>
-        <w:t xml:space="preserve"> long for the display will scroll back and forth. The following settings control the speed.</w:t>
+        <w:t>Lines of text that too long for the display will scroll back and forth. The following settings control the speed.</w:t>
       </w:r>
     </w:p>
     <w:p>
@@ -3800,15 +3280,7 @@
         <w:pStyle w:val="Heading4"/>
       </w:pPr>
       <w:r>
-        <w:t>Text/</w:t>
-      </w:r>
-      <w:proofErr w:type="spellStart"/>
-      <w:r>
-        <w:t>HiLite</w:t>
-      </w:r>
-      <w:proofErr w:type="spellEnd"/>
-      <w:r>
-        <w:t xml:space="preserve"> Colors</w:t>
+        <w:t>Text/HiLite Colors</w:t>
       </w:r>
     </w:p>
     <w:p>
@@ -3829,15 +3301,8 @@
         <w:pStyle w:val="Heading4"/>
       </w:pPr>
       <w:r>
-        <w:t xml:space="preserve">Direction: </w:t>
-      </w:r>
-      <w:proofErr w:type="spellStart"/>
-      <w:proofErr w:type="gramStart"/>
-      <w:r>
-        <w:t>Normal:Reverse</w:t>
-      </w:r>
-      <w:proofErr w:type="spellEnd"/>
-      <w:proofErr w:type="gramEnd"/>
+        <w:t>Direction: Normal:Reverse</w:t>
+      </w:r>
     </w:p>
     <w:p>
       <w:r>
@@ -3870,15 +3335,7 @@
     </w:p>
     <w:p>
       <w:r>
-        <w:t xml:space="preserve">Since the PCB was designed with 10% resistors for measuring the battery voltage some calibration is needed. A future PCB will probably use better </w:t>
-      </w:r>
-      <w:proofErr w:type="gramStart"/>
-      <w:r>
-        <w:t>resistors</w:t>
-      </w:r>
-      <w:proofErr w:type="gramEnd"/>
-      <w:r>
-        <w:t xml:space="preserve"> so this won’t be needed.</w:t>
+        <w:t>Since the PCB was designed with 10% resistors for measuring the battery voltage some calibration is needed. A future PCB will probably use better resistors so this won’t be needed.</w:t>
       </w:r>
     </w:p>
     <w:p>
@@ -3886,13 +3343,8 @@
         <w:pStyle w:val="Heading4"/>
       </w:pPr>
       <w:r>
-        <w:t xml:space="preserve">Show Battery: </w:t>
-      </w:r>
-      <w:proofErr w:type="spellStart"/>
-      <w:r>
-        <w:t>Yes|No</w:t>
-      </w:r>
-      <w:proofErr w:type="spellEnd"/>
+        <w:t>Show Battery: Yes|No</w:t>
+      </w:r>
     </w:p>
     <w:p>
       <w:r>
@@ -3942,15 +3394,7 @@
         <w:t>This continuously reads the battery value</w:t>
       </w:r>
       <w:r>
-        <w:t xml:space="preserve">. It was originally used for testing, but it seems like it might possibly be </w:t>
-      </w:r>
-      <w:proofErr w:type="gramStart"/>
-      <w:r>
-        <w:t>useful</w:t>
-      </w:r>
-      <w:proofErr w:type="gramEnd"/>
-      <w:r>
-        <w:t xml:space="preserve"> so it was left in the menu system.</w:t>
+        <w:t>. It was originally used for testing, but it seems like it might possibly be useful so it was left in the menu system.</w:t>
       </w:r>
     </w:p>
     <w:p>
@@ -3966,15 +3410,7 @@
         <w:t xml:space="preserve">New firmware can be loaded by putting </w:t>
       </w:r>
       <w:r>
-        <w:t xml:space="preserve">the binary file on the SD card. It must be named </w:t>
-      </w:r>
-      <w:proofErr w:type="spellStart"/>
-      <w:r>
-        <w:t>RadioFox.BIN</w:t>
-      </w:r>
-      <w:proofErr w:type="spellEnd"/>
-      <w:r>
-        <w:t>.</w:t>
+        <w:t>the binary file on the SD card. It must be named RadioFox.BIN.</w:t>
       </w:r>
       <w:r>
         <w:t xml:space="preserve"> There are two prompts, one to confirm overwriting the firmware, and another to allow deletion of the </w:t>
@@ -4024,21 +3460,8 @@
         <w:t xml:space="preserve">and reset </w:t>
       </w:r>
       <w:r>
-        <w:t xml:space="preserve">the </w:t>
-      </w:r>
-      <w:proofErr w:type="spellStart"/>
-      <w:r>
-        <w:t>eeprom</w:t>
-      </w:r>
-      <w:proofErr w:type="spellEnd"/>
-      <w:r>
-        <w:t xml:space="preserve"> where the settings are </w:t>
-      </w:r>
-      <w:proofErr w:type="gramStart"/>
-      <w:r>
-        <w:t>save</w:t>
-      </w:r>
-      <w:proofErr w:type="gramEnd"/>
+        <w:t>the eeprom where the settings are save</w:t>
+      </w:r>
       <w:r>
         <w:t xml:space="preserve"> in non-volatile memory. This is how settings are saved while the system is not powered.</w:t>
       </w:r>
@@ -4053,15 +3476,7 @@
     </w:p>
     <w:p>
       <w:r>
-        <w:t xml:space="preserve">This stores </w:t>
-      </w:r>
-      <w:proofErr w:type="gramStart"/>
-      <w:r>
-        <w:t>all of</w:t>
-      </w:r>
-      <w:proofErr w:type="gramEnd"/>
-      <w:r>
-        <w:t xml:space="preserve"> the current settings in the non-volatile memory</w:t>
+        <w:t>This stores all of the current settings in the non-volatile memory</w:t>
       </w:r>
       <w:r>
         <w:t>. Note that this is not often used since settings are normally saved each time they are changed.</w:t>
@@ -4092,7 +3507,7 @@
 </file>
 
 <file path=word/endnotes.xml><?xml version="1.0" encoding="utf-8"?>
-<w:endnotes xmlns:wpc="http://schemas.microsoft.com/office/word/2010/wordprocessingCanvas" xmlns:cx="http://schemas.microsoft.com/office/drawing/2014/chartex" xmlns:cx1="http://schemas.microsoft.com/office/drawing/2015/9/8/chartex" xmlns:cx2="http://schemas.microsoft.com/office/drawing/2015/10/21/chartex" xmlns:cx3="http://schemas.microsoft.com/office/drawing/2016/5/9/chartex" xmlns:cx4="http://schemas.microsoft.com/office/drawing/2016/5/10/chartex" xmlns:cx5="http://schemas.microsoft.com/office/drawing/2016/5/11/chartex" xmlns:cx6="http://schemas.microsoft.com/office/drawing/2016/5/12/chartex" xmlns:cx7="http://schemas.microsoft.com/office/drawing/2016/5/13/chartex" xmlns:cx8="http://schemas.microsoft.com/office/drawing/2016/5/14/chartex" xmlns:mc="http://schemas.openxmlformats.org/markup-compatibility/2006" xmlns:aink="http://schemas.microsoft.com/office/drawing/2016/ink" xmlns:am3d="http://schemas.microsoft.com/office/drawing/2017/model3d" xmlns:o="urn:schemas-microsoft-com:office:office" xmlns:oel="http://schemas.microsoft.com/office/2019/extlst" xmlns:r="http://schemas.openxmlformats.org/officeDocument/2006/relationships" xmlns:m="http://schemas.openxmlformats.org/officeDocument/2006/math" xmlns:v="urn:schemas-microsoft-com:vml" xmlns:wp14="http://schemas.microsoft.com/office/word/2010/wordprocessingDrawing" xmlns:wp="http://schemas.openxmlformats.org/drawingml/2006/wordprocessingDrawing" xmlns:w10="urn:schemas-microsoft-com:office:word" xmlns:w="http://schemas.openxmlformats.org/wordprocessingml/2006/main" xmlns:w14="http://schemas.microsoft.com/office/word/2010/wordml" xmlns:w15="http://schemas.microsoft.com/office/word/2012/wordml" xmlns:w16cex="http://schemas.microsoft.com/office/word/2018/wordml/cex" xmlns:w16cid="http://schemas.microsoft.com/office/word/2016/wordml/cid" xmlns:w16="http://schemas.microsoft.com/office/word/2018/wordml" xmlns:w16du="http://schemas.microsoft.com/office/word/2023/wordml/word16du" xmlns:w16sdtdh="http://schemas.microsoft.com/office/word/2020/wordml/sdtdatahash" xmlns:w16sdtfl="http://schemas.microsoft.com/office/word/2024/wordml/sdtformatlock" xmlns:w16se="http://schemas.microsoft.com/office/word/2015/wordml/symex" xmlns:wpg="http://schemas.microsoft.com/office/word/2010/wordprocessingGroup" xmlns:wpi="http://schemas.microsoft.com/office/word/2010/wordprocessingInk" xmlns:wne="http://schemas.microsoft.com/office/word/2006/wordml" xmlns:wps="http://schemas.microsoft.com/office/word/2010/wordprocessingShape" mc:Ignorable="w14 w15 w16se w16cid w16 w16cex w16sdtdh w16sdtfl w16du wp14">
+<w:endnotes xmlns:wpc="http://schemas.microsoft.com/office/word/2010/wordprocessingCanvas" xmlns:cx="http://schemas.microsoft.com/office/drawing/2014/chartex" xmlns:cx1="http://schemas.microsoft.com/office/drawing/2015/9/8/chartex" xmlns:cx2="http://schemas.microsoft.com/office/drawing/2015/10/21/chartex" xmlns:cx3="http://schemas.microsoft.com/office/drawing/2016/5/9/chartex" xmlns:cx4="http://schemas.microsoft.com/office/drawing/2016/5/10/chartex" xmlns:cx5="http://schemas.microsoft.com/office/drawing/2016/5/11/chartex" xmlns:cx6="http://schemas.microsoft.com/office/drawing/2016/5/12/chartex" xmlns:cx7="http://schemas.microsoft.com/office/drawing/2016/5/13/chartex" xmlns:cx8="http://schemas.microsoft.com/office/drawing/2016/5/14/chartex" xmlns:mc="http://schemas.openxmlformats.org/markup-compatibility/2006" xmlns:aink="http://schemas.microsoft.com/office/drawing/2016/ink" xmlns:am3d="http://schemas.microsoft.com/office/drawing/2017/model3d" xmlns:o="urn:schemas-microsoft-com:office:office" xmlns:oel="http://schemas.microsoft.com/office/2019/extlst" xmlns:r="http://schemas.openxmlformats.org/officeDocument/2006/relationships" xmlns:m="http://schemas.openxmlformats.org/officeDocument/2006/math" xmlns:v="urn:schemas-microsoft-com:vml" xmlns:wp14="http://schemas.microsoft.com/office/word/2010/wordprocessingDrawing" xmlns:wp="http://schemas.openxmlformats.org/drawingml/2006/wordprocessingDrawing" xmlns:w10="urn:schemas-microsoft-com:office:word" xmlns:w="http://schemas.openxmlformats.org/wordprocessingml/2006/main" xmlns:w14="http://schemas.microsoft.com/office/word/2010/wordml" xmlns:w15="http://schemas.microsoft.com/office/word/2012/wordml" xmlns:w16cex="http://schemas.microsoft.com/office/word/2018/wordml/cex" xmlns:w16cid="http://schemas.microsoft.com/office/word/2016/wordml/cid" xmlns:w16="http://schemas.microsoft.com/office/word/2018/wordml" xmlns:w16du="http://schemas.microsoft.com/office/word/2023/wordml/word16du" xmlns:w16sdtdh="http://schemas.microsoft.com/office/word/2020/wordml/sdtdatahash" xmlns:w16se="http://schemas.microsoft.com/office/word/2015/wordml/symex" xmlns:wpg="http://schemas.microsoft.com/office/word/2010/wordprocessingGroup" xmlns:wpi="http://schemas.microsoft.com/office/word/2010/wordprocessingInk" xmlns:wne="http://schemas.microsoft.com/office/word/2006/wordml" xmlns:wps="http://schemas.microsoft.com/office/word/2010/wordprocessingShape" mc:Ignorable="w14 w15 w16se w16cid w16 w16cex w16sdtdh w16du wp14">
   <w:endnote w:type="separator" w:id="-1">
     <w:p>
       <w:pPr>
@@ -4117,7 +3532,7 @@
 </file>
 
 <file path=word/footer1.xml><?xml version="1.0" encoding="utf-8"?>
-<w:ftr xmlns:wpc="http://schemas.microsoft.com/office/word/2010/wordprocessingCanvas" xmlns:cx="http://schemas.microsoft.com/office/drawing/2014/chartex" xmlns:cx1="http://schemas.microsoft.com/office/drawing/2015/9/8/chartex" xmlns:cx2="http://schemas.microsoft.com/office/drawing/2015/10/21/chartex" xmlns:cx3="http://schemas.microsoft.com/office/drawing/2016/5/9/chartex" xmlns:cx4="http://schemas.microsoft.com/office/drawing/2016/5/10/chartex" xmlns:cx5="http://schemas.microsoft.com/office/drawing/2016/5/11/chartex" xmlns:cx6="http://schemas.microsoft.com/office/drawing/2016/5/12/chartex" xmlns:cx7="http://schemas.microsoft.com/office/drawing/2016/5/13/chartex" xmlns:cx8="http://schemas.microsoft.com/office/drawing/2016/5/14/chartex" xmlns:mc="http://schemas.openxmlformats.org/markup-compatibility/2006" xmlns:aink="http://schemas.microsoft.com/office/drawing/2016/ink" xmlns:am3d="http://schemas.microsoft.com/office/drawing/2017/model3d" xmlns:o="urn:schemas-microsoft-com:office:office" xmlns:oel="http://schemas.microsoft.com/office/2019/extlst" xmlns:r="http://schemas.openxmlformats.org/officeDocument/2006/relationships" xmlns:m="http://schemas.openxmlformats.org/officeDocument/2006/math" xmlns:v="urn:schemas-microsoft-com:vml" xmlns:wp14="http://schemas.microsoft.com/office/word/2010/wordprocessingDrawing" xmlns:wp="http://schemas.openxmlformats.org/drawingml/2006/wordprocessingDrawing" xmlns:w10="urn:schemas-microsoft-com:office:word" xmlns:w="http://schemas.openxmlformats.org/wordprocessingml/2006/main" xmlns:w14="http://schemas.microsoft.com/office/word/2010/wordml" xmlns:w15="http://schemas.microsoft.com/office/word/2012/wordml" xmlns:w16cex="http://schemas.microsoft.com/office/word/2018/wordml/cex" xmlns:w16cid="http://schemas.microsoft.com/office/word/2016/wordml/cid" xmlns:w16="http://schemas.microsoft.com/office/word/2018/wordml" xmlns:w16du="http://schemas.microsoft.com/office/word/2023/wordml/word16du" xmlns:w16sdtdh="http://schemas.microsoft.com/office/word/2020/wordml/sdtdatahash" xmlns:w16sdtfl="http://schemas.microsoft.com/office/word/2024/wordml/sdtformatlock" xmlns:w16se="http://schemas.microsoft.com/office/word/2015/wordml/symex" xmlns:wpg="http://schemas.microsoft.com/office/word/2010/wordprocessingGroup" xmlns:wpi="http://schemas.microsoft.com/office/word/2010/wordprocessingInk" xmlns:wne="http://schemas.microsoft.com/office/word/2006/wordml" xmlns:wps="http://schemas.microsoft.com/office/word/2010/wordprocessingShape" mc:Ignorable="w14 w15 w16se w16cid w16 w16cex w16sdtdh w16sdtfl w16du wp14">
+<w:ftr xmlns:wpc="http://schemas.microsoft.com/office/word/2010/wordprocessingCanvas" xmlns:cx="http://schemas.microsoft.com/office/drawing/2014/chartex" xmlns:cx1="http://schemas.microsoft.com/office/drawing/2015/9/8/chartex" xmlns:cx2="http://schemas.microsoft.com/office/drawing/2015/10/21/chartex" xmlns:cx3="http://schemas.microsoft.com/office/drawing/2016/5/9/chartex" xmlns:cx4="http://schemas.microsoft.com/office/drawing/2016/5/10/chartex" xmlns:cx5="http://schemas.microsoft.com/office/drawing/2016/5/11/chartex" xmlns:cx6="http://schemas.microsoft.com/office/drawing/2016/5/12/chartex" xmlns:cx7="http://schemas.microsoft.com/office/drawing/2016/5/13/chartex" xmlns:cx8="http://schemas.microsoft.com/office/drawing/2016/5/14/chartex" xmlns:mc="http://schemas.openxmlformats.org/markup-compatibility/2006" xmlns:aink="http://schemas.microsoft.com/office/drawing/2016/ink" xmlns:am3d="http://schemas.microsoft.com/office/drawing/2017/model3d" xmlns:o="urn:schemas-microsoft-com:office:office" xmlns:oel="http://schemas.microsoft.com/office/2019/extlst" xmlns:r="http://schemas.openxmlformats.org/officeDocument/2006/relationships" xmlns:m="http://schemas.openxmlformats.org/officeDocument/2006/math" xmlns:v="urn:schemas-microsoft-com:vml" xmlns:wp14="http://schemas.microsoft.com/office/word/2010/wordprocessingDrawing" xmlns:wp="http://schemas.openxmlformats.org/drawingml/2006/wordprocessingDrawing" xmlns:w10="urn:schemas-microsoft-com:office:word" xmlns:w="http://schemas.openxmlformats.org/wordprocessingml/2006/main" xmlns:w14="http://schemas.microsoft.com/office/word/2010/wordml" xmlns:w15="http://schemas.microsoft.com/office/word/2012/wordml" xmlns:w16cex="http://schemas.microsoft.com/office/word/2018/wordml/cex" xmlns:w16cid="http://schemas.microsoft.com/office/word/2016/wordml/cid" xmlns:w16="http://schemas.microsoft.com/office/word/2018/wordml" xmlns:w16du="http://schemas.microsoft.com/office/word/2023/wordml/word16du" xmlns:w16sdtdh="http://schemas.microsoft.com/office/word/2020/wordml/sdtdatahash" xmlns:w16se="http://schemas.microsoft.com/office/word/2015/wordml/symex" xmlns:wpg="http://schemas.microsoft.com/office/word/2010/wordprocessingGroup" xmlns:wpi="http://schemas.microsoft.com/office/word/2010/wordprocessingInk" xmlns:wne="http://schemas.microsoft.com/office/word/2006/wordml" xmlns:wps="http://schemas.microsoft.com/office/word/2010/wordprocessingShape" mc:Ignorable="w14 w15 w16se w16cid w16 w16cex w16sdtdh w16du wp14">
   <w:sdt>
     <w:sdtPr>
       <w:id w:val="-1635484502"/>
@@ -4248,7 +3663,7 @@
 </file>
 
 <file path=word/footnotes.xml><?xml version="1.0" encoding="utf-8"?>
-<w:footnotes xmlns:wpc="http://schemas.microsoft.com/office/word/2010/wordprocessingCanvas" xmlns:cx="http://schemas.microsoft.com/office/drawing/2014/chartex" xmlns:cx1="http://schemas.microsoft.com/office/drawing/2015/9/8/chartex" xmlns:cx2="http://schemas.microsoft.com/office/drawing/2015/10/21/chartex" xmlns:cx3="http://schemas.microsoft.com/office/drawing/2016/5/9/chartex" xmlns:cx4="http://schemas.microsoft.com/office/drawing/2016/5/10/chartex" xmlns:cx5="http://schemas.microsoft.com/office/drawing/2016/5/11/chartex" xmlns:cx6="http://schemas.microsoft.com/office/drawing/2016/5/12/chartex" xmlns:cx7="http://schemas.microsoft.com/office/drawing/2016/5/13/chartex" xmlns:cx8="http://schemas.microsoft.com/office/drawing/2016/5/14/chartex" xmlns:mc="http://schemas.openxmlformats.org/markup-compatibility/2006" xmlns:aink="http://schemas.microsoft.com/office/drawing/2016/ink" xmlns:am3d="http://schemas.microsoft.com/office/drawing/2017/model3d" xmlns:o="urn:schemas-microsoft-com:office:office" xmlns:oel="http://schemas.microsoft.com/office/2019/extlst" xmlns:r="http://schemas.openxmlformats.org/officeDocument/2006/relationships" xmlns:m="http://schemas.openxmlformats.org/officeDocument/2006/math" xmlns:v="urn:schemas-microsoft-com:vml" xmlns:wp14="http://schemas.microsoft.com/office/word/2010/wordprocessingDrawing" xmlns:wp="http://schemas.openxmlformats.org/drawingml/2006/wordprocessingDrawing" xmlns:w10="urn:schemas-microsoft-com:office:word" xmlns:w="http://schemas.openxmlformats.org/wordprocessingml/2006/main" xmlns:w14="http://schemas.microsoft.com/office/word/2010/wordml" xmlns:w15="http://schemas.microsoft.com/office/word/2012/wordml" xmlns:w16cex="http://schemas.microsoft.com/office/word/2018/wordml/cex" xmlns:w16cid="http://schemas.microsoft.com/office/word/2016/wordml/cid" xmlns:w16="http://schemas.microsoft.com/office/word/2018/wordml" xmlns:w16du="http://schemas.microsoft.com/office/word/2023/wordml/word16du" xmlns:w16sdtdh="http://schemas.microsoft.com/office/word/2020/wordml/sdtdatahash" xmlns:w16sdtfl="http://schemas.microsoft.com/office/word/2024/wordml/sdtformatlock" xmlns:w16se="http://schemas.microsoft.com/office/word/2015/wordml/symex" xmlns:wpg="http://schemas.microsoft.com/office/word/2010/wordprocessingGroup" xmlns:wpi="http://schemas.microsoft.com/office/word/2010/wordprocessingInk" xmlns:wne="http://schemas.microsoft.com/office/word/2006/wordml" xmlns:wps="http://schemas.microsoft.com/office/word/2010/wordprocessingShape" mc:Ignorable="w14 w15 w16se w16cid w16 w16cex w16sdtdh w16sdtfl w16du wp14">
+<w:footnotes xmlns:wpc="http://schemas.microsoft.com/office/word/2010/wordprocessingCanvas" xmlns:cx="http://schemas.microsoft.com/office/drawing/2014/chartex" xmlns:cx1="http://schemas.microsoft.com/office/drawing/2015/9/8/chartex" xmlns:cx2="http://schemas.microsoft.com/office/drawing/2015/10/21/chartex" xmlns:cx3="http://schemas.microsoft.com/office/drawing/2016/5/9/chartex" xmlns:cx4="http://schemas.microsoft.com/office/drawing/2016/5/10/chartex" xmlns:cx5="http://schemas.microsoft.com/office/drawing/2016/5/11/chartex" xmlns:cx6="http://schemas.microsoft.com/office/drawing/2016/5/12/chartex" xmlns:cx7="http://schemas.microsoft.com/office/drawing/2016/5/13/chartex" xmlns:cx8="http://schemas.microsoft.com/office/drawing/2016/5/14/chartex" xmlns:mc="http://schemas.openxmlformats.org/markup-compatibility/2006" xmlns:aink="http://schemas.microsoft.com/office/drawing/2016/ink" xmlns:am3d="http://schemas.microsoft.com/office/drawing/2017/model3d" xmlns:o="urn:schemas-microsoft-com:office:office" xmlns:oel="http://schemas.microsoft.com/office/2019/extlst" xmlns:r="http://schemas.openxmlformats.org/officeDocument/2006/relationships" xmlns:m="http://schemas.openxmlformats.org/officeDocument/2006/math" xmlns:v="urn:schemas-microsoft-com:vml" xmlns:wp14="http://schemas.microsoft.com/office/word/2010/wordprocessingDrawing" xmlns:wp="http://schemas.openxmlformats.org/drawingml/2006/wordprocessingDrawing" xmlns:w10="urn:schemas-microsoft-com:office:word" xmlns:w="http://schemas.openxmlformats.org/wordprocessingml/2006/main" xmlns:w14="http://schemas.microsoft.com/office/word/2010/wordml" xmlns:w15="http://schemas.microsoft.com/office/word/2012/wordml" xmlns:w16cex="http://schemas.microsoft.com/office/word/2018/wordml/cex" xmlns:w16cid="http://schemas.microsoft.com/office/word/2016/wordml/cid" xmlns:w16="http://schemas.microsoft.com/office/word/2018/wordml" xmlns:w16du="http://schemas.microsoft.com/office/word/2023/wordml/word16du" xmlns:w16sdtdh="http://schemas.microsoft.com/office/word/2020/wordml/sdtdatahash" xmlns:w16se="http://schemas.microsoft.com/office/word/2015/wordml/symex" xmlns:wpg="http://schemas.microsoft.com/office/word/2010/wordprocessingGroup" xmlns:wpi="http://schemas.microsoft.com/office/word/2010/wordprocessingInk" xmlns:wne="http://schemas.microsoft.com/office/word/2006/wordml" xmlns:wps="http://schemas.microsoft.com/office/word/2010/wordprocessingShape" mc:Ignorable="w14 w15 w16se w16cid w16 w16cex w16sdtdh w16du wp14">
   <w:footnote w:type="separator" w:id="-1">
     <w:p>
       <w:pPr>
@@ -4273,7 +3688,7 @@
 </file>
 
 <file path=word/numbering.xml><?xml version="1.0" encoding="utf-8"?>
-<w:numbering xmlns:wpc="http://schemas.microsoft.com/office/word/2010/wordprocessingCanvas" xmlns:cx="http://schemas.microsoft.com/office/drawing/2014/chartex" xmlns:cx1="http://schemas.microsoft.com/office/drawing/2015/9/8/chartex" xmlns:cx2="http://schemas.microsoft.com/office/drawing/2015/10/21/chartex" xmlns:cx3="http://schemas.microsoft.com/office/drawing/2016/5/9/chartex" xmlns:cx4="http://schemas.microsoft.com/office/drawing/2016/5/10/chartex" xmlns:cx5="http://schemas.microsoft.com/office/drawing/2016/5/11/chartex" xmlns:cx6="http://schemas.microsoft.com/office/drawing/2016/5/12/chartex" xmlns:cx7="http://schemas.microsoft.com/office/drawing/2016/5/13/chartex" xmlns:cx8="http://schemas.microsoft.com/office/drawing/2016/5/14/chartex" xmlns:mc="http://schemas.openxmlformats.org/markup-compatibility/2006" xmlns:aink="http://schemas.microsoft.com/office/drawing/2016/ink" xmlns:am3d="http://schemas.microsoft.com/office/drawing/2017/model3d" xmlns:o="urn:schemas-microsoft-com:office:office" xmlns:oel="http://schemas.microsoft.com/office/2019/extlst" xmlns:r="http://schemas.openxmlformats.org/officeDocument/2006/relationships" xmlns:m="http://schemas.openxmlformats.org/officeDocument/2006/math" xmlns:v="urn:schemas-microsoft-com:vml" xmlns:wp14="http://schemas.microsoft.com/office/word/2010/wordprocessingDrawing" xmlns:wp="http://schemas.openxmlformats.org/drawingml/2006/wordprocessingDrawing" xmlns:w10="urn:schemas-microsoft-com:office:word" xmlns:w="http://schemas.openxmlformats.org/wordprocessingml/2006/main" xmlns:w14="http://schemas.microsoft.com/office/word/2010/wordml" xmlns:w15="http://schemas.microsoft.com/office/word/2012/wordml" xmlns:w16cex="http://schemas.microsoft.com/office/word/2018/wordml/cex" xmlns:w16cid="http://schemas.microsoft.com/office/word/2016/wordml/cid" xmlns:w16="http://schemas.microsoft.com/office/word/2018/wordml" xmlns:w16du="http://schemas.microsoft.com/office/word/2023/wordml/word16du" xmlns:w16sdtdh="http://schemas.microsoft.com/office/word/2020/wordml/sdtdatahash" xmlns:w16sdtfl="http://schemas.microsoft.com/office/word/2024/wordml/sdtformatlock" xmlns:w16se="http://schemas.microsoft.com/office/word/2015/wordml/symex" xmlns:wpg="http://schemas.microsoft.com/office/word/2010/wordprocessingGroup" xmlns:wpi="http://schemas.microsoft.com/office/word/2010/wordprocessingInk" xmlns:wne="http://schemas.microsoft.com/office/word/2006/wordml" xmlns:wps="http://schemas.microsoft.com/office/word/2010/wordprocessingShape" mc:Ignorable="w14 w15 w16se w16cid w16 w16cex w16sdtdh w16sdtfl w16du wp14">
+<w:numbering xmlns:wpc="http://schemas.microsoft.com/office/word/2010/wordprocessingCanvas" xmlns:cx="http://schemas.microsoft.com/office/drawing/2014/chartex" xmlns:cx1="http://schemas.microsoft.com/office/drawing/2015/9/8/chartex" xmlns:cx2="http://schemas.microsoft.com/office/drawing/2015/10/21/chartex" xmlns:cx3="http://schemas.microsoft.com/office/drawing/2016/5/9/chartex" xmlns:cx4="http://schemas.microsoft.com/office/drawing/2016/5/10/chartex" xmlns:cx5="http://schemas.microsoft.com/office/drawing/2016/5/11/chartex" xmlns:cx6="http://schemas.microsoft.com/office/drawing/2016/5/12/chartex" xmlns:cx7="http://schemas.microsoft.com/office/drawing/2016/5/13/chartex" xmlns:cx8="http://schemas.microsoft.com/office/drawing/2016/5/14/chartex" xmlns:mc="http://schemas.openxmlformats.org/markup-compatibility/2006" xmlns:aink="http://schemas.microsoft.com/office/drawing/2016/ink" xmlns:am3d="http://schemas.microsoft.com/office/drawing/2017/model3d" xmlns:o="urn:schemas-microsoft-com:office:office" xmlns:oel="http://schemas.microsoft.com/office/2019/extlst" xmlns:r="http://schemas.openxmlformats.org/officeDocument/2006/relationships" xmlns:m="http://schemas.openxmlformats.org/officeDocument/2006/math" xmlns:v="urn:schemas-microsoft-com:vml" xmlns:wp14="http://schemas.microsoft.com/office/word/2010/wordprocessingDrawing" xmlns:wp="http://schemas.openxmlformats.org/drawingml/2006/wordprocessingDrawing" xmlns:w10="urn:schemas-microsoft-com:office:word" xmlns:w="http://schemas.openxmlformats.org/wordprocessingml/2006/main" xmlns:w14="http://schemas.microsoft.com/office/word/2010/wordml" xmlns:w15="http://schemas.microsoft.com/office/word/2012/wordml" xmlns:w16cex="http://schemas.microsoft.com/office/word/2018/wordml/cex" xmlns:w16cid="http://schemas.microsoft.com/office/word/2016/wordml/cid" xmlns:w16="http://schemas.microsoft.com/office/word/2018/wordml" xmlns:w16du="http://schemas.microsoft.com/office/word/2023/wordml/word16du" xmlns:w16sdtdh="http://schemas.microsoft.com/office/word/2020/wordml/sdtdatahash" xmlns:w16se="http://schemas.microsoft.com/office/word/2015/wordml/symex" xmlns:wpg="http://schemas.microsoft.com/office/word/2010/wordprocessingGroup" xmlns:wpi="http://schemas.microsoft.com/office/word/2010/wordprocessingInk" xmlns:wne="http://schemas.microsoft.com/office/word/2006/wordml" xmlns:wps="http://schemas.microsoft.com/office/word/2010/wordprocessingShape" mc:Ignorable="w14 w15 w16se w16cid w16 w16cex w16sdtdh w16du wp14">
   <w:abstractNum w:abstractNumId="0" w15:restartNumberingAfterBreak="0">
     <w:nsid w:val="006D7728"/>
     <w:multiLevelType w:val="hybridMultilevel"/>
@@ -15658,7 +15073,7 @@
 </file>
 
 <file path=word/styles.xml><?xml version="1.0" encoding="utf-8"?>
-<w:styles xmlns:mc="http://schemas.openxmlformats.org/markup-compatibility/2006" xmlns:r="http://schemas.openxmlformats.org/officeDocument/2006/relationships" xmlns:w="http://schemas.openxmlformats.org/wordprocessingml/2006/main" xmlns:w14="http://schemas.microsoft.com/office/word/2010/wordml" xmlns:w15="http://schemas.microsoft.com/office/word/2012/wordml" xmlns:w16cex="http://schemas.microsoft.com/office/word/2018/wordml/cex" xmlns:w16cid="http://schemas.microsoft.com/office/word/2016/wordml/cid" xmlns:w16="http://schemas.microsoft.com/office/word/2018/wordml" xmlns:w16du="http://schemas.microsoft.com/office/word/2023/wordml/word16du" xmlns:w16sdtdh="http://schemas.microsoft.com/office/word/2020/wordml/sdtdatahash" xmlns:w16sdtfl="http://schemas.microsoft.com/office/word/2024/wordml/sdtformatlock" xmlns:w16se="http://schemas.microsoft.com/office/word/2015/wordml/symex" mc:Ignorable="w14 w15 w16se w16cid w16 w16cex w16sdtdh w16sdtfl w16du">
+<w:styles xmlns:mc="http://schemas.openxmlformats.org/markup-compatibility/2006" xmlns:r="http://schemas.openxmlformats.org/officeDocument/2006/relationships" xmlns:w="http://schemas.openxmlformats.org/wordprocessingml/2006/main" xmlns:w14="http://schemas.microsoft.com/office/word/2010/wordml" xmlns:w15="http://schemas.microsoft.com/office/word/2012/wordml" xmlns:w16cex="http://schemas.microsoft.com/office/word/2018/wordml/cex" xmlns:w16cid="http://schemas.microsoft.com/office/word/2016/wordml/cid" xmlns:w16="http://schemas.microsoft.com/office/word/2018/wordml" xmlns:w16du="http://schemas.microsoft.com/office/word/2023/wordml/word16du" xmlns:w16sdtdh="http://schemas.microsoft.com/office/word/2020/wordml/sdtdatahash" xmlns:w16se="http://schemas.microsoft.com/office/word/2015/wordml/symex" mc:Ignorable="w14 w15 w16se w16cid w16 w16cex w16sdtdh w16du">
   <w:docDefaults>
     <w:rPrDefault>
       <w:rPr>

</xml_diff>

<commit_message>
VS Code version of the code
</commit_message>
<xml_diff>
--- a/RadioFox.docx
+++ b/RadioFox.docx
@@ -1,6 +1,6 @@
 
 <file path=word/document.xml><?xml version="1.0" encoding="utf-8"?>
-<w:document xmlns:wpc="http://schemas.microsoft.com/office/word/2010/wordprocessingCanvas" xmlns:cx="http://schemas.microsoft.com/office/drawing/2014/chartex" xmlns:cx1="http://schemas.microsoft.com/office/drawing/2015/9/8/chartex" xmlns:cx2="http://schemas.microsoft.com/office/drawing/2015/10/21/chartex" xmlns:cx3="http://schemas.microsoft.com/office/drawing/2016/5/9/chartex" xmlns:cx4="http://schemas.microsoft.com/office/drawing/2016/5/10/chartex" xmlns:cx5="http://schemas.microsoft.com/office/drawing/2016/5/11/chartex" xmlns:cx6="http://schemas.microsoft.com/office/drawing/2016/5/12/chartex" xmlns:cx7="http://schemas.microsoft.com/office/drawing/2016/5/13/chartex" xmlns:cx8="http://schemas.microsoft.com/office/drawing/2016/5/14/chartex" xmlns:mc="http://schemas.openxmlformats.org/markup-compatibility/2006" xmlns:aink="http://schemas.microsoft.com/office/drawing/2016/ink" xmlns:am3d="http://schemas.microsoft.com/office/drawing/2017/model3d" xmlns:o="urn:schemas-microsoft-com:office:office" xmlns:oel="http://schemas.microsoft.com/office/2019/extlst" xmlns:r="http://schemas.openxmlformats.org/officeDocument/2006/relationships" xmlns:m="http://schemas.openxmlformats.org/officeDocument/2006/math" xmlns:v="urn:schemas-microsoft-com:vml" xmlns:wp14="http://schemas.microsoft.com/office/word/2010/wordprocessingDrawing" xmlns:wp="http://schemas.openxmlformats.org/drawingml/2006/wordprocessingDrawing" xmlns:w10="urn:schemas-microsoft-com:office:word" xmlns:w="http://schemas.openxmlformats.org/wordprocessingml/2006/main" xmlns:w14="http://schemas.microsoft.com/office/word/2010/wordml" xmlns:w15="http://schemas.microsoft.com/office/word/2012/wordml" xmlns:w16cex="http://schemas.microsoft.com/office/word/2018/wordml/cex" xmlns:w16cid="http://schemas.microsoft.com/office/word/2016/wordml/cid" xmlns:w16="http://schemas.microsoft.com/office/word/2018/wordml" xmlns:w16du="http://schemas.microsoft.com/office/word/2023/wordml/word16du" xmlns:w16sdtdh="http://schemas.microsoft.com/office/word/2020/wordml/sdtdatahash" xmlns:w16se="http://schemas.microsoft.com/office/word/2015/wordml/symex" xmlns:wpg="http://schemas.microsoft.com/office/word/2010/wordprocessingGroup" xmlns:wpi="http://schemas.microsoft.com/office/word/2010/wordprocessingInk" xmlns:wne="http://schemas.microsoft.com/office/word/2006/wordml" xmlns:wps="http://schemas.microsoft.com/office/word/2010/wordprocessingShape" mc:Ignorable="w14 w15 w16se w16cid w16 w16cex w16sdtdh w16du wp14">
+<w:document xmlns:wpc="http://schemas.microsoft.com/office/word/2010/wordprocessingCanvas" xmlns:cx="http://schemas.microsoft.com/office/drawing/2014/chartex" xmlns:cx1="http://schemas.microsoft.com/office/drawing/2015/9/8/chartex" xmlns:cx2="http://schemas.microsoft.com/office/drawing/2015/10/21/chartex" xmlns:cx3="http://schemas.microsoft.com/office/drawing/2016/5/9/chartex" xmlns:cx4="http://schemas.microsoft.com/office/drawing/2016/5/10/chartex" xmlns:cx5="http://schemas.microsoft.com/office/drawing/2016/5/11/chartex" xmlns:cx6="http://schemas.microsoft.com/office/drawing/2016/5/12/chartex" xmlns:cx7="http://schemas.microsoft.com/office/drawing/2016/5/13/chartex" xmlns:cx8="http://schemas.microsoft.com/office/drawing/2016/5/14/chartex" xmlns:mc="http://schemas.openxmlformats.org/markup-compatibility/2006" xmlns:aink="http://schemas.microsoft.com/office/drawing/2016/ink" xmlns:am3d="http://schemas.microsoft.com/office/drawing/2017/model3d" xmlns:o="urn:schemas-microsoft-com:office:office" xmlns:oel="http://schemas.microsoft.com/office/2019/extlst" xmlns:r="http://schemas.openxmlformats.org/officeDocument/2006/relationships" xmlns:m="http://schemas.openxmlformats.org/officeDocument/2006/math" xmlns:v="urn:schemas-microsoft-com:vml" xmlns:wp14="http://schemas.microsoft.com/office/word/2010/wordprocessingDrawing" xmlns:wp="http://schemas.openxmlformats.org/drawingml/2006/wordprocessingDrawing" xmlns:w10="urn:schemas-microsoft-com:office:word" xmlns:w="http://schemas.openxmlformats.org/wordprocessingml/2006/main" xmlns:w14="http://schemas.microsoft.com/office/word/2010/wordml" xmlns:w15="http://schemas.microsoft.com/office/word/2012/wordml" xmlns:w16cex="http://schemas.microsoft.com/office/word/2018/wordml/cex" xmlns:w16cid="http://schemas.microsoft.com/office/word/2016/wordml/cid" xmlns:w16="http://schemas.microsoft.com/office/word/2018/wordml" xmlns:w16du="http://schemas.microsoft.com/office/word/2023/wordml/word16du" xmlns:w16sdtdh="http://schemas.microsoft.com/office/word/2020/wordml/sdtdatahash" xmlns:w16sdtfl="http://schemas.microsoft.com/office/word/2024/wordml/sdtformatlock" xmlns:w16se="http://schemas.microsoft.com/office/word/2015/wordml/symex" xmlns:wpg="http://schemas.microsoft.com/office/word/2010/wordprocessingGroup" xmlns:wpi="http://schemas.microsoft.com/office/word/2010/wordprocessingInk" xmlns:wne="http://schemas.microsoft.com/office/word/2006/wordml" xmlns:wps="http://schemas.microsoft.com/office/word/2010/wordprocessingShape" mc:Ignorable="w14 w15 w16se w16cid w16 w16cex w16sdtdh w16sdtfl w16du wp14">
   <w:body>
     <w:p>
       <w:pPr>
@@ -62,7 +62,19 @@
         <w:rPr>
           <w:lang w:val="en-US"/>
         </w:rPr>
-        <w:t xml:space="preserve"> as fox hunting or sometimes as bunny hunting. It is played by hiding a transmitter that transmits periodically and then silent until it is time to transmit again. This cycle repeats. Teams use radio receivers with directional antennas to find the transmitter. The technique is called triangulation. The first team to find the transmitter wins. Sometimes the transmitter is moved periodically to make the game more challenging, this is called a walking fox.</w:t>
+        <w:t xml:space="preserve"> as fox hunting or sometimes as bunny hunting. It is played by hiding a transmitter that transmits periodically and</w:t>
+      </w:r>
+      <w:r>
+        <w:rPr>
+          <w:lang w:val="en-US"/>
+        </w:rPr>
+        <w:t xml:space="preserve"> is</w:t>
+      </w:r>
+      <w:r>
+        <w:rPr>
+          <w:lang w:val="en-US"/>
+        </w:rPr>
+        <w:t xml:space="preserve"> then silent until it is time to transmit again. This cycle repeats. Teams use radio receivers with directional antennas to find the transmitter. The technique is called triangulation. The first team to find the transmitter wins. Sometimes the transmitter is moved periodically to make the game more challenging, this is called a walking fox.</w:t>
       </w:r>
     </w:p>
     <w:p/>
@@ -254,10 +266,24 @@
         <w:t xml:space="preserve">The </w:t>
       </w:r>
       <w:r>
-        <w:t>device is charged using the USB-C connector. There is a flaw on the PCB that requires</w:t>
-      </w:r>
-      <w:r>
-        <w:t xml:space="preserve"> a USB-A to USB-C cable. This will be fixed in a future revision of the PCB</w:t>
+        <w:t xml:space="preserve">device is charged using the USB-C connector. There is a flaw </w:t>
+      </w:r>
+      <w:proofErr w:type="gramStart"/>
+      <w:r>
+        <w:t>on</w:t>
+      </w:r>
+      <w:proofErr w:type="gramEnd"/>
+      <w:r>
+        <w:t xml:space="preserve"> the PCB that requires</w:t>
+      </w:r>
+      <w:r>
+        <w:t xml:space="preserve"> a USB-A to USB-C cable. This </w:t>
+      </w:r>
+      <w:r>
+        <w:t>has been fixed in version 1.11</w:t>
+      </w:r>
+      <w:r>
+        <w:t xml:space="preserve"> of the PCB</w:t>
       </w:r>
       <w:r>
         <w:t xml:space="preserve"> so that USB-C to USB-C cables will also work.</w:t>
@@ -319,7 +345,21 @@
         <w:rPr>
           <w:lang w:val="en-US"/>
         </w:rPr>
-        <w:t>The firmware source code consists of C and C++. The source code will be released at a future date, it is still being changed frequently.</w:t>
+        <w:t xml:space="preserve">The firmware source code consists of C and C++. The source code will be released at a future </w:t>
+      </w:r>
+      <w:proofErr w:type="gramStart"/>
+      <w:r>
+        <w:rPr>
+          <w:lang w:val="en-US"/>
+        </w:rPr>
+        <w:t>date,</w:t>
+      </w:r>
+      <w:proofErr w:type="gramEnd"/>
+      <w:r>
+        <w:rPr>
+          <w:lang w:val="en-US"/>
+        </w:rPr>
+        <w:t xml:space="preserve"> it is still being changed frequently.</w:t>
       </w:r>
     </w:p>
     <w:p>
@@ -504,7 +544,35 @@
         <w:rPr>
           <w:lang w:val="en-US"/>
         </w:rPr>
-        <w:t>Show the active run time on the main display in hours, minutes, and seconds. This time is reset on boot, and just keeps track of the time used for sending and pausing.</w:t>
+        <w:t xml:space="preserve">Show the active </w:t>
+      </w:r>
+      <w:proofErr w:type="gramStart"/>
+      <w:r>
+        <w:rPr>
+          <w:lang w:val="en-US"/>
+        </w:rPr>
+        <w:t>run</w:t>
+      </w:r>
+      <w:proofErr w:type="gramEnd"/>
+      <w:r>
+        <w:rPr>
+          <w:lang w:val="en-US"/>
+        </w:rPr>
+        <w:t xml:space="preserve"> time on the main display in hours, minutes, and seconds. This time is reset on </w:t>
+      </w:r>
+      <w:proofErr w:type="gramStart"/>
+      <w:r>
+        <w:rPr>
+          <w:lang w:val="en-US"/>
+        </w:rPr>
+        <w:t>boot, and</w:t>
+      </w:r>
+      <w:proofErr w:type="gramEnd"/>
+      <w:r>
+        <w:rPr>
+          <w:lang w:val="en-US"/>
+        </w:rPr>
+        <w:t xml:space="preserve"> just keeps track of the time used for sending and pausing.</w:t>
       </w:r>
     </w:p>
     <w:p>
@@ -544,8 +612,16 @@
         <w:rPr>
           <w:lang w:val="en-US"/>
         </w:rPr>
-        <w:t>Added a switch to limit the frequency range to that allowed for beacon use in ITU region 2. The range is 144.276-144.300 MHz.</w:t>
-      </w:r>
+        <w:t xml:space="preserve">Added a switch to limit the frequency range to that allowed for beacon use in ITU region 2. The range is 144.276-144.300 </w:t>
+      </w:r>
+      <w:proofErr w:type="spellStart"/>
+      <w:r>
+        <w:rPr>
+          <w:lang w:val="en-US"/>
+        </w:rPr>
+        <w:t>MHz.</w:t>
+      </w:r>
+      <w:proofErr w:type="spellEnd"/>
     </w:p>
     <w:p>
       <w:r>
@@ -581,7 +657,15 @@
         </w:numPr>
       </w:pPr>
       <w:r>
-        <w:t>Fixed crash when no SD card found.</w:t>
+        <w:t xml:space="preserve">Fixed crash when no SD card </w:t>
+      </w:r>
+      <w:proofErr w:type="gramStart"/>
+      <w:r>
+        <w:t>found</w:t>
+      </w:r>
+      <w:proofErr w:type="gramEnd"/>
+      <w:r>
+        <w:t>.</w:t>
       </w:r>
     </w:p>
     <w:p>
@@ -673,7 +757,21 @@
         <w:rPr>
           <w:lang w:val="en-US"/>
         </w:rPr>
-        <w:t>This is initial version when this document was first created. The software is considered mostly complete.</w:t>
+        <w:t xml:space="preserve">This is initial </w:t>
+      </w:r>
+      <w:proofErr w:type="gramStart"/>
+      <w:r>
+        <w:rPr>
+          <w:lang w:val="en-US"/>
+        </w:rPr>
+        <w:t>version</w:t>
+      </w:r>
+      <w:proofErr w:type="gramEnd"/>
+      <w:r>
+        <w:rPr>
+          <w:lang w:val="en-US"/>
+        </w:rPr>
+        <w:t xml:space="preserve"> when this document was first created. The software is considered mostly complete.</w:t>
       </w:r>
     </w:p>
     <w:p>
@@ -701,11 +799,129 @@
       </w:r>
     </w:p>
     <w:p>
-      <w:r>
-        <w:rPr>
-          <w:lang w:val="en-US"/>
-        </w:rPr>
-        <w:t>The Fox is a single PCB that includes an 18650 battery holder that can have 1 or 2 batteries. There is a USB C connector on the left edge used for charging the batteries. Above that is a micro-SD slot. The SD card holds tone files and saved settings files. It can also be used to load new firmware onto the TTGO chip. There is also a USB C connector on the TTGO. It is used for downloading firmware or debugging operations. It might also be used for serial communications in a future firmware release. It is not used for charging the batteries.</w:t>
+      <w:pPr>
+        <w:rPr>
+          <w:lang w:val="en-US"/>
+        </w:rPr>
+      </w:pPr>
+      <w:r>
+        <w:rPr>
+          <w:lang w:val="en-US"/>
+        </w:rPr>
+        <w:t xml:space="preserve">The Fox is a single PCB that includes an </w:t>
+      </w:r>
+      <w:proofErr w:type="gramStart"/>
+      <w:r>
+        <w:rPr>
+          <w:lang w:val="en-US"/>
+        </w:rPr>
+        <w:t>18650 battery</w:t>
+      </w:r>
+      <w:proofErr w:type="gramEnd"/>
+      <w:r>
+        <w:rPr>
+          <w:lang w:val="en-US"/>
+        </w:rPr>
+        <w:t xml:space="preserve"> holder that can have 1 or 2 batteries.</w:t>
+      </w:r>
+      <w:r>
+        <w:rPr>
+          <w:lang w:val="en-US"/>
+        </w:rPr>
+        <w:t xml:space="preserve"> Th</w:t>
+      </w:r>
+      <w:r>
+        <w:rPr>
+          <w:lang w:val="en-US"/>
+        </w:rPr>
+        <w:t>e button top batteries are used. The flat top batteries will not work. Also note that the size standard</w:t>
+      </w:r>
+      <w:r>
+        <w:rPr>
+          <w:lang w:val="en-US"/>
+        </w:rPr>
+        <w:t xml:space="preserve"> is not always followed and some batteries will not fit. If that is the </w:t>
+      </w:r>
+      <w:proofErr w:type="gramStart"/>
+      <w:r>
+        <w:rPr>
+          <w:lang w:val="en-US"/>
+        </w:rPr>
+        <w:t>case</w:t>
+      </w:r>
+      <w:proofErr w:type="gramEnd"/>
+      <w:r>
+        <w:rPr>
+          <w:lang w:val="en-US"/>
+        </w:rPr>
+        <w:t xml:space="preserve"> try a different pair. </w:t>
+      </w:r>
+      <w:r>
+        <w:rPr>
+          <w:lang w:val="en-US"/>
+        </w:rPr>
+        <w:t xml:space="preserve">The best batteries I have found are </w:t>
+      </w:r>
+      <w:r>
+        <w:rPr>
+          <w:lang w:val="en-US"/>
+        </w:rPr>
+        <w:t>from www.liionwholesale.com.</w:t>
+      </w:r>
+      <w:r>
+        <w:rPr>
+          <w:lang w:val="en-US"/>
+        </w:rPr>
+        <w:t xml:space="preserve"> The batteries I use are found here: </w:t>
+      </w:r>
+      <w:hyperlink r:id="rId9" w:history="1">
+        <w:r>
+          <w:rPr>
+            <w:rStyle w:val="Hyperlink"/>
+          </w:rPr>
+          <w:t xml:space="preserve">Protected 3400mAh 10A 18650 Button Top Battery - Wholesale Discount – </w:t>
+        </w:r>
+        <w:proofErr w:type="spellStart"/>
+        <w:r>
+          <w:rPr>
+            <w:rStyle w:val="Hyperlink"/>
+          </w:rPr>
+          <w:t>Liion</w:t>
+        </w:r>
+        <w:proofErr w:type="spellEnd"/>
+        <w:r>
+          <w:rPr>
+            <w:rStyle w:val="Hyperlink"/>
+          </w:rPr>
+          <w:t xml:space="preserve"> Wholesale Batteries</w:t>
+        </w:r>
+      </w:hyperlink>
+      <w:r>
+        <w:rPr>
+          <w:lang w:val="en-US"/>
+        </w:rPr>
+        <w:t xml:space="preserve"> </w:t>
+      </w:r>
+      <w:r>
+        <w:rPr>
+          <w:lang w:val="en-US"/>
+        </w:rPr>
+        <w:t>.</w:t>
+      </w:r>
+    </w:p>
+    <w:p>
+      <w:pPr>
+        <w:rPr>
+          <w:lang w:val="en-US"/>
+        </w:rPr>
+      </w:pPr>
+    </w:p>
+    <w:p>
+      <w:r>
+        <w:rPr>
+          <w:lang w:val="en-US"/>
+        </w:rPr>
+        <w:t>There is a USB C connector on the left edge used for charging the batteries. Above that is a micro-SD slot. The SD card holds tone files and saved settings files. It can also be used to load new firmware onto the TTGO chip. There is also a USB C connector on the TTGO. It is used for downloading firmware or debugging operations. It might also be used for serial communications in a future firmware release. It is not used for charging the batteries.</w:t>
       </w:r>
     </w:p>
     <w:p>
@@ -713,6 +929,7 @@
         <w:pStyle w:val="Heading2"/>
       </w:pPr>
       <w:r>
+        <w:lastRenderedPageBreak/>
         <w:t>Radio</w:t>
       </w:r>
     </w:p>
@@ -721,20 +938,41 @@
         <w:rPr>
           <w:lang w:val="en-US"/>
         </w:rPr>
-        <w:t xml:space="preserve">The radio functions are handled by the SA818-V on the top right. There are vents in the case to allow cooling as this module can become quite hot when transmitting at high power for longer timer intervals. Transmitting longer than one minute is not recommended. High power is about </w:t>
-      </w:r>
-      <w:r>
-        <w:rPr>
-          <w:lang w:val="en-US"/>
-        </w:rPr>
-        <w:lastRenderedPageBreak/>
+        <w:t xml:space="preserve">The radio functions are handled by the SA818-V on the top right. There are vents in the case to allow cooling as this module can become quite hot when transmitting at high power for longer </w:t>
+      </w:r>
+      <w:proofErr w:type="gramStart"/>
+      <w:r>
+        <w:rPr>
+          <w:lang w:val="en-US"/>
+        </w:rPr>
+        <w:t>timer</w:t>
+      </w:r>
+      <w:proofErr w:type="gramEnd"/>
+      <w:r>
+        <w:rPr>
+          <w:lang w:val="en-US"/>
+        </w:rPr>
+        <w:t xml:space="preserve"> intervals. Transmitting longer than one minute is not recommended. High power is about </w:t>
+      </w:r>
+      <w:proofErr w:type="gramStart"/>
+      <w:r>
+        <w:rPr>
+          <w:lang w:val="en-US"/>
+        </w:rPr>
         <w:t>1</w:t>
       </w:r>
       <w:r>
         <w:rPr>
           <w:lang w:val="en-US"/>
         </w:rPr>
-        <w:t xml:space="preserve">W and low power is about </w:t>
+        <w:t>W</w:t>
+      </w:r>
+      <w:proofErr w:type="gramEnd"/>
+      <w:r>
+        <w:rPr>
+          <w:lang w:val="en-US"/>
+        </w:rPr>
+        <w:t xml:space="preserve"> and low power is about </w:t>
       </w:r>
       <w:r>
         <w:rPr>
@@ -786,7 +1024,49 @@
         <w:rPr>
           <w:lang w:val="en-US"/>
         </w:rPr>
-        <w:t>button top style and protection is recommended. The 18650 battery length is a very loose standard and some batteries may not fit. Too long and they cannot be used. Too short, it might be possible to bend the contacts on the battery holder negative side. The battery holder is polarized to prevent insertion in the wrong direction. Do not defeat the feature or magic blue smoke may appear from the PCB!</w:t>
+        <w:t xml:space="preserve">button top style and protection is recommended. The </w:t>
+      </w:r>
+      <w:proofErr w:type="gramStart"/>
+      <w:r>
+        <w:rPr>
+          <w:lang w:val="en-US"/>
+        </w:rPr>
+        <w:t>18650 battery</w:t>
+      </w:r>
+      <w:proofErr w:type="gramEnd"/>
+      <w:r>
+        <w:rPr>
+          <w:lang w:val="en-US"/>
+        </w:rPr>
+        <w:t xml:space="preserve"> length is a very loose </w:t>
+      </w:r>
+      <w:proofErr w:type="gramStart"/>
+      <w:r>
+        <w:rPr>
+          <w:lang w:val="en-US"/>
+        </w:rPr>
+        <w:t>standard</w:t>
+      </w:r>
+      <w:proofErr w:type="gramEnd"/>
+      <w:r>
+        <w:rPr>
+          <w:lang w:val="en-US"/>
+        </w:rPr>
+        <w:t xml:space="preserve"> and some batteries may not fit. </w:t>
+      </w:r>
+      <w:proofErr w:type="gramStart"/>
+      <w:r>
+        <w:rPr>
+          <w:lang w:val="en-US"/>
+        </w:rPr>
+        <w:t>Too</w:t>
+      </w:r>
+      <w:proofErr w:type="gramEnd"/>
+      <w:r>
+        <w:rPr>
+          <w:lang w:val="en-US"/>
+        </w:rPr>
+        <w:t xml:space="preserve"> long and they cannot be used. Too short, it might be possible to bend the contacts on the battery holder negative side. The battery holder is polarized to prevent insertion in the wrong direction. Do not defeat the feature or magic blue smoke may appear from the PCB!</w:t>
       </w:r>
     </w:p>
     <w:p>
@@ -802,7 +1082,35 @@
         <w:rPr>
           <w:lang w:val="en-US"/>
         </w:rPr>
-        <w:t>The actual runtime depends on the transmitting time and quality of the batteries. There are many deceptively labelled 18650 batteries available. The best one are made by Panasonic and Sanyo. Using 1 minute transmit, 4 minutes pause, low power setting, and display dimming the Fox Radio ran for 12 hours using Panasonic batteries.</w:t>
+        <w:t xml:space="preserve">The actual runtime depends on the transmitting time and quality of the batteries. There are many deceptively labelled 18650 batteries available. The best </w:t>
+      </w:r>
+      <w:proofErr w:type="gramStart"/>
+      <w:r>
+        <w:rPr>
+          <w:lang w:val="en-US"/>
+        </w:rPr>
+        <w:t>one</w:t>
+      </w:r>
+      <w:proofErr w:type="gramEnd"/>
+      <w:r>
+        <w:rPr>
+          <w:lang w:val="en-US"/>
+        </w:rPr>
+        <w:t xml:space="preserve"> </w:t>
+      </w:r>
+      <w:proofErr w:type="gramStart"/>
+      <w:r>
+        <w:rPr>
+          <w:lang w:val="en-US"/>
+        </w:rPr>
+        <w:t>are</w:t>
+      </w:r>
+      <w:proofErr w:type="gramEnd"/>
+      <w:r>
+        <w:rPr>
+          <w:lang w:val="en-US"/>
+        </w:rPr>
+        <w:t xml:space="preserve"> made by Panasonic and Sanyo. Using 1 minute transmit, 4 minutes pause, low power setting, and display dimming the Fox Radio ran for 12 hours using Panasonic batteries.</w:t>
       </w:r>
     </w:p>
     <w:p>
@@ -829,13 +1137,38 @@
         </w:rPr>
         <w:t xml:space="preserve">The files are saved as .TXT and simply contain a list of tones to be played. The format is similar the hard coded files from here: </w:t>
       </w:r>
-      <w:hyperlink r:id="rId9">
+      <w:hyperlink r:id="rId10">
+        <w:proofErr w:type="spellStart"/>
         <w:r>
           <w:rPr>
             <w:rStyle w:val="Hyperlink"/>
             <w:lang w:val="en-US"/>
           </w:rPr>
-          <w:t>robsoncouto/arduino-songs (github.com)</w:t>
+          <w:t>robsoncouto</w:t>
+        </w:r>
+        <w:proofErr w:type="spellEnd"/>
+        <w:r>
+          <w:rPr>
+            <w:rStyle w:val="Hyperlink"/>
+            <w:lang w:val="en-US"/>
+          </w:rPr>
+          <w:t>/</w:t>
+        </w:r>
+        <w:proofErr w:type="spellStart"/>
+        <w:r>
+          <w:rPr>
+            <w:rStyle w:val="Hyperlink"/>
+            <w:lang w:val="en-US"/>
+          </w:rPr>
+          <w:t>arduino</w:t>
+        </w:r>
+        <w:proofErr w:type="spellEnd"/>
+        <w:r>
+          <w:rPr>
+            <w:rStyle w:val="Hyperlink"/>
+            <w:lang w:val="en-US"/>
+          </w:rPr>
+          <w:t>-songs (github.com)</w:t>
         </w:r>
       </w:hyperlink>
     </w:p>
@@ -902,286 +1235,863 @@
           <w:bCs/>
         </w:rPr>
       </w:pPr>
+      <w:proofErr w:type="gramStart"/>
       <w:r>
         <w:rPr>
           <w:b/>
           <w:bCs/>
         </w:rPr>
-        <w:t>there are two values per note (pitch and duration)</w:t>
-      </w:r>
-    </w:p>
-    <w:p>
-      <w:pPr>
+        <w:t>there</w:t>
+      </w:r>
+      <w:proofErr w:type="gramEnd"/>
+      <w:r>
         <w:rPr>
           <w:b/>
           <w:bCs/>
         </w:rPr>
-      </w:pPr>
-      <w:r>
+        <w:t xml:space="preserve"> are two values per note (pitch and duration)</w:t>
+      </w:r>
+    </w:p>
+    <w:p>
+      <w:pPr>
         <w:rPr>
           <w:b/>
           <w:bCs/>
         </w:rPr>
-        <w:t>make sure each token ends with a ','</w:t>
-      </w:r>
-    </w:p>
-    <w:p>
-      <w:pPr>
+      </w:pPr>
+      <w:r>
         <w:rPr>
           <w:b/>
           <w:bCs/>
         </w:rPr>
-      </w:pPr>
-      <w:r>
+        <w:t>make sure each token ends with a ','</w:t>
+      </w:r>
+    </w:p>
+    <w:p>
+      <w:pPr>
         <w:rPr>
           <w:b/>
           <w:bCs/>
         </w:rPr>
-        <w:t>and that the data starts with the tilde which must not be in these comments</w:t>
-      </w:r>
-    </w:p>
-    <w:p>
-      <w:pPr>
+      </w:pPr>
+      <w:r>
         <w:rPr>
           <w:b/>
           <w:bCs/>
-          <w:lang w:val="en-US"/>
-        </w:rPr>
-      </w:pPr>
-      <w:r>
+        </w:rPr>
+        <w:t>and that the data starts with the tilde which must not be in these comments</w:t>
+      </w:r>
+    </w:p>
+    <w:p>
+      <w:pPr>
         <w:rPr>
           <w:b/>
           <w:bCs/>
           <w:lang w:val="en-US"/>
         </w:rPr>
-        <w:t>LENGTH, %val can be used to set the length of the note, it defaults to 90% and 10% quiet after the note</w:t>
-      </w:r>
-    </w:p>
-    <w:p>
-      <w:pPr>
+      </w:pPr>
+      <w:r>
         <w:rPr>
           <w:b/>
           <w:bCs/>
-        </w:rPr>
-      </w:pPr>
+          <w:lang w:val="en-US"/>
+        </w:rPr>
+        <w:t>LENGTH, %</w:t>
+      </w:r>
+      <w:proofErr w:type="spellStart"/>
       <w:r>
         <w:rPr>
           <w:b/>
           <w:bCs/>
-        </w:rPr>
-        <w:t>This can be used for pizzicato notes, LENGTH, 25, for example</w:t>
-      </w:r>
-    </w:p>
-    <w:p>
-      <w:pPr>
+          <w:lang w:val="en-US"/>
+        </w:rPr>
+        <w:t>val</w:t>
+      </w:r>
+      <w:proofErr w:type="spellEnd"/>
+      <w:r>
         <w:rPr>
           <w:b/>
           <w:bCs/>
-        </w:rPr>
-      </w:pPr>
-      <w:r>
+          <w:lang w:val="en-US"/>
+        </w:rPr>
+        <w:t xml:space="preserve"> can be used to set the length of the note, it defaults to 90% and 10% quiet after the note</w:t>
+      </w:r>
+    </w:p>
+    <w:p>
+      <w:pPr>
         <w:rPr>
           <w:b/>
           <w:bCs/>
         </w:rPr>
-        <w:t>~</w:t>
-      </w:r>
-    </w:p>
-    <w:p>
-      <w:pPr>
+      </w:pPr>
+      <w:r>
         <w:rPr>
           <w:b/>
           <w:bCs/>
         </w:rPr>
-      </w:pPr>
-      <w:r>
+        <w:lastRenderedPageBreak/>
+        <w:t>This can be used for pizzicato notes, LENGTH, 25, for example</w:t>
+      </w:r>
+    </w:p>
+    <w:p>
+      <w:pPr>
         <w:rPr>
           <w:b/>
           <w:bCs/>
         </w:rPr>
-        <w:t>TEMPO, 145,</w:t>
-      </w:r>
-    </w:p>
-    <w:p>
-      <w:pPr>
+      </w:pPr>
+      <w:r>
         <w:rPr>
           <w:b/>
           <w:bCs/>
         </w:rPr>
-      </w:pPr>
-      <w:r>
+        <w:t>~</w:t>
+      </w:r>
+    </w:p>
+    <w:p>
+      <w:pPr>
         <w:rPr>
           <w:b/>
           <w:bCs/>
         </w:rPr>
-        <w:t>LENGTH, 90,</w:t>
-      </w:r>
-    </w:p>
-    <w:p>
-      <w:pPr>
+      </w:pPr>
+      <w:r>
         <w:rPr>
           <w:b/>
           <w:bCs/>
-          <w:lang w:val="en-US"/>
-        </w:rPr>
-      </w:pPr>
-      <w:r>
+        </w:rPr>
+        <w:t>TEMPO, 145,</w:t>
+      </w:r>
+    </w:p>
+    <w:p>
+      <w:pPr>
         <w:rPr>
           <w:b/>
           <w:bCs/>
-          <w:lang w:val="en-US"/>
-        </w:rPr>
-        <w:t>NOTE_E5, 4,  NOTE_B4, 8,  NOTE_C5, 8,  NOTE_D5, 4,  NOTE_C5, 8,  NOTE_B4, 8,</w:t>
-      </w:r>
-    </w:p>
-    <w:p>
-      <w:pPr>
+        </w:rPr>
+      </w:pPr>
+      <w:r>
         <w:rPr>
           <w:b/>
           <w:bCs/>
-          <w:lang w:val="en-US"/>
-        </w:rPr>
-      </w:pPr>
-      <w:r>
+        </w:rPr>
+        <w:t>LENGTH, 90,</w:t>
+      </w:r>
+    </w:p>
+    <w:p>
+      <w:pPr>
         <w:rPr>
           <w:b/>
           <w:bCs/>
           <w:lang w:val="en-US"/>
         </w:rPr>
-        <w:lastRenderedPageBreak/>
-        <w:t>NOTE_A4, 4,  NOTE_A4, 8,  NOTE_C5, 8,  NOTE_E5, 4,  NOTE_D5, 8,  NOTE_C5, 8,</w:t>
-      </w:r>
-    </w:p>
-    <w:p>
-      <w:pPr>
+      </w:pPr>
+      <w:r>
         <w:rPr>
           <w:b/>
           <w:bCs/>
           <w:lang w:val="en-US"/>
         </w:rPr>
-      </w:pPr>
+        <w:t xml:space="preserve">NOTE_E5, </w:t>
+      </w:r>
+      <w:proofErr w:type="gramStart"/>
       <w:r>
         <w:rPr>
           <w:b/>
           <w:bCs/>
           <w:lang w:val="en-US"/>
         </w:rPr>
-        <w:t>NOTE_B4, -4, NOTE_C5, 8,  NOTE_D5, 4,  NOTE_E5, 4,</w:t>
-      </w:r>
-    </w:p>
-    <w:p>
-      <w:pPr>
+        <w:t>4,  NOTE</w:t>
+      </w:r>
+      <w:proofErr w:type="gramEnd"/>
+      <w:r>
         <w:rPr>
           <w:b/>
           <w:bCs/>
           <w:lang w:val="en-US"/>
         </w:rPr>
-      </w:pPr>
+        <w:t xml:space="preserve">_B4, </w:t>
+      </w:r>
+      <w:proofErr w:type="gramStart"/>
       <w:r>
         <w:rPr>
           <w:b/>
           <w:bCs/>
           <w:lang w:val="en-US"/>
         </w:rPr>
-        <w:t>NOTE_C5, 4,  NOTE_A4, 4,  NOTE_A4, 8,  NOTE_A4, 4,  NOTE_B4, 8,  NOTE_C5, 8,</w:t>
-      </w:r>
-    </w:p>
-    <w:p>
-      <w:pPr>
+        <w:t>8,  NOTE</w:t>
+      </w:r>
+      <w:proofErr w:type="gramEnd"/>
+      <w:r>
         <w:rPr>
           <w:b/>
           <w:bCs/>
           <w:lang w:val="en-US"/>
         </w:rPr>
-      </w:pPr>
+        <w:t xml:space="preserve">_C5, </w:t>
+      </w:r>
+      <w:proofErr w:type="gramStart"/>
       <w:r>
         <w:rPr>
           <w:b/>
           <w:bCs/>
           <w:lang w:val="en-US"/>
         </w:rPr>
-        <w:t>NOTE_D5, -4, NOTE_F5, 8,  NOTE_A5, 4,  NOTE_G5, 8,  NOTE_F5, 8,</w:t>
-      </w:r>
-    </w:p>
-    <w:p>
-      <w:pPr>
+        <w:t>8,  NOTE</w:t>
+      </w:r>
+      <w:proofErr w:type="gramEnd"/>
+      <w:r>
         <w:rPr>
           <w:b/>
           <w:bCs/>
           <w:lang w:val="en-US"/>
         </w:rPr>
-      </w:pPr>
+        <w:t xml:space="preserve">_D5, </w:t>
+      </w:r>
+      <w:proofErr w:type="gramStart"/>
       <w:r>
         <w:rPr>
           <w:b/>
           <w:bCs/>
           <w:lang w:val="en-US"/>
         </w:rPr>
-        <w:t>NOTE_E5, -4, NOTE_C5, 8,  NOTE_E5, 4,  NOTE_D5, 8,  NOTE_C5, 8,</w:t>
-      </w:r>
-    </w:p>
-    <w:p>
-      <w:pPr>
+        <w:t>4,  NOTE</w:t>
+      </w:r>
+      <w:proofErr w:type="gramEnd"/>
+      <w:r>
         <w:rPr>
           <w:b/>
           <w:bCs/>
           <w:lang w:val="en-US"/>
         </w:rPr>
-      </w:pPr>
+        <w:t xml:space="preserve">_C5, </w:t>
+      </w:r>
+      <w:proofErr w:type="gramStart"/>
       <w:r>
         <w:rPr>
           <w:b/>
           <w:bCs/>
           <w:lang w:val="en-US"/>
         </w:rPr>
-        <w:t>NOTE_B4, 4,  NOTE_B4, 8,  NOTE_C5, 8,  NOTE_D5, 4,  NOTE_E5, 4,</w:t>
-      </w:r>
-    </w:p>
-    <w:p>
-      <w:pPr>
+        <w:t>8,  NOTE</w:t>
+      </w:r>
+      <w:proofErr w:type="gramEnd"/>
+      <w:r>
         <w:rPr>
           <w:b/>
           <w:bCs/>
           <w:lang w:val="en-US"/>
         </w:rPr>
-      </w:pPr>
-      <w:r>
+        <w:t>_B4, 8,</w:t>
+      </w:r>
+    </w:p>
+    <w:p>
+      <w:pPr>
         <w:rPr>
           <w:b/>
           <w:bCs/>
           <w:lang w:val="en-US"/>
         </w:rPr>
-        <w:t>NOTE_C5, 4,  NOTE_A4, 4,  NOTE_A4, 4, REST, 4,</w:t>
-      </w:r>
-    </w:p>
-    <w:p>
-      <w:pPr>
-        <w:pStyle w:val="Heading1"/>
-      </w:pPr>
-      <w:r>
-        <w:t>Updating Firmware</w:t>
-      </w:r>
-    </w:p>
-    <w:p>
-      <w:r>
-        <w:rPr>
-          <w:lang w:val="en-US"/>
-        </w:rPr>
-        <w:t xml:space="preserve">The new file must be put on the SD card and named RadioFox.bin. The system menu has an entry </w:t>
-      </w:r>
+      </w:pPr>
       <w:r>
         <w:rPr>
           <w:b/>
           <w:bCs/>
           <w:lang w:val="en-US"/>
         </w:rPr>
+        <w:t xml:space="preserve">NOTE_A4, </w:t>
+      </w:r>
+      <w:proofErr w:type="gramStart"/>
+      <w:r>
+        <w:rPr>
+          <w:b/>
+          <w:bCs/>
+          <w:lang w:val="en-US"/>
+        </w:rPr>
+        <w:t>4,  NOTE</w:t>
+      </w:r>
+      <w:proofErr w:type="gramEnd"/>
+      <w:r>
+        <w:rPr>
+          <w:b/>
+          <w:bCs/>
+          <w:lang w:val="en-US"/>
+        </w:rPr>
+        <w:t xml:space="preserve">_A4, </w:t>
+      </w:r>
+      <w:proofErr w:type="gramStart"/>
+      <w:r>
+        <w:rPr>
+          <w:b/>
+          <w:bCs/>
+          <w:lang w:val="en-US"/>
+        </w:rPr>
+        <w:t>8,  NOTE</w:t>
+      </w:r>
+      <w:proofErr w:type="gramEnd"/>
+      <w:r>
+        <w:rPr>
+          <w:b/>
+          <w:bCs/>
+          <w:lang w:val="en-US"/>
+        </w:rPr>
+        <w:t xml:space="preserve">_C5, </w:t>
+      </w:r>
+      <w:proofErr w:type="gramStart"/>
+      <w:r>
+        <w:rPr>
+          <w:b/>
+          <w:bCs/>
+          <w:lang w:val="en-US"/>
+        </w:rPr>
+        <w:t>8,  NOTE</w:t>
+      </w:r>
+      <w:proofErr w:type="gramEnd"/>
+      <w:r>
+        <w:rPr>
+          <w:b/>
+          <w:bCs/>
+          <w:lang w:val="en-US"/>
+        </w:rPr>
+        <w:t xml:space="preserve">_E5, </w:t>
+      </w:r>
+      <w:proofErr w:type="gramStart"/>
+      <w:r>
+        <w:rPr>
+          <w:b/>
+          <w:bCs/>
+          <w:lang w:val="en-US"/>
+        </w:rPr>
+        <w:t>4,  NOTE</w:t>
+      </w:r>
+      <w:proofErr w:type="gramEnd"/>
+      <w:r>
+        <w:rPr>
+          <w:b/>
+          <w:bCs/>
+          <w:lang w:val="en-US"/>
+        </w:rPr>
+        <w:t xml:space="preserve">_D5, </w:t>
+      </w:r>
+      <w:proofErr w:type="gramStart"/>
+      <w:r>
+        <w:rPr>
+          <w:b/>
+          <w:bCs/>
+          <w:lang w:val="en-US"/>
+        </w:rPr>
+        <w:t>8,  NOTE</w:t>
+      </w:r>
+      <w:proofErr w:type="gramEnd"/>
+      <w:r>
+        <w:rPr>
+          <w:b/>
+          <w:bCs/>
+          <w:lang w:val="en-US"/>
+        </w:rPr>
+        <w:t>_C5, 8,</w:t>
+      </w:r>
+    </w:p>
+    <w:p>
+      <w:pPr>
+        <w:rPr>
+          <w:b/>
+          <w:bCs/>
+          <w:lang w:val="en-US"/>
+        </w:rPr>
+      </w:pPr>
+      <w:r>
+        <w:rPr>
+          <w:b/>
+          <w:bCs/>
+          <w:lang w:val="en-US"/>
+        </w:rPr>
+        <w:t xml:space="preserve">NOTE_B4, -4, NOTE_C5, </w:t>
+      </w:r>
+      <w:proofErr w:type="gramStart"/>
+      <w:r>
+        <w:rPr>
+          <w:b/>
+          <w:bCs/>
+          <w:lang w:val="en-US"/>
+        </w:rPr>
+        <w:t>8,  NOTE</w:t>
+      </w:r>
+      <w:proofErr w:type="gramEnd"/>
+      <w:r>
+        <w:rPr>
+          <w:b/>
+          <w:bCs/>
+          <w:lang w:val="en-US"/>
+        </w:rPr>
+        <w:t xml:space="preserve">_D5, </w:t>
+      </w:r>
+      <w:proofErr w:type="gramStart"/>
+      <w:r>
+        <w:rPr>
+          <w:b/>
+          <w:bCs/>
+          <w:lang w:val="en-US"/>
+        </w:rPr>
+        <w:t>4,  NOTE</w:t>
+      </w:r>
+      <w:proofErr w:type="gramEnd"/>
+      <w:r>
+        <w:rPr>
+          <w:b/>
+          <w:bCs/>
+          <w:lang w:val="en-US"/>
+        </w:rPr>
+        <w:t>_E5, 4,</w:t>
+      </w:r>
+    </w:p>
+    <w:p>
+      <w:pPr>
+        <w:rPr>
+          <w:b/>
+          <w:bCs/>
+          <w:lang w:val="en-US"/>
+        </w:rPr>
+      </w:pPr>
+      <w:r>
+        <w:rPr>
+          <w:b/>
+          <w:bCs/>
+          <w:lang w:val="en-US"/>
+        </w:rPr>
+        <w:t xml:space="preserve">NOTE_C5, </w:t>
+      </w:r>
+      <w:proofErr w:type="gramStart"/>
+      <w:r>
+        <w:rPr>
+          <w:b/>
+          <w:bCs/>
+          <w:lang w:val="en-US"/>
+        </w:rPr>
+        <w:t>4,  NOTE</w:t>
+      </w:r>
+      <w:proofErr w:type="gramEnd"/>
+      <w:r>
+        <w:rPr>
+          <w:b/>
+          <w:bCs/>
+          <w:lang w:val="en-US"/>
+        </w:rPr>
+        <w:t xml:space="preserve">_A4, </w:t>
+      </w:r>
+      <w:proofErr w:type="gramStart"/>
+      <w:r>
+        <w:rPr>
+          <w:b/>
+          <w:bCs/>
+          <w:lang w:val="en-US"/>
+        </w:rPr>
+        <w:t>4,  NOTE</w:t>
+      </w:r>
+      <w:proofErr w:type="gramEnd"/>
+      <w:r>
+        <w:rPr>
+          <w:b/>
+          <w:bCs/>
+          <w:lang w:val="en-US"/>
+        </w:rPr>
+        <w:t xml:space="preserve">_A4, </w:t>
+      </w:r>
+      <w:proofErr w:type="gramStart"/>
+      <w:r>
+        <w:rPr>
+          <w:b/>
+          <w:bCs/>
+          <w:lang w:val="en-US"/>
+        </w:rPr>
+        <w:t>8,  NOTE</w:t>
+      </w:r>
+      <w:proofErr w:type="gramEnd"/>
+      <w:r>
+        <w:rPr>
+          <w:b/>
+          <w:bCs/>
+          <w:lang w:val="en-US"/>
+        </w:rPr>
+        <w:t xml:space="preserve">_A4, </w:t>
+      </w:r>
+      <w:proofErr w:type="gramStart"/>
+      <w:r>
+        <w:rPr>
+          <w:b/>
+          <w:bCs/>
+          <w:lang w:val="en-US"/>
+        </w:rPr>
+        <w:t>4,  NOTE</w:t>
+      </w:r>
+      <w:proofErr w:type="gramEnd"/>
+      <w:r>
+        <w:rPr>
+          <w:b/>
+          <w:bCs/>
+          <w:lang w:val="en-US"/>
+        </w:rPr>
+        <w:t xml:space="preserve">_B4, </w:t>
+      </w:r>
+      <w:proofErr w:type="gramStart"/>
+      <w:r>
+        <w:rPr>
+          <w:b/>
+          <w:bCs/>
+          <w:lang w:val="en-US"/>
+        </w:rPr>
+        <w:t>8,  NOTE</w:t>
+      </w:r>
+      <w:proofErr w:type="gramEnd"/>
+      <w:r>
+        <w:rPr>
+          <w:b/>
+          <w:bCs/>
+          <w:lang w:val="en-US"/>
+        </w:rPr>
+        <w:t>_C5, 8,</w:t>
+      </w:r>
+    </w:p>
+    <w:p>
+      <w:pPr>
+        <w:rPr>
+          <w:b/>
+          <w:bCs/>
+          <w:lang w:val="en-US"/>
+        </w:rPr>
+      </w:pPr>
+      <w:r>
+        <w:rPr>
+          <w:b/>
+          <w:bCs/>
+          <w:lang w:val="en-US"/>
+        </w:rPr>
+        <w:t xml:space="preserve">NOTE_D5, -4, NOTE_F5, </w:t>
+      </w:r>
+      <w:proofErr w:type="gramStart"/>
+      <w:r>
+        <w:rPr>
+          <w:b/>
+          <w:bCs/>
+          <w:lang w:val="en-US"/>
+        </w:rPr>
+        <w:t>8,  NOTE</w:t>
+      </w:r>
+      <w:proofErr w:type="gramEnd"/>
+      <w:r>
+        <w:rPr>
+          <w:b/>
+          <w:bCs/>
+          <w:lang w:val="en-US"/>
+        </w:rPr>
+        <w:t xml:space="preserve">_A5, </w:t>
+      </w:r>
+      <w:proofErr w:type="gramStart"/>
+      <w:r>
+        <w:rPr>
+          <w:b/>
+          <w:bCs/>
+          <w:lang w:val="en-US"/>
+        </w:rPr>
+        <w:t>4,  NOTE</w:t>
+      </w:r>
+      <w:proofErr w:type="gramEnd"/>
+      <w:r>
+        <w:rPr>
+          <w:b/>
+          <w:bCs/>
+          <w:lang w:val="en-US"/>
+        </w:rPr>
+        <w:t xml:space="preserve">_G5, </w:t>
+      </w:r>
+      <w:proofErr w:type="gramStart"/>
+      <w:r>
+        <w:rPr>
+          <w:b/>
+          <w:bCs/>
+          <w:lang w:val="en-US"/>
+        </w:rPr>
+        <w:t>8,  NOTE</w:t>
+      </w:r>
+      <w:proofErr w:type="gramEnd"/>
+      <w:r>
+        <w:rPr>
+          <w:b/>
+          <w:bCs/>
+          <w:lang w:val="en-US"/>
+        </w:rPr>
+        <w:t>_F5, 8,</w:t>
+      </w:r>
+    </w:p>
+    <w:p>
+      <w:pPr>
+        <w:rPr>
+          <w:b/>
+          <w:bCs/>
+          <w:lang w:val="en-US"/>
+        </w:rPr>
+      </w:pPr>
+      <w:r>
+        <w:rPr>
+          <w:b/>
+          <w:bCs/>
+          <w:lang w:val="en-US"/>
+        </w:rPr>
+        <w:t xml:space="preserve">NOTE_E5, -4, NOTE_C5, </w:t>
+      </w:r>
+      <w:proofErr w:type="gramStart"/>
+      <w:r>
+        <w:rPr>
+          <w:b/>
+          <w:bCs/>
+          <w:lang w:val="en-US"/>
+        </w:rPr>
+        <w:t>8,  NOTE</w:t>
+      </w:r>
+      <w:proofErr w:type="gramEnd"/>
+      <w:r>
+        <w:rPr>
+          <w:b/>
+          <w:bCs/>
+          <w:lang w:val="en-US"/>
+        </w:rPr>
+        <w:t xml:space="preserve">_E5, </w:t>
+      </w:r>
+      <w:proofErr w:type="gramStart"/>
+      <w:r>
+        <w:rPr>
+          <w:b/>
+          <w:bCs/>
+          <w:lang w:val="en-US"/>
+        </w:rPr>
+        <w:t>4,  NOTE</w:t>
+      </w:r>
+      <w:proofErr w:type="gramEnd"/>
+      <w:r>
+        <w:rPr>
+          <w:b/>
+          <w:bCs/>
+          <w:lang w:val="en-US"/>
+        </w:rPr>
+        <w:t xml:space="preserve">_D5, </w:t>
+      </w:r>
+      <w:proofErr w:type="gramStart"/>
+      <w:r>
+        <w:rPr>
+          <w:b/>
+          <w:bCs/>
+          <w:lang w:val="en-US"/>
+        </w:rPr>
+        <w:t>8,  NOTE</w:t>
+      </w:r>
+      <w:proofErr w:type="gramEnd"/>
+      <w:r>
+        <w:rPr>
+          <w:b/>
+          <w:bCs/>
+          <w:lang w:val="en-US"/>
+        </w:rPr>
+        <w:t>_C5, 8,</w:t>
+      </w:r>
+    </w:p>
+    <w:p>
+      <w:pPr>
+        <w:rPr>
+          <w:b/>
+          <w:bCs/>
+          <w:lang w:val="en-US"/>
+        </w:rPr>
+      </w:pPr>
+      <w:r>
+        <w:rPr>
+          <w:b/>
+          <w:bCs/>
+          <w:lang w:val="en-US"/>
+        </w:rPr>
+        <w:t xml:space="preserve">NOTE_B4, </w:t>
+      </w:r>
+      <w:proofErr w:type="gramStart"/>
+      <w:r>
+        <w:rPr>
+          <w:b/>
+          <w:bCs/>
+          <w:lang w:val="en-US"/>
+        </w:rPr>
+        <w:t>4,  NOTE</w:t>
+      </w:r>
+      <w:proofErr w:type="gramEnd"/>
+      <w:r>
+        <w:rPr>
+          <w:b/>
+          <w:bCs/>
+          <w:lang w:val="en-US"/>
+        </w:rPr>
+        <w:t xml:space="preserve">_B4, </w:t>
+      </w:r>
+      <w:proofErr w:type="gramStart"/>
+      <w:r>
+        <w:rPr>
+          <w:b/>
+          <w:bCs/>
+          <w:lang w:val="en-US"/>
+        </w:rPr>
+        <w:t>8,  NOTE</w:t>
+      </w:r>
+      <w:proofErr w:type="gramEnd"/>
+      <w:r>
+        <w:rPr>
+          <w:b/>
+          <w:bCs/>
+          <w:lang w:val="en-US"/>
+        </w:rPr>
+        <w:t xml:space="preserve">_C5, </w:t>
+      </w:r>
+      <w:proofErr w:type="gramStart"/>
+      <w:r>
+        <w:rPr>
+          <w:b/>
+          <w:bCs/>
+          <w:lang w:val="en-US"/>
+        </w:rPr>
+        <w:t>8,  NOTE</w:t>
+      </w:r>
+      <w:proofErr w:type="gramEnd"/>
+      <w:r>
+        <w:rPr>
+          <w:b/>
+          <w:bCs/>
+          <w:lang w:val="en-US"/>
+        </w:rPr>
+        <w:t xml:space="preserve">_D5, </w:t>
+      </w:r>
+      <w:proofErr w:type="gramStart"/>
+      <w:r>
+        <w:rPr>
+          <w:b/>
+          <w:bCs/>
+          <w:lang w:val="en-US"/>
+        </w:rPr>
+        <w:t>4,  NOTE</w:t>
+      </w:r>
+      <w:proofErr w:type="gramEnd"/>
+      <w:r>
+        <w:rPr>
+          <w:b/>
+          <w:bCs/>
+          <w:lang w:val="en-US"/>
+        </w:rPr>
+        <w:t>_E5, 4,</w:t>
+      </w:r>
+    </w:p>
+    <w:p>
+      <w:pPr>
+        <w:rPr>
+          <w:b/>
+          <w:bCs/>
+          <w:lang w:val="en-US"/>
+        </w:rPr>
+      </w:pPr>
+      <w:r>
+        <w:rPr>
+          <w:b/>
+          <w:bCs/>
+          <w:lang w:val="en-US"/>
+        </w:rPr>
+        <w:t xml:space="preserve">NOTE_C5, </w:t>
+      </w:r>
+      <w:proofErr w:type="gramStart"/>
+      <w:r>
+        <w:rPr>
+          <w:b/>
+          <w:bCs/>
+          <w:lang w:val="en-US"/>
+        </w:rPr>
+        <w:t>4,  NOTE</w:t>
+      </w:r>
+      <w:proofErr w:type="gramEnd"/>
+      <w:r>
+        <w:rPr>
+          <w:b/>
+          <w:bCs/>
+          <w:lang w:val="en-US"/>
+        </w:rPr>
+        <w:t xml:space="preserve">_A4, </w:t>
+      </w:r>
+      <w:proofErr w:type="gramStart"/>
+      <w:r>
+        <w:rPr>
+          <w:b/>
+          <w:bCs/>
+          <w:lang w:val="en-US"/>
+        </w:rPr>
+        <w:t>4,  NOTE</w:t>
+      </w:r>
+      <w:proofErr w:type="gramEnd"/>
+      <w:r>
+        <w:rPr>
+          <w:b/>
+          <w:bCs/>
+          <w:lang w:val="en-US"/>
+        </w:rPr>
+        <w:t>_A4, 4, REST, 4,</w:t>
+      </w:r>
+    </w:p>
+    <w:p>
+      <w:pPr>
+        <w:pStyle w:val="Heading1"/>
+      </w:pPr>
+      <w:r>
+        <w:t>Updating Firmware</w:t>
+      </w:r>
+    </w:p>
+    <w:p>
+      <w:r>
+        <w:rPr>
+          <w:lang w:val="en-US"/>
+        </w:rPr>
+        <w:t xml:space="preserve">The new file must be put on the SD card and named </w:t>
+      </w:r>
+      <w:proofErr w:type="spellStart"/>
+      <w:r>
+        <w:rPr>
+          <w:lang w:val="en-US"/>
+        </w:rPr>
+        <w:t>RadioFox.bin</w:t>
+      </w:r>
+      <w:proofErr w:type="spellEnd"/>
+      <w:r>
+        <w:rPr>
+          <w:lang w:val="en-US"/>
+        </w:rPr>
+        <w:t xml:space="preserve">. The system menu has an entry </w:t>
+      </w:r>
+      <w:r>
+        <w:rPr>
+          <w:b/>
+          <w:bCs/>
+          <w:lang w:val="en-US"/>
+        </w:rPr>
         <w:t>New Version BIN file</w:t>
       </w:r>
       <w:r>
         <w:rPr>
           <w:lang w:val="en-US"/>
         </w:rPr>
-        <w:t xml:space="preserve"> that will attempt to load this file. Confirmation will be required from the dial, After loading the BIN file can optionally be erased.</w:t>
+        <w:t xml:space="preserve"> that will attempt to load this file. Confirmation will be required from the dial, </w:t>
+      </w:r>
+      <w:proofErr w:type="gramStart"/>
+      <w:r>
+        <w:rPr>
+          <w:lang w:val="en-US"/>
+        </w:rPr>
+        <w:t>After</w:t>
+      </w:r>
+      <w:proofErr w:type="gramEnd"/>
+      <w:r>
+        <w:rPr>
+          <w:lang w:val="en-US"/>
+        </w:rPr>
+        <w:t xml:space="preserve"> loading the BIN file can optionally be erased.</w:t>
       </w:r>
     </w:p>
     <w:p>
@@ -1197,7 +2107,21 @@
         <w:rPr>
           <w:lang w:val="en-US"/>
         </w:rPr>
-        <w:t>DTMF (aka touch-tones) can be sent from the transmitter to control certain operations of the radio. It works best when the tones are sent for at least a second. It is usually also necessary to wait 2 seconds after pressing the transmit button on the radio. All commands consist of a ‘*’ followed by a digit. The following commands are available.</w:t>
+        <w:t xml:space="preserve">DTMF (aka touch-tones) can be sent from the transmitter to control certain operations of the radio. It works best when the tones are sent for at least a second. It is usually also necessary to wait 2 seconds after pressing the transmit button on the radio. All commands consist of </w:t>
+      </w:r>
+      <w:proofErr w:type="gramStart"/>
+      <w:r>
+        <w:rPr>
+          <w:lang w:val="en-US"/>
+        </w:rPr>
+        <w:t>a ‘*’</w:t>
+      </w:r>
+      <w:proofErr w:type="gramEnd"/>
+      <w:r>
+        <w:rPr>
+          <w:lang w:val="en-US"/>
+        </w:rPr>
+        <w:t xml:space="preserve"> followed by a digit. The following commands are available.</w:t>
       </w:r>
     </w:p>
     <w:p/>
@@ -1206,7 +2130,21 @@
         <w:rPr>
           <w:lang w:val="en-US"/>
         </w:rPr>
-        <w:t>Please feel free to request additional commands. I’m sure there are other usual things that can be done remotely using DTMF signals. Also note that these functions have not yet been tested extensively so there may be some bugs in the code. I will fix as soon as I can after I find out what they are.</w:t>
+        <w:t xml:space="preserve">Please feel free to request additional commands. I’m sure there are other usual things that can be done remotely using DTMF signals. Also note that these functions have not yet been tested extensively so there may be some bugs in the code. I will </w:t>
+      </w:r>
+      <w:proofErr w:type="gramStart"/>
+      <w:r>
+        <w:rPr>
+          <w:lang w:val="en-US"/>
+        </w:rPr>
+        <w:t>fix</w:t>
+      </w:r>
+      <w:proofErr w:type="gramEnd"/>
+      <w:r>
+        <w:rPr>
+          <w:lang w:val="en-US"/>
+        </w:rPr>
+        <w:t xml:space="preserve"> as soon as I can after I find out what they are.</w:t>
       </w:r>
     </w:p>
     <w:p>
@@ -1255,22 +2193,6 @@
     <w:p>
       <w:r>
         <w:t>Set low power mode.</w:t>
-      </w:r>
-    </w:p>
-    <w:p>
-      <w:pPr>
-        <w:pStyle w:val="Heading2"/>
-      </w:pPr>
-      <w:r>
-        <w:t>DTMF *</w:t>
-      </w:r>
-      <w:r>
-        <w:t>5</w:t>
-      </w:r>
-    </w:p>
-    <w:p>
-      <w:r>
-        <w:t>Set high power mode.</w:t>
       </w:r>
     </w:p>
     <w:p>
@@ -1282,6 +2204,22 @@
         <w:t>DTMF *</w:t>
       </w:r>
       <w:r>
+        <w:t>5</w:t>
+      </w:r>
+    </w:p>
+    <w:p>
+      <w:r>
+        <w:t>Set high power mode.</w:t>
+      </w:r>
+    </w:p>
+    <w:p>
+      <w:pPr>
+        <w:pStyle w:val="Heading2"/>
+      </w:pPr>
+      <w:r>
+        <w:t>DTMF *</w:t>
+      </w:r>
+      <w:r>
         <w:t>6</w:t>
       </w:r>
     </w:p>
@@ -1306,7 +2244,15 @@
         <w:t xml:space="preserve">All operations can be controlled by the rotary push button on the </w:t>
       </w:r>
       <w:r>
-        <w:t>box and the two extra buttons to the left labelled B0 and B1</w:t>
+        <w:t xml:space="preserve">box and the two extra buttons </w:t>
+      </w:r>
+      <w:proofErr w:type="gramStart"/>
+      <w:r>
+        <w:t>to</w:t>
+      </w:r>
+      <w:proofErr w:type="gramEnd"/>
+      <w:r>
+        <w:t xml:space="preserve"> the left labelled B0 and B1</w:t>
       </w:r>
       <w:r>
         <w:t>.</w:t>
@@ -1408,12 +2354,14 @@
       <w:r>
         <w:t xml:space="preserve"> The top one is called </w:t>
       </w:r>
+      <w:proofErr w:type="gramStart"/>
       <w:r>
         <w:t>B</w:t>
       </w:r>
       <w:r>
         <w:t>0</w:t>
       </w:r>
+      <w:proofErr w:type="gramEnd"/>
       <w:r>
         <w:t xml:space="preserve"> and the bottom one is called </w:t>
       </w:r>
@@ -1504,7 +2452,21 @@
         <w:rPr>
           <w:lang w:val="da-DK"/>
         </w:rPr>
-        <w:t xml:space="preserve"> During Run Mode</w:t>
+        <w:t xml:space="preserve"> </w:t>
+      </w:r>
+      <w:proofErr w:type="spellStart"/>
+      <w:r>
+        <w:rPr>
+          <w:lang w:val="da-DK"/>
+        </w:rPr>
+        <w:t>During</w:t>
+      </w:r>
+      <w:proofErr w:type="spellEnd"/>
+      <w:r>
+        <w:rPr>
+          <w:lang w:val="da-DK"/>
+        </w:rPr>
+        <w:t xml:space="preserve"> Run Mode</w:t>
       </w:r>
     </w:p>
     <w:p>
@@ -1579,12 +2541,26 @@
         <w:rPr>
           <w:lang w:val="da-DK"/>
         </w:rPr>
-        <w:t>1 During Menu Mod</w:t>
-      </w:r>
+        <w:t xml:space="preserve">1 </w:t>
+      </w:r>
+      <w:proofErr w:type="spellStart"/>
       <w:r>
         <w:rPr>
           <w:lang w:val="da-DK"/>
         </w:rPr>
+        <w:t>During</w:t>
+      </w:r>
+      <w:proofErr w:type="spellEnd"/>
+      <w:r>
+        <w:rPr>
+          <w:lang w:val="da-DK"/>
+        </w:rPr>
+        <w:t xml:space="preserve"> Menu Mod</w:t>
+      </w:r>
+      <w:r>
+        <w:rPr>
+          <w:lang w:val="da-DK"/>
+        </w:rPr>
         <w:t>e</w:t>
       </w:r>
     </w:p>
@@ -1622,7 +2598,21 @@
         <w:rPr>
           <w:lang w:val="en-US"/>
         </w:rPr>
-        <w:t xml:space="preserve"> if at the top menu. Long </w:t>
+        <w:t xml:space="preserve"> if </w:t>
+      </w:r>
+      <w:proofErr w:type="gramStart"/>
+      <w:r>
+        <w:rPr>
+          <w:lang w:val="en-US"/>
+        </w:rPr>
+        <w:t>at</w:t>
+      </w:r>
+      <w:proofErr w:type="gramEnd"/>
+      <w:r>
+        <w:rPr>
+          <w:lang w:val="en-US"/>
+        </w:rPr>
+        <w:t xml:space="preserve"> the top menu. Long </w:t>
       </w:r>
       <w:r>
         <w:rPr>
@@ -1646,7 +2636,21 @@
         <w:rPr>
           <w:lang w:val="en-US"/>
         </w:rPr>
-        <w:t>displays some help (if available) about the current menu item</w:t>
+        <w:t xml:space="preserve">displays some help (if available) </w:t>
+      </w:r>
+      <w:proofErr w:type="gramStart"/>
+      <w:r>
+        <w:rPr>
+          <w:lang w:val="en-US"/>
+        </w:rPr>
+        <w:t>about</w:t>
+      </w:r>
+      <w:proofErr w:type="gramEnd"/>
+      <w:r>
+        <w:rPr>
+          <w:lang w:val="en-US"/>
+        </w:rPr>
+        <w:t xml:space="preserve"> the current menu item</w:t>
       </w:r>
       <w:r>
         <w:rPr>
@@ -1658,7 +2662,35 @@
         <w:rPr>
           <w:lang w:val="en-US"/>
         </w:rPr>
-        <w:t xml:space="preserve"> Note that currently only a few menu items have help. More will be added in the future.</w:t>
+        <w:t xml:space="preserve"> Note that currently only a few </w:t>
+      </w:r>
+      <w:proofErr w:type="gramStart"/>
+      <w:r>
+        <w:rPr>
+          <w:lang w:val="en-US"/>
+        </w:rPr>
+        <w:t>menu items</w:t>
+      </w:r>
+      <w:proofErr w:type="gramEnd"/>
+      <w:r>
+        <w:rPr>
+          <w:lang w:val="en-US"/>
+        </w:rPr>
+        <w:t xml:space="preserve"> have </w:t>
+      </w:r>
+      <w:proofErr w:type="gramStart"/>
+      <w:r>
+        <w:rPr>
+          <w:lang w:val="en-US"/>
+        </w:rPr>
+        <w:t>help</w:t>
+      </w:r>
+      <w:proofErr w:type="gramEnd"/>
+      <w:r>
+        <w:rPr>
+          <w:lang w:val="en-US"/>
+        </w:rPr>
+        <w:t>. More will be added in the future.</w:t>
       </w:r>
     </w:p>
     <w:p>
@@ -1722,6 +2754,7 @@
         <w:rPr>
           <w:lang w:val="en-US"/>
         </w:rPr>
+        <w:lastRenderedPageBreak/>
         <w:t>B</w:t>
       </w:r>
       <w:r>
@@ -1783,14 +2816,21 @@
         <w:rPr>
           <w:lang w:val="en-US"/>
         </w:rPr>
-        <w:t xml:space="preserve">. After a dial click the increment will change to 10 and dial will </w:t>
-      </w:r>
-      <w:r>
-        <w:rPr>
-          <w:lang w:val="en-US"/>
-        </w:rPr>
-        <w:lastRenderedPageBreak/>
-        <w:t xml:space="preserve">add and subtract </w:t>
+        <w:t xml:space="preserve">. After a dial </w:t>
+      </w:r>
+      <w:proofErr w:type="gramStart"/>
+      <w:r>
+        <w:rPr>
+          <w:lang w:val="en-US"/>
+        </w:rPr>
+        <w:t>click</w:t>
+      </w:r>
+      <w:proofErr w:type="gramEnd"/>
+      <w:r>
+        <w:rPr>
+          <w:lang w:val="en-US"/>
+        </w:rPr>
+        <w:t xml:space="preserve"> the increment will change to 10 and dial will add and subtract </w:t>
       </w:r>
       <w:r>
         <w:rPr>
@@ -1879,7 +2919,15 @@
     </w:p>
     <w:p>
       <w:r>
-        <w:t xml:space="preserve">Dial rotation is only useful in the menu system, it doesn’t have any function while the radio </w:t>
+        <w:t xml:space="preserve">Dial rotation is only useful in the menu </w:t>
+      </w:r>
+      <w:proofErr w:type="gramStart"/>
+      <w:r>
+        <w:t>system,</w:t>
+      </w:r>
+      <w:proofErr w:type="gramEnd"/>
+      <w:r>
+        <w:t xml:space="preserve"> it doesn’t have any function while the radio </w:t>
       </w:r>
       <w:r>
         <w:t>status is displayed.</w:t>
@@ -1912,13 +2960,29 @@
         <w:t>,</w:t>
       </w:r>
       <w:r>
-        <w:t xml:space="preserve"> boolean values toggle with each click.</w:t>
+        <w:t xml:space="preserve"> </w:t>
+      </w:r>
+      <w:proofErr w:type="spellStart"/>
+      <w:r>
+        <w:t>boolean</w:t>
+      </w:r>
+      <w:proofErr w:type="spellEnd"/>
+      <w:r>
+        <w:t xml:space="preserve"> values toggle with each click.</w:t>
       </w:r>
       <w:r>
         <w:t xml:space="preserve"> Multiple selections cycle through all the available options.</w:t>
       </w:r>
       <w:r>
-        <w:t xml:space="preserve"> Integer values go to another screen that shows the minimum and maximum values. Rotating the dial right increases the value while rotating to the left decreases it by the increment amount. The increment amount can be changed by clicking the button which will cycle between different values. One of the values will be a reset to the original value, activated with a long press. A long press is also used to accept the new value and return to the menu. A * </w:t>
+        <w:t xml:space="preserve"> Integer values go to another screen that shows the minimum and maximum values. Rotating the dial right increases the value while rotating to the left decreases it by the increment amount. The increment amount can be changed by clicking the button which will cycle between different values. One of the values will be a reset to the original value, activated with a long press. </w:t>
+      </w:r>
+      <w:proofErr w:type="gramStart"/>
+      <w:r>
+        <w:t>A long</w:t>
+      </w:r>
+      <w:proofErr w:type="gramEnd"/>
+      <w:r>
+        <w:t xml:space="preserve"> press is also used to accept the new value and return to the menu. A * </w:t>
       </w:r>
       <w:r>
         <w:t xml:space="preserve">or highlight </w:t>
@@ -1927,10 +2991,18 @@
         <w:t xml:space="preserve">indicates the active menu line. A + in front of the menu means another menu will be activated. </w:t>
       </w:r>
       <w:r>
-        <w:t>Any menu item starting with ‘-‘</w:t>
-      </w:r>
-      <w:r>
-        <w:t xml:space="preserve"> goes back to the previous menu when clicked. A</w:t>
+        <w:t>Any menu item starting with ‘</w:t>
+      </w:r>
+      <w:proofErr w:type="gramStart"/>
+      <w:r>
+        <w:t>-‘</w:t>
+      </w:r>
+      <w:r>
+        <w:t xml:space="preserve"> goes</w:t>
+      </w:r>
+      <w:proofErr w:type="gramEnd"/>
+      <w:r>
+        <w:t xml:space="preserve"> back to the previous menu when clicked. A</w:t>
       </w:r>
       <w:r>
         <w:t xml:space="preserve"> dial</w:t>
@@ -2062,7 +3134,15 @@
         <w:ind w:left="1440"/>
       </w:pPr>
       <w:r>
-        <w:t>Select menu item, including return to previous menu</w:t>
+        <w:t xml:space="preserve">Select menu </w:t>
+      </w:r>
+      <w:proofErr w:type="gramStart"/>
+      <w:r>
+        <w:t>item</w:t>
+      </w:r>
+      <w:proofErr w:type="gramEnd"/>
+      <w:r>
+        <w:t>, including return to previous menu</w:t>
       </w:r>
     </w:p>
     <w:p>
@@ -2070,8 +3150,13 @@
         <w:ind w:left="1440"/>
       </w:pPr>
       <w:r>
-        <w:t>Toggle booleans</w:t>
-      </w:r>
+        <w:t xml:space="preserve">Toggle </w:t>
+      </w:r>
+      <w:proofErr w:type="spellStart"/>
+      <w:r>
+        <w:t>booleans</w:t>
+      </w:r>
+      <w:proofErr w:type="spellEnd"/>
     </w:p>
     <w:p>
       <w:pPr>
@@ -2103,6 +3188,7 @@
         <w:pStyle w:val="Heading1"/>
       </w:pPr>
       <w:r>
+        <w:lastRenderedPageBreak/>
         <w:t>Main Operating Screen</w:t>
       </w:r>
     </w:p>
@@ -2126,29 +3212,57 @@
         <w:t xml:space="preserve"> The bottom of the screen shows the</w:t>
       </w:r>
       <w:r>
-        <w:t xml:space="preserve"> battery status on the right if it has been enabled. This is related to the current battery voltage and will drop while transmitting. There are also 4 LED’s on the PCB that can be seen through</w:t>
+        <w:t xml:space="preserve"> battery status on the right if it has been enabled. This is related to the current battery voltage and will drop while transmitting. There are also 4 </w:t>
+      </w:r>
+      <w:proofErr w:type="gramStart"/>
+      <w:r>
+        <w:t>LED’s</w:t>
+      </w:r>
+      <w:proofErr w:type="gramEnd"/>
+      <w:r>
+        <w:t xml:space="preserve"> on the PCB that can be seen through</w:t>
       </w:r>
       <w:r>
         <w:t xml:space="preserve"> the slot on the </w:t>
       </w:r>
       <w:r>
-        <w:lastRenderedPageBreak/>
         <w:t>side</w:t>
       </w:r>
       <w:r>
         <w:t xml:space="preserve"> of the case</w:t>
       </w:r>
       <w:r>
-        <w:t>. These LED’s are controlled by the battery charger circuit and indicate the battery status during running and charging.</w:t>
+        <w:t xml:space="preserve">. These </w:t>
+      </w:r>
+      <w:proofErr w:type="gramStart"/>
+      <w:r>
+        <w:t>LED’s</w:t>
+      </w:r>
+      <w:proofErr w:type="gramEnd"/>
+      <w:r>
+        <w:t xml:space="preserve"> are controlled by the battery charger circuit and indicate the battery status during running and charging.</w:t>
       </w:r>
     </w:p>
     <w:p/>
     <w:p>
-      <w:r>
-        <w:t>During transmitting the bottom left shows an animated red dot. In a future firmware update the</w:t>
-      </w:r>
-      <w:r>
-        <w:t xml:space="preserve"> received DTMF characters will be display next to this.</w:t>
+      <w:proofErr w:type="gramStart"/>
+      <w:r>
+        <w:t>During</w:t>
+      </w:r>
+      <w:proofErr w:type="gramEnd"/>
+      <w:r>
+        <w:t xml:space="preserve"> transmitting the bottom left shows an animated red dot. In a future firmware update the</w:t>
+      </w:r>
+      <w:r>
+        <w:t xml:space="preserve"> </w:t>
+      </w:r>
+      <w:proofErr w:type="gramStart"/>
+      <w:r>
+        <w:t>received DTMF characters</w:t>
+      </w:r>
+      <w:proofErr w:type="gramEnd"/>
+      <w:r>
+        <w:t xml:space="preserve"> will be display next to this.</w:t>
       </w:r>
     </w:p>
     <w:p>
@@ -2163,8 +3277,13 @@
       <w:r>
         <w:t xml:space="preserve">The following sections detail each entry in </w:t>
       </w:r>
-      <w:r>
-        <w:t>all of the menus</w:t>
+      <w:proofErr w:type="gramStart"/>
+      <w:r>
+        <w:t>all of</w:t>
+      </w:r>
+      <w:proofErr w:type="gramEnd"/>
+      <w:r>
+        <w:t xml:space="preserve"> the menus</w:t>
       </w:r>
       <w:r>
         <w:t xml:space="preserve"> starting with the main or top menu</w:t>
@@ -2191,7 +3310,15 @@
         <w:t>’</w:t>
       </w:r>
       <w:r>
-        <w:t xml:space="preserve"> or a ‘-‘ to indicate a range</w:t>
+        <w:t xml:space="preserve"> or a ‘</w:t>
+      </w:r>
+      <w:proofErr w:type="gramStart"/>
+      <w:r>
+        <w:t>-‘ to</w:t>
+      </w:r>
+      <w:proofErr w:type="gramEnd"/>
+      <w:r>
+        <w:t xml:space="preserve"> indicate a range</w:t>
       </w:r>
       <w:r>
         <w:t>.</w:t>
@@ -2216,7 +3343,15 @@
         <w:t xml:space="preserve"> Some menu entries may depend on other menu items </w:t>
       </w:r>
       <w:r>
-        <w:t xml:space="preserve">settings. For example the audio file name menu item is hidden unless </w:t>
+        <w:t xml:space="preserve">settings. For </w:t>
+      </w:r>
+      <w:proofErr w:type="gramStart"/>
+      <w:r>
+        <w:t>example</w:t>
+      </w:r>
+      <w:proofErr w:type="gramEnd"/>
+      <w:r>
+        <w:t xml:space="preserve"> the audio file name menu item is hidden unless </w:t>
       </w:r>
       <w:r>
         <w:t>“Play Audio File” is Yes.</w:t>
@@ -2235,7 +3370,11 @@
         <w:pStyle w:val="Heading3"/>
       </w:pPr>
       <w:r>
-        <w:t>XMIT: On</w:t>
+        <w:t xml:space="preserve">XMIT: </w:t>
+      </w:r>
+      <w:proofErr w:type="spellStart"/>
+      <w:r>
+        <w:t>On</w:t>
       </w:r>
       <w:r>
         <w:t>|</w:t>
@@ -2243,13 +3382,43 @@
       <w:r>
         <w:t>Off</w:t>
       </w:r>
-    </w:p>
-    <w:p>
-      <w:r>
-        <w:t xml:space="preserve">This must be set to On for the radio to begin </w:t>
-      </w:r>
-      <w:r>
-        <w:t>transmitting. If saved as On then the radio will start sending right after booting. If it is Off it will not automatically start sending. It can be toggle</w:t>
+      <w:proofErr w:type="spellEnd"/>
+    </w:p>
+    <w:p>
+      <w:r>
+        <w:t xml:space="preserve">This must be set to </w:t>
+      </w:r>
+      <w:proofErr w:type="gramStart"/>
+      <w:r>
+        <w:t>On</w:t>
+      </w:r>
+      <w:proofErr w:type="gramEnd"/>
+      <w:r>
+        <w:t xml:space="preserve"> for the radio to begin </w:t>
+      </w:r>
+      <w:proofErr w:type="gramStart"/>
+      <w:r>
+        <w:t>transmitting</w:t>
+      </w:r>
+      <w:proofErr w:type="gramEnd"/>
+      <w:r>
+        <w:t xml:space="preserve">. If saved as </w:t>
+      </w:r>
+      <w:proofErr w:type="gramStart"/>
+      <w:r>
+        <w:t>On</w:t>
+      </w:r>
+      <w:proofErr w:type="gramEnd"/>
+      <w:r>
+        <w:t xml:space="preserve"> then the radio will start sending right after booting. If it is </w:t>
+      </w:r>
+      <w:proofErr w:type="gramStart"/>
+      <w:r>
+        <w:t>Off</w:t>
+      </w:r>
+      <w:proofErr w:type="gramEnd"/>
+      <w:r>
+        <w:t xml:space="preserve"> it will not automatically start sending. It can be toggle</w:t>
       </w:r>
       <w:r>
         <w:t>d</w:t>
@@ -2258,15 +3427,24 @@
         <w:t xml:space="preserve"> with the B0 button while in run mode</w:t>
       </w:r>
       <w:r>
-        <w:t>. Using B0 does not changed</w:t>
-      </w:r>
+        <w:t xml:space="preserve">. Using B0 does not </w:t>
+      </w:r>
+      <w:proofErr w:type="gramStart"/>
+      <w:r>
+        <w:t>changed</w:t>
+      </w:r>
+      <w:proofErr w:type="gramEnd"/>
     </w:p>
     <w:p>
       <w:pPr>
         <w:pStyle w:val="Heading3"/>
       </w:pPr>
       <w:r>
-        <w:t>TX Power: High</w:t>
+        <w:t xml:space="preserve">TX Power: </w:t>
+      </w:r>
+      <w:proofErr w:type="spellStart"/>
+      <w:r>
+        <w:t>High</w:t>
       </w:r>
       <w:r>
         <w:t>|</w:t>
@@ -2278,6 +3456,7 @@
         </w:rPr>
         <w:t>Low</w:t>
       </w:r>
+      <w:proofErr w:type="spellEnd"/>
     </w:p>
     <w:p>
       <w:r>
@@ -2333,7 +3512,11 @@
         <w:t>:</w:t>
       </w:r>
       <w:r>
-        <w:t xml:space="preserve"> Yes|</w:t>
+        <w:t xml:space="preserve"> </w:t>
+      </w:r>
+      <w:proofErr w:type="spellStart"/>
+      <w:r>
+        <w:t>Yes|</w:t>
       </w:r>
       <w:r>
         <w:rPr>
@@ -2342,6 +3525,7 @@
         </w:rPr>
         <w:t>No</w:t>
       </w:r>
+      <w:proofErr w:type="spellEnd"/>
     </w:p>
     <w:p>
       <w:r>
@@ -2356,7 +3540,12 @@
         <w:pStyle w:val="Heading3"/>
       </w:pPr>
       <w:r>
-        <w:t>Send GPS: Yes|</w:t>
+        <w:lastRenderedPageBreak/>
+        <w:t xml:space="preserve">Send GPS: </w:t>
+      </w:r>
+      <w:proofErr w:type="spellStart"/>
+      <w:r>
+        <w:t>Yes|</w:t>
       </w:r>
       <w:r>
         <w:rPr>
@@ -2365,6 +3554,7 @@
         </w:rPr>
         <w:t>NO</w:t>
       </w:r>
+      <w:proofErr w:type="spellEnd"/>
       <w:r>
         <w:t xml:space="preserve"> (beacon mode only)</w:t>
       </w:r>
@@ -2377,8 +3567,13 @@
         <w:t xml:space="preserve">ude and longitude values. The values must be entered manually from a phone </w:t>
       </w:r>
       <w:r>
-        <w:t>or GPS device. A future version of the hardware may have a built-in GPS module</w:t>
-      </w:r>
+        <w:t xml:space="preserve">or GPS device. A future version of the hardware may have a built-in GPS </w:t>
+      </w:r>
+      <w:proofErr w:type="gramStart"/>
+      <w:r>
+        <w:t>module</w:t>
+      </w:r>
+      <w:proofErr w:type="gramEnd"/>
       <w:r>
         <w:t xml:space="preserve"> or it may be able to connect to a serial GPS device using the USB connection.</w:t>
       </w:r>
@@ -2388,15 +3583,18 @@
         <w:pStyle w:val="Heading3"/>
       </w:pPr>
       <w:r>
-        <w:lastRenderedPageBreak/>
         <w:t xml:space="preserve">Latitude: </w:t>
       </w:r>
       <w:r>
         <w:t>+/-</w:t>
       </w:r>
+      <w:proofErr w:type="spellStart"/>
+      <w:proofErr w:type="gramStart"/>
       <w:r>
         <w:t>n.nnnnnn</w:t>
       </w:r>
+      <w:proofErr w:type="spellEnd"/>
+      <w:proofErr w:type="gramEnd"/>
       <w:r>
         <w:t xml:space="preserve"> (</w:t>
       </w:r>
@@ -2443,7 +3641,17 @@
         <w:pStyle w:val="Heading3"/>
       </w:pPr>
       <w:r>
-        <w:t xml:space="preserve">Longitude: +/-n.nnnnnn (Send </w:t>
+        <w:t>Longitude: +/-</w:t>
+      </w:r>
+      <w:proofErr w:type="spellStart"/>
+      <w:proofErr w:type="gramStart"/>
+      <w:r>
+        <w:t>n.nnnnnn</w:t>
+      </w:r>
+      <w:proofErr w:type="spellEnd"/>
+      <w:proofErr w:type="gramEnd"/>
+      <w:r>
+        <w:t xml:space="preserve"> (Send </w:t>
       </w:r>
       <w:r>
         <w:rPr>
@@ -2547,8 +3755,13 @@
         <w:t>Play Audio File</w:t>
       </w:r>
       <w:r>
-        <w:t>: Yes|No</w:t>
-      </w:r>
+        <w:t xml:space="preserve">: </w:t>
+      </w:r>
+      <w:proofErr w:type="spellStart"/>
+      <w:r>
+        <w:t>Yes|No</w:t>
+      </w:r>
+      <w:proofErr w:type="spellEnd"/>
     </w:p>
     <w:p>
       <w:r>
@@ -2572,13 +3785,37 @@
     </w:p>
     <w:p>
       <w:r>
-        <w:t xml:space="preserve">This menu item is only visible if the previous item is set to Yes. Clicking the dial will list all of the </w:t>
-      </w:r>
-      <w:r>
-        <w:t>*.txt files on the SD card. The dial is rotated to highlight a file and a long press will set it</w:t>
-      </w:r>
-      <w:r>
-        <w:t>. Note that a click of dial just exits the list of file with no selection being performed.</w:t>
+        <w:t xml:space="preserve">This menu item is only visible if the previous item is set to Yes. Clicking the dial will list </w:t>
+      </w:r>
+      <w:proofErr w:type="gramStart"/>
+      <w:r>
+        <w:t>all of</w:t>
+      </w:r>
+      <w:proofErr w:type="gramEnd"/>
+      <w:r>
+        <w:t xml:space="preserve"> the </w:t>
+      </w:r>
+      <w:r>
+        <w:t xml:space="preserve">*.txt files on the SD card. The dial is rotated to highlight a </w:t>
+      </w:r>
+      <w:proofErr w:type="gramStart"/>
+      <w:r>
+        <w:t>file</w:t>
+      </w:r>
+      <w:proofErr w:type="gramEnd"/>
+      <w:r>
+        <w:t xml:space="preserve"> and a long press will set it</w:t>
+      </w:r>
+      <w:r>
+        <w:t xml:space="preserve">. Note that a click of dial just exits the list of </w:t>
+      </w:r>
+      <w:proofErr w:type="gramStart"/>
+      <w:r>
+        <w:t>file</w:t>
+      </w:r>
+      <w:proofErr w:type="gramEnd"/>
+      <w:r>
+        <w:t xml:space="preserve"> with no selection being performed.</w:t>
       </w:r>
     </w:p>
     <w:p>
@@ -2605,6 +3842,7 @@
         <w:pStyle w:val="Heading2"/>
       </w:pPr>
       <w:r>
+        <w:lastRenderedPageBreak/>
         <w:t>+Radio Timers</w:t>
       </w:r>
     </w:p>
@@ -2621,7 +3859,15 @@
         <w:t>When B0 or the menu starts the transmit mode</w:t>
       </w:r>
       <w:r>
-        <w:t xml:space="preserve"> the system will not actually begin sending until this time is expired. This allows the radio to be hidden</w:t>
+        <w:t xml:space="preserve"> the system will not actually begin sending until this time </w:t>
+      </w:r>
+      <w:proofErr w:type="gramStart"/>
+      <w:r>
+        <w:t>is expired</w:t>
+      </w:r>
+      <w:proofErr w:type="gramEnd"/>
+      <w:r>
+        <w:t>. This allows the radio to be hidden</w:t>
       </w:r>
       <w:r>
         <w:t xml:space="preserve"> and </w:t>
@@ -2638,8 +3884,13 @@
         <w:pStyle w:val="Heading3"/>
       </w:pPr>
       <w:r>
-        <w:t>Timer Mode: Fixed|Random</w:t>
-      </w:r>
+        <w:t xml:space="preserve">Timer Mode: </w:t>
+      </w:r>
+      <w:proofErr w:type="spellStart"/>
+      <w:r>
+        <w:t>Fixed|Random</w:t>
+      </w:r>
+      <w:proofErr w:type="spellEnd"/>
     </w:p>
     <w:p>
       <w:r>
@@ -2649,17 +3900,217 @@
         <w:t xml:space="preserve"> mode the sending time and pause timer are controlled by the Send and Pause values</w:t>
       </w:r>
       <w:r>
-        <w:t xml:space="preserve"> and are always the same. In Random mode the transmit time and pause time are randomly </w:t>
-      </w:r>
+        <w:t xml:space="preserve"> and are always the same. In Random mode the transmit time and pause time are randomly chosen</w:t>
+      </w:r>
+      <w:r>
+        <w:t xml:space="preserve"> from the allowed values set in the Min and Max values for TX Send and Pause. This makes </w:t>
+      </w:r>
+      <w:proofErr w:type="gramStart"/>
+      <w:r>
+        <w:t>the timing</w:t>
+      </w:r>
+      <w:proofErr w:type="gramEnd"/>
+      <w:r>
+        <w:t xml:space="preserve"> less predictable and </w:t>
+      </w:r>
+      <w:proofErr w:type="gramStart"/>
+      <w:r>
+        <w:t>make</w:t>
+      </w:r>
+      <w:proofErr w:type="gramEnd"/>
+      <w:r>
+        <w:t xml:space="preserve"> the game a little bit harder.</w:t>
+      </w:r>
+      <w:r>
+        <w:t xml:space="preserve"> Keep your ears on!</w:t>
+      </w:r>
+    </w:p>
+    <w:p>
+      <w:pPr>
+        <w:pStyle w:val="Heading3"/>
+      </w:pPr>
+      <w:r>
+        <w:t xml:space="preserve">TX Send: </w:t>
+      </w:r>
+      <w:r>
+        <w:t>10-90 Sec</w:t>
+      </w:r>
+    </w:p>
+    <w:p>
+      <w:r>
+        <w:t>Fixed time for transmission. Shorter times are more challenging</w:t>
+      </w:r>
+      <w:r>
+        <w:t xml:space="preserve"> to locate</w:t>
+      </w:r>
+      <w:r>
+        <w:t xml:space="preserve"> but use less battery energy</w:t>
+      </w:r>
+      <w:r>
+        <w:t>. Longer times overheat the radio</w:t>
+      </w:r>
+      <w:r>
+        <w:t xml:space="preserve"> and use more battery </w:t>
+      </w:r>
+      <w:r>
+        <w:t>energy</w:t>
+      </w:r>
+      <w:r>
+        <w:t>.</w:t>
+      </w:r>
+    </w:p>
+    <w:p>
+      <w:pPr>
+        <w:pStyle w:val="Heading3"/>
+      </w:pPr>
+      <w:r>
+        <w:t>TX Pause:10-1200 Sec</w:t>
+      </w:r>
+    </w:p>
+    <w:p>
+      <w:r>
+        <w:t xml:space="preserve">This is the </w:t>
+      </w:r>
+      <w:proofErr w:type="gramStart"/>
+      <w:r>
+        <w:t>pause time</w:t>
+      </w:r>
+      <w:proofErr w:type="gramEnd"/>
+      <w:r>
+        <w:t xml:space="preserve"> between transmissions</w:t>
+      </w:r>
+      <w:r>
+        <w:t>. Longer times let the radio cool off and save the battery for longer run times.</w:t>
+      </w:r>
+    </w:p>
+    <w:p>
+      <w:pPr>
+        <w:pStyle w:val="Heading3"/>
+      </w:pPr>
+      <w:r>
+        <w:t>TX Send Min: 10-90 Sec</w:t>
+      </w:r>
+    </w:p>
+    <w:p>
+      <w:r>
+        <w:t>In random mode this is the minimum send time.</w:t>
+      </w:r>
+    </w:p>
+    <w:p>
+      <w:pPr>
+        <w:pStyle w:val="Heading3"/>
+      </w:pPr>
+      <w:r>
+        <w:t xml:space="preserve">TX Send Max: </w:t>
+      </w:r>
+      <w:r>
+        <w:t>10-90 Sec</w:t>
+      </w:r>
+    </w:p>
+    <w:p>
+      <w:r>
+        <w:t xml:space="preserve">In </w:t>
+      </w:r>
+      <w:r>
+        <w:t xml:space="preserve">random mode this is the maximum </w:t>
+      </w:r>
+      <w:proofErr w:type="gramStart"/>
+      <w:r>
+        <w:t>send</w:t>
+      </w:r>
+      <w:proofErr w:type="gramEnd"/>
+      <w:r>
+        <w:t xml:space="preserve"> time.</w:t>
+      </w:r>
+    </w:p>
+    <w:p>
+      <w:pPr>
+        <w:pStyle w:val="Heading3"/>
+      </w:pPr>
+      <w:r>
+        <w:t>TX Pause Min: 10-1200 Sec</w:t>
+      </w:r>
+    </w:p>
+    <w:p>
+      <w:r>
+        <w:t>In random mode this is the minimum pause time.</w:t>
+      </w:r>
+    </w:p>
+    <w:p>
+      <w:pPr>
+        <w:pStyle w:val="Heading3"/>
+      </w:pPr>
+      <w:r>
+        <w:t>TX Pause Max: 10-1200 Sec</w:t>
+      </w:r>
+    </w:p>
+    <w:p>
+      <w:r>
+        <w:t>In random mode this is the maximum pause time.</w:t>
+      </w:r>
+    </w:p>
+    <w:p>
+      <w:pPr>
+        <w:pStyle w:val="Heading3"/>
+      </w:pPr>
+      <w:r>
+        <w:t xml:space="preserve">TX Stop: </w:t>
+      </w:r>
+      <w:proofErr w:type="spellStart"/>
+      <w:r>
+        <w:t>Immediate|Finish</w:t>
+      </w:r>
+      <w:proofErr w:type="spellEnd"/>
+      <w:r>
+        <w:t xml:space="preserve"> Cycle</w:t>
+      </w:r>
+    </w:p>
+    <w:p>
+      <w:r>
+        <w:t xml:space="preserve">During transmit time the Beacon, Call Sign, and Audio are continuously sent. At the end of the transmission time this option controls whether the transmission stops immediately </w:t>
+      </w:r>
+      <w:proofErr w:type="gramStart"/>
+      <w:r>
+        <w:t>of</w:t>
+      </w:r>
+      <w:proofErr w:type="gramEnd"/>
+      <w:r>
+        <w:t xml:space="preserve"> waits to stop until the entire cycle is finished.</w:t>
+      </w:r>
+    </w:p>
+    <w:p/>
+    <w:p>
       <w:r>
         <w:lastRenderedPageBreak/>
-        <w:t>chosen</w:t>
-      </w:r>
-      <w:r>
-        <w:t xml:space="preserve"> from the allowed values set in the Min and Max values for TX Send and Pause. This makes the timing less predictable and make the game a little bit harder.</w:t>
-      </w:r>
-      <w:r>
-        <w:t xml:space="preserve"> Keep your ears on!</w:t>
+        <w:t>A clever use of this command</w:t>
+      </w:r>
+      <w:r>
+        <w:t xml:space="preserve"> allows for only one cycle of beacon, ID, and music to be sent during each transmission time. Set the transmit</w:t>
+      </w:r>
+      <w:r>
+        <w:t xml:space="preserve"> time to something less than</w:t>
+      </w:r>
+      <w:r>
+        <w:t xml:space="preserve"> the time to perform a complete cycle and set this option to “Finish Cycle”. The </w:t>
+      </w:r>
+      <w:proofErr w:type="gramStart"/>
+      <w:r>
+        <w:t>transmit  cycle</w:t>
+      </w:r>
+      <w:proofErr w:type="gramEnd"/>
+      <w:r>
+        <w:t xml:space="preserve"> will begin, the timer will expire, but the current cycle will </w:t>
+      </w:r>
+      <w:proofErr w:type="gramStart"/>
+      <w:r>
+        <w:t>complete</w:t>
+      </w:r>
+      <w:proofErr w:type="gramEnd"/>
+      <w:r>
+        <w:t xml:space="preserve"> before stopping</w:t>
+      </w:r>
+      <w:r>
+        <w:t>.</w:t>
       </w:r>
     </w:p>
     <w:p>
@@ -2667,30 +4118,524 @@
         <w:pStyle w:val="Heading3"/>
       </w:pPr>
       <w:r>
-        <w:t xml:space="preserve">TX Send: </w:t>
-      </w:r>
-      <w:r>
-        <w:t>10-90 Sec</w:t>
-      </w:r>
-    </w:p>
-    <w:p>
-      <w:r>
-        <w:t>Fixed time for transmission. Shorter times are more challenging</w:t>
-      </w:r>
-      <w:r>
-        <w:t xml:space="preserve"> to locate</w:t>
-      </w:r>
-      <w:r>
-        <w:t xml:space="preserve"> but use less battery energy</w:t>
-      </w:r>
-      <w:r>
-        <w:t>. Longer times overheat the radio</w:t>
-      </w:r>
-      <w:r>
-        <w:t xml:space="preserve"> and use more battery </w:t>
-      </w:r>
-      <w:r>
-        <w:t>energy</w:t>
+        <w:t xml:space="preserve">Radio Pause: </w:t>
+      </w:r>
+      <w:proofErr w:type="spellStart"/>
+      <w:r>
+        <w:t>Sleep|Awake</w:t>
+      </w:r>
+      <w:proofErr w:type="spellEnd"/>
+    </w:p>
+    <w:p>
+      <w:r>
+        <w:t xml:space="preserve">During pause time the radio can be put into sleep mode. This lowers the power consumption and lets the battery last longer. </w:t>
+      </w:r>
+      <w:proofErr w:type="gramStart"/>
+      <w:r>
+        <w:t>However</w:t>
+      </w:r>
+      <w:proofErr w:type="gramEnd"/>
+      <w:r>
+        <w:t xml:space="preserve"> note that this also means that the DTMF commands are disabled since the radio is asleep!</w:t>
+      </w:r>
+    </w:p>
+    <w:p>
+      <w:pPr>
+        <w:pStyle w:val="Heading2"/>
+      </w:pPr>
+      <w:r>
+        <w:t>+</w:t>
+      </w:r>
+      <w:r>
+        <w:t>More Radio Settings</w:t>
+      </w:r>
+    </w:p>
+    <w:p>
+      <w:pPr>
+        <w:pStyle w:val="Heading3"/>
+      </w:pPr>
+      <w:r>
+        <w:t>RX Offset: -</w:t>
+      </w:r>
+      <w:proofErr w:type="gramStart"/>
+      <w:r>
+        <w:t>600|0|</w:t>
+      </w:r>
+      <w:proofErr w:type="gramEnd"/>
+      <w:r>
+        <w:t>+600 kHz</w:t>
+      </w:r>
+    </w:p>
+    <w:p>
+      <w:r>
+        <w:t>This is the frequency offset from the transmit frequency that the radio uses to receive DTMF commands</w:t>
+      </w:r>
+      <w:r>
+        <w:t xml:space="preserve">. An offset is recommended. If 0 is used the radio will only listen when it isn’t </w:t>
+      </w:r>
+      <w:proofErr w:type="gramStart"/>
+      <w:r>
+        <w:t>sending</w:t>
+      </w:r>
+      <w:proofErr w:type="gramEnd"/>
+      <w:r>
+        <w:t>. It has not been tested if it listens during sending when the offset is not 0.</w:t>
+      </w:r>
+    </w:p>
+    <w:p>
+      <w:pPr>
+        <w:pStyle w:val="Heading3"/>
+      </w:pPr>
+      <w:r>
+        <w:t xml:space="preserve">Bandwidth: </w:t>
+      </w:r>
+      <w:proofErr w:type="gramStart"/>
+      <w:r>
+        <w:t>12.5|</w:t>
+      </w:r>
+      <w:r>
+        <w:t>25</w:t>
+      </w:r>
+      <w:proofErr w:type="gramEnd"/>
+      <w:r>
+        <w:t xml:space="preserve"> kHz</w:t>
+      </w:r>
+    </w:p>
+    <w:p>
+      <w:r>
+        <w:t>This sets the radio bandwidth</w:t>
+      </w:r>
+      <w:r>
+        <w:t>. It has not been tested much to see what effect it has on performance yet.</w:t>
+      </w:r>
+    </w:p>
+    <w:p>
+      <w:pPr>
+        <w:pStyle w:val="Heading3"/>
+      </w:pPr>
+      <w:r>
+        <w:t>CTCSS/DCS: CTCSS|DCS</w:t>
+      </w:r>
+    </w:p>
+    <w:p>
+      <w:r>
+        <w:t xml:space="preserve">This sets the </w:t>
+      </w:r>
+      <w:r>
+        <w:t>un-squelch</w:t>
+      </w:r>
+      <w:r>
+        <w:t xml:space="preserve"> values</w:t>
+      </w:r>
+      <w:r>
+        <w:t xml:space="preserve"> for either the analog or digital versions.</w:t>
+      </w:r>
+    </w:p>
+    <w:p>
+      <w:pPr>
+        <w:pStyle w:val="Heading3"/>
+      </w:pPr>
+      <w:r>
+        <w:t>TX CTCSS:</w:t>
+      </w:r>
+      <w:r>
+        <w:t xml:space="preserve"> None</w:t>
+      </w:r>
+      <w:r>
+        <w:t>|</w:t>
+      </w:r>
+      <w:r>
+        <w:t>67-</w:t>
+      </w:r>
+      <w:r>
+        <w:t>250.3</w:t>
+      </w:r>
+    </w:p>
+    <w:p>
+      <w:r>
+        <w:t>Analog un-squelch frequencies sent out.</w:t>
+      </w:r>
+    </w:p>
+    <w:p>
+      <w:pPr>
+        <w:pStyle w:val="Heading3"/>
+      </w:pPr>
+      <w:r>
+        <w:t>RX CTCSS:</w:t>
+      </w:r>
+      <w:r>
+        <w:t xml:space="preserve"> None|67-250.3</w:t>
+      </w:r>
+    </w:p>
+    <w:p>
+      <w:r>
+        <w:t>Analog un-squelch frequency for receiving.</w:t>
+      </w:r>
+    </w:p>
+    <w:p>
+      <w:pPr>
+        <w:pStyle w:val="Heading3"/>
+      </w:pPr>
+      <w:r>
+        <w:t>TX DCS:</w:t>
+      </w:r>
+      <w:r>
+        <w:t xml:space="preserve"> None|023-754</w:t>
+      </w:r>
+    </w:p>
+    <w:p>
+      <w:r>
+        <w:t>Digital un-squelch value for sending.</w:t>
+      </w:r>
+    </w:p>
+    <w:p>
+      <w:pPr>
+        <w:pStyle w:val="Heading3"/>
+      </w:pPr>
+      <w:r>
+        <w:t>TX I/N: I|N</w:t>
+      </w:r>
+    </w:p>
+    <w:p>
+      <w:r>
+        <w:t>The digital I or N value for sending.</w:t>
+      </w:r>
+    </w:p>
+    <w:p>
+      <w:pPr>
+        <w:pStyle w:val="Heading3"/>
+      </w:pPr>
+      <w:r>
+        <w:t>RX DCS: None|023-754</w:t>
+      </w:r>
+    </w:p>
+    <w:p>
+      <w:r>
+        <w:t>Digital un-squelch value for receiving.</w:t>
+      </w:r>
+    </w:p>
+    <w:p>
+      <w:pPr>
+        <w:pStyle w:val="Heading3"/>
+      </w:pPr>
+      <w:r>
+        <w:lastRenderedPageBreak/>
+        <w:t>RX I/N: I|N</w:t>
+      </w:r>
+    </w:p>
+    <w:p>
+      <w:r>
+        <w:t>The digital I or N value for receiving.</w:t>
+      </w:r>
+    </w:p>
+    <w:p>
+      <w:pPr>
+        <w:pStyle w:val="Heading3"/>
+      </w:pPr>
+      <w:r>
+        <w:t>RX Volume:</w:t>
+      </w:r>
+      <w:r>
+        <w:t xml:space="preserve"> 1-6</w:t>
+      </w:r>
+    </w:p>
+    <w:p>
+      <w:r>
+        <w:t>This is the receive volume setting. It affects how well DTMF tones are detected.</w:t>
+      </w:r>
+    </w:p>
+    <w:p>
+      <w:pPr>
+        <w:pStyle w:val="Heading3"/>
+      </w:pPr>
+      <w:r>
+        <w:t>RX Squelch:</w:t>
+      </w:r>
+      <w:r>
+        <w:t xml:space="preserve"> 0-8</w:t>
+      </w:r>
+    </w:p>
+    <w:p>
+      <w:r>
+        <w:t>This affects how much signal is required to receive the DTMF signals.</w:t>
+      </w:r>
+    </w:p>
+    <w:p>
+      <w:pPr>
+        <w:pStyle w:val="Heading2"/>
+      </w:pPr>
+      <w:r>
+        <w:t>Cancel Waits/TX Now</w:t>
+      </w:r>
+    </w:p>
+    <w:p>
+      <w:r>
+        <w:t>When the radio is in either send or pause mode this command will cancel the timer and the next mo</w:t>
+      </w:r>
+      <w:r>
+        <w:t xml:space="preserve">de will start. For </w:t>
+      </w:r>
+      <w:proofErr w:type="gramStart"/>
+      <w:r>
+        <w:t>example</w:t>
+      </w:r>
+      <w:proofErr w:type="gramEnd"/>
+      <w:r>
+        <w:t xml:space="preserve"> if you want to cancel</w:t>
+      </w:r>
+      <w:r>
+        <w:t xml:space="preserve"> the pause and go to transmit, use this option. It can also be done by long pressing B0.</w:t>
+      </w:r>
+    </w:p>
+    <w:p>
+      <w:pPr>
+        <w:pStyle w:val="Heading2"/>
+      </w:pPr>
+      <w:r>
+        <w:t>+Saved Settings Files</w:t>
+      </w:r>
+    </w:p>
+    <w:p>
+      <w:r>
+        <w:t>Saved settings files are named files stored on the SD card. They are useful to</w:t>
+      </w:r>
+      <w:r>
+        <w:t xml:space="preserve"> quickly configure the radio for different uses. All values except the battery calibration are affected.</w:t>
+      </w:r>
+    </w:p>
+    <w:p>
+      <w:pPr>
+        <w:pStyle w:val="Heading3"/>
+      </w:pPr>
+      <w:r>
+        <w:t>Create File</w:t>
+      </w:r>
+    </w:p>
+    <w:p>
+      <w:r>
+        <w:t>This prompts the user for a name. The file is then created using the current system settings.</w:t>
+      </w:r>
+    </w:p>
+    <w:p>
+      <w:pPr>
+        <w:pStyle w:val="Heading3"/>
+      </w:pPr>
+      <w:r>
+        <w:t>Save/Update File</w:t>
+      </w:r>
+    </w:p>
+    <w:p>
+      <w:r>
+        <w:t xml:space="preserve">This command saves the current settings into the selected file. If it already </w:t>
+      </w:r>
+      <w:proofErr w:type="gramStart"/>
+      <w:r>
+        <w:t>exists</w:t>
+      </w:r>
+      <w:proofErr w:type="gramEnd"/>
+      <w:r>
+        <w:t xml:space="preserve"> the user will be asked to confirm overwriting the file.</w:t>
+      </w:r>
+    </w:p>
+    <w:p>
+      <w:pPr>
+        <w:pStyle w:val="Heading3"/>
+      </w:pPr>
+      <w:r>
+        <w:t>Load File</w:t>
+      </w:r>
+    </w:p>
+    <w:p>
+      <w:r>
+        <w:t xml:space="preserve">This command asks the user for the name and then sets </w:t>
+      </w:r>
+      <w:proofErr w:type="gramStart"/>
+      <w:r>
+        <w:t>all of</w:t>
+      </w:r>
+      <w:proofErr w:type="gramEnd"/>
+      <w:r>
+        <w:t xml:space="preserve"> the system settings except the battery calibration using the values in the file.</w:t>
+      </w:r>
+    </w:p>
+    <w:p>
+      <w:pPr>
+        <w:pStyle w:val="Heading3"/>
+      </w:pPr>
+      <w:r>
+        <w:t>Delete File</w:t>
+      </w:r>
+    </w:p>
+    <w:p>
+      <w:r>
+        <w:t>The user selects a file from the list and then it can be deleted.</w:t>
+      </w:r>
+    </w:p>
+    <w:p>
+      <w:pPr>
+        <w:pStyle w:val="Heading2"/>
+      </w:pPr>
+      <w:r>
+        <w:lastRenderedPageBreak/>
+        <w:t>+System Settings</w:t>
+      </w:r>
+    </w:p>
+    <w:p>
+      <w:pPr>
+        <w:pStyle w:val="Heading3"/>
+      </w:pPr>
+      <w:r>
+        <w:t>+Display</w:t>
+      </w:r>
+      <w:r>
+        <w:t xml:space="preserve"> Settings</w:t>
+      </w:r>
+    </w:p>
+    <w:p>
+      <w:pPr>
+        <w:pStyle w:val="Heading4"/>
+      </w:pPr>
+      <w:r>
+        <w:t xml:space="preserve">Dimming Mode: </w:t>
+      </w:r>
+      <w:proofErr w:type="spellStart"/>
+      <w:r>
+        <w:t>None</w:t>
+      </w:r>
+      <w:r>
+        <w:t>|Timer</w:t>
+      </w:r>
+      <w:proofErr w:type="spellEnd"/>
+    </w:p>
+    <w:p>
+      <w:r>
+        <w:t xml:space="preserve">The display can be set to dim automatically after a specified number of seconds. This is used to save battery power since the backlight </w:t>
+      </w:r>
+      <w:r>
+        <w:t>uses a significant amount.</w:t>
+      </w:r>
+    </w:p>
+    <w:p>
+      <w:pPr>
+        <w:pStyle w:val="Heading4"/>
+      </w:pPr>
+      <w:r>
+        <w:t>Bright Value: 1-100</w:t>
+      </w:r>
+      <w:r>
+        <w:t>%</w:t>
+      </w:r>
+    </w:p>
+    <w:p>
+      <w:r>
+        <w:t>Set the display brightness value.</w:t>
+      </w:r>
+    </w:p>
+    <w:p>
+      <w:pPr>
+        <w:pStyle w:val="Heading4"/>
+      </w:pPr>
+      <w:r>
+        <w:t xml:space="preserve">Dim Value: </w:t>
+      </w:r>
+      <w:r>
+        <w:t>0-100%</w:t>
+      </w:r>
+    </w:p>
+    <w:p>
+      <w:r>
+        <w:t xml:space="preserve">Set the display brightness after the </w:t>
+      </w:r>
+      <w:r>
+        <w:t>timer below expires.</w:t>
+      </w:r>
+    </w:p>
+    <w:p>
+      <w:pPr>
+        <w:pStyle w:val="Heading4"/>
+      </w:pPr>
+      <w:r>
+        <w:t>Display Dim Time:</w:t>
+      </w:r>
+      <w:r>
+        <w:t xml:space="preserve"> 0-120 S</w:t>
+      </w:r>
+    </w:p>
+    <w:p>
+      <w:r>
+        <w:t>Specify the time until the display changes to dim mode.</w:t>
+      </w:r>
+    </w:p>
+    <w:p>
+      <w:pPr>
+        <w:pStyle w:val="Heading4"/>
+      </w:pPr>
+      <w:r>
+        <w:t>+Sideways Scroll Settings</w:t>
+      </w:r>
+    </w:p>
+    <w:p>
+      <w:r>
+        <w:t xml:space="preserve">Lines of text that </w:t>
+      </w:r>
+      <w:proofErr w:type="gramStart"/>
+      <w:r>
+        <w:t>too</w:t>
+      </w:r>
+      <w:proofErr w:type="gramEnd"/>
+      <w:r>
+        <w:t xml:space="preserve"> long for the display will scroll back and forth. The following settings control the speed.</w:t>
+      </w:r>
+    </w:p>
+    <w:p>
+      <w:pPr>
+        <w:pStyle w:val="Heading5"/>
+      </w:pPr>
+      <w:r>
+        <w:t xml:space="preserve">Speed: </w:t>
+      </w:r>
+      <w:r>
+        <w:t>1-1000 mS</w:t>
+      </w:r>
+    </w:p>
+    <w:p>
+      <w:r>
+        <w:t>Controls the speed of text moving to the left.</w:t>
+      </w:r>
+    </w:p>
+    <w:p>
+      <w:pPr>
+        <w:pStyle w:val="Heading5"/>
+      </w:pPr>
+      <w:r>
+        <w:t>Pause: 1-100</w:t>
+      </w:r>
+      <w:r>
+        <w:t xml:space="preserve"> mS</w:t>
+      </w:r>
+    </w:p>
+    <w:p>
+      <w:r>
+        <w:t>This controls the pause when the text is at the end (all the way to the left).</w:t>
+      </w:r>
+    </w:p>
+    <w:p>
+      <w:pPr>
+        <w:pStyle w:val="Heading5"/>
+      </w:pPr>
+      <w:r>
+        <w:t>Reverse Speed: 1-20x</w:t>
+      </w:r>
+    </w:p>
+    <w:p>
+      <w:r>
+        <w:t xml:space="preserve">This is how fast the text scrolls </w:t>
+      </w:r>
+      <w:r>
+        <w:t>back to the beginning (to the right). 2x means twice as fast as the text scroll</w:t>
+      </w:r>
+      <w:r>
+        <w:t>ed to the left</w:t>
       </w:r>
       <w:r>
         <w:t>.</w:t>
@@ -2698,18 +4643,103 @@
     </w:p>
     <w:p>
       <w:pPr>
+        <w:pStyle w:val="Heading4"/>
+      </w:pPr>
+      <w:r>
+        <w:t xml:space="preserve">Menu Selection: </w:t>
+      </w:r>
+      <w:r>
+        <w:t>Color|*</w:t>
+      </w:r>
+    </w:p>
+    <w:p>
+      <w:r>
+        <w:t>Menu selections</w:t>
+      </w:r>
+      <w:r>
+        <w:t xml:space="preserve"> and selections from a list can be either colored or marked with </w:t>
+      </w:r>
+      <w:proofErr w:type="gramStart"/>
+      <w:r>
+        <w:t>the ‘*</w:t>
+      </w:r>
+      <w:proofErr w:type="gramEnd"/>
+      <w:r>
+        <w:t>’ character.</w:t>
+      </w:r>
+    </w:p>
+    <w:p>
+      <w:pPr>
+        <w:pStyle w:val="Heading4"/>
+      </w:pPr>
+      <w:r>
+        <w:t>Text/</w:t>
+      </w:r>
+      <w:proofErr w:type="spellStart"/>
+      <w:r>
+        <w:t>HiLite</w:t>
+      </w:r>
+      <w:proofErr w:type="spellEnd"/>
+      <w:r>
+        <w:t xml:space="preserve"> Colors</w:t>
+      </w:r>
+    </w:p>
+    <w:p>
+      <w:r>
+        <w:t xml:space="preserve">This selection </w:t>
+      </w:r>
+      <w:proofErr w:type="gramStart"/>
+      <w:r>
+        <w:t>allows for choosing</w:t>
+      </w:r>
+      <w:proofErr w:type="gramEnd"/>
+      <w:r>
+        <w:t xml:space="preserve"> the colors of the text and the highlight. The background screen is always black.</w:t>
+      </w:r>
+    </w:p>
+    <w:p>
+      <w:pPr>
         <w:pStyle w:val="Heading3"/>
       </w:pPr>
       <w:r>
-        <w:t>TX Pause:10-1200 Sec</w:t>
-      </w:r>
-    </w:p>
-    <w:p>
-      <w:r>
-        <w:t>This is the pause time between transmissions</w:t>
-      </w:r>
-      <w:r>
-        <w:t>. Longer times let the radio cool off and save the battery for longer run times.</w:t>
+        <w:lastRenderedPageBreak/>
+        <w:t>+Dial &amp; Button Settings</w:t>
+      </w:r>
+    </w:p>
+    <w:p>
+      <w:pPr>
+        <w:pStyle w:val="Heading4"/>
+      </w:pPr>
+      <w:r>
+        <w:t xml:space="preserve">Direction: </w:t>
+      </w:r>
+      <w:proofErr w:type="spellStart"/>
+      <w:proofErr w:type="gramStart"/>
+      <w:r>
+        <w:t>Normal:Reverse</w:t>
+      </w:r>
+      <w:proofErr w:type="spellEnd"/>
+      <w:proofErr w:type="gramEnd"/>
+    </w:p>
+    <w:p>
+      <w:r>
+        <w:t>If you really want the button to be the other way around this is the choice for you.</w:t>
+      </w:r>
+    </w:p>
+    <w:p>
+      <w:pPr>
+        <w:pStyle w:val="Heading4"/>
+      </w:pPr>
+      <w:r>
+        <w:t>Long Press Timer: 2-200</w:t>
+      </w:r>
+    </w:p>
+    <w:p>
+      <w:r>
+        <w:t>This value affects how long or short a long press is. The default value is normally OK</w:t>
+      </w:r>
+      <w:r>
+        <w:t>, but somebody might want to change it.</w:t>
       </w:r>
     </w:p>
     <w:p>
@@ -2717,12 +4747,91 @@
         <w:pStyle w:val="Heading3"/>
       </w:pPr>
       <w:r>
-        <w:t>TX Send Min: 10-90 Sec</w:t>
-      </w:r>
-    </w:p>
-    <w:p>
-      <w:r>
-        <w:t>In random mode this is the minimum send time.</w:t>
+        <w:t>+Battery Settings</w:t>
+      </w:r>
+    </w:p>
+    <w:p>
+      <w:r>
+        <w:t xml:space="preserve">Since the PCB was designed with 10% resistors for measuring the battery voltage some calibration is needed. A future PCB will probably use better </w:t>
+      </w:r>
+      <w:proofErr w:type="gramStart"/>
+      <w:r>
+        <w:t>resistors</w:t>
+      </w:r>
+      <w:proofErr w:type="gramEnd"/>
+      <w:r>
+        <w:t xml:space="preserve"> so this won’t be needed.</w:t>
+      </w:r>
+    </w:p>
+    <w:p>
+      <w:pPr>
+        <w:pStyle w:val="Heading4"/>
+      </w:pPr>
+      <w:r>
+        <w:t xml:space="preserve">Show Battery: </w:t>
+      </w:r>
+      <w:proofErr w:type="spellStart"/>
+      <w:r>
+        <w:t>Yes|No</w:t>
+      </w:r>
+      <w:proofErr w:type="spellEnd"/>
+    </w:p>
+    <w:p>
+      <w:r>
+        <w:t xml:space="preserve">This option controls the </w:t>
+      </w:r>
+      <w:r>
+        <w:t>battery display on the bottom right of the display.</w:t>
+      </w:r>
+    </w:p>
+    <w:p>
+      <w:pPr>
+        <w:pStyle w:val="Heading4"/>
+      </w:pPr>
+      <w:r>
+        <w:t>Full Battery: 2000-4000</w:t>
+      </w:r>
+    </w:p>
+    <w:p>
+      <w:r>
+        <w:t>This is the value that indicates a full 4.2V battery.</w:t>
+      </w:r>
+    </w:p>
+    <w:p>
+      <w:pPr>
+        <w:pStyle w:val="Heading4"/>
+      </w:pPr>
+      <w:r>
+        <w:t>Set Full Battery</w:t>
+      </w:r>
+    </w:p>
+    <w:p>
+      <w:r>
+        <w:t>This selection reads the current battery values and stores it. It is best set by fully charging the battery and then disconnecting the charger. Wait a couple of minutes and then use it several times until it seems stable.</w:t>
+      </w:r>
+    </w:p>
+    <w:p>
+      <w:pPr>
+        <w:pStyle w:val="Heading4"/>
+      </w:pPr>
+      <w:r>
+        <w:t>Read Battery Raw Data</w:t>
+      </w:r>
+    </w:p>
+    <w:p>
+      <w:r>
+        <w:t>This continuously reads the battery value</w:t>
+      </w:r>
+      <w:r>
+        <w:t xml:space="preserve">. It was originally used for testing, but it seems like it might possibly be </w:t>
+      </w:r>
+      <w:proofErr w:type="gramStart"/>
+      <w:r>
+        <w:t>useful</w:t>
+      </w:r>
+      <w:proofErr w:type="gramEnd"/>
+      <w:r>
+        <w:t xml:space="preserve"> so it was left in the menu system.</w:t>
       </w:r>
     </w:p>
     <w:p>
@@ -2730,18 +4839,37 @@
         <w:pStyle w:val="Heading3"/>
       </w:pPr>
       <w:r>
-        <w:t xml:space="preserve">TX Send Max: </w:t>
-      </w:r>
-      <w:r>
-        <w:t>10-90 Sec</w:t>
-      </w:r>
-    </w:p>
-    <w:p>
-      <w:r>
-        <w:t xml:space="preserve">In </w:t>
-      </w:r>
-      <w:r>
-        <w:t>random mode this is the maximum send time.</w:t>
+        <w:t>New Version BIN File</w:t>
+      </w:r>
+    </w:p>
+    <w:p>
+      <w:r>
+        <w:t xml:space="preserve">New firmware can be loaded by putting </w:t>
+      </w:r>
+      <w:r>
+        <w:t xml:space="preserve">the binary file on the SD card. It must be named </w:t>
+      </w:r>
+      <w:proofErr w:type="spellStart"/>
+      <w:r>
+        <w:t>RadioFox.BIN</w:t>
+      </w:r>
+      <w:proofErr w:type="spellEnd"/>
+      <w:r>
+        <w:t>.</w:t>
+      </w:r>
+      <w:r>
+        <w:t xml:space="preserve"> There are two prompts, one to confirm </w:t>
+      </w:r>
+      <w:proofErr w:type="gramStart"/>
+      <w:r>
+        <w:t>overwriting</w:t>
+      </w:r>
+      <w:proofErr w:type="gramEnd"/>
+      <w:r>
+        <w:t xml:space="preserve"> the firmware, and another to allow deletion of the </w:t>
+      </w:r>
+      <w:r>
+        <w:t>BIN file after installation.</w:t>
       </w:r>
     </w:p>
     <w:p>
@@ -2749,12 +4877,24 @@
         <w:pStyle w:val="Heading3"/>
       </w:pPr>
       <w:r>
-        <w:t>TX Pause Min: 10-1200 Sec</w:t>
-      </w:r>
-    </w:p>
-    <w:p>
-      <w:r>
-        <w:t>In random mode this is the minimum pause time.</w:t>
+        <w:t>Factory Settings</w:t>
+      </w:r>
+    </w:p>
+    <w:p>
+      <w:r>
+        <w:t xml:space="preserve">This command resets </w:t>
+      </w:r>
+      <w:r>
+        <w:t xml:space="preserve">all </w:t>
+      </w:r>
+      <w:r>
+        <w:t>settings</w:t>
+      </w:r>
+      <w:r>
+        <w:t xml:space="preserve"> except the high battery value to the original factory values.</w:t>
+      </w:r>
+      <w:r>
+        <w:t xml:space="preserve"> The factory reset can also be done by holding the dial button down while turning the power on.</w:t>
       </w:r>
     </w:p>
     <w:p>
@@ -2762,56 +4902,35 @@
         <w:pStyle w:val="Heading3"/>
       </w:pPr>
       <w:r>
-        <w:t>TX Pause Max: 10-1200 Sec</w:t>
-      </w:r>
-    </w:p>
-    <w:p>
-      <w:r>
-        <w:t>In random mode this is the maximum pause time.</w:t>
-      </w:r>
-    </w:p>
-    <w:p>
-      <w:pPr>
-        <w:pStyle w:val="Heading3"/>
-      </w:pPr>
-      <w:r>
-        <w:t>TX Stop: Immediate|Finish Cycle</w:t>
-      </w:r>
-    </w:p>
-    <w:p>
-      <w:r>
-        <w:t>During transmit time the Beacon, Call Sign, and Audio are continuously sent. At the end of the transmission time this option controls whether the transmission stops immediately of waits to stop until the entire cycle is finished.</w:t>
-      </w:r>
-    </w:p>
-    <w:p/>
-    <w:p>
-      <w:r>
-        <w:t>A clever use of this command</w:t>
-      </w:r>
-      <w:r>
-        <w:t xml:space="preserve"> allows for only one cycle of beacon, ID, and music to be sent during each transmission time. Set the transmit</w:t>
-      </w:r>
-      <w:r>
-        <w:t xml:space="preserve"> time to something less than</w:t>
-      </w:r>
-      <w:r>
-        <w:t xml:space="preserve"> the time to perform a complete cycle and set this option to “Finish Cycle”. The transmit  cycle will begin, the timer will expire, but the current cycle will complete before stopping</w:t>
-      </w:r>
-      <w:r>
-        <w:t>.</w:t>
-      </w:r>
-    </w:p>
-    <w:p>
-      <w:pPr>
-        <w:pStyle w:val="Heading3"/>
-      </w:pPr>
-      <w:r>
-        <w:t>Radio Pause: Sleep|Awake</w:t>
-      </w:r>
-    </w:p>
-    <w:p>
-      <w:r>
-        <w:t>During pause time the radio can be put into sleep mode. This lowers the power consumption and lets the battery last longer. However note that this also means that the DTMF commands are disabled since the radio is asleep!</w:t>
+        <w:lastRenderedPageBreak/>
+        <w:t>Format EEPROM</w:t>
+      </w:r>
+    </w:p>
+    <w:p>
+      <w:r>
+        <w:t xml:space="preserve">This will clear </w:t>
+      </w:r>
+      <w:r>
+        <w:t xml:space="preserve">and reset </w:t>
+      </w:r>
+      <w:r>
+        <w:t xml:space="preserve">the </w:t>
+      </w:r>
+      <w:proofErr w:type="spellStart"/>
+      <w:r>
+        <w:t>eeprom</w:t>
+      </w:r>
+      <w:proofErr w:type="spellEnd"/>
+      <w:r>
+        <w:t xml:space="preserve"> where the settings are </w:t>
+      </w:r>
+      <w:proofErr w:type="gramStart"/>
+      <w:r>
+        <w:t>save</w:t>
+      </w:r>
+      <w:proofErr w:type="gramEnd"/>
+      <w:r>
+        <w:t xml:space="preserve"> in non-volatile memory. This is how settings are saved while the system is not powered.</w:t>
       </w:r>
     </w:p>
     <w:p>
@@ -2819,196 +4938,23 @@
         <w:pStyle w:val="Heading2"/>
       </w:pPr>
       <w:r>
-        <w:lastRenderedPageBreak/>
-        <w:t>+</w:t>
-      </w:r>
-      <w:r>
-        <w:t>More Radio Settings</w:t>
-      </w:r>
-    </w:p>
-    <w:p>
-      <w:pPr>
-        <w:pStyle w:val="Heading3"/>
-      </w:pPr>
-      <w:r>
-        <w:t>RX Offset: -600|0|+600 kHz</w:t>
-      </w:r>
-    </w:p>
-    <w:p>
-      <w:r>
-        <w:t>This is the frequency offset from the transmit frequency that the radio uses to receive DTMF commands</w:t>
-      </w:r>
-      <w:r>
-        <w:t>. An offset is recommended. If 0 is used the radio will only listen when it isn’t sending. It has not been tested if it listens during sending when the offset is not 0.</w:t>
-      </w:r>
-    </w:p>
-    <w:p>
-      <w:pPr>
-        <w:pStyle w:val="Heading3"/>
-      </w:pPr>
-      <w:r>
-        <w:t>Bandwidth: 12.5|</w:t>
-      </w:r>
-      <w:r>
-        <w:t>25 kHz</w:t>
-      </w:r>
-    </w:p>
-    <w:p>
-      <w:r>
-        <w:t>This sets the radio bandwidth</w:t>
-      </w:r>
-      <w:r>
-        <w:t>. It has not been tested much to see what effect it has on performance yet.</w:t>
-      </w:r>
-    </w:p>
-    <w:p>
-      <w:pPr>
-        <w:pStyle w:val="Heading3"/>
-      </w:pPr>
-      <w:r>
-        <w:t>CTCSS/DCS: CTCSS|DCS</w:t>
-      </w:r>
-    </w:p>
-    <w:p>
-      <w:r>
-        <w:t xml:space="preserve">This sets the </w:t>
-      </w:r>
-      <w:r>
-        <w:t>un-squelch</w:t>
-      </w:r>
-      <w:r>
-        <w:t xml:space="preserve"> values</w:t>
-      </w:r>
-      <w:r>
-        <w:t xml:space="preserve"> for either the analog or digital versions.</w:t>
-      </w:r>
-    </w:p>
-    <w:p>
-      <w:pPr>
-        <w:pStyle w:val="Heading3"/>
-      </w:pPr>
-      <w:r>
-        <w:t>TX CTCSS:</w:t>
-      </w:r>
-      <w:r>
-        <w:t xml:space="preserve"> None</w:t>
-      </w:r>
-      <w:r>
-        <w:t>|</w:t>
-      </w:r>
-      <w:r>
-        <w:t>67-</w:t>
-      </w:r>
-      <w:r>
-        <w:t>250.3</w:t>
-      </w:r>
-    </w:p>
-    <w:p>
-      <w:r>
-        <w:t>Analog un-squelch frequencies sent out.</w:t>
-      </w:r>
-    </w:p>
-    <w:p>
-      <w:pPr>
-        <w:pStyle w:val="Heading3"/>
-      </w:pPr>
-      <w:r>
-        <w:t>RX CTCSS:</w:t>
-      </w:r>
-      <w:r>
-        <w:t xml:space="preserve"> None|67-250.3</w:t>
-      </w:r>
-    </w:p>
-    <w:p>
-      <w:r>
-        <w:t>Analog un-squelch frequency for receiving.</w:t>
-      </w:r>
-    </w:p>
-    <w:p>
-      <w:pPr>
-        <w:pStyle w:val="Heading3"/>
-      </w:pPr>
-      <w:r>
-        <w:t>TX DCS:</w:t>
-      </w:r>
-      <w:r>
-        <w:t xml:space="preserve"> None|023-754</w:t>
-      </w:r>
-    </w:p>
-    <w:p>
-      <w:r>
-        <w:t>Digital un-squelch value for sending.</w:t>
-      </w:r>
-    </w:p>
-    <w:p>
-      <w:pPr>
-        <w:pStyle w:val="Heading3"/>
-      </w:pPr>
-      <w:r>
-        <w:t>TX I/N: I|N</w:t>
-      </w:r>
-    </w:p>
-    <w:p>
-      <w:r>
-        <w:t>The digital I or N value for sending.</w:t>
-      </w:r>
-    </w:p>
-    <w:p>
-      <w:pPr>
-        <w:pStyle w:val="Heading3"/>
-      </w:pPr>
-      <w:r>
-        <w:t>RX DCS: None|023-754</w:t>
-      </w:r>
-    </w:p>
-    <w:p>
-      <w:r>
-        <w:t>Digital un-squelch value for receiving.</w:t>
-      </w:r>
-    </w:p>
-    <w:p>
-      <w:pPr>
-        <w:pStyle w:val="Heading3"/>
-      </w:pPr>
-      <w:r>
-        <w:t>RX I/N: I|N</w:t>
-      </w:r>
-    </w:p>
-    <w:p>
-      <w:r>
-        <w:t>The digital I or N value for receiving.</w:t>
-      </w:r>
-    </w:p>
-    <w:p>
-      <w:pPr>
-        <w:pStyle w:val="Heading3"/>
-      </w:pPr>
-      <w:r>
-        <w:t>RX Volume:</w:t>
-      </w:r>
-      <w:r>
-        <w:t xml:space="preserve"> 1-6</w:t>
-      </w:r>
-    </w:p>
-    <w:p>
-      <w:r>
-        <w:t>This is the receive volume setting. It affects how well DTMF tones are detected.</w:t>
-      </w:r>
-    </w:p>
-    <w:p>
-      <w:pPr>
-        <w:pStyle w:val="Heading3"/>
-      </w:pPr>
-      <w:r>
-        <w:t>RX Squelch:</w:t>
-      </w:r>
-      <w:r>
-        <w:t xml:space="preserve"> 0-8</w:t>
-      </w:r>
-    </w:p>
-    <w:p>
-      <w:r>
-        <w:t>This affects how much signal is required to receive the DTMF signals.</w:t>
+        <w:t>Save Current Settings</w:t>
+      </w:r>
+    </w:p>
+    <w:p>
+      <w:r>
+        <w:t xml:space="preserve">This stores </w:t>
+      </w:r>
+      <w:proofErr w:type="gramStart"/>
+      <w:r>
+        <w:t>all of</w:t>
+      </w:r>
+      <w:proofErr w:type="gramEnd"/>
+      <w:r>
+        <w:t xml:space="preserve"> the current settings in the non-volatile memory</w:t>
+      </w:r>
+      <w:r>
+        <w:t>. Note that this is not often used since settings are normally saved each time they are changed.</w:t>
       </w:r>
     </w:p>
     <w:p>
@@ -3016,477 +4962,6 @@
         <w:pStyle w:val="Heading2"/>
       </w:pPr>
       <w:r>
-        <w:lastRenderedPageBreak/>
-        <w:t>Cancel Waits/TX Now</w:t>
-      </w:r>
-    </w:p>
-    <w:p>
-      <w:r>
-        <w:t>When the radio is in either send or pause mode this command will cancel the timer and the next mo</w:t>
-      </w:r>
-      <w:r>
-        <w:t>de will start. For example if you want to cancel</w:t>
-      </w:r>
-      <w:r>
-        <w:t xml:space="preserve"> the pause and go to transmit, use this option. It can also be done by long pressing B0.</w:t>
-      </w:r>
-    </w:p>
-    <w:p>
-      <w:pPr>
-        <w:pStyle w:val="Heading2"/>
-      </w:pPr>
-      <w:r>
-        <w:t>+Saved Settings Files</w:t>
-      </w:r>
-    </w:p>
-    <w:p>
-      <w:r>
-        <w:t>Saved settings files are named files stored on the SD card. They are useful to</w:t>
-      </w:r>
-      <w:r>
-        <w:t xml:space="preserve"> quickly configure the radio for different uses. All values except the battery calibration are affected.</w:t>
-      </w:r>
-    </w:p>
-    <w:p>
-      <w:pPr>
-        <w:pStyle w:val="Heading3"/>
-      </w:pPr>
-      <w:r>
-        <w:t>Create File</w:t>
-      </w:r>
-    </w:p>
-    <w:p>
-      <w:r>
-        <w:t>This prompts the user for a name. The file is then created using the current system settings.</w:t>
-      </w:r>
-    </w:p>
-    <w:p>
-      <w:pPr>
-        <w:pStyle w:val="Heading3"/>
-      </w:pPr>
-      <w:r>
-        <w:t>Save/Update File</w:t>
-      </w:r>
-    </w:p>
-    <w:p>
-      <w:r>
-        <w:t>This command saves the current settings into the selected file. If it already exists the user will be asked to confirm overwriting the file.</w:t>
-      </w:r>
-    </w:p>
-    <w:p>
-      <w:pPr>
-        <w:pStyle w:val="Heading3"/>
-      </w:pPr>
-      <w:r>
-        <w:t>Load File</w:t>
-      </w:r>
-    </w:p>
-    <w:p>
-      <w:r>
-        <w:t>This command asks the user for the name and then sets all of the system settings except the battery calibration using the values in the file.</w:t>
-      </w:r>
-    </w:p>
-    <w:p>
-      <w:pPr>
-        <w:pStyle w:val="Heading3"/>
-      </w:pPr>
-      <w:r>
-        <w:t>Delete File</w:t>
-      </w:r>
-    </w:p>
-    <w:p>
-      <w:r>
-        <w:t>The user selects a file from the list and then it can be deleted.</w:t>
-      </w:r>
-    </w:p>
-    <w:p>
-      <w:pPr>
-        <w:pStyle w:val="Heading2"/>
-      </w:pPr>
-      <w:r>
-        <w:t>+System Settings</w:t>
-      </w:r>
-    </w:p>
-    <w:p>
-      <w:pPr>
-        <w:pStyle w:val="Heading3"/>
-      </w:pPr>
-      <w:r>
-        <w:t>+Display</w:t>
-      </w:r>
-      <w:r>
-        <w:t xml:space="preserve"> Settings</w:t>
-      </w:r>
-    </w:p>
-    <w:p>
-      <w:pPr>
-        <w:pStyle w:val="Heading4"/>
-      </w:pPr>
-      <w:r>
-        <w:t>Dimming Mode: None</w:t>
-      </w:r>
-      <w:r>
-        <w:t>|Timer</w:t>
-      </w:r>
-    </w:p>
-    <w:p>
-      <w:r>
-        <w:t xml:space="preserve">The display can be set to dim automatically after a specified number of seconds. This is used to save battery power since the backlight </w:t>
-      </w:r>
-      <w:r>
-        <w:t>uses a significant amount.</w:t>
-      </w:r>
-    </w:p>
-    <w:p>
-      <w:pPr>
-        <w:pStyle w:val="Heading4"/>
-      </w:pPr>
-      <w:r>
-        <w:t>Bright Value: 1-100</w:t>
-      </w:r>
-      <w:r>
-        <w:t>%</w:t>
-      </w:r>
-    </w:p>
-    <w:p>
-      <w:r>
-        <w:t>Set the display brightness value.</w:t>
-      </w:r>
-    </w:p>
-    <w:p>
-      <w:pPr>
-        <w:pStyle w:val="Heading4"/>
-      </w:pPr>
-      <w:r>
-        <w:t xml:space="preserve">Dim Value: </w:t>
-      </w:r>
-      <w:r>
-        <w:t>0-100%</w:t>
-      </w:r>
-    </w:p>
-    <w:p>
-      <w:r>
-        <w:t xml:space="preserve">Set the display brightness after the </w:t>
-      </w:r>
-      <w:r>
-        <w:t>timer below expires.</w:t>
-      </w:r>
-    </w:p>
-    <w:p>
-      <w:pPr>
-        <w:pStyle w:val="Heading4"/>
-      </w:pPr>
-      <w:r>
-        <w:lastRenderedPageBreak/>
-        <w:t>Display Dim Time:</w:t>
-      </w:r>
-      <w:r>
-        <w:t xml:space="preserve"> 0-120 S</w:t>
-      </w:r>
-    </w:p>
-    <w:p>
-      <w:r>
-        <w:t>Specify the time until the display changes to dim mode.</w:t>
-      </w:r>
-    </w:p>
-    <w:p>
-      <w:pPr>
-        <w:pStyle w:val="Heading4"/>
-      </w:pPr>
-      <w:r>
-        <w:t>+Sideways Scroll Settings</w:t>
-      </w:r>
-    </w:p>
-    <w:p>
-      <w:r>
-        <w:t>Lines of text that too long for the display will scroll back and forth. The following settings control the speed.</w:t>
-      </w:r>
-    </w:p>
-    <w:p>
-      <w:pPr>
-        <w:pStyle w:val="Heading5"/>
-      </w:pPr>
-      <w:r>
-        <w:t xml:space="preserve">Speed: </w:t>
-      </w:r>
-      <w:r>
-        <w:t>1-1000 mS</w:t>
-      </w:r>
-    </w:p>
-    <w:p>
-      <w:r>
-        <w:t>Controls the speed of text moving to the left.</w:t>
-      </w:r>
-    </w:p>
-    <w:p>
-      <w:pPr>
-        <w:pStyle w:val="Heading5"/>
-      </w:pPr>
-      <w:r>
-        <w:t>Pause: 1-100</w:t>
-      </w:r>
-      <w:r>
-        <w:t xml:space="preserve"> mS</w:t>
-      </w:r>
-    </w:p>
-    <w:p>
-      <w:r>
-        <w:t>This controls the pause when the text is at the end (all the way to the left).</w:t>
-      </w:r>
-    </w:p>
-    <w:p>
-      <w:pPr>
-        <w:pStyle w:val="Heading5"/>
-      </w:pPr>
-      <w:r>
-        <w:t>Reverse Speed: 1-20x</w:t>
-      </w:r>
-    </w:p>
-    <w:p>
-      <w:r>
-        <w:t xml:space="preserve">This is how fast the text scrolls </w:t>
-      </w:r>
-      <w:r>
-        <w:t>back to the beginning (to the right). 2x means twice as fast as the text scroll</w:t>
-      </w:r>
-      <w:r>
-        <w:t>ed to the left</w:t>
-      </w:r>
-      <w:r>
-        <w:t>.</w:t>
-      </w:r>
-    </w:p>
-    <w:p>
-      <w:pPr>
-        <w:pStyle w:val="Heading4"/>
-      </w:pPr>
-      <w:r>
-        <w:t xml:space="preserve">Menu Selection: </w:t>
-      </w:r>
-      <w:r>
-        <w:t>Color|*</w:t>
-      </w:r>
-    </w:p>
-    <w:p>
-      <w:r>
-        <w:t>Menu selections</w:t>
-      </w:r>
-      <w:r>
-        <w:t xml:space="preserve"> and selections from a list can be either colored or marked with the ‘*’ character.</w:t>
-      </w:r>
-    </w:p>
-    <w:p>
-      <w:pPr>
-        <w:pStyle w:val="Heading4"/>
-      </w:pPr>
-      <w:r>
-        <w:t>Text/HiLite Colors</w:t>
-      </w:r>
-    </w:p>
-    <w:p>
-      <w:r>
-        <w:t>This selection allows for choosing the colors of the text and the highlight. The background screen is always black.</w:t>
-      </w:r>
-    </w:p>
-    <w:p>
-      <w:pPr>
-        <w:pStyle w:val="Heading3"/>
-      </w:pPr>
-      <w:r>
-        <w:t>+Dial &amp; Button Settings</w:t>
-      </w:r>
-    </w:p>
-    <w:p>
-      <w:pPr>
-        <w:pStyle w:val="Heading4"/>
-      </w:pPr>
-      <w:r>
-        <w:t>Direction: Normal:Reverse</w:t>
-      </w:r>
-    </w:p>
-    <w:p>
-      <w:r>
-        <w:t>If you really want the button to be the other way around this is the choice for you.</w:t>
-      </w:r>
-    </w:p>
-    <w:p>
-      <w:pPr>
-        <w:pStyle w:val="Heading4"/>
-      </w:pPr>
-      <w:r>
-        <w:t>Long Press Timer: 2-200</w:t>
-      </w:r>
-    </w:p>
-    <w:p>
-      <w:r>
-        <w:t>This value affects how long or short a long press is. The default value is normally OK</w:t>
-      </w:r>
-      <w:r>
-        <w:t>, but somebody might want to change it.</w:t>
-      </w:r>
-    </w:p>
-    <w:p>
-      <w:pPr>
-        <w:pStyle w:val="Heading3"/>
-      </w:pPr>
-      <w:r>
-        <w:t>+Battery Settings</w:t>
-      </w:r>
-    </w:p>
-    <w:p>
-      <w:r>
-        <w:t>Since the PCB was designed with 10% resistors for measuring the battery voltage some calibration is needed. A future PCB will probably use better resistors so this won’t be needed.</w:t>
-      </w:r>
-    </w:p>
-    <w:p>
-      <w:pPr>
-        <w:pStyle w:val="Heading4"/>
-      </w:pPr>
-      <w:r>
-        <w:t>Show Battery: Yes|No</w:t>
-      </w:r>
-    </w:p>
-    <w:p>
-      <w:r>
-        <w:t xml:space="preserve">This option controls the </w:t>
-      </w:r>
-      <w:r>
-        <w:t>battery display on the bottom right of the display.</w:t>
-      </w:r>
-    </w:p>
-    <w:p>
-      <w:pPr>
-        <w:pStyle w:val="Heading4"/>
-      </w:pPr>
-      <w:r>
-        <w:lastRenderedPageBreak/>
-        <w:t>Full Battery: 2000-4000</w:t>
-      </w:r>
-    </w:p>
-    <w:p>
-      <w:r>
-        <w:t>This is the value that indicates a full 4.2V battery.</w:t>
-      </w:r>
-    </w:p>
-    <w:p>
-      <w:pPr>
-        <w:pStyle w:val="Heading4"/>
-      </w:pPr>
-      <w:r>
-        <w:t>Set Full Battery</w:t>
-      </w:r>
-    </w:p>
-    <w:p>
-      <w:r>
-        <w:t>This selection reads the current battery values and stores it. It is best set by fully charging the battery and then disconnecting the charger. Wait a couple of minutes and then use it several times until it seems stable.</w:t>
-      </w:r>
-    </w:p>
-    <w:p>
-      <w:pPr>
-        <w:pStyle w:val="Heading4"/>
-      </w:pPr>
-      <w:r>
-        <w:t>Read Battery Raw Data</w:t>
-      </w:r>
-    </w:p>
-    <w:p>
-      <w:r>
-        <w:t>This continuously reads the battery value</w:t>
-      </w:r>
-      <w:r>
-        <w:t>. It was originally used for testing, but it seems like it might possibly be useful so it was left in the menu system.</w:t>
-      </w:r>
-    </w:p>
-    <w:p>
-      <w:pPr>
-        <w:pStyle w:val="Heading3"/>
-      </w:pPr>
-      <w:r>
-        <w:t>New Version BIN File</w:t>
-      </w:r>
-    </w:p>
-    <w:p>
-      <w:r>
-        <w:t xml:space="preserve">New firmware can be loaded by putting </w:t>
-      </w:r>
-      <w:r>
-        <w:t>the binary file on the SD card. It must be named RadioFox.BIN.</w:t>
-      </w:r>
-      <w:r>
-        <w:t xml:space="preserve"> There are two prompts, one to confirm overwriting the firmware, and another to allow deletion of the </w:t>
-      </w:r>
-      <w:r>
-        <w:t>BIN file after installation.</w:t>
-      </w:r>
-    </w:p>
-    <w:p>
-      <w:pPr>
-        <w:pStyle w:val="Heading3"/>
-      </w:pPr>
-      <w:r>
-        <w:t>Factory Settings</w:t>
-      </w:r>
-    </w:p>
-    <w:p>
-      <w:r>
-        <w:t xml:space="preserve">This command resets </w:t>
-      </w:r>
-      <w:r>
-        <w:t xml:space="preserve">all </w:t>
-      </w:r>
-      <w:r>
-        <w:t>settings</w:t>
-      </w:r>
-      <w:r>
-        <w:t xml:space="preserve"> except the high battery value to the original factory values.</w:t>
-      </w:r>
-      <w:r>
-        <w:t xml:space="preserve"> The factory reset can also be done by holding the dial button down while turning the power on.</w:t>
-      </w:r>
-    </w:p>
-    <w:p>
-      <w:pPr>
-        <w:pStyle w:val="Heading3"/>
-      </w:pPr>
-      <w:r>
-        <w:t>Format EEPROM</w:t>
-      </w:r>
-    </w:p>
-    <w:p>
-      <w:r>
-        <w:t xml:space="preserve">This will clear </w:t>
-      </w:r>
-      <w:r>
-        <w:t xml:space="preserve">and reset </w:t>
-      </w:r>
-      <w:r>
-        <w:t>the eeprom where the settings are save</w:t>
-      </w:r>
-      <w:r>
-        <w:t xml:space="preserve"> in non-volatile memory. This is how settings are saved while the system is not powered.</w:t>
-      </w:r>
-    </w:p>
-    <w:p>
-      <w:pPr>
-        <w:pStyle w:val="Heading2"/>
-      </w:pPr>
-      <w:r>
-        <w:t>Save Current Settings</w:t>
-      </w:r>
-    </w:p>
-    <w:p>
-      <w:r>
-        <w:t>This stores all of the current settings in the non-volatile memory</w:t>
-      </w:r>
-      <w:r>
-        <w:t>. Note that this is not often used since settings are normally saved each time they are changed.</w:t>
-      </w:r>
-    </w:p>
-    <w:p>
-      <w:pPr>
-        <w:pStyle w:val="Heading2"/>
-      </w:pPr>
-      <w:r>
         <w:t>Reboot</w:t>
       </w:r>
     </w:p>
@@ -3496,7 +4971,7 @@
       </w:r>
     </w:p>
     <w:sectPr>
-      <w:footerReference w:type="default" r:id="rId10"/>
+      <w:footerReference w:type="default" r:id="rId11"/>
       <w:pgSz w:w="12240" w:h="15840"/>
       <w:pgMar w:top="1440" w:right="1440" w:bottom="1440" w:left="1440" w:header="720" w:footer="720" w:gutter="0"/>
       <w:pgNumType w:start="1"/>
@@ -3507,7 +4982,7 @@
 </file>
 
 <file path=word/endnotes.xml><?xml version="1.0" encoding="utf-8"?>
-<w:endnotes xmlns:wpc="http://schemas.microsoft.com/office/word/2010/wordprocessingCanvas" xmlns:cx="http://schemas.microsoft.com/office/drawing/2014/chartex" xmlns:cx1="http://schemas.microsoft.com/office/drawing/2015/9/8/chartex" xmlns:cx2="http://schemas.microsoft.com/office/drawing/2015/10/21/chartex" xmlns:cx3="http://schemas.microsoft.com/office/drawing/2016/5/9/chartex" xmlns:cx4="http://schemas.microsoft.com/office/drawing/2016/5/10/chartex" xmlns:cx5="http://schemas.microsoft.com/office/drawing/2016/5/11/chartex" xmlns:cx6="http://schemas.microsoft.com/office/drawing/2016/5/12/chartex" xmlns:cx7="http://schemas.microsoft.com/office/drawing/2016/5/13/chartex" xmlns:cx8="http://schemas.microsoft.com/office/drawing/2016/5/14/chartex" xmlns:mc="http://schemas.openxmlformats.org/markup-compatibility/2006" xmlns:aink="http://schemas.microsoft.com/office/drawing/2016/ink" xmlns:am3d="http://schemas.microsoft.com/office/drawing/2017/model3d" xmlns:o="urn:schemas-microsoft-com:office:office" xmlns:oel="http://schemas.microsoft.com/office/2019/extlst" xmlns:r="http://schemas.openxmlformats.org/officeDocument/2006/relationships" xmlns:m="http://schemas.openxmlformats.org/officeDocument/2006/math" xmlns:v="urn:schemas-microsoft-com:vml" xmlns:wp14="http://schemas.microsoft.com/office/word/2010/wordprocessingDrawing" xmlns:wp="http://schemas.openxmlformats.org/drawingml/2006/wordprocessingDrawing" xmlns:w10="urn:schemas-microsoft-com:office:word" xmlns:w="http://schemas.openxmlformats.org/wordprocessingml/2006/main" xmlns:w14="http://schemas.microsoft.com/office/word/2010/wordml" xmlns:w15="http://schemas.microsoft.com/office/word/2012/wordml" xmlns:w16cex="http://schemas.microsoft.com/office/word/2018/wordml/cex" xmlns:w16cid="http://schemas.microsoft.com/office/word/2016/wordml/cid" xmlns:w16="http://schemas.microsoft.com/office/word/2018/wordml" xmlns:w16du="http://schemas.microsoft.com/office/word/2023/wordml/word16du" xmlns:w16sdtdh="http://schemas.microsoft.com/office/word/2020/wordml/sdtdatahash" xmlns:w16se="http://schemas.microsoft.com/office/word/2015/wordml/symex" xmlns:wpg="http://schemas.microsoft.com/office/word/2010/wordprocessingGroup" xmlns:wpi="http://schemas.microsoft.com/office/word/2010/wordprocessingInk" xmlns:wne="http://schemas.microsoft.com/office/word/2006/wordml" xmlns:wps="http://schemas.microsoft.com/office/word/2010/wordprocessingShape" mc:Ignorable="w14 w15 w16se w16cid w16 w16cex w16sdtdh w16du wp14">
+<w:endnotes xmlns:wpc="http://schemas.microsoft.com/office/word/2010/wordprocessingCanvas" xmlns:cx="http://schemas.microsoft.com/office/drawing/2014/chartex" xmlns:cx1="http://schemas.microsoft.com/office/drawing/2015/9/8/chartex" xmlns:cx2="http://schemas.microsoft.com/office/drawing/2015/10/21/chartex" xmlns:cx3="http://schemas.microsoft.com/office/drawing/2016/5/9/chartex" xmlns:cx4="http://schemas.microsoft.com/office/drawing/2016/5/10/chartex" xmlns:cx5="http://schemas.microsoft.com/office/drawing/2016/5/11/chartex" xmlns:cx6="http://schemas.microsoft.com/office/drawing/2016/5/12/chartex" xmlns:cx7="http://schemas.microsoft.com/office/drawing/2016/5/13/chartex" xmlns:cx8="http://schemas.microsoft.com/office/drawing/2016/5/14/chartex" xmlns:mc="http://schemas.openxmlformats.org/markup-compatibility/2006" xmlns:aink="http://schemas.microsoft.com/office/drawing/2016/ink" xmlns:am3d="http://schemas.microsoft.com/office/drawing/2017/model3d" xmlns:o="urn:schemas-microsoft-com:office:office" xmlns:oel="http://schemas.microsoft.com/office/2019/extlst" xmlns:r="http://schemas.openxmlformats.org/officeDocument/2006/relationships" xmlns:m="http://schemas.openxmlformats.org/officeDocument/2006/math" xmlns:v="urn:schemas-microsoft-com:vml" xmlns:wp14="http://schemas.microsoft.com/office/word/2010/wordprocessingDrawing" xmlns:wp="http://schemas.openxmlformats.org/drawingml/2006/wordprocessingDrawing" xmlns:w10="urn:schemas-microsoft-com:office:word" xmlns:w="http://schemas.openxmlformats.org/wordprocessingml/2006/main" xmlns:w14="http://schemas.microsoft.com/office/word/2010/wordml" xmlns:w15="http://schemas.microsoft.com/office/word/2012/wordml" xmlns:w16cex="http://schemas.microsoft.com/office/word/2018/wordml/cex" xmlns:w16cid="http://schemas.microsoft.com/office/word/2016/wordml/cid" xmlns:w16="http://schemas.microsoft.com/office/word/2018/wordml" xmlns:w16du="http://schemas.microsoft.com/office/word/2023/wordml/word16du" xmlns:w16sdtdh="http://schemas.microsoft.com/office/word/2020/wordml/sdtdatahash" xmlns:w16sdtfl="http://schemas.microsoft.com/office/word/2024/wordml/sdtformatlock" xmlns:w16se="http://schemas.microsoft.com/office/word/2015/wordml/symex" xmlns:wpg="http://schemas.microsoft.com/office/word/2010/wordprocessingGroup" xmlns:wpi="http://schemas.microsoft.com/office/word/2010/wordprocessingInk" xmlns:wne="http://schemas.microsoft.com/office/word/2006/wordml" xmlns:wps="http://schemas.microsoft.com/office/word/2010/wordprocessingShape" mc:Ignorable="w14 w15 w16se w16cid w16 w16cex w16sdtdh w16sdtfl w16du wp14">
   <w:endnote w:type="separator" w:id="-1">
     <w:p>
       <w:pPr>
@@ -3532,7 +5007,7 @@
 </file>
 
 <file path=word/footer1.xml><?xml version="1.0" encoding="utf-8"?>
-<w:ftr xmlns:wpc="http://schemas.microsoft.com/office/word/2010/wordprocessingCanvas" xmlns:cx="http://schemas.microsoft.com/office/drawing/2014/chartex" xmlns:cx1="http://schemas.microsoft.com/office/drawing/2015/9/8/chartex" xmlns:cx2="http://schemas.microsoft.com/office/drawing/2015/10/21/chartex" xmlns:cx3="http://schemas.microsoft.com/office/drawing/2016/5/9/chartex" xmlns:cx4="http://schemas.microsoft.com/office/drawing/2016/5/10/chartex" xmlns:cx5="http://schemas.microsoft.com/office/drawing/2016/5/11/chartex" xmlns:cx6="http://schemas.microsoft.com/office/drawing/2016/5/12/chartex" xmlns:cx7="http://schemas.microsoft.com/office/drawing/2016/5/13/chartex" xmlns:cx8="http://schemas.microsoft.com/office/drawing/2016/5/14/chartex" xmlns:mc="http://schemas.openxmlformats.org/markup-compatibility/2006" xmlns:aink="http://schemas.microsoft.com/office/drawing/2016/ink" xmlns:am3d="http://schemas.microsoft.com/office/drawing/2017/model3d" xmlns:o="urn:schemas-microsoft-com:office:office" xmlns:oel="http://schemas.microsoft.com/office/2019/extlst" xmlns:r="http://schemas.openxmlformats.org/officeDocument/2006/relationships" xmlns:m="http://schemas.openxmlformats.org/officeDocument/2006/math" xmlns:v="urn:schemas-microsoft-com:vml" xmlns:wp14="http://schemas.microsoft.com/office/word/2010/wordprocessingDrawing" xmlns:wp="http://schemas.openxmlformats.org/drawingml/2006/wordprocessingDrawing" xmlns:w10="urn:schemas-microsoft-com:office:word" xmlns:w="http://schemas.openxmlformats.org/wordprocessingml/2006/main" xmlns:w14="http://schemas.microsoft.com/office/word/2010/wordml" xmlns:w15="http://schemas.microsoft.com/office/word/2012/wordml" xmlns:w16cex="http://schemas.microsoft.com/office/word/2018/wordml/cex" xmlns:w16cid="http://schemas.microsoft.com/office/word/2016/wordml/cid" xmlns:w16="http://schemas.microsoft.com/office/word/2018/wordml" xmlns:w16du="http://schemas.microsoft.com/office/word/2023/wordml/word16du" xmlns:w16sdtdh="http://schemas.microsoft.com/office/word/2020/wordml/sdtdatahash" xmlns:w16se="http://schemas.microsoft.com/office/word/2015/wordml/symex" xmlns:wpg="http://schemas.microsoft.com/office/word/2010/wordprocessingGroup" xmlns:wpi="http://schemas.microsoft.com/office/word/2010/wordprocessingInk" xmlns:wne="http://schemas.microsoft.com/office/word/2006/wordml" xmlns:wps="http://schemas.microsoft.com/office/word/2010/wordprocessingShape" mc:Ignorable="w14 w15 w16se w16cid w16 w16cex w16sdtdh w16du wp14">
+<w:ftr xmlns:wpc="http://schemas.microsoft.com/office/word/2010/wordprocessingCanvas" xmlns:cx="http://schemas.microsoft.com/office/drawing/2014/chartex" xmlns:cx1="http://schemas.microsoft.com/office/drawing/2015/9/8/chartex" xmlns:cx2="http://schemas.microsoft.com/office/drawing/2015/10/21/chartex" xmlns:cx3="http://schemas.microsoft.com/office/drawing/2016/5/9/chartex" xmlns:cx4="http://schemas.microsoft.com/office/drawing/2016/5/10/chartex" xmlns:cx5="http://schemas.microsoft.com/office/drawing/2016/5/11/chartex" xmlns:cx6="http://schemas.microsoft.com/office/drawing/2016/5/12/chartex" xmlns:cx7="http://schemas.microsoft.com/office/drawing/2016/5/13/chartex" xmlns:cx8="http://schemas.microsoft.com/office/drawing/2016/5/14/chartex" xmlns:mc="http://schemas.openxmlformats.org/markup-compatibility/2006" xmlns:aink="http://schemas.microsoft.com/office/drawing/2016/ink" xmlns:am3d="http://schemas.microsoft.com/office/drawing/2017/model3d" xmlns:o="urn:schemas-microsoft-com:office:office" xmlns:oel="http://schemas.microsoft.com/office/2019/extlst" xmlns:r="http://schemas.openxmlformats.org/officeDocument/2006/relationships" xmlns:m="http://schemas.openxmlformats.org/officeDocument/2006/math" xmlns:v="urn:schemas-microsoft-com:vml" xmlns:wp14="http://schemas.microsoft.com/office/word/2010/wordprocessingDrawing" xmlns:wp="http://schemas.openxmlformats.org/drawingml/2006/wordprocessingDrawing" xmlns:w10="urn:schemas-microsoft-com:office:word" xmlns:w="http://schemas.openxmlformats.org/wordprocessingml/2006/main" xmlns:w14="http://schemas.microsoft.com/office/word/2010/wordml" xmlns:w15="http://schemas.microsoft.com/office/word/2012/wordml" xmlns:w16cex="http://schemas.microsoft.com/office/word/2018/wordml/cex" xmlns:w16cid="http://schemas.microsoft.com/office/word/2016/wordml/cid" xmlns:w16="http://schemas.microsoft.com/office/word/2018/wordml" xmlns:w16du="http://schemas.microsoft.com/office/word/2023/wordml/word16du" xmlns:w16sdtdh="http://schemas.microsoft.com/office/word/2020/wordml/sdtdatahash" xmlns:w16sdtfl="http://schemas.microsoft.com/office/word/2024/wordml/sdtformatlock" xmlns:w16se="http://schemas.microsoft.com/office/word/2015/wordml/symex" xmlns:wpg="http://schemas.microsoft.com/office/word/2010/wordprocessingGroup" xmlns:wpi="http://schemas.microsoft.com/office/word/2010/wordprocessingInk" xmlns:wne="http://schemas.microsoft.com/office/word/2006/wordml" xmlns:wps="http://schemas.microsoft.com/office/word/2010/wordprocessingShape" mc:Ignorable="w14 w15 w16se w16cid w16 w16cex w16sdtdh w16sdtfl w16du wp14">
   <w:sdt>
     <w:sdtPr>
       <w:id w:val="-1635484502"/>
@@ -3663,7 +5138,7 @@
 </file>
 
 <file path=word/footnotes.xml><?xml version="1.0" encoding="utf-8"?>
-<w:footnotes xmlns:wpc="http://schemas.microsoft.com/office/word/2010/wordprocessingCanvas" xmlns:cx="http://schemas.microsoft.com/office/drawing/2014/chartex" xmlns:cx1="http://schemas.microsoft.com/office/drawing/2015/9/8/chartex" xmlns:cx2="http://schemas.microsoft.com/office/drawing/2015/10/21/chartex" xmlns:cx3="http://schemas.microsoft.com/office/drawing/2016/5/9/chartex" xmlns:cx4="http://schemas.microsoft.com/office/drawing/2016/5/10/chartex" xmlns:cx5="http://schemas.microsoft.com/office/drawing/2016/5/11/chartex" xmlns:cx6="http://schemas.microsoft.com/office/drawing/2016/5/12/chartex" xmlns:cx7="http://schemas.microsoft.com/office/drawing/2016/5/13/chartex" xmlns:cx8="http://schemas.microsoft.com/office/drawing/2016/5/14/chartex" xmlns:mc="http://schemas.openxmlformats.org/markup-compatibility/2006" xmlns:aink="http://schemas.microsoft.com/office/drawing/2016/ink" xmlns:am3d="http://schemas.microsoft.com/office/drawing/2017/model3d" xmlns:o="urn:schemas-microsoft-com:office:office" xmlns:oel="http://schemas.microsoft.com/office/2019/extlst" xmlns:r="http://schemas.openxmlformats.org/officeDocument/2006/relationships" xmlns:m="http://schemas.openxmlformats.org/officeDocument/2006/math" xmlns:v="urn:schemas-microsoft-com:vml" xmlns:wp14="http://schemas.microsoft.com/office/word/2010/wordprocessingDrawing" xmlns:wp="http://schemas.openxmlformats.org/drawingml/2006/wordprocessingDrawing" xmlns:w10="urn:schemas-microsoft-com:office:word" xmlns:w="http://schemas.openxmlformats.org/wordprocessingml/2006/main" xmlns:w14="http://schemas.microsoft.com/office/word/2010/wordml" xmlns:w15="http://schemas.microsoft.com/office/word/2012/wordml" xmlns:w16cex="http://schemas.microsoft.com/office/word/2018/wordml/cex" xmlns:w16cid="http://schemas.microsoft.com/office/word/2016/wordml/cid" xmlns:w16="http://schemas.microsoft.com/office/word/2018/wordml" xmlns:w16du="http://schemas.microsoft.com/office/word/2023/wordml/word16du" xmlns:w16sdtdh="http://schemas.microsoft.com/office/word/2020/wordml/sdtdatahash" xmlns:w16se="http://schemas.microsoft.com/office/word/2015/wordml/symex" xmlns:wpg="http://schemas.microsoft.com/office/word/2010/wordprocessingGroup" xmlns:wpi="http://schemas.microsoft.com/office/word/2010/wordprocessingInk" xmlns:wne="http://schemas.microsoft.com/office/word/2006/wordml" xmlns:wps="http://schemas.microsoft.com/office/word/2010/wordprocessingShape" mc:Ignorable="w14 w15 w16se w16cid w16 w16cex w16sdtdh w16du wp14">
+<w:footnotes xmlns:wpc="http://schemas.microsoft.com/office/word/2010/wordprocessingCanvas" xmlns:cx="http://schemas.microsoft.com/office/drawing/2014/chartex" xmlns:cx1="http://schemas.microsoft.com/office/drawing/2015/9/8/chartex" xmlns:cx2="http://schemas.microsoft.com/office/drawing/2015/10/21/chartex" xmlns:cx3="http://schemas.microsoft.com/office/drawing/2016/5/9/chartex" xmlns:cx4="http://schemas.microsoft.com/office/drawing/2016/5/10/chartex" xmlns:cx5="http://schemas.microsoft.com/office/drawing/2016/5/11/chartex" xmlns:cx6="http://schemas.microsoft.com/office/drawing/2016/5/12/chartex" xmlns:cx7="http://schemas.microsoft.com/office/drawing/2016/5/13/chartex" xmlns:cx8="http://schemas.microsoft.com/office/drawing/2016/5/14/chartex" xmlns:mc="http://schemas.openxmlformats.org/markup-compatibility/2006" xmlns:aink="http://schemas.microsoft.com/office/drawing/2016/ink" xmlns:am3d="http://schemas.microsoft.com/office/drawing/2017/model3d" xmlns:o="urn:schemas-microsoft-com:office:office" xmlns:oel="http://schemas.microsoft.com/office/2019/extlst" xmlns:r="http://schemas.openxmlformats.org/officeDocument/2006/relationships" xmlns:m="http://schemas.openxmlformats.org/officeDocument/2006/math" xmlns:v="urn:schemas-microsoft-com:vml" xmlns:wp14="http://schemas.microsoft.com/office/word/2010/wordprocessingDrawing" xmlns:wp="http://schemas.openxmlformats.org/drawingml/2006/wordprocessingDrawing" xmlns:w10="urn:schemas-microsoft-com:office:word" xmlns:w="http://schemas.openxmlformats.org/wordprocessingml/2006/main" xmlns:w14="http://schemas.microsoft.com/office/word/2010/wordml" xmlns:w15="http://schemas.microsoft.com/office/word/2012/wordml" xmlns:w16cex="http://schemas.microsoft.com/office/word/2018/wordml/cex" xmlns:w16cid="http://schemas.microsoft.com/office/word/2016/wordml/cid" xmlns:w16="http://schemas.microsoft.com/office/word/2018/wordml" xmlns:w16du="http://schemas.microsoft.com/office/word/2023/wordml/word16du" xmlns:w16sdtdh="http://schemas.microsoft.com/office/word/2020/wordml/sdtdatahash" xmlns:w16sdtfl="http://schemas.microsoft.com/office/word/2024/wordml/sdtformatlock" xmlns:w16se="http://schemas.microsoft.com/office/word/2015/wordml/symex" xmlns:wpg="http://schemas.microsoft.com/office/word/2010/wordprocessingGroup" xmlns:wpi="http://schemas.microsoft.com/office/word/2010/wordprocessingInk" xmlns:wne="http://schemas.microsoft.com/office/word/2006/wordml" xmlns:wps="http://schemas.microsoft.com/office/word/2010/wordprocessingShape" mc:Ignorable="w14 w15 w16se w16cid w16 w16cex w16sdtdh w16sdtfl w16du wp14">
   <w:footnote w:type="separator" w:id="-1">
     <w:p>
       <w:pPr>
@@ -3688,7 +5163,7 @@
 </file>
 
 <file path=word/numbering.xml><?xml version="1.0" encoding="utf-8"?>
-<w:numbering xmlns:wpc="http://schemas.microsoft.com/office/word/2010/wordprocessingCanvas" xmlns:cx="http://schemas.microsoft.com/office/drawing/2014/chartex" xmlns:cx1="http://schemas.microsoft.com/office/drawing/2015/9/8/chartex" xmlns:cx2="http://schemas.microsoft.com/office/drawing/2015/10/21/chartex" xmlns:cx3="http://schemas.microsoft.com/office/drawing/2016/5/9/chartex" xmlns:cx4="http://schemas.microsoft.com/office/drawing/2016/5/10/chartex" xmlns:cx5="http://schemas.microsoft.com/office/drawing/2016/5/11/chartex" xmlns:cx6="http://schemas.microsoft.com/office/drawing/2016/5/12/chartex" xmlns:cx7="http://schemas.microsoft.com/office/drawing/2016/5/13/chartex" xmlns:cx8="http://schemas.microsoft.com/office/drawing/2016/5/14/chartex" xmlns:mc="http://schemas.openxmlformats.org/markup-compatibility/2006" xmlns:aink="http://schemas.microsoft.com/office/drawing/2016/ink" xmlns:am3d="http://schemas.microsoft.com/office/drawing/2017/model3d" xmlns:o="urn:schemas-microsoft-com:office:office" xmlns:oel="http://schemas.microsoft.com/office/2019/extlst" xmlns:r="http://schemas.openxmlformats.org/officeDocument/2006/relationships" xmlns:m="http://schemas.openxmlformats.org/officeDocument/2006/math" xmlns:v="urn:schemas-microsoft-com:vml" xmlns:wp14="http://schemas.microsoft.com/office/word/2010/wordprocessingDrawing" xmlns:wp="http://schemas.openxmlformats.org/drawingml/2006/wordprocessingDrawing" xmlns:w10="urn:schemas-microsoft-com:office:word" xmlns:w="http://schemas.openxmlformats.org/wordprocessingml/2006/main" xmlns:w14="http://schemas.microsoft.com/office/word/2010/wordml" xmlns:w15="http://schemas.microsoft.com/office/word/2012/wordml" xmlns:w16cex="http://schemas.microsoft.com/office/word/2018/wordml/cex" xmlns:w16cid="http://schemas.microsoft.com/office/word/2016/wordml/cid" xmlns:w16="http://schemas.microsoft.com/office/word/2018/wordml" xmlns:w16du="http://schemas.microsoft.com/office/word/2023/wordml/word16du" xmlns:w16sdtdh="http://schemas.microsoft.com/office/word/2020/wordml/sdtdatahash" xmlns:w16se="http://schemas.microsoft.com/office/word/2015/wordml/symex" xmlns:wpg="http://schemas.microsoft.com/office/word/2010/wordprocessingGroup" xmlns:wpi="http://schemas.microsoft.com/office/word/2010/wordprocessingInk" xmlns:wne="http://schemas.microsoft.com/office/word/2006/wordml" xmlns:wps="http://schemas.microsoft.com/office/word/2010/wordprocessingShape" mc:Ignorable="w14 w15 w16se w16cid w16 w16cex w16sdtdh w16du wp14">
+<w:numbering xmlns:wpc="http://schemas.microsoft.com/office/word/2010/wordprocessingCanvas" xmlns:cx="http://schemas.microsoft.com/office/drawing/2014/chartex" xmlns:cx1="http://schemas.microsoft.com/office/drawing/2015/9/8/chartex" xmlns:cx2="http://schemas.microsoft.com/office/drawing/2015/10/21/chartex" xmlns:cx3="http://schemas.microsoft.com/office/drawing/2016/5/9/chartex" xmlns:cx4="http://schemas.microsoft.com/office/drawing/2016/5/10/chartex" xmlns:cx5="http://schemas.microsoft.com/office/drawing/2016/5/11/chartex" xmlns:cx6="http://schemas.microsoft.com/office/drawing/2016/5/12/chartex" xmlns:cx7="http://schemas.microsoft.com/office/drawing/2016/5/13/chartex" xmlns:cx8="http://schemas.microsoft.com/office/drawing/2016/5/14/chartex" xmlns:mc="http://schemas.openxmlformats.org/markup-compatibility/2006" xmlns:aink="http://schemas.microsoft.com/office/drawing/2016/ink" xmlns:am3d="http://schemas.microsoft.com/office/drawing/2017/model3d" xmlns:o="urn:schemas-microsoft-com:office:office" xmlns:oel="http://schemas.microsoft.com/office/2019/extlst" xmlns:r="http://schemas.openxmlformats.org/officeDocument/2006/relationships" xmlns:m="http://schemas.openxmlformats.org/officeDocument/2006/math" xmlns:v="urn:schemas-microsoft-com:vml" xmlns:wp14="http://schemas.microsoft.com/office/word/2010/wordprocessingDrawing" xmlns:wp="http://schemas.openxmlformats.org/drawingml/2006/wordprocessingDrawing" xmlns:w10="urn:schemas-microsoft-com:office:word" xmlns:w="http://schemas.openxmlformats.org/wordprocessingml/2006/main" xmlns:w14="http://schemas.microsoft.com/office/word/2010/wordml" xmlns:w15="http://schemas.microsoft.com/office/word/2012/wordml" xmlns:w16cex="http://schemas.microsoft.com/office/word/2018/wordml/cex" xmlns:w16cid="http://schemas.microsoft.com/office/word/2016/wordml/cid" xmlns:w16="http://schemas.microsoft.com/office/word/2018/wordml" xmlns:w16du="http://schemas.microsoft.com/office/word/2023/wordml/word16du" xmlns:w16sdtdh="http://schemas.microsoft.com/office/word/2020/wordml/sdtdatahash" xmlns:w16sdtfl="http://schemas.microsoft.com/office/word/2024/wordml/sdtformatlock" xmlns:w16se="http://schemas.microsoft.com/office/word/2015/wordml/symex" xmlns:wpg="http://schemas.microsoft.com/office/word/2010/wordprocessingGroup" xmlns:wpi="http://schemas.microsoft.com/office/word/2010/wordprocessingInk" xmlns:wne="http://schemas.microsoft.com/office/word/2006/wordml" xmlns:wps="http://schemas.microsoft.com/office/word/2010/wordprocessingShape" mc:Ignorable="w14 w15 w16se w16cid w16 w16cex w16sdtdh w16sdtfl w16du wp14">
   <w:abstractNum w:abstractNumId="0" w15:restartNumberingAfterBreak="0">
     <w:nsid w:val="006D7728"/>
     <w:multiLevelType w:val="hybridMultilevel"/>
@@ -15073,7 +16548,7 @@
 </file>
 
 <file path=word/styles.xml><?xml version="1.0" encoding="utf-8"?>
-<w:styles xmlns:mc="http://schemas.openxmlformats.org/markup-compatibility/2006" xmlns:r="http://schemas.openxmlformats.org/officeDocument/2006/relationships" xmlns:w="http://schemas.openxmlformats.org/wordprocessingml/2006/main" xmlns:w14="http://schemas.microsoft.com/office/word/2010/wordml" xmlns:w15="http://schemas.microsoft.com/office/word/2012/wordml" xmlns:w16cex="http://schemas.microsoft.com/office/word/2018/wordml/cex" xmlns:w16cid="http://schemas.microsoft.com/office/word/2016/wordml/cid" xmlns:w16="http://schemas.microsoft.com/office/word/2018/wordml" xmlns:w16du="http://schemas.microsoft.com/office/word/2023/wordml/word16du" xmlns:w16sdtdh="http://schemas.microsoft.com/office/word/2020/wordml/sdtdatahash" xmlns:w16se="http://schemas.microsoft.com/office/word/2015/wordml/symex" mc:Ignorable="w14 w15 w16se w16cid w16 w16cex w16sdtdh w16du">
+<w:styles xmlns:mc="http://schemas.openxmlformats.org/markup-compatibility/2006" xmlns:r="http://schemas.openxmlformats.org/officeDocument/2006/relationships" xmlns:w="http://schemas.openxmlformats.org/wordprocessingml/2006/main" xmlns:w14="http://schemas.microsoft.com/office/word/2010/wordml" xmlns:w15="http://schemas.microsoft.com/office/word/2012/wordml" xmlns:w16cex="http://schemas.microsoft.com/office/word/2018/wordml/cex" xmlns:w16cid="http://schemas.microsoft.com/office/word/2016/wordml/cid" xmlns:w16="http://schemas.microsoft.com/office/word/2018/wordml" xmlns:w16du="http://schemas.microsoft.com/office/word/2023/wordml/word16du" xmlns:w16sdtdh="http://schemas.microsoft.com/office/word/2020/wordml/sdtdatahash" xmlns:w16sdtfl="http://schemas.microsoft.com/office/word/2024/wordml/sdtformatlock" xmlns:w16se="http://schemas.microsoft.com/office/word/2015/wordml/symex" mc:Ignorable="w14 w15 w16se w16cid w16 w16cex w16sdtdh w16sdtfl w16du">
   <w:docDefaults>
     <w:rPrDefault>
       <w:rPr>

</xml_diff>

<commit_message>
Vs code version (#34)
* VS Code version of the code

* Changes to esp32 espressif release 3.x

* Add files via upload

* more updates

* Add files via upload

* Add files via upload

* Delete RadioFox.cpp

* Delete WavPlayer.cpp

* Delete WebServerX.cpp

* Delete RadioFox.sln

* Delete README

* Add files via upload

* Delete RadioFox.h

* Add files via upload

* Add files via upload
</commit_message>
<xml_diff>
--- a/RadioFox.docx
+++ b/RadioFox.docx
@@ -1,6 +1,6 @@
 
 <file path=word/document.xml><?xml version="1.0" encoding="utf-8"?>
-<w:document xmlns:wpc="http://schemas.microsoft.com/office/word/2010/wordprocessingCanvas" xmlns:cx="http://schemas.microsoft.com/office/drawing/2014/chartex" xmlns:cx1="http://schemas.microsoft.com/office/drawing/2015/9/8/chartex" xmlns:cx2="http://schemas.microsoft.com/office/drawing/2015/10/21/chartex" xmlns:cx3="http://schemas.microsoft.com/office/drawing/2016/5/9/chartex" xmlns:cx4="http://schemas.microsoft.com/office/drawing/2016/5/10/chartex" xmlns:cx5="http://schemas.microsoft.com/office/drawing/2016/5/11/chartex" xmlns:cx6="http://schemas.microsoft.com/office/drawing/2016/5/12/chartex" xmlns:cx7="http://schemas.microsoft.com/office/drawing/2016/5/13/chartex" xmlns:cx8="http://schemas.microsoft.com/office/drawing/2016/5/14/chartex" xmlns:mc="http://schemas.openxmlformats.org/markup-compatibility/2006" xmlns:aink="http://schemas.microsoft.com/office/drawing/2016/ink" xmlns:am3d="http://schemas.microsoft.com/office/drawing/2017/model3d" xmlns:o="urn:schemas-microsoft-com:office:office" xmlns:oel="http://schemas.microsoft.com/office/2019/extlst" xmlns:r="http://schemas.openxmlformats.org/officeDocument/2006/relationships" xmlns:m="http://schemas.openxmlformats.org/officeDocument/2006/math" xmlns:v="urn:schemas-microsoft-com:vml" xmlns:wp14="http://schemas.microsoft.com/office/word/2010/wordprocessingDrawing" xmlns:wp="http://schemas.openxmlformats.org/drawingml/2006/wordprocessingDrawing" xmlns:w10="urn:schemas-microsoft-com:office:word" xmlns:w="http://schemas.openxmlformats.org/wordprocessingml/2006/main" xmlns:w14="http://schemas.microsoft.com/office/word/2010/wordml" xmlns:w15="http://schemas.microsoft.com/office/word/2012/wordml" xmlns:w16cex="http://schemas.microsoft.com/office/word/2018/wordml/cex" xmlns:w16cid="http://schemas.microsoft.com/office/word/2016/wordml/cid" xmlns:w16="http://schemas.microsoft.com/office/word/2018/wordml" xmlns:w16du="http://schemas.microsoft.com/office/word/2023/wordml/word16du" xmlns:w16sdtdh="http://schemas.microsoft.com/office/word/2020/wordml/sdtdatahash" xmlns:w16se="http://schemas.microsoft.com/office/word/2015/wordml/symex" xmlns:wpg="http://schemas.microsoft.com/office/word/2010/wordprocessingGroup" xmlns:wpi="http://schemas.microsoft.com/office/word/2010/wordprocessingInk" xmlns:wne="http://schemas.microsoft.com/office/word/2006/wordml" xmlns:wps="http://schemas.microsoft.com/office/word/2010/wordprocessingShape" mc:Ignorable="w14 w15 w16se w16cid w16 w16cex w16sdtdh w16du wp14">
+<w:document xmlns:wpc="http://schemas.microsoft.com/office/word/2010/wordprocessingCanvas" xmlns:cx="http://schemas.microsoft.com/office/drawing/2014/chartex" xmlns:cx1="http://schemas.microsoft.com/office/drawing/2015/9/8/chartex" xmlns:cx2="http://schemas.microsoft.com/office/drawing/2015/10/21/chartex" xmlns:cx3="http://schemas.microsoft.com/office/drawing/2016/5/9/chartex" xmlns:cx4="http://schemas.microsoft.com/office/drawing/2016/5/10/chartex" xmlns:cx5="http://schemas.microsoft.com/office/drawing/2016/5/11/chartex" xmlns:cx6="http://schemas.microsoft.com/office/drawing/2016/5/12/chartex" xmlns:cx7="http://schemas.microsoft.com/office/drawing/2016/5/13/chartex" xmlns:cx8="http://schemas.microsoft.com/office/drawing/2016/5/14/chartex" xmlns:mc="http://schemas.openxmlformats.org/markup-compatibility/2006" xmlns:aink="http://schemas.microsoft.com/office/drawing/2016/ink" xmlns:am3d="http://schemas.microsoft.com/office/drawing/2017/model3d" xmlns:o="urn:schemas-microsoft-com:office:office" xmlns:oel="http://schemas.microsoft.com/office/2019/extlst" xmlns:r="http://schemas.openxmlformats.org/officeDocument/2006/relationships" xmlns:m="http://schemas.openxmlformats.org/officeDocument/2006/math" xmlns:v="urn:schemas-microsoft-com:vml" xmlns:wp14="http://schemas.microsoft.com/office/word/2010/wordprocessingDrawing" xmlns:wp="http://schemas.openxmlformats.org/drawingml/2006/wordprocessingDrawing" xmlns:w10="urn:schemas-microsoft-com:office:word" xmlns:w="http://schemas.openxmlformats.org/wordprocessingml/2006/main" xmlns:w14="http://schemas.microsoft.com/office/word/2010/wordml" xmlns:w15="http://schemas.microsoft.com/office/word/2012/wordml" xmlns:w16cex="http://schemas.microsoft.com/office/word/2018/wordml/cex" xmlns:w16cid="http://schemas.microsoft.com/office/word/2016/wordml/cid" xmlns:w16="http://schemas.microsoft.com/office/word/2018/wordml" xmlns:w16du="http://schemas.microsoft.com/office/word/2023/wordml/word16du" xmlns:w16sdtdh="http://schemas.microsoft.com/office/word/2020/wordml/sdtdatahash" xmlns:w16sdtfl="http://schemas.microsoft.com/office/word/2024/wordml/sdtformatlock" xmlns:w16se="http://schemas.microsoft.com/office/word/2015/wordml/symex" xmlns:wpg="http://schemas.microsoft.com/office/word/2010/wordprocessingGroup" xmlns:wpi="http://schemas.microsoft.com/office/word/2010/wordprocessingInk" xmlns:wne="http://schemas.microsoft.com/office/word/2006/wordml" xmlns:wps="http://schemas.microsoft.com/office/word/2010/wordprocessingShape" mc:Ignorable="w14 w15 w16se w16cid w16 w16cex w16sdtdh w16sdtfl w16du wp14">
   <w:body>
     <w:p>
       <w:pPr>
@@ -62,7 +62,19 @@
         <w:rPr>
           <w:lang w:val="en-US"/>
         </w:rPr>
-        <w:t xml:space="preserve"> as fox hunting or sometimes as bunny hunting. It is played by hiding a transmitter that transmits periodically and then silent until it is time to transmit again. This cycle repeats. Teams use radio receivers with directional antennas to find the transmitter. The technique is called triangulation. The first team to find the transmitter wins. Sometimes the transmitter is moved periodically to make the game more challenging, this is called a walking fox.</w:t>
+        <w:t xml:space="preserve"> as fox hunting or sometimes as bunny hunting. It is played by hiding a transmitter that transmits periodically and</w:t>
+      </w:r>
+      <w:r>
+        <w:rPr>
+          <w:lang w:val="en-US"/>
+        </w:rPr>
+        <w:t xml:space="preserve"> is</w:t>
+      </w:r>
+      <w:r>
+        <w:rPr>
+          <w:lang w:val="en-US"/>
+        </w:rPr>
+        <w:t xml:space="preserve"> then silent until it is time to transmit again. This cycle repeats. Teams use radio receivers with directional antennas to find the transmitter. The technique is called triangulation. The first team to find the transmitter wins. Sometimes the transmitter is moved periodically to make the game more challenging, this is called a walking fox.</w:t>
       </w:r>
     </w:p>
     <w:p/>
@@ -254,10 +266,24 @@
         <w:t xml:space="preserve">The </w:t>
       </w:r>
       <w:r>
-        <w:t>device is charged using the USB-C connector. There is a flaw on the PCB that requires</w:t>
-      </w:r>
-      <w:r>
-        <w:t xml:space="preserve"> a USB-A to USB-C cable. This will be fixed in a future revision of the PCB</w:t>
+        <w:t xml:space="preserve">device is charged using the USB-C connector. There is a flaw </w:t>
+      </w:r>
+      <w:proofErr w:type="gramStart"/>
+      <w:r>
+        <w:t>on</w:t>
+      </w:r>
+      <w:proofErr w:type="gramEnd"/>
+      <w:r>
+        <w:t xml:space="preserve"> the PCB that requires</w:t>
+      </w:r>
+      <w:r>
+        <w:t xml:space="preserve"> a USB-A to USB-C cable. This </w:t>
+      </w:r>
+      <w:r>
+        <w:t>has been fixed in version 1.11</w:t>
+      </w:r>
+      <w:r>
+        <w:t xml:space="preserve"> of the PCB</w:t>
       </w:r>
       <w:r>
         <w:t xml:space="preserve"> so that USB-C to USB-C cables will also work.</w:t>
@@ -319,7 +345,21 @@
         <w:rPr>
           <w:lang w:val="en-US"/>
         </w:rPr>
-        <w:t>The firmware source code consists of C and C++. The source code will be released at a future date, it is still being changed frequently.</w:t>
+        <w:t xml:space="preserve">The firmware source code consists of C and C++. The source code will be released at a future </w:t>
+      </w:r>
+      <w:proofErr w:type="gramStart"/>
+      <w:r>
+        <w:rPr>
+          <w:lang w:val="en-US"/>
+        </w:rPr>
+        <w:t>date,</w:t>
+      </w:r>
+      <w:proofErr w:type="gramEnd"/>
+      <w:r>
+        <w:rPr>
+          <w:lang w:val="en-US"/>
+        </w:rPr>
+        <w:t xml:space="preserve"> it is still being changed frequently.</w:t>
       </w:r>
     </w:p>
     <w:p>
@@ -504,7 +544,35 @@
         <w:rPr>
           <w:lang w:val="en-US"/>
         </w:rPr>
-        <w:t>Show the active run time on the main display in hours, minutes, and seconds. This time is reset on boot, and just keeps track of the time used for sending and pausing.</w:t>
+        <w:t xml:space="preserve">Show the active </w:t>
+      </w:r>
+      <w:proofErr w:type="gramStart"/>
+      <w:r>
+        <w:rPr>
+          <w:lang w:val="en-US"/>
+        </w:rPr>
+        <w:t>run</w:t>
+      </w:r>
+      <w:proofErr w:type="gramEnd"/>
+      <w:r>
+        <w:rPr>
+          <w:lang w:val="en-US"/>
+        </w:rPr>
+        <w:t xml:space="preserve"> time on the main display in hours, minutes, and seconds. This time is reset on </w:t>
+      </w:r>
+      <w:proofErr w:type="gramStart"/>
+      <w:r>
+        <w:rPr>
+          <w:lang w:val="en-US"/>
+        </w:rPr>
+        <w:t>boot, and</w:t>
+      </w:r>
+      <w:proofErr w:type="gramEnd"/>
+      <w:r>
+        <w:rPr>
+          <w:lang w:val="en-US"/>
+        </w:rPr>
+        <w:t xml:space="preserve"> just keeps track of the time used for sending and pausing.</w:t>
       </w:r>
     </w:p>
     <w:p>
@@ -544,8 +612,16 @@
         <w:rPr>
           <w:lang w:val="en-US"/>
         </w:rPr>
-        <w:t>Added a switch to limit the frequency range to that allowed for beacon use in ITU region 2. The range is 144.276-144.300 MHz.</w:t>
-      </w:r>
+        <w:t xml:space="preserve">Added a switch to limit the frequency range to that allowed for beacon use in ITU region 2. The range is 144.276-144.300 </w:t>
+      </w:r>
+      <w:proofErr w:type="spellStart"/>
+      <w:r>
+        <w:rPr>
+          <w:lang w:val="en-US"/>
+        </w:rPr>
+        <w:t>MHz.</w:t>
+      </w:r>
+      <w:proofErr w:type="spellEnd"/>
     </w:p>
     <w:p>
       <w:r>
@@ -581,7 +657,15 @@
         </w:numPr>
       </w:pPr>
       <w:r>
-        <w:t>Fixed crash when no SD card found.</w:t>
+        <w:t xml:space="preserve">Fixed crash when no SD card </w:t>
+      </w:r>
+      <w:proofErr w:type="gramStart"/>
+      <w:r>
+        <w:t>found</w:t>
+      </w:r>
+      <w:proofErr w:type="gramEnd"/>
+      <w:r>
+        <w:t>.</w:t>
       </w:r>
     </w:p>
     <w:p>
@@ -673,7 +757,21 @@
         <w:rPr>
           <w:lang w:val="en-US"/>
         </w:rPr>
-        <w:t>This is initial version when this document was first created. The software is considered mostly complete.</w:t>
+        <w:t xml:space="preserve">This is initial </w:t>
+      </w:r>
+      <w:proofErr w:type="gramStart"/>
+      <w:r>
+        <w:rPr>
+          <w:lang w:val="en-US"/>
+        </w:rPr>
+        <w:t>version</w:t>
+      </w:r>
+      <w:proofErr w:type="gramEnd"/>
+      <w:r>
+        <w:rPr>
+          <w:lang w:val="en-US"/>
+        </w:rPr>
+        <w:t xml:space="preserve"> when this document was first created. The software is considered mostly complete.</w:t>
       </w:r>
     </w:p>
     <w:p>
@@ -701,11 +799,129 @@
       </w:r>
     </w:p>
     <w:p>
-      <w:r>
-        <w:rPr>
-          <w:lang w:val="en-US"/>
-        </w:rPr>
-        <w:t>The Fox is a single PCB that includes an 18650 battery holder that can have 1 or 2 batteries. There is a USB C connector on the left edge used for charging the batteries. Above that is a micro-SD slot. The SD card holds tone files and saved settings files. It can also be used to load new firmware onto the TTGO chip. There is also a USB C connector on the TTGO. It is used for downloading firmware or debugging operations. It might also be used for serial communications in a future firmware release. It is not used for charging the batteries.</w:t>
+      <w:pPr>
+        <w:rPr>
+          <w:lang w:val="en-US"/>
+        </w:rPr>
+      </w:pPr>
+      <w:r>
+        <w:rPr>
+          <w:lang w:val="en-US"/>
+        </w:rPr>
+        <w:t xml:space="preserve">The Fox is a single PCB that includes an </w:t>
+      </w:r>
+      <w:proofErr w:type="gramStart"/>
+      <w:r>
+        <w:rPr>
+          <w:lang w:val="en-US"/>
+        </w:rPr>
+        <w:t>18650 battery</w:t>
+      </w:r>
+      <w:proofErr w:type="gramEnd"/>
+      <w:r>
+        <w:rPr>
+          <w:lang w:val="en-US"/>
+        </w:rPr>
+        <w:t xml:space="preserve"> holder that can have 1 or 2 batteries.</w:t>
+      </w:r>
+      <w:r>
+        <w:rPr>
+          <w:lang w:val="en-US"/>
+        </w:rPr>
+        <w:t xml:space="preserve"> Th</w:t>
+      </w:r>
+      <w:r>
+        <w:rPr>
+          <w:lang w:val="en-US"/>
+        </w:rPr>
+        <w:t>e button top batteries are used. The flat top batteries will not work. Also note that the size standard</w:t>
+      </w:r>
+      <w:r>
+        <w:rPr>
+          <w:lang w:val="en-US"/>
+        </w:rPr>
+        <w:t xml:space="preserve"> is not always followed and some batteries will not fit. If that is the </w:t>
+      </w:r>
+      <w:proofErr w:type="gramStart"/>
+      <w:r>
+        <w:rPr>
+          <w:lang w:val="en-US"/>
+        </w:rPr>
+        <w:t>case</w:t>
+      </w:r>
+      <w:proofErr w:type="gramEnd"/>
+      <w:r>
+        <w:rPr>
+          <w:lang w:val="en-US"/>
+        </w:rPr>
+        <w:t xml:space="preserve"> try a different pair. </w:t>
+      </w:r>
+      <w:r>
+        <w:rPr>
+          <w:lang w:val="en-US"/>
+        </w:rPr>
+        <w:t xml:space="preserve">The best batteries I have found are </w:t>
+      </w:r>
+      <w:r>
+        <w:rPr>
+          <w:lang w:val="en-US"/>
+        </w:rPr>
+        <w:t>from www.liionwholesale.com.</w:t>
+      </w:r>
+      <w:r>
+        <w:rPr>
+          <w:lang w:val="en-US"/>
+        </w:rPr>
+        <w:t xml:space="preserve"> The batteries I use are found here: </w:t>
+      </w:r>
+      <w:hyperlink r:id="rId9" w:history="1">
+        <w:r>
+          <w:rPr>
+            <w:rStyle w:val="Hyperlink"/>
+          </w:rPr>
+          <w:t xml:space="preserve">Protected 3400mAh 10A 18650 Button Top Battery - Wholesale Discount – </w:t>
+        </w:r>
+        <w:proofErr w:type="spellStart"/>
+        <w:r>
+          <w:rPr>
+            <w:rStyle w:val="Hyperlink"/>
+          </w:rPr>
+          <w:t>Liion</w:t>
+        </w:r>
+        <w:proofErr w:type="spellEnd"/>
+        <w:r>
+          <w:rPr>
+            <w:rStyle w:val="Hyperlink"/>
+          </w:rPr>
+          <w:t xml:space="preserve"> Wholesale Batteries</w:t>
+        </w:r>
+      </w:hyperlink>
+      <w:r>
+        <w:rPr>
+          <w:lang w:val="en-US"/>
+        </w:rPr>
+        <w:t xml:space="preserve"> </w:t>
+      </w:r>
+      <w:r>
+        <w:rPr>
+          <w:lang w:val="en-US"/>
+        </w:rPr>
+        <w:t>.</w:t>
+      </w:r>
+    </w:p>
+    <w:p>
+      <w:pPr>
+        <w:rPr>
+          <w:lang w:val="en-US"/>
+        </w:rPr>
+      </w:pPr>
+    </w:p>
+    <w:p>
+      <w:r>
+        <w:rPr>
+          <w:lang w:val="en-US"/>
+        </w:rPr>
+        <w:t>There is a USB C connector on the left edge used for charging the batteries. Above that is a micro-SD slot. The SD card holds tone files and saved settings files. It can also be used to load new firmware onto the TTGO chip. There is also a USB C connector on the TTGO. It is used for downloading firmware or debugging operations. It might also be used for serial communications in a future firmware release. It is not used for charging the batteries.</w:t>
       </w:r>
     </w:p>
     <w:p>
@@ -713,6 +929,7 @@
         <w:pStyle w:val="Heading2"/>
       </w:pPr>
       <w:r>
+        <w:lastRenderedPageBreak/>
         <w:t>Radio</w:t>
       </w:r>
     </w:p>
@@ -721,20 +938,41 @@
         <w:rPr>
           <w:lang w:val="en-US"/>
         </w:rPr>
-        <w:t xml:space="preserve">The radio functions are handled by the SA818-V on the top right. There are vents in the case to allow cooling as this module can become quite hot when transmitting at high power for longer timer intervals. Transmitting longer than one minute is not recommended. High power is about </w:t>
-      </w:r>
-      <w:r>
-        <w:rPr>
-          <w:lang w:val="en-US"/>
-        </w:rPr>
-        <w:lastRenderedPageBreak/>
+        <w:t xml:space="preserve">The radio functions are handled by the SA818-V on the top right. There are vents in the case to allow cooling as this module can become quite hot when transmitting at high power for longer </w:t>
+      </w:r>
+      <w:proofErr w:type="gramStart"/>
+      <w:r>
+        <w:rPr>
+          <w:lang w:val="en-US"/>
+        </w:rPr>
+        <w:t>timer</w:t>
+      </w:r>
+      <w:proofErr w:type="gramEnd"/>
+      <w:r>
+        <w:rPr>
+          <w:lang w:val="en-US"/>
+        </w:rPr>
+        <w:t xml:space="preserve"> intervals. Transmitting longer than one minute is not recommended. High power is about </w:t>
+      </w:r>
+      <w:proofErr w:type="gramStart"/>
+      <w:r>
+        <w:rPr>
+          <w:lang w:val="en-US"/>
+        </w:rPr>
         <w:t>1</w:t>
       </w:r>
       <w:r>
         <w:rPr>
           <w:lang w:val="en-US"/>
         </w:rPr>
-        <w:t xml:space="preserve">W and low power is about </w:t>
+        <w:t>W</w:t>
+      </w:r>
+      <w:proofErr w:type="gramEnd"/>
+      <w:r>
+        <w:rPr>
+          <w:lang w:val="en-US"/>
+        </w:rPr>
+        <w:t xml:space="preserve"> and low power is about </w:t>
       </w:r>
       <w:r>
         <w:rPr>
@@ -786,7 +1024,49 @@
         <w:rPr>
           <w:lang w:val="en-US"/>
         </w:rPr>
-        <w:t>button top style and protection is recommended. The 18650 battery length is a very loose standard and some batteries may not fit. Too long and they cannot be used. Too short, it might be possible to bend the contacts on the battery holder negative side. The battery holder is polarized to prevent insertion in the wrong direction. Do not defeat the feature or magic blue smoke may appear from the PCB!</w:t>
+        <w:t xml:space="preserve">button top style and protection is recommended. The </w:t>
+      </w:r>
+      <w:proofErr w:type="gramStart"/>
+      <w:r>
+        <w:rPr>
+          <w:lang w:val="en-US"/>
+        </w:rPr>
+        <w:t>18650 battery</w:t>
+      </w:r>
+      <w:proofErr w:type="gramEnd"/>
+      <w:r>
+        <w:rPr>
+          <w:lang w:val="en-US"/>
+        </w:rPr>
+        <w:t xml:space="preserve"> length is a very loose </w:t>
+      </w:r>
+      <w:proofErr w:type="gramStart"/>
+      <w:r>
+        <w:rPr>
+          <w:lang w:val="en-US"/>
+        </w:rPr>
+        <w:t>standard</w:t>
+      </w:r>
+      <w:proofErr w:type="gramEnd"/>
+      <w:r>
+        <w:rPr>
+          <w:lang w:val="en-US"/>
+        </w:rPr>
+        <w:t xml:space="preserve"> and some batteries may not fit. </w:t>
+      </w:r>
+      <w:proofErr w:type="gramStart"/>
+      <w:r>
+        <w:rPr>
+          <w:lang w:val="en-US"/>
+        </w:rPr>
+        <w:t>Too</w:t>
+      </w:r>
+      <w:proofErr w:type="gramEnd"/>
+      <w:r>
+        <w:rPr>
+          <w:lang w:val="en-US"/>
+        </w:rPr>
+        <w:t xml:space="preserve"> long and they cannot be used. Too short, it might be possible to bend the contacts on the battery holder negative side. The battery holder is polarized to prevent insertion in the wrong direction. Do not defeat the feature or magic blue smoke may appear from the PCB!</w:t>
       </w:r>
     </w:p>
     <w:p>
@@ -802,7 +1082,35 @@
         <w:rPr>
           <w:lang w:val="en-US"/>
         </w:rPr>
-        <w:t>The actual runtime depends on the transmitting time and quality of the batteries. There are many deceptively labelled 18650 batteries available. The best one are made by Panasonic and Sanyo. Using 1 minute transmit, 4 minutes pause, low power setting, and display dimming the Fox Radio ran for 12 hours using Panasonic batteries.</w:t>
+        <w:t xml:space="preserve">The actual runtime depends on the transmitting time and quality of the batteries. There are many deceptively labelled 18650 batteries available. The best </w:t>
+      </w:r>
+      <w:proofErr w:type="gramStart"/>
+      <w:r>
+        <w:rPr>
+          <w:lang w:val="en-US"/>
+        </w:rPr>
+        <w:t>one</w:t>
+      </w:r>
+      <w:proofErr w:type="gramEnd"/>
+      <w:r>
+        <w:rPr>
+          <w:lang w:val="en-US"/>
+        </w:rPr>
+        <w:t xml:space="preserve"> </w:t>
+      </w:r>
+      <w:proofErr w:type="gramStart"/>
+      <w:r>
+        <w:rPr>
+          <w:lang w:val="en-US"/>
+        </w:rPr>
+        <w:t>are</w:t>
+      </w:r>
+      <w:proofErr w:type="gramEnd"/>
+      <w:r>
+        <w:rPr>
+          <w:lang w:val="en-US"/>
+        </w:rPr>
+        <w:t xml:space="preserve"> made by Panasonic and Sanyo. Using 1 minute transmit, 4 minutes pause, low power setting, and display dimming the Fox Radio ran for 12 hours using Panasonic batteries.</w:t>
       </w:r>
     </w:p>
     <w:p>
@@ -829,13 +1137,38 @@
         </w:rPr>
         <w:t xml:space="preserve">The files are saved as .TXT and simply contain a list of tones to be played. The format is similar the hard coded files from here: </w:t>
       </w:r>
-      <w:hyperlink r:id="rId9">
+      <w:hyperlink r:id="rId10">
+        <w:proofErr w:type="spellStart"/>
         <w:r>
           <w:rPr>
             <w:rStyle w:val="Hyperlink"/>
             <w:lang w:val="en-US"/>
           </w:rPr>
-          <w:t>robsoncouto/arduino-songs (github.com)</w:t>
+          <w:t>robsoncouto</w:t>
+        </w:r>
+        <w:proofErr w:type="spellEnd"/>
+        <w:r>
+          <w:rPr>
+            <w:rStyle w:val="Hyperlink"/>
+            <w:lang w:val="en-US"/>
+          </w:rPr>
+          <w:t>/</w:t>
+        </w:r>
+        <w:proofErr w:type="spellStart"/>
+        <w:r>
+          <w:rPr>
+            <w:rStyle w:val="Hyperlink"/>
+            <w:lang w:val="en-US"/>
+          </w:rPr>
+          <w:t>arduino</w:t>
+        </w:r>
+        <w:proofErr w:type="spellEnd"/>
+        <w:r>
+          <w:rPr>
+            <w:rStyle w:val="Hyperlink"/>
+            <w:lang w:val="en-US"/>
+          </w:rPr>
+          <w:t>-songs (github.com)</w:t>
         </w:r>
       </w:hyperlink>
     </w:p>
@@ -902,286 +1235,863 @@
           <w:bCs/>
         </w:rPr>
       </w:pPr>
+      <w:proofErr w:type="gramStart"/>
       <w:r>
         <w:rPr>
           <w:b/>
           <w:bCs/>
         </w:rPr>
-        <w:t>there are two values per note (pitch and duration)</w:t>
-      </w:r>
-    </w:p>
-    <w:p>
-      <w:pPr>
+        <w:t>there</w:t>
+      </w:r>
+      <w:proofErr w:type="gramEnd"/>
+      <w:r>
         <w:rPr>
           <w:b/>
           <w:bCs/>
         </w:rPr>
-      </w:pPr>
-      <w:r>
+        <w:t xml:space="preserve"> are two values per note (pitch and duration)</w:t>
+      </w:r>
+    </w:p>
+    <w:p>
+      <w:pPr>
         <w:rPr>
           <w:b/>
           <w:bCs/>
         </w:rPr>
-        <w:t>make sure each token ends with a ','</w:t>
-      </w:r>
-    </w:p>
-    <w:p>
-      <w:pPr>
+      </w:pPr>
+      <w:r>
         <w:rPr>
           <w:b/>
           <w:bCs/>
         </w:rPr>
-      </w:pPr>
-      <w:r>
+        <w:t>make sure each token ends with a ','</w:t>
+      </w:r>
+    </w:p>
+    <w:p>
+      <w:pPr>
         <w:rPr>
           <w:b/>
           <w:bCs/>
         </w:rPr>
-        <w:t>and that the data starts with the tilde which must not be in these comments</w:t>
-      </w:r>
-    </w:p>
-    <w:p>
-      <w:pPr>
+      </w:pPr>
+      <w:r>
         <w:rPr>
           <w:b/>
           <w:bCs/>
-          <w:lang w:val="en-US"/>
-        </w:rPr>
-      </w:pPr>
-      <w:r>
+        </w:rPr>
+        <w:t>and that the data starts with the tilde which must not be in these comments</w:t>
+      </w:r>
+    </w:p>
+    <w:p>
+      <w:pPr>
         <w:rPr>
           <w:b/>
           <w:bCs/>
           <w:lang w:val="en-US"/>
         </w:rPr>
-        <w:t>LENGTH, %val can be used to set the length of the note, it defaults to 90% and 10% quiet after the note</w:t>
-      </w:r>
-    </w:p>
-    <w:p>
-      <w:pPr>
+      </w:pPr>
+      <w:r>
         <w:rPr>
           <w:b/>
           <w:bCs/>
-        </w:rPr>
-      </w:pPr>
+          <w:lang w:val="en-US"/>
+        </w:rPr>
+        <w:t>LENGTH, %</w:t>
+      </w:r>
+      <w:proofErr w:type="spellStart"/>
       <w:r>
         <w:rPr>
           <w:b/>
           <w:bCs/>
-        </w:rPr>
-        <w:t>This can be used for pizzicato notes, LENGTH, 25, for example</w:t>
-      </w:r>
-    </w:p>
-    <w:p>
-      <w:pPr>
+          <w:lang w:val="en-US"/>
+        </w:rPr>
+        <w:t>val</w:t>
+      </w:r>
+      <w:proofErr w:type="spellEnd"/>
+      <w:r>
         <w:rPr>
           <w:b/>
           <w:bCs/>
-        </w:rPr>
-      </w:pPr>
-      <w:r>
+          <w:lang w:val="en-US"/>
+        </w:rPr>
+        <w:t xml:space="preserve"> can be used to set the length of the note, it defaults to 90% and 10% quiet after the note</w:t>
+      </w:r>
+    </w:p>
+    <w:p>
+      <w:pPr>
         <w:rPr>
           <w:b/>
           <w:bCs/>
         </w:rPr>
-        <w:t>~</w:t>
-      </w:r>
-    </w:p>
-    <w:p>
-      <w:pPr>
+      </w:pPr>
+      <w:r>
         <w:rPr>
           <w:b/>
           <w:bCs/>
         </w:rPr>
-      </w:pPr>
-      <w:r>
+        <w:lastRenderedPageBreak/>
+        <w:t>This can be used for pizzicato notes, LENGTH, 25, for example</w:t>
+      </w:r>
+    </w:p>
+    <w:p>
+      <w:pPr>
         <w:rPr>
           <w:b/>
           <w:bCs/>
         </w:rPr>
-        <w:t>TEMPO, 145,</w:t>
-      </w:r>
-    </w:p>
-    <w:p>
-      <w:pPr>
+      </w:pPr>
+      <w:r>
         <w:rPr>
           <w:b/>
           <w:bCs/>
         </w:rPr>
-      </w:pPr>
-      <w:r>
+        <w:t>~</w:t>
+      </w:r>
+    </w:p>
+    <w:p>
+      <w:pPr>
         <w:rPr>
           <w:b/>
           <w:bCs/>
         </w:rPr>
-        <w:t>LENGTH, 90,</w:t>
-      </w:r>
-    </w:p>
-    <w:p>
-      <w:pPr>
+      </w:pPr>
+      <w:r>
         <w:rPr>
           <w:b/>
           <w:bCs/>
-          <w:lang w:val="en-US"/>
-        </w:rPr>
-      </w:pPr>
-      <w:r>
+        </w:rPr>
+        <w:t>TEMPO, 145,</w:t>
+      </w:r>
+    </w:p>
+    <w:p>
+      <w:pPr>
         <w:rPr>
           <w:b/>
           <w:bCs/>
-          <w:lang w:val="en-US"/>
-        </w:rPr>
-        <w:t>NOTE_E5, 4,  NOTE_B4, 8,  NOTE_C5, 8,  NOTE_D5, 4,  NOTE_C5, 8,  NOTE_B4, 8,</w:t>
-      </w:r>
-    </w:p>
-    <w:p>
-      <w:pPr>
+        </w:rPr>
+      </w:pPr>
+      <w:r>
         <w:rPr>
           <w:b/>
           <w:bCs/>
-          <w:lang w:val="en-US"/>
-        </w:rPr>
-      </w:pPr>
-      <w:r>
+        </w:rPr>
+        <w:t>LENGTH, 90,</w:t>
+      </w:r>
+    </w:p>
+    <w:p>
+      <w:pPr>
         <w:rPr>
           <w:b/>
           <w:bCs/>
           <w:lang w:val="en-US"/>
         </w:rPr>
-        <w:lastRenderedPageBreak/>
-        <w:t>NOTE_A4, 4,  NOTE_A4, 8,  NOTE_C5, 8,  NOTE_E5, 4,  NOTE_D5, 8,  NOTE_C5, 8,</w:t>
-      </w:r>
-    </w:p>
-    <w:p>
-      <w:pPr>
+      </w:pPr>
+      <w:r>
         <w:rPr>
           <w:b/>
           <w:bCs/>
           <w:lang w:val="en-US"/>
         </w:rPr>
-      </w:pPr>
+        <w:t xml:space="preserve">NOTE_E5, </w:t>
+      </w:r>
+      <w:proofErr w:type="gramStart"/>
       <w:r>
         <w:rPr>
           <w:b/>
           <w:bCs/>
           <w:lang w:val="en-US"/>
         </w:rPr>
-        <w:t>NOTE_B4, -4, NOTE_C5, 8,  NOTE_D5, 4,  NOTE_E5, 4,</w:t>
-      </w:r>
-    </w:p>
-    <w:p>
-      <w:pPr>
+        <w:t>4,  NOTE</w:t>
+      </w:r>
+      <w:proofErr w:type="gramEnd"/>
+      <w:r>
         <w:rPr>
           <w:b/>
           <w:bCs/>
           <w:lang w:val="en-US"/>
         </w:rPr>
-      </w:pPr>
+        <w:t xml:space="preserve">_B4, </w:t>
+      </w:r>
+      <w:proofErr w:type="gramStart"/>
       <w:r>
         <w:rPr>
           <w:b/>
           <w:bCs/>
           <w:lang w:val="en-US"/>
         </w:rPr>
-        <w:t>NOTE_C5, 4,  NOTE_A4, 4,  NOTE_A4, 8,  NOTE_A4, 4,  NOTE_B4, 8,  NOTE_C5, 8,</w:t>
-      </w:r>
-    </w:p>
-    <w:p>
-      <w:pPr>
+        <w:t>8,  NOTE</w:t>
+      </w:r>
+      <w:proofErr w:type="gramEnd"/>
+      <w:r>
         <w:rPr>
           <w:b/>
           <w:bCs/>
           <w:lang w:val="en-US"/>
         </w:rPr>
-      </w:pPr>
+        <w:t xml:space="preserve">_C5, </w:t>
+      </w:r>
+      <w:proofErr w:type="gramStart"/>
       <w:r>
         <w:rPr>
           <w:b/>
           <w:bCs/>
           <w:lang w:val="en-US"/>
         </w:rPr>
-        <w:t>NOTE_D5, -4, NOTE_F5, 8,  NOTE_A5, 4,  NOTE_G5, 8,  NOTE_F5, 8,</w:t>
-      </w:r>
-    </w:p>
-    <w:p>
-      <w:pPr>
+        <w:t>8,  NOTE</w:t>
+      </w:r>
+      <w:proofErr w:type="gramEnd"/>
+      <w:r>
         <w:rPr>
           <w:b/>
           <w:bCs/>
           <w:lang w:val="en-US"/>
         </w:rPr>
-      </w:pPr>
+        <w:t xml:space="preserve">_D5, </w:t>
+      </w:r>
+      <w:proofErr w:type="gramStart"/>
       <w:r>
         <w:rPr>
           <w:b/>
           <w:bCs/>
           <w:lang w:val="en-US"/>
         </w:rPr>
-        <w:t>NOTE_E5, -4, NOTE_C5, 8,  NOTE_E5, 4,  NOTE_D5, 8,  NOTE_C5, 8,</w:t>
-      </w:r>
-    </w:p>
-    <w:p>
-      <w:pPr>
+        <w:t>4,  NOTE</w:t>
+      </w:r>
+      <w:proofErr w:type="gramEnd"/>
+      <w:r>
         <w:rPr>
           <w:b/>
           <w:bCs/>
           <w:lang w:val="en-US"/>
         </w:rPr>
-      </w:pPr>
+        <w:t xml:space="preserve">_C5, </w:t>
+      </w:r>
+      <w:proofErr w:type="gramStart"/>
       <w:r>
         <w:rPr>
           <w:b/>
           <w:bCs/>
           <w:lang w:val="en-US"/>
         </w:rPr>
-        <w:t>NOTE_B4, 4,  NOTE_B4, 8,  NOTE_C5, 8,  NOTE_D5, 4,  NOTE_E5, 4,</w:t>
-      </w:r>
-    </w:p>
-    <w:p>
-      <w:pPr>
+        <w:t>8,  NOTE</w:t>
+      </w:r>
+      <w:proofErr w:type="gramEnd"/>
+      <w:r>
         <w:rPr>
           <w:b/>
           <w:bCs/>
           <w:lang w:val="en-US"/>
         </w:rPr>
-      </w:pPr>
-      <w:r>
+        <w:t>_B4, 8,</w:t>
+      </w:r>
+    </w:p>
+    <w:p>
+      <w:pPr>
         <w:rPr>
           <w:b/>
           <w:bCs/>
           <w:lang w:val="en-US"/>
         </w:rPr>
-        <w:t>NOTE_C5, 4,  NOTE_A4, 4,  NOTE_A4, 4, REST, 4,</w:t>
-      </w:r>
-    </w:p>
-    <w:p>
-      <w:pPr>
-        <w:pStyle w:val="Heading1"/>
-      </w:pPr>
-      <w:r>
-        <w:t>Updating Firmware</w:t>
-      </w:r>
-    </w:p>
-    <w:p>
-      <w:r>
-        <w:rPr>
-          <w:lang w:val="en-US"/>
-        </w:rPr>
-        <w:t xml:space="preserve">The new file must be put on the SD card and named RadioFox.bin. The system menu has an entry </w:t>
-      </w:r>
+      </w:pPr>
       <w:r>
         <w:rPr>
           <w:b/>
           <w:bCs/>
           <w:lang w:val="en-US"/>
         </w:rPr>
+        <w:t xml:space="preserve">NOTE_A4, </w:t>
+      </w:r>
+      <w:proofErr w:type="gramStart"/>
+      <w:r>
+        <w:rPr>
+          <w:b/>
+          <w:bCs/>
+          <w:lang w:val="en-US"/>
+        </w:rPr>
+        <w:t>4,  NOTE</w:t>
+      </w:r>
+      <w:proofErr w:type="gramEnd"/>
+      <w:r>
+        <w:rPr>
+          <w:b/>
+          <w:bCs/>
+          <w:lang w:val="en-US"/>
+        </w:rPr>
+        <w:t xml:space="preserve">_A4, </w:t>
+      </w:r>
+      <w:proofErr w:type="gramStart"/>
+      <w:r>
+        <w:rPr>
+          <w:b/>
+          <w:bCs/>
+          <w:lang w:val="en-US"/>
+        </w:rPr>
+        <w:t>8,  NOTE</w:t>
+      </w:r>
+      <w:proofErr w:type="gramEnd"/>
+      <w:r>
+        <w:rPr>
+          <w:b/>
+          <w:bCs/>
+          <w:lang w:val="en-US"/>
+        </w:rPr>
+        <w:t xml:space="preserve">_C5, </w:t>
+      </w:r>
+      <w:proofErr w:type="gramStart"/>
+      <w:r>
+        <w:rPr>
+          <w:b/>
+          <w:bCs/>
+          <w:lang w:val="en-US"/>
+        </w:rPr>
+        <w:t>8,  NOTE</w:t>
+      </w:r>
+      <w:proofErr w:type="gramEnd"/>
+      <w:r>
+        <w:rPr>
+          <w:b/>
+          <w:bCs/>
+          <w:lang w:val="en-US"/>
+        </w:rPr>
+        <w:t xml:space="preserve">_E5, </w:t>
+      </w:r>
+      <w:proofErr w:type="gramStart"/>
+      <w:r>
+        <w:rPr>
+          <w:b/>
+          <w:bCs/>
+          <w:lang w:val="en-US"/>
+        </w:rPr>
+        <w:t>4,  NOTE</w:t>
+      </w:r>
+      <w:proofErr w:type="gramEnd"/>
+      <w:r>
+        <w:rPr>
+          <w:b/>
+          <w:bCs/>
+          <w:lang w:val="en-US"/>
+        </w:rPr>
+        <w:t xml:space="preserve">_D5, </w:t>
+      </w:r>
+      <w:proofErr w:type="gramStart"/>
+      <w:r>
+        <w:rPr>
+          <w:b/>
+          <w:bCs/>
+          <w:lang w:val="en-US"/>
+        </w:rPr>
+        <w:t>8,  NOTE</w:t>
+      </w:r>
+      <w:proofErr w:type="gramEnd"/>
+      <w:r>
+        <w:rPr>
+          <w:b/>
+          <w:bCs/>
+          <w:lang w:val="en-US"/>
+        </w:rPr>
+        <w:t>_C5, 8,</w:t>
+      </w:r>
+    </w:p>
+    <w:p>
+      <w:pPr>
+        <w:rPr>
+          <w:b/>
+          <w:bCs/>
+          <w:lang w:val="en-US"/>
+        </w:rPr>
+      </w:pPr>
+      <w:r>
+        <w:rPr>
+          <w:b/>
+          <w:bCs/>
+          <w:lang w:val="en-US"/>
+        </w:rPr>
+        <w:t xml:space="preserve">NOTE_B4, -4, NOTE_C5, </w:t>
+      </w:r>
+      <w:proofErr w:type="gramStart"/>
+      <w:r>
+        <w:rPr>
+          <w:b/>
+          <w:bCs/>
+          <w:lang w:val="en-US"/>
+        </w:rPr>
+        <w:t>8,  NOTE</w:t>
+      </w:r>
+      <w:proofErr w:type="gramEnd"/>
+      <w:r>
+        <w:rPr>
+          <w:b/>
+          <w:bCs/>
+          <w:lang w:val="en-US"/>
+        </w:rPr>
+        <w:t xml:space="preserve">_D5, </w:t>
+      </w:r>
+      <w:proofErr w:type="gramStart"/>
+      <w:r>
+        <w:rPr>
+          <w:b/>
+          <w:bCs/>
+          <w:lang w:val="en-US"/>
+        </w:rPr>
+        <w:t>4,  NOTE</w:t>
+      </w:r>
+      <w:proofErr w:type="gramEnd"/>
+      <w:r>
+        <w:rPr>
+          <w:b/>
+          <w:bCs/>
+          <w:lang w:val="en-US"/>
+        </w:rPr>
+        <w:t>_E5, 4,</w:t>
+      </w:r>
+    </w:p>
+    <w:p>
+      <w:pPr>
+        <w:rPr>
+          <w:b/>
+          <w:bCs/>
+          <w:lang w:val="en-US"/>
+        </w:rPr>
+      </w:pPr>
+      <w:r>
+        <w:rPr>
+          <w:b/>
+          <w:bCs/>
+          <w:lang w:val="en-US"/>
+        </w:rPr>
+        <w:t xml:space="preserve">NOTE_C5, </w:t>
+      </w:r>
+      <w:proofErr w:type="gramStart"/>
+      <w:r>
+        <w:rPr>
+          <w:b/>
+          <w:bCs/>
+          <w:lang w:val="en-US"/>
+        </w:rPr>
+        <w:t>4,  NOTE</w:t>
+      </w:r>
+      <w:proofErr w:type="gramEnd"/>
+      <w:r>
+        <w:rPr>
+          <w:b/>
+          <w:bCs/>
+          <w:lang w:val="en-US"/>
+        </w:rPr>
+        <w:t xml:space="preserve">_A4, </w:t>
+      </w:r>
+      <w:proofErr w:type="gramStart"/>
+      <w:r>
+        <w:rPr>
+          <w:b/>
+          <w:bCs/>
+          <w:lang w:val="en-US"/>
+        </w:rPr>
+        <w:t>4,  NOTE</w:t>
+      </w:r>
+      <w:proofErr w:type="gramEnd"/>
+      <w:r>
+        <w:rPr>
+          <w:b/>
+          <w:bCs/>
+          <w:lang w:val="en-US"/>
+        </w:rPr>
+        <w:t xml:space="preserve">_A4, </w:t>
+      </w:r>
+      <w:proofErr w:type="gramStart"/>
+      <w:r>
+        <w:rPr>
+          <w:b/>
+          <w:bCs/>
+          <w:lang w:val="en-US"/>
+        </w:rPr>
+        <w:t>8,  NOTE</w:t>
+      </w:r>
+      <w:proofErr w:type="gramEnd"/>
+      <w:r>
+        <w:rPr>
+          <w:b/>
+          <w:bCs/>
+          <w:lang w:val="en-US"/>
+        </w:rPr>
+        <w:t xml:space="preserve">_A4, </w:t>
+      </w:r>
+      <w:proofErr w:type="gramStart"/>
+      <w:r>
+        <w:rPr>
+          <w:b/>
+          <w:bCs/>
+          <w:lang w:val="en-US"/>
+        </w:rPr>
+        <w:t>4,  NOTE</w:t>
+      </w:r>
+      <w:proofErr w:type="gramEnd"/>
+      <w:r>
+        <w:rPr>
+          <w:b/>
+          <w:bCs/>
+          <w:lang w:val="en-US"/>
+        </w:rPr>
+        <w:t xml:space="preserve">_B4, </w:t>
+      </w:r>
+      <w:proofErr w:type="gramStart"/>
+      <w:r>
+        <w:rPr>
+          <w:b/>
+          <w:bCs/>
+          <w:lang w:val="en-US"/>
+        </w:rPr>
+        <w:t>8,  NOTE</w:t>
+      </w:r>
+      <w:proofErr w:type="gramEnd"/>
+      <w:r>
+        <w:rPr>
+          <w:b/>
+          <w:bCs/>
+          <w:lang w:val="en-US"/>
+        </w:rPr>
+        <w:t>_C5, 8,</w:t>
+      </w:r>
+    </w:p>
+    <w:p>
+      <w:pPr>
+        <w:rPr>
+          <w:b/>
+          <w:bCs/>
+          <w:lang w:val="en-US"/>
+        </w:rPr>
+      </w:pPr>
+      <w:r>
+        <w:rPr>
+          <w:b/>
+          <w:bCs/>
+          <w:lang w:val="en-US"/>
+        </w:rPr>
+        <w:t xml:space="preserve">NOTE_D5, -4, NOTE_F5, </w:t>
+      </w:r>
+      <w:proofErr w:type="gramStart"/>
+      <w:r>
+        <w:rPr>
+          <w:b/>
+          <w:bCs/>
+          <w:lang w:val="en-US"/>
+        </w:rPr>
+        <w:t>8,  NOTE</w:t>
+      </w:r>
+      <w:proofErr w:type="gramEnd"/>
+      <w:r>
+        <w:rPr>
+          <w:b/>
+          <w:bCs/>
+          <w:lang w:val="en-US"/>
+        </w:rPr>
+        <w:t xml:space="preserve">_A5, </w:t>
+      </w:r>
+      <w:proofErr w:type="gramStart"/>
+      <w:r>
+        <w:rPr>
+          <w:b/>
+          <w:bCs/>
+          <w:lang w:val="en-US"/>
+        </w:rPr>
+        <w:t>4,  NOTE</w:t>
+      </w:r>
+      <w:proofErr w:type="gramEnd"/>
+      <w:r>
+        <w:rPr>
+          <w:b/>
+          <w:bCs/>
+          <w:lang w:val="en-US"/>
+        </w:rPr>
+        <w:t xml:space="preserve">_G5, </w:t>
+      </w:r>
+      <w:proofErr w:type="gramStart"/>
+      <w:r>
+        <w:rPr>
+          <w:b/>
+          <w:bCs/>
+          <w:lang w:val="en-US"/>
+        </w:rPr>
+        <w:t>8,  NOTE</w:t>
+      </w:r>
+      <w:proofErr w:type="gramEnd"/>
+      <w:r>
+        <w:rPr>
+          <w:b/>
+          <w:bCs/>
+          <w:lang w:val="en-US"/>
+        </w:rPr>
+        <w:t>_F5, 8,</w:t>
+      </w:r>
+    </w:p>
+    <w:p>
+      <w:pPr>
+        <w:rPr>
+          <w:b/>
+          <w:bCs/>
+          <w:lang w:val="en-US"/>
+        </w:rPr>
+      </w:pPr>
+      <w:r>
+        <w:rPr>
+          <w:b/>
+          <w:bCs/>
+          <w:lang w:val="en-US"/>
+        </w:rPr>
+        <w:t xml:space="preserve">NOTE_E5, -4, NOTE_C5, </w:t>
+      </w:r>
+      <w:proofErr w:type="gramStart"/>
+      <w:r>
+        <w:rPr>
+          <w:b/>
+          <w:bCs/>
+          <w:lang w:val="en-US"/>
+        </w:rPr>
+        <w:t>8,  NOTE</w:t>
+      </w:r>
+      <w:proofErr w:type="gramEnd"/>
+      <w:r>
+        <w:rPr>
+          <w:b/>
+          <w:bCs/>
+          <w:lang w:val="en-US"/>
+        </w:rPr>
+        <w:t xml:space="preserve">_E5, </w:t>
+      </w:r>
+      <w:proofErr w:type="gramStart"/>
+      <w:r>
+        <w:rPr>
+          <w:b/>
+          <w:bCs/>
+          <w:lang w:val="en-US"/>
+        </w:rPr>
+        <w:t>4,  NOTE</w:t>
+      </w:r>
+      <w:proofErr w:type="gramEnd"/>
+      <w:r>
+        <w:rPr>
+          <w:b/>
+          <w:bCs/>
+          <w:lang w:val="en-US"/>
+        </w:rPr>
+        <w:t xml:space="preserve">_D5, </w:t>
+      </w:r>
+      <w:proofErr w:type="gramStart"/>
+      <w:r>
+        <w:rPr>
+          <w:b/>
+          <w:bCs/>
+          <w:lang w:val="en-US"/>
+        </w:rPr>
+        <w:t>8,  NOTE</w:t>
+      </w:r>
+      <w:proofErr w:type="gramEnd"/>
+      <w:r>
+        <w:rPr>
+          <w:b/>
+          <w:bCs/>
+          <w:lang w:val="en-US"/>
+        </w:rPr>
+        <w:t>_C5, 8,</w:t>
+      </w:r>
+    </w:p>
+    <w:p>
+      <w:pPr>
+        <w:rPr>
+          <w:b/>
+          <w:bCs/>
+          <w:lang w:val="en-US"/>
+        </w:rPr>
+      </w:pPr>
+      <w:r>
+        <w:rPr>
+          <w:b/>
+          <w:bCs/>
+          <w:lang w:val="en-US"/>
+        </w:rPr>
+        <w:t xml:space="preserve">NOTE_B4, </w:t>
+      </w:r>
+      <w:proofErr w:type="gramStart"/>
+      <w:r>
+        <w:rPr>
+          <w:b/>
+          <w:bCs/>
+          <w:lang w:val="en-US"/>
+        </w:rPr>
+        <w:t>4,  NOTE</w:t>
+      </w:r>
+      <w:proofErr w:type="gramEnd"/>
+      <w:r>
+        <w:rPr>
+          <w:b/>
+          <w:bCs/>
+          <w:lang w:val="en-US"/>
+        </w:rPr>
+        <w:t xml:space="preserve">_B4, </w:t>
+      </w:r>
+      <w:proofErr w:type="gramStart"/>
+      <w:r>
+        <w:rPr>
+          <w:b/>
+          <w:bCs/>
+          <w:lang w:val="en-US"/>
+        </w:rPr>
+        <w:t>8,  NOTE</w:t>
+      </w:r>
+      <w:proofErr w:type="gramEnd"/>
+      <w:r>
+        <w:rPr>
+          <w:b/>
+          <w:bCs/>
+          <w:lang w:val="en-US"/>
+        </w:rPr>
+        <w:t xml:space="preserve">_C5, </w:t>
+      </w:r>
+      <w:proofErr w:type="gramStart"/>
+      <w:r>
+        <w:rPr>
+          <w:b/>
+          <w:bCs/>
+          <w:lang w:val="en-US"/>
+        </w:rPr>
+        <w:t>8,  NOTE</w:t>
+      </w:r>
+      <w:proofErr w:type="gramEnd"/>
+      <w:r>
+        <w:rPr>
+          <w:b/>
+          <w:bCs/>
+          <w:lang w:val="en-US"/>
+        </w:rPr>
+        <w:t xml:space="preserve">_D5, </w:t>
+      </w:r>
+      <w:proofErr w:type="gramStart"/>
+      <w:r>
+        <w:rPr>
+          <w:b/>
+          <w:bCs/>
+          <w:lang w:val="en-US"/>
+        </w:rPr>
+        <w:t>4,  NOTE</w:t>
+      </w:r>
+      <w:proofErr w:type="gramEnd"/>
+      <w:r>
+        <w:rPr>
+          <w:b/>
+          <w:bCs/>
+          <w:lang w:val="en-US"/>
+        </w:rPr>
+        <w:t>_E5, 4,</w:t>
+      </w:r>
+    </w:p>
+    <w:p>
+      <w:pPr>
+        <w:rPr>
+          <w:b/>
+          <w:bCs/>
+          <w:lang w:val="en-US"/>
+        </w:rPr>
+      </w:pPr>
+      <w:r>
+        <w:rPr>
+          <w:b/>
+          <w:bCs/>
+          <w:lang w:val="en-US"/>
+        </w:rPr>
+        <w:t xml:space="preserve">NOTE_C5, </w:t>
+      </w:r>
+      <w:proofErr w:type="gramStart"/>
+      <w:r>
+        <w:rPr>
+          <w:b/>
+          <w:bCs/>
+          <w:lang w:val="en-US"/>
+        </w:rPr>
+        <w:t>4,  NOTE</w:t>
+      </w:r>
+      <w:proofErr w:type="gramEnd"/>
+      <w:r>
+        <w:rPr>
+          <w:b/>
+          <w:bCs/>
+          <w:lang w:val="en-US"/>
+        </w:rPr>
+        <w:t xml:space="preserve">_A4, </w:t>
+      </w:r>
+      <w:proofErr w:type="gramStart"/>
+      <w:r>
+        <w:rPr>
+          <w:b/>
+          <w:bCs/>
+          <w:lang w:val="en-US"/>
+        </w:rPr>
+        <w:t>4,  NOTE</w:t>
+      </w:r>
+      <w:proofErr w:type="gramEnd"/>
+      <w:r>
+        <w:rPr>
+          <w:b/>
+          <w:bCs/>
+          <w:lang w:val="en-US"/>
+        </w:rPr>
+        <w:t>_A4, 4, REST, 4,</w:t>
+      </w:r>
+    </w:p>
+    <w:p>
+      <w:pPr>
+        <w:pStyle w:val="Heading1"/>
+      </w:pPr>
+      <w:r>
+        <w:t>Updating Firmware</w:t>
+      </w:r>
+    </w:p>
+    <w:p>
+      <w:r>
+        <w:rPr>
+          <w:lang w:val="en-US"/>
+        </w:rPr>
+        <w:t xml:space="preserve">The new file must be put on the SD card and named </w:t>
+      </w:r>
+      <w:proofErr w:type="spellStart"/>
+      <w:r>
+        <w:rPr>
+          <w:lang w:val="en-US"/>
+        </w:rPr>
+        <w:t>RadioFox.bin</w:t>
+      </w:r>
+      <w:proofErr w:type="spellEnd"/>
+      <w:r>
+        <w:rPr>
+          <w:lang w:val="en-US"/>
+        </w:rPr>
+        <w:t xml:space="preserve">. The system menu has an entry </w:t>
+      </w:r>
+      <w:r>
+        <w:rPr>
+          <w:b/>
+          <w:bCs/>
+          <w:lang w:val="en-US"/>
+        </w:rPr>
         <w:t>New Version BIN file</w:t>
       </w:r>
       <w:r>
         <w:rPr>
           <w:lang w:val="en-US"/>
         </w:rPr>
-        <w:t xml:space="preserve"> that will attempt to load this file. Confirmation will be required from the dial, After loading the BIN file can optionally be erased.</w:t>
+        <w:t xml:space="preserve"> that will attempt to load this file. Confirmation will be required from the dial, </w:t>
+      </w:r>
+      <w:proofErr w:type="gramStart"/>
+      <w:r>
+        <w:rPr>
+          <w:lang w:val="en-US"/>
+        </w:rPr>
+        <w:t>After</w:t>
+      </w:r>
+      <w:proofErr w:type="gramEnd"/>
+      <w:r>
+        <w:rPr>
+          <w:lang w:val="en-US"/>
+        </w:rPr>
+        <w:t xml:space="preserve"> loading the BIN file can optionally be erased.</w:t>
       </w:r>
     </w:p>
     <w:p>
@@ -1197,7 +2107,21 @@
         <w:rPr>
           <w:lang w:val="en-US"/>
         </w:rPr>
-        <w:t>DTMF (aka touch-tones) can be sent from the transmitter to control certain operations of the radio. It works best when the tones are sent for at least a second. It is usually also necessary to wait 2 seconds after pressing the transmit button on the radio. All commands consist of a ‘*’ followed by a digit. The following commands are available.</w:t>
+        <w:t xml:space="preserve">DTMF (aka touch-tones) can be sent from the transmitter to control certain operations of the radio. It works best when the tones are sent for at least a second. It is usually also necessary to wait 2 seconds after pressing the transmit button on the radio. All commands consist of </w:t>
+      </w:r>
+      <w:proofErr w:type="gramStart"/>
+      <w:r>
+        <w:rPr>
+          <w:lang w:val="en-US"/>
+        </w:rPr>
+        <w:t>a ‘*’</w:t>
+      </w:r>
+      <w:proofErr w:type="gramEnd"/>
+      <w:r>
+        <w:rPr>
+          <w:lang w:val="en-US"/>
+        </w:rPr>
+        <w:t xml:space="preserve"> followed by a digit. The following commands are available.</w:t>
       </w:r>
     </w:p>
     <w:p/>
@@ -1206,7 +2130,21 @@
         <w:rPr>
           <w:lang w:val="en-US"/>
         </w:rPr>
-        <w:t>Please feel free to request additional commands. I’m sure there are other usual things that can be done remotely using DTMF signals. Also note that these functions have not yet been tested extensively so there may be some bugs in the code. I will fix as soon as I can after I find out what they are.</w:t>
+        <w:t xml:space="preserve">Please feel free to request additional commands. I’m sure there are other usual things that can be done remotely using DTMF signals. Also note that these functions have not yet been tested extensively so there may be some bugs in the code. I will </w:t>
+      </w:r>
+      <w:proofErr w:type="gramStart"/>
+      <w:r>
+        <w:rPr>
+          <w:lang w:val="en-US"/>
+        </w:rPr>
+        <w:t>fix</w:t>
+      </w:r>
+      <w:proofErr w:type="gramEnd"/>
+      <w:r>
+        <w:rPr>
+          <w:lang w:val="en-US"/>
+        </w:rPr>
+        <w:t xml:space="preserve"> as soon as I can after I find out what they are.</w:t>
       </w:r>
     </w:p>
     <w:p>
@@ -1255,22 +2193,6 @@
     <w:p>
       <w:r>
         <w:t>Set low power mode.</w:t>
-      </w:r>
-    </w:p>
-    <w:p>
-      <w:pPr>
-        <w:pStyle w:val="Heading2"/>
-      </w:pPr>
-      <w:r>
-        <w:t>DTMF *</w:t>
-      </w:r>
-      <w:r>
-        <w:t>5</w:t>
-      </w:r>
-    </w:p>
-    <w:p>
-      <w:r>
-        <w:t>Set high power mode.</w:t>
       </w:r>
     </w:p>
     <w:p>
@@ -1282,6 +2204,22 @@
         <w:t>DTMF *</w:t>
       </w:r>
       <w:r>
+        <w:t>5</w:t>
+      </w:r>
+    </w:p>
+    <w:p>
+      <w:r>
+        <w:t>Set high power mode.</w:t>
+      </w:r>
+    </w:p>
+    <w:p>
+      <w:pPr>
+        <w:pStyle w:val="Heading2"/>
+      </w:pPr>
+      <w:r>
+        <w:t>DTMF *</w:t>
+      </w:r>
+      <w:r>
         <w:t>6</w:t>
       </w:r>
     </w:p>
@@ -1306,7 +2244,15 @@
         <w:t xml:space="preserve">All operations can be controlled by the rotary push button on the </w:t>
       </w:r>
       <w:r>
-        <w:t>box and the two extra buttons to the left labelled B0 and B1</w:t>
+        <w:t xml:space="preserve">box and the two extra buttons </w:t>
+      </w:r>
+      <w:proofErr w:type="gramStart"/>
+      <w:r>
+        <w:t>to</w:t>
+      </w:r>
+      <w:proofErr w:type="gramEnd"/>
+      <w:r>
+        <w:t xml:space="preserve"> the left labelled B0 and B1</w:t>
       </w:r>
       <w:r>
         <w:t>.</w:t>
@@ -1408,12 +2354,14 @@
       <w:r>
         <w:t xml:space="preserve"> The top one is called </w:t>
       </w:r>
+      <w:proofErr w:type="gramStart"/>
       <w:r>
         <w:t>B</w:t>
       </w:r>
       <w:r>
         <w:t>0</w:t>
       </w:r>
+      <w:proofErr w:type="gramEnd"/>
       <w:r>
         <w:t xml:space="preserve"> and the bottom one is called </w:t>
       </w:r>
@@ -1504,7 +2452,21 @@
         <w:rPr>
           <w:lang w:val="da-DK"/>
         </w:rPr>
-        <w:t xml:space="preserve"> During Run Mode</w:t>
+        <w:t xml:space="preserve"> </w:t>
+      </w:r>
+      <w:proofErr w:type="spellStart"/>
+      <w:r>
+        <w:rPr>
+          <w:lang w:val="da-DK"/>
+        </w:rPr>
+        <w:t>During</w:t>
+      </w:r>
+      <w:proofErr w:type="spellEnd"/>
+      <w:r>
+        <w:rPr>
+          <w:lang w:val="da-DK"/>
+        </w:rPr>
+        <w:t xml:space="preserve"> Run Mode</w:t>
       </w:r>
     </w:p>
     <w:p>
@@ -1579,12 +2541,26 @@
         <w:rPr>
           <w:lang w:val="da-DK"/>
         </w:rPr>
-        <w:t>1 During Menu Mod</w:t>
-      </w:r>
+        <w:t xml:space="preserve">1 </w:t>
+      </w:r>
+      <w:proofErr w:type="spellStart"/>
       <w:r>
         <w:rPr>
           <w:lang w:val="da-DK"/>
         </w:rPr>
+        <w:t>During</w:t>
+      </w:r>
+      <w:proofErr w:type="spellEnd"/>
+      <w:r>
+        <w:rPr>
+          <w:lang w:val="da-DK"/>
+        </w:rPr>
+        <w:t xml:space="preserve"> Menu Mod</w:t>
+      </w:r>
+      <w:r>
+        <w:rPr>
+          <w:lang w:val="da-DK"/>
+        </w:rPr>
         <w:t>e</w:t>
       </w:r>
     </w:p>
@@ -1622,7 +2598,21 @@
         <w:rPr>
           <w:lang w:val="en-US"/>
         </w:rPr>
-        <w:t xml:space="preserve"> if at the top menu. Long </w:t>
+        <w:t xml:space="preserve"> if </w:t>
+      </w:r>
+      <w:proofErr w:type="gramStart"/>
+      <w:r>
+        <w:rPr>
+          <w:lang w:val="en-US"/>
+        </w:rPr>
+        <w:t>at</w:t>
+      </w:r>
+      <w:proofErr w:type="gramEnd"/>
+      <w:r>
+        <w:rPr>
+          <w:lang w:val="en-US"/>
+        </w:rPr>
+        <w:t xml:space="preserve"> the top menu. Long </w:t>
       </w:r>
       <w:r>
         <w:rPr>
@@ -1646,7 +2636,21 @@
         <w:rPr>
           <w:lang w:val="en-US"/>
         </w:rPr>
-        <w:t>displays some help (if available) about the current menu item</w:t>
+        <w:t xml:space="preserve">displays some help (if available) </w:t>
+      </w:r>
+      <w:proofErr w:type="gramStart"/>
+      <w:r>
+        <w:rPr>
+          <w:lang w:val="en-US"/>
+        </w:rPr>
+        <w:t>about</w:t>
+      </w:r>
+      <w:proofErr w:type="gramEnd"/>
+      <w:r>
+        <w:rPr>
+          <w:lang w:val="en-US"/>
+        </w:rPr>
+        <w:t xml:space="preserve"> the current menu item</w:t>
       </w:r>
       <w:r>
         <w:rPr>
@@ -1658,7 +2662,35 @@
         <w:rPr>
           <w:lang w:val="en-US"/>
         </w:rPr>
-        <w:t xml:space="preserve"> Note that currently only a few menu items have help. More will be added in the future.</w:t>
+        <w:t xml:space="preserve"> Note that currently only a few </w:t>
+      </w:r>
+      <w:proofErr w:type="gramStart"/>
+      <w:r>
+        <w:rPr>
+          <w:lang w:val="en-US"/>
+        </w:rPr>
+        <w:t>menu items</w:t>
+      </w:r>
+      <w:proofErr w:type="gramEnd"/>
+      <w:r>
+        <w:rPr>
+          <w:lang w:val="en-US"/>
+        </w:rPr>
+        <w:t xml:space="preserve"> have </w:t>
+      </w:r>
+      <w:proofErr w:type="gramStart"/>
+      <w:r>
+        <w:rPr>
+          <w:lang w:val="en-US"/>
+        </w:rPr>
+        <w:t>help</w:t>
+      </w:r>
+      <w:proofErr w:type="gramEnd"/>
+      <w:r>
+        <w:rPr>
+          <w:lang w:val="en-US"/>
+        </w:rPr>
+        <w:t>. More will be added in the future.</w:t>
       </w:r>
     </w:p>
     <w:p>
@@ -1722,6 +2754,7 @@
         <w:rPr>
           <w:lang w:val="en-US"/>
         </w:rPr>
+        <w:lastRenderedPageBreak/>
         <w:t>B</w:t>
       </w:r>
       <w:r>
@@ -1783,14 +2816,21 @@
         <w:rPr>
           <w:lang w:val="en-US"/>
         </w:rPr>
-        <w:t xml:space="preserve">. After a dial click the increment will change to 10 and dial will </w:t>
-      </w:r>
-      <w:r>
-        <w:rPr>
-          <w:lang w:val="en-US"/>
-        </w:rPr>
-        <w:lastRenderedPageBreak/>
-        <w:t xml:space="preserve">add and subtract </w:t>
+        <w:t xml:space="preserve">. After a dial </w:t>
+      </w:r>
+      <w:proofErr w:type="gramStart"/>
+      <w:r>
+        <w:rPr>
+          <w:lang w:val="en-US"/>
+        </w:rPr>
+        <w:t>click</w:t>
+      </w:r>
+      <w:proofErr w:type="gramEnd"/>
+      <w:r>
+        <w:rPr>
+          <w:lang w:val="en-US"/>
+        </w:rPr>
+        <w:t xml:space="preserve"> the increment will change to 10 and dial will add and subtract </w:t>
       </w:r>
       <w:r>
         <w:rPr>
@@ -1879,7 +2919,15 @@
     </w:p>
     <w:p>
       <w:r>
-        <w:t xml:space="preserve">Dial rotation is only useful in the menu system, it doesn’t have any function while the radio </w:t>
+        <w:t xml:space="preserve">Dial rotation is only useful in the menu </w:t>
+      </w:r>
+      <w:proofErr w:type="gramStart"/>
+      <w:r>
+        <w:t>system,</w:t>
+      </w:r>
+      <w:proofErr w:type="gramEnd"/>
+      <w:r>
+        <w:t xml:space="preserve"> it doesn’t have any function while the radio </w:t>
       </w:r>
       <w:r>
         <w:t>status is displayed.</w:t>
@@ -1912,13 +2960,29 @@
         <w:t>,</w:t>
       </w:r>
       <w:r>
-        <w:t xml:space="preserve"> boolean values toggle with each click.</w:t>
+        <w:t xml:space="preserve"> </w:t>
+      </w:r>
+      <w:proofErr w:type="spellStart"/>
+      <w:r>
+        <w:t>boolean</w:t>
+      </w:r>
+      <w:proofErr w:type="spellEnd"/>
+      <w:r>
+        <w:t xml:space="preserve"> values toggle with each click.</w:t>
       </w:r>
       <w:r>
         <w:t xml:space="preserve"> Multiple selections cycle through all the available options.</w:t>
       </w:r>
       <w:r>
-        <w:t xml:space="preserve"> Integer values go to another screen that shows the minimum and maximum values. Rotating the dial right increases the value while rotating to the left decreases it by the increment amount. The increment amount can be changed by clicking the button which will cycle between different values. One of the values will be a reset to the original value, activated with a long press. A long press is also used to accept the new value and return to the menu. A * </w:t>
+        <w:t xml:space="preserve"> Integer values go to another screen that shows the minimum and maximum values. Rotating the dial right increases the value while rotating to the left decreases it by the increment amount. The increment amount can be changed by clicking the button which will cycle between different values. One of the values will be a reset to the original value, activated with a long press. </w:t>
+      </w:r>
+      <w:proofErr w:type="gramStart"/>
+      <w:r>
+        <w:t>A long</w:t>
+      </w:r>
+      <w:proofErr w:type="gramEnd"/>
+      <w:r>
+        <w:t xml:space="preserve"> press is also used to accept the new value and return to the menu. A * </w:t>
       </w:r>
       <w:r>
         <w:t xml:space="preserve">or highlight </w:t>
@@ -1927,10 +2991,18 @@
         <w:t xml:space="preserve">indicates the active menu line. A + in front of the menu means another menu will be activated. </w:t>
       </w:r>
       <w:r>
-        <w:t>Any menu item starting with ‘-‘</w:t>
-      </w:r>
-      <w:r>
-        <w:t xml:space="preserve"> goes back to the previous menu when clicked. A</w:t>
+        <w:t>Any menu item starting with ‘</w:t>
+      </w:r>
+      <w:proofErr w:type="gramStart"/>
+      <w:r>
+        <w:t>-‘</w:t>
+      </w:r>
+      <w:r>
+        <w:t xml:space="preserve"> goes</w:t>
+      </w:r>
+      <w:proofErr w:type="gramEnd"/>
+      <w:r>
+        <w:t xml:space="preserve"> back to the previous menu when clicked. A</w:t>
       </w:r>
       <w:r>
         <w:t xml:space="preserve"> dial</w:t>
@@ -2062,7 +3134,15 @@
         <w:ind w:left="1440"/>
       </w:pPr>
       <w:r>
-        <w:t>Select menu item, including return to previous menu</w:t>
+        <w:t xml:space="preserve">Select menu </w:t>
+      </w:r>
+      <w:proofErr w:type="gramStart"/>
+      <w:r>
+        <w:t>item</w:t>
+      </w:r>
+      <w:proofErr w:type="gramEnd"/>
+      <w:r>
+        <w:t>, including return to previous menu</w:t>
       </w:r>
     </w:p>
     <w:p>
@@ -2070,8 +3150,13 @@
         <w:ind w:left="1440"/>
       </w:pPr>
       <w:r>
-        <w:t>Toggle booleans</w:t>
-      </w:r>
+        <w:t xml:space="preserve">Toggle </w:t>
+      </w:r>
+      <w:proofErr w:type="spellStart"/>
+      <w:r>
+        <w:t>booleans</w:t>
+      </w:r>
+      <w:proofErr w:type="spellEnd"/>
     </w:p>
     <w:p>
       <w:pPr>
@@ -2103,6 +3188,7 @@
         <w:pStyle w:val="Heading1"/>
       </w:pPr>
       <w:r>
+        <w:lastRenderedPageBreak/>
         <w:t>Main Operating Screen</w:t>
       </w:r>
     </w:p>
@@ -2126,29 +3212,57 @@
         <w:t xml:space="preserve"> The bottom of the screen shows the</w:t>
       </w:r>
       <w:r>
-        <w:t xml:space="preserve"> battery status on the right if it has been enabled. This is related to the current battery voltage and will drop while transmitting. There are also 4 LED’s on the PCB that can be seen through</w:t>
+        <w:t xml:space="preserve"> battery status on the right if it has been enabled. This is related to the current battery voltage and will drop while transmitting. There are also 4 </w:t>
+      </w:r>
+      <w:proofErr w:type="gramStart"/>
+      <w:r>
+        <w:t>LED’s</w:t>
+      </w:r>
+      <w:proofErr w:type="gramEnd"/>
+      <w:r>
+        <w:t xml:space="preserve"> on the PCB that can be seen through</w:t>
       </w:r>
       <w:r>
         <w:t xml:space="preserve"> the slot on the </w:t>
       </w:r>
       <w:r>
-        <w:lastRenderedPageBreak/>
         <w:t>side</w:t>
       </w:r>
       <w:r>
         <w:t xml:space="preserve"> of the case</w:t>
       </w:r>
       <w:r>
-        <w:t>. These LED’s are controlled by the battery charger circuit and indicate the battery status during running and charging.</w:t>
+        <w:t xml:space="preserve">. These </w:t>
+      </w:r>
+      <w:proofErr w:type="gramStart"/>
+      <w:r>
+        <w:t>LED’s</w:t>
+      </w:r>
+      <w:proofErr w:type="gramEnd"/>
+      <w:r>
+        <w:t xml:space="preserve"> are controlled by the battery charger circuit and indicate the battery status during running and charging.</w:t>
       </w:r>
     </w:p>
     <w:p/>
     <w:p>
-      <w:r>
-        <w:t>During transmitting the bottom left shows an animated red dot. In a future firmware update the</w:t>
-      </w:r>
-      <w:r>
-        <w:t xml:space="preserve"> received DTMF characters will be display next to this.</w:t>
+      <w:proofErr w:type="gramStart"/>
+      <w:r>
+        <w:t>During</w:t>
+      </w:r>
+      <w:proofErr w:type="gramEnd"/>
+      <w:r>
+        <w:t xml:space="preserve"> transmitting the bottom left shows an animated red dot. In a future firmware update the</w:t>
+      </w:r>
+      <w:r>
+        <w:t xml:space="preserve"> </w:t>
+      </w:r>
+      <w:proofErr w:type="gramStart"/>
+      <w:r>
+        <w:t>received DTMF characters</w:t>
+      </w:r>
+      <w:proofErr w:type="gramEnd"/>
+      <w:r>
+        <w:t xml:space="preserve"> will be display next to this.</w:t>
       </w:r>
     </w:p>
     <w:p>
@@ -2163,8 +3277,13 @@
       <w:r>
         <w:t xml:space="preserve">The following sections detail each entry in </w:t>
       </w:r>
-      <w:r>
-        <w:t>all of the menus</w:t>
+      <w:proofErr w:type="gramStart"/>
+      <w:r>
+        <w:t>all of</w:t>
+      </w:r>
+      <w:proofErr w:type="gramEnd"/>
+      <w:r>
+        <w:t xml:space="preserve"> the menus</w:t>
       </w:r>
       <w:r>
         <w:t xml:space="preserve"> starting with the main or top menu</w:t>
@@ -2191,7 +3310,15 @@
         <w:t>’</w:t>
       </w:r>
       <w:r>
-        <w:t xml:space="preserve"> or a ‘-‘ to indicate a range</w:t>
+        <w:t xml:space="preserve"> or a ‘</w:t>
+      </w:r>
+      <w:proofErr w:type="gramStart"/>
+      <w:r>
+        <w:t>-‘ to</w:t>
+      </w:r>
+      <w:proofErr w:type="gramEnd"/>
+      <w:r>
+        <w:t xml:space="preserve"> indicate a range</w:t>
       </w:r>
       <w:r>
         <w:t>.</w:t>
@@ -2216,7 +3343,15 @@
         <w:t xml:space="preserve"> Some menu entries may depend on other menu items </w:t>
       </w:r>
       <w:r>
-        <w:t xml:space="preserve">settings. For example the audio file name menu item is hidden unless </w:t>
+        <w:t xml:space="preserve">settings. For </w:t>
+      </w:r>
+      <w:proofErr w:type="gramStart"/>
+      <w:r>
+        <w:t>example</w:t>
+      </w:r>
+      <w:proofErr w:type="gramEnd"/>
+      <w:r>
+        <w:t xml:space="preserve"> the audio file name menu item is hidden unless </w:t>
       </w:r>
       <w:r>
         <w:t>“Play Audio File” is Yes.</w:t>
@@ -2235,7 +3370,11 @@
         <w:pStyle w:val="Heading3"/>
       </w:pPr>
       <w:r>
-        <w:t>XMIT: On</w:t>
+        <w:t xml:space="preserve">XMIT: </w:t>
+      </w:r>
+      <w:proofErr w:type="spellStart"/>
+      <w:r>
+        <w:t>On</w:t>
       </w:r>
       <w:r>
         <w:t>|</w:t>
@@ -2243,13 +3382,43 @@
       <w:r>
         <w:t>Off</w:t>
       </w:r>
-    </w:p>
-    <w:p>
-      <w:r>
-        <w:t xml:space="preserve">This must be set to On for the radio to begin </w:t>
-      </w:r>
-      <w:r>
-        <w:t>transmitting. If saved as On then the radio will start sending right after booting. If it is Off it will not automatically start sending. It can be toggle</w:t>
+      <w:proofErr w:type="spellEnd"/>
+    </w:p>
+    <w:p>
+      <w:r>
+        <w:t xml:space="preserve">This must be set to </w:t>
+      </w:r>
+      <w:proofErr w:type="gramStart"/>
+      <w:r>
+        <w:t>On</w:t>
+      </w:r>
+      <w:proofErr w:type="gramEnd"/>
+      <w:r>
+        <w:t xml:space="preserve"> for the radio to begin </w:t>
+      </w:r>
+      <w:proofErr w:type="gramStart"/>
+      <w:r>
+        <w:t>transmitting</w:t>
+      </w:r>
+      <w:proofErr w:type="gramEnd"/>
+      <w:r>
+        <w:t xml:space="preserve">. If saved as </w:t>
+      </w:r>
+      <w:proofErr w:type="gramStart"/>
+      <w:r>
+        <w:t>On</w:t>
+      </w:r>
+      <w:proofErr w:type="gramEnd"/>
+      <w:r>
+        <w:t xml:space="preserve"> then the radio will start sending right after booting. If it is </w:t>
+      </w:r>
+      <w:proofErr w:type="gramStart"/>
+      <w:r>
+        <w:t>Off</w:t>
+      </w:r>
+      <w:proofErr w:type="gramEnd"/>
+      <w:r>
+        <w:t xml:space="preserve"> it will not automatically start sending. It can be toggle</w:t>
       </w:r>
       <w:r>
         <w:t>d</w:t>
@@ -2258,15 +3427,24 @@
         <w:t xml:space="preserve"> with the B0 button while in run mode</w:t>
       </w:r>
       <w:r>
-        <w:t>. Using B0 does not changed</w:t>
-      </w:r>
+        <w:t xml:space="preserve">. Using B0 does not </w:t>
+      </w:r>
+      <w:proofErr w:type="gramStart"/>
+      <w:r>
+        <w:t>changed</w:t>
+      </w:r>
+      <w:proofErr w:type="gramEnd"/>
     </w:p>
     <w:p>
       <w:pPr>
         <w:pStyle w:val="Heading3"/>
       </w:pPr>
       <w:r>
-        <w:t>TX Power: High</w:t>
+        <w:t xml:space="preserve">TX Power: </w:t>
+      </w:r>
+      <w:proofErr w:type="spellStart"/>
+      <w:r>
+        <w:t>High</w:t>
       </w:r>
       <w:r>
         <w:t>|</w:t>
@@ -2278,6 +3456,7 @@
         </w:rPr>
         <w:t>Low</w:t>
       </w:r>
+      <w:proofErr w:type="spellEnd"/>
     </w:p>
     <w:p>
       <w:r>
@@ -2333,7 +3512,11 @@
         <w:t>:</w:t>
       </w:r>
       <w:r>
-        <w:t xml:space="preserve"> Yes|</w:t>
+        <w:t xml:space="preserve"> </w:t>
+      </w:r>
+      <w:proofErr w:type="spellStart"/>
+      <w:r>
+        <w:t>Yes|</w:t>
       </w:r>
       <w:r>
         <w:rPr>
@@ -2342,6 +3525,7 @@
         </w:rPr>
         <w:t>No</w:t>
       </w:r>
+      <w:proofErr w:type="spellEnd"/>
     </w:p>
     <w:p>
       <w:r>
@@ -2356,7 +3540,12 @@
         <w:pStyle w:val="Heading3"/>
       </w:pPr>
       <w:r>
-        <w:t>Send GPS: Yes|</w:t>
+        <w:lastRenderedPageBreak/>
+        <w:t xml:space="preserve">Send GPS: </w:t>
+      </w:r>
+      <w:proofErr w:type="spellStart"/>
+      <w:r>
+        <w:t>Yes|</w:t>
       </w:r>
       <w:r>
         <w:rPr>
@@ -2365,6 +3554,7 @@
         </w:rPr>
         <w:t>NO</w:t>
       </w:r>
+      <w:proofErr w:type="spellEnd"/>
       <w:r>
         <w:t xml:space="preserve"> (beacon mode only)</w:t>
       </w:r>
@@ -2377,8 +3567,13 @@
         <w:t xml:space="preserve">ude and longitude values. The values must be entered manually from a phone </w:t>
       </w:r>
       <w:r>
-        <w:t>or GPS device. A future version of the hardware may have a built-in GPS module</w:t>
-      </w:r>
+        <w:t xml:space="preserve">or GPS device. A future version of the hardware may have a built-in GPS </w:t>
+      </w:r>
+      <w:proofErr w:type="gramStart"/>
+      <w:r>
+        <w:t>module</w:t>
+      </w:r>
+      <w:proofErr w:type="gramEnd"/>
       <w:r>
         <w:t xml:space="preserve"> or it may be able to connect to a serial GPS device using the USB connection.</w:t>
       </w:r>
@@ -2388,15 +3583,18 @@
         <w:pStyle w:val="Heading3"/>
       </w:pPr>
       <w:r>
-        <w:lastRenderedPageBreak/>
         <w:t xml:space="preserve">Latitude: </w:t>
       </w:r>
       <w:r>
         <w:t>+/-</w:t>
       </w:r>
+      <w:proofErr w:type="spellStart"/>
+      <w:proofErr w:type="gramStart"/>
       <w:r>
         <w:t>n.nnnnnn</w:t>
       </w:r>
+      <w:proofErr w:type="spellEnd"/>
+      <w:proofErr w:type="gramEnd"/>
       <w:r>
         <w:t xml:space="preserve"> (</w:t>
       </w:r>
@@ -2443,7 +3641,17 @@
         <w:pStyle w:val="Heading3"/>
       </w:pPr>
       <w:r>
-        <w:t xml:space="preserve">Longitude: +/-n.nnnnnn (Send </w:t>
+        <w:t>Longitude: +/-</w:t>
+      </w:r>
+      <w:proofErr w:type="spellStart"/>
+      <w:proofErr w:type="gramStart"/>
+      <w:r>
+        <w:t>n.nnnnnn</w:t>
+      </w:r>
+      <w:proofErr w:type="spellEnd"/>
+      <w:proofErr w:type="gramEnd"/>
+      <w:r>
+        <w:t xml:space="preserve"> (Send </w:t>
       </w:r>
       <w:r>
         <w:rPr>
@@ -2547,8 +3755,13 @@
         <w:t>Play Audio File</w:t>
       </w:r>
       <w:r>
-        <w:t>: Yes|No</w:t>
-      </w:r>
+        <w:t xml:space="preserve">: </w:t>
+      </w:r>
+      <w:proofErr w:type="spellStart"/>
+      <w:r>
+        <w:t>Yes|No</w:t>
+      </w:r>
+      <w:proofErr w:type="spellEnd"/>
     </w:p>
     <w:p>
       <w:r>
@@ -2572,13 +3785,37 @@
     </w:p>
     <w:p>
       <w:r>
-        <w:t xml:space="preserve">This menu item is only visible if the previous item is set to Yes. Clicking the dial will list all of the </w:t>
-      </w:r>
-      <w:r>
-        <w:t>*.txt files on the SD card. The dial is rotated to highlight a file and a long press will set it</w:t>
-      </w:r>
-      <w:r>
-        <w:t>. Note that a click of dial just exits the list of file with no selection being performed.</w:t>
+        <w:t xml:space="preserve">This menu item is only visible if the previous item is set to Yes. Clicking the dial will list </w:t>
+      </w:r>
+      <w:proofErr w:type="gramStart"/>
+      <w:r>
+        <w:t>all of</w:t>
+      </w:r>
+      <w:proofErr w:type="gramEnd"/>
+      <w:r>
+        <w:t xml:space="preserve"> the </w:t>
+      </w:r>
+      <w:r>
+        <w:t xml:space="preserve">*.txt files on the SD card. The dial is rotated to highlight a </w:t>
+      </w:r>
+      <w:proofErr w:type="gramStart"/>
+      <w:r>
+        <w:t>file</w:t>
+      </w:r>
+      <w:proofErr w:type="gramEnd"/>
+      <w:r>
+        <w:t xml:space="preserve"> and a long press will set it</w:t>
+      </w:r>
+      <w:r>
+        <w:t xml:space="preserve">. Note that a click of dial just exits the list of </w:t>
+      </w:r>
+      <w:proofErr w:type="gramStart"/>
+      <w:r>
+        <w:t>file</w:t>
+      </w:r>
+      <w:proofErr w:type="gramEnd"/>
+      <w:r>
+        <w:t xml:space="preserve"> with no selection being performed.</w:t>
       </w:r>
     </w:p>
     <w:p>
@@ -2605,6 +3842,7 @@
         <w:pStyle w:val="Heading2"/>
       </w:pPr>
       <w:r>
+        <w:lastRenderedPageBreak/>
         <w:t>+Radio Timers</w:t>
       </w:r>
     </w:p>
@@ -2621,7 +3859,15 @@
         <w:t>When B0 or the menu starts the transmit mode</w:t>
       </w:r>
       <w:r>
-        <w:t xml:space="preserve"> the system will not actually begin sending until this time is expired. This allows the radio to be hidden</w:t>
+        <w:t xml:space="preserve"> the system will not actually begin sending until this time </w:t>
+      </w:r>
+      <w:proofErr w:type="gramStart"/>
+      <w:r>
+        <w:t>is expired</w:t>
+      </w:r>
+      <w:proofErr w:type="gramEnd"/>
+      <w:r>
+        <w:t>. This allows the radio to be hidden</w:t>
       </w:r>
       <w:r>
         <w:t xml:space="preserve"> and </w:t>
@@ -2638,8 +3884,13 @@
         <w:pStyle w:val="Heading3"/>
       </w:pPr>
       <w:r>
-        <w:t>Timer Mode: Fixed|Random</w:t>
-      </w:r>
+        <w:t xml:space="preserve">Timer Mode: </w:t>
+      </w:r>
+      <w:proofErr w:type="spellStart"/>
+      <w:r>
+        <w:t>Fixed|Random</w:t>
+      </w:r>
+      <w:proofErr w:type="spellEnd"/>
     </w:p>
     <w:p>
       <w:r>
@@ -2649,17 +3900,217 @@
         <w:t xml:space="preserve"> mode the sending time and pause timer are controlled by the Send and Pause values</w:t>
       </w:r>
       <w:r>
-        <w:t xml:space="preserve"> and are always the same. In Random mode the transmit time and pause time are randomly </w:t>
-      </w:r>
+        <w:t xml:space="preserve"> and are always the same. In Random mode the transmit time and pause time are randomly chosen</w:t>
+      </w:r>
+      <w:r>
+        <w:t xml:space="preserve"> from the allowed values set in the Min and Max values for TX Send and Pause. This makes </w:t>
+      </w:r>
+      <w:proofErr w:type="gramStart"/>
+      <w:r>
+        <w:t>the timing</w:t>
+      </w:r>
+      <w:proofErr w:type="gramEnd"/>
+      <w:r>
+        <w:t xml:space="preserve"> less predictable and </w:t>
+      </w:r>
+      <w:proofErr w:type="gramStart"/>
+      <w:r>
+        <w:t>make</w:t>
+      </w:r>
+      <w:proofErr w:type="gramEnd"/>
+      <w:r>
+        <w:t xml:space="preserve"> the game a little bit harder.</w:t>
+      </w:r>
+      <w:r>
+        <w:t xml:space="preserve"> Keep your ears on!</w:t>
+      </w:r>
+    </w:p>
+    <w:p>
+      <w:pPr>
+        <w:pStyle w:val="Heading3"/>
+      </w:pPr>
+      <w:r>
+        <w:t xml:space="preserve">TX Send: </w:t>
+      </w:r>
+      <w:r>
+        <w:t>10-90 Sec</w:t>
+      </w:r>
+    </w:p>
+    <w:p>
+      <w:r>
+        <w:t>Fixed time for transmission. Shorter times are more challenging</w:t>
+      </w:r>
+      <w:r>
+        <w:t xml:space="preserve"> to locate</w:t>
+      </w:r>
+      <w:r>
+        <w:t xml:space="preserve"> but use less battery energy</w:t>
+      </w:r>
+      <w:r>
+        <w:t>. Longer times overheat the radio</w:t>
+      </w:r>
+      <w:r>
+        <w:t xml:space="preserve"> and use more battery </w:t>
+      </w:r>
+      <w:r>
+        <w:t>energy</w:t>
+      </w:r>
+      <w:r>
+        <w:t>.</w:t>
+      </w:r>
+    </w:p>
+    <w:p>
+      <w:pPr>
+        <w:pStyle w:val="Heading3"/>
+      </w:pPr>
+      <w:r>
+        <w:t>TX Pause:10-1200 Sec</w:t>
+      </w:r>
+    </w:p>
+    <w:p>
+      <w:r>
+        <w:t xml:space="preserve">This is the </w:t>
+      </w:r>
+      <w:proofErr w:type="gramStart"/>
+      <w:r>
+        <w:t>pause time</w:t>
+      </w:r>
+      <w:proofErr w:type="gramEnd"/>
+      <w:r>
+        <w:t xml:space="preserve"> between transmissions</w:t>
+      </w:r>
+      <w:r>
+        <w:t>. Longer times let the radio cool off and save the battery for longer run times.</w:t>
+      </w:r>
+    </w:p>
+    <w:p>
+      <w:pPr>
+        <w:pStyle w:val="Heading3"/>
+      </w:pPr>
+      <w:r>
+        <w:t>TX Send Min: 10-90 Sec</w:t>
+      </w:r>
+    </w:p>
+    <w:p>
+      <w:r>
+        <w:t>In random mode this is the minimum send time.</w:t>
+      </w:r>
+    </w:p>
+    <w:p>
+      <w:pPr>
+        <w:pStyle w:val="Heading3"/>
+      </w:pPr>
+      <w:r>
+        <w:t xml:space="preserve">TX Send Max: </w:t>
+      </w:r>
+      <w:r>
+        <w:t>10-90 Sec</w:t>
+      </w:r>
+    </w:p>
+    <w:p>
+      <w:r>
+        <w:t xml:space="preserve">In </w:t>
+      </w:r>
+      <w:r>
+        <w:t xml:space="preserve">random mode this is the maximum </w:t>
+      </w:r>
+      <w:proofErr w:type="gramStart"/>
+      <w:r>
+        <w:t>send</w:t>
+      </w:r>
+      <w:proofErr w:type="gramEnd"/>
+      <w:r>
+        <w:t xml:space="preserve"> time.</w:t>
+      </w:r>
+    </w:p>
+    <w:p>
+      <w:pPr>
+        <w:pStyle w:val="Heading3"/>
+      </w:pPr>
+      <w:r>
+        <w:t>TX Pause Min: 10-1200 Sec</w:t>
+      </w:r>
+    </w:p>
+    <w:p>
+      <w:r>
+        <w:t>In random mode this is the minimum pause time.</w:t>
+      </w:r>
+    </w:p>
+    <w:p>
+      <w:pPr>
+        <w:pStyle w:val="Heading3"/>
+      </w:pPr>
+      <w:r>
+        <w:t>TX Pause Max: 10-1200 Sec</w:t>
+      </w:r>
+    </w:p>
+    <w:p>
+      <w:r>
+        <w:t>In random mode this is the maximum pause time.</w:t>
+      </w:r>
+    </w:p>
+    <w:p>
+      <w:pPr>
+        <w:pStyle w:val="Heading3"/>
+      </w:pPr>
+      <w:r>
+        <w:t xml:space="preserve">TX Stop: </w:t>
+      </w:r>
+      <w:proofErr w:type="spellStart"/>
+      <w:r>
+        <w:t>Immediate|Finish</w:t>
+      </w:r>
+      <w:proofErr w:type="spellEnd"/>
+      <w:r>
+        <w:t xml:space="preserve"> Cycle</w:t>
+      </w:r>
+    </w:p>
+    <w:p>
+      <w:r>
+        <w:t xml:space="preserve">During transmit time the Beacon, Call Sign, and Audio are continuously sent. At the end of the transmission time this option controls whether the transmission stops immediately </w:t>
+      </w:r>
+      <w:proofErr w:type="gramStart"/>
+      <w:r>
+        <w:t>of</w:t>
+      </w:r>
+      <w:proofErr w:type="gramEnd"/>
+      <w:r>
+        <w:t xml:space="preserve"> waits to stop until the entire cycle is finished.</w:t>
+      </w:r>
+    </w:p>
+    <w:p/>
+    <w:p>
       <w:r>
         <w:lastRenderedPageBreak/>
-        <w:t>chosen</w:t>
-      </w:r>
-      <w:r>
-        <w:t xml:space="preserve"> from the allowed values set in the Min and Max values for TX Send and Pause. This makes the timing less predictable and make the game a little bit harder.</w:t>
-      </w:r>
-      <w:r>
-        <w:t xml:space="preserve"> Keep your ears on!</w:t>
+        <w:t>A clever use of this command</w:t>
+      </w:r>
+      <w:r>
+        <w:t xml:space="preserve"> allows for only one cycle of beacon, ID, and music to be sent during each transmission time. Set the transmit</w:t>
+      </w:r>
+      <w:r>
+        <w:t xml:space="preserve"> time to something less than</w:t>
+      </w:r>
+      <w:r>
+        <w:t xml:space="preserve"> the time to perform a complete cycle and set this option to “Finish Cycle”. The </w:t>
+      </w:r>
+      <w:proofErr w:type="gramStart"/>
+      <w:r>
+        <w:t>transmit  cycle</w:t>
+      </w:r>
+      <w:proofErr w:type="gramEnd"/>
+      <w:r>
+        <w:t xml:space="preserve"> will begin, the timer will expire, but the current cycle will </w:t>
+      </w:r>
+      <w:proofErr w:type="gramStart"/>
+      <w:r>
+        <w:t>complete</w:t>
+      </w:r>
+      <w:proofErr w:type="gramEnd"/>
+      <w:r>
+        <w:t xml:space="preserve"> before stopping</w:t>
+      </w:r>
+      <w:r>
+        <w:t>.</w:t>
       </w:r>
     </w:p>
     <w:p>
@@ -2667,30 +4118,524 @@
         <w:pStyle w:val="Heading3"/>
       </w:pPr>
       <w:r>
-        <w:t xml:space="preserve">TX Send: </w:t>
-      </w:r>
-      <w:r>
-        <w:t>10-90 Sec</w:t>
-      </w:r>
-    </w:p>
-    <w:p>
-      <w:r>
-        <w:t>Fixed time for transmission. Shorter times are more challenging</w:t>
-      </w:r>
-      <w:r>
-        <w:t xml:space="preserve"> to locate</w:t>
-      </w:r>
-      <w:r>
-        <w:t xml:space="preserve"> but use less battery energy</w:t>
-      </w:r>
-      <w:r>
-        <w:t>. Longer times overheat the radio</w:t>
-      </w:r>
-      <w:r>
-        <w:t xml:space="preserve"> and use more battery </w:t>
-      </w:r>
-      <w:r>
-        <w:t>energy</w:t>
+        <w:t xml:space="preserve">Radio Pause: </w:t>
+      </w:r>
+      <w:proofErr w:type="spellStart"/>
+      <w:r>
+        <w:t>Sleep|Awake</w:t>
+      </w:r>
+      <w:proofErr w:type="spellEnd"/>
+    </w:p>
+    <w:p>
+      <w:r>
+        <w:t xml:space="preserve">During pause time the radio can be put into sleep mode. This lowers the power consumption and lets the battery last longer. </w:t>
+      </w:r>
+      <w:proofErr w:type="gramStart"/>
+      <w:r>
+        <w:t>However</w:t>
+      </w:r>
+      <w:proofErr w:type="gramEnd"/>
+      <w:r>
+        <w:t xml:space="preserve"> note that this also means that the DTMF commands are disabled since the radio is asleep!</w:t>
+      </w:r>
+    </w:p>
+    <w:p>
+      <w:pPr>
+        <w:pStyle w:val="Heading2"/>
+      </w:pPr>
+      <w:r>
+        <w:t>+</w:t>
+      </w:r>
+      <w:r>
+        <w:t>More Radio Settings</w:t>
+      </w:r>
+    </w:p>
+    <w:p>
+      <w:pPr>
+        <w:pStyle w:val="Heading3"/>
+      </w:pPr>
+      <w:r>
+        <w:t>RX Offset: -</w:t>
+      </w:r>
+      <w:proofErr w:type="gramStart"/>
+      <w:r>
+        <w:t>600|0|</w:t>
+      </w:r>
+      <w:proofErr w:type="gramEnd"/>
+      <w:r>
+        <w:t>+600 kHz</w:t>
+      </w:r>
+    </w:p>
+    <w:p>
+      <w:r>
+        <w:t>This is the frequency offset from the transmit frequency that the radio uses to receive DTMF commands</w:t>
+      </w:r>
+      <w:r>
+        <w:t xml:space="preserve">. An offset is recommended. If 0 is used the radio will only listen when it isn’t </w:t>
+      </w:r>
+      <w:proofErr w:type="gramStart"/>
+      <w:r>
+        <w:t>sending</w:t>
+      </w:r>
+      <w:proofErr w:type="gramEnd"/>
+      <w:r>
+        <w:t>. It has not been tested if it listens during sending when the offset is not 0.</w:t>
+      </w:r>
+    </w:p>
+    <w:p>
+      <w:pPr>
+        <w:pStyle w:val="Heading3"/>
+      </w:pPr>
+      <w:r>
+        <w:t xml:space="preserve">Bandwidth: </w:t>
+      </w:r>
+      <w:proofErr w:type="gramStart"/>
+      <w:r>
+        <w:t>12.5|</w:t>
+      </w:r>
+      <w:r>
+        <w:t>25</w:t>
+      </w:r>
+      <w:proofErr w:type="gramEnd"/>
+      <w:r>
+        <w:t xml:space="preserve"> kHz</w:t>
+      </w:r>
+    </w:p>
+    <w:p>
+      <w:r>
+        <w:t>This sets the radio bandwidth</w:t>
+      </w:r>
+      <w:r>
+        <w:t>. It has not been tested much to see what effect it has on performance yet.</w:t>
+      </w:r>
+    </w:p>
+    <w:p>
+      <w:pPr>
+        <w:pStyle w:val="Heading3"/>
+      </w:pPr>
+      <w:r>
+        <w:t>CTCSS/DCS: CTCSS|DCS</w:t>
+      </w:r>
+    </w:p>
+    <w:p>
+      <w:r>
+        <w:t xml:space="preserve">This sets the </w:t>
+      </w:r>
+      <w:r>
+        <w:t>un-squelch</w:t>
+      </w:r>
+      <w:r>
+        <w:t xml:space="preserve"> values</w:t>
+      </w:r>
+      <w:r>
+        <w:t xml:space="preserve"> for either the analog or digital versions.</w:t>
+      </w:r>
+    </w:p>
+    <w:p>
+      <w:pPr>
+        <w:pStyle w:val="Heading3"/>
+      </w:pPr>
+      <w:r>
+        <w:t>TX CTCSS:</w:t>
+      </w:r>
+      <w:r>
+        <w:t xml:space="preserve"> None</w:t>
+      </w:r>
+      <w:r>
+        <w:t>|</w:t>
+      </w:r>
+      <w:r>
+        <w:t>67-</w:t>
+      </w:r>
+      <w:r>
+        <w:t>250.3</w:t>
+      </w:r>
+    </w:p>
+    <w:p>
+      <w:r>
+        <w:t>Analog un-squelch frequencies sent out.</w:t>
+      </w:r>
+    </w:p>
+    <w:p>
+      <w:pPr>
+        <w:pStyle w:val="Heading3"/>
+      </w:pPr>
+      <w:r>
+        <w:t>RX CTCSS:</w:t>
+      </w:r>
+      <w:r>
+        <w:t xml:space="preserve"> None|67-250.3</w:t>
+      </w:r>
+    </w:p>
+    <w:p>
+      <w:r>
+        <w:t>Analog un-squelch frequency for receiving.</w:t>
+      </w:r>
+    </w:p>
+    <w:p>
+      <w:pPr>
+        <w:pStyle w:val="Heading3"/>
+      </w:pPr>
+      <w:r>
+        <w:t>TX DCS:</w:t>
+      </w:r>
+      <w:r>
+        <w:t xml:space="preserve"> None|023-754</w:t>
+      </w:r>
+    </w:p>
+    <w:p>
+      <w:r>
+        <w:t>Digital un-squelch value for sending.</w:t>
+      </w:r>
+    </w:p>
+    <w:p>
+      <w:pPr>
+        <w:pStyle w:val="Heading3"/>
+      </w:pPr>
+      <w:r>
+        <w:t>TX I/N: I|N</w:t>
+      </w:r>
+    </w:p>
+    <w:p>
+      <w:r>
+        <w:t>The digital I or N value for sending.</w:t>
+      </w:r>
+    </w:p>
+    <w:p>
+      <w:pPr>
+        <w:pStyle w:val="Heading3"/>
+      </w:pPr>
+      <w:r>
+        <w:t>RX DCS: None|023-754</w:t>
+      </w:r>
+    </w:p>
+    <w:p>
+      <w:r>
+        <w:t>Digital un-squelch value for receiving.</w:t>
+      </w:r>
+    </w:p>
+    <w:p>
+      <w:pPr>
+        <w:pStyle w:val="Heading3"/>
+      </w:pPr>
+      <w:r>
+        <w:lastRenderedPageBreak/>
+        <w:t>RX I/N: I|N</w:t>
+      </w:r>
+    </w:p>
+    <w:p>
+      <w:r>
+        <w:t>The digital I or N value for receiving.</w:t>
+      </w:r>
+    </w:p>
+    <w:p>
+      <w:pPr>
+        <w:pStyle w:val="Heading3"/>
+      </w:pPr>
+      <w:r>
+        <w:t>RX Volume:</w:t>
+      </w:r>
+      <w:r>
+        <w:t xml:space="preserve"> 1-6</w:t>
+      </w:r>
+    </w:p>
+    <w:p>
+      <w:r>
+        <w:t>This is the receive volume setting. It affects how well DTMF tones are detected.</w:t>
+      </w:r>
+    </w:p>
+    <w:p>
+      <w:pPr>
+        <w:pStyle w:val="Heading3"/>
+      </w:pPr>
+      <w:r>
+        <w:t>RX Squelch:</w:t>
+      </w:r>
+      <w:r>
+        <w:t xml:space="preserve"> 0-8</w:t>
+      </w:r>
+    </w:p>
+    <w:p>
+      <w:r>
+        <w:t>This affects how much signal is required to receive the DTMF signals.</w:t>
+      </w:r>
+    </w:p>
+    <w:p>
+      <w:pPr>
+        <w:pStyle w:val="Heading2"/>
+      </w:pPr>
+      <w:r>
+        <w:t>Cancel Waits/TX Now</w:t>
+      </w:r>
+    </w:p>
+    <w:p>
+      <w:r>
+        <w:t>When the radio is in either send or pause mode this command will cancel the timer and the next mo</w:t>
+      </w:r>
+      <w:r>
+        <w:t xml:space="preserve">de will start. For </w:t>
+      </w:r>
+      <w:proofErr w:type="gramStart"/>
+      <w:r>
+        <w:t>example</w:t>
+      </w:r>
+      <w:proofErr w:type="gramEnd"/>
+      <w:r>
+        <w:t xml:space="preserve"> if you want to cancel</w:t>
+      </w:r>
+      <w:r>
+        <w:t xml:space="preserve"> the pause and go to transmit, use this option. It can also be done by long pressing B0.</w:t>
+      </w:r>
+    </w:p>
+    <w:p>
+      <w:pPr>
+        <w:pStyle w:val="Heading2"/>
+      </w:pPr>
+      <w:r>
+        <w:t>+Saved Settings Files</w:t>
+      </w:r>
+    </w:p>
+    <w:p>
+      <w:r>
+        <w:t>Saved settings files are named files stored on the SD card. They are useful to</w:t>
+      </w:r>
+      <w:r>
+        <w:t xml:space="preserve"> quickly configure the radio for different uses. All values except the battery calibration are affected.</w:t>
+      </w:r>
+    </w:p>
+    <w:p>
+      <w:pPr>
+        <w:pStyle w:val="Heading3"/>
+      </w:pPr>
+      <w:r>
+        <w:t>Create File</w:t>
+      </w:r>
+    </w:p>
+    <w:p>
+      <w:r>
+        <w:t>This prompts the user for a name. The file is then created using the current system settings.</w:t>
+      </w:r>
+    </w:p>
+    <w:p>
+      <w:pPr>
+        <w:pStyle w:val="Heading3"/>
+      </w:pPr>
+      <w:r>
+        <w:t>Save/Update File</w:t>
+      </w:r>
+    </w:p>
+    <w:p>
+      <w:r>
+        <w:t xml:space="preserve">This command saves the current settings into the selected file. If it already </w:t>
+      </w:r>
+      <w:proofErr w:type="gramStart"/>
+      <w:r>
+        <w:t>exists</w:t>
+      </w:r>
+      <w:proofErr w:type="gramEnd"/>
+      <w:r>
+        <w:t xml:space="preserve"> the user will be asked to confirm overwriting the file.</w:t>
+      </w:r>
+    </w:p>
+    <w:p>
+      <w:pPr>
+        <w:pStyle w:val="Heading3"/>
+      </w:pPr>
+      <w:r>
+        <w:t>Load File</w:t>
+      </w:r>
+    </w:p>
+    <w:p>
+      <w:r>
+        <w:t xml:space="preserve">This command asks the user for the name and then sets </w:t>
+      </w:r>
+      <w:proofErr w:type="gramStart"/>
+      <w:r>
+        <w:t>all of</w:t>
+      </w:r>
+      <w:proofErr w:type="gramEnd"/>
+      <w:r>
+        <w:t xml:space="preserve"> the system settings except the battery calibration using the values in the file.</w:t>
+      </w:r>
+    </w:p>
+    <w:p>
+      <w:pPr>
+        <w:pStyle w:val="Heading3"/>
+      </w:pPr>
+      <w:r>
+        <w:t>Delete File</w:t>
+      </w:r>
+    </w:p>
+    <w:p>
+      <w:r>
+        <w:t>The user selects a file from the list and then it can be deleted.</w:t>
+      </w:r>
+    </w:p>
+    <w:p>
+      <w:pPr>
+        <w:pStyle w:val="Heading2"/>
+      </w:pPr>
+      <w:r>
+        <w:lastRenderedPageBreak/>
+        <w:t>+System Settings</w:t>
+      </w:r>
+    </w:p>
+    <w:p>
+      <w:pPr>
+        <w:pStyle w:val="Heading3"/>
+      </w:pPr>
+      <w:r>
+        <w:t>+Display</w:t>
+      </w:r>
+      <w:r>
+        <w:t xml:space="preserve"> Settings</w:t>
+      </w:r>
+    </w:p>
+    <w:p>
+      <w:pPr>
+        <w:pStyle w:val="Heading4"/>
+      </w:pPr>
+      <w:r>
+        <w:t xml:space="preserve">Dimming Mode: </w:t>
+      </w:r>
+      <w:proofErr w:type="spellStart"/>
+      <w:r>
+        <w:t>None</w:t>
+      </w:r>
+      <w:r>
+        <w:t>|Timer</w:t>
+      </w:r>
+      <w:proofErr w:type="spellEnd"/>
+    </w:p>
+    <w:p>
+      <w:r>
+        <w:t xml:space="preserve">The display can be set to dim automatically after a specified number of seconds. This is used to save battery power since the backlight </w:t>
+      </w:r>
+      <w:r>
+        <w:t>uses a significant amount.</w:t>
+      </w:r>
+    </w:p>
+    <w:p>
+      <w:pPr>
+        <w:pStyle w:val="Heading4"/>
+      </w:pPr>
+      <w:r>
+        <w:t>Bright Value: 1-100</w:t>
+      </w:r>
+      <w:r>
+        <w:t>%</w:t>
+      </w:r>
+    </w:p>
+    <w:p>
+      <w:r>
+        <w:t>Set the display brightness value.</w:t>
+      </w:r>
+    </w:p>
+    <w:p>
+      <w:pPr>
+        <w:pStyle w:val="Heading4"/>
+      </w:pPr>
+      <w:r>
+        <w:t xml:space="preserve">Dim Value: </w:t>
+      </w:r>
+      <w:r>
+        <w:t>0-100%</w:t>
+      </w:r>
+    </w:p>
+    <w:p>
+      <w:r>
+        <w:t xml:space="preserve">Set the display brightness after the </w:t>
+      </w:r>
+      <w:r>
+        <w:t>timer below expires.</w:t>
+      </w:r>
+    </w:p>
+    <w:p>
+      <w:pPr>
+        <w:pStyle w:val="Heading4"/>
+      </w:pPr>
+      <w:r>
+        <w:t>Display Dim Time:</w:t>
+      </w:r>
+      <w:r>
+        <w:t xml:space="preserve"> 0-120 S</w:t>
+      </w:r>
+    </w:p>
+    <w:p>
+      <w:r>
+        <w:t>Specify the time until the display changes to dim mode.</w:t>
+      </w:r>
+    </w:p>
+    <w:p>
+      <w:pPr>
+        <w:pStyle w:val="Heading4"/>
+      </w:pPr>
+      <w:r>
+        <w:t>+Sideways Scroll Settings</w:t>
+      </w:r>
+    </w:p>
+    <w:p>
+      <w:r>
+        <w:t xml:space="preserve">Lines of text that </w:t>
+      </w:r>
+      <w:proofErr w:type="gramStart"/>
+      <w:r>
+        <w:t>too</w:t>
+      </w:r>
+      <w:proofErr w:type="gramEnd"/>
+      <w:r>
+        <w:t xml:space="preserve"> long for the display will scroll back and forth. The following settings control the speed.</w:t>
+      </w:r>
+    </w:p>
+    <w:p>
+      <w:pPr>
+        <w:pStyle w:val="Heading5"/>
+      </w:pPr>
+      <w:r>
+        <w:t xml:space="preserve">Speed: </w:t>
+      </w:r>
+      <w:r>
+        <w:t>1-1000 mS</w:t>
+      </w:r>
+    </w:p>
+    <w:p>
+      <w:r>
+        <w:t>Controls the speed of text moving to the left.</w:t>
+      </w:r>
+    </w:p>
+    <w:p>
+      <w:pPr>
+        <w:pStyle w:val="Heading5"/>
+      </w:pPr>
+      <w:r>
+        <w:t>Pause: 1-100</w:t>
+      </w:r>
+      <w:r>
+        <w:t xml:space="preserve"> mS</w:t>
+      </w:r>
+    </w:p>
+    <w:p>
+      <w:r>
+        <w:t>This controls the pause when the text is at the end (all the way to the left).</w:t>
+      </w:r>
+    </w:p>
+    <w:p>
+      <w:pPr>
+        <w:pStyle w:val="Heading5"/>
+      </w:pPr>
+      <w:r>
+        <w:t>Reverse Speed: 1-20x</w:t>
+      </w:r>
+    </w:p>
+    <w:p>
+      <w:r>
+        <w:t xml:space="preserve">This is how fast the text scrolls </w:t>
+      </w:r>
+      <w:r>
+        <w:t>back to the beginning (to the right). 2x means twice as fast as the text scroll</w:t>
+      </w:r>
+      <w:r>
+        <w:t>ed to the left</w:t>
       </w:r>
       <w:r>
         <w:t>.</w:t>
@@ -2698,18 +4643,103 @@
     </w:p>
     <w:p>
       <w:pPr>
+        <w:pStyle w:val="Heading4"/>
+      </w:pPr>
+      <w:r>
+        <w:t xml:space="preserve">Menu Selection: </w:t>
+      </w:r>
+      <w:r>
+        <w:t>Color|*</w:t>
+      </w:r>
+    </w:p>
+    <w:p>
+      <w:r>
+        <w:t>Menu selections</w:t>
+      </w:r>
+      <w:r>
+        <w:t xml:space="preserve"> and selections from a list can be either colored or marked with </w:t>
+      </w:r>
+      <w:proofErr w:type="gramStart"/>
+      <w:r>
+        <w:t>the ‘*</w:t>
+      </w:r>
+      <w:proofErr w:type="gramEnd"/>
+      <w:r>
+        <w:t>’ character.</w:t>
+      </w:r>
+    </w:p>
+    <w:p>
+      <w:pPr>
+        <w:pStyle w:val="Heading4"/>
+      </w:pPr>
+      <w:r>
+        <w:t>Text/</w:t>
+      </w:r>
+      <w:proofErr w:type="spellStart"/>
+      <w:r>
+        <w:t>HiLite</w:t>
+      </w:r>
+      <w:proofErr w:type="spellEnd"/>
+      <w:r>
+        <w:t xml:space="preserve"> Colors</w:t>
+      </w:r>
+    </w:p>
+    <w:p>
+      <w:r>
+        <w:t xml:space="preserve">This selection </w:t>
+      </w:r>
+      <w:proofErr w:type="gramStart"/>
+      <w:r>
+        <w:t>allows for choosing</w:t>
+      </w:r>
+      <w:proofErr w:type="gramEnd"/>
+      <w:r>
+        <w:t xml:space="preserve"> the colors of the text and the highlight. The background screen is always black.</w:t>
+      </w:r>
+    </w:p>
+    <w:p>
+      <w:pPr>
         <w:pStyle w:val="Heading3"/>
       </w:pPr>
       <w:r>
-        <w:t>TX Pause:10-1200 Sec</w:t>
-      </w:r>
-    </w:p>
-    <w:p>
-      <w:r>
-        <w:t>This is the pause time between transmissions</w:t>
-      </w:r>
-      <w:r>
-        <w:t>. Longer times let the radio cool off and save the battery for longer run times.</w:t>
+        <w:lastRenderedPageBreak/>
+        <w:t>+Dial &amp; Button Settings</w:t>
+      </w:r>
+    </w:p>
+    <w:p>
+      <w:pPr>
+        <w:pStyle w:val="Heading4"/>
+      </w:pPr>
+      <w:r>
+        <w:t xml:space="preserve">Direction: </w:t>
+      </w:r>
+      <w:proofErr w:type="spellStart"/>
+      <w:proofErr w:type="gramStart"/>
+      <w:r>
+        <w:t>Normal:Reverse</w:t>
+      </w:r>
+      <w:proofErr w:type="spellEnd"/>
+      <w:proofErr w:type="gramEnd"/>
+    </w:p>
+    <w:p>
+      <w:r>
+        <w:t>If you really want the button to be the other way around this is the choice for you.</w:t>
+      </w:r>
+    </w:p>
+    <w:p>
+      <w:pPr>
+        <w:pStyle w:val="Heading4"/>
+      </w:pPr>
+      <w:r>
+        <w:t>Long Press Timer: 2-200</w:t>
+      </w:r>
+    </w:p>
+    <w:p>
+      <w:r>
+        <w:t>This value affects how long or short a long press is. The default value is normally OK</w:t>
+      </w:r>
+      <w:r>
+        <w:t>, but somebody might want to change it.</w:t>
       </w:r>
     </w:p>
     <w:p>
@@ -2717,12 +4747,91 @@
         <w:pStyle w:val="Heading3"/>
       </w:pPr>
       <w:r>
-        <w:t>TX Send Min: 10-90 Sec</w:t>
-      </w:r>
-    </w:p>
-    <w:p>
-      <w:r>
-        <w:t>In random mode this is the minimum send time.</w:t>
+        <w:t>+Battery Settings</w:t>
+      </w:r>
+    </w:p>
+    <w:p>
+      <w:r>
+        <w:t xml:space="preserve">Since the PCB was designed with 10% resistors for measuring the battery voltage some calibration is needed. A future PCB will probably use better </w:t>
+      </w:r>
+      <w:proofErr w:type="gramStart"/>
+      <w:r>
+        <w:t>resistors</w:t>
+      </w:r>
+      <w:proofErr w:type="gramEnd"/>
+      <w:r>
+        <w:t xml:space="preserve"> so this won’t be needed.</w:t>
+      </w:r>
+    </w:p>
+    <w:p>
+      <w:pPr>
+        <w:pStyle w:val="Heading4"/>
+      </w:pPr>
+      <w:r>
+        <w:t xml:space="preserve">Show Battery: </w:t>
+      </w:r>
+      <w:proofErr w:type="spellStart"/>
+      <w:r>
+        <w:t>Yes|No</w:t>
+      </w:r>
+      <w:proofErr w:type="spellEnd"/>
+    </w:p>
+    <w:p>
+      <w:r>
+        <w:t xml:space="preserve">This option controls the </w:t>
+      </w:r>
+      <w:r>
+        <w:t>battery display on the bottom right of the display.</w:t>
+      </w:r>
+    </w:p>
+    <w:p>
+      <w:pPr>
+        <w:pStyle w:val="Heading4"/>
+      </w:pPr>
+      <w:r>
+        <w:t>Full Battery: 2000-4000</w:t>
+      </w:r>
+    </w:p>
+    <w:p>
+      <w:r>
+        <w:t>This is the value that indicates a full 4.2V battery.</w:t>
+      </w:r>
+    </w:p>
+    <w:p>
+      <w:pPr>
+        <w:pStyle w:val="Heading4"/>
+      </w:pPr>
+      <w:r>
+        <w:t>Set Full Battery</w:t>
+      </w:r>
+    </w:p>
+    <w:p>
+      <w:r>
+        <w:t>This selection reads the current battery values and stores it. It is best set by fully charging the battery and then disconnecting the charger. Wait a couple of minutes and then use it several times until it seems stable.</w:t>
+      </w:r>
+    </w:p>
+    <w:p>
+      <w:pPr>
+        <w:pStyle w:val="Heading4"/>
+      </w:pPr>
+      <w:r>
+        <w:t>Read Battery Raw Data</w:t>
+      </w:r>
+    </w:p>
+    <w:p>
+      <w:r>
+        <w:t>This continuously reads the battery value</w:t>
+      </w:r>
+      <w:r>
+        <w:t xml:space="preserve">. It was originally used for testing, but it seems like it might possibly be </w:t>
+      </w:r>
+      <w:proofErr w:type="gramStart"/>
+      <w:r>
+        <w:t>useful</w:t>
+      </w:r>
+      <w:proofErr w:type="gramEnd"/>
+      <w:r>
+        <w:t xml:space="preserve"> so it was left in the menu system.</w:t>
       </w:r>
     </w:p>
     <w:p>
@@ -2730,18 +4839,37 @@
         <w:pStyle w:val="Heading3"/>
       </w:pPr>
       <w:r>
-        <w:t xml:space="preserve">TX Send Max: </w:t>
-      </w:r>
-      <w:r>
-        <w:t>10-90 Sec</w:t>
-      </w:r>
-    </w:p>
-    <w:p>
-      <w:r>
-        <w:t xml:space="preserve">In </w:t>
-      </w:r>
-      <w:r>
-        <w:t>random mode this is the maximum send time.</w:t>
+        <w:t>New Version BIN File</w:t>
+      </w:r>
+    </w:p>
+    <w:p>
+      <w:r>
+        <w:t xml:space="preserve">New firmware can be loaded by putting </w:t>
+      </w:r>
+      <w:r>
+        <w:t xml:space="preserve">the binary file on the SD card. It must be named </w:t>
+      </w:r>
+      <w:proofErr w:type="spellStart"/>
+      <w:r>
+        <w:t>RadioFox.BIN</w:t>
+      </w:r>
+      <w:proofErr w:type="spellEnd"/>
+      <w:r>
+        <w:t>.</w:t>
+      </w:r>
+      <w:r>
+        <w:t xml:space="preserve"> There are two prompts, one to confirm </w:t>
+      </w:r>
+      <w:proofErr w:type="gramStart"/>
+      <w:r>
+        <w:t>overwriting</w:t>
+      </w:r>
+      <w:proofErr w:type="gramEnd"/>
+      <w:r>
+        <w:t xml:space="preserve"> the firmware, and another to allow deletion of the </w:t>
+      </w:r>
+      <w:r>
+        <w:t>BIN file after installation.</w:t>
       </w:r>
     </w:p>
     <w:p>
@@ -2749,12 +4877,24 @@
         <w:pStyle w:val="Heading3"/>
       </w:pPr>
       <w:r>
-        <w:t>TX Pause Min: 10-1200 Sec</w:t>
-      </w:r>
-    </w:p>
-    <w:p>
-      <w:r>
-        <w:t>In random mode this is the minimum pause time.</w:t>
+        <w:t>Factory Settings</w:t>
+      </w:r>
+    </w:p>
+    <w:p>
+      <w:r>
+        <w:t xml:space="preserve">This command resets </w:t>
+      </w:r>
+      <w:r>
+        <w:t xml:space="preserve">all </w:t>
+      </w:r>
+      <w:r>
+        <w:t>settings</w:t>
+      </w:r>
+      <w:r>
+        <w:t xml:space="preserve"> except the high battery value to the original factory values.</w:t>
+      </w:r>
+      <w:r>
+        <w:t xml:space="preserve"> The factory reset can also be done by holding the dial button down while turning the power on.</w:t>
       </w:r>
     </w:p>
     <w:p>
@@ -2762,56 +4902,35 @@
         <w:pStyle w:val="Heading3"/>
       </w:pPr>
       <w:r>
-        <w:t>TX Pause Max: 10-1200 Sec</w:t>
-      </w:r>
-    </w:p>
-    <w:p>
-      <w:r>
-        <w:t>In random mode this is the maximum pause time.</w:t>
-      </w:r>
-    </w:p>
-    <w:p>
-      <w:pPr>
-        <w:pStyle w:val="Heading3"/>
-      </w:pPr>
-      <w:r>
-        <w:t>TX Stop: Immediate|Finish Cycle</w:t>
-      </w:r>
-    </w:p>
-    <w:p>
-      <w:r>
-        <w:t>During transmit time the Beacon, Call Sign, and Audio are continuously sent. At the end of the transmission time this option controls whether the transmission stops immediately of waits to stop until the entire cycle is finished.</w:t>
-      </w:r>
-    </w:p>
-    <w:p/>
-    <w:p>
-      <w:r>
-        <w:t>A clever use of this command</w:t>
-      </w:r>
-      <w:r>
-        <w:t xml:space="preserve"> allows for only one cycle of beacon, ID, and music to be sent during each transmission time. Set the transmit</w:t>
-      </w:r>
-      <w:r>
-        <w:t xml:space="preserve"> time to something less than</w:t>
-      </w:r>
-      <w:r>
-        <w:t xml:space="preserve"> the time to perform a complete cycle and set this option to “Finish Cycle”. The transmit  cycle will begin, the timer will expire, but the current cycle will complete before stopping</w:t>
-      </w:r>
-      <w:r>
-        <w:t>.</w:t>
-      </w:r>
-    </w:p>
-    <w:p>
-      <w:pPr>
-        <w:pStyle w:val="Heading3"/>
-      </w:pPr>
-      <w:r>
-        <w:t>Radio Pause: Sleep|Awake</w:t>
-      </w:r>
-    </w:p>
-    <w:p>
-      <w:r>
-        <w:t>During pause time the radio can be put into sleep mode. This lowers the power consumption and lets the battery last longer. However note that this also means that the DTMF commands are disabled since the radio is asleep!</w:t>
+        <w:lastRenderedPageBreak/>
+        <w:t>Format EEPROM</w:t>
+      </w:r>
+    </w:p>
+    <w:p>
+      <w:r>
+        <w:t xml:space="preserve">This will clear </w:t>
+      </w:r>
+      <w:r>
+        <w:t xml:space="preserve">and reset </w:t>
+      </w:r>
+      <w:r>
+        <w:t xml:space="preserve">the </w:t>
+      </w:r>
+      <w:proofErr w:type="spellStart"/>
+      <w:r>
+        <w:t>eeprom</w:t>
+      </w:r>
+      <w:proofErr w:type="spellEnd"/>
+      <w:r>
+        <w:t xml:space="preserve"> where the settings are </w:t>
+      </w:r>
+      <w:proofErr w:type="gramStart"/>
+      <w:r>
+        <w:t>save</w:t>
+      </w:r>
+      <w:proofErr w:type="gramEnd"/>
+      <w:r>
+        <w:t xml:space="preserve"> in non-volatile memory. This is how settings are saved while the system is not powered.</w:t>
       </w:r>
     </w:p>
     <w:p>
@@ -2819,196 +4938,23 @@
         <w:pStyle w:val="Heading2"/>
       </w:pPr>
       <w:r>
-        <w:lastRenderedPageBreak/>
-        <w:t>+</w:t>
-      </w:r>
-      <w:r>
-        <w:t>More Radio Settings</w:t>
-      </w:r>
-    </w:p>
-    <w:p>
-      <w:pPr>
-        <w:pStyle w:val="Heading3"/>
-      </w:pPr>
-      <w:r>
-        <w:t>RX Offset: -600|0|+600 kHz</w:t>
-      </w:r>
-    </w:p>
-    <w:p>
-      <w:r>
-        <w:t>This is the frequency offset from the transmit frequency that the radio uses to receive DTMF commands</w:t>
-      </w:r>
-      <w:r>
-        <w:t>. An offset is recommended. If 0 is used the radio will only listen when it isn’t sending. It has not been tested if it listens during sending when the offset is not 0.</w:t>
-      </w:r>
-    </w:p>
-    <w:p>
-      <w:pPr>
-        <w:pStyle w:val="Heading3"/>
-      </w:pPr>
-      <w:r>
-        <w:t>Bandwidth: 12.5|</w:t>
-      </w:r>
-      <w:r>
-        <w:t>25 kHz</w:t>
-      </w:r>
-    </w:p>
-    <w:p>
-      <w:r>
-        <w:t>This sets the radio bandwidth</w:t>
-      </w:r>
-      <w:r>
-        <w:t>. It has not been tested much to see what effect it has on performance yet.</w:t>
-      </w:r>
-    </w:p>
-    <w:p>
-      <w:pPr>
-        <w:pStyle w:val="Heading3"/>
-      </w:pPr>
-      <w:r>
-        <w:t>CTCSS/DCS: CTCSS|DCS</w:t>
-      </w:r>
-    </w:p>
-    <w:p>
-      <w:r>
-        <w:t xml:space="preserve">This sets the </w:t>
-      </w:r>
-      <w:r>
-        <w:t>un-squelch</w:t>
-      </w:r>
-      <w:r>
-        <w:t xml:space="preserve"> values</w:t>
-      </w:r>
-      <w:r>
-        <w:t xml:space="preserve"> for either the analog or digital versions.</w:t>
-      </w:r>
-    </w:p>
-    <w:p>
-      <w:pPr>
-        <w:pStyle w:val="Heading3"/>
-      </w:pPr>
-      <w:r>
-        <w:t>TX CTCSS:</w:t>
-      </w:r>
-      <w:r>
-        <w:t xml:space="preserve"> None</w:t>
-      </w:r>
-      <w:r>
-        <w:t>|</w:t>
-      </w:r>
-      <w:r>
-        <w:t>67-</w:t>
-      </w:r>
-      <w:r>
-        <w:t>250.3</w:t>
-      </w:r>
-    </w:p>
-    <w:p>
-      <w:r>
-        <w:t>Analog un-squelch frequencies sent out.</w:t>
-      </w:r>
-    </w:p>
-    <w:p>
-      <w:pPr>
-        <w:pStyle w:val="Heading3"/>
-      </w:pPr>
-      <w:r>
-        <w:t>RX CTCSS:</w:t>
-      </w:r>
-      <w:r>
-        <w:t xml:space="preserve"> None|67-250.3</w:t>
-      </w:r>
-    </w:p>
-    <w:p>
-      <w:r>
-        <w:t>Analog un-squelch frequency for receiving.</w:t>
-      </w:r>
-    </w:p>
-    <w:p>
-      <w:pPr>
-        <w:pStyle w:val="Heading3"/>
-      </w:pPr>
-      <w:r>
-        <w:t>TX DCS:</w:t>
-      </w:r>
-      <w:r>
-        <w:t xml:space="preserve"> None|023-754</w:t>
-      </w:r>
-    </w:p>
-    <w:p>
-      <w:r>
-        <w:t>Digital un-squelch value for sending.</w:t>
-      </w:r>
-    </w:p>
-    <w:p>
-      <w:pPr>
-        <w:pStyle w:val="Heading3"/>
-      </w:pPr>
-      <w:r>
-        <w:t>TX I/N: I|N</w:t>
-      </w:r>
-    </w:p>
-    <w:p>
-      <w:r>
-        <w:t>The digital I or N value for sending.</w:t>
-      </w:r>
-    </w:p>
-    <w:p>
-      <w:pPr>
-        <w:pStyle w:val="Heading3"/>
-      </w:pPr>
-      <w:r>
-        <w:t>RX DCS: None|023-754</w:t>
-      </w:r>
-    </w:p>
-    <w:p>
-      <w:r>
-        <w:t>Digital un-squelch value for receiving.</w:t>
-      </w:r>
-    </w:p>
-    <w:p>
-      <w:pPr>
-        <w:pStyle w:val="Heading3"/>
-      </w:pPr>
-      <w:r>
-        <w:t>RX I/N: I|N</w:t>
-      </w:r>
-    </w:p>
-    <w:p>
-      <w:r>
-        <w:t>The digital I or N value for receiving.</w:t>
-      </w:r>
-    </w:p>
-    <w:p>
-      <w:pPr>
-        <w:pStyle w:val="Heading3"/>
-      </w:pPr>
-      <w:r>
-        <w:t>RX Volume:</w:t>
-      </w:r>
-      <w:r>
-        <w:t xml:space="preserve"> 1-6</w:t>
-      </w:r>
-    </w:p>
-    <w:p>
-      <w:r>
-        <w:t>This is the receive volume setting. It affects how well DTMF tones are detected.</w:t>
-      </w:r>
-    </w:p>
-    <w:p>
-      <w:pPr>
-        <w:pStyle w:val="Heading3"/>
-      </w:pPr>
-      <w:r>
-        <w:t>RX Squelch:</w:t>
-      </w:r>
-      <w:r>
-        <w:t xml:space="preserve"> 0-8</w:t>
-      </w:r>
-    </w:p>
-    <w:p>
-      <w:r>
-        <w:t>This affects how much signal is required to receive the DTMF signals.</w:t>
+        <w:t>Save Current Settings</w:t>
+      </w:r>
+    </w:p>
+    <w:p>
+      <w:r>
+        <w:t xml:space="preserve">This stores </w:t>
+      </w:r>
+      <w:proofErr w:type="gramStart"/>
+      <w:r>
+        <w:t>all of</w:t>
+      </w:r>
+      <w:proofErr w:type="gramEnd"/>
+      <w:r>
+        <w:t xml:space="preserve"> the current settings in the non-volatile memory</w:t>
+      </w:r>
+      <w:r>
+        <w:t>. Note that this is not often used since settings are normally saved each time they are changed.</w:t>
       </w:r>
     </w:p>
     <w:p>
@@ -3016,477 +4962,6 @@
         <w:pStyle w:val="Heading2"/>
       </w:pPr>
       <w:r>
-        <w:lastRenderedPageBreak/>
-        <w:t>Cancel Waits/TX Now</w:t>
-      </w:r>
-    </w:p>
-    <w:p>
-      <w:r>
-        <w:t>When the radio is in either send or pause mode this command will cancel the timer and the next mo</w:t>
-      </w:r>
-      <w:r>
-        <w:t>de will start. For example if you want to cancel</w:t>
-      </w:r>
-      <w:r>
-        <w:t xml:space="preserve"> the pause and go to transmit, use this option. It can also be done by long pressing B0.</w:t>
-      </w:r>
-    </w:p>
-    <w:p>
-      <w:pPr>
-        <w:pStyle w:val="Heading2"/>
-      </w:pPr>
-      <w:r>
-        <w:t>+Saved Settings Files</w:t>
-      </w:r>
-    </w:p>
-    <w:p>
-      <w:r>
-        <w:t>Saved settings files are named files stored on the SD card. They are useful to</w:t>
-      </w:r>
-      <w:r>
-        <w:t xml:space="preserve"> quickly configure the radio for different uses. All values except the battery calibration are affected.</w:t>
-      </w:r>
-    </w:p>
-    <w:p>
-      <w:pPr>
-        <w:pStyle w:val="Heading3"/>
-      </w:pPr>
-      <w:r>
-        <w:t>Create File</w:t>
-      </w:r>
-    </w:p>
-    <w:p>
-      <w:r>
-        <w:t>This prompts the user for a name. The file is then created using the current system settings.</w:t>
-      </w:r>
-    </w:p>
-    <w:p>
-      <w:pPr>
-        <w:pStyle w:val="Heading3"/>
-      </w:pPr>
-      <w:r>
-        <w:t>Save/Update File</w:t>
-      </w:r>
-    </w:p>
-    <w:p>
-      <w:r>
-        <w:t>This command saves the current settings into the selected file. If it already exists the user will be asked to confirm overwriting the file.</w:t>
-      </w:r>
-    </w:p>
-    <w:p>
-      <w:pPr>
-        <w:pStyle w:val="Heading3"/>
-      </w:pPr>
-      <w:r>
-        <w:t>Load File</w:t>
-      </w:r>
-    </w:p>
-    <w:p>
-      <w:r>
-        <w:t>This command asks the user for the name and then sets all of the system settings except the battery calibration using the values in the file.</w:t>
-      </w:r>
-    </w:p>
-    <w:p>
-      <w:pPr>
-        <w:pStyle w:val="Heading3"/>
-      </w:pPr>
-      <w:r>
-        <w:t>Delete File</w:t>
-      </w:r>
-    </w:p>
-    <w:p>
-      <w:r>
-        <w:t>The user selects a file from the list and then it can be deleted.</w:t>
-      </w:r>
-    </w:p>
-    <w:p>
-      <w:pPr>
-        <w:pStyle w:val="Heading2"/>
-      </w:pPr>
-      <w:r>
-        <w:t>+System Settings</w:t>
-      </w:r>
-    </w:p>
-    <w:p>
-      <w:pPr>
-        <w:pStyle w:val="Heading3"/>
-      </w:pPr>
-      <w:r>
-        <w:t>+Display</w:t>
-      </w:r>
-      <w:r>
-        <w:t xml:space="preserve"> Settings</w:t>
-      </w:r>
-    </w:p>
-    <w:p>
-      <w:pPr>
-        <w:pStyle w:val="Heading4"/>
-      </w:pPr>
-      <w:r>
-        <w:t>Dimming Mode: None</w:t>
-      </w:r>
-      <w:r>
-        <w:t>|Timer</w:t>
-      </w:r>
-    </w:p>
-    <w:p>
-      <w:r>
-        <w:t xml:space="preserve">The display can be set to dim automatically after a specified number of seconds. This is used to save battery power since the backlight </w:t>
-      </w:r>
-      <w:r>
-        <w:t>uses a significant amount.</w:t>
-      </w:r>
-    </w:p>
-    <w:p>
-      <w:pPr>
-        <w:pStyle w:val="Heading4"/>
-      </w:pPr>
-      <w:r>
-        <w:t>Bright Value: 1-100</w:t>
-      </w:r>
-      <w:r>
-        <w:t>%</w:t>
-      </w:r>
-    </w:p>
-    <w:p>
-      <w:r>
-        <w:t>Set the display brightness value.</w:t>
-      </w:r>
-    </w:p>
-    <w:p>
-      <w:pPr>
-        <w:pStyle w:val="Heading4"/>
-      </w:pPr>
-      <w:r>
-        <w:t xml:space="preserve">Dim Value: </w:t>
-      </w:r>
-      <w:r>
-        <w:t>0-100%</w:t>
-      </w:r>
-    </w:p>
-    <w:p>
-      <w:r>
-        <w:t xml:space="preserve">Set the display brightness after the </w:t>
-      </w:r>
-      <w:r>
-        <w:t>timer below expires.</w:t>
-      </w:r>
-    </w:p>
-    <w:p>
-      <w:pPr>
-        <w:pStyle w:val="Heading4"/>
-      </w:pPr>
-      <w:r>
-        <w:lastRenderedPageBreak/>
-        <w:t>Display Dim Time:</w:t>
-      </w:r>
-      <w:r>
-        <w:t xml:space="preserve"> 0-120 S</w:t>
-      </w:r>
-    </w:p>
-    <w:p>
-      <w:r>
-        <w:t>Specify the time until the display changes to dim mode.</w:t>
-      </w:r>
-    </w:p>
-    <w:p>
-      <w:pPr>
-        <w:pStyle w:val="Heading4"/>
-      </w:pPr>
-      <w:r>
-        <w:t>+Sideways Scroll Settings</w:t>
-      </w:r>
-    </w:p>
-    <w:p>
-      <w:r>
-        <w:t>Lines of text that too long for the display will scroll back and forth. The following settings control the speed.</w:t>
-      </w:r>
-    </w:p>
-    <w:p>
-      <w:pPr>
-        <w:pStyle w:val="Heading5"/>
-      </w:pPr>
-      <w:r>
-        <w:t xml:space="preserve">Speed: </w:t>
-      </w:r>
-      <w:r>
-        <w:t>1-1000 mS</w:t>
-      </w:r>
-    </w:p>
-    <w:p>
-      <w:r>
-        <w:t>Controls the speed of text moving to the left.</w:t>
-      </w:r>
-    </w:p>
-    <w:p>
-      <w:pPr>
-        <w:pStyle w:val="Heading5"/>
-      </w:pPr>
-      <w:r>
-        <w:t>Pause: 1-100</w:t>
-      </w:r>
-      <w:r>
-        <w:t xml:space="preserve"> mS</w:t>
-      </w:r>
-    </w:p>
-    <w:p>
-      <w:r>
-        <w:t>This controls the pause when the text is at the end (all the way to the left).</w:t>
-      </w:r>
-    </w:p>
-    <w:p>
-      <w:pPr>
-        <w:pStyle w:val="Heading5"/>
-      </w:pPr>
-      <w:r>
-        <w:t>Reverse Speed: 1-20x</w:t>
-      </w:r>
-    </w:p>
-    <w:p>
-      <w:r>
-        <w:t xml:space="preserve">This is how fast the text scrolls </w:t>
-      </w:r>
-      <w:r>
-        <w:t>back to the beginning (to the right). 2x means twice as fast as the text scroll</w:t>
-      </w:r>
-      <w:r>
-        <w:t>ed to the left</w:t>
-      </w:r>
-      <w:r>
-        <w:t>.</w:t>
-      </w:r>
-    </w:p>
-    <w:p>
-      <w:pPr>
-        <w:pStyle w:val="Heading4"/>
-      </w:pPr>
-      <w:r>
-        <w:t xml:space="preserve">Menu Selection: </w:t>
-      </w:r>
-      <w:r>
-        <w:t>Color|*</w:t>
-      </w:r>
-    </w:p>
-    <w:p>
-      <w:r>
-        <w:t>Menu selections</w:t>
-      </w:r>
-      <w:r>
-        <w:t xml:space="preserve"> and selections from a list can be either colored or marked with the ‘*’ character.</w:t>
-      </w:r>
-    </w:p>
-    <w:p>
-      <w:pPr>
-        <w:pStyle w:val="Heading4"/>
-      </w:pPr>
-      <w:r>
-        <w:t>Text/HiLite Colors</w:t>
-      </w:r>
-    </w:p>
-    <w:p>
-      <w:r>
-        <w:t>This selection allows for choosing the colors of the text and the highlight. The background screen is always black.</w:t>
-      </w:r>
-    </w:p>
-    <w:p>
-      <w:pPr>
-        <w:pStyle w:val="Heading3"/>
-      </w:pPr>
-      <w:r>
-        <w:t>+Dial &amp; Button Settings</w:t>
-      </w:r>
-    </w:p>
-    <w:p>
-      <w:pPr>
-        <w:pStyle w:val="Heading4"/>
-      </w:pPr>
-      <w:r>
-        <w:t>Direction: Normal:Reverse</w:t>
-      </w:r>
-    </w:p>
-    <w:p>
-      <w:r>
-        <w:t>If you really want the button to be the other way around this is the choice for you.</w:t>
-      </w:r>
-    </w:p>
-    <w:p>
-      <w:pPr>
-        <w:pStyle w:val="Heading4"/>
-      </w:pPr>
-      <w:r>
-        <w:t>Long Press Timer: 2-200</w:t>
-      </w:r>
-    </w:p>
-    <w:p>
-      <w:r>
-        <w:t>This value affects how long or short a long press is. The default value is normally OK</w:t>
-      </w:r>
-      <w:r>
-        <w:t>, but somebody might want to change it.</w:t>
-      </w:r>
-    </w:p>
-    <w:p>
-      <w:pPr>
-        <w:pStyle w:val="Heading3"/>
-      </w:pPr>
-      <w:r>
-        <w:t>+Battery Settings</w:t>
-      </w:r>
-    </w:p>
-    <w:p>
-      <w:r>
-        <w:t>Since the PCB was designed with 10% resistors for measuring the battery voltage some calibration is needed. A future PCB will probably use better resistors so this won’t be needed.</w:t>
-      </w:r>
-    </w:p>
-    <w:p>
-      <w:pPr>
-        <w:pStyle w:val="Heading4"/>
-      </w:pPr>
-      <w:r>
-        <w:t>Show Battery: Yes|No</w:t>
-      </w:r>
-    </w:p>
-    <w:p>
-      <w:r>
-        <w:t xml:space="preserve">This option controls the </w:t>
-      </w:r>
-      <w:r>
-        <w:t>battery display on the bottom right of the display.</w:t>
-      </w:r>
-    </w:p>
-    <w:p>
-      <w:pPr>
-        <w:pStyle w:val="Heading4"/>
-      </w:pPr>
-      <w:r>
-        <w:lastRenderedPageBreak/>
-        <w:t>Full Battery: 2000-4000</w:t>
-      </w:r>
-    </w:p>
-    <w:p>
-      <w:r>
-        <w:t>This is the value that indicates a full 4.2V battery.</w:t>
-      </w:r>
-    </w:p>
-    <w:p>
-      <w:pPr>
-        <w:pStyle w:val="Heading4"/>
-      </w:pPr>
-      <w:r>
-        <w:t>Set Full Battery</w:t>
-      </w:r>
-    </w:p>
-    <w:p>
-      <w:r>
-        <w:t>This selection reads the current battery values and stores it. It is best set by fully charging the battery and then disconnecting the charger. Wait a couple of minutes and then use it several times until it seems stable.</w:t>
-      </w:r>
-    </w:p>
-    <w:p>
-      <w:pPr>
-        <w:pStyle w:val="Heading4"/>
-      </w:pPr>
-      <w:r>
-        <w:t>Read Battery Raw Data</w:t>
-      </w:r>
-    </w:p>
-    <w:p>
-      <w:r>
-        <w:t>This continuously reads the battery value</w:t>
-      </w:r>
-      <w:r>
-        <w:t>. It was originally used for testing, but it seems like it might possibly be useful so it was left in the menu system.</w:t>
-      </w:r>
-    </w:p>
-    <w:p>
-      <w:pPr>
-        <w:pStyle w:val="Heading3"/>
-      </w:pPr>
-      <w:r>
-        <w:t>New Version BIN File</w:t>
-      </w:r>
-    </w:p>
-    <w:p>
-      <w:r>
-        <w:t xml:space="preserve">New firmware can be loaded by putting </w:t>
-      </w:r>
-      <w:r>
-        <w:t>the binary file on the SD card. It must be named RadioFox.BIN.</w:t>
-      </w:r>
-      <w:r>
-        <w:t xml:space="preserve"> There are two prompts, one to confirm overwriting the firmware, and another to allow deletion of the </w:t>
-      </w:r>
-      <w:r>
-        <w:t>BIN file after installation.</w:t>
-      </w:r>
-    </w:p>
-    <w:p>
-      <w:pPr>
-        <w:pStyle w:val="Heading3"/>
-      </w:pPr>
-      <w:r>
-        <w:t>Factory Settings</w:t>
-      </w:r>
-    </w:p>
-    <w:p>
-      <w:r>
-        <w:t xml:space="preserve">This command resets </w:t>
-      </w:r>
-      <w:r>
-        <w:t xml:space="preserve">all </w:t>
-      </w:r>
-      <w:r>
-        <w:t>settings</w:t>
-      </w:r>
-      <w:r>
-        <w:t xml:space="preserve"> except the high battery value to the original factory values.</w:t>
-      </w:r>
-      <w:r>
-        <w:t xml:space="preserve"> The factory reset can also be done by holding the dial button down while turning the power on.</w:t>
-      </w:r>
-    </w:p>
-    <w:p>
-      <w:pPr>
-        <w:pStyle w:val="Heading3"/>
-      </w:pPr>
-      <w:r>
-        <w:t>Format EEPROM</w:t>
-      </w:r>
-    </w:p>
-    <w:p>
-      <w:r>
-        <w:t xml:space="preserve">This will clear </w:t>
-      </w:r>
-      <w:r>
-        <w:t xml:space="preserve">and reset </w:t>
-      </w:r>
-      <w:r>
-        <w:t>the eeprom where the settings are save</w:t>
-      </w:r>
-      <w:r>
-        <w:t xml:space="preserve"> in non-volatile memory. This is how settings are saved while the system is not powered.</w:t>
-      </w:r>
-    </w:p>
-    <w:p>
-      <w:pPr>
-        <w:pStyle w:val="Heading2"/>
-      </w:pPr>
-      <w:r>
-        <w:t>Save Current Settings</w:t>
-      </w:r>
-    </w:p>
-    <w:p>
-      <w:r>
-        <w:t>This stores all of the current settings in the non-volatile memory</w:t>
-      </w:r>
-      <w:r>
-        <w:t>. Note that this is not often used since settings are normally saved each time they are changed.</w:t>
-      </w:r>
-    </w:p>
-    <w:p>
-      <w:pPr>
-        <w:pStyle w:val="Heading2"/>
-      </w:pPr>
-      <w:r>
         <w:t>Reboot</w:t>
       </w:r>
     </w:p>
@@ -3496,7 +4971,7 @@
       </w:r>
     </w:p>
     <w:sectPr>
-      <w:footerReference w:type="default" r:id="rId10"/>
+      <w:footerReference w:type="default" r:id="rId11"/>
       <w:pgSz w:w="12240" w:h="15840"/>
       <w:pgMar w:top="1440" w:right="1440" w:bottom="1440" w:left="1440" w:header="720" w:footer="720" w:gutter="0"/>
       <w:pgNumType w:start="1"/>
@@ -3507,7 +4982,7 @@
 </file>
 
 <file path=word/endnotes.xml><?xml version="1.0" encoding="utf-8"?>
-<w:endnotes xmlns:wpc="http://schemas.microsoft.com/office/word/2010/wordprocessingCanvas" xmlns:cx="http://schemas.microsoft.com/office/drawing/2014/chartex" xmlns:cx1="http://schemas.microsoft.com/office/drawing/2015/9/8/chartex" xmlns:cx2="http://schemas.microsoft.com/office/drawing/2015/10/21/chartex" xmlns:cx3="http://schemas.microsoft.com/office/drawing/2016/5/9/chartex" xmlns:cx4="http://schemas.microsoft.com/office/drawing/2016/5/10/chartex" xmlns:cx5="http://schemas.microsoft.com/office/drawing/2016/5/11/chartex" xmlns:cx6="http://schemas.microsoft.com/office/drawing/2016/5/12/chartex" xmlns:cx7="http://schemas.microsoft.com/office/drawing/2016/5/13/chartex" xmlns:cx8="http://schemas.microsoft.com/office/drawing/2016/5/14/chartex" xmlns:mc="http://schemas.openxmlformats.org/markup-compatibility/2006" xmlns:aink="http://schemas.microsoft.com/office/drawing/2016/ink" xmlns:am3d="http://schemas.microsoft.com/office/drawing/2017/model3d" xmlns:o="urn:schemas-microsoft-com:office:office" xmlns:oel="http://schemas.microsoft.com/office/2019/extlst" xmlns:r="http://schemas.openxmlformats.org/officeDocument/2006/relationships" xmlns:m="http://schemas.openxmlformats.org/officeDocument/2006/math" xmlns:v="urn:schemas-microsoft-com:vml" xmlns:wp14="http://schemas.microsoft.com/office/word/2010/wordprocessingDrawing" xmlns:wp="http://schemas.openxmlformats.org/drawingml/2006/wordprocessingDrawing" xmlns:w10="urn:schemas-microsoft-com:office:word" xmlns:w="http://schemas.openxmlformats.org/wordprocessingml/2006/main" xmlns:w14="http://schemas.microsoft.com/office/word/2010/wordml" xmlns:w15="http://schemas.microsoft.com/office/word/2012/wordml" xmlns:w16cex="http://schemas.microsoft.com/office/word/2018/wordml/cex" xmlns:w16cid="http://schemas.microsoft.com/office/word/2016/wordml/cid" xmlns:w16="http://schemas.microsoft.com/office/word/2018/wordml" xmlns:w16du="http://schemas.microsoft.com/office/word/2023/wordml/word16du" xmlns:w16sdtdh="http://schemas.microsoft.com/office/word/2020/wordml/sdtdatahash" xmlns:w16se="http://schemas.microsoft.com/office/word/2015/wordml/symex" xmlns:wpg="http://schemas.microsoft.com/office/word/2010/wordprocessingGroup" xmlns:wpi="http://schemas.microsoft.com/office/word/2010/wordprocessingInk" xmlns:wne="http://schemas.microsoft.com/office/word/2006/wordml" xmlns:wps="http://schemas.microsoft.com/office/word/2010/wordprocessingShape" mc:Ignorable="w14 w15 w16se w16cid w16 w16cex w16sdtdh w16du wp14">
+<w:endnotes xmlns:wpc="http://schemas.microsoft.com/office/word/2010/wordprocessingCanvas" xmlns:cx="http://schemas.microsoft.com/office/drawing/2014/chartex" xmlns:cx1="http://schemas.microsoft.com/office/drawing/2015/9/8/chartex" xmlns:cx2="http://schemas.microsoft.com/office/drawing/2015/10/21/chartex" xmlns:cx3="http://schemas.microsoft.com/office/drawing/2016/5/9/chartex" xmlns:cx4="http://schemas.microsoft.com/office/drawing/2016/5/10/chartex" xmlns:cx5="http://schemas.microsoft.com/office/drawing/2016/5/11/chartex" xmlns:cx6="http://schemas.microsoft.com/office/drawing/2016/5/12/chartex" xmlns:cx7="http://schemas.microsoft.com/office/drawing/2016/5/13/chartex" xmlns:cx8="http://schemas.microsoft.com/office/drawing/2016/5/14/chartex" xmlns:mc="http://schemas.openxmlformats.org/markup-compatibility/2006" xmlns:aink="http://schemas.microsoft.com/office/drawing/2016/ink" xmlns:am3d="http://schemas.microsoft.com/office/drawing/2017/model3d" xmlns:o="urn:schemas-microsoft-com:office:office" xmlns:oel="http://schemas.microsoft.com/office/2019/extlst" xmlns:r="http://schemas.openxmlformats.org/officeDocument/2006/relationships" xmlns:m="http://schemas.openxmlformats.org/officeDocument/2006/math" xmlns:v="urn:schemas-microsoft-com:vml" xmlns:wp14="http://schemas.microsoft.com/office/word/2010/wordprocessingDrawing" xmlns:wp="http://schemas.openxmlformats.org/drawingml/2006/wordprocessingDrawing" xmlns:w10="urn:schemas-microsoft-com:office:word" xmlns:w="http://schemas.openxmlformats.org/wordprocessingml/2006/main" xmlns:w14="http://schemas.microsoft.com/office/word/2010/wordml" xmlns:w15="http://schemas.microsoft.com/office/word/2012/wordml" xmlns:w16cex="http://schemas.microsoft.com/office/word/2018/wordml/cex" xmlns:w16cid="http://schemas.microsoft.com/office/word/2016/wordml/cid" xmlns:w16="http://schemas.microsoft.com/office/word/2018/wordml" xmlns:w16du="http://schemas.microsoft.com/office/word/2023/wordml/word16du" xmlns:w16sdtdh="http://schemas.microsoft.com/office/word/2020/wordml/sdtdatahash" xmlns:w16sdtfl="http://schemas.microsoft.com/office/word/2024/wordml/sdtformatlock" xmlns:w16se="http://schemas.microsoft.com/office/word/2015/wordml/symex" xmlns:wpg="http://schemas.microsoft.com/office/word/2010/wordprocessingGroup" xmlns:wpi="http://schemas.microsoft.com/office/word/2010/wordprocessingInk" xmlns:wne="http://schemas.microsoft.com/office/word/2006/wordml" xmlns:wps="http://schemas.microsoft.com/office/word/2010/wordprocessingShape" mc:Ignorable="w14 w15 w16se w16cid w16 w16cex w16sdtdh w16sdtfl w16du wp14">
   <w:endnote w:type="separator" w:id="-1">
     <w:p>
       <w:pPr>
@@ -3532,7 +5007,7 @@
 </file>
 
 <file path=word/footer1.xml><?xml version="1.0" encoding="utf-8"?>
-<w:ftr xmlns:wpc="http://schemas.microsoft.com/office/word/2010/wordprocessingCanvas" xmlns:cx="http://schemas.microsoft.com/office/drawing/2014/chartex" xmlns:cx1="http://schemas.microsoft.com/office/drawing/2015/9/8/chartex" xmlns:cx2="http://schemas.microsoft.com/office/drawing/2015/10/21/chartex" xmlns:cx3="http://schemas.microsoft.com/office/drawing/2016/5/9/chartex" xmlns:cx4="http://schemas.microsoft.com/office/drawing/2016/5/10/chartex" xmlns:cx5="http://schemas.microsoft.com/office/drawing/2016/5/11/chartex" xmlns:cx6="http://schemas.microsoft.com/office/drawing/2016/5/12/chartex" xmlns:cx7="http://schemas.microsoft.com/office/drawing/2016/5/13/chartex" xmlns:cx8="http://schemas.microsoft.com/office/drawing/2016/5/14/chartex" xmlns:mc="http://schemas.openxmlformats.org/markup-compatibility/2006" xmlns:aink="http://schemas.microsoft.com/office/drawing/2016/ink" xmlns:am3d="http://schemas.microsoft.com/office/drawing/2017/model3d" xmlns:o="urn:schemas-microsoft-com:office:office" xmlns:oel="http://schemas.microsoft.com/office/2019/extlst" xmlns:r="http://schemas.openxmlformats.org/officeDocument/2006/relationships" xmlns:m="http://schemas.openxmlformats.org/officeDocument/2006/math" xmlns:v="urn:schemas-microsoft-com:vml" xmlns:wp14="http://schemas.microsoft.com/office/word/2010/wordprocessingDrawing" xmlns:wp="http://schemas.openxmlformats.org/drawingml/2006/wordprocessingDrawing" xmlns:w10="urn:schemas-microsoft-com:office:word" xmlns:w="http://schemas.openxmlformats.org/wordprocessingml/2006/main" xmlns:w14="http://schemas.microsoft.com/office/word/2010/wordml" xmlns:w15="http://schemas.microsoft.com/office/word/2012/wordml" xmlns:w16cex="http://schemas.microsoft.com/office/word/2018/wordml/cex" xmlns:w16cid="http://schemas.microsoft.com/office/word/2016/wordml/cid" xmlns:w16="http://schemas.microsoft.com/office/word/2018/wordml" xmlns:w16du="http://schemas.microsoft.com/office/word/2023/wordml/word16du" xmlns:w16sdtdh="http://schemas.microsoft.com/office/word/2020/wordml/sdtdatahash" xmlns:w16se="http://schemas.microsoft.com/office/word/2015/wordml/symex" xmlns:wpg="http://schemas.microsoft.com/office/word/2010/wordprocessingGroup" xmlns:wpi="http://schemas.microsoft.com/office/word/2010/wordprocessingInk" xmlns:wne="http://schemas.microsoft.com/office/word/2006/wordml" xmlns:wps="http://schemas.microsoft.com/office/word/2010/wordprocessingShape" mc:Ignorable="w14 w15 w16se w16cid w16 w16cex w16sdtdh w16du wp14">
+<w:ftr xmlns:wpc="http://schemas.microsoft.com/office/word/2010/wordprocessingCanvas" xmlns:cx="http://schemas.microsoft.com/office/drawing/2014/chartex" xmlns:cx1="http://schemas.microsoft.com/office/drawing/2015/9/8/chartex" xmlns:cx2="http://schemas.microsoft.com/office/drawing/2015/10/21/chartex" xmlns:cx3="http://schemas.microsoft.com/office/drawing/2016/5/9/chartex" xmlns:cx4="http://schemas.microsoft.com/office/drawing/2016/5/10/chartex" xmlns:cx5="http://schemas.microsoft.com/office/drawing/2016/5/11/chartex" xmlns:cx6="http://schemas.microsoft.com/office/drawing/2016/5/12/chartex" xmlns:cx7="http://schemas.microsoft.com/office/drawing/2016/5/13/chartex" xmlns:cx8="http://schemas.microsoft.com/office/drawing/2016/5/14/chartex" xmlns:mc="http://schemas.openxmlformats.org/markup-compatibility/2006" xmlns:aink="http://schemas.microsoft.com/office/drawing/2016/ink" xmlns:am3d="http://schemas.microsoft.com/office/drawing/2017/model3d" xmlns:o="urn:schemas-microsoft-com:office:office" xmlns:oel="http://schemas.microsoft.com/office/2019/extlst" xmlns:r="http://schemas.openxmlformats.org/officeDocument/2006/relationships" xmlns:m="http://schemas.openxmlformats.org/officeDocument/2006/math" xmlns:v="urn:schemas-microsoft-com:vml" xmlns:wp14="http://schemas.microsoft.com/office/word/2010/wordprocessingDrawing" xmlns:wp="http://schemas.openxmlformats.org/drawingml/2006/wordprocessingDrawing" xmlns:w10="urn:schemas-microsoft-com:office:word" xmlns:w="http://schemas.openxmlformats.org/wordprocessingml/2006/main" xmlns:w14="http://schemas.microsoft.com/office/word/2010/wordml" xmlns:w15="http://schemas.microsoft.com/office/word/2012/wordml" xmlns:w16cex="http://schemas.microsoft.com/office/word/2018/wordml/cex" xmlns:w16cid="http://schemas.microsoft.com/office/word/2016/wordml/cid" xmlns:w16="http://schemas.microsoft.com/office/word/2018/wordml" xmlns:w16du="http://schemas.microsoft.com/office/word/2023/wordml/word16du" xmlns:w16sdtdh="http://schemas.microsoft.com/office/word/2020/wordml/sdtdatahash" xmlns:w16sdtfl="http://schemas.microsoft.com/office/word/2024/wordml/sdtformatlock" xmlns:w16se="http://schemas.microsoft.com/office/word/2015/wordml/symex" xmlns:wpg="http://schemas.microsoft.com/office/word/2010/wordprocessingGroup" xmlns:wpi="http://schemas.microsoft.com/office/word/2010/wordprocessingInk" xmlns:wne="http://schemas.microsoft.com/office/word/2006/wordml" xmlns:wps="http://schemas.microsoft.com/office/word/2010/wordprocessingShape" mc:Ignorable="w14 w15 w16se w16cid w16 w16cex w16sdtdh w16sdtfl w16du wp14">
   <w:sdt>
     <w:sdtPr>
       <w:id w:val="-1635484502"/>
@@ -3663,7 +5138,7 @@
 </file>
 
 <file path=word/footnotes.xml><?xml version="1.0" encoding="utf-8"?>
-<w:footnotes xmlns:wpc="http://schemas.microsoft.com/office/word/2010/wordprocessingCanvas" xmlns:cx="http://schemas.microsoft.com/office/drawing/2014/chartex" xmlns:cx1="http://schemas.microsoft.com/office/drawing/2015/9/8/chartex" xmlns:cx2="http://schemas.microsoft.com/office/drawing/2015/10/21/chartex" xmlns:cx3="http://schemas.microsoft.com/office/drawing/2016/5/9/chartex" xmlns:cx4="http://schemas.microsoft.com/office/drawing/2016/5/10/chartex" xmlns:cx5="http://schemas.microsoft.com/office/drawing/2016/5/11/chartex" xmlns:cx6="http://schemas.microsoft.com/office/drawing/2016/5/12/chartex" xmlns:cx7="http://schemas.microsoft.com/office/drawing/2016/5/13/chartex" xmlns:cx8="http://schemas.microsoft.com/office/drawing/2016/5/14/chartex" xmlns:mc="http://schemas.openxmlformats.org/markup-compatibility/2006" xmlns:aink="http://schemas.microsoft.com/office/drawing/2016/ink" xmlns:am3d="http://schemas.microsoft.com/office/drawing/2017/model3d" xmlns:o="urn:schemas-microsoft-com:office:office" xmlns:oel="http://schemas.microsoft.com/office/2019/extlst" xmlns:r="http://schemas.openxmlformats.org/officeDocument/2006/relationships" xmlns:m="http://schemas.openxmlformats.org/officeDocument/2006/math" xmlns:v="urn:schemas-microsoft-com:vml" xmlns:wp14="http://schemas.microsoft.com/office/word/2010/wordprocessingDrawing" xmlns:wp="http://schemas.openxmlformats.org/drawingml/2006/wordprocessingDrawing" xmlns:w10="urn:schemas-microsoft-com:office:word" xmlns:w="http://schemas.openxmlformats.org/wordprocessingml/2006/main" xmlns:w14="http://schemas.microsoft.com/office/word/2010/wordml" xmlns:w15="http://schemas.microsoft.com/office/word/2012/wordml" xmlns:w16cex="http://schemas.microsoft.com/office/word/2018/wordml/cex" xmlns:w16cid="http://schemas.microsoft.com/office/word/2016/wordml/cid" xmlns:w16="http://schemas.microsoft.com/office/word/2018/wordml" xmlns:w16du="http://schemas.microsoft.com/office/word/2023/wordml/word16du" xmlns:w16sdtdh="http://schemas.microsoft.com/office/word/2020/wordml/sdtdatahash" xmlns:w16se="http://schemas.microsoft.com/office/word/2015/wordml/symex" xmlns:wpg="http://schemas.microsoft.com/office/word/2010/wordprocessingGroup" xmlns:wpi="http://schemas.microsoft.com/office/word/2010/wordprocessingInk" xmlns:wne="http://schemas.microsoft.com/office/word/2006/wordml" xmlns:wps="http://schemas.microsoft.com/office/word/2010/wordprocessingShape" mc:Ignorable="w14 w15 w16se w16cid w16 w16cex w16sdtdh w16du wp14">
+<w:footnotes xmlns:wpc="http://schemas.microsoft.com/office/word/2010/wordprocessingCanvas" xmlns:cx="http://schemas.microsoft.com/office/drawing/2014/chartex" xmlns:cx1="http://schemas.microsoft.com/office/drawing/2015/9/8/chartex" xmlns:cx2="http://schemas.microsoft.com/office/drawing/2015/10/21/chartex" xmlns:cx3="http://schemas.microsoft.com/office/drawing/2016/5/9/chartex" xmlns:cx4="http://schemas.microsoft.com/office/drawing/2016/5/10/chartex" xmlns:cx5="http://schemas.microsoft.com/office/drawing/2016/5/11/chartex" xmlns:cx6="http://schemas.microsoft.com/office/drawing/2016/5/12/chartex" xmlns:cx7="http://schemas.microsoft.com/office/drawing/2016/5/13/chartex" xmlns:cx8="http://schemas.microsoft.com/office/drawing/2016/5/14/chartex" xmlns:mc="http://schemas.openxmlformats.org/markup-compatibility/2006" xmlns:aink="http://schemas.microsoft.com/office/drawing/2016/ink" xmlns:am3d="http://schemas.microsoft.com/office/drawing/2017/model3d" xmlns:o="urn:schemas-microsoft-com:office:office" xmlns:oel="http://schemas.microsoft.com/office/2019/extlst" xmlns:r="http://schemas.openxmlformats.org/officeDocument/2006/relationships" xmlns:m="http://schemas.openxmlformats.org/officeDocument/2006/math" xmlns:v="urn:schemas-microsoft-com:vml" xmlns:wp14="http://schemas.microsoft.com/office/word/2010/wordprocessingDrawing" xmlns:wp="http://schemas.openxmlformats.org/drawingml/2006/wordprocessingDrawing" xmlns:w10="urn:schemas-microsoft-com:office:word" xmlns:w="http://schemas.openxmlformats.org/wordprocessingml/2006/main" xmlns:w14="http://schemas.microsoft.com/office/word/2010/wordml" xmlns:w15="http://schemas.microsoft.com/office/word/2012/wordml" xmlns:w16cex="http://schemas.microsoft.com/office/word/2018/wordml/cex" xmlns:w16cid="http://schemas.microsoft.com/office/word/2016/wordml/cid" xmlns:w16="http://schemas.microsoft.com/office/word/2018/wordml" xmlns:w16du="http://schemas.microsoft.com/office/word/2023/wordml/word16du" xmlns:w16sdtdh="http://schemas.microsoft.com/office/word/2020/wordml/sdtdatahash" xmlns:w16sdtfl="http://schemas.microsoft.com/office/word/2024/wordml/sdtformatlock" xmlns:w16se="http://schemas.microsoft.com/office/word/2015/wordml/symex" xmlns:wpg="http://schemas.microsoft.com/office/word/2010/wordprocessingGroup" xmlns:wpi="http://schemas.microsoft.com/office/word/2010/wordprocessingInk" xmlns:wne="http://schemas.microsoft.com/office/word/2006/wordml" xmlns:wps="http://schemas.microsoft.com/office/word/2010/wordprocessingShape" mc:Ignorable="w14 w15 w16se w16cid w16 w16cex w16sdtdh w16sdtfl w16du wp14">
   <w:footnote w:type="separator" w:id="-1">
     <w:p>
       <w:pPr>
@@ -3688,7 +5163,7 @@
 </file>
 
 <file path=word/numbering.xml><?xml version="1.0" encoding="utf-8"?>
-<w:numbering xmlns:wpc="http://schemas.microsoft.com/office/word/2010/wordprocessingCanvas" xmlns:cx="http://schemas.microsoft.com/office/drawing/2014/chartex" xmlns:cx1="http://schemas.microsoft.com/office/drawing/2015/9/8/chartex" xmlns:cx2="http://schemas.microsoft.com/office/drawing/2015/10/21/chartex" xmlns:cx3="http://schemas.microsoft.com/office/drawing/2016/5/9/chartex" xmlns:cx4="http://schemas.microsoft.com/office/drawing/2016/5/10/chartex" xmlns:cx5="http://schemas.microsoft.com/office/drawing/2016/5/11/chartex" xmlns:cx6="http://schemas.microsoft.com/office/drawing/2016/5/12/chartex" xmlns:cx7="http://schemas.microsoft.com/office/drawing/2016/5/13/chartex" xmlns:cx8="http://schemas.microsoft.com/office/drawing/2016/5/14/chartex" xmlns:mc="http://schemas.openxmlformats.org/markup-compatibility/2006" xmlns:aink="http://schemas.microsoft.com/office/drawing/2016/ink" xmlns:am3d="http://schemas.microsoft.com/office/drawing/2017/model3d" xmlns:o="urn:schemas-microsoft-com:office:office" xmlns:oel="http://schemas.microsoft.com/office/2019/extlst" xmlns:r="http://schemas.openxmlformats.org/officeDocument/2006/relationships" xmlns:m="http://schemas.openxmlformats.org/officeDocument/2006/math" xmlns:v="urn:schemas-microsoft-com:vml" xmlns:wp14="http://schemas.microsoft.com/office/word/2010/wordprocessingDrawing" xmlns:wp="http://schemas.openxmlformats.org/drawingml/2006/wordprocessingDrawing" xmlns:w10="urn:schemas-microsoft-com:office:word" xmlns:w="http://schemas.openxmlformats.org/wordprocessingml/2006/main" xmlns:w14="http://schemas.microsoft.com/office/word/2010/wordml" xmlns:w15="http://schemas.microsoft.com/office/word/2012/wordml" xmlns:w16cex="http://schemas.microsoft.com/office/word/2018/wordml/cex" xmlns:w16cid="http://schemas.microsoft.com/office/word/2016/wordml/cid" xmlns:w16="http://schemas.microsoft.com/office/word/2018/wordml" xmlns:w16du="http://schemas.microsoft.com/office/word/2023/wordml/word16du" xmlns:w16sdtdh="http://schemas.microsoft.com/office/word/2020/wordml/sdtdatahash" xmlns:w16se="http://schemas.microsoft.com/office/word/2015/wordml/symex" xmlns:wpg="http://schemas.microsoft.com/office/word/2010/wordprocessingGroup" xmlns:wpi="http://schemas.microsoft.com/office/word/2010/wordprocessingInk" xmlns:wne="http://schemas.microsoft.com/office/word/2006/wordml" xmlns:wps="http://schemas.microsoft.com/office/word/2010/wordprocessingShape" mc:Ignorable="w14 w15 w16se w16cid w16 w16cex w16sdtdh w16du wp14">
+<w:numbering xmlns:wpc="http://schemas.microsoft.com/office/word/2010/wordprocessingCanvas" xmlns:cx="http://schemas.microsoft.com/office/drawing/2014/chartex" xmlns:cx1="http://schemas.microsoft.com/office/drawing/2015/9/8/chartex" xmlns:cx2="http://schemas.microsoft.com/office/drawing/2015/10/21/chartex" xmlns:cx3="http://schemas.microsoft.com/office/drawing/2016/5/9/chartex" xmlns:cx4="http://schemas.microsoft.com/office/drawing/2016/5/10/chartex" xmlns:cx5="http://schemas.microsoft.com/office/drawing/2016/5/11/chartex" xmlns:cx6="http://schemas.microsoft.com/office/drawing/2016/5/12/chartex" xmlns:cx7="http://schemas.microsoft.com/office/drawing/2016/5/13/chartex" xmlns:cx8="http://schemas.microsoft.com/office/drawing/2016/5/14/chartex" xmlns:mc="http://schemas.openxmlformats.org/markup-compatibility/2006" xmlns:aink="http://schemas.microsoft.com/office/drawing/2016/ink" xmlns:am3d="http://schemas.microsoft.com/office/drawing/2017/model3d" xmlns:o="urn:schemas-microsoft-com:office:office" xmlns:oel="http://schemas.microsoft.com/office/2019/extlst" xmlns:r="http://schemas.openxmlformats.org/officeDocument/2006/relationships" xmlns:m="http://schemas.openxmlformats.org/officeDocument/2006/math" xmlns:v="urn:schemas-microsoft-com:vml" xmlns:wp14="http://schemas.microsoft.com/office/word/2010/wordprocessingDrawing" xmlns:wp="http://schemas.openxmlformats.org/drawingml/2006/wordprocessingDrawing" xmlns:w10="urn:schemas-microsoft-com:office:word" xmlns:w="http://schemas.openxmlformats.org/wordprocessingml/2006/main" xmlns:w14="http://schemas.microsoft.com/office/word/2010/wordml" xmlns:w15="http://schemas.microsoft.com/office/word/2012/wordml" xmlns:w16cex="http://schemas.microsoft.com/office/word/2018/wordml/cex" xmlns:w16cid="http://schemas.microsoft.com/office/word/2016/wordml/cid" xmlns:w16="http://schemas.microsoft.com/office/word/2018/wordml" xmlns:w16du="http://schemas.microsoft.com/office/word/2023/wordml/word16du" xmlns:w16sdtdh="http://schemas.microsoft.com/office/word/2020/wordml/sdtdatahash" xmlns:w16sdtfl="http://schemas.microsoft.com/office/word/2024/wordml/sdtformatlock" xmlns:w16se="http://schemas.microsoft.com/office/word/2015/wordml/symex" xmlns:wpg="http://schemas.microsoft.com/office/word/2010/wordprocessingGroup" xmlns:wpi="http://schemas.microsoft.com/office/word/2010/wordprocessingInk" xmlns:wne="http://schemas.microsoft.com/office/word/2006/wordml" xmlns:wps="http://schemas.microsoft.com/office/word/2010/wordprocessingShape" mc:Ignorable="w14 w15 w16se w16cid w16 w16cex w16sdtdh w16sdtfl w16du wp14">
   <w:abstractNum w:abstractNumId="0" w15:restartNumberingAfterBreak="0">
     <w:nsid w:val="006D7728"/>
     <w:multiLevelType w:val="hybridMultilevel"/>
@@ -15073,7 +16548,7 @@
 </file>
 
 <file path=word/styles.xml><?xml version="1.0" encoding="utf-8"?>
-<w:styles xmlns:mc="http://schemas.openxmlformats.org/markup-compatibility/2006" xmlns:r="http://schemas.openxmlformats.org/officeDocument/2006/relationships" xmlns:w="http://schemas.openxmlformats.org/wordprocessingml/2006/main" xmlns:w14="http://schemas.microsoft.com/office/word/2010/wordml" xmlns:w15="http://schemas.microsoft.com/office/word/2012/wordml" xmlns:w16cex="http://schemas.microsoft.com/office/word/2018/wordml/cex" xmlns:w16cid="http://schemas.microsoft.com/office/word/2016/wordml/cid" xmlns:w16="http://schemas.microsoft.com/office/word/2018/wordml" xmlns:w16du="http://schemas.microsoft.com/office/word/2023/wordml/word16du" xmlns:w16sdtdh="http://schemas.microsoft.com/office/word/2020/wordml/sdtdatahash" xmlns:w16se="http://schemas.microsoft.com/office/word/2015/wordml/symex" mc:Ignorable="w14 w15 w16se w16cid w16 w16cex w16sdtdh w16du">
+<w:styles xmlns:mc="http://schemas.openxmlformats.org/markup-compatibility/2006" xmlns:r="http://schemas.openxmlformats.org/officeDocument/2006/relationships" xmlns:w="http://schemas.openxmlformats.org/wordprocessingml/2006/main" xmlns:w14="http://schemas.microsoft.com/office/word/2010/wordml" xmlns:w15="http://schemas.microsoft.com/office/word/2012/wordml" xmlns:w16cex="http://schemas.microsoft.com/office/word/2018/wordml/cex" xmlns:w16cid="http://schemas.microsoft.com/office/word/2016/wordml/cid" xmlns:w16="http://schemas.microsoft.com/office/word/2018/wordml" xmlns:w16du="http://schemas.microsoft.com/office/word/2023/wordml/word16du" xmlns:w16sdtdh="http://schemas.microsoft.com/office/word/2020/wordml/sdtdatahash" xmlns:w16sdtfl="http://schemas.microsoft.com/office/word/2024/wordml/sdtformatlock" xmlns:w16se="http://schemas.microsoft.com/office/word/2015/wordml/symex" mc:Ignorable="w14 w15 w16se w16cid w16 w16cex w16sdtdh w16sdtfl w16du">
   <w:docDefaults>
     <w:rPrDefault>
       <w:rPr>

</xml_diff>

<commit_message>
Updated rotary dial code to core 3.x pcounter driver. Updated the docx to reflect the latest code.
</commit_message>
<xml_diff>
--- a/RadioFox.docx
+++ b/RadioFox.docx
@@ -337,8 +337,44 @@
         <w:rPr>
           <w:lang w:val="en-US"/>
         </w:rPr>
-        <w:t>The firmware source code consists of C and C++. The source code will be released at a future date, it is still being changed frequently.</w:t>
-      </w:r>
+        <w:t>The firmware source code consists of C and C++. T</w:t>
+      </w:r>
+      <w:r>
+        <w:rPr>
+          <w:lang w:val="en-US"/>
+        </w:rPr>
+        <w:t xml:space="preserve">he source code can be found at </w:t>
+      </w:r>
+      <w:hyperlink r:id="rId9" w:history="1">
+        <w:proofErr w:type="spellStart"/>
+        <w:r>
+          <w:rPr>
+            <w:rStyle w:val="Hyperlink"/>
+          </w:rPr>
+          <w:t>MartinNohr</w:t>
+        </w:r>
+        <w:proofErr w:type="spellEnd"/>
+        <w:r>
+          <w:rPr>
+            <w:rStyle w:val="Hyperlink"/>
+          </w:rPr>
+          <w:t>/</w:t>
+        </w:r>
+        <w:proofErr w:type="spellStart"/>
+        <w:r>
+          <w:rPr>
+            <w:rStyle w:val="Hyperlink"/>
+          </w:rPr>
+          <w:t>RadioFox</w:t>
+        </w:r>
+        <w:proofErr w:type="spellEnd"/>
+        <w:r>
+          <w:rPr>
+            <w:rStyle w:val="Hyperlink"/>
+          </w:rPr>
+          <w:t>: Ham Radio Fox Software</w:t>
+        </w:r>
+      </w:hyperlink>
     </w:p>
     <w:p>
       <w:pPr>
@@ -405,7 +441,21 @@
         </w:numPr>
       </w:pPr>
       <w:r>
-        <w:t>Added ability to play WAV and MP3 files. Removed the immediate txstop option as it could leave the audio player in an untidy state.</w:t>
+        <w:t xml:space="preserve">Added ability to play WAV and MP3 files. Removed the immediate </w:t>
+      </w:r>
+      <w:proofErr w:type="spellStart"/>
+      <w:r>
+        <w:t>txstop</w:t>
+      </w:r>
+      <w:proofErr w:type="spellEnd"/>
+      <w:r>
+        <w:t xml:space="preserve"> option as it could leave the audio player in an untidy state.</w:t>
+      </w:r>
+      <w:r>
+        <w:t xml:space="preserve"> Updated </w:t>
+      </w:r>
+      <w:r>
+        <w:t>some libraries to the latest versions.</w:t>
       </w:r>
     </w:p>
     <w:p>
@@ -422,7 +472,15 @@
         </w:numPr>
       </w:pPr>
       <w:r>
-        <w:t>Ported the code to espressif core 3.x instead of requiring 2.0.17.</w:t>
+        <w:t xml:space="preserve">Ported the code to </w:t>
+      </w:r>
+      <w:proofErr w:type="spellStart"/>
+      <w:r>
+        <w:t>espressif</w:t>
+      </w:r>
+      <w:proofErr w:type="spellEnd"/>
+      <w:r>
+        <w:t xml:space="preserve"> core 3.x instead of requiring 2.0.17.</w:t>
       </w:r>
     </w:p>
     <w:p>
@@ -439,6 +497,7 @@
         </w:numPr>
       </w:pPr>
       <w:r>
+        <w:lastRenderedPageBreak/>
         <w:t>Moved latitude and long</w:t>
       </w:r>
       <w:r>
@@ -472,7 +531,6 @@
         </w:numPr>
       </w:pPr>
       <w:r>
-        <w:lastRenderedPageBreak/>
         <w:t>I also corrected the documentation that the power output is 1 or 0.5 Watts for high and low power settings.</w:t>
       </w:r>
     </w:p>
@@ -596,8 +654,16 @@
         <w:rPr>
           <w:lang w:val="en-US"/>
         </w:rPr>
-        <w:t>Added a switch to limit the frequency range to that allowed for beacon use in ITU region 2. The range is 144.276-144.300 MHz.</w:t>
-      </w:r>
+        <w:t xml:space="preserve">Added a switch to limit the frequency range to that allowed for beacon use in ITU region 2. The range is 144.276-144.300 </w:t>
+      </w:r>
+      <w:proofErr w:type="spellStart"/>
+      <w:r>
+        <w:rPr>
+          <w:lang w:val="en-US"/>
+        </w:rPr>
+        <w:t>MHz.</w:t>
+      </w:r>
+      <w:proofErr w:type="spellEnd"/>
     </w:p>
     <w:p>
       <w:r>
@@ -798,14 +864,35 @@
         <w:rPr>
           <w:lang w:val="en-US"/>
         </w:rPr>
-        <w:t xml:space="preserve"> The batteries I use are found here: </w:t>
-      </w:r>
-      <w:hyperlink r:id="rId9" w:history="1">
+        <w:t xml:space="preserve"> The batteries I use are </w:t>
+      </w:r>
+      <w:r>
+        <w:rPr>
+          <w:lang w:val="en-US"/>
+        </w:rPr>
+        <w:lastRenderedPageBreak/>
+        <w:t xml:space="preserve">found here: </w:t>
+      </w:r>
+      <w:hyperlink r:id="rId10" w:history="1">
         <w:r>
           <w:rPr>
             <w:rStyle w:val="Hyperlink"/>
           </w:rPr>
-          <w:t>Protected 3400mAh 10A 18650 Button Top Battery - Wholesale Discount – Liion Wholesale Batteries</w:t>
+          <w:t xml:space="preserve">Protected 3400mAh 10A 18650 Button Top Battery - Wholesale Discount – </w:t>
+        </w:r>
+        <w:proofErr w:type="spellStart"/>
+        <w:r>
+          <w:rPr>
+            <w:rStyle w:val="Hyperlink"/>
+          </w:rPr>
+          <w:t>Liion</w:t>
+        </w:r>
+        <w:proofErr w:type="spellEnd"/>
+        <w:r>
+          <w:rPr>
+            <w:rStyle w:val="Hyperlink"/>
+          </w:rPr>
+          <w:t xml:space="preserve"> Wholesale Batteries</w:t>
         </w:r>
       </w:hyperlink>
       <w:r>
@@ -833,7 +920,6 @@
         <w:rPr>
           <w:lang w:val="en-US"/>
         </w:rPr>
-        <w:lastRenderedPageBreak/>
         <w:t>There is a USB C connector on the left edge used for charging the batteries. Above that is a micro-SD slot. The SD card holds tone files and saved settings files. It can also be used to load new firmware onto the TTGO chip. There is also a USB C connector on the TTGO. It is used for downloading firmware or debugging operations. It might also be used for serial communications in a future firmware release. It is not used for charging the batteries.</w:t>
       </w:r>
     </w:p>
@@ -914,7 +1000,19 @@
         <w:rPr>
           <w:lang w:val="en-US"/>
         </w:rPr>
-        <w:t>button top style and protection is recommended. The 18650 battery length is a very loose standard and some batteries may not fit. Too long and they cannot be used. Too short, it might be possible to bend the contacts on the battery holder negative side. The battery holder is polarized to prevent insertion in the wrong direction. Do not defeat the feature or magic blue smoke may appear from the PCB!</w:t>
+        <w:t xml:space="preserve">button top style and protection is recommended. The 18650 battery length is a very loose </w:t>
+      </w:r>
+      <w:r>
+        <w:rPr>
+          <w:lang w:val="en-US"/>
+        </w:rPr>
+        <w:t>standard,</w:t>
+      </w:r>
+      <w:r>
+        <w:rPr>
+          <w:lang w:val="en-US"/>
+        </w:rPr>
+        <w:t xml:space="preserve"> and some batteries may not fit. Too long and they cannot be used. Too short, it might be possible to bend the contacts on the battery holder negative side. The battery holder is polarized to prevent insertion in the wrong direction. Do not defeat the feature or magic blue smoke may appear from the PCB!</w:t>
       </w:r>
     </w:p>
     <w:p>
@@ -957,13 +1055,38 @@
         </w:rPr>
         <w:t xml:space="preserve">The files are saved as .TXT and simply contain a list of tones to be played. The format is similar the hard coded files from here: </w:t>
       </w:r>
-      <w:hyperlink r:id="rId10">
+      <w:hyperlink r:id="rId11">
+        <w:proofErr w:type="spellStart"/>
         <w:r>
           <w:rPr>
             <w:rStyle w:val="Hyperlink"/>
             <w:lang w:val="en-US"/>
           </w:rPr>
-          <w:t>robsoncouto/arduino-songs (github.com)</w:t>
+          <w:t>robsoncouto</w:t>
+        </w:r>
+        <w:proofErr w:type="spellEnd"/>
+        <w:r>
+          <w:rPr>
+            <w:rStyle w:val="Hyperlink"/>
+            <w:lang w:val="en-US"/>
+          </w:rPr>
+          <w:t>/</w:t>
+        </w:r>
+        <w:proofErr w:type="spellStart"/>
+        <w:r>
+          <w:rPr>
+            <w:rStyle w:val="Hyperlink"/>
+            <w:lang w:val="en-US"/>
+          </w:rPr>
+          <w:t>arduino</w:t>
+        </w:r>
+        <w:proofErr w:type="spellEnd"/>
+        <w:r>
+          <w:rPr>
+            <w:rStyle w:val="Hyperlink"/>
+            <w:lang w:val="en-US"/>
+          </w:rPr>
+          <w:t>-songs (github.com)</w:t>
         </w:r>
       </w:hyperlink>
     </w:p>
@@ -1083,22 +1206,25 @@
           <w:bCs/>
           <w:lang w:val="en-US"/>
         </w:rPr>
-        <w:t>LENGTH, %val can be used to set the length of the note, it defaults to 90% and 10% quiet after the note</w:t>
-      </w:r>
-    </w:p>
-    <w:p>
-      <w:pPr>
+        <w:t>LENGTH, %</w:t>
+      </w:r>
+      <w:proofErr w:type="spellStart"/>
+      <w:r>
         <w:rPr>
           <w:b/>
           <w:bCs/>
-        </w:rPr>
-      </w:pPr>
+          <w:lang w:val="en-US"/>
+        </w:rPr>
+        <w:t>val</w:t>
+      </w:r>
+      <w:proofErr w:type="spellEnd"/>
       <w:r>
         <w:rPr>
           <w:b/>
           <w:bCs/>
-        </w:rPr>
-        <w:t>This can be used for pizzicato notes, LENGTH, 25, for example</w:t>
+          <w:lang w:val="en-US"/>
+        </w:rPr>
+        <w:t xml:space="preserve"> can be used to set the length of the note, it defaults to 90% and 10% quiet after the note</w:t>
       </w:r>
     </w:p>
     <w:p>
@@ -1113,7 +1239,7 @@
           <w:b/>
           <w:bCs/>
         </w:rPr>
-        <w:t>~</w:t>
+        <w:t>This can be used for pizzicato notes, LENGTH, 25, for example</w:t>
       </w:r>
     </w:p>
     <w:p>
@@ -1128,7 +1254,7 @@
           <w:b/>
           <w:bCs/>
         </w:rPr>
-        <w:t>TEMPO, 145,</w:t>
+        <w:t>~</w:t>
       </w:r>
     </w:p>
     <w:p>
@@ -1143,7 +1269,7 @@
           <w:b/>
           <w:bCs/>
         </w:rPr>
-        <w:t>LENGTH, 90,</w:t>
+        <w:t>TEMPO, 145,</w:t>
       </w:r>
     </w:p>
     <w:p>
@@ -1151,16 +1277,14 @@
         <w:rPr>
           <w:b/>
           <w:bCs/>
-          <w:lang w:val="en-US"/>
         </w:rPr>
       </w:pPr>
       <w:r>
         <w:rPr>
           <w:b/>
           <w:bCs/>
-          <w:lang w:val="en-US"/>
-        </w:rPr>
-        <w:t>NOTE_E5, 4,  NOTE_B4, 8,  NOTE_C5, 8,  NOTE_D5, 4,  NOTE_C5, 8,  NOTE_B4, 8,</w:t>
+        </w:rPr>
+        <w:t>LENGTH, 90,</w:t>
       </w:r>
     </w:p>
     <w:p>
@@ -1177,7 +1301,7 @@
           <w:bCs/>
           <w:lang w:val="en-US"/>
         </w:rPr>
-        <w:t>NOTE_A4, 4,  NOTE_A4, 8,  NOTE_C5, 8,  NOTE_E5, 4,  NOTE_D5, 8,  NOTE_C5, 8,</w:t>
+        <w:t>NOTE_E5, 4,  NOTE_B4, 8,  NOTE_C5, 8,  NOTE_D5, 4,  NOTE_C5, 8,  NOTE_B4, 8,</w:t>
       </w:r>
     </w:p>
     <w:p>
@@ -1194,7 +1318,7 @@
           <w:bCs/>
           <w:lang w:val="en-US"/>
         </w:rPr>
-        <w:t>NOTE_B4, -4, NOTE_C5, 8,  NOTE_D5, 4,  NOTE_E5, 4,</w:t>
+        <w:t>NOTE_A4, 4,  NOTE_A4, 8,  NOTE_C5, 8,  NOTE_E5, 4,  NOTE_D5, 8,  NOTE_C5, 8,</w:t>
       </w:r>
     </w:p>
     <w:p>
@@ -1211,7 +1335,7 @@
           <w:bCs/>
           <w:lang w:val="en-US"/>
         </w:rPr>
-        <w:t>NOTE_C5, 4,  NOTE_A4, 4,  NOTE_A4, 8,  NOTE_A4, 4,  NOTE_B4, 8,  NOTE_C5, 8,</w:t>
+        <w:t>NOTE_B4, -4, NOTE_C5, 8,  NOTE_D5, 4,  NOTE_E5, 4,</w:t>
       </w:r>
     </w:p>
     <w:p>
@@ -1228,7 +1352,7 @@
           <w:bCs/>
           <w:lang w:val="en-US"/>
         </w:rPr>
-        <w:t>NOTE_D5, -4, NOTE_F5, 8,  NOTE_A5, 4,  NOTE_G5, 8,  NOTE_F5, 8,</w:t>
+        <w:t>NOTE_C5, 4,  NOTE_A4, 4,  NOTE_A4, 8,  NOTE_A4, 4,  NOTE_B4, 8,  NOTE_C5, 8,</w:t>
       </w:r>
     </w:p>
     <w:p>
@@ -1245,7 +1369,7 @@
           <w:bCs/>
           <w:lang w:val="en-US"/>
         </w:rPr>
-        <w:t>NOTE_E5, -4, NOTE_C5, 8,  NOTE_E5, 4,  NOTE_D5, 8,  NOTE_C5, 8,</w:t>
+        <w:t>NOTE_D5, -4, NOTE_F5, 8,  NOTE_A5, 4,  NOTE_G5, 8,  NOTE_F5, 8,</w:t>
       </w:r>
     </w:p>
     <w:p>
@@ -1262,7 +1386,7 @@
           <w:bCs/>
           <w:lang w:val="en-US"/>
         </w:rPr>
-        <w:t>NOTE_B4, 4,  NOTE_B4, 8,  NOTE_C5, 8,  NOTE_D5, 4,  NOTE_E5, 4,</w:t>
+        <w:t>NOTE_E5, -4, NOTE_C5, 8,  NOTE_E5, 4,  NOTE_D5, 8,  NOTE_C5, 8,</w:t>
       </w:r>
     </w:p>
     <w:p>
@@ -1279,30 +1403,89 @@
           <w:bCs/>
           <w:lang w:val="en-US"/>
         </w:rPr>
-        <w:t>NOTE_C5, 4,  NOTE_A4, 4,  NOTE_A4, 4, REST, 4,</w:t>
-      </w:r>
-    </w:p>
-    <w:p>
-      <w:pPr>
-        <w:pStyle w:val="Heading1"/>
-      </w:pPr>
-      <w:r>
-        <w:t>Updating Firmware</w:t>
-      </w:r>
-    </w:p>
-    <w:p>
-      <w:r>
-        <w:rPr>
-          <w:lang w:val="en-US"/>
-        </w:rPr>
-        <w:t xml:space="preserve">The new file must be put on the SD card and named RadioFox.bin. The system menu has an entry </w:t>
-      </w:r>
-      <w:r>
+        <w:t>NOTE_B4, 4,  NOTE_B4, 8,  NOTE_C5, 8,  NOTE_D5, 4,  NOTE_E5, 4,</w:t>
+      </w:r>
+    </w:p>
+    <w:p>
+      <w:pPr>
         <w:rPr>
           <w:b/>
           <w:bCs/>
           <w:lang w:val="en-US"/>
         </w:rPr>
+      </w:pPr>
+      <w:r>
+        <w:rPr>
+          <w:b/>
+          <w:bCs/>
+          <w:lang w:val="en-US"/>
+        </w:rPr>
+        <w:t>NOTE_C5, 4,  NOTE_A4, 4,  NOTE_A4, 4, REST, 4,</w:t>
+      </w:r>
+    </w:p>
+    <w:p>
+      <w:pPr>
+        <w:pStyle w:val="Heading1"/>
+      </w:pPr>
+      <w:r>
+        <w:t>Audio Files</w:t>
+      </w:r>
+    </w:p>
+    <w:p>
+      <w:r>
+        <w:t xml:space="preserve">It is possible to play MP3 or WAV </w:t>
+      </w:r>
+      <w:r>
+        <w:t xml:space="preserve">files </w:t>
+      </w:r>
+      <w:r>
+        <w:t>instead of the tone files.</w:t>
+      </w:r>
+      <w:r>
+        <w:t xml:space="preserve"> They are selected through the same menu selection. Th</w:t>
+      </w:r>
+      <w:r>
+        <w:t xml:space="preserve">e radio uses PDM (pulse density modulation) to encode the audio. This is not the best audio quality, but it does allow the use of the existing board design. Better </w:t>
+      </w:r>
+      <w:r>
+        <w:t>quality would require a proper sound chip on the PCB. This may be done in the future.</w:t>
+      </w:r>
+    </w:p>
+    <w:p>
+      <w:pPr>
+        <w:pStyle w:val="Heading1"/>
+      </w:pPr>
+      <w:r>
+        <w:t>Updating Firmware</w:t>
+      </w:r>
+    </w:p>
+    <w:p>
+      <w:r>
+        <w:rPr>
+          <w:lang w:val="en-US"/>
+        </w:rPr>
+        <w:t xml:space="preserve">The new file must be put on the SD card and named </w:t>
+      </w:r>
+      <w:proofErr w:type="spellStart"/>
+      <w:r>
+        <w:rPr>
+          <w:lang w:val="en-US"/>
+        </w:rPr>
+        <w:t>RadioFox.bin</w:t>
+      </w:r>
+      <w:proofErr w:type="spellEnd"/>
+      <w:r>
+        <w:rPr>
+          <w:lang w:val="en-US"/>
+        </w:rPr>
+        <w:t xml:space="preserve">. The system menu has an entry </w:t>
+      </w:r>
+      <w:r>
+        <w:rPr>
+          <w:b/>
+          <w:bCs/>
+          <w:lang w:val="en-US"/>
+        </w:rPr>
         <w:t>New Version BIN file</w:t>
       </w:r>
       <w:r>
@@ -1334,6 +1517,7 @@
         <w:rPr>
           <w:lang w:val="en-US"/>
         </w:rPr>
+        <w:lastRenderedPageBreak/>
         <w:t>Please feel free to request additional commands. I’m sure there are other usual things that can be done remotely using DTMF signals. Also note that these functions have not yet been tested extensively so there may be some bugs in the code. I will fix as soon as I can after I find out what they are.</w:t>
       </w:r>
     </w:p>
@@ -1358,357 +1542,384 @@
         <w:pStyle w:val="Heading2"/>
       </w:pPr>
       <w:r>
+        <w:t>DTMF *</w:t>
+      </w:r>
+      <w:r>
+        <w:t>2</w:t>
+      </w:r>
+    </w:p>
+    <w:p>
+      <w:r>
+        <w:t>Stop transmitting timer.</w:t>
+      </w:r>
+    </w:p>
+    <w:p>
+      <w:pPr>
+        <w:pStyle w:val="Heading2"/>
+      </w:pPr>
+      <w:r>
+        <w:t>DTMF *</w:t>
+      </w:r>
+      <w:r>
+        <w:t>4</w:t>
+      </w:r>
+    </w:p>
+    <w:p>
+      <w:r>
+        <w:t>Set low power mode.</w:t>
+      </w:r>
+    </w:p>
+    <w:p>
+      <w:pPr>
+        <w:pStyle w:val="Heading2"/>
+      </w:pPr>
+      <w:r>
+        <w:t>DTMF *</w:t>
+      </w:r>
+      <w:r>
+        <w:t>5</w:t>
+      </w:r>
+    </w:p>
+    <w:p>
+      <w:r>
+        <w:t>Set high power mode.</w:t>
+      </w:r>
+    </w:p>
+    <w:p>
+      <w:pPr>
+        <w:pStyle w:val="Heading2"/>
+      </w:pPr>
+      <w:r>
+        <w:t>DTMF *</w:t>
+      </w:r>
+      <w:r>
+        <w:t>6</w:t>
+      </w:r>
+    </w:p>
+    <w:p>
+      <w:r>
+        <w:rPr>
+          <w:lang w:val="en-US"/>
+        </w:rPr>
+        <w:t>Cancel existing delay and pause and begin transmitting immediately.</w:t>
+      </w:r>
+    </w:p>
+    <w:p>
+      <w:pPr>
+        <w:pStyle w:val="Heading1"/>
+      </w:pPr>
+      <w:r>
+        <w:t>Button Operations</w:t>
+      </w:r>
+    </w:p>
+    <w:p>
+      <w:r>
+        <w:t xml:space="preserve">All operations can be controlled by the rotary push button on the </w:t>
+      </w:r>
+      <w:r>
+        <w:t>box and the two extra buttons to the left labelled B0 and B1</w:t>
+      </w:r>
+      <w:r>
+        <w:t>.</w:t>
+      </w:r>
+      <w:r>
+        <w:t xml:space="preserve"> A long press is used to access </w:t>
+      </w:r>
+      <w:r>
+        <w:t>the menu system</w:t>
+      </w:r>
+      <w:r>
+        <w:t xml:space="preserve"> and is done by holding the button down for about a ½ second or longer. This long press time is also adjustable if a longer or shorter time is preferred. The system has two modes of operation. After booting the display shows the </w:t>
+      </w:r>
+      <w:r>
+        <w:t xml:space="preserve">radio status and some important </w:t>
+      </w:r>
+      <w:r>
+        <w:t xml:space="preserve">radio </w:t>
+      </w:r>
+      <w:r>
+        <w:t>settings</w:t>
+      </w:r>
+      <w:r>
+        <w:t>.</w:t>
+      </w:r>
+    </w:p>
+    <w:p/>
+    <w:p>
+      <w:r>
+        <w:rPr>
+          <w:lang w:val="en-US"/>
+        </w:rPr>
+        <w:t>A long press on the dial or a simple press on B1 will open the menus. The system opens the last menu that was used. A long press or B1 in the menus returns to the normal radio mode. Each menu except the main menu has two entries, the first and the last, which will return to the previous menu.</w:t>
+      </w:r>
+    </w:p>
+    <w:p/>
+    <w:p>
+      <w:r>
+        <w:t>Many</w:t>
+      </w:r>
+      <w:r>
+        <w:t xml:space="preserve"> data entry screens will show help on the bottom few lines to explain </w:t>
+      </w:r>
+      <w:r>
+        <w:t>the button functions.</w:t>
+      </w:r>
+    </w:p>
+    <w:p>
+      <w:pPr>
+        <w:pStyle w:val="Heading2"/>
+      </w:pPr>
+      <w:r>
         <w:lastRenderedPageBreak/>
-        <w:t>DTMF *</w:t>
-      </w:r>
-      <w:r>
-        <w:t>2</w:t>
-      </w:r>
-    </w:p>
-    <w:p>
-      <w:r>
-        <w:t>Stop transmitting timer.</w:t>
-      </w:r>
-    </w:p>
-    <w:p>
-      <w:pPr>
-        <w:pStyle w:val="Heading2"/>
-      </w:pPr>
-      <w:r>
-        <w:t>DTMF *</w:t>
-      </w:r>
-      <w:r>
-        <w:t>4</w:t>
-      </w:r>
-    </w:p>
-    <w:p>
-      <w:r>
-        <w:t>Set low power mode.</w:t>
-      </w:r>
-    </w:p>
-    <w:p>
-      <w:pPr>
-        <w:pStyle w:val="Heading2"/>
-      </w:pPr>
-      <w:r>
-        <w:t>DTMF *</w:t>
-      </w:r>
-      <w:r>
-        <w:t>5</w:t>
-      </w:r>
-    </w:p>
-    <w:p>
-      <w:r>
-        <w:t>Set high power mode.</w:t>
-      </w:r>
-    </w:p>
-    <w:p>
-      <w:pPr>
-        <w:pStyle w:val="Heading2"/>
-      </w:pPr>
-      <w:r>
-        <w:t>DTMF *</w:t>
-      </w:r>
-      <w:r>
-        <w:t>6</w:t>
-      </w:r>
-    </w:p>
-    <w:p>
-      <w:r>
-        <w:rPr>
-          <w:lang w:val="en-US"/>
-        </w:rPr>
-        <w:t>Cancel existing delay and pause and begin transmitting immediately.</w:t>
-      </w:r>
-    </w:p>
-    <w:p>
-      <w:pPr>
-        <w:pStyle w:val="Heading1"/>
-      </w:pPr>
-      <w:r>
-        <w:t>Button Operations</w:t>
-      </w:r>
-    </w:p>
-    <w:p>
-      <w:r>
-        <w:t xml:space="preserve">All operations can be controlled by the rotary push button on the </w:t>
-      </w:r>
-      <w:r>
-        <w:t>box and the two extra buttons to the left labelled B0 and B1</w:t>
+        <w:t>Dedicated Buttons – Button0</w:t>
+      </w:r>
+      <w:r>
+        <w:t>(</w:t>
+      </w:r>
+      <w:r>
+        <w:t>B</w:t>
+      </w:r>
+      <w:r>
+        <w:t>0</w:t>
+      </w:r>
+      <w:r>
+        <w:t>)</w:t>
+      </w:r>
+      <w:r>
+        <w:t xml:space="preserve"> and Button1</w:t>
+      </w:r>
+      <w:r>
+        <w:t>(</w:t>
+      </w:r>
+      <w:r>
+        <w:t>B</w:t>
+      </w:r>
+      <w:r>
+        <w:t>1</w:t>
+      </w:r>
+      <w:r>
+        <w:t>)</w:t>
+      </w:r>
+    </w:p>
+    <w:p>
+      <w:r>
+        <w:t xml:space="preserve">There are two dedicated buttons on the </w:t>
+      </w:r>
+      <w:r>
+        <w:t xml:space="preserve">top </w:t>
+      </w:r>
+      <w:r>
+        <w:t>left of the TTGO device.</w:t>
+      </w:r>
+      <w:r>
+        <w:t xml:space="preserve"> They are accessible from the top of the </w:t>
+      </w:r>
+      <w:r>
+        <w:t>case.</w:t>
+      </w:r>
+      <w:r>
+        <w:t xml:space="preserve"> The top one is called </w:t>
+      </w:r>
+      <w:r>
+        <w:t>B</w:t>
+      </w:r>
+      <w:r>
+        <w:t>0</w:t>
+      </w:r>
+      <w:r>
+        <w:t xml:space="preserve"> and the bottom one is called </w:t>
+      </w:r>
+      <w:r>
+        <w:t>B</w:t>
+      </w:r>
+      <w:r>
+        <w:t>1</w:t>
       </w:r>
       <w:r>
         <w:t>.</w:t>
       </w:r>
       <w:r>
-        <w:t xml:space="preserve"> A long press is used to access </w:t>
-      </w:r>
-      <w:r>
-        <w:t>the menu system</w:t>
-      </w:r>
-      <w:r>
-        <w:t xml:space="preserve"> and is done by holding the button down for about a ½ second or longer. This long press time is also adjustable if a longer or shorter time is preferred. The system has two modes of operation. After booting the display shows the </w:t>
-      </w:r>
-      <w:r>
-        <w:t xml:space="preserve">radio status and some important </w:t>
-      </w:r>
-      <w:r>
-        <w:t xml:space="preserve">radio </w:t>
-      </w:r>
-      <w:r>
-        <w:t>settings</w:t>
+        <w:t xml:space="preserve"> Both these buttons support both clicking and long presses</w:t>
+      </w:r>
+      <w:r>
+        <w:t xml:space="preserve">. A long press of </w:t>
+      </w:r>
+      <w:r>
+        <w:t>B0</w:t>
+      </w:r>
+      <w:r>
+        <w:t xml:space="preserve"> and </w:t>
+      </w:r>
+      <w:r>
+        <w:t>B1 together</w:t>
+      </w:r>
+      <w:r>
+        <w:t xml:space="preserve"> </w:t>
+      </w:r>
+      <w:r>
+        <w:t>will reboot the system</w:t>
       </w:r>
       <w:r>
         <w:t>.</w:t>
       </w:r>
-    </w:p>
-    <w:p/>
-    <w:p>
-      <w:r>
-        <w:rPr>
-          <w:lang w:val="en-US"/>
-        </w:rPr>
-        <w:t>A long press on the dial or a simple press on B1 will open the menus. The system opens the last menu that was used. A long press or B1 in the menus returns to the normal radio mode. Each menu except the main menu has two entries, the first and the last, which will return to the previous menu.</w:t>
-      </w:r>
-    </w:p>
-    <w:p/>
-    <w:p>
-      <w:r>
-        <w:t>Many</w:t>
-      </w:r>
-      <w:r>
-        <w:t xml:space="preserve"> data entry screens will show help on the bottom few lines to explain </w:t>
-      </w:r>
-      <w:r>
-        <w:t>the button functions.</w:t>
-      </w:r>
-    </w:p>
-    <w:p>
-      <w:pPr>
-        <w:pStyle w:val="Heading2"/>
-      </w:pPr>
-      <w:r>
-        <w:t>Dedicated Buttons – Button0</w:t>
-      </w:r>
-      <w:r>
-        <w:t>(</w:t>
+      <w:r>
+        <w:t xml:space="preserve"> </w:t>
+      </w:r>
+      <w:r>
+        <w:t>The</w:t>
+      </w:r>
+      <w:r>
+        <w:t xml:space="preserve"> function of the</w:t>
+      </w:r>
+      <w:r>
+        <w:t>se buttons depend</w:t>
+      </w:r>
+      <w:r>
+        <w:t>s</w:t>
+      </w:r>
+      <w:r>
+        <w:t xml:space="preserve"> on the current operating mode</w:t>
+      </w:r>
+      <w:r>
+        <w:t xml:space="preserve"> as described next.</w:t>
+      </w:r>
+      <w:r>
+        <w:t xml:space="preserve"> Common to all modes is that </w:t>
+      </w:r>
+      <w:r>
+        <w:t xml:space="preserve">clicking </w:t>
       </w:r>
       <w:r>
         <w:t>B</w:t>
       </w:r>
       <w:r>
-        <w:t>0</w:t>
-      </w:r>
-      <w:r>
-        <w:t>)</w:t>
-      </w:r>
-      <w:r>
-        <w:t xml:space="preserve"> and Button1</w:t>
-      </w:r>
-      <w:r>
-        <w:t>(</w:t>
-      </w:r>
-      <w:r>
+        <w:t>1</w:t>
+      </w:r>
+      <w:r>
+        <w:t xml:space="preserve"> will always emulate a long press of the dial button.</w:t>
+      </w:r>
+    </w:p>
+    <w:p>
+      <w:pPr>
+        <w:pStyle w:val="Heading3"/>
+        <w:rPr>
+          <w:lang w:val="da-DK"/>
+        </w:rPr>
+      </w:pPr>
+      <w:r>
+        <w:rPr>
+          <w:lang w:val="da-DK"/>
+        </w:rPr>
+        <w:t>B0/B1</w:t>
+      </w:r>
+      <w:r>
+        <w:rPr>
+          <w:lang w:val="da-DK"/>
+        </w:rPr>
+        <w:t xml:space="preserve"> </w:t>
+      </w:r>
+      <w:proofErr w:type="spellStart"/>
+      <w:r>
+        <w:rPr>
+          <w:lang w:val="da-DK"/>
+        </w:rPr>
+        <w:t>During</w:t>
+      </w:r>
+      <w:proofErr w:type="spellEnd"/>
+      <w:r>
+        <w:rPr>
+          <w:lang w:val="da-DK"/>
+        </w:rPr>
+        <w:t xml:space="preserve"> Run Mode</w:t>
+      </w:r>
+    </w:p>
+    <w:p>
+      <w:pPr>
+        <w:rPr>
+          <w:lang w:val="en-US"/>
+        </w:rPr>
+      </w:pPr>
+      <w:r>
+        <w:rPr>
+          <w:lang w:val="en-US"/>
+        </w:rPr>
+        <w:t xml:space="preserve">B0 toggles the run </w:t>
+      </w:r>
+      <w:r>
+        <w:rPr>
+          <w:lang w:val="en-US"/>
+        </w:rPr>
+        <w:t xml:space="preserve">state to stop or start </w:t>
+      </w:r>
+      <w:r>
+        <w:rPr>
+          <w:lang w:val="en-US"/>
+        </w:rPr>
+        <w:t xml:space="preserve">transmitting mode. </w:t>
+      </w:r>
+      <w:r>
+        <w:rPr>
+          <w:lang w:val="en-US"/>
+        </w:rPr>
+        <w:t>Long B0 cancels the current transmit or pause timer</w:t>
+      </w:r>
+      <w:r>
+        <w:rPr>
+          <w:lang w:val="en-US"/>
+        </w:rPr>
+        <w:t xml:space="preserve">. </w:t>
+      </w:r>
+      <w:r>
+        <w:rPr>
+          <w:lang w:val="en-US"/>
+        </w:rPr>
+        <w:t>B1 enters the menu system.</w:t>
+      </w:r>
+    </w:p>
+    <w:p>
+      <w:pPr>
+        <w:pStyle w:val="Heading3"/>
+        <w:rPr>
+          <w:lang w:val="da-DK"/>
+        </w:rPr>
+      </w:pPr>
+      <w:r>
+        <w:rPr>
+          <w:lang w:val="da-DK"/>
+        </w:rPr>
         <w:t>B</w:t>
       </w:r>
       <w:r>
-        <w:t>1</w:t>
-      </w:r>
-      <w:r>
-        <w:t>)</w:t>
-      </w:r>
-    </w:p>
-    <w:p>
-      <w:r>
-        <w:t xml:space="preserve">There are two dedicated buttons on the </w:t>
-      </w:r>
-      <w:r>
-        <w:t xml:space="preserve">top </w:t>
-      </w:r>
-      <w:r>
-        <w:t>left of the TTGO device.</w:t>
-      </w:r>
-      <w:r>
-        <w:t xml:space="preserve"> They are accessible from the top of the </w:t>
-      </w:r>
-      <w:r>
-        <w:t>case.</w:t>
-      </w:r>
-      <w:r>
-        <w:t xml:space="preserve"> The top one is called </w:t>
-      </w:r>
-      <w:r>
+        <w:rPr>
+          <w:lang w:val="da-DK"/>
+        </w:rPr>
+        <w:t>0/</w:t>
+      </w:r>
+      <w:r>
+        <w:rPr>
+          <w:lang w:val="da-DK"/>
+        </w:rPr>
         <w:t>B</w:t>
       </w:r>
       <w:r>
-        <w:t>0</w:t>
-      </w:r>
-      <w:r>
-        <w:t xml:space="preserve"> and the bottom one is called </w:t>
-      </w:r>
-      <w:r>
-        <w:t>B</w:t>
-      </w:r>
-      <w:r>
-        <w:t>1</w:t>
-      </w:r>
-      <w:r>
-        <w:t>.</w:t>
-      </w:r>
-      <w:r>
-        <w:t xml:space="preserve"> Both these buttons support both clicking and long presses</w:t>
-      </w:r>
-      <w:r>
-        <w:t xml:space="preserve">. A long press of </w:t>
-      </w:r>
-      <w:r>
-        <w:t>B0</w:t>
-      </w:r>
-      <w:r>
-        <w:t xml:space="preserve"> and </w:t>
-      </w:r>
-      <w:r>
-        <w:t>B1 together</w:t>
-      </w:r>
-      <w:r>
-        <w:t xml:space="preserve"> </w:t>
-      </w:r>
-      <w:r>
-        <w:t>will reboot the system</w:t>
-      </w:r>
-      <w:r>
-        <w:t>.</w:t>
-      </w:r>
-      <w:r>
-        <w:t xml:space="preserve"> </w:t>
-      </w:r>
-      <w:r>
-        <w:t>The</w:t>
-      </w:r>
-      <w:r>
-        <w:t xml:space="preserve"> function of the</w:t>
-      </w:r>
-      <w:r>
-        <w:t>se buttons depend</w:t>
-      </w:r>
-      <w:r>
-        <w:t>s</w:t>
-      </w:r>
-      <w:r>
-        <w:t xml:space="preserve"> on the current operating mode</w:t>
-      </w:r>
-      <w:r>
-        <w:t xml:space="preserve"> as described next.</w:t>
-      </w:r>
-      <w:r>
-        <w:t xml:space="preserve"> Common to all modes is that </w:t>
-      </w:r>
-      <w:r>
-        <w:t xml:space="preserve">clicking </w:t>
-      </w:r>
-      <w:r>
-        <w:t>B</w:t>
-      </w:r>
-      <w:r>
-        <w:t>1</w:t>
-      </w:r>
-      <w:r>
-        <w:t xml:space="preserve"> will always emulate a long press of the dial button.</w:t>
-      </w:r>
-    </w:p>
-    <w:p>
-      <w:pPr>
-        <w:pStyle w:val="Heading3"/>
         <w:rPr>
           <w:lang w:val="da-DK"/>
         </w:rPr>
-      </w:pPr>
+        <w:t xml:space="preserve">1 </w:t>
+      </w:r>
+      <w:proofErr w:type="spellStart"/>
       <w:r>
         <w:rPr>
           <w:lang w:val="da-DK"/>
         </w:rPr>
-        <w:t>B0/B1</w:t>
-      </w:r>
+        <w:t>During</w:t>
+      </w:r>
+      <w:proofErr w:type="spellEnd"/>
       <w:r>
         <w:rPr>
           <w:lang w:val="da-DK"/>
         </w:rPr>
-        <w:t xml:space="preserve"> During Run Mode</w:t>
-      </w:r>
-    </w:p>
-    <w:p>
-      <w:pPr>
-        <w:rPr>
-          <w:lang w:val="en-US"/>
-        </w:rPr>
-      </w:pPr>
-      <w:r>
-        <w:rPr>
-          <w:lang w:val="en-US"/>
-        </w:rPr>
-        <w:t xml:space="preserve">B0 toggles the run </w:t>
-      </w:r>
-      <w:r>
-        <w:rPr>
-          <w:lang w:val="en-US"/>
-        </w:rPr>
-        <w:t xml:space="preserve">state to stop or start </w:t>
-      </w:r>
-      <w:r>
-        <w:rPr>
-          <w:lang w:val="en-US"/>
-        </w:rPr>
-        <w:t xml:space="preserve">transmitting mode. </w:t>
-      </w:r>
-      <w:r>
-        <w:rPr>
-          <w:lang w:val="en-US"/>
-        </w:rPr>
-        <w:t>Long B0 cancels the current transmit or pause timer</w:t>
-      </w:r>
-      <w:r>
-        <w:rPr>
-          <w:lang w:val="en-US"/>
-        </w:rPr>
-        <w:t xml:space="preserve">. </w:t>
-      </w:r>
-      <w:r>
-        <w:rPr>
-          <w:lang w:val="en-US"/>
-        </w:rPr>
-        <w:t>B1 enters the menu system.</w:t>
-      </w:r>
-    </w:p>
-    <w:p>
-      <w:pPr>
-        <w:pStyle w:val="Heading3"/>
-        <w:rPr>
-          <w:lang w:val="da-DK"/>
-        </w:rPr>
-      </w:pPr>
-      <w:r>
-        <w:rPr>
-          <w:lang w:val="da-DK"/>
-        </w:rPr>
-        <w:lastRenderedPageBreak/>
-        <w:t>B</w:t>
-      </w:r>
-      <w:r>
-        <w:rPr>
-          <w:lang w:val="da-DK"/>
-        </w:rPr>
-        <w:t>0/</w:t>
-      </w:r>
-      <w:r>
-        <w:rPr>
-          <w:lang w:val="da-DK"/>
-        </w:rPr>
-        <w:t>B</w:t>
-      </w:r>
-      <w:r>
-        <w:rPr>
-          <w:lang w:val="da-DK"/>
-        </w:rPr>
-        <w:t>1 During Menu Mod</w:t>
+        <w:t xml:space="preserve"> Menu Mod</w:t>
       </w:r>
       <w:r>
         <w:rPr>
@@ -2034,7 +2245,15 @@
         <w:t>,</w:t>
       </w:r>
       <w:r>
-        <w:t xml:space="preserve"> boolean values toggle with each click.</w:t>
+        <w:t xml:space="preserve"> </w:t>
+      </w:r>
+      <w:proofErr w:type="spellStart"/>
+      <w:r>
+        <w:t>boolean</w:t>
+      </w:r>
+      <w:proofErr w:type="spellEnd"/>
+      <w:r>
+        <w:t xml:space="preserve"> values toggle with each click.</w:t>
       </w:r>
       <w:r>
         <w:t xml:space="preserve"> Multiple selections cycle through all the available options.</w:t>
@@ -2080,6 +2299,7 @@
       <w:bookmarkStart w:id="8" w:name="_it4r5xstzl63" w:colFirst="0" w:colLast="0"/>
       <w:bookmarkEnd w:id="8"/>
       <w:r>
+        <w:lastRenderedPageBreak/>
         <w:t>Button Menu Operations</w:t>
       </w:r>
       <w:r>
@@ -2192,9 +2412,13 @@
         <w:ind w:left="1440"/>
       </w:pPr>
       <w:r>
-        <w:lastRenderedPageBreak/>
-        <w:t>Toggle booleans</w:t>
-      </w:r>
+        <w:t xml:space="preserve">Toggle </w:t>
+      </w:r>
+      <w:proofErr w:type="spellStart"/>
+      <w:r>
+        <w:t>booleans</w:t>
+      </w:r>
+      <w:proofErr w:type="spellEnd"/>
     </w:p>
     <w:p>
       <w:pPr>
@@ -2349,6 +2573,7 @@
         <w:pStyle w:val="Heading2"/>
       </w:pPr>
       <w:r>
+        <w:lastRenderedPageBreak/>
         <w:t>+Radio Settings</w:t>
       </w:r>
     </w:p>
@@ -2357,7 +2582,11 @@
         <w:pStyle w:val="Heading3"/>
       </w:pPr>
       <w:r>
-        <w:t>XMIT: On</w:t>
+        <w:t xml:space="preserve">XMIT: </w:t>
+      </w:r>
+      <w:proofErr w:type="spellStart"/>
+      <w:r>
+        <w:t>On</w:t>
       </w:r>
       <w:r>
         <w:t>|</w:t>
@@ -2365,6 +2594,7 @@
       <w:r>
         <w:t>Off</w:t>
       </w:r>
+      <w:proofErr w:type="spellEnd"/>
     </w:p>
     <w:p>
       <w:r>
@@ -2388,7 +2618,11 @@
         <w:pStyle w:val="Heading3"/>
       </w:pPr>
       <w:r>
-        <w:t>TX Power: High</w:t>
+        <w:t xml:space="preserve">TX Power: </w:t>
+      </w:r>
+      <w:proofErr w:type="spellStart"/>
+      <w:r>
+        <w:t>High</w:t>
       </w:r>
       <w:r>
         <w:t>|</w:t>
@@ -2400,6 +2634,7 @@
         </w:rPr>
         <w:t>Low</w:t>
       </w:r>
+      <w:proofErr w:type="spellEnd"/>
     </w:p>
     <w:p>
       <w:r>
@@ -2446,7 +2681,6 @@
         </w:rPr>
       </w:pPr>
       <w:r>
-        <w:lastRenderedPageBreak/>
         <w:t xml:space="preserve">Beacon </w:t>
       </w:r>
       <w:r>
@@ -2456,7 +2690,11 @@
         <w:t>:</w:t>
       </w:r>
       <w:r>
-        <w:t xml:space="preserve"> Yes|</w:t>
+        <w:t xml:space="preserve"> </w:t>
+      </w:r>
+      <w:proofErr w:type="spellStart"/>
+      <w:r>
+        <w:t>Yes|</w:t>
       </w:r>
       <w:r>
         <w:rPr>
@@ -2465,6 +2703,7 @@
         </w:rPr>
         <w:t>No</w:t>
       </w:r>
+      <w:proofErr w:type="spellEnd"/>
     </w:p>
     <w:p>
       <w:r>
@@ -2479,7 +2718,11 @@
         <w:pStyle w:val="Heading3"/>
       </w:pPr>
       <w:r>
-        <w:t>Send GPS: Yes|</w:t>
+        <w:t xml:space="preserve">Send GPS: </w:t>
+      </w:r>
+      <w:proofErr w:type="spellStart"/>
+      <w:r>
+        <w:t>Yes|</w:t>
       </w:r>
       <w:r>
         <w:rPr>
@@ -2488,6 +2731,7 @@
         </w:rPr>
         <w:t>NO</w:t>
       </w:r>
+      <w:proofErr w:type="spellEnd"/>
       <w:r>
         <w:t xml:space="preserve"> (beacon mode only)</w:t>
       </w:r>
@@ -2516,9 +2760,11 @@
       <w:r>
         <w:t>+/-</w:t>
       </w:r>
+      <w:proofErr w:type="spellStart"/>
       <w:r>
         <w:t>n.nnnnnn</w:t>
       </w:r>
+      <w:proofErr w:type="spellEnd"/>
       <w:r>
         <w:t xml:space="preserve"> (</w:t>
       </w:r>
@@ -2565,7 +2811,15 @@
         <w:pStyle w:val="Heading3"/>
       </w:pPr>
       <w:r>
-        <w:t xml:space="preserve">Longitude: +/-n.nnnnnn (Send </w:t>
+        <w:t>Longitude: +/-</w:t>
+      </w:r>
+      <w:proofErr w:type="spellStart"/>
+      <w:r>
+        <w:t>n.nnnnnn</w:t>
+      </w:r>
+      <w:proofErr w:type="spellEnd"/>
+      <w:r>
+        <w:t xml:space="preserve"> (Send </w:t>
       </w:r>
       <w:r>
         <w:rPr>
@@ -2666,11 +2920,17 @@
         <w:pStyle w:val="Heading3"/>
       </w:pPr>
       <w:r>
+        <w:lastRenderedPageBreak/>
         <w:t>Play Audio File</w:t>
       </w:r>
       <w:r>
-        <w:t>: Yes|No</w:t>
-      </w:r>
+        <w:t xml:space="preserve">: </w:t>
+      </w:r>
+      <w:proofErr w:type="spellStart"/>
+      <w:r>
+        <w:t>Yes|No</w:t>
+      </w:r>
+      <w:proofErr w:type="spellEnd"/>
     </w:p>
     <w:p>
       <w:r>
@@ -2727,8 +2987,203 @@
         <w:pStyle w:val="Heading2"/>
       </w:pPr>
       <w:r>
+        <w:t>+Radio Timers</w:t>
+      </w:r>
+    </w:p>
+    <w:p>
+      <w:pPr>
+        <w:pStyle w:val="Heading3"/>
+      </w:pPr>
+      <w:r>
+        <w:t>Start Delay: 0-120 Min</w:t>
+      </w:r>
+    </w:p>
+    <w:p>
+      <w:r>
+        <w:t>When B0 or the menu starts the transmit mode</w:t>
+      </w:r>
+      <w:r>
+        <w:t xml:space="preserve"> the system will not actually begin sending until this time is expired. This allows the radio to be hidden</w:t>
+      </w:r>
+      <w:r>
+        <w:t xml:space="preserve"> and </w:t>
+      </w:r>
+      <w:r>
+        <w:t>gives the hiding person time to leave the area and return</w:t>
+      </w:r>
+      <w:r>
+        <w:t xml:space="preserve"> before transmission starts.</w:t>
+      </w:r>
+    </w:p>
+    <w:p>
+      <w:pPr>
+        <w:pStyle w:val="Heading3"/>
+      </w:pPr>
+      <w:r>
+        <w:t xml:space="preserve">Timer Mode: </w:t>
+      </w:r>
+      <w:proofErr w:type="spellStart"/>
+      <w:r>
+        <w:t>Fixed|Random</w:t>
+      </w:r>
+      <w:proofErr w:type="spellEnd"/>
+    </w:p>
+    <w:p>
+      <w:r>
+        <w:t>In Fixed</w:t>
+      </w:r>
+      <w:r>
+        <w:t xml:space="preserve"> mode the sending time and pause timer are controlled by the Send and Pause values</w:t>
+      </w:r>
+      <w:r>
+        <w:t xml:space="preserve"> and are always the same. In Random mode the transmit time and pause time are randomly chosen</w:t>
+      </w:r>
+      <w:r>
+        <w:t xml:space="preserve"> from the allowed values set in the Min and Max values for TX Send and Pause. This makes the timing less predictable and make the game a little bit harder.</w:t>
+      </w:r>
+      <w:r>
+        <w:t xml:space="preserve"> Keep your ears on!</w:t>
+      </w:r>
+    </w:p>
+    <w:p>
+      <w:pPr>
+        <w:pStyle w:val="Heading3"/>
+      </w:pPr>
+      <w:r>
+        <w:t xml:space="preserve">TX Send: </w:t>
+      </w:r>
+      <w:r>
+        <w:t>10-90 Sec</w:t>
+      </w:r>
+    </w:p>
+    <w:p>
+      <w:r>
+        <w:t>Fixed time for transmission. Shorter times are more challenging</w:t>
+      </w:r>
+      <w:r>
+        <w:t xml:space="preserve"> to locate</w:t>
+      </w:r>
+      <w:r>
+        <w:t xml:space="preserve"> but use less battery energy</w:t>
+      </w:r>
+      <w:r>
+        <w:t>. Longer times overheat the radio</w:t>
+      </w:r>
+      <w:r>
+        <w:t xml:space="preserve"> and use more battery </w:t>
+      </w:r>
+      <w:r>
+        <w:t>energy</w:t>
+      </w:r>
+      <w:r>
+        <w:t>.</w:t>
+      </w:r>
+      <w:r>
+        <w:t xml:space="preserve"> If </w:t>
+      </w:r>
+      <w:r>
+        <w:t xml:space="preserve">this time is set to less than the total </w:t>
+      </w:r>
+      <w:proofErr w:type="spellStart"/>
+      <w:r>
+        <w:t>ID</w:t>
+      </w:r>
+      <w:r>
+        <w:t>+</w:t>
+      </w:r>
+      <w:r>
+        <w:t>Call</w:t>
+      </w:r>
+      <w:r>
+        <w:t>+Audio</w:t>
+      </w:r>
+      <w:proofErr w:type="spellEnd"/>
+      <w:r>
+        <w:t xml:space="preserve"> time then there will be only </w:t>
+      </w:r>
+      <w:r>
+        <w:t>one cycle of data transmitted.</w:t>
+      </w:r>
+      <w:r>
+        <w:t xml:space="preserve"> If the time is longer then the </w:t>
+      </w:r>
+      <w:proofErr w:type="spellStart"/>
+      <w:r>
+        <w:t>ID</w:t>
+      </w:r>
+      <w:r>
+        <w:t>+Call</w:t>
+      </w:r>
+      <w:r>
+        <w:t>+Audio</w:t>
+      </w:r>
+      <w:proofErr w:type="spellEnd"/>
+      <w:r>
+        <w:t xml:space="preserve"> cycles will be repeated until the time has expired. Note that </w:t>
+      </w:r>
+      <w:r>
+        <w:t xml:space="preserve">both ID and Audio will always be completed before </w:t>
+      </w:r>
+      <w:r>
+        <w:t>transmission ends</w:t>
+      </w:r>
+      <w:r>
+        <w:t>.</w:t>
+      </w:r>
+    </w:p>
+    <w:p>
+      <w:pPr>
+        <w:pStyle w:val="Heading3"/>
+      </w:pPr>
+      <w:r>
+        <w:t>TX Pause:10-1200 Sec</w:t>
+      </w:r>
+    </w:p>
+    <w:p>
+      <w:r>
+        <w:t xml:space="preserve">This is the </w:t>
+      </w:r>
+      <w:r>
+        <w:t>pause</w:t>
+      </w:r>
+      <w:r>
+        <w:t xml:space="preserve"> between transmissions</w:t>
+      </w:r>
+      <w:r>
+        <w:t>. Longer times let the radio cool off and save the battery for longer run times.</w:t>
+      </w:r>
+    </w:p>
+    <w:p>
+      <w:pPr>
+        <w:pStyle w:val="Heading3"/>
+      </w:pPr>
+      <w:r>
+        <w:t>TX Send Min: 10-90 Sec</w:t>
+      </w:r>
+    </w:p>
+    <w:p>
+      <w:r>
+        <w:t>In random mode this is the minimum send time.</w:t>
+      </w:r>
+    </w:p>
+    <w:p>
+      <w:pPr>
+        <w:pStyle w:val="Heading3"/>
+      </w:pPr>
+      <w:r>
         <w:lastRenderedPageBreak/>
-        <w:t>+Radio Timers</w:t>
+        <w:t xml:space="preserve">TX Send Max: </w:t>
+      </w:r>
+      <w:r>
+        <w:t>10-90 Sec</w:t>
+      </w:r>
+    </w:p>
+    <w:p>
+      <w:r>
+        <w:t xml:space="preserve">In </w:t>
+      </w:r>
+      <w:r>
+        <w:t>random mode this is the maximum send time.</w:t>
       </w:r>
     </w:p>
     <w:p>
@@ -2736,24 +3191,12 @@
         <w:pStyle w:val="Heading3"/>
       </w:pPr>
       <w:r>
-        <w:t>Start Delay: 0-120 Min</w:t>
-      </w:r>
-    </w:p>
-    <w:p>
-      <w:r>
-        <w:t>When B0 or the menu starts the transmit mode</w:t>
-      </w:r>
-      <w:r>
-        <w:t xml:space="preserve"> the system will not actually begin sending until this time is expired. This allows the radio to be hidden</w:t>
-      </w:r>
-      <w:r>
-        <w:t xml:space="preserve"> and </w:t>
-      </w:r>
-      <w:r>
-        <w:t>gives the hiding person time to leave the area and return</w:t>
-      </w:r>
-      <w:r>
-        <w:t xml:space="preserve"> before transmission starts.</w:t>
+        <w:t>TX Pause Min: 10-1200 Sec</w:t>
+      </w:r>
+    </w:p>
+    <w:p>
+      <w:r>
+        <w:t>In random mode this is the minimum pause time.</w:t>
       </w:r>
     </w:p>
     <w:p>
@@ -2761,24 +3204,12 @@
         <w:pStyle w:val="Heading3"/>
       </w:pPr>
       <w:r>
-        <w:t>Timer Mode: Fixed|Random</w:t>
-      </w:r>
-    </w:p>
-    <w:p>
-      <w:r>
-        <w:t>In Fixed</w:t>
-      </w:r>
-      <w:r>
-        <w:t xml:space="preserve"> mode the sending time and pause timer are controlled by the Send and Pause values</w:t>
-      </w:r>
-      <w:r>
-        <w:t xml:space="preserve"> and are always the same. In Random mode the transmit time and pause time are randomly chosen</w:t>
-      </w:r>
-      <w:r>
-        <w:t xml:space="preserve"> from the allowed values set in the Min and Max values for TX Send and Pause. This makes the timing less predictable and make the game a little bit harder.</w:t>
-      </w:r>
-      <w:r>
-        <w:t xml:space="preserve"> Keep your ears on!</w:t>
+        <w:t>TX Pause Max: 10-1200 Sec</w:t>
+      </w:r>
+    </w:p>
+    <w:p>
+      <w:r>
+        <w:t>In random mode this is the maximum pause time.</w:t>
       </w:r>
     </w:p>
     <w:p>
@@ -2786,30 +3217,466 @@
         <w:pStyle w:val="Heading3"/>
       </w:pPr>
       <w:r>
-        <w:t xml:space="preserve">TX Send: </w:t>
-      </w:r>
-      <w:r>
-        <w:t>10-90 Sec</w:t>
-      </w:r>
-    </w:p>
-    <w:p>
-      <w:r>
-        <w:t>Fixed time for transmission. Shorter times are more challenging</w:t>
-      </w:r>
-      <w:r>
-        <w:t xml:space="preserve"> to locate</w:t>
-      </w:r>
-      <w:r>
-        <w:t xml:space="preserve"> but use less battery energy</w:t>
-      </w:r>
-      <w:r>
-        <w:t>. Longer times overheat the radio</w:t>
-      </w:r>
-      <w:r>
-        <w:t xml:space="preserve"> and use more battery </w:t>
-      </w:r>
-      <w:r>
-        <w:t>energy</w:t>
+        <w:t xml:space="preserve">Radio Pause: </w:t>
+      </w:r>
+      <w:proofErr w:type="spellStart"/>
+      <w:r>
+        <w:t>Sleep|Awake</w:t>
+      </w:r>
+      <w:proofErr w:type="spellEnd"/>
+    </w:p>
+    <w:p>
+      <w:r>
+        <w:t>During pause time the radio can be put into sleep mode. This lowers the power consumption and lets the battery last longer. However note that this also means that the DTMF commands are disabled since the radio is asleep!</w:t>
+      </w:r>
+    </w:p>
+    <w:p>
+      <w:pPr>
+        <w:pStyle w:val="Heading2"/>
+      </w:pPr>
+      <w:r>
+        <w:t>+</w:t>
+      </w:r>
+      <w:r>
+        <w:t>More Radio Settings</w:t>
+      </w:r>
+    </w:p>
+    <w:p>
+      <w:pPr>
+        <w:pStyle w:val="Heading3"/>
+      </w:pPr>
+      <w:r>
+        <w:t>RX Offset: -600|0|+600 kHz</w:t>
+      </w:r>
+    </w:p>
+    <w:p>
+      <w:r>
+        <w:t>This is the frequency offset from the transmit frequency that the radio uses to receive DTMF commands</w:t>
+      </w:r>
+      <w:r>
+        <w:t>. An offset is recommended. If 0 is used the radio will only listen when it isn’t sending. It has not been tested if it listens during sending when the offset is not 0.</w:t>
+      </w:r>
+    </w:p>
+    <w:p>
+      <w:pPr>
+        <w:pStyle w:val="Heading3"/>
+      </w:pPr>
+      <w:r>
+        <w:t>Bandwidth: 12.5|</w:t>
+      </w:r>
+      <w:r>
+        <w:t>25 kHz</w:t>
+      </w:r>
+    </w:p>
+    <w:p>
+      <w:r>
+        <w:t>This sets the radio bandwidth</w:t>
+      </w:r>
+      <w:r>
+        <w:t>. It has not been tested much to see what effect it has on performance yet.</w:t>
+      </w:r>
+    </w:p>
+    <w:p>
+      <w:pPr>
+        <w:pStyle w:val="Heading3"/>
+      </w:pPr>
+      <w:r>
+        <w:t>CTCSS/DCS: CTCSS|DCS</w:t>
+      </w:r>
+    </w:p>
+    <w:p>
+      <w:r>
+        <w:t xml:space="preserve">This sets the </w:t>
+      </w:r>
+      <w:r>
+        <w:t>un-squelch</w:t>
+      </w:r>
+      <w:r>
+        <w:t xml:space="preserve"> values</w:t>
+      </w:r>
+      <w:r>
+        <w:t xml:space="preserve"> for either the analog or digital versions.</w:t>
+      </w:r>
+    </w:p>
+    <w:p>
+      <w:pPr>
+        <w:pStyle w:val="Heading3"/>
+      </w:pPr>
+      <w:r>
+        <w:t>TX CTCSS:</w:t>
+      </w:r>
+      <w:r>
+        <w:t xml:space="preserve"> None</w:t>
+      </w:r>
+      <w:r>
+        <w:t>|</w:t>
+      </w:r>
+      <w:r>
+        <w:t>67-</w:t>
+      </w:r>
+      <w:r>
+        <w:t>250.3</w:t>
+      </w:r>
+    </w:p>
+    <w:p>
+      <w:r>
+        <w:t>Analog un-squelch frequencies sent out.</w:t>
+      </w:r>
+    </w:p>
+    <w:p>
+      <w:pPr>
+        <w:pStyle w:val="Heading3"/>
+      </w:pPr>
+      <w:r>
+        <w:t>RX CTCSS:</w:t>
+      </w:r>
+      <w:r>
+        <w:t xml:space="preserve"> None|67-250.3</w:t>
+      </w:r>
+    </w:p>
+    <w:p>
+      <w:r>
+        <w:t>Analog un-squelch frequency for receiving.</w:t>
+      </w:r>
+    </w:p>
+    <w:p>
+      <w:pPr>
+        <w:pStyle w:val="Heading3"/>
+      </w:pPr>
+      <w:r>
+        <w:t>TX DCS:</w:t>
+      </w:r>
+      <w:r>
+        <w:t xml:space="preserve"> None|023-754</w:t>
+      </w:r>
+    </w:p>
+    <w:p>
+      <w:r>
+        <w:t>Digital un-squelch value for sending.</w:t>
+      </w:r>
+    </w:p>
+    <w:p>
+      <w:pPr>
+        <w:pStyle w:val="Heading3"/>
+      </w:pPr>
+      <w:r>
+        <w:lastRenderedPageBreak/>
+        <w:t>TX I/N: I|N</w:t>
+      </w:r>
+    </w:p>
+    <w:p>
+      <w:r>
+        <w:t>The digital I or N value for sending.</w:t>
+      </w:r>
+    </w:p>
+    <w:p>
+      <w:pPr>
+        <w:pStyle w:val="Heading3"/>
+      </w:pPr>
+      <w:r>
+        <w:t>RX DCS: None|023-754</w:t>
+      </w:r>
+    </w:p>
+    <w:p>
+      <w:r>
+        <w:t>Digital un-squelch value for receiving.</w:t>
+      </w:r>
+    </w:p>
+    <w:p>
+      <w:pPr>
+        <w:pStyle w:val="Heading3"/>
+      </w:pPr>
+      <w:r>
+        <w:t>RX I/N: I|N</w:t>
+      </w:r>
+    </w:p>
+    <w:p>
+      <w:r>
+        <w:t>The digital I or N value for receiving.</w:t>
+      </w:r>
+    </w:p>
+    <w:p>
+      <w:pPr>
+        <w:pStyle w:val="Heading3"/>
+      </w:pPr>
+      <w:r>
+        <w:t>RX Volume:</w:t>
+      </w:r>
+      <w:r>
+        <w:t xml:space="preserve"> 1-6</w:t>
+      </w:r>
+    </w:p>
+    <w:p>
+      <w:r>
+        <w:t>This is the receive volume setting. It affects how well DTMF tones are detected.</w:t>
+      </w:r>
+    </w:p>
+    <w:p>
+      <w:pPr>
+        <w:pStyle w:val="Heading3"/>
+      </w:pPr>
+      <w:r>
+        <w:t>RX Squelch:</w:t>
+      </w:r>
+      <w:r>
+        <w:t xml:space="preserve"> 0-8</w:t>
+      </w:r>
+    </w:p>
+    <w:p>
+      <w:r>
+        <w:t>This affects how much signal is required to receive the DTMF signals.</w:t>
+      </w:r>
+    </w:p>
+    <w:p>
+      <w:pPr>
+        <w:pStyle w:val="Heading2"/>
+      </w:pPr>
+      <w:r>
+        <w:t>Cancel Waits/TX Now</w:t>
+      </w:r>
+    </w:p>
+    <w:p>
+      <w:r>
+        <w:t>When the radio is in either send or pause mode this command will cancel the timer and the next mo</w:t>
+      </w:r>
+      <w:r>
+        <w:t xml:space="preserve">de will start. For </w:t>
+      </w:r>
+      <w:r>
+        <w:t>example,</w:t>
+      </w:r>
+      <w:r>
+        <w:t xml:space="preserve"> if you want to cancel</w:t>
+      </w:r>
+      <w:r>
+        <w:t xml:space="preserve"> the pause and go to transmit, use this option. It can also be done by long pressing B0.</w:t>
+      </w:r>
+    </w:p>
+    <w:p>
+      <w:pPr>
+        <w:pStyle w:val="Heading2"/>
+      </w:pPr>
+      <w:r>
+        <w:t>+Saved Settings Files</w:t>
+      </w:r>
+    </w:p>
+    <w:p>
+      <w:r>
+        <w:t>Saved settings files are named files stored on the SD card. They are useful to</w:t>
+      </w:r>
+      <w:r>
+        <w:t xml:space="preserve"> quickly configure the radio for different uses. All values except the battery calibration are affected.</w:t>
+      </w:r>
+    </w:p>
+    <w:p>
+      <w:pPr>
+        <w:pStyle w:val="Heading3"/>
+      </w:pPr>
+      <w:r>
+        <w:t>Create File</w:t>
+      </w:r>
+    </w:p>
+    <w:p>
+      <w:r>
+        <w:t>This prompts the user for a name. The file is then created using the current system settings.</w:t>
+      </w:r>
+    </w:p>
+    <w:p>
+      <w:pPr>
+        <w:pStyle w:val="Heading3"/>
+      </w:pPr>
+      <w:r>
+        <w:t>Save/Update File</w:t>
+      </w:r>
+    </w:p>
+    <w:p>
+      <w:r>
+        <w:t>This command saves the current settings into the selected file. If it already exists the user will be asked to confirm overwriting the file.</w:t>
+      </w:r>
+    </w:p>
+    <w:p>
+      <w:pPr>
+        <w:pStyle w:val="Heading3"/>
+      </w:pPr>
+      <w:r>
+        <w:t>Load File</w:t>
+      </w:r>
+    </w:p>
+    <w:p>
+      <w:r>
+        <w:t>This command asks the user for the name and then sets all of the system settings except the battery calibration using the values in the file.</w:t>
+      </w:r>
+    </w:p>
+    <w:p>
+      <w:pPr>
+        <w:pStyle w:val="Heading3"/>
+      </w:pPr>
+      <w:r>
+        <w:lastRenderedPageBreak/>
+        <w:t>Delete File</w:t>
+      </w:r>
+    </w:p>
+    <w:p>
+      <w:r>
+        <w:t>The user selects a file from the list and then it can be deleted.</w:t>
+      </w:r>
+    </w:p>
+    <w:p>
+      <w:pPr>
+        <w:pStyle w:val="Heading2"/>
+      </w:pPr>
+      <w:r>
+        <w:t>+System Settings</w:t>
+      </w:r>
+    </w:p>
+    <w:p>
+      <w:pPr>
+        <w:pStyle w:val="Heading3"/>
+      </w:pPr>
+      <w:r>
+        <w:t>+Display</w:t>
+      </w:r>
+      <w:r>
+        <w:t xml:space="preserve"> Settings</w:t>
+      </w:r>
+    </w:p>
+    <w:p>
+      <w:pPr>
+        <w:pStyle w:val="Heading4"/>
+      </w:pPr>
+      <w:r>
+        <w:t xml:space="preserve">Dimming Mode: </w:t>
+      </w:r>
+      <w:proofErr w:type="spellStart"/>
+      <w:r>
+        <w:t>None</w:t>
+      </w:r>
+      <w:r>
+        <w:t>|Timer</w:t>
+      </w:r>
+      <w:proofErr w:type="spellEnd"/>
+    </w:p>
+    <w:p>
+      <w:r>
+        <w:t xml:space="preserve">The display can be set to dim automatically after a specified number of seconds. This is used to save battery power since the backlight </w:t>
+      </w:r>
+      <w:r>
+        <w:t>uses a significant amount.</w:t>
+      </w:r>
+    </w:p>
+    <w:p>
+      <w:pPr>
+        <w:pStyle w:val="Heading4"/>
+      </w:pPr>
+      <w:r>
+        <w:t>Bright Value: 1-100</w:t>
+      </w:r>
+      <w:r>
+        <w:t>%</w:t>
+      </w:r>
+    </w:p>
+    <w:p>
+      <w:r>
+        <w:t>Set the display brightness value.</w:t>
+      </w:r>
+    </w:p>
+    <w:p>
+      <w:pPr>
+        <w:pStyle w:val="Heading4"/>
+      </w:pPr>
+      <w:r>
+        <w:t xml:space="preserve">Dim Value: </w:t>
+      </w:r>
+      <w:r>
+        <w:t>0-100%</w:t>
+      </w:r>
+    </w:p>
+    <w:p>
+      <w:r>
+        <w:t xml:space="preserve">Set the display brightness after the </w:t>
+      </w:r>
+      <w:r>
+        <w:t>timer below expires.</w:t>
+      </w:r>
+    </w:p>
+    <w:p>
+      <w:pPr>
+        <w:pStyle w:val="Heading4"/>
+      </w:pPr>
+      <w:r>
+        <w:t>Display Dim Time:</w:t>
+      </w:r>
+      <w:r>
+        <w:t xml:space="preserve"> 0-120 S</w:t>
+      </w:r>
+    </w:p>
+    <w:p>
+      <w:r>
+        <w:t>Specify the time until the display changes to dim mode.</w:t>
+      </w:r>
+    </w:p>
+    <w:p>
+      <w:pPr>
+        <w:pStyle w:val="Heading4"/>
+      </w:pPr>
+      <w:r>
+        <w:t>+Sideways Scroll Settings</w:t>
+      </w:r>
+    </w:p>
+    <w:p>
+      <w:r>
+        <w:t>Lines of text that too long for the display will scroll back and forth. The following settings control the speed.</w:t>
+      </w:r>
+    </w:p>
+    <w:p>
+      <w:pPr>
+        <w:pStyle w:val="Heading5"/>
+      </w:pPr>
+      <w:r>
+        <w:t xml:space="preserve">Speed: </w:t>
+      </w:r>
+      <w:r>
+        <w:t>1-1000 mS</w:t>
+      </w:r>
+    </w:p>
+    <w:p>
+      <w:r>
+        <w:t>Controls the speed of text moving to the left.</w:t>
+      </w:r>
+    </w:p>
+    <w:p>
+      <w:pPr>
+        <w:pStyle w:val="Heading5"/>
+      </w:pPr>
+      <w:r>
+        <w:t>Pause: 1-100</w:t>
+      </w:r>
+      <w:r>
+        <w:t xml:space="preserve"> mS</w:t>
+      </w:r>
+    </w:p>
+    <w:p>
+      <w:r>
+        <w:t>This controls the pause when the text is at the end (all the way to the left).</w:t>
+      </w:r>
+    </w:p>
+    <w:p>
+      <w:pPr>
+        <w:pStyle w:val="Heading5"/>
+      </w:pPr>
+      <w:r>
+        <w:t>Reverse Speed: 1-20x</w:t>
+      </w:r>
+    </w:p>
+    <w:p>
+      <w:r>
+        <w:t xml:space="preserve">This is how fast the text scrolls </w:t>
+      </w:r>
+      <w:r>
+        <w:t>back to the beginning (to the right). 2x means twice as fast as the text scroll</w:t>
+      </w:r>
+      <w:r>
+        <w:t>ed to the left</w:t>
       </w:r>
       <w:r>
         <w:t>.</w:t>
@@ -2817,450 +3684,21 @@
     </w:p>
     <w:p>
       <w:pPr>
-        <w:pStyle w:val="Heading3"/>
-      </w:pPr>
-      <w:r>
-        <w:t>TX Pause:10-1200 Sec</w:t>
-      </w:r>
-    </w:p>
-    <w:p>
-      <w:r>
-        <w:t>This is the pause time between transmissions</w:t>
-      </w:r>
-      <w:r>
-        <w:t>. Longer times let the radio cool off and save the battery for longer run times.</w:t>
-      </w:r>
-    </w:p>
-    <w:p>
-      <w:pPr>
-        <w:pStyle w:val="Heading3"/>
-      </w:pPr>
-      <w:r>
-        <w:t>TX Send Min: 10-90 Sec</w:t>
-      </w:r>
-    </w:p>
-    <w:p>
-      <w:r>
-        <w:t>In random mode this is the minimum send time.</w:t>
-      </w:r>
-    </w:p>
-    <w:p>
-      <w:pPr>
-        <w:pStyle w:val="Heading3"/>
-      </w:pPr>
-      <w:r>
-        <w:t xml:space="preserve">TX Send Max: </w:t>
-      </w:r>
-      <w:r>
-        <w:t>10-90 Sec</w:t>
-      </w:r>
-    </w:p>
-    <w:p>
-      <w:r>
-        <w:t xml:space="preserve">In </w:t>
-      </w:r>
-      <w:r>
-        <w:t>random mode this is the maximum send time.</w:t>
-      </w:r>
-    </w:p>
-    <w:p>
-      <w:pPr>
-        <w:pStyle w:val="Heading3"/>
-      </w:pPr>
-      <w:r>
-        <w:t>TX Pause Min: 10-1200 Sec</w:t>
-      </w:r>
-    </w:p>
-    <w:p>
-      <w:r>
-        <w:t>In random mode this is the minimum pause time.</w:t>
-      </w:r>
-    </w:p>
-    <w:p>
-      <w:pPr>
-        <w:pStyle w:val="Heading3"/>
-      </w:pPr>
-      <w:r>
-        <w:t>TX Pause Max: 10-1200 Sec</w:t>
-      </w:r>
-    </w:p>
-    <w:p>
-      <w:r>
-        <w:t>In random mode this is the maximum pause time.</w:t>
-      </w:r>
-    </w:p>
-    <w:p>
-      <w:pPr>
-        <w:pStyle w:val="Heading3"/>
-      </w:pPr>
-      <w:r>
-        <w:t>TX Stop: Immediate|Finish Cycle</w:t>
-      </w:r>
-    </w:p>
-    <w:p>
-      <w:r>
-        <w:t>During transmit time the Beacon, Call Sign, and Audio are continuously sent. At the end of the transmission time this option controls whether the transmission stops immediately o</w:t>
-      </w:r>
-      <w:r>
-        <w:t>r</w:t>
-      </w:r>
-      <w:r>
-        <w:t xml:space="preserve"> waits to stop until the entire cycle is finished.</w:t>
-      </w:r>
-    </w:p>
-    <w:p/>
-    <w:p>
-      <w:r>
-        <w:lastRenderedPageBreak/>
-        <w:t>A clever use of this command</w:t>
-      </w:r>
-      <w:r>
-        <w:t xml:space="preserve"> allows for only one cycle of beacon, ID, and music to be sent during each transmission time. Set the transmit</w:t>
-      </w:r>
-      <w:r>
-        <w:t xml:space="preserve"> time to something less than</w:t>
-      </w:r>
-      <w:r>
-        <w:t xml:space="preserve"> the time to perform a complete cycle and set this option to “Finish Cycle”. The transmit  cycle will begin, the timer will expire, but the current cycle will complete before stopping</w:t>
-      </w:r>
-      <w:r>
-        <w:t>.</w:t>
-      </w:r>
-    </w:p>
-    <w:p>
-      <w:pPr>
-        <w:pStyle w:val="Heading3"/>
-      </w:pPr>
-      <w:r>
-        <w:t>Radio Pause: Sleep|Awake</w:t>
-      </w:r>
-    </w:p>
-    <w:p>
-      <w:r>
-        <w:t>During pause time the radio can be put into sleep mode. This lowers the power consumption and lets the battery last longer. However note that this also means that the DTMF commands are disabled since the radio is asleep!</w:t>
-      </w:r>
-    </w:p>
-    <w:p>
-      <w:pPr>
-        <w:pStyle w:val="Heading2"/>
-      </w:pPr>
-      <w:r>
-        <w:t>+</w:t>
-      </w:r>
-      <w:r>
-        <w:t>More Radio Settings</w:t>
-      </w:r>
-    </w:p>
-    <w:p>
-      <w:pPr>
-        <w:pStyle w:val="Heading3"/>
-      </w:pPr>
-      <w:r>
-        <w:t>RX Offset: -600|0|+600 kHz</w:t>
-      </w:r>
-    </w:p>
-    <w:p>
-      <w:r>
-        <w:t>This is the frequency offset from the transmit frequency that the radio uses to receive DTMF commands</w:t>
-      </w:r>
-      <w:r>
-        <w:t>. An offset is recommended. If 0 is used the radio will only listen when it isn’t sending. It has not been tested if it listens during sending when the offset is not 0.</w:t>
-      </w:r>
-    </w:p>
-    <w:p>
-      <w:pPr>
-        <w:pStyle w:val="Heading3"/>
-      </w:pPr>
-      <w:r>
-        <w:t>Bandwidth: 12.5|</w:t>
-      </w:r>
-      <w:r>
-        <w:t>25 kHz</w:t>
-      </w:r>
-    </w:p>
-    <w:p>
-      <w:r>
-        <w:t>This sets the radio bandwidth</w:t>
-      </w:r>
-      <w:r>
-        <w:t>. It has not been tested much to see what effect it has on performance yet.</w:t>
-      </w:r>
-    </w:p>
-    <w:p>
-      <w:pPr>
-        <w:pStyle w:val="Heading3"/>
-      </w:pPr>
-      <w:r>
-        <w:t>CTCSS/DCS: CTCSS|DCS</w:t>
-      </w:r>
-    </w:p>
-    <w:p>
-      <w:r>
-        <w:t xml:space="preserve">This sets the </w:t>
-      </w:r>
-      <w:r>
-        <w:t>un-squelch</w:t>
-      </w:r>
-      <w:r>
-        <w:t xml:space="preserve"> values</w:t>
-      </w:r>
-      <w:r>
-        <w:t xml:space="preserve"> for either the analog or digital versions.</w:t>
-      </w:r>
-    </w:p>
-    <w:p>
-      <w:pPr>
-        <w:pStyle w:val="Heading3"/>
-      </w:pPr>
-      <w:r>
-        <w:t>TX CTCSS:</w:t>
-      </w:r>
-      <w:r>
-        <w:t xml:space="preserve"> None</w:t>
-      </w:r>
-      <w:r>
-        <w:t>|</w:t>
-      </w:r>
-      <w:r>
-        <w:t>67-</w:t>
-      </w:r>
-      <w:r>
-        <w:t>250.3</w:t>
-      </w:r>
-    </w:p>
-    <w:p>
-      <w:r>
-        <w:t>Analog un-squelch frequencies sent out.</w:t>
-      </w:r>
-    </w:p>
-    <w:p>
-      <w:pPr>
-        <w:pStyle w:val="Heading3"/>
-      </w:pPr>
-      <w:r>
-        <w:t>RX CTCSS:</w:t>
-      </w:r>
-      <w:r>
-        <w:t xml:space="preserve"> None|67-250.3</w:t>
-      </w:r>
-    </w:p>
-    <w:p>
-      <w:r>
-        <w:t>Analog un-squelch frequency for receiving.</w:t>
-      </w:r>
-    </w:p>
-    <w:p>
-      <w:pPr>
-        <w:pStyle w:val="Heading3"/>
-      </w:pPr>
-      <w:r>
-        <w:t>TX DCS:</w:t>
-      </w:r>
-      <w:r>
-        <w:t xml:space="preserve"> None|023-754</w:t>
-      </w:r>
-    </w:p>
-    <w:p>
-      <w:r>
-        <w:t>Digital un-squelch value for sending.</w:t>
-      </w:r>
-    </w:p>
-    <w:p>
-      <w:pPr>
-        <w:pStyle w:val="Heading3"/>
-      </w:pPr>
-      <w:r>
-        <w:t>TX I/N: I|N</w:t>
-      </w:r>
-    </w:p>
-    <w:p>
-      <w:r>
-        <w:t>The digital I or N value for sending.</w:t>
-      </w:r>
-    </w:p>
-    <w:p>
-      <w:pPr>
-        <w:pStyle w:val="Heading3"/>
-      </w:pPr>
-      <w:r>
-        <w:t>RX DCS: None|023-754</w:t>
-      </w:r>
-    </w:p>
-    <w:p>
-      <w:r>
-        <w:t>Digital un-squelch value for receiving.</w:t>
-      </w:r>
-    </w:p>
-    <w:p>
-      <w:pPr>
-        <w:pStyle w:val="Heading3"/>
-      </w:pPr>
-      <w:r>
-        <w:lastRenderedPageBreak/>
-        <w:t>RX I/N: I|N</w:t>
-      </w:r>
-    </w:p>
-    <w:p>
-      <w:r>
-        <w:t>The digital I or N value for receiving.</w:t>
-      </w:r>
-    </w:p>
-    <w:p>
-      <w:pPr>
-        <w:pStyle w:val="Heading3"/>
-      </w:pPr>
-      <w:r>
-        <w:t>RX Volume:</w:t>
-      </w:r>
-      <w:r>
-        <w:t xml:space="preserve"> 1-6</w:t>
-      </w:r>
-    </w:p>
-    <w:p>
-      <w:r>
-        <w:t>This is the receive volume setting. It affects how well DTMF tones are detected.</w:t>
-      </w:r>
-    </w:p>
-    <w:p>
-      <w:pPr>
-        <w:pStyle w:val="Heading3"/>
-      </w:pPr>
-      <w:r>
-        <w:t>RX Squelch:</w:t>
-      </w:r>
-      <w:r>
-        <w:t xml:space="preserve"> 0-8</w:t>
-      </w:r>
-    </w:p>
-    <w:p>
-      <w:r>
-        <w:t>This affects how much signal is required to receive the DTMF signals.</w:t>
-      </w:r>
-    </w:p>
-    <w:p>
-      <w:pPr>
-        <w:pStyle w:val="Heading2"/>
-      </w:pPr>
-      <w:r>
-        <w:t>Cancel Waits/TX Now</w:t>
-      </w:r>
-    </w:p>
-    <w:p>
-      <w:r>
-        <w:t>When the radio is in either send or pause mode this command will cancel the timer and the next mo</w:t>
-      </w:r>
-      <w:r>
-        <w:t>de will start. For example if you want to cancel</w:t>
-      </w:r>
-      <w:r>
-        <w:t xml:space="preserve"> the pause and go to transmit, use this option. It can also be done by long pressing B0.</w:t>
-      </w:r>
-    </w:p>
-    <w:p>
-      <w:pPr>
-        <w:pStyle w:val="Heading2"/>
-      </w:pPr>
-      <w:r>
-        <w:t>+Saved Settings Files</w:t>
-      </w:r>
-    </w:p>
-    <w:p>
-      <w:r>
-        <w:t>Saved settings files are named files stored on the SD card. They are useful to</w:t>
-      </w:r>
-      <w:r>
-        <w:t xml:space="preserve"> quickly configure the radio for different uses. All values except the battery calibration are affected.</w:t>
-      </w:r>
-    </w:p>
-    <w:p>
-      <w:pPr>
-        <w:pStyle w:val="Heading3"/>
-      </w:pPr>
-      <w:r>
-        <w:t>Create File</w:t>
-      </w:r>
-    </w:p>
-    <w:p>
-      <w:r>
-        <w:t>This prompts the user for a name. The file is then created using the current system settings.</w:t>
-      </w:r>
-    </w:p>
-    <w:p>
-      <w:pPr>
-        <w:pStyle w:val="Heading3"/>
-      </w:pPr>
-      <w:r>
-        <w:t>Save/Update File</w:t>
-      </w:r>
-    </w:p>
-    <w:p>
-      <w:r>
-        <w:t>This command saves the current settings into the selected file. If it already exists the user will be asked to confirm overwriting the file.</w:t>
-      </w:r>
-    </w:p>
-    <w:p>
-      <w:pPr>
-        <w:pStyle w:val="Heading3"/>
-      </w:pPr>
-      <w:r>
-        <w:t>Load File</w:t>
-      </w:r>
-    </w:p>
-    <w:p>
-      <w:r>
-        <w:t>This command asks the user for the name and then sets all of the system settings except the battery calibration using the values in the file.</w:t>
-      </w:r>
-    </w:p>
-    <w:p>
-      <w:pPr>
-        <w:pStyle w:val="Heading3"/>
-      </w:pPr>
-      <w:r>
-        <w:t>Delete File</w:t>
-      </w:r>
-    </w:p>
-    <w:p>
-      <w:r>
-        <w:t>The user selects a file from the list and then it can be deleted.</w:t>
-      </w:r>
-    </w:p>
-    <w:p>
-      <w:pPr>
-        <w:pStyle w:val="Heading2"/>
-      </w:pPr>
-      <w:r>
-        <w:lastRenderedPageBreak/>
-        <w:t>+System Settings</w:t>
-      </w:r>
-    </w:p>
-    <w:p>
-      <w:pPr>
-        <w:pStyle w:val="Heading3"/>
-      </w:pPr>
-      <w:r>
-        <w:t>+Display</w:t>
-      </w:r>
-      <w:r>
-        <w:t xml:space="preserve"> Settings</w:t>
-      </w:r>
-    </w:p>
-    <w:p>
-      <w:pPr>
         <w:pStyle w:val="Heading4"/>
       </w:pPr>
       <w:r>
-        <w:t>Dimming Mode: None</w:t>
-      </w:r>
-      <w:r>
-        <w:t>|Timer</w:t>
-      </w:r>
-    </w:p>
-    <w:p>
-      <w:r>
-        <w:t xml:space="preserve">The display can be set to dim automatically after a specified number of seconds. This is used to save battery power since the backlight </w:t>
-      </w:r>
-      <w:r>
-        <w:t>uses a significant amount.</w:t>
+        <w:t xml:space="preserve">Menu Selection: </w:t>
+      </w:r>
+      <w:r>
+        <w:t>Color|*</w:t>
+      </w:r>
+    </w:p>
+    <w:p>
+      <w:r>
+        <w:t>Menu selections</w:t>
+      </w:r>
+      <w:r>
+        <w:t xml:space="preserve"> and selections from a list can be either colored or marked with the ‘*’ character.</w:t>
       </w:r>
     </w:p>
     <w:p>
@@ -3268,144 +3706,15 @@
         <w:pStyle w:val="Heading4"/>
       </w:pPr>
       <w:r>
-        <w:t>Bright Value: 1-100</w:t>
-      </w:r>
-      <w:r>
-        <w:t>%</w:t>
-      </w:r>
-    </w:p>
-    <w:p>
-      <w:r>
-        <w:t>Set the display brightness value.</w:t>
-      </w:r>
-    </w:p>
-    <w:p>
-      <w:pPr>
-        <w:pStyle w:val="Heading4"/>
-      </w:pPr>
-      <w:r>
-        <w:t xml:space="preserve">Dim Value: </w:t>
-      </w:r>
-      <w:r>
-        <w:t>0-100%</w:t>
-      </w:r>
-    </w:p>
-    <w:p>
-      <w:r>
-        <w:t xml:space="preserve">Set the display brightness after the </w:t>
-      </w:r>
-      <w:r>
-        <w:t>timer below expires.</w:t>
-      </w:r>
-    </w:p>
-    <w:p>
-      <w:pPr>
-        <w:pStyle w:val="Heading4"/>
-      </w:pPr>
-      <w:r>
-        <w:t>Display Dim Time:</w:t>
-      </w:r>
-      <w:r>
-        <w:t xml:space="preserve"> 0-120 S</w:t>
-      </w:r>
-    </w:p>
-    <w:p>
-      <w:r>
-        <w:t>Specify the time until the display changes to dim mode.</w:t>
-      </w:r>
-    </w:p>
-    <w:p>
-      <w:pPr>
-        <w:pStyle w:val="Heading4"/>
-      </w:pPr>
-      <w:r>
-        <w:t>+Sideways Scroll Settings</w:t>
-      </w:r>
-    </w:p>
-    <w:p>
-      <w:r>
-        <w:t>Lines of text that too long for the display will scroll back and forth. The following settings control the speed.</w:t>
-      </w:r>
-    </w:p>
-    <w:p>
-      <w:pPr>
-        <w:pStyle w:val="Heading5"/>
-      </w:pPr>
-      <w:r>
-        <w:t xml:space="preserve">Speed: </w:t>
-      </w:r>
-      <w:r>
-        <w:t>1-1000 mS</w:t>
-      </w:r>
-    </w:p>
-    <w:p>
-      <w:r>
-        <w:t>Controls the speed of text moving to the left.</w:t>
-      </w:r>
-    </w:p>
-    <w:p>
-      <w:pPr>
-        <w:pStyle w:val="Heading5"/>
-      </w:pPr>
-      <w:r>
-        <w:t>Pause: 1-100</w:t>
-      </w:r>
-      <w:r>
-        <w:t xml:space="preserve"> mS</w:t>
-      </w:r>
-    </w:p>
-    <w:p>
-      <w:r>
-        <w:t>This controls the pause when the text is at the end (all the way to the left).</w:t>
-      </w:r>
-    </w:p>
-    <w:p>
-      <w:pPr>
-        <w:pStyle w:val="Heading5"/>
-      </w:pPr>
-      <w:r>
-        <w:t>Reverse Speed: 1-20x</w:t>
-      </w:r>
-    </w:p>
-    <w:p>
-      <w:r>
-        <w:t xml:space="preserve">This is how fast the text scrolls </w:t>
-      </w:r>
-      <w:r>
-        <w:t>back to the beginning (to the right). 2x means twice as fast as the text scroll</w:t>
-      </w:r>
-      <w:r>
-        <w:t>ed to the left</w:t>
-      </w:r>
-      <w:r>
-        <w:t>.</w:t>
-      </w:r>
-    </w:p>
-    <w:p>
-      <w:pPr>
-        <w:pStyle w:val="Heading4"/>
-      </w:pPr>
-      <w:r>
-        <w:t xml:space="preserve">Menu Selection: </w:t>
-      </w:r>
-      <w:r>
-        <w:t>Color|*</w:t>
-      </w:r>
-    </w:p>
-    <w:p>
-      <w:r>
-        <w:t>Menu selections</w:t>
-      </w:r>
-      <w:r>
-        <w:t xml:space="preserve"> and selections from a list can be either colored or marked with the ‘*’ character.</w:t>
-      </w:r>
-    </w:p>
-    <w:p>
-      <w:pPr>
-        <w:pStyle w:val="Heading4"/>
-      </w:pPr>
-      <w:r>
-        <w:t>Text/HiLite Colors</w:t>
+        <w:t>Text/</w:t>
+      </w:r>
+      <w:proofErr w:type="spellStart"/>
+      <w:r>
+        <w:t>HiLite</w:t>
+      </w:r>
+      <w:proofErr w:type="spellEnd"/>
+      <w:r>
+        <w:t xml:space="preserve"> Colors</w:t>
       </w:r>
     </w:p>
     <w:p>
@@ -3427,8 +3736,13 @@
         <w:pStyle w:val="Heading4"/>
       </w:pPr>
       <w:r>
-        <w:t>Direction: Normal:Reverse</w:t>
-      </w:r>
+        <w:t xml:space="preserve">Direction: </w:t>
+      </w:r>
+      <w:proofErr w:type="spellStart"/>
+      <w:r>
+        <w:t>Normal:Reverse</w:t>
+      </w:r>
+      <w:proofErr w:type="spellEnd"/>
     </w:p>
     <w:p>
       <w:r>
@@ -3469,8 +3783,13 @@
         <w:pStyle w:val="Heading4"/>
       </w:pPr>
       <w:r>
-        <w:t>Show Battery: Yes|No</w:t>
-      </w:r>
+        <w:t xml:space="preserve">Show Battery: </w:t>
+      </w:r>
+      <w:proofErr w:type="spellStart"/>
+      <w:r>
+        <w:t>Yes|No</w:t>
+      </w:r>
+      <w:proofErr w:type="spellEnd"/>
     </w:p>
     <w:p>
       <w:r>
@@ -3535,7 +3854,15 @@
         <w:t xml:space="preserve">New firmware can be loaded by putting </w:t>
       </w:r>
       <w:r>
-        <w:t>the binary file on the SD card. It must be named RadioFox.BIN.</w:t>
+        <w:t xml:space="preserve">the binary file on the SD card. It must be named </w:t>
+      </w:r>
+      <w:proofErr w:type="spellStart"/>
+      <w:r>
+        <w:t>RadioFox.BIN</w:t>
+      </w:r>
+      <w:proofErr w:type="spellEnd"/>
+      <w:r>
+        <w:t>.</w:t>
       </w:r>
       <w:r>
         <w:t xml:space="preserve"> There are two prompts, one to confirm overwriting the firmware, and another to allow deletion of the </w:t>
@@ -3586,7 +3913,15 @@
         <w:t xml:space="preserve">and reset </w:t>
       </w:r>
       <w:r>
-        <w:t>the eeprom where the settings are save</w:t>
+        <w:t xml:space="preserve">the </w:t>
+      </w:r>
+      <w:proofErr w:type="spellStart"/>
+      <w:r>
+        <w:t>eeprom</w:t>
+      </w:r>
+      <w:proofErr w:type="spellEnd"/>
+      <w:r>
+        <w:t xml:space="preserve"> where the settings are save</w:t>
       </w:r>
       <w:r>
         <w:t xml:space="preserve"> in non-volatile memory. This is how settings are saved while the system is not powered.</w:t>
@@ -3622,7 +3957,7 @@
       </w:r>
     </w:p>
     <w:sectPr>
-      <w:footerReference w:type="default" r:id="rId11"/>
+      <w:footerReference w:type="default" r:id="rId12"/>
       <w:pgSz w:w="12240" w:h="15840"/>
       <w:pgMar w:top="1440" w:right="1440" w:bottom="1440" w:left="1440" w:header="720" w:footer="720" w:gutter="0"/>
       <w:pgNumType w:start="1"/>
@@ -5923,7 +6258,6 @@
   <w:style w:type="character" w:default="1" w:styleId="DefaultParagraphFont">
     <w:name w:val="Default Paragraph Font"/>
     <w:uiPriority w:val="1"/>
-    <w:semiHidden/>
     <w:unhideWhenUsed/>
   </w:style>
   <w:style w:type="table" w:default="1" w:styleId="TableNormal">

</xml_diff>

<commit_message>
Update FOX_Version to 1.15.0 and fix firmware update command. Change partition table handling in platformio.ini.
</commit_message>
<xml_diff>
--- a/RadioFox.docx
+++ b/RadioFox.docx
@@ -346,33 +346,11 @@
         <w:t xml:space="preserve">he source code can be found at </w:t>
       </w:r>
       <w:hyperlink r:id="rId9" w:history="1">
-        <w:proofErr w:type="spellStart"/>
         <w:r>
           <w:rPr>
             <w:rStyle w:val="Hyperlink"/>
           </w:rPr>
-          <w:t>MartinNohr</w:t>
-        </w:r>
-        <w:proofErr w:type="spellEnd"/>
-        <w:r>
-          <w:rPr>
-            <w:rStyle w:val="Hyperlink"/>
-          </w:rPr>
-          <w:t>/</w:t>
-        </w:r>
-        <w:proofErr w:type="spellStart"/>
-        <w:r>
-          <w:rPr>
-            <w:rStyle w:val="Hyperlink"/>
-          </w:rPr>
-          <w:t>RadioFox</w:t>
-        </w:r>
-        <w:proofErr w:type="spellEnd"/>
-        <w:r>
-          <w:rPr>
-            <w:rStyle w:val="Hyperlink"/>
-          </w:rPr>
-          <w:t>: Ham Radio Fox Software</w:t>
+          <w:t>MartinNohr/RadioFox: Ham Radio Fox Software</w:t>
         </w:r>
       </w:hyperlink>
     </w:p>
@@ -425,6 +403,38 @@
       </w:r>
       <w:r>
         <w:t xml:space="preserve"> are described below.</w:t>
+      </w:r>
+    </w:p>
+    <w:p>
+      <w:r>
+        <w:t>Version 1.15</w:t>
+      </w:r>
+    </w:p>
+    <w:p>
+      <w:pPr>
+        <w:pStyle w:val="ListParagraph"/>
+        <w:numPr>
+          <w:ilvl w:val="0"/>
+          <w:numId w:val="14"/>
+        </w:numPr>
+      </w:pPr>
+      <w:r>
+        <w:t>Fixed the update firmware command. It was sadly broken in previous versions</w:t>
+      </w:r>
+      <w:r>
+        <w:t>.</w:t>
+      </w:r>
+      <w:r>
+        <w:t xml:space="preserve"> It can only be updated</w:t>
+      </w:r>
+      <w:r>
+        <w:t xml:space="preserve"> using a binary loader program.</w:t>
+      </w:r>
+      <w:r>
+        <w:t xml:space="preserve"> The factory bin file is required since the partition table has been changed.</w:t>
+      </w:r>
+      <w:r>
+        <w:t xml:space="preserve"> You can also send the esp32 back to me and I will program it for free.</w:t>
       </w:r>
     </w:p>
     <w:p>
@@ -441,15 +451,7 @@
         </w:numPr>
       </w:pPr>
       <w:r>
-        <w:t xml:space="preserve">Added ability to play WAV and MP3 files. Removed the immediate </w:t>
-      </w:r>
-      <w:proofErr w:type="spellStart"/>
-      <w:r>
-        <w:t>txstop</w:t>
-      </w:r>
-      <w:proofErr w:type="spellEnd"/>
-      <w:r>
-        <w:t xml:space="preserve"> option as it could leave the audio player in an untidy state.</w:t>
+        <w:t>Added ability to play WAV and MP3 files. Removed the immediate txstop option as it could leave the audio player in an untidy state.</w:t>
       </w:r>
       <w:r>
         <w:t xml:space="preserve"> Updated </w:t>
@@ -460,6 +462,7 @@
     </w:p>
     <w:p>
       <w:r>
+        <w:lastRenderedPageBreak/>
         <w:t>Version 1.13</w:t>
       </w:r>
     </w:p>
@@ -472,15 +475,7 @@
         </w:numPr>
       </w:pPr>
       <w:r>
-        <w:t xml:space="preserve">Ported the code to </w:t>
-      </w:r>
-      <w:proofErr w:type="spellStart"/>
-      <w:r>
-        <w:t>espressif</w:t>
-      </w:r>
-      <w:proofErr w:type="spellEnd"/>
-      <w:r>
-        <w:t xml:space="preserve"> core 3.x instead of requiring 2.0.17.</w:t>
+        <w:t>Ported the code to espressif core 3.x instead of requiring 2.0.17.</w:t>
       </w:r>
     </w:p>
     <w:p>
@@ -497,7 +492,6 @@
         </w:numPr>
       </w:pPr>
       <w:r>
-        <w:lastRenderedPageBreak/>
         <w:t>Moved latitude and long</w:t>
       </w:r>
       <w:r>
@@ -654,16 +648,8 @@
         <w:rPr>
           <w:lang w:val="en-US"/>
         </w:rPr>
-        <w:t xml:space="preserve">Added a switch to limit the frequency range to that allowed for beacon use in ITU region 2. The range is 144.276-144.300 </w:t>
-      </w:r>
-      <w:proofErr w:type="spellStart"/>
-      <w:r>
-        <w:rPr>
-          <w:lang w:val="en-US"/>
-        </w:rPr>
-        <w:t>MHz.</w:t>
-      </w:r>
-      <w:proofErr w:type="spellEnd"/>
+        <w:t>Added a switch to limit the frequency range to that allowed for beacon use in ITU region 2. The range is 144.276-144.300 MHz.</w:t>
+      </w:r>
     </w:p>
     <w:p>
       <w:r>
@@ -807,6 +793,7 @@
       <w:bookmarkEnd w:id="4"/>
       <w:bookmarkEnd w:id="5"/>
       <w:r>
+        <w:lastRenderedPageBreak/>
         <w:t>The Hardware</w:t>
       </w:r>
     </w:p>
@@ -864,35 +851,14 @@
         <w:rPr>
           <w:lang w:val="en-US"/>
         </w:rPr>
-        <w:t xml:space="preserve"> The batteries I use are </w:t>
-      </w:r>
-      <w:r>
-        <w:rPr>
-          <w:lang w:val="en-US"/>
-        </w:rPr>
-        <w:lastRenderedPageBreak/>
-        <w:t xml:space="preserve">found here: </w:t>
+        <w:t xml:space="preserve"> The batteries I use are found here: </w:t>
       </w:r>
       <w:hyperlink r:id="rId10" w:history="1">
         <w:r>
           <w:rPr>
             <w:rStyle w:val="Hyperlink"/>
           </w:rPr>
-          <w:t xml:space="preserve">Protected 3400mAh 10A 18650 Button Top Battery - Wholesale Discount – </w:t>
-        </w:r>
-        <w:proofErr w:type="spellStart"/>
-        <w:r>
-          <w:rPr>
-            <w:rStyle w:val="Hyperlink"/>
-          </w:rPr>
-          <w:t>Liion</w:t>
-        </w:r>
-        <w:proofErr w:type="spellEnd"/>
-        <w:r>
-          <w:rPr>
-            <w:rStyle w:val="Hyperlink"/>
-          </w:rPr>
-          <w:t xml:space="preserve"> Wholesale Batteries</w:t>
+          <w:t>Protected 3400mAh 10A 18650 Button Top Battery - Wholesale Discount – Liion Wholesale Batteries</w:t>
         </w:r>
       </w:hyperlink>
       <w:r>
@@ -1036,6 +1002,7 @@
         <w:pStyle w:val="Heading1"/>
       </w:pPr>
       <w:r>
+        <w:lastRenderedPageBreak/>
         <w:t>Tone Files</w:t>
       </w:r>
     </w:p>
@@ -1056,37 +1023,12 @@
         <w:t xml:space="preserve">The files are saved as .TXT and simply contain a list of tones to be played. The format is similar the hard coded files from here: </w:t>
       </w:r>
       <w:hyperlink r:id="rId11">
-        <w:proofErr w:type="spellStart"/>
         <w:r>
           <w:rPr>
             <w:rStyle w:val="Hyperlink"/>
             <w:lang w:val="en-US"/>
           </w:rPr>
-          <w:t>robsoncouto</w:t>
-        </w:r>
-        <w:proofErr w:type="spellEnd"/>
-        <w:r>
-          <w:rPr>
-            <w:rStyle w:val="Hyperlink"/>
-            <w:lang w:val="en-US"/>
-          </w:rPr>
-          <w:t>/</w:t>
-        </w:r>
-        <w:proofErr w:type="spellStart"/>
-        <w:r>
-          <w:rPr>
-            <w:rStyle w:val="Hyperlink"/>
-            <w:lang w:val="en-US"/>
-          </w:rPr>
-          <w:t>arduino</w:t>
-        </w:r>
-        <w:proofErr w:type="spellEnd"/>
-        <w:r>
-          <w:rPr>
-            <w:rStyle w:val="Hyperlink"/>
-            <w:lang w:val="en-US"/>
-          </w:rPr>
-          <w:t>-songs (github.com)</w:t>
+          <w:t>robsoncouto/arduino-songs (github.com)</w:t>
         </w:r>
       </w:hyperlink>
     </w:p>
@@ -1122,7 +1064,6 @@
         <w:pStyle w:val="Heading2"/>
       </w:pPr>
       <w:r>
-        <w:lastRenderedPageBreak/>
         <w:t xml:space="preserve">Example </w:t>
       </w:r>
       <w:r>
@@ -1206,25 +1147,22 @@
           <w:bCs/>
           <w:lang w:val="en-US"/>
         </w:rPr>
-        <w:t>LENGTH, %</w:t>
-      </w:r>
-      <w:proofErr w:type="spellStart"/>
-      <w:r>
+        <w:t>LENGTH, %val can be used to set the length of the note, it defaults to 90% and 10% quiet after the note</w:t>
+      </w:r>
+    </w:p>
+    <w:p>
+      <w:pPr>
         <w:rPr>
           <w:b/>
           <w:bCs/>
-          <w:lang w:val="en-US"/>
-        </w:rPr>
-        <w:t>val</w:t>
-      </w:r>
-      <w:proofErr w:type="spellEnd"/>
+        </w:rPr>
+      </w:pPr>
       <w:r>
         <w:rPr>
           <w:b/>
           <w:bCs/>
-          <w:lang w:val="en-US"/>
-        </w:rPr>
-        <w:t xml:space="preserve"> can be used to set the length of the note, it defaults to 90% and 10% quiet after the note</w:t>
+        </w:rPr>
+        <w:t>This can be used for pizzicato notes, LENGTH, 25, for example</w:t>
       </w:r>
     </w:p>
     <w:p>
@@ -1239,7 +1177,7 @@
           <w:b/>
           <w:bCs/>
         </w:rPr>
-        <w:t>This can be used for pizzicato notes, LENGTH, 25, for example</w:t>
+        <w:t>~</w:t>
       </w:r>
     </w:p>
     <w:p>
@@ -1254,7 +1192,7 @@
           <w:b/>
           <w:bCs/>
         </w:rPr>
-        <w:t>~</w:t>
+        <w:t>TEMPO, 145,</w:t>
       </w:r>
     </w:p>
     <w:p>
@@ -1269,7 +1207,7 @@
           <w:b/>
           <w:bCs/>
         </w:rPr>
-        <w:t>TEMPO, 145,</w:t>
+        <w:t>LENGTH, 90,</w:t>
       </w:r>
     </w:p>
     <w:p>
@@ -1277,14 +1215,16 @@
         <w:rPr>
           <w:b/>
           <w:bCs/>
+          <w:lang w:val="en-US"/>
         </w:rPr>
       </w:pPr>
       <w:r>
         <w:rPr>
           <w:b/>
           <w:bCs/>
-        </w:rPr>
-        <w:t>LENGTH, 90,</w:t>
+          <w:lang w:val="en-US"/>
+        </w:rPr>
+        <w:t>NOTE_E5, 4,  NOTE_B4, 8,  NOTE_C5, 8,  NOTE_D5, 4,  NOTE_C5, 8,  NOTE_B4, 8,</w:t>
       </w:r>
     </w:p>
     <w:p>
@@ -1301,7 +1241,7 @@
           <w:bCs/>
           <w:lang w:val="en-US"/>
         </w:rPr>
-        <w:t>NOTE_E5, 4,  NOTE_B4, 8,  NOTE_C5, 8,  NOTE_D5, 4,  NOTE_C5, 8,  NOTE_B4, 8,</w:t>
+        <w:t>NOTE_A4, 4,  NOTE_A4, 8,  NOTE_C5, 8,  NOTE_E5, 4,  NOTE_D5, 8,  NOTE_C5, 8,</w:t>
       </w:r>
     </w:p>
     <w:p>
@@ -1318,7 +1258,7 @@
           <w:bCs/>
           <w:lang w:val="en-US"/>
         </w:rPr>
-        <w:t>NOTE_A4, 4,  NOTE_A4, 8,  NOTE_C5, 8,  NOTE_E5, 4,  NOTE_D5, 8,  NOTE_C5, 8,</w:t>
+        <w:t>NOTE_B4, -4, NOTE_C5, 8,  NOTE_D5, 4,  NOTE_E5, 4,</w:t>
       </w:r>
     </w:p>
     <w:p>
@@ -1335,7 +1275,7 @@
           <w:bCs/>
           <w:lang w:val="en-US"/>
         </w:rPr>
-        <w:t>NOTE_B4, -4, NOTE_C5, 8,  NOTE_D5, 4,  NOTE_E5, 4,</w:t>
+        <w:t>NOTE_C5, 4,  NOTE_A4, 4,  NOTE_A4, 8,  NOTE_A4, 4,  NOTE_B4, 8,  NOTE_C5, 8,</w:t>
       </w:r>
     </w:p>
     <w:p>
@@ -1352,7 +1292,7 @@
           <w:bCs/>
           <w:lang w:val="en-US"/>
         </w:rPr>
-        <w:t>NOTE_C5, 4,  NOTE_A4, 4,  NOTE_A4, 8,  NOTE_A4, 4,  NOTE_B4, 8,  NOTE_C5, 8,</w:t>
+        <w:t>NOTE_D5, -4, NOTE_F5, 8,  NOTE_A5, 4,  NOTE_G5, 8,  NOTE_F5, 8,</w:t>
       </w:r>
     </w:p>
     <w:p>
@@ -1369,7 +1309,7 @@
           <w:bCs/>
           <w:lang w:val="en-US"/>
         </w:rPr>
-        <w:t>NOTE_D5, -4, NOTE_F5, 8,  NOTE_A5, 4,  NOTE_G5, 8,  NOTE_F5, 8,</w:t>
+        <w:t>NOTE_E5, -4, NOTE_C5, 8,  NOTE_E5, 4,  NOTE_D5, 8,  NOTE_C5, 8,</w:t>
       </w:r>
     </w:p>
     <w:p>
@@ -1386,7 +1326,7 @@
           <w:bCs/>
           <w:lang w:val="en-US"/>
         </w:rPr>
-        <w:t>NOTE_E5, -4, NOTE_C5, 8,  NOTE_E5, 4,  NOTE_D5, 8,  NOTE_C5, 8,</w:t>
+        <w:t>NOTE_B4, 4,  NOTE_B4, 8,  NOTE_C5, 8,  NOTE_D5, 4,  NOTE_E5, 4,</w:t>
       </w:r>
     </w:p>
     <w:p>
@@ -1403,24 +1343,66 @@
           <w:bCs/>
           <w:lang w:val="en-US"/>
         </w:rPr>
-        <w:t>NOTE_B4, 4,  NOTE_B4, 8,  NOTE_C5, 8,  NOTE_D5, 4,  NOTE_E5, 4,</w:t>
-      </w:r>
-    </w:p>
-    <w:p>
-      <w:pPr>
+        <w:t>NOTE_C5, 4,  NOTE_A4, 4,  NOTE_A4, 4, REST, 4,</w:t>
+      </w:r>
+    </w:p>
+    <w:p>
+      <w:pPr>
+        <w:pStyle w:val="Heading1"/>
+      </w:pPr>
+      <w:r>
+        <w:t>Audio Files</w:t>
+      </w:r>
+    </w:p>
+    <w:p>
+      <w:r>
+        <w:t xml:space="preserve">It is possible to play MP3 or WAV </w:t>
+      </w:r>
+      <w:r>
+        <w:t xml:space="preserve">files </w:t>
+      </w:r>
+      <w:r>
+        <w:t>instead of the tone files.</w:t>
+      </w:r>
+      <w:r>
+        <w:t xml:space="preserve"> They are selected through the same menu selection. Th</w:t>
+      </w:r>
+      <w:r>
+        <w:t xml:space="preserve">e radio uses PDM (pulse density modulation) to encode the audio. This is not the best audio quality, but it does allow the use of the existing board design. Better </w:t>
+      </w:r>
+      <w:r>
+        <w:t>quality would require a proper sound chip on the PCB. This may be done in the future.</w:t>
+      </w:r>
+    </w:p>
+    <w:p>
+      <w:pPr>
+        <w:pStyle w:val="Heading1"/>
+      </w:pPr>
+      <w:r>
+        <w:lastRenderedPageBreak/>
+        <w:t>Updating Firmware</w:t>
+      </w:r>
+    </w:p>
+    <w:p>
+      <w:r>
+        <w:rPr>
+          <w:lang w:val="en-US"/>
+        </w:rPr>
+        <w:t xml:space="preserve">The new file must be put on the SD card and named RadioFox.bin. The system menu has an entry </w:t>
+      </w:r>
+      <w:r>
         <w:rPr>
           <w:b/>
           <w:bCs/>
           <w:lang w:val="en-US"/>
         </w:rPr>
-      </w:pPr>
-      <w:r>
-        <w:rPr>
-          <w:b/>
-          <w:bCs/>
-          <w:lang w:val="en-US"/>
-        </w:rPr>
-        <w:t>NOTE_C5, 4,  NOTE_A4, 4,  NOTE_A4, 4, REST, 4,</w:t>
+        <w:t>New Version BIN file</w:t>
+      </w:r>
+      <w:r>
+        <w:rPr>
+          <w:lang w:val="en-US"/>
+        </w:rPr>
+        <w:t xml:space="preserve"> that will attempt to load this file. Confirmation will be required from the dial, After loading the BIN file can optionally be erased.</w:t>
       </w:r>
     </w:p>
     <w:p>
@@ -1428,27 +1410,107 @@
         <w:pStyle w:val="Heading1"/>
       </w:pPr>
       <w:r>
-        <w:t>Audio Files</w:t>
-      </w:r>
-    </w:p>
-    <w:p>
-      <w:r>
-        <w:t xml:space="preserve">It is possible to play MP3 or WAV </w:t>
-      </w:r>
-      <w:r>
-        <w:t xml:space="preserve">files </w:t>
-      </w:r>
-      <w:r>
-        <w:t>instead of the tone files.</w:t>
-      </w:r>
-      <w:r>
-        <w:t xml:space="preserve"> They are selected through the same menu selection. Th</w:t>
-      </w:r>
-      <w:r>
-        <w:t xml:space="preserve">e radio uses PDM (pulse density modulation) to encode the audio. This is not the best audio quality, but it does allow the use of the existing board design. Better </w:t>
-      </w:r>
-      <w:r>
-        <w:t>quality would require a proper sound chip on the PCB. This may be done in the future.</w:t>
+        <w:t>DTMF Operations</w:t>
+      </w:r>
+    </w:p>
+    <w:p>
+      <w:r>
+        <w:rPr>
+          <w:lang w:val="en-US"/>
+        </w:rPr>
+        <w:t>DTMF (aka touch-tones) can be sent from the transmitter to control certain operations of the radio. It works best when the tones are sent for at least a second. It is usually also necessary to wait 2 seconds after pressing the transmit button on the radio. All commands consist of a ‘*’ followed by a digit. The following commands are available.</w:t>
+      </w:r>
+    </w:p>
+    <w:p/>
+    <w:p>
+      <w:r>
+        <w:rPr>
+          <w:lang w:val="en-US"/>
+        </w:rPr>
+        <w:t>Please feel free to request additional commands. I’m sure there are other usual things that can be done remotely using DTMF signals. Also note that these functions have not yet been tested extensively so there may be some bugs in the code. I will fix as soon as I can after I find out what they are.</w:t>
+      </w:r>
+    </w:p>
+    <w:p>
+      <w:pPr>
+        <w:pStyle w:val="Heading2"/>
+      </w:pPr>
+      <w:r>
+        <w:t>DTMF *1</w:t>
+      </w:r>
+    </w:p>
+    <w:p>
+      <w:r>
+        <w:t>Start transmitt</w:t>
+      </w:r>
+      <w:r>
+        <w:t>ing timer.</w:t>
+      </w:r>
+    </w:p>
+    <w:p>
+      <w:pPr>
+        <w:pStyle w:val="Heading2"/>
+      </w:pPr>
+      <w:r>
+        <w:t>DTMF *</w:t>
+      </w:r>
+      <w:r>
+        <w:t>2</w:t>
+      </w:r>
+    </w:p>
+    <w:p>
+      <w:r>
+        <w:t>Stop transmitting timer.</w:t>
+      </w:r>
+    </w:p>
+    <w:p>
+      <w:pPr>
+        <w:pStyle w:val="Heading2"/>
+      </w:pPr>
+      <w:r>
+        <w:t>DTMF *</w:t>
+      </w:r>
+      <w:r>
+        <w:t>4</w:t>
+      </w:r>
+    </w:p>
+    <w:p>
+      <w:r>
+        <w:t>Set low power mode.</w:t>
+      </w:r>
+    </w:p>
+    <w:p>
+      <w:pPr>
+        <w:pStyle w:val="Heading2"/>
+      </w:pPr>
+      <w:r>
+        <w:t>DTMF *</w:t>
+      </w:r>
+      <w:r>
+        <w:t>5</w:t>
+      </w:r>
+    </w:p>
+    <w:p>
+      <w:r>
+        <w:t>Set high power mode.</w:t>
+      </w:r>
+    </w:p>
+    <w:p>
+      <w:pPr>
+        <w:pStyle w:val="Heading2"/>
+      </w:pPr>
+      <w:r>
+        <w:t>DTMF *</w:t>
+      </w:r>
+      <w:r>
+        <w:t>6</w:t>
+      </w:r>
+    </w:p>
+    <w:p>
+      <w:r>
+        <w:rPr>
+          <w:lang w:val="en-US"/>
+        </w:rPr>
+        <w:t>Cancel existing delay and pause and begin transmitting immediately.</w:t>
       </w:r>
     </w:p>
     <w:p>
@@ -1456,59 +1518,43 @@
         <w:pStyle w:val="Heading1"/>
       </w:pPr>
       <w:r>
-        <w:t>Updating Firmware</w:t>
-      </w:r>
-    </w:p>
-    <w:p>
-      <w:r>
-        <w:rPr>
-          <w:lang w:val="en-US"/>
-        </w:rPr>
-        <w:t xml:space="preserve">The new file must be put on the SD card and named </w:t>
-      </w:r>
-      <w:proofErr w:type="spellStart"/>
-      <w:r>
-        <w:rPr>
-          <w:lang w:val="en-US"/>
-        </w:rPr>
-        <w:t>RadioFox.bin</w:t>
-      </w:r>
-      <w:proofErr w:type="spellEnd"/>
-      <w:r>
-        <w:rPr>
-          <w:lang w:val="en-US"/>
-        </w:rPr>
-        <w:t xml:space="preserve">. The system menu has an entry </w:t>
-      </w:r>
-      <w:r>
-        <w:rPr>
-          <w:b/>
-          <w:bCs/>
-          <w:lang w:val="en-US"/>
-        </w:rPr>
-        <w:t>New Version BIN file</w:t>
-      </w:r>
-      <w:r>
-        <w:rPr>
-          <w:lang w:val="en-US"/>
-        </w:rPr>
-        <w:t xml:space="preserve"> that will attempt to load this file. Confirmation will be required from the dial, After loading the BIN file can optionally be erased.</w:t>
-      </w:r>
-    </w:p>
-    <w:p>
-      <w:pPr>
-        <w:pStyle w:val="Heading1"/>
-      </w:pPr>
-      <w:r>
-        <w:t>DTMF Operations</w:t>
-      </w:r>
-    </w:p>
-    <w:p>
-      <w:r>
-        <w:rPr>
-          <w:lang w:val="en-US"/>
-        </w:rPr>
-        <w:t>DTMF (aka touch-tones) can be sent from the transmitter to control certain operations of the radio. It works best when the tones are sent for at least a second. It is usually also necessary to wait 2 seconds after pressing the transmit button on the radio. All commands consist of a ‘*’ followed by a digit. The following commands are available.</w:t>
+        <w:t>Button Operations</w:t>
+      </w:r>
+    </w:p>
+    <w:p>
+      <w:r>
+        <w:t xml:space="preserve">All operations can be controlled by the rotary push button on the </w:t>
+      </w:r>
+      <w:r>
+        <w:t>box and the two extra buttons to the left labelled B0 and B1</w:t>
+      </w:r>
+      <w:r>
+        <w:t>.</w:t>
+      </w:r>
+      <w:r>
+        <w:t xml:space="preserve"> A long press is used to access </w:t>
+      </w:r>
+      <w:r>
+        <w:t>the menu system</w:t>
+      </w:r>
+      <w:r>
+        <w:t xml:space="preserve"> and is done by </w:t>
+      </w:r>
+      <w:r>
+        <w:lastRenderedPageBreak/>
+        <w:t xml:space="preserve">holding the button down for about a ½ second or longer. This long press time is also adjustable if a longer or shorter time is preferred. The system has two modes of operation. After booting the display shows the </w:t>
+      </w:r>
+      <w:r>
+        <w:t xml:space="preserve">radio status and some important </w:t>
+      </w:r>
+      <w:r>
+        <w:t xml:space="preserve">radio </w:t>
+      </w:r>
+      <w:r>
+        <w:t>settings</w:t>
+      </w:r>
+      <w:r>
+        <w:t>.</w:t>
       </w:r>
     </w:p>
     <w:p/>
@@ -1517,8 +1563,19 @@
         <w:rPr>
           <w:lang w:val="en-US"/>
         </w:rPr>
-        <w:lastRenderedPageBreak/>
-        <w:t>Please feel free to request additional commands. I’m sure there are other usual things that can be done remotely using DTMF signals. Also note that these functions have not yet been tested extensively so there may be some bugs in the code. I will fix as soon as I can after I find out what they are.</w:t>
+        <w:t>A long press on the dial or a simple press on B1 will open the menus. The system opens the last menu that was used. A long press or B1 in the menus returns to the normal radio mode. Each menu except the main menu has two entries, the first and the last, which will return to the previous menu.</w:t>
+      </w:r>
+    </w:p>
+    <w:p/>
+    <w:p>
+      <w:r>
+        <w:t>Many</w:t>
+      </w:r>
+      <w:r>
+        <w:t xml:space="preserve"> data entry screens will show help on the bottom few lines to explain </w:t>
+      </w:r>
+      <w:r>
+        <w:t>the button functions.</w:t>
       </w:r>
     </w:p>
     <w:p>
@@ -1526,400 +1583,227 @@
         <w:pStyle w:val="Heading2"/>
       </w:pPr>
       <w:r>
-        <w:t>DTMF *1</w:t>
-      </w:r>
-    </w:p>
-    <w:p>
-      <w:r>
-        <w:t>Start transmitt</w:t>
-      </w:r>
-      <w:r>
-        <w:t>ing timer.</w:t>
-      </w:r>
-    </w:p>
-    <w:p>
-      <w:pPr>
-        <w:pStyle w:val="Heading2"/>
-      </w:pPr>
-      <w:r>
-        <w:t>DTMF *</w:t>
-      </w:r>
-      <w:r>
-        <w:t>2</w:t>
-      </w:r>
-    </w:p>
-    <w:p>
-      <w:r>
-        <w:t>Stop transmitting timer.</w:t>
-      </w:r>
-    </w:p>
-    <w:p>
-      <w:pPr>
-        <w:pStyle w:val="Heading2"/>
-      </w:pPr>
-      <w:r>
-        <w:t>DTMF *</w:t>
-      </w:r>
-      <w:r>
-        <w:t>4</w:t>
-      </w:r>
-    </w:p>
-    <w:p>
-      <w:r>
-        <w:t>Set low power mode.</w:t>
-      </w:r>
-    </w:p>
-    <w:p>
-      <w:pPr>
-        <w:pStyle w:val="Heading2"/>
-      </w:pPr>
-      <w:r>
-        <w:t>DTMF *</w:t>
-      </w:r>
-      <w:r>
-        <w:t>5</w:t>
-      </w:r>
-    </w:p>
-    <w:p>
-      <w:r>
-        <w:t>Set high power mode.</w:t>
-      </w:r>
-    </w:p>
-    <w:p>
-      <w:pPr>
-        <w:pStyle w:val="Heading2"/>
-      </w:pPr>
-      <w:r>
-        <w:t>DTMF *</w:t>
-      </w:r>
-      <w:r>
-        <w:t>6</w:t>
-      </w:r>
-    </w:p>
-    <w:p>
-      <w:r>
-        <w:rPr>
-          <w:lang w:val="en-US"/>
-        </w:rPr>
-        <w:t>Cancel existing delay and pause and begin transmitting immediately.</w:t>
-      </w:r>
-    </w:p>
-    <w:p>
-      <w:pPr>
-        <w:pStyle w:val="Heading1"/>
-      </w:pPr>
-      <w:r>
-        <w:t>Button Operations</w:t>
-      </w:r>
-    </w:p>
-    <w:p>
-      <w:r>
-        <w:t xml:space="preserve">All operations can be controlled by the rotary push button on the </w:t>
-      </w:r>
-      <w:r>
-        <w:t>box and the two extra buttons to the left labelled B0 and B1</w:t>
+        <w:t>Dedicated Buttons – Button0</w:t>
+      </w:r>
+      <w:r>
+        <w:t>(</w:t>
+      </w:r>
+      <w:r>
+        <w:t>B</w:t>
+      </w:r>
+      <w:r>
+        <w:t>0</w:t>
+      </w:r>
+      <w:r>
+        <w:t>)</w:t>
+      </w:r>
+      <w:r>
+        <w:t xml:space="preserve"> and Button1</w:t>
+      </w:r>
+      <w:r>
+        <w:t>(</w:t>
+      </w:r>
+      <w:r>
+        <w:t>B</w:t>
+      </w:r>
+      <w:r>
+        <w:t>1</w:t>
+      </w:r>
+      <w:r>
+        <w:t>)</w:t>
+      </w:r>
+    </w:p>
+    <w:p>
+      <w:r>
+        <w:t xml:space="preserve">There are two dedicated buttons on the </w:t>
+      </w:r>
+      <w:r>
+        <w:t xml:space="preserve">top </w:t>
+      </w:r>
+      <w:r>
+        <w:t>left of the TTGO device.</w:t>
+      </w:r>
+      <w:r>
+        <w:t xml:space="preserve"> They are accessible from the top of the </w:t>
+      </w:r>
+      <w:r>
+        <w:t>case.</w:t>
+      </w:r>
+      <w:r>
+        <w:t xml:space="preserve"> The top one is called </w:t>
+      </w:r>
+      <w:r>
+        <w:t>B</w:t>
+      </w:r>
+      <w:r>
+        <w:t>0</w:t>
+      </w:r>
+      <w:r>
+        <w:t xml:space="preserve"> and the bottom one is called </w:t>
+      </w:r>
+      <w:r>
+        <w:t>B</w:t>
+      </w:r>
+      <w:r>
+        <w:t>1</w:t>
       </w:r>
       <w:r>
         <w:t>.</w:t>
       </w:r>
       <w:r>
-        <w:t xml:space="preserve"> A long press is used to access </w:t>
-      </w:r>
-      <w:r>
-        <w:t>the menu system</w:t>
-      </w:r>
-      <w:r>
-        <w:t xml:space="preserve"> and is done by holding the button down for about a ½ second or longer. This long press time is also adjustable if a longer or shorter time is preferred. The system has two modes of operation. After booting the display shows the </w:t>
-      </w:r>
-      <w:r>
-        <w:t xml:space="preserve">radio status and some important </w:t>
-      </w:r>
-      <w:r>
-        <w:t xml:space="preserve">radio </w:t>
-      </w:r>
-      <w:r>
-        <w:t>settings</w:t>
+        <w:t xml:space="preserve"> Both these buttons support both clicking and long presses</w:t>
+      </w:r>
+      <w:r>
+        <w:t xml:space="preserve">. A long press of </w:t>
+      </w:r>
+      <w:r>
+        <w:t>B0</w:t>
+      </w:r>
+      <w:r>
+        <w:t xml:space="preserve"> and </w:t>
+      </w:r>
+      <w:r>
+        <w:t>B1 together</w:t>
+      </w:r>
+      <w:r>
+        <w:t xml:space="preserve"> </w:t>
+      </w:r>
+      <w:r>
+        <w:t>will reboot the system</w:t>
       </w:r>
       <w:r>
         <w:t>.</w:t>
       </w:r>
-    </w:p>
-    <w:p/>
-    <w:p>
-      <w:r>
-        <w:rPr>
-          <w:lang w:val="en-US"/>
-        </w:rPr>
-        <w:t>A long press on the dial or a simple press on B1 will open the menus. The system opens the last menu that was used. A long press or B1 in the menus returns to the normal radio mode. Each menu except the main menu has two entries, the first and the last, which will return to the previous menu.</w:t>
-      </w:r>
-    </w:p>
-    <w:p/>
-    <w:p>
-      <w:r>
-        <w:t>Many</w:t>
-      </w:r>
-      <w:r>
-        <w:t xml:space="preserve"> data entry screens will show help on the bottom few lines to explain </w:t>
-      </w:r>
-      <w:r>
-        <w:t>the button functions.</w:t>
-      </w:r>
-    </w:p>
-    <w:p>
-      <w:pPr>
-        <w:pStyle w:val="Heading2"/>
-      </w:pPr>
-      <w:r>
-        <w:lastRenderedPageBreak/>
-        <w:t>Dedicated Buttons – Button0</w:t>
-      </w:r>
-      <w:r>
-        <w:t>(</w:t>
+      <w:r>
+        <w:t xml:space="preserve"> </w:t>
+      </w:r>
+      <w:r>
+        <w:t>The</w:t>
+      </w:r>
+      <w:r>
+        <w:t xml:space="preserve"> function of the</w:t>
+      </w:r>
+      <w:r>
+        <w:t>se buttons depend</w:t>
+      </w:r>
+      <w:r>
+        <w:t>s</w:t>
+      </w:r>
+      <w:r>
+        <w:t xml:space="preserve"> on the current operating mode</w:t>
+      </w:r>
+      <w:r>
+        <w:t xml:space="preserve"> as described next.</w:t>
+      </w:r>
+      <w:r>
+        <w:t xml:space="preserve"> Common to all modes is that </w:t>
+      </w:r>
+      <w:r>
+        <w:t xml:space="preserve">clicking </w:t>
       </w:r>
       <w:r>
         <w:t>B</w:t>
       </w:r>
       <w:r>
-        <w:t>0</w:t>
-      </w:r>
-      <w:r>
-        <w:t>)</w:t>
-      </w:r>
-      <w:r>
-        <w:t xml:space="preserve"> and Button1</w:t>
-      </w:r>
-      <w:r>
-        <w:t>(</w:t>
-      </w:r>
-      <w:r>
+        <w:t>1</w:t>
+      </w:r>
+      <w:r>
+        <w:t xml:space="preserve"> will always emulate a long press of the dial button.</w:t>
+      </w:r>
+    </w:p>
+    <w:p>
+      <w:pPr>
+        <w:pStyle w:val="Heading3"/>
+        <w:rPr>
+          <w:lang w:val="da-DK"/>
+        </w:rPr>
+      </w:pPr>
+      <w:r>
+        <w:rPr>
+          <w:lang w:val="da-DK"/>
+        </w:rPr>
+        <w:t>B0/B1</w:t>
+      </w:r>
+      <w:r>
+        <w:rPr>
+          <w:lang w:val="da-DK"/>
+        </w:rPr>
+        <w:t xml:space="preserve"> During Run Mode</w:t>
+      </w:r>
+    </w:p>
+    <w:p>
+      <w:pPr>
+        <w:rPr>
+          <w:lang w:val="en-US"/>
+        </w:rPr>
+      </w:pPr>
+      <w:r>
+        <w:rPr>
+          <w:lang w:val="en-US"/>
+        </w:rPr>
+        <w:t xml:space="preserve">B0 toggles the run </w:t>
+      </w:r>
+      <w:r>
+        <w:rPr>
+          <w:lang w:val="en-US"/>
+        </w:rPr>
+        <w:t xml:space="preserve">state to stop or start </w:t>
+      </w:r>
+      <w:r>
+        <w:rPr>
+          <w:lang w:val="en-US"/>
+        </w:rPr>
+        <w:t xml:space="preserve">transmitting mode. </w:t>
+      </w:r>
+      <w:r>
+        <w:rPr>
+          <w:lang w:val="en-US"/>
+        </w:rPr>
+        <w:t>Long B0 cancels the current transmit or pause timer</w:t>
+      </w:r>
+      <w:r>
+        <w:rPr>
+          <w:lang w:val="en-US"/>
+        </w:rPr>
+        <w:t xml:space="preserve">. </w:t>
+      </w:r>
+      <w:r>
+        <w:rPr>
+          <w:lang w:val="en-US"/>
+        </w:rPr>
+        <w:t>B1 enters the menu system.</w:t>
+      </w:r>
+    </w:p>
+    <w:p>
+      <w:pPr>
+        <w:pStyle w:val="Heading3"/>
+        <w:rPr>
+          <w:lang w:val="da-DK"/>
+        </w:rPr>
+      </w:pPr>
+      <w:r>
+        <w:rPr>
+          <w:lang w:val="da-DK"/>
+        </w:rPr>
         <w:t>B</w:t>
       </w:r>
       <w:r>
-        <w:t>1</w:t>
-      </w:r>
-      <w:r>
-        <w:t>)</w:t>
-      </w:r>
-    </w:p>
-    <w:p>
-      <w:r>
-        <w:t xml:space="preserve">There are two dedicated buttons on the </w:t>
-      </w:r>
-      <w:r>
-        <w:t xml:space="preserve">top </w:t>
-      </w:r>
-      <w:r>
-        <w:t>left of the TTGO device.</w:t>
-      </w:r>
-      <w:r>
-        <w:t xml:space="preserve"> They are accessible from the top of the </w:t>
-      </w:r>
-      <w:r>
-        <w:t>case.</w:t>
-      </w:r>
-      <w:r>
-        <w:t xml:space="preserve"> The top one is called </w:t>
-      </w:r>
-      <w:r>
+        <w:rPr>
+          <w:lang w:val="da-DK"/>
+        </w:rPr>
+        <w:t>0/</w:t>
+      </w:r>
+      <w:r>
+        <w:rPr>
+          <w:lang w:val="da-DK"/>
+        </w:rPr>
         <w:t>B</w:t>
       </w:r>
       <w:r>
-        <w:t>0</w:t>
-      </w:r>
-      <w:r>
-        <w:t xml:space="preserve"> and the bottom one is called </w:t>
-      </w:r>
-      <w:r>
-        <w:t>B</w:t>
-      </w:r>
-      <w:r>
-        <w:t>1</w:t>
-      </w:r>
-      <w:r>
-        <w:t>.</w:t>
-      </w:r>
-      <w:r>
-        <w:t xml:space="preserve"> Both these buttons support both clicking and long presses</w:t>
-      </w:r>
-      <w:r>
-        <w:t xml:space="preserve">. A long press of </w:t>
-      </w:r>
-      <w:r>
-        <w:t>B0</w:t>
-      </w:r>
-      <w:r>
-        <w:t xml:space="preserve"> and </w:t>
-      </w:r>
-      <w:r>
-        <w:t>B1 together</w:t>
-      </w:r>
-      <w:r>
-        <w:t xml:space="preserve"> </w:t>
-      </w:r>
-      <w:r>
-        <w:t>will reboot the system</w:t>
-      </w:r>
-      <w:r>
-        <w:t>.</w:t>
-      </w:r>
-      <w:r>
-        <w:t xml:space="preserve"> </w:t>
-      </w:r>
-      <w:r>
-        <w:t>The</w:t>
-      </w:r>
-      <w:r>
-        <w:t xml:space="preserve"> function of the</w:t>
-      </w:r>
-      <w:r>
-        <w:t>se buttons depend</w:t>
-      </w:r>
-      <w:r>
-        <w:t>s</w:t>
-      </w:r>
-      <w:r>
-        <w:t xml:space="preserve"> on the current operating mode</w:t>
-      </w:r>
-      <w:r>
-        <w:t xml:space="preserve"> as described next.</w:t>
-      </w:r>
-      <w:r>
-        <w:t xml:space="preserve"> Common to all modes is that </w:t>
-      </w:r>
-      <w:r>
-        <w:t xml:space="preserve">clicking </w:t>
-      </w:r>
-      <w:r>
-        <w:t>B</w:t>
-      </w:r>
-      <w:r>
-        <w:t>1</w:t>
-      </w:r>
-      <w:r>
-        <w:t xml:space="preserve"> will always emulate a long press of the dial button.</w:t>
-      </w:r>
-    </w:p>
-    <w:p>
-      <w:pPr>
-        <w:pStyle w:val="Heading3"/>
         <w:rPr>
           <w:lang w:val="da-DK"/>
         </w:rPr>
-      </w:pPr>
-      <w:r>
-        <w:rPr>
-          <w:lang w:val="da-DK"/>
-        </w:rPr>
-        <w:t>B0/B1</w:t>
-      </w:r>
-      <w:r>
-        <w:rPr>
-          <w:lang w:val="da-DK"/>
-        </w:rPr>
-        <w:t xml:space="preserve"> </w:t>
-      </w:r>
-      <w:proofErr w:type="spellStart"/>
-      <w:r>
-        <w:rPr>
-          <w:lang w:val="da-DK"/>
-        </w:rPr>
-        <w:t>During</w:t>
-      </w:r>
-      <w:proofErr w:type="spellEnd"/>
-      <w:r>
-        <w:rPr>
-          <w:lang w:val="da-DK"/>
-        </w:rPr>
-        <w:t xml:space="preserve"> Run Mode</w:t>
-      </w:r>
-    </w:p>
-    <w:p>
-      <w:pPr>
-        <w:rPr>
-          <w:lang w:val="en-US"/>
-        </w:rPr>
-      </w:pPr>
-      <w:r>
-        <w:rPr>
-          <w:lang w:val="en-US"/>
-        </w:rPr>
-        <w:t xml:space="preserve">B0 toggles the run </w:t>
-      </w:r>
-      <w:r>
-        <w:rPr>
-          <w:lang w:val="en-US"/>
-        </w:rPr>
-        <w:t xml:space="preserve">state to stop or start </w:t>
-      </w:r>
-      <w:r>
-        <w:rPr>
-          <w:lang w:val="en-US"/>
-        </w:rPr>
-        <w:t xml:space="preserve">transmitting mode. </w:t>
-      </w:r>
-      <w:r>
-        <w:rPr>
-          <w:lang w:val="en-US"/>
-        </w:rPr>
-        <w:t>Long B0 cancels the current transmit or pause timer</w:t>
-      </w:r>
-      <w:r>
-        <w:rPr>
-          <w:lang w:val="en-US"/>
-        </w:rPr>
-        <w:t xml:space="preserve">. </w:t>
-      </w:r>
-      <w:r>
-        <w:rPr>
-          <w:lang w:val="en-US"/>
-        </w:rPr>
-        <w:t>B1 enters the menu system.</w:t>
-      </w:r>
-    </w:p>
-    <w:p>
-      <w:pPr>
-        <w:pStyle w:val="Heading3"/>
-        <w:rPr>
-          <w:lang w:val="da-DK"/>
-        </w:rPr>
-      </w:pPr>
-      <w:r>
-        <w:rPr>
-          <w:lang w:val="da-DK"/>
-        </w:rPr>
-        <w:t>B</w:t>
-      </w:r>
-      <w:r>
-        <w:rPr>
-          <w:lang w:val="da-DK"/>
-        </w:rPr>
-        <w:t>0/</w:t>
-      </w:r>
-      <w:r>
-        <w:rPr>
-          <w:lang w:val="da-DK"/>
-        </w:rPr>
-        <w:t>B</w:t>
-      </w:r>
-      <w:r>
-        <w:rPr>
-          <w:lang w:val="da-DK"/>
-        </w:rPr>
-        <w:t xml:space="preserve">1 </w:t>
-      </w:r>
-      <w:proofErr w:type="spellStart"/>
-      <w:r>
-        <w:rPr>
-          <w:lang w:val="da-DK"/>
-        </w:rPr>
-        <w:t>During</w:t>
-      </w:r>
-      <w:proofErr w:type="spellEnd"/>
-      <w:r>
-        <w:rPr>
-          <w:lang w:val="da-DK"/>
-        </w:rPr>
-        <w:t xml:space="preserve"> Menu Mod</w:t>
+        <w:t>1 During Menu Mod</w:t>
       </w:r>
       <w:r>
         <w:rPr>
@@ -2239,21 +2123,17 @@
         <w:t>s</w:t>
       </w:r>
       <w:r>
-        <w:t xml:space="preserve"> settings. In the menus</w:t>
+        <w:t xml:space="preserve"> settings. In the </w:t>
+      </w:r>
+      <w:r>
+        <w:lastRenderedPageBreak/>
+        <w:t>menus</w:t>
       </w:r>
       <w:r>
         <w:t>,</w:t>
       </w:r>
       <w:r>
-        <w:t xml:space="preserve"> </w:t>
-      </w:r>
-      <w:proofErr w:type="spellStart"/>
-      <w:r>
-        <w:t>boolean</w:t>
-      </w:r>
-      <w:proofErr w:type="spellEnd"/>
-      <w:r>
-        <w:t xml:space="preserve"> values toggle with each click.</w:t>
+        <w:t xml:space="preserve"> boolean values toggle with each click.</w:t>
       </w:r>
       <w:r>
         <w:t xml:space="preserve"> Multiple selections cycle through all the available options.</w:t>
@@ -2299,209 +2179,204 @@
       <w:bookmarkStart w:id="8" w:name="_it4r5xstzl63" w:colFirst="0" w:colLast="0"/>
       <w:bookmarkEnd w:id="8"/>
       <w:r>
+        <w:t>Button Menu Operations</w:t>
+      </w:r>
+      <w:r>
+        <w:t xml:space="preserve"> Short Descriptions</w:t>
+      </w:r>
+    </w:p>
+    <w:p/>
+    <w:p>
+      <w:pPr>
+        <w:ind w:left="720"/>
+      </w:pPr>
+      <w:r>
+        <w:t>Left/ Right</w:t>
+      </w:r>
+    </w:p>
+    <w:p>
+      <w:pPr>
+        <w:ind w:left="1440"/>
+      </w:pPr>
+      <w:r>
+        <w:t xml:space="preserve">Select menu </w:t>
+      </w:r>
+    </w:p>
+    <w:p>
+      <w:pPr>
+        <w:ind w:left="1440"/>
+      </w:pPr>
+      <w:r>
+        <w:t>Select file</w:t>
+      </w:r>
+      <w:r>
+        <w:t xml:space="preserve"> or list</w:t>
+      </w:r>
+      <w:r>
+        <w:t xml:space="preserve"> values</w:t>
+      </w:r>
+    </w:p>
+    <w:p>
+      <w:pPr>
+        <w:ind w:left="1440"/>
+      </w:pPr>
+      <w:r>
+        <w:t>Inc/ Dec integers</w:t>
+      </w:r>
+    </w:p>
+    <w:p>
+      <w:pPr>
+        <w:ind w:left="720"/>
+      </w:pPr>
+      <w:r>
+        <w:t>Long press</w:t>
+      </w:r>
+    </w:p>
+    <w:p>
+      <w:pPr>
+        <w:ind w:left="1440"/>
+      </w:pPr>
+      <w:r>
+        <w:t>Open menu system, goes to the remembered menu point</w:t>
+      </w:r>
+    </w:p>
+    <w:p>
+      <w:pPr>
+        <w:ind w:left="1440"/>
+      </w:pPr>
+      <w:r>
+        <w:t xml:space="preserve">Return to </w:t>
+      </w:r>
+      <w:r>
+        <w:t>radio</w:t>
+      </w:r>
+      <w:r>
+        <w:t xml:space="preserve"> mode, the current menu point is remembered</w:t>
+      </w:r>
+    </w:p>
+    <w:p>
+      <w:pPr>
+        <w:ind w:left="1440"/>
+      </w:pPr>
+      <w:r>
+        <w:t>Accept integer</w:t>
+      </w:r>
+    </w:p>
+    <w:p>
+      <w:pPr>
+        <w:ind w:left="1440"/>
+      </w:pPr>
+      <w:r>
+        <w:t>Choose filenames</w:t>
+      </w:r>
+    </w:p>
+    <w:p>
+      <w:pPr>
+        <w:ind w:left="720"/>
+      </w:pPr>
+      <w:r>
+        <w:t>Click</w:t>
+      </w:r>
+    </w:p>
+    <w:p>
+      <w:pPr>
+        <w:ind w:left="1440"/>
+      </w:pPr>
+      <w:r>
+        <w:t>Select menu item, including return to previous menu</w:t>
+      </w:r>
+    </w:p>
+    <w:p>
+      <w:pPr>
+        <w:ind w:left="1440"/>
+      </w:pPr>
+      <w:r>
+        <w:t>Toggle booleans</w:t>
+      </w:r>
+    </w:p>
+    <w:p>
+      <w:pPr>
+        <w:ind w:left="1440"/>
+      </w:pPr>
+      <w:r>
+        <w:t>Cycle</w:t>
+      </w:r>
+      <w:r>
+        <w:t xml:space="preserve"> through multiple selections</w:t>
+      </w:r>
+    </w:p>
+    <w:p>
+      <w:pPr>
+        <w:ind w:left="1440"/>
+      </w:pPr>
+      <w:r>
+        <w:t xml:space="preserve">Cancel filename </w:t>
+      </w:r>
+      <w:r>
+        <w:t xml:space="preserve">or list </w:t>
+      </w:r>
+      <w:r>
+        <w:t>selections</w:t>
+      </w:r>
+    </w:p>
+    <w:p>
+      <w:pPr>
+        <w:pStyle w:val="Heading1"/>
+      </w:pPr>
+      <w:r>
+        <w:t>Main Operating Screen</w:t>
+      </w:r>
+    </w:p>
+    <w:p>
+      <w:r>
+        <w:t>After booting or when not in the menu system the radio status is displayed. It shows the current operation, the count of transmit cycles, the ID text,</w:t>
+      </w:r>
+      <w:r>
+        <w:t xml:space="preserve"> any selected audio file,</w:t>
+      </w:r>
+      <w:r>
+        <w:t xml:space="preserve"> the</w:t>
+      </w:r>
+      <w:r>
+        <w:t xml:space="preserve"> transmit</w:t>
+      </w:r>
+      <w:r>
+        <w:t xml:space="preserve"> frequency and the receive frequency offset.</w:t>
+      </w:r>
+      <w:r>
+        <w:t xml:space="preserve"> The bottom of the screen shows the</w:t>
+      </w:r>
+      <w:r>
+        <w:t xml:space="preserve"> battery status on the right if it has been enabled. This is related to the current battery voltage and will drop while transmitting. There are also 4 LED’s on the PCB that can be seen through</w:t>
+      </w:r>
+      <w:r>
+        <w:t xml:space="preserve"> the slot on the </w:t>
+      </w:r>
+      <w:r>
+        <w:t>side</w:t>
+      </w:r>
+      <w:r>
+        <w:t xml:space="preserve"> of the case</w:t>
+      </w:r>
+      <w:r>
+        <w:t>. These LED’s are controlled by the battery charger circuit and indicate the battery status during running and charging.</w:t>
+      </w:r>
+    </w:p>
+    <w:p/>
+    <w:p>
+      <w:r>
+        <w:t>During transmitting the bottom left shows an animated red dot. In a future firmware update the</w:t>
+      </w:r>
+      <w:r>
+        <w:t xml:space="preserve"> received DTMF characters will be display next to this.</w:t>
+      </w:r>
+    </w:p>
+    <w:p>
+      <w:pPr>
+        <w:pStyle w:val="Heading1"/>
+      </w:pPr>
+      <w:r>
         <w:lastRenderedPageBreak/>
-        <w:t>Button Menu Operations</w:t>
-      </w:r>
-      <w:r>
-        <w:t xml:space="preserve"> Short Descriptions</w:t>
-      </w:r>
-    </w:p>
-    <w:p/>
-    <w:p>
-      <w:pPr>
-        <w:ind w:left="720"/>
-      </w:pPr>
-      <w:r>
-        <w:t>Left/ Right</w:t>
-      </w:r>
-    </w:p>
-    <w:p>
-      <w:pPr>
-        <w:ind w:left="1440"/>
-      </w:pPr>
-      <w:r>
-        <w:t xml:space="preserve">Select menu </w:t>
-      </w:r>
-    </w:p>
-    <w:p>
-      <w:pPr>
-        <w:ind w:left="1440"/>
-      </w:pPr>
-      <w:r>
-        <w:t>Select file</w:t>
-      </w:r>
-      <w:r>
-        <w:t xml:space="preserve"> or list</w:t>
-      </w:r>
-      <w:r>
-        <w:t xml:space="preserve"> values</w:t>
-      </w:r>
-    </w:p>
-    <w:p>
-      <w:pPr>
-        <w:ind w:left="1440"/>
-      </w:pPr>
-      <w:r>
-        <w:t>Inc/ Dec integers</w:t>
-      </w:r>
-    </w:p>
-    <w:p>
-      <w:pPr>
-        <w:ind w:left="720"/>
-      </w:pPr>
-      <w:r>
-        <w:t>Long press</w:t>
-      </w:r>
-    </w:p>
-    <w:p>
-      <w:pPr>
-        <w:ind w:left="1440"/>
-      </w:pPr>
-      <w:r>
-        <w:t>Open menu system, goes to the remembered menu point</w:t>
-      </w:r>
-    </w:p>
-    <w:p>
-      <w:pPr>
-        <w:ind w:left="1440"/>
-      </w:pPr>
-      <w:r>
-        <w:t xml:space="preserve">Return to </w:t>
-      </w:r>
-      <w:r>
-        <w:t>radio</w:t>
-      </w:r>
-      <w:r>
-        <w:t xml:space="preserve"> mode, the current menu point is remembered</w:t>
-      </w:r>
-    </w:p>
-    <w:p>
-      <w:pPr>
-        <w:ind w:left="1440"/>
-      </w:pPr>
-      <w:r>
-        <w:t>Accept integer</w:t>
-      </w:r>
-    </w:p>
-    <w:p>
-      <w:pPr>
-        <w:ind w:left="1440"/>
-      </w:pPr>
-      <w:r>
-        <w:t>Choose filenames</w:t>
-      </w:r>
-    </w:p>
-    <w:p>
-      <w:pPr>
-        <w:ind w:left="720"/>
-      </w:pPr>
-      <w:r>
-        <w:t>Click</w:t>
-      </w:r>
-    </w:p>
-    <w:p>
-      <w:pPr>
-        <w:ind w:left="1440"/>
-      </w:pPr>
-      <w:r>
-        <w:t>Select menu item, including return to previous menu</w:t>
-      </w:r>
-    </w:p>
-    <w:p>
-      <w:pPr>
-        <w:ind w:left="1440"/>
-      </w:pPr>
-      <w:r>
-        <w:t xml:space="preserve">Toggle </w:t>
-      </w:r>
-      <w:proofErr w:type="spellStart"/>
-      <w:r>
-        <w:t>booleans</w:t>
-      </w:r>
-      <w:proofErr w:type="spellEnd"/>
-    </w:p>
-    <w:p>
-      <w:pPr>
-        <w:ind w:left="1440"/>
-      </w:pPr>
-      <w:r>
-        <w:t>Cycle</w:t>
-      </w:r>
-      <w:r>
-        <w:t xml:space="preserve"> through multiple selections</w:t>
-      </w:r>
-    </w:p>
-    <w:p>
-      <w:pPr>
-        <w:ind w:left="1440"/>
-      </w:pPr>
-      <w:r>
-        <w:t xml:space="preserve">Cancel filename </w:t>
-      </w:r>
-      <w:r>
-        <w:t xml:space="preserve">or list </w:t>
-      </w:r>
-      <w:r>
-        <w:t>selections</w:t>
-      </w:r>
-    </w:p>
-    <w:p>
-      <w:pPr>
-        <w:pStyle w:val="Heading1"/>
-      </w:pPr>
-      <w:r>
-        <w:t>Main Operating Screen</w:t>
-      </w:r>
-    </w:p>
-    <w:p>
-      <w:r>
-        <w:t>After booting or when not in the menu system the radio status is displayed. It shows the current operation, the count of transmit cycles, the ID text,</w:t>
-      </w:r>
-      <w:r>
-        <w:t xml:space="preserve"> any selected audio file,</w:t>
-      </w:r>
-      <w:r>
-        <w:t xml:space="preserve"> the</w:t>
-      </w:r>
-      <w:r>
-        <w:t xml:space="preserve"> transmit</w:t>
-      </w:r>
-      <w:r>
-        <w:t xml:space="preserve"> frequency and the receive frequency offset.</w:t>
-      </w:r>
-      <w:r>
-        <w:t xml:space="preserve"> The bottom of the screen shows the</w:t>
-      </w:r>
-      <w:r>
-        <w:t xml:space="preserve"> battery status on the right if it has been enabled. This is related to the current battery voltage and will drop while transmitting. There are also 4 LED’s on the PCB that can be seen through</w:t>
-      </w:r>
-      <w:r>
-        <w:t xml:space="preserve"> the slot on the </w:t>
-      </w:r>
-      <w:r>
-        <w:t>side</w:t>
-      </w:r>
-      <w:r>
-        <w:t xml:space="preserve"> of the case</w:t>
-      </w:r>
-      <w:r>
-        <w:t>. These LED’s are controlled by the battery charger circuit and indicate the battery status during running and charging.</w:t>
-      </w:r>
-    </w:p>
-    <w:p/>
-    <w:p>
-      <w:r>
-        <w:t>During transmitting the bottom left shows an animated red dot. In a future firmware update the</w:t>
-      </w:r>
-      <w:r>
-        <w:t xml:space="preserve"> received DTMF characters will be display next to this.</w:t>
-      </w:r>
-    </w:p>
-    <w:p>
-      <w:pPr>
-        <w:pStyle w:val="Heading1"/>
-      </w:pPr>
-      <w:r>
         <w:t>Menu Details</w:t>
       </w:r>
     </w:p>
@@ -2573,7 +2448,6 @@
         <w:pStyle w:val="Heading2"/>
       </w:pPr>
       <w:r>
-        <w:lastRenderedPageBreak/>
         <w:t>+Radio Settings</w:t>
       </w:r>
     </w:p>
@@ -2582,11 +2456,7 @@
         <w:pStyle w:val="Heading3"/>
       </w:pPr>
       <w:r>
-        <w:t xml:space="preserve">XMIT: </w:t>
-      </w:r>
-      <w:proofErr w:type="spellStart"/>
-      <w:r>
-        <w:t>On</w:t>
+        <w:t>XMIT: On</w:t>
       </w:r>
       <w:r>
         <w:t>|</w:t>
@@ -2594,7 +2464,6 @@
       <w:r>
         <w:t>Off</w:t>
       </w:r>
-      <w:proofErr w:type="spellEnd"/>
     </w:p>
     <w:p>
       <w:r>
@@ -2618,11 +2487,7 @@
         <w:pStyle w:val="Heading3"/>
       </w:pPr>
       <w:r>
-        <w:t xml:space="preserve">TX Power: </w:t>
-      </w:r>
-      <w:proofErr w:type="spellStart"/>
-      <w:r>
-        <w:t>High</w:t>
+        <w:t>TX Power: High</w:t>
       </w:r>
       <w:r>
         <w:t>|</w:t>
@@ -2634,7 +2499,6 @@
         </w:rPr>
         <w:t>Low</w:t>
       </w:r>
-      <w:proofErr w:type="spellEnd"/>
     </w:p>
     <w:p>
       <w:r>
@@ -2690,11 +2554,7 @@
         <w:t>:</w:t>
       </w:r>
       <w:r>
-        <w:t xml:space="preserve"> </w:t>
-      </w:r>
-      <w:proofErr w:type="spellStart"/>
-      <w:r>
-        <w:t>Yes|</w:t>
+        <w:t xml:space="preserve"> Yes|</w:t>
       </w:r>
       <w:r>
         <w:rPr>
@@ -2703,7 +2563,6 @@
         </w:rPr>
         <w:t>No</w:t>
       </w:r>
-      <w:proofErr w:type="spellEnd"/>
     </w:p>
     <w:p>
       <w:r>
@@ -2718,11 +2577,7 @@
         <w:pStyle w:val="Heading3"/>
       </w:pPr>
       <w:r>
-        <w:t xml:space="preserve">Send GPS: </w:t>
-      </w:r>
-      <w:proofErr w:type="spellStart"/>
-      <w:r>
-        <w:t>Yes|</w:t>
+        <w:t>Send GPS: Yes|</w:t>
       </w:r>
       <w:r>
         <w:rPr>
@@ -2731,7 +2586,6 @@
         </w:rPr>
         <w:t>NO</w:t>
       </w:r>
-      <w:proofErr w:type="spellEnd"/>
       <w:r>
         <w:t xml:space="preserve"> (beacon mode only)</w:t>
       </w:r>
@@ -2760,11 +2614,9 @@
       <w:r>
         <w:t>+/-</w:t>
       </w:r>
-      <w:proofErr w:type="spellStart"/>
       <w:r>
         <w:t>n.nnnnnn</w:t>
       </w:r>
-      <w:proofErr w:type="spellEnd"/>
       <w:r>
         <w:t xml:space="preserve"> (</w:t>
       </w:r>
@@ -2811,15 +2663,7 @@
         <w:pStyle w:val="Heading3"/>
       </w:pPr>
       <w:r>
-        <w:t>Longitude: +/-</w:t>
-      </w:r>
-      <w:proofErr w:type="spellStart"/>
-      <w:r>
-        <w:t>n.nnnnnn</w:t>
-      </w:r>
-      <w:proofErr w:type="spellEnd"/>
-      <w:r>
-        <w:t xml:space="preserve"> (Send </w:t>
+        <w:t xml:space="preserve">Longitude: +/-n.nnnnnn (Send </w:t>
       </w:r>
       <w:r>
         <w:rPr>
@@ -2856,6 +2700,7 @@
         <w:pStyle w:val="Heading3"/>
       </w:pPr>
       <w:r>
+        <w:lastRenderedPageBreak/>
         <w:t>Beacon</w:t>
       </w:r>
       <w:r>
@@ -2920,17 +2765,11 @@
         <w:pStyle w:val="Heading3"/>
       </w:pPr>
       <w:r>
-        <w:lastRenderedPageBreak/>
         <w:t>Play Audio File</w:t>
       </w:r>
       <w:r>
-        <w:t xml:space="preserve">: </w:t>
-      </w:r>
-      <w:proofErr w:type="spellStart"/>
-      <w:r>
-        <w:t>Yes|No</w:t>
-      </w:r>
-      <w:proofErr w:type="spellEnd"/>
+        <w:t>: Yes|No</w:t>
+      </w:r>
     </w:p>
     <w:p>
       <w:r>
@@ -3020,13 +2859,8 @@
         <w:pStyle w:val="Heading3"/>
       </w:pPr>
       <w:r>
-        <w:t xml:space="preserve">Timer Mode: </w:t>
-      </w:r>
-      <w:proofErr w:type="spellStart"/>
-      <w:r>
-        <w:t>Fixed|Random</w:t>
-      </w:r>
-      <w:proofErr w:type="spellEnd"/>
+        <w:t>Timer Mode: Fixed|Random</w:t>
+      </w:r>
     </w:p>
     <w:p>
       <w:r>
@@ -3082,11 +2916,7 @@
         <w:t xml:space="preserve"> If </w:t>
       </w:r>
       <w:r>
-        <w:t xml:space="preserve">this time is set to less than the total </w:t>
-      </w:r>
-      <w:proofErr w:type="spellStart"/>
-      <w:r>
-        <w:t>ID</w:t>
+        <w:t>this time is set to less than the total ID</w:t>
       </w:r>
       <w:r>
         <w:t>+</w:t>
@@ -3095,31 +2925,23 @@
         <w:t>Call</w:t>
       </w:r>
       <w:r>
-        <w:t>+Audio</w:t>
-      </w:r>
-      <w:proofErr w:type="spellEnd"/>
-      <w:r>
-        <w:t xml:space="preserve"> time then there will be only </w:t>
+        <w:t xml:space="preserve">+Audio time then there will be only </w:t>
       </w:r>
       <w:r>
         <w:t>one cycle of data transmitted.</w:t>
       </w:r>
       <w:r>
-        <w:t xml:space="preserve"> If the time is longer then the </w:t>
-      </w:r>
-      <w:proofErr w:type="spellStart"/>
-      <w:r>
-        <w:t>ID</w:t>
+        <w:t xml:space="preserve"> If the </w:t>
+      </w:r>
+      <w:r>
+        <w:lastRenderedPageBreak/>
+        <w:t>time is longer then the ID</w:t>
       </w:r>
       <w:r>
         <w:t>+Call</w:t>
       </w:r>
       <w:r>
-        <w:t>+Audio</w:t>
-      </w:r>
-      <w:proofErr w:type="spellEnd"/>
-      <w:r>
-        <w:t xml:space="preserve"> cycles will be repeated until the time has expired. Note that </w:t>
+        <w:t xml:space="preserve">+Audio cycles will be repeated until the time has expired. Note that </w:t>
       </w:r>
       <w:r>
         <w:t xml:space="preserve">both ID and Audio will always be completed before </w:t>
@@ -3171,19 +2993,151 @@
         <w:pStyle w:val="Heading3"/>
       </w:pPr>
       <w:r>
+        <w:t xml:space="preserve">TX Send Max: </w:t>
+      </w:r>
+      <w:r>
+        <w:t>10-90 Sec</w:t>
+      </w:r>
+    </w:p>
+    <w:p>
+      <w:r>
+        <w:t xml:space="preserve">In </w:t>
+      </w:r>
+      <w:r>
+        <w:t>random mode this is the maximum send time.</w:t>
+      </w:r>
+    </w:p>
+    <w:p>
+      <w:pPr>
+        <w:pStyle w:val="Heading3"/>
+      </w:pPr>
+      <w:r>
+        <w:t>TX Pause Min: 10-1200 Sec</w:t>
+      </w:r>
+    </w:p>
+    <w:p>
+      <w:r>
+        <w:t>In random mode this is the minimum pause time.</w:t>
+      </w:r>
+    </w:p>
+    <w:p>
+      <w:pPr>
+        <w:pStyle w:val="Heading3"/>
+      </w:pPr>
+      <w:r>
+        <w:t>TX Pause Max: 10-1200 Sec</w:t>
+      </w:r>
+    </w:p>
+    <w:p>
+      <w:r>
+        <w:t>In random mode this is the maximum pause time.</w:t>
+      </w:r>
+    </w:p>
+    <w:p>
+      <w:pPr>
+        <w:pStyle w:val="Heading3"/>
+      </w:pPr>
+      <w:r>
+        <w:t>Radio Pause: Sleep|Awake</w:t>
+      </w:r>
+    </w:p>
+    <w:p>
+      <w:r>
+        <w:t>During pause time the radio can be put into sleep mode. This lowers the power consumption and lets the battery last longer. However note that this also means that the DTMF commands are disabled since the radio is asleep!</w:t>
+      </w:r>
+    </w:p>
+    <w:p>
+      <w:pPr>
+        <w:pStyle w:val="Heading2"/>
+      </w:pPr>
+      <w:r>
+        <w:t>+</w:t>
+      </w:r>
+      <w:r>
+        <w:t>More Radio Settings</w:t>
+      </w:r>
+    </w:p>
+    <w:p>
+      <w:pPr>
+        <w:pStyle w:val="Heading3"/>
+      </w:pPr>
+      <w:r>
+        <w:t>RX Offset: -600|0|+600 kHz</w:t>
+      </w:r>
+    </w:p>
+    <w:p>
+      <w:r>
+        <w:t>This is the frequency offset from the transmit frequency that the radio uses to receive DTMF commands</w:t>
+      </w:r>
+      <w:r>
+        <w:t>. An offset is recommended. If 0 is used the radio will only listen when it isn’t sending. It has not been tested if it listens during sending when the offset is not 0.</w:t>
+      </w:r>
+    </w:p>
+    <w:p>
+      <w:pPr>
+        <w:pStyle w:val="Heading3"/>
+      </w:pPr>
+      <w:r>
+        <w:t>Bandwidth: 12.5|</w:t>
+      </w:r>
+      <w:r>
+        <w:t>25 kHz</w:t>
+      </w:r>
+    </w:p>
+    <w:p>
+      <w:r>
+        <w:t>This sets the radio bandwidth</w:t>
+      </w:r>
+      <w:r>
+        <w:t>. It has not been tested much to see what effect it has on performance yet.</w:t>
+      </w:r>
+    </w:p>
+    <w:p>
+      <w:pPr>
+        <w:pStyle w:val="Heading3"/>
+      </w:pPr>
+      <w:r>
+        <w:t>CTCSS/DCS: CTCSS|DCS</w:t>
+      </w:r>
+    </w:p>
+    <w:p>
+      <w:r>
+        <w:t xml:space="preserve">This sets the </w:t>
+      </w:r>
+      <w:r>
+        <w:t>un-squelch</w:t>
+      </w:r>
+      <w:r>
+        <w:t xml:space="preserve"> values</w:t>
+      </w:r>
+      <w:r>
+        <w:t xml:space="preserve"> for either the analog or digital versions.</w:t>
+      </w:r>
+    </w:p>
+    <w:p>
+      <w:pPr>
+        <w:pStyle w:val="Heading3"/>
+      </w:pPr>
+      <w:r>
         <w:lastRenderedPageBreak/>
-        <w:t xml:space="preserve">TX Send Max: </w:t>
-      </w:r>
-      <w:r>
-        <w:t>10-90 Sec</w:t>
-      </w:r>
-    </w:p>
-    <w:p>
-      <w:r>
-        <w:t xml:space="preserve">In </w:t>
-      </w:r>
-      <w:r>
-        <w:t>random mode this is the maximum send time.</w:t>
+        <w:t>TX CTCSS:</w:t>
+      </w:r>
+      <w:r>
+        <w:t xml:space="preserve"> None</w:t>
+      </w:r>
+      <w:r>
+        <w:t>|</w:t>
+      </w:r>
+      <w:r>
+        <w:t>67-</w:t>
+      </w:r>
+      <w:r>
+        <w:t>250.3</w:t>
+      </w:r>
+    </w:p>
+    <w:p>
+      <w:r>
+        <w:t>Analog un-squelch frequencies sent out.</w:t>
       </w:r>
     </w:p>
     <w:p>
@@ -3191,12 +3145,15 @@
         <w:pStyle w:val="Heading3"/>
       </w:pPr>
       <w:r>
-        <w:t>TX Pause Min: 10-1200 Sec</w:t>
-      </w:r>
-    </w:p>
-    <w:p>
-      <w:r>
-        <w:t>In random mode this is the minimum pause time.</w:t>
+        <w:t>RX CTCSS:</w:t>
+      </w:r>
+      <w:r>
+        <w:t xml:space="preserve"> None|67-250.3</w:t>
+      </w:r>
+    </w:p>
+    <w:p>
+      <w:r>
+        <w:t>Analog un-squelch frequency for receiving.</w:t>
       </w:r>
     </w:p>
     <w:p>
@@ -3204,12 +3161,15 @@
         <w:pStyle w:val="Heading3"/>
       </w:pPr>
       <w:r>
-        <w:t>TX Pause Max: 10-1200 Sec</w:t>
-      </w:r>
-    </w:p>
-    <w:p>
-      <w:r>
-        <w:t>In random mode this is the maximum pause time.</w:t>
+        <w:t>TX DCS:</w:t>
+      </w:r>
+      <w:r>
+        <w:t xml:space="preserve"> None|023-754</w:t>
+      </w:r>
+    </w:p>
+    <w:p>
+      <w:r>
+        <w:t>Digital un-squelch value for sending.</w:t>
       </w:r>
     </w:p>
     <w:p>
@@ -3217,17 +3177,70 @@
         <w:pStyle w:val="Heading3"/>
       </w:pPr>
       <w:r>
-        <w:t xml:space="preserve">Radio Pause: </w:t>
-      </w:r>
-      <w:proofErr w:type="spellStart"/>
-      <w:r>
-        <w:t>Sleep|Awake</w:t>
-      </w:r>
-      <w:proofErr w:type="spellEnd"/>
-    </w:p>
-    <w:p>
-      <w:r>
-        <w:t>During pause time the radio can be put into sleep mode. This lowers the power consumption and lets the battery last longer. However note that this also means that the DTMF commands are disabled since the radio is asleep!</w:t>
+        <w:t>TX I/N: I|N</w:t>
+      </w:r>
+    </w:p>
+    <w:p>
+      <w:r>
+        <w:t>The digital I or N value for sending.</w:t>
+      </w:r>
+    </w:p>
+    <w:p>
+      <w:pPr>
+        <w:pStyle w:val="Heading3"/>
+      </w:pPr>
+      <w:r>
+        <w:t>RX DCS: None|023-754</w:t>
+      </w:r>
+    </w:p>
+    <w:p>
+      <w:r>
+        <w:t>Digital un-squelch value for receiving.</w:t>
+      </w:r>
+    </w:p>
+    <w:p>
+      <w:pPr>
+        <w:pStyle w:val="Heading3"/>
+      </w:pPr>
+      <w:r>
+        <w:t>RX I/N: I|N</w:t>
+      </w:r>
+    </w:p>
+    <w:p>
+      <w:r>
+        <w:t>The digital I or N value for receiving.</w:t>
+      </w:r>
+    </w:p>
+    <w:p>
+      <w:pPr>
+        <w:pStyle w:val="Heading3"/>
+      </w:pPr>
+      <w:r>
+        <w:t>RX Volume:</w:t>
+      </w:r>
+      <w:r>
+        <w:t xml:space="preserve"> 1-6</w:t>
+      </w:r>
+    </w:p>
+    <w:p>
+      <w:r>
+        <w:t>This is the receive volume setting. It affects how well DTMF tones are detected.</w:t>
+      </w:r>
+    </w:p>
+    <w:p>
+      <w:pPr>
+        <w:pStyle w:val="Heading3"/>
+      </w:pPr>
+      <w:r>
+        <w:t>RX Squelch:</w:t>
+      </w:r>
+      <w:r>
+        <w:t xml:space="preserve"> 0-8</w:t>
+      </w:r>
+    </w:p>
+    <w:p>
+      <w:r>
+        <w:t>This affects how much signal is required to receive the DTMF signals.</w:t>
       </w:r>
     </w:p>
     <w:p>
@@ -3235,10 +3248,40 @@
         <w:pStyle w:val="Heading2"/>
       </w:pPr>
       <w:r>
-        <w:t>+</w:t>
-      </w:r>
-      <w:r>
-        <w:t>More Radio Settings</w:t>
+        <w:t>Cancel Waits/TX Now</w:t>
+      </w:r>
+    </w:p>
+    <w:p>
+      <w:r>
+        <w:t>When the radio is in either send or pause mode this command will cancel the timer and the next mo</w:t>
+      </w:r>
+      <w:r>
+        <w:t xml:space="preserve">de will start. For </w:t>
+      </w:r>
+      <w:r>
+        <w:t>example,</w:t>
+      </w:r>
+      <w:r>
+        <w:t xml:space="preserve"> if you want to cancel</w:t>
+      </w:r>
+      <w:r>
+        <w:t xml:space="preserve"> the pause and go to transmit, use this option. It can also be done by long pressing B0.</w:t>
+      </w:r>
+    </w:p>
+    <w:p>
+      <w:pPr>
+        <w:pStyle w:val="Heading2"/>
+      </w:pPr>
+      <w:r>
+        <w:t>+Saved Settings Files</w:t>
+      </w:r>
+    </w:p>
+    <w:p>
+      <w:r>
+        <w:t>Saved settings files are named files stored on the SD card. They are useful to</w:t>
+      </w:r>
+      <w:r>
+        <w:t xml:space="preserve"> quickly configure the radio for different uses. All values except the battery calibration are affected.</w:t>
       </w:r>
     </w:p>
     <w:p>
@@ -3246,15 +3289,12 @@
         <w:pStyle w:val="Heading3"/>
       </w:pPr>
       <w:r>
-        <w:t>RX Offset: -600|0|+600 kHz</w:t>
-      </w:r>
-    </w:p>
-    <w:p>
-      <w:r>
-        <w:t>This is the frequency offset from the transmit frequency that the radio uses to receive DTMF commands</w:t>
-      </w:r>
-      <w:r>
-        <w:t>. An offset is recommended. If 0 is used the radio will only listen when it isn’t sending. It has not been tested if it listens during sending when the offset is not 0.</w:t>
+        <w:t>Create File</w:t>
+      </w:r>
+    </w:p>
+    <w:p>
+      <w:r>
+        <w:t>This prompts the user for a name. The file is then created using the current system settings.</w:t>
       </w:r>
     </w:p>
     <w:p>
@@ -3262,18 +3302,13 @@
         <w:pStyle w:val="Heading3"/>
       </w:pPr>
       <w:r>
-        <w:t>Bandwidth: 12.5|</w:t>
-      </w:r>
-      <w:r>
-        <w:t>25 kHz</w:t>
-      </w:r>
-    </w:p>
-    <w:p>
-      <w:r>
-        <w:t>This sets the radio bandwidth</w:t>
-      </w:r>
-      <w:r>
-        <w:t>. It has not been tested much to see what effect it has on performance yet.</w:t>
+        <w:lastRenderedPageBreak/>
+        <w:t>Save/Update File</w:t>
+      </w:r>
+    </w:p>
+    <w:p>
+      <w:r>
+        <w:t>This command saves the current settings into the selected file. If it already exists the user will be asked to confirm overwriting the file.</w:t>
       </w:r>
     </w:p>
     <w:p>
@@ -3281,21 +3316,12 @@
         <w:pStyle w:val="Heading3"/>
       </w:pPr>
       <w:r>
-        <w:t>CTCSS/DCS: CTCSS|DCS</w:t>
-      </w:r>
-    </w:p>
-    <w:p>
-      <w:r>
-        <w:t xml:space="preserve">This sets the </w:t>
-      </w:r>
-      <w:r>
-        <w:t>un-squelch</w:t>
-      </w:r>
-      <w:r>
-        <w:t xml:space="preserve"> values</w:t>
-      </w:r>
-      <w:r>
-        <w:t xml:space="preserve"> for either the analog or digital versions.</w:t>
+        <w:t>Load File</w:t>
+      </w:r>
+    </w:p>
+    <w:p>
+      <w:r>
+        <w:t>This command asks the user for the name and then sets all of the system settings except the battery calibration using the values in the file.</w:t>
       </w:r>
     </w:p>
     <w:p>
@@ -3303,24 +3329,20 @@
         <w:pStyle w:val="Heading3"/>
       </w:pPr>
       <w:r>
-        <w:t>TX CTCSS:</w:t>
-      </w:r>
-      <w:r>
-        <w:t xml:space="preserve"> None</w:t>
-      </w:r>
-      <w:r>
-        <w:t>|</w:t>
-      </w:r>
-      <w:r>
-        <w:t>67-</w:t>
-      </w:r>
-      <w:r>
-        <w:t>250.3</w:t>
-      </w:r>
-    </w:p>
-    <w:p>
-      <w:r>
-        <w:t>Analog un-squelch frequencies sent out.</w:t>
+        <w:t>Delete File</w:t>
+      </w:r>
+    </w:p>
+    <w:p>
+      <w:r>
+        <w:t>The user selects a file from the list and then it can be deleted.</w:t>
+      </w:r>
+    </w:p>
+    <w:p>
+      <w:pPr>
+        <w:pStyle w:val="Heading2"/>
+      </w:pPr>
+      <w:r>
+        <w:t>+System Settings</w:t>
       </w:r>
     </w:p>
     <w:p>
@@ -3328,15 +3350,180 @@
         <w:pStyle w:val="Heading3"/>
       </w:pPr>
       <w:r>
-        <w:t>RX CTCSS:</w:t>
-      </w:r>
-      <w:r>
-        <w:t xml:space="preserve"> None|67-250.3</w:t>
-      </w:r>
-    </w:p>
-    <w:p>
-      <w:r>
-        <w:t>Analog un-squelch frequency for receiving.</w:t>
+        <w:t>+Display</w:t>
+      </w:r>
+      <w:r>
+        <w:t xml:space="preserve"> Settings</w:t>
+      </w:r>
+    </w:p>
+    <w:p>
+      <w:pPr>
+        <w:pStyle w:val="Heading4"/>
+      </w:pPr>
+      <w:r>
+        <w:t>Dimming Mode: None</w:t>
+      </w:r>
+      <w:r>
+        <w:t>|Timer</w:t>
+      </w:r>
+    </w:p>
+    <w:p>
+      <w:r>
+        <w:t xml:space="preserve">The display can be set to dim automatically after a specified number of seconds. This is used to save battery power since the backlight </w:t>
+      </w:r>
+      <w:r>
+        <w:t>uses a significant amount.</w:t>
+      </w:r>
+    </w:p>
+    <w:p>
+      <w:pPr>
+        <w:pStyle w:val="Heading4"/>
+      </w:pPr>
+      <w:r>
+        <w:t>Bright Value: 1-100</w:t>
+      </w:r>
+      <w:r>
+        <w:t>%</w:t>
+      </w:r>
+    </w:p>
+    <w:p>
+      <w:r>
+        <w:t>Set the display brightness value.</w:t>
+      </w:r>
+    </w:p>
+    <w:p>
+      <w:pPr>
+        <w:pStyle w:val="Heading4"/>
+      </w:pPr>
+      <w:r>
+        <w:t xml:space="preserve">Dim Value: </w:t>
+      </w:r>
+      <w:r>
+        <w:t>0-100%</w:t>
+      </w:r>
+    </w:p>
+    <w:p>
+      <w:r>
+        <w:t xml:space="preserve">Set the display brightness after the </w:t>
+      </w:r>
+      <w:r>
+        <w:t>timer below expires.</w:t>
+      </w:r>
+    </w:p>
+    <w:p>
+      <w:pPr>
+        <w:pStyle w:val="Heading4"/>
+      </w:pPr>
+      <w:r>
+        <w:t>Display Dim Time:</w:t>
+      </w:r>
+      <w:r>
+        <w:t xml:space="preserve"> 0-120 S</w:t>
+      </w:r>
+    </w:p>
+    <w:p>
+      <w:r>
+        <w:t>Specify the time until the display changes to dim mode.</w:t>
+      </w:r>
+    </w:p>
+    <w:p>
+      <w:pPr>
+        <w:pStyle w:val="Heading4"/>
+      </w:pPr>
+      <w:r>
+        <w:t>+Sideways Scroll Settings</w:t>
+      </w:r>
+    </w:p>
+    <w:p>
+      <w:r>
+        <w:t>Lines of text that too long for the display will scroll back and forth. The following settings control the speed.</w:t>
+      </w:r>
+    </w:p>
+    <w:p>
+      <w:pPr>
+        <w:pStyle w:val="Heading5"/>
+      </w:pPr>
+      <w:r>
+        <w:t xml:space="preserve">Speed: </w:t>
+      </w:r>
+      <w:r>
+        <w:t>1-1000 mS</w:t>
+      </w:r>
+    </w:p>
+    <w:p>
+      <w:r>
+        <w:t>Controls the speed of text moving to the left.</w:t>
+      </w:r>
+    </w:p>
+    <w:p>
+      <w:pPr>
+        <w:pStyle w:val="Heading5"/>
+      </w:pPr>
+      <w:r>
+        <w:t>Pause: 1-100</w:t>
+      </w:r>
+      <w:r>
+        <w:t xml:space="preserve"> mS</w:t>
+      </w:r>
+    </w:p>
+    <w:p>
+      <w:r>
+        <w:t>This controls the pause when the text is at the end (all the way to the left).</w:t>
+      </w:r>
+    </w:p>
+    <w:p>
+      <w:pPr>
+        <w:pStyle w:val="Heading5"/>
+      </w:pPr>
+      <w:r>
+        <w:lastRenderedPageBreak/>
+        <w:t>Reverse Speed: 1-20x</w:t>
+      </w:r>
+    </w:p>
+    <w:p>
+      <w:r>
+        <w:t xml:space="preserve">This is how fast the text scrolls </w:t>
+      </w:r>
+      <w:r>
+        <w:t>back to the beginning (to the right). 2x means twice as fast as the text scroll</w:t>
+      </w:r>
+      <w:r>
+        <w:t>ed to the left</w:t>
+      </w:r>
+      <w:r>
+        <w:t>.</w:t>
+      </w:r>
+    </w:p>
+    <w:p>
+      <w:pPr>
+        <w:pStyle w:val="Heading4"/>
+      </w:pPr>
+      <w:r>
+        <w:t xml:space="preserve">Menu Selection: </w:t>
+      </w:r>
+      <w:r>
+        <w:t>Color|*</w:t>
+      </w:r>
+    </w:p>
+    <w:p>
+      <w:r>
+        <w:t>Menu selections</w:t>
+      </w:r>
+      <w:r>
+        <w:t xml:space="preserve"> and selections from a list can be either colored or marked with the ‘*’ character.</w:t>
+      </w:r>
+    </w:p>
+    <w:p>
+      <w:pPr>
+        <w:pStyle w:val="Heading4"/>
+      </w:pPr>
+      <w:r>
+        <w:t>Text/HiLite Colors</w:t>
+      </w:r>
+    </w:p>
+    <w:p>
+      <w:r>
+        <w:t>This selection allows for choosing the colors of the text and the highlight. The background screen is always black.</w:t>
       </w:r>
     </w:p>
     <w:p>
@@ -3344,15 +3531,36 @@
         <w:pStyle w:val="Heading3"/>
       </w:pPr>
       <w:r>
-        <w:t>TX DCS:</w:t>
-      </w:r>
-      <w:r>
-        <w:t xml:space="preserve"> None|023-754</w:t>
-      </w:r>
-    </w:p>
-    <w:p>
-      <w:r>
-        <w:t>Digital un-squelch value for sending.</w:t>
+        <w:t>+Dial &amp; Button Settings</w:t>
+      </w:r>
+    </w:p>
+    <w:p>
+      <w:pPr>
+        <w:pStyle w:val="Heading4"/>
+      </w:pPr>
+      <w:r>
+        <w:t>Direction: Normal:Reverse</w:t>
+      </w:r>
+    </w:p>
+    <w:p>
+      <w:r>
+        <w:t>If you really want the button to be the other way around this is the choice for you.</w:t>
+      </w:r>
+    </w:p>
+    <w:p>
+      <w:pPr>
+        <w:pStyle w:val="Heading4"/>
+      </w:pPr>
+      <w:r>
+        <w:t>Long Press Timer: 2-200</w:t>
+      </w:r>
+    </w:p>
+    <w:p>
+      <w:r>
+        <w:t>This value affects how long or short a long press is. The default value is normally OK</w:t>
+      </w:r>
+      <w:r>
+        <w:t>, but somebody might want to change it.</w:t>
       </w:r>
     </w:p>
     <w:p>
@@ -3360,13 +3568,93 @@
         <w:pStyle w:val="Heading3"/>
       </w:pPr>
       <w:r>
+        <w:t>+Battery Settings</w:t>
+      </w:r>
+    </w:p>
+    <w:p>
+      <w:r>
+        <w:t>Since the PCB was designed with 10% resistors for measuring the battery voltage some calibration is needed. A future PCB will probably use better resistors so this won’t be needed.</w:t>
+      </w:r>
+    </w:p>
+    <w:p>
+      <w:pPr>
+        <w:pStyle w:val="Heading4"/>
+      </w:pPr>
+      <w:r>
+        <w:t>Show Battery: Yes|No</w:t>
+      </w:r>
+    </w:p>
+    <w:p>
+      <w:r>
+        <w:t xml:space="preserve">This option controls the </w:t>
+      </w:r>
+      <w:r>
+        <w:t>battery display on the bottom right of the display.</w:t>
+      </w:r>
+    </w:p>
+    <w:p>
+      <w:pPr>
+        <w:pStyle w:val="Heading4"/>
+      </w:pPr>
+      <w:r>
+        <w:t>Full Battery: 2000-4000</w:t>
+      </w:r>
+    </w:p>
+    <w:p>
+      <w:r>
+        <w:t>This is the value that indicates a full 4.2V battery.</w:t>
+      </w:r>
+    </w:p>
+    <w:p>
+      <w:pPr>
+        <w:pStyle w:val="Heading4"/>
+      </w:pPr>
+      <w:r>
+        <w:t>Set Full Battery</w:t>
+      </w:r>
+    </w:p>
+    <w:p>
+      <w:r>
+        <w:t>This selection reads the current battery values and stores it. It is best set by fully charging the battery and then disconnecting the charger. Wait a couple of minutes and then use it several times until it seems stable.</w:t>
+      </w:r>
+    </w:p>
+    <w:p>
+      <w:pPr>
+        <w:pStyle w:val="Heading4"/>
+      </w:pPr>
+      <w:r>
+        <w:t>Read Battery Raw Data</w:t>
+      </w:r>
+    </w:p>
+    <w:p>
+      <w:r>
+        <w:t>This continuously reads the battery value</w:t>
+      </w:r>
+      <w:r>
+        <w:t>. It was originally used for testing, but it seems like it might possibly be useful so it was left in the menu system.</w:t>
+      </w:r>
+    </w:p>
+    <w:p>
+      <w:pPr>
+        <w:pStyle w:val="Heading3"/>
+      </w:pPr>
+      <w:r>
         <w:lastRenderedPageBreak/>
-        <w:t>TX I/N: I|N</w:t>
-      </w:r>
-    </w:p>
-    <w:p>
-      <w:r>
-        <w:t>The digital I or N value for sending.</w:t>
+        <w:t>New Version BIN File</w:t>
+      </w:r>
+    </w:p>
+    <w:p>
+      <w:r>
+        <w:t xml:space="preserve">New firmware can be loaded by putting </w:t>
+      </w:r>
+      <w:r>
+        <w:t>the binary file on the SD card. It must be named RadioFox.BIN.</w:t>
+      </w:r>
+      <w:r>
+        <w:t xml:space="preserve"> There are two prompts, one to confirm overwriting the firmware, and another to allow deletion of the </w:t>
+      </w:r>
+      <w:r>
+        <w:t>BIN file after installation.</w:t>
       </w:r>
     </w:p>
     <w:p>
@@ -3374,12 +3662,24 @@
         <w:pStyle w:val="Heading3"/>
       </w:pPr>
       <w:r>
-        <w:t>RX DCS: None|023-754</w:t>
-      </w:r>
-    </w:p>
-    <w:p>
-      <w:r>
-        <w:t>Digital un-squelch value for receiving.</w:t>
+        <w:t>Factory Settings</w:t>
+      </w:r>
+    </w:p>
+    <w:p>
+      <w:r>
+        <w:t xml:space="preserve">This command resets </w:t>
+      </w:r>
+      <w:r>
+        <w:t xml:space="preserve">all </w:t>
+      </w:r>
+      <w:r>
+        <w:t>settings</w:t>
+      </w:r>
+      <w:r>
+        <w:t xml:space="preserve"> except the high battery value to the original factory values.</w:t>
+      </w:r>
+      <w:r>
+        <w:t xml:space="preserve"> The factory reset can also be done by holding the dial button down while turning the power on.</w:t>
       </w:r>
     </w:p>
     <w:p>
@@ -3387,521 +3687,6 @@
         <w:pStyle w:val="Heading3"/>
       </w:pPr>
       <w:r>
-        <w:t>RX I/N: I|N</w:t>
-      </w:r>
-    </w:p>
-    <w:p>
-      <w:r>
-        <w:t>The digital I or N value for receiving.</w:t>
-      </w:r>
-    </w:p>
-    <w:p>
-      <w:pPr>
-        <w:pStyle w:val="Heading3"/>
-      </w:pPr>
-      <w:r>
-        <w:t>RX Volume:</w:t>
-      </w:r>
-      <w:r>
-        <w:t xml:space="preserve"> 1-6</w:t>
-      </w:r>
-    </w:p>
-    <w:p>
-      <w:r>
-        <w:t>This is the receive volume setting. It affects how well DTMF tones are detected.</w:t>
-      </w:r>
-    </w:p>
-    <w:p>
-      <w:pPr>
-        <w:pStyle w:val="Heading3"/>
-      </w:pPr>
-      <w:r>
-        <w:t>RX Squelch:</w:t>
-      </w:r>
-      <w:r>
-        <w:t xml:space="preserve"> 0-8</w:t>
-      </w:r>
-    </w:p>
-    <w:p>
-      <w:r>
-        <w:t>This affects how much signal is required to receive the DTMF signals.</w:t>
-      </w:r>
-    </w:p>
-    <w:p>
-      <w:pPr>
-        <w:pStyle w:val="Heading2"/>
-      </w:pPr>
-      <w:r>
-        <w:t>Cancel Waits/TX Now</w:t>
-      </w:r>
-    </w:p>
-    <w:p>
-      <w:r>
-        <w:t>When the radio is in either send or pause mode this command will cancel the timer and the next mo</w:t>
-      </w:r>
-      <w:r>
-        <w:t xml:space="preserve">de will start. For </w:t>
-      </w:r>
-      <w:r>
-        <w:t>example,</w:t>
-      </w:r>
-      <w:r>
-        <w:t xml:space="preserve"> if you want to cancel</w:t>
-      </w:r>
-      <w:r>
-        <w:t xml:space="preserve"> the pause and go to transmit, use this option. It can also be done by long pressing B0.</w:t>
-      </w:r>
-    </w:p>
-    <w:p>
-      <w:pPr>
-        <w:pStyle w:val="Heading2"/>
-      </w:pPr>
-      <w:r>
-        <w:t>+Saved Settings Files</w:t>
-      </w:r>
-    </w:p>
-    <w:p>
-      <w:r>
-        <w:t>Saved settings files are named files stored on the SD card. They are useful to</w:t>
-      </w:r>
-      <w:r>
-        <w:t xml:space="preserve"> quickly configure the radio for different uses. All values except the battery calibration are affected.</w:t>
-      </w:r>
-    </w:p>
-    <w:p>
-      <w:pPr>
-        <w:pStyle w:val="Heading3"/>
-      </w:pPr>
-      <w:r>
-        <w:t>Create File</w:t>
-      </w:r>
-    </w:p>
-    <w:p>
-      <w:r>
-        <w:t>This prompts the user for a name. The file is then created using the current system settings.</w:t>
-      </w:r>
-    </w:p>
-    <w:p>
-      <w:pPr>
-        <w:pStyle w:val="Heading3"/>
-      </w:pPr>
-      <w:r>
-        <w:t>Save/Update File</w:t>
-      </w:r>
-    </w:p>
-    <w:p>
-      <w:r>
-        <w:t>This command saves the current settings into the selected file. If it already exists the user will be asked to confirm overwriting the file.</w:t>
-      </w:r>
-    </w:p>
-    <w:p>
-      <w:pPr>
-        <w:pStyle w:val="Heading3"/>
-      </w:pPr>
-      <w:r>
-        <w:t>Load File</w:t>
-      </w:r>
-    </w:p>
-    <w:p>
-      <w:r>
-        <w:t>This command asks the user for the name and then sets all of the system settings except the battery calibration using the values in the file.</w:t>
-      </w:r>
-    </w:p>
-    <w:p>
-      <w:pPr>
-        <w:pStyle w:val="Heading3"/>
-      </w:pPr>
-      <w:r>
-        <w:lastRenderedPageBreak/>
-        <w:t>Delete File</w:t>
-      </w:r>
-    </w:p>
-    <w:p>
-      <w:r>
-        <w:t>The user selects a file from the list and then it can be deleted.</w:t>
-      </w:r>
-    </w:p>
-    <w:p>
-      <w:pPr>
-        <w:pStyle w:val="Heading2"/>
-      </w:pPr>
-      <w:r>
-        <w:t>+System Settings</w:t>
-      </w:r>
-    </w:p>
-    <w:p>
-      <w:pPr>
-        <w:pStyle w:val="Heading3"/>
-      </w:pPr>
-      <w:r>
-        <w:t>+Display</w:t>
-      </w:r>
-      <w:r>
-        <w:t xml:space="preserve"> Settings</w:t>
-      </w:r>
-    </w:p>
-    <w:p>
-      <w:pPr>
-        <w:pStyle w:val="Heading4"/>
-      </w:pPr>
-      <w:r>
-        <w:t xml:space="preserve">Dimming Mode: </w:t>
-      </w:r>
-      <w:proofErr w:type="spellStart"/>
-      <w:r>
-        <w:t>None</w:t>
-      </w:r>
-      <w:r>
-        <w:t>|Timer</w:t>
-      </w:r>
-      <w:proofErr w:type="spellEnd"/>
-    </w:p>
-    <w:p>
-      <w:r>
-        <w:t xml:space="preserve">The display can be set to dim automatically after a specified number of seconds. This is used to save battery power since the backlight </w:t>
-      </w:r>
-      <w:r>
-        <w:t>uses a significant amount.</w:t>
-      </w:r>
-    </w:p>
-    <w:p>
-      <w:pPr>
-        <w:pStyle w:val="Heading4"/>
-      </w:pPr>
-      <w:r>
-        <w:t>Bright Value: 1-100</w:t>
-      </w:r>
-      <w:r>
-        <w:t>%</w:t>
-      </w:r>
-    </w:p>
-    <w:p>
-      <w:r>
-        <w:t>Set the display brightness value.</w:t>
-      </w:r>
-    </w:p>
-    <w:p>
-      <w:pPr>
-        <w:pStyle w:val="Heading4"/>
-      </w:pPr>
-      <w:r>
-        <w:t xml:space="preserve">Dim Value: </w:t>
-      </w:r>
-      <w:r>
-        <w:t>0-100%</w:t>
-      </w:r>
-    </w:p>
-    <w:p>
-      <w:r>
-        <w:t xml:space="preserve">Set the display brightness after the </w:t>
-      </w:r>
-      <w:r>
-        <w:t>timer below expires.</w:t>
-      </w:r>
-    </w:p>
-    <w:p>
-      <w:pPr>
-        <w:pStyle w:val="Heading4"/>
-      </w:pPr>
-      <w:r>
-        <w:t>Display Dim Time:</w:t>
-      </w:r>
-      <w:r>
-        <w:t xml:space="preserve"> 0-120 S</w:t>
-      </w:r>
-    </w:p>
-    <w:p>
-      <w:r>
-        <w:t>Specify the time until the display changes to dim mode.</w:t>
-      </w:r>
-    </w:p>
-    <w:p>
-      <w:pPr>
-        <w:pStyle w:val="Heading4"/>
-      </w:pPr>
-      <w:r>
-        <w:t>+Sideways Scroll Settings</w:t>
-      </w:r>
-    </w:p>
-    <w:p>
-      <w:r>
-        <w:t>Lines of text that too long for the display will scroll back and forth. The following settings control the speed.</w:t>
-      </w:r>
-    </w:p>
-    <w:p>
-      <w:pPr>
-        <w:pStyle w:val="Heading5"/>
-      </w:pPr>
-      <w:r>
-        <w:t xml:space="preserve">Speed: </w:t>
-      </w:r>
-      <w:r>
-        <w:t>1-1000 mS</w:t>
-      </w:r>
-    </w:p>
-    <w:p>
-      <w:r>
-        <w:t>Controls the speed of text moving to the left.</w:t>
-      </w:r>
-    </w:p>
-    <w:p>
-      <w:pPr>
-        <w:pStyle w:val="Heading5"/>
-      </w:pPr>
-      <w:r>
-        <w:t>Pause: 1-100</w:t>
-      </w:r>
-      <w:r>
-        <w:t xml:space="preserve"> mS</w:t>
-      </w:r>
-    </w:p>
-    <w:p>
-      <w:r>
-        <w:t>This controls the pause when the text is at the end (all the way to the left).</w:t>
-      </w:r>
-    </w:p>
-    <w:p>
-      <w:pPr>
-        <w:pStyle w:val="Heading5"/>
-      </w:pPr>
-      <w:r>
-        <w:t>Reverse Speed: 1-20x</w:t>
-      </w:r>
-    </w:p>
-    <w:p>
-      <w:r>
-        <w:t xml:space="preserve">This is how fast the text scrolls </w:t>
-      </w:r>
-      <w:r>
-        <w:t>back to the beginning (to the right). 2x means twice as fast as the text scroll</w:t>
-      </w:r>
-      <w:r>
-        <w:t>ed to the left</w:t>
-      </w:r>
-      <w:r>
-        <w:t>.</w:t>
-      </w:r>
-    </w:p>
-    <w:p>
-      <w:pPr>
-        <w:pStyle w:val="Heading4"/>
-      </w:pPr>
-      <w:r>
-        <w:t xml:space="preserve">Menu Selection: </w:t>
-      </w:r>
-      <w:r>
-        <w:t>Color|*</w:t>
-      </w:r>
-    </w:p>
-    <w:p>
-      <w:r>
-        <w:t>Menu selections</w:t>
-      </w:r>
-      <w:r>
-        <w:t xml:space="preserve"> and selections from a list can be either colored or marked with the ‘*’ character.</w:t>
-      </w:r>
-    </w:p>
-    <w:p>
-      <w:pPr>
-        <w:pStyle w:val="Heading4"/>
-      </w:pPr>
-      <w:r>
-        <w:t>Text/</w:t>
-      </w:r>
-      <w:proofErr w:type="spellStart"/>
-      <w:r>
-        <w:t>HiLite</w:t>
-      </w:r>
-      <w:proofErr w:type="spellEnd"/>
-      <w:r>
-        <w:t xml:space="preserve"> Colors</w:t>
-      </w:r>
-    </w:p>
-    <w:p>
-      <w:r>
-        <w:t>This selection allows for choosing the colors of the text and the highlight. The background screen is always black.</w:t>
-      </w:r>
-    </w:p>
-    <w:p>
-      <w:pPr>
-        <w:pStyle w:val="Heading3"/>
-      </w:pPr>
-      <w:r>
-        <w:lastRenderedPageBreak/>
-        <w:t>+Dial &amp; Button Settings</w:t>
-      </w:r>
-    </w:p>
-    <w:p>
-      <w:pPr>
-        <w:pStyle w:val="Heading4"/>
-      </w:pPr>
-      <w:r>
-        <w:t xml:space="preserve">Direction: </w:t>
-      </w:r>
-      <w:proofErr w:type="spellStart"/>
-      <w:r>
-        <w:t>Normal:Reverse</w:t>
-      </w:r>
-      <w:proofErr w:type="spellEnd"/>
-    </w:p>
-    <w:p>
-      <w:r>
-        <w:t>If you really want the button to be the other way around this is the choice for you.</w:t>
-      </w:r>
-    </w:p>
-    <w:p>
-      <w:pPr>
-        <w:pStyle w:val="Heading4"/>
-      </w:pPr>
-      <w:r>
-        <w:t>Long Press Timer: 2-200</w:t>
-      </w:r>
-    </w:p>
-    <w:p>
-      <w:r>
-        <w:t>This value affects how long or short a long press is. The default value is normally OK</w:t>
-      </w:r>
-      <w:r>
-        <w:t>, but somebody might want to change it.</w:t>
-      </w:r>
-    </w:p>
-    <w:p>
-      <w:pPr>
-        <w:pStyle w:val="Heading3"/>
-      </w:pPr>
-      <w:r>
-        <w:t>+Battery Settings</w:t>
-      </w:r>
-    </w:p>
-    <w:p>
-      <w:r>
-        <w:t>Since the PCB was designed with 10% resistors for measuring the battery voltage some calibration is needed. A future PCB will probably use better resistors so this won’t be needed.</w:t>
-      </w:r>
-    </w:p>
-    <w:p>
-      <w:pPr>
-        <w:pStyle w:val="Heading4"/>
-      </w:pPr>
-      <w:r>
-        <w:t xml:space="preserve">Show Battery: </w:t>
-      </w:r>
-      <w:proofErr w:type="spellStart"/>
-      <w:r>
-        <w:t>Yes|No</w:t>
-      </w:r>
-      <w:proofErr w:type="spellEnd"/>
-    </w:p>
-    <w:p>
-      <w:r>
-        <w:t xml:space="preserve">This option controls the </w:t>
-      </w:r>
-      <w:r>
-        <w:t>battery display on the bottom right of the display.</w:t>
-      </w:r>
-    </w:p>
-    <w:p>
-      <w:pPr>
-        <w:pStyle w:val="Heading4"/>
-      </w:pPr>
-      <w:r>
-        <w:t>Full Battery: 2000-4000</w:t>
-      </w:r>
-    </w:p>
-    <w:p>
-      <w:r>
-        <w:t>This is the value that indicates a full 4.2V battery.</w:t>
-      </w:r>
-    </w:p>
-    <w:p>
-      <w:pPr>
-        <w:pStyle w:val="Heading4"/>
-      </w:pPr>
-      <w:r>
-        <w:t>Set Full Battery</w:t>
-      </w:r>
-    </w:p>
-    <w:p>
-      <w:r>
-        <w:t>This selection reads the current battery values and stores it. It is best set by fully charging the battery and then disconnecting the charger. Wait a couple of minutes and then use it several times until it seems stable.</w:t>
-      </w:r>
-    </w:p>
-    <w:p>
-      <w:pPr>
-        <w:pStyle w:val="Heading4"/>
-      </w:pPr>
-      <w:r>
-        <w:t>Read Battery Raw Data</w:t>
-      </w:r>
-    </w:p>
-    <w:p>
-      <w:r>
-        <w:t>This continuously reads the battery value</w:t>
-      </w:r>
-      <w:r>
-        <w:t>. It was originally used for testing, but it seems like it might possibly be useful so it was left in the menu system.</w:t>
-      </w:r>
-    </w:p>
-    <w:p>
-      <w:pPr>
-        <w:pStyle w:val="Heading3"/>
-      </w:pPr>
-      <w:r>
-        <w:t>New Version BIN File</w:t>
-      </w:r>
-    </w:p>
-    <w:p>
-      <w:r>
-        <w:t xml:space="preserve">New firmware can be loaded by putting </w:t>
-      </w:r>
-      <w:r>
-        <w:t xml:space="preserve">the binary file on the SD card. It must be named </w:t>
-      </w:r>
-      <w:proofErr w:type="spellStart"/>
-      <w:r>
-        <w:t>RadioFox.BIN</w:t>
-      </w:r>
-      <w:proofErr w:type="spellEnd"/>
-      <w:r>
-        <w:t>.</w:t>
-      </w:r>
-      <w:r>
-        <w:t xml:space="preserve"> There are two prompts, one to confirm overwriting the firmware, and another to allow deletion of the </w:t>
-      </w:r>
-      <w:r>
-        <w:t>BIN file after installation.</w:t>
-      </w:r>
-    </w:p>
-    <w:p>
-      <w:pPr>
-        <w:pStyle w:val="Heading3"/>
-      </w:pPr>
-      <w:r>
-        <w:t>Factory Settings</w:t>
-      </w:r>
-    </w:p>
-    <w:p>
-      <w:r>
-        <w:t xml:space="preserve">This command resets </w:t>
-      </w:r>
-      <w:r>
-        <w:t xml:space="preserve">all </w:t>
-      </w:r>
-      <w:r>
-        <w:t>settings</w:t>
-      </w:r>
-      <w:r>
-        <w:t xml:space="preserve"> except the high battery value to the original factory values.</w:t>
-      </w:r>
-      <w:r>
-        <w:t xml:space="preserve"> The factory reset can also be done by holding the dial button down while turning the power on.</w:t>
-      </w:r>
-    </w:p>
-    <w:p>
-      <w:pPr>
-        <w:pStyle w:val="Heading3"/>
-      </w:pPr>
-      <w:r>
-        <w:lastRenderedPageBreak/>
         <w:t>Format EEPROM</w:t>
       </w:r>
     </w:p>
@@ -3913,15 +3698,7 @@
         <w:t xml:space="preserve">and reset </w:t>
       </w:r>
       <w:r>
-        <w:t xml:space="preserve">the </w:t>
-      </w:r>
-      <w:proofErr w:type="spellStart"/>
-      <w:r>
-        <w:t>eeprom</w:t>
-      </w:r>
-      <w:proofErr w:type="spellEnd"/>
-      <w:r>
-        <w:t xml:space="preserve"> where the settings are save</w:t>
+        <w:t>the eeprom where the settings are save</w:t>
       </w:r>
       <w:r>
         <w:t xml:space="preserve"> in non-volatile memory. This is how settings are saved while the system is not powered.</w:t>
@@ -5482,6 +5259,118 @@
     </w:lvl>
   </w:abstractNum>
   <w:abstractNum w:abstractNumId="12" w15:restartNumberingAfterBreak="0">
+    <w:nsid w:val="66D835CA"/>
+    <w:multiLevelType w:val="hybridMultilevel"/>
+    <w:tmpl w:val="33A22D2C"/>
+    <w:lvl w:ilvl="0" w:tplc="9C60A818">
+      <w:numFmt w:val="bullet"/>
+      <w:lvlText w:val="-"/>
+      <w:lvlJc w:val="left"/>
+      <w:pPr>
+        <w:ind w:left="720" w:hanging="360"/>
+      </w:pPr>
+      <w:rPr>
+        <w:rFonts w:ascii="Arial" w:eastAsia="Arial" w:hAnsi="Arial" w:cs="Arial" w:hint="default"/>
+      </w:rPr>
+    </w:lvl>
+    <w:lvl w:ilvl="1" w:tplc="04090003" w:tentative="1">
+      <w:start w:val="1"/>
+      <w:numFmt w:val="bullet"/>
+      <w:lvlText w:val="o"/>
+      <w:lvlJc w:val="left"/>
+      <w:pPr>
+        <w:ind w:left="1440" w:hanging="360"/>
+      </w:pPr>
+      <w:rPr>
+        <w:rFonts w:ascii="Courier New" w:hAnsi="Courier New" w:cs="Courier New" w:hint="default"/>
+      </w:rPr>
+    </w:lvl>
+    <w:lvl w:ilvl="2" w:tplc="04090005" w:tentative="1">
+      <w:start w:val="1"/>
+      <w:numFmt w:val="bullet"/>
+      <w:lvlText w:val=""/>
+      <w:lvlJc w:val="left"/>
+      <w:pPr>
+        <w:ind w:left="2160" w:hanging="360"/>
+      </w:pPr>
+      <w:rPr>
+        <w:rFonts w:ascii="Wingdings" w:hAnsi="Wingdings" w:hint="default"/>
+      </w:rPr>
+    </w:lvl>
+    <w:lvl w:ilvl="3" w:tplc="04090001" w:tentative="1">
+      <w:start w:val="1"/>
+      <w:numFmt w:val="bullet"/>
+      <w:lvlText w:val=""/>
+      <w:lvlJc w:val="left"/>
+      <w:pPr>
+        <w:ind w:left="2880" w:hanging="360"/>
+      </w:pPr>
+      <w:rPr>
+        <w:rFonts w:ascii="Symbol" w:hAnsi="Symbol" w:hint="default"/>
+      </w:rPr>
+    </w:lvl>
+    <w:lvl w:ilvl="4" w:tplc="04090003" w:tentative="1">
+      <w:start w:val="1"/>
+      <w:numFmt w:val="bullet"/>
+      <w:lvlText w:val="o"/>
+      <w:lvlJc w:val="left"/>
+      <w:pPr>
+        <w:ind w:left="3600" w:hanging="360"/>
+      </w:pPr>
+      <w:rPr>
+        <w:rFonts w:ascii="Courier New" w:hAnsi="Courier New" w:cs="Courier New" w:hint="default"/>
+      </w:rPr>
+    </w:lvl>
+    <w:lvl w:ilvl="5" w:tplc="04090005" w:tentative="1">
+      <w:start w:val="1"/>
+      <w:numFmt w:val="bullet"/>
+      <w:lvlText w:val=""/>
+      <w:lvlJc w:val="left"/>
+      <w:pPr>
+        <w:ind w:left="4320" w:hanging="360"/>
+      </w:pPr>
+      <w:rPr>
+        <w:rFonts w:ascii="Wingdings" w:hAnsi="Wingdings" w:hint="default"/>
+      </w:rPr>
+    </w:lvl>
+    <w:lvl w:ilvl="6" w:tplc="04090001" w:tentative="1">
+      <w:start w:val="1"/>
+      <w:numFmt w:val="bullet"/>
+      <w:lvlText w:val=""/>
+      <w:lvlJc w:val="left"/>
+      <w:pPr>
+        <w:ind w:left="5040" w:hanging="360"/>
+      </w:pPr>
+      <w:rPr>
+        <w:rFonts w:ascii="Symbol" w:hAnsi="Symbol" w:hint="default"/>
+      </w:rPr>
+    </w:lvl>
+    <w:lvl w:ilvl="7" w:tplc="04090003" w:tentative="1">
+      <w:start w:val="1"/>
+      <w:numFmt w:val="bullet"/>
+      <w:lvlText w:val="o"/>
+      <w:lvlJc w:val="left"/>
+      <w:pPr>
+        <w:ind w:left="5760" w:hanging="360"/>
+      </w:pPr>
+      <w:rPr>
+        <w:rFonts w:ascii="Courier New" w:hAnsi="Courier New" w:cs="Courier New" w:hint="default"/>
+      </w:rPr>
+    </w:lvl>
+    <w:lvl w:ilvl="8" w:tplc="04090005" w:tentative="1">
+      <w:start w:val="1"/>
+      <w:numFmt w:val="bullet"/>
+      <w:lvlText w:val=""/>
+      <w:lvlJc w:val="left"/>
+      <w:pPr>
+        <w:ind w:left="6480" w:hanging="360"/>
+      </w:pPr>
+      <w:rPr>
+        <w:rFonts w:ascii="Wingdings" w:hAnsi="Wingdings" w:hint="default"/>
+      </w:rPr>
+    </w:lvl>
+  </w:abstractNum>
+  <w:abstractNum w:abstractNumId="13" w15:restartNumberingAfterBreak="0">
     <w:nsid w:val="74D85371"/>
     <w:multiLevelType w:val="hybridMultilevel"/>
     <w:tmpl w:val="B20E36AC"/>
@@ -5600,7 +5489,7 @@
     <w:abstractNumId w:val="5"/>
   </w:num>
   <w:num w:numId="3" w16cid:durableId="780148532">
-    <w:abstractNumId w:val="12"/>
+    <w:abstractNumId w:val="13"/>
   </w:num>
   <w:num w:numId="4" w16cid:durableId="304706915">
     <w:abstractNumId w:val="6"/>
@@ -5631,6 +5520,9 @@
   </w:num>
   <w:num w:numId="13" w16cid:durableId="627049321">
     <w:abstractNumId w:val="9"/>
+  </w:num>
+  <w:num w:numId="14" w16cid:durableId="234357511">
+    <w:abstractNumId w:val="12"/>
   </w:num>
   <w:numIdMacAtCleanup w:val="13"/>
 </w:numbering>
@@ -6258,6 +6150,7 @@
   <w:style w:type="character" w:default="1" w:styleId="DefaultParagraphFont">
     <w:name w:val="Default Paragraph Font"/>
     <w:uiPriority w:val="1"/>
+    <w:semiHidden/>
     <w:unhideWhenUsed/>
   </w:style>
   <w:style w:type="table" w:default="1" w:styleId="TableNormal">

</xml_diff>

<commit_message>
Update firmware update instructions in documentation for clarity and add details on factory firmware file usage.
</commit_message>
<xml_diff>
--- a/RadioFox.docx
+++ b/RadioFox.docx
@@ -266,7 +266,15 @@
         <w:t xml:space="preserve">The </w:t>
       </w:r>
       <w:r>
-        <w:t>device is charged using the USB-C connector. There is a flaw on the PCB that requires</w:t>
+        <w:t xml:space="preserve">device is charged using the USB-C connector. There is a flaw </w:t>
+      </w:r>
+      <w:proofErr w:type="gramStart"/>
+      <w:r>
+        <w:t>on</w:t>
+      </w:r>
+      <w:proofErr w:type="gramEnd"/>
+      <w:r>
+        <w:t xml:space="preserve"> the PCB that requires</w:t>
       </w:r>
       <w:r>
         <w:t xml:space="preserve"> a USB-A to USB-C cable. This </w:t>
@@ -346,11 +354,33 @@
         <w:t xml:space="preserve">he source code can be found at </w:t>
       </w:r>
       <w:hyperlink r:id="rId9" w:history="1">
+        <w:proofErr w:type="spellStart"/>
         <w:r>
           <w:rPr>
             <w:rStyle w:val="Hyperlink"/>
           </w:rPr>
-          <w:t>MartinNohr/RadioFox: Ham Radio Fox Software</w:t>
+          <w:t>MartinNohr</w:t>
+        </w:r>
+        <w:proofErr w:type="spellEnd"/>
+        <w:r>
+          <w:rPr>
+            <w:rStyle w:val="Hyperlink"/>
+          </w:rPr>
+          <w:t>/</w:t>
+        </w:r>
+        <w:proofErr w:type="spellStart"/>
+        <w:r>
+          <w:rPr>
+            <w:rStyle w:val="Hyperlink"/>
+          </w:rPr>
+          <w:t>RadioFox</w:t>
+        </w:r>
+        <w:proofErr w:type="spellEnd"/>
+        <w:r>
+          <w:rPr>
+            <w:rStyle w:val="Hyperlink"/>
+          </w:rPr>
+          <w:t>: Ham Radio Fox Software</w:t>
         </w:r>
       </w:hyperlink>
     </w:p>
@@ -434,7 +464,15 @@
         <w:t xml:space="preserve"> The factory bin file is required since the partition table has been changed.</w:t>
       </w:r>
       <w:r>
-        <w:t xml:space="preserve"> You can also send the esp32 back to me and I will program it for free.</w:t>
+        <w:t xml:space="preserve"> You can also send </w:t>
+      </w:r>
+      <w:proofErr w:type="gramStart"/>
+      <w:r>
+        <w:t>the esp32</w:t>
+      </w:r>
+      <w:proofErr w:type="gramEnd"/>
+      <w:r>
+        <w:t xml:space="preserve"> back to me and I will program it for free.</w:t>
       </w:r>
     </w:p>
     <w:p>
@@ -451,7 +489,15 @@
         </w:numPr>
       </w:pPr>
       <w:r>
-        <w:t>Added ability to play WAV and MP3 files. Removed the immediate txstop option as it could leave the audio player in an untidy state.</w:t>
+        <w:t xml:space="preserve">Added ability to play WAV and MP3 files. Removed the immediate </w:t>
+      </w:r>
+      <w:proofErr w:type="spellStart"/>
+      <w:r>
+        <w:t>txstop</w:t>
+      </w:r>
+      <w:proofErr w:type="spellEnd"/>
+      <w:r>
+        <w:t xml:space="preserve"> option as it could leave the audio player in an untidy state.</w:t>
       </w:r>
       <w:r>
         <w:t xml:space="preserve"> Updated </w:t>
@@ -475,7 +521,15 @@
         </w:numPr>
       </w:pPr>
       <w:r>
-        <w:t>Ported the code to espressif core 3.x instead of requiring 2.0.17.</w:t>
+        <w:t xml:space="preserve">Ported the code to </w:t>
+      </w:r>
+      <w:proofErr w:type="spellStart"/>
+      <w:r>
+        <w:t>espressif</w:t>
+      </w:r>
+      <w:proofErr w:type="spellEnd"/>
+      <w:r>
+        <w:t xml:space="preserve"> core 3.x instead of requiring 2.0.17.</w:t>
       </w:r>
     </w:p>
     <w:p>
@@ -608,7 +662,35 @@
         <w:rPr>
           <w:lang w:val="en-US"/>
         </w:rPr>
-        <w:t>Show the active run time on the main display in hours, minutes, and seconds. This time is reset on boot, and just keeps track of the time used for sending and pausing.</w:t>
+        <w:t xml:space="preserve">Show the active </w:t>
+      </w:r>
+      <w:proofErr w:type="gramStart"/>
+      <w:r>
+        <w:rPr>
+          <w:lang w:val="en-US"/>
+        </w:rPr>
+        <w:t>run</w:t>
+      </w:r>
+      <w:proofErr w:type="gramEnd"/>
+      <w:r>
+        <w:rPr>
+          <w:lang w:val="en-US"/>
+        </w:rPr>
+        <w:t xml:space="preserve"> time on the main display in hours, minutes, and seconds. This time is reset on </w:t>
+      </w:r>
+      <w:proofErr w:type="gramStart"/>
+      <w:r>
+        <w:rPr>
+          <w:lang w:val="en-US"/>
+        </w:rPr>
+        <w:t>boot, and</w:t>
+      </w:r>
+      <w:proofErr w:type="gramEnd"/>
+      <w:r>
+        <w:rPr>
+          <w:lang w:val="en-US"/>
+        </w:rPr>
+        <w:t xml:space="preserve"> just keeps track of the time used for sending and pausing.</w:t>
       </w:r>
     </w:p>
     <w:p>
@@ -648,8 +730,16 @@
         <w:rPr>
           <w:lang w:val="en-US"/>
         </w:rPr>
-        <w:t>Added a switch to limit the frequency range to that allowed for beacon use in ITU region 2. The range is 144.276-144.300 MHz.</w:t>
-      </w:r>
+        <w:t xml:space="preserve">Added a switch to limit the frequency range to that allowed for beacon use in ITU region 2. The range is 144.276-144.300 </w:t>
+      </w:r>
+      <w:proofErr w:type="spellStart"/>
+      <w:r>
+        <w:rPr>
+          <w:lang w:val="en-US"/>
+        </w:rPr>
+        <w:t>MHz.</w:t>
+      </w:r>
+      <w:proofErr w:type="spellEnd"/>
     </w:p>
     <w:p>
       <w:r>
@@ -685,7 +775,15 @@
         </w:numPr>
       </w:pPr>
       <w:r>
-        <w:t>Fixed crash when no SD card found.</w:t>
+        <w:t xml:space="preserve">Fixed crash when no SD card </w:t>
+      </w:r>
+      <w:proofErr w:type="gramStart"/>
+      <w:r>
+        <w:t>found</w:t>
+      </w:r>
+      <w:proofErr w:type="gramEnd"/>
+      <w:r>
+        <w:t>.</w:t>
       </w:r>
     </w:p>
     <w:p>
@@ -777,7 +875,21 @@
         <w:rPr>
           <w:lang w:val="en-US"/>
         </w:rPr>
-        <w:t>This is initial version when this document was first created. The software is considered mostly complete.</w:t>
+        <w:t xml:space="preserve">This is initial </w:t>
+      </w:r>
+      <w:proofErr w:type="gramStart"/>
+      <w:r>
+        <w:rPr>
+          <w:lang w:val="en-US"/>
+        </w:rPr>
+        <w:t>version</w:t>
+      </w:r>
+      <w:proofErr w:type="gramEnd"/>
+      <w:r>
+        <w:rPr>
+          <w:lang w:val="en-US"/>
+        </w:rPr>
+        <w:t xml:space="preserve"> when this document was first created. The software is considered mostly complete.</w:t>
       </w:r>
     </w:p>
     <w:p>
@@ -815,7 +927,21 @@
         <w:rPr>
           <w:lang w:val="en-US"/>
         </w:rPr>
-        <w:t>The Fox is a single PCB that includes an 18650 battery holder that can have 1 or 2 batteries.</w:t>
+        <w:t xml:space="preserve">The Fox is a single PCB that includes an </w:t>
+      </w:r>
+      <w:proofErr w:type="gramStart"/>
+      <w:r>
+        <w:rPr>
+          <w:lang w:val="en-US"/>
+        </w:rPr>
+        <w:t>18650 battery</w:t>
+      </w:r>
+      <w:proofErr w:type="gramEnd"/>
+      <w:r>
+        <w:rPr>
+          <w:lang w:val="en-US"/>
+        </w:rPr>
+        <w:t xml:space="preserve"> holder that can have 1 or 2 batteries.</w:t>
       </w:r>
       <w:r>
         <w:rPr>
@@ -827,13 +953,41 @@
         <w:rPr>
           <w:lang w:val="en-US"/>
         </w:rPr>
-        <w:t>e button top batteries are used. The flat top batteries will not work. Also note that the size standard</w:t>
-      </w:r>
-      <w:r>
-        <w:rPr>
-          <w:lang w:val="en-US"/>
-        </w:rPr>
-        <w:t xml:space="preserve"> is not always followed and some batteries will not fit. If that is the case try a different pair. </w:t>
+        <w:t xml:space="preserve">e button top batteries are used. The </w:t>
+      </w:r>
+      <w:proofErr w:type="gramStart"/>
+      <w:r>
+        <w:rPr>
+          <w:lang w:val="en-US"/>
+        </w:rPr>
+        <w:t>flat top</w:t>
+      </w:r>
+      <w:proofErr w:type="gramEnd"/>
+      <w:r>
+        <w:rPr>
+          <w:lang w:val="en-US"/>
+        </w:rPr>
+        <w:t xml:space="preserve"> batteries will not work. Also note that the size standard</w:t>
+      </w:r>
+      <w:r>
+        <w:rPr>
+          <w:lang w:val="en-US"/>
+        </w:rPr>
+        <w:t xml:space="preserve"> is not always followed and some batteries will not fit. If that is the </w:t>
+      </w:r>
+      <w:proofErr w:type="gramStart"/>
+      <w:r>
+        <w:rPr>
+          <w:lang w:val="en-US"/>
+        </w:rPr>
+        <w:t>case</w:t>
+      </w:r>
+      <w:proofErr w:type="gramEnd"/>
+      <w:r>
+        <w:rPr>
+          <w:lang w:val="en-US"/>
+        </w:rPr>
+        <w:t xml:space="preserve"> try a different pair. </w:t>
       </w:r>
       <w:r>
         <w:rPr>
@@ -858,7 +1012,21 @@
           <w:rPr>
             <w:rStyle w:val="Hyperlink"/>
           </w:rPr>
-          <w:t>Protected 3400mAh 10A 18650 Button Top Battery - Wholesale Discount – Liion Wholesale Batteries</w:t>
+          <w:t xml:space="preserve">Protected 3400mAh 10A 18650 Button Top Battery - Wholesale Discount – </w:t>
+        </w:r>
+        <w:proofErr w:type="spellStart"/>
+        <w:r>
+          <w:rPr>
+            <w:rStyle w:val="Hyperlink"/>
+          </w:rPr>
+          <w:t>Liion</w:t>
+        </w:r>
+        <w:proofErr w:type="spellEnd"/>
+        <w:r>
+          <w:rPr>
+            <w:rStyle w:val="Hyperlink"/>
+          </w:rPr>
+          <w:t xml:space="preserve"> Wholesale Batteries</w:t>
         </w:r>
       </w:hyperlink>
       <w:r>
@@ -904,6 +1072,7 @@
         </w:rPr>
         <w:t xml:space="preserve">The radio functions are handled by the SA818-V on the top right. There are vents in the case to allow cooling as this module can become quite hot when transmitting at high power for longer timer intervals. Transmitting longer than one minute is not recommended. High power is about </w:t>
       </w:r>
+      <w:proofErr w:type="gramStart"/>
       <w:r>
         <w:rPr>
           <w:lang w:val="en-US"/>
@@ -914,7 +1083,14 @@
         <w:rPr>
           <w:lang w:val="en-US"/>
         </w:rPr>
-        <w:t xml:space="preserve">W and low power is about </w:t>
+        <w:t>W</w:t>
+      </w:r>
+      <w:proofErr w:type="gramEnd"/>
+      <w:r>
+        <w:rPr>
+          <w:lang w:val="en-US"/>
+        </w:rPr>
+        <w:t xml:space="preserve"> and low power is about </w:t>
       </w:r>
       <w:r>
         <w:rPr>
@@ -966,7 +1142,21 @@
         <w:rPr>
           <w:lang w:val="en-US"/>
         </w:rPr>
-        <w:t xml:space="preserve">button top style and protection is recommended. The 18650 battery length is a very loose </w:t>
+        <w:t xml:space="preserve">button top style and protection is recommended. The </w:t>
+      </w:r>
+      <w:proofErr w:type="gramStart"/>
+      <w:r>
+        <w:rPr>
+          <w:lang w:val="en-US"/>
+        </w:rPr>
+        <w:t>18650 battery</w:t>
+      </w:r>
+      <w:proofErr w:type="gramEnd"/>
+      <w:r>
+        <w:rPr>
+          <w:lang w:val="en-US"/>
+        </w:rPr>
+        <w:t xml:space="preserve"> length is a very loose </w:t>
       </w:r>
       <w:r>
         <w:rPr>
@@ -994,7 +1184,35 @@
         <w:rPr>
           <w:lang w:val="en-US"/>
         </w:rPr>
-        <w:t>The actual runtime depends on the transmitting time and quality of the batteries. There are many deceptively labelled 18650 batteries available. The best one are made by Panasonic and Sanyo. Using 1 minute transmit, 4 minutes pause, low power setting, and display dimming the Fox Radio ran for 12 hours using Panasonic batteries.</w:t>
+        <w:t xml:space="preserve">The actual runtime depends on the transmitting time and quality of the batteries. There are many deceptively labelled 18650 batteries available. The best </w:t>
+      </w:r>
+      <w:proofErr w:type="gramStart"/>
+      <w:r>
+        <w:rPr>
+          <w:lang w:val="en-US"/>
+        </w:rPr>
+        <w:t>one</w:t>
+      </w:r>
+      <w:proofErr w:type="gramEnd"/>
+      <w:r>
+        <w:rPr>
+          <w:lang w:val="en-US"/>
+        </w:rPr>
+        <w:t xml:space="preserve"> </w:t>
+      </w:r>
+      <w:proofErr w:type="gramStart"/>
+      <w:r>
+        <w:rPr>
+          <w:lang w:val="en-US"/>
+        </w:rPr>
+        <w:t>are</w:t>
+      </w:r>
+      <w:proofErr w:type="gramEnd"/>
+      <w:r>
+        <w:rPr>
+          <w:lang w:val="en-US"/>
+        </w:rPr>
+        <w:t xml:space="preserve"> made by Panasonic and Sanyo. Using 1 minute transmit, 4 minutes pause, low power setting, and display dimming the Fox Radio ran for 12 hours using Panasonic batteries.</w:t>
       </w:r>
     </w:p>
     <w:p>
@@ -1023,12 +1241,37 @@
         <w:t xml:space="preserve">The files are saved as .TXT and simply contain a list of tones to be played. The format is similar the hard coded files from here: </w:t>
       </w:r>
       <w:hyperlink r:id="rId11">
+        <w:proofErr w:type="spellStart"/>
         <w:r>
           <w:rPr>
             <w:rStyle w:val="Hyperlink"/>
             <w:lang w:val="en-US"/>
           </w:rPr>
-          <w:t>robsoncouto/arduino-songs (github.com)</w:t>
+          <w:t>robsoncouto</w:t>
+        </w:r>
+        <w:proofErr w:type="spellEnd"/>
+        <w:r>
+          <w:rPr>
+            <w:rStyle w:val="Hyperlink"/>
+            <w:lang w:val="en-US"/>
+          </w:rPr>
+          <w:t>/</w:t>
+        </w:r>
+        <w:proofErr w:type="spellStart"/>
+        <w:r>
+          <w:rPr>
+            <w:rStyle w:val="Hyperlink"/>
+            <w:lang w:val="en-US"/>
+          </w:rPr>
+          <w:t>arduino</w:t>
+        </w:r>
+        <w:proofErr w:type="spellEnd"/>
+        <w:r>
+          <w:rPr>
+            <w:rStyle w:val="Hyperlink"/>
+            <w:lang w:val="en-US"/>
+          </w:rPr>
+          <w:t>-songs (github.com)</w:t>
         </w:r>
       </w:hyperlink>
     </w:p>
@@ -1095,12 +1338,21 @@
           <w:bCs/>
         </w:rPr>
       </w:pPr>
-      <w:r>
-        <w:rPr>
-          <w:b/>
-          <w:bCs/>
-        </w:rPr>
-        <w:t>there are two values per note (pitch and duration)</w:t>
+      <w:proofErr w:type="gramStart"/>
+      <w:r>
+        <w:rPr>
+          <w:b/>
+          <w:bCs/>
+        </w:rPr>
+        <w:t>there</w:t>
+      </w:r>
+      <w:proofErr w:type="gramEnd"/>
+      <w:r>
+        <w:rPr>
+          <w:b/>
+          <w:bCs/>
+        </w:rPr>
+        <w:t xml:space="preserve"> are two values per note (pitch and duration)</w:t>
       </w:r>
     </w:p>
     <w:p>
@@ -1147,7 +1399,25 @@
           <w:bCs/>
           <w:lang w:val="en-US"/>
         </w:rPr>
-        <w:t>LENGTH, %val can be used to set the length of the note, it defaults to 90% and 10% quiet after the note</w:t>
+        <w:t>LENGTH, %</w:t>
+      </w:r>
+      <w:proofErr w:type="spellStart"/>
+      <w:r>
+        <w:rPr>
+          <w:b/>
+          <w:bCs/>
+          <w:lang w:val="en-US"/>
+        </w:rPr>
+        <w:t>val</w:t>
+      </w:r>
+      <w:proofErr w:type="spellEnd"/>
+      <w:r>
+        <w:rPr>
+          <w:b/>
+          <w:bCs/>
+          <w:lang w:val="en-US"/>
+        </w:rPr>
+        <w:t xml:space="preserve"> can be used to set the length of the note, it defaults to 90% and 10% quiet after the note</w:t>
       </w:r>
     </w:p>
     <w:p>
@@ -1224,126 +1494,648 @@
           <w:bCs/>
           <w:lang w:val="en-US"/>
         </w:rPr>
-        <w:t>NOTE_E5, 4,  NOTE_B4, 8,  NOTE_C5, 8,  NOTE_D5, 4,  NOTE_C5, 8,  NOTE_B4, 8,</w:t>
-      </w:r>
-    </w:p>
-    <w:p>
-      <w:pPr>
-        <w:rPr>
-          <w:b/>
-          <w:bCs/>
-          <w:lang w:val="en-US"/>
-        </w:rPr>
-      </w:pPr>
-      <w:r>
-        <w:rPr>
-          <w:b/>
-          <w:bCs/>
-          <w:lang w:val="en-US"/>
-        </w:rPr>
-        <w:t>NOTE_A4, 4,  NOTE_A4, 8,  NOTE_C5, 8,  NOTE_E5, 4,  NOTE_D5, 8,  NOTE_C5, 8,</w:t>
-      </w:r>
-    </w:p>
-    <w:p>
-      <w:pPr>
-        <w:rPr>
-          <w:b/>
-          <w:bCs/>
-          <w:lang w:val="en-US"/>
-        </w:rPr>
-      </w:pPr>
-      <w:r>
-        <w:rPr>
-          <w:b/>
-          <w:bCs/>
-          <w:lang w:val="en-US"/>
-        </w:rPr>
-        <w:t>NOTE_B4, -4, NOTE_C5, 8,  NOTE_D5, 4,  NOTE_E5, 4,</w:t>
-      </w:r>
-    </w:p>
-    <w:p>
-      <w:pPr>
-        <w:rPr>
-          <w:b/>
-          <w:bCs/>
-          <w:lang w:val="en-US"/>
-        </w:rPr>
-      </w:pPr>
-      <w:r>
-        <w:rPr>
-          <w:b/>
-          <w:bCs/>
-          <w:lang w:val="en-US"/>
-        </w:rPr>
-        <w:t>NOTE_C5, 4,  NOTE_A4, 4,  NOTE_A4, 8,  NOTE_A4, 4,  NOTE_B4, 8,  NOTE_C5, 8,</w:t>
-      </w:r>
-    </w:p>
-    <w:p>
-      <w:pPr>
-        <w:rPr>
-          <w:b/>
-          <w:bCs/>
-          <w:lang w:val="en-US"/>
-        </w:rPr>
-      </w:pPr>
-      <w:r>
-        <w:rPr>
-          <w:b/>
-          <w:bCs/>
-          <w:lang w:val="en-US"/>
-        </w:rPr>
-        <w:t>NOTE_D5, -4, NOTE_F5, 8,  NOTE_A5, 4,  NOTE_G5, 8,  NOTE_F5, 8,</w:t>
-      </w:r>
-    </w:p>
-    <w:p>
-      <w:pPr>
-        <w:rPr>
-          <w:b/>
-          <w:bCs/>
-          <w:lang w:val="en-US"/>
-        </w:rPr>
-      </w:pPr>
-      <w:r>
-        <w:rPr>
-          <w:b/>
-          <w:bCs/>
-          <w:lang w:val="en-US"/>
-        </w:rPr>
-        <w:t>NOTE_E5, -4, NOTE_C5, 8,  NOTE_E5, 4,  NOTE_D5, 8,  NOTE_C5, 8,</w:t>
-      </w:r>
-    </w:p>
-    <w:p>
-      <w:pPr>
-        <w:rPr>
-          <w:b/>
-          <w:bCs/>
-          <w:lang w:val="en-US"/>
-        </w:rPr>
-      </w:pPr>
-      <w:r>
-        <w:rPr>
-          <w:b/>
-          <w:bCs/>
-          <w:lang w:val="en-US"/>
-        </w:rPr>
-        <w:t>NOTE_B4, 4,  NOTE_B4, 8,  NOTE_C5, 8,  NOTE_D5, 4,  NOTE_E5, 4,</w:t>
-      </w:r>
-    </w:p>
-    <w:p>
-      <w:pPr>
-        <w:rPr>
-          <w:b/>
-          <w:bCs/>
-          <w:lang w:val="en-US"/>
-        </w:rPr>
-      </w:pPr>
-      <w:r>
-        <w:rPr>
-          <w:b/>
-          <w:bCs/>
-          <w:lang w:val="en-US"/>
-        </w:rPr>
-        <w:t>NOTE_C5, 4,  NOTE_A4, 4,  NOTE_A4, 4, REST, 4,</w:t>
+        <w:t xml:space="preserve">NOTE_E5, </w:t>
+      </w:r>
+      <w:proofErr w:type="gramStart"/>
+      <w:r>
+        <w:rPr>
+          <w:b/>
+          <w:bCs/>
+          <w:lang w:val="en-US"/>
+        </w:rPr>
+        <w:t>4,  NOTE</w:t>
+      </w:r>
+      <w:proofErr w:type="gramEnd"/>
+      <w:r>
+        <w:rPr>
+          <w:b/>
+          <w:bCs/>
+          <w:lang w:val="en-US"/>
+        </w:rPr>
+        <w:t xml:space="preserve">_B4, </w:t>
+      </w:r>
+      <w:proofErr w:type="gramStart"/>
+      <w:r>
+        <w:rPr>
+          <w:b/>
+          <w:bCs/>
+          <w:lang w:val="en-US"/>
+        </w:rPr>
+        <w:t>8,  NOTE</w:t>
+      </w:r>
+      <w:proofErr w:type="gramEnd"/>
+      <w:r>
+        <w:rPr>
+          <w:b/>
+          <w:bCs/>
+          <w:lang w:val="en-US"/>
+        </w:rPr>
+        <w:t xml:space="preserve">_C5, </w:t>
+      </w:r>
+      <w:proofErr w:type="gramStart"/>
+      <w:r>
+        <w:rPr>
+          <w:b/>
+          <w:bCs/>
+          <w:lang w:val="en-US"/>
+        </w:rPr>
+        <w:t>8,  NOTE</w:t>
+      </w:r>
+      <w:proofErr w:type="gramEnd"/>
+      <w:r>
+        <w:rPr>
+          <w:b/>
+          <w:bCs/>
+          <w:lang w:val="en-US"/>
+        </w:rPr>
+        <w:t xml:space="preserve">_D5, </w:t>
+      </w:r>
+      <w:proofErr w:type="gramStart"/>
+      <w:r>
+        <w:rPr>
+          <w:b/>
+          <w:bCs/>
+          <w:lang w:val="en-US"/>
+        </w:rPr>
+        <w:t>4,  NOTE</w:t>
+      </w:r>
+      <w:proofErr w:type="gramEnd"/>
+      <w:r>
+        <w:rPr>
+          <w:b/>
+          <w:bCs/>
+          <w:lang w:val="en-US"/>
+        </w:rPr>
+        <w:t xml:space="preserve">_C5, </w:t>
+      </w:r>
+      <w:proofErr w:type="gramStart"/>
+      <w:r>
+        <w:rPr>
+          <w:b/>
+          <w:bCs/>
+          <w:lang w:val="en-US"/>
+        </w:rPr>
+        <w:t>8,  NOTE</w:t>
+      </w:r>
+      <w:proofErr w:type="gramEnd"/>
+      <w:r>
+        <w:rPr>
+          <w:b/>
+          <w:bCs/>
+          <w:lang w:val="en-US"/>
+        </w:rPr>
+        <w:t>_B4, 8,</w:t>
+      </w:r>
+    </w:p>
+    <w:p>
+      <w:pPr>
+        <w:rPr>
+          <w:b/>
+          <w:bCs/>
+          <w:lang w:val="en-US"/>
+        </w:rPr>
+      </w:pPr>
+      <w:r>
+        <w:rPr>
+          <w:b/>
+          <w:bCs/>
+          <w:lang w:val="en-US"/>
+        </w:rPr>
+        <w:t xml:space="preserve">NOTE_A4, </w:t>
+      </w:r>
+      <w:proofErr w:type="gramStart"/>
+      <w:r>
+        <w:rPr>
+          <w:b/>
+          <w:bCs/>
+          <w:lang w:val="en-US"/>
+        </w:rPr>
+        <w:t>4,  NOTE</w:t>
+      </w:r>
+      <w:proofErr w:type="gramEnd"/>
+      <w:r>
+        <w:rPr>
+          <w:b/>
+          <w:bCs/>
+          <w:lang w:val="en-US"/>
+        </w:rPr>
+        <w:t xml:space="preserve">_A4, </w:t>
+      </w:r>
+      <w:proofErr w:type="gramStart"/>
+      <w:r>
+        <w:rPr>
+          <w:b/>
+          <w:bCs/>
+          <w:lang w:val="en-US"/>
+        </w:rPr>
+        <w:t>8,  NOTE</w:t>
+      </w:r>
+      <w:proofErr w:type="gramEnd"/>
+      <w:r>
+        <w:rPr>
+          <w:b/>
+          <w:bCs/>
+          <w:lang w:val="en-US"/>
+        </w:rPr>
+        <w:t xml:space="preserve">_C5, </w:t>
+      </w:r>
+      <w:proofErr w:type="gramStart"/>
+      <w:r>
+        <w:rPr>
+          <w:b/>
+          <w:bCs/>
+          <w:lang w:val="en-US"/>
+        </w:rPr>
+        <w:t>8,  NOTE</w:t>
+      </w:r>
+      <w:proofErr w:type="gramEnd"/>
+      <w:r>
+        <w:rPr>
+          <w:b/>
+          <w:bCs/>
+          <w:lang w:val="en-US"/>
+        </w:rPr>
+        <w:t xml:space="preserve">_E5, </w:t>
+      </w:r>
+      <w:proofErr w:type="gramStart"/>
+      <w:r>
+        <w:rPr>
+          <w:b/>
+          <w:bCs/>
+          <w:lang w:val="en-US"/>
+        </w:rPr>
+        <w:t>4,  NOTE</w:t>
+      </w:r>
+      <w:proofErr w:type="gramEnd"/>
+      <w:r>
+        <w:rPr>
+          <w:b/>
+          <w:bCs/>
+          <w:lang w:val="en-US"/>
+        </w:rPr>
+        <w:t xml:space="preserve">_D5, </w:t>
+      </w:r>
+      <w:proofErr w:type="gramStart"/>
+      <w:r>
+        <w:rPr>
+          <w:b/>
+          <w:bCs/>
+          <w:lang w:val="en-US"/>
+        </w:rPr>
+        <w:t>8,  NOTE</w:t>
+      </w:r>
+      <w:proofErr w:type="gramEnd"/>
+      <w:r>
+        <w:rPr>
+          <w:b/>
+          <w:bCs/>
+          <w:lang w:val="en-US"/>
+        </w:rPr>
+        <w:t>_C5, 8,</w:t>
+      </w:r>
+    </w:p>
+    <w:p>
+      <w:pPr>
+        <w:rPr>
+          <w:b/>
+          <w:bCs/>
+          <w:lang w:val="en-US"/>
+        </w:rPr>
+      </w:pPr>
+      <w:r>
+        <w:rPr>
+          <w:b/>
+          <w:bCs/>
+          <w:lang w:val="en-US"/>
+        </w:rPr>
+        <w:t xml:space="preserve">NOTE_B4, -4, NOTE_C5, </w:t>
+      </w:r>
+      <w:proofErr w:type="gramStart"/>
+      <w:r>
+        <w:rPr>
+          <w:b/>
+          <w:bCs/>
+          <w:lang w:val="en-US"/>
+        </w:rPr>
+        <w:t>8,  NOTE</w:t>
+      </w:r>
+      <w:proofErr w:type="gramEnd"/>
+      <w:r>
+        <w:rPr>
+          <w:b/>
+          <w:bCs/>
+          <w:lang w:val="en-US"/>
+        </w:rPr>
+        <w:t xml:space="preserve">_D5, </w:t>
+      </w:r>
+      <w:proofErr w:type="gramStart"/>
+      <w:r>
+        <w:rPr>
+          <w:b/>
+          <w:bCs/>
+          <w:lang w:val="en-US"/>
+        </w:rPr>
+        <w:t>4,  NOTE</w:t>
+      </w:r>
+      <w:proofErr w:type="gramEnd"/>
+      <w:r>
+        <w:rPr>
+          <w:b/>
+          <w:bCs/>
+          <w:lang w:val="en-US"/>
+        </w:rPr>
+        <w:t>_E5, 4,</w:t>
+      </w:r>
+    </w:p>
+    <w:p>
+      <w:pPr>
+        <w:rPr>
+          <w:b/>
+          <w:bCs/>
+          <w:lang w:val="en-US"/>
+        </w:rPr>
+      </w:pPr>
+      <w:r>
+        <w:rPr>
+          <w:b/>
+          <w:bCs/>
+          <w:lang w:val="en-US"/>
+        </w:rPr>
+        <w:t xml:space="preserve">NOTE_C5, </w:t>
+      </w:r>
+      <w:proofErr w:type="gramStart"/>
+      <w:r>
+        <w:rPr>
+          <w:b/>
+          <w:bCs/>
+          <w:lang w:val="en-US"/>
+        </w:rPr>
+        <w:t>4,  NOTE</w:t>
+      </w:r>
+      <w:proofErr w:type="gramEnd"/>
+      <w:r>
+        <w:rPr>
+          <w:b/>
+          <w:bCs/>
+          <w:lang w:val="en-US"/>
+        </w:rPr>
+        <w:t xml:space="preserve">_A4, </w:t>
+      </w:r>
+      <w:proofErr w:type="gramStart"/>
+      <w:r>
+        <w:rPr>
+          <w:b/>
+          <w:bCs/>
+          <w:lang w:val="en-US"/>
+        </w:rPr>
+        <w:t>4,  NOTE</w:t>
+      </w:r>
+      <w:proofErr w:type="gramEnd"/>
+      <w:r>
+        <w:rPr>
+          <w:b/>
+          <w:bCs/>
+          <w:lang w:val="en-US"/>
+        </w:rPr>
+        <w:t xml:space="preserve">_A4, </w:t>
+      </w:r>
+      <w:proofErr w:type="gramStart"/>
+      <w:r>
+        <w:rPr>
+          <w:b/>
+          <w:bCs/>
+          <w:lang w:val="en-US"/>
+        </w:rPr>
+        <w:t>8,  NOTE</w:t>
+      </w:r>
+      <w:proofErr w:type="gramEnd"/>
+      <w:r>
+        <w:rPr>
+          <w:b/>
+          <w:bCs/>
+          <w:lang w:val="en-US"/>
+        </w:rPr>
+        <w:t xml:space="preserve">_A4, </w:t>
+      </w:r>
+      <w:proofErr w:type="gramStart"/>
+      <w:r>
+        <w:rPr>
+          <w:b/>
+          <w:bCs/>
+          <w:lang w:val="en-US"/>
+        </w:rPr>
+        <w:t>4,  NOTE</w:t>
+      </w:r>
+      <w:proofErr w:type="gramEnd"/>
+      <w:r>
+        <w:rPr>
+          <w:b/>
+          <w:bCs/>
+          <w:lang w:val="en-US"/>
+        </w:rPr>
+        <w:t xml:space="preserve">_B4, </w:t>
+      </w:r>
+      <w:proofErr w:type="gramStart"/>
+      <w:r>
+        <w:rPr>
+          <w:b/>
+          <w:bCs/>
+          <w:lang w:val="en-US"/>
+        </w:rPr>
+        <w:t>8,  NOTE</w:t>
+      </w:r>
+      <w:proofErr w:type="gramEnd"/>
+      <w:r>
+        <w:rPr>
+          <w:b/>
+          <w:bCs/>
+          <w:lang w:val="en-US"/>
+        </w:rPr>
+        <w:t>_C5, 8,</w:t>
+      </w:r>
+    </w:p>
+    <w:p>
+      <w:pPr>
+        <w:rPr>
+          <w:b/>
+          <w:bCs/>
+          <w:lang w:val="en-US"/>
+        </w:rPr>
+      </w:pPr>
+      <w:r>
+        <w:rPr>
+          <w:b/>
+          <w:bCs/>
+          <w:lang w:val="en-US"/>
+        </w:rPr>
+        <w:t xml:space="preserve">NOTE_D5, -4, NOTE_F5, </w:t>
+      </w:r>
+      <w:proofErr w:type="gramStart"/>
+      <w:r>
+        <w:rPr>
+          <w:b/>
+          <w:bCs/>
+          <w:lang w:val="en-US"/>
+        </w:rPr>
+        <w:t>8,  NOTE</w:t>
+      </w:r>
+      <w:proofErr w:type="gramEnd"/>
+      <w:r>
+        <w:rPr>
+          <w:b/>
+          <w:bCs/>
+          <w:lang w:val="en-US"/>
+        </w:rPr>
+        <w:t xml:space="preserve">_A5, </w:t>
+      </w:r>
+      <w:proofErr w:type="gramStart"/>
+      <w:r>
+        <w:rPr>
+          <w:b/>
+          <w:bCs/>
+          <w:lang w:val="en-US"/>
+        </w:rPr>
+        <w:t>4,  NOTE</w:t>
+      </w:r>
+      <w:proofErr w:type="gramEnd"/>
+      <w:r>
+        <w:rPr>
+          <w:b/>
+          <w:bCs/>
+          <w:lang w:val="en-US"/>
+        </w:rPr>
+        <w:t xml:space="preserve">_G5, </w:t>
+      </w:r>
+      <w:proofErr w:type="gramStart"/>
+      <w:r>
+        <w:rPr>
+          <w:b/>
+          <w:bCs/>
+          <w:lang w:val="en-US"/>
+        </w:rPr>
+        <w:t>8,  NOTE</w:t>
+      </w:r>
+      <w:proofErr w:type="gramEnd"/>
+      <w:r>
+        <w:rPr>
+          <w:b/>
+          <w:bCs/>
+          <w:lang w:val="en-US"/>
+        </w:rPr>
+        <w:t>_F5, 8,</w:t>
+      </w:r>
+    </w:p>
+    <w:p>
+      <w:pPr>
+        <w:rPr>
+          <w:b/>
+          <w:bCs/>
+          <w:lang w:val="en-US"/>
+        </w:rPr>
+      </w:pPr>
+      <w:r>
+        <w:rPr>
+          <w:b/>
+          <w:bCs/>
+          <w:lang w:val="en-US"/>
+        </w:rPr>
+        <w:t xml:space="preserve">NOTE_E5, -4, NOTE_C5, </w:t>
+      </w:r>
+      <w:proofErr w:type="gramStart"/>
+      <w:r>
+        <w:rPr>
+          <w:b/>
+          <w:bCs/>
+          <w:lang w:val="en-US"/>
+        </w:rPr>
+        <w:t>8,  NOTE</w:t>
+      </w:r>
+      <w:proofErr w:type="gramEnd"/>
+      <w:r>
+        <w:rPr>
+          <w:b/>
+          <w:bCs/>
+          <w:lang w:val="en-US"/>
+        </w:rPr>
+        <w:t xml:space="preserve">_E5, </w:t>
+      </w:r>
+      <w:proofErr w:type="gramStart"/>
+      <w:r>
+        <w:rPr>
+          <w:b/>
+          <w:bCs/>
+          <w:lang w:val="en-US"/>
+        </w:rPr>
+        <w:t>4,  NOTE</w:t>
+      </w:r>
+      <w:proofErr w:type="gramEnd"/>
+      <w:r>
+        <w:rPr>
+          <w:b/>
+          <w:bCs/>
+          <w:lang w:val="en-US"/>
+        </w:rPr>
+        <w:t xml:space="preserve">_D5, </w:t>
+      </w:r>
+      <w:proofErr w:type="gramStart"/>
+      <w:r>
+        <w:rPr>
+          <w:b/>
+          <w:bCs/>
+          <w:lang w:val="en-US"/>
+        </w:rPr>
+        <w:t>8,  NOTE</w:t>
+      </w:r>
+      <w:proofErr w:type="gramEnd"/>
+      <w:r>
+        <w:rPr>
+          <w:b/>
+          <w:bCs/>
+          <w:lang w:val="en-US"/>
+        </w:rPr>
+        <w:t>_C5, 8,</w:t>
+      </w:r>
+    </w:p>
+    <w:p>
+      <w:pPr>
+        <w:rPr>
+          <w:b/>
+          <w:bCs/>
+          <w:lang w:val="en-US"/>
+        </w:rPr>
+      </w:pPr>
+      <w:r>
+        <w:rPr>
+          <w:b/>
+          <w:bCs/>
+          <w:lang w:val="en-US"/>
+        </w:rPr>
+        <w:t xml:space="preserve">NOTE_B4, </w:t>
+      </w:r>
+      <w:proofErr w:type="gramStart"/>
+      <w:r>
+        <w:rPr>
+          <w:b/>
+          <w:bCs/>
+          <w:lang w:val="en-US"/>
+        </w:rPr>
+        <w:t>4,  NOTE</w:t>
+      </w:r>
+      <w:proofErr w:type="gramEnd"/>
+      <w:r>
+        <w:rPr>
+          <w:b/>
+          <w:bCs/>
+          <w:lang w:val="en-US"/>
+        </w:rPr>
+        <w:t xml:space="preserve">_B4, </w:t>
+      </w:r>
+      <w:proofErr w:type="gramStart"/>
+      <w:r>
+        <w:rPr>
+          <w:b/>
+          <w:bCs/>
+          <w:lang w:val="en-US"/>
+        </w:rPr>
+        <w:t>8,  NOTE</w:t>
+      </w:r>
+      <w:proofErr w:type="gramEnd"/>
+      <w:r>
+        <w:rPr>
+          <w:b/>
+          <w:bCs/>
+          <w:lang w:val="en-US"/>
+        </w:rPr>
+        <w:t xml:space="preserve">_C5, </w:t>
+      </w:r>
+      <w:proofErr w:type="gramStart"/>
+      <w:r>
+        <w:rPr>
+          <w:b/>
+          <w:bCs/>
+          <w:lang w:val="en-US"/>
+        </w:rPr>
+        <w:t>8,  NOTE</w:t>
+      </w:r>
+      <w:proofErr w:type="gramEnd"/>
+      <w:r>
+        <w:rPr>
+          <w:b/>
+          <w:bCs/>
+          <w:lang w:val="en-US"/>
+        </w:rPr>
+        <w:t xml:space="preserve">_D5, </w:t>
+      </w:r>
+      <w:proofErr w:type="gramStart"/>
+      <w:r>
+        <w:rPr>
+          <w:b/>
+          <w:bCs/>
+          <w:lang w:val="en-US"/>
+        </w:rPr>
+        <w:t>4,  NOTE</w:t>
+      </w:r>
+      <w:proofErr w:type="gramEnd"/>
+      <w:r>
+        <w:rPr>
+          <w:b/>
+          <w:bCs/>
+          <w:lang w:val="en-US"/>
+        </w:rPr>
+        <w:t>_E5, 4,</w:t>
+      </w:r>
+    </w:p>
+    <w:p>
+      <w:pPr>
+        <w:rPr>
+          <w:b/>
+          <w:bCs/>
+          <w:lang w:val="en-US"/>
+        </w:rPr>
+      </w:pPr>
+      <w:r>
+        <w:rPr>
+          <w:b/>
+          <w:bCs/>
+          <w:lang w:val="en-US"/>
+        </w:rPr>
+        <w:t xml:space="preserve">NOTE_C5, </w:t>
+      </w:r>
+      <w:proofErr w:type="gramStart"/>
+      <w:r>
+        <w:rPr>
+          <w:b/>
+          <w:bCs/>
+          <w:lang w:val="en-US"/>
+        </w:rPr>
+        <w:t>4,  NOTE</w:t>
+      </w:r>
+      <w:proofErr w:type="gramEnd"/>
+      <w:r>
+        <w:rPr>
+          <w:b/>
+          <w:bCs/>
+          <w:lang w:val="en-US"/>
+        </w:rPr>
+        <w:t xml:space="preserve">_A4, </w:t>
+      </w:r>
+      <w:proofErr w:type="gramStart"/>
+      <w:r>
+        <w:rPr>
+          <w:b/>
+          <w:bCs/>
+          <w:lang w:val="en-US"/>
+        </w:rPr>
+        <w:t>4,  NOTE</w:t>
+      </w:r>
+      <w:proofErr w:type="gramEnd"/>
+      <w:r>
+        <w:rPr>
+          <w:b/>
+          <w:bCs/>
+          <w:lang w:val="en-US"/>
+        </w:rPr>
+        <w:t>_A4, 4, REST, 4,</w:t>
       </w:r>
     </w:p>
     <w:p>
@@ -1379,16 +2171,101 @@
         <w:pStyle w:val="Heading1"/>
       </w:pPr>
       <w:r>
+        <w:t>Updating Firmware</w:t>
+      </w:r>
+    </w:p>
+    <w:p>
+      <w:pPr>
+        <w:rPr>
+          <w:lang w:val="en-US"/>
+        </w:rPr>
+      </w:pPr>
+      <w:r>
+        <w:rPr>
+          <w:lang w:val="en-US"/>
+        </w:rPr>
+        <w:t xml:space="preserve">The new file must be put on the SD card and named </w:t>
+      </w:r>
+      <w:proofErr w:type="spellStart"/>
+      <w:r>
+        <w:rPr>
+          <w:lang w:val="en-US"/>
+        </w:rPr>
+        <w:t>RadioFox.bin</w:t>
+      </w:r>
+      <w:proofErr w:type="spellEnd"/>
+      <w:r>
+        <w:rPr>
+          <w:lang w:val="en-US"/>
+        </w:rPr>
+        <w:t>.</w:t>
+      </w:r>
+      <w:r>
+        <w:rPr>
+          <w:lang w:val="en-US"/>
+        </w:rPr>
+        <w:t xml:space="preserve"> The file is found on the </w:t>
+      </w:r>
+      <w:proofErr w:type="spellStart"/>
+      <w:r>
+        <w:rPr>
+          <w:lang w:val="en-US"/>
+        </w:rPr>
+        <w:t>github</w:t>
+      </w:r>
+      <w:proofErr w:type="spellEnd"/>
+      <w:r>
+        <w:rPr>
+          <w:lang w:val="en-US"/>
+        </w:rPr>
+        <w:t xml:space="preserve"> site in the </w:t>
+      </w:r>
+      <w:r>
+        <w:rPr>
+          <w:lang w:val="en-US"/>
+        </w:rPr>
+        <w:t xml:space="preserve">firmware folder, it is named </w:t>
+      </w:r>
+      <w:proofErr w:type="spellStart"/>
+      <w:r>
+        <w:rPr>
+          <w:lang w:val="en-US"/>
+        </w:rPr>
+        <w:t>firmware.bin</w:t>
+      </w:r>
+      <w:proofErr w:type="spellEnd"/>
+      <w:r>
+        <w:rPr>
+          <w:lang w:val="en-US"/>
+        </w:rPr>
+        <w:t>, it must be renamed</w:t>
+      </w:r>
+      <w:r>
+        <w:rPr>
+          <w:lang w:val="en-US"/>
+        </w:rPr>
+        <w:t xml:space="preserve"> and copied to the </w:t>
+      </w:r>
+      <w:proofErr w:type="gramStart"/>
+      <w:r>
+        <w:rPr>
+          <w:lang w:val="en-US"/>
+        </w:rPr>
         <w:lastRenderedPageBreak/>
-        <w:t>Updating Firmware</w:t>
-      </w:r>
-    </w:p>
-    <w:p>
-      <w:r>
-        <w:rPr>
-          <w:lang w:val="en-US"/>
-        </w:rPr>
-        <w:t xml:space="preserve">The new file must be put on the SD card and named RadioFox.bin. The system menu has an entry </w:t>
+        <w:t>micro SD</w:t>
+      </w:r>
+      <w:proofErr w:type="gramEnd"/>
+      <w:r>
+        <w:rPr>
+          <w:lang w:val="en-US"/>
+        </w:rPr>
+        <w:t xml:space="preserve"> card.</w:t>
+      </w:r>
+      <w:r>
+        <w:rPr>
+          <w:lang w:val="en-US"/>
+        </w:rPr>
+        <w:t xml:space="preserve"> The system menu has an entry </w:t>
       </w:r>
       <w:r>
         <w:rPr>
@@ -1402,7 +2279,102 @@
         <w:rPr>
           <w:lang w:val="en-US"/>
         </w:rPr>
-        <w:t xml:space="preserve"> that will attempt to load this file. Confirmation will be required from the dial, After loading the BIN file can optionally be erased.</w:t>
+        <w:t xml:space="preserve"> that will attempt to load this file. Confirmation will be required from the dial, </w:t>
+      </w:r>
+      <w:proofErr w:type="gramStart"/>
+      <w:r>
+        <w:rPr>
+          <w:lang w:val="en-US"/>
+        </w:rPr>
+        <w:t>After</w:t>
+      </w:r>
+      <w:proofErr w:type="gramEnd"/>
+      <w:r>
+        <w:rPr>
+          <w:lang w:val="en-US"/>
+        </w:rPr>
+        <w:t xml:space="preserve"> loading the BIN file can optionally be erased.</w:t>
+      </w:r>
+    </w:p>
+    <w:p>
+      <w:pPr>
+        <w:rPr>
+          <w:lang w:val="en-US"/>
+        </w:rPr>
+      </w:pPr>
+    </w:p>
+    <w:p>
+      <w:r>
+        <w:rPr>
+          <w:lang w:val="en-US"/>
+        </w:rPr>
+        <w:t xml:space="preserve">There is another file there named </w:t>
+      </w:r>
+      <w:proofErr w:type="spellStart"/>
+      <w:r>
+        <w:rPr>
+          <w:lang w:val="en-US"/>
+        </w:rPr>
+        <w:t>firmware.factory.bin</w:t>
+      </w:r>
+      <w:proofErr w:type="spellEnd"/>
+      <w:r>
+        <w:rPr>
+          <w:lang w:val="en-US"/>
+        </w:rPr>
+        <w:t>. It contains the partition settings</w:t>
+      </w:r>
+      <w:r>
+        <w:rPr>
+          <w:lang w:val="en-US"/>
+        </w:rPr>
+        <w:t xml:space="preserve"> needed to update pre 1.15 versions, which are not bin file updateable. It will be necessary to use</w:t>
+      </w:r>
+      <w:r>
+        <w:rPr>
+          <w:lang w:val="en-US"/>
+        </w:rPr>
+        <w:t xml:space="preserve"> an esp32 flash program. I have only done this from </w:t>
+      </w:r>
+      <w:proofErr w:type="spellStart"/>
+      <w:r>
+        <w:rPr>
+          <w:lang w:val="en-US"/>
+        </w:rPr>
+        <w:t>platformio</w:t>
+      </w:r>
+      <w:proofErr w:type="spellEnd"/>
+      <w:r>
+        <w:rPr>
+          <w:lang w:val="en-US"/>
+        </w:rPr>
+        <w:t>, but there are probably other ways.</w:t>
+      </w:r>
+      <w:r>
+        <w:rPr>
+          <w:lang w:val="en-US"/>
+        </w:rPr>
+        <w:t xml:space="preserve"> Send </w:t>
+      </w:r>
+      <w:proofErr w:type="gramStart"/>
+      <w:r>
+        <w:rPr>
+          <w:lang w:val="en-US"/>
+        </w:rPr>
+        <w:t>the esp32</w:t>
+      </w:r>
+      <w:proofErr w:type="gramEnd"/>
+      <w:r>
+        <w:rPr>
+          <w:lang w:val="en-US"/>
+        </w:rPr>
+        <w:t xml:space="preserve"> to me and I will update it and send it back.</w:t>
+      </w:r>
+      <w:r>
+        <w:rPr>
+          <w:lang w:val="en-US"/>
+        </w:rPr>
+        <w:t xml:space="preserve"> Please include postage!</w:t>
       </w:r>
     </w:p>
     <w:p>
@@ -1418,7 +2390,21 @@
         <w:rPr>
           <w:lang w:val="en-US"/>
         </w:rPr>
-        <w:t>DTMF (aka touch-tones) can be sent from the transmitter to control certain operations of the radio. It works best when the tones are sent for at least a second. It is usually also necessary to wait 2 seconds after pressing the transmit button on the radio. All commands consist of a ‘*’ followed by a digit. The following commands are available.</w:t>
+        <w:t xml:space="preserve">DTMF (aka touch-tones) can be sent from the transmitter to control certain operations of the radio. It works best when the tones are sent for at least a second. It is usually also necessary to wait 2 seconds after pressing the transmit button on the radio. All commands consist of </w:t>
+      </w:r>
+      <w:proofErr w:type="gramStart"/>
+      <w:r>
+        <w:rPr>
+          <w:lang w:val="en-US"/>
+        </w:rPr>
+        <w:t>a ‘*’</w:t>
+      </w:r>
+      <w:proofErr w:type="gramEnd"/>
+      <w:r>
+        <w:rPr>
+          <w:lang w:val="en-US"/>
+        </w:rPr>
+        <w:t xml:space="preserve"> followed by a digit. The following commands are available.</w:t>
       </w:r>
     </w:p>
     <w:p/>
@@ -1427,7 +2413,21 @@
         <w:rPr>
           <w:lang w:val="en-US"/>
         </w:rPr>
-        <w:t>Please feel free to request additional commands. I’m sure there are other usual things that can be done remotely using DTMF signals. Also note that these functions have not yet been tested extensively so there may be some bugs in the code. I will fix as soon as I can after I find out what they are.</w:t>
+        <w:t xml:space="preserve">Please feel free to request additional commands. I’m sure there are other usual things that can be done remotely using DTMF signals. Also note that these functions have not yet been tested extensively so there may be some bugs in the code. I will </w:t>
+      </w:r>
+      <w:proofErr w:type="gramStart"/>
+      <w:r>
+        <w:rPr>
+          <w:lang w:val="en-US"/>
+        </w:rPr>
+        <w:t>fix</w:t>
+      </w:r>
+      <w:proofErr w:type="gramEnd"/>
+      <w:r>
+        <w:rPr>
+          <w:lang w:val="en-US"/>
+        </w:rPr>
+        <w:t xml:space="preserve"> as soon as I can after I find out what they are.</w:t>
       </w:r>
     </w:p>
     <w:p>
@@ -1518,6 +2518,7 @@
         <w:pStyle w:val="Heading1"/>
       </w:pPr>
       <w:r>
+        <w:lastRenderedPageBreak/>
         <w:t>Button Operations</w:t>
       </w:r>
     </w:p>
@@ -1526,7 +2527,15 @@
         <w:t xml:space="preserve">All operations can be controlled by the rotary push button on the </w:t>
       </w:r>
       <w:r>
-        <w:t>box and the two extra buttons to the left labelled B0 and B1</w:t>
+        <w:t xml:space="preserve">box and the two extra buttons </w:t>
+      </w:r>
+      <w:proofErr w:type="gramStart"/>
+      <w:r>
+        <w:t>to</w:t>
+      </w:r>
+      <w:proofErr w:type="gramEnd"/>
+      <w:r>
+        <w:t xml:space="preserve"> the left labelled B0 and B1</w:t>
       </w:r>
       <w:r>
         <w:t>.</w:t>
@@ -1538,11 +2547,7 @@
         <w:t>the menu system</w:t>
       </w:r>
       <w:r>
-        <w:t xml:space="preserve"> and is done by </w:t>
-      </w:r>
-      <w:r>
-        <w:lastRenderedPageBreak/>
-        <w:t xml:space="preserve">holding the button down for about a ½ second or longer. This long press time is also adjustable if a longer or shorter time is preferred. The system has two modes of operation. After booting the display shows the </w:t>
+        <w:t xml:space="preserve"> and is done by holding the button down for about a ½ second or longer. This long press time is also adjustable if a longer or shorter time is preferred. The system has two modes of operation. After booting the display shows the </w:t>
       </w:r>
       <w:r>
         <w:t xml:space="preserve">radio status and some important </w:t>
@@ -1632,12 +2637,14 @@
       <w:r>
         <w:t xml:space="preserve"> The top one is called </w:t>
       </w:r>
+      <w:proofErr w:type="gramStart"/>
       <w:r>
         <w:t>B</w:t>
       </w:r>
       <w:r>
         <w:t>0</w:t>
       </w:r>
+      <w:proofErr w:type="gramEnd"/>
       <w:r>
         <w:t xml:space="preserve"> and the bottom one is called </w:t>
       </w:r>
@@ -1728,7 +2735,21 @@
         <w:rPr>
           <w:lang w:val="da-DK"/>
         </w:rPr>
-        <w:t xml:space="preserve"> During Run Mode</w:t>
+        <w:t xml:space="preserve"> </w:t>
+      </w:r>
+      <w:proofErr w:type="spellStart"/>
+      <w:r>
+        <w:rPr>
+          <w:lang w:val="da-DK"/>
+        </w:rPr>
+        <w:t>During</w:t>
+      </w:r>
+      <w:proofErr w:type="spellEnd"/>
+      <w:r>
+        <w:rPr>
+          <w:lang w:val="da-DK"/>
+        </w:rPr>
+        <w:t xml:space="preserve"> Run Mode</w:t>
       </w:r>
     </w:p>
     <w:p>
@@ -1803,12 +2824,26 @@
         <w:rPr>
           <w:lang w:val="da-DK"/>
         </w:rPr>
-        <w:t>1 During Menu Mod</w:t>
-      </w:r>
+        <w:t xml:space="preserve">1 </w:t>
+      </w:r>
+      <w:proofErr w:type="spellStart"/>
       <w:r>
         <w:rPr>
           <w:lang w:val="da-DK"/>
         </w:rPr>
+        <w:t>During</w:t>
+      </w:r>
+      <w:proofErr w:type="spellEnd"/>
+      <w:r>
+        <w:rPr>
+          <w:lang w:val="da-DK"/>
+        </w:rPr>
+        <w:t xml:space="preserve"> Menu Mod</w:t>
+      </w:r>
+      <w:r>
+        <w:rPr>
+          <w:lang w:val="da-DK"/>
+        </w:rPr>
         <w:t>e</w:t>
       </w:r>
     </w:p>
@@ -1846,7 +2881,21 @@
         <w:rPr>
           <w:lang w:val="en-US"/>
         </w:rPr>
-        <w:t xml:space="preserve"> if at the top menu. Long </w:t>
+        <w:t xml:space="preserve"> if </w:t>
+      </w:r>
+      <w:proofErr w:type="gramStart"/>
+      <w:r>
+        <w:rPr>
+          <w:lang w:val="en-US"/>
+        </w:rPr>
+        <w:t>at</w:t>
+      </w:r>
+      <w:proofErr w:type="gramEnd"/>
+      <w:r>
+        <w:rPr>
+          <w:lang w:val="en-US"/>
+        </w:rPr>
+        <w:t xml:space="preserve"> the top menu. Long </w:t>
       </w:r>
       <w:r>
         <w:rPr>
@@ -1870,7 +2919,21 @@
         <w:rPr>
           <w:lang w:val="en-US"/>
         </w:rPr>
-        <w:t>displays some help (if available) about the current menu item</w:t>
+        <w:t xml:space="preserve">displays some help (if available) </w:t>
+      </w:r>
+      <w:proofErr w:type="gramStart"/>
+      <w:r>
+        <w:rPr>
+          <w:lang w:val="en-US"/>
+        </w:rPr>
+        <w:t>about</w:t>
+      </w:r>
+      <w:proofErr w:type="gramEnd"/>
+      <w:r>
+        <w:rPr>
+          <w:lang w:val="en-US"/>
+        </w:rPr>
+        <w:t xml:space="preserve"> the current menu item</w:t>
       </w:r>
       <w:r>
         <w:rPr>
@@ -1882,7 +2945,35 @@
         <w:rPr>
           <w:lang w:val="en-US"/>
         </w:rPr>
-        <w:t xml:space="preserve"> Note that currently only a few menu items have help. More will be added in the future.</w:t>
+        <w:t xml:space="preserve"> Note that currently only a few </w:t>
+      </w:r>
+      <w:proofErr w:type="gramStart"/>
+      <w:r>
+        <w:rPr>
+          <w:lang w:val="en-US"/>
+        </w:rPr>
+        <w:t>menu items</w:t>
+      </w:r>
+      <w:proofErr w:type="gramEnd"/>
+      <w:r>
+        <w:rPr>
+          <w:lang w:val="en-US"/>
+        </w:rPr>
+        <w:t xml:space="preserve"> have </w:t>
+      </w:r>
+      <w:proofErr w:type="gramStart"/>
+      <w:r>
+        <w:rPr>
+          <w:lang w:val="en-US"/>
+        </w:rPr>
+        <w:t>help</w:t>
+      </w:r>
+      <w:proofErr w:type="gramEnd"/>
+      <w:r>
+        <w:rPr>
+          <w:lang w:val="en-US"/>
+        </w:rPr>
+        <w:t>. More will be added in the future.</w:t>
       </w:r>
     </w:p>
     <w:p>
@@ -2007,7 +3098,35 @@
         <w:rPr>
           <w:lang w:val="en-US"/>
         </w:rPr>
-        <w:t xml:space="preserve">. After a dial click the increment will change to 10 and dial will add and subtract </w:t>
+        <w:t xml:space="preserve">. After a dial </w:t>
+      </w:r>
+      <w:proofErr w:type="gramStart"/>
+      <w:r>
+        <w:rPr>
+          <w:lang w:val="en-US"/>
+        </w:rPr>
+        <w:t>click</w:t>
+      </w:r>
+      <w:proofErr w:type="gramEnd"/>
+      <w:r>
+        <w:rPr>
+          <w:lang w:val="en-US"/>
+        </w:rPr>
+        <w:t xml:space="preserve"> the increment will change to </w:t>
+      </w:r>
+      <w:proofErr w:type="gramStart"/>
+      <w:r>
+        <w:rPr>
+          <w:lang w:val="en-US"/>
+        </w:rPr>
+        <w:t>10</w:t>
+      </w:r>
+      <w:proofErr w:type="gramEnd"/>
+      <w:r>
+        <w:rPr>
+          <w:lang w:val="en-US"/>
+        </w:rPr>
+        <w:t xml:space="preserve"> and dial will add and subtract </w:t>
       </w:r>
       <w:r>
         <w:rPr>
@@ -2085,6 +3204,7 @@
       <w:bookmarkEnd w:id="6"/>
       <w:bookmarkEnd w:id="7"/>
       <w:r>
+        <w:lastRenderedPageBreak/>
         <w:t xml:space="preserve">Rotating </w:t>
       </w:r>
       <w:r>
@@ -2096,7 +3216,15 @@
     </w:p>
     <w:p>
       <w:r>
-        <w:t xml:space="preserve">Dial rotation is only useful in the menu system, it doesn’t have any function while the radio </w:t>
+        <w:t xml:space="preserve">Dial rotation is only useful in the menu </w:t>
+      </w:r>
+      <w:proofErr w:type="gramStart"/>
+      <w:r>
+        <w:t>system,</w:t>
+      </w:r>
+      <w:proofErr w:type="gramEnd"/>
+      <w:r>
+        <w:t xml:space="preserve"> it doesn’t have any function while the radio </w:t>
       </w:r>
       <w:r>
         <w:t>status is displayed.</w:t>
@@ -2123,23 +3251,35 @@
         <w:t>s</w:t>
       </w:r>
       <w:r>
-        <w:t xml:space="preserve"> settings. In the </w:t>
-      </w:r>
-      <w:r>
-        <w:lastRenderedPageBreak/>
-        <w:t>menus</w:t>
+        <w:t xml:space="preserve"> settings. In the menus</w:t>
       </w:r>
       <w:r>
         <w:t>,</w:t>
       </w:r>
       <w:r>
-        <w:t xml:space="preserve"> boolean values toggle with each click.</w:t>
+        <w:t xml:space="preserve"> </w:t>
+      </w:r>
+      <w:proofErr w:type="spellStart"/>
+      <w:r>
+        <w:t>boolean</w:t>
+      </w:r>
+      <w:proofErr w:type="spellEnd"/>
+      <w:r>
+        <w:t xml:space="preserve"> values toggle with each click.</w:t>
       </w:r>
       <w:r>
         <w:t xml:space="preserve"> Multiple selections cycle through all the available options.</w:t>
       </w:r>
       <w:r>
-        <w:t xml:space="preserve"> Integer values go to another screen that shows the minimum and maximum values. Rotating the dial right increases the value while rotating to the left decreases it by the increment amount. The increment amount can be changed by clicking the button which will cycle between different values. One of the values will be a reset to the original value, activated with a long press. A long press is also used to accept the new value and return to the menu. A * </w:t>
+        <w:t xml:space="preserve"> Integer values go to another screen that shows the minimum and maximum values. Rotating the dial right increases the value while rotating to the left decreases it by the increment amount. The increment amount can be changed by clicking the button which will cycle between different values. One of the values will be a reset to the original value, activated with a long press. </w:t>
+      </w:r>
+      <w:proofErr w:type="gramStart"/>
+      <w:r>
+        <w:t>A long</w:t>
+      </w:r>
+      <w:proofErr w:type="gramEnd"/>
+      <w:r>
+        <w:t xml:space="preserve"> press is also used to accept the new value and return to the menu. A * </w:t>
       </w:r>
       <w:r>
         <w:t xml:space="preserve">or highlight </w:t>
@@ -2148,10 +3288,18 @@
         <w:t xml:space="preserve">indicates the active menu line. A + in front of the menu means another menu will be activated. </w:t>
       </w:r>
       <w:r>
-        <w:t>Any menu item starting with ‘-‘</w:t>
-      </w:r>
-      <w:r>
-        <w:t xml:space="preserve"> goes back to the previous menu when clicked. A</w:t>
+        <w:t>Any menu item starting with ‘</w:t>
+      </w:r>
+      <w:proofErr w:type="gramStart"/>
+      <w:r>
+        <w:t>-‘</w:t>
+      </w:r>
+      <w:r>
+        <w:t xml:space="preserve"> goes</w:t>
+      </w:r>
+      <w:proofErr w:type="gramEnd"/>
+      <w:r>
+        <w:t xml:space="preserve"> back to the previous menu when clicked. A</w:t>
       </w:r>
       <w:r>
         <w:t xml:space="preserve"> dial</w:t>
@@ -2283,7 +3431,15 @@
         <w:ind w:left="1440"/>
       </w:pPr>
       <w:r>
-        <w:t>Select menu item, including return to previous menu</w:t>
+        <w:t xml:space="preserve">Select menu </w:t>
+      </w:r>
+      <w:proofErr w:type="gramStart"/>
+      <w:r>
+        <w:t>item</w:t>
+      </w:r>
+      <w:proofErr w:type="gramEnd"/>
+      <w:r>
+        <w:t>, including return to previous menu</w:t>
       </w:r>
     </w:p>
     <w:p>
@@ -2291,8 +3447,13 @@
         <w:ind w:left="1440"/>
       </w:pPr>
       <w:r>
-        <w:t>Toggle booleans</w:t>
-      </w:r>
+        <w:t xml:space="preserve">Toggle </w:t>
+      </w:r>
+      <w:proofErr w:type="spellStart"/>
+      <w:r>
+        <w:t>booleans</w:t>
+      </w:r>
+      <w:proofErr w:type="spellEnd"/>
     </w:p>
     <w:p>
       <w:pPr>
@@ -2347,7 +3508,15 @@
         <w:t xml:space="preserve"> The bottom of the screen shows the</w:t>
       </w:r>
       <w:r>
-        <w:t xml:space="preserve"> battery status on the right if it has been enabled. This is related to the current battery voltage and will drop while transmitting. There are also 4 LED’s on the PCB that can be seen through</w:t>
+        <w:t xml:space="preserve"> battery status on the right if it has been enabled. This is related to the current battery voltage and will drop while transmitting. There are also 4 </w:t>
+      </w:r>
+      <w:proofErr w:type="gramStart"/>
+      <w:r>
+        <w:t>LED’s</w:t>
+      </w:r>
+      <w:proofErr w:type="gramEnd"/>
+      <w:r>
+        <w:t xml:space="preserve"> on the PCB that can be seen through</w:t>
       </w:r>
       <w:r>
         <w:t xml:space="preserve"> the slot on the </w:t>
@@ -2359,16 +3528,38 @@
         <w:t xml:space="preserve"> of the case</w:t>
       </w:r>
       <w:r>
-        <w:t>. These LED’s are controlled by the battery charger circuit and indicate the battery status during running and charging.</w:t>
+        <w:t xml:space="preserve">. These </w:t>
+      </w:r>
+      <w:proofErr w:type="gramStart"/>
+      <w:r>
+        <w:t>LED’s</w:t>
+      </w:r>
+      <w:proofErr w:type="gramEnd"/>
+      <w:r>
+        <w:t xml:space="preserve"> are controlled by the battery charger circuit and indicate the battery status during running and charging.</w:t>
       </w:r>
     </w:p>
     <w:p/>
     <w:p>
-      <w:r>
-        <w:t>During transmitting the bottom left shows an animated red dot. In a future firmware update the</w:t>
-      </w:r>
-      <w:r>
-        <w:t xml:space="preserve"> received DTMF characters will be display next to this.</w:t>
+      <w:proofErr w:type="gramStart"/>
+      <w:r>
+        <w:lastRenderedPageBreak/>
+        <w:t>During</w:t>
+      </w:r>
+      <w:proofErr w:type="gramEnd"/>
+      <w:r>
+        <w:t xml:space="preserve"> transmitting the bottom left shows an animated red dot. In a future firmware update the</w:t>
+      </w:r>
+      <w:r>
+        <w:t xml:space="preserve"> </w:t>
+      </w:r>
+      <w:proofErr w:type="gramStart"/>
+      <w:r>
+        <w:t>received DTMF characters</w:t>
+      </w:r>
+      <w:proofErr w:type="gramEnd"/>
+      <w:r>
+        <w:t xml:space="preserve"> will be display next to this.</w:t>
       </w:r>
     </w:p>
     <w:p>
@@ -2376,7 +3567,6 @@
         <w:pStyle w:val="Heading1"/>
       </w:pPr>
       <w:r>
-        <w:lastRenderedPageBreak/>
         <w:t>Menu Details</w:t>
       </w:r>
     </w:p>
@@ -2384,8 +3574,13 @@
       <w:r>
         <w:t xml:space="preserve">The following sections detail each entry in </w:t>
       </w:r>
-      <w:r>
-        <w:t>all of the menus</w:t>
+      <w:proofErr w:type="gramStart"/>
+      <w:r>
+        <w:t>all of</w:t>
+      </w:r>
+      <w:proofErr w:type="gramEnd"/>
+      <w:r>
+        <w:t xml:space="preserve"> the menus</w:t>
       </w:r>
       <w:r>
         <w:t xml:space="preserve"> starting with the main or top menu</w:t>
@@ -2412,7 +3607,15 @@
         <w:t>’</w:t>
       </w:r>
       <w:r>
-        <w:t xml:space="preserve"> or a ‘-‘ to indicate a range</w:t>
+        <w:t xml:space="preserve"> or a ‘</w:t>
+      </w:r>
+      <w:proofErr w:type="gramStart"/>
+      <w:r>
+        <w:t>-‘ to</w:t>
+      </w:r>
+      <w:proofErr w:type="gramEnd"/>
+      <w:r>
+        <w:t xml:space="preserve"> indicate a range</w:t>
       </w:r>
       <w:r>
         <w:t>.</w:t>
@@ -2437,7 +3640,15 @@
         <w:t xml:space="preserve"> Some menu entries may depend on other menu items </w:t>
       </w:r>
       <w:r>
-        <w:t xml:space="preserve">settings. For example the audio file name menu item is hidden unless </w:t>
+        <w:t xml:space="preserve">settings. For </w:t>
+      </w:r>
+      <w:proofErr w:type="gramStart"/>
+      <w:r>
+        <w:t>example</w:t>
+      </w:r>
+      <w:proofErr w:type="gramEnd"/>
+      <w:r>
+        <w:t xml:space="preserve"> the audio file name menu item is hidden unless </w:t>
       </w:r>
       <w:r>
         <w:t>“Play Audio File” is Yes.</w:t>
@@ -2456,7 +3667,11 @@
         <w:pStyle w:val="Heading3"/>
       </w:pPr>
       <w:r>
-        <w:t>XMIT: On</w:t>
+        <w:t xml:space="preserve">XMIT: </w:t>
+      </w:r>
+      <w:proofErr w:type="spellStart"/>
+      <w:r>
+        <w:t>On</w:t>
       </w:r>
       <w:r>
         <w:t>|</w:t>
@@ -2464,13 +3679,43 @@
       <w:r>
         <w:t>Off</w:t>
       </w:r>
-    </w:p>
-    <w:p>
-      <w:r>
-        <w:t xml:space="preserve">This must be set to On for the radio to begin </w:t>
-      </w:r>
-      <w:r>
-        <w:t>transmitting. If saved as On then the radio will start sending right after booting. If it is Off it will not automatically start sending. It can be toggle</w:t>
+      <w:proofErr w:type="spellEnd"/>
+    </w:p>
+    <w:p>
+      <w:r>
+        <w:t xml:space="preserve">This must be set to </w:t>
+      </w:r>
+      <w:proofErr w:type="gramStart"/>
+      <w:r>
+        <w:t>On</w:t>
+      </w:r>
+      <w:proofErr w:type="gramEnd"/>
+      <w:r>
+        <w:t xml:space="preserve"> for the radio to begin </w:t>
+      </w:r>
+      <w:proofErr w:type="gramStart"/>
+      <w:r>
+        <w:t>transmitting</w:t>
+      </w:r>
+      <w:proofErr w:type="gramEnd"/>
+      <w:r>
+        <w:t xml:space="preserve">. If saved as </w:t>
+      </w:r>
+      <w:proofErr w:type="gramStart"/>
+      <w:r>
+        <w:t>On</w:t>
+      </w:r>
+      <w:proofErr w:type="gramEnd"/>
+      <w:r>
+        <w:t xml:space="preserve"> then the radio will start sending right after booting. If it is </w:t>
+      </w:r>
+      <w:proofErr w:type="gramStart"/>
+      <w:r>
+        <w:t>Off</w:t>
+      </w:r>
+      <w:proofErr w:type="gramEnd"/>
+      <w:r>
+        <w:t xml:space="preserve"> it will not automatically start sending. It can be toggle</w:t>
       </w:r>
       <w:r>
         <w:t>d</w:t>
@@ -2479,15 +3724,24 @@
         <w:t xml:space="preserve"> with the B0 button while in run mode</w:t>
       </w:r>
       <w:r>
-        <w:t>. Using B0 does not changed</w:t>
-      </w:r>
+        <w:t xml:space="preserve">. Using B0 does not </w:t>
+      </w:r>
+      <w:proofErr w:type="gramStart"/>
+      <w:r>
+        <w:t>changed</w:t>
+      </w:r>
+      <w:proofErr w:type="gramEnd"/>
     </w:p>
     <w:p>
       <w:pPr>
         <w:pStyle w:val="Heading3"/>
       </w:pPr>
       <w:r>
-        <w:t>TX Power: High</w:t>
+        <w:t xml:space="preserve">TX Power: </w:t>
+      </w:r>
+      <w:proofErr w:type="spellStart"/>
+      <w:r>
+        <w:t>High</w:t>
       </w:r>
       <w:r>
         <w:t>|</w:t>
@@ -2499,6 +3753,7 @@
         </w:rPr>
         <w:t>Low</w:t>
       </w:r>
+      <w:proofErr w:type="spellEnd"/>
     </w:p>
     <w:p>
       <w:r>
@@ -2554,7 +3809,11 @@
         <w:t>:</w:t>
       </w:r>
       <w:r>
-        <w:t xml:space="preserve"> Yes|</w:t>
+        <w:t xml:space="preserve"> </w:t>
+      </w:r>
+      <w:proofErr w:type="spellStart"/>
+      <w:r>
+        <w:t>Yes|</w:t>
       </w:r>
       <w:r>
         <w:rPr>
@@ -2563,6 +3822,7 @@
         </w:rPr>
         <w:t>No</w:t>
       </w:r>
+      <w:proofErr w:type="spellEnd"/>
     </w:p>
     <w:p>
       <w:r>
@@ -2577,7 +3837,11 @@
         <w:pStyle w:val="Heading3"/>
       </w:pPr>
       <w:r>
-        <w:t>Send GPS: Yes|</w:t>
+        <w:t xml:space="preserve">Send GPS: </w:t>
+      </w:r>
+      <w:proofErr w:type="spellStart"/>
+      <w:r>
+        <w:t>Yes|</w:t>
       </w:r>
       <w:r>
         <w:rPr>
@@ -2586,6 +3850,7 @@
         </w:rPr>
         <w:t>NO</w:t>
       </w:r>
+      <w:proofErr w:type="spellEnd"/>
       <w:r>
         <w:t xml:space="preserve"> (beacon mode only)</w:t>
       </w:r>
@@ -2598,8 +3863,13 @@
         <w:t xml:space="preserve">ude and longitude values. The values must be entered manually from a phone </w:t>
       </w:r>
       <w:r>
-        <w:t>or GPS device. A future version of the hardware may have a built-in GPS module</w:t>
-      </w:r>
+        <w:t xml:space="preserve">or GPS device. A future version of the hardware may have a built-in GPS </w:t>
+      </w:r>
+      <w:proofErr w:type="gramStart"/>
+      <w:r>
+        <w:t>module</w:t>
+      </w:r>
+      <w:proofErr w:type="gramEnd"/>
       <w:r>
         <w:t xml:space="preserve"> or it may be able to connect to a serial GPS device using the USB connection.</w:t>
       </w:r>
@@ -2614,9 +3884,13 @@
       <w:r>
         <w:t>+/-</w:t>
       </w:r>
+      <w:proofErr w:type="spellStart"/>
+      <w:proofErr w:type="gramStart"/>
       <w:r>
         <w:t>n.nnnnnn</w:t>
       </w:r>
+      <w:proofErr w:type="spellEnd"/>
+      <w:proofErr w:type="gramEnd"/>
       <w:r>
         <w:t xml:space="preserve"> (</w:t>
       </w:r>
@@ -2663,7 +3937,18 @@
         <w:pStyle w:val="Heading3"/>
       </w:pPr>
       <w:r>
-        <w:t xml:space="preserve">Longitude: +/-n.nnnnnn (Send </w:t>
+        <w:lastRenderedPageBreak/>
+        <w:t>Longitude: +/-</w:t>
+      </w:r>
+      <w:proofErr w:type="spellStart"/>
+      <w:proofErr w:type="gramStart"/>
+      <w:r>
+        <w:t>n.nnnnnn</w:t>
+      </w:r>
+      <w:proofErr w:type="spellEnd"/>
+      <w:proofErr w:type="gramEnd"/>
+      <w:r>
+        <w:t xml:space="preserve"> (Send </w:t>
       </w:r>
       <w:r>
         <w:rPr>
@@ -2700,7 +3985,6 @@
         <w:pStyle w:val="Heading3"/>
       </w:pPr>
       <w:r>
-        <w:lastRenderedPageBreak/>
         <w:t>Beacon</w:t>
       </w:r>
       <w:r>
@@ -2768,8 +4052,13 @@
         <w:t>Play Audio File</w:t>
       </w:r>
       <w:r>
-        <w:t>: Yes|No</w:t>
-      </w:r>
+        <w:t xml:space="preserve">: </w:t>
+      </w:r>
+      <w:proofErr w:type="spellStart"/>
+      <w:r>
+        <w:t>Yes|No</w:t>
+      </w:r>
+      <w:proofErr w:type="spellEnd"/>
     </w:p>
     <w:p>
       <w:r>
@@ -2793,13 +4082,37 @@
     </w:p>
     <w:p>
       <w:r>
-        <w:t xml:space="preserve">This menu item is only visible if the previous item is set to Yes. Clicking the dial will list all of the </w:t>
-      </w:r>
-      <w:r>
-        <w:t>*.txt files on the SD card. The dial is rotated to highlight a file and a long press will set it</w:t>
-      </w:r>
-      <w:r>
-        <w:t>. Note that a click of dial just exits the list of file with no selection being performed.</w:t>
+        <w:t xml:space="preserve">This menu item is only visible if the previous item is set to Yes. Clicking the dial will list </w:t>
+      </w:r>
+      <w:proofErr w:type="gramStart"/>
+      <w:r>
+        <w:t>all of</w:t>
+      </w:r>
+      <w:proofErr w:type="gramEnd"/>
+      <w:r>
+        <w:t xml:space="preserve"> the </w:t>
+      </w:r>
+      <w:r>
+        <w:t xml:space="preserve">*.txt files on the SD card. The dial is rotated to highlight a </w:t>
+      </w:r>
+      <w:proofErr w:type="gramStart"/>
+      <w:r>
+        <w:t>file</w:t>
+      </w:r>
+      <w:proofErr w:type="gramEnd"/>
+      <w:r>
+        <w:t xml:space="preserve"> and a long press will set it</w:t>
+      </w:r>
+      <w:r>
+        <w:t xml:space="preserve">. Note that a click of dial just exits the list of </w:t>
+      </w:r>
+      <w:proofErr w:type="gramStart"/>
+      <w:r>
+        <w:t>file</w:t>
+      </w:r>
+      <w:proofErr w:type="gramEnd"/>
+      <w:r>
+        <w:t xml:space="preserve"> with no selection being performed.</w:t>
       </w:r>
     </w:p>
     <w:p>
@@ -2842,7 +4155,15 @@
         <w:t>When B0 or the menu starts the transmit mode</w:t>
       </w:r>
       <w:r>
-        <w:t xml:space="preserve"> the system will not actually begin sending until this time is expired. This allows the radio to be hidden</w:t>
+        <w:t xml:space="preserve"> the system will not actually begin sending until this time </w:t>
+      </w:r>
+      <w:proofErr w:type="gramStart"/>
+      <w:r>
+        <w:t>is expired</w:t>
+      </w:r>
+      <w:proofErr w:type="gramEnd"/>
+      <w:r>
+        <w:t>. This allows the radio to be hidden</w:t>
       </w:r>
       <w:r>
         <w:t xml:space="preserve"> and </w:t>
@@ -2859,8 +4180,13 @@
         <w:pStyle w:val="Heading3"/>
       </w:pPr>
       <w:r>
-        <w:t>Timer Mode: Fixed|Random</w:t>
-      </w:r>
+        <w:t xml:space="preserve">Timer Mode: </w:t>
+      </w:r>
+      <w:proofErr w:type="spellStart"/>
+      <w:r>
+        <w:t>Fixed|Random</w:t>
+      </w:r>
+      <w:proofErr w:type="spellEnd"/>
     </w:p>
     <w:p>
       <w:r>
@@ -2873,7 +4199,23 @@
         <w:t xml:space="preserve"> and are always the same. In Random mode the transmit time and pause time are randomly chosen</w:t>
       </w:r>
       <w:r>
-        <w:t xml:space="preserve"> from the allowed values set in the Min and Max values for TX Send and Pause. This makes the timing less predictable and make the game a little bit harder.</w:t>
+        <w:t xml:space="preserve"> from the allowed values set in the Min and Max values for TX Send and Pause. This makes </w:t>
+      </w:r>
+      <w:proofErr w:type="gramStart"/>
+      <w:r>
+        <w:t>the timing</w:t>
+      </w:r>
+      <w:proofErr w:type="gramEnd"/>
+      <w:r>
+        <w:t xml:space="preserve"> less predictable and </w:t>
+      </w:r>
+      <w:proofErr w:type="gramStart"/>
+      <w:r>
+        <w:t>make</w:t>
+      </w:r>
+      <w:proofErr w:type="gramEnd"/>
+      <w:r>
+        <w:t xml:space="preserve"> the game a little bit harder.</w:t>
       </w:r>
       <w:r>
         <w:t xml:space="preserve"> Keep your ears on!</w:t>
@@ -2884,6 +4226,7 @@
         <w:pStyle w:val="Heading3"/>
       </w:pPr>
       <w:r>
+        <w:lastRenderedPageBreak/>
         <w:t xml:space="preserve">TX Send: </w:t>
       </w:r>
       <w:r>
@@ -2916,7 +4259,11 @@
         <w:t xml:space="preserve"> If </w:t>
       </w:r>
       <w:r>
-        <w:t>this time is set to less than the total ID</w:t>
+        <w:t xml:space="preserve">this time is set to less than the total </w:t>
+      </w:r>
+      <w:proofErr w:type="spellStart"/>
+      <w:r>
+        <w:t>ID</w:t>
       </w:r>
       <w:r>
         <w:t>+</w:t>
@@ -2925,29 +4272,644 @@
         <w:t>Call</w:t>
       </w:r>
       <w:r>
-        <w:t xml:space="preserve">+Audio time then there will be only </w:t>
+        <w:t>+Audio</w:t>
+      </w:r>
+      <w:proofErr w:type="spellEnd"/>
+      <w:r>
+        <w:t xml:space="preserve"> </w:t>
+      </w:r>
+      <w:proofErr w:type="gramStart"/>
+      <w:r>
+        <w:t>time</w:t>
+      </w:r>
+      <w:proofErr w:type="gramEnd"/>
+      <w:r>
+        <w:t xml:space="preserve"> then there will be only </w:t>
       </w:r>
       <w:r>
         <w:t>one cycle of data transmitted.</w:t>
       </w:r>
       <w:r>
-        <w:t xml:space="preserve"> If the </w:t>
-      </w:r>
+        <w:t xml:space="preserve"> If the time is longer then the </w:t>
+      </w:r>
+      <w:proofErr w:type="spellStart"/>
+      <w:r>
+        <w:t>ID</w:t>
+      </w:r>
+      <w:r>
+        <w:t>+Call</w:t>
+      </w:r>
+      <w:r>
+        <w:t>+Audio</w:t>
+      </w:r>
+      <w:proofErr w:type="spellEnd"/>
+      <w:r>
+        <w:t xml:space="preserve"> cycles will be repeated until the time has expired. Note that </w:t>
+      </w:r>
+      <w:r>
+        <w:t xml:space="preserve">both ID and Audio will always be completed before </w:t>
+      </w:r>
+      <w:r>
+        <w:t>transmission ends</w:t>
+      </w:r>
+      <w:r>
+        <w:t>.</w:t>
+      </w:r>
+    </w:p>
+    <w:p>
+      <w:pPr>
+        <w:pStyle w:val="Heading3"/>
+      </w:pPr>
+      <w:r>
+        <w:t>TX Pause:10-1200 Sec</w:t>
+      </w:r>
+    </w:p>
+    <w:p>
+      <w:r>
+        <w:t xml:space="preserve">This is the </w:t>
+      </w:r>
+      <w:r>
+        <w:t>pause</w:t>
+      </w:r>
+      <w:r>
+        <w:t xml:space="preserve"> between transmissions</w:t>
+      </w:r>
+      <w:r>
+        <w:t>. Longer times let the radio cool off and save the battery for longer run times.</w:t>
+      </w:r>
+    </w:p>
+    <w:p>
+      <w:pPr>
+        <w:pStyle w:val="Heading3"/>
+      </w:pPr>
+      <w:r>
+        <w:t>TX Send Min: 10-90 Sec</w:t>
+      </w:r>
+    </w:p>
+    <w:p>
+      <w:r>
+        <w:t>In random mode this is the minimum send time.</w:t>
+      </w:r>
+    </w:p>
+    <w:p>
+      <w:pPr>
+        <w:pStyle w:val="Heading3"/>
+      </w:pPr>
+      <w:r>
+        <w:t xml:space="preserve">TX Send Max: </w:t>
+      </w:r>
+      <w:r>
+        <w:t>10-90 Sec</w:t>
+      </w:r>
+    </w:p>
+    <w:p>
+      <w:r>
+        <w:t xml:space="preserve">In </w:t>
+      </w:r>
+      <w:r>
+        <w:t xml:space="preserve">random mode this is the maximum </w:t>
+      </w:r>
+      <w:proofErr w:type="gramStart"/>
+      <w:r>
+        <w:t>send</w:t>
+      </w:r>
+      <w:proofErr w:type="gramEnd"/>
+      <w:r>
+        <w:t xml:space="preserve"> time.</w:t>
+      </w:r>
+    </w:p>
+    <w:p>
+      <w:pPr>
+        <w:pStyle w:val="Heading3"/>
+      </w:pPr>
+      <w:r>
+        <w:t>TX Pause Min: 10-1200 Sec</w:t>
+      </w:r>
+    </w:p>
+    <w:p>
+      <w:r>
+        <w:t>In random mode this is the minimum pause time.</w:t>
+      </w:r>
+    </w:p>
+    <w:p>
+      <w:pPr>
+        <w:pStyle w:val="Heading3"/>
+      </w:pPr>
+      <w:r>
+        <w:t>TX Pause Max: 10-1200 Sec</w:t>
+      </w:r>
+    </w:p>
+    <w:p>
+      <w:r>
+        <w:t>In random mode this is the maximum pause time.</w:t>
+      </w:r>
+    </w:p>
+    <w:p>
+      <w:pPr>
+        <w:pStyle w:val="Heading3"/>
+      </w:pPr>
+      <w:r>
+        <w:t xml:space="preserve">Radio Pause: </w:t>
+      </w:r>
+      <w:proofErr w:type="spellStart"/>
+      <w:r>
+        <w:t>Sleep|Awake</w:t>
+      </w:r>
+      <w:proofErr w:type="spellEnd"/>
+    </w:p>
+    <w:p>
+      <w:r>
+        <w:t xml:space="preserve">During pause time the radio can be put into sleep mode. This lowers the power consumption and lets the battery last longer. </w:t>
+      </w:r>
+      <w:proofErr w:type="gramStart"/>
+      <w:r>
+        <w:t>However</w:t>
+      </w:r>
+      <w:proofErr w:type="gramEnd"/>
+      <w:r>
+        <w:t xml:space="preserve"> note that this also means that the DTMF commands are disabled since the radio is asleep!</w:t>
+      </w:r>
+    </w:p>
+    <w:p>
+      <w:pPr>
+        <w:pStyle w:val="Heading2"/>
+      </w:pPr>
+      <w:r>
+        <w:t>+</w:t>
+      </w:r>
+      <w:r>
+        <w:t>More Radio Settings</w:t>
+      </w:r>
+    </w:p>
+    <w:p>
+      <w:pPr>
+        <w:pStyle w:val="Heading3"/>
+      </w:pPr>
+      <w:r>
+        <w:t>RX Offset: -600|0|+600 kHz</w:t>
+      </w:r>
+    </w:p>
+    <w:p>
+      <w:r>
+        <w:t>This is the frequency offset from the transmit frequency that the radio uses to receive DTMF commands</w:t>
+      </w:r>
+      <w:r>
+        <w:t xml:space="preserve">. An offset is recommended. If 0 is used the radio will only listen when it isn’t </w:t>
+      </w:r>
+      <w:proofErr w:type="gramStart"/>
+      <w:r>
+        <w:t>sending</w:t>
+      </w:r>
+      <w:proofErr w:type="gramEnd"/>
+      <w:r>
+        <w:t>. It has not been tested if it listens during sending when the offset is not 0.</w:t>
+      </w:r>
+    </w:p>
+    <w:p>
+      <w:pPr>
+        <w:pStyle w:val="Heading3"/>
+      </w:pPr>
+      <w:r>
+        <w:t>Bandwidth: 12.5|</w:t>
+      </w:r>
+      <w:r>
+        <w:t>25 kHz</w:t>
+      </w:r>
+    </w:p>
+    <w:p>
+      <w:r>
+        <w:t>This sets the radio bandwidth</w:t>
+      </w:r>
+      <w:r>
+        <w:t>. It has not been tested much to see what effect it has on performance yet.</w:t>
+      </w:r>
+    </w:p>
+    <w:p>
+      <w:pPr>
+        <w:pStyle w:val="Heading3"/>
+      </w:pPr>
       <w:r>
         <w:lastRenderedPageBreak/>
-        <w:t>time is longer then the ID</w:t>
-      </w:r>
-      <w:r>
-        <w:t>+Call</w:t>
-      </w:r>
-      <w:r>
-        <w:t xml:space="preserve">+Audio cycles will be repeated until the time has expired. Note that </w:t>
-      </w:r>
-      <w:r>
-        <w:t xml:space="preserve">both ID and Audio will always be completed before </w:t>
-      </w:r>
-      <w:r>
-        <w:t>transmission ends</w:t>
+        <w:t>CTCSS/DCS: CTCSS|DCS</w:t>
+      </w:r>
+    </w:p>
+    <w:p>
+      <w:r>
+        <w:t xml:space="preserve">This sets the </w:t>
+      </w:r>
+      <w:r>
+        <w:t>un-squelch</w:t>
+      </w:r>
+      <w:r>
+        <w:t xml:space="preserve"> values</w:t>
+      </w:r>
+      <w:r>
+        <w:t xml:space="preserve"> for either the analog or digital versions.</w:t>
+      </w:r>
+    </w:p>
+    <w:p>
+      <w:pPr>
+        <w:pStyle w:val="Heading3"/>
+      </w:pPr>
+      <w:r>
+        <w:t>TX CTCSS:</w:t>
+      </w:r>
+      <w:r>
+        <w:t xml:space="preserve"> None</w:t>
+      </w:r>
+      <w:r>
+        <w:t>|</w:t>
+      </w:r>
+      <w:r>
+        <w:t>67-</w:t>
+      </w:r>
+      <w:r>
+        <w:t>250.3</w:t>
+      </w:r>
+    </w:p>
+    <w:p>
+      <w:r>
+        <w:t>Analog un-squelch frequencies sent out.</w:t>
+      </w:r>
+    </w:p>
+    <w:p>
+      <w:pPr>
+        <w:pStyle w:val="Heading3"/>
+      </w:pPr>
+      <w:r>
+        <w:t>RX CTCSS:</w:t>
+      </w:r>
+      <w:r>
+        <w:t xml:space="preserve"> None|67-250.3</w:t>
+      </w:r>
+    </w:p>
+    <w:p>
+      <w:r>
+        <w:t>Analog un-squelch frequency for receiving.</w:t>
+      </w:r>
+    </w:p>
+    <w:p>
+      <w:pPr>
+        <w:pStyle w:val="Heading3"/>
+      </w:pPr>
+      <w:r>
+        <w:t>TX DCS:</w:t>
+      </w:r>
+      <w:r>
+        <w:t xml:space="preserve"> None|023-754</w:t>
+      </w:r>
+    </w:p>
+    <w:p>
+      <w:r>
+        <w:t>Digital un-squelch value for sending.</w:t>
+      </w:r>
+    </w:p>
+    <w:p>
+      <w:pPr>
+        <w:pStyle w:val="Heading3"/>
+      </w:pPr>
+      <w:r>
+        <w:t>TX I/N: I|N</w:t>
+      </w:r>
+    </w:p>
+    <w:p>
+      <w:r>
+        <w:t>The digital I or N value for sending.</w:t>
+      </w:r>
+    </w:p>
+    <w:p>
+      <w:pPr>
+        <w:pStyle w:val="Heading3"/>
+      </w:pPr>
+      <w:r>
+        <w:t>RX DCS: None|023-754</w:t>
+      </w:r>
+    </w:p>
+    <w:p>
+      <w:r>
+        <w:t>Digital un-squelch value for receiving.</w:t>
+      </w:r>
+    </w:p>
+    <w:p>
+      <w:pPr>
+        <w:pStyle w:val="Heading3"/>
+      </w:pPr>
+      <w:r>
+        <w:t>RX I/N: I|N</w:t>
+      </w:r>
+    </w:p>
+    <w:p>
+      <w:r>
+        <w:t>The digital I or N value for receiving.</w:t>
+      </w:r>
+    </w:p>
+    <w:p>
+      <w:pPr>
+        <w:pStyle w:val="Heading3"/>
+      </w:pPr>
+      <w:r>
+        <w:t>RX Volume:</w:t>
+      </w:r>
+      <w:r>
+        <w:t xml:space="preserve"> 1-6</w:t>
+      </w:r>
+    </w:p>
+    <w:p>
+      <w:r>
+        <w:t>This is the receive volume setting. It affects how well DTMF tones are detected.</w:t>
+      </w:r>
+    </w:p>
+    <w:p>
+      <w:pPr>
+        <w:pStyle w:val="Heading3"/>
+      </w:pPr>
+      <w:r>
+        <w:t>RX Squelch:</w:t>
+      </w:r>
+      <w:r>
+        <w:t xml:space="preserve"> 0-8</w:t>
+      </w:r>
+    </w:p>
+    <w:p>
+      <w:r>
+        <w:t>This affects how much signal is required to receive the DTMF signals.</w:t>
+      </w:r>
+    </w:p>
+    <w:p>
+      <w:pPr>
+        <w:pStyle w:val="Heading2"/>
+      </w:pPr>
+      <w:r>
+        <w:t>Cancel Waits/TX Now</w:t>
+      </w:r>
+    </w:p>
+    <w:p>
+      <w:r>
+        <w:t>When the radio is in either send or pause mode this command will cancel the timer and the next mo</w:t>
+      </w:r>
+      <w:r>
+        <w:t xml:space="preserve">de will start. For </w:t>
+      </w:r>
+      <w:r>
+        <w:t>example,</w:t>
+      </w:r>
+      <w:r>
+        <w:t xml:space="preserve"> if you want to cancel</w:t>
+      </w:r>
+      <w:r>
+        <w:t xml:space="preserve"> the pause and go to transmit, use this option. It can also be done by long pressing B0.</w:t>
+      </w:r>
+    </w:p>
+    <w:p>
+      <w:pPr>
+        <w:pStyle w:val="Heading2"/>
+      </w:pPr>
+      <w:r>
+        <w:t>+Saved Settings Files</w:t>
+      </w:r>
+    </w:p>
+    <w:p>
+      <w:r>
+        <w:t>Saved settings files are named files stored on the SD card. They are useful to</w:t>
+      </w:r>
+      <w:r>
+        <w:t xml:space="preserve"> quickly configure the radio for different uses. All values except the battery calibration are affected.</w:t>
+      </w:r>
+    </w:p>
+    <w:p>
+      <w:pPr>
+        <w:pStyle w:val="Heading3"/>
+      </w:pPr>
+      <w:r>
+        <w:lastRenderedPageBreak/>
+        <w:t>Create File</w:t>
+      </w:r>
+    </w:p>
+    <w:p>
+      <w:r>
+        <w:t>This prompts the user for a name. The file is then created using the current system settings.</w:t>
+      </w:r>
+    </w:p>
+    <w:p>
+      <w:pPr>
+        <w:pStyle w:val="Heading3"/>
+      </w:pPr>
+      <w:r>
+        <w:t>Save/Update File</w:t>
+      </w:r>
+    </w:p>
+    <w:p>
+      <w:r>
+        <w:t xml:space="preserve">This command saves the current settings into the selected file. If it already </w:t>
+      </w:r>
+      <w:proofErr w:type="gramStart"/>
+      <w:r>
+        <w:t>exists</w:t>
+      </w:r>
+      <w:proofErr w:type="gramEnd"/>
+      <w:r>
+        <w:t xml:space="preserve"> the user will be asked to confirm overwriting the file.</w:t>
+      </w:r>
+    </w:p>
+    <w:p>
+      <w:pPr>
+        <w:pStyle w:val="Heading3"/>
+      </w:pPr>
+      <w:r>
+        <w:t>Load File</w:t>
+      </w:r>
+    </w:p>
+    <w:p>
+      <w:r>
+        <w:t xml:space="preserve">This command asks the user for the name and then sets </w:t>
+      </w:r>
+      <w:proofErr w:type="gramStart"/>
+      <w:r>
+        <w:t>all of</w:t>
+      </w:r>
+      <w:proofErr w:type="gramEnd"/>
+      <w:r>
+        <w:t xml:space="preserve"> the system settings except the battery calibration using the values in the file.</w:t>
+      </w:r>
+    </w:p>
+    <w:p>
+      <w:pPr>
+        <w:pStyle w:val="Heading3"/>
+      </w:pPr>
+      <w:r>
+        <w:t>Delete File</w:t>
+      </w:r>
+    </w:p>
+    <w:p>
+      <w:r>
+        <w:t>The user selects a file from the list and then it can be deleted.</w:t>
+      </w:r>
+    </w:p>
+    <w:p>
+      <w:pPr>
+        <w:pStyle w:val="Heading2"/>
+      </w:pPr>
+      <w:r>
+        <w:t>+System Settings</w:t>
+      </w:r>
+    </w:p>
+    <w:p>
+      <w:pPr>
+        <w:pStyle w:val="Heading3"/>
+      </w:pPr>
+      <w:r>
+        <w:t>+Display</w:t>
+      </w:r>
+      <w:r>
+        <w:t xml:space="preserve"> Settings</w:t>
+      </w:r>
+    </w:p>
+    <w:p>
+      <w:pPr>
+        <w:pStyle w:val="Heading4"/>
+      </w:pPr>
+      <w:r>
+        <w:t xml:space="preserve">Dimming Mode: </w:t>
+      </w:r>
+      <w:proofErr w:type="spellStart"/>
+      <w:r>
+        <w:t>None</w:t>
+      </w:r>
+      <w:r>
+        <w:t>|Timer</w:t>
+      </w:r>
+      <w:proofErr w:type="spellEnd"/>
+    </w:p>
+    <w:p>
+      <w:r>
+        <w:t xml:space="preserve">The display can be set to dim automatically after a specified number of seconds. This is used to save battery power since the backlight </w:t>
+      </w:r>
+      <w:r>
+        <w:t>uses a significant amount.</w:t>
+      </w:r>
+    </w:p>
+    <w:p>
+      <w:pPr>
+        <w:pStyle w:val="Heading4"/>
+      </w:pPr>
+      <w:r>
+        <w:t>Bright Value: 1-100</w:t>
+      </w:r>
+      <w:r>
+        <w:t>%</w:t>
+      </w:r>
+    </w:p>
+    <w:p>
+      <w:r>
+        <w:t>Set the display brightness value.</w:t>
+      </w:r>
+    </w:p>
+    <w:p>
+      <w:pPr>
+        <w:pStyle w:val="Heading4"/>
+      </w:pPr>
+      <w:r>
+        <w:t xml:space="preserve">Dim Value: </w:t>
+      </w:r>
+      <w:r>
+        <w:t>0-100%</w:t>
+      </w:r>
+    </w:p>
+    <w:p>
+      <w:r>
+        <w:t xml:space="preserve">Set the display brightness after the </w:t>
+      </w:r>
+      <w:r>
+        <w:t>timer below expires.</w:t>
+      </w:r>
+    </w:p>
+    <w:p>
+      <w:pPr>
+        <w:pStyle w:val="Heading4"/>
+      </w:pPr>
+      <w:r>
+        <w:t>Display Dim Time:</w:t>
+      </w:r>
+      <w:r>
+        <w:t xml:space="preserve"> 0-120 S</w:t>
+      </w:r>
+    </w:p>
+    <w:p>
+      <w:r>
+        <w:t>Specify the time until the display changes to dim mode.</w:t>
+      </w:r>
+    </w:p>
+    <w:p>
+      <w:pPr>
+        <w:pStyle w:val="Heading4"/>
+      </w:pPr>
+      <w:r>
+        <w:t>+Sideways Scroll Settings</w:t>
+      </w:r>
+    </w:p>
+    <w:p>
+      <w:r>
+        <w:t xml:space="preserve">Lines of text that </w:t>
+      </w:r>
+      <w:proofErr w:type="gramStart"/>
+      <w:r>
+        <w:t>too</w:t>
+      </w:r>
+      <w:proofErr w:type="gramEnd"/>
+      <w:r>
+        <w:t xml:space="preserve"> long for the display will scroll back and forth. The following settings control the speed.</w:t>
+      </w:r>
+    </w:p>
+    <w:p>
+      <w:pPr>
+        <w:pStyle w:val="Heading5"/>
+      </w:pPr>
+      <w:r>
+        <w:t xml:space="preserve">Speed: </w:t>
+      </w:r>
+      <w:r>
+        <w:t>1-1000 mS</w:t>
+      </w:r>
+    </w:p>
+    <w:p>
+      <w:r>
+        <w:t>Controls the speed of text moving to the left.</w:t>
+      </w:r>
+    </w:p>
+    <w:p>
+      <w:pPr>
+        <w:pStyle w:val="Heading5"/>
+      </w:pPr>
+      <w:r>
+        <w:lastRenderedPageBreak/>
+        <w:t>Pause: 1-100</w:t>
+      </w:r>
+      <w:r>
+        <w:t xml:space="preserve"> mS</w:t>
+      </w:r>
+    </w:p>
+    <w:p>
+      <w:r>
+        <w:t>This controls the pause when the text is at the end (all the way to the left).</w:t>
+      </w:r>
+    </w:p>
+    <w:p>
+      <w:pPr>
+        <w:pStyle w:val="Heading5"/>
+      </w:pPr>
+      <w:r>
+        <w:t>Reverse Speed: 1-20x</w:t>
+      </w:r>
+    </w:p>
+    <w:p>
+      <w:r>
+        <w:t xml:space="preserve">This is how fast the text scrolls </w:t>
+      </w:r>
+      <w:r>
+        <w:t>back to the beginning (to the right). 2x means twice as fast as the text scroll</w:t>
+      </w:r>
+      <w:r>
+        <w:t>ed to the left</w:t>
       </w:r>
       <w:r>
         <w:t>.</w:t>
@@ -2955,24 +4917,102 @@
     </w:p>
     <w:p>
       <w:pPr>
+        <w:pStyle w:val="Heading4"/>
+      </w:pPr>
+      <w:r>
+        <w:t xml:space="preserve">Menu Selection: </w:t>
+      </w:r>
+      <w:r>
+        <w:t>Color|*</w:t>
+      </w:r>
+    </w:p>
+    <w:p>
+      <w:r>
+        <w:t>Menu selections</w:t>
+      </w:r>
+      <w:r>
+        <w:t xml:space="preserve"> and selections from a list can be either colored or marked with </w:t>
+      </w:r>
+      <w:proofErr w:type="gramStart"/>
+      <w:r>
+        <w:t>the ‘*</w:t>
+      </w:r>
+      <w:proofErr w:type="gramEnd"/>
+      <w:r>
+        <w:t>’ character.</w:t>
+      </w:r>
+    </w:p>
+    <w:p>
+      <w:pPr>
+        <w:pStyle w:val="Heading4"/>
+      </w:pPr>
+      <w:r>
+        <w:t>Text/</w:t>
+      </w:r>
+      <w:proofErr w:type="spellStart"/>
+      <w:r>
+        <w:t>HiLite</w:t>
+      </w:r>
+      <w:proofErr w:type="spellEnd"/>
+      <w:r>
+        <w:t xml:space="preserve"> Colors</w:t>
+      </w:r>
+    </w:p>
+    <w:p>
+      <w:r>
+        <w:t xml:space="preserve">This selection </w:t>
+      </w:r>
+      <w:proofErr w:type="gramStart"/>
+      <w:r>
+        <w:t>allows for choosing</w:t>
+      </w:r>
+      <w:proofErr w:type="gramEnd"/>
+      <w:r>
+        <w:t xml:space="preserve"> the colors of the text and the highlight. The background screen is always black.</w:t>
+      </w:r>
+    </w:p>
+    <w:p>
+      <w:pPr>
         <w:pStyle w:val="Heading3"/>
       </w:pPr>
       <w:r>
-        <w:t>TX Pause:10-1200 Sec</w:t>
-      </w:r>
-    </w:p>
-    <w:p>
-      <w:r>
-        <w:t xml:space="preserve">This is the </w:t>
-      </w:r>
-      <w:r>
-        <w:t>pause</w:t>
-      </w:r>
-      <w:r>
-        <w:t xml:space="preserve"> between transmissions</w:t>
-      </w:r>
-      <w:r>
-        <w:t>. Longer times let the radio cool off and save the battery for longer run times.</w:t>
+        <w:t>+Dial &amp; Button Settings</w:t>
+      </w:r>
+    </w:p>
+    <w:p>
+      <w:pPr>
+        <w:pStyle w:val="Heading4"/>
+      </w:pPr>
+      <w:r>
+        <w:t xml:space="preserve">Direction: </w:t>
+      </w:r>
+      <w:proofErr w:type="spellStart"/>
+      <w:proofErr w:type="gramStart"/>
+      <w:r>
+        <w:t>Normal:Reverse</w:t>
+      </w:r>
+      <w:proofErr w:type="spellEnd"/>
+      <w:proofErr w:type="gramEnd"/>
+    </w:p>
+    <w:p>
+      <w:r>
+        <w:t>If you really want the button to be the other way around this is the choice for you.</w:t>
+      </w:r>
+    </w:p>
+    <w:p>
+      <w:pPr>
+        <w:pStyle w:val="Heading4"/>
+      </w:pPr>
+      <w:r>
+        <w:t>Long Press Timer: 2-200</w:t>
+      </w:r>
+    </w:p>
+    <w:p>
+      <w:r>
+        <w:t>This value affects how long or short a long press is. The default value is normally OK</w:t>
+      </w:r>
+      <w:r>
+        <w:t>, but somebody might want to change it.</w:t>
       </w:r>
     </w:p>
     <w:p>
@@ -2980,12 +5020,92 @@
         <w:pStyle w:val="Heading3"/>
       </w:pPr>
       <w:r>
-        <w:t>TX Send Min: 10-90 Sec</w:t>
-      </w:r>
-    </w:p>
-    <w:p>
-      <w:r>
-        <w:t>In random mode this is the minimum send time.</w:t>
+        <w:t>+Battery Settings</w:t>
+      </w:r>
+    </w:p>
+    <w:p>
+      <w:r>
+        <w:t xml:space="preserve">Since the PCB was designed with 10% resistors for measuring the battery voltage some calibration is needed. A future PCB will probably use better </w:t>
+      </w:r>
+      <w:proofErr w:type="gramStart"/>
+      <w:r>
+        <w:t>resistors</w:t>
+      </w:r>
+      <w:proofErr w:type="gramEnd"/>
+      <w:r>
+        <w:t xml:space="preserve"> so this won’t be needed.</w:t>
+      </w:r>
+    </w:p>
+    <w:p>
+      <w:pPr>
+        <w:pStyle w:val="Heading4"/>
+      </w:pPr>
+      <w:r>
+        <w:t xml:space="preserve">Show Battery: </w:t>
+      </w:r>
+      <w:proofErr w:type="spellStart"/>
+      <w:r>
+        <w:t>Yes|No</w:t>
+      </w:r>
+      <w:proofErr w:type="spellEnd"/>
+    </w:p>
+    <w:p>
+      <w:r>
+        <w:t xml:space="preserve">This option controls the </w:t>
+      </w:r>
+      <w:r>
+        <w:t>battery display on the bottom right of the display.</w:t>
+      </w:r>
+    </w:p>
+    <w:p>
+      <w:pPr>
+        <w:pStyle w:val="Heading4"/>
+      </w:pPr>
+      <w:r>
+        <w:t>Full Battery: 2000-4000</w:t>
+      </w:r>
+    </w:p>
+    <w:p>
+      <w:r>
+        <w:t>This is the value that indicates a full 4.2V battery.</w:t>
+      </w:r>
+    </w:p>
+    <w:p>
+      <w:pPr>
+        <w:pStyle w:val="Heading4"/>
+      </w:pPr>
+      <w:r>
+        <w:t>Set Full Battery</w:t>
+      </w:r>
+    </w:p>
+    <w:p>
+      <w:r>
+        <w:t>This selection reads the current battery values and stores it. It is best set by fully charging the battery and then disconnecting the charger. Wait a couple of minutes and then use it several times until it seems stable.</w:t>
+      </w:r>
+    </w:p>
+    <w:p>
+      <w:pPr>
+        <w:pStyle w:val="Heading4"/>
+      </w:pPr>
+      <w:r>
+        <w:lastRenderedPageBreak/>
+        <w:t>Read Battery Raw Data</w:t>
+      </w:r>
+    </w:p>
+    <w:p>
+      <w:r>
+        <w:t>This continuously reads the battery value</w:t>
+      </w:r>
+      <w:r>
+        <w:t xml:space="preserve">. It was originally used for testing, but it seems like it might possibly be </w:t>
+      </w:r>
+      <w:proofErr w:type="gramStart"/>
+      <w:r>
+        <w:t>useful</w:t>
+      </w:r>
+      <w:proofErr w:type="gramEnd"/>
+      <w:r>
+        <w:t xml:space="preserve"> so it was left in the menu system.</w:t>
       </w:r>
     </w:p>
     <w:p>
@@ -2993,18 +5113,37 @@
         <w:pStyle w:val="Heading3"/>
       </w:pPr>
       <w:r>
-        <w:t xml:space="preserve">TX Send Max: </w:t>
-      </w:r>
-      <w:r>
-        <w:t>10-90 Sec</w:t>
-      </w:r>
-    </w:p>
-    <w:p>
-      <w:r>
-        <w:t xml:space="preserve">In </w:t>
-      </w:r>
-      <w:r>
-        <w:t>random mode this is the maximum send time.</w:t>
+        <w:t>New Version BIN File</w:t>
+      </w:r>
+    </w:p>
+    <w:p>
+      <w:r>
+        <w:t xml:space="preserve">New firmware can be loaded by putting </w:t>
+      </w:r>
+      <w:r>
+        <w:t xml:space="preserve">the binary file on the SD card. It must be named </w:t>
+      </w:r>
+      <w:proofErr w:type="spellStart"/>
+      <w:r>
+        <w:t>RadioFox.BIN</w:t>
+      </w:r>
+      <w:proofErr w:type="spellEnd"/>
+      <w:r>
+        <w:t>.</w:t>
+      </w:r>
+      <w:r>
+        <w:t xml:space="preserve"> There are two prompts, one to confirm </w:t>
+      </w:r>
+      <w:proofErr w:type="gramStart"/>
+      <w:r>
+        <w:t>overwriting</w:t>
+      </w:r>
+      <w:proofErr w:type="gramEnd"/>
+      <w:r>
+        <w:t xml:space="preserve"> the firmware, and another to allow deletion of the </w:t>
+      </w:r>
+      <w:r>
+        <w:t>BIN file after installation.</w:t>
       </w:r>
     </w:p>
     <w:p>
@@ -3012,12 +5151,24 @@
         <w:pStyle w:val="Heading3"/>
       </w:pPr>
       <w:r>
-        <w:t>TX Pause Min: 10-1200 Sec</w:t>
-      </w:r>
-    </w:p>
-    <w:p>
-      <w:r>
-        <w:t>In random mode this is the minimum pause time.</w:t>
+        <w:t>Factory Settings</w:t>
+      </w:r>
+    </w:p>
+    <w:p>
+      <w:r>
+        <w:t xml:space="preserve">This command resets </w:t>
+      </w:r>
+      <w:r>
+        <w:t xml:space="preserve">all </w:t>
+      </w:r>
+      <w:r>
+        <w:t>settings</w:t>
+      </w:r>
+      <w:r>
+        <w:t xml:space="preserve"> except the high battery value to the original factory values.</w:t>
+      </w:r>
+      <w:r>
+        <w:t xml:space="preserve"> The factory reset can also be done by holding the dial button down while turning the power on.</w:t>
       </w:r>
     </w:p>
     <w:p>
@@ -3025,25 +5176,34 @@
         <w:pStyle w:val="Heading3"/>
       </w:pPr>
       <w:r>
-        <w:t>TX Pause Max: 10-1200 Sec</w:t>
-      </w:r>
-    </w:p>
-    <w:p>
-      <w:r>
-        <w:t>In random mode this is the maximum pause time.</w:t>
-      </w:r>
-    </w:p>
-    <w:p>
-      <w:pPr>
-        <w:pStyle w:val="Heading3"/>
-      </w:pPr>
-      <w:r>
-        <w:t>Radio Pause: Sleep|Awake</w:t>
-      </w:r>
-    </w:p>
-    <w:p>
-      <w:r>
-        <w:t>During pause time the radio can be put into sleep mode. This lowers the power consumption and lets the battery last longer. However note that this also means that the DTMF commands are disabled since the radio is asleep!</w:t>
+        <w:t>Format EEPROM</w:t>
+      </w:r>
+    </w:p>
+    <w:p>
+      <w:r>
+        <w:t xml:space="preserve">This will clear </w:t>
+      </w:r>
+      <w:r>
+        <w:t xml:space="preserve">and reset </w:t>
+      </w:r>
+      <w:r>
+        <w:t xml:space="preserve">the </w:t>
+      </w:r>
+      <w:proofErr w:type="spellStart"/>
+      <w:r>
+        <w:t>eeprom</w:t>
+      </w:r>
+      <w:proofErr w:type="spellEnd"/>
+      <w:r>
+        <w:t xml:space="preserve"> where the settings are </w:t>
+      </w:r>
+      <w:proofErr w:type="gramStart"/>
+      <w:r>
+        <w:t>save</w:t>
+      </w:r>
+      <w:proofErr w:type="gramEnd"/>
+      <w:r>
+        <w:t xml:space="preserve"> in non-volatile memory. This is how settings are saved while the system is not powered.</w:t>
       </w:r>
     </w:p>
     <w:p>
@@ -3051,673 +5211,31 @@
         <w:pStyle w:val="Heading2"/>
       </w:pPr>
       <w:r>
-        <w:t>+</w:t>
-      </w:r>
-      <w:r>
-        <w:t>More Radio Settings</w:t>
-      </w:r>
-    </w:p>
-    <w:p>
-      <w:pPr>
-        <w:pStyle w:val="Heading3"/>
-      </w:pPr>
-      <w:r>
-        <w:t>RX Offset: -600|0|+600 kHz</w:t>
-      </w:r>
-    </w:p>
-    <w:p>
-      <w:r>
-        <w:t>This is the frequency offset from the transmit frequency that the radio uses to receive DTMF commands</w:t>
-      </w:r>
-      <w:r>
-        <w:t>. An offset is recommended. If 0 is used the radio will only listen when it isn’t sending. It has not been tested if it listens during sending when the offset is not 0.</w:t>
-      </w:r>
-    </w:p>
-    <w:p>
-      <w:pPr>
-        <w:pStyle w:val="Heading3"/>
-      </w:pPr>
-      <w:r>
-        <w:t>Bandwidth: 12.5|</w:t>
-      </w:r>
-      <w:r>
-        <w:t>25 kHz</w:t>
-      </w:r>
-    </w:p>
-    <w:p>
-      <w:r>
-        <w:t>This sets the radio bandwidth</w:t>
-      </w:r>
-      <w:r>
-        <w:t>. It has not been tested much to see what effect it has on performance yet.</w:t>
-      </w:r>
-    </w:p>
-    <w:p>
-      <w:pPr>
-        <w:pStyle w:val="Heading3"/>
-      </w:pPr>
-      <w:r>
-        <w:t>CTCSS/DCS: CTCSS|DCS</w:t>
-      </w:r>
-    </w:p>
-    <w:p>
-      <w:r>
-        <w:t xml:space="preserve">This sets the </w:t>
-      </w:r>
-      <w:r>
-        <w:t>un-squelch</w:t>
-      </w:r>
-      <w:r>
-        <w:t xml:space="preserve"> values</w:t>
-      </w:r>
-      <w:r>
-        <w:t xml:space="preserve"> for either the analog or digital versions.</w:t>
-      </w:r>
-    </w:p>
-    <w:p>
-      <w:pPr>
-        <w:pStyle w:val="Heading3"/>
-      </w:pPr>
-      <w:r>
-        <w:lastRenderedPageBreak/>
-        <w:t>TX CTCSS:</w:t>
-      </w:r>
-      <w:r>
-        <w:t xml:space="preserve"> None</w:t>
-      </w:r>
-      <w:r>
-        <w:t>|</w:t>
-      </w:r>
-      <w:r>
-        <w:t>67-</w:t>
-      </w:r>
-      <w:r>
-        <w:t>250.3</w:t>
-      </w:r>
-    </w:p>
-    <w:p>
-      <w:r>
-        <w:t>Analog un-squelch frequencies sent out.</w:t>
-      </w:r>
-    </w:p>
-    <w:p>
-      <w:pPr>
-        <w:pStyle w:val="Heading3"/>
-      </w:pPr>
-      <w:r>
-        <w:t>RX CTCSS:</w:t>
-      </w:r>
-      <w:r>
-        <w:t xml:space="preserve"> None|67-250.3</w:t>
-      </w:r>
-    </w:p>
-    <w:p>
-      <w:r>
-        <w:t>Analog un-squelch frequency for receiving.</w:t>
-      </w:r>
-    </w:p>
-    <w:p>
-      <w:pPr>
-        <w:pStyle w:val="Heading3"/>
-      </w:pPr>
-      <w:r>
-        <w:t>TX DCS:</w:t>
-      </w:r>
-      <w:r>
-        <w:t xml:space="preserve"> None|023-754</w:t>
-      </w:r>
-    </w:p>
-    <w:p>
-      <w:r>
-        <w:t>Digital un-squelch value for sending.</w:t>
-      </w:r>
-    </w:p>
-    <w:p>
-      <w:pPr>
-        <w:pStyle w:val="Heading3"/>
-      </w:pPr>
-      <w:r>
-        <w:t>TX I/N: I|N</w:t>
-      </w:r>
-    </w:p>
-    <w:p>
-      <w:r>
-        <w:t>The digital I or N value for sending.</w:t>
-      </w:r>
-    </w:p>
-    <w:p>
-      <w:pPr>
-        <w:pStyle w:val="Heading3"/>
-      </w:pPr>
-      <w:r>
-        <w:t>RX DCS: None|023-754</w:t>
-      </w:r>
-    </w:p>
-    <w:p>
-      <w:r>
-        <w:t>Digital un-squelch value for receiving.</w:t>
-      </w:r>
-    </w:p>
-    <w:p>
-      <w:pPr>
-        <w:pStyle w:val="Heading3"/>
-      </w:pPr>
-      <w:r>
-        <w:t>RX I/N: I|N</w:t>
-      </w:r>
-    </w:p>
-    <w:p>
-      <w:r>
-        <w:t>The digital I or N value for receiving.</w:t>
-      </w:r>
-    </w:p>
-    <w:p>
-      <w:pPr>
-        <w:pStyle w:val="Heading3"/>
-      </w:pPr>
-      <w:r>
-        <w:t>RX Volume:</w:t>
-      </w:r>
-      <w:r>
-        <w:t xml:space="preserve"> 1-6</w:t>
-      </w:r>
-    </w:p>
-    <w:p>
-      <w:r>
-        <w:t>This is the receive volume setting. It affects how well DTMF tones are detected.</w:t>
-      </w:r>
-    </w:p>
-    <w:p>
-      <w:pPr>
-        <w:pStyle w:val="Heading3"/>
-      </w:pPr>
-      <w:r>
-        <w:t>RX Squelch:</w:t>
-      </w:r>
-      <w:r>
-        <w:t xml:space="preserve"> 0-8</w:t>
-      </w:r>
-    </w:p>
-    <w:p>
-      <w:r>
-        <w:t>This affects how much signal is required to receive the DTMF signals.</w:t>
-      </w:r>
-    </w:p>
-    <w:p>
-      <w:pPr>
-        <w:pStyle w:val="Heading2"/>
-      </w:pPr>
-      <w:r>
-        <w:t>Cancel Waits/TX Now</w:t>
-      </w:r>
-    </w:p>
-    <w:p>
-      <w:r>
-        <w:t>When the radio is in either send or pause mode this command will cancel the timer and the next mo</w:t>
-      </w:r>
-      <w:r>
-        <w:t xml:space="preserve">de will start. For </w:t>
-      </w:r>
-      <w:r>
-        <w:t>example,</w:t>
-      </w:r>
-      <w:r>
-        <w:t xml:space="preserve"> if you want to cancel</w:t>
-      </w:r>
-      <w:r>
-        <w:t xml:space="preserve"> the pause and go to transmit, use this option. It can also be done by long pressing B0.</w:t>
-      </w:r>
-    </w:p>
-    <w:p>
-      <w:pPr>
-        <w:pStyle w:val="Heading2"/>
-      </w:pPr>
-      <w:r>
-        <w:t>+Saved Settings Files</w:t>
-      </w:r>
-    </w:p>
-    <w:p>
-      <w:r>
-        <w:t>Saved settings files are named files stored on the SD card. They are useful to</w:t>
-      </w:r>
-      <w:r>
-        <w:t xml:space="preserve"> quickly configure the radio for different uses. All values except the battery calibration are affected.</w:t>
-      </w:r>
-    </w:p>
-    <w:p>
-      <w:pPr>
-        <w:pStyle w:val="Heading3"/>
-      </w:pPr>
-      <w:r>
-        <w:t>Create File</w:t>
-      </w:r>
-    </w:p>
-    <w:p>
-      <w:r>
-        <w:t>This prompts the user for a name. The file is then created using the current system settings.</w:t>
-      </w:r>
-    </w:p>
-    <w:p>
-      <w:pPr>
-        <w:pStyle w:val="Heading3"/>
-      </w:pPr>
-      <w:r>
-        <w:lastRenderedPageBreak/>
-        <w:t>Save/Update File</w:t>
-      </w:r>
-    </w:p>
-    <w:p>
-      <w:r>
-        <w:t>This command saves the current settings into the selected file. If it already exists the user will be asked to confirm overwriting the file.</w:t>
-      </w:r>
-    </w:p>
-    <w:p>
-      <w:pPr>
-        <w:pStyle w:val="Heading3"/>
-      </w:pPr>
-      <w:r>
-        <w:t>Load File</w:t>
-      </w:r>
-    </w:p>
-    <w:p>
-      <w:r>
-        <w:t>This command asks the user for the name and then sets all of the system settings except the battery calibration using the values in the file.</w:t>
-      </w:r>
-    </w:p>
-    <w:p>
-      <w:pPr>
-        <w:pStyle w:val="Heading3"/>
-      </w:pPr>
-      <w:r>
-        <w:t>Delete File</w:t>
-      </w:r>
-    </w:p>
-    <w:p>
-      <w:r>
-        <w:t>The user selects a file from the list and then it can be deleted.</w:t>
-      </w:r>
-    </w:p>
-    <w:p>
-      <w:pPr>
-        <w:pStyle w:val="Heading2"/>
-      </w:pPr>
-      <w:r>
-        <w:t>+System Settings</w:t>
-      </w:r>
-    </w:p>
-    <w:p>
-      <w:pPr>
-        <w:pStyle w:val="Heading3"/>
-      </w:pPr>
-      <w:r>
-        <w:t>+Display</w:t>
-      </w:r>
-      <w:r>
-        <w:t xml:space="preserve"> Settings</w:t>
-      </w:r>
-    </w:p>
-    <w:p>
-      <w:pPr>
-        <w:pStyle w:val="Heading4"/>
-      </w:pPr>
-      <w:r>
-        <w:t>Dimming Mode: None</w:t>
-      </w:r>
-      <w:r>
-        <w:t>|Timer</w:t>
-      </w:r>
-    </w:p>
-    <w:p>
-      <w:r>
-        <w:t xml:space="preserve">The display can be set to dim automatically after a specified number of seconds. This is used to save battery power since the backlight </w:t>
-      </w:r>
-      <w:r>
-        <w:t>uses a significant amount.</w:t>
-      </w:r>
-    </w:p>
-    <w:p>
-      <w:pPr>
-        <w:pStyle w:val="Heading4"/>
-      </w:pPr>
-      <w:r>
-        <w:t>Bright Value: 1-100</w:t>
-      </w:r>
-      <w:r>
-        <w:t>%</w:t>
-      </w:r>
-    </w:p>
-    <w:p>
-      <w:r>
-        <w:t>Set the display brightness value.</w:t>
-      </w:r>
-    </w:p>
-    <w:p>
-      <w:pPr>
-        <w:pStyle w:val="Heading4"/>
-      </w:pPr>
-      <w:r>
-        <w:t xml:space="preserve">Dim Value: </w:t>
-      </w:r>
-      <w:r>
-        <w:t>0-100%</w:t>
-      </w:r>
-    </w:p>
-    <w:p>
-      <w:r>
-        <w:t xml:space="preserve">Set the display brightness after the </w:t>
-      </w:r>
-      <w:r>
-        <w:t>timer below expires.</w:t>
-      </w:r>
-    </w:p>
-    <w:p>
-      <w:pPr>
-        <w:pStyle w:val="Heading4"/>
-      </w:pPr>
-      <w:r>
-        <w:t>Display Dim Time:</w:t>
-      </w:r>
-      <w:r>
-        <w:t xml:space="preserve"> 0-120 S</w:t>
-      </w:r>
-    </w:p>
-    <w:p>
-      <w:r>
-        <w:t>Specify the time until the display changes to dim mode.</w:t>
-      </w:r>
-    </w:p>
-    <w:p>
-      <w:pPr>
-        <w:pStyle w:val="Heading4"/>
-      </w:pPr>
-      <w:r>
-        <w:t>+Sideways Scroll Settings</w:t>
-      </w:r>
-    </w:p>
-    <w:p>
-      <w:r>
-        <w:t>Lines of text that too long for the display will scroll back and forth. The following settings control the speed.</w:t>
-      </w:r>
-    </w:p>
-    <w:p>
-      <w:pPr>
-        <w:pStyle w:val="Heading5"/>
-      </w:pPr>
-      <w:r>
-        <w:t xml:space="preserve">Speed: </w:t>
-      </w:r>
-      <w:r>
-        <w:t>1-1000 mS</w:t>
-      </w:r>
-    </w:p>
-    <w:p>
-      <w:r>
-        <w:t>Controls the speed of text moving to the left.</w:t>
-      </w:r>
-    </w:p>
-    <w:p>
-      <w:pPr>
-        <w:pStyle w:val="Heading5"/>
-      </w:pPr>
-      <w:r>
-        <w:t>Pause: 1-100</w:t>
-      </w:r>
-      <w:r>
-        <w:t xml:space="preserve"> mS</w:t>
-      </w:r>
-    </w:p>
-    <w:p>
-      <w:r>
-        <w:t>This controls the pause when the text is at the end (all the way to the left).</w:t>
-      </w:r>
-    </w:p>
-    <w:p>
-      <w:pPr>
-        <w:pStyle w:val="Heading5"/>
-      </w:pPr>
-      <w:r>
-        <w:lastRenderedPageBreak/>
-        <w:t>Reverse Speed: 1-20x</w:t>
-      </w:r>
-    </w:p>
-    <w:p>
-      <w:r>
-        <w:t xml:space="preserve">This is how fast the text scrolls </w:t>
-      </w:r>
-      <w:r>
-        <w:t>back to the beginning (to the right). 2x means twice as fast as the text scroll</w:t>
-      </w:r>
-      <w:r>
-        <w:t>ed to the left</w:t>
-      </w:r>
-      <w:r>
-        <w:t>.</w:t>
-      </w:r>
-    </w:p>
-    <w:p>
-      <w:pPr>
-        <w:pStyle w:val="Heading4"/>
-      </w:pPr>
-      <w:r>
-        <w:t xml:space="preserve">Menu Selection: </w:t>
-      </w:r>
-      <w:r>
-        <w:t>Color|*</w:t>
-      </w:r>
-    </w:p>
-    <w:p>
-      <w:r>
-        <w:t>Menu selections</w:t>
-      </w:r>
-      <w:r>
-        <w:t xml:space="preserve"> and selections from a list can be either colored or marked with the ‘*’ character.</w:t>
-      </w:r>
-    </w:p>
-    <w:p>
-      <w:pPr>
-        <w:pStyle w:val="Heading4"/>
-      </w:pPr>
-      <w:r>
-        <w:t>Text/HiLite Colors</w:t>
-      </w:r>
-    </w:p>
-    <w:p>
-      <w:r>
-        <w:t>This selection allows for choosing the colors of the text and the highlight. The background screen is always black.</w:t>
-      </w:r>
-    </w:p>
-    <w:p>
-      <w:pPr>
-        <w:pStyle w:val="Heading3"/>
-      </w:pPr>
-      <w:r>
-        <w:t>+Dial &amp; Button Settings</w:t>
-      </w:r>
-    </w:p>
-    <w:p>
-      <w:pPr>
-        <w:pStyle w:val="Heading4"/>
-      </w:pPr>
-      <w:r>
-        <w:t>Direction: Normal:Reverse</w:t>
-      </w:r>
-    </w:p>
-    <w:p>
-      <w:r>
-        <w:t>If you really want the button to be the other way around this is the choice for you.</w:t>
-      </w:r>
-    </w:p>
-    <w:p>
-      <w:pPr>
-        <w:pStyle w:val="Heading4"/>
-      </w:pPr>
-      <w:r>
-        <w:t>Long Press Timer: 2-200</w:t>
-      </w:r>
-    </w:p>
-    <w:p>
-      <w:r>
-        <w:t>This value affects how long or short a long press is. The default value is normally OK</w:t>
-      </w:r>
-      <w:r>
-        <w:t>, but somebody might want to change it.</w:t>
-      </w:r>
-    </w:p>
-    <w:p>
-      <w:pPr>
-        <w:pStyle w:val="Heading3"/>
-      </w:pPr>
-      <w:r>
-        <w:t>+Battery Settings</w:t>
-      </w:r>
-    </w:p>
-    <w:p>
-      <w:r>
-        <w:t>Since the PCB was designed with 10% resistors for measuring the battery voltage some calibration is needed. A future PCB will probably use better resistors so this won’t be needed.</w:t>
-      </w:r>
-    </w:p>
-    <w:p>
-      <w:pPr>
-        <w:pStyle w:val="Heading4"/>
-      </w:pPr>
-      <w:r>
-        <w:t>Show Battery: Yes|No</w:t>
-      </w:r>
-    </w:p>
-    <w:p>
-      <w:r>
-        <w:t xml:space="preserve">This option controls the </w:t>
-      </w:r>
-      <w:r>
-        <w:t>battery display on the bottom right of the display.</w:t>
-      </w:r>
-    </w:p>
-    <w:p>
-      <w:pPr>
-        <w:pStyle w:val="Heading4"/>
-      </w:pPr>
-      <w:r>
-        <w:t>Full Battery: 2000-4000</w:t>
-      </w:r>
-    </w:p>
-    <w:p>
-      <w:r>
-        <w:t>This is the value that indicates a full 4.2V battery.</w:t>
-      </w:r>
-    </w:p>
-    <w:p>
-      <w:pPr>
-        <w:pStyle w:val="Heading4"/>
-      </w:pPr>
-      <w:r>
-        <w:t>Set Full Battery</w:t>
-      </w:r>
-    </w:p>
-    <w:p>
-      <w:r>
-        <w:t>This selection reads the current battery values and stores it. It is best set by fully charging the battery and then disconnecting the charger. Wait a couple of minutes and then use it several times until it seems stable.</w:t>
-      </w:r>
-    </w:p>
-    <w:p>
-      <w:pPr>
-        <w:pStyle w:val="Heading4"/>
-      </w:pPr>
-      <w:r>
-        <w:t>Read Battery Raw Data</w:t>
-      </w:r>
-    </w:p>
-    <w:p>
-      <w:r>
-        <w:t>This continuously reads the battery value</w:t>
-      </w:r>
-      <w:r>
-        <w:t>. It was originally used for testing, but it seems like it might possibly be useful so it was left in the menu system.</w:t>
-      </w:r>
-    </w:p>
-    <w:p>
-      <w:pPr>
-        <w:pStyle w:val="Heading3"/>
-      </w:pPr>
-      <w:r>
-        <w:lastRenderedPageBreak/>
-        <w:t>New Version BIN File</w:t>
-      </w:r>
-    </w:p>
-    <w:p>
-      <w:r>
-        <w:t xml:space="preserve">New firmware can be loaded by putting </w:t>
-      </w:r>
-      <w:r>
-        <w:t>the binary file on the SD card. It must be named RadioFox.BIN.</w:t>
-      </w:r>
-      <w:r>
-        <w:t xml:space="preserve"> There are two prompts, one to confirm overwriting the firmware, and another to allow deletion of the </w:t>
-      </w:r>
-      <w:r>
-        <w:t>BIN file after installation.</w:t>
-      </w:r>
-    </w:p>
-    <w:p>
-      <w:pPr>
-        <w:pStyle w:val="Heading3"/>
-      </w:pPr>
-      <w:r>
-        <w:t>Factory Settings</w:t>
-      </w:r>
-    </w:p>
-    <w:p>
-      <w:r>
-        <w:t xml:space="preserve">This command resets </w:t>
-      </w:r>
-      <w:r>
-        <w:t xml:space="preserve">all </w:t>
-      </w:r>
-      <w:r>
-        <w:t>settings</w:t>
-      </w:r>
-      <w:r>
-        <w:t xml:space="preserve"> except the high battery value to the original factory values.</w:t>
-      </w:r>
-      <w:r>
-        <w:t xml:space="preserve"> The factory reset can also be done by holding the dial button down while turning the power on.</w:t>
-      </w:r>
-    </w:p>
-    <w:p>
-      <w:pPr>
-        <w:pStyle w:val="Heading3"/>
-      </w:pPr>
-      <w:r>
-        <w:t>Format EEPROM</w:t>
-      </w:r>
-    </w:p>
-    <w:p>
-      <w:r>
-        <w:t xml:space="preserve">This will clear </w:t>
-      </w:r>
-      <w:r>
-        <w:t xml:space="preserve">and reset </w:t>
-      </w:r>
-      <w:r>
-        <w:t>the eeprom where the settings are save</w:t>
-      </w:r>
-      <w:r>
-        <w:t xml:space="preserve"> in non-volatile memory. This is how settings are saved while the system is not powered.</w:t>
-      </w:r>
-    </w:p>
-    <w:p>
-      <w:pPr>
-        <w:pStyle w:val="Heading2"/>
-      </w:pPr>
-      <w:r>
         <w:t>Save Current Settings</w:t>
       </w:r>
     </w:p>
     <w:p>
       <w:r>
-        <w:t>This stores all of the current settings in the non-volatile memory</w:t>
-      </w:r>
-      <w:r>
-        <w:t>. Note that this is not often used since settings are normally saved each time they are changed.</w:t>
+        <w:t xml:space="preserve">This stores </w:t>
+      </w:r>
+      <w:proofErr w:type="gramStart"/>
+      <w:r>
+        <w:t>all of</w:t>
+      </w:r>
+      <w:proofErr w:type="gramEnd"/>
+      <w:r>
+        <w:t xml:space="preserve"> the current settings in the non-volatile memory</w:t>
+      </w:r>
+      <w:r>
+        <w:t xml:space="preserve">. Note that this is not often used since settings are normally saved each </w:t>
+      </w:r>
+      <w:proofErr w:type="gramStart"/>
+      <w:r>
+        <w:t>time</w:t>
+      </w:r>
+      <w:proofErr w:type="gramEnd"/>
+      <w:r>
+        <w:t xml:space="preserve"> they are changed.</w:t>
       </w:r>
     </w:p>
     <w:p>
@@ -3779,6 +5297,7 @@
         <w:docPartUnique/>
       </w:docPartObj>
     </w:sdtPr>
+    <w:sdtEndPr/>
     <w:sdtContent>
       <w:sdt>
         <w:sdtPr>
@@ -3788,6 +5307,7 @@
             <w:docPartUnique/>
           </w:docPartObj>
         </w:sdtPr>
+        <w:sdtEndPr/>
         <w:sdtContent>
           <w:p>
             <w:pPr>

</xml_diff>

<commit_message>
Noted that SD card is limited 32GB.
</commit_message>
<xml_diff>
--- a/RadioFox.docx
+++ b/RadioFox.docx
@@ -266,7 +266,15 @@
         <w:t xml:space="preserve">The </w:t>
       </w:r>
       <w:r>
-        <w:t>device is charged using the USB-C connector. There is a flaw on the PCB that requires</w:t>
+        <w:t xml:space="preserve">device is charged using the USB-C connector. There is a flaw </w:t>
+      </w:r>
+      <w:proofErr w:type="gramStart"/>
+      <w:r>
+        <w:t>on</w:t>
+      </w:r>
+      <w:proofErr w:type="gramEnd"/>
+      <w:r>
+        <w:t xml:space="preserve"> the PCB that requires</w:t>
       </w:r>
       <w:r>
         <w:t xml:space="preserve"> a USB-A to USB-C cable. This </w:t>
@@ -346,47 +354,99 @@
         <w:t xml:space="preserve">he source code can be found at </w:t>
       </w:r>
       <w:hyperlink r:id="rId9" w:history="1">
+        <w:proofErr w:type="spellStart"/>
         <w:r>
           <w:rPr>
             <w:rStyle w:val="Hyperlink"/>
           </w:rPr>
-          <w:t>MartinNohr/RadioFox: Ham Radio Fox Software</w:t>
+          <w:t>MartinNohr</w:t>
         </w:r>
-      </w:hyperlink>
-    </w:p>
-    <w:p>
-      <w:pPr>
-        <w:pStyle w:val="Heading3"/>
-      </w:pPr>
-      <w:r>
-        <w:t xml:space="preserve">Arduino </w:t>
-      </w:r>
-      <w:r>
-        <w:t>Library Code Versions</w:t>
-      </w:r>
-    </w:p>
-    <w:p>
-      <w:r>
-        <w:t>The source code</w:t>
-      </w:r>
-      <w:r>
-        <w:t xml:space="preserve"> for the radio</w:t>
-      </w:r>
-      <w:r>
-        <w:t xml:space="preserve"> is available here: </w:t>
-      </w:r>
-      <w:hyperlink r:id="rId10" w:history="1">
+        <w:proofErr w:type="spellEnd"/>
         <w:r>
           <w:rPr>
             <w:rStyle w:val="Hyperlink"/>
           </w:rPr>
-          <w:t>MartinNohr/RadioFox: Ham Radio Fox Software</w:t>
+          <w:t>/</w:t>
+        </w:r>
+        <w:proofErr w:type="spellStart"/>
+        <w:r>
+          <w:rPr>
+            <w:rStyle w:val="Hyperlink"/>
+          </w:rPr>
+          <w:t>RadioFox</w:t>
+        </w:r>
+        <w:proofErr w:type="spellEnd"/>
+        <w:r>
+          <w:rPr>
+            <w:rStyle w:val="Hyperlink"/>
+          </w:rPr>
+          <w:t>: Ham Radio Fox Software</w:t>
         </w:r>
       </w:hyperlink>
     </w:p>
     <w:p>
-      <w:r>
-        <w:t xml:space="preserve">VS Code IDE with the pioarduino extension </w:t>
+      <w:pPr>
+        <w:pStyle w:val="Heading3"/>
+      </w:pPr>
+      <w:r>
+        <w:t xml:space="preserve">Arduino </w:t>
+      </w:r>
+      <w:r>
+        <w:t>Library Code Versions</w:t>
+      </w:r>
+    </w:p>
+    <w:p>
+      <w:r>
+        <w:t>The source code</w:t>
+      </w:r>
+      <w:r>
+        <w:t xml:space="preserve"> for the radio</w:t>
+      </w:r>
+      <w:r>
+        <w:t xml:space="preserve"> is available here: </w:t>
+      </w:r>
+      <w:hyperlink r:id="rId10" w:history="1">
+        <w:proofErr w:type="spellStart"/>
+        <w:r>
+          <w:rPr>
+            <w:rStyle w:val="Hyperlink"/>
+          </w:rPr>
+          <w:t>MartinNohr</w:t>
+        </w:r>
+        <w:proofErr w:type="spellEnd"/>
+        <w:r>
+          <w:rPr>
+            <w:rStyle w:val="Hyperlink"/>
+          </w:rPr>
+          <w:t>/</w:t>
+        </w:r>
+        <w:proofErr w:type="spellStart"/>
+        <w:r>
+          <w:rPr>
+            <w:rStyle w:val="Hyperlink"/>
+          </w:rPr>
+          <w:t>RadioFox</w:t>
+        </w:r>
+        <w:proofErr w:type="spellEnd"/>
+        <w:r>
+          <w:rPr>
+            <w:rStyle w:val="Hyperlink"/>
+          </w:rPr>
+          <w:t>: Ham Radio Fox Software</w:t>
+        </w:r>
+      </w:hyperlink>
+    </w:p>
+    <w:p>
+      <w:r>
+        <w:t xml:space="preserve">VS Code IDE with the </w:t>
+      </w:r>
+      <w:proofErr w:type="spellStart"/>
+      <w:r>
+        <w:t>pioarduino</w:t>
+      </w:r>
+      <w:proofErr w:type="spellEnd"/>
+      <w:r>
+        <w:t xml:space="preserve"> extension </w:t>
       </w:r>
       <w:r>
         <w:t>is used for compiling the code.</w:t>
@@ -431,13 +491,29 @@
         <w:t xml:space="preserve"> The factory bin file is required since the partition table has been changed.</w:t>
       </w:r>
       <w:r>
-        <w:t xml:space="preserve"> You can also send the esp32 back to me and I will program it for free.</w:t>
-      </w:r>
-      <w:r>
-        <w:t xml:space="preserve"> I also put a file on the GitHub site called ./firmware/firmware</w:t>
-      </w:r>
-      <w:r>
-        <w:t xml:space="preserve">.factory.bin. This file contains all the partition information and the </w:t>
+        <w:t xml:space="preserve"> You can also send </w:t>
+      </w:r>
+      <w:proofErr w:type="gramStart"/>
+      <w:r>
+        <w:t>the esp32</w:t>
+      </w:r>
+      <w:proofErr w:type="gramEnd"/>
+      <w:r>
+        <w:t xml:space="preserve"> back to me and I will program it for free.</w:t>
+      </w:r>
+      <w:r>
+        <w:t xml:space="preserve"> I also put a file on the GitHub site called ./firmware/</w:t>
+      </w:r>
+      <w:proofErr w:type="spellStart"/>
+      <w:r>
+        <w:t>firmware</w:t>
+      </w:r>
+      <w:r>
+        <w:t>.factory.bin</w:t>
+      </w:r>
+      <w:proofErr w:type="spellEnd"/>
+      <w:r>
+        <w:t xml:space="preserve">. This file contains all the partition information and the </w:t>
       </w:r>
       <w:r>
         <w:t xml:space="preserve">app code. I think it can be used to update earlier versions of the firmware by using a </w:t>
@@ -447,7 +523,7 @@
         <w:t>flashing program. However, I have not personally tried this</w:t>
       </w:r>
       <w:r>
-        <w:t xml:space="preserve"> since I always just load from VS Code, which is what I use for developing the code.</w:t>
+        <w:t xml:space="preserve"> since I always load from VS Code, which is what I use for developing the code.</w:t>
       </w:r>
     </w:p>
     <w:p>
@@ -464,7 +540,15 @@
         </w:numPr>
       </w:pPr>
       <w:r>
-        <w:t>Added ability to play WAV and MP3 files. Removed the immediate txstop option as it could leave the audio player in an untidy state.</w:t>
+        <w:t xml:space="preserve">Added ability to play WAV and MP3 files. Removed the immediate </w:t>
+      </w:r>
+      <w:proofErr w:type="spellStart"/>
+      <w:r>
+        <w:t>txstop</w:t>
+      </w:r>
+      <w:proofErr w:type="spellEnd"/>
+      <w:r>
+        <w:t xml:space="preserve"> option as it could leave the audio player in an untidy state.</w:t>
       </w:r>
       <w:r>
         <w:t xml:space="preserve"> Updated </w:t>
@@ -487,7 +571,15 @@
         </w:numPr>
       </w:pPr>
       <w:r>
-        <w:t>Ported the code to espressif core 3.x instead of requiring 2.0.17.</w:t>
+        <w:t xml:space="preserve">Ported the code to </w:t>
+      </w:r>
+      <w:proofErr w:type="spellStart"/>
+      <w:r>
+        <w:t>espressif</w:t>
+      </w:r>
+      <w:proofErr w:type="spellEnd"/>
+      <w:r>
+        <w:t xml:space="preserve"> core 3.x instead of requiring 2.0.17.</w:t>
       </w:r>
     </w:p>
     <w:p>
@@ -620,7 +712,35 @@
         <w:rPr>
           <w:lang w:val="en-US"/>
         </w:rPr>
-        <w:t>Show the active run time on the main display in hours, minutes, and seconds. This time is reset on boot, and just keeps track of the time used for sending and pausing.</w:t>
+        <w:t xml:space="preserve">Show the active </w:t>
+      </w:r>
+      <w:proofErr w:type="gramStart"/>
+      <w:r>
+        <w:rPr>
+          <w:lang w:val="en-US"/>
+        </w:rPr>
+        <w:t>run</w:t>
+      </w:r>
+      <w:proofErr w:type="gramEnd"/>
+      <w:r>
+        <w:rPr>
+          <w:lang w:val="en-US"/>
+        </w:rPr>
+        <w:t xml:space="preserve"> time on the main display in hours, minutes, and seconds. This time is reset on </w:t>
+      </w:r>
+      <w:proofErr w:type="gramStart"/>
+      <w:r>
+        <w:rPr>
+          <w:lang w:val="en-US"/>
+        </w:rPr>
+        <w:t>boot, and</w:t>
+      </w:r>
+      <w:proofErr w:type="gramEnd"/>
+      <w:r>
+        <w:rPr>
+          <w:lang w:val="en-US"/>
+        </w:rPr>
+        <w:t xml:space="preserve"> just keeps track of the time used for sending and pausing.</w:t>
       </w:r>
     </w:p>
     <w:p>
@@ -660,8 +780,16 @@
         <w:rPr>
           <w:lang w:val="en-US"/>
         </w:rPr>
-        <w:t>Added a switch to limit the frequency range to that allowed for beacon use in ITU region 2. The range is 144.276-144.300 MHz.</w:t>
-      </w:r>
+        <w:t xml:space="preserve">Added a switch to limit the frequency range to that allowed for beacon use in ITU region 2. The range is 144.276-144.300 </w:t>
+      </w:r>
+      <w:proofErr w:type="spellStart"/>
+      <w:r>
+        <w:rPr>
+          <w:lang w:val="en-US"/>
+        </w:rPr>
+        <w:t>MHz.</w:t>
+      </w:r>
+      <w:proofErr w:type="spellEnd"/>
     </w:p>
     <w:p>
       <w:r>
@@ -697,7 +825,15 @@
         </w:numPr>
       </w:pPr>
       <w:r>
-        <w:t>Fixed crash when no SD card found.</w:t>
+        <w:t xml:space="preserve">Fixed crash when no SD card </w:t>
+      </w:r>
+      <w:proofErr w:type="gramStart"/>
+      <w:r>
+        <w:t>found</w:t>
+      </w:r>
+      <w:proofErr w:type="gramEnd"/>
+      <w:r>
+        <w:t>.</w:t>
       </w:r>
     </w:p>
     <w:p>
@@ -801,7 +937,21 @@
         <w:rPr>
           <w:lang w:val="en-US"/>
         </w:rPr>
-        <w:t>initial version when this document was first created. The software is considered mostly complete.</w:t>
+        <w:t xml:space="preserve">initial </w:t>
+      </w:r>
+      <w:proofErr w:type="gramStart"/>
+      <w:r>
+        <w:rPr>
+          <w:lang w:val="en-US"/>
+        </w:rPr>
+        <w:t>version</w:t>
+      </w:r>
+      <w:proofErr w:type="gramEnd"/>
+      <w:r>
+        <w:rPr>
+          <w:lang w:val="en-US"/>
+        </w:rPr>
+        <w:t xml:space="preserve"> when this document was first created. The software is considered mostly complete.</w:t>
       </w:r>
     </w:p>
     <w:p>
@@ -839,7 +989,21 @@
         <w:rPr>
           <w:lang w:val="en-US"/>
         </w:rPr>
-        <w:t>The Fox is a single PCB that includes an 18650 battery holder that can have 1 or 2 batteries.</w:t>
+        <w:t xml:space="preserve">The Fox is a single PCB that includes an </w:t>
+      </w:r>
+      <w:proofErr w:type="gramStart"/>
+      <w:r>
+        <w:rPr>
+          <w:lang w:val="en-US"/>
+        </w:rPr>
+        <w:t>18650 battery</w:t>
+      </w:r>
+      <w:proofErr w:type="gramEnd"/>
+      <w:r>
+        <w:rPr>
+          <w:lang w:val="en-US"/>
+        </w:rPr>
+        <w:t xml:space="preserve"> holder that can have 1 or 2 batteries.</w:t>
       </w:r>
       <w:r>
         <w:rPr>
@@ -881,13 +1045,41 @@
         <w:rPr>
           <w:lang w:val="en-US"/>
         </w:rPr>
-        <w:t>. The flat top batteries will not work. Also note that the size standard</w:t>
-      </w:r>
-      <w:r>
-        <w:rPr>
-          <w:lang w:val="en-US"/>
-        </w:rPr>
-        <w:t xml:space="preserve"> is not always followed and some batteries will not fit. If that is the case try a different pair. </w:t>
+        <w:t xml:space="preserve">. The </w:t>
+      </w:r>
+      <w:proofErr w:type="gramStart"/>
+      <w:r>
+        <w:rPr>
+          <w:lang w:val="en-US"/>
+        </w:rPr>
+        <w:t>flat top</w:t>
+      </w:r>
+      <w:proofErr w:type="gramEnd"/>
+      <w:r>
+        <w:rPr>
+          <w:lang w:val="en-US"/>
+        </w:rPr>
+        <w:t xml:space="preserve"> batteries will not work. Also note that the size standard</w:t>
+      </w:r>
+      <w:r>
+        <w:rPr>
+          <w:lang w:val="en-US"/>
+        </w:rPr>
+        <w:t xml:space="preserve"> is not always followed and some batteries will not fit. If that is the </w:t>
+      </w:r>
+      <w:proofErr w:type="gramStart"/>
+      <w:r>
+        <w:rPr>
+          <w:lang w:val="en-US"/>
+        </w:rPr>
+        <w:t>case</w:t>
+      </w:r>
+      <w:proofErr w:type="gramEnd"/>
+      <w:r>
+        <w:rPr>
+          <w:lang w:val="en-US"/>
+        </w:rPr>
+        <w:t xml:space="preserve"> try a different pair. </w:t>
       </w:r>
       <w:r>
         <w:rPr>
@@ -912,7 +1104,21 @@
           <w:rPr>
             <w:rStyle w:val="Hyperlink"/>
           </w:rPr>
-          <w:t>Protected 3400mAh 10A 18650 Button Top Battery - Wholesale Discount – Liion Wholesale Batteries</w:t>
+          <w:t xml:space="preserve">Protected 3400mAh 10A 18650 Button Top Battery - Wholesale Discount – </w:t>
+        </w:r>
+        <w:proofErr w:type="spellStart"/>
+        <w:r>
+          <w:rPr>
+            <w:rStyle w:val="Hyperlink"/>
+          </w:rPr>
+          <w:t>Liion</w:t>
+        </w:r>
+        <w:proofErr w:type="spellEnd"/>
+        <w:r>
+          <w:rPr>
+            <w:rStyle w:val="Hyperlink"/>
+          </w:rPr>
+          <w:t xml:space="preserve"> Wholesale Batteries</w:t>
         </w:r>
       </w:hyperlink>
       <w:r>
@@ -958,6 +1164,7 @@
         </w:rPr>
         <w:t xml:space="preserve">The radio functions are handled by the SA818-V on the top right. There are vents in the case to allow cooling as this module can become quite hot when transmitting at high power for longer timer intervals. Transmitting longer than one minute is not recommended. High power is about </w:t>
       </w:r>
+      <w:proofErr w:type="gramStart"/>
       <w:r>
         <w:rPr>
           <w:lang w:val="en-US"/>
@@ -968,7 +1175,14 @@
         <w:rPr>
           <w:lang w:val="en-US"/>
         </w:rPr>
-        <w:t xml:space="preserve">W and low power is about </w:t>
+        <w:t>W</w:t>
+      </w:r>
+      <w:proofErr w:type="gramEnd"/>
+      <w:r>
+        <w:rPr>
+          <w:lang w:val="en-US"/>
+        </w:rPr>
+        <w:t xml:space="preserve"> and low power is about </w:t>
       </w:r>
       <w:r>
         <w:rPr>
@@ -1025,7 +1239,21 @@
         <w:rPr>
           <w:lang w:val="en-US"/>
         </w:rPr>
-        <w:t xml:space="preserve">button top style and protection is recommended. The 18650 battery length is a very loose </w:t>
+        <w:t xml:space="preserve">button top style and protection is recommended. The </w:t>
+      </w:r>
+      <w:proofErr w:type="gramStart"/>
+      <w:r>
+        <w:rPr>
+          <w:lang w:val="en-US"/>
+        </w:rPr>
+        <w:t>18650 battery</w:t>
+      </w:r>
+      <w:proofErr w:type="gramEnd"/>
+      <w:r>
+        <w:rPr>
+          <w:lang w:val="en-US"/>
+        </w:rPr>
+        <w:t xml:space="preserve"> length is a very loose </w:t>
       </w:r>
       <w:r>
         <w:rPr>
@@ -1064,7 +1292,21 @@
         <w:rPr>
           <w:lang w:val="en-US"/>
         </w:rPr>
-        <w:t>The SD card holds the tone, mp3, and wav files. You can also put the RadioFox.bin file on there for updating the firmware.</w:t>
+        <w:t xml:space="preserve">The SD card holds the tone, mp3, and wav files. You can also put the </w:t>
+      </w:r>
+      <w:proofErr w:type="spellStart"/>
+      <w:r>
+        <w:rPr>
+          <w:lang w:val="en-US"/>
+        </w:rPr>
+        <w:t>RadioFox.bin</w:t>
+      </w:r>
+      <w:proofErr w:type="spellEnd"/>
+      <w:r>
+        <w:rPr>
+          <w:lang w:val="en-US"/>
+        </w:rPr>
+        <w:t xml:space="preserve"> file on there for updating the firmware.</w:t>
       </w:r>
       <w:r>
         <w:rPr>
@@ -1088,8 +1330,30 @@
         <w:rPr>
           <w:lang w:val="en-US"/>
         </w:rPr>
-        <w:t>at ./firmware/firmware.bin and must be renamed on the SD card to RadioFox.bin</w:t>
-      </w:r>
+        <w:t>at ./firmware/</w:t>
+      </w:r>
+      <w:proofErr w:type="spellStart"/>
+      <w:r>
+        <w:rPr>
+          <w:lang w:val="en-US"/>
+        </w:rPr>
+        <w:t>firmware.bin</w:t>
+      </w:r>
+      <w:proofErr w:type="spellEnd"/>
+      <w:r>
+        <w:rPr>
+          <w:lang w:val="en-US"/>
+        </w:rPr>
+        <w:t xml:space="preserve"> and must be renamed on the SD card to </w:t>
+      </w:r>
+      <w:proofErr w:type="spellStart"/>
+      <w:r>
+        <w:rPr>
+          <w:lang w:val="en-US"/>
+        </w:rPr>
+        <w:t>RadioFox.bin</w:t>
+      </w:r>
+      <w:proofErr w:type="spellEnd"/>
       <w:r>
         <w:rPr>
           <w:lang w:val="en-US"/>
@@ -1101,6 +1365,52 @@
           <w:lang w:val="en-US"/>
         </w:rPr>
         <w:t xml:space="preserve"> See the note above on version 1.15 for more information.</w:t>
+      </w:r>
+    </w:p>
+    <w:p>
+      <w:pPr>
+        <w:rPr>
+          <w:lang w:val="en-US"/>
+        </w:rPr>
+      </w:pPr>
+    </w:p>
+    <w:p>
+      <w:pPr>
+        <w:rPr>
+          <w:lang w:val="en-US"/>
+        </w:rPr>
+      </w:pPr>
+      <w:r>
+        <w:rPr>
+          <w:lang w:val="en-US"/>
+        </w:rPr>
+        <w:t>Note that the SD card is limited to 32GB</w:t>
+      </w:r>
+      <w:r>
+        <w:rPr>
+          <w:lang w:val="en-US"/>
+        </w:rPr>
+        <w:t xml:space="preserve">. This is a function of the </w:t>
+      </w:r>
+      <w:proofErr w:type="spellStart"/>
+      <w:r>
+        <w:rPr>
+          <w:lang w:val="en-US"/>
+        </w:rPr>
+        <w:t>espressif</w:t>
+      </w:r>
+      <w:proofErr w:type="spellEnd"/>
+      <w:r>
+        <w:rPr>
+          <w:lang w:val="en-US"/>
+        </w:rPr>
+        <w:t xml:space="preserve"> core code for handling files. We hope this will be updated at some point</w:t>
+      </w:r>
+      <w:r>
+        <w:rPr>
+          <w:lang w:val="en-US"/>
+        </w:rPr>
+        <w:t>.</w:t>
       </w:r>
     </w:p>
     <w:p>
@@ -1163,12 +1473,37 @@
         <w:t xml:space="preserve">The files are saved as .TXT and simply contain a list of tones to be played. The format is similar the hard coded files from here: </w:t>
       </w:r>
       <w:hyperlink r:id="rId12">
+        <w:proofErr w:type="spellStart"/>
         <w:r>
           <w:rPr>
             <w:rStyle w:val="Hyperlink"/>
             <w:lang w:val="en-US"/>
           </w:rPr>
-          <w:t>robsoncouto/arduino-songs (github.com)</w:t>
+          <w:t>robsoncouto</w:t>
+        </w:r>
+        <w:proofErr w:type="spellEnd"/>
+        <w:r>
+          <w:rPr>
+            <w:rStyle w:val="Hyperlink"/>
+            <w:lang w:val="en-US"/>
+          </w:rPr>
+          <w:t>/</w:t>
+        </w:r>
+        <w:proofErr w:type="spellStart"/>
+        <w:r>
+          <w:rPr>
+            <w:rStyle w:val="Hyperlink"/>
+            <w:lang w:val="en-US"/>
+          </w:rPr>
+          <w:t>arduino</w:t>
+        </w:r>
+        <w:proofErr w:type="spellEnd"/>
+        <w:r>
+          <w:rPr>
+            <w:rStyle w:val="Hyperlink"/>
+            <w:lang w:val="en-US"/>
+          </w:rPr>
+          <w:t>-songs (github.com)</w:t>
         </w:r>
       </w:hyperlink>
     </w:p>
@@ -1235,12 +1570,21 @@
           <w:bCs/>
         </w:rPr>
       </w:pPr>
-      <w:r>
-        <w:rPr>
-          <w:b/>
-          <w:bCs/>
-        </w:rPr>
-        <w:t>there are two values per note (pitch and duration)</w:t>
+      <w:proofErr w:type="gramStart"/>
+      <w:r>
+        <w:rPr>
+          <w:b/>
+          <w:bCs/>
+        </w:rPr>
+        <w:t>there</w:t>
+      </w:r>
+      <w:proofErr w:type="gramEnd"/>
+      <w:r>
+        <w:rPr>
+          <w:b/>
+          <w:bCs/>
+        </w:rPr>
+        <w:t xml:space="preserve"> are two values per note (pitch and duration)</w:t>
       </w:r>
     </w:p>
     <w:p>
@@ -1287,7 +1631,25 @@
           <w:bCs/>
           <w:lang w:val="en-US"/>
         </w:rPr>
-        <w:t>LENGTH, %val can be used to set the length of the note, it defaults to 90% and 10% quiet after the note</w:t>
+        <w:t>LENGTH, %</w:t>
+      </w:r>
+      <w:proofErr w:type="spellStart"/>
+      <w:r>
+        <w:rPr>
+          <w:b/>
+          <w:bCs/>
+          <w:lang w:val="en-US"/>
+        </w:rPr>
+        <w:t>val</w:t>
+      </w:r>
+      <w:proofErr w:type="spellEnd"/>
+      <w:r>
+        <w:rPr>
+          <w:b/>
+          <w:bCs/>
+          <w:lang w:val="en-US"/>
+        </w:rPr>
+        <w:t xml:space="preserve"> can be used to set the length of the note, it defaults to 90% and 10% quiet after the note</w:t>
       </w:r>
     </w:p>
     <w:p>
@@ -1364,126 +1726,648 @@
           <w:bCs/>
           <w:lang w:val="en-US"/>
         </w:rPr>
-        <w:t>NOTE_E5, 4,  NOTE_B4, 8,  NOTE_C5, 8,  NOTE_D5, 4,  NOTE_C5, 8,  NOTE_B4, 8,</w:t>
-      </w:r>
-    </w:p>
-    <w:p>
-      <w:pPr>
-        <w:rPr>
-          <w:b/>
-          <w:bCs/>
-          <w:lang w:val="en-US"/>
-        </w:rPr>
-      </w:pPr>
-      <w:r>
-        <w:rPr>
-          <w:b/>
-          <w:bCs/>
-          <w:lang w:val="en-US"/>
-        </w:rPr>
-        <w:t>NOTE_A4, 4,  NOTE_A4, 8,  NOTE_C5, 8,  NOTE_E5, 4,  NOTE_D5, 8,  NOTE_C5, 8,</w:t>
-      </w:r>
-    </w:p>
-    <w:p>
-      <w:pPr>
-        <w:rPr>
-          <w:b/>
-          <w:bCs/>
-          <w:lang w:val="en-US"/>
-        </w:rPr>
-      </w:pPr>
-      <w:r>
-        <w:rPr>
-          <w:b/>
-          <w:bCs/>
-          <w:lang w:val="en-US"/>
-        </w:rPr>
-        <w:t>NOTE_B4, -4, NOTE_C5, 8,  NOTE_D5, 4,  NOTE_E5, 4,</w:t>
-      </w:r>
-    </w:p>
-    <w:p>
-      <w:pPr>
-        <w:rPr>
-          <w:b/>
-          <w:bCs/>
-          <w:lang w:val="en-US"/>
-        </w:rPr>
-      </w:pPr>
-      <w:r>
-        <w:rPr>
-          <w:b/>
-          <w:bCs/>
-          <w:lang w:val="en-US"/>
-        </w:rPr>
-        <w:t>NOTE_C5, 4,  NOTE_A4, 4,  NOTE_A4, 8,  NOTE_A4, 4,  NOTE_B4, 8,  NOTE_C5, 8,</w:t>
-      </w:r>
-    </w:p>
-    <w:p>
-      <w:pPr>
-        <w:rPr>
-          <w:b/>
-          <w:bCs/>
-          <w:lang w:val="en-US"/>
-        </w:rPr>
-      </w:pPr>
-      <w:r>
-        <w:rPr>
-          <w:b/>
-          <w:bCs/>
-          <w:lang w:val="en-US"/>
-        </w:rPr>
-        <w:t>NOTE_D5, -4, NOTE_F5, 8,  NOTE_A5, 4,  NOTE_G5, 8,  NOTE_F5, 8,</w:t>
-      </w:r>
-    </w:p>
-    <w:p>
-      <w:pPr>
-        <w:rPr>
-          <w:b/>
-          <w:bCs/>
-          <w:lang w:val="en-US"/>
-        </w:rPr>
-      </w:pPr>
-      <w:r>
-        <w:rPr>
-          <w:b/>
-          <w:bCs/>
-          <w:lang w:val="en-US"/>
-        </w:rPr>
-        <w:t>NOTE_E5, -4, NOTE_C5, 8,  NOTE_E5, 4,  NOTE_D5, 8,  NOTE_C5, 8,</w:t>
-      </w:r>
-    </w:p>
-    <w:p>
-      <w:pPr>
-        <w:rPr>
-          <w:b/>
-          <w:bCs/>
-          <w:lang w:val="en-US"/>
-        </w:rPr>
-      </w:pPr>
-      <w:r>
-        <w:rPr>
-          <w:b/>
-          <w:bCs/>
-          <w:lang w:val="en-US"/>
-        </w:rPr>
-        <w:t>NOTE_B4, 4,  NOTE_B4, 8,  NOTE_C5, 8,  NOTE_D5, 4,  NOTE_E5, 4,</w:t>
-      </w:r>
-    </w:p>
-    <w:p>
-      <w:pPr>
-        <w:rPr>
-          <w:b/>
-          <w:bCs/>
-          <w:lang w:val="en-US"/>
-        </w:rPr>
-      </w:pPr>
-      <w:r>
-        <w:rPr>
-          <w:b/>
-          <w:bCs/>
-          <w:lang w:val="en-US"/>
-        </w:rPr>
-        <w:t>NOTE_C5, 4,  NOTE_A4, 4,  NOTE_A4, 4, REST, 4,</w:t>
+        <w:t xml:space="preserve">NOTE_E5, </w:t>
+      </w:r>
+      <w:proofErr w:type="gramStart"/>
+      <w:r>
+        <w:rPr>
+          <w:b/>
+          <w:bCs/>
+          <w:lang w:val="en-US"/>
+        </w:rPr>
+        <w:t>4,  NOTE</w:t>
+      </w:r>
+      <w:proofErr w:type="gramEnd"/>
+      <w:r>
+        <w:rPr>
+          <w:b/>
+          <w:bCs/>
+          <w:lang w:val="en-US"/>
+        </w:rPr>
+        <w:t xml:space="preserve">_B4, </w:t>
+      </w:r>
+      <w:proofErr w:type="gramStart"/>
+      <w:r>
+        <w:rPr>
+          <w:b/>
+          <w:bCs/>
+          <w:lang w:val="en-US"/>
+        </w:rPr>
+        <w:t>8,  NOTE</w:t>
+      </w:r>
+      <w:proofErr w:type="gramEnd"/>
+      <w:r>
+        <w:rPr>
+          <w:b/>
+          <w:bCs/>
+          <w:lang w:val="en-US"/>
+        </w:rPr>
+        <w:t xml:space="preserve">_C5, </w:t>
+      </w:r>
+      <w:proofErr w:type="gramStart"/>
+      <w:r>
+        <w:rPr>
+          <w:b/>
+          <w:bCs/>
+          <w:lang w:val="en-US"/>
+        </w:rPr>
+        <w:t>8,  NOTE</w:t>
+      </w:r>
+      <w:proofErr w:type="gramEnd"/>
+      <w:r>
+        <w:rPr>
+          <w:b/>
+          <w:bCs/>
+          <w:lang w:val="en-US"/>
+        </w:rPr>
+        <w:t xml:space="preserve">_D5, </w:t>
+      </w:r>
+      <w:proofErr w:type="gramStart"/>
+      <w:r>
+        <w:rPr>
+          <w:b/>
+          <w:bCs/>
+          <w:lang w:val="en-US"/>
+        </w:rPr>
+        <w:t>4,  NOTE</w:t>
+      </w:r>
+      <w:proofErr w:type="gramEnd"/>
+      <w:r>
+        <w:rPr>
+          <w:b/>
+          <w:bCs/>
+          <w:lang w:val="en-US"/>
+        </w:rPr>
+        <w:t xml:space="preserve">_C5, </w:t>
+      </w:r>
+      <w:proofErr w:type="gramStart"/>
+      <w:r>
+        <w:rPr>
+          <w:b/>
+          <w:bCs/>
+          <w:lang w:val="en-US"/>
+        </w:rPr>
+        <w:t>8,  NOTE</w:t>
+      </w:r>
+      <w:proofErr w:type="gramEnd"/>
+      <w:r>
+        <w:rPr>
+          <w:b/>
+          <w:bCs/>
+          <w:lang w:val="en-US"/>
+        </w:rPr>
+        <w:t>_B4, 8,</w:t>
+      </w:r>
+    </w:p>
+    <w:p>
+      <w:pPr>
+        <w:rPr>
+          <w:b/>
+          <w:bCs/>
+          <w:lang w:val="en-US"/>
+        </w:rPr>
+      </w:pPr>
+      <w:r>
+        <w:rPr>
+          <w:b/>
+          <w:bCs/>
+          <w:lang w:val="en-US"/>
+        </w:rPr>
+        <w:t xml:space="preserve">NOTE_A4, </w:t>
+      </w:r>
+      <w:proofErr w:type="gramStart"/>
+      <w:r>
+        <w:rPr>
+          <w:b/>
+          <w:bCs/>
+          <w:lang w:val="en-US"/>
+        </w:rPr>
+        <w:t>4,  NOTE</w:t>
+      </w:r>
+      <w:proofErr w:type="gramEnd"/>
+      <w:r>
+        <w:rPr>
+          <w:b/>
+          <w:bCs/>
+          <w:lang w:val="en-US"/>
+        </w:rPr>
+        <w:t xml:space="preserve">_A4, </w:t>
+      </w:r>
+      <w:proofErr w:type="gramStart"/>
+      <w:r>
+        <w:rPr>
+          <w:b/>
+          <w:bCs/>
+          <w:lang w:val="en-US"/>
+        </w:rPr>
+        <w:t>8,  NOTE</w:t>
+      </w:r>
+      <w:proofErr w:type="gramEnd"/>
+      <w:r>
+        <w:rPr>
+          <w:b/>
+          <w:bCs/>
+          <w:lang w:val="en-US"/>
+        </w:rPr>
+        <w:t xml:space="preserve">_C5, </w:t>
+      </w:r>
+      <w:proofErr w:type="gramStart"/>
+      <w:r>
+        <w:rPr>
+          <w:b/>
+          <w:bCs/>
+          <w:lang w:val="en-US"/>
+        </w:rPr>
+        <w:t>8,  NOTE</w:t>
+      </w:r>
+      <w:proofErr w:type="gramEnd"/>
+      <w:r>
+        <w:rPr>
+          <w:b/>
+          <w:bCs/>
+          <w:lang w:val="en-US"/>
+        </w:rPr>
+        <w:t xml:space="preserve">_E5, </w:t>
+      </w:r>
+      <w:proofErr w:type="gramStart"/>
+      <w:r>
+        <w:rPr>
+          <w:b/>
+          <w:bCs/>
+          <w:lang w:val="en-US"/>
+        </w:rPr>
+        <w:t>4,  NOTE</w:t>
+      </w:r>
+      <w:proofErr w:type="gramEnd"/>
+      <w:r>
+        <w:rPr>
+          <w:b/>
+          <w:bCs/>
+          <w:lang w:val="en-US"/>
+        </w:rPr>
+        <w:t xml:space="preserve">_D5, </w:t>
+      </w:r>
+      <w:proofErr w:type="gramStart"/>
+      <w:r>
+        <w:rPr>
+          <w:b/>
+          <w:bCs/>
+          <w:lang w:val="en-US"/>
+        </w:rPr>
+        <w:t>8,  NOTE</w:t>
+      </w:r>
+      <w:proofErr w:type="gramEnd"/>
+      <w:r>
+        <w:rPr>
+          <w:b/>
+          <w:bCs/>
+          <w:lang w:val="en-US"/>
+        </w:rPr>
+        <w:t>_C5, 8,</w:t>
+      </w:r>
+    </w:p>
+    <w:p>
+      <w:pPr>
+        <w:rPr>
+          <w:b/>
+          <w:bCs/>
+          <w:lang w:val="en-US"/>
+        </w:rPr>
+      </w:pPr>
+      <w:r>
+        <w:rPr>
+          <w:b/>
+          <w:bCs/>
+          <w:lang w:val="en-US"/>
+        </w:rPr>
+        <w:t xml:space="preserve">NOTE_B4, -4, NOTE_C5, </w:t>
+      </w:r>
+      <w:proofErr w:type="gramStart"/>
+      <w:r>
+        <w:rPr>
+          <w:b/>
+          <w:bCs/>
+          <w:lang w:val="en-US"/>
+        </w:rPr>
+        <w:t>8,  NOTE</w:t>
+      </w:r>
+      <w:proofErr w:type="gramEnd"/>
+      <w:r>
+        <w:rPr>
+          <w:b/>
+          <w:bCs/>
+          <w:lang w:val="en-US"/>
+        </w:rPr>
+        <w:t xml:space="preserve">_D5, </w:t>
+      </w:r>
+      <w:proofErr w:type="gramStart"/>
+      <w:r>
+        <w:rPr>
+          <w:b/>
+          <w:bCs/>
+          <w:lang w:val="en-US"/>
+        </w:rPr>
+        <w:t>4,  NOTE</w:t>
+      </w:r>
+      <w:proofErr w:type="gramEnd"/>
+      <w:r>
+        <w:rPr>
+          <w:b/>
+          <w:bCs/>
+          <w:lang w:val="en-US"/>
+        </w:rPr>
+        <w:t>_E5, 4,</w:t>
+      </w:r>
+    </w:p>
+    <w:p>
+      <w:pPr>
+        <w:rPr>
+          <w:b/>
+          <w:bCs/>
+          <w:lang w:val="en-US"/>
+        </w:rPr>
+      </w:pPr>
+      <w:r>
+        <w:rPr>
+          <w:b/>
+          <w:bCs/>
+          <w:lang w:val="en-US"/>
+        </w:rPr>
+        <w:t xml:space="preserve">NOTE_C5, </w:t>
+      </w:r>
+      <w:proofErr w:type="gramStart"/>
+      <w:r>
+        <w:rPr>
+          <w:b/>
+          <w:bCs/>
+          <w:lang w:val="en-US"/>
+        </w:rPr>
+        <w:t>4,  NOTE</w:t>
+      </w:r>
+      <w:proofErr w:type="gramEnd"/>
+      <w:r>
+        <w:rPr>
+          <w:b/>
+          <w:bCs/>
+          <w:lang w:val="en-US"/>
+        </w:rPr>
+        <w:t xml:space="preserve">_A4, </w:t>
+      </w:r>
+      <w:proofErr w:type="gramStart"/>
+      <w:r>
+        <w:rPr>
+          <w:b/>
+          <w:bCs/>
+          <w:lang w:val="en-US"/>
+        </w:rPr>
+        <w:t>4,  NOTE</w:t>
+      </w:r>
+      <w:proofErr w:type="gramEnd"/>
+      <w:r>
+        <w:rPr>
+          <w:b/>
+          <w:bCs/>
+          <w:lang w:val="en-US"/>
+        </w:rPr>
+        <w:t xml:space="preserve">_A4, </w:t>
+      </w:r>
+      <w:proofErr w:type="gramStart"/>
+      <w:r>
+        <w:rPr>
+          <w:b/>
+          <w:bCs/>
+          <w:lang w:val="en-US"/>
+        </w:rPr>
+        <w:t>8,  NOTE</w:t>
+      </w:r>
+      <w:proofErr w:type="gramEnd"/>
+      <w:r>
+        <w:rPr>
+          <w:b/>
+          <w:bCs/>
+          <w:lang w:val="en-US"/>
+        </w:rPr>
+        <w:t xml:space="preserve">_A4, </w:t>
+      </w:r>
+      <w:proofErr w:type="gramStart"/>
+      <w:r>
+        <w:rPr>
+          <w:b/>
+          <w:bCs/>
+          <w:lang w:val="en-US"/>
+        </w:rPr>
+        <w:t>4,  NOTE</w:t>
+      </w:r>
+      <w:proofErr w:type="gramEnd"/>
+      <w:r>
+        <w:rPr>
+          <w:b/>
+          <w:bCs/>
+          <w:lang w:val="en-US"/>
+        </w:rPr>
+        <w:t xml:space="preserve">_B4, </w:t>
+      </w:r>
+      <w:proofErr w:type="gramStart"/>
+      <w:r>
+        <w:rPr>
+          <w:b/>
+          <w:bCs/>
+          <w:lang w:val="en-US"/>
+        </w:rPr>
+        <w:t>8,  NOTE</w:t>
+      </w:r>
+      <w:proofErr w:type="gramEnd"/>
+      <w:r>
+        <w:rPr>
+          <w:b/>
+          <w:bCs/>
+          <w:lang w:val="en-US"/>
+        </w:rPr>
+        <w:t>_C5, 8,</w:t>
+      </w:r>
+    </w:p>
+    <w:p>
+      <w:pPr>
+        <w:rPr>
+          <w:b/>
+          <w:bCs/>
+          <w:lang w:val="en-US"/>
+        </w:rPr>
+      </w:pPr>
+      <w:r>
+        <w:rPr>
+          <w:b/>
+          <w:bCs/>
+          <w:lang w:val="en-US"/>
+        </w:rPr>
+        <w:t xml:space="preserve">NOTE_D5, -4, NOTE_F5, </w:t>
+      </w:r>
+      <w:proofErr w:type="gramStart"/>
+      <w:r>
+        <w:rPr>
+          <w:b/>
+          <w:bCs/>
+          <w:lang w:val="en-US"/>
+        </w:rPr>
+        <w:t>8,  NOTE</w:t>
+      </w:r>
+      <w:proofErr w:type="gramEnd"/>
+      <w:r>
+        <w:rPr>
+          <w:b/>
+          <w:bCs/>
+          <w:lang w:val="en-US"/>
+        </w:rPr>
+        <w:t xml:space="preserve">_A5, </w:t>
+      </w:r>
+      <w:proofErr w:type="gramStart"/>
+      <w:r>
+        <w:rPr>
+          <w:b/>
+          <w:bCs/>
+          <w:lang w:val="en-US"/>
+        </w:rPr>
+        <w:t>4,  NOTE</w:t>
+      </w:r>
+      <w:proofErr w:type="gramEnd"/>
+      <w:r>
+        <w:rPr>
+          <w:b/>
+          <w:bCs/>
+          <w:lang w:val="en-US"/>
+        </w:rPr>
+        <w:t xml:space="preserve">_G5, </w:t>
+      </w:r>
+      <w:proofErr w:type="gramStart"/>
+      <w:r>
+        <w:rPr>
+          <w:b/>
+          <w:bCs/>
+          <w:lang w:val="en-US"/>
+        </w:rPr>
+        <w:t>8,  NOTE</w:t>
+      </w:r>
+      <w:proofErr w:type="gramEnd"/>
+      <w:r>
+        <w:rPr>
+          <w:b/>
+          <w:bCs/>
+          <w:lang w:val="en-US"/>
+        </w:rPr>
+        <w:t>_F5, 8,</w:t>
+      </w:r>
+    </w:p>
+    <w:p>
+      <w:pPr>
+        <w:rPr>
+          <w:b/>
+          <w:bCs/>
+          <w:lang w:val="en-US"/>
+        </w:rPr>
+      </w:pPr>
+      <w:r>
+        <w:rPr>
+          <w:b/>
+          <w:bCs/>
+          <w:lang w:val="en-US"/>
+        </w:rPr>
+        <w:t xml:space="preserve">NOTE_E5, -4, NOTE_C5, </w:t>
+      </w:r>
+      <w:proofErr w:type="gramStart"/>
+      <w:r>
+        <w:rPr>
+          <w:b/>
+          <w:bCs/>
+          <w:lang w:val="en-US"/>
+        </w:rPr>
+        <w:t>8,  NOTE</w:t>
+      </w:r>
+      <w:proofErr w:type="gramEnd"/>
+      <w:r>
+        <w:rPr>
+          <w:b/>
+          <w:bCs/>
+          <w:lang w:val="en-US"/>
+        </w:rPr>
+        <w:t xml:space="preserve">_E5, </w:t>
+      </w:r>
+      <w:proofErr w:type="gramStart"/>
+      <w:r>
+        <w:rPr>
+          <w:b/>
+          <w:bCs/>
+          <w:lang w:val="en-US"/>
+        </w:rPr>
+        <w:t>4,  NOTE</w:t>
+      </w:r>
+      <w:proofErr w:type="gramEnd"/>
+      <w:r>
+        <w:rPr>
+          <w:b/>
+          <w:bCs/>
+          <w:lang w:val="en-US"/>
+        </w:rPr>
+        <w:t xml:space="preserve">_D5, </w:t>
+      </w:r>
+      <w:proofErr w:type="gramStart"/>
+      <w:r>
+        <w:rPr>
+          <w:b/>
+          <w:bCs/>
+          <w:lang w:val="en-US"/>
+        </w:rPr>
+        <w:t>8,  NOTE</w:t>
+      </w:r>
+      <w:proofErr w:type="gramEnd"/>
+      <w:r>
+        <w:rPr>
+          <w:b/>
+          <w:bCs/>
+          <w:lang w:val="en-US"/>
+        </w:rPr>
+        <w:t>_C5, 8,</w:t>
+      </w:r>
+    </w:p>
+    <w:p>
+      <w:pPr>
+        <w:rPr>
+          <w:b/>
+          <w:bCs/>
+          <w:lang w:val="en-US"/>
+        </w:rPr>
+      </w:pPr>
+      <w:r>
+        <w:rPr>
+          <w:b/>
+          <w:bCs/>
+          <w:lang w:val="en-US"/>
+        </w:rPr>
+        <w:t xml:space="preserve">NOTE_B4, </w:t>
+      </w:r>
+      <w:proofErr w:type="gramStart"/>
+      <w:r>
+        <w:rPr>
+          <w:b/>
+          <w:bCs/>
+          <w:lang w:val="en-US"/>
+        </w:rPr>
+        <w:t>4,  NOTE</w:t>
+      </w:r>
+      <w:proofErr w:type="gramEnd"/>
+      <w:r>
+        <w:rPr>
+          <w:b/>
+          <w:bCs/>
+          <w:lang w:val="en-US"/>
+        </w:rPr>
+        <w:t xml:space="preserve">_B4, </w:t>
+      </w:r>
+      <w:proofErr w:type="gramStart"/>
+      <w:r>
+        <w:rPr>
+          <w:b/>
+          <w:bCs/>
+          <w:lang w:val="en-US"/>
+        </w:rPr>
+        <w:t>8,  NOTE</w:t>
+      </w:r>
+      <w:proofErr w:type="gramEnd"/>
+      <w:r>
+        <w:rPr>
+          <w:b/>
+          <w:bCs/>
+          <w:lang w:val="en-US"/>
+        </w:rPr>
+        <w:t xml:space="preserve">_C5, </w:t>
+      </w:r>
+      <w:proofErr w:type="gramStart"/>
+      <w:r>
+        <w:rPr>
+          <w:b/>
+          <w:bCs/>
+          <w:lang w:val="en-US"/>
+        </w:rPr>
+        <w:t>8,  NOTE</w:t>
+      </w:r>
+      <w:proofErr w:type="gramEnd"/>
+      <w:r>
+        <w:rPr>
+          <w:b/>
+          <w:bCs/>
+          <w:lang w:val="en-US"/>
+        </w:rPr>
+        <w:t xml:space="preserve">_D5, </w:t>
+      </w:r>
+      <w:proofErr w:type="gramStart"/>
+      <w:r>
+        <w:rPr>
+          <w:b/>
+          <w:bCs/>
+          <w:lang w:val="en-US"/>
+        </w:rPr>
+        <w:t>4,  NOTE</w:t>
+      </w:r>
+      <w:proofErr w:type="gramEnd"/>
+      <w:r>
+        <w:rPr>
+          <w:b/>
+          <w:bCs/>
+          <w:lang w:val="en-US"/>
+        </w:rPr>
+        <w:t>_E5, 4,</w:t>
+      </w:r>
+    </w:p>
+    <w:p>
+      <w:pPr>
+        <w:rPr>
+          <w:b/>
+          <w:bCs/>
+          <w:lang w:val="en-US"/>
+        </w:rPr>
+      </w:pPr>
+      <w:r>
+        <w:rPr>
+          <w:b/>
+          <w:bCs/>
+          <w:lang w:val="en-US"/>
+        </w:rPr>
+        <w:t xml:space="preserve">NOTE_C5, </w:t>
+      </w:r>
+      <w:proofErr w:type="gramStart"/>
+      <w:r>
+        <w:rPr>
+          <w:b/>
+          <w:bCs/>
+          <w:lang w:val="en-US"/>
+        </w:rPr>
+        <w:t>4,  NOTE</w:t>
+      </w:r>
+      <w:proofErr w:type="gramEnd"/>
+      <w:r>
+        <w:rPr>
+          <w:b/>
+          <w:bCs/>
+          <w:lang w:val="en-US"/>
+        </w:rPr>
+        <w:t xml:space="preserve">_A4, </w:t>
+      </w:r>
+      <w:proofErr w:type="gramStart"/>
+      <w:r>
+        <w:rPr>
+          <w:b/>
+          <w:bCs/>
+          <w:lang w:val="en-US"/>
+        </w:rPr>
+        <w:t>4,  NOTE</w:t>
+      </w:r>
+      <w:proofErr w:type="gramEnd"/>
+      <w:r>
+        <w:rPr>
+          <w:b/>
+          <w:bCs/>
+          <w:lang w:val="en-US"/>
+        </w:rPr>
+        <w:t>_A4, 4, REST, 4,</w:t>
       </w:r>
     </w:p>
     <w:p>
@@ -1536,25 +2420,81 @@
         <w:rPr>
           <w:lang w:val="en-US"/>
         </w:rPr>
-        <w:t>The new file must be put on the SD card and named RadioFox.bin.</w:t>
-      </w:r>
-      <w:r>
-        <w:rPr>
-          <w:lang w:val="en-US"/>
-        </w:rPr>
-        <w:t xml:space="preserve"> The file is found on the github site in the </w:t>
-      </w:r>
-      <w:r>
-        <w:rPr>
-          <w:lang w:val="en-US"/>
-        </w:rPr>
-        <w:t>firmware folder, it is named firmware.bin, it must be renamed</w:t>
-      </w:r>
-      <w:r>
-        <w:rPr>
-          <w:lang w:val="en-US"/>
-        </w:rPr>
-        <w:t xml:space="preserve"> and copied to the micro SD card.</w:t>
+        <w:t xml:space="preserve">The new file must be put on the SD card and named </w:t>
+      </w:r>
+      <w:proofErr w:type="spellStart"/>
+      <w:r>
+        <w:rPr>
+          <w:lang w:val="en-US"/>
+        </w:rPr>
+        <w:t>RadioFox.bin</w:t>
+      </w:r>
+      <w:proofErr w:type="spellEnd"/>
+      <w:r>
+        <w:rPr>
+          <w:lang w:val="en-US"/>
+        </w:rPr>
+        <w:t>.</w:t>
+      </w:r>
+      <w:r>
+        <w:rPr>
+          <w:lang w:val="en-US"/>
+        </w:rPr>
+        <w:t xml:space="preserve"> The file is found on the </w:t>
+      </w:r>
+      <w:proofErr w:type="spellStart"/>
+      <w:r>
+        <w:rPr>
+          <w:lang w:val="en-US"/>
+        </w:rPr>
+        <w:t>github</w:t>
+      </w:r>
+      <w:proofErr w:type="spellEnd"/>
+      <w:r>
+        <w:rPr>
+          <w:lang w:val="en-US"/>
+        </w:rPr>
+        <w:t xml:space="preserve"> site in the </w:t>
+      </w:r>
+      <w:r>
+        <w:rPr>
+          <w:lang w:val="en-US"/>
+        </w:rPr>
+        <w:t xml:space="preserve">firmware folder, it is named </w:t>
+      </w:r>
+      <w:proofErr w:type="spellStart"/>
+      <w:r>
+        <w:rPr>
+          <w:lang w:val="en-US"/>
+        </w:rPr>
+        <w:t>firmware.bin</w:t>
+      </w:r>
+      <w:proofErr w:type="spellEnd"/>
+      <w:r>
+        <w:rPr>
+          <w:lang w:val="en-US"/>
+        </w:rPr>
+        <w:t>, it must be renamed</w:t>
+      </w:r>
+      <w:r>
+        <w:rPr>
+          <w:lang w:val="en-US"/>
+        </w:rPr>
+        <w:t xml:space="preserve"> and copied to the </w:t>
+      </w:r>
+      <w:proofErr w:type="gramStart"/>
+      <w:r>
+        <w:rPr>
+          <w:lang w:val="en-US"/>
+        </w:rPr>
+        <w:t>micro SD</w:t>
+      </w:r>
+      <w:proofErr w:type="gramEnd"/>
+      <w:r>
+        <w:rPr>
+          <w:lang w:val="en-US"/>
+        </w:rPr>
+        <w:t xml:space="preserve"> card.</w:t>
       </w:r>
       <w:r>
         <w:rPr>
@@ -1574,22 +2514,50 @@
         <w:rPr>
           <w:lang w:val="en-US"/>
         </w:rPr>
-        <w:t xml:space="preserve"> that will attempt to load this file. Confirmation will be required from the dial, After loading the BIN file can optionally be erased.</w:t>
-      </w:r>
-    </w:p>
-    <w:p>
-      <w:pPr>
-        <w:rPr>
-          <w:lang w:val="en-US"/>
-        </w:rPr>
-      </w:pPr>
-    </w:p>
-    <w:p>
-      <w:r>
-        <w:rPr>
-          <w:lang w:val="en-US"/>
-        </w:rPr>
-        <w:t>There is another file there named firmware.factory.bin. It contains the partition settings</w:t>
+        <w:t xml:space="preserve"> that will attempt to load this file. Confirmation will be required from the dial, </w:t>
+      </w:r>
+      <w:proofErr w:type="gramStart"/>
+      <w:r>
+        <w:rPr>
+          <w:lang w:val="en-US"/>
+        </w:rPr>
+        <w:t>After</w:t>
+      </w:r>
+      <w:proofErr w:type="gramEnd"/>
+      <w:r>
+        <w:rPr>
+          <w:lang w:val="en-US"/>
+        </w:rPr>
+        <w:t xml:space="preserve"> loading the BIN file can optionally be erased.</w:t>
+      </w:r>
+    </w:p>
+    <w:p>
+      <w:pPr>
+        <w:rPr>
+          <w:lang w:val="en-US"/>
+        </w:rPr>
+      </w:pPr>
+    </w:p>
+    <w:p>
+      <w:r>
+        <w:rPr>
+          <w:lang w:val="en-US"/>
+        </w:rPr>
+        <w:t xml:space="preserve">There is another file there named </w:t>
+      </w:r>
+      <w:proofErr w:type="spellStart"/>
+      <w:r>
+        <w:rPr>
+          <w:lang w:val="en-US"/>
+        </w:rPr>
+        <w:t>firmware.factory.bin</w:t>
+      </w:r>
+      <w:proofErr w:type="spellEnd"/>
+      <w:r>
+        <w:rPr>
+          <w:lang w:val="en-US"/>
+        </w:rPr>
+        <w:t>. It contains the partition settings</w:t>
       </w:r>
       <w:r>
         <w:rPr>
@@ -1601,13 +2569,41 @@
         <w:rPr>
           <w:lang w:val="en-US"/>
         </w:rPr>
-        <w:t xml:space="preserve"> an esp32 flash program. I have only done this from platformio, but there are probably other ways.</w:t>
-      </w:r>
-      <w:r>
-        <w:rPr>
-          <w:lang w:val="en-US"/>
-        </w:rPr>
-        <w:t xml:space="preserve"> Send the esp32 to me and I will update it and send it back.</w:t>
+        <w:t xml:space="preserve"> an esp32 flash program. I have only done this from </w:t>
+      </w:r>
+      <w:proofErr w:type="spellStart"/>
+      <w:r>
+        <w:rPr>
+          <w:lang w:val="en-US"/>
+        </w:rPr>
+        <w:t>platformio</w:t>
+      </w:r>
+      <w:proofErr w:type="spellEnd"/>
+      <w:r>
+        <w:rPr>
+          <w:lang w:val="en-US"/>
+        </w:rPr>
+        <w:t>, but there are probably other ways.</w:t>
+      </w:r>
+      <w:r>
+        <w:rPr>
+          <w:lang w:val="en-US"/>
+        </w:rPr>
+        <w:t xml:space="preserve"> Send </w:t>
+      </w:r>
+      <w:proofErr w:type="gramStart"/>
+      <w:r>
+        <w:rPr>
+          <w:lang w:val="en-US"/>
+        </w:rPr>
+        <w:t>the esp32</w:t>
+      </w:r>
+      <w:proofErr w:type="gramEnd"/>
+      <w:r>
+        <w:rPr>
+          <w:lang w:val="en-US"/>
+        </w:rPr>
+        <w:t xml:space="preserve"> to me and I will update it and send it back.</w:t>
       </w:r>
       <w:r>
         <w:rPr>
@@ -1629,7 +2625,21 @@
         <w:rPr>
           <w:lang w:val="en-US"/>
         </w:rPr>
-        <w:t>DTMF (aka touch-tones) can be sent from the transmitter to control certain operations of the radio. It works best when the tones are sent for at least a second. It is usually also necessary to wait 2 seconds after pressing the transmit button on the radio. All commands consist of a ‘*’ followed by a digit. The following commands are available.</w:t>
+        <w:t xml:space="preserve">DTMF (aka touch-tones) can be sent from the transmitter to control certain operations of the radio. It works best when the tones are sent for at least a second. It is usually also necessary to wait 2 seconds after pressing the transmit button on the radio. All commands consist of </w:t>
+      </w:r>
+      <w:proofErr w:type="gramStart"/>
+      <w:r>
+        <w:rPr>
+          <w:lang w:val="en-US"/>
+        </w:rPr>
+        <w:t>a ‘*’</w:t>
+      </w:r>
+      <w:proofErr w:type="gramEnd"/>
+      <w:r>
+        <w:rPr>
+          <w:lang w:val="en-US"/>
+        </w:rPr>
+        <w:t xml:space="preserve"> followed by a digit. The following commands are available.</w:t>
       </w:r>
     </w:p>
     <w:p/>
@@ -1638,7 +2648,21 @@
         <w:rPr>
           <w:lang w:val="en-US"/>
         </w:rPr>
-        <w:t>Please feel free to request additional commands. I’m sure there are other usual things that can be done remotely using DTMF signals. Also note that these functions have not yet been tested extensively so there may be some bugs in the code. I will fix as soon as I can after I find out what they are.</w:t>
+        <w:t xml:space="preserve">Please feel free to request additional commands. I’m sure there are other usual things that can be done remotely using DTMF signals. Also note that these functions have not yet been tested extensively so there may be some bugs in the code. I will </w:t>
+      </w:r>
+      <w:proofErr w:type="gramStart"/>
+      <w:r>
+        <w:rPr>
+          <w:lang w:val="en-US"/>
+        </w:rPr>
+        <w:t>fix</w:t>
+      </w:r>
+      <w:proofErr w:type="gramEnd"/>
+      <w:r>
+        <w:rPr>
+          <w:lang w:val="en-US"/>
+        </w:rPr>
+        <w:t xml:space="preserve"> as soon as I can after I find out what they are.</w:t>
       </w:r>
     </w:p>
     <w:p>
@@ -1738,7 +2762,15 @@
         <w:t xml:space="preserve">All operations can be controlled by the rotary push button on the </w:t>
       </w:r>
       <w:r>
-        <w:t>box and the two extra buttons to the left labelled B0 and B1</w:t>
+        <w:t xml:space="preserve">box and the two extra buttons </w:t>
+      </w:r>
+      <w:proofErr w:type="gramStart"/>
+      <w:r>
+        <w:t>to</w:t>
+      </w:r>
+      <w:proofErr w:type="gramEnd"/>
+      <w:r>
+        <w:t xml:space="preserve"> the left labelled B0 and B1</w:t>
       </w:r>
       <w:r>
         <w:t>.</w:t>
@@ -1840,12 +2872,14 @@
       <w:r>
         <w:t xml:space="preserve"> The top one is called </w:t>
       </w:r>
+      <w:proofErr w:type="gramStart"/>
       <w:r>
         <w:t>B</w:t>
       </w:r>
       <w:r>
         <w:t>0</w:t>
       </w:r>
+      <w:proofErr w:type="gramEnd"/>
       <w:r>
         <w:t xml:space="preserve"> and the bottom one is called </w:t>
       </w:r>
@@ -1936,7 +2970,21 @@
         <w:rPr>
           <w:lang w:val="da-DK"/>
         </w:rPr>
-        <w:t xml:space="preserve"> During Run Mode</w:t>
+        <w:t xml:space="preserve"> </w:t>
+      </w:r>
+      <w:proofErr w:type="spellStart"/>
+      <w:r>
+        <w:rPr>
+          <w:lang w:val="da-DK"/>
+        </w:rPr>
+        <w:t>During</w:t>
+      </w:r>
+      <w:proofErr w:type="spellEnd"/>
+      <w:r>
+        <w:rPr>
+          <w:lang w:val="da-DK"/>
+        </w:rPr>
+        <w:t xml:space="preserve"> Run Mode</w:t>
       </w:r>
     </w:p>
     <w:p>
@@ -2011,12 +3059,26 @@
         <w:rPr>
           <w:lang w:val="da-DK"/>
         </w:rPr>
-        <w:t>1 During Menu Mod</w:t>
-      </w:r>
+        <w:t xml:space="preserve">1 </w:t>
+      </w:r>
+      <w:proofErr w:type="spellStart"/>
       <w:r>
         <w:rPr>
           <w:lang w:val="da-DK"/>
         </w:rPr>
+        <w:t>During</w:t>
+      </w:r>
+      <w:proofErr w:type="spellEnd"/>
+      <w:r>
+        <w:rPr>
+          <w:lang w:val="da-DK"/>
+        </w:rPr>
+        <w:t xml:space="preserve"> Menu Mod</w:t>
+      </w:r>
+      <w:r>
+        <w:rPr>
+          <w:lang w:val="da-DK"/>
+        </w:rPr>
         <w:t>e</w:t>
       </w:r>
     </w:p>
@@ -2054,7 +3116,21 @@
         <w:rPr>
           <w:lang w:val="en-US"/>
         </w:rPr>
-        <w:t xml:space="preserve"> if at the top menu. Long </w:t>
+        <w:t xml:space="preserve"> if </w:t>
+      </w:r>
+      <w:proofErr w:type="gramStart"/>
+      <w:r>
+        <w:rPr>
+          <w:lang w:val="en-US"/>
+        </w:rPr>
+        <w:t>at</w:t>
+      </w:r>
+      <w:proofErr w:type="gramEnd"/>
+      <w:r>
+        <w:rPr>
+          <w:lang w:val="en-US"/>
+        </w:rPr>
+        <w:t xml:space="preserve"> the top menu. Long </w:t>
       </w:r>
       <w:r>
         <w:rPr>
@@ -2078,7 +3154,21 @@
         <w:rPr>
           <w:lang w:val="en-US"/>
         </w:rPr>
-        <w:t>displays some help (if available) about the current menu item</w:t>
+        <w:t xml:space="preserve">displays some help (if available) </w:t>
+      </w:r>
+      <w:proofErr w:type="gramStart"/>
+      <w:r>
+        <w:rPr>
+          <w:lang w:val="en-US"/>
+        </w:rPr>
+        <w:t>about</w:t>
+      </w:r>
+      <w:proofErr w:type="gramEnd"/>
+      <w:r>
+        <w:rPr>
+          <w:lang w:val="en-US"/>
+        </w:rPr>
+        <w:t xml:space="preserve"> the current menu item</w:t>
       </w:r>
       <w:r>
         <w:rPr>
@@ -2090,7 +3180,35 @@
         <w:rPr>
           <w:lang w:val="en-US"/>
         </w:rPr>
-        <w:t xml:space="preserve"> Note that currently only a few menu items have help. More will be added in the future.</w:t>
+        <w:t xml:space="preserve"> Note that currently only a few </w:t>
+      </w:r>
+      <w:proofErr w:type="gramStart"/>
+      <w:r>
+        <w:rPr>
+          <w:lang w:val="en-US"/>
+        </w:rPr>
+        <w:t>menu items</w:t>
+      </w:r>
+      <w:proofErr w:type="gramEnd"/>
+      <w:r>
+        <w:rPr>
+          <w:lang w:val="en-US"/>
+        </w:rPr>
+        <w:t xml:space="preserve"> have </w:t>
+      </w:r>
+      <w:proofErr w:type="gramStart"/>
+      <w:r>
+        <w:rPr>
+          <w:lang w:val="en-US"/>
+        </w:rPr>
+        <w:t>help</w:t>
+      </w:r>
+      <w:proofErr w:type="gramEnd"/>
+      <w:r>
+        <w:rPr>
+          <w:lang w:val="en-US"/>
+        </w:rPr>
+        <w:t>. More will be added in the future.</w:t>
       </w:r>
     </w:p>
     <w:p>
@@ -2215,7 +3333,35 @@
         <w:rPr>
           <w:lang w:val="en-US"/>
         </w:rPr>
-        <w:t xml:space="preserve">. After a dial click the increment will change to 10 and dial will </w:t>
+        <w:t xml:space="preserve">. After a dial </w:t>
+      </w:r>
+      <w:proofErr w:type="gramStart"/>
+      <w:r>
+        <w:rPr>
+          <w:lang w:val="en-US"/>
+        </w:rPr>
+        <w:t>click</w:t>
+      </w:r>
+      <w:proofErr w:type="gramEnd"/>
+      <w:r>
+        <w:rPr>
+          <w:lang w:val="en-US"/>
+        </w:rPr>
+        <w:t xml:space="preserve"> the increment will change to </w:t>
+      </w:r>
+      <w:proofErr w:type="gramStart"/>
+      <w:r>
+        <w:rPr>
+          <w:lang w:val="en-US"/>
+        </w:rPr>
+        <w:t>10</w:t>
+      </w:r>
+      <w:proofErr w:type="gramEnd"/>
+      <w:r>
+        <w:rPr>
+          <w:lang w:val="en-US"/>
+        </w:rPr>
+        <w:t xml:space="preserve"> and dial will </w:t>
       </w:r>
       <w:r>
         <w:rPr>
@@ -2311,7 +3457,15 @@
     </w:p>
     <w:p>
       <w:r>
-        <w:t xml:space="preserve">Dial rotation is only useful in the menu system, it doesn’t have any function while the radio </w:t>
+        <w:t xml:space="preserve">Dial rotation is only useful in the menu </w:t>
+      </w:r>
+      <w:proofErr w:type="gramStart"/>
+      <w:r>
+        <w:t>system,</w:t>
+      </w:r>
+      <w:proofErr w:type="gramEnd"/>
+      <w:r>
+        <w:t xml:space="preserve"> it doesn’t have any function while the radio </w:t>
       </w:r>
       <w:r>
         <w:t>status is displayed.</w:t>
@@ -2344,13 +3498,29 @@
         <w:t>,</w:t>
       </w:r>
       <w:r>
-        <w:t xml:space="preserve"> boolean values toggle with each click.</w:t>
+        <w:t xml:space="preserve"> </w:t>
+      </w:r>
+      <w:proofErr w:type="spellStart"/>
+      <w:r>
+        <w:t>boolean</w:t>
+      </w:r>
+      <w:proofErr w:type="spellEnd"/>
+      <w:r>
+        <w:t xml:space="preserve"> values toggle with each click.</w:t>
       </w:r>
       <w:r>
         <w:t xml:space="preserve"> Multiple selections cycle through all the available options.</w:t>
       </w:r>
       <w:r>
-        <w:t xml:space="preserve"> Integer values go to another screen that shows the minimum and maximum values. Rotating the dial right increases the value while rotating to the left decreases it by the increment amount. The increment amount can be changed by clicking the button which will cycle between different values. One of the values will be a reset to the original value, activated with a long press. A long press is also used to accept the new value and return to the menu. A * </w:t>
+        <w:t xml:space="preserve"> Integer values go to another screen that shows the minimum and maximum values. Rotating the dial right increases the value while rotating to the left decreases it by the increment amount. The increment amount can be changed by clicking the button which will cycle between different values. One of the values will be a reset to the original value, activated with a long press. </w:t>
+      </w:r>
+      <w:proofErr w:type="gramStart"/>
+      <w:r>
+        <w:t>A long</w:t>
+      </w:r>
+      <w:proofErr w:type="gramEnd"/>
+      <w:r>
+        <w:t xml:space="preserve"> press is also used to accept the new value and return to the menu. A * </w:t>
       </w:r>
       <w:r>
         <w:t xml:space="preserve">or highlight </w:t>
@@ -2359,10 +3529,18 @@
         <w:t xml:space="preserve">indicates the active menu line. A + in front of the menu means another menu will be activated. </w:t>
       </w:r>
       <w:r>
-        <w:t>Any menu item starting with ‘-‘</w:t>
-      </w:r>
-      <w:r>
-        <w:t xml:space="preserve"> goes back to the previous menu when clicked. A</w:t>
+        <w:t>Any menu item starting with ‘</w:t>
+      </w:r>
+      <w:proofErr w:type="gramStart"/>
+      <w:r>
+        <w:t>-‘</w:t>
+      </w:r>
+      <w:r>
+        <w:t xml:space="preserve"> goes</w:t>
+      </w:r>
+      <w:proofErr w:type="gramEnd"/>
+      <w:r>
+        <w:t xml:space="preserve"> back to the previous menu when clicked. A</w:t>
       </w:r>
       <w:r>
         <w:t xml:space="preserve"> dial</w:t>
@@ -2494,7 +3672,15 @@
         <w:ind w:left="1440"/>
       </w:pPr>
       <w:r>
-        <w:t>Select menu item, including return to previous menu</w:t>
+        <w:t xml:space="preserve">Select menu </w:t>
+      </w:r>
+      <w:proofErr w:type="gramStart"/>
+      <w:r>
+        <w:t>item</w:t>
+      </w:r>
+      <w:proofErr w:type="gramEnd"/>
+      <w:r>
+        <w:t>, including return to previous menu</w:t>
       </w:r>
     </w:p>
     <w:p>
@@ -2502,8 +3688,13 @@
         <w:ind w:left="1440"/>
       </w:pPr>
       <w:r>
-        <w:t>Toggle booleans</w:t>
-      </w:r>
+        <w:t xml:space="preserve">Toggle </w:t>
+      </w:r>
+      <w:proofErr w:type="spellStart"/>
+      <w:r>
+        <w:t>booleans</w:t>
+      </w:r>
+      <w:proofErr w:type="spellEnd"/>
     </w:p>
     <w:p>
       <w:pPr>
@@ -2558,7 +3749,15 @@
         <w:t xml:space="preserve"> The bottom of the screen shows the</w:t>
       </w:r>
       <w:r>
-        <w:t xml:space="preserve"> battery status on the right if it has been enabled. This is related to the current battery voltage and will drop while transmitting. There are also 4 LED’s on the PCB that can be seen through</w:t>
+        <w:t xml:space="preserve"> battery status on the right if it has been enabled. This is related to the current battery voltage and will drop while transmitting. There are also 4 </w:t>
+      </w:r>
+      <w:proofErr w:type="gramStart"/>
+      <w:r>
+        <w:t>LED’s</w:t>
+      </w:r>
+      <w:proofErr w:type="gramEnd"/>
+      <w:r>
+        <w:t xml:space="preserve"> on the PCB that can be seen through</w:t>
       </w:r>
       <w:r>
         <w:t xml:space="preserve"> the slot on the </w:t>
@@ -2571,16 +3770,37 @@
         <w:t xml:space="preserve"> of the case</w:t>
       </w:r>
       <w:r>
-        <w:t>. These LED’s are controlled by the battery charger circuit and indicate the battery status during running and charging.</w:t>
+        <w:t xml:space="preserve">. These </w:t>
+      </w:r>
+      <w:proofErr w:type="gramStart"/>
+      <w:r>
+        <w:t>LED’s</w:t>
+      </w:r>
+      <w:proofErr w:type="gramEnd"/>
+      <w:r>
+        <w:t xml:space="preserve"> are controlled by the battery charger circuit and indicate the battery status during running and charging.</w:t>
       </w:r>
     </w:p>
     <w:p/>
     <w:p>
-      <w:r>
-        <w:t>During transmitting the bottom left shows an animated red dot. In a future firmware update the</w:t>
-      </w:r>
-      <w:r>
-        <w:t xml:space="preserve"> received DTMF characters will be display next to this.</w:t>
+      <w:proofErr w:type="gramStart"/>
+      <w:r>
+        <w:t>During</w:t>
+      </w:r>
+      <w:proofErr w:type="gramEnd"/>
+      <w:r>
+        <w:t xml:space="preserve"> transmitting the bottom left shows an animated red dot. In a future firmware update the</w:t>
+      </w:r>
+      <w:r>
+        <w:t xml:space="preserve"> </w:t>
+      </w:r>
+      <w:proofErr w:type="gramStart"/>
+      <w:r>
+        <w:t>received DTMF characters</w:t>
+      </w:r>
+      <w:proofErr w:type="gramEnd"/>
+      <w:r>
+        <w:t xml:space="preserve"> will be display next to this.</w:t>
       </w:r>
     </w:p>
     <w:p>
@@ -2595,8 +3815,13 @@
       <w:r>
         <w:t xml:space="preserve">The following sections detail each entry in </w:t>
       </w:r>
-      <w:r>
-        <w:t>all of the menus</w:t>
+      <w:proofErr w:type="gramStart"/>
+      <w:r>
+        <w:t>all of</w:t>
+      </w:r>
+      <w:proofErr w:type="gramEnd"/>
+      <w:r>
+        <w:t xml:space="preserve"> the menus</w:t>
       </w:r>
       <w:r>
         <w:t xml:space="preserve"> starting with the main or top menu</w:t>
@@ -2623,7 +3848,15 @@
         <w:t>’</w:t>
       </w:r>
       <w:r>
-        <w:t xml:space="preserve"> or a ‘-‘ to indicate a range</w:t>
+        <w:t xml:space="preserve"> or a ‘</w:t>
+      </w:r>
+      <w:proofErr w:type="gramStart"/>
+      <w:r>
+        <w:t>-‘ to</w:t>
+      </w:r>
+      <w:proofErr w:type="gramEnd"/>
+      <w:r>
+        <w:t xml:space="preserve"> indicate a range</w:t>
       </w:r>
       <w:r>
         <w:t>.</w:t>
@@ -2648,7 +3881,15 @@
         <w:t xml:space="preserve"> Some menu entries may depend on other menu items </w:t>
       </w:r>
       <w:r>
-        <w:t xml:space="preserve">settings. For example the audio file name menu item is hidden unless </w:t>
+        <w:t xml:space="preserve">settings. For </w:t>
+      </w:r>
+      <w:proofErr w:type="gramStart"/>
+      <w:r>
+        <w:t>example</w:t>
+      </w:r>
+      <w:proofErr w:type="gramEnd"/>
+      <w:r>
+        <w:t xml:space="preserve"> the audio file name menu item is hidden unless </w:t>
       </w:r>
       <w:r>
         <w:t>“Play Audio File” is Yes.</w:t>
@@ -2667,7 +3908,11 @@
         <w:pStyle w:val="Heading3"/>
       </w:pPr>
       <w:r>
-        <w:t>XMIT: On</w:t>
+        <w:t xml:space="preserve">XMIT: </w:t>
+      </w:r>
+      <w:proofErr w:type="spellStart"/>
+      <w:r>
+        <w:t>On</w:t>
       </w:r>
       <w:r>
         <w:t>|</w:t>
@@ -2675,13 +3920,43 @@
       <w:r>
         <w:t>Off</w:t>
       </w:r>
-    </w:p>
-    <w:p>
-      <w:r>
-        <w:t xml:space="preserve">This must be set to On for the radio to begin </w:t>
-      </w:r>
-      <w:r>
-        <w:t>transmitting. If saved as On then the radio will start sending right after booting. If it is Off it will not automatically start sending. It can be toggle</w:t>
+      <w:proofErr w:type="spellEnd"/>
+    </w:p>
+    <w:p>
+      <w:r>
+        <w:t xml:space="preserve">This must be set to </w:t>
+      </w:r>
+      <w:proofErr w:type="gramStart"/>
+      <w:r>
+        <w:t>On</w:t>
+      </w:r>
+      <w:proofErr w:type="gramEnd"/>
+      <w:r>
+        <w:t xml:space="preserve"> for the radio to begin </w:t>
+      </w:r>
+      <w:proofErr w:type="gramStart"/>
+      <w:r>
+        <w:t>transmitting</w:t>
+      </w:r>
+      <w:proofErr w:type="gramEnd"/>
+      <w:r>
+        <w:t xml:space="preserve">. If saved as </w:t>
+      </w:r>
+      <w:proofErr w:type="gramStart"/>
+      <w:r>
+        <w:t>On</w:t>
+      </w:r>
+      <w:proofErr w:type="gramEnd"/>
+      <w:r>
+        <w:t xml:space="preserve"> then the radio will start sending right after booting. If it is </w:t>
+      </w:r>
+      <w:proofErr w:type="gramStart"/>
+      <w:r>
+        <w:t>Off</w:t>
+      </w:r>
+      <w:proofErr w:type="gramEnd"/>
+      <w:r>
+        <w:t xml:space="preserve"> it will not automatically start sending. It can be toggle</w:t>
       </w:r>
       <w:r>
         <w:t>d</w:t>
@@ -2690,15 +3965,24 @@
         <w:t xml:space="preserve"> with the B0 button while in run mode</w:t>
       </w:r>
       <w:r>
-        <w:t>. Using B0 does not changed</w:t>
-      </w:r>
+        <w:t xml:space="preserve">. Using B0 does not </w:t>
+      </w:r>
+      <w:proofErr w:type="gramStart"/>
+      <w:r>
+        <w:t>changed</w:t>
+      </w:r>
+      <w:proofErr w:type="gramEnd"/>
     </w:p>
     <w:p>
       <w:pPr>
         <w:pStyle w:val="Heading3"/>
       </w:pPr>
       <w:r>
-        <w:t>TX Power: High</w:t>
+        <w:t xml:space="preserve">TX Power: </w:t>
+      </w:r>
+      <w:proofErr w:type="spellStart"/>
+      <w:r>
+        <w:t>High</w:t>
       </w:r>
       <w:r>
         <w:t>|</w:t>
@@ -2710,6 +3994,7 @@
         </w:rPr>
         <w:t>Low</w:t>
       </w:r>
+      <w:proofErr w:type="spellEnd"/>
     </w:p>
     <w:p>
       <w:r>
@@ -2765,7 +4050,11 @@
         <w:t>:</w:t>
       </w:r>
       <w:r>
-        <w:t xml:space="preserve"> Yes|</w:t>
+        <w:t xml:space="preserve"> </w:t>
+      </w:r>
+      <w:proofErr w:type="spellStart"/>
+      <w:r>
+        <w:t>Yes|</w:t>
       </w:r>
       <w:r>
         <w:rPr>
@@ -2774,6 +4063,7 @@
         </w:rPr>
         <w:t>No</w:t>
       </w:r>
+      <w:proofErr w:type="spellEnd"/>
     </w:p>
     <w:p>
       <w:r>
@@ -2788,7 +4078,11 @@
         <w:pStyle w:val="Heading3"/>
       </w:pPr>
       <w:r>
-        <w:t>Send GPS: Yes|</w:t>
+        <w:t xml:space="preserve">Send GPS: </w:t>
+      </w:r>
+      <w:proofErr w:type="spellStart"/>
+      <w:r>
+        <w:t>Yes|</w:t>
       </w:r>
       <w:r>
         <w:rPr>
@@ -2797,6 +4091,7 @@
         </w:rPr>
         <w:t>NO</w:t>
       </w:r>
+      <w:proofErr w:type="spellEnd"/>
       <w:r>
         <w:t xml:space="preserve"> (beacon mode only)</w:t>
       </w:r>
@@ -2809,8 +4104,13 @@
         <w:t xml:space="preserve">ude and longitude values. The values must be entered manually from a phone </w:t>
       </w:r>
       <w:r>
-        <w:t>or GPS device. A future version of the hardware may have a built-in GPS module</w:t>
-      </w:r>
+        <w:t xml:space="preserve">or GPS device. A future version of the hardware may have a built-in GPS </w:t>
+      </w:r>
+      <w:proofErr w:type="gramStart"/>
+      <w:r>
+        <w:t>module</w:t>
+      </w:r>
+      <w:proofErr w:type="gramEnd"/>
       <w:r>
         <w:t xml:space="preserve"> or it may be able to connect to a serial GPS device using the USB connection.</w:t>
       </w:r>
@@ -2826,9 +4126,13 @@
       <w:r>
         <w:t>+/-</w:t>
       </w:r>
+      <w:proofErr w:type="spellStart"/>
+      <w:proofErr w:type="gramStart"/>
       <w:r>
         <w:t>n.nnnnnn</w:t>
       </w:r>
+      <w:proofErr w:type="spellEnd"/>
+      <w:proofErr w:type="gramEnd"/>
       <w:r>
         <w:t xml:space="preserve"> (</w:t>
       </w:r>
@@ -2875,7 +4179,17 @@
         <w:pStyle w:val="Heading3"/>
       </w:pPr>
       <w:r>
-        <w:t xml:space="preserve">Longitude: +/-n.nnnnnn (Send </w:t>
+        <w:t>Longitude: +/-</w:t>
+      </w:r>
+      <w:proofErr w:type="spellStart"/>
+      <w:proofErr w:type="gramStart"/>
+      <w:r>
+        <w:t>n.nnnnnn</w:t>
+      </w:r>
+      <w:proofErr w:type="spellEnd"/>
+      <w:proofErr w:type="gramEnd"/>
+      <w:r>
+        <w:t xml:space="preserve"> (Send </w:t>
       </w:r>
       <w:r>
         <w:rPr>
@@ -2979,8 +4293,13 @@
         <w:t>Play Audio File</w:t>
       </w:r>
       <w:r>
-        <w:t>: Yes|No</w:t>
-      </w:r>
+        <w:t xml:space="preserve">: </w:t>
+      </w:r>
+      <w:proofErr w:type="spellStart"/>
+      <w:r>
+        <w:t>Yes|No</w:t>
+      </w:r>
+      <w:proofErr w:type="spellEnd"/>
     </w:p>
     <w:p>
       <w:r>
@@ -3004,13 +4323,37 @@
     </w:p>
     <w:p>
       <w:r>
-        <w:t xml:space="preserve">This menu item is only visible if the previous item is set to Yes. Clicking the dial will list all of the </w:t>
-      </w:r>
-      <w:r>
-        <w:t>*.txt files on the SD card. The dial is rotated to highlight a file and a long press will set it</w:t>
-      </w:r>
-      <w:r>
-        <w:t>. Note that a click of dial just exits the list of file with no selection being performed.</w:t>
+        <w:t xml:space="preserve">This menu item is only visible if the previous item is set to Yes. Clicking the dial will list </w:t>
+      </w:r>
+      <w:proofErr w:type="gramStart"/>
+      <w:r>
+        <w:t>all of</w:t>
+      </w:r>
+      <w:proofErr w:type="gramEnd"/>
+      <w:r>
+        <w:t xml:space="preserve"> the </w:t>
+      </w:r>
+      <w:r>
+        <w:t xml:space="preserve">*.txt files on the SD card. The dial is rotated to highlight a </w:t>
+      </w:r>
+      <w:proofErr w:type="gramStart"/>
+      <w:r>
+        <w:t>file</w:t>
+      </w:r>
+      <w:proofErr w:type="gramEnd"/>
+      <w:r>
+        <w:t xml:space="preserve"> and a long press will set it</w:t>
+      </w:r>
+      <w:r>
+        <w:t xml:space="preserve">. Note that a click of dial just exits the list of </w:t>
+      </w:r>
+      <w:proofErr w:type="gramStart"/>
+      <w:r>
+        <w:t>file</w:t>
+      </w:r>
+      <w:proofErr w:type="gramEnd"/>
+      <w:r>
+        <w:t xml:space="preserve"> with no selection being performed.</w:t>
       </w:r>
     </w:p>
     <w:p>
@@ -3053,7 +4396,15 @@
         <w:t>When B0 or the menu starts the transmit mode</w:t>
       </w:r>
       <w:r>
-        <w:t xml:space="preserve"> the system will not actually begin sending until this time is expired. This allows the radio to be hidden</w:t>
+        <w:t xml:space="preserve"> the system will not actually begin sending until this time </w:t>
+      </w:r>
+      <w:proofErr w:type="gramStart"/>
+      <w:r>
+        <w:t>is expired</w:t>
+      </w:r>
+      <w:proofErr w:type="gramEnd"/>
+      <w:r>
+        <w:t>. This allows the radio to be hidden</w:t>
       </w:r>
       <w:r>
         <w:t xml:space="preserve"> and </w:t>
@@ -3070,8 +4421,13 @@
         <w:pStyle w:val="Heading3"/>
       </w:pPr>
       <w:r>
-        <w:t>Timer Mode: Fixed|Random</w:t>
-      </w:r>
+        <w:t xml:space="preserve">Timer Mode: </w:t>
+      </w:r>
+      <w:proofErr w:type="spellStart"/>
+      <w:r>
+        <w:t>Fixed|Random</w:t>
+      </w:r>
+      <w:proofErr w:type="spellEnd"/>
     </w:p>
     <w:p>
       <w:r>
@@ -3088,7 +4444,23 @@
         <w:t>chosen</w:t>
       </w:r>
       <w:r>
-        <w:t xml:space="preserve"> from the allowed values set in the Min and Max values for TX Send and Pause. This makes the timing less predictable and make the game a little bit harder.</w:t>
+        <w:t xml:space="preserve"> from the allowed values set in the Min and Max values for TX Send and Pause. This makes </w:t>
+      </w:r>
+      <w:proofErr w:type="gramStart"/>
+      <w:r>
+        <w:t>the timing</w:t>
+      </w:r>
+      <w:proofErr w:type="gramEnd"/>
+      <w:r>
+        <w:t xml:space="preserve"> less predictable and </w:t>
+      </w:r>
+      <w:proofErr w:type="gramStart"/>
+      <w:r>
+        <w:t>make</w:t>
+      </w:r>
+      <w:proofErr w:type="gramEnd"/>
+      <w:r>
+        <w:t xml:space="preserve"> the game a little bit harder.</w:t>
       </w:r>
       <w:r>
         <w:t xml:space="preserve"> Keep your ears on!</w:t>
@@ -3131,7 +4503,11 @@
         <w:t xml:space="preserve"> If </w:t>
       </w:r>
       <w:r>
-        <w:t>this time is set to less than the total ID</w:t>
+        <w:t xml:space="preserve">this time is set to less than the total </w:t>
+      </w:r>
+      <w:proofErr w:type="spellStart"/>
+      <w:r>
+        <w:t>ID</w:t>
       </w:r>
       <w:r>
         <w:t>+</w:t>
@@ -3140,19 +4516,39 @@
         <w:t>Call</w:t>
       </w:r>
       <w:r>
-        <w:t xml:space="preserve">+Audio time then there will be only </w:t>
+        <w:t>+Audio</w:t>
+      </w:r>
+      <w:proofErr w:type="spellEnd"/>
+      <w:r>
+        <w:t xml:space="preserve"> </w:t>
+      </w:r>
+      <w:proofErr w:type="gramStart"/>
+      <w:r>
+        <w:t>time</w:t>
+      </w:r>
+      <w:proofErr w:type="gramEnd"/>
+      <w:r>
+        <w:t xml:space="preserve"> then there will be only </w:t>
       </w:r>
       <w:r>
         <w:t>one cycle of data transmitted.</w:t>
       </w:r>
       <w:r>
-        <w:t xml:space="preserve"> If the time is longer then the ID</w:t>
+        <w:t xml:space="preserve"> If the time is longer then the </w:t>
+      </w:r>
+      <w:proofErr w:type="spellStart"/>
+      <w:r>
+        <w:t>ID</w:t>
       </w:r>
       <w:r>
         <w:t>+Call</w:t>
       </w:r>
       <w:r>
-        <w:t xml:space="preserve">+Audio cycles will be repeated until the time has expired. Note that </w:t>
+        <w:t>+Audio</w:t>
+      </w:r>
+      <w:proofErr w:type="spellEnd"/>
+      <w:r>
+        <w:t xml:space="preserve"> cycles will be repeated until the time has expired. Note that </w:t>
       </w:r>
       <w:r>
         <w:t xml:space="preserve">both ID and Audio will always be completed before </w:t>
@@ -3215,7 +4611,15 @@
         <w:t xml:space="preserve">In </w:t>
       </w:r>
       <w:r>
-        <w:t>random mode this is the maximum send time.</w:t>
+        <w:t xml:space="preserve">random mode this is the maximum </w:t>
+      </w:r>
+      <w:proofErr w:type="gramStart"/>
+      <w:r>
+        <w:t>send</w:t>
+      </w:r>
+      <w:proofErr w:type="gramEnd"/>
+      <w:r>
+        <w:t xml:space="preserve"> time.</w:t>
       </w:r>
     </w:p>
     <w:p>
@@ -3249,12 +4653,25 @@
         <w:pStyle w:val="Heading3"/>
       </w:pPr>
       <w:r>
-        <w:t>Radio Pause: Sleep|Awake</w:t>
-      </w:r>
-    </w:p>
-    <w:p>
-      <w:r>
-        <w:t>During pause time the radio can be put into sleep mode. This lowers the power consumption and lets the battery last longer. However note that this also means that the DTMF commands are disabled since the radio is asleep!</w:t>
+        <w:t xml:space="preserve">Radio Pause: </w:t>
+      </w:r>
+      <w:proofErr w:type="spellStart"/>
+      <w:r>
+        <w:t>Sleep|Awake</w:t>
+      </w:r>
+      <w:proofErr w:type="spellEnd"/>
+    </w:p>
+    <w:p>
+      <w:r>
+        <w:t xml:space="preserve">During pause time the radio can be put into sleep mode. This lowers the power consumption and lets the battery last longer. </w:t>
+      </w:r>
+      <w:proofErr w:type="gramStart"/>
+      <w:r>
+        <w:t>However</w:t>
+      </w:r>
+      <w:proofErr w:type="gramEnd"/>
+      <w:r>
+        <w:t xml:space="preserve"> note that this also means that the DTMF commands are disabled since the radio is asleep!</w:t>
       </w:r>
     </w:p>
     <w:p>
@@ -3281,7 +4698,15 @@
         <w:t>This is the frequency offset from the transmit frequency that the radio uses to receive DTMF commands</w:t>
       </w:r>
       <w:r>
-        <w:t>. An offset is recommended. If 0 is used the radio will only listen when it isn’t sending. It has not been tested if it listens during sending when the offset is not 0.</w:t>
+        <w:t xml:space="preserve">. An offset is recommended. If 0 is used the radio will only listen when it isn’t </w:t>
+      </w:r>
+      <w:proofErr w:type="gramStart"/>
+      <w:r>
+        <w:t>sending</w:t>
+      </w:r>
+      <w:proofErr w:type="gramEnd"/>
+      <w:r>
+        <w:t>. It has not been tested if it listens during sending when the offset is not 0.</w:t>
       </w:r>
     </w:p>
     <w:p>
@@ -3519,7 +4944,15 @@
     </w:p>
     <w:p>
       <w:r>
-        <w:t>This command saves the current settings into the selected file. If it already exists the user will be asked to confirm overwriting the file.</w:t>
+        <w:t xml:space="preserve">This command saves the current settings into the selected file. If it already </w:t>
+      </w:r>
+      <w:proofErr w:type="gramStart"/>
+      <w:r>
+        <w:t>exists</w:t>
+      </w:r>
+      <w:proofErr w:type="gramEnd"/>
+      <w:r>
+        <w:t xml:space="preserve"> the user will be asked to confirm overwriting the file.</w:t>
       </w:r>
     </w:p>
     <w:p>
@@ -3532,7 +4965,15 @@
     </w:p>
     <w:p>
       <w:r>
-        <w:t>This command asks the user for the name and then sets all of the system settings except the battery calibration using the values in the file.</w:t>
+        <w:t xml:space="preserve">This command asks the user for the name and then sets </w:t>
+      </w:r>
+      <w:proofErr w:type="gramStart"/>
+      <w:r>
+        <w:t>all of</w:t>
+      </w:r>
+      <w:proofErr w:type="gramEnd"/>
+      <w:r>
+        <w:t xml:space="preserve"> the system settings except the battery calibration using the values in the file.</w:t>
       </w:r>
     </w:p>
     <w:p>
@@ -3572,11 +5013,16 @@
         <w:pStyle w:val="Heading4"/>
       </w:pPr>
       <w:r>
-        <w:t>Dimming Mode: None</w:t>
+        <w:t xml:space="preserve">Dimming Mode: </w:t>
+      </w:r>
+      <w:proofErr w:type="spellStart"/>
+      <w:r>
+        <w:t>None</w:t>
       </w:r>
       <w:r>
         <w:t>|Timer</w:t>
       </w:r>
+      <w:proofErr w:type="spellEnd"/>
     </w:p>
     <w:p>
       <w:r>
@@ -3647,7 +5093,15 @@
     </w:p>
     <w:p>
       <w:r>
-        <w:t>Lines of text that too long for the display will scroll back and forth. The following settings control the speed.</w:t>
+        <w:t xml:space="preserve">Lines of text that </w:t>
+      </w:r>
+      <w:proofErr w:type="gramStart"/>
+      <w:r>
+        <w:t>too</w:t>
+      </w:r>
+      <w:proofErr w:type="gramEnd"/>
+      <w:r>
+        <w:t xml:space="preserve"> long for the display will scroll back and forth. The following settings control the speed.</w:t>
       </w:r>
     </w:p>
     <w:p>
@@ -3721,7 +5175,15 @@
         <w:t>Menu selections</w:t>
       </w:r>
       <w:r>
-        <w:t xml:space="preserve"> and selections from a list can be either colored or marked with the ‘*’ character.</w:t>
+        <w:t xml:space="preserve"> and selections from a list can be either colored or marked with </w:t>
+      </w:r>
+      <w:proofErr w:type="gramStart"/>
+      <w:r>
+        <w:t>the ‘*</w:t>
+      </w:r>
+      <w:proofErr w:type="gramEnd"/>
+      <w:r>
+        <w:t>’ character.</w:t>
       </w:r>
     </w:p>
     <w:p>
@@ -3729,12 +5191,28 @@
         <w:pStyle w:val="Heading4"/>
       </w:pPr>
       <w:r>
-        <w:t>Text/HiLite Colors</w:t>
-      </w:r>
-    </w:p>
-    <w:p>
-      <w:r>
-        <w:t>This selection allows for choosing the colors of the text and the highlight. The background screen is always black.</w:t>
+        <w:t>Text/</w:t>
+      </w:r>
+      <w:proofErr w:type="spellStart"/>
+      <w:r>
+        <w:t>HiLite</w:t>
+      </w:r>
+      <w:proofErr w:type="spellEnd"/>
+      <w:r>
+        <w:t xml:space="preserve"> Colors</w:t>
+      </w:r>
+    </w:p>
+    <w:p>
+      <w:r>
+        <w:t xml:space="preserve">This selection </w:t>
+      </w:r>
+      <w:proofErr w:type="gramStart"/>
+      <w:r>
+        <w:t>allows for choosing</w:t>
+      </w:r>
+      <w:proofErr w:type="gramEnd"/>
+      <w:r>
+        <w:t xml:space="preserve"> the colors of the text and the highlight. The background screen is always black.</w:t>
       </w:r>
     </w:p>
     <w:p>
@@ -3750,8 +5228,15 @@
         <w:pStyle w:val="Heading4"/>
       </w:pPr>
       <w:r>
-        <w:t>Direction: Normal:Reverse</w:t>
-      </w:r>
+        <w:t xml:space="preserve">Direction: </w:t>
+      </w:r>
+      <w:proofErr w:type="spellStart"/>
+      <w:proofErr w:type="gramStart"/>
+      <w:r>
+        <w:t>Normal:Reverse</w:t>
+      </w:r>
+      <w:proofErr w:type="spellEnd"/>
+      <w:proofErr w:type="gramEnd"/>
     </w:p>
     <w:p>
       <w:r>
@@ -3784,7 +5269,15 @@
     </w:p>
     <w:p>
       <w:r>
-        <w:t>Since the PCB was designed with 10% resistors for measuring the battery voltage some calibration is needed. A future PCB will probably use better resistors so this won’t be needed.</w:t>
+        <w:t xml:space="preserve">Since the PCB was designed with 10% resistors for measuring the battery voltage some calibration is needed. A future PCB will probably use better </w:t>
+      </w:r>
+      <w:proofErr w:type="gramStart"/>
+      <w:r>
+        <w:t>resistors</w:t>
+      </w:r>
+      <w:proofErr w:type="gramEnd"/>
+      <w:r>
+        <w:t xml:space="preserve"> so this won’t be needed.</w:t>
       </w:r>
     </w:p>
     <w:p>
@@ -3792,8 +5285,13 @@
         <w:pStyle w:val="Heading4"/>
       </w:pPr>
       <w:r>
-        <w:t>Show Battery: Yes|No</w:t>
-      </w:r>
+        <w:t xml:space="preserve">Show Battery: </w:t>
+      </w:r>
+      <w:proofErr w:type="spellStart"/>
+      <w:r>
+        <w:t>Yes|No</w:t>
+      </w:r>
+      <w:proofErr w:type="spellEnd"/>
     </w:p>
     <w:p>
       <w:r>
@@ -3843,7 +5341,15 @@
         <w:t>This continuously reads the battery value</w:t>
       </w:r>
       <w:r>
-        <w:t>. It was originally used for testing, but it seems like it might possibly be useful so it was left in the menu system.</w:t>
+        <w:t xml:space="preserve">. It was originally used for testing, but it seems like it might possibly be </w:t>
+      </w:r>
+      <w:proofErr w:type="gramStart"/>
+      <w:r>
+        <w:t>useful</w:t>
+      </w:r>
+      <w:proofErr w:type="gramEnd"/>
+      <w:r>
+        <w:t xml:space="preserve"> so it was left in the menu system.</w:t>
       </w:r>
     </w:p>
     <w:p>
@@ -3859,10 +5365,26 @@
         <w:t xml:space="preserve">New firmware can be loaded by putting </w:t>
       </w:r>
       <w:r>
-        <w:t>the binary file on the SD card. It must be named RadioFox.BIN.</w:t>
-      </w:r>
-      <w:r>
-        <w:t xml:space="preserve"> There are two prompts, one to confirm overwriting the firmware, and another to allow deletion of the </w:t>
+        <w:t xml:space="preserve">the binary file on the SD card. It must be named </w:t>
+      </w:r>
+      <w:proofErr w:type="spellStart"/>
+      <w:r>
+        <w:t>RadioFox.BIN</w:t>
+      </w:r>
+      <w:proofErr w:type="spellEnd"/>
+      <w:r>
+        <w:t>.</w:t>
+      </w:r>
+      <w:r>
+        <w:t xml:space="preserve"> There are two prompts, one to confirm </w:t>
+      </w:r>
+      <w:proofErr w:type="gramStart"/>
+      <w:r>
+        <w:t>overwriting</w:t>
+      </w:r>
+      <w:proofErr w:type="gramEnd"/>
+      <w:r>
+        <w:t xml:space="preserve"> the firmware, and another to allow deletion of the </w:t>
       </w:r>
       <w:r>
         <w:t>BIN file after installation.</w:t>
@@ -3909,8 +5431,21 @@
         <w:t xml:space="preserve">and reset </w:t>
       </w:r>
       <w:r>
-        <w:t>the eeprom where the settings are save</w:t>
-      </w:r>
+        <w:t xml:space="preserve">the </w:t>
+      </w:r>
+      <w:proofErr w:type="spellStart"/>
+      <w:r>
+        <w:t>eeprom</w:t>
+      </w:r>
+      <w:proofErr w:type="spellEnd"/>
+      <w:r>
+        <w:t xml:space="preserve"> where the settings are </w:t>
+      </w:r>
+      <w:proofErr w:type="gramStart"/>
+      <w:r>
+        <w:t>save</w:t>
+      </w:r>
+      <w:proofErr w:type="gramEnd"/>
       <w:r>
         <w:t xml:space="preserve"> in non-volatile memory. This is how settings are saved while the system is not powered.</w:t>
       </w:r>
@@ -3925,10 +5460,26 @@
     </w:p>
     <w:p>
       <w:r>
-        <w:t>This stores all of the current settings in the non-volatile memory</w:t>
-      </w:r>
-      <w:r>
-        <w:t>. Note that this is not often used since settings are normally saved each time they are changed.</w:t>
+        <w:t xml:space="preserve">This stores </w:t>
+      </w:r>
+      <w:proofErr w:type="gramStart"/>
+      <w:r>
+        <w:t>all of</w:t>
+      </w:r>
+      <w:proofErr w:type="gramEnd"/>
+      <w:r>
+        <w:t xml:space="preserve"> the current settings in the non-volatile memory</w:t>
+      </w:r>
+      <w:r>
+        <w:t xml:space="preserve">. Note that this is not often used since settings are normally saved each </w:t>
+      </w:r>
+      <w:proofErr w:type="gramStart"/>
+      <w:r>
+        <w:t>time</w:t>
+      </w:r>
+      <w:proofErr w:type="gramEnd"/>
+      <w:r>
+        <w:t xml:space="preserve"> they are changed.</w:t>
       </w:r>
     </w:p>
     <w:p>
@@ -3990,6 +5541,7 @@
         <w:docPartUnique/>
       </w:docPartObj>
     </w:sdtPr>
+    <w:sdtEndPr/>
     <w:sdtContent>
       <w:sdt>
         <w:sdtPr>
@@ -3999,6 +5551,7 @@
             <w:docPartUnique/>
           </w:docPartObj>
         </w:sdtPr>
+        <w:sdtEndPr/>
         <w:sdtContent>
           <w:p>
             <w:pPr>
@@ -6361,6 +7914,7 @@
   <w:style w:type="character" w:default="1" w:styleId="DefaultParagraphFont">
     <w:name w:val="Default Paragraph Font"/>
     <w:uiPriority w:val="1"/>
+    <w:semiHidden/>
     <w:unhideWhenUsed/>
   </w:style>
   <w:style w:type="table" w:default="1" w:styleId="TableNormal">

</xml_diff>